<commit_message>
Survey 1 (CSUR): fix remaining review cons and style edit
- Add Fig. 2 (primary studies by year and technology, generated from
  extraction_table.csv); correct the corpus range from 1998-2026 to
  2006-2026 to match the data.
- Note that the only L6 study is a company preprint with crewed-aircraft
  trials, and state what changes if it is discounted.
- Rewrite the enumerated "First/Second/Third" passages and vary the fixed
  Maturity / Key barrier endings of each section.
- Word files: new title, both authors, rubric caption; cover
  letter now names the authors.
- Rebuild main.pdf and the zip package.
</commit_message>
<xml_diff>
--- a/github/k/Survey1_ACM_CSUR_Manuscript.docx
+++ b/github/k/Survey1_ACM_CSUR_Manuscript.docx
@@ -14,7 +14,7 @@
           <w:b/>
           <w:sz w:val="28"/>
         </w:rPr>
-        <w:t>Quantum Computing for Autonomous Robotics: A Systematic Survey of Methods, Evidence, and Deployment Constraints</w:t>
+        <w:t>Quantum Technologies for Autonomous Robotics: A Systematic Survey of Methods, Evidence, and Deployment Constraints</w:t>
       </w:r>
     </w:p>
     <w:p>
@@ -30,7 +30,9 @@
           <w:sz w:val="20"/>
           <w:highlight w:val="yellow"/>
         </w:rPr>
-        <w:t>[FILL: AUTHOR NAME(S)], [FILL: Institution, Country]</w:t>
+        <w:t>YESHWANTH GURU, Amrita Vishwa Vidyapeetham, Chennai, India (g_yeshwanth@ch.students.amrita.edu)</w:t>
+        <w:br/>
+        <w:t>DEV KUNWAR SINGH CHAUHAN, Amrita Vishwa Vidyapeetham, Chennai, India (c_devsingh@ch.amrita.edu)</w:t>
       </w:r>
     </w:p>
     <w:p>
@@ -211,13 +213,13 @@
           <w:sz w:val="18"/>
           <w:highlight w:val="yellow"/>
         </w:rPr>
-        <w:t>[FILL: Authors]</w:t>
+        <w:t>Yeshwanth Guru and Dev Kunwar Singh Chauhan</w:t>
       </w:r>
       <w:r>
         <w:rPr>
           <w:sz w:val="18"/>
         </w:rPr>
-        <w:t xml:space="preserve">. 2026. Quantum Computing for Autonomous Robotics: A Systematic Survey of Methods, Evidence, and Deployment Constraints. </w:t>
+        <w:t xml:space="preserve">. 2026. Quantum Technologies for Autonomous Robotics: A Systematic Survey of Methods, Evidence, and Deployment Constraints. </w:t>
       </w:r>
       <w:r>
         <w:rPr>
@@ -15045,7 +15047,7 @@
           <w:i w:val="0"/>
           <w:highlight w:val="yellow"/>
         </w:rPr>
-        <w:t>[FILL: Acknowledgments and funding: grant numbers, funding bodies, and people to thank.]</w:t>
+        <w:t>[FILL: Acknowledgments and funding: grant numbers, funding bodies, and people to thank.] The authors used a generative AI assistant (Claude, Anthropic) to help draft, edit, and typeset parts of this manuscript and to check references and internal consistency. The authors reviewed and revised all content and take full responsibility for it.</w:t>
       </w:r>
     </w:p>
     <w:p>

</xml_diff>

<commit_message>
Survey 1: count Benioff 1998/2002 as primary studies; full-history timeline
- Reclassify Benioff1998 and Benioff2002 from foundational works to L1
  primary studies (72 primary, 94 foundational); update counts, Tables
  2 and 4, the synthesis table, the supplement, the CSV and PRISMA.
- Explain in Section 3.4 why the record is sparse before 2006 and when
  studies became regular.
- Rewrite Section 2.3 as a full history in four eras (1982-1993,
  1994-2005, 2006-2015, 2016-present) including sensing, communication
  and the 2025-26 control-loop studies.
- Redraw Fig. 1 as a year-by-year timeline with quantum computing and
  robotics columns, robotics milestones colored by technology, sized
  to print at a legible 6.5 pt on the acmsmall text block.
- Redraw Fig. 2 with one bar per year from 1998 and the eras shaded.
- Both figures are generated by tools/make_figures.py.
</commit_message>
<xml_diff>
--- a/github/k/Survey1_ACM_CSUR_Manuscript.docx
+++ b/github/k/Survey1_ACM_CSUR_Manuscript.docx
@@ -585,7 +585,7 @@
         <w:t xml:space="preserve"> </w:t>
       </w:r>
       <w:r>
-        <w:t xml:space="preserve">70</w:t>
+        <w:t xml:space="preserve">72</w:t>
       </w:r>
       <w:r>
         <w:t xml:space="preserve"> </w:t>
@@ -669,7 +669,7 @@
         <w:t xml:space="preserve"> </w:t>
       </w:r>
       <w:r>
-        <w:t xml:space="preserve">96</w:t>
+        <w:t xml:space="preserve">94</w:t>
       </w:r>
       <w:r>
         <w:t xml:space="preserve"> </w:t>
@@ -3582,7 +3582,7 @@
               <w:jc w:val="left"/>
             </w:pPr>
             <w:r>
-              <w:t xml:space="preserve">Five robotic functions; 70 primary studies, 172 references</w:t>
+              <w:t xml:space="preserve">Five robotic functions; 72 primary studies, 172 references</w:t>
             </w:r>
           </w:p>
         </w:tc>
@@ -3709,7 +3709,7 @@
         </w:numPr>
       </w:pPr>
       <w:r>
-        <w:t xml:space="preserve">A systematic, PRISMA 2020-guided review of 70 primary studies on quantum and quantum-inspired methods for robotics, published between 2006 and 2026, set against 96 foundational works and six related quantum computer-vision studies (Section</w:t>
+        <w:t xml:space="preserve">A systematic, PRISMA 2020-guided review of 72 primary studies on quantum and quantum-inspired methods for robotics, published between 1998 and 2026, set against 94 foundational works and six related quantum computer-vision studies (Section</w:t>
       </w:r>
       <w:r>
         <w:t xml:space="preserve"> </w:t>
@@ -5439,7 +5439,7 @@
         <w:t xml:space="preserve"> </w:t>
       </w:r>
       <w:r>
-        <w:t xml:space="preserve">summarizes the history of the field in four eras. In the</w:t>
+        <w:t xml:space="preserve">traces the field from its beginning, in four eras, with quantum computing milestones on one side and robotics milestones on the other, colored by technology. In the</w:t>
       </w:r>
       <w:r>
         <w:t xml:space="preserve"> </w:t>
@@ -5455,7 +5455,7 @@
         <w:t xml:space="preserve"> </w:t>
       </w:r>
       <w:r>
-        <w:t xml:space="preserve">(1980–1994),</w:t>
+        <w:t xml:space="preserve">(1982–1993),</w:t>
       </w:r>
       <w:r>
         <w:t xml:space="preserve"> </w:t>
@@ -5543,7 +5543,7 @@
         <w:t xml:space="preserve"> </w:t>
       </w:r>
       <w:r>
-        <w:t xml:space="preserve">(1995–2005), Shor’s factoring algorithm </w:t>
+        <w:t xml:space="preserve">(1994–2005), Shor’s factoring algorithm </w:t>
       </w:r>
       <w:r>
         <w:fldChar w:fldCharType="begin"/>
@@ -5600,7 +5600,7 @@
         <w:t xml:space="preserve"> </w:t>
       </w:r>
       <w:r>
-        <w:t xml:space="preserve">established that quantum computers could outperform classical ones on practically important tasks, and</w:t>
+        <w:t xml:space="preserve">showed that quantum computers could outperform classical ones on practically important tasks. Robotics entered the picture as theory:</w:t>
       </w:r>
       <w:r>
         <w:t xml:space="preserve"> </w:t>
@@ -5624,7 +5624,7 @@
         <w:t xml:space="preserve"> </w:t>
       </w:r>
       <w:r>
-        <w:t xml:space="preserve">introduced the concept of a</w:t>
+        <w:t xml:space="preserve">introduced the</w:t>
       </w:r>
       <w:r>
         <w:t xml:space="preserve"> </w:t>
@@ -5637,7 +5637,51 @@
         <w:t xml:space="preserve">quantum robot</w:t>
       </w:r>
       <w:r>
-        <w:t xml:space="preserve">, a mobile quantum system carrying an onboard quantum computer and interacting with its environment. In the</w:t>
+        <w:t xml:space="preserve">, a mobile quantum system carrying an onboard quantum computer and interacting with its environment, and later showed that such a robot gains nothing from Grover search when it must move through the region it searches </w:t>
+      </w:r>
+      <w:r>
+        <w:fldChar w:fldCharType="begin"/>
+      </w:r>
+      <w:r>
+        <w:instrText xml:space="preserve">ADDIN CSL_CITATION {"citationID":"MENDELEY_CITATION_63","citationItems":[{"id":"ITEM-63","isTemporary":false,"itemData":{"URL":"https://arxiv.org/abs/quant-ph/0003006","author":[{"family":"Benioff","given":"Paul"}],"collection-title":"Contemporary mathematics","container-title":"Quantum computation and information","editor":[{"family":"Lomonaco","given":"Samuel J.","suffix":"Jr."},{"family":"Brandt","given":"Howard E."}],"id":"Benioff2002","issued":{"date-parts":[[2002]]},"publisher":"American Mathematical Society","publisher-place":"Providence, RI","title":"Space searches with a quantum robot","type":"chapter","volume":"305"}}],"isEdited":false,"manualOverride":{"citeprocText":"(Benioff 2002)","isManuallyOverridden":false,"manualOverrideText":""},"mendeley":{"formattedCitation":"(Benioff 2002)","plainTextFormattedCitation":"(Benioff 2002)","previouslyFormattedCitation":"(Benioff 2002)"},"properties":{"noteIndex":0},"schema":"https://github.com/citation-style-language/schema/raw/master/csl-citation.json"}</w:instrText>
+      </w:r>
+      <w:r>
+        <w:fldChar w:fldCharType="separate"/>
+      </w:r>
+      <w:r>
+        <w:t xml:space="preserve">(Benioff 2002)</w:t>
+      </w:r>
+      <w:r>
+        <w:fldChar w:fldCharType="end"/>
+      </w:r>
+      <w:r>
+        <w:t xml:space="preserve">, while quantum-inspired evolutionary algorithms brought quantum ideas to classical optimization </w:t>
+      </w:r>
+      <w:r>
+        <w:fldChar w:fldCharType="begin"/>
+      </w:r>
+      <w:r>
+        <w:instrText xml:space="preserve">ADDIN CSL_CITATION {"citationID":"MENDELEY_CITATION_64","citationItems":[{"id":"ITEM-64","isTemporary":false,"itemData":{"DOI":"10.1109/TEVC.2002.804320","author":[{"family":"Han","given":"Kuk-Hyun"},{"family":"Kim","given":"Jong-Hwan"}],"container-title":"IEEE Transactions on Evolutionary Computation","id":"Han2002","issue":"6","issued":{"date-parts":[[2002]]},"page":"580-593","publisher":"IEEE","title":"Quantum-inspired evolutionary algorithm for a class of combinatorial optimization","type":"article-journal","volume":"6"}}],"isEdited":false,"manualOverride":{"citeprocText":"(Han and Kim 2002)","isManuallyOverridden":false,"manualOverrideText":""},"mendeley":{"formattedCitation":"(Han and Kim 2002)","plainTextFormattedCitation":"(Han and Kim 2002)","previouslyFormattedCitation":"(Han and Kim 2002)"},"properties":{"noteIndex":0},"schema":"https://github.com/citation-style-language/schema/raw/master/csl-citation.json"}</w:instrText>
+      </w:r>
+      <w:r>
+        <w:fldChar w:fldCharType="separate"/>
+      </w:r>
+      <w:r>
+        <w:t xml:space="preserve">(Han and Kim 2002)</w:t>
+      </w:r>
+      <w:r>
+        <w:fldChar w:fldCharType="end"/>
+      </w:r>
+      <w:r>
+        <w:t xml:space="preserve">.</w:t>
+      </w:r>
+    </w:p>
+    <w:p>
+      <w:pPr>
+        <w:pStyle w:val="BodyText"/>
+      </w:pPr>
+      <w:r>
+        <w:t xml:space="preserve">In the</w:t>
       </w:r>
       <w:r>
         <w:t xml:space="preserve"> </w:t>
@@ -5662,7 +5706,7 @@
         <w:fldChar w:fldCharType="begin"/>
       </w:r>
       <w:r>
-        <w:instrText xml:space="preserve">ADDIN CSL_CITATION {"citationID":"MENDELEY_CITATION_63","citationItems":[{"id":"ITEM-63","isTemporary":false,"itemData":{"DOI":"10.1017/S0263574705002596","author":[{"family":"Dong","given":"Daoyi"},{"family":"Chen","given":"Chunlin"},{"family":"Zhang","given":"Chenbin"},{"family":"Chen","given":"Zonghai"}],"container-title":"Robotica","id":"Dong2006","issue":"4","issued":{"date-parts":[[2006]]},"page":"513-521","title":"Quantum robot: Structure, algorithms and applications","title-short":"Quantum robot","type":"article-journal","volume":"24"},"suppress-author":false}],"isEdited":false,"manualOverride":{"citeprocText":"Dong et al. (2006)","isManuallyOverridden":false,"manualOverrideText":""},"mendeley":{"formattedCitation":"Dong et al. (2006)","plainTextFormattedCitation":"Dong et al. (2006)","previouslyFormattedCitation":"Dong et al. (2006)"},"properties":{"noteIndex":0},"schema":"https://github.com/citation-style-language/schema/raw/master/csl-citation.json"}</w:instrText>
+        <w:instrText xml:space="preserve">ADDIN CSL_CITATION {"citationID":"MENDELEY_CITATION_65","citationItems":[{"id":"ITEM-65","isTemporary":false,"itemData":{"DOI":"10.1017/S0263574705002596","author":[{"family":"Dong","given":"Daoyi"},{"family":"Chen","given":"Chunlin"},{"family":"Zhang","given":"Chenbin"},{"family":"Chen","given":"Zonghai"}],"container-title":"Robotica","id":"Dong2006","issue":"4","issued":{"date-parts":[[2006]]},"page":"513-521","title":"Quantum robot: Structure, algorithms and applications","title-short":"Quantum robot","type":"article-journal","volume":"24"},"suppress-author":false}],"isEdited":false,"manualOverride":{"citeprocText":"Dong et al. (2006)","isManuallyOverridden":false,"manualOverrideText":""},"mendeley":{"formattedCitation":"Dong et al. (2006)","plainTextFormattedCitation":"Dong et al. (2006)","previouslyFormattedCitation":"Dong et al. (2006)"},"properties":{"noteIndex":0},"schema":"https://github.com/citation-style-language/schema/raw/master/csl-citation.json"}</w:instrText>
       </w:r>
       <w:r>
         <w:fldChar w:fldCharType="separate"/>
@@ -5683,7 +5727,7 @@
         <w:fldChar w:fldCharType="begin"/>
       </w:r>
       <w:r>
-        <w:instrText xml:space="preserve">ADDIN CSL_CITATION {"citationID":"MENDELEY_CITATION_64","citationItems":[{"id":"ITEM-64","isTemporary":false,"itemData":{"DOI":"10.1109/TSMCB.2008.925743","author":[{"family":"Dong","given":"Daoyi"},{"family":"Chen","given":"Chunlin"},{"family":"Li","given":"Hanxiong"},{"family":"Tarn","given":"Tzyh-Jong"}],"container-title":"IEEE Transactions on Systems, Man, and Cybernetics, Part B (Cybernetics)","id":"Dong2008","issue":"5","issued":{"date-parts":[[2008]]},"page":"1207-1220","title":"Quantum reinforcement learning","type":"article-journal","volume":"38"}}],"isEdited":false,"manualOverride":{"citeprocText":"(Dong et al. 2008)","isManuallyOverridden":false,"manualOverrideText":""},"mendeley":{"formattedCitation":"(Dong et al. 2008)","plainTextFormattedCitation":"(Dong et al. 2008)","previouslyFormattedCitation":"(Dong et al. 2008)"},"properties":{"noteIndex":0},"schema":"https://github.com/citation-style-language/schema/raw/master/csl-citation.json"}</w:instrText>
+        <w:instrText xml:space="preserve">ADDIN CSL_CITATION {"citationID":"MENDELEY_CITATION_66","citationItems":[{"id":"ITEM-66","isTemporary":false,"itemData":{"DOI":"10.1109/TSMCB.2008.925743","author":[{"family":"Dong","given":"Daoyi"},{"family":"Chen","given":"Chunlin"},{"family":"Li","given":"Hanxiong"},{"family":"Tarn","given":"Tzyh-Jong"}],"container-title":"IEEE Transactions on Systems, Man, and Cybernetics, Part B (Cybernetics)","id":"Dong2008","issue":"5","issued":{"date-parts":[[2008]]},"page":"1207-1220","title":"Quantum reinforcement learning","type":"article-journal","volume":"38"}}],"isEdited":false,"manualOverride":{"citeprocText":"(Dong et al. 2008)","isManuallyOverridden":false,"manualOverrideText":""},"mendeley":{"formattedCitation":"(Dong et al. 2008)","plainTextFormattedCitation":"(Dong et al. 2008)","previouslyFormattedCitation":"(Dong et al. 2008)"},"properties":{"noteIndex":0},"schema":"https://github.com/citation-style-language/schema/raw/master/csl-citation.json"}</w:instrText>
       </w:r>
       <w:r>
         <w:fldChar w:fldCharType="separate"/>
@@ -5701,7 +5745,7 @@
         <w:fldChar w:fldCharType="begin"/>
       </w:r>
       <w:r>
-        <w:instrText xml:space="preserve">ADDIN CSL_CITATION {"citationID":"MENDELEY_CITATION_65","citationItems":[{"id":"ITEM-65","isTemporary":false,"itemData":{"DOI":"10.1103/PhysRevLett.103.150502","author":[{"family":"Harrow","given":"Aram W."},{"family":"Hassidim","given":"Avinatan"},{"family":"Lloyd","given":"Seth"}],"container-title":"Physical Review Letters","id":"Harrow2009","issue":"15","issued":{"date-parts":[[2009]]},"page":"150502","publisher":"American Physical Society","title":"Quantum algorithm for linear systems of equations","type":"article-journal","volume":"103"}}],"isEdited":false,"manualOverride":{"citeprocText":"(Harrow, Hassidim, and Lloyd 2009)","isManuallyOverridden":false,"manualOverrideText":""},"mendeley":{"formattedCitation":"(Harrow, Hassidim, and Lloyd 2009)","plainTextFormattedCitation":"(Harrow, Hassidim, and Lloyd 2009)","previouslyFormattedCitation":"(Harrow, Hassidim, and Lloyd 2009)"},"properties":{"noteIndex":0},"schema":"https://github.com/citation-style-language/schema/raw/master/csl-citation.json"}</w:instrText>
+        <w:instrText xml:space="preserve">ADDIN CSL_CITATION {"citationID":"MENDELEY_CITATION_67","citationItems":[{"id":"ITEM-67","isTemporary":false,"itemData":{"DOI":"10.1103/PhysRevLett.103.150502","author":[{"family":"Harrow","given":"Aram W."},{"family":"Hassidim","given":"Avinatan"},{"family":"Lloyd","given":"Seth"}],"container-title":"Physical Review Letters","id":"Harrow2009","issue":"15","issued":{"date-parts":[[2009]]},"page":"150502","publisher":"American Physical Society","title":"Quantum algorithm for linear systems of equations","type":"article-journal","volume":"103"}}],"isEdited":false,"manualOverride":{"citeprocText":"(Harrow, Hassidim, and Lloyd 2009)","isManuallyOverridden":false,"manualOverrideText":""},"mendeley":{"formattedCitation":"(Harrow, Hassidim, and Lloyd 2009)","plainTextFormattedCitation":"(Harrow, Hassidim, and Lloyd 2009)","previouslyFormattedCitation":"(Harrow, Hassidim, and Lloyd 2009)"},"properties":{"noteIndex":0},"schema":"https://github.com/citation-style-language/schema/raw/master/csl-citation.json"}</w:instrText>
       </w:r>
       <w:r>
         <w:fldChar w:fldCharType="separate"/>
@@ -5719,7 +5763,7 @@
         <w:fldChar w:fldCharType="begin"/>
       </w:r>
       <w:r>
-        <w:instrText xml:space="preserve">ADDIN CSL_CITATION {"citationID":"MENDELEY_CITATION_66","citationItems":[{"id":"ITEM-66","isTemporary":false,"itemData":{"DOI":"10.1038/nature10012","author":[{"family":"Johnson","given":"M. W."},{"family":"Amin","given":"M. H. S."},{"family":"Gildert","given":"S."},{"family":"Lanting","given":"T."},{"family":"Hamze","given":"F."},{"family":"Dickson","given":"N."},{"family":"Harris","given":"R."},{"family":"Berkley","given":"A. J."},{"family":"Johansson","given":"J."},{"family":"Bunyk","given":"P."},{"family":"Chapple","given":"E. M."},{"family":"Enderud","given":"C."},{"family":"Hilton","given":"J. P."},{"family":"Karimi","given":"K."},{"family":"Ladizinsky","given":"E."},{"family":"Ladizinsky","given":"N."},{"family":"Oh","given":"T."},{"family":"Perminov","given":"I."},{"family":"Rich","given":"C."},{"family":"Thom","given":"M. C."},{"family":"Tolkacheva","given":"E."},{"family":"Truncik","given":"C. J. S."},{"family":"Uchaikin","given":"S."},{"family":"Wang","given":"J."},{"family":"Wilson","given":"B."},{"family":"Rose","given":"G."}],"container-title":"Nature","id":"Johnson2011","issue":"7346","issued":{"date-parts":[[2011]]},"page":"194-198","publisher":"Nature Publishing Group","title":"Quantum annealing with manufactured spins","type":"article-journal","volume":"473"}}],"isEdited":false,"manualOverride":{"citeprocText":"(Johnson et al. 2011)","isManuallyOverridden":false,"manualOverrideText":""},"mendeley":{"formattedCitation":"(Johnson et al. 2011)","plainTextFormattedCitation":"(Johnson et al. 2011)","previouslyFormattedCitation":"(Johnson et al. 2011)"},"properties":{"noteIndex":0},"schema":"https://github.com/citation-style-language/schema/raw/master/csl-citation.json"}</w:instrText>
+        <w:instrText xml:space="preserve">ADDIN CSL_CITATION {"citationID":"MENDELEY_CITATION_68","citationItems":[{"id":"ITEM-68","isTemporary":false,"itemData":{"DOI":"10.1038/nature10012","author":[{"family":"Johnson","given":"M. W."},{"family":"Amin","given":"M. H. S."},{"family":"Gildert","given":"S."},{"family":"Lanting","given":"T."},{"family":"Hamze","given":"F."},{"family":"Dickson","given":"N."},{"family":"Harris","given":"R."},{"family":"Berkley","given":"A. J."},{"family":"Johansson","given":"J."},{"family":"Bunyk","given":"P."},{"family":"Chapple","given":"E. M."},{"family":"Enderud","given":"C."},{"family":"Hilton","given":"J. P."},{"family":"Karimi","given":"K."},{"family":"Ladizinsky","given":"E."},{"family":"Ladizinsky","given":"N."},{"family":"Oh","given":"T."},{"family":"Perminov","given":"I."},{"family":"Rich","given":"C."},{"family":"Thom","given":"M. C."},{"family":"Tolkacheva","given":"E."},{"family":"Truncik","given":"C. J. S."},{"family":"Uchaikin","given":"S."},{"family":"Wang","given":"J."},{"family":"Wilson","given":"B."},{"family":"Rose","given":"G."}],"container-title":"Nature","id":"Johnson2011","issue":"7346","issued":{"date-parts":[[2011]]},"page":"194-198","publisher":"Nature Publishing Group","title":"Quantum annealing with manufactured spins","type":"article-journal","volume":"473"}}],"isEdited":false,"manualOverride":{"citeprocText":"(Johnson et al. 2011)","isManuallyOverridden":false,"manualOverrideText":""},"mendeley":{"formattedCitation":"(Johnson et al. 2011)","plainTextFormattedCitation":"(Johnson et al. 2011)","previouslyFormattedCitation":"(Johnson et al. 2011)"},"properties":{"noteIndex":0},"schema":"https://github.com/citation-style-language/schema/raw/master/csl-citation.json"}</w:instrText>
       </w:r>
       <w:r>
         <w:fldChar w:fldCharType="separate"/>
@@ -5737,7 +5781,7 @@
         <w:fldChar w:fldCharType="begin"/>
       </w:r>
       <w:r>
-        <w:instrText xml:space="preserve">ADDIN CSL_CITATION {"citationID":"MENDELEY_CITATION_67","citationItems":[{"id":"ITEM-67","isTemporary":false,"itemData":{"DOI":"10.1038/ncomms5213","author":[{"family":"Peruzzo","given":"Alberto"},{"family":"McClean","given":"Jarrod"},{"family":"Shadbolt","given":"Peter"},{"family":"Yung","given":"Man-Hong"},{"family":"Zhou","given":"Xiao-Qi"},{"family":"Love","given":"Peter J."},{"family":"Aspuru-Guzik","given":"Alán"},{"family":"O’Brien","given":"Jeremy L."}],"container-title":"Nature Communications","id":"Peruzzo2014","issue":"1","issued":{"date-parts":[[2014]]},"page":"4213","publisher":"Nature Publishing Group","title":"A variational eigenvalue solver on a photonic quantum processor","type":"article-journal","volume":"5"}}],"isEdited":false,"manualOverride":{"citeprocText":"(Peruzzo et al. 2014)","isManuallyOverridden":false,"manualOverrideText":""},"mendeley":{"formattedCitation":"(Peruzzo et al. 2014)","plainTextFormattedCitation":"(Peruzzo et al. 2014)","previouslyFormattedCitation":"(Peruzzo et al. 2014)"},"properties":{"noteIndex":0},"schema":"https://github.com/citation-style-language/schema/raw/master/csl-citation.json"}</w:instrText>
+        <w:instrText xml:space="preserve">ADDIN CSL_CITATION {"citationID":"MENDELEY_CITATION_69","citationItems":[{"id":"ITEM-69","isTemporary":false,"itemData":{"DOI":"10.1038/ncomms5213","author":[{"family":"Peruzzo","given":"Alberto"},{"family":"McClean","given":"Jarrod"},{"family":"Shadbolt","given":"Peter"},{"family":"Yung","given":"Man-Hong"},{"family":"Zhou","given":"Xiao-Qi"},{"family":"Love","given":"Peter J."},{"family":"Aspuru-Guzik","given":"Alán"},{"family":"O’Brien","given":"Jeremy L."}],"container-title":"Nature Communications","id":"Peruzzo2014","issue":"1","issued":{"date-parts":[[2014]]},"page":"4213","publisher":"Nature Publishing Group","title":"A variational eigenvalue solver on a photonic quantum processor","type":"article-journal","volume":"5"}}],"isEdited":false,"manualOverride":{"citeprocText":"(Peruzzo et al. 2014)","isManuallyOverridden":false,"manualOverrideText":""},"mendeley":{"formattedCitation":"(Peruzzo et al. 2014)","plainTextFormattedCitation":"(Peruzzo et al. 2014)","previouslyFormattedCitation":"(Peruzzo et al. 2014)"},"properties":{"noteIndex":0},"schema":"https://github.com/citation-style-language/schema/raw/master/csl-citation.json"}</w:instrText>
       </w:r>
       <w:r>
         <w:fldChar w:fldCharType="separate"/>
@@ -5758,7 +5802,7 @@
         <w:fldChar w:fldCharType="begin"/>
       </w:r>
       <w:r>
-        <w:instrText xml:space="preserve">ADDIN CSL_CITATION {"citationID":"MENDELEY_CITATION_68","citationItems":[{"id":"ITEM-68","isTemporary":false,"itemData":{"URL":"https://arxiv.org/abs/1411.4028","author":[{"family":"Farhi","given":"Edward"},{"family":"Goldstone","given":"Jeffrey"},{"family":"Gutmann","given":"Sam"}],"id":"Farhi2014","issued":{"date-parts":[[2014]]},"title":"A quantum approximate optimization algorithm","type":""}}],"isEdited":false,"manualOverride":{"citeprocText":"(Farhi, Goldstone, and Gutmann 2014)","isManuallyOverridden":false,"manualOverrideText":""},"mendeley":{"formattedCitation":"(Farhi, Goldstone, and Gutmann 2014)","plainTextFormattedCitation":"(Farhi, Goldstone, and Gutmann 2014)","previouslyFormattedCitation":"(Farhi, Goldstone, and Gutmann 2014)"},"properties":{"noteIndex":0},"schema":"https://github.com/citation-style-language/schema/raw/master/csl-citation.json"}</w:instrText>
+        <w:instrText xml:space="preserve">ADDIN CSL_CITATION {"citationID":"MENDELEY_CITATION_70","citationItems":[{"id":"ITEM-70","isTemporary":false,"itemData":{"URL":"https://arxiv.org/abs/1411.4028","author":[{"family":"Farhi","given":"Edward"},{"family":"Goldstone","given":"Jeffrey"},{"family":"Gutmann","given":"Sam"}],"id":"Farhi2014","issued":{"date-parts":[[2014]]},"title":"A quantum approximate optimization algorithm","type":""}}],"isEdited":false,"manualOverride":{"citeprocText":"(Farhi, Goldstone, and Gutmann 2014)","isManuallyOverridden":false,"manualOverrideText":""},"mendeley":{"formattedCitation":"(Farhi, Goldstone, and Gutmann 2014)","plainTextFormattedCitation":"(Farhi, Goldstone, and Gutmann 2014)","previouslyFormattedCitation":"(Farhi, Goldstone, and Gutmann 2014)"},"properties":{"noteIndex":0},"schema":"https://github.com/citation-style-language/schema/raw/master/csl-citation.json"}</w:instrText>
       </w:r>
       <w:r>
         <w:fldChar w:fldCharType="separate"/>
@@ -5773,7 +5817,61 @@
         <w:t xml:space="preserve"> </w:t>
       </w:r>
       <w:r>
-        <w:t xml:space="preserve">introduced the variational paradigm. In the</w:t>
+        <w:t xml:space="preserve">introduced the variational paradigm. The first robotics results of this era ran on classical hardware or on sensors rather than quantum computers: quantum-inspired reinforcement learning drove a physical robot </w:t>
+      </w:r>
+      <w:r>
+        <w:fldChar w:fldCharType="begin"/>
+      </w:r>
+      <w:r>
+        <w:instrText xml:space="preserve">ADDIN CSL_CITATION {"citationID":"MENDELEY_CITATION_71","citationItems":[{"id":"ITEM-71","isTemporary":false,"itemData":{"DOI":"10.1109/TMECH.2010.2090896","author":[{"family":"Dong","given":"Daoyi"},{"family":"Chen","given":"Chunlin"},{"family":"Chu","given":"Jian"},{"family":"Tarn","given":"Tzyh-Jong"}],"container-title":"IEEE/ASME Transactions on Mechatronics","id":"Dong2012","issue":"1","issued":{"date-parts":[[2012]]},"page":"86-97","publisher":"IEEE","title":"Robust quantum-inspired reinforcement learning for robot navigation","type":"article-journal","volume":"17"}}],"isEdited":false,"manualOverride":{"citeprocText":"(Dong et al. 2012)","isManuallyOverridden":false,"manualOverrideText":""},"mendeley":{"formattedCitation":"(Dong et al. 2012)","plainTextFormattedCitation":"(Dong et al. 2012)","previouslyFormattedCitation":"(Dong et al. 2012)"},"properties":{"noteIndex":0},"schema":"https://github.com/citation-style-language/schema/raw/master/csl-citation.json"}</w:instrText>
+      </w:r>
+      <w:r>
+        <w:fldChar w:fldCharType="separate"/>
+      </w:r>
+      <w:r>
+        <w:t xml:space="preserve">(Dong et al. 2012)</w:t>
+      </w:r>
+      <w:r>
+        <w:fldChar w:fldCharType="end"/>
+      </w:r>
+      <w:r>
+        <w:t xml:space="preserve">, an atom-interferometric accelerometer flew on an aircraft </w:t>
+      </w:r>
+      <w:r>
+        <w:fldChar w:fldCharType="begin"/>
+      </w:r>
+      <w:r>
+        <w:instrText xml:space="preserve">ADDIN CSL_CITATION {"citationID":"MENDELEY_CITATION_72","citationItems":[{"id":"ITEM-72","isTemporary":false,"itemData":{"DOI":"10.1038/ncomms1479","author":[{"family":"Geiger","given":"R."},{"family":"Ménoret","given":"V."},{"family":"Stern","given":"G."},{"family":"Zahzam","given":"N."},{"family":"Cheinet","given":"P."},{"family":"Battelier","given":"B."},{"family":"Villing","given":"A."},{"family":"Moron","given":"F."},{"family":"Lours","given":"M."},{"family":"Bidel","given":"Y."},{"family":"Bresson","given":"A."},{"family":"Landragin","given":"A."},{"family":"Bouyer","given":"P."}],"container-title":"Nature Communications","id":"Geiger2011","issued":{"date-parts":[[2011]]},"page":"474","title":"Detecting inertial effects with airborne matter-wave interferometry","type":"article-journal","volume":"2"}}],"isEdited":false,"manualOverride":{"citeprocText":"(Geiger et al. 2011)","isManuallyOverridden":false,"manualOverrideText":""},"mendeley":{"formattedCitation":"(Geiger et al. 2011)","plainTextFormattedCitation":"(Geiger et al. 2011)","previouslyFormattedCitation":"(Geiger et al. 2011)"},"properties":{"noteIndex":0},"schema":"https://github.com/citation-style-language/schema/raw/master/csl-citation.json"}</w:instrText>
+      </w:r>
+      <w:r>
+        <w:fldChar w:fldCharType="separate"/>
+      </w:r>
+      <w:r>
+        <w:t xml:space="preserve">(Geiger et al. 2011)</w:t>
+      </w:r>
+      <w:r>
+        <w:fldChar w:fldCharType="end"/>
+      </w:r>
+      <w:r>
+        <w:t xml:space="preserve">, and planning problems were first mapped to a quantum annealer </w:t>
+      </w:r>
+      <w:r>
+        <w:fldChar w:fldCharType="begin"/>
+      </w:r>
+      <w:r>
+        <w:instrText xml:space="preserve">ADDIN CSL_CITATION {"citationID":"MENDELEY_CITATION_73","citationItems":[{"id":"ITEM-73","isTemporary":false,"itemData":{"DOI":"10.1007/s11128-014-0892-x","author":[{"family":"Rieffel","given":"Eleanor G."},{"family":"Venturelli","given":"Davide"},{"family":"O’Gorman","given":"Bryan"},{"family":"Do","given":"Minh B."},{"family":"Prystay","given":"Elicia M."},{"family":"Smelyanskiy","given":"Vadim N."}],"container-title":"Quantum Information Processing","id":"Rieffel2015","issue":"1","issued":{"date-parts":[[2015]]},"page":"1-36","title":"A case study in programming a quantum annealer for hard operational planning problems","type":"article-journal","volume":"14"}}],"isEdited":false,"manualOverride":{"citeprocText":"(Rieffel et al. 2015)","isManuallyOverridden":false,"manualOverrideText":""},"mendeley":{"formattedCitation":"(Rieffel et al. 2015)","plainTextFormattedCitation":"(Rieffel et al. 2015)","previouslyFormattedCitation":"(Rieffel et al. 2015)"},"properties":{"noteIndex":0},"schema":"https://github.com/citation-style-language/schema/raw/master/csl-citation.json"}</w:instrText>
+      </w:r>
+      <w:r>
+        <w:fldChar w:fldCharType="separate"/>
+      </w:r>
+      <w:r>
+        <w:t xml:space="preserve">(Rieffel et al. 2015)</w:t>
+      </w:r>
+      <w:r>
+        <w:fldChar w:fldCharType="end"/>
+      </w:r>
+      <w:r>
+        <w:t xml:space="preserve">. In the</w:t>
       </w:r>
       <w:r>
         <w:t xml:space="preserve"> </w:t>
@@ -5789,16 +5887,16 @@
         <w:t xml:space="preserve"> </w:t>
       </w:r>
       <w:r>
-        <w:t xml:space="preserve">(2016-present),</w:t>
-      </w:r>
-      <w:r>
-        <w:t xml:space="preserve"> </w:t>
-      </w:r>
-      <w:r>
-        <w:fldChar w:fldCharType="begin"/>
-      </w:r>
-      <w:r>
-        <w:instrText xml:space="preserve">ADDIN CSL_CITATION {"citationID":"MENDELEY_CITATION_69","citationItems":[{"id":"ITEM-69","isTemporary":false,"itemData":{"DOI":"10.22331/q-2018-08-06-79","author":[{"family":"Preskill","given":"John"}],"container-title":"Quantum","id":"Preskill2018","issued":{"date-parts":[[2018]]},"page":"79","publisher":"Verein zur Förderung des Open Access Publizierens in den Quantenwissenschaften","title":"Quantum computing in the NISQ era and beyond","type":"article-journal","volume":"2"},"suppress-author":false}],"isEdited":false,"manualOverride":{"citeprocText":"Preskill (2018)","isManuallyOverridden":false,"manualOverrideText":""},"mendeley":{"formattedCitation":"Preskill (2018)","plainTextFormattedCitation":"Preskill (2018)","previouslyFormattedCitation":"Preskill (2018)"},"properties":{"noteIndex":0},"schema":"https://github.com/citation-style-language/schema/raw/master/csl-citation.json"}</w:instrText>
+        <w:t xml:space="preserve">(2016–present), public cloud access opened gate-based processors to robotics groups,</w:t>
+      </w:r>
+      <w:r>
+        <w:t xml:space="preserve"> </w:t>
+      </w:r>
+      <w:r>
+        <w:fldChar w:fldCharType="begin"/>
+      </w:r>
+      <w:r>
+        <w:instrText xml:space="preserve">ADDIN CSL_CITATION {"citationID":"MENDELEY_CITATION_74","citationItems":[{"id":"ITEM-74","isTemporary":false,"itemData":{"DOI":"10.22331/q-2018-08-06-79","author":[{"family":"Preskill","given":"John"}],"container-title":"Quantum","id":"Preskill2018","issued":{"date-parts":[[2018]]},"page":"79","publisher":"Verein zur Förderung des Open Access Publizierens in den Quantenwissenschaften","title":"Quantum computing in the NISQ era and beyond","type":"article-journal","volume":"2"},"suppress-author":false}],"isEdited":false,"manualOverride":{"citeprocText":"Preskill (2018)","isManuallyOverridden":false,"manualOverrideText":""},"mendeley":{"formattedCitation":"Preskill (2018)","plainTextFormattedCitation":"Preskill (2018)","previouslyFormattedCitation":"Preskill (2018)"},"properties":{"noteIndex":0},"schema":"https://github.com/citation-style-language/schema/raw/master/csl-citation.json"}</w:instrText>
       </w:r>
       <w:r>
         <w:fldChar w:fldCharType="separate"/>
@@ -5813,13 +5911,13 @@
         <w:t xml:space="preserve"> </w:t>
       </w:r>
       <w:r>
-        <w:t xml:space="preserve">named the regime of noisy 50–100-qubit devices, Google’s Sycamore processor performed a random-circuit sampling task beyond the reach of classical simulation at the time </w:t>
-      </w:r>
-      <w:r>
-        <w:fldChar w:fldCharType="begin"/>
-      </w:r>
-      <w:r>
-        <w:instrText xml:space="preserve">ADDIN CSL_CITATION {"citationID":"MENDELEY_CITATION_70","citationItems":[{"id":"ITEM-70","isTemporary":false,"itemData":{"DOI":"10.1038/s41586-019-1666-5","author":[{"family":"Arute","given":"Frank"},{"family":"Arya","given":"Kunal"},{"family":"Babbush","given":"Ryan"},{"family":"Bacon","given":"Dave"},{"family":"Bardin","given":"Joseph C."},{"family":"Barends","given":"Rami"},{"family":"Biswas","given":"Rupak"},{"family":"Boixo","given":"Sergio"},{"family":"Brandao","given":"Fernando G. S. L."},{"family":"Buell","given":"David A."},{"family":"Burkett","given":"Brian"},{"family":"Chen","given":"Yu"},{"family":"Chen","given":"Zijun"},{"family":"Chiaro","given":"Ben"},{"family":"Collins","given":"Roberto"},{"family":"Courtney","given":"William"},{"family":"Dunsworth","given":"Andrew"},{"family":"Farhi","given":"Edward"},{"family":"Foxen","given":"Brooks"},{"family":"Fowler","given":"Austin"},{"family":"Gidney","given":"Craig"},{"family":"Giustina","given":"Marissa"},{"family":"Graff","given":"Rob"},{"family":"Guerin","given":"Keith"},{"family":"Habegger","given":"Steve"},{"family":"Harrigan","given":"Matthew P."},{"family":"Hartmann","given":"Michael J."},{"family":"Ho","given":"Alan"},{"family":"Hoffmann","given":"Markus"},{"family":"Huang","given":"Trent"},{"family":"Humble","given":"Travis S."},{"family":"Isakov","given":"Sergei V."},{"family":"Jeffrey","given":"Evan"},{"family":"Jiang","given":"Zhang"},{"family":"Kafri","given":"Dvir"},{"family":"Kechedzhi","given":"Kostyantyn"},{"family":"Kelly","given":"Julian"},{"family":"Klimov","given":"Paul V."},{"family":"Knysh","given":"Sergey"},{"family":"Korotkov","given":"Alexander"},{"family":"Kostritsa","given":"Fedor"},{"family":"Landhuis","given":"David"},{"family":"Lindmark","given":"Mike"},{"family":"Lucero","given":"Erik"},{"family":"Lyakh","given":"Dmitry"},{"family":"Mandrà","given":"Salvatore"},{"family":"McClean","given":"Jarrod R."},{"family":"McEwen","given":"Matthew"},{"family":"Megrant","given":"Anthony"},{"family":"Mi","given":"Xiao"},{"family":"Michielsen","given":"Kristel"},{"family":"Mohseni","given":"Masoud"},{"family":"Mutus","given":"Josh"},{"family":"Naaman","given":"Ofer"},{"family":"Neeley","given":"Matthew"},{"family":"Neill","given":"Charles"},{"family":"Niu","given":"Murphy Yuezhen"},{"family":"Ostby","given":"Eric"},{"family":"Petukhov","given":"Andre"},{"family":"Platt","given":"John C."},{"family":"Quintana","given":"Chris"},{"family":"Rieffel","given":"Eleanor G."},{"family":"Roushan","given":"Pedram"},{"family":"Rubin","given":"Nicholas C."},{"family":"Sank","given":"Daniel"},{"family":"Satzinger","given":"Kevin J."},{"family":"Smelyanskiy","given":"Vadim"},{"family":"Sung","given":"Kevin J."},{"family":"Trevithick","given":"Matthew D."},{"family":"Vainsencher","given":"Amit"},{"family":"Villalonga","given":"Benjamin"},{"family":"White","given":"Theodore"},{"family":"Yao","given":"Z. Jamie"},{"family":"Yeh","given":"Ping"},{"family":"Zalcman","given":"Adam"},{"family":"Neven","given":"Hartmut"},{"family":"Martinis","given":"John M."}],"container-title":"Nature","id":"Arute2019","issue":"7779","issued":{"date-parts":[[2019]]},"page":"505-510","title":"Quantum supremacy using a programmable superconducting processor","type":"article-journal","volume":"574"}}],"isEdited":false,"manualOverride":{"citeprocText":"(Arute et al. 2019)","isManuallyOverridden":false,"manualOverrideText":""},"mendeley":{"formattedCitation":"(Arute et al. 2019)","plainTextFormattedCitation":"(Arute et al. 2019)","previouslyFormattedCitation":"(Arute et al. 2019)"},"properties":{"noteIndex":0},"schema":"https://github.com/citation-style-language/schema/raw/master/csl-citation.json"}</w:instrText>
+        <w:t xml:space="preserve">named the regime of noisy 50–100-qubit devices, and Google’s Sycamore processor performed a random-circuit sampling task beyond the reach of classical simulation at the time </w:t>
+      </w:r>
+      <w:r>
+        <w:fldChar w:fldCharType="begin"/>
+      </w:r>
+      <w:r>
+        <w:instrText xml:space="preserve">ADDIN CSL_CITATION {"citationID":"MENDELEY_CITATION_75","citationItems":[{"id":"ITEM-75","isTemporary":false,"itemData":{"DOI":"10.1038/s41586-019-1666-5","author":[{"family":"Arute","given":"Frank"},{"family":"Arya","given":"Kunal"},{"family":"Babbush","given":"Ryan"},{"family":"Bacon","given":"Dave"},{"family":"Bardin","given":"Joseph C."},{"family":"Barends","given":"Rami"},{"family":"Biswas","given":"Rupak"},{"family":"Boixo","given":"Sergio"},{"family":"Brandao","given":"Fernando G. S. L."},{"family":"Buell","given":"David A."},{"family":"Burkett","given":"Brian"},{"family":"Chen","given":"Yu"},{"family":"Chen","given":"Zijun"},{"family":"Chiaro","given":"Ben"},{"family":"Collins","given":"Roberto"},{"family":"Courtney","given":"William"},{"family":"Dunsworth","given":"Andrew"},{"family":"Farhi","given":"Edward"},{"family":"Foxen","given":"Brooks"},{"family":"Fowler","given":"Austin"},{"family":"Gidney","given":"Craig"},{"family":"Giustina","given":"Marissa"},{"family":"Graff","given":"Rob"},{"family":"Guerin","given":"Keith"},{"family":"Habegger","given":"Steve"},{"family":"Harrigan","given":"Matthew P."},{"family":"Hartmann","given":"Michael J."},{"family":"Ho","given":"Alan"},{"family":"Hoffmann","given":"Markus"},{"family":"Huang","given":"Trent"},{"family":"Humble","given":"Travis S."},{"family":"Isakov","given":"Sergei V."},{"family":"Jeffrey","given":"Evan"},{"family":"Jiang","given":"Zhang"},{"family":"Kafri","given":"Dvir"},{"family":"Kechedzhi","given":"Kostyantyn"},{"family":"Kelly","given":"Julian"},{"family":"Klimov","given":"Paul V."},{"family":"Knysh","given":"Sergey"},{"family":"Korotkov","given":"Alexander"},{"family":"Kostritsa","given":"Fedor"},{"family":"Landhuis","given":"David"},{"family":"Lindmark","given":"Mike"},{"family":"Lucero","given":"Erik"},{"family":"Lyakh","given":"Dmitry"},{"family":"Mandrà","given":"Salvatore"},{"family":"McClean","given":"Jarrod R."},{"family":"McEwen","given":"Matthew"},{"family":"Megrant","given":"Anthony"},{"family":"Mi","given":"Xiao"},{"family":"Michielsen","given":"Kristel"},{"family":"Mohseni","given":"Masoud"},{"family":"Mutus","given":"Josh"},{"family":"Naaman","given":"Ofer"},{"family":"Neeley","given":"Matthew"},{"family":"Neill","given":"Charles"},{"family":"Niu","given":"Murphy Yuezhen"},{"family":"Ostby","given":"Eric"},{"family":"Petukhov","given":"Andre"},{"family":"Platt","given":"John C."},{"family":"Quintana","given":"Chris"},{"family":"Rieffel","given":"Eleanor G."},{"family":"Roushan","given":"Pedram"},{"family":"Rubin","given":"Nicholas C."},{"family":"Sank","given":"Daniel"},{"family":"Satzinger","given":"Kevin J."},{"family":"Smelyanskiy","given":"Vadim"},{"family":"Sung","given":"Kevin J."},{"family":"Trevithick","given":"Matthew D."},{"family":"Vainsencher","given":"Amit"},{"family":"Villalonga","given":"Benjamin"},{"family":"White","given":"Theodore"},{"family":"Yao","given":"Z. Jamie"},{"family":"Yeh","given":"Ping"},{"family":"Zalcman","given":"Adam"},{"family":"Neven","given":"Hartmut"},{"family":"Martinis","given":"John M."}],"container-title":"Nature","id":"Arute2019","issue":"7779","issued":{"date-parts":[[2019]]},"page":"505-510","title":"Quantum supremacy using a programmable superconducting processor","type":"article-journal","volume":"574"}}],"isEdited":false,"manualOverride":{"citeprocText":"(Arute et al. 2019)","isManuallyOverridden":false,"manualOverrideText":""},"mendeley":{"formattedCitation":"(Arute et al. 2019)","plainTextFormattedCitation":"(Arute et al. 2019)","previouslyFormattedCitation":"(Arute et al. 2019)"},"properties":{"noteIndex":0},"schema":"https://github.com/citation-style-language/schema/raw/master/csl-citation.json"}</w:instrText>
       </w:r>
       <w:r>
         <w:fldChar w:fldCharType="separate"/>
@@ -5831,49 +5929,31 @@
         <w:fldChar w:fldCharType="end"/>
       </w:r>
       <w:r>
-        <w:t xml:space="preserve">, and cloud access made quantum experimentation widely available. Robotics researchers began to publish quantum and quantum-inspired studies of navigation </w:t>
-      </w:r>
-      <w:r>
-        <w:fldChar w:fldCharType="begin"/>
-      </w:r>
-      <w:r>
-        <w:instrText xml:space="preserve">ADDIN CSL_CITATION {"citationID":"MENDELEY_CITATION_72","citationItems":[{"id":"ITEM-71","isTemporary":false,"itemData":{"DOI":"10.1109/TMECH.2010.2090896","author":[{"family":"Dong","given":"Daoyi"},{"family":"Chen","given":"Chunlin"},{"family":"Chu","given":"Jian"},{"family":"Tarn","given":"Tzyh-Jong"}],"container-title":"IEEE/ASME Transactions on Mechatronics","id":"Dong2012","issue":"1","issued":{"date-parts":[[2012]]},"page":"86-97","publisher":"IEEE","title":"Robust quantum-inspired reinforcement learning for robot navigation","type":"article-journal","volume":"17"}},{"id":"ITEM-72","isTemporary":false,"itemData":{"DOI":"10.1109/ACCESS.2024.3417808","author":[{"family":"Hohenfeld","given":"Hans"},{"family":"Heimann","given":"Dirk"},{"family":"Wiebe","given":"Felix"},{"family":"Kirchner","given":"Frank"}],"container-title":"IEEE Access","id":"Hohenfeld2024","issued":{"date-parts":[[2024]]},"page":"87217-87236","publisher":"IEEE","title":"Quantum deep reinforcement learning for robot navigation tasks","type":"article-journal","volume":"12"}}],"isEdited":false,"manualOverride":{"citeprocText":"(Dong et al. 2012; Hohenfeld et al. 2024)","isManuallyOverridden":false,"manualOverrideText":""},"mendeley":{"formattedCitation":"(Dong et al. 2012; Hohenfeld et al. 2024)","plainTextFormattedCitation":"(Dong et al. 2012; Hohenfeld et al. 2024)","previouslyFormattedCitation":"(Dong et al. 2012; Hohenfeld et al. 2024)"},"properties":{"noteIndex":0},"schema":"https://github.com/citation-style-language/schema/raw/master/csl-citation.json"}</w:instrText>
-      </w:r>
-      <w:r>
-        <w:fldChar w:fldCharType="separate"/>
-      </w:r>
-      <w:r>
-        <w:t xml:space="preserve">(Dong et al. 2012; Hohenfeld et al. 2024)</w:t>
-      </w:r>
-      <w:r>
-        <w:fldChar w:fldCharType="end"/>
-      </w:r>
-      <w:r>
-        <w:t xml:space="preserve">, fleet routing </w:t>
-      </w:r>
-      <w:r>
-        <w:fldChar w:fldCharType="begin"/>
-      </w:r>
-      <w:r>
-        <w:instrText xml:space="preserve">ADDIN CSL_CITATION {"citationID":"MENDELEY_CITATION_74","citationItems":[{"id":"ITEM-73","isTemporary":false,"itemData":{"DOI":"10.3389/fcomp.2019.00009","author":[{"family":"Ohzeki","given":"Masayuki"},{"family":"Miki","given":"Akira"},{"family":"Miyama","given":"Masamichi J."},{"family":"Terabe","given":"Masayoshi"}],"container-title":"Frontiers in Computer Science","id":"Ohzeki2019","issued":{"date-parts":[[2019]]},"page":"9","publisher":"Frontiers Media","title":"Control of automated guided vehicles without collision by quantum annealer and digital devices","type":"article-journal","volume":"1"}},{"id":"ITEM-74","isTemporary":false,"itemData":{"DOI":"10.1145/3293320.3293333","author":[{"family":"Clark","given":"James"},{"family":"West","given":"Tristan"},{"family":"Zammit","given":"Joseph Paul"},{"family":"Guo","given":"Xiaohu"},{"family":"Mason","given":"Luke"},{"family":"Russell","given":"Duncan"}],"container-title":"Proceedings of the international conference on high performance computing in asia-pacific region (HPC Asia 2019)","id":"Clark2019","issued":{"date-parts":[[2019]]},"page":"111-119","publisher":"ACM","publisher-place":"New York, NY, USA","title":"Towards real time multi-robot routing using quantum computing technologies","type":"paper-conference"}}],"isEdited":false,"manualOverride":{"citeprocText":"(Ohzeki et al. 2019; Clark et al. 2019)","isManuallyOverridden":false,"manualOverrideText":""},"mendeley":{"formattedCitation":"(Ohzeki et al. 2019; Clark et al. 2019)","plainTextFormattedCitation":"(Ohzeki et al. 2019; Clark et al. 2019)","previouslyFormattedCitation":"(Ohzeki et al. 2019; Clark et al. 2019)"},"properties":{"noteIndex":0},"schema":"https://github.com/citation-style-language/schema/raw/master/csl-citation.json"}</w:instrText>
-      </w:r>
-      <w:r>
-        <w:fldChar w:fldCharType="separate"/>
-      </w:r>
-      <w:r>
-        <w:t xml:space="preserve">(Ohzeki et al. 2019; Clark et al. 2019)</w:t>
-      </w:r>
-      <w:r>
-        <w:fldChar w:fldCharType="end"/>
-      </w:r>
-      <w:r>
-        <w:t xml:space="preserve">, motion planning </w:t>
-      </w:r>
-      <w:r>
-        <w:fldChar w:fldCharType="begin"/>
-      </w:r>
-      <w:r>
-        <w:instrText xml:space="preserve">ADDIN CSL_CITATION {"citationID":"MENDELEY_CITATION_75","citationItems":[{"id":"ITEM-75","isTemporary":false,"itemData":{"DOI":"10.3390/math10142475","author":[{"family":"Chella","given":"Antonio"},{"family":"Gaglio","given":"Salvatore"},{"family":"Pilato","given":"Giovanni"},{"family":"Vella","given":"Filippo"},{"family":"Zammuto","given":"Salvatore"}],"container-title":"Mathematics","id":"Chella2022","issue":"14","issued":{"date-parts":[[2022]]},"page":"2475","publisher":"MDPI","title":"A quantum planner for robot motion","type":"article-journal","volume":"10"}}],"isEdited":false,"manualOverride":{"citeprocText":"(Chella et al. 2022)","isManuallyOverridden":false,"manualOverrideText":""},"mendeley":{"formattedCitation":"(Chella et al. 2022)","plainTextFormattedCitation":"(Chella et al. 2022)","previouslyFormattedCitation":"(Chella et al. 2022)"},"properties":{"noteIndex":0},"schema":"https://github.com/citation-style-language/schema/raw/master/csl-citation.json"}</w:instrText>
+        <w:t xml:space="preserve">. Quantum robotics then moved from concepts to experiments: annealers routed vehicles and robot fleets </w:t>
+      </w:r>
+      <w:r>
+        <w:fldChar w:fldCharType="begin"/>
+      </w:r>
+      <w:r>
+        <w:instrText xml:space="preserve">ADDIN CSL_CITATION {"citationID":"MENDELEY_CITATION_79","citationItems":[{"id":"ITEM-76","isTemporary":false,"itemData":{"DOI":"10.3389/fict.2017.00029","author":[{"family":"Neukart","given":"Florian"},{"family":"Compostella","given":"Gabriele"},{"family":"Seidel","given":"Christian"},{"dropping-particle":"von","family":"Dollen","given":"David"},{"family":"Yarkoni","given":"Sheir"},{"family":"Parney","given":"Bob"}],"container-title":"Frontiers in ICT","id":"Neukart2017","issued":{"date-parts":[[2017]]},"page":"29","title":"Traffic flow optimization using a quantum annealer","type":"article-journal","volume":"4"}},{"id":"ITEM-77","isTemporary":false,"itemData":{"DOI":"10.3389/fcomp.2019.00009","author":[{"family":"Ohzeki","given":"Masayuki"},{"family":"Miki","given":"Akira"},{"family":"Miyama","given":"Masamichi J."},{"family":"Terabe","given":"Masayoshi"}],"container-title":"Frontiers in Computer Science","id":"Ohzeki2019","issued":{"date-parts":[[2019]]},"page":"9","publisher":"Frontiers Media","title":"Control of automated guided vehicles without collision by quantum annealer and digital devices","type":"article-journal","volume":"1"}},{"id":"ITEM-78","isTemporary":false,"itemData":{"DOI":"10.1145/3293320.3293333","author":[{"family":"Clark","given":"James"},{"family":"West","given":"Tristan"},{"family":"Zammit","given":"Joseph Paul"},{"family":"Guo","given":"Xiaohu"},{"family":"Mason","given":"Luke"},{"family":"Russell","given":"Duncan"}],"container-title":"Proceedings of the international conference on high performance computing in asia-pacific region (HPC Asia 2019)","id":"Clark2019","issued":{"date-parts":[[2019]]},"page":"111-119","publisher":"ACM","publisher-place":"New York, NY, USA","title":"Towards real time multi-robot routing using quantum computing technologies","type":"paper-conference"}},{"id":"ITEM-79","isTemporary":false,"itemData":{"DOI":"10.1038/s41598-025-28481-w","author":[{"family":"Quang","given":"Thinh Nguyen"},{"family":"Matsuyama","given":"Kosuke"},{"family":"Shimizu","given":"Keisuke"},{"family":"Sugano","given":"Hiroki"},{"family":"Kurimoto","given":"Eiji"},{"family":"Miki","given":"Masahiro"},{"family":"Suzuki","given":"Jumpei"},{"family":"Chen","given":"Ziyi"},{"family":"Waidyasooriya","given":"Hasitha Muthumala"},{"family":"Hariyama","given":"Masanori"},{"family":"Hitomi","given":"Masaru"},{"family":"Sawamura","given":"Kenta"},{"family":"Ohzeki","given":"Masayuki"}],"container-title":"Scientific Reports","id":"Quang2025","issued":{"date-parts":[[2025]]},"page":"44047","publisher":"Nature Publishing Group","title":"Quantum annealing-based route optimization for commercial AGV operating systems in large-scale logistics warehouses","type":"article-journal","volume":"15"}}],"isEdited":false,"manualOverride":{"citeprocText":"(Neukart et al. 2017; Ohzeki et al. 2019; Clark et al. 2019; Quang et al. 2025)","isManuallyOverridden":false,"manualOverrideText":""},"mendeley":{"formattedCitation":"(Neukart et al. 2017; Ohzeki et al. 2019; Clark et al. 2019; Quang et al. 2025)","plainTextFormattedCitation":"(Neukart et al. 2017; Ohzeki et al. 2019; Clark et al. 2019; Quang et al. 2025)","previouslyFormattedCitation":"(Neukart et al. 2017; Ohzeki et al. 2019; Clark et al. 2019; Quang et al. 2025)"},"properties":{"noteIndex":0},"schema":"https://github.com/citation-style-language/schema/raw/master/csl-citation.json"}</w:instrText>
+      </w:r>
+      <w:r>
+        <w:fldChar w:fldCharType="separate"/>
+      </w:r>
+      <w:r>
+        <w:t xml:space="preserve">(Neukart et al. 2017; Ohzeki et al. 2019; Clark et al. 2019; Quang et al. 2025)</w:t>
+      </w:r>
+      <w:r>
+        <w:fldChar w:fldCharType="end"/>
+      </w:r>
+      <w:r>
+        <w:t xml:space="preserve">, gate-based circuits were applied to motion planning </w:t>
+      </w:r>
+      <w:r>
+        <w:fldChar w:fldCharType="begin"/>
+      </w:r>
+      <w:r>
+        <w:instrText xml:space="preserve">ADDIN CSL_CITATION {"citationID":"MENDELEY_CITATION_80","citationItems":[{"id":"ITEM-80","isTemporary":false,"itemData":{"DOI":"10.3390/math10142475","author":[{"family":"Chella","given":"Antonio"},{"family":"Gaglio","given":"Salvatore"},{"family":"Pilato","given":"Giovanni"},{"family":"Vella","given":"Filippo"},{"family":"Zammuto","given":"Salvatore"}],"container-title":"Mathematics","id":"Chella2022","issue":"14","issued":{"date-parts":[[2022]]},"page":"2475","publisher":"MDPI","title":"A quantum planner for robot motion","type":"article-journal","volume":"10"}}],"isEdited":false,"manualOverride":{"citeprocText":"(Chella et al. 2022)","isManuallyOverridden":false,"manualOverrideText":""},"mendeley":{"formattedCitation":"(Chella et al. 2022)","plainTextFormattedCitation":"(Chella et al. 2022)","previouslyFormattedCitation":"(Chella et al. 2022)"},"properties":{"noteIndex":0},"schema":"https://github.com/citation-style-language/schema/raw/master/csl-citation.json"}</w:instrText>
       </w:r>
       <w:r>
         <w:fldChar w:fldCharType="separate"/>
@@ -5891,7 +5971,7 @@
         <w:fldChar w:fldCharType="begin"/>
       </w:r>
       <w:r>
-        <w:instrText xml:space="preserve">ADDIN CSL_CITATION {"citationID":"MENDELEY_CITATION_76","citationItems":[{"id":"ITEM-76","isTemporary":false,"itemData":{"DOI":"10.1016/j.robot.2023.104362","author":[{"family":"Chella","given":"Antonio"},{"family":"Gaglio","given":"Salvatore"},{"family":"Mannone","given":"Maria"},{"family":"Pilato","given":"Giovanni"},{"family":"Seidita","given":"Valeria"},{"family":"Vella","given":"Filippo"},{"family":"Zammuto","given":"Salvatore"}],"container-title":"Robotics and Autonomous Systems","id":"Chella2023","issued":{"date-parts":[[2023]]},"page":"104362","publisher":"Elsevier","title":"Quantum planning for swarm robotics","type":"article-journal","volume":"161"}}],"isEdited":false,"manualOverride":{"citeprocText":"(Chella et al. 2023)","isManuallyOverridden":false,"manualOverrideText":""},"mendeley":{"formattedCitation":"(Chella et al. 2023)","plainTextFormattedCitation":"(Chella et al. 2023)","previouslyFormattedCitation":"(Chella et al. 2023)"},"properties":{"noteIndex":0},"schema":"https://github.com/citation-style-language/schema/raw/master/csl-citation.json"}</w:instrText>
+        <w:instrText xml:space="preserve">ADDIN CSL_CITATION {"citationID":"MENDELEY_CITATION_81","citationItems":[{"id":"ITEM-81","isTemporary":false,"itemData":{"DOI":"10.1016/j.robot.2023.104362","author":[{"family":"Chella","given":"Antonio"},{"family":"Gaglio","given":"Salvatore"},{"family":"Mannone","given":"Maria"},{"family":"Pilato","given":"Giovanni"},{"family":"Seidita","given":"Valeria"},{"family":"Vella","given":"Filippo"},{"family":"Zammuto","given":"Salvatore"}],"container-title":"Robotics and Autonomous Systems","id":"Chella2023","issued":{"date-parts":[[2023]]},"page":"104362","publisher":"Elsevier","title":"Quantum planning for swarm robotics","type":"article-journal","volume":"161"}}],"isEdited":false,"manualOverride":{"citeprocText":"(Chella et al. 2023)","isManuallyOverridden":false,"manualOverrideText":""},"mendeley":{"formattedCitation":"(Chella et al. 2023)","plainTextFormattedCitation":"(Chella et al. 2023)","previouslyFormattedCitation":"(Chella et al. 2023)"},"properties":{"noteIndex":0},"schema":"https://github.com/citation-style-language/schema/raw/master/csl-citation.json"}</w:instrText>
       </w:r>
       <w:r>
         <w:fldChar w:fldCharType="separate"/>
@@ -5909,7 +5989,7 @@
         <w:fldChar w:fldCharType="begin"/>
       </w:r>
       <w:r>
-        <w:instrText xml:space="preserve">ADDIN CSL_CITATION {"citationID":"MENDELEY_CITATION_77","citationItems":[{"id":"ITEM-77","isTemporary":false,"itemData":{"DOI":"10.1016/j.robot.2025.105026","author":[{"family":"Antero","given":"Unai"},{"family":"Sierra","given":"Basilio"},{"family":"Oñativia","given":"Jon"},{"family":"Ruiz","given":"Alejandra"},{"family":"Osaba","given":"Eneko"}],"container-title":"Robotics and Autonomous Systems","id":"Antero2025","issued":{"date-parts":[[2025]]},"page":"105026","publisher":"Elsevier","title":"Robot localization aided by quantum algorithms","type":"article-journal","volume":"192"}}],"isEdited":false,"manualOverride":{"citeprocText":"(Antero et al. 2025)","isManuallyOverridden":false,"manualOverrideText":""},"mendeley":{"formattedCitation":"(Antero et al. 2025)","plainTextFormattedCitation":"(Antero et al. 2025)","previouslyFormattedCitation":"(Antero et al. 2025)"},"properties":{"noteIndex":0},"schema":"https://github.com/citation-style-language/schema/raw/master/csl-citation.json"}</w:instrText>
+        <w:instrText xml:space="preserve">ADDIN CSL_CITATION {"citationID":"MENDELEY_CITATION_82","citationItems":[{"id":"ITEM-82","isTemporary":false,"itemData":{"DOI":"10.1016/j.robot.2025.105026","author":[{"family":"Antero","given":"Unai"},{"family":"Sierra","given":"Basilio"},{"family":"Oñativia","given":"Jon"},{"family":"Ruiz","given":"Alejandra"},{"family":"Osaba","given":"Eneko"}],"container-title":"Robotics and Autonomous Systems","id":"Antero2025","issued":{"date-parts":[[2025]]},"page":"105026","publisher":"Elsevier","title":"Robot localization aided by quantum algorithms","type":"article-journal","volume":"192"}}],"isEdited":false,"manualOverride":{"citeprocText":"(Antero et al. 2025)","isManuallyOverridden":false,"manualOverrideText":""},"mendeley":{"formattedCitation":"(Antero et al. 2025)","plainTextFormattedCitation":"(Antero et al. 2025)","previouslyFormattedCitation":"(Antero et al. 2025)"},"properties":{"noteIndex":0},"schema":"https://github.com/citation-style-language/schema/raw/master/csl-citation.json"}</w:instrText>
       </w:r>
       <w:r>
         <w:fldChar w:fldCharType="separate"/>
@@ -5921,13 +6001,13 @@
         <w:fldChar w:fldCharType="end"/>
       </w:r>
       <w:r>
-        <w:t xml:space="preserve">, and kinematics </w:t>
-      </w:r>
-      <w:r>
-        <w:fldChar w:fldCharType="begin"/>
-      </w:r>
-      <w:r>
-        <w:instrText xml:space="preserve">ADDIN CSL_CITATION {"citationID":"MENDELEY_CITATION_78","citationItems":[{"id":"ITEM-78","isTemporary":false,"itemData":{"DOI":"10.1038/s41598-025-12109-0","author":[{"family":"Otani","given":"Takuya"},{"family":"Takanishi","given":"Atsuo"},{"family":"Hara","given":"Nobuyuki"},{"family":"Takita","given":"Yutaka"},{"family":"Kimura","given":"Koichi"}],"container-title":"Scientific Reports","id":"Otani2025","issued":{"date-parts":[[2025]]},"page":"28508","publisher":"Nature Publishing Group","title":"Quantum computation for robot posture optimization","type":"article-journal","volume":"15"}}],"isEdited":false,"manualOverride":{"citeprocText":"(Otani et al. 2025)","isManuallyOverridden":false,"manualOverrideText":""},"mendeley":{"formattedCitation":"(Otani et al. 2025)","plainTextFormattedCitation":"(Otani et al. 2025)","previouslyFormattedCitation":"(Otani et al. 2025)"},"properties":{"noteIndex":0},"schema":"https://github.com/citation-style-language/schema/raw/master/csl-citation.json"}</w:instrText>
+        <w:t xml:space="preserve">, kinematics </w:t>
+      </w:r>
+      <w:r>
+        <w:fldChar w:fldCharType="begin"/>
+      </w:r>
+      <w:r>
+        <w:instrText xml:space="preserve">ADDIN CSL_CITATION {"citationID":"MENDELEY_CITATION_83","citationItems":[{"id":"ITEM-83","isTemporary":false,"itemData":{"DOI":"10.1038/s41598-025-12109-0","author":[{"family":"Otani","given":"Takuya"},{"family":"Takanishi","given":"Atsuo"},{"family":"Hara","given":"Nobuyuki"},{"family":"Takita","given":"Yutaka"},{"family":"Kimura","given":"Koichi"}],"container-title":"Scientific Reports","id":"Otani2025","issued":{"date-parts":[[2025]]},"page":"28508","publisher":"Nature Publishing Group","title":"Quantum computation for robot posture optimization","type":"article-journal","volume":"15"}}],"isEdited":false,"manualOverride":{"citeprocText":"(Otani et al. 2025)","isManuallyOverridden":false,"manualOverrideText":""},"mendeley":{"formattedCitation":"(Otani et al. 2025)","plainTextFormattedCitation":"(Otani et al. 2025)","previouslyFormattedCitation":"(Otani et al. 2025)"},"properties":{"noteIndex":0},"schema":"https://github.com/citation-style-language/schema/raw/master/csl-citation.json"}</w:instrText>
       </w:r>
       <w:r>
         <w:fldChar w:fldCharType="separate"/>
@@ -5939,19 +6019,94 @@
         <w:fldChar w:fldCharType="end"/>
       </w:r>
       <w:r>
-        <w:t xml:space="preserve">, alongside rapid progress in quantum sensing for navigation </w:t>
-      </w:r>
-      <w:r>
-        <w:fldChar w:fldCharType="begin"/>
-      </w:r>
-      <w:r>
-        <w:instrText xml:space="preserve">ADDIN CSL_CITATION {"citationID":"MENDELEY_CITATION_79","citationItems":[{"id":"ITEM-79","isTemporary":false,"itemData":{"DOI":"10.48550/arXiv.2504.08167","URL":"https://arxiv.org/abs/2504.08167","author":[{"family":"Muradoglu","given":"Murat"},{"family":"Johnsson","given":"Mattias T."},{"family":"Wilson","given":"Nathanial M."},{"family":"Cohen","given":"Yuval"},{"family":"Shin","given":"Dongki"},{"family":"Navickas","given":"Tomas"},{"family":"Pyragius","given":"Tadas"},{"family":"Thomas","given":"Divya"},{"family":"Thompson","given":"Daniel"},{"family":"Moore","given":"Steven I."},{"family":"Rahman","given":"Md Tanvir"},{"family":"Walker","given":"Adrian"},{"family":"Dutta","given":"Indranil"},{"family":"Bijjahalli","given":"Suraj"},{"family":"Berlocher","given":"Jacob"},{"family":"Hush","given":"Michael R."},{"family":"Anderson","given":"Russell P."},{"family":"Szigeti","given":"Stuart S."},{"family":"Biercuk","given":"Michael J."}],"id":"Muradoglu2025","issued":{"date-parts":[[2025]]},"title":"Quantum-assured magnetic navigation achieves positioning accuracy better than a strategic-grade INS in airborne and ground-based field trials","type":""}}],"isEdited":false,"manualOverride":{"citeprocText":"(Muradoglu et al. 2025)","isManuallyOverridden":false,"manualOverrideText":""},"mendeley":{"formattedCitation":"(Muradoglu et al. 2025)","plainTextFormattedCitation":"(Muradoglu et al. 2025)","previouslyFormattedCitation":"(Muradoglu et al. 2025)"},"properties":{"noteIndex":0},"schema":"https://github.com/citation-style-language/schema/raw/master/csl-citation.json"}</w:instrText>
+        <w:t xml:space="preserve">, and navigation learning </w:t>
+      </w:r>
+      <w:r>
+        <w:fldChar w:fldCharType="begin"/>
+      </w:r>
+      <w:r>
+        <w:instrText xml:space="preserve">ADDIN CSL_CITATION {"citationID":"MENDELEY_CITATION_84","citationItems":[{"id":"ITEM-84","isTemporary":false,"itemData":{"DOI":"10.1109/ACCESS.2024.3417808","author":[{"family":"Hohenfeld","given":"Hans"},{"family":"Heimann","given":"Dirk"},{"family":"Wiebe","given":"Felix"},{"family":"Kirchner","given":"Frank"}],"container-title":"IEEE Access","id":"Hohenfeld2024","issued":{"date-parts":[[2024]]},"page":"87217-87236","publisher":"IEEE","title":"Quantum deep reinforcement learning for robot navigation tasks","type":"article-journal","volume":"12"}}],"isEdited":false,"manualOverride":{"citeprocText":"(Hohenfeld et al. 2024)","isManuallyOverridden":false,"manualOverrideText":""},"mendeley":{"formattedCitation":"(Hohenfeld et al. 2024)","plainTextFormattedCitation":"(Hohenfeld et al. 2024)","previouslyFormattedCitation":"(Hohenfeld et al. 2024)"},"properties":{"noteIndex":0},"schema":"https://github.com/citation-style-language/schema/raw/master/csl-citation.json"}</w:instrText>
+      </w:r>
+      <w:r>
+        <w:fldChar w:fldCharType="separate"/>
+      </w:r>
+      <w:r>
+        <w:t xml:space="preserve">(Hohenfeld et al. 2024)</w:t>
+      </w:r>
+      <w:r>
+        <w:fldChar w:fldCharType="end"/>
+      </w:r>
+      <w:r>
+        <w:t xml:space="preserve">, drones carried entanglement and quantum keys </w:t>
+      </w:r>
+      <w:r>
+        <w:fldChar w:fldCharType="begin"/>
+      </w:r>
+      <w:r>
+        <w:instrText xml:space="preserve">ADDIN CSL_CITATION {"citationID":"MENDELEY_CITATION_86","citationItems":[{"id":"ITEM-85","isTemporary":false,"itemData":{"DOI":"10.1103/PhysRevLett.126.020503","author":[{"family":"Liu","given":"Hua-Ying"},{"family":"Tian","given":"Xiao-Hui"},{"family":"Gu","given":"Changsheng"},{"family":"Fan","given":"Pengfei"},{"family":"Ni","given":"Xin"},{"family":"Yang","given":"Ran"},{"family":"Zhang","given":"Ji-Ning"},{"family":"Hu","given":"Mingzhe"},{"family":"Guo","given":"Jian"},{"family":"Cao","given":"Xun"},{"family":"Hu","given":"Xiaopeng"},{"family":"Zhao","given":"Gang"},{"family":"Lu","given":"Yan-Qing"},{"family":"Gong","given":"Yan-Xiao"},{"family":"Xie","given":"Zhenda"},{"family":"Zhu","given":"Shi-Ning"}],"container-title":"Physical Review Letters","id":"Liu2021","issued":{"date-parts":[[2021]]},"page":"020503","title":"Optical-relayed entanglement distribution using drones as mobile nodes","type":"article-journal","volume":"126"}},{"id":"ITEM-86","isTemporary":false,"itemData":{"DOI":"10.1103/PhysRevLett.133.200801","author":[{"family":"Tian","given":"Xiao-Hui"},{"family":"Yang","given":"Ran"},{"family":"Liu","given":"Hua-Ying"},{"family":"Fan","given":"Pengfei"},{"family":"Zhang","given":"Ji-Ning"},{"family":"Gu","given":"Changsheng"},{"family":"Chen","given":"Mengwen"},{"family":"Hu","given":"Mingzhe"},{"family":"Lu","given":"Feng-Yu"},{"family":"Yin","given":"Zhen-Qiang"},{"family":"Yin","given":"Zhi-Jun"},{"family":"Yuan","given":"Mo"},{"family":"Wang","given":"Shuang"},{"family":"Chen","given":"Wei"},{"family":"Gong","given":"Yan-Xiao"},{"family":"Zhu","given":"Shi-Ning"},{"family":"Xie","given":"Zhenda"}],"container-title":"Physical Review Letters","id":"Tian2023","issue":"20","issued":{"date-parts":[[2024]]},"page":"200801","publisher":"American Physical Society","title":"Experimental demonstration of drone-based quantum key distribution","type":"article-journal","volume":"133"}}],"isEdited":false,"manualOverride":{"citeprocText":"(Liu et al. 2021; Tian et al. 2024)","isManuallyOverridden":false,"manualOverrideText":""},"mendeley":{"formattedCitation":"(Liu et al. 2021; Tian et al. 2024)","plainTextFormattedCitation":"(Liu et al. 2021; Tian et al. 2024)","previouslyFormattedCitation":"(Liu et al. 2021; Tian et al. 2024)"},"properties":{"noteIndex":0},"schema":"https://github.com/citation-style-language/schema/raw/master/csl-citation.json"}</w:instrText>
+      </w:r>
+      <w:r>
+        <w:fldChar w:fldCharType="separate"/>
+      </w:r>
+      <w:r>
+        <w:t xml:space="preserve">(Liu et al. 2021; Tian et al. 2024)</w:t>
+      </w:r>
+      <w:r>
+        <w:fldChar w:fldCharType="end"/>
+      </w:r>
+      <w:r>
+        <w:t xml:space="preserve">, quantum magnetometers navigated aircraft without GNSS </w:t>
+      </w:r>
+      <w:r>
+        <w:fldChar w:fldCharType="begin"/>
+      </w:r>
+      <w:r>
+        <w:instrText xml:space="preserve">ADDIN CSL_CITATION {"citationID":"MENDELEY_CITATION_87","citationItems":[{"id":"ITEM-87","isTemporary":false,"itemData":{"DOI":"10.48550/arXiv.2504.08167","URL":"https://arxiv.org/abs/2504.08167","author":[{"family":"Muradoglu","given":"Murat"},{"family":"Johnsson","given":"Mattias T."},{"family":"Wilson","given":"Nathanial M."},{"family":"Cohen","given":"Yuval"},{"family":"Shin","given":"Dongki"},{"family":"Navickas","given":"Tomas"},{"family":"Pyragius","given":"Tadas"},{"family":"Thomas","given":"Divya"},{"family":"Thompson","given":"Daniel"},{"family":"Moore","given":"Steven I."},{"family":"Rahman","given":"Md Tanvir"},{"family":"Walker","given":"Adrian"},{"family":"Dutta","given":"Indranil"},{"family":"Bijjahalli","given":"Suraj"},{"family":"Berlocher","given":"Jacob"},{"family":"Hush","given":"Michael R."},{"family":"Anderson","given":"Russell P."},{"family":"Szigeti","given":"Stuart S."},{"family":"Biercuk","given":"Michael J."}],"id":"Muradoglu2025","issued":{"date-parts":[[2025]]},"title":"Quantum-assured magnetic navigation achieves positioning accuracy better than a strategic-grade INS in airborne and ground-based field trials","type":""}}],"isEdited":false,"manualOverride":{"citeprocText":"(Muradoglu et al. 2025)","isManuallyOverridden":false,"manualOverrideText":""},"mendeley":{"formattedCitation":"(Muradoglu et al. 2025)","plainTextFormattedCitation":"(Muradoglu et al. 2025)","previouslyFormattedCitation":"(Muradoglu et al. 2025)"},"properties":{"noteIndex":0},"schema":"https://github.com/citation-style-language/schema/raw/master/csl-citation.json"}</w:instrText>
       </w:r>
       <w:r>
         <w:fldChar w:fldCharType="separate"/>
       </w:r>
       <w:r>
         <w:t xml:space="preserve">(Muradoglu et al. 2025)</w:t>
+      </w:r>
+      <w:r>
+        <w:fldChar w:fldCharType="end"/>
+      </w:r>
+      <w:r>
+        <w:t xml:space="preserve">, and, most recently, quantum policies reached a physical control system </w:t>
+      </w:r>
+      <w:r>
+        <w:fldChar w:fldCharType="begin"/>
+      </w:r>
+      <w:r>
+        <w:instrText xml:space="preserve">ADDIN CSL_CITATION {"citationID":"MENDELEY_CITATION_88","citationItems":[{"id":"ITEM-88","isTemporary":false,"itemData":{"URL":"https://arxiv.org/abs/2508.01690","author":[{"family":"Sun","given":"Yize"},{"family":"Hagog","given":"Mohamad"},{"family":"Weber","given":"Marc"},{"family":"Hein","given":"Daniel"},{"family":"Udluft","given":"Steffen"},{"family":"Tresp","given":"Volker"},{"family":"Ma","given":"Yunpu"}],"id":"Sun2025","issued":{"date-parts":[[2025]]},"note":"QML@QCE 2025 workshop","title":"First experience with real-time control using simulated VQC-based quantum policies","type":""}}],"isEdited":false,"manualOverride":{"citeprocText":"(Sun et al. 2025)","isManuallyOverridden":false,"manualOverrideText":""},"mendeley":{"formattedCitation":"(Sun et al. 2025)","plainTextFormattedCitation":"(Sun et al. 2025)","previouslyFormattedCitation":"(Sun et al. 2025)"},"properties":{"noteIndex":0},"schema":"https://github.com/citation-style-language/schema/raw/master/csl-citation.json"}</w:instrText>
+      </w:r>
+      <w:r>
+        <w:fldChar w:fldCharType="separate"/>
+      </w:r>
+      <w:r>
+        <w:t xml:space="preserve">(Sun et al. 2025)</w:t>
+      </w:r>
+      <w:r>
+        <w:fldChar w:fldCharType="end"/>
+      </w:r>
+      <w:r>
+        <w:t xml:space="preserve"> </w:t>
+      </w:r>
+      <w:r>
+        <w:t xml:space="preserve">and a QPU was placed inside a control loop </w:t>
+      </w:r>
+      <w:r>
+        <w:fldChar w:fldCharType="begin"/>
+      </w:r>
+      <w:r>
+        <w:instrText xml:space="preserve">ADDIN CSL_CITATION {"citationID":"MENDELEY_CITATION_89","citationItems":[{"id":"ITEM-89","isTemporary":false,"itemData":{"URL":"https://arxiv.org/abs/2605.01716","author":[{"family":"Ngo","given":"Nguyen Truong Thu"},{"family":"Mehtola","given":"Väinö"},{"family":"Lenssen","given":"Jérome"},{"family":"Wang","given":"Peiyong"},{"family":"Cosco","given":"Francesco"},{"family":"Lu","given":"Tien-Fu"},{"family":"Quach","given":"James Q."}],"id":"Ngo2026","issued":{"date-parts":[[2026]]},"title":"Towards real-time control of a CartPole system on a quantum computer","type":""}}],"isEdited":false,"manualOverride":{"citeprocText":"(Ngo et al. 2026)","isManuallyOverridden":false,"manualOverrideText":""},"mendeley":{"formattedCitation":"(Ngo et al. 2026)","plainTextFormattedCitation":"(Ngo et al. 2026)","previouslyFormattedCitation":"(Ngo et al. 2026)"},"properties":{"noteIndex":0},"schema":"https://github.com/citation-style-language/schema/raw/master/csl-citation.json"}</w:instrText>
+      </w:r>
+      <w:r>
+        <w:fldChar w:fldCharType="separate"/>
+      </w:r>
+      <w:r>
+        <w:t xml:space="preserve">(Ngo et al. 2026)</w:t>
       </w:r>
       <w:r>
         <w:fldChar w:fldCharType="end"/>
@@ -5967,7 +6122,7 @@
       <w:r>
         <w:drawing>
           <wp:inline>
-            <wp:extent cx="5334000" cy="4086054"/>
+            <wp:extent cx="5334000" cy="6577664"/>
             <wp:effectExtent b="0" l="0" r="0" t="0"/>
             <wp:docPr descr="" title="" id="30" name="Picture"/>
             <a:graphic>
@@ -5988,7 +6143,7 @@
                   <pic:spPr bwMode="auto">
                     <a:xfrm>
                       <a:off x="0" y="0"/>
-                      <a:ext cx="5334000" cy="4086054"/>
+                      <a:ext cx="5334000" cy="6577664"/>
                     </a:xfrm>
                     <a:prstGeom prst="rect">
                       <a:avLst/>
@@ -6022,7 +6177,7 @@
         <w:t xml:space="preserve"> </w:t>
       </w:r>
       <w:r>
-        <w:t xml:space="preserve">Timeline of quantum computing and quantum robotics milestones, 1982–2026, across the four eras used in this survey.</w:t>
+        <w:t xml:space="preserve">Evolution of quantum computing and quantum robotics, 1982–2026, across the four eras used in this survey. Robotics milestones are colored by technology: quantum computation, quantum-inspired classical computation, quantum sensing, and quantum communication.</w:t>
       </w:r>
     </w:p>
     <w:bookmarkEnd w:id="32"/>
@@ -6056,7 +6211,7 @@
         <w:fldChar w:fldCharType="begin"/>
       </w:r>
       <w:r>
-        <w:instrText xml:space="preserve">ADDIN CSL_CITATION {"citationID":"MENDELEY_CITATION_80","citationItems":[{"id":"ITEM-80","isTemporary":false,"itemData":{"DOI":"10.1136/bmj.n71","author":[{"family":"Page","given":"Matthew J."},{"family":"McKenzie","given":"Joanne E."},{"family":"Bossuyt","given":"Patrick M."},{"family":"Boutron","given":"Isabelle"},{"family":"Hoffmann","given":"Tammy C."},{"family":"Mulrow","given":"Cynthia D."},{"family":"Shamseer","given":"Larissa"},{"family":"Tetzlaff","given":"Jennifer M."},{"family":"Akl","given":"Elie A."},{"family":"Brennan","given":"Sue E."},{"family":"Chou","given":"Roger"},{"family":"Glanville","given":"Julie"},{"family":"Grimshaw","given":"Jeremy M."},{"family":"Hróbjartsson","given":"Asbjørn"},{"family":"Lalu","given":"Manoj M."},{"family":"Li","given":"Tianjing"},{"family":"Loder","given":"Elizabeth W."},{"family":"Mayo-Wilson","given":"Evan"},{"family":"McDonald","given":"Steve"},{"family":"McGuinness","given":"Luke A."},{"family":"Stewart","given":"Lesley A."},{"family":"Thomas","given":"James"},{"family":"Tricco","given":"Andrea C."},{"family":"Welch","given":"Vivian A."},{"family":"Whiting","given":"Penny"},{"family":"Moher","given":"David"}],"container-title":"BMJ","id":"Page2021","issued":{"date-parts":[[2021]]},"page":"n71","publisher":"BMJ Publishing Group","title":"The PRISMA 2020 statement: An updated guideline for reporting systematic reviews","title-short":"The PRISMA 2020 statement","type":"article-journal","volume":"372"}}],"isEdited":false,"manualOverride":{"citeprocText":"(Page et al. 2021)","isManuallyOverridden":false,"manualOverrideText":""},"mendeley":{"formattedCitation":"(Page et al. 2021)","plainTextFormattedCitation":"(Page et al. 2021)","previouslyFormattedCitation":"(Page et al. 2021)"},"properties":{"noteIndex":0},"schema":"https://github.com/citation-style-language/schema/raw/master/csl-citation.json"}</w:instrText>
+        <w:instrText xml:space="preserve">ADDIN CSL_CITATION {"citationID":"MENDELEY_CITATION_90","citationItems":[{"id":"ITEM-90","isTemporary":false,"itemData":{"DOI":"10.1136/bmj.n71","author":[{"family":"Page","given":"Matthew J."},{"family":"McKenzie","given":"Joanne E."},{"family":"Bossuyt","given":"Patrick M."},{"family":"Boutron","given":"Isabelle"},{"family":"Hoffmann","given":"Tammy C."},{"family":"Mulrow","given":"Cynthia D."},{"family":"Shamseer","given":"Larissa"},{"family":"Tetzlaff","given":"Jennifer M."},{"family":"Akl","given":"Elie A."},{"family":"Brennan","given":"Sue E."},{"family":"Chou","given":"Roger"},{"family":"Glanville","given":"Julie"},{"family":"Grimshaw","given":"Jeremy M."},{"family":"Hróbjartsson","given":"Asbjørn"},{"family":"Lalu","given":"Manoj M."},{"family":"Li","given":"Tianjing"},{"family":"Loder","given":"Elizabeth W."},{"family":"Mayo-Wilson","given":"Evan"},{"family":"McDonald","given":"Steve"},{"family":"McGuinness","given":"Luke A."},{"family":"Stewart","given":"Lesley A."},{"family":"Thomas","given":"James"},{"family":"Tricco","given":"Andrea C."},{"family":"Welch","given":"Vivian A."},{"family":"Whiting","given":"Penny"},{"family":"Moher","given":"David"}],"container-title":"BMJ","id":"Page2021","issued":{"date-parts":[[2021]]},"page":"n71","publisher":"BMJ Publishing Group","title":"The PRISMA 2020 statement: An updated guideline for reporting systematic reviews","title-short":"The PRISMA 2020 statement","type":"article-journal","volume":"372"}}],"isEdited":false,"manualOverride":{"citeprocText":"(Page et al. 2021)","isManuallyOverridden":false,"manualOverrideText":""},"mendeley":{"formattedCitation":"(Page et al. 2021)","plainTextFormattedCitation":"(Page et al. 2021)","previouslyFormattedCitation":"(Page et al. 2021)"},"properties":{"noteIndex":0},"schema":"https://github.com/citation-style-language/schema/raw/master/csl-citation.json"}</w:instrText>
       </w:r>
       <w:r>
         <w:fldChar w:fldCharType="separate"/>
@@ -6080,7 +6235,7 @@
         <w:fldChar w:fldCharType="begin"/>
       </w:r>
       <w:r>
-        <w:instrText xml:space="preserve">ADDIN CSL_CITATION {"citationID":"MENDELEY_CITATION_81","citationItems":[{"id":"ITEM-81","isTemporary":false,"itemData":{"author":[{"family":"Kitchenham","given":"Barbara"},{"family":"Charters","given":"Stuart"}],"genre":"EBSE Technical Report","id":"Kitchenham2007","issued":{"date-parts":[[2007]]},"note":"Version 2.3","number":"EBSE-2007-01","publisher":"Keele University; Durham University","title":"Guidelines for performing systematic literature reviews in software engineering","type":"report"},"suppress-author":false}],"isEdited":false,"manualOverride":{"citeprocText":"Kitchenham and Charters (2007)","isManuallyOverridden":false,"manualOverrideText":""},"mendeley":{"formattedCitation":"Kitchenham and Charters (2007)","plainTextFormattedCitation":"Kitchenham and Charters (2007)","previouslyFormattedCitation":"Kitchenham and Charters (2007)"},"properties":{"noteIndex":0},"schema":"https://github.com/citation-style-language/schema/raw/master/csl-citation.json"}</w:instrText>
+        <w:instrText xml:space="preserve">ADDIN CSL_CITATION {"citationID":"MENDELEY_CITATION_91","citationItems":[{"id":"ITEM-91","isTemporary":false,"itemData":{"author":[{"family":"Kitchenham","given":"Barbara"},{"family":"Charters","given":"Stuart"}],"genre":"EBSE Technical Report","id":"Kitchenham2007","issued":{"date-parts":[[2007]]},"note":"Version 2.3","number":"EBSE-2007-01","publisher":"Keele University; Durham University","title":"Guidelines for performing systematic literature reviews in software engineering","type":"report"},"suppress-author":false}],"isEdited":false,"manualOverride":{"citeprocText":"Kitchenham and Charters (2007)","isManuallyOverridden":false,"manualOverrideText":""},"mendeley":{"formattedCitation":"Kitchenham and Charters (2007)","plainTextFormattedCitation":"Kitchenham and Charters (2007)","previouslyFormattedCitation":"Kitchenham and Charters (2007)"},"properties":{"noteIndex":0},"schema":"https://github.com/citation-style-language/schema/raw/master/csl-citation.json"}</w:instrText>
       </w:r>
       <w:r>
         <w:fldChar w:fldCharType="separate"/>
@@ -6256,7 +6411,7 @@
         <w:fldChar w:fldCharType="begin"/>
       </w:r>
       <w:r>
-        <w:instrText xml:space="preserve">ADDIN CSL_CITATION {"citationID":"MENDELEY_CITATION_85","citationItems":[{"id":"ITEM-82","isTemporary":false,"itemData":{"DOI":"10.1109/ICRA.2019.8793768","author":[{"family":"Petschnigg","given":"Christina"},{"family":"Brandstötter","given":"Mathias"},{"family":"Pichler","given":"Horst"},{"family":"Hofbaur","given":"Michael W."},{"family":"Dieber","given":"Bernhard"}],"container-title":"Proceedings of the 2019 international conference on robotics and automation (ICRA)","id":"Petschnigg2019","issued":{"date-parts":[[2019]]},"page":"803-810","publisher":"IEEE","title":"Quantum computation in robotic science and applications","type":"paper-conference"}},{"id":"ITEM-83","isTemporary":false,"itemData":{"DOI":"10.1007/s42484-024-00225-5","author":[{"family":"Yan","given":"Fei"},{"family":"Iliyasu","given":"Abdullah M."},{"family":"Li","given":"Nianqiao"},{"family":"Salama","given":"Ahmed S."},{"family":"Hirota","given":"Kaoru"}],"container-title":"Quantum Machine Intelligence","id":"Yan2024","issue":"2","issued":{"date-parts":[[2024]]},"page":"86","publisher":"Springer","title":"Quantum robotics: A review of emerging trends","title-short":"Quantum robotics","type":"article-journal","volume":"6"}},{"id":"ITEM-84","isTemporary":false,"itemData":{"DOI":"10.2200/S00746ED1V01Y201612QMC010","author":[{"family":"Tandon","given":"Prateek"},{"family":"Lam","given":"Stanley"},{"family":"Shih","given":"Ben"},{"family":"Mehta","given":"Tanay"},{"family":"Mitev","given":"Alex"},{"family":"Ong","given":"Zhiyang"}],"collection-title":"Synthesis lectures on quantum computing","id":"Tandon2017","issued":{"date-parts":[[2017]]},"publisher":"Morgan &amp; Claypool Publishers","title":"Quantum robotics: A primer on current science and future perspectives","title-short":"Quantum robotics","type":"book"}},{"id":"ITEM-85","isTemporary":false,"itemData":{"URL":"https://arxiv.org/abs/2211.03464","author":[{"family":"Meyer","given":"Nico"},{"family":"Ufrecht","given":"Christian"},{"family":"Periyasamy","given":"Maniraman"},{"family":"Scherer","given":"Daniel D."},{"family":"Plinge","given":"Axel"},{"family":"Mutschler","given":"Christopher"}],"id":"Meyer2022","issued":{"date-parts":[[2022]]},"title":"A survey on quantum reinforcement learning","type":""}}],"isEdited":false,"manualOverride":{"citeprocText":"(Petschnigg et al. 2019; Yan et al. 2024; Tandon et al. 2017; Meyer et al. 2022)","isManuallyOverridden":false,"manualOverrideText":""},"mendeley":{"formattedCitation":"(Petschnigg et al. 2019; Yan et al. 2024; Tandon et al. 2017; Meyer et al. 2022)","plainTextFormattedCitation":"(Petschnigg et al. 2019; Yan et al. 2024; Tandon et al. 2017; Meyer et al. 2022)","previouslyFormattedCitation":"(Petschnigg et al. 2019; Yan et al. 2024; Tandon et al. 2017; Meyer et al. 2022)"},"properties":{"noteIndex":0},"schema":"https://github.com/citation-style-language/schema/raw/master/csl-citation.json"}</w:instrText>
+        <w:instrText xml:space="preserve">ADDIN CSL_CITATION {"citationID":"MENDELEY_CITATION_95","citationItems":[{"id":"ITEM-92","isTemporary":false,"itemData":{"DOI":"10.1109/ICRA.2019.8793768","author":[{"family":"Petschnigg","given":"Christina"},{"family":"Brandstötter","given":"Mathias"},{"family":"Pichler","given":"Horst"},{"family":"Hofbaur","given":"Michael W."},{"family":"Dieber","given":"Bernhard"}],"container-title":"Proceedings of the 2019 international conference on robotics and automation (ICRA)","id":"Petschnigg2019","issued":{"date-parts":[[2019]]},"page":"803-810","publisher":"IEEE","title":"Quantum computation in robotic science and applications","type":"paper-conference"}},{"id":"ITEM-93","isTemporary":false,"itemData":{"DOI":"10.1007/s42484-024-00225-5","author":[{"family":"Yan","given":"Fei"},{"family":"Iliyasu","given":"Abdullah M."},{"family":"Li","given":"Nianqiao"},{"family":"Salama","given":"Ahmed S."},{"family":"Hirota","given":"Kaoru"}],"container-title":"Quantum Machine Intelligence","id":"Yan2024","issue":"2","issued":{"date-parts":[[2024]]},"page":"86","publisher":"Springer","title":"Quantum robotics: A review of emerging trends","title-short":"Quantum robotics","type":"article-journal","volume":"6"}},{"id":"ITEM-94","isTemporary":false,"itemData":{"DOI":"10.2200/S00746ED1V01Y201612QMC010","author":[{"family":"Tandon","given":"Prateek"},{"family":"Lam","given":"Stanley"},{"family":"Shih","given":"Ben"},{"family":"Mehta","given":"Tanay"},{"family":"Mitev","given":"Alex"},{"family":"Ong","given":"Zhiyang"}],"collection-title":"Synthesis lectures on quantum computing","id":"Tandon2017","issued":{"date-parts":[[2017]]},"publisher":"Morgan &amp; Claypool Publishers","title":"Quantum robotics: A primer on current science and future perspectives","title-short":"Quantum robotics","type":"book"}},{"id":"ITEM-95","isTemporary":false,"itemData":{"URL":"https://arxiv.org/abs/2211.03464","author":[{"family":"Meyer","given":"Nico"},{"family":"Ufrecht","given":"Christian"},{"family":"Periyasamy","given":"Maniraman"},{"family":"Scherer","given":"Daniel D."},{"family":"Plinge","given":"Axel"},{"family":"Mutschler","given":"Christopher"}],"id":"Meyer2022","issued":{"date-parts":[[2022]]},"title":"A survey on quantum reinforcement learning","type":""}}],"isEdited":false,"manualOverride":{"citeprocText":"(Petschnigg et al. 2019; Yan et al. 2024; Tandon et al. 2017; Meyer et al. 2022)","isManuallyOverridden":false,"manualOverrideText":""},"mendeley":{"formattedCitation":"(Petschnigg et al. 2019; Yan et al. 2024; Tandon et al. 2017; Meyer et al. 2022)","plainTextFormattedCitation":"(Petschnigg et al. 2019; Yan et al. 2024; Tandon et al. 2017; Meyer et al. 2022)","previouslyFormattedCitation":"(Petschnigg et al. 2019; Yan et al. 2024; Tandon et al. 2017; Meyer et al. 2022)"},"properties":{"noteIndex":0},"schema":"https://github.com/citation-style-language/schema/raw/master/csl-citation.json"}</w:instrText>
       </w:r>
       <w:r>
         <w:fldChar w:fldCharType="separate"/>
@@ -6470,7 +6625,7 @@
         <w:fldChar w:fldCharType="begin"/>
       </w:r>
       <w:r>
-        <w:instrText xml:space="preserve">ADDIN CSL_CITATION {"citationID":"MENDELEY_CITATION_86","citationItems":[{"id":"ITEM-86","isTemporary":false,"itemData":{"DOI":"10.1109/ACCESS.2024.3417808","author":[{"family":"Hohenfeld","given":"Hans"},{"family":"Heimann","given":"Dirk"},{"family":"Wiebe","given":"Felix"},{"family":"Kirchner","given":"Frank"}],"container-title":"IEEE Access","id":"Hohenfeld2024","issued":{"date-parts":[[2024]]},"page":"87217-87236","publisher":"IEEE","title":"Quantum deep reinforcement learning for robot navigation tasks","type":"article-journal","volume":"12"},"suppress-author":false}],"isEdited":false,"manualOverride":{"citeprocText":"Hohenfeld et al. (2024)","isManuallyOverridden":false,"manualOverrideText":""},"mendeley":{"formattedCitation":"Hohenfeld et al. (2024)","plainTextFormattedCitation":"Hohenfeld et al. (2024)","previouslyFormattedCitation":"Hohenfeld et al. (2024)"},"properties":{"noteIndex":0},"schema":"https://github.com/citation-style-language/schema/raw/master/csl-citation.json"}</w:instrText>
+        <w:instrText xml:space="preserve">ADDIN CSL_CITATION {"citationID":"MENDELEY_CITATION_96","citationItems":[{"id":"ITEM-96","isTemporary":false,"itemData":{"DOI":"10.1109/ACCESS.2024.3417808","author":[{"family":"Hohenfeld","given":"Hans"},{"family":"Heimann","given":"Dirk"},{"family":"Wiebe","given":"Felix"},{"family":"Kirchner","given":"Frank"}],"container-title":"IEEE Access","id":"Hohenfeld2024","issued":{"date-parts":[[2024]]},"page":"87217-87236","publisher":"IEEE","title":"Quantum deep reinforcement learning for robot navigation tasks","type":"article-journal","volume":"12"},"suppress-author":false}],"isEdited":false,"manualOverride":{"citeprocText":"Hohenfeld et al. (2024)","isManuallyOverridden":false,"manualOverrideText":""},"mendeley":{"formattedCitation":"Hohenfeld et al. (2024)","plainTextFormattedCitation":"Hohenfeld et al. (2024)","previouslyFormattedCitation":"Hohenfeld et al. (2024)"},"properties":{"noteIndex":0},"schema":"https://github.com/citation-style-language/schema/raw/master/csl-citation.json"}</w:instrText>
       </w:r>
       <w:r>
         <w:fldChar w:fldCharType="separate"/>
@@ -6571,7 +6726,28 @@
         <w:t xml:space="preserve">[FILL: number of records identified / after de-duplication / screened / full texts assessed / excluded with reasons]</w:t>
       </w:r>
       <w:r>
-        <w:t xml:space="preserve">. A supplementary web search in October 2026, run while this article was revised, used additional terms for drones and UAVs, multi-agent and autonomous mobility, autonomous driving, cart-pole control, and storage and retrieval systems; it identified 12 further primary studies and 5 foundational works, which are included in all counts below. The final corpus comprises 70 primary studies (63 empirical or theoretical studies and 7 reviews) and 96 foundational works; together with six related quantum computer-vision studies (Section</w:t>
+        <w:t xml:space="preserve">. A supplementary web search in October 2026, run while this article was revised, used additional terms for drones and UAVs, multi-agent and autonomous mobility, autonomous driving, cart-pole control, and storage and retrieval systems; it identified 12 further primary studies and 5 foundational works, which are included in all counts below. Two early theoretical papers by</w:t>
+      </w:r>
+      <w:r>
+        <w:t xml:space="preserve"> </w:t>
+      </w:r>
+      <w:r>
+        <w:fldChar w:fldCharType="begin"/>
+      </w:r>
+      <w:r>
+        <w:instrText xml:space="preserve">ADDIN CSL_CITATION {"citationID":"MENDELEY_CITATION_98","citationItems":[{"id":"ITEM-97","isTemporary":false,"itemData":{"DOI":"10.1103/PhysRevA.58.893","author":[{"family":"Benioff","given":"Paul"}],"container-title":"Physical Review A","id":"Benioff1998","issue":"2","issued":{"date-parts":[[1998]]},"page":"893-904","publisher":"American Physical Society","title":"Quantum robots and environments","type":"article-journal","volume":"58"},"suppress-author":false},{"id":"ITEM-98","isTemporary":false,"itemData":{"URL":"https://arxiv.org/abs/quant-ph/0003006","author":[{"family":"Benioff","given":"Paul"}],"collection-title":"Contemporary mathematics","container-title":"Quantum computation and information","editor":[{"family":"Lomonaco","given":"Samuel J.","suffix":"Jr."},{"family":"Brandt","given":"Howard E."}],"id":"Benioff2002","issued":{"date-parts":[[2002]]},"publisher":"American Mathematical Society","publisher-place":"Providence, RI","title":"Space searches with a quantum robot","type":"chapter","volume":"305"}}],"isEdited":false,"manualOverride":{"citeprocText":"Benioff (1998, 2002)","isManuallyOverridden":false,"manualOverrideText":""},"mendeley":{"formattedCitation":"Benioff (1998, 2002)","plainTextFormattedCitation":"Benioff (1998, 2002)","previouslyFormattedCitation":"Benioff (1998, 2002)"},"properties":{"noteIndex":0},"schema":"https://github.com/citation-style-language/schema/raw/master/csl-citation.json"}</w:instrText>
+      </w:r>
+      <w:r>
+        <w:fldChar w:fldCharType="separate"/>
+      </w:r>
+      <w:r>
+        <w:t xml:space="preserve">Benioff (1998, 2002)</w:t>
+      </w:r>
+      <w:r>
+        <w:fldChar w:fldCharType="end"/>
+      </w:r>
+      <w:r>
+        <w:t xml:space="preserve">, first cited as foundational works, analyze what a quantum robot can do and how fast it can search a region, so they satisfy I1 and are counted as primary studies. The final corpus comprises 72 primary studies (65 empirical or theoretical studies and 7 reviews) and 94 foundational works; together with six related quantum computer-vision studies (Section</w:t>
       </w:r>
       <w:r>
         <w:t xml:space="preserve"> </w:t>
@@ -6602,7 +6778,7 @@
         <w:t xml:space="preserve"> </w:t>
       </w:r>
       <w:r>
-        <w:t xml:space="preserve">shows how recent the corpus is: 51 of the 70 primary studies appeared in 2023 or later, and 25 in 2025 alone.</w:t>
+        <w:t xml:space="preserve">shows how the field evolved. Before 2006 the record holds only Benioff’s two theoretical papers: the useful quantum algorithms had only just appeared and there was no programmable hardware to run them on, so robotics work stayed conceptual. Studies became regular only after D-Wave annealers (2011) and cloud access to gate-based processors (2016) arrived, and 51 of the 72 primary studies appeared in 2023 or later, 25 in 2025 alone.</w:t>
       </w:r>
     </w:p>
     <w:p>
@@ -6680,11 +6856,25 @@
           <m:t>=</m:t>
         </m:r>
         <m:r>
-          <m:t>70</m:t>
+          <m:t>72</m:t>
         </m:r>
       </m:oMath>
       <w:r>
-        <w:t xml:space="preserve">, including the 7 reviews). Studies from 2006 to 2017 are grouped; 2026 covers the part of the year before the last search.</w:t>
+        <w:t xml:space="preserve">, including the 7 reviews), from the first quantum-robot paper in 1998 to 2026, with the eras of Figure </w:t>
+      </w:r>
+      <w:hyperlink w:anchor="fig:timeline">
+        <w:r>
+          <w:rPr>
+            <w:rStyle w:val="Hyperlink"/>
+          </w:rPr>
+          <w:t xml:space="preserve">1</w:t>
+        </w:r>
+      </w:hyperlink>
+      <w:r>
+        <w:t xml:space="preserve"> </w:t>
+      </w:r>
+      <w:r>
+        <w:t xml:space="preserve">shaded. 2026 covers the part of the year before the last search.</w:t>
       </w:r>
     </w:p>
     <w:p>
@@ -7334,7 +7524,7 @@
         <w:t xml:space="preserve"> </w:t>
       </w:r>
       <w:r>
-        <w:t xml:space="preserve">Evidence hierarchy used to grade the primary studies, with the number of studies at each level (63 studies; 7 reviews excluded).</w:t>
+        <w:t xml:space="preserve">Evidence hierarchy used to grade the primary studies, with the number of studies at each level (65 studies; 7 reviews excluded).</w:t>
       </w:r>
     </w:p>
     <w:tbl>
@@ -7343,7 +7533,7 @@
         <w:tblW w:type="pct" w:w="5000"/>
         <w:tblLook w:firstRow="1" w:lastRow="0" w:firstColumn="0" w:lastColumn="0" w:noHBand="0" w:noVBand="0" w:val="0020"/>
         <w:jc w:val="start"/>
-        <w:tblCaption w:val="Table 2. Evidence hierarchy used to grade the primary studies, with the number of studies at each level (63 studies; 7 reviews excluded)."/>
+        <w:tblCaption w:val="Table 2. Evidence hierarchy used to grade the primary studies, with the number of studies at each level (65 studies; 7 reviews excluded)."/>
       </w:tblPr>
       <w:tblGrid>
         <w:gridCol w:w="475"/>
@@ -7482,7 +7672,7 @@
               <w:jc w:val="left"/>
             </w:pPr>
             <w:r>
-              <w:t xml:space="preserve">4</w:t>
+              <w:t xml:space="preserve">6</w:t>
             </w:r>
           </w:p>
         </w:tc>
@@ -7497,13 +7687,13 @@
               <w:fldChar w:fldCharType="begin"/>
             </w:r>
             <w:r>
-              <w:instrText xml:space="preserve">ADDIN CSL_CITATION {"citationID":"MENDELEY_CITATION_88","citationItems":[{"id":"ITEM-87","isTemporary":false,"itemData":{"DOI":"10.3390/e25091323","author":[{"family":"Lawless","given":"William F."},{"family":"Moskowitz","given":"Ira S."},{"family":"Doctor","given":"Katarina Z."}],"container-title":"Entropy","id":"Lawless2023","issue":"9","issued":{"date-parts":[[2023]]},"page":"1323","publisher":"MDPI","title":"A quantum-like model of interdependence for embodied human–machine teams: Reviewing the path to autonomy facing complexity and uncertainty","title-short":"A quantum-like model of interdependence for embodied human–machine teams","type":"article-journal","volume":"25"}},{"id":"ITEM-88","isTemporary":false,"itemData":{"DOI":"10.3390/e27020152","author":[{"family":"Humr","given":"Scott"},{"family":"Canan","given":"Mustafa"},{"family":"Demir","given":"Mustafa"}],"container-title":"Entropy","id":"Humr2025","issue":"2","issued":{"date-parts":[[2025]]},"page":"152","publisher":"MDPI","title":"A quantum probability approach to improving human–AI decision making","type":"article-journal","volume":"27"}}],"isEdited":false,"manualOverride":{"citeprocText":"(Lawless, Moskowitz, and Doctor 2023; Humr, Canan, and Demir 2025)","isManuallyOverridden":false,"manualOverrideText":""},"mendeley":{"formattedCitation":"(Lawless, Moskowitz, and Doctor 2023; Humr, Canan, and Demir 2025)","plainTextFormattedCitation":"(Lawless, Moskowitz, and Doctor 2023; Humr, Canan, and Demir 2025)","previouslyFormattedCitation":"(Lawless, Moskowitz, and Doctor 2023; Humr, Canan, and Demir 2025)"},"properties":{"noteIndex":0},"schema":"https://github.com/citation-style-language/schema/raw/master/csl-citation.json"}</w:instrText>
+              <w:instrText xml:space="preserve">ADDIN CSL_CITATION {"citationID":"MENDELEY_CITATION_101","citationItems":[{"id":"ITEM-99","isTemporary":false,"itemData":{"DOI":"10.1103/PhysRevA.58.893","author":[{"family":"Benioff","given":"Paul"}],"container-title":"Physical Review A","id":"Benioff1998","issue":"2","issued":{"date-parts":[[1998]]},"page":"893-904","publisher":"American Physical Society","title":"Quantum robots and environments","type":"article-journal","volume":"58"}},{"id":"ITEM-100","isTemporary":false,"itemData":{"DOI":"10.3390/e25091323","author":[{"family":"Lawless","given":"William F."},{"family":"Moskowitz","given":"Ira S."},{"family":"Doctor","given":"Katarina Z."}],"container-title":"Entropy","id":"Lawless2023","issue":"9","issued":{"date-parts":[[2023]]},"page":"1323","publisher":"MDPI","title":"A quantum-like model of interdependence for embodied human–machine teams: Reviewing the path to autonomy facing complexity and uncertainty","title-short":"A quantum-like model of interdependence for embodied human–machine teams","type":"article-journal","volume":"25"}},{"id":"ITEM-101","isTemporary":false,"itemData":{"DOI":"10.3390/e27020152","author":[{"family":"Humr","given":"Scott"},{"family":"Canan","given":"Mustafa"},{"family":"Demir","given":"Mustafa"}],"container-title":"Entropy","id":"Humr2025","issue":"2","issued":{"date-parts":[[2025]]},"page":"152","publisher":"MDPI","title":"A quantum probability approach to improving human–AI decision making","type":"article-journal","volume":"27"}}],"isEdited":false,"manualOverride":{"citeprocText":"(Benioff 1998; Lawless, Moskowitz, and Doctor 2023; Humr, Canan, and Demir 2025)","isManuallyOverridden":false,"manualOverrideText":""},"mendeley":{"formattedCitation":"(Benioff 1998; Lawless, Moskowitz, and Doctor 2023; Humr, Canan, and Demir 2025)","plainTextFormattedCitation":"(Benioff 1998; Lawless, Moskowitz, and Doctor 2023; Humr, Canan, and Demir 2025)","previouslyFormattedCitation":"(Benioff 1998; Lawless, Moskowitz, and Doctor 2023; Humr, Canan, and Demir 2025)"},"properties":{"noteIndex":0},"schema":"https://github.com/citation-style-language/schema/raw/master/csl-citation.json"}</w:instrText>
             </w:r>
             <w:r>
               <w:fldChar w:fldCharType="separate"/>
             </w:r>
             <w:r>
-              <w:t xml:space="preserve">(Lawless, Moskowitz, and Doctor 2023; Humr, Canan, and Demir 2025)</w:t>
+              <w:t xml:space="preserve">(Benioff 1998; Lawless, Moskowitz, and Doctor 2023; Humr, Canan, and Demir 2025)</w:t>
             </w:r>
             <w:r>
               <w:fldChar w:fldCharType="end"/>
@@ -7571,7 +7761,7 @@
               <w:fldChar w:fldCharType="begin"/>
             </w:r>
             <w:r>
-              <w:instrText xml:space="preserve">ADDIN CSL_CITATION {"citationID":"MENDELEY_CITATION_91","citationItems":[{"id":"ITEM-89","isTemporary":false,"itemData":{"DOI":"10.3390/math10142475","author":[{"family":"Chella","given":"Antonio"},{"family":"Gaglio","given":"Salvatore"},{"family":"Pilato","given":"Giovanni"},{"family":"Vella","given":"Filippo"},{"family":"Zammuto","given":"Salvatore"}],"container-title":"Mathematics","id":"Chella2022","issue":"14","issued":{"date-parts":[[2022]]},"page":"2475","publisher":"MDPI","title":"A quantum planner for robot motion","type":"article-journal","volume":"10"}},{"id":"ITEM-90","isTemporary":false,"itemData":{"DOI":"10.1109/ACCESS.2023.3307316","author":[{"family":"Lathrop","given":"Paul"},{"family":"Boardman","given":"Beth"},{"family":"Martínez","given":"Sonia"}],"container-title":"IEEE Access","id":"Lathrop2023","issued":{"date-parts":[[2023]]},"page":"89506-89519","title":"Quantum search approaches to sampling-based motion planning","type":"article-journal","volume":"11"}},{"id":"ITEM-91","isTemporary":false,"itemData":{"author":[{"family":"Roh","given":"Emily Jimin"},{"family":"Baek","given":"Hankyul"},{"family":"Kim","given":"Donghyeon"},{"family":"Kim","given":"Joongheon"}],"container-title":"IEEE Transactions on Mobile Computing","id":"Roh2025","issue":"2","issued":{"date-parts":[[2025]]},"page":"1031-1042","title":"Fast quantum convolutional neural networks for low-complexity object detection in autonomous driving applications","type":"article-journal","volume":"24"}}],"isEdited":false,"manualOverride":{"citeprocText":"(Chella et al. 2022; Lathrop, Boardman, and Martínez 2023; Roh et al. 2025)","isManuallyOverridden":false,"manualOverrideText":""},"mendeley":{"formattedCitation":"(Chella et al. 2022; Lathrop, Boardman, and Martínez 2023; Roh et al. 2025)","plainTextFormattedCitation":"(Chella et al. 2022; Lathrop, Boardman, and Martínez 2023; Roh et al. 2025)","previouslyFormattedCitation":"(Chella et al. 2022; Lathrop, Boardman, and Martínez 2023; Roh et al. 2025)"},"properties":{"noteIndex":0},"schema":"https://github.com/citation-style-language/schema/raw/master/csl-citation.json"}</w:instrText>
+              <w:instrText xml:space="preserve">ADDIN CSL_CITATION {"citationID":"MENDELEY_CITATION_104","citationItems":[{"id":"ITEM-102","isTemporary":false,"itemData":{"DOI":"10.3390/math10142475","author":[{"family":"Chella","given":"Antonio"},{"family":"Gaglio","given":"Salvatore"},{"family":"Pilato","given":"Giovanni"},{"family":"Vella","given":"Filippo"},{"family":"Zammuto","given":"Salvatore"}],"container-title":"Mathematics","id":"Chella2022","issue":"14","issued":{"date-parts":[[2022]]},"page":"2475","publisher":"MDPI","title":"A quantum planner for robot motion","type":"article-journal","volume":"10"}},{"id":"ITEM-103","isTemporary":false,"itemData":{"DOI":"10.1109/ACCESS.2023.3307316","author":[{"family":"Lathrop","given":"Paul"},{"family":"Boardman","given":"Beth"},{"family":"Martínez","given":"Sonia"}],"container-title":"IEEE Access","id":"Lathrop2023","issued":{"date-parts":[[2023]]},"page":"89506-89519","title":"Quantum search approaches to sampling-based motion planning","type":"article-journal","volume":"11"}},{"id":"ITEM-104","isTemporary":false,"itemData":{"author":[{"family":"Roh","given":"Emily Jimin"},{"family":"Baek","given":"Hankyul"},{"family":"Kim","given":"Donghyeon"},{"family":"Kim","given":"Joongheon"}],"container-title":"IEEE Transactions on Mobile Computing","id":"Roh2025","issue":"2","issued":{"date-parts":[[2025]]},"page":"1031-1042","title":"Fast quantum convolutional neural networks for low-complexity object detection in autonomous driving applications","type":"article-journal","volume":"24"}}],"isEdited":false,"manualOverride":{"citeprocText":"(Chella et al. 2022; Lathrop, Boardman, and Martínez 2023; Roh et al. 2025)","isManuallyOverridden":false,"manualOverrideText":""},"mendeley":{"formattedCitation":"(Chella et al. 2022; Lathrop, Boardman, and Martínez 2023; Roh et al. 2025)","plainTextFormattedCitation":"(Chella et al. 2022; Lathrop, Boardman, and Martínez 2023; Roh et al. 2025)","previouslyFormattedCitation":"(Chella et al. 2022; Lathrop, Boardman, and Martínez 2023; Roh et al. 2025)"},"properties":{"noteIndex":0},"schema":"https://github.com/citation-style-language/schema/raw/master/csl-citation.json"}</w:instrText>
             </w:r>
             <w:r>
               <w:fldChar w:fldCharType="separate"/>
@@ -7645,7 +7835,7 @@
               <w:fldChar w:fldCharType="begin"/>
             </w:r>
             <w:r>
-              <w:instrText xml:space="preserve">ADDIN CSL_CITATION {"citationID":"MENDELEY_CITATION_94","citationItems":[{"id":"ITEM-92","isTemporary":false,"itemData":{"DOI":"10.1145/3293320.3293333","author":[{"family":"Clark","given":"James"},{"family":"West","given":"Tristan"},{"family":"Zammit","given":"Joseph Paul"},{"family":"Guo","given":"Xiaohu"},{"family":"Mason","given":"Luke"},{"family":"Russell","given":"Duncan"}],"container-title":"Proceedings of the international conference on high performance computing in asia-pacific region (HPC Asia 2019)","id":"Clark2019","issued":{"date-parts":[[2019]]},"page":"111-119","publisher":"ACM","publisher-place":"New York, NY, USA","title":"Towards real time multi-robot routing using quantum computing technologies","type":"paper-conference"}},{"id":"ITEM-93","isTemporary":false,"itemData":{"DOI":"10.1038/s41598-023-45668-1","author":[{"family":"Leib","given":"Dominik"},{"family":"Seidel","given":"Tobias"},{"family":"Jäger","given":"Sven"},{"family":"Heese","given":"Raoul"},{"family":"Jones","given":"Caitlin Isobel"},{"family":"Awasthi","given":"Abhishek"},{"family":"Niederle","given":"Astrid"},{"family":"Bortz","given":"Michael"}],"container-title":"Scientific Reports","id":"Leib2023","issued":{"date-parts":[[2023]]},"publisher":"Nature Publishing Group","title":"An optimization case study for solving a transport robot scheduling problem on quantum-hybrid and quantum-inspired hardware","type":"article-journal","volume":"13"}},{"id":"ITEM-94","isTemporary":false,"itemData":{"DOI":"10.1038/s41598-025-12109-0","author":[{"family":"Otani","given":"Takuya"},{"family":"Takanishi","given":"Atsuo"},{"family":"Hara","given":"Nobuyuki"},{"family":"Takita","given":"Yutaka"},{"family":"Kimura","given":"Koichi"}],"container-title":"Scientific Reports","id":"Otani2025","issued":{"date-parts":[[2025]]},"page":"28508","publisher":"Nature Publishing Group","title":"Quantum computation for robot posture optimization","type":"article-journal","volume":"15"}}],"isEdited":false,"manualOverride":{"citeprocText":"(Clark et al. 2019; Leib et al. 2023; Otani et al. 2025)","isManuallyOverridden":false,"manualOverrideText":""},"mendeley":{"formattedCitation":"(Clark et al. 2019; Leib et al. 2023; Otani et al. 2025)","plainTextFormattedCitation":"(Clark et al. 2019; Leib et al. 2023; Otani et al. 2025)","previouslyFormattedCitation":"(Clark et al. 2019; Leib et al. 2023; Otani et al. 2025)"},"properties":{"noteIndex":0},"schema":"https://github.com/citation-style-language/schema/raw/master/csl-citation.json"}</w:instrText>
+              <w:instrText xml:space="preserve">ADDIN CSL_CITATION {"citationID":"MENDELEY_CITATION_107","citationItems":[{"id":"ITEM-105","isTemporary":false,"itemData":{"DOI":"10.1145/3293320.3293333","author":[{"family":"Clark","given":"James"},{"family":"West","given":"Tristan"},{"family":"Zammit","given":"Joseph Paul"},{"family":"Guo","given":"Xiaohu"},{"family":"Mason","given":"Luke"},{"family":"Russell","given":"Duncan"}],"container-title":"Proceedings of the international conference on high performance computing in asia-pacific region (HPC Asia 2019)","id":"Clark2019","issued":{"date-parts":[[2019]]},"page":"111-119","publisher":"ACM","publisher-place":"New York, NY, USA","title":"Towards real time multi-robot routing using quantum computing technologies","type":"paper-conference"}},{"id":"ITEM-106","isTemporary":false,"itemData":{"DOI":"10.1038/s41598-023-45668-1","author":[{"family":"Leib","given":"Dominik"},{"family":"Seidel","given":"Tobias"},{"family":"Jäger","given":"Sven"},{"family":"Heese","given":"Raoul"},{"family":"Jones","given":"Caitlin Isobel"},{"family":"Awasthi","given":"Abhishek"},{"family":"Niederle","given":"Astrid"},{"family":"Bortz","given":"Michael"}],"container-title":"Scientific Reports","id":"Leib2023","issued":{"date-parts":[[2023]]},"publisher":"Nature Publishing Group","title":"An optimization case study for solving a transport robot scheduling problem on quantum-hybrid and quantum-inspired hardware","type":"article-journal","volume":"13"}},{"id":"ITEM-107","isTemporary":false,"itemData":{"DOI":"10.1038/s41598-025-12109-0","author":[{"family":"Otani","given":"Takuya"},{"family":"Takanishi","given":"Atsuo"},{"family":"Hara","given":"Nobuyuki"},{"family":"Takita","given":"Yutaka"},{"family":"Kimura","given":"Koichi"}],"container-title":"Scientific Reports","id":"Otani2025","issued":{"date-parts":[[2025]]},"page":"28508","publisher":"Nature Publishing Group","title":"Quantum computation for robot posture optimization","type":"article-journal","volume":"15"}}],"isEdited":false,"manualOverride":{"citeprocText":"(Clark et al. 2019; Leib et al. 2023; Otani et al. 2025)","isManuallyOverridden":false,"manualOverrideText":""},"mendeley":{"formattedCitation":"(Clark et al. 2019; Leib et al. 2023; Otani et al. 2025)","plainTextFormattedCitation":"(Clark et al. 2019; Leib et al. 2023; Otani et al. 2025)","previouslyFormattedCitation":"(Clark et al. 2019; Leib et al. 2023; Otani et al. 2025)"},"properties":{"noteIndex":0},"schema":"https://github.com/citation-style-language/schema/raw/master/csl-citation.json"}</w:instrText>
             </w:r>
             <w:r>
               <w:fldChar w:fldCharType="separate"/>
@@ -7719,7 +7909,7 @@
               <w:fldChar w:fldCharType="begin"/>
             </w:r>
             <w:r>
-              <w:instrText xml:space="preserve">ADDIN CSL_CITATION {"citationID":"MENDELEY_CITATION_97","citationItems":[{"id":"ITEM-95","isTemporary":false,"itemData":{"DOI":"10.1109/ACCESS.2024.3417808","author":[{"family":"Hohenfeld","given":"Hans"},{"family":"Heimann","given":"Dirk"},{"family":"Wiebe","given":"Felix"},{"family":"Kirchner","given":"Frank"}],"container-title":"IEEE Access","id":"Hohenfeld2024","issued":{"date-parts":[[2024]]},"page":"87217-87236","publisher":"IEEE","title":"Quantum deep reinforcement learning for robot navigation tasks","type":"article-journal","volume":"12"}},{"id":"ITEM-96","isTemporary":false,"itemData":{"DOI":"10.1007/s42484-024-00226-4","author":[{"family":"Sinha","given":"Akash"},{"family":"Macaluso","given":"Antonio"},{"family":"Klusch","given":"Matthias"}],"container-title":"Quantum Machine Intelligence","id":"Sinha2023","issued":{"date-parts":[[2025]]},"page":"19","publisher":"Springer","title":"Nav-Q: Quantum deep reinforcement learning for collision-free navigation of self-driving cars","title-short":"Nav-Q","type":"article-journal","volume":"7"}},{"id":"ITEM-97","isTemporary":false,"itemData":{"DOI":"10.1038/s41598-025-28481-w","author":[{"family":"Quang","given":"Thinh Nguyen"},{"family":"Matsuyama","given":"Kosuke"},{"family":"Shimizu","given":"Keisuke"},{"family":"Sugano","given":"Hiroki"},{"family":"Kurimoto","given":"Eiji"},{"family":"Miki","given":"Masahiro"},{"family":"Suzuki","given":"Jumpei"},{"family":"Chen","given":"Ziyi"},{"family":"Waidyasooriya","given":"Hasitha Muthumala"},{"family":"Hariyama","given":"Masanori"},{"family":"Hitomi","given":"Masaru"},{"family":"Sawamura","given":"Kenta"},{"family":"Ohzeki","given":"Masayuki"}],"container-title":"Scientific Reports","id":"Quang2025","issued":{"date-parts":[[2025]]},"page":"44047","publisher":"Nature Publishing Group","title":"Quantum annealing-based route optimization for commercial AGV operating systems in large-scale logistics warehouses","type":"article-journal","volume":"15"}}],"isEdited":false,"manualOverride":{"citeprocText":"(Hohenfeld et al. 2024; Sinha, Macaluso, and Klusch 2025; Quang et al. 2025)","isManuallyOverridden":false,"manualOverrideText":""},"mendeley":{"formattedCitation":"(Hohenfeld et al. 2024; Sinha, Macaluso, and Klusch 2025; Quang et al. 2025)","plainTextFormattedCitation":"(Hohenfeld et al. 2024; Sinha, Macaluso, and Klusch 2025; Quang et al. 2025)","previouslyFormattedCitation":"(Hohenfeld et al. 2024; Sinha, Macaluso, and Klusch 2025; Quang et al. 2025)"},"properties":{"noteIndex":0},"schema":"https://github.com/citation-style-language/schema/raw/master/csl-citation.json"}</w:instrText>
+              <w:instrText xml:space="preserve">ADDIN CSL_CITATION {"citationID":"MENDELEY_CITATION_110","citationItems":[{"id":"ITEM-108","isTemporary":false,"itemData":{"DOI":"10.1109/ACCESS.2024.3417808","author":[{"family":"Hohenfeld","given":"Hans"},{"family":"Heimann","given":"Dirk"},{"family":"Wiebe","given":"Felix"},{"family":"Kirchner","given":"Frank"}],"container-title":"IEEE Access","id":"Hohenfeld2024","issued":{"date-parts":[[2024]]},"page":"87217-87236","publisher":"IEEE","title":"Quantum deep reinforcement learning for robot navigation tasks","type":"article-journal","volume":"12"}},{"id":"ITEM-109","isTemporary":false,"itemData":{"DOI":"10.1007/s42484-024-00226-4","author":[{"family":"Sinha","given":"Akash"},{"family":"Macaluso","given":"Antonio"},{"family":"Klusch","given":"Matthias"}],"container-title":"Quantum Machine Intelligence","id":"Sinha2023","issued":{"date-parts":[[2025]]},"page":"19","publisher":"Springer","title":"Nav-Q: Quantum deep reinforcement learning for collision-free navigation of self-driving cars","title-short":"Nav-Q","type":"article-journal","volume":"7"}},{"id":"ITEM-110","isTemporary":false,"itemData":{"DOI":"10.1038/s41598-025-28481-w","author":[{"family":"Quang","given":"Thinh Nguyen"},{"family":"Matsuyama","given":"Kosuke"},{"family":"Shimizu","given":"Keisuke"},{"family":"Sugano","given":"Hiroki"},{"family":"Kurimoto","given":"Eiji"},{"family":"Miki","given":"Masahiro"},{"family":"Suzuki","given":"Jumpei"},{"family":"Chen","given":"Ziyi"},{"family":"Waidyasooriya","given":"Hasitha Muthumala"},{"family":"Hariyama","given":"Masanori"},{"family":"Hitomi","given":"Masaru"},{"family":"Sawamura","given":"Kenta"},{"family":"Ohzeki","given":"Masayuki"}],"container-title":"Scientific Reports","id":"Quang2025","issued":{"date-parts":[[2025]]},"page":"44047","publisher":"Nature Publishing Group","title":"Quantum annealing-based route optimization for commercial AGV operating systems in large-scale logistics warehouses","type":"article-journal","volume":"15"}}],"isEdited":false,"manualOverride":{"citeprocText":"(Hohenfeld et al. 2024; Sinha, Macaluso, and Klusch 2025; Quang et al. 2025)","isManuallyOverridden":false,"manualOverrideText":""},"mendeley":{"formattedCitation":"(Hohenfeld et al. 2024; Sinha, Macaluso, and Klusch 2025; Quang et al. 2025)","plainTextFormattedCitation":"(Hohenfeld et al. 2024; Sinha, Macaluso, and Klusch 2025; Quang et al. 2025)","previouslyFormattedCitation":"(Hohenfeld et al. 2024; Sinha, Macaluso, and Klusch 2025; Quang et al. 2025)"},"properties":{"noteIndex":0},"schema":"https://github.com/citation-style-language/schema/raw/master/csl-citation.json"}</w:instrText>
             </w:r>
             <w:r>
               <w:fldChar w:fldCharType="separate"/>
@@ -7793,7 +7983,7 @@
               <w:fldChar w:fldCharType="begin"/>
             </w:r>
             <w:r>
-              <w:instrText xml:space="preserve">ADDIN CSL_CITATION {"citationID":"MENDELEY_CITATION_100","citationItems":[{"id":"ITEM-98","isTemporary":false,"itemData":{"DOI":"10.1109/TMECH.2010.2090896","author":[{"family":"Dong","given":"Daoyi"},{"family":"Chen","given":"Chunlin"},{"family":"Chu","given":"Jian"},{"family":"Tarn","given":"Tzyh-Jong"}],"container-title":"IEEE/ASME Transactions on Mechatronics","id":"Dong2012","issue":"1","issued":{"date-parts":[[2012]]},"page":"86-97","publisher":"IEEE","title":"Robust quantum-inspired reinforcement learning for robot navigation","type":"article-journal","volume":"17"}},{"id":"ITEM-99","isTemporary":false,"itemData":{"DOI":"10.1103/PhysRevLett.126.020503","author":[{"family":"Liu","given":"Hua-Ying"},{"family":"Tian","given":"Xiao-Hui"},{"family":"Gu","given":"Changsheng"},{"family":"Fan","given":"Pengfei"},{"family":"Ni","given":"Xin"},{"family":"Yang","given":"Ran"},{"family":"Zhang","given":"Ji-Ning"},{"family":"Hu","given":"Mingzhe"},{"family":"Guo","given":"Jian"},{"family":"Cao","given":"Xun"},{"family":"Hu","given":"Xiaopeng"},{"family":"Zhao","given":"Gang"},{"family":"Lu","given":"Yan-Qing"},{"family":"Gong","given":"Yan-Xiao"},{"family":"Xie","given":"Zhenda"},{"family":"Zhu","given":"Shi-Ning"}],"container-title":"Physical Review Letters","id":"Liu2021","issued":{"date-parts":[[2021]]},"page":"020503","title":"Optical-relayed entanglement distribution using drones as mobile nodes","type":"article-journal","volume":"126"}},{"id":"ITEM-100","isTemporary":false,"itemData":{"URL":"https://arxiv.org/abs/2508.01690","author":[{"family":"Sun","given":"Yize"},{"family":"Hagog","given":"Mohamad"},{"family":"Weber","given":"Marc"},{"family":"Hein","given":"Daniel"},{"family":"Udluft","given":"Steffen"},{"family":"Tresp","given":"Volker"},{"family":"Ma","given":"Yunpu"}],"id":"Sun2025","issued":{"date-parts":[[2025]]},"note":"QML@QCE 2025 workshop","title":"First experience with real-time control using simulated VQC-based quantum policies","type":""}}],"isEdited":false,"manualOverride":{"citeprocText":"(Dong et al. 2012; Liu et al. 2021; Sun et al. 2025)","isManuallyOverridden":false,"manualOverrideText":""},"mendeley":{"formattedCitation":"(Dong et al. 2012; Liu et al. 2021; Sun et al. 2025)","plainTextFormattedCitation":"(Dong et al. 2012; Liu et al. 2021; Sun et al. 2025)","previouslyFormattedCitation":"(Dong et al. 2012; Liu et al. 2021; Sun et al. 2025)"},"properties":{"noteIndex":0},"schema":"https://github.com/citation-style-language/schema/raw/master/csl-citation.json"}</w:instrText>
+              <w:instrText xml:space="preserve">ADDIN CSL_CITATION {"citationID":"MENDELEY_CITATION_113","citationItems":[{"id":"ITEM-111","isTemporary":false,"itemData":{"DOI":"10.1109/TMECH.2010.2090896","author":[{"family":"Dong","given":"Daoyi"},{"family":"Chen","given":"Chunlin"},{"family":"Chu","given":"Jian"},{"family":"Tarn","given":"Tzyh-Jong"}],"container-title":"IEEE/ASME Transactions on Mechatronics","id":"Dong2012","issue":"1","issued":{"date-parts":[[2012]]},"page":"86-97","publisher":"IEEE","title":"Robust quantum-inspired reinforcement learning for robot navigation","type":"article-journal","volume":"17"}},{"id":"ITEM-112","isTemporary":false,"itemData":{"DOI":"10.1103/PhysRevLett.126.020503","author":[{"family":"Liu","given":"Hua-Ying"},{"family":"Tian","given":"Xiao-Hui"},{"family":"Gu","given":"Changsheng"},{"family":"Fan","given":"Pengfei"},{"family":"Ni","given":"Xin"},{"family":"Yang","given":"Ran"},{"family":"Zhang","given":"Ji-Ning"},{"family":"Hu","given":"Mingzhe"},{"family":"Guo","given":"Jian"},{"family":"Cao","given":"Xun"},{"family":"Hu","given":"Xiaopeng"},{"family":"Zhao","given":"Gang"},{"family":"Lu","given":"Yan-Qing"},{"family":"Gong","given":"Yan-Xiao"},{"family":"Xie","given":"Zhenda"},{"family":"Zhu","given":"Shi-Ning"}],"container-title":"Physical Review Letters","id":"Liu2021","issued":{"date-parts":[[2021]]},"page":"020503","title":"Optical-relayed entanglement distribution using drones as mobile nodes","type":"article-journal","volume":"126"}},{"id":"ITEM-113","isTemporary":false,"itemData":{"URL":"https://arxiv.org/abs/2508.01690","author":[{"family":"Sun","given":"Yize"},{"family":"Hagog","given":"Mohamad"},{"family":"Weber","given":"Marc"},{"family":"Hein","given":"Daniel"},{"family":"Udluft","given":"Steffen"},{"family":"Tresp","given":"Volker"},{"family":"Ma","given":"Yunpu"}],"id":"Sun2025","issued":{"date-parts":[[2025]]},"note":"QML@QCE 2025 workshop","title":"First experience with real-time control using simulated VQC-based quantum policies","type":""}}],"isEdited":false,"manualOverride":{"citeprocText":"(Dong et al. 2012; Liu et al. 2021; Sun et al. 2025)","isManuallyOverridden":false,"manualOverrideText":""},"mendeley":{"formattedCitation":"(Dong et al. 2012; Liu et al. 2021; Sun et al. 2025)","plainTextFormattedCitation":"(Dong et al. 2012; Liu et al. 2021; Sun et al. 2025)","previouslyFormattedCitation":"(Dong et al. 2012; Liu et al. 2021; Sun et al. 2025)"},"properties":{"noteIndex":0},"schema":"https://github.com/citation-style-language/schema/raw/master/csl-citation.json"}</w:instrText>
             </w:r>
             <w:r>
               <w:fldChar w:fldCharType="separate"/>
@@ -7867,7 +8057,7 @@
               <w:fldChar w:fldCharType="begin"/>
             </w:r>
             <w:r>
-              <w:instrText xml:space="preserve">ADDIN CSL_CITATION {"citationID":"MENDELEY_CITATION_101","citationItems":[{"id":"ITEM-101","isTemporary":false,"itemData":{"DOI":"10.48550/arXiv.2504.08167","URL":"https://arxiv.org/abs/2504.08167","author":[{"family":"Muradoglu","given":"Murat"},{"family":"Johnsson","given":"Mattias T."},{"family":"Wilson","given":"Nathanial M."},{"family":"Cohen","given":"Yuval"},{"family":"Shin","given":"Dongki"},{"family":"Navickas","given":"Tomas"},{"family":"Pyragius","given":"Tadas"},{"family":"Thomas","given":"Divya"},{"family":"Thompson","given":"Daniel"},{"family":"Moore","given":"Steven I."},{"family":"Rahman","given":"Md Tanvir"},{"family":"Walker","given":"Adrian"},{"family":"Dutta","given":"Indranil"},{"family":"Bijjahalli","given":"Suraj"},{"family":"Berlocher","given":"Jacob"},{"family":"Hush","given":"Michael R."},{"family":"Anderson","given":"Russell P."},{"family":"Szigeti","given":"Stuart S."},{"family":"Biercuk","given":"Michael J."}],"id":"Muradoglu2025","issued":{"date-parts":[[2025]]},"title":"Quantum-assured magnetic navigation achieves positioning accuracy better than a strategic-grade INS in airborne and ground-based field trials","type":""}}],"isEdited":false,"manualOverride":{"citeprocText":"(Muradoglu et al. 2025)","isManuallyOverridden":false,"manualOverrideText":""},"mendeley":{"formattedCitation":"(Muradoglu et al. 2025)","plainTextFormattedCitation":"(Muradoglu et al. 2025)","previouslyFormattedCitation":"(Muradoglu et al. 2025)"},"properties":{"noteIndex":0},"schema":"https://github.com/citation-style-language/schema/raw/master/csl-citation.json"}</w:instrText>
+              <w:instrText xml:space="preserve">ADDIN CSL_CITATION {"citationID":"MENDELEY_CITATION_114","citationItems":[{"id":"ITEM-114","isTemporary":false,"itemData":{"DOI":"10.48550/arXiv.2504.08167","URL":"https://arxiv.org/abs/2504.08167","author":[{"family":"Muradoglu","given":"Murat"},{"family":"Johnsson","given":"Mattias T."},{"family":"Wilson","given":"Nathanial M."},{"family":"Cohen","given":"Yuval"},{"family":"Shin","given":"Dongki"},{"family":"Navickas","given":"Tomas"},{"family":"Pyragius","given":"Tadas"},{"family":"Thomas","given":"Divya"},{"family":"Thompson","given":"Daniel"},{"family":"Moore","given":"Steven I."},{"family":"Rahman","given":"Md Tanvir"},{"family":"Walker","given":"Adrian"},{"family":"Dutta","given":"Indranil"},{"family":"Bijjahalli","given":"Suraj"},{"family":"Berlocher","given":"Jacob"},{"family":"Hush","given":"Michael R."},{"family":"Anderson","given":"Russell P."},{"family":"Szigeti","given":"Stuart S."},{"family":"Biercuk","given":"Michael J."}],"id":"Muradoglu2025","issued":{"date-parts":[[2025]]},"title":"Quantum-assured magnetic navigation achieves positioning accuracy better than a strategic-grade INS in airborne and ground-based field trials","type":""}}],"isEdited":false,"manualOverride":{"citeprocText":"(Muradoglu et al. 2025)","isManuallyOverridden":false,"manualOverrideText":""},"mendeley":{"formattedCitation":"(Muradoglu et al. 2025)","plainTextFormattedCitation":"(Muradoglu et al. 2025)","previouslyFormattedCitation":"(Muradoglu et al. 2025)"},"properties":{"noteIndex":0},"schema":"https://github.com/citation-style-language/schema/raw/master/csl-citation.json"}</w:instrText>
             </w:r>
             <w:r>
               <w:fldChar w:fldCharType="separate"/>
@@ -8078,7 +8268,7 @@
         <w:fldChar w:fldCharType="begin"/>
       </w:r>
       <w:r>
-        <w:instrText xml:space="preserve">ADDIN CSL_CITATION {"citationID":"MENDELEY_CITATION_103","citationItems":[{"id":"ITEM-102","isTemporary":false,"itemData":{"URL":"https://arxiv.org/abs/2605.20801","author":[{"family":"Altrabulsi","given":"Mohamed Khair"},{"family":"Innan","given":"Nouhaila"},{"family":"Marchisio","given":"Alberto"},{"family":"Kashif","given":"Muhammad"},{"family":"Shafique","given":"Muhammad"}],"id":"Altrabulsi2026","issued":{"date-parts":[[2026]]},"title":"Q-SpiRL: Quantum spiking reinforcement learning for adaptive robot navigation","title-short":"Q-SpiRL","type":""}},{"id":"ITEM-103","isTemporary":false,"itemData":{"DOI":"10.48550/arXiv.2504.08167","URL":"https://arxiv.org/abs/2504.08167","author":[{"family":"Muradoglu","given":"Murat"},{"family":"Johnsson","given":"Mattias T."},{"family":"Wilson","given":"Nathanial M."},{"family":"Cohen","given":"Yuval"},{"family":"Shin","given":"Dongki"},{"family":"Navickas","given":"Tomas"},{"family":"Pyragius","given":"Tadas"},{"family":"Thomas","given":"Divya"},{"family":"Thompson","given":"Daniel"},{"family":"Moore","given":"Steven I."},{"family":"Rahman","given":"Md Tanvir"},{"family":"Walker","given":"Adrian"},{"family":"Dutta","given":"Indranil"},{"family":"Bijjahalli","given":"Suraj"},{"family":"Berlocher","given":"Jacob"},{"family":"Hush","given":"Michael R."},{"family":"Anderson","given":"Russell P."},{"family":"Szigeti","given":"Stuart S."},{"family":"Biercuk","given":"Michael J."}],"id":"Muradoglu2025","issued":{"date-parts":[[2025]]},"title":"Quantum-assured magnetic navigation achieves positioning accuracy better than a strategic-grade INS in airborne and ground-based field trials","type":""}}],"isEdited":false,"manualOverride":{"citeprocText":"(Altrabulsi et al. 2026; Muradoglu et al. 2025)","isManuallyOverridden":false,"manualOverrideText":""},"mendeley":{"formattedCitation":"(Altrabulsi et al. 2026; Muradoglu et al. 2025)","plainTextFormattedCitation":"(Altrabulsi et al. 2026; Muradoglu et al. 2025)","previouslyFormattedCitation":"(Altrabulsi et al. 2026; Muradoglu et al. 2025)"},"properties":{"noteIndex":0},"schema":"https://github.com/citation-style-language/schema/raw/master/csl-citation.json"}</w:instrText>
+        <w:instrText xml:space="preserve">ADDIN CSL_CITATION {"citationID":"MENDELEY_CITATION_116","citationItems":[{"id":"ITEM-115","isTemporary":false,"itemData":{"URL":"https://arxiv.org/abs/2605.20801","author":[{"family":"Altrabulsi","given":"Mohamed Khair"},{"family":"Innan","given":"Nouhaila"},{"family":"Marchisio","given":"Alberto"},{"family":"Kashif","given":"Muhammad"},{"family":"Shafique","given":"Muhammad"}],"id":"Altrabulsi2026","issued":{"date-parts":[[2026]]},"title":"Q-SpiRL: Quantum spiking reinforcement learning for adaptive robot navigation","title-short":"Q-SpiRL","type":""}},{"id":"ITEM-116","isTemporary":false,"itemData":{"DOI":"10.48550/arXiv.2504.08167","URL":"https://arxiv.org/abs/2504.08167","author":[{"family":"Muradoglu","given":"Murat"},{"family":"Johnsson","given":"Mattias T."},{"family":"Wilson","given":"Nathanial M."},{"family":"Cohen","given":"Yuval"},{"family":"Shin","given":"Dongki"},{"family":"Navickas","given":"Tomas"},{"family":"Pyragius","given":"Tadas"},{"family":"Thomas","given":"Divya"},{"family":"Thompson","given":"Daniel"},{"family":"Moore","given":"Steven I."},{"family":"Rahman","given":"Md Tanvir"},{"family":"Walker","given":"Adrian"},{"family":"Dutta","given":"Indranil"},{"family":"Bijjahalli","given":"Suraj"},{"family":"Berlocher","given":"Jacob"},{"family":"Hush","given":"Michael R."},{"family":"Anderson","given":"Russell P."},{"family":"Szigeti","given":"Stuart S."},{"family":"Biercuk","given":"Michael J."}],"id":"Muradoglu2025","issued":{"date-parts":[[2025]]},"title":"Quantum-assured magnetic navigation achieves positioning accuracy better than a strategic-grade INS in airborne and ground-based field trials","type":""}}],"isEdited":false,"manualOverride":{"citeprocText":"(Altrabulsi et al. 2026; Muradoglu et al. 2025)","isManuallyOverridden":false,"manualOverrideText":""},"mendeley":{"formattedCitation":"(Altrabulsi et al. 2026; Muradoglu et al. 2025)","plainTextFormattedCitation":"(Altrabulsi et al. 2026; Muradoglu et al. 2025)","previouslyFormattedCitation":"(Altrabulsi et al. 2026; Muradoglu et al. 2025)"},"properties":{"noteIndex":0},"schema":"https://github.com/citation-style-language/schema/raw/master/csl-citation.json"}</w:instrText>
       </w:r>
       <w:r>
         <w:fldChar w:fldCharType="separate"/>
@@ -8201,7 +8391,7 @@
         <w:fldChar w:fldCharType="begin"/>
       </w:r>
       <w:r>
-        <w:instrText xml:space="preserve">ADDIN CSL_CITATION {"citationID":"MENDELEY_CITATION_104","citationItems":[{"id":"ITEM-104","isTemporary":false,"itemData":{"DOI":"10.3389/fphy.2014.00005","author":[{"family":"Lucas","given":"Andrew"}],"container-title":"Frontiers in Physics","id":"Lucas2014","issued":{"date-parts":[[2014]]},"page":"5","publisher":"Frontiers Media","title":"Ising formulations of many NP problems","type":"article-journal","volume":"2"},"suppress-author":false}],"isEdited":false,"manualOverride":{"citeprocText":"Lucas (2014)","isManuallyOverridden":false,"manualOverrideText":""},"mendeley":{"formattedCitation":"Lucas (2014)","plainTextFormattedCitation":"Lucas (2014)","previouslyFormattedCitation":"Lucas (2014)"},"properties":{"noteIndex":0},"schema":"https://github.com/citation-style-language/schema/raw/master/csl-citation.json"}</w:instrText>
+        <w:instrText xml:space="preserve">ADDIN CSL_CITATION {"citationID":"MENDELEY_CITATION_117","citationItems":[{"id":"ITEM-117","isTemporary":false,"itemData":{"DOI":"10.3389/fphy.2014.00005","author":[{"family":"Lucas","given":"Andrew"}],"container-title":"Frontiers in Physics","id":"Lucas2014","issued":{"date-parts":[[2014]]},"page":"5","publisher":"Frontiers Media","title":"Ising formulations of many NP problems","type":"article-journal","volume":"2"},"suppress-author":false}],"isEdited":false,"manualOverride":{"citeprocText":"Lucas (2014)","isManuallyOverridden":false,"manualOverrideText":""},"mendeley":{"formattedCitation":"Lucas (2014)","plainTextFormattedCitation":"Lucas (2014)","previouslyFormattedCitation":"Lucas (2014)"},"properties":{"noteIndex":0},"schema":"https://github.com/citation-style-language/schema/raw/master/csl-citation.json"}</w:instrText>
       </w:r>
       <w:r>
         <w:fldChar w:fldCharType="separate"/>
@@ -8222,7 +8412,7 @@
         <w:fldChar w:fldCharType="begin"/>
       </w:r>
       <w:r>
-        <w:instrText xml:space="preserve">ADDIN CSL_CITATION {"citationID":"MENDELEY_CITATION_105","citationItems":[{"id":"ITEM-105","isTemporary":false,"itemData":{"DOI":"10.1038/nature10012","author":[{"family":"Johnson","given":"M. W."},{"family":"Amin","given":"M. H. S."},{"family":"Gildert","given":"S."},{"family":"Lanting","given":"T."},{"family":"Hamze","given":"F."},{"family":"Dickson","given":"N."},{"family":"Harris","given":"R."},{"family":"Berkley","given":"A. J."},{"family":"Johansson","given":"J."},{"family":"Bunyk","given":"P."},{"family":"Chapple","given":"E. M."},{"family":"Enderud","given":"C."},{"family":"Hilton","given":"J. P."},{"family":"Karimi","given":"K."},{"family":"Ladizinsky","given":"E."},{"family":"Ladizinsky","given":"N."},{"family":"Oh","given":"T."},{"family":"Perminov","given":"I."},{"family":"Rich","given":"C."},{"family":"Thom","given":"M. C."},{"family":"Tolkacheva","given":"E."},{"family":"Truncik","given":"C. J. S."},{"family":"Uchaikin","given":"S."},{"family":"Wang","given":"J."},{"family":"Wilson","given":"B."},{"family":"Rose","given":"G."}],"container-title":"Nature","id":"Johnson2011","issue":"7346","issued":{"date-parts":[[2011]]},"page":"194-198","publisher":"Nature Publishing Group","title":"Quantum annealing with manufactured spins","type":"article-journal","volume":"473"}}],"isEdited":false,"manualOverride":{"citeprocText":"(Johnson et al. 2011)","isManuallyOverridden":false,"manualOverrideText":""},"mendeley":{"formattedCitation":"(Johnson et al. 2011)","plainTextFormattedCitation":"(Johnson et al. 2011)","previouslyFormattedCitation":"(Johnson et al. 2011)"},"properties":{"noteIndex":0},"schema":"https://github.com/citation-style-language/schema/raw/master/csl-citation.json"}</w:instrText>
+        <w:instrText xml:space="preserve">ADDIN CSL_CITATION {"citationID":"MENDELEY_CITATION_118","citationItems":[{"id":"ITEM-118","isTemporary":false,"itemData":{"DOI":"10.1038/nature10012","author":[{"family":"Johnson","given":"M. W."},{"family":"Amin","given":"M. H. S."},{"family":"Gildert","given":"S."},{"family":"Lanting","given":"T."},{"family":"Hamze","given":"F."},{"family":"Dickson","given":"N."},{"family":"Harris","given":"R."},{"family":"Berkley","given":"A. J."},{"family":"Johansson","given":"J."},{"family":"Bunyk","given":"P."},{"family":"Chapple","given":"E. M."},{"family":"Enderud","given":"C."},{"family":"Hilton","given":"J. P."},{"family":"Karimi","given":"K."},{"family":"Ladizinsky","given":"E."},{"family":"Ladizinsky","given":"N."},{"family":"Oh","given":"T."},{"family":"Perminov","given":"I."},{"family":"Rich","given":"C."},{"family":"Thom","given":"M. C."},{"family":"Tolkacheva","given":"E."},{"family":"Truncik","given":"C. J. S."},{"family":"Uchaikin","given":"S."},{"family":"Wang","given":"J."},{"family":"Wilson","given":"B."},{"family":"Rose","given":"G."}],"container-title":"Nature","id":"Johnson2011","issue":"7346","issued":{"date-parts":[[2011]]},"page":"194-198","publisher":"Nature Publishing Group","title":"Quantum annealing with manufactured spins","type":"article-journal","volume":"473"}}],"isEdited":false,"manualOverride":{"citeprocText":"(Johnson et al. 2011)","isManuallyOverridden":false,"manualOverrideText":""},"mendeley":{"formattedCitation":"(Johnson et al. 2011)","plainTextFormattedCitation":"(Johnson et al. 2011)","previouslyFormattedCitation":"(Johnson et al. 2011)"},"properties":{"noteIndex":0},"schema":"https://github.com/citation-style-language/schema/raw/master/csl-citation.json"}</w:instrText>
       </w:r>
       <w:r>
         <w:fldChar w:fldCharType="separate"/>
@@ -8243,7 +8433,7 @@
         <w:fldChar w:fldCharType="begin"/>
       </w:r>
       <w:r>
-        <w:instrText xml:space="preserve">ADDIN CSL_CITATION {"citationID":"MENDELEY_CITATION_106","citationItems":[{"id":"ITEM-106","isTemporary":false,"itemData":{"URL":"https://arxiv.org/abs/1411.4028","author":[{"family":"Farhi","given":"Edward"},{"family":"Goldstone","given":"Jeffrey"},{"family":"Gutmann","given":"Sam"}],"id":"Farhi2014","issued":{"date-parts":[[2014]]},"title":"A quantum approximate optimization algorithm","type":""}}],"isEdited":false,"manualOverride":{"citeprocText":"(Farhi, Goldstone, and Gutmann 2014)","isManuallyOverridden":false,"manualOverrideText":""},"mendeley":{"formattedCitation":"(Farhi, Goldstone, and Gutmann 2014)","plainTextFormattedCitation":"(Farhi, Goldstone, and Gutmann 2014)","previouslyFormattedCitation":"(Farhi, Goldstone, and Gutmann 2014)"},"properties":{"noteIndex":0},"schema":"https://github.com/citation-style-language/schema/raw/master/csl-citation.json"}</w:instrText>
+        <w:instrText xml:space="preserve">ADDIN CSL_CITATION {"citationID":"MENDELEY_CITATION_119","citationItems":[{"id":"ITEM-119","isTemporary":false,"itemData":{"URL":"https://arxiv.org/abs/1411.4028","author":[{"family":"Farhi","given":"Edward"},{"family":"Goldstone","given":"Jeffrey"},{"family":"Gutmann","given":"Sam"}],"id":"Farhi2014","issued":{"date-parts":[[2014]]},"title":"A quantum approximate optimization algorithm","type":""}}],"isEdited":false,"manualOverride":{"citeprocText":"(Farhi, Goldstone, and Gutmann 2014)","isManuallyOverridden":false,"manualOverrideText":""},"mendeley":{"formattedCitation":"(Farhi, Goldstone, and Gutmann 2014)","plainTextFormattedCitation":"(Farhi, Goldstone, and Gutmann 2014)","previouslyFormattedCitation":"(Farhi, Goldstone, and Gutmann 2014)"},"properties":{"noteIndex":0},"schema":"https://github.com/citation-style-language/schema/raw/master/csl-citation.json"}</w:instrText>
       </w:r>
       <w:r>
         <w:fldChar w:fldCharType="separate"/>
@@ -8318,7 +8508,7 @@
         <w:fldChar w:fldCharType="begin"/>
       </w:r>
       <w:r>
-        <w:instrText xml:space="preserve">ADDIN CSL_CITATION {"citationID":"MENDELEY_CITATION_107","citationItems":[{"id":"ITEM-107","isTemporary":false,"itemData":{"DOI":"10.3390/a12020034","author":[{"family":"Hadfield","given":"Stuart"},{"family":"Wang","given":"Zhihui"},{"family":"O’Gorman","given":"Bryan"},{"family":"Rieffel","given":"Eleanor G."},{"family":"Venturelli","given":"Davide"},{"family":"Biswas","given":"Rupak"}],"container-title":"Algorithms","id":"Hadfield2019","issue":"2","issued":{"date-parts":[[2019]]},"page":"34","publisher":"MDPI","title":"From the quantum approximate optimization algorithm to a quantum alternating operator ansatz","type":"article-journal","volume":"12"},"suppress-author":false}],"isEdited":false,"manualOverride":{"citeprocText":"Hadfield et al. (2019)","isManuallyOverridden":false,"manualOverrideText":""},"mendeley":{"formattedCitation":"Hadfield et al. (2019)","plainTextFormattedCitation":"Hadfield et al. (2019)","previouslyFormattedCitation":"Hadfield et al. (2019)"},"properties":{"noteIndex":0},"schema":"https://github.com/citation-style-language/schema/raw/master/csl-citation.json"}</w:instrText>
+        <w:instrText xml:space="preserve">ADDIN CSL_CITATION {"citationID":"MENDELEY_CITATION_120","citationItems":[{"id":"ITEM-120","isTemporary":false,"itemData":{"DOI":"10.3390/a12020034","author":[{"family":"Hadfield","given":"Stuart"},{"family":"Wang","given":"Zhihui"},{"family":"O’Gorman","given":"Bryan"},{"family":"Rieffel","given":"Eleanor G."},{"family":"Venturelli","given":"Davide"},{"family":"Biswas","given":"Rupak"}],"container-title":"Algorithms","id":"Hadfield2019","issue":"2","issued":{"date-parts":[[2019]]},"page":"34","publisher":"MDPI","title":"From the quantum approximate optimization algorithm to a quantum alternating operator ansatz","type":"article-journal","volume":"12"},"suppress-author":false}],"isEdited":false,"manualOverride":{"citeprocText":"Hadfield et al. (2019)","isManuallyOverridden":false,"manualOverrideText":""},"mendeley":{"formattedCitation":"Hadfield et al. (2019)","plainTextFormattedCitation":"Hadfield et al. (2019)","previouslyFormattedCitation":"Hadfield et al. (2019)"},"properties":{"noteIndex":0},"schema":"https://github.com/citation-style-language/schema/raw/master/csl-citation.json"}</w:instrText>
       </w:r>
       <w:r>
         <w:fldChar w:fldCharType="separate"/>
@@ -8342,7 +8532,7 @@
         <w:fldChar w:fldCharType="begin"/>
       </w:r>
       <w:r>
-        <w:instrText xml:space="preserve">ADDIN CSL_CITATION {"citationID":"MENDELEY_CITATION_108","citationItems":[{"id":"ITEM-108","isTemporary":false,"itemData":{"DOI":"10.1103/PhysRevX.10.021067","author":[{"family":"Zhou","given":"Leo"},{"family":"Wang","given":"Sheng-Tao"},{"family":"Choi","given":"Soonwon"},{"family":"Pichler","given":"Hannes"},{"family":"Lukin","given":"Mikhail D."}],"container-title":"Physical Review X","id":"Zhou2020","issue":"2","issued":{"date-parts":[[2020]]},"page":"021067","publisher":"American Physical Society","title":"Quantum approximate optimization algorithm: Performance, mechanism, and implementation on near-term devices","title-short":"Quantum approximate optimization algorithm","type":"article-journal","volume":"10"},"suppress-author":false}],"isEdited":false,"manualOverride":{"citeprocText":"Zhou et al. (2020)","isManuallyOverridden":false,"manualOverrideText":""},"mendeley":{"formattedCitation":"Zhou et al. (2020)","plainTextFormattedCitation":"Zhou et al. (2020)","previouslyFormattedCitation":"Zhou et al. (2020)"},"properties":{"noteIndex":0},"schema":"https://github.com/citation-style-language/schema/raw/master/csl-citation.json"}</w:instrText>
+        <w:instrText xml:space="preserve">ADDIN CSL_CITATION {"citationID":"MENDELEY_CITATION_121","citationItems":[{"id":"ITEM-121","isTemporary":false,"itemData":{"DOI":"10.1103/PhysRevX.10.021067","author":[{"family":"Zhou","given":"Leo"},{"family":"Wang","given":"Sheng-Tao"},{"family":"Choi","given":"Soonwon"},{"family":"Pichler","given":"Hannes"},{"family":"Lukin","given":"Mikhail D."}],"container-title":"Physical Review X","id":"Zhou2020","issue":"2","issued":{"date-parts":[[2020]]},"page":"021067","publisher":"American Physical Society","title":"Quantum approximate optimization algorithm: Performance, mechanism, and implementation on near-term devices","title-short":"Quantum approximate optimization algorithm","type":"article-journal","volume":"10"},"suppress-author":false}],"isEdited":false,"manualOverride":{"citeprocText":"Zhou et al. (2020)","isManuallyOverridden":false,"manualOverrideText":""},"mendeley":{"formattedCitation":"Zhou et al. (2020)","plainTextFormattedCitation":"Zhou et al. (2020)","previouslyFormattedCitation":"Zhou et al. (2020)"},"properties":{"noteIndex":0},"schema":"https://github.com/citation-style-language/schema/raw/master/csl-citation.json"}</w:instrText>
       </w:r>
       <w:r>
         <w:fldChar w:fldCharType="separate"/>
@@ -8377,7 +8567,7 @@
         <w:fldChar w:fldCharType="begin"/>
       </w:r>
       <w:r>
-        <w:instrText xml:space="preserve">ADDIN CSL_CITATION {"citationID":"MENDELEY_CITATION_109","citationItems":[{"id":"ITEM-109","isTemporary":false,"itemData":{"DOI":"10.22331/q-2020-04-20-256","author":[{"family":"Barkoutsos","given":"Panagiotis Kl."},{"family":"Nannicini","given":"Giacomo"},{"family":"Robert","given":"Anton"},{"family":"Tavernelli","given":"Ivano"},{"family":"Woerner","given":"Stefan"}],"container-title":"Quantum","id":"Barkoutsos2020","issued":{"date-parts":[[2020]]},"page":"256","publisher":"Verein zur Förderung des Open Access Publizierens in den Quantenwissenschaften","title":"Improving variational quantum optimization using CVaR","type":"article-journal","volume":"4"},"suppress-author":false}],"isEdited":false,"manualOverride":{"citeprocText":"Barkoutsos et al. (2020)","isManuallyOverridden":false,"manualOverrideText":""},"mendeley":{"formattedCitation":"Barkoutsos et al. (2020)","plainTextFormattedCitation":"Barkoutsos et al. (2020)","previouslyFormattedCitation":"Barkoutsos et al. (2020)"},"properties":{"noteIndex":0},"schema":"https://github.com/citation-style-language/schema/raw/master/csl-citation.json"}</w:instrText>
+        <w:instrText xml:space="preserve">ADDIN CSL_CITATION {"citationID":"MENDELEY_CITATION_122","citationItems":[{"id":"ITEM-122","isTemporary":false,"itemData":{"DOI":"10.22331/q-2020-04-20-256","author":[{"family":"Barkoutsos","given":"Panagiotis Kl."},{"family":"Nannicini","given":"Giacomo"},{"family":"Robert","given":"Anton"},{"family":"Tavernelli","given":"Ivano"},{"family":"Woerner","given":"Stefan"}],"container-title":"Quantum","id":"Barkoutsos2020","issued":{"date-parts":[[2020]]},"page":"256","publisher":"Verein zur Förderung des Open Access Publizierens in den Quantenwissenschaften","title":"Improving variational quantum optimization using CVaR","type":"article-journal","volume":"4"},"suppress-author":false}],"isEdited":false,"manualOverride":{"citeprocText":"Barkoutsos et al. (2020)","isManuallyOverridden":false,"manualOverrideText":""},"mendeley":{"formattedCitation":"Barkoutsos et al. (2020)","plainTextFormattedCitation":"Barkoutsos et al. (2020)","previouslyFormattedCitation":"Barkoutsos et al. (2020)"},"properties":{"noteIndex":0},"schema":"https://github.com/citation-style-language/schema/raw/master/csl-citation.json"}</w:instrText>
       </w:r>
       <w:r>
         <w:fldChar w:fldCharType="separate"/>
@@ -8401,7 +8591,7 @@
         <w:fldChar w:fldCharType="begin"/>
       </w:r>
       <w:r>
-        <w:instrText xml:space="preserve">ADDIN CSL_CITATION {"citationID":"MENDELEY_CITATION_110","citationItems":[{"id":"ITEM-110","isTemporary":false,"itemData":{"DOI":"10.1007/s11128-014-0892-x","author":[{"family":"Rieffel","given":"Eleanor G."},{"family":"Venturelli","given":"Davide"},{"family":"O’Gorman","given":"Bryan"},{"family":"Do","given":"Minh B."},{"family":"Prystay","given":"Elicia M."},{"family":"Smelyanskiy","given":"Vadim N."}],"container-title":"Quantum Information Processing","id":"Rieffel2015","issue":"1","issued":{"date-parts":[[2015]]},"page":"1-36","title":"A case study in programming a quantum annealer for hard operational planning problems","type":"article-journal","volume":"14"},"suppress-author":false}],"isEdited":false,"manualOverride":{"citeprocText":"Rieffel et al. (2015)","isManuallyOverridden":false,"manualOverrideText":""},"mendeley":{"formattedCitation":"Rieffel et al. (2015)","plainTextFormattedCitation":"Rieffel et al. (2015)","previouslyFormattedCitation":"Rieffel et al. (2015)"},"properties":{"noteIndex":0},"schema":"https://github.com/citation-style-language/schema/raw/master/csl-citation.json"}</w:instrText>
+        <w:instrText xml:space="preserve">ADDIN CSL_CITATION {"citationID":"MENDELEY_CITATION_123","citationItems":[{"id":"ITEM-123","isTemporary":false,"itemData":{"DOI":"10.1007/s11128-014-0892-x","author":[{"family":"Rieffel","given":"Eleanor G."},{"family":"Venturelli","given":"Davide"},{"family":"O’Gorman","given":"Bryan"},{"family":"Do","given":"Minh B."},{"family":"Prystay","given":"Elicia M."},{"family":"Smelyanskiy","given":"Vadim N."}],"container-title":"Quantum Information Processing","id":"Rieffel2015","issue":"1","issued":{"date-parts":[[2015]]},"page":"1-36","title":"A case study in programming a quantum annealer for hard operational planning problems","type":"article-journal","volume":"14"},"suppress-author":false}],"isEdited":false,"manualOverride":{"citeprocText":"Rieffel et al. (2015)","isManuallyOverridden":false,"manualOverrideText":""},"mendeley":{"formattedCitation":"Rieffel et al. (2015)","plainTextFormattedCitation":"Rieffel et al. (2015)","previouslyFormattedCitation":"Rieffel et al. (2015)"},"properties":{"noteIndex":0},"schema":"https://github.com/citation-style-language/schema/raw/master/csl-citation.json"}</w:instrText>
       </w:r>
       <w:r>
         <w:fldChar w:fldCharType="separate"/>
@@ -8425,7 +8615,7 @@
         <w:fldChar w:fldCharType="begin"/>
       </w:r>
       <w:r>
-        <w:instrText xml:space="preserve">ADDIN CSL_CITATION {"citationID":"MENDELEY_CITATION_111","citationItems":[{"id":"ITEM-111","isTemporary":false,"itemData":{"DOI":"10.3389/fict.2017.00029","author":[{"family":"Neukart","given":"Florian"},{"family":"Compostella","given":"Gabriele"},{"family":"Seidel","given":"Christian"},{"dropping-particle":"von","family":"Dollen","given":"David"},{"family":"Yarkoni","given":"Sheir"},{"family":"Parney","given":"Bob"}],"container-title":"Frontiers in ICT","id":"Neukart2017","issued":{"date-parts":[[2017]]},"page":"29","title":"Traffic flow optimization using a quantum annealer","type":"article-journal","volume":"4"},"suppress-author":false}],"isEdited":false,"manualOverride":{"citeprocText":"Neukart et al. (2017)","isManuallyOverridden":false,"manualOverrideText":""},"mendeley":{"formattedCitation":"Neukart et al. (2017)","plainTextFormattedCitation":"Neukart et al. (2017)","previouslyFormattedCitation":"Neukart et al. (2017)"},"properties":{"noteIndex":0},"schema":"https://github.com/citation-style-language/schema/raw/master/csl-citation.json"}</w:instrText>
+        <w:instrText xml:space="preserve">ADDIN CSL_CITATION {"citationID":"MENDELEY_CITATION_124","citationItems":[{"id":"ITEM-124","isTemporary":false,"itemData":{"DOI":"10.3389/fict.2017.00029","author":[{"family":"Neukart","given":"Florian"},{"family":"Compostella","given":"Gabriele"},{"family":"Seidel","given":"Christian"},{"dropping-particle":"von","family":"Dollen","given":"David"},{"family":"Yarkoni","given":"Sheir"},{"family":"Parney","given":"Bob"}],"container-title":"Frontiers in ICT","id":"Neukart2017","issued":{"date-parts":[[2017]]},"page":"29","title":"Traffic flow optimization using a quantum annealer","type":"article-journal","volume":"4"},"suppress-author":false}],"isEdited":false,"manualOverride":{"citeprocText":"Neukart et al. (2017)","isManuallyOverridden":false,"manualOverrideText":""},"mendeley":{"formattedCitation":"Neukart et al. (2017)","plainTextFormattedCitation":"Neukart et al. (2017)","previouslyFormattedCitation":"Neukart et al. (2017)"},"properties":{"noteIndex":0},"schema":"https://github.com/citation-style-language/schema/raw/master/csl-citation.json"}</w:instrText>
       </w:r>
       <w:r>
         <w:fldChar w:fldCharType="separate"/>
@@ -8449,7 +8639,7 @@
         <w:fldChar w:fldCharType="begin"/>
       </w:r>
       <w:r>
-        <w:instrText xml:space="preserve">ADDIN CSL_CITATION {"citationID":"MENDELEY_CITATION_112","citationItems":[{"id":"ITEM-112","isTemporary":false,"itemData":{"DOI":"10.1088/1361-6633/ac8c54","author":[{"family":"Yarkoni","given":"Sheir"},{"family":"Raponi","given":"Elena"},{"family":"Bäck","given":"Thomas"},{"family":"Schmitt","given":"Sebastian"}],"container-title":"Reports on Progress in Physics","id":"Yarkoni2022","issue":"10","issued":{"date-parts":[[2022]]},"page":"104001","title":"Quantum annealing for industry applications: Introduction and review","title-short":"Quantum annealing for industry applications","type":"article-journal","volume":"85"},"suppress-author":false}],"isEdited":false,"manualOverride":{"citeprocText":"Yarkoni et al. (2022)","isManuallyOverridden":false,"manualOverrideText":""},"mendeley":{"formattedCitation":"Yarkoni et al. (2022)","plainTextFormattedCitation":"Yarkoni et al. (2022)","previouslyFormattedCitation":"Yarkoni et al. (2022)"},"properties":{"noteIndex":0},"schema":"https://github.com/citation-style-language/schema/raw/master/csl-citation.json"}</w:instrText>
+        <w:instrText xml:space="preserve">ADDIN CSL_CITATION {"citationID":"MENDELEY_CITATION_125","citationItems":[{"id":"ITEM-125","isTemporary":false,"itemData":{"DOI":"10.1088/1361-6633/ac8c54","author":[{"family":"Yarkoni","given":"Sheir"},{"family":"Raponi","given":"Elena"},{"family":"Bäck","given":"Thomas"},{"family":"Schmitt","given":"Sebastian"}],"container-title":"Reports on Progress in Physics","id":"Yarkoni2022","issue":"10","issued":{"date-parts":[[2022]]},"page":"104001","title":"Quantum annealing for industry applications: Introduction and review","title-short":"Quantum annealing for industry applications","type":"article-journal","volume":"85"},"suppress-author":false}],"isEdited":false,"manualOverride":{"citeprocText":"Yarkoni et al. (2022)","isManuallyOverridden":false,"manualOverrideText":""},"mendeley":{"formattedCitation":"Yarkoni et al. (2022)","plainTextFormattedCitation":"Yarkoni et al. (2022)","previouslyFormattedCitation":"Yarkoni et al. (2022)"},"properties":{"noteIndex":0},"schema":"https://github.com/citation-style-language/schema/raw/master/csl-citation.json"}</w:instrText>
       </w:r>
       <w:r>
         <w:fldChar w:fldCharType="separate"/>
@@ -8481,7 +8671,7 @@
         <w:fldChar w:fldCharType="begin"/>
       </w:r>
       <w:r>
-        <w:instrText xml:space="preserve">ADDIN CSL_CITATION {"citationID":"MENDELEY_CITATION_113","citationItems":[{"id":"ITEM-113","isTemporary":false,"itemData":{"DOI":"10.1038/s41598-019-43176-9","author":[{"family":"Guerreschi","given":"Gian Giacomo"},{"family":"Matsuura","given":"Anne Y."}],"container-title":"Scientific Reports","id":"Guerreschi2019","issued":{"date-parts":[[2019]]},"page":"6903","publisher":"Nature Publishing Group","title":"QAOA for Max-Cut requires hundreds of qubits for quantum speed-up","type":"article-journal","volume":"9"},"suppress-author":false}],"isEdited":false,"manualOverride":{"citeprocText":"Guerreschi and Matsuura (2019)","isManuallyOverridden":false,"manualOverrideText":""},"mendeley":{"formattedCitation":"Guerreschi and Matsuura (2019)","plainTextFormattedCitation":"Guerreschi and Matsuura (2019)","previouslyFormattedCitation":"Guerreschi and Matsuura (2019)"},"properties":{"noteIndex":0},"schema":"https://github.com/citation-style-language/schema/raw/master/csl-citation.json"}</w:instrText>
+        <w:instrText xml:space="preserve">ADDIN CSL_CITATION {"citationID":"MENDELEY_CITATION_126","citationItems":[{"id":"ITEM-126","isTemporary":false,"itemData":{"DOI":"10.1038/s41598-019-43176-9","author":[{"family":"Guerreschi","given":"Gian Giacomo"},{"family":"Matsuura","given":"Anne Y."}],"container-title":"Scientific Reports","id":"Guerreschi2019","issued":{"date-parts":[[2019]]},"page":"6903","publisher":"Nature Publishing Group","title":"QAOA for Max-Cut requires hundreds of qubits for quantum speed-up","type":"article-journal","volume":"9"},"suppress-author":false}],"isEdited":false,"manualOverride":{"citeprocText":"Guerreschi and Matsuura (2019)","isManuallyOverridden":false,"manualOverrideText":""},"mendeley":{"formattedCitation":"Guerreschi and Matsuura (2019)","plainTextFormattedCitation":"Guerreschi and Matsuura (2019)","previouslyFormattedCitation":"Guerreschi and Matsuura (2019)"},"properties":{"noteIndex":0},"schema":"https://github.com/citation-style-language/schema/raw/master/csl-citation.json"}</w:instrText>
       </w:r>
       <w:r>
         <w:fldChar w:fldCharType="separate"/>
@@ -8534,7 +8724,7 @@
         <w:fldChar w:fldCharType="begin"/>
       </w:r>
       <w:r>
-        <w:instrText xml:space="preserve">ADDIN CSL_CITATION {"citationID":"MENDELEY_CITATION_114","citationItems":[{"id":"ITEM-114","isTemporary":false,"itemData":{"DOI":"10.3389/fcomp.2019.00009","author":[{"family":"Ohzeki","given":"Masayuki"},{"family":"Miki","given":"Akira"},{"family":"Miyama","given":"Masamichi J."},{"family":"Terabe","given":"Masayoshi"}],"container-title":"Frontiers in Computer Science","id":"Ohzeki2019","issued":{"date-parts":[[2019]]},"page":"9","publisher":"Frontiers Media","title":"Control of automated guided vehicles without collision by quantum annealer and digital devices","type":"article-journal","volume":"1"},"suppress-author":false}],"isEdited":false,"manualOverride":{"citeprocText":"Ohzeki et al. (2019)","isManuallyOverridden":false,"manualOverrideText":""},"mendeley":{"formattedCitation":"Ohzeki et al. (2019)","plainTextFormattedCitation":"Ohzeki et al. (2019)","previouslyFormattedCitation":"Ohzeki et al. (2019)"},"properties":{"noteIndex":0},"schema":"https://github.com/citation-style-language/schema/raw/master/csl-citation.json"}</w:instrText>
+        <w:instrText xml:space="preserve">ADDIN CSL_CITATION {"citationID":"MENDELEY_CITATION_127","citationItems":[{"id":"ITEM-127","isTemporary":false,"itemData":{"DOI":"10.3389/fcomp.2019.00009","author":[{"family":"Ohzeki","given":"Masayuki"},{"family":"Miki","given":"Akira"},{"family":"Miyama","given":"Masamichi J."},{"family":"Terabe","given":"Masayoshi"}],"container-title":"Frontiers in Computer Science","id":"Ohzeki2019","issued":{"date-parts":[[2019]]},"page":"9","publisher":"Frontiers Media","title":"Control of automated guided vehicles without collision by quantum annealer and digital devices","type":"article-journal","volume":"1"},"suppress-author":false}],"isEdited":false,"manualOverride":{"citeprocText":"Ohzeki et al. (2019)","isManuallyOverridden":false,"manualOverrideText":""},"mendeley":{"formattedCitation":"Ohzeki et al. (2019)","plainTextFormattedCitation":"Ohzeki et al. (2019)","previouslyFormattedCitation":"Ohzeki et al. (2019)"},"properties":{"noteIndex":0},"schema":"https://github.com/citation-style-language/schema/raw/master/csl-citation.json"}</w:instrText>
       </w:r>
       <w:r>
         <w:fldChar w:fldCharType="separate"/>
@@ -8560,7 +8750,7 @@
         <w:fldChar w:fldCharType="begin"/>
       </w:r>
       <w:r>
-        <w:instrText xml:space="preserve">ADDIN CSL_CITATION {"citationID":"MENDELEY_CITATION_115","citationItems":[{"id":"ITEM-115","isTemporary":false,"itemData":{"DOI":"10.1038/s41598-025-28481-w","author":[{"family":"Quang","given":"Thinh Nguyen"},{"family":"Matsuyama","given":"Kosuke"},{"family":"Shimizu","given":"Keisuke"},{"family":"Sugano","given":"Hiroki"},{"family":"Kurimoto","given":"Eiji"},{"family":"Miki","given":"Masahiro"},{"family":"Suzuki","given":"Jumpei"},{"family":"Chen","given":"Ziyi"},{"family":"Waidyasooriya","given":"Hasitha Muthumala"},{"family":"Hariyama","given":"Masanori"},{"family":"Hitomi","given":"Masaru"},{"family":"Sawamura","given":"Kenta"},{"family":"Ohzeki","given":"Masayuki"}],"container-title":"Scientific Reports","id":"Quang2025","issued":{"date-parts":[[2025]]},"page":"44047","publisher":"Nature Publishing Group","title":"Quantum annealing-based route optimization for commercial AGV operating systems in large-scale logistics warehouses","type":"article-journal","volume":"15"},"suppress-author":false}],"isEdited":false,"manualOverride":{"citeprocText":"Quang et al. (2025)","isManuallyOverridden":false,"manualOverrideText":""},"mendeley":{"formattedCitation":"Quang et al. (2025)","plainTextFormattedCitation":"Quang et al. (2025)","previouslyFormattedCitation":"Quang et al. (2025)"},"properties":{"noteIndex":0},"schema":"https://github.com/citation-style-language/schema/raw/master/csl-citation.json"}</w:instrText>
+        <w:instrText xml:space="preserve">ADDIN CSL_CITATION {"citationID":"MENDELEY_CITATION_128","citationItems":[{"id":"ITEM-128","isTemporary":false,"itemData":{"DOI":"10.1038/s41598-025-28481-w","author":[{"family":"Quang","given":"Thinh Nguyen"},{"family":"Matsuyama","given":"Kosuke"},{"family":"Shimizu","given":"Keisuke"},{"family":"Sugano","given":"Hiroki"},{"family":"Kurimoto","given":"Eiji"},{"family":"Miki","given":"Masahiro"},{"family":"Suzuki","given":"Jumpei"},{"family":"Chen","given":"Ziyi"},{"family":"Waidyasooriya","given":"Hasitha Muthumala"},{"family":"Hariyama","given":"Masanori"},{"family":"Hitomi","given":"Masaru"},{"family":"Sawamura","given":"Kenta"},{"family":"Ohzeki","given":"Masayuki"}],"container-title":"Scientific Reports","id":"Quang2025","issued":{"date-parts":[[2025]]},"page":"44047","publisher":"Nature Publishing Group","title":"Quantum annealing-based route optimization for commercial AGV operating systems in large-scale logistics warehouses","type":"article-journal","volume":"15"},"suppress-author":false}],"isEdited":false,"manualOverride":{"citeprocText":"Quang et al. (2025)","isManuallyOverridden":false,"manualOverrideText":""},"mendeley":{"formattedCitation":"Quang et al. (2025)","plainTextFormattedCitation":"Quang et al. (2025)","previouslyFormattedCitation":"Quang et al. (2025)"},"properties":{"noteIndex":0},"schema":"https://github.com/citation-style-language/schema/raw/master/csl-citation.json"}</w:instrText>
       </w:r>
       <w:r>
         <w:fldChar w:fldCharType="separate"/>
@@ -8603,7 +8793,7 @@
         <w:fldChar w:fldCharType="begin"/>
       </w:r>
       <w:r>
-        <w:instrText xml:space="preserve">ADDIN CSL_CITATION {"citationID":"MENDELEY_CITATION_116","citationItems":[{"id":"ITEM-116","isTemporary":false,"itemData":{"DOI":"10.1145/3293320.3293333","author":[{"family":"Clark","given":"James"},{"family":"West","given":"Tristan"},{"family":"Zammit","given":"Joseph Paul"},{"family":"Guo","given":"Xiaohu"},{"family":"Mason","given":"Luke"},{"family":"Russell","given":"Duncan"}],"container-title":"Proceedings of the international conference on high performance computing in asia-pacific region (HPC Asia 2019)","id":"Clark2019","issued":{"date-parts":[[2019]]},"page":"111-119","publisher":"ACM","publisher-place":"New York, NY, USA","title":"Towards real time multi-robot routing using quantum computing technologies","type":"paper-conference"},"suppress-author":false}],"isEdited":false,"manualOverride":{"citeprocText":"Clark et al. (2019)","isManuallyOverridden":false,"manualOverrideText":""},"mendeley":{"formattedCitation":"Clark et al. (2019)","plainTextFormattedCitation":"Clark et al. (2019)","previouslyFormattedCitation":"Clark et al. (2019)"},"properties":{"noteIndex":0},"schema":"https://github.com/citation-style-language/schema/raw/master/csl-citation.json"}</w:instrText>
+        <w:instrText xml:space="preserve">ADDIN CSL_CITATION {"citationID":"MENDELEY_CITATION_129","citationItems":[{"id":"ITEM-129","isTemporary":false,"itemData":{"DOI":"10.1145/3293320.3293333","author":[{"family":"Clark","given":"James"},{"family":"West","given":"Tristan"},{"family":"Zammit","given":"Joseph Paul"},{"family":"Guo","given":"Xiaohu"},{"family":"Mason","given":"Luke"},{"family":"Russell","given":"Duncan"}],"container-title":"Proceedings of the international conference on high performance computing in asia-pacific region (HPC Asia 2019)","id":"Clark2019","issued":{"date-parts":[[2019]]},"page":"111-119","publisher":"ACM","publisher-place":"New York, NY, USA","title":"Towards real time multi-robot routing using quantum computing technologies","type":"paper-conference"},"suppress-author":false}],"isEdited":false,"manualOverride":{"citeprocText":"Clark et al. (2019)","isManuallyOverridden":false,"manualOverrideText":""},"mendeley":{"formattedCitation":"Clark et al. (2019)","plainTextFormattedCitation":"Clark et al. (2019)","previouslyFormattedCitation":"Clark et al. (2019)"},"properties":{"noteIndex":0},"schema":"https://github.com/citation-style-language/schema/raw/master/csl-citation.json"}</w:instrText>
       </w:r>
       <w:r>
         <w:fldChar w:fldCharType="separate"/>
@@ -8639,7 +8829,7 @@
         <w:fldChar w:fldCharType="begin"/>
       </w:r>
       <w:r>
-        <w:instrText xml:space="preserve">ADDIN CSL_CITATION {"citationID":"MENDELEY_CITATION_117","citationItems":[{"id":"ITEM-117","isTemporary":false,"itemData":{"DOI":"10.1109/IISWC53511.2021.00015","author":[{"family":"Ravi","given":"Gokul Subramanian"},{"family":"Smith","given":"Kaitlin N."},{"family":"Gokhale","given":"Pranav"},{"family":"Chong","given":"Frederic T."}],"container-title":"2021 IEEE international symposium on workload characterization (IISWC)","id":"Ravi2021","issued":{"date-parts":[[2021]]},"page":"39-50","publisher":"IEEE","title":"Quantum computing in the cloud: Analyzing job and machine characteristics","title-short":"Quantum computing in the cloud","type":"paper-conference"}}],"isEdited":false,"manualOverride":{"citeprocText":"(Ravi et al. 2021)","isManuallyOverridden":false,"manualOverrideText":""},"mendeley":{"formattedCitation":"(Ravi et al. 2021)","plainTextFormattedCitation":"(Ravi et al. 2021)","previouslyFormattedCitation":"(Ravi et al. 2021)"},"properties":{"noteIndex":0},"schema":"https://github.com/citation-style-language/schema/raw/master/csl-citation.json"}</w:instrText>
+        <w:instrText xml:space="preserve">ADDIN CSL_CITATION {"citationID":"MENDELEY_CITATION_130","citationItems":[{"id":"ITEM-130","isTemporary":false,"itemData":{"DOI":"10.1109/IISWC53511.2021.00015","author":[{"family":"Ravi","given":"Gokul Subramanian"},{"family":"Smith","given":"Kaitlin N."},{"family":"Gokhale","given":"Pranav"},{"family":"Chong","given":"Frederic T."}],"container-title":"2021 IEEE international symposium on workload characterization (IISWC)","id":"Ravi2021","issued":{"date-parts":[[2021]]},"page":"39-50","publisher":"IEEE","title":"Quantum computing in the cloud: Analyzing job and machine characteristics","title-short":"Quantum computing in the cloud","type":"paper-conference"}}],"isEdited":false,"manualOverride":{"citeprocText":"(Ravi et al. 2021)","isManuallyOverridden":false,"manualOverrideText":""},"mendeley":{"formattedCitation":"(Ravi et al. 2021)","plainTextFormattedCitation":"(Ravi et al. 2021)","previouslyFormattedCitation":"(Ravi et al. 2021)"},"properties":{"noteIndex":0},"schema":"https://github.com/citation-style-language/schema/raw/master/csl-citation.json"}</w:instrText>
       </w:r>
       <w:r>
         <w:fldChar w:fldCharType="separate"/>
@@ -8668,7 +8858,7 @@
         <w:fldChar w:fldCharType="begin"/>
       </w:r>
       <w:r>
-        <w:instrText xml:space="preserve">ADDIN CSL_CITATION {"citationID":"MENDELEY_CITATION_118","citationItems":[{"id":"ITEM-118","isTemporary":false,"itemData":{"DOI":"10.1038/s41598-024-72101-y","author":[{"family":"Śmierzchalski","given":"Tomasz"},{"family":"Pawłowski","given":"Jakub"},{"family":"Przybysz","given":"Artur"},{"family":"Pawela","given":"Łukasz"},{"family":"Puchała","given":"Zbigniew"},{"family":"Koniorczyk","given":"Mátyás"},{"family":"Gardas","given":"Bartłomiej"},{"family":"Deffner","given":"Sebastian"},{"family":"Domino","given":"Krzysztof"}],"container-title":"Scientific Reports","id":"Smierzchalski2024","issued":{"date-parts":[[2024]]},"page":"21809","publisher":"Nature Publishing Group","title":"Hybrid quantum-classical computation for automatic guided vehicles scheduling","type":"article-journal","volume":"14"},"suppress-author":false}],"isEdited":false,"manualOverride":{"citeprocText":"Śmierzchalski et al. (2024)","isManuallyOverridden":false,"manualOverrideText":""},"mendeley":{"formattedCitation":"Śmierzchalski et al. (2024)","plainTextFormattedCitation":"Śmierzchalski et al. (2024)","previouslyFormattedCitation":"Śmierzchalski et al. (2024)"},"properties":{"noteIndex":0},"schema":"https://github.com/citation-style-language/schema/raw/master/csl-citation.json"}</w:instrText>
+        <w:instrText xml:space="preserve">ADDIN CSL_CITATION {"citationID":"MENDELEY_CITATION_131","citationItems":[{"id":"ITEM-131","isTemporary":false,"itemData":{"DOI":"10.1038/s41598-024-72101-y","author":[{"family":"Śmierzchalski","given":"Tomasz"},{"family":"Pawłowski","given":"Jakub"},{"family":"Przybysz","given":"Artur"},{"family":"Pawela","given":"Łukasz"},{"family":"Puchała","given":"Zbigniew"},{"family":"Koniorczyk","given":"Mátyás"},{"family":"Gardas","given":"Bartłomiej"},{"family":"Deffner","given":"Sebastian"},{"family":"Domino","given":"Krzysztof"}],"container-title":"Scientific Reports","id":"Smierzchalski2024","issued":{"date-parts":[[2024]]},"page":"21809","publisher":"Nature Publishing Group","title":"Hybrid quantum-classical computation for automatic guided vehicles scheduling","type":"article-journal","volume":"14"},"suppress-author":false}],"isEdited":false,"manualOverride":{"citeprocText":"Śmierzchalski et al. (2024)","isManuallyOverridden":false,"manualOverrideText":""},"mendeley":{"formattedCitation":"Śmierzchalski et al. (2024)","plainTextFormattedCitation":"Śmierzchalski et al. (2024)","previouslyFormattedCitation":"Śmierzchalski et al. (2024)"},"properties":{"noteIndex":0},"schema":"https://github.com/citation-style-language/schema/raw/master/csl-citation.json"}</w:instrText>
       </w:r>
       <w:r>
         <w:fldChar w:fldCharType="separate"/>
@@ -8692,7 +8882,7 @@
         <w:fldChar w:fldCharType="begin"/>
       </w:r>
       <w:r>
-        <w:instrText xml:space="preserve">ADDIN CSL_CITATION {"citationID":"MENDELEY_CITATION_119","citationItems":[{"id":"ITEM-119","isTemporary":false,"itemData":{"DOI":"10.1038/s41598-023-45668-1","author":[{"family":"Leib","given":"Dominik"},{"family":"Seidel","given":"Tobias"},{"family":"Jäger","given":"Sven"},{"family":"Heese","given":"Raoul"},{"family":"Jones","given":"Caitlin Isobel"},{"family":"Awasthi","given":"Abhishek"},{"family":"Niederle","given":"Astrid"},{"family":"Bortz","given":"Michael"}],"container-title":"Scientific Reports","id":"Leib2023","issued":{"date-parts":[[2023]]},"publisher":"Nature Publishing Group","title":"An optimization case study for solving a transport robot scheduling problem on quantum-hybrid and quantum-inspired hardware","type":"article-journal","volume":"13"},"suppress-author":false}],"isEdited":false,"manualOverride":{"citeprocText":"Leib et al. (2023)","isManuallyOverridden":false,"manualOverrideText":""},"mendeley":{"formattedCitation":"Leib et al. (2023)","plainTextFormattedCitation":"Leib et al. (2023)","previouslyFormattedCitation":"Leib et al. (2023)"},"properties":{"noteIndex":0},"schema":"https://github.com/citation-style-language/schema/raw/master/csl-citation.json"}</w:instrText>
+        <w:instrText xml:space="preserve">ADDIN CSL_CITATION {"citationID":"MENDELEY_CITATION_132","citationItems":[{"id":"ITEM-132","isTemporary":false,"itemData":{"DOI":"10.1038/s41598-023-45668-1","author":[{"family":"Leib","given":"Dominik"},{"family":"Seidel","given":"Tobias"},{"family":"Jäger","given":"Sven"},{"family":"Heese","given":"Raoul"},{"family":"Jones","given":"Caitlin Isobel"},{"family":"Awasthi","given":"Abhishek"},{"family":"Niederle","given":"Astrid"},{"family":"Bortz","given":"Michael"}],"container-title":"Scientific Reports","id":"Leib2023","issued":{"date-parts":[[2023]]},"publisher":"Nature Publishing Group","title":"An optimization case study for solving a transport robot scheduling problem on quantum-hybrid and quantum-inspired hardware","type":"article-journal","volume":"13"},"suppress-author":false}],"isEdited":false,"manualOverride":{"citeprocText":"Leib et al. (2023)","isManuallyOverridden":false,"manualOverrideText":""},"mendeley":{"formattedCitation":"Leib et al. (2023)","plainTextFormattedCitation":"Leib et al. (2023)","previouslyFormattedCitation":"Leib et al. (2023)"},"properties":{"noteIndex":0},"schema":"https://github.com/citation-style-language/schema/raw/master/csl-citation.json"}</w:instrText>
       </w:r>
       <w:r>
         <w:fldChar w:fldCharType="separate"/>
@@ -8734,7 +8924,7 @@
         <w:fldChar w:fldCharType="begin"/>
       </w:r>
       <w:r>
-        <w:instrText xml:space="preserve">ADDIN CSL_CITATION {"citationID":"MENDELEY_CITATION_120","citationItems":[{"id":"ITEM-120","isTemporary":false,"itemData":{"DOI":"10.3390/a14070194","author":[{"family":"Atchade-Adelomou","given":"Parfait"},{"family":"Alonso-Linaje","given":"Guillermo"},{"family":"Albo-Canals","given":"Jordi"},{"family":"Casado-Fauli","given":"Daniel"}],"container-title":"Algorithms","id":"AtchadeAdelomou2021","issue":"7","issued":{"date-parts":[[2021]]},"page":"194","publisher":"MDPI","title":"qRobot: A quantum computing approach in mobile robot order picking and batching problem solver optimization","title-short":"qRobot","type":"article-journal","volume":"14"},"suppress-author":false}],"isEdited":false,"manualOverride":{"citeprocText":"Atchade-Adelomou et al. (2021)","isManuallyOverridden":false,"manualOverrideText":""},"mendeley":{"formattedCitation":"Atchade-Adelomou et al. (2021)","plainTextFormattedCitation":"Atchade-Adelomou et al. (2021)","previouslyFormattedCitation":"Atchade-Adelomou et al. (2021)"},"properties":{"noteIndex":0},"schema":"https://github.com/citation-style-language/schema/raw/master/csl-citation.json"}</w:instrText>
+        <w:instrText xml:space="preserve">ADDIN CSL_CITATION {"citationID":"MENDELEY_CITATION_133","citationItems":[{"id":"ITEM-133","isTemporary":false,"itemData":{"DOI":"10.3390/a14070194","author":[{"family":"Atchade-Adelomou","given":"Parfait"},{"family":"Alonso-Linaje","given":"Guillermo"},{"family":"Albo-Canals","given":"Jordi"},{"family":"Casado-Fauli","given":"Daniel"}],"container-title":"Algorithms","id":"AtchadeAdelomou2021","issue":"7","issued":{"date-parts":[[2021]]},"page":"194","publisher":"MDPI","title":"qRobot: A quantum computing approach in mobile robot order picking and batching problem solver optimization","title-short":"qRobot","type":"article-journal","volume":"14"},"suppress-author":false}],"isEdited":false,"manualOverride":{"citeprocText":"Atchade-Adelomou et al. (2021)","isManuallyOverridden":false,"manualOverrideText":""},"mendeley":{"formattedCitation":"Atchade-Adelomou et al. (2021)","plainTextFormattedCitation":"Atchade-Adelomou et al. (2021)","previouslyFormattedCitation":"Atchade-Adelomou et al. (2021)"},"properties":{"noteIndex":0},"schema":"https://github.com/citation-style-language/schema/raw/master/csl-citation.json"}</w:instrText>
       </w:r>
       <w:r>
         <w:fldChar w:fldCharType="separate"/>
@@ -8758,7 +8948,7 @@
         <w:fldChar w:fldCharType="begin"/>
       </w:r>
       <w:r>
-        <w:instrText xml:space="preserve">ADDIN CSL_CITATION {"citationID":"MENDELEY_CITATION_121","citationItems":[{"id":"ITEM-121","isTemporary":false,"itemData":{"DOI":"10.1515/auto-2023-0072","author":[{"family":"Windmann","given":"Stefan"}],"container-title":"at – Automatisierungstechnik","id":"Windmann2023","issued":{"date-parts":[[2023]]},"title":"Quantum computer-aided job scheduling for storage and retrieval systems","type":"article-journal"},"suppress-author":false}],"isEdited":false,"manualOverride":{"citeprocText":"Windmann (2023)","isManuallyOverridden":false,"manualOverrideText":""},"mendeley":{"formattedCitation":"Windmann (2023)","plainTextFormattedCitation":"Windmann (2023)","previouslyFormattedCitation":"Windmann (2023)"},"properties":{"noteIndex":0},"schema":"https://github.com/citation-style-language/schema/raw/master/csl-citation.json"}</w:instrText>
+        <w:instrText xml:space="preserve">ADDIN CSL_CITATION {"citationID":"MENDELEY_CITATION_134","citationItems":[{"id":"ITEM-134","isTemporary":false,"itemData":{"DOI":"10.1515/auto-2023-0072","author":[{"family":"Windmann","given":"Stefan"}],"container-title":"at – Automatisierungstechnik","id":"Windmann2023","issued":{"date-parts":[[2023]]},"title":"Quantum computer-aided job scheduling for storage and retrieval systems","type":"article-journal"},"suppress-author":false}],"isEdited":false,"manualOverride":{"citeprocText":"Windmann (2023)","isManuallyOverridden":false,"manualOverrideText":""},"mendeley":{"formattedCitation":"Windmann (2023)","plainTextFormattedCitation":"Windmann (2023)","previouslyFormattedCitation":"Windmann (2023)"},"properties":{"noteIndex":0},"schema":"https://github.com/citation-style-language/schema/raw/master/csl-citation.json"}</w:instrText>
       </w:r>
       <w:r>
         <w:fldChar w:fldCharType="separate"/>
@@ -8809,7 +8999,7 @@
         <w:fldChar w:fldCharType="begin"/>
       </w:r>
       <w:r>
-        <w:instrText xml:space="preserve">ADDIN CSL_CITATION {"citationID":"MENDELEY_CITATION_122","citationItems":[{"id":"ITEM-122","isTemporary":false,"itemData":{"DOI":"10.1103/PhysRevApplied.18.054045","author":[{"family":"Schuetz","given":"Martin J. A."},{"family":"Brubaker","given":"J. Kyle"},{"family":"Montagu","given":"Henry"},{"dropping-particle":"van","family":"Dijk","given":"Yannick"},{"family":"Klepsch","given":"Johannes"},{"family":"Ross","given":"Philipp"},{"family":"Luckow","given":"Andre"},{"family":"Resende","given":"Mauricio G. C."},{"family":"Katzgraber","given":"Helmut G."}],"container-title":"Physical Review Applied","id":"Schuetz2022","issue":"5","issued":{"date-parts":[[2022]]},"page":"054045","publisher":"American Physical Society","title":"Optimization of robot-trajectory planning with nature-inspired and hybrid quantum algorithms","type":"article-journal","volume":"18"},"suppress-author":false}],"isEdited":false,"manualOverride":{"citeprocText":"Schuetz et al. (2022)","isManuallyOverridden":false,"manualOverrideText":""},"mendeley":{"formattedCitation":"Schuetz et al. (2022)","plainTextFormattedCitation":"Schuetz et al. (2022)","previouslyFormattedCitation":"Schuetz et al. (2022)"},"properties":{"noteIndex":0},"schema":"https://github.com/citation-style-language/schema/raw/master/csl-citation.json"}</w:instrText>
+        <w:instrText xml:space="preserve">ADDIN CSL_CITATION {"citationID":"MENDELEY_CITATION_135","citationItems":[{"id":"ITEM-135","isTemporary":false,"itemData":{"DOI":"10.1103/PhysRevApplied.18.054045","author":[{"family":"Schuetz","given":"Martin J. A."},{"family":"Brubaker","given":"J. Kyle"},{"family":"Montagu","given":"Henry"},{"dropping-particle":"van","family":"Dijk","given":"Yannick"},{"family":"Klepsch","given":"Johannes"},{"family":"Ross","given":"Philipp"},{"family":"Luckow","given":"Andre"},{"family":"Resende","given":"Mauricio G. C."},{"family":"Katzgraber","given":"Helmut G."}],"container-title":"Physical Review Applied","id":"Schuetz2022","issue":"5","issued":{"date-parts":[[2022]]},"page":"054045","publisher":"American Physical Society","title":"Optimization of robot-trajectory planning with nature-inspired and hybrid quantum algorithms","type":"article-journal","volume":"18"},"suppress-author":false}],"isEdited":false,"manualOverride":{"citeprocText":"Schuetz et al. (2022)","isManuallyOverridden":false,"manualOverrideText":""},"mendeley":{"formattedCitation":"Schuetz et al. (2022)","plainTextFormattedCitation":"Schuetz et al. (2022)","previouslyFormattedCitation":"Schuetz et al. (2022)"},"properties":{"noteIndex":0},"schema":"https://github.com/citation-style-language/schema/raw/master/csl-citation.json"}</w:instrText>
       </w:r>
       <w:r>
         <w:fldChar w:fldCharType="separate"/>
@@ -8850,7 +9040,7 @@
         <w:fldChar w:fldCharType="begin"/>
       </w:r>
       <w:r>
-        <w:instrText xml:space="preserve">ADDIN CSL_CITATION {"citationID":"MENDELEY_CITATION_123","citationItems":[{"id":"ITEM-123","isTemporary":false,"itemData":{"DOI":"10.1016/j.procir.2025.01.099","author":[{"family":"Willmann","given":"Moritz"},{"family":"Albus","given":"Marcel"},{"family":"Schnabel","given":"Jan"},{"family":"Roth","given":"Marco"}],"container-title":"Procedia CIRP","id":"Willmann2025","issued":{"date-parts":[[2025]]},"note":"58th CIRP Conference on Manufacturing Systems","page":"25-30","publisher":"Elsevier","title":"Application of quantum annealing for scalable robotic assembly line optimization: A case study","title-short":"Application of quantum annealing for scalable robotic assembly line optimization","type":"article-journal","volume":"134"},"suppress-author":false}],"isEdited":false,"manualOverride":{"citeprocText":"Willmann et al. (2025)","isManuallyOverridden":false,"manualOverrideText":""},"mendeley":{"formattedCitation":"Willmann et al. (2025)","plainTextFormattedCitation":"Willmann et al. (2025)","previouslyFormattedCitation":"Willmann et al. (2025)"},"properties":{"noteIndex":0},"schema":"https://github.com/citation-style-language/schema/raw/master/csl-citation.json"}</w:instrText>
+        <w:instrText xml:space="preserve">ADDIN CSL_CITATION {"citationID":"MENDELEY_CITATION_136","citationItems":[{"id":"ITEM-136","isTemporary":false,"itemData":{"DOI":"10.1016/j.procir.2025.01.099","author":[{"family":"Willmann","given":"Moritz"},{"family":"Albus","given":"Marcel"},{"family":"Schnabel","given":"Jan"},{"family":"Roth","given":"Marco"}],"container-title":"Procedia CIRP","id":"Willmann2025","issued":{"date-parts":[[2025]]},"note":"58th CIRP Conference on Manufacturing Systems","page":"25-30","publisher":"Elsevier","title":"Application of quantum annealing for scalable robotic assembly line optimization: A case study","title-short":"Application of quantum annealing for scalable robotic assembly line optimization","type":"article-journal","volume":"134"},"suppress-author":false}],"isEdited":false,"manualOverride":{"citeprocText":"Willmann et al. (2025)","isManuallyOverridden":false,"manualOverrideText":""},"mendeley":{"formattedCitation":"Willmann et al. (2025)","plainTextFormattedCitation":"Willmann et al. (2025)","previouslyFormattedCitation":"Willmann et al. (2025)"},"properties":{"noteIndex":0},"schema":"https://github.com/citation-style-language/schema/raw/master/csl-citation.json"}</w:instrText>
       </w:r>
       <w:r>
         <w:fldChar w:fldCharType="separate"/>
@@ -8874,7 +9064,7 @@
         <w:fldChar w:fldCharType="begin"/>
       </w:r>
       <w:r>
-        <w:instrText xml:space="preserve">ADDIN CSL_CITATION {"citationID":"MENDELEY_CITATION_124","citationItems":[{"id":"ITEM-124","isTemporary":false,"itemData":{"DOI":"10.1109/QCE65121.2025.10359","author":[{"family":"Osaba","given":"Eneko"},{"family":"Garrote","given":"Estibaliz"},{"family":"Miranda-Rodriguez","given":"Pablo"},{"family":"Ciacco","given":"Alessia"},{"family":"Cabanes","given":"Itziar"},{"family":"Mancisidor","given":"Aitziber"}],"container-title":"2025 IEEE international conference on quantum computing and engineering (QCE)","id":"Osaba2025","issued":{"date-parts":[[2025]]},"page":"388-389","publisher":"IEEE","publisher-place":"Albuquerque, NM, USA","title":"Quantum-assisted automatic path-planning for robotic quality inspection in Industry 4.0","type":"paper-conference","volume":"2"},"suppress-author":false}],"isEdited":false,"manualOverride":{"citeprocText":"Osaba, Garrote, et al. (2025)","isManuallyOverridden":false,"manualOverrideText":""},"mendeley":{"formattedCitation":"Osaba, Garrote, et al. (2025)","plainTextFormattedCitation":"Osaba, Garrote, et al. (2025)","previouslyFormattedCitation":"Osaba, Garrote, et al. (2025)"},"properties":{"noteIndex":0},"schema":"https://github.com/citation-style-language/schema/raw/master/csl-citation.json"}</w:instrText>
+        <w:instrText xml:space="preserve">ADDIN CSL_CITATION {"citationID":"MENDELEY_CITATION_137","citationItems":[{"id":"ITEM-137","isTemporary":false,"itemData":{"DOI":"10.1109/QCE65121.2025.10359","author":[{"family":"Osaba","given":"Eneko"},{"family":"Garrote","given":"Estibaliz"},{"family":"Miranda-Rodriguez","given":"Pablo"},{"family":"Ciacco","given":"Alessia"},{"family":"Cabanes","given":"Itziar"},{"family":"Mancisidor","given":"Aitziber"}],"container-title":"2025 IEEE international conference on quantum computing and engineering (QCE)","id":"Osaba2025","issued":{"date-parts":[[2025]]},"page":"388-389","publisher":"IEEE","publisher-place":"Albuquerque, NM, USA","title":"Quantum-assisted automatic path-planning for robotic quality inspection in Industry 4.0","type":"paper-conference","volume":"2"},"suppress-author":false}],"isEdited":false,"manualOverride":{"citeprocText":"Osaba, Garrote, et al. (2025)","isManuallyOverridden":false,"manualOverrideText":""},"mendeley":{"formattedCitation":"Osaba, Garrote, et al. (2025)","plainTextFormattedCitation":"Osaba, Garrote, et al. (2025)","previouslyFormattedCitation":"Osaba, Garrote, et al. (2025)"},"properties":{"noteIndex":0},"schema":"https://github.com/citation-style-language/schema/raw/master/csl-citation.json"}</w:instrText>
       </w:r>
       <w:r>
         <w:fldChar w:fldCharType="separate"/>
@@ -8925,7 +9115,7 @@
         <w:fldChar w:fldCharType="begin"/>
       </w:r>
       <w:r>
-        <w:instrText xml:space="preserve">ADDIN CSL_CITATION {"citationID":"MENDELEY_CITATION_125","citationItems":[{"id":"ITEM-125","isTemporary":false,"itemData":{"DOI":"10.1038/s41598-025-12109-0","author":[{"family":"Otani","given":"Takuya"},{"family":"Takanishi","given":"Atsuo"},{"family":"Hara","given":"Nobuyuki"},{"family":"Takita","given":"Yutaka"},{"family":"Kimura","given":"Koichi"}],"container-title":"Scientific Reports","id":"Otani2025","issued":{"date-parts":[[2025]]},"page":"28508","publisher":"Nature Publishing Group","title":"Quantum computation for robot posture optimization","type":"article-journal","volume":"15"},"suppress-author":false}],"isEdited":false,"manualOverride":{"citeprocText":"Otani et al. (2025)","isManuallyOverridden":false,"manualOverrideText":""},"mendeley":{"formattedCitation":"Otani et al. (2025)","plainTextFormattedCitation":"Otani et al. (2025)","previouslyFormattedCitation":"Otani et al. (2025)"},"properties":{"noteIndex":0},"schema":"https://github.com/citation-style-language/schema/raw/master/csl-citation.json"}</w:instrText>
+        <w:instrText xml:space="preserve">ADDIN CSL_CITATION {"citationID":"MENDELEY_CITATION_138","citationItems":[{"id":"ITEM-138","isTemporary":false,"itemData":{"DOI":"10.1038/s41598-025-12109-0","author":[{"family":"Otani","given":"Takuya"},{"family":"Takanishi","given":"Atsuo"},{"family":"Hara","given":"Nobuyuki"},{"family":"Takita","given":"Yutaka"},{"family":"Kimura","given":"Koichi"}],"container-title":"Scientific Reports","id":"Otani2025","issued":{"date-parts":[[2025]]},"page":"28508","publisher":"Nature Publishing Group","title":"Quantum computation for robot posture optimization","type":"article-journal","volume":"15"},"suppress-author":false}],"isEdited":false,"manualOverride":{"citeprocText":"Otani et al. (2025)","isManuallyOverridden":false,"manualOverrideText":""},"mendeley":{"formattedCitation":"Otani et al. (2025)","plainTextFormattedCitation":"Otani et al. (2025)","previouslyFormattedCitation":"Otani et al. (2025)"},"properties":{"noteIndex":0},"schema":"https://github.com/citation-style-language/schema/raw/master/csl-citation.json"}</w:instrText>
       </w:r>
       <w:r>
         <w:fldChar w:fldCharType="separate"/>
@@ -9011,7 +9201,7 @@
         <w:fldChar w:fldCharType="begin"/>
       </w:r>
       <w:r>
-        <w:instrText xml:space="preserve">ADDIN CSL_CITATION {"citationID":"MENDELEY_CITATION_126","citationItems":[{"id":"ITEM-126","isTemporary":false,"itemData":{"DOI":"10.1038/s41598-025-34346-z","author":[{"family":"Salloum","given":"Hadi"},{"family":"Savin","given":"Sergei"},{"family":"Kholodov","given":"Yaroslav"},{"family":"Ryzhakov","given":"Gleb"},{"family":"Farina","given":"Mirko"},{"family":"Oseledets","given":"Ivan"}],"container-title":"Scientific Reports","id":"Salloum2026","issued":{"date-parts":[[2026]]},"page":"4244","publisher":"Nature Publishing Group","title":"Quantum annealing for inverse kinematics in robotics","type":"article-journal","volume":"16"},"suppress-author":false}],"isEdited":false,"manualOverride":{"citeprocText":"Salloum et al. (2026)","isManuallyOverridden":false,"manualOverrideText":""},"mendeley":{"formattedCitation":"Salloum et al. (2026)","plainTextFormattedCitation":"Salloum et al. (2026)","previouslyFormattedCitation":"Salloum et al. (2026)"},"properties":{"noteIndex":0},"schema":"https://github.com/citation-style-language/schema/raw/master/csl-citation.json"}</w:instrText>
+        <w:instrText xml:space="preserve">ADDIN CSL_CITATION {"citationID":"MENDELEY_CITATION_139","citationItems":[{"id":"ITEM-139","isTemporary":false,"itemData":{"DOI":"10.1038/s41598-025-34346-z","author":[{"family":"Salloum","given":"Hadi"},{"family":"Savin","given":"Sergei"},{"family":"Kholodov","given":"Yaroslav"},{"family":"Ryzhakov","given":"Gleb"},{"family":"Farina","given":"Mirko"},{"family":"Oseledets","given":"Ivan"}],"container-title":"Scientific Reports","id":"Salloum2026","issued":{"date-parts":[[2026]]},"page":"4244","publisher":"Nature Publishing Group","title":"Quantum annealing for inverse kinematics in robotics","type":"article-journal","volume":"16"},"suppress-author":false}],"isEdited":false,"manualOverride":{"citeprocText":"Salloum et al. (2026)","isManuallyOverridden":false,"manualOverrideText":""},"mendeley":{"formattedCitation":"Salloum et al. (2026)","plainTextFormattedCitation":"Salloum et al. (2026)","previouslyFormattedCitation":"Salloum et al. (2026)"},"properties":{"noteIndex":0},"schema":"https://github.com/citation-style-language/schema/raw/master/csl-citation.json"}</w:instrText>
       </w:r>
       <w:r>
         <w:fldChar w:fldCharType="separate"/>
@@ -9059,7 +9249,7 @@
         <w:fldChar w:fldCharType="begin"/>
       </w:r>
       <w:r>
-        <w:instrText xml:space="preserve">ADDIN CSL_CITATION {"citationID":"MENDELEY_CITATION_127","citationItems":[{"id":"ITEM-127","isTemporary":false,"itemData":{"author":[{"family":"LaValle","given":"Steven M."}],"id":"LaValle1998","issued":{"date-parts":[[1998,10]]},"number":"TR 98-11","publisher":"Computer Science Department, Iowa State University","publisher-place":"Ames, IA, USA","title":"Rapidly-exploring random trees: A new tool for path planning","title-short":"Rapidly-exploring random trees","type":"report"}}],"isEdited":false,"manualOverride":{"citeprocText":"(LaValle 1998)","isManuallyOverridden":false,"manualOverrideText":""},"mendeley":{"formattedCitation":"(LaValle 1998)","plainTextFormattedCitation":"(LaValle 1998)","previouslyFormattedCitation":"(LaValle 1998)"},"properties":{"noteIndex":0},"schema":"https://github.com/citation-style-language/schema/raw/master/csl-citation.json"}</w:instrText>
+        <w:instrText xml:space="preserve">ADDIN CSL_CITATION {"citationID":"MENDELEY_CITATION_140","citationItems":[{"id":"ITEM-140","isTemporary":false,"itemData":{"author":[{"family":"LaValle","given":"Steven M."}],"id":"LaValle1998","issued":{"date-parts":[[1998,10]]},"number":"TR 98-11","publisher":"Computer Science Department, Iowa State University","publisher-place":"Ames, IA, USA","title":"Rapidly-exploring random trees: A new tool for path planning","title-short":"Rapidly-exploring random trees","type":"report"}}],"isEdited":false,"manualOverride":{"citeprocText":"(LaValle 1998)","isManuallyOverridden":false,"manualOverrideText":""},"mendeley":{"formattedCitation":"(LaValle 1998)","plainTextFormattedCitation":"(LaValle 1998)","previouslyFormattedCitation":"(LaValle 1998)"},"properties":{"noteIndex":0},"schema":"https://github.com/citation-style-language/schema/raw/master/csl-citation.json"}</w:instrText>
       </w:r>
       <w:r>
         <w:fldChar w:fldCharType="separate"/>
@@ -9077,7 +9267,7 @@
         <w:fldChar w:fldCharType="begin"/>
       </w:r>
       <w:r>
-        <w:instrText xml:space="preserve">ADDIN CSL_CITATION {"citationID":"MENDELEY_CITATION_128","citationItems":[{"id":"ITEM-128","isTemporary":false,"itemData":{"DOI":"10.1177/0278364911406761","author":[{"family":"Karaman","given":"Sertac"},{"family":"Frazzoli","given":"Emilio"}],"container-title":"The International Journal of Robotics Research","id":"Karaman2011","issue":"7","issued":{"date-parts":[[2011]]},"page":"846-894","publisher":"SAGE Publications","title":"Sampling-based algorithms for optimal motion planning","type":"article-journal","volume":"30"}}],"isEdited":false,"manualOverride":{"citeprocText":"(Karaman and Frazzoli 2011)","isManuallyOverridden":false,"manualOverrideText":""},"mendeley":{"formattedCitation":"(Karaman and Frazzoli 2011)","plainTextFormattedCitation":"(Karaman and Frazzoli 2011)","previouslyFormattedCitation":"(Karaman and Frazzoli 2011)"},"properties":{"noteIndex":0},"schema":"https://github.com/citation-style-language/schema/raw/master/csl-citation.json"}</w:instrText>
+        <w:instrText xml:space="preserve">ADDIN CSL_CITATION {"citationID":"MENDELEY_CITATION_141","citationItems":[{"id":"ITEM-141","isTemporary":false,"itemData":{"DOI":"10.1177/0278364911406761","author":[{"family":"Karaman","given":"Sertac"},{"family":"Frazzoli","given":"Emilio"}],"container-title":"The International Journal of Robotics Research","id":"Karaman2011","issue":"7","issued":{"date-parts":[[2011]]},"page":"846-894","publisher":"SAGE Publications","title":"Sampling-based algorithms for optimal motion planning","type":"article-journal","volume":"30"}}],"isEdited":false,"manualOverride":{"citeprocText":"(Karaman and Frazzoli 2011)","isManuallyOverridden":false,"manualOverrideText":""},"mendeley":{"formattedCitation":"(Karaman and Frazzoli 2011)","plainTextFormattedCitation":"(Karaman and Frazzoli 2011)","previouslyFormattedCitation":"(Karaman and Frazzoli 2011)"},"properties":{"noteIndex":0},"schema":"https://github.com/citation-style-language/schema/raw/master/csl-citation.json"}</w:instrText>
       </w:r>
       <w:r>
         <w:fldChar w:fldCharType="separate"/>
@@ -9095,7 +9285,7 @@
         <w:fldChar w:fldCharType="begin"/>
       </w:r>
       <w:r>
-        <w:instrText xml:space="preserve">ADDIN CSL_CITATION {"citationID":"MENDELEY_CITATION_129","citationItems":[{"id":"ITEM-129","isTemporary":false,"itemData":{"DOI":"10.1146/annurev-control-091420-084139","author":[{"family":"Garrett","given":"Caelan Reed"},{"family":"Chitnis","given":"Rohan"},{"family":"Holladay","given":"Rachel"},{"family":"Kim","given":"Beomjoon"},{"family":"Silver","given":"Tom"},{"family":"Kaelbling","given":"Leslie Pack"},{"family":"Lozano-Pérez","given":"Tomás"}],"container-title":"Annual Review of Control, Robotics, and Autonomous Systems","id":"Garrett2021","issued":{"date-parts":[[2021]]},"page":"265-293","publisher":"Annual Reviews","title":"Integrated task and motion planning","type":"article-journal","volume":"4"}}],"isEdited":false,"manualOverride":{"citeprocText":"(Garrett et al. 2021)","isManuallyOverridden":false,"manualOverrideText":""},"mendeley":{"formattedCitation":"(Garrett et al. 2021)","plainTextFormattedCitation":"(Garrett et al. 2021)","previouslyFormattedCitation":"(Garrett et al. 2021)"},"properties":{"noteIndex":0},"schema":"https://github.com/citation-style-language/schema/raw/master/csl-citation.json"}</w:instrText>
+        <w:instrText xml:space="preserve">ADDIN CSL_CITATION {"citationID":"MENDELEY_CITATION_142","citationItems":[{"id":"ITEM-142","isTemporary":false,"itemData":{"DOI":"10.1146/annurev-control-091420-084139","author":[{"family":"Garrett","given":"Caelan Reed"},{"family":"Chitnis","given":"Rohan"},{"family":"Holladay","given":"Rachel"},{"family":"Kim","given":"Beomjoon"},{"family":"Silver","given":"Tom"},{"family":"Kaelbling","given":"Leslie Pack"},{"family":"Lozano-Pérez","given":"Tomás"}],"container-title":"Annual Review of Control, Robotics, and Autonomous Systems","id":"Garrett2021","issued":{"date-parts":[[2021]]},"page":"265-293","publisher":"Annual Reviews","title":"Integrated task and motion planning","type":"article-journal","volume":"4"}}],"isEdited":false,"manualOverride":{"citeprocText":"(Garrett et al. 2021)","isManuallyOverridden":false,"manualOverrideText":""},"mendeley":{"formattedCitation":"(Garrett et al. 2021)","plainTextFormattedCitation":"(Garrett et al. 2021)","previouslyFormattedCitation":"(Garrett et al. 2021)"},"properties":{"noteIndex":0},"schema":"https://github.com/citation-style-language/schema/raw/master/csl-citation.json"}</w:instrText>
       </w:r>
       <w:r>
         <w:fldChar w:fldCharType="separate"/>
@@ -9116,7 +9306,7 @@
         <w:fldChar w:fldCharType="begin"/>
       </w:r>
       <w:r>
-        <w:instrText xml:space="preserve">ADDIN CSL_CITATION {"citationID":"MENDELEY_CITATION_132","citationItems":[{"id":"ITEM-130","isTemporary":false,"itemData":{"DOI":"10.3389/fcomp.2019.00009","author":[{"family":"Ohzeki","given":"Masayuki"},{"family":"Miki","given":"Akira"},{"family":"Miyama","given":"Masamichi J."},{"family":"Terabe","given":"Masayoshi"}],"container-title":"Frontiers in Computer Science","id":"Ohzeki2019","issued":{"date-parts":[[2019]]},"page":"9","publisher":"Frontiers Media","title":"Control of automated guided vehicles without collision by quantum annealer and digital devices","type":"article-journal","volume":"1"}},{"id":"ITEM-131","isTemporary":false,"itemData":{"DOI":"10.1038/s41598-024-72101-y","author":[{"family":"Śmierzchalski","given":"Tomasz"},{"family":"Pawłowski","given":"Jakub"},{"family":"Przybysz","given":"Artur"},{"family":"Pawela","given":"Łukasz"},{"family":"Puchała","given":"Zbigniew"},{"family":"Koniorczyk","given":"Mátyás"},{"family":"Gardas","given":"Bartłomiej"},{"family":"Deffner","given":"Sebastian"},{"family":"Domino","given":"Krzysztof"}],"container-title":"Scientific Reports","id":"Smierzchalski2024","issued":{"date-parts":[[2024]]},"page":"21809","publisher":"Nature Publishing Group","title":"Hybrid quantum-classical computation for automatic guided vehicles scheduling","type":"article-journal","volume":"14"}},{"id":"ITEM-132","isTemporary":false,"itemData":{"DOI":"10.1038/s41598-023-45668-1","author":[{"family":"Leib","given":"Dominik"},{"family":"Seidel","given":"Tobias"},{"family":"Jäger","given":"Sven"},{"family":"Heese","given":"Raoul"},{"family":"Jones","given":"Caitlin Isobel"},{"family":"Awasthi","given":"Abhishek"},{"family":"Niederle","given":"Astrid"},{"family":"Bortz","given":"Michael"}],"container-title":"Scientific Reports","id":"Leib2023","issued":{"date-parts":[[2023]]},"publisher":"Nature Publishing Group","title":"An optimization case study for solving a transport robot scheduling problem on quantum-hybrid and quantum-inspired hardware","type":"article-journal","volume":"13"}}],"isEdited":false,"manualOverride":{"citeprocText":"(Ohzeki et al. 2019; Śmierzchalski et al. 2024; Leib et al. 2023)","isManuallyOverridden":false,"manualOverrideText":""},"mendeley":{"formattedCitation":"(Ohzeki et al. 2019; Śmierzchalski et al. 2024; Leib et al. 2023)","plainTextFormattedCitation":"(Ohzeki et al. 2019; Śmierzchalski et al. 2024; Leib et al. 2023)","previouslyFormattedCitation":"(Ohzeki et al. 2019; Śmierzchalski et al. 2024; Leib et al. 2023)"},"properties":{"noteIndex":0},"schema":"https://github.com/citation-style-language/schema/raw/master/csl-citation.json"}</w:instrText>
+        <w:instrText xml:space="preserve">ADDIN CSL_CITATION {"citationID":"MENDELEY_CITATION_145","citationItems":[{"id":"ITEM-143","isTemporary":false,"itemData":{"DOI":"10.3389/fcomp.2019.00009","author":[{"family":"Ohzeki","given":"Masayuki"},{"family":"Miki","given":"Akira"},{"family":"Miyama","given":"Masamichi J."},{"family":"Terabe","given":"Masayoshi"}],"container-title":"Frontiers in Computer Science","id":"Ohzeki2019","issued":{"date-parts":[[2019]]},"page":"9","publisher":"Frontiers Media","title":"Control of automated guided vehicles without collision by quantum annealer and digital devices","type":"article-journal","volume":"1"}},{"id":"ITEM-144","isTemporary":false,"itemData":{"DOI":"10.1038/s41598-024-72101-y","author":[{"family":"Śmierzchalski","given":"Tomasz"},{"family":"Pawłowski","given":"Jakub"},{"family":"Przybysz","given":"Artur"},{"family":"Pawela","given":"Łukasz"},{"family":"Puchała","given":"Zbigniew"},{"family":"Koniorczyk","given":"Mátyás"},{"family":"Gardas","given":"Bartłomiej"},{"family":"Deffner","given":"Sebastian"},{"family":"Domino","given":"Krzysztof"}],"container-title":"Scientific Reports","id":"Smierzchalski2024","issued":{"date-parts":[[2024]]},"page":"21809","publisher":"Nature Publishing Group","title":"Hybrid quantum-classical computation for automatic guided vehicles scheduling","type":"article-journal","volume":"14"}},{"id":"ITEM-145","isTemporary":false,"itemData":{"DOI":"10.1038/s41598-023-45668-1","author":[{"family":"Leib","given":"Dominik"},{"family":"Seidel","given":"Tobias"},{"family":"Jäger","given":"Sven"},{"family":"Heese","given":"Raoul"},{"family":"Jones","given":"Caitlin Isobel"},{"family":"Awasthi","given":"Abhishek"},{"family":"Niederle","given":"Astrid"},{"family":"Bortz","given":"Michael"}],"container-title":"Scientific Reports","id":"Leib2023","issued":{"date-parts":[[2023]]},"publisher":"Nature Publishing Group","title":"An optimization case study for solving a transport robot scheduling problem on quantum-hybrid and quantum-inspired hardware","type":"article-journal","volume":"13"}}],"isEdited":false,"manualOverride":{"citeprocText":"(Ohzeki et al. 2019; Śmierzchalski et al. 2024; Leib et al. 2023)","isManuallyOverridden":false,"manualOverrideText":""},"mendeley":{"formattedCitation":"(Ohzeki et al. 2019; Śmierzchalski et al. 2024; Leib et al. 2023)","plainTextFormattedCitation":"(Ohzeki et al. 2019; Śmierzchalski et al. 2024; Leib et al. 2023)","previouslyFormattedCitation":"(Ohzeki et al. 2019; Śmierzchalski et al. 2024; Leib et al. 2023)"},"properties":{"noteIndex":0},"schema":"https://github.com/citation-style-language/schema/raw/master/csl-citation.json"}</w:instrText>
       </w:r>
       <w:r>
         <w:fldChar w:fldCharType="separate"/>
@@ -9134,7 +9324,7 @@
         <w:fldChar w:fldCharType="begin"/>
       </w:r>
       <w:r>
-        <w:instrText xml:space="preserve">ADDIN CSL_CITATION {"citationID":"MENDELEY_CITATION_133","citationItems":[{"id":"ITEM-133","isTemporary":false,"itemData":{"DOI":"10.1016/j.procir.2025.01.099","author":[{"family":"Willmann","given":"Moritz"},{"family":"Albus","given":"Marcel"},{"family":"Schnabel","given":"Jan"},{"family":"Roth","given":"Marco"}],"container-title":"Procedia CIRP","id":"Willmann2025","issued":{"date-parts":[[2025]]},"note":"58th CIRP Conference on Manufacturing Systems","page":"25-30","publisher":"Elsevier","title":"Application of quantum annealing for scalable robotic assembly line optimization: A case study","title-short":"Application of quantum annealing for scalable robotic assembly line optimization","type":"article-journal","volume":"134"}}],"isEdited":false,"manualOverride":{"citeprocText":"(Willmann et al. 2025)","isManuallyOverridden":false,"manualOverrideText":""},"mendeley":{"formattedCitation":"(Willmann et al. 2025)","plainTextFormattedCitation":"(Willmann et al. 2025)","previouslyFormattedCitation":"(Willmann et al. 2025)"},"properties":{"noteIndex":0},"schema":"https://github.com/citation-style-language/schema/raw/master/csl-citation.json"}</w:instrText>
+        <w:instrText xml:space="preserve">ADDIN CSL_CITATION {"citationID":"MENDELEY_CITATION_146","citationItems":[{"id":"ITEM-146","isTemporary":false,"itemData":{"DOI":"10.1016/j.procir.2025.01.099","author":[{"family":"Willmann","given":"Moritz"},{"family":"Albus","given":"Marcel"},{"family":"Schnabel","given":"Jan"},{"family":"Roth","given":"Marco"}],"container-title":"Procedia CIRP","id":"Willmann2025","issued":{"date-parts":[[2025]]},"note":"58th CIRP Conference on Manufacturing Systems","page":"25-30","publisher":"Elsevier","title":"Application of quantum annealing for scalable robotic assembly line optimization: A case study","title-short":"Application of quantum annealing for scalable robotic assembly line optimization","type":"article-journal","volume":"134"}}],"isEdited":false,"manualOverride":{"citeprocText":"(Willmann et al. 2025)","isManuallyOverridden":false,"manualOverrideText":""},"mendeley":{"formattedCitation":"(Willmann et al. 2025)","plainTextFormattedCitation":"(Willmann et al. 2025)","previouslyFormattedCitation":"(Willmann et al. 2025)"},"properties":{"noteIndex":0},"schema":"https://github.com/citation-style-language/schema/raw/master/csl-citation.json"}</w:instrText>
       </w:r>
       <w:r>
         <w:fldChar w:fldCharType="separate"/>
@@ -9152,7 +9342,7 @@
         <w:fldChar w:fldCharType="begin"/>
       </w:r>
       <w:r>
-        <w:instrText xml:space="preserve">ADDIN CSL_CITATION {"citationID":"MENDELEY_CITATION_134","citationItems":[{"id":"ITEM-134","isTemporary":false,"itemData":{"DOI":"10.1038/s41598-023-45668-1","author":[{"family":"Leib","given":"Dominik"},{"family":"Seidel","given":"Tobias"},{"family":"Jäger","given":"Sven"},{"family":"Heese","given":"Raoul"},{"family":"Jones","given":"Caitlin Isobel"},{"family":"Awasthi","given":"Abhishek"},{"family":"Niederle","given":"Astrid"},{"family":"Bortz","given":"Michael"}],"container-title":"Scientific Reports","id":"Leib2023","issued":{"date-parts":[[2023]]},"publisher":"Nature Publishing Group","title":"An optimization case study for solving a transport robot scheduling problem on quantum-hybrid and quantum-inspired hardware","type":"article-journal","volume":"13"}}],"isEdited":false,"manualOverride":{"citeprocText":"(Leib et al. 2023)","isManuallyOverridden":false,"manualOverrideText":""},"mendeley":{"formattedCitation":"(Leib et al. 2023)","plainTextFormattedCitation":"(Leib et al. 2023)","previouslyFormattedCitation":"(Leib et al. 2023)"},"properties":{"noteIndex":0},"schema":"https://github.com/citation-style-language/schema/raw/master/csl-citation.json"}</w:instrText>
+        <w:instrText xml:space="preserve">ADDIN CSL_CITATION {"citationID":"MENDELEY_CITATION_147","citationItems":[{"id":"ITEM-147","isTemporary":false,"itemData":{"DOI":"10.1038/s41598-023-45668-1","author":[{"family":"Leib","given":"Dominik"},{"family":"Seidel","given":"Tobias"},{"family":"Jäger","given":"Sven"},{"family":"Heese","given":"Raoul"},{"family":"Jones","given":"Caitlin Isobel"},{"family":"Awasthi","given":"Abhishek"},{"family":"Niederle","given":"Astrid"},{"family":"Bortz","given":"Michael"}],"container-title":"Scientific Reports","id":"Leib2023","issued":{"date-parts":[[2023]]},"publisher":"Nature Publishing Group","title":"An optimization case study for solving a transport robot scheduling problem on quantum-hybrid and quantum-inspired hardware","type":"article-journal","volume":"13"}}],"isEdited":false,"manualOverride":{"citeprocText":"(Leib et al. 2023)","isManuallyOverridden":false,"manualOverrideText":""},"mendeley":{"formattedCitation":"(Leib et al. 2023)","plainTextFormattedCitation":"(Leib et al. 2023)","previouslyFormattedCitation":"(Leib et al. 2023)"},"properties":{"noteIndex":0},"schema":"https://github.com/citation-style-language/schema/raw/master/csl-citation.json"}</w:instrText>
       </w:r>
       <w:r>
         <w:fldChar w:fldCharType="separate"/>
@@ -9196,7 +9386,7 @@
         <w:fldChar w:fldCharType="begin"/>
       </w:r>
       <w:r>
-        <w:instrText xml:space="preserve">ADDIN CSL_CITATION {"citationID":"MENDELEY_CITATION_135","citationItems":[{"id":"ITEM-135","isTemporary":false,"itemData":{"DOI":"10.1145/3293320.3293333","author":[{"family":"Clark","given":"James"},{"family":"West","given":"Tristan"},{"family":"Zammit","given":"Joseph Paul"},{"family":"Guo","given":"Xiaohu"},{"family":"Mason","given":"Luke"},{"family":"Russell","given":"Duncan"}],"container-title":"Proceedings of the international conference on high performance computing in asia-pacific region (HPC Asia 2019)","id":"Clark2019","issued":{"date-parts":[[2019]]},"page":"111-119","publisher":"ACM","publisher-place":"New York, NY, USA","title":"Towards real time multi-robot routing using quantum computing technologies","type":"paper-conference"}}],"isEdited":false,"manualOverride":{"citeprocText":"(Clark et al. 2019)","isManuallyOverridden":false,"manualOverrideText":""},"mendeley":{"formattedCitation":"(Clark et al. 2019)","plainTextFormattedCitation":"(Clark et al. 2019)","previouslyFormattedCitation":"(Clark et al. 2019)"},"properties":{"noteIndex":0},"schema":"https://github.com/citation-style-language/schema/raw/master/csl-citation.json"}</w:instrText>
+        <w:instrText xml:space="preserve">ADDIN CSL_CITATION {"citationID":"MENDELEY_CITATION_148","citationItems":[{"id":"ITEM-148","isTemporary":false,"itemData":{"DOI":"10.1145/3293320.3293333","author":[{"family":"Clark","given":"James"},{"family":"West","given":"Tristan"},{"family":"Zammit","given":"Joseph Paul"},{"family":"Guo","given":"Xiaohu"},{"family":"Mason","given":"Luke"},{"family":"Russell","given":"Duncan"}],"container-title":"Proceedings of the international conference on high performance computing in asia-pacific region (HPC Asia 2019)","id":"Clark2019","issued":{"date-parts":[[2019]]},"page":"111-119","publisher":"ACM","publisher-place":"New York, NY, USA","title":"Towards real time multi-robot routing using quantum computing technologies","type":"paper-conference"}}],"isEdited":false,"manualOverride":{"citeprocText":"(Clark et al. 2019)","isManuallyOverridden":false,"manualOverrideText":""},"mendeley":{"formattedCitation":"(Clark et al. 2019)","plainTextFormattedCitation":"(Clark et al. 2019)","previouslyFormattedCitation":"(Clark et al. 2019)"},"properties":{"noteIndex":0},"schema":"https://github.com/citation-style-language/schema/raw/master/csl-citation.json"}</w:instrText>
       </w:r>
       <w:r>
         <w:fldChar w:fldCharType="separate"/>
@@ -9214,7 +9404,7 @@
         <w:fldChar w:fldCharType="begin"/>
       </w:r>
       <w:r>
-        <w:instrText xml:space="preserve">ADDIN CSL_CITATION {"citationID":"MENDELEY_CITATION_136","citationItems":[{"id":"ITEM-136","isTemporary":false,"itemData":{"DOI":"10.1038/s41598-025-28481-w","author":[{"family":"Quang","given":"Thinh Nguyen"},{"family":"Matsuyama","given":"Kosuke"},{"family":"Shimizu","given":"Keisuke"},{"family":"Sugano","given":"Hiroki"},{"family":"Kurimoto","given":"Eiji"},{"family":"Miki","given":"Masahiro"},{"family":"Suzuki","given":"Jumpei"},{"family":"Chen","given":"Ziyi"},{"family":"Waidyasooriya","given":"Hasitha Muthumala"},{"family":"Hariyama","given":"Masanori"},{"family":"Hitomi","given":"Masaru"},{"family":"Sawamura","given":"Kenta"},{"family":"Ohzeki","given":"Masayuki"}],"container-title":"Scientific Reports","id":"Quang2025","issued":{"date-parts":[[2025]]},"page":"44047","publisher":"Nature Publishing Group","title":"Quantum annealing-based route optimization for commercial AGV operating systems in large-scale logistics warehouses","type":"article-journal","volume":"15"}}],"isEdited":false,"manualOverride":{"citeprocText":"(Quang et al. 2025)","isManuallyOverridden":false,"manualOverrideText":""},"mendeley":{"formattedCitation":"(Quang et al. 2025)","plainTextFormattedCitation":"(Quang et al. 2025)","previouslyFormattedCitation":"(Quang et al. 2025)"},"properties":{"noteIndex":0},"schema":"https://github.com/citation-style-language/schema/raw/master/csl-citation.json"}</w:instrText>
+        <w:instrText xml:space="preserve">ADDIN CSL_CITATION {"citationID":"MENDELEY_CITATION_149","citationItems":[{"id":"ITEM-149","isTemporary":false,"itemData":{"DOI":"10.1038/s41598-025-28481-w","author":[{"family":"Quang","given":"Thinh Nguyen"},{"family":"Matsuyama","given":"Kosuke"},{"family":"Shimizu","given":"Keisuke"},{"family":"Sugano","given":"Hiroki"},{"family":"Kurimoto","given":"Eiji"},{"family":"Miki","given":"Masahiro"},{"family":"Suzuki","given":"Jumpei"},{"family":"Chen","given":"Ziyi"},{"family":"Waidyasooriya","given":"Hasitha Muthumala"},{"family":"Hariyama","given":"Masanori"},{"family":"Hitomi","given":"Masaru"},{"family":"Sawamura","given":"Kenta"},{"family":"Ohzeki","given":"Masayuki"}],"container-title":"Scientific Reports","id":"Quang2025","issued":{"date-parts":[[2025]]},"page":"44047","publisher":"Nature Publishing Group","title":"Quantum annealing-based route optimization for commercial AGV operating systems in large-scale logistics warehouses","type":"article-journal","volume":"15"}}],"isEdited":false,"manualOverride":{"citeprocText":"(Quang et al. 2025)","isManuallyOverridden":false,"manualOverrideText":""},"mendeley":{"formattedCitation":"(Quang et al. 2025)","plainTextFormattedCitation":"(Quang et al. 2025)","previouslyFormattedCitation":"(Quang et al. 2025)"},"properties":{"noteIndex":0},"schema":"https://github.com/citation-style-language/schema/raw/master/csl-citation.json"}</w:instrText>
       </w:r>
       <w:r>
         <w:fldChar w:fldCharType="separate"/>
@@ -9232,7 +9422,7 @@
         <w:fldChar w:fldCharType="begin"/>
       </w:r>
       <w:r>
-        <w:instrText xml:space="preserve">ADDIN CSL_CITATION {"citationID":"MENDELEY_CITATION_137","citationItems":[{"id":"ITEM-137","isTemporary":false,"itemData":{"DOI":"10.1038/s41598-025-34346-z","author":[{"family":"Salloum","given":"Hadi"},{"family":"Savin","given":"Sergei"},{"family":"Kholodov","given":"Yaroslav"},{"family":"Ryzhakov","given":"Gleb"},{"family":"Farina","given":"Mirko"},{"family":"Oseledets","given":"Ivan"}],"container-title":"Scientific Reports","id":"Salloum2026","issued":{"date-parts":[[2026]]},"page":"4244","publisher":"Nature Publishing Group","title":"Quantum annealing for inverse kinematics in robotics","type":"article-journal","volume":"16"}}],"isEdited":false,"manualOverride":{"citeprocText":"(Salloum et al. 2026)","isManuallyOverridden":false,"manualOverrideText":""},"mendeley":{"formattedCitation":"(Salloum et al. 2026)","plainTextFormattedCitation":"(Salloum et al. 2026)","previouslyFormattedCitation":"(Salloum et al. 2026)"},"properties":{"noteIndex":0},"schema":"https://github.com/citation-style-language/schema/raw/master/csl-citation.json"}</w:instrText>
+        <w:instrText xml:space="preserve">ADDIN CSL_CITATION {"citationID":"MENDELEY_CITATION_150","citationItems":[{"id":"ITEM-150","isTemporary":false,"itemData":{"DOI":"10.1038/s41598-025-34346-z","author":[{"family":"Salloum","given":"Hadi"},{"family":"Savin","given":"Sergei"},{"family":"Kholodov","given":"Yaroslav"},{"family":"Ryzhakov","given":"Gleb"},{"family":"Farina","given":"Mirko"},{"family":"Oseledets","given":"Ivan"}],"container-title":"Scientific Reports","id":"Salloum2026","issued":{"date-parts":[[2026]]},"page":"4244","publisher":"Nature Publishing Group","title":"Quantum annealing for inverse kinematics in robotics","type":"article-journal","volume":"16"}}],"isEdited":false,"manualOverride":{"citeprocText":"(Salloum et al. 2026)","isManuallyOverridden":false,"manualOverrideText":""},"mendeley":{"formattedCitation":"(Salloum et al. 2026)","plainTextFormattedCitation":"(Salloum et al. 2026)","previouslyFormattedCitation":"(Salloum et al. 2026)"},"properties":{"noteIndex":0},"schema":"https://github.com/citation-style-language/schema/raw/master/csl-citation.json"}</w:instrText>
       </w:r>
       <w:r>
         <w:fldChar w:fldCharType="separate"/>
@@ -9253,7 +9443,7 @@
         <w:fldChar w:fldCharType="begin"/>
       </w:r>
       <w:r>
-        <w:instrText xml:space="preserve">ADDIN CSL_CITATION {"citationID":"MENDELEY_CITATION_138","citationItems":[{"id":"ITEM-138","isTemporary":false,"itemData":{"DOI":"10.1038/s41598-025-12109-0","author":[{"family":"Otani","given":"Takuya"},{"family":"Takanishi","given":"Atsuo"},{"family":"Hara","given":"Nobuyuki"},{"family":"Takita","given":"Yutaka"},{"family":"Kimura","given":"Koichi"}],"container-title":"Scientific Reports","id":"Otani2025","issued":{"date-parts":[[2025]]},"page":"28508","publisher":"Nature Publishing Group","title":"Quantum computation for robot posture optimization","type":"article-journal","volume":"15"}}],"isEdited":false,"manualOverride":{"citeprocText":"(Otani et al. 2025)","isManuallyOverridden":false,"manualOverrideText":""},"mendeley":{"formattedCitation":"(Otani et al. 2025)","plainTextFormattedCitation":"(Otani et al. 2025)","previouslyFormattedCitation":"(Otani et al. 2025)"},"properties":{"noteIndex":0},"schema":"https://github.com/citation-style-language/schema/raw/master/csl-citation.json"}</w:instrText>
+        <w:instrText xml:space="preserve">ADDIN CSL_CITATION {"citationID":"MENDELEY_CITATION_151","citationItems":[{"id":"ITEM-151","isTemporary":false,"itemData":{"DOI":"10.1038/s41598-025-12109-0","author":[{"family":"Otani","given":"Takuya"},{"family":"Takanishi","given":"Atsuo"},{"family":"Hara","given":"Nobuyuki"},{"family":"Takita","given":"Yutaka"},{"family":"Kimura","given":"Koichi"}],"container-title":"Scientific Reports","id":"Otani2025","issued":{"date-parts":[[2025]]},"page":"28508","publisher":"Nature Publishing Group","title":"Quantum computation for robot posture optimization","type":"article-journal","volume":"15"}}],"isEdited":false,"manualOverride":{"citeprocText":"(Otani et al. 2025)","isManuallyOverridden":false,"manualOverrideText":""},"mendeley":{"formattedCitation":"(Otani et al. 2025)","plainTextFormattedCitation":"(Otani et al. 2025)","previouslyFormattedCitation":"(Otani et al. 2025)"},"properties":{"noteIndex":0},"schema":"https://github.com/citation-style-language/schema/raw/master/csl-citation.json"}</w:instrText>
       </w:r>
       <w:r>
         <w:fldChar w:fldCharType="separate"/>
@@ -9271,7 +9461,7 @@
         <w:fldChar w:fldCharType="begin"/>
       </w:r>
       <w:r>
-        <w:instrText xml:space="preserve">ADDIN CSL_CITATION {"citationID":"MENDELEY_CITATION_139","citationItems":[{"id":"ITEM-139","isTemporary":false,"itemData":{"DOI":"10.1109/QCE65121.2025.10359","author":[{"family":"Osaba","given":"Eneko"},{"family":"Garrote","given":"Estibaliz"},{"family":"Miranda-Rodriguez","given":"Pablo"},{"family":"Ciacco","given":"Alessia"},{"family":"Cabanes","given":"Itziar"},{"family":"Mancisidor","given":"Aitziber"}],"container-title":"2025 IEEE international conference on quantum computing and engineering (QCE)","id":"Osaba2025","issued":{"date-parts":[[2025]]},"page":"388-389","publisher":"IEEE","publisher-place":"Albuquerque, NM, USA","title":"Quantum-assisted automatic path-planning for robotic quality inspection in Industry 4.0","type":"paper-conference","volume":"2"}}],"isEdited":false,"manualOverride":{"citeprocText":"(Osaba, Garrote, et al. 2025)","isManuallyOverridden":false,"manualOverrideText":""},"mendeley":{"formattedCitation":"(Osaba, Garrote, et al. 2025)","plainTextFormattedCitation":"(Osaba, Garrote, et al. 2025)","previouslyFormattedCitation":"(Osaba, Garrote, et al. 2025)"},"properties":{"noteIndex":0},"schema":"https://github.com/citation-style-language/schema/raw/master/csl-citation.json"}</w:instrText>
+        <w:instrText xml:space="preserve">ADDIN CSL_CITATION {"citationID":"MENDELEY_CITATION_152","citationItems":[{"id":"ITEM-152","isTemporary":false,"itemData":{"DOI":"10.1109/QCE65121.2025.10359","author":[{"family":"Osaba","given":"Eneko"},{"family":"Garrote","given":"Estibaliz"},{"family":"Miranda-Rodriguez","given":"Pablo"},{"family":"Ciacco","given":"Alessia"},{"family":"Cabanes","given":"Itziar"},{"family":"Mancisidor","given":"Aitziber"}],"container-title":"2025 IEEE international conference on quantum computing and engineering (QCE)","id":"Osaba2025","issued":{"date-parts":[[2025]]},"page":"388-389","publisher":"IEEE","publisher-place":"Albuquerque, NM, USA","title":"Quantum-assisted automatic path-planning for robotic quality inspection in Industry 4.0","type":"paper-conference","volume":"2"}}],"isEdited":false,"manualOverride":{"citeprocText":"(Osaba, Garrote, et al. 2025)","isManuallyOverridden":false,"manualOverrideText":""},"mendeley":{"formattedCitation":"(Osaba, Garrote, et al. 2025)","plainTextFormattedCitation":"(Osaba, Garrote, et al. 2025)","previouslyFormattedCitation":"(Osaba, Garrote, et al. 2025)"},"properties":{"noteIndex":0},"schema":"https://github.com/citation-style-language/schema/raw/master/csl-citation.json"}</w:instrText>
       </w:r>
       <w:r>
         <w:fldChar w:fldCharType="separate"/>
@@ -9297,7 +9487,7 @@
         <w:fldChar w:fldCharType="begin"/>
       </w:r>
       <w:r>
-        <w:instrText xml:space="preserve">ADDIN CSL_CITATION {"citationID":"MENDELEY_CITATION_140","citationItems":[{"id":"ITEM-140","isTemporary":false,"itemData":{"DOI":"10.1126/sciadv.aav2372","author":[{"family":"Goto","given":"Hayato"},{"family":"Tatsumura","given":"Kosuke"},{"family":"Dixon","given":"Alexander R."}],"container-title":"Science Advances","id":"Goto2019","issue":"4","issued":{"date-parts":[[2019]]},"page":"eaav2372","publisher":"American Association for the Advancement of Science","title":"Combinatorial optimization by simulating adiabatic bifurcations in nonlinear Hamiltonian systems","type":"article-journal","volume":"5"}}],"isEdited":false,"manualOverride":{"citeprocText":"(Goto, Tatsumura, and Dixon 2019)","isManuallyOverridden":false,"manualOverrideText":""},"mendeley":{"formattedCitation":"(Goto, Tatsumura, and Dixon 2019)","plainTextFormattedCitation":"(Goto, Tatsumura, and Dixon 2019)","previouslyFormattedCitation":"(Goto, Tatsumura, and Dixon 2019)"},"properties":{"noteIndex":0},"schema":"https://github.com/citation-style-language/schema/raw/master/csl-citation.json"}</w:instrText>
+        <w:instrText xml:space="preserve">ADDIN CSL_CITATION {"citationID":"MENDELEY_CITATION_153","citationItems":[{"id":"ITEM-153","isTemporary":false,"itemData":{"DOI":"10.1126/sciadv.aav2372","author":[{"family":"Goto","given":"Hayato"},{"family":"Tatsumura","given":"Kosuke"},{"family":"Dixon","given":"Alexander R."}],"container-title":"Science Advances","id":"Goto2019","issue":"4","issued":{"date-parts":[[2019]]},"page":"eaav2372","publisher":"American Association for the Advancement of Science","title":"Combinatorial optimization by simulating adiabatic bifurcations in nonlinear Hamiltonian systems","type":"article-journal","volume":"5"}}],"isEdited":false,"manualOverride":{"citeprocText":"(Goto, Tatsumura, and Dixon 2019)","isManuallyOverridden":false,"manualOverrideText":""},"mendeley":{"formattedCitation":"(Goto, Tatsumura, and Dixon 2019)","plainTextFormattedCitation":"(Goto, Tatsumura, and Dixon 2019)","previouslyFormattedCitation":"(Goto, Tatsumura, and Dixon 2019)"},"properties":{"noteIndex":0},"schema":"https://github.com/citation-style-language/schema/raw/master/csl-citation.json"}</w:instrText>
       </w:r>
       <w:r>
         <w:fldChar w:fldCharType="separate"/>
@@ -9414,7 +9604,7 @@
         <w:fldChar w:fldCharType="begin"/>
       </w:r>
       <w:r>
-        <w:instrText xml:space="preserve">ADDIN CSL_CITATION {"citationID":"MENDELEY_CITATION_141","citationItems":[{"id":"ITEM-141","isTemporary":false,"itemData":{"DOI":"10.1145/237814.237866","author":[{"family":"Grover","given":"Lov K."}],"container-title":"Proceedings of the twenty-eighth annual ACM symposium on theory of computing (STOC ’96)","id":"Grover1996","issued":{"date-parts":[[1996]]},"page":"212-219","publisher":"ACM","publisher-place":"New York, NY, USA","title":"A fast quantum mechanical algorithm for database search","type":"paper-conference"}}],"isEdited":false,"manualOverride":{"citeprocText":"(Grover 1996)","isManuallyOverridden":false,"manualOverrideText":""},"mendeley":{"formattedCitation":"(Grover 1996)","plainTextFormattedCitation":"(Grover 1996)","previouslyFormattedCitation":"(Grover 1996)"},"properties":{"noteIndex":0},"schema":"https://github.com/citation-style-language/schema/raw/master/csl-citation.json"}</w:instrText>
+        <w:instrText xml:space="preserve">ADDIN CSL_CITATION {"citationID":"MENDELEY_CITATION_154","citationItems":[{"id":"ITEM-154","isTemporary":false,"itemData":{"DOI":"10.1145/237814.237866","author":[{"family":"Grover","given":"Lov K."}],"container-title":"Proceedings of the twenty-eighth annual ACM symposium on theory of computing (STOC ’96)","id":"Grover1996","issued":{"date-parts":[[1996]]},"page":"212-219","publisher":"ACM","publisher-place":"New York, NY, USA","title":"A fast quantum mechanical algorithm for database search","type":"paper-conference"}}],"isEdited":false,"manualOverride":{"citeprocText":"(Grover 1996)","isManuallyOverridden":false,"manualOverrideText":""},"mendeley":{"formattedCitation":"(Grover 1996)","plainTextFormattedCitation":"(Grover 1996)","previouslyFormattedCitation":"(Grover 1996)"},"properties":{"noteIndex":0},"schema":"https://github.com/citation-style-language/schema/raw/master/csl-citation.json"}</w:instrText>
       </w:r>
       <w:r>
         <w:fldChar w:fldCharType="separate"/>
@@ -9520,7 +9710,7 @@
         <w:fldChar w:fldCharType="begin"/>
       </w:r>
       <w:r>
-        <w:instrText xml:space="preserve">ADDIN CSL_CITATION {"citationID":"MENDELEY_CITATION_142","citationItems":[{"id":"ITEM-142","isTemporary":false,"itemData":{"DOI":"10.1090/conm/305/05215","author":[{"family":"Brassard","given":"Gilles"},{"family":"Høyer","given":"Peter"},{"family":"Mosca","given":"Michele"},{"family":"Tapp","given":"Alain"}],"collection-title":"Contemporary mathematics","container-title":"Quantum computation and information","editor":[{"family":"Lomonaco","given":"Samuel J.","suffix":"Jr."}],"id":"Brassard2002","issued":{"date-parts":[[2002]]},"page":"53-74","publisher":"American Mathematical Society","title":"Quantum amplitude amplification and estimation","type":"chapter","volume":"305"}}],"isEdited":false,"manualOverride":{"citeprocText":"(Brassard et al. 2002)","isManuallyOverridden":false,"manualOverrideText":""},"mendeley":{"formattedCitation":"(Brassard et al. 2002)","plainTextFormattedCitation":"(Brassard et al. 2002)","previouslyFormattedCitation":"(Brassard et al. 2002)"},"properties":{"noteIndex":0},"schema":"https://github.com/citation-style-language/schema/raw/master/csl-citation.json"}</w:instrText>
+        <w:instrText xml:space="preserve">ADDIN CSL_CITATION {"citationID":"MENDELEY_CITATION_155","citationItems":[{"id":"ITEM-155","isTemporary":false,"itemData":{"DOI":"10.1090/conm/305/05215","author":[{"family":"Brassard","given":"Gilles"},{"family":"Høyer","given":"Peter"},{"family":"Mosca","given":"Michele"},{"family":"Tapp","given":"Alain"}],"collection-title":"Contemporary mathematics","container-title":"Quantum computation and information","editor":[{"family":"Lomonaco","given":"Samuel J.","suffix":"Jr."}],"id":"Brassard2002","issued":{"date-parts":[[2002]]},"page":"53-74","publisher":"American Mathematical Society","title":"Quantum amplitude amplification and estimation","type":"chapter","volume":"305"}}],"isEdited":false,"manualOverride":{"citeprocText":"(Brassard et al. 2002)","isManuallyOverridden":false,"manualOverrideText":""},"mendeley":{"formattedCitation":"(Brassard et al. 2002)","plainTextFormattedCitation":"(Brassard et al. 2002)","previouslyFormattedCitation":"(Brassard et al. 2002)"},"properties":{"noteIndex":0},"schema":"https://github.com/citation-style-language/schema/raw/master/csl-citation.json"}</w:instrText>
       </w:r>
       <w:r>
         <w:fldChar w:fldCharType="separate"/>
@@ -9538,7 +9728,7 @@
         <w:fldChar w:fldCharType="begin"/>
       </w:r>
       <w:r>
-        <w:instrText xml:space="preserve">ADDIN CSL_CITATION {"citationID":"MENDELEY_CITATION_143","citationItems":[{"id":"ITEM-143","isTemporary":false,"itemData":{"DOI":"10.1098/rspa.2015.0301","author":[{"family":"Montanaro","given":"Ashley"}],"container-title":"Proceedings of the Royal Society A: Mathematical, Physical and Engineering Sciences","id":"Montanaro2015","issue":"2181","issued":{"date-parts":[[2015]]},"page":"20150301","publisher":"The Royal Society","title":"Quantum speedup of Monte Carlo methods","type":"article-journal","volume":"471"}}],"isEdited":false,"manualOverride":{"citeprocText":"(Montanaro 2015)","isManuallyOverridden":false,"manualOverrideText":""},"mendeley":{"formattedCitation":"(Montanaro 2015)","plainTextFormattedCitation":"(Montanaro 2015)","previouslyFormattedCitation":"(Montanaro 2015)"},"properties":{"noteIndex":0},"schema":"https://github.com/citation-style-language/schema/raw/master/csl-citation.json"}</w:instrText>
+        <w:instrText xml:space="preserve">ADDIN CSL_CITATION {"citationID":"MENDELEY_CITATION_156","citationItems":[{"id":"ITEM-156","isTemporary":false,"itemData":{"DOI":"10.1098/rspa.2015.0301","author":[{"family":"Montanaro","given":"Ashley"}],"container-title":"Proceedings of the Royal Society A: Mathematical, Physical and Engineering Sciences","id":"Montanaro2015","issue":"2181","issued":{"date-parts":[[2015]]},"page":"20150301","publisher":"The Royal Society","title":"Quantum speedup of Monte Carlo methods","type":"article-journal","volume":"471"}}],"isEdited":false,"manualOverride":{"citeprocText":"(Montanaro 2015)","isManuallyOverridden":false,"manualOverrideText":""},"mendeley":{"formattedCitation":"(Montanaro 2015)","plainTextFormattedCitation":"(Montanaro 2015)","previouslyFormattedCitation":"(Montanaro 2015)"},"properties":{"noteIndex":0},"schema":"https://github.com/citation-style-language/schema/raw/master/csl-citation.json"}</w:instrText>
       </w:r>
       <w:r>
         <w:fldChar w:fldCharType="separate"/>
@@ -9556,7 +9746,7 @@
         <w:fldChar w:fldCharType="begin"/>
       </w:r>
       <w:r>
-        <w:instrText xml:space="preserve">ADDIN CSL_CITATION {"citationID":"MENDELEY_CITATION_144","citationItems":[{"id":"ITEM-144","isTemporary":false,"itemData":{"DOI":"10.1109/ROBOT.1999.772544","author":[{"family":"Dellaert","given":"Frank"},{"family":"Fox","given":"Dieter"},{"family":"Burgard","given":"Wolfram"},{"family":"Thrun","given":"Sebastian"}],"container-title":"Proceedings of the 1999 IEEE international conference on robotics and automation (ICRA)","id":"Dellaert1999","issued":{"date-parts":[[1999]]},"page":"1322-1328","publisher":"IEEE","title":"Monte Carlo localization for mobile robots","type":"paper-conference","volume":"2"}}],"isEdited":false,"manualOverride":{"citeprocText":"(Dellaert et al. 1999)","isManuallyOverridden":false,"manualOverrideText":""},"mendeley":{"formattedCitation":"(Dellaert et al. 1999)","plainTextFormattedCitation":"(Dellaert et al. 1999)","previouslyFormattedCitation":"(Dellaert et al. 1999)"},"properties":{"noteIndex":0},"schema":"https://github.com/citation-style-language/schema/raw/master/csl-citation.json"}</w:instrText>
+        <w:instrText xml:space="preserve">ADDIN CSL_CITATION {"citationID":"MENDELEY_CITATION_157","citationItems":[{"id":"ITEM-157","isTemporary":false,"itemData":{"DOI":"10.1109/ROBOT.1999.772544","author":[{"family":"Dellaert","given":"Frank"},{"family":"Fox","given":"Dieter"},{"family":"Burgard","given":"Wolfram"},{"family":"Thrun","given":"Sebastian"}],"container-title":"Proceedings of the 1999 IEEE international conference on robotics and automation (ICRA)","id":"Dellaert1999","issued":{"date-parts":[[1999]]},"page":"1322-1328","publisher":"IEEE","title":"Monte Carlo localization for mobile robots","type":"paper-conference","volume":"2"}}],"isEdited":false,"manualOverride":{"citeprocText":"(Dellaert et al. 1999)","isManuallyOverridden":false,"manualOverrideText":""},"mendeley":{"formattedCitation":"(Dellaert et al. 1999)","plainTextFormattedCitation":"(Dellaert et al. 1999)","previouslyFormattedCitation":"(Dellaert et al. 1999)"},"properties":{"noteIndex":0},"schema":"https://github.com/citation-style-language/schema/raw/master/csl-citation.json"}</w:instrText>
       </w:r>
       <w:r>
         <w:fldChar w:fldCharType="separate"/>
@@ -9577,7 +9767,7 @@
         <w:fldChar w:fldCharType="begin"/>
       </w:r>
       <w:r>
-        <w:instrText xml:space="preserve">ADDIN CSL_CITATION {"citationID":"MENDELEY_CITATION_145","citationItems":[{"id":"ITEM-145","isTemporary":false,"itemData":{"DOI":"10.1103/PhysRevX.4.031002","author":[{"family":"Paparo","given":"Giuseppe Davide"},{"family":"Dunjko","given":"Vedran"},{"family":"Makmal","given":"Adi"},{"family":"Martin-Delgado","given":"Miguel Angel"},{"family":"Briegel","given":"Hans J."}],"container-title":"Physical Review X","id":"Paparo2014","issue":"3","issued":{"date-parts":[[2014]]},"page":"031002","title":"Quantum speedup for active learning agents","type":"article-journal","volume":"4"}}],"isEdited":false,"manualOverride":{"citeprocText":"(Paparo et al. 2014)","isManuallyOverridden":false,"manualOverrideText":""},"mendeley":{"formattedCitation":"(Paparo et al. 2014)","plainTextFormattedCitation":"(Paparo et al. 2014)","previouslyFormattedCitation":"(Paparo et al. 2014)"},"properties":{"noteIndex":0},"schema":"https://github.com/citation-style-language/schema/raw/master/csl-citation.json"}</w:instrText>
+        <w:instrText xml:space="preserve">ADDIN CSL_CITATION {"citationID":"MENDELEY_CITATION_158","citationItems":[{"id":"ITEM-158","isTemporary":false,"itemData":{"DOI":"10.1103/PhysRevX.4.031002","author":[{"family":"Paparo","given":"Giuseppe Davide"},{"family":"Dunjko","given":"Vedran"},{"family":"Makmal","given":"Adi"},{"family":"Martin-Delgado","given":"Miguel Angel"},{"family":"Briegel","given":"Hans J."}],"container-title":"Physical Review X","id":"Paparo2014","issue":"3","issued":{"date-parts":[[2014]]},"page":"031002","title":"Quantum speedup for active learning agents","type":"article-journal","volume":"4"}}],"isEdited":false,"manualOverride":{"citeprocText":"(Paparo et al. 2014)","isManuallyOverridden":false,"manualOverrideText":""},"mendeley":{"formattedCitation":"(Paparo et al. 2014)","plainTextFormattedCitation":"(Paparo et al. 2014)","previouslyFormattedCitation":"(Paparo et al. 2014)"},"properties":{"noteIndex":0},"schema":"https://github.com/citation-style-language/schema/raw/master/csl-citation.json"}</w:instrText>
       </w:r>
       <w:r>
         <w:fldChar w:fldCharType="separate"/>
@@ -9595,7 +9785,7 @@
         <w:fldChar w:fldCharType="begin"/>
       </w:r>
       <w:r>
-        <w:instrText xml:space="preserve">ADDIN CSL_CITATION {"citationID":"MENDELEY_CITATION_146","citationItems":[{"id":"ITEM-146","isTemporary":false,"itemData":{"URL":"https://arxiv.org/abs/1401.2142","author":[{"family":"Wiebe","given":"Nathan"},{"family":"Kapoor","given":"Ashish"},{"family":"Svore","given":"Krysta M."}],"container-title":"Quantum Information &amp; Computation","id":"Wiebe2015","issue":"3–4","issued":{"date-parts":[[2015]]},"page":"318-358","publisher":"Rinton Press","title":"Quantum algorithms for nearest-neighbor methods for supervised and unsupervised learning","type":"article-journal","volume":"15"}}],"isEdited":false,"manualOverride":{"citeprocText":"(Wiebe, Kapoor, and Svore 2015)","isManuallyOverridden":false,"manualOverrideText":""},"mendeley":{"formattedCitation":"(Wiebe, Kapoor, and Svore 2015)","plainTextFormattedCitation":"(Wiebe, Kapoor, and Svore 2015)","previouslyFormattedCitation":"(Wiebe, Kapoor, and Svore 2015)"},"properties":{"noteIndex":0},"schema":"https://github.com/citation-style-language/schema/raw/master/csl-citation.json"}</w:instrText>
+        <w:instrText xml:space="preserve">ADDIN CSL_CITATION {"citationID":"MENDELEY_CITATION_159","citationItems":[{"id":"ITEM-159","isTemporary":false,"itemData":{"URL":"https://arxiv.org/abs/1401.2142","author":[{"family":"Wiebe","given":"Nathan"},{"family":"Kapoor","given":"Ashish"},{"family":"Svore","given":"Krysta M."}],"container-title":"Quantum Information &amp; Computation","id":"Wiebe2015","issue":"3–4","issued":{"date-parts":[[2015]]},"page":"318-358","publisher":"Rinton Press","title":"Quantum algorithms for nearest-neighbor methods for supervised and unsupervised learning","type":"article-journal","volume":"15"}}],"isEdited":false,"manualOverride":{"citeprocText":"(Wiebe, Kapoor, and Svore 2015)","isManuallyOverridden":false,"manualOverrideText":""},"mendeley":{"formattedCitation":"(Wiebe, Kapoor, and Svore 2015)","plainTextFormattedCitation":"(Wiebe, Kapoor, and Svore 2015)","previouslyFormattedCitation":"(Wiebe, Kapoor, and Svore 2015)"},"properties":{"noteIndex":0},"schema":"https://github.com/citation-style-language/schema/raw/master/csl-citation.json"}</w:instrText>
       </w:r>
       <w:r>
         <w:fldChar w:fldCharType="separate"/>
@@ -9616,7 +9806,7 @@
         <w:fldChar w:fldCharType="begin"/>
       </w:r>
       <w:r>
-        <w:instrText xml:space="preserve">ADDIN CSL_CITATION {"citationID":"MENDELEY_CITATION_147","citationItems":[{"id":"ITEM-147","isTemporary":false,"itemData":{"URL":"https://arxiv.org/abs/quant-ph/0003006","author":[{"family":"Benioff","given":"Paul"}],"collection-title":"Contemporary mathematics","container-title":"Quantum computation and information","editor":[{"family":"Lomonaco","given":"Samuel J.","suffix":"Jr."},{"family":"Brandt","given":"Howard E."}],"id":"Benioff2002","issued":{"date-parts":[[2002]]},"publisher":"American Mathematical Society","publisher-place":"Providence, RI","title":"Space searches with a quantum robot","type":"chapter","volume":"305"},"suppress-author":false}],"isEdited":false,"manualOverride":{"citeprocText":"Benioff (2002)","isManuallyOverridden":false,"manualOverrideText":""},"mendeley":{"formattedCitation":"Benioff (2002)","plainTextFormattedCitation":"Benioff (2002)","previouslyFormattedCitation":"Benioff (2002)"},"properties":{"noteIndex":0},"schema":"https://github.com/citation-style-language/schema/raw/master/csl-citation.json"}</w:instrText>
+        <w:instrText xml:space="preserve">ADDIN CSL_CITATION {"citationID":"MENDELEY_CITATION_160","citationItems":[{"id":"ITEM-160","isTemporary":false,"itemData":{"URL":"https://arxiv.org/abs/quant-ph/0003006","author":[{"family":"Benioff","given":"Paul"}],"collection-title":"Contemporary mathematics","container-title":"Quantum computation and information","editor":[{"family":"Lomonaco","given":"Samuel J.","suffix":"Jr."},{"family":"Brandt","given":"Howard E."}],"id":"Benioff2002","issued":{"date-parts":[[2002]]},"publisher":"American Mathematical Society","publisher-place":"Providence, RI","title":"Space searches with a quantum robot","type":"chapter","volume":"305"},"suppress-author":false}],"isEdited":false,"manualOverride":{"citeprocText":"Benioff (2002)","isManuallyOverridden":false,"manualOverrideText":""},"mendeley":{"formattedCitation":"Benioff (2002)","plainTextFormattedCitation":"Benioff (2002)","previouslyFormattedCitation":"Benioff (2002)"},"properties":{"noteIndex":0},"schema":"https://github.com/citation-style-language/schema/raw/master/csl-citation.json"}</w:instrText>
       </w:r>
       <w:r>
         <w:fldChar w:fldCharType="separate"/>
@@ -9661,7 +9851,7 @@
         <w:fldChar w:fldCharType="begin"/>
       </w:r>
       <w:r>
-        <w:instrText xml:space="preserve">ADDIN CSL_CITATION {"citationID":"MENDELEY_CITATION_148","citationItems":[{"id":"ITEM-148","isTemporary":false,"itemData":{"DOI":"10.3390/math10142475","author":[{"family":"Chella","given":"Antonio"},{"family":"Gaglio","given":"Salvatore"},{"family":"Pilato","given":"Giovanni"},{"family":"Vella","given":"Filippo"},{"family":"Zammuto","given":"Salvatore"}],"container-title":"Mathematics","id":"Chella2022","issue":"14","issued":{"date-parts":[[2022]]},"page":"2475","publisher":"MDPI","title":"A quantum planner for robot motion","type":"article-journal","volume":"10"},"suppress-author":false}],"isEdited":false,"manualOverride":{"citeprocText":"Chella et al. (2022)","isManuallyOverridden":false,"manualOverrideText":""},"mendeley":{"formattedCitation":"Chella et al. (2022)","plainTextFormattedCitation":"Chella et al. (2022)","previouslyFormattedCitation":"Chella et al. (2022)"},"properties":{"noteIndex":0},"schema":"https://github.com/citation-style-language/schema/raw/master/csl-citation.json"}</w:instrText>
+        <w:instrText xml:space="preserve">ADDIN CSL_CITATION {"citationID":"MENDELEY_CITATION_161","citationItems":[{"id":"ITEM-161","isTemporary":false,"itemData":{"DOI":"10.3390/math10142475","author":[{"family":"Chella","given":"Antonio"},{"family":"Gaglio","given":"Salvatore"},{"family":"Pilato","given":"Giovanni"},{"family":"Vella","given":"Filippo"},{"family":"Zammuto","given":"Salvatore"}],"container-title":"Mathematics","id":"Chella2022","issue":"14","issued":{"date-parts":[[2022]]},"page":"2475","publisher":"MDPI","title":"A quantum planner for robot motion","type":"article-journal","volume":"10"},"suppress-author":false}],"isEdited":false,"manualOverride":{"citeprocText":"Chella et al. (2022)","isManuallyOverridden":false,"manualOverrideText":""},"mendeley":{"formattedCitation":"Chella et al. (2022)","plainTextFormattedCitation":"Chella et al. (2022)","previouslyFormattedCitation":"Chella et al. (2022)"},"properties":{"noteIndex":0},"schema":"https://github.com/citation-style-language/schema/raw/master/csl-citation.json"}</w:instrText>
       </w:r>
       <w:r>
         <w:fldChar w:fldCharType="separate"/>
@@ -9747,7 +9937,7 @@
         <w:fldChar w:fldCharType="begin"/>
       </w:r>
       <w:r>
-        <w:instrText xml:space="preserve">ADDIN CSL_CITATION {"citationID":"MENDELEY_CITATION_149","citationItems":[{"id":"ITEM-149","isTemporary":false,"itemData":{"DOI":"10.1016/j.robot.2023.104362","author":[{"family":"Chella","given":"Antonio"},{"family":"Gaglio","given":"Salvatore"},{"family":"Mannone","given":"Maria"},{"family":"Pilato","given":"Giovanni"},{"family":"Seidita","given":"Valeria"},{"family":"Vella","given":"Filippo"},{"family":"Zammuto","given":"Salvatore"}],"container-title":"Robotics and Autonomous Systems","id":"Chella2023","issued":{"date-parts":[[2023]]},"page":"104362","publisher":"Elsevier","title":"Quantum planning for swarm robotics","type":"article-journal","volume":"161"},"suppress-author":false}],"isEdited":false,"manualOverride":{"citeprocText":"Chella et al. (2023)","isManuallyOverridden":false,"manualOverrideText":""},"mendeley":{"formattedCitation":"Chella et al. (2023)","plainTextFormattedCitation":"Chella et al. (2023)","previouslyFormattedCitation":"Chella et al. (2023)"},"properties":{"noteIndex":0},"schema":"https://github.com/citation-style-language/schema/raw/master/csl-citation.json"}</w:instrText>
+        <w:instrText xml:space="preserve">ADDIN CSL_CITATION {"citationID":"MENDELEY_CITATION_162","citationItems":[{"id":"ITEM-162","isTemporary":false,"itemData":{"DOI":"10.1016/j.robot.2023.104362","author":[{"family":"Chella","given":"Antonio"},{"family":"Gaglio","given":"Salvatore"},{"family":"Mannone","given":"Maria"},{"family":"Pilato","given":"Giovanni"},{"family":"Seidita","given":"Valeria"},{"family":"Vella","given":"Filippo"},{"family":"Zammuto","given":"Salvatore"}],"container-title":"Robotics and Autonomous Systems","id":"Chella2023","issued":{"date-parts":[[2023]]},"page":"104362","publisher":"Elsevier","title":"Quantum planning for swarm robotics","type":"article-journal","volume":"161"},"suppress-author":false}],"isEdited":false,"manualOverride":{"citeprocText":"Chella et al. (2023)","isManuallyOverridden":false,"manualOverrideText":""},"mendeley":{"formattedCitation":"Chella et al. (2023)","plainTextFormattedCitation":"Chella et al. (2023)","previouslyFormattedCitation":"Chella et al. (2023)"},"properties":{"noteIndex":0},"schema":"https://github.com/citation-style-language/schema/raw/master/csl-citation.json"}</w:instrText>
       </w:r>
       <w:r>
         <w:fldChar w:fldCharType="separate"/>
@@ -9771,7 +9961,7 @@
         <w:fldChar w:fldCharType="begin"/>
       </w:r>
       <w:r>
-        <w:instrText xml:space="preserve">ADDIN CSL_CITATION {"citationID":"MENDELEY_CITATION_150","citationItems":[{"id":"ITEM-150","isTemporary":false,"itemData":{"DOI":"10.1109/ACCESS.2023.3307316","author":[{"family":"Lathrop","given":"Paul"},{"family":"Boardman","given":"Beth"},{"family":"Martínez","given":"Sonia"}],"container-title":"IEEE Access","id":"Lathrop2023","issued":{"date-parts":[[2023]]},"page":"89506-89519","title":"Quantum search approaches to sampling-based motion planning","type":"article-journal","volume":"11"},"suppress-author":false}],"isEdited":false,"manualOverride":{"citeprocText":"Lathrop, Boardman, and Martínez (2023)","isManuallyOverridden":false,"manualOverrideText":""},"mendeley":{"formattedCitation":"Lathrop, Boardman, and Martínez (2023)","plainTextFormattedCitation":"Lathrop, Boardman, and Martínez (2023)","previouslyFormattedCitation":"Lathrop, Boardman, and Martínez (2023)"},"properties":{"noteIndex":0},"schema":"https://github.com/citation-style-language/schema/raw/master/csl-citation.json"}</w:instrText>
+        <w:instrText xml:space="preserve">ADDIN CSL_CITATION {"citationID":"MENDELEY_CITATION_163","citationItems":[{"id":"ITEM-163","isTemporary":false,"itemData":{"DOI":"10.1109/ACCESS.2023.3307316","author":[{"family":"Lathrop","given":"Paul"},{"family":"Boardman","given":"Beth"},{"family":"Martínez","given":"Sonia"}],"container-title":"IEEE Access","id":"Lathrop2023","issued":{"date-parts":[[2023]]},"page":"89506-89519","title":"Quantum search approaches to sampling-based motion planning","type":"article-journal","volume":"11"},"suppress-author":false}],"isEdited":false,"manualOverride":{"citeprocText":"Lathrop, Boardman, and Martínez (2023)","isManuallyOverridden":false,"manualOverrideText":""},"mendeley":{"formattedCitation":"Lathrop, Boardman, and Martínez (2023)","plainTextFormattedCitation":"Lathrop, Boardman, and Martínez (2023)","previouslyFormattedCitation":"Lathrop, Boardman, and Martínez (2023)"},"properties":{"noteIndex":0},"schema":"https://github.com/citation-style-language/schema/raw/master/csl-citation.json"}</w:instrText>
       </w:r>
       <w:r>
         <w:fldChar w:fldCharType="separate"/>
@@ -9797,7 +9987,7 @@
         <w:fldChar w:fldCharType="begin"/>
       </w:r>
       <w:r>
-        <w:instrText xml:space="preserve">ADDIN CSL_CITATION {"citationID":"MENDELEY_CITATION_151","citationItems":[{"id":"ITEM-151","isTemporary":false,"itemData":{"author":[{"family":"Nigatu","given":"Hassen"},{"family":"Shi","given":"Gaokun"},{"family":"Li","given":"Jituo"},{"family":"Wang","given":"Jin"},{"family":"Lu","given":"Guodong"},{"family":"Li","given":"Howard"}],"container-title":"IEEE Robotics and Automation Letters","id":"Nigatu2025","issued":{"date-parts":[[2025]]},"note":"Accepted October 2025; preprint arXiv:2509.07216","title":"Quantum machine learning and Grover’s algorithm for quantum optimization of robotic manipulators","type":"article-journal"},"suppress-author":false}],"isEdited":false,"manualOverride":{"citeprocText":"Nigatu et al. (2025)","isManuallyOverridden":false,"manualOverrideText":""},"mendeley":{"formattedCitation":"Nigatu et al. (2025)","plainTextFormattedCitation":"Nigatu et al. (2025)","previouslyFormattedCitation":"Nigatu et al. (2025)"},"properties":{"noteIndex":0},"schema":"https://github.com/citation-style-language/schema/raw/master/csl-citation.json"}</w:instrText>
+        <w:instrText xml:space="preserve">ADDIN CSL_CITATION {"citationID":"MENDELEY_CITATION_164","citationItems":[{"id":"ITEM-164","isTemporary":false,"itemData":{"author":[{"family":"Nigatu","given":"Hassen"},{"family":"Shi","given":"Gaokun"},{"family":"Li","given":"Jituo"},{"family":"Wang","given":"Jin"},{"family":"Lu","given":"Guodong"},{"family":"Li","given":"Howard"}],"container-title":"IEEE Robotics and Automation Letters","id":"Nigatu2025","issued":{"date-parts":[[2025]]},"note":"Accepted October 2025; preprint arXiv:2509.07216","title":"Quantum machine learning and Grover’s algorithm for quantum optimization of robotic manipulators","type":"article-journal"},"suppress-author":false}],"isEdited":false,"manualOverride":{"citeprocText":"Nigatu et al. (2025)","isManuallyOverridden":false,"manualOverrideText":""},"mendeley":{"formattedCitation":"Nigatu et al. (2025)","plainTextFormattedCitation":"Nigatu et al. (2025)","previouslyFormattedCitation":"Nigatu et al. (2025)"},"properties":{"noteIndex":0},"schema":"https://github.com/citation-style-language/schema/raw/master/csl-citation.json"}</w:instrText>
       </w:r>
       <w:r>
         <w:fldChar w:fldCharType="separate"/>
@@ -9821,7 +10011,7 @@
         <w:fldChar w:fldCharType="begin"/>
       </w:r>
       <w:r>
-        <w:instrText xml:space="preserve">ADDIN CSL_CITATION {"citationID":"MENDELEY_CITATION_152","citationItems":[{"id":"ITEM-152","isTemporary":false,"itemData":{"DOI":"10.1109/TCE.2024.3423416","author":[{"family":"Sarkar","given":"Mayukh"},{"family":"Pradhan","given":"Jitesh"},{"family":"Singh","given":"Anil Kumar"},{"family":"Nenavath","given":"Hathiram"}],"container-title":"IEEE Transactions on Consumer Electronics","id":"Sarkar2024","issue":"3","issued":{"date-parts":[[2024]]},"page":"5597-5606","publisher":"IEEE","title":"A novel hybrid quantum architecture for path planning in quantum-enabled autonomous mobile robots","type":"article-journal","volume":"70"},"suppress-author":false}],"isEdited":false,"manualOverride":{"citeprocText":"Sarkar et al. (2024)","isManuallyOverridden":false,"manualOverrideText":""},"mendeley":{"formattedCitation":"Sarkar et al. (2024)","plainTextFormattedCitation":"Sarkar et al. (2024)","previouslyFormattedCitation":"Sarkar et al. (2024)"},"properties":{"noteIndex":0},"schema":"https://github.com/citation-style-language/schema/raw/master/csl-citation.json"}</w:instrText>
+        <w:instrText xml:space="preserve">ADDIN CSL_CITATION {"citationID":"MENDELEY_CITATION_165","citationItems":[{"id":"ITEM-165","isTemporary":false,"itemData":{"DOI":"10.1109/TCE.2024.3423416","author":[{"family":"Sarkar","given":"Mayukh"},{"family":"Pradhan","given":"Jitesh"},{"family":"Singh","given":"Anil Kumar"},{"family":"Nenavath","given":"Hathiram"}],"container-title":"IEEE Transactions on Consumer Electronics","id":"Sarkar2024","issue":"3","issued":{"date-parts":[[2024]]},"page":"5597-5606","publisher":"IEEE","title":"A novel hybrid quantum architecture for path planning in quantum-enabled autonomous mobile robots","type":"article-journal","volume":"70"},"suppress-author":false}],"isEdited":false,"manualOverride":{"citeprocText":"Sarkar et al. (2024)","isManuallyOverridden":false,"manualOverrideText":""},"mendeley":{"formattedCitation":"Sarkar et al. (2024)","plainTextFormattedCitation":"Sarkar et al. (2024)","previouslyFormattedCitation":"Sarkar et al. (2024)"},"properties":{"noteIndex":0},"schema":"https://github.com/citation-style-language/schema/raw/master/csl-citation.json"}</w:instrText>
       </w:r>
       <w:r>
         <w:fldChar w:fldCharType="separate"/>
@@ -9884,7 +10074,7 @@
         <w:fldChar w:fldCharType="begin"/>
       </w:r>
       <w:r>
-        <w:instrText xml:space="preserve">ADDIN CSL_CITATION {"citationID":"MENDELEY_CITATION_153","citationItems":[{"id":"ITEM-153","isTemporary":false,"itemData":{"URL":"https://proceedings.mlr.press/v267/gerlach25a.html","author":[{"family":"Gerlach","given":"Thore"},{"family":"Lee","given":"Loong Kuan"},{"family":"Barbaresco","given":"Frederic"},{"family":"Piatkowski","given":"Nico"}],"collection-title":"Proceedings of machine learning research","container-title":"Proceedings of the 42nd international conference on machine learning","editor":[{"family":"Singh","given":"Aarti"},{"family":"Fazel","given":"Maryam"},{"family":"Hsu","given":"Daniel"},{"family":"Lacoste-Julien","given":"Simon"},{"family":"Berkenkamp","given":"Felix"},{"family":"Maharaj","given":"Tegan"},{"family":"Wagstaff","given":"Kiri"},{"family":"Zhu","given":"Jerry"}],"id":"Gerlach2025","issued":{"date-parts":[[2025]]},"page":"19161-19171","publisher":"PMLR","title":"Hybrid quantum-classical multi-agent pathfinding","type":"paper-conference","volume":"267"},"suppress-author":false}],"isEdited":false,"manualOverride":{"citeprocText":"Gerlach et al. (2025)","isManuallyOverridden":false,"manualOverrideText":""},"mendeley":{"formattedCitation":"Gerlach et al. (2025)","plainTextFormattedCitation":"Gerlach et al. (2025)","previouslyFormattedCitation":"Gerlach et al. (2025)"},"properties":{"noteIndex":0},"schema":"https://github.com/citation-style-language/schema/raw/master/csl-citation.json"}</w:instrText>
+        <w:instrText xml:space="preserve">ADDIN CSL_CITATION {"citationID":"MENDELEY_CITATION_166","citationItems":[{"id":"ITEM-166","isTemporary":false,"itemData":{"URL":"https://proceedings.mlr.press/v267/gerlach25a.html","author":[{"family":"Gerlach","given":"Thore"},{"family":"Lee","given":"Loong Kuan"},{"family":"Barbaresco","given":"Frederic"},{"family":"Piatkowski","given":"Nico"}],"collection-title":"Proceedings of machine learning research","container-title":"Proceedings of the 42nd international conference on machine learning","editor":[{"family":"Singh","given":"Aarti"},{"family":"Fazel","given":"Maryam"},{"family":"Hsu","given":"Daniel"},{"family":"Lacoste-Julien","given":"Simon"},{"family":"Berkenkamp","given":"Felix"},{"family":"Maharaj","given":"Tegan"},{"family":"Wagstaff","given":"Kiri"},{"family":"Zhu","given":"Jerry"}],"id":"Gerlach2025","issued":{"date-parts":[[2025]]},"page":"19161-19171","publisher":"PMLR","title":"Hybrid quantum-classical multi-agent pathfinding","type":"paper-conference","volume":"267"},"suppress-author":false}],"isEdited":false,"manualOverride":{"citeprocText":"Gerlach et al. (2025)","isManuallyOverridden":false,"manualOverrideText":""},"mendeley":{"formattedCitation":"Gerlach et al. (2025)","plainTextFormattedCitation":"Gerlach et al. (2025)","previouslyFormattedCitation":"Gerlach et al. (2025)"},"properties":{"noteIndex":0},"schema":"https://github.com/citation-style-language/schema/raw/master/csl-citation.json"}</w:instrText>
       </w:r>
       <w:r>
         <w:fldChar w:fldCharType="separate"/>
@@ -9908,7 +10098,7 @@
         <w:fldChar w:fldCharType="begin"/>
       </w:r>
       <w:r>
-        <w:instrText xml:space="preserve">ADDIN CSL_CITATION {"citationID":"MENDELEY_CITATION_154","citationItems":[{"id":"ITEM-154","isTemporary":false,"itemData":{"URL":"https://arxiv.org/abs/2602.14799","author":[{"family":"González Villasmil","given":"Javier"}],"id":"GonzalezVillasmil2026","issued":{"date-parts":[[2026]]},"title":"Scalable multi-robot path planning via quadratic unconstrained binary optimization","type":""},"suppress-author":false}],"isEdited":false,"manualOverride":{"citeprocText":"González Villasmil (2026)","isManuallyOverridden":false,"manualOverrideText":""},"mendeley":{"formattedCitation":"González Villasmil (2026)","plainTextFormattedCitation":"González Villasmil (2026)","previouslyFormattedCitation":"González Villasmil (2026)"},"properties":{"noteIndex":0},"schema":"https://github.com/citation-style-language/schema/raw/master/csl-citation.json"}</w:instrText>
+        <w:instrText xml:space="preserve">ADDIN CSL_CITATION {"citationID":"MENDELEY_CITATION_167","citationItems":[{"id":"ITEM-167","isTemporary":false,"itemData":{"URL":"https://arxiv.org/abs/2602.14799","author":[{"family":"González Villasmil","given":"Javier"}],"id":"GonzalezVillasmil2026","issued":{"date-parts":[[2026]]},"title":"Scalable multi-robot path planning via quadratic unconstrained binary optimization","type":""},"suppress-author":false}],"isEdited":false,"manualOverride":{"citeprocText":"González Villasmil (2026)","isManuallyOverridden":false,"manualOverrideText":""},"mendeley":{"formattedCitation":"González Villasmil (2026)","plainTextFormattedCitation":"González Villasmil (2026)","previouslyFormattedCitation":"González Villasmil (2026)"},"properties":{"noteIndex":0},"schema":"https://github.com/citation-style-language/schema/raw/master/csl-citation.json"}</w:instrText>
       </w:r>
       <w:r>
         <w:fldChar w:fldCharType="separate"/>
@@ -9955,7 +10145,7 @@
         <w:fldChar w:fldCharType="begin"/>
       </w:r>
       <w:r>
-        <w:instrText xml:space="preserve">ADDIN CSL_CITATION {"citationID":"MENDELEY_CITATION_155","citationItems":[{"id":"ITEM-155","isTemporary":false,"itemData":{"URL":"https://arxiv.org/abs/2407.08767","author":[{"family":"Rao","given":"Poojith U."},{"family":"Speelman","given":"Florian"},{"family":"Sodhi","given":"Balwinder"},{"family":"Kinge","given":"Sachin"}],"id":"Rao2024","issued":{"date-parts":[[2024]]},"title":"A quantum computing approach for multi-robot coverage path planning","type":""},"suppress-author":false}],"isEdited":false,"manualOverride":{"citeprocText":"Rao et al. (2024)","isManuallyOverridden":false,"manualOverrideText":""},"mendeley":{"formattedCitation":"Rao et al. (2024)","plainTextFormattedCitation":"Rao et al. (2024)","previouslyFormattedCitation":"Rao et al. (2024)"},"properties":{"noteIndex":0},"schema":"https://github.com/citation-style-language/schema/raw/master/csl-citation.json"}</w:instrText>
+        <w:instrText xml:space="preserve">ADDIN CSL_CITATION {"citationID":"MENDELEY_CITATION_168","citationItems":[{"id":"ITEM-168","isTemporary":false,"itemData":{"URL":"https://arxiv.org/abs/2407.08767","author":[{"family":"Rao","given":"Poojith U."},{"family":"Speelman","given":"Florian"},{"family":"Sodhi","given":"Balwinder"},{"family":"Kinge","given":"Sachin"}],"id":"Rao2024","issued":{"date-parts":[[2024]]},"title":"A quantum computing approach for multi-robot coverage path planning","type":""},"suppress-author":false}],"isEdited":false,"manualOverride":{"citeprocText":"Rao et al. (2024)","isManuallyOverridden":false,"manualOverrideText":""},"mendeley":{"formattedCitation":"Rao et al. (2024)","plainTextFormattedCitation":"Rao et al. (2024)","previouslyFormattedCitation":"Rao et al. (2024)"},"properties":{"noteIndex":0},"schema":"https://github.com/citation-style-language/schema/raw/master/csl-citation.json"}</w:instrText>
       </w:r>
       <w:r>
         <w:fldChar w:fldCharType="separate"/>
@@ -9976,7 +10166,7 @@
         <w:fldChar w:fldCharType="begin"/>
       </w:r>
       <w:r>
-        <w:instrText xml:space="preserve">ADDIN CSL_CITATION {"citationID":"MENDELEY_CITATION_156","citationItems":[{"id":"ITEM-156","isTemporary":false,"itemData":{"DOI":"10.3390/a12020034","author":[{"family":"Hadfield","given":"Stuart"},{"family":"Wang","given":"Zhihui"},{"family":"O’Gorman","given":"Bryan"},{"family":"Rieffel","given":"Eleanor G."},{"family":"Venturelli","given":"Davide"},{"family":"Biswas","given":"Rupak"}],"container-title":"Algorithms","id":"Hadfield2019","issue":"2","issued":{"date-parts":[[2019]]},"page":"34","publisher":"MDPI","title":"From the quantum approximate optimization algorithm to a quantum alternating operator ansatz","type":"article-journal","volume":"12"}}],"isEdited":false,"manualOverride":{"citeprocText":"(Hadfield et al. 2019)","isManuallyOverridden":false,"manualOverrideText":""},"mendeley":{"formattedCitation":"(Hadfield et al. 2019)","plainTextFormattedCitation":"(Hadfield et al. 2019)","previouslyFormattedCitation":"(Hadfield et al. 2019)"},"properties":{"noteIndex":0},"schema":"https://github.com/citation-style-language/schema/raw/master/csl-citation.json"}</w:instrText>
+        <w:instrText xml:space="preserve">ADDIN CSL_CITATION {"citationID":"MENDELEY_CITATION_169","citationItems":[{"id":"ITEM-169","isTemporary":false,"itemData":{"DOI":"10.3390/a12020034","author":[{"family":"Hadfield","given":"Stuart"},{"family":"Wang","given":"Zhihui"},{"family":"O’Gorman","given":"Bryan"},{"family":"Rieffel","given":"Eleanor G."},{"family":"Venturelli","given":"Davide"},{"family":"Biswas","given":"Rupak"}],"container-title":"Algorithms","id":"Hadfield2019","issue":"2","issued":{"date-parts":[[2019]]},"page":"34","publisher":"MDPI","title":"From the quantum approximate optimization algorithm to a quantum alternating operator ansatz","type":"article-journal","volume":"12"}}],"isEdited":false,"manualOverride":{"citeprocText":"(Hadfield et al. 2019)","isManuallyOverridden":false,"manualOverrideText":""},"mendeley":{"formattedCitation":"(Hadfield et al. 2019)","plainTextFormattedCitation":"(Hadfield et al. 2019)","previouslyFormattedCitation":"(Hadfield et al. 2019)"},"properties":{"noteIndex":0},"schema":"https://github.com/citation-style-language/schema/raw/master/csl-citation.json"}</w:instrText>
       </w:r>
       <w:r>
         <w:fldChar w:fldCharType="separate"/>
@@ -10002,7 +10192,7 @@
         <w:fldChar w:fldCharType="begin"/>
       </w:r>
       <w:r>
-        <w:instrText xml:space="preserve">ADDIN CSL_CITATION {"citationID":"MENDELEY_CITATION_157","citationItems":[{"id":"ITEM-157","isTemporary":false,"itemData":{"URL":"https://arxiv.org/abs/2508.21361","author":[{"family":"Innan","given":"Nouhaila"},{"family":"Kashif","given":"Muhammad"},{"family":"Marchisio","given":"Alberto"},{"family":"Gan","given":"Yung-Sze"},{"family":"Barbaresco","given":"Frederic"},{"family":"Shafique","given":"Muhammad"}],"id":"Innan2025","issued":{"date-parts":[[2025]]},"title":"QUAV: Quantum-assisted path planning and optimization for UAV navigation with obstacle avoidance","title-short":"QUAV","type":""},"suppress-author":false}],"isEdited":false,"manualOverride":{"citeprocText":"Innan et al. (2025)","isManuallyOverridden":false,"manualOverrideText":""},"mendeley":{"formattedCitation":"Innan et al. (2025)","plainTextFormattedCitation":"Innan et al. (2025)","previouslyFormattedCitation":"Innan et al. (2025)"},"properties":{"noteIndex":0},"schema":"https://github.com/citation-style-language/schema/raw/master/csl-citation.json"}</w:instrText>
+        <w:instrText xml:space="preserve">ADDIN CSL_CITATION {"citationID":"MENDELEY_CITATION_170","citationItems":[{"id":"ITEM-170","isTemporary":false,"itemData":{"URL":"https://arxiv.org/abs/2508.21361","author":[{"family":"Innan","given":"Nouhaila"},{"family":"Kashif","given":"Muhammad"},{"family":"Marchisio","given":"Alberto"},{"family":"Gan","given":"Yung-Sze"},{"family":"Barbaresco","given":"Frederic"},{"family":"Shafique","given":"Muhammad"}],"id":"Innan2025","issued":{"date-parts":[[2025]]},"title":"QUAV: Quantum-assisted path planning and optimization for UAV navigation with obstacle avoidance","title-short":"QUAV","type":""},"suppress-author":false}],"isEdited":false,"manualOverride":{"citeprocText":"Innan et al. (2025)","isManuallyOverridden":false,"manualOverrideText":""},"mendeley":{"formattedCitation":"Innan et al. (2025)","plainTextFormattedCitation":"Innan et al. (2025)","previouslyFormattedCitation":"Innan et al. (2025)"},"properties":{"noteIndex":0},"schema":"https://github.com/citation-style-language/schema/raw/master/csl-citation.json"}</w:instrText>
       </w:r>
       <w:r>
         <w:fldChar w:fldCharType="separate"/>
@@ -10026,7 +10216,7 @@
         <w:fldChar w:fldCharType="begin"/>
       </w:r>
       <w:r>
-        <w:instrText xml:space="preserve">ADDIN CSL_CITATION {"citationID":"MENDELEY_CITATION_158","citationItems":[{"id":"ITEM-158","isTemporary":false,"itemData":{"URL":"https://arxiv.org/abs/2501.18432","author":[{"family":"Osaba","given":"Eneko"},{"family":"Miranda-Rodriguez","given":"Pablo"},{"family":"Oikonomakis","given":"Andreas"},{"family":"Petrič","given":"Matic"},{"family":"Ruiz","given":"Alejandra"},{"family":"Bock","given":"Sebastian"},{"family":"Kourtis","given":"Michail-Alexandros"}],"container-title":"2025 IEEE congress on evolutionary computation (CEC)","id":"OsabaDrone2025","issued":{"date-parts":[[2025]]},"publisher":"IEEE","title":"Solving drone routing problems with quantum computing: A hybrid approach combining quantum annealing and gate-based paradigms","title-short":"Solving drone routing problems with quantum computing","type":"paper-conference"},"suppress-author":false}],"isEdited":false,"manualOverride":{"citeprocText":"Osaba, Miranda-Rodriguez, et al. (2025)","isManuallyOverridden":false,"manualOverrideText":""},"mendeley":{"formattedCitation":"Osaba, Miranda-Rodriguez, et al. (2025)","plainTextFormattedCitation":"Osaba, Miranda-Rodriguez, et al. (2025)","previouslyFormattedCitation":"Osaba, Miranda-Rodriguez, et al. (2025)"},"properties":{"noteIndex":0},"schema":"https://github.com/citation-style-language/schema/raw/master/csl-citation.json"}</w:instrText>
+        <w:instrText xml:space="preserve">ADDIN CSL_CITATION {"citationID":"MENDELEY_CITATION_171","citationItems":[{"id":"ITEM-171","isTemporary":false,"itemData":{"URL":"https://arxiv.org/abs/2501.18432","author":[{"family":"Osaba","given":"Eneko"},{"family":"Miranda-Rodriguez","given":"Pablo"},{"family":"Oikonomakis","given":"Andreas"},{"family":"Petrič","given":"Matic"},{"family":"Ruiz","given":"Alejandra"},{"family":"Bock","given":"Sebastian"},{"family":"Kourtis","given":"Michail-Alexandros"}],"container-title":"2025 IEEE congress on evolutionary computation (CEC)","id":"OsabaDrone2025","issued":{"date-parts":[[2025]]},"publisher":"IEEE","title":"Solving drone routing problems with quantum computing: A hybrid approach combining quantum annealing and gate-based paradigms","title-short":"Solving drone routing problems with quantum computing","type":"paper-conference"},"suppress-author":false}],"isEdited":false,"manualOverride":{"citeprocText":"Osaba, Miranda-Rodriguez, et al. (2025)","isManuallyOverridden":false,"manualOverrideText":""},"mendeley":{"formattedCitation":"Osaba, Miranda-Rodriguez, et al. (2025)","plainTextFormattedCitation":"Osaba, Miranda-Rodriguez, et al. (2025)","previouslyFormattedCitation":"Osaba, Miranda-Rodriguez, et al. (2025)"},"properties":{"noteIndex":0},"schema":"https://github.com/citation-style-language/schema/raw/master/csl-citation.json"}</w:instrText>
       </w:r>
       <w:r>
         <w:fldChar w:fldCharType="separate"/>
@@ -10050,7 +10240,7 @@
         <w:fldChar w:fldCharType="begin"/>
       </w:r>
       <w:r>
-        <w:instrText xml:space="preserve">ADDIN CSL_CITATION {"citationID":"MENDELEY_CITATION_159","citationItems":[{"id":"ITEM-159","isTemporary":false,"itemData":{"URL":"https://arxiv.org/abs/2606.14252","author":[{"family":"Bang","given":"Junyeop"},{"family":"Lee","given":"Byongho"},{"family":"An","given":"Dohyun"},{"family":"Kim","given":"Hwangnam"}],"id":"Bang2026","issued":{"date-parts":[[2026]]},"title":"Optimality-preserving decomposition for scalable QAOA in natural-language-guided multi-drone assignment","type":""},"suppress-author":false}],"isEdited":false,"manualOverride":{"citeprocText":"Bang et al. (2026)","isManuallyOverridden":false,"manualOverrideText":""},"mendeley":{"formattedCitation":"Bang et al. (2026)","plainTextFormattedCitation":"Bang et al. (2026)","previouslyFormattedCitation":"Bang et al. (2026)"},"properties":{"noteIndex":0},"schema":"https://github.com/citation-style-language/schema/raw/master/csl-citation.json"}</w:instrText>
+        <w:instrText xml:space="preserve">ADDIN CSL_CITATION {"citationID":"MENDELEY_CITATION_172","citationItems":[{"id":"ITEM-172","isTemporary":false,"itemData":{"URL":"https://arxiv.org/abs/2606.14252","author":[{"family":"Bang","given":"Junyeop"},{"family":"Lee","given":"Byongho"},{"family":"An","given":"Dohyun"},{"family":"Kim","given":"Hwangnam"}],"id":"Bang2026","issued":{"date-parts":[[2026]]},"title":"Optimality-preserving decomposition for scalable QAOA in natural-language-guided multi-drone assignment","type":""},"suppress-author":false}],"isEdited":false,"manualOverride":{"citeprocText":"Bang et al. (2026)","isManuallyOverridden":false,"manualOverrideText":""},"mendeley":{"formattedCitation":"Bang et al. (2026)","plainTextFormattedCitation":"Bang et al. (2026)","previouslyFormattedCitation":"Bang et al. (2026)"},"properties":{"noteIndex":0},"schema":"https://github.com/citation-style-language/schema/raw/master/csl-citation.json"}</w:instrText>
       </w:r>
       <w:r>
         <w:fldChar w:fldCharType="separate"/>
@@ -10095,7 +10285,7 @@
         <w:fldChar w:fldCharType="begin"/>
       </w:r>
       <w:r>
-        <w:instrText xml:space="preserve">ADDIN CSL_CITATION {"citationID":"MENDELEY_CITATION_160","citationItems":[{"id":"ITEM-160","isTemporary":false,"itemData":{"URL":"https://openaccess.thecvf.com/content/CVPR2026/html/Yu_HQC-NBV_A_Hybrid_Quantum-Classical_View_Planning_Approach_CVPR_2026_paper.html","author":[{"family":"Yu","given":"Xiaotong"},{"family":"Chen","given":"Chang Wen"}],"container-title":"Proceedings of the IEEE/CVF conference on computer vision and pattern recognition (CVPR)","id":"Yu2025","issued":{"date-parts":[[2026,6]]},"page":"35091-35100","title":"HQC-NBV: A hybrid quantum-classical view planning approach","title-short":"HQC-NBV","type":"paper-conference"},"suppress-author":false}],"isEdited":false,"manualOverride":{"citeprocText":"Yu and Chen (2026)","isManuallyOverridden":false,"manualOverrideText":""},"mendeley":{"formattedCitation":"Yu and Chen (2026)","plainTextFormattedCitation":"Yu and Chen (2026)","previouslyFormattedCitation":"Yu and Chen (2026)"},"properties":{"noteIndex":0},"schema":"https://github.com/citation-style-language/schema/raw/master/csl-citation.json"}</w:instrText>
+        <w:instrText xml:space="preserve">ADDIN CSL_CITATION {"citationID":"MENDELEY_CITATION_173","citationItems":[{"id":"ITEM-173","isTemporary":false,"itemData":{"URL":"https://openaccess.thecvf.com/content/CVPR2026/html/Yu_HQC-NBV_A_Hybrid_Quantum-Classical_View_Planning_Approach_CVPR_2026_paper.html","author":[{"family":"Yu","given":"Xiaotong"},{"family":"Chen","given":"Chang Wen"}],"container-title":"Proceedings of the IEEE/CVF conference on computer vision and pattern recognition (CVPR)","id":"Yu2025","issued":{"date-parts":[[2026,6]]},"page":"35091-35100","title":"HQC-NBV: A hybrid quantum-classical view planning approach","title-short":"HQC-NBV","type":"paper-conference"},"suppress-author":false}],"isEdited":false,"manualOverride":{"citeprocText":"Yu and Chen (2026)","isManuallyOverridden":false,"manualOverrideText":""},"mendeley":{"formattedCitation":"Yu and Chen (2026)","plainTextFormattedCitation":"Yu and Chen (2026)","previouslyFormattedCitation":"Yu and Chen (2026)"},"properties":{"noteIndex":0},"schema":"https://github.com/citation-style-language/schema/raw/master/csl-citation.json"}</w:instrText>
       </w:r>
       <w:r>
         <w:fldChar w:fldCharType="separate"/>
@@ -10119,7 +10309,7 @@
         <w:fldChar w:fldCharType="begin"/>
       </w:r>
       <w:r>
-        <w:instrText xml:space="preserve">ADDIN CSL_CITATION {"citationID":"MENDELEY_CITATION_161","citationItems":[{"id":"ITEM-161","isTemporary":false,"itemData":{"DOI":"10.1016/j.robot.2025.105026","author":[{"family":"Antero","given":"Unai"},{"family":"Sierra","given":"Basilio"},{"family":"Oñativia","given":"Jon"},{"family":"Ruiz","given":"Alejandra"},{"family":"Osaba","given":"Eneko"}],"container-title":"Robotics and Autonomous Systems","id":"Antero2025","issued":{"date-parts":[[2025]]},"page":"105026","publisher":"Elsevier","title":"Robot localization aided by quantum algorithms","type":"article-journal","volume":"192"},"suppress-author":false}],"isEdited":false,"manualOverride":{"citeprocText":"Antero et al. (2025)","isManuallyOverridden":false,"manualOverrideText":""},"mendeley":{"formattedCitation":"Antero et al. (2025)","plainTextFormattedCitation":"Antero et al. (2025)","previouslyFormattedCitation":"Antero et al. (2025)"},"properties":{"noteIndex":0},"schema":"https://github.com/citation-style-language/schema/raw/master/csl-citation.json"}</w:instrText>
+        <w:instrText xml:space="preserve">ADDIN CSL_CITATION {"citationID":"MENDELEY_CITATION_174","citationItems":[{"id":"ITEM-174","isTemporary":false,"itemData":{"DOI":"10.1016/j.robot.2025.105026","author":[{"family":"Antero","given":"Unai"},{"family":"Sierra","given":"Basilio"},{"family":"Oñativia","given":"Jon"},{"family":"Ruiz","given":"Alejandra"},{"family":"Osaba","given":"Eneko"}],"container-title":"Robotics and Autonomous Systems","id":"Antero2025","issued":{"date-parts":[[2025]]},"page":"105026","publisher":"Elsevier","title":"Robot localization aided by quantum algorithms","type":"article-journal","volume":"192"},"suppress-author":false}],"isEdited":false,"manualOverride":{"citeprocText":"Antero et al. (2025)","isManuallyOverridden":false,"manualOverrideText":""},"mendeley":{"formattedCitation":"Antero et al. (2025)","plainTextFormattedCitation":"Antero et al. (2025)","previouslyFormattedCitation":"Antero et al. (2025)"},"properties":{"noteIndex":0},"schema":"https://github.com/citation-style-language/schema/raw/master/csl-citation.json"}</w:instrText>
       </w:r>
       <w:r>
         <w:fldChar w:fldCharType="separate"/>
@@ -10228,7 +10418,7 @@
         <w:fldChar w:fldCharType="begin"/>
       </w:r>
       <w:r>
-        <w:instrText xml:space="preserve">ADDIN CSL_CITATION {"citationID":"MENDELEY_CITATION_163","citationItems":[{"id":"ITEM-162","isTemporary":false,"itemData":{"DOI":"10.3390/math10142475","author":[{"family":"Chella","given":"Antonio"},{"family":"Gaglio","given":"Salvatore"},{"family":"Pilato","given":"Giovanni"},{"family":"Vella","given":"Filippo"},{"family":"Zammuto","given":"Salvatore"}],"container-title":"Mathematics","id":"Chella2022","issue":"14","issued":{"date-parts":[[2022]]},"page":"2475","publisher":"MDPI","title":"A quantum planner for robot motion","type":"article-journal","volume":"10"}},{"id":"ITEM-163","isTemporary":false,"itemData":{"author":[{"family":"Nigatu","given":"Hassen"},{"family":"Shi","given":"Gaokun"},{"family":"Li","given":"Jituo"},{"family":"Wang","given":"Jin"},{"family":"Lu","given":"Guodong"},{"family":"Li","given":"Howard"}],"container-title":"IEEE Robotics and Automation Letters","id":"Nigatu2025","issued":{"date-parts":[[2025]]},"note":"Accepted October 2025; preprint arXiv:2509.07216","title":"Quantum machine learning and Grover’s algorithm for quantum optimization of robotic manipulators","type":"article-journal"}}],"isEdited":false,"manualOverride":{"citeprocText":"(Chella et al. 2022; Nigatu et al. 2025)","isManuallyOverridden":false,"manualOverrideText":""},"mendeley":{"formattedCitation":"(Chella et al. 2022; Nigatu et al. 2025)","plainTextFormattedCitation":"(Chella et al. 2022; Nigatu et al. 2025)","previouslyFormattedCitation":"(Chella et al. 2022; Nigatu et al. 2025)"},"properties":{"noteIndex":0},"schema":"https://github.com/citation-style-language/schema/raw/master/csl-citation.json"}</w:instrText>
+        <w:instrText xml:space="preserve">ADDIN CSL_CITATION {"citationID":"MENDELEY_CITATION_176","citationItems":[{"id":"ITEM-175","isTemporary":false,"itemData":{"DOI":"10.3390/math10142475","author":[{"family":"Chella","given":"Antonio"},{"family":"Gaglio","given":"Salvatore"},{"family":"Pilato","given":"Giovanni"},{"family":"Vella","given":"Filippo"},{"family":"Zammuto","given":"Salvatore"}],"container-title":"Mathematics","id":"Chella2022","issue":"14","issued":{"date-parts":[[2022]]},"page":"2475","publisher":"MDPI","title":"A quantum planner for robot motion","type":"article-journal","volume":"10"}},{"id":"ITEM-176","isTemporary":false,"itemData":{"author":[{"family":"Nigatu","given":"Hassen"},{"family":"Shi","given":"Gaokun"},{"family":"Li","given":"Jituo"},{"family":"Wang","given":"Jin"},{"family":"Lu","given":"Guodong"},{"family":"Li","given":"Howard"}],"container-title":"IEEE Robotics and Automation Letters","id":"Nigatu2025","issued":{"date-parts":[[2025]]},"note":"Accepted October 2025; preprint arXiv:2509.07216","title":"Quantum machine learning and Grover’s algorithm for quantum optimization of robotic manipulators","type":"article-journal"}}],"isEdited":false,"manualOverride":{"citeprocText":"(Chella et al. 2022; Nigatu et al. 2025)","isManuallyOverridden":false,"manualOverrideText":""},"mendeley":{"formattedCitation":"(Chella et al. 2022; Nigatu et al. 2025)","plainTextFormattedCitation":"(Chella et al. 2022; Nigatu et al. 2025)","previouslyFormattedCitation":"(Chella et al. 2022; Nigatu et al. 2025)"},"properties":{"noteIndex":0},"schema":"https://github.com/citation-style-language/schema/raw/master/csl-citation.json"}</w:instrText>
       </w:r>
       <w:r>
         <w:fldChar w:fldCharType="separate"/>
@@ -10246,7 +10436,7 @@
         <w:fldChar w:fldCharType="begin"/>
       </w:r>
       <w:r>
-        <w:instrText xml:space="preserve">ADDIN CSL_CITATION {"citationID":"MENDELEY_CITATION_164","citationItems":[{"id":"ITEM-164","isTemporary":false,"itemData":{"URL":"https://arxiv.org/abs/2508.21361","author":[{"family":"Innan","given":"Nouhaila"},{"family":"Kashif","given":"Muhammad"},{"family":"Marchisio","given":"Alberto"},{"family":"Gan","given":"Yung-Sze"},{"family":"Barbaresco","given":"Frederic"},{"family":"Shafique","given":"Muhammad"}],"id":"Innan2025","issued":{"date-parts":[[2025]]},"title":"QUAV: Quantum-assisted path planning and optimization for UAV navigation with obstacle avoidance","title-short":"QUAV","type":""}}],"isEdited":false,"manualOverride":{"citeprocText":"(Innan et al. 2025)","isManuallyOverridden":false,"manualOverrideText":""},"mendeley":{"formattedCitation":"(Innan et al. 2025)","plainTextFormattedCitation":"(Innan et al. 2025)","previouslyFormattedCitation":"(Innan et al. 2025)"},"properties":{"noteIndex":0},"schema":"https://github.com/citation-style-language/schema/raw/master/csl-citation.json"}</w:instrText>
+        <w:instrText xml:space="preserve">ADDIN CSL_CITATION {"citationID":"MENDELEY_CITATION_177","citationItems":[{"id":"ITEM-177","isTemporary":false,"itemData":{"URL":"https://arxiv.org/abs/2508.21361","author":[{"family":"Innan","given":"Nouhaila"},{"family":"Kashif","given":"Muhammad"},{"family":"Marchisio","given":"Alberto"},{"family":"Gan","given":"Yung-Sze"},{"family":"Barbaresco","given":"Frederic"},{"family":"Shafique","given":"Muhammad"}],"id":"Innan2025","issued":{"date-parts":[[2025]]},"title":"QUAV: Quantum-assisted path planning and optimization for UAV navigation with obstacle avoidance","title-short":"QUAV","type":""}}],"isEdited":false,"manualOverride":{"citeprocText":"(Innan et al. 2025)","isManuallyOverridden":false,"manualOverrideText":""},"mendeley":{"formattedCitation":"(Innan et al. 2025)","plainTextFormattedCitation":"(Innan et al. 2025)","previouslyFormattedCitation":"(Innan et al. 2025)"},"properties":{"noteIndex":0},"schema":"https://github.com/citation-style-language/schema/raw/master/csl-citation.json"}</w:instrText>
       </w:r>
       <w:r>
         <w:fldChar w:fldCharType="separate"/>
@@ -10267,7 +10457,7 @@
         <w:fldChar w:fldCharType="begin"/>
       </w:r>
       <w:r>
-        <w:instrText xml:space="preserve">ADDIN CSL_CITATION {"citationID":"MENDELEY_CITATION_165","citationItems":[{"id":"ITEM-165","isTemporary":false,"itemData":{"DOI":"10.1016/j.robot.2025.105026","author":[{"family":"Antero","given":"Unai"},{"family":"Sierra","given":"Basilio"},{"family":"Oñativia","given":"Jon"},{"family":"Ruiz","given":"Alejandra"},{"family":"Osaba","given":"Eneko"}],"container-title":"Robotics and Autonomous Systems","id":"Antero2025","issued":{"date-parts":[[2025]]},"page":"105026","publisher":"Elsevier","title":"Robot localization aided by quantum algorithms","type":"article-journal","volume":"192"}}],"isEdited":false,"manualOverride":{"citeprocText":"(Antero et al. 2025)","isManuallyOverridden":false,"manualOverrideText":""},"mendeley":{"formattedCitation":"(Antero et al. 2025)","plainTextFormattedCitation":"(Antero et al. 2025)","previouslyFormattedCitation":"(Antero et al. 2025)"},"properties":{"noteIndex":0},"schema":"https://github.com/citation-style-language/schema/raw/master/csl-citation.json"}</w:instrText>
+        <w:instrText xml:space="preserve">ADDIN CSL_CITATION {"citationID":"MENDELEY_CITATION_178","citationItems":[{"id":"ITEM-178","isTemporary":false,"itemData":{"DOI":"10.1016/j.robot.2025.105026","author":[{"family":"Antero","given":"Unai"},{"family":"Sierra","given":"Basilio"},{"family":"Oñativia","given":"Jon"},{"family":"Ruiz","given":"Alejandra"},{"family":"Osaba","given":"Eneko"}],"container-title":"Robotics and Autonomous Systems","id":"Antero2025","issued":{"date-parts":[[2025]]},"page":"105026","publisher":"Elsevier","title":"Robot localization aided by quantum algorithms","type":"article-journal","volume":"192"}}],"isEdited":false,"manualOverride":{"citeprocText":"(Antero et al. 2025)","isManuallyOverridden":false,"manualOverrideText":""},"mendeley":{"formattedCitation":"(Antero et al. 2025)","plainTextFormattedCitation":"(Antero et al. 2025)","previouslyFormattedCitation":"(Antero et al. 2025)"},"properties":{"noteIndex":0},"schema":"https://github.com/citation-style-language/schema/raw/master/csl-citation.json"}</w:instrText>
       </w:r>
       <w:r>
         <w:fldChar w:fldCharType="separate"/>
@@ -10288,7 +10478,7 @@
         <w:fldChar w:fldCharType="begin"/>
       </w:r>
       <w:r>
-        <w:instrText xml:space="preserve">ADDIN CSL_CITATION {"citationID":"MENDELEY_CITATION_166","citationItems":[{"id":"ITEM-166","isTemporary":false,"itemData":{"URL":"https://proceedings.mlr.press/v267/gerlach25a.html","author":[{"family":"Gerlach","given":"Thore"},{"family":"Lee","given":"Loong Kuan"},{"family":"Barbaresco","given":"Frederic"},{"family":"Piatkowski","given":"Nico"}],"collection-title":"Proceedings of machine learning research","container-title":"Proceedings of the 42nd international conference on machine learning","editor":[{"family":"Singh","given":"Aarti"},{"family":"Fazel","given":"Maryam"},{"family":"Hsu","given":"Daniel"},{"family":"Lacoste-Julien","given":"Simon"},{"family":"Berkenkamp","given":"Felix"},{"family":"Maharaj","given":"Tegan"},{"family":"Wagstaff","given":"Kiri"},{"family":"Zhu","given":"Jerry"}],"id":"Gerlach2025","issued":{"date-parts":[[2025]]},"page":"19161-19171","publisher":"PMLR","title":"Hybrid quantum-classical multi-agent pathfinding","type":"paper-conference","volume":"267"}}],"isEdited":false,"manualOverride":{"citeprocText":"(Gerlach et al. 2025)","isManuallyOverridden":false,"manualOverrideText":""},"mendeley":{"formattedCitation":"(Gerlach et al. 2025)","plainTextFormattedCitation":"(Gerlach et al. 2025)","previouslyFormattedCitation":"(Gerlach et al. 2025)"},"properties":{"noteIndex":0},"schema":"https://github.com/citation-style-language/schema/raw/master/csl-citation.json"}</w:instrText>
+        <w:instrText xml:space="preserve">ADDIN CSL_CITATION {"citationID":"MENDELEY_CITATION_179","citationItems":[{"id":"ITEM-179","isTemporary":false,"itemData":{"URL":"https://proceedings.mlr.press/v267/gerlach25a.html","author":[{"family":"Gerlach","given":"Thore"},{"family":"Lee","given":"Loong Kuan"},{"family":"Barbaresco","given":"Frederic"},{"family":"Piatkowski","given":"Nico"}],"collection-title":"Proceedings of machine learning research","container-title":"Proceedings of the 42nd international conference on machine learning","editor":[{"family":"Singh","given":"Aarti"},{"family":"Fazel","given":"Maryam"},{"family":"Hsu","given":"Daniel"},{"family":"Lacoste-Julien","given":"Simon"},{"family":"Berkenkamp","given":"Felix"},{"family":"Maharaj","given":"Tegan"},{"family":"Wagstaff","given":"Kiri"},{"family":"Zhu","given":"Jerry"}],"id":"Gerlach2025","issued":{"date-parts":[[2025]]},"page":"19161-19171","publisher":"PMLR","title":"Hybrid quantum-classical multi-agent pathfinding","type":"paper-conference","volume":"267"}}],"isEdited":false,"manualOverride":{"citeprocText":"(Gerlach et al. 2025)","isManuallyOverridden":false,"manualOverrideText":""},"mendeley":{"formattedCitation":"(Gerlach et al. 2025)","plainTextFormattedCitation":"(Gerlach et al. 2025)","previouslyFormattedCitation":"(Gerlach et al. 2025)"},"properties":{"noteIndex":0},"schema":"https://github.com/citation-style-language/schema/raw/master/csl-citation.json"}</w:instrText>
       </w:r>
       <w:r>
         <w:fldChar w:fldCharType="separate"/>
@@ -10306,7 +10496,7 @@
         <w:fldChar w:fldCharType="begin"/>
       </w:r>
       <w:r>
-        <w:instrText xml:space="preserve">ADDIN CSL_CITATION {"citationID":"MENDELEY_CITATION_167","citationItems":[{"id":"ITEM-167","isTemporary":false,"itemData":{"DOI":"10.1177/0278364911406761","author":[{"family":"Karaman","given":"Sertac"},{"family":"Frazzoli","given":"Emilio"}],"container-title":"The International Journal of Robotics Research","id":"Karaman2011","issue":"7","issued":{"date-parts":[[2011]]},"page":"846-894","publisher":"SAGE Publications","title":"Sampling-based algorithms for optimal motion planning","type":"article-journal","volume":"30"}}],"isEdited":false,"manualOverride":{"citeprocText":"(Karaman and Frazzoli 2011)","isManuallyOverridden":false,"manualOverrideText":""},"mendeley":{"formattedCitation":"(Karaman and Frazzoli 2011)","plainTextFormattedCitation":"(Karaman and Frazzoli 2011)","previouslyFormattedCitation":"(Karaman and Frazzoli 2011)"},"properties":{"noteIndex":0},"schema":"https://github.com/citation-style-language/schema/raw/master/csl-citation.json"}</w:instrText>
+        <w:instrText xml:space="preserve">ADDIN CSL_CITATION {"citationID":"MENDELEY_CITATION_180","citationItems":[{"id":"ITEM-180","isTemporary":false,"itemData":{"DOI":"10.1177/0278364911406761","author":[{"family":"Karaman","given":"Sertac"},{"family":"Frazzoli","given":"Emilio"}],"container-title":"The International Journal of Robotics Research","id":"Karaman2011","issue":"7","issued":{"date-parts":[[2011]]},"page":"846-894","publisher":"SAGE Publications","title":"Sampling-based algorithms for optimal motion planning","type":"article-journal","volume":"30"}}],"isEdited":false,"manualOverride":{"citeprocText":"(Karaman and Frazzoli 2011)","isManuallyOverridden":false,"manualOverrideText":""},"mendeley":{"formattedCitation":"(Karaman and Frazzoli 2011)","plainTextFormattedCitation":"(Karaman and Frazzoli 2011)","previouslyFormattedCitation":"(Karaman and Frazzoli 2011)"},"properties":{"noteIndex":0},"schema":"https://github.com/citation-style-language/schema/raw/master/csl-citation.json"}</w:instrText>
       </w:r>
       <w:r>
         <w:fldChar w:fldCharType="separate"/>
@@ -10324,7 +10514,7 @@
         <w:fldChar w:fldCharType="begin"/>
       </w:r>
       <w:r>
-        <w:instrText xml:space="preserve">ADDIN CSL_CITATION {"citationID":"MENDELEY_CITATION_168","citationItems":[{"id":"ITEM-168","isTemporary":false,"itemData":{"DOI":"10.1109/ROBOT.1999.772544","author":[{"family":"Dellaert","given":"Frank"},{"family":"Fox","given":"Dieter"},{"family":"Burgard","given":"Wolfram"},{"family":"Thrun","given":"Sebastian"}],"container-title":"Proceedings of the 1999 IEEE international conference on robotics and automation (ICRA)","id":"Dellaert1999","issued":{"date-parts":[[1999]]},"page":"1322-1328","publisher":"IEEE","title":"Monte Carlo localization for mobile robots","type":"paper-conference","volume":"2"}}],"isEdited":false,"manualOverride":{"citeprocText":"(Dellaert et al. 1999)","isManuallyOverridden":false,"manualOverrideText":""},"mendeley":{"formattedCitation":"(Dellaert et al. 1999)","plainTextFormattedCitation":"(Dellaert et al. 1999)","previouslyFormattedCitation":"(Dellaert et al. 1999)"},"properties":{"noteIndex":0},"schema":"https://github.com/citation-style-language/schema/raw/master/csl-citation.json"}</w:instrText>
+        <w:instrText xml:space="preserve">ADDIN CSL_CITATION {"citationID":"MENDELEY_CITATION_181","citationItems":[{"id":"ITEM-181","isTemporary":false,"itemData":{"DOI":"10.1109/ROBOT.1999.772544","author":[{"family":"Dellaert","given":"Frank"},{"family":"Fox","given":"Dieter"},{"family":"Burgard","given":"Wolfram"},{"family":"Thrun","given":"Sebastian"}],"container-title":"Proceedings of the 1999 IEEE international conference on robotics and automation (ICRA)","id":"Dellaert1999","issued":{"date-parts":[[1999]]},"page":"1322-1328","publisher":"IEEE","title":"Monte Carlo localization for mobile robots","type":"paper-conference","volume":"2"}}],"isEdited":false,"manualOverride":{"citeprocText":"(Dellaert et al. 1999)","isManuallyOverridden":false,"manualOverrideText":""},"mendeley":{"formattedCitation":"(Dellaert et al. 1999)","plainTextFormattedCitation":"(Dellaert et al. 1999)","previouslyFormattedCitation":"(Dellaert et al. 1999)"},"properties":{"noteIndex":0},"schema":"https://github.com/citation-style-language/schema/raw/master/csl-citation.json"}</w:instrText>
       </w:r>
       <w:r>
         <w:fldChar w:fldCharType="separate"/>
@@ -10350,7 +10540,7 @@
         <w:fldChar w:fldCharType="begin"/>
       </w:r>
       <w:r>
-        <w:instrText xml:space="preserve">ADDIN CSL_CITATION {"citationID":"MENDELEY_CITATION_169","citationItems":[{"id":"ITEM-169","isTemporary":false,"itemData":{"DOI":"10.1103/PhysRevA.86.032324","author":[{"family":"Fowler","given":"Austin G."},{"family":"Mariantoni","given":"Matteo"},{"family":"Martinis","given":"John M."},{"family":"Cleland","given":"Andrew N."}],"container-title":"Physical Review A","id":"Fowler2012","issue":"3","issued":{"date-parts":[[2012]]},"page":"032324","publisher":"American Physical Society","title":"Surface codes: Towards practical large-scale quantum computation","title-short":"Surface codes","type":"article-journal","volume":"86"}}],"isEdited":false,"manualOverride":{"citeprocText":"(Fowler et al. 2012)","isManuallyOverridden":false,"manualOverrideText":""},"mendeley":{"formattedCitation":"(Fowler et al. 2012)","plainTextFormattedCitation":"(Fowler et al. 2012)","previouslyFormattedCitation":"(Fowler et al. 2012)"},"properties":{"noteIndex":0},"schema":"https://github.com/citation-style-language/schema/raw/master/csl-citation.json"}</w:instrText>
+        <w:instrText xml:space="preserve">ADDIN CSL_CITATION {"citationID":"MENDELEY_CITATION_182","citationItems":[{"id":"ITEM-182","isTemporary":false,"itemData":{"DOI":"10.1103/PhysRevA.86.032324","author":[{"family":"Fowler","given":"Austin G."},{"family":"Mariantoni","given":"Matteo"},{"family":"Martinis","given":"John M."},{"family":"Cleland","given":"Andrew N."}],"container-title":"Physical Review A","id":"Fowler2012","issue":"3","issued":{"date-parts":[[2012]]},"page":"032324","publisher":"American Physical Society","title":"Surface codes: Towards practical large-scale quantum computation","title-short":"Surface codes","type":"article-journal","volume":"86"}}],"isEdited":false,"manualOverride":{"citeprocText":"(Fowler et al. 2012)","isManuallyOverridden":false,"manualOverrideText":""},"mendeley":{"formattedCitation":"(Fowler et al. 2012)","plainTextFormattedCitation":"(Fowler et al. 2012)","previouslyFormattedCitation":"(Fowler et al. 2012)"},"properties":{"noteIndex":0},"schema":"https://github.com/citation-style-language/schema/raw/master/csl-citation.json"}</w:instrText>
       </w:r>
       <w:r>
         <w:fldChar w:fldCharType="separate"/>
@@ -10415,7 +10605,7 @@
         <w:fldChar w:fldCharType="begin"/>
       </w:r>
       <w:r>
-        <w:instrText xml:space="preserve">ADDIN CSL_CITATION {"citationID":"MENDELEY_CITATION_172","citationItems":[{"id":"ITEM-170","isTemporary":false,"itemData":{"DOI":"10.1038/nature23474","author":[{"family":"Biamonte","given":"Jacob"},{"family":"Wittek","given":"Peter"},{"family":"Pancotti","given":"Nicola"},{"family":"Rebentrost","given":"Patrick"},{"family":"Wiebe","given":"Nathan"},{"family":"Lloyd","given":"Seth"}],"container-title":"Nature","id":"Biamonte2017","issue":"7671","issued":{"date-parts":[[2017]]},"page":"195-202","publisher":"Nature Publishing Group","title":"Quantum machine learning","type":"article-journal","volume":"549"}},{"id":"ITEM-171","isTemporary":false,"itemData":{"DOI":"10.1007/978-3-030-83098-4","author":[{"family":"Schuld","given":"Maria"},{"family":"Petruccione","given":"Francesco"}],"collection-title":"Quantum science and technology","edition":"2nd","id":"Schuld2021","issued":{"date-parts":[[2021]]},"publisher":"Springer","publisher-place":"Cham, Switzerland","title":"Machine learning with quantum computers","type":"book"}},{"id":"ITEM-172","isTemporary":false,"itemData":{"DOI":"10.48550/arXiv.2401.11351","URL":"https://arxiv.org/abs/2401.11351","author":[{"family":"Wang","given":"Yunfei"},{"family":"Liu","given":"Junyu"}],"id":"Wang2024","issued":{"date-parts":[[2024]]},"title":"A comprehensive review of quantum machine learning: From NISQ to fault tolerance","title-short":"A comprehensive review of quantum machine learning","type":""}}],"isEdited":false,"manualOverride":{"citeprocText":"(Biamonte et al. 2017; Schuld and Petruccione 2021; Y. Wang and Liu 2024)","isManuallyOverridden":false,"manualOverrideText":""},"mendeley":{"formattedCitation":"(Biamonte et al. 2017; Schuld and Petruccione 2021; Y. Wang and Liu 2024)","plainTextFormattedCitation":"(Biamonte et al. 2017; Schuld and Petruccione 2021; Y. Wang and Liu 2024)","previouslyFormattedCitation":"(Biamonte et al. 2017; Schuld and Petruccione 2021; Y. Wang and Liu 2024)"},"properties":{"noteIndex":0},"schema":"https://github.com/citation-style-language/schema/raw/master/csl-citation.json"}</w:instrText>
+        <w:instrText xml:space="preserve">ADDIN CSL_CITATION {"citationID":"MENDELEY_CITATION_185","citationItems":[{"id":"ITEM-183","isTemporary":false,"itemData":{"DOI":"10.1038/nature23474","author":[{"family":"Biamonte","given":"Jacob"},{"family":"Wittek","given":"Peter"},{"family":"Pancotti","given":"Nicola"},{"family":"Rebentrost","given":"Patrick"},{"family":"Wiebe","given":"Nathan"},{"family":"Lloyd","given":"Seth"}],"container-title":"Nature","id":"Biamonte2017","issue":"7671","issued":{"date-parts":[[2017]]},"page":"195-202","publisher":"Nature Publishing Group","title":"Quantum machine learning","type":"article-journal","volume":"549"}},{"id":"ITEM-184","isTemporary":false,"itemData":{"DOI":"10.1007/978-3-030-83098-4","author":[{"family":"Schuld","given":"Maria"},{"family":"Petruccione","given":"Francesco"}],"collection-title":"Quantum science and technology","edition":"2nd","id":"Schuld2021","issued":{"date-parts":[[2021]]},"publisher":"Springer","publisher-place":"Cham, Switzerland","title":"Machine learning with quantum computers","type":"book"}},{"id":"ITEM-185","isTemporary":false,"itemData":{"DOI":"10.48550/arXiv.2401.11351","URL":"https://arxiv.org/abs/2401.11351","author":[{"family":"Wang","given":"Yunfei"},{"family":"Liu","given":"Junyu"}],"id":"Wang2024","issued":{"date-parts":[[2024]]},"title":"A comprehensive review of quantum machine learning: From NISQ to fault tolerance","title-short":"A comprehensive review of quantum machine learning","type":""}}],"isEdited":false,"manualOverride":{"citeprocText":"(Biamonte et al. 2017; Schuld and Petruccione 2021; Y. Wang and Liu 2024)","isManuallyOverridden":false,"manualOverrideText":""},"mendeley":{"formattedCitation":"(Biamonte et al. 2017; Schuld and Petruccione 2021; Y. Wang and Liu 2024)","plainTextFormattedCitation":"(Biamonte et al. 2017; Schuld and Petruccione 2021; Y. Wang and Liu 2024)","previouslyFormattedCitation":"(Biamonte et al. 2017; Schuld and Petruccione 2021; Y. Wang and Liu 2024)"},"properties":{"noteIndex":0},"schema":"https://github.com/citation-style-language/schema/raw/master/csl-citation.json"}</w:instrText>
       </w:r>
       <w:r>
         <w:fldChar w:fldCharType="separate"/>
@@ -10433,7 +10623,7 @@
         <w:fldChar w:fldCharType="begin"/>
       </w:r>
       <w:r>
-        <w:instrText xml:space="preserve">ADDIN CSL_CITATION {"citationID":"MENDELEY_CITATION_173","citationItems":[{"id":"ITEM-173","isTemporary":false,"itemData":{"URL":"https://arxiv.org/abs/1307.0411","author":[{"family":"Lloyd","given":"Seth"},{"family":"Mohseni","given":"Masoud"},{"family":"Rebentrost","given":"Patrick"}],"id":"Lloyd2014","issued":{"date-parts":[[2013]]},"title":"Quantum algorithms for supervised and unsupervised machine learning","type":""}}],"isEdited":false,"manualOverride":{"citeprocText":"(Lloyd, Mohseni, and Rebentrost 2013)","isManuallyOverridden":false,"manualOverrideText":""},"mendeley":{"formattedCitation":"(Lloyd, Mohseni, and Rebentrost 2013)","plainTextFormattedCitation":"(Lloyd, Mohseni, and Rebentrost 2013)","previouslyFormattedCitation":"(Lloyd, Mohseni, and Rebentrost 2013)"},"properties":{"noteIndex":0},"schema":"https://github.com/citation-style-language/schema/raw/master/csl-citation.json"}</w:instrText>
+        <w:instrText xml:space="preserve">ADDIN CSL_CITATION {"citationID":"MENDELEY_CITATION_186","citationItems":[{"id":"ITEM-186","isTemporary":false,"itemData":{"URL":"https://arxiv.org/abs/1307.0411","author":[{"family":"Lloyd","given":"Seth"},{"family":"Mohseni","given":"Masoud"},{"family":"Rebentrost","given":"Patrick"}],"id":"Lloyd2014","issued":{"date-parts":[[2013]]},"title":"Quantum algorithms for supervised and unsupervised machine learning","type":""}}],"isEdited":false,"manualOverride":{"citeprocText":"(Lloyd, Mohseni, and Rebentrost 2013)","isManuallyOverridden":false,"manualOverrideText":""},"mendeley":{"formattedCitation":"(Lloyd, Mohseni, and Rebentrost 2013)","plainTextFormattedCitation":"(Lloyd, Mohseni, and Rebentrost 2013)","previouslyFormattedCitation":"(Lloyd, Mohseni, and Rebentrost 2013)"},"properties":{"noteIndex":0},"schema":"https://github.com/citation-style-language/schema/raw/master/csl-citation.json"}</w:instrText>
       </w:r>
       <w:r>
         <w:fldChar w:fldCharType="separate"/>
@@ -10454,7 +10644,7 @@
         <w:fldChar w:fldCharType="begin"/>
       </w:r>
       <w:r>
-        <w:instrText xml:space="preserve">ADDIN CSL_CITATION {"citationID":"MENDELEY_CITATION_174","citationItems":[{"id":"ITEM-174","isTemporary":false,"itemData":{"DOI":"10.1103/PhysRevLett.113.130503","author":[{"family":"Rebentrost","given":"Patrick"},{"family":"Mohseni","given":"Masoud"},{"family":"Lloyd","given":"Seth"}],"container-title":"Physical Review Letters","id":"Rebentrost2014","issue":"13","issued":{"date-parts":[[2014]]},"page":"130503","title":"Quantum support vector machine for big data classification","type":"article-journal","volume":"113"}}],"isEdited":false,"manualOverride":{"citeprocText":"(Rebentrost, Mohseni, and Lloyd 2014)","isManuallyOverridden":false,"manualOverrideText":""},"mendeley":{"formattedCitation":"(Rebentrost, Mohseni, and Lloyd 2014)","plainTextFormattedCitation":"(Rebentrost, Mohseni, and Lloyd 2014)","previouslyFormattedCitation":"(Rebentrost, Mohseni, and Lloyd 2014)"},"properties":{"noteIndex":0},"schema":"https://github.com/citation-style-language/schema/raw/master/csl-citation.json"}</w:instrText>
+        <w:instrText xml:space="preserve">ADDIN CSL_CITATION {"citationID":"MENDELEY_CITATION_187","citationItems":[{"id":"ITEM-187","isTemporary":false,"itemData":{"DOI":"10.1103/PhysRevLett.113.130503","author":[{"family":"Rebentrost","given":"Patrick"},{"family":"Mohseni","given":"Masoud"},{"family":"Lloyd","given":"Seth"}],"container-title":"Physical Review Letters","id":"Rebentrost2014","issue":"13","issued":{"date-parts":[[2014]]},"page":"130503","title":"Quantum support vector machine for big data classification","type":"article-journal","volume":"113"}}],"isEdited":false,"manualOverride":{"citeprocText":"(Rebentrost, Mohseni, and Lloyd 2014)","isManuallyOverridden":false,"manualOverrideText":""},"mendeley":{"formattedCitation":"(Rebentrost, Mohseni, and Lloyd 2014)","plainTextFormattedCitation":"(Rebentrost, Mohseni, and Lloyd 2014)","previouslyFormattedCitation":"(Rebentrost, Mohseni, and Lloyd 2014)"},"properties":{"noteIndex":0},"schema":"https://github.com/citation-style-language/schema/raw/master/csl-citation.json"}</w:instrText>
       </w:r>
       <w:r>
         <w:fldChar w:fldCharType="separate"/>
@@ -10475,7 +10665,7 @@
         <w:fldChar w:fldCharType="begin"/>
       </w:r>
       <w:r>
-        <w:instrText xml:space="preserve">ADDIN CSL_CITATION {"citationID":"MENDELEY_CITATION_175","citationItems":[{"id":"ITEM-175","isTemporary":false,"itemData":{"DOI":"10.1103/PhysRevA.98.032309","author":[{"family":"Mitarai","given":"Kosuke"},{"family":"Negoro","given":"Makoto"},{"family":"Kitagawa","given":"Masahiro"},{"family":"Fujii","given":"Keisuke"}],"container-title":"Physical Review A","id":"Mitarai2018","issue":"3","issued":{"date-parts":[[2018]]},"page":"032309","publisher":"American Physical Society","title":"Quantum circuit learning","type":"article-journal","volume":"98"}}],"isEdited":false,"manualOverride":{"citeprocText":"(Mitarai et al. 2018)","isManuallyOverridden":false,"manualOverrideText":""},"mendeley":{"formattedCitation":"(Mitarai et al. 2018)","plainTextFormattedCitation":"(Mitarai et al. 2018)","previouslyFormattedCitation":"(Mitarai et al. 2018)"},"properties":{"noteIndex":0},"schema":"https://github.com/citation-style-language/schema/raw/master/csl-citation.json"}</w:instrText>
+        <w:instrText xml:space="preserve">ADDIN CSL_CITATION {"citationID":"MENDELEY_CITATION_188","citationItems":[{"id":"ITEM-188","isTemporary":false,"itemData":{"DOI":"10.1103/PhysRevA.98.032309","author":[{"family":"Mitarai","given":"Kosuke"},{"family":"Negoro","given":"Makoto"},{"family":"Kitagawa","given":"Masahiro"},{"family":"Fujii","given":"Keisuke"}],"container-title":"Physical Review A","id":"Mitarai2018","issue":"3","issued":{"date-parts":[[2018]]},"page":"032309","publisher":"American Physical Society","title":"Quantum circuit learning","type":"article-journal","volume":"98"}}],"isEdited":false,"manualOverride":{"citeprocText":"(Mitarai et al. 2018)","isManuallyOverridden":false,"manualOverrideText":""},"mendeley":{"formattedCitation":"(Mitarai et al. 2018)","plainTextFormattedCitation":"(Mitarai et al. 2018)","previouslyFormattedCitation":"(Mitarai et al. 2018)"},"properties":{"noteIndex":0},"schema":"https://github.com/citation-style-language/schema/raw/master/csl-citation.json"}</w:instrText>
       </w:r>
       <w:r>
         <w:fldChar w:fldCharType="separate"/>
@@ -10496,7 +10686,7 @@
         <w:fldChar w:fldCharType="begin"/>
       </w:r>
       <w:r>
-        <w:instrText xml:space="preserve">ADDIN CSL_CITATION {"citationID":"MENDELEY_CITATION_176","citationItems":[{"id":"ITEM-176","isTemporary":false,"itemData":{"URL":"https://arxiv.org/abs/1802.06002","author":[{"family":"Farhi","given":"Edward"},{"family":"Neven","given":"Hartmut"}],"id":"Farhi2018","issued":{"date-parts":[[2018]]},"title":"Classification with quantum neural networks on near term processors","type":""}}],"isEdited":false,"manualOverride":{"citeprocText":"(Farhi and Neven 2018)","isManuallyOverridden":false,"manualOverrideText":""},"mendeley":{"formattedCitation":"(Farhi and Neven 2018)","plainTextFormattedCitation":"(Farhi and Neven 2018)","previouslyFormattedCitation":"(Farhi and Neven 2018)"},"properties":{"noteIndex":0},"schema":"https://github.com/citation-style-language/schema/raw/master/csl-citation.json"}</w:instrText>
+        <w:instrText xml:space="preserve">ADDIN CSL_CITATION {"citationID":"MENDELEY_CITATION_189","citationItems":[{"id":"ITEM-189","isTemporary":false,"itemData":{"URL":"https://arxiv.org/abs/1802.06002","author":[{"family":"Farhi","given":"Edward"},{"family":"Neven","given":"Hartmut"}],"id":"Farhi2018","issued":{"date-parts":[[2018]]},"title":"Classification with quantum neural networks on near term processors","type":""}}],"isEdited":false,"manualOverride":{"citeprocText":"(Farhi and Neven 2018)","isManuallyOverridden":false,"manualOverrideText":""},"mendeley":{"formattedCitation":"(Farhi and Neven 2018)","plainTextFormattedCitation":"(Farhi and Neven 2018)","previouslyFormattedCitation":"(Farhi and Neven 2018)"},"properties":{"noteIndex":0},"schema":"https://github.com/citation-style-language/schema/raw/master/csl-citation.json"}</w:instrText>
       </w:r>
       <w:r>
         <w:fldChar w:fldCharType="separate"/>
@@ -10517,7 +10707,7 @@
         <w:fldChar w:fldCharType="begin"/>
       </w:r>
       <w:r>
-        <w:instrText xml:space="preserve">ADDIN CSL_CITATION {"citationID":"MENDELEY_CITATION_177","citationItems":[{"id":"ITEM-177","isTemporary":false,"itemData":{"DOI":"10.1103/PhysRevLett.122.040504","author":[{"family":"Schuld","given":"Maria"},{"family":"Killoran","given":"Nathan"}],"container-title":"Physical Review Letters","id":"Schuld2019","issue":"4","issued":{"date-parts":[[2019]]},"page":"040504","publisher":"American Physical Society","title":"Quantum machine learning in feature Hilbert spaces","type":"article-journal","volume":"122"}}],"isEdited":false,"manualOverride":{"citeprocText":"(Schuld and Killoran 2019)","isManuallyOverridden":false,"manualOverrideText":""},"mendeley":{"formattedCitation":"(Schuld and Killoran 2019)","plainTextFormattedCitation":"(Schuld and Killoran 2019)","previouslyFormattedCitation":"(Schuld and Killoran 2019)"},"properties":{"noteIndex":0},"schema":"https://github.com/citation-style-language/schema/raw/master/csl-citation.json"}</w:instrText>
+        <w:instrText xml:space="preserve">ADDIN CSL_CITATION {"citationID":"MENDELEY_CITATION_190","citationItems":[{"id":"ITEM-190","isTemporary":false,"itemData":{"DOI":"10.1103/PhysRevLett.122.040504","author":[{"family":"Schuld","given":"Maria"},{"family":"Killoran","given":"Nathan"}],"container-title":"Physical Review Letters","id":"Schuld2019","issue":"4","issued":{"date-parts":[[2019]]},"page":"040504","publisher":"American Physical Society","title":"Quantum machine learning in feature Hilbert spaces","type":"article-journal","volume":"122"}}],"isEdited":false,"manualOverride":{"citeprocText":"(Schuld and Killoran 2019)","isManuallyOverridden":false,"manualOverrideText":""},"mendeley":{"formattedCitation":"(Schuld and Killoran 2019)","plainTextFormattedCitation":"(Schuld and Killoran 2019)","previouslyFormattedCitation":"(Schuld and Killoran 2019)"},"properties":{"noteIndex":0},"schema":"https://github.com/citation-style-language/schema/raw/master/csl-citation.json"}</w:instrText>
       </w:r>
       <w:r>
         <w:fldChar w:fldCharType="separate"/>
@@ -10541,7 +10731,7 @@
         <w:fldChar w:fldCharType="begin"/>
       </w:r>
       <w:r>
-        <w:instrText xml:space="preserve">ADDIN CSL_CITATION {"citationID":"MENDELEY_CITATION_178","citationItems":[{"id":"ITEM-178","isTemporary":false,"itemData":{"DOI":"10.1038/s41586-019-0980-2","author":[{"family":"Havlíček","given":"Vojtěch"},{"family":"Córcoles","given":"Antonio D."},{"family":"Temme","given":"Kristan"},{"family":"Harrow","given":"Aram W."},{"family":"Kandala","given":"Abhinav"},{"family":"Chow","given":"Jerry M."},{"family":"Gambetta","given":"Jay M."}],"container-title":"Nature","id":"Havlicek2019","issue":"7747","issued":{"date-parts":[[2019]]},"page":"209-212","publisher":"Nature Publishing Group","title":"Supervised learning with quantum-enhanced feature spaces","type":"article-journal","volume":"567"},"suppress-author":false}],"isEdited":false,"manualOverride":{"citeprocText":"Havlíček et al. (2019)","isManuallyOverridden":false,"manualOverrideText":""},"mendeley":{"formattedCitation":"Havlíček et al. (2019)","plainTextFormattedCitation":"Havlíček et al. (2019)","previouslyFormattedCitation":"Havlíček et al. (2019)"},"properties":{"noteIndex":0},"schema":"https://github.com/citation-style-language/schema/raw/master/csl-citation.json"}</w:instrText>
+        <w:instrText xml:space="preserve">ADDIN CSL_CITATION {"citationID":"MENDELEY_CITATION_191","citationItems":[{"id":"ITEM-191","isTemporary":false,"itemData":{"DOI":"10.1038/s41586-019-0980-2","author":[{"family":"Havlíček","given":"Vojtěch"},{"family":"Córcoles","given":"Antonio D."},{"family":"Temme","given":"Kristan"},{"family":"Harrow","given":"Aram W."},{"family":"Kandala","given":"Abhinav"},{"family":"Chow","given":"Jerry M."},{"family":"Gambetta","given":"Jay M."}],"container-title":"Nature","id":"Havlicek2019","issue":"7747","issued":{"date-parts":[[2019]]},"page":"209-212","publisher":"Nature Publishing Group","title":"Supervised learning with quantum-enhanced feature spaces","type":"article-journal","volume":"567"},"suppress-author":false}],"isEdited":false,"manualOverride":{"citeprocText":"Havlíček et al. (2019)","isManuallyOverridden":false,"manualOverrideText":""},"mendeley":{"formattedCitation":"Havlíček et al. (2019)","plainTextFormattedCitation":"Havlíček et al. (2019)","previouslyFormattedCitation":"Havlíček et al. (2019)"},"properties":{"noteIndex":0},"schema":"https://github.com/citation-style-language/schema/raw/master/csl-citation.json"}</w:instrText>
       </w:r>
       <w:r>
         <w:fldChar w:fldCharType="separate"/>
@@ -10562,7 +10752,7 @@
         <w:fldChar w:fldCharType="begin"/>
       </w:r>
       <w:r>
-        <w:instrText xml:space="preserve">ADDIN CSL_CITATION {"citationID":"MENDELEY_CITATION_179","citationItems":[{"id":"ITEM-179","isTemporary":false,"itemData":{"DOI":"10.1007/s42484-020-00012-y","author":[{"family":"Henderson","given":"Maxwell"},{"family":"Shakya","given":"Samriddhi"},{"family":"Pradhan","given":"Shashindra"},{"family":"Cook","given":"Tristan"}],"container-title":"Quantum Machine Intelligence","id":"Henderson2020","issue":"1","issued":{"date-parts":[[2020]]},"page":"2","publisher":"Springer","title":"Quanvolutional neural networks: Powering image recognition with quantum circuits","title-short":"Quanvolutional neural networks","type":"article-journal","volume":"2"}}],"isEdited":false,"manualOverride":{"citeprocText":"(Henderson et al. 2020)","isManuallyOverridden":false,"manualOverrideText":""},"mendeley":{"formattedCitation":"(Henderson et al. 2020)","plainTextFormattedCitation":"(Henderson et al. 2020)","previouslyFormattedCitation":"(Henderson et al. 2020)"},"properties":{"noteIndex":0},"schema":"https://github.com/citation-style-language/schema/raw/master/csl-citation.json"}</w:instrText>
+        <w:instrText xml:space="preserve">ADDIN CSL_CITATION {"citationID":"MENDELEY_CITATION_192","citationItems":[{"id":"ITEM-192","isTemporary":false,"itemData":{"DOI":"10.1007/s42484-020-00012-y","author":[{"family":"Henderson","given":"Maxwell"},{"family":"Shakya","given":"Samriddhi"},{"family":"Pradhan","given":"Shashindra"},{"family":"Cook","given":"Tristan"}],"container-title":"Quantum Machine Intelligence","id":"Henderson2020","issue":"1","issued":{"date-parts":[[2020]]},"page":"2","publisher":"Springer","title":"Quanvolutional neural networks: Powering image recognition with quantum circuits","title-short":"Quanvolutional neural networks","type":"article-journal","volume":"2"}}],"isEdited":false,"manualOverride":{"citeprocText":"(Henderson et al. 2020)","isManuallyOverridden":false,"manualOverrideText":""},"mendeley":{"formattedCitation":"(Henderson et al. 2020)","plainTextFormattedCitation":"(Henderson et al. 2020)","previouslyFormattedCitation":"(Henderson et al. 2020)"},"properties":{"noteIndex":0},"schema":"https://github.com/citation-style-language/schema/raw/master/csl-citation.json"}</w:instrText>
       </w:r>
       <w:r>
         <w:fldChar w:fldCharType="separate"/>
@@ -10608,7 +10798,7 @@
         <w:fldChar w:fldCharType="begin"/>
       </w:r>
       <w:r>
-        <w:instrText xml:space="preserve">ADDIN CSL_CITATION {"citationID":"MENDELEY_CITATION_180","citationItems":[{"id":"ITEM-180","isTemporary":false,"itemData":{"author":[{"family":"Roh","given":"Emily Jimin"},{"family":"Baek","given":"Hankyul"},{"family":"Kim","given":"Donghyeon"},{"family":"Kim","given":"Joongheon"}],"container-title":"IEEE Transactions on Mobile Computing","id":"Roh2025","issue":"2","issued":{"date-parts":[[2025]]},"page":"1031-1042","title":"Fast quantum convolutional neural networks for low-complexity object detection in autonomous driving applications","type":"article-journal","volume":"24"},"suppress-author":false}],"isEdited":false,"manualOverride":{"citeprocText":"Roh et al. (2025)","isManuallyOverridden":false,"manualOverrideText":""},"mendeley":{"formattedCitation":"Roh et al. (2025)","plainTextFormattedCitation":"Roh et al. (2025)","previouslyFormattedCitation":"Roh et al. (2025)"},"properties":{"noteIndex":0},"schema":"https://github.com/citation-style-language/schema/raw/master/csl-citation.json"}</w:instrText>
+        <w:instrText xml:space="preserve">ADDIN CSL_CITATION {"citationID":"MENDELEY_CITATION_193","citationItems":[{"id":"ITEM-193","isTemporary":false,"itemData":{"author":[{"family":"Roh","given":"Emily Jimin"},{"family":"Baek","given":"Hankyul"},{"family":"Kim","given":"Donghyeon"},{"family":"Kim","given":"Joongheon"}],"container-title":"IEEE Transactions on Mobile Computing","id":"Roh2025","issue":"2","issued":{"date-parts":[[2025]]},"page":"1031-1042","title":"Fast quantum convolutional neural networks for low-complexity object detection in autonomous driving applications","type":"article-journal","volume":"24"},"suppress-author":false}],"isEdited":false,"manualOverride":{"citeprocText":"Roh et al. (2025)","isManuallyOverridden":false,"manualOverrideText":""},"mendeley":{"formattedCitation":"Roh et al. (2025)","plainTextFormattedCitation":"Roh et al. (2025)","previouslyFormattedCitation":"Roh et al. (2025)"},"properties":{"noteIndex":0},"schema":"https://github.com/citation-style-language/schema/raw/master/csl-citation.json"}</w:instrText>
       </w:r>
       <w:r>
         <w:fldChar w:fldCharType="separate"/>
@@ -10629,7 +10819,7 @@
         <w:fldChar w:fldCharType="begin"/>
       </w:r>
       <w:r>
-        <w:instrText xml:space="preserve">ADDIN CSL_CITATION {"citationID":"MENDELEY_CITATION_181","citationItems":[{"id":"ITEM-181","isTemporary":false,"itemData":{"DOI":"10.1109/ICRA.2019.8793768","author":[{"family":"Petschnigg","given":"Christina"},{"family":"Brandstötter","given":"Mathias"},{"family":"Pichler","given":"Horst"},{"family":"Hofbaur","given":"Michael W."},{"family":"Dieber","given":"Bernhard"}],"container-title":"Proceedings of the 2019 international conference on robotics and automation (ICRA)","id":"Petschnigg2019","issued":{"date-parts":[[2019]]},"page":"803-810","publisher":"IEEE","title":"Quantum computation in robotic science and applications","type":"paper-conference"},"suppress-author":false}],"isEdited":false,"manualOverride":{"citeprocText":"Petschnigg et al. (2019)","isManuallyOverridden":false,"manualOverrideText":""},"mendeley":{"formattedCitation":"Petschnigg et al. (2019)","plainTextFormattedCitation":"Petschnigg et al. (2019)","previouslyFormattedCitation":"Petschnigg et al. (2019)"},"properties":{"noteIndex":0},"schema":"https://github.com/citation-style-language/schema/raw/master/csl-citation.json"}</w:instrText>
+        <w:instrText xml:space="preserve">ADDIN CSL_CITATION {"citationID":"MENDELEY_CITATION_194","citationItems":[{"id":"ITEM-194","isTemporary":false,"itemData":{"DOI":"10.1109/ICRA.2019.8793768","author":[{"family":"Petschnigg","given":"Christina"},{"family":"Brandstötter","given":"Mathias"},{"family":"Pichler","given":"Horst"},{"family":"Hofbaur","given":"Michael W."},{"family":"Dieber","given":"Bernhard"}],"container-title":"Proceedings of the 2019 international conference on robotics and automation (ICRA)","id":"Petschnigg2019","issued":{"date-parts":[[2019]]},"page":"803-810","publisher":"IEEE","title":"Quantum computation in robotic science and applications","type":"paper-conference"},"suppress-author":false}],"isEdited":false,"manualOverride":{"citeprocText":"Petschnigg et al. (2019)","isManuallyOverridden":false,"manualOverrideText":""},"mendeley":{"formattedCitation":"Petschnigg et al. (2019)","plainTextFormattedCitation":"Petschnigg et al. (2019)","previouslyFormattedCitation":"Petschnigg et al. (2019)"},"properties":{"noteIndex":0},"schema":"https://github.com/citation-style-language/schema/raw/master/csl-citation.json"}</w:instrText>
       </w:r>
       <w:r>
         <w:fldChar w:fldCharType="separate"/>
@@ -10653,7 +10843,7 @@
         <w:fldChar w:fldCharType="begin"/>
       </w:r>
       <w:r>
-        <w:instrText xml:space="preserve">ADDIN CSL_CITATION {"citationID":"MENDELEY_CITATION_182","citationItems":[{"id":"ITEM-182","isTemporary":false,"itemData":{"DOI":"10.1007/s42484-024-00225-5","author":[{"family":"Yan","given":"Fei"},{"family":"Iliyasu","given":"Abdullah M."},{"family":"Li","given":"Nianqiao"},{"family":"Salama","given":"Ahmed S."},{"family":"Hirota","given":"Kaoru"}],"container-title":"Quantum Machine Intelligence","id":"Yan2024","issue":"2","issued":{"date-parts":[[2024]]},"page":"86","publisher":"Springer","title":"Quantum robotics: A review of emerging trends","title-short":"Quantum robotics","type":"article-journal","volume":"6"},"suppress-author":false}],"isEdited":false,"manualOverride":{"citeprocText":"Yan et al. (2024)","isManuallyOverridden":false,"manualOverrideText":""},"mendeley":{"formattedCitation":"Yan et al. (2024)","plainTextFormattedCitation":"Yan et al. (2024)","previouslyFormattedCitation":"Yan et al. (2024)"},"properties":{"noteIndex":0},"schema":"https://github.com/citation-style-language/schema/raw/master/csl-citation.json"}</w:instrText>
+        <w:instrText xml:space="preserve">ADDIN CSL_CITATION {"citationID":"MENDELEY_CITATION_195","citationItems":[{"id":"ITEM-195","isTemporary":false,"itemData":{"DOI":"10.1007/s42484-024-00225-5","author":[{"family":"Yan","given":"Fei"},{"family":"Iliyasu","given":"Abdullah M."},{"family":"Li","given":"Nianqiao"},{"family":"Salama","given":"Ahmed S."},{"family":"Hirota","given":"Kaoru"}],"container-title":"Quantum Machine Intelligence","id":"Yan2024","issue":"2","issued":{"date-parts":[[2024]]},"page":"86","publisher":"Springer","title":"Quantum robotics: A review of emerging trends","title-short":"Quantum robotics","type":"article-journal","volume":"6"},"suppress-author":false}],"isEdited":false,"manualOverride":{"citeprocText":"Yan et al. (2024)","isManuallyOverridden":false,"manualOverrideText":""},"mendeley":{"formattedCitation":"Yan et al. (2024)","plainTextFormattedCitation":"Yan et al. (2024)","previouslyFormattedCitation":"Yan et al. (2024)"},"properties":{"noteIndex":0},"schema":"https://github.com/citation-style-language/schema/raw/master/csl-citation.json"}</w:instrText>
       </w:r>
       <w:r>
         <w:fldChar w:fldCharType="separate"/>
@@ -10677,7 +10867,7 @@
         <w:fldChar w:fldCharType="begin"/>
       </w:r>
       <w:r>
-        <w:instrText xml:space="preserve">ADDIN CSL_CITATION {"citationID":"MENDELEY_CITATION_183","citationItems":[{"id":"ITEM-183","isTemporary":false,"itemData":{"DOI":"10.1109/ASE63991.2025.00306","author":[{"family":"Wang","given":"Xinyi"},{"family":"Arcaini","given":"Paolo"},{"family":"Ali","given":"Shaukat"},{"family":"Xu","given":"Qinghua"},{"family":"Peyrucain","given":"Thomas"}],"container-title":"Proceedings of the 40th IEEE/ACM international conference on automated software engineering (ASE)","id":"Wang2025","issued":{"date-parts":[[2025]]},"publisher":"IEEE","title":"Quantum machine learning-based test oracle for autonomous mobile robots","type":"paper-conference"},"suppress-author":false}],"isEdited":false,"manualOverride":{"citeprocText":"Xinyi Wang et al. (2025)","isManuallyOverridden":false,"manualOverrideText":""},"mendeley":{"formattedCitation":"Xinyi Wang et al. (2025)","plainTextFormattedCitation":"Xinyi Wang et al. (2025)","previouslyFormattedCitation":"Xinyi Wang et al. (2025)"},"properties":{"noteIndex":0},"schema":"https://github.com/citation-style-language/schema/raw/master/csl-citation.json"}</w:instrText>
+        <w:instrText xml:space="preserve">ADDIN CSL_CITATION {"citationID":"MENDELEY_CITATION_196","citationItems":[{"id":"ITEM-196","isTemporary":false,"itemData":{"DOI":"10.1109/ASE63991.2025.00306","author":[{"family":"Wang","given":"Xinyi"},{"family":"Arcaini","given":"Paolo"},{"family":"Ali","given":"Shaukat"},{"family":"Xu","given":"Qinghua"},{"family":"Peyrucain","given":"Thomas"}],"container-title":"Proceedings of the 40th IEEE/ACM international conference on automated software engineering (ASE)","id":"Wang2025","issued":{"date-parts":[[2025]]},"publisher":"IEEE","title":"Quantum machine learning-based test oracle for autonomous mobile robots","type":"paper-conference"},"suppress-author":false}],"isEdited":false,"manualOverride":{"citeprocText":"Xinyi Wang et al. (2025)","isManuallyOverridden":false,"manualOverrideText":""},"mendeley":{"formattedCitation":"Xinyi Wang et al. (2025)","plainTextFormattedCitation":"Xinyi Wang et al. (2025)","previouslyFormattedCitation":"Xinyi Wang et al. (2025)"},"properties":{"noteIndex":0},"schema":"https://github.com/citation-style-language/schema/raw/master/csl-citation.json"}</w:instrText>
       </w:r>
       <w:r>
         <w:fldChar w:fldCharType="separate"/>
@@ -10701,7 +10891,7 @@
         <w:fldChar w:fldCharType="begin"/>
       </w:r>
       <w:r>
-        <w:instrText xml:space="preserve">ADDIN CSL_CITATION {"citationID":"MENDELEY_CITATION_184","citationItems":[{"id":"ITEM-184","isTemporary":false,"itemData":{"DOI":"10.2139/ssrn.3244327","author":[{"family":"Gonçalves","given":"Carlos Pedro"}],"id":"Goncalves2018","issued":{"date-parts":[[2018]]},"publisher":"SSRN preprint 3244327","title":"Quantum robotics, neural networks and the quantum force interpretation","type":""},"suppress-author":false}],"isEdited":false,"manualOverride":{"citeprocText":"Gonçalves (2018)","isManuallyOverridden":false,"manualOverrideText":""},"mendeley":{"formattedCitation":"Gonçalves (2018)","plainTextFormattedCitation":"Gonçalves (2018)","previouslyFormattedCitation":"Gonçalves (2018)"},"properties":{"noteIndex":0},"schema":"https://github.com/citation-style-language/schema/raw/master/csl-citation.json"}</w:instrText>
+        <w:instrText xml:space="preserve">ADDIN CSL_CITATION {"citationID":"MENDELEY_CITATION_197","citationItems":[{"id":"ITEM-197","isTemporary":false,"itemData":{"DOI":"10.2139/ssrn.3244327","author":[{"family":"Gonçalves","given":"Carlos Pedro"}],"id":"Goncalves2018","issued":{"date-parts":[[2018]]},"publisher":"SSRN preprint 3244327","title":"Quantum robotics, neural networks and the quantum force interpretation","type":""},"suppress-author":false}],"isEdited":false,"manualOverride":{"citeprocText":"Gonçalves (2018)","isManuallyOverridden":false,"manualOverrideText":""},"mendeley":{"formattedCitation":"Gonçalves (2018)","plainTextFormattedCitation":"Gonçalves (2018)","previouslyFormattedCitation":"Gonçalves (2018)"},"properties":{"noteIndex":0},"schema":"https://github.com/citation-style-language/schema/raw/master/csl-citation.json"}</w:instrText>
       </w:r>
       <w:r>
         <w:fldChar w:fldCharType="separate"/>
@@ -10722,7 +10912,7 @@
         <w:fldChar w:fldCharType="begin"/>
       </w:r>
       <w:r>
-        <w:instrText xml:space="preserve">ADDIN CSL_CITATION {"citationID":"MENDELEY_CITATION_185","citationItems":[{"id":"ITEM-185","isTemporary":false,"itemData":{"DOI":"10.1103/PhysRevA.58.893","author":[{"family":"Benioff","given":"Paul"}],"container-title":"Physical Review A","id":"Benioff1998","issue":"2","issued":{"date-parts":[[1998]]},"page":"893-904","publisher":"American Physical Society","title":"Quantum robots and environments","type":"article-journal","volume":"58"}}],"isEdited":false,"manualOverride":{"citeprocText":"(Benioff 1998)","isManuallyOverridden":false,"manualOverrideText":""},"mendeley":{"formattedCitation":"(Benioff 1998)","plainTextFormattedCitation":"(Benioff 1998)","previouslyFormattedCitation":"(Benioff 1998)"},"properties":{"noteIndex":0},"schema":"https://github.com/citation-style-language/schema/raw/master/csl-citation.json"}</w:instrText>
+        <w:instrText xml:space="preserve">ADDIN CSL_CITATION {"citationID":"MENDELEY_CITATION_198","citationItems":[{"id":"ITEM-198","isTemporary":false,"itemData":{"DOI":"10.1103/PhysRevA.58.893","author":[{"family":"Benioff","given":"Paul"}],"container-title":"Physical Review A","id":"Benioff1998","issue":"2","issued":{"date-parts":[[1998]]},"page":"893-904","publisher":"American Physical Society","title":"Quantum robots and environments","type":"article-journal","volume":"58"}}],"isEdited":false,"manualOverride":{"citeprocText":"(Benioff 1998)","isManuallyOverridden":false,"manualOverrideText":""},"mendeley":{"formattedCitation":"(Benioff 1998)","plainTextFormattedCitation":"(Benioff 1998)","previouslyFormattedCitation":"(Benioff 1998)"},"properties":{"noteIndex":0},"schema":"https://github.com/citation-style-language/schema/raw/master/csl-citation.json"}</w:instrText>
       </w:r>
       <w:r>
         <w:fldChar w:fldCharType="separate"/>
@@ -10763,7 +10953,7 @@
         <w:fldChar w:fldCharType="begin"/>
       </w:r>
       <w:r>
-        <w:instrText xml:space="preserve">ADDIN CSL_CITATION {"citationID":"MENDELEY_CITATION_186","citationItems":[{"id":"ITEM-186","isTemporary":false,"itemData":{"DOI":"10.1038/s41467-018-07090-4","author":[{"family":"McClean","given":"Jarrod R."},{"family":"Boixo","given":"Sergio"},{"family":"Smelyanskiy","given":"Vadim N."},{"family":"Babbush","given":"Ryan"},{"family":"Neven","given":"Hartmut"}],"container-title":"Nature Communications","id":"McClean2018","issue":"1","issued":{"date-parts":[[2018]]},"page":"4812","publisher":"Nature Publishing Group","title":"Barren plateaus in quantum neural network training landscapes","type":"article-journal","volume":"9"},"suppress-author":false}],"isEdited":false,"manualOverride":{"citeprocText":"McClean et al. (2018)","isManuallyOverridden":false,"manualOverrideText":""},"mendeley":{"formattedCitation":"McClean et al. (2018)","plainTextFormattedCitation":"McClean et al. (2018)","previouslyFormattedCitation":"McClean et al. (2018)"},"properties":{"noteIndex":0},"schema":"https://github.com/citation-style-language/schema/raw/master/csl-citation.json"}</w:instrText>
+        <w:instrText xml:space="preserve">ADDIN CSL_CITATION {"citationID":"MENDELEY_CITATION_199","citationItems":[{"id":"ITEM-199","isTemporary":false,"itemData":{"DOI":"10.1038/s41467-018-07090-4","author":[{"family":"McClean","given":"Jarrod R."},{"family":"Boixo","given":"Sergio"},{"family":"Smelyanskiy","given":"Vadim N."},{"family":"Babbush","given":"Ryan"},{"family":"Neven","given":"Hartmut"}],"container-title":"Nature Communications","id":"McClean2018","issue":"1","issued":{"date-parts":[[2018]]},"page":"4812","publisher":"Nature Publishing Group","title":"Barren plateaus in quantum neural network training landscapes","type":"article-journal","volume":"9"},"suppress-author":false}],"isEdited":false,"manualOverride":{"citeprocText":"McClean et al. (2018)","isManuallyOverridden":false,"manualOverrideText":""},"mendeley":{"formattedCitation":"McClean et al. (2018)","plainTextFormattedCitation":"McClean et al. (2018)","previouslyFormattedCitation":"McClean et al. (2018)"},"properties":{"noteIndex":0},"schema":"https://github.com/citation-style-language/schema/raw/master/csl-citation.json"}</w:instrText>
       </w:r>
       <w:r>
         <w:fldChar w:fldCharType="separate"/>
@@ -10787,7 +10977,7 @@
         <w:fldChar w:fldCharType="begin"/>
       </w:r>
       <w:r>
-        <w:instrText xml:space="preserve">ADDIN CSL_CITATION {"citationID":"MENDELEY_CITATION_187","citationItems":[{"id":"ITEM-187","isTemporary":false,"itemData":{"DOI":"10.1038/s41467-021-21728-w","author":[{"family":"Cerezo","given":"M."},{"family":"Sone","given":"Akira"},{"family":"Volkoff","given":"Tyler"},{"family":"Cincio","given":"Lukasz"},{"family":"Coles","given":"Patrick J."}],"container-title":"Nature Communications","id":"Cerezo2021b","issued":{"date-parts":[[2021]]},"page":"1791","publisher":"Nature Publishing Group","title":"Cost function dependent barren plateaus in shallow parametrized quantum circuits","type":"article-journal","volume":"12"},"suppress-author":false}],"isEdited":false,"manualOverride":{"citeprocText":"Cerezo, Sone, et al. (2021)","isManuallyOverridden":false,"manualOverrideText":""},"mendeley":{"formattedCitation":"Cerezo, Sone, et al. (2021)","plainTextFormattedCitation":"Cerezo, Sone, et al. (2021)","previouslyFormattedCitation":"Cerezo, Sone, et al. (2021)"},"properties":{"noteIndex":0},"schema":"https://github.com/citation-style-language/schema/raw/master/csl-citation.json"}</w:instrText>
+        <w:instrText xml:space="preserve">ADDIN CSL_CITATION {"citationID":"MENDELEY_CITATION_200","citationItems":[{"id":"ITEM-200","isTemporary":false,"itemData":{"DOI":"10.1038/s41467-021-21728-w","author":[{"family":"Cerezo","given":"M."},{"family":"Sone","given":"Akira"},{"family":"Volkoff","given":"Tyler"},{"family":"Cincio","given":"Lukasz"},{"family":"Coles","given":"Patrick J."}],"container-title":"Nature Communications","id":"Cerezo2021b","issued":{"date-parts":[[2021]]},"page":"1791","publisher":"Nature Publishing Group","title":"Cost function dependent barren plateaus in shallow parametrized quantum circuits","type":"article-journal","volume":"12"},"suppress-author":false}],"isEdited":false,"manualOverride":{"citeprocText":"Cerezo, Sone, et al. (2021)","isManuallyOverridden":false,"manualOverrideText":""},"mendeley":{"formattedCitation":"Cerezo, Sone, et al. (2021)","plainTextFormattedCitation":"Cerezo, Sone, et al. (2021)","previouslyFormattedCitation":"Cerezo, Sone, et al. (2021)"},"properties":{"noteIndex":0},"schema":"https://github.com/citation-style-language/schema/raw/master/csl-citation.json"}</w:instrText>
       </w:r>
       <w:r>
         <w:fldChar w:fldCharType="separate"/>
@@ -10811,7 +11001,7 @@
         <w:fldChar w:fldCharType="begin"/>
       </w:r>
       <w:r>
-        <w:instrText xml:space="preserve">ADDIN CSL_CITATION {"citationID":"MENDELEY_CITATION_188","citationItems":[{"id":"ITEM-188","isTemporary":false,"itemData":{"DOI":"10.1038/s42254-025-00813-9","author":[{"family":"Larocca","given":"Martı́n"},{"family":"Thanasilp","given":"Supanut"},{"family":"Wang","given":"Samson"},{"family":"Sharma","given":"Kunal"},{"family":"Biamonte","given":"Jacob"},{"family":"Coles","given":"Patrick J."},{"family":"Cincio","given":"Lukasz"},{"family":"McClean","given":"Jarrod R."},{"family":"Holmes","given":"Zoë"},{"family":"Cerezo","given":"M."}],"container-title":"Nature Reviews Physics","id":"Larocca2025","issue":"4","issued":{"date-parts":[[2025]]},"page":"174-189","publisher":"Nature Publishing Group","title":"Barren plateaus in variational quantum computing","type":"article-journal","volume":"7"},"suppress-author":false}],"isEdited":false,"manualOverride":{"citeprocText":"Larocca et al. (2025)","isManuallyOverridden":false,"manualOverrideText":""},"mendeley":{"formattedCitation":"Larocca et al. (2025)","plainTextFormattedCitation":"Larocca et al. (2025)","previouslyFormattedCitation":"Larocca et al. (2025)"},"properties":{"noteIndex":0},"schema":"https://github.com/citation-style-language/schema/raw/master/csl-citation.json"}</w:instrText>
+        <w:instrText xml:space="preserve">ADDIN CSL_CITATION {"citationID":"MENDELEY_CITATION_201","citationItems":[{"id":"ITEM-201","isTemporary":false,"itemData":{"DOI":"10.1038/s42254-025-00813-9","author":[{"family":"Larocca","given":"Martı́n"},{"family":"Thanasilp","given":"Supanut"},{"family":"Wang","given":"Samson"},{"family":"Sharma","given":"Kunal"},{"family":"Biamonte","given":"Jacob"},{"family":"Coles","given":"Patrick J."},{"family":"Cincio","given":"Lukasz"},{"family":"McClean","given":"Jarrod R."},{"family":"Holmes","given":"Zoë"},{"family":"Cerezo","given":"M."}],"container-title":"Nature Reviews Physics","id":"Larocca2025","issue":"4","issued":{"date-parts":[[2025]]},"page":"174-189","publisher":"Nature Publishing Group","title":"Barren plateaus in variational quantum computing","type":"article-journal","volume":"7"},"suppress-author":false}],"isEdited":false,"manualOverride":{"citeprocText":"Larocca et al. (2025)","isManuallyOverridden":false,"manualOverrideText":""},"mendeley":{"formattedCitation":"Larocca et al. (2025)","plainTextFormattedCitation":"Larocca et al. (2025)","previouslyFormattedCitation":"Larocca et al. (2025)"},"properties":{"noteIndex":0},"schema":"https://github.com/citation-style-language/schema/raw/master/csl-citation.json"}</w:instrText>
       </w:r>
       <w:r>
         <w:fldChar w:fldCharType="separate"/>
@@ -10859,7 +11049,7 @@
         <w:fldChar w:fldCharType="begin"/>
       </w:r>
       <w:r>
-        <w:instrText xml:space="preserve">ADDIN CSL_CITATION {"citationID":"MENDELEY_CITATION_190","citationItems":[{"id":"ITEM-189","isTemporary":false,"itemData":{"DOI":"10.1145/3313276.3316310","author":[{"family":"Tang","given":"Ewin"}],"container-title":"Proceedings of the 51st annual ACM SIGACT symposium on theory of computing (STOC 2019)","id":"Tang2019","issued":{"date-parts":[[2019]]},"page":"217-228","publisher":"ACM","publisher-place":"New York, NY, USA","title":"A quantum-inspired classical algorithm for recommendation systems","type":"paper-conference"}},{"id":"ITEM-190","isTemporary":false,"itemData":{"DOI":"10.1145/3357713.3384314","author":[{"family":"Chia","given":"Nai-Hui"},{"family":"Gilyén","given":"András"},{"family":"Li","given":"Tongyang"},{"family":"Lin","given":"Han-Hsuan"},{"family":"Tang","given":"Ewin"},{"family":"Wang","given":"Chunhao"}],"container-title":"Proceedings of the 52nd annual ACM SIGACT symposium on theory of computing (STOC 2020)","id":"Chia2020","issued":{"date-parts":[[2020]]},"page":"387-400","publisher":"ACM","publisher-place":"New York, NY, USA","title":"Sampling-based sublinear low-rank matrix arithmetic framework for dequantizing quantum machine learning","type":"paper-conference"}}],"isEdited":false,"manualOverride":{"citeprocText":"(E. Tang 2019; Chia et al. 2020)","isManuallyOverridden":false,"manualOverrideText":""},"mendeley":{"formattedCitation":"(E. Tang 2019; Chia et al. 2020)","plainTextFormattedCitation":"(E. Tang 2019; Chia et al. 2020)","previouslyFormattedCitation":"(E. Tang 2019; Chia et al. 2020)"},"properties":{"noteIndex":0},"schema":"https://github.com/citation-style-language/schema/raw/master/csl-citation.json"}</w:instrText>
+        <w:instrText xml:space="preserve">ADDIN CSL_CITATION {"citationID":"MENDELEY_CITATION_203","citationItems":[{"id":"ITEM-202","isTemporary":false,"itemData":{"DOI":"10.1145/3313276.3316310","author":[{"family":"Tang","given":"Ewin"}],"container-title":"Proceedings of the 51st annual ACM SIGACT symposium on theory of computing (STOC 2019)","id":"Tang2019","issued":{"date-parts":[[2019]]},"page":"217-228","publisher":"ACM","publisher-place":"New York, NY, USA","title":"A quantum-inspired classical algorithm for recommendation systems","type":"paper-conference"}},{"id":"ITEM-203","isTemporary":false,"itemData":{"DOI":"10.1145/3357713.3384314","author":[{"family":"Chia","given":"Nai-Hui"},{"family":"Gilyén","given":"András"},{"family":"Li","given":"Tongyang"},{"family":"Lin","given":"Han-Hsuan"},{"family":"Tang","given":"Ewin"},{"family":"Wang","given":"Chunhao"}],"container-title":"Proceedings of the 52nd annual ACM SIGACT symposium on theory of computing (STOC 2020)","id":"Chia2020","issued":{"date-parts":[[2020]]},"page":"387-400","publisher":"ACM","publisher-place":"New York, NY, USA","title":"Sampling-based sublinear low-rank matrix arithmetic framework for dequantizing quantum machine learning","type":"paper-conference"}}],"isEdited":false,"manualOverride":{"citeprocText":"(E. Tang 2019; Chia et al. 2020)","isManuallyOverridden":false,"manualOverrideText":""},"mendeley":{"formattedCitation":"(E. Tang 2019; Chia et al. 2020)","plainTextFormattedCitation":"(E. Tang 2019; Chia et al. 2020)","previouslyFormattedCitation":"(E. Tang 2019; Chia et al. 2020)"},"properties":{"noteIndex":0},"schema":"https://github.com/citation-style-language/schema/raw/master/csl-citation.json"}</w:instrText>
       </w:r>
       <w:r>
         <w:fldChar w:fldCharType="separate"/>
@@ -10877,7 +11067,7 @@
         <w:fldChar w:fldCharType="begin"/>
       </w:r>
       <w:r>
-        <w:instrText xml:space="preserve">ADDIN CSL_CITATION {"citationID":"MENDELEY_CITATION_191","citationItems":[{"id":"ITEM-191","isTemporary":false,"itemData":{"DOI":"10.1038/nphys3272","author":[{"family":"Aaronson","given":"Scott"}],"container-title":"Nature Physics","id":"Aaronson2015","issue":"4","issued":{"date-parts":[[2015]]},"page":"291-293","title":"Read the fine print","type":"article-journal","volume":"11"}}],"isEdited":false,"manualOverride":{"citeprocText":"(Aaronson 2015)","isManuallyOverridden":false,"manualOverrideText":""},"mendeley":{"formattedCitation":"(Aaronson 2015)","plainTextFormattedCitation":"(Aaronson 2015)","previouslyFormattedCitation":"(Aaronson 2015)"},"properties":{"noteIndex":0},"schema":"https://github.com/citation-style-language/schema/raw/master/csl-citation.json"}</w:instrText>
+        <w:instrText xml:space="preserve">ADDIN CSL_CITATION {"citationID":"MENDELEY_CITATION_204","citationItems":[{"id":"ITEM-204","isTemporary":false,"itemData":{"DOI":"10.1038/nphys3272","author":[{"family":"Aaronson","given":"Scott"}],"container-title":"Nature Physics","id":"Aaronson2015","issue":"4","issued":{"date-parts":[[2015]]},"page":"291-293","title":"Read the fine print","type":"article-journal","volume":"11"}}],"isEdited":false,"manualOverride":{"citeprocText":"(Aaronson 2015)","isManuallyOverridden":false,"manualOverrideText":""},"mendeley":{"formattedCitation":"(Aaronson 2015)","plainTextFormattedCitation":"(Aaronson 2015)","previouslyFormattedCitation":"(Aaronson 2015)"},"properties":{"noteIndex":0},"schema":"https://github.com/citation-style-language/schema/raw/master/csl-citation.json"}</w:instrText>
       </w:r>
       <w:r>
         <w:fldChar w:fldCharType="separate"/>
@@ -10923,7 +11113,7 @@
         <w:fldChar w:fldCharType="begin"/>
       </w:r>
       <w:r>
-        <w:instrText xml:space="preserve">ADDIN CSL_CITATION {"citationID":"MENDELEY_CITATION_193","citationItems":[{"id":"ITEM-192","isTemporary":false,"itemData":{"URL":"https://arxiv.org/abs/2211.03464","author":[{"family":"Meyer","given":"Nico"},{"family":"Ufrecht","given":"Christian"},{"family":"Periyasamy","given":"Maniraman"},{"family":"Scherer","given":"Daniel D."},{"family":"Plinge","given":"Axel"},{"family":"Mutschler","given":"Christopher"}],"id":"Meyer2022","issued":{"date-parts":[[2022]]},"title":"A survey on quantum reinforcement learning","type":""}},{"id":"ITEM-193","isTemporary":false,"itemData":{"DOI":"10.1088/1361-6633/aab406","author":[{"family":"Dunjko","given":"Vedran"},{"family":"Briegel","given":"Hans J."}],"container-title":"Reports on Progress in Physics","id":"Dunjko2018","issue":"7","issued":{"date-parts":[[2018]]},"page":"074001","title":"Machine learning &amp; artificial intelligence in the quantum domain: A review of recent progress","title-short":"Machine learning &amp; artificial intelligence in the quantum domain","type":"article-journal","volume":"81"}}],"isEdited":false,"manualOverride":{"citeprocText":"(Meyer et al. 2022; Dunjko and Briegel 2018)","isManuallyOverridden":false,"manualOverrideText":""},"mendeley":{"formattedCitation":"(Meyer et al. 2022; Dunjko and Briegel 2018)","plainTextFormattedCitation":"(Meyer et al. 2022; Dunjko and Briegel 2018)","previouslyFormattedCitation":"(Meyer et al. 2022; Dunjko and Briegel 2018)"},"properties":{"noteIndex":0},"schema":"https://github.com/citation-style-language/schema/raw/master/csl-citation.json"}</w:instrText>
+        <w:instrText xml:space="preserve">ADDIN CSL_CITATION {"citationID":"MENDELEY_CITATION_206","citationItems":[{"id":"ITEM-205","isTemporary":false,"itemData":{"URL":"https://arxiv.org/abs/2211.03464","author":[{"family":"Meyer","given":"Nico"},{"family":"Ufrecht","given":"Christian"},{"family":"Periyasamy","given":"Maniraman"},{"family":"Scherer","given":"Daniel D."},{"family":"Plinge","given":"Axel"},{"family":"Mutschler","given":"Christopher"}],"id":"Meyer2022","issued":{"date-parts":[[2022]]},"title":"A survey on quantum reinforcement learning","type":""}},{"id":"ITEM-206","isTemporary":false,"itemData":{"DOI":"10.1088/1361-6633/aab406","author":[{"family":"Dunjko","given":"Vedran"},{"family":"Briegel","given":"Hans J."}],"container-title":"Reports on Progress in Physics","id":"Dunjko2018","issue":"7","issued":{"date-parts":[[2018]]},"page":"074001","title":"Machine learning &amp; artificial intelligence in the quantum domain: A review of recent progress","title-short":"Machine learning &amp; artificial intelligence in the quantum domain","type":"article-journal","volume":"81"}}],"isEdited":false,"manualOverride":{"citeprocText":"(Meyer et al. 2022; Dunjko and Briegel 2018)","isManuallyOverridden":false,"manualOverrideText":""},"mendeley":{"formattedCitation":"(Meyer et al. 2022; Dunjko and Briegel 2018)","plainTextFormattedCitation":"(Meyer et al. 2022; Dunjko and Briegel 2018)","previouslyFormattedCitation":"(Meyer et al. 2022; Dunjko and Briegel 2018)"},"properties":{"noteIndex":0},"schema":"https://github.com/citation-style-language/schema/raw/master/csl-citation.json"}</w:instrText>
       </w:r>
       <w:r>
         <w:fldChar w:fldCharType="separate"/>
@@ -10944,7 +11134,7 @@
         <w:fldChar w:fldCharType="begin"/>
       </w:r>
       <w:r>
-        <w:instrText xml:space="preserve">ADDIN CSL_CITATION {"citationID":"MENDELEY_CITATION_194","citationItems":[{"id":"ITEM-194","isTemporary":false,"itemData":{"DOI":"10.1109/TSMCB.2008.925743","author":[{"family":"Dong","given":"Daoyi"},{"family":"Chen","given":"Chunlin"},{"family":"Li","given":"Hanxiong"},{"family":"Tarn","given":"Tzyh-Jong"}],"container-title":"IEEE Transactions on Systems, Man, and Cybernetics, Part B (Cybernetics)","id":"Dong2008","issue":"5","issued":{"date-parts":[[2008]]},"page":"1207-1220","title":"Quantum reinforcement learning","type":"article-journal","volume":"38"},"suppress-author":false}],"isEdited":false,"manualOverride":{"citeprocText":"Dong et al. (2008)","isManuallyOverridden":false,"manualOverrideText":""},"mendeley":{"formattedCitation":"Dong et al. (2008)","plainTextFormattedCitation":"Dong et al. (2008)","previouslyFormattedCitation":"Dong et al. (2008)"},"properties":{"noteIndex":0},"schema":"https://github.com/citation-style-language/schema/raw/master/csl-citation.json"}</w:instrText>
+        <w:instrText xml:space="preserve">ADDIN CSL_CITATION {"citationID":"MENDELEY_CITATION_207","citationItems":[{"id":"ITEM-207","isTemporary":false,"itemData":{"DOI":"10.1109/TSMCB.2008.925743","author":[{"family":"Dong","given":"Daoyi"},{"family":"Chen","given":"Chunlin"},{"family":"Li","given":"Hanxiong"},{"family":"Tarn","given":"Tzyh-Jong"}],"container-title":"IEEE Transactions on Systems, Man, and Cybernetics, Part B (Cybernetics)","id":"Dong2008","issue":"5","issued":{"date-parts":[[2008]]},"page":"1207-1220","title":"Quantum reinforcement learning","type":"article-journal","volume":"38"},"suppress-author":false}],"isEdited":false,"manualOverride":{"citeprocText":"Dong et al. (2008)","isManuallyOverridden":false,"manualOverrideText":""},"mendeley":{"formattedCitation":"Dong et al. (2008)","plainTextFormattedCitation":"Dong et al. (2008)","previouslyFormattedCitation":"Dong et al. (2008)"},"properties":{"noteIndex":0},"schema":"https://github.com/citation-style-language/schema/raw/master/csl-citation.json"}</w:instrText>
       </w:r>
       <w:r>
         <w:fldChar w:fldCharType="separate"/>
@@ -10965,7 +11155,7 @@
         <w:fldChar w:fldCharType="begin"/>
       </w:r>
       <w:r>
-        <w:instrText xml:space="preserve">ADDIN CSL_CITATION {"citationID":"MENDELEY_CITATION_195","citationItems":[{"id":"ITEM-195","isTemporary":false,"itemData":{"DOI":"10.1038/srep00400","author":[{"family":"Briegel","given":"Hans J."},{"family":"De las Cuevas","given":"Gemma"}],"container-title":"Scientific Reports","id":"Briegel2012","issued":{"date-parts":[[2012]]},"page":"400","title":"Projective simulation for artificial intelligence","type":"article-journal","volume":"2"}}],"isEdited":false,"manualOverride":{"citeprocText":"(Briegel and De las Cuevas 2012)","isManuallyOverridden":false,"manualOverrideText":""},"mendeley":{"formattedCitation":"(Briegel and De las Cuevas 2012)","plainTextFormattedCitation":"(Briegel and De las Cuevas 2012)","previouslyFormattedCitation":"(Briegel and De las Cuevas 2012)"},"properties":{"noteIndex":0},"schema":"https://github.com/citation-style-language/schema/raw/master/csl-citation.json"}</w:instrText>
+        <w:instrText xml:space="preserve">ADDIN CSL_CITATION {"citationID":"MENDELEY_CITATION_208","citationItems":[{"id":"ITEM-208","isTemporary":false,"itemData":{"DOI":"10.1038/srep00400","author":[{"family":"Briegel","given":"Hans J."},{"family":"De las Cuevas","given":"Gemma"}],"container-title":"Scientific Reports","id":"Briegel2012","issued":{"date-parts":[[2012]]},"page":"400","title":"Projective simulation for artificial intelligence","type":"article-journal","volume":"2"}}],"isEdited":false,"manualOverride":{"citeprocText":"(Briegel and De las Cuevas 2012)","isManuallyOverridden":false,"manualOverrideText":""},"mendeley":{"formattedCitation":"(Briegel and De las Cuevas 2012)","plainTextFormattedCitation":"(Briegel and De las Cuevas 2012)","previouslyFormattedCitation":"(Briegel and De las Cuevas 2012)"},"properties":{"noteIndex":0},"schema":"https://github.com/citation-style-language/schema/raw/master/csl-citation.json"}</w:instrText>
       </w:r>
       <w:r>
         <w:fldChar w:fldCharType="separate"/>
@@ -10986,7 +11176,7 @@
         <w:fldChar w:fldCharType="begin"/>
       </w:r>
       <w:r>
-        <w:instrText xml:space="preserve">ADDIN CSL_CITATION {"citationID":"MENDELEY_CITATION_196","citationItems":[{"id":"ITEM-196","isTemporary":false,"itemData":{"DOI":"10.1103/PhysRevX.4.031002","author":[{"family":"Paparo","given":"Giuseppe Davide"},{"family":"Dunjko","given":"Vedran"},{"family":"Makmal","given":"Adi"},{"family":"Martin-Delgado","given":"Miguel Angel"},{"family":"Briegel","given":"Hans J."}],"container-title":"Physical Review X","id":"Paparo2014","issue":"3","issued":{"date-parts":[[2014]]},"page":"031002","title":"Quantum speedup for active learning agents","type":"article-journal","volume":"4"}}],"isEdited":false,"manualOverride":{"citeprocText":"(Paparo et al. 2014)","isManuallyOverridden":false,"manualOverrideText":""},"mendeley":{"formattedCitation":"(Paparo et al. 2014)","plainTextFormattedCitation":"(Paparo et al. 2014)","previouslyFormattedCitation":"(Paparo et al. 2014)"},"properties":{"noteIndex":0},"schema":"https://github.com/citation-style-language/schema/raw/master/csl-citation.json"}</w:instrText>
+        <w:instrText xml:space="preserve">ADDIN CSL_CITATION {"citationID":"MENDELEY_CITATION_209","citationItems":[{"id":"ITEM-209","isTemporary":false,"itemData":{"DOI":"10.1103/PhysRevX.4.031002","author":[{"family":"Paparo","given":"Giuseppe Davide"},{"family":"Dunjko","given":"Vedran"},{"family":"Makmal","given":"Adi"},{"family":"Martin-Delgado","given":"Miguel Angel"},{"family":"Briegel","given":"Hans J."}],"container-title":"Physical Review X","id":"Paparo2014","issue":"3","issued":{"date-parts":[[2014]]},"page":"031002","title":"Quantum speedup for active learning agents","type":"article-journal","volume":"4"}}],"isEdited":false,"manualOverride":{"citeprocText":"(Paparo et al. 2014)","isManuallyOverridden":false,"manualOverrideText":""},"mendeley":{"formattedCitation":"(Paparo et al. 2014)","plainTextFormattedCitation":"(Paparo et al. 2014)","previouslyFormattedCitation":"(Paparo et al. 2014)"},"properties":{"noteIndex":0},"schema":"https://github.com/citation-style-language/schema/raw/master/csl-citation.json"}</w:instrText>
       </w:r>
       <w:r>
         <w:fldChar w:fldCharType="separate"/>
@@ -11004,7 +11194,7 @@
         <w:fldChar w:fldCharType="begin"/>
       </w:r>
       <w:r>
-        <w:instrText xml:space="preserve">ADDIN CSL_CITATION {"citationID":"MENDELEY_CITATION_197","citationItems":[{"id":"ITEM-197","isTemporary":false,"itemData":{"ISBN":"978-0-262-03924-6","author":[{"family":"Sutton","given":"Richard S."},{"family":"Barto","given":"Andrew G."}],"collection-title":"Adaptive computation and machine learning","edition":"2nd","id":"Sutton2018","issued":{"date-parts":[[2018]]},"publisher":"MIT Press","publisher-place":"Cambridge, MA, USA","title":"Reinforcement learning: An introduction","title-short":"Reinforcement learning","type":"book"}}],"isEdited":false,"manualOverride":{"citeprocText":"(Sutton and Barto 2018)","isManuallyOverridden":false,"manualOverrideText":""},"mendeley":{"formattedCitation":"(Sutton and Barto 2018)","plainTextFormattedCitation":"(Sutton and Barto 2018)","previouslyFormattedCitation":"(Sutton and Barto 2018)"},"properties":{"noteIndex":0},"schema":"https://github.com/citation-style-language/schema/raw/master/csl-citation.json"}</w:instrText>
+        <w:instrText xml:space="preserve">ADDIN CSL_CITATION {"citationID":"MENDELEY_CITATION_210","citationItems":[{"id":"ITEM-210","isTemporary":false,"itemData":{"ISBN":"978-0-262-03924-6","author":[{"family":"Sutton","given":"Richard S."},{"family":"Barto","given":"Andrew G."}],"collection-title":"Adaptive computation and machine learning","edition":"2nd","id":"Sutton2018","issued":{"date-parts":[[2018]]},"publisher":"MIT Press","publisher-place":"Cambridge, MA, USA","title":"Reinforcement learning: An introduction","title-short":"Reinforcement learning","type":"book"}}],"isEdited":false,"manualOverride":{"citeprocText":"(Sutton and Barto 2018)","isManuallyOverridden":false,"manualOverrideText":""},"mendeley":{"formattedCitation":"(Sutton and Barto 2018)","plainTextFormattedCitation":"(Sutton and Barto 2018)","previouslyFormattedCitation":"(Sutton and Barto 2018)"},"properties":{"noteIndex":0},"schema":"https://github.com/citation-style-language/schema/raw/master/csl-citation.json"}</w:instrText>
       </w:r>
       <w:r>
         <w:fldChar w:fldCharType="separate"/>
@@ -11025,7 +11215,7 @@
         <w:fldChar w:fldCharType="begin"/>
       </w:r>
       <w:r>
-        <w:instrText xml:space="preserve">ADDIN CSL_CITATION {"citationID":"MENDELEY_CITATION_198","citationItems":[{"id":"ITEM-198","isTemporary":false,"itemData":{"DOI":"10.1109/ACCESS.2020.3010470","author":[{"family":"Chen","given":"Samuel Yen-Chi"},{"family":"Yang","given":"Chao-Han Huck"},{"family":"Qi","given":"Jun"},{"family":"Chen","given":"Pin-Yu"},{"family":"Ma","given":"Xiaoli"},{"family":"Goan","given":"Hsi-Sheng"}],"container-title":"IEEE Access","id":"Chen2020","issued":{"date-parts":[[2020]]},"page":"141007-141024","title":"Variational quantum circuits for deep reinforcement learning","type":"article-journal","volume":"8"}}],"isEdited":false,"manualOverride":{"citeprocText":"(Chen et al. 2020)","isManuallyOverridden":false,"manualOverrideText":""},"mendeley":{"formattedCitation":"(Chen et al. 2020)","plainTextFormattedCitation":"(Chen et al. 2020)","previouslyFormattedCitation":"(Chen et al. 2020)"},"properties":{"noteIndex":0},"schema":"https://github.com/citation-style-language/schema/raw/master/csl-citation.json"}</w:instrText>
+        <w:instrText xml:space="preserve">ADDIN CSL_CITATION {"citationID":"MENDELEY_CITATION_211","citationItems":[{"id":"ITEM-211","isTemporary":false,"itemData":{"DOI":"10.1109/ACCESS.2020.3010470","author":[{"family":"Chen","given":"Samuel Yen-Chi"},{"family":"Yang","given":"Chao-Han Huck"},{"family":"Qi","given":"Jun"},{"family":"Chen","given":"Pin-Yu"},{"family":"Ma","given":"Xiaoli"},{"family":"Goan","given":"Hsi-Sheng"}],"container-title":"IEEE Access","id":"Chen2020","issued":{"date-parts":[[2020]]},"page":"141007-141024","title":"Variational quantum circuits for deep reinforcement learning","type":"article-journal","volume":"8"}}],"isEdited":false,"manualOverride":{"citeprocText":"(Chen et al. 2020)","isManuallyOverridden":false,"manualOverrideText":""},"mendeley":{"formattedCitation":"(Chen et al. 2020)","plainTextFormattedCitation":"(Chen et al. 2020)","previouslyFormattedCitation":"(Chen et al. 2020)"},"properties":{"noteIndex":0},"schema":"https://github.com/citation-style-language/schema/raw/master/csl-citation.json"}</w:instrText>
       </w:r>
       <w:r>
         <w:fldChar w:fldCharType="separate"/>
@@ -11043,7 +11233,7 @@
         <w:fldChar w:fldCharType="begin"/>
       </w:r>
       <w:r>
-        <w:instrText xml:space="preserve">ADDIN CSL_CITATION {"citationID":"MENDELEY_CITATION_199","citationItems":[{"id":"ITEM-199","isTemporary":false,"itemData":{"DOI":"10.22331/q-2022-05-24-720","author":[{"family":"Skolik","given":"Andrea"},{"family":"Jerbi","given":"Sofiene"},{"family":"Dunjko","given":"Vedran"}],"container-title":"Quantum","id":"Skolik2022","issued":{"date-parts":[[2022]]},"page":"720","title":"Quantum agents in the gym: A variational quantum algorithm for deep Q-learning","title-short":"Quantum agents in the gym","type":"article-journal","volume":"6"}}],"isEdited":false,"manualOverride":{"citeprocText":"(Skolik, Jerbi, and Dunjko 2022)","isManuallyOverridden":false,"manualOverrideText":""},"mendeley":{"formattedCitation":"(Skolik, Jerbi, and Dunjko 2022)","plainTextFormattedCitation":"(Skolik, Jerbi, and Dunjko 2022)","previouslyFormattedCitation":"(Skolik, Jerbi, and Dunjko 2022)"},"properties":{"noteIndex":0},"schema":"https://github.com/citation-style-language/schema/raw/master/csl-citation.json"}</w:instrText>
+        <w:instrText xml:space="preserve">ADDIN CSL_CITATION {"citationID":"MENDELEY_CITATION_212","citationItems":[{"id":"ITEM-212","isTemporary":false,"itemData":{"DOI":"10.22331/q-2022-05-24-720","author":[{"family":"Skolik","given":"Andrea"},{"family":"Jerbi","given":"Sofiene"},{"family":"Dunjko","given":"Vedran"}],"container-title":"Quantum","id":"Skolik2022","issued":{"date-parts":[[2022]]},"page":"720","title":"Quantum agents in the gym: A variational quantum algorithm for deep Q-learning","title-short":"Quantum agents in the gym","type":"article-journal","volume":"6"}}],"isEdited":false,"manualOverride":{"citeprocText":"(Skolik, Jerbi, and Dunjko 2022)","isManuallyOverridden":false,"manualOverrideText":""},"mendeley":{"formattedCitation":"(Skolik, Jerbi, and Dunjko 2022)","plainTextFormattedCitation":"(Skolik, Jerbi, and Dunjko 2022)","previouslyFormattedCitation":"(Skolik, Jerbi, and Dunjko 2022)"},"properties":{"noteIndex":0},"schema":"https://github.com/citation-style-language/schema/raw/master/csl-citation.json"}</w:instrText>
       </w:r>
       <w:r>
         <w:fldChar w:fldCharType="separate"/>
@@ -11061,7 +11251,7 @@
         <w:fldChar w:fldCharType="begin"/>
       </w:r>
       <w:r>
-        <w:instrText xml:space="preserve">ADDIN CSL_CITATION {"citationID":"MENDELEY_CITATION_200","citationItems":[{"id":"ITEM-200","isTemporary":false,"itemData":{"URL":"https://proceedings.neurips.cc/paper/2021/hash/eec96a7f788e88184c0e713456026f3f-Abstract.html","author":[{"family":"Jerbi","given":"Sofiene"},{"family":"Gyurik","given":"Casper F. S."},{"family":"Marshall","given":"Simon C."},{"family":"Briegel","given":"Hans J."},{"family":"Dunjko","given":"Vedran"}],"container-title":"Advances in neural information processing systems","id":"Jerbi2021","issued":{"date-parts":[[2021]]},"page":"28362-28375","title":"Parametrized quantum policies for reinforcement learning","type":"paper-conference","volume":"34"}}],"isEdited":false,"manualOverride":{"citeprocText":"(Jerbi et al. 2021)","isManuallyOverridden":false,"manualOverrideText":""},"mendeley":{"formattedCitation":"(Jerbi et al. 2021)","plainTextFormattedCitation":"(Jerbi et al. 2021)","previouslyFormattedCitation":"(Jerbi et al. 2021)"},"properties":{"noteIndex":0},"schema":"https://github.com/citation-style-language/schema/raw/master/csl-citation.json"}</w:instrText>
+        <w:instrText xml:space="preserve">ADDIN CSL_CITATION {"citationID":"MENDELEY_CITATION_213","citationItems":[{"id":"ITEM-213","isTemporary":false,"itemData":{"URL":"https://proceedings.neurips.cc/paper/2021/hash/eec96a7f788e88184c0e713456026f3f-Abstract.html","author":[{"family":"Jerbi","given":"Sofiene"},{"family":"Gyurik","given":"Casper F. S."},{"family":"Marshall","given":"Simon C."},{"family":"Briegel","given":"Hans J."},{"family":"Dunjko","given":"Vedran"}],"container-title":"Advances in neural information processing systems","id":"Jerbi2021","issued":{"date-parts":[[2021]]},"page":"28362-28375","title":"Parametrized quantum policies for reinforcement learning","type":"paper-conference","volume":"34"}}],"isEdited":false,"manualOverride":{"citeprocText":"(Jerbi et al. 2021)","isManuallyOverridden":false,"manualOverrideText":""},"mendeley":{"formattedCitation":"(Jerbi et al. 2021)","plainTextFormattedCitation":"(Jerbi et al. 2021)","previouslyFormattedCitation":"(Jerbi et al. 2021)"},"properties":{"noteIndex":0},"schema":"https://github.com/citation-style-language/schema/raw/master/csl-citation.json"}</w:instrText>
       </w:r>
       <w:r>
         <w:fldChar w:fldCharType="separate"/>
@@ -11079,7 +11269,7 @@
         <w:fldChar w:fldCharType="begin"/>
       </w:r>
       <w:r>
-        <w:instrText xml:space="preserve">ADDIN CSL_CITATION {"citationID":"MENDELEY_CITATION_201","citationItems":[{"id":"ITEM-201","isTemporary":false,"itemData":{"DOI":"10.1088/2632-2153/ac4559","author":[{"family":"Chen","given":"Samuel Yen-Chi"},{"family":"Huang","given":"Chih-Min"},{"family":"Hsing","given":"Chia-Wei"},{"family":"Goan","given":"Hsi-Sheng"},{"family":"Kao","given":"Ying-Jer"}],"container-title":"Machine Learning: Science and Technology","id":"Chen2022","issue":"1","issued":{"date-parts":[[2022]]},"page":"015025","publisher":"IOP Publishing","title":"Variational quantum reinforcement learning via evolutionary optimization","type":"article-journal","volume":"3"}}],"isEdited":false,"manualOverride":{"citeprocText":"(Chen et al. 2022)","isManuallyOverridden":false,"manualOverrideText":""},"mendeley":{"formattedCitation":"(Chen et al. 2022)","plainTextFormattedCitation":"(Chen et al. 2022)","previouslyFormattedCitation":"(Chen et al. 2022)"},"properties":{"noteIndex":0},"schema":"https://github.com/citation-style-language/schema/raw/master/csl-citation.json"}</w:instrText>
+        <w:instrText xml:space="preserve">ADDIN CSL_CITATION {"citationID":"MENDELEY_CITATION_214","citationItems":[{"id":"ITEM-214","isTemporary":false,"itemData":{"DOI":"10.1088/2632-2153/ac4559","author":[{"family":"Chen","given":"Samuel Yen-Chi"},{"family":"Huang","given":"Chih-Min"},{"family":"Hsing","given":"Chia-Wei"},{"family":"Goan","given":"Hsi-Sheng"},{"family":"Kao","given":"Ying-Jer"}],"container-title":"Machine Learning: Science and Technology","id":"Chen2022","issue":"1","issued":{"date-parts":[[2022]]},"page":"015025","publisher":"IOP Publishing","title":"Variational quantum reinforcement learning via evolutionary optimization","type":"article-journal","volume":"3"}}],"isEdited":false,"manualOverride":{"citeprocText":"(Chen et al. 2022)","isManuallyOverridden":false,"manualOverrideText":""},"mendeley":{"formattedCitation":"(Chen et al. 2022)","plainTextFormattedCitation":"(Chen et al. 2022)","previouslyFormattedCitation":"(Chen et al. 2022)"},"properties":{"noteIndex":0},"schema":"https://github.com/citation-style-language/schema/raw/master/csl-citation.json"}</w:instrText>
       </w:r>
       <w:r>
         <w:fldChar w:fldCharType="separate"/>
@@ -11097,7 +11287,7 @@
         <w:fldChar w:fldCharType="begin"/>
       </w:r>
       <w:r>
-        <w:instrText xml:space="preserve">ADDIN CSL_CITATION {"citationID":"MENDELEY_CITATION_202","citationItems":[{"id":"ITEM-202","isTemporary":false,"itemData":{"DOI":"10.1109/ICDCS54860.2022.00151","author":[{"family":"Yun","given":"Won Joon"},{"family":"Kwak","given":"Yunseok"},{"family":"Kim","given":"Jae Pyoung"},{"family":"Cho","given":"Hyunhee"},{"family":"Jung","given":"Soyi"},{"family":"Park","given":"Jihong"},{"family":"Kim","given":"Joongheon"}],"container-title":"Proceedings of the 2022 IEEE 42nd international conference on distributed computing systems (ICDCS)","id":"Yun2022","issued":{"date-parts":[[2022]]},"page":"1332-1335","publisher":"IEEE","title":"Quantum multi-agent reinforcement learning via variational quantum circuit design","type":"paper-conference"}}],"isEdited":false,"manualOverride":{"citeprocText":"(Yun et al. 2022)","isManuallyOverridden":false,"manualOverrideText":""},"mendeley":{"formattedCitation":"(Yun et al. 2022)","plainTextFormattedCitation":"(Yun et al. 2022)","previouslyFormattedCitation":"(Yun et al. 2022)"},"properties":{"noteIndex":0},"schema":"https://github.com/citation-style-language/schema/raw/master/csl-citation.json"}</w:instrText>
+        <w:instrText xml:space="preserve">ADDIN CSL_CITATION {"citationID":"MENDELEY_CITATION_215","citationItems":[{"id":"ITEM-215","isTemporary":false,"itemData":{"DOI":"10.1109/ICDCS54860.2022.00151","author":[{"family":"Yun","given":"Won Joon"},{"family":"Kwak","given":"Yunseok"},{"family":"Kim","given":"Jae Pyoung"},{"family":"Cho","given":"Hyunhee"},{"family":"Jung","given":"Soyi"},{"family":"Park","given":"Jihong"},{"family":"Kim","given":"Joongheon"}],"container-title":"Proceedings of the 2022 IEEE 42nd international conference on distributed computing systems (ICDCS)","id":"Yun2022","issued":{"date-parts":[[2022]]},"page":"1332-1335","publisher":"IEEE","title":"Quantum multi-agent reinforcement learning via variational quantum circuit design","type":"paper-conference"}}],"isEdited":false,"manualOverride":{"citeprocText":"(Yun et al. 2022)","isManuallyOverridden":false,"manualOverrideText":""},"mendeley":{"formattedCitation":"(Yun et al. 2022)","plainTextFormattedCitation":"(Yun et al. 2022)","previouslyFormattedCitation":"(Yun et al. 2022)"},"properties":{"noteIndex":0},"schema":"https://github.com/citation-style-language/schema/raw/master/csl-citation.json"}</w:instrText>
       </w:r>
       <w:r>
         <w:fldChar w:fldCharType="separate"/>
@@ -11138,7 +11328,7 @@
         <w:fldChar w:fldCharType="begin"/>
       </w:r>
       <w:r>
-        <w:instrText xml:space="preserve">ADDIN CSL_CITATION {"citationID":"MENDELEY_CITATION_203","citationItems":[{"id":"ITEM-203","isTemporary":false,"itemData":{"DOI":"10.1109/TMECH.2010.2090896","author":[{"family":"Dong","given":"Daoyi"},{"family":"Chen","given":"Chunlin"},{"family":"Chu","given":"Jian"},{"family":"Tarn","given":"Tzyh-Jong"}],"container-title":"IEEE/ASME Transactions on Mechatronics","id":"Dong2012","issue":"1","issued":{"date-parts":[[2012]]},"page":"86-97","publisher":"IEEE","title":"Robust quantum-inspired reinforcement learning for robot navigation","type":"article-journal","volume":"17"},"suppress-author":false}],"isEdited":false,"manualOverride":{"citeprocText":"Dong et al. (2012)","isManuallyOverridden":false,"manualOverrideText":""},"mendeley":{"formattedCitation":"Dong et al. (2012)","plainTextFormattedCitation":"Dong et al. (2012)","previouslyFormattedCitation":"Dong et al. (2012)"},"properties":{"noteIndex":0},"schema":"https://github.com/citation-style-language/schema/raw/master/csl-citation.json"}</w:instrText>
+        <w:instrText xml:space="preserve">ADDIN CSL_CITATION {"citationID":"MENDELEY_CITATION_216","citationItems":[{"id":"ITEM-216","isTemporary":false,"itemData":{"DOI":"10.1109/TMECH.2010.2090896","author":[{"family":"Dong","given":"Daoyi"},{"family":"Chen","given":"Chunlin"},{"family":"Chu","given":"Jian"},{"family":"Tarn","given":"Tzyh-Jong"}],"container-title":"IEEE/ASME Transactions on Mechatronics","id":"Dong2012","issue":"1","issued":{"date-parts":[[2012]]},"page":"86-97","publisher":"IEEE","title":"Robust quantum-inspired reinforcement learning for robot navigation","type":"article-journal","volume":"17"},"suppress-author":false}],"isEdited":false,"manualOverride":{"citeprocText":"Dong et al. (2012)","isManuallyOverridden":false,"manualOverrideText":""},"mendeley":{"formattedCitation":"Dong et al. (2012)","plainTextFormattedCitation":"Dong et al. (2012)","previouslyFormattedCitation":"Dong et al. (2012)"},"properties":{"noteIndex":0},"schema":"https://github.com/citation-style-language/schema/raw/master/csl-citation.json"}</w:instrText>
       </w:r>
       <w:r>
         <w:fldChar w:fldCharType="separate"/>
@@ -11201,7 +11391,7 @@
         <w:fldChar w:fldCharType="begin"/>
       </w:r>
       <w:r>
-        <w:instrText xml:space="preserve">ADDIN CSL_CITATION {"citationID":"MENDELEY_CITATION_204","citationItems":[{"id":"ITEM-204","isTemporary":false,"itemData":{"DOI":"10.1109/ACCESS.2024.3417808","author":[{"family":"Hohenfeld","given":"Hans"},{"family":"Heimann","given":"Dirk"},{"family":"Wiebe","given":"Felix"},{"family":"Kirchner","given":"Frank"}],"container-title":"IEEE Access","id":"Hohenfeld2024","issued":{"date-parts":[[2024]]},"page":"87217-87236","publisher":"IEEE","title":"Quantum deep reinforcement learning for robot navigation tasks","type":"article-journal","volume":"12"},"suppress-author":false}],"isEdited":false,"manualOverride":{"citeprocText":"Hohenfeld et al. (2024)","isManuallyOverridden":false,"manualOverrideText":""},"mendeley":{"formattedCitation":"Hohenfeld et al. (2024)","plainTextFormattedCitation":"Hohenfeld et al. (2024)","previouslyFormattedCitation":"Hohenfeld et al. (2024)"},"properties":{"noteIndex":0},"schema":"https://github.com/citation-style-language/schema/raw/master/csl-citation.json"}</w:instrText>
+        <w:instrText xml:space="preserve">ADDIN CSL_CITATION {"citationID":"MENDELEY_CITATION_217","citationItems":[{"id":"ITEM-217","isTemporary":false,"itemData":{"DOI":"10.1109/ACCESS.2024.3417808","author":[{"family":"Hohenfeld","given":"Hans"},{"family":"Heimann","given":"Dirk"},{"family":"Wiebe","given":"Felix"},{"family":"Kirchner","given":"Frank"}],"container-title":"IEEE Access","id":"Hohenfeld2024","issued":{"date-parts":[[2024]]},"page":"87217-87236","publisher":"IEEE","title":"Quantum deep reinforcement learning for robot navigation tasks","type":"article-journal","volume":"12"},"suppress-author":false}],"isEdited":false,"manualOverride":{"citeprocText":"Hohenfeld et al. (2024)","isManuallyOverridden":false,"manualOverrideText":""},"mendeley":{"formattedCitation":"Hohenfeld et al. (2024)","plainTextFormattedCitation":"Hohenfeld et al. (2024)","previouslyFormattedCitation":"Hohenfeld et al. (2024)"},"properties":{"noteIndex":0},"schema":"https://github.com/citation-style-language/schema/raw/master/csl-citation.json"}</w:instrText>
       </w:r>
       <w:r>
         <w:fldChar w:fldCharType="separate"/>
@@ -11225,7 +11415,7 @@
         <w:fldChar w:fldCharType="begin"/>
       </w:r>
       <w:r>
-        <w:instrText xml:space="preserve">ADDIN CSL_CITATION {"citationID":"MENDELEY_CITATION_205","citationItems":[{"id":"ITEM-205","isTemporary":false,"itemData":{"DOI":"10.5220/0013371800003890","ISBN":"978-989-758-737-5","author":[{"family":"Drăgan","given":"Theodora-Augustina"},{"family":"Künzner","given":"Alexander"},{"family":"Wille","given":"Robert"},{"family":"Lorenz","given":"Jeanette Miriam"}],"container-title":"Proceedings of the 17th international conference on agents and artificial intelligence (ICAART 2025)","id":"Dragan2025","issued":{"date-parts":[[2025]]},"page":"807-814","publisher":"SciTePress","title":"Continuous quantum reinforcement learning for robot navigation","type":"paper-conference","volume":"1"},"suppress-author":false}],"isEdited":false,"manualOverride":{"citeprocText":"Drăgan et al. (2025)","isManuallyOverridden":false,"manualOverrideText":""},"mendeley":{"formattedCitation":"Drăgan et al. (2025)","plainTextFormattedCitation":"Drăgan et al. (2025)","previouslyFormattedCitation":"Drăgan et al. (2025)"},"properties":{"noteIndex":0},"schema":"https://github.com/citation-style-language/schema/raw/master/csl-citation.json"}</w:instrText>
+        <w:instrText xml:space="preserve">ADDIN CSL_CITATION {"citationID":"MENDELEY_CITATION_218","citationItems":[{"id":"ITEM-218","isTemporary":false,"itemData":{"DOI":"10.5220/0013371800003890","ISBN":"978-989-758-737-5","author":[{"family":"Drăgan","given":"Theodora-Augustina"},{"family":"Künzner","given":"Alexander"},{"family":"Wille","given":"Robert"},{"family":"Lorenz","given":"Jeanette Miriam"}],"container-title":"Proceedings of the 17th international conference on agents and artificial intelligence (ICAART 2025)","id":"Dragan2025","issued":{"date-parts":[[2025]]},"page":"807-814","publisher":"SciTePress","title":"Continuous quantum reinforcement learning for robot navigation","type":"paper-conference","volume":"1"},"suppress-author":false}],"isEdited":false,"manualOverride":{"citeprocText":"Drăgan et al. (2025)","isManuallyOverridden":false,"manualOverrideText":""},"mendeley":{"formattedCitation":"Drăgan et al. (2025)","plainTextFormattedCitation":"Drăgan et al. (2025)","previouslyFormattedCitation":"Drăgan et al. (2025)"},"properties":{"noteIndex":0},"schema":"https://github.com/citation-style-language/schema/raw/master/csl-citation.json"}</w:instrText>
       </w:r>
       <w:r>
         <w:fldChar w:fldCharType="separate"/>
@@ -11318,7 +11508,7 @@
         <w:fldChar w:fldCharType="begin"/>
       </w:r>
       <w:r>
-        <w:instrText xml:space="preserve">ADDIN CSL_CITATION {"citationID":"MENDELEY_CITATION_206","citationItems":[{"id":"ITEM-206","isTemporary":false,"itemData":{"DOI":"10.1007/s42484-024-00226-4","author":[{"family":"Sinha","given":"Akash"},{"family":"Macaluso","given":"Antonio"},{"family":"Klusch","given":"Matthias"}],"container-title":"Quantum Machine Intelligence","id":"Sinha2023","issued":{"date-parts":[[2025]]},"page":"19","publisher":"Springer","title":"Nav-Q: Quantum deep reinforcement learning for collision-free navigation of self-driving cars","title-short":"Nav-Q","type":"article-journal","volume":"7"},"suppress-author":false}],"isEdited":false,"manualOverride":{"citeprocText":"Sinha, Macaluso, and Klusch (2025)","isManuallyOverridden":false,"manualOverrideText":""},"mendeley":{"formattedCitation":"Sinha, Macaluso, and Klusch (2025)","plainTextFormattedCitation":"Sinha, Macaluso, and Klusch (2025)","previouslyFormattedCitation":"Sinha, Macaluso, and Klusch (2025)"},"properties":{"noteIndex":0},"schema":"https://github.com/citation-style-language/schema/raw/master/csl-citation.json"}</w:instrText>
+        <w:instrText xml:space="preserve">ADDIN CSL_CITATION {"citationID":"MENDELEY_CITATION_219","citationItems":[{"id":"ITEM-219","isTemporary":false,"itemData":{"DOI":"10.1007/s42484-024-00226-4","author":[{"family":"Sinha","given":"Akash"},{"family":"Macaluso","given":"Antonio"},{"family":"Klusch","given":"Matthias"}],"container-title":"Quantum Machine Intelligence","id":"Sinha2023","issued":{"date-parts":[[2025]]},"page":"19","publisher":"Springer","title":"Nav-Q: Quantum deep reinforcement learning for collision-free navigation of self-driving cars","title-short":"Nav-Q","type":"article-journal","volume":"7"},"suppress-author":false}],"isEdited":false,"manualOverride":{"citeprocText":"Sinha, Macaluso, and Klusch (2025)","isManuallyOverridden":false,"manualOverrideText":""},"mendeley":{"formattedCitation":"Sinha, Macaluso, and Klusch (2025)","plainTextFormattedCitation":"Sinha, Macaluso, and Klusch (2025)","previouslyFormattedCitation":"Sinha, Macaluso, and Klusch (2025)"},"properties":{"noteIndex":0},"schema":"https://github.com/citation-style-language/schema/raw/master/csl-citation.json"}</w:instrText>
       </w:r>
       <w:r>
         <w:fldChar w:fldCharType="separate"/>
@@ -11342,7 +11532,7 @@
         <w:fldChar w:fldCharType="begin"/>
       </w:r>
       <w:r>
-        <w:instrText xml:space="preserve">ADDIN CSL_CITATION {"citationID":"MENDELEY_CITATION_207","citationItems":[{"id":"ITEM-207","isTemporary":false,"itemData":{"URL":"https://arxiv.org/abs/2212.11681","author":[{"family":"Acuto","given":"Alberto"},{"family":"Barillà","given":"Paola"},{"family":"Bozzolo","given":"Ludovico"},{"family":"Conterno","given":"Matteo"},{"family":"Pavese","given":"Mattia"},{"family":"Policicchio","given":"Antonio"}],"id":"Acuto2022","issued":{"date-parts":[[2022]]},"title":"Variational quantum soft actor-critic for robotic arm control","type":""},"suppress-author":false}],"isEdited":false,"manualOverride":{"citeprocText":"Acuto et al. (2022)","isManuallyOverridden":false,"manualOverrideText":""},"mendeley":{"formattedCitation":"Acuto et al. (2022)","plainTextFormattedCitation":"Acuto et al. (2022)","previouslyFormattedCitation":"Acuto et al. (2022)"},"properties":{"noteIndex":0},"schema":"https://github.com/citation-style-language/schema/raw/master/csl-citation.json"}</w:instrText>
+        <w:instrText xml:space="preserve">ADDIN CSL_CITATION {"citationID":"MENDELEY_CITATION_220","citationItems":[{"id":"ITEM-220","isTemporary":false,"itemData":{"URL":"https://arxiv.org/abs/2212.11681","author":[{"family":"Acuto","given":"Alberto"},{"family":"Barillà","given":"Paola"},{"family":"Bozzolo","given":"Ludovico"},{"family":"Conterno","given":"Matteo"},{"family":"Pavese","given":"Mattia"},{"family":"Policicchio","given":"Antonio"}],"id":"Acuto2022","issued":{"date-parts":[[2022]]},"title":"Variational quantum soft actor-critic for robotic arm control","type":""},"suppress-author":false}],"isEdited":false,"manualOverride":{"citeprocText":"Acuto et al. (2022)","isManuallyOverridden":false,"manualOverrideText":""},"mendeley":{"formattedCitation":"Acuto et al. (2022)","plainTextFormattedCitation":"Acuto et al. (2022)","previouslyFormattedCitation":"Acuto et al. (2022)"},"properties":{"noteIndex":0},"schema":"https://github.com/citation-style-language/schema/raw/master/csl-citation.json"}</w:instrText>
       </w:r>
       <w:r>
         <w:fldChar w:fldCharType="separate"/>
@@ -11366,7 +11556,7 @@
         <w:fldChar w:fldCharType="begin"/>
       </w:r>
       <w:r>
-        <w:instrText xml:space="preserve">ADDIN CSL_CITATION {"citationID":"MENDELEY_CITATION_208","citationItems":[{"id":"ITEM-208","isTemporary":false,"itemData":{"DOI":"10.48550/arXiv.2509.11388","URL":"https://arxiv.org/abs/2509.11388","author":[{"family":"Lokossou","given":"Romerik"},{"family":"Girma","given":"Birhanu Shimelis"},{"family":"Tonguz","given":"Ozan K."},{"family":"Biyabani","given":"Ahmed"}],"id":"Lokossou2025","issued":{"date-parts":[[2025]]},"title":"Quantum deep reinforcement learning for humanoid robot navigation task","type":""},"suppress-author":false}],"isEdited":false,"manualOverride":{"citeprocText":"Lokossou et al. (2025)","isManuallyOverridden":false,"manualOverrideText":""},"mendeley":{"formattedCitation":"Lokossou et al. (2025)","plainTextFormattedCitation":"Lokossou et al. (2025)","previouslyFormattedCitation":"Lokossou et al. (2025)"},"properties":{"noteIndex":0},"schema":"https://github.com/citation-style-language/schema/raw/master/csl-citation.json"}</w:instrText>
+        <w:instrText xml:space="preserve">ADDIN CSL_CITATION {"citationID":"MENDELEY_CITATION_221","citationItems":[{"id":"ITEM-221","isTemporary":false,"itemData":{"DOI":"10.48550/arXiv.2509.11388","URL":"https://arxiv.org/abs/2509.11388","author":[{"family":"Lokossou","given":"Romerik"},{"family":"Girma","given":"Birhanu Shimelis"},{"family":"Tonguz","given":"Ozan K."},{"family":"Biyabani","given":"Ahmed"}],"id":"Lokossou2025","issued":{"date-parts":[[2025]]},"title":"Quantum deep reinforcement learning for humanoid robot navigation task","type":""},"suppress-author":false}],"isEdited":false,"manualOverride":{"citeprocText":"Lokossou et al. (2025)","isManuallyOverridden":false,"manualOverrideText":""},"mendeley":{"formattedCitation":"Lokossou et al. (2025)","plainTextFormattedCitation":"Lokossou et al. (2025)","previouslyFormattedCitation":"Lokossou et al. (2025)"},"properties":{"noteIndex":0},"schema":"https://github.com/citation-style-language/schema/raw/master/csl-citation.json"}</w:instrText>
       </w:r>
       <w:r>
         <w:fldChar w:fldCharType="separate"/>
@@ -11411,7 +11601,7 @@
         <w:fldChar w:fldCharType="begin"/>
       </w:r>
       <w:r>
-        <w:instrText xml:space="preserve">ADDIN CSL_CITATION {"citationID":"MENDELEY_CITATION_209","citationItems":[{"id":"ITEM-209","isTemporary":false,"itemData":{"author":[{"family":"Park","given":"Chanyoung"},{"family":"Yun","given":"Won Joon"},{"family":"Kim","given":"Jae Pyoung"},{"family":"Rodrigues","given":"Tiago Koketsu"},{"family":"Park","given":"Soohyun"},{"family":"Jung","given":"Soyi"},{"family":"Kim","given":"Joongheon"}],"container-title":"IEEE Internet of Things Journal","id":"Park2023","issue":"22","issued":{"date-parts":[[2023]]},"page":"20033-20048","title":"Quantum multi-agent actor-critic networks for cooperative mobile access in multi-UAV systems","type":"article-journal","volume":"10"},"suppress-author":false}],"isEdited":false,"manualOverride":{"citeprocText":"C. Park et al. (2023)","isManuallyOverridden":false,"manualOverrideText":""},"mendeley":{"formattedCitation":"C. Park et al. (2023)","plainTextFormattedCitation":"C. Park et al. (2023)","previouslyFormattedCitation":"C. Park et al. (2023)"},"properties":{"noteIndex":0},"schema":"https://github.com/citation-style-language/schema/raw/master/csl-citation.json"}</w:instrText>
+        <w:instrText xml:space="preserve">ADDIN CSL_CITATION {"citationID":"MENDELEY_CITATION_222","citationItems":[{"id":"ITEM-222","isTemporary":false,"itemData":{"author":[{"family":"Park","given":"Chanyoung"},{"family":"Yun","given":"Won Joon"},{"family":"Kim","given":"Jae Pyoung"},{"family":"Rodrigues","given":"Tiago Koketsu"},{"family":"Park","given":"Soohyun"},{"family":"Jung","given":"Soyi"},{"family":"Kim","given":"Joongheon"}],"container-title":"IEEE Internet of Things Journal","id":"Park2023","issue":"22","issued":{"date-parts":[[2023]]},"page":"20033-20048","title":"Quantum multi-agent actor-critic networks for cooperative mobile access in multi-UAV systems","type":"article-journal","volume":"10"},"suppress-author":false}],"isEdited":false,"manualOverride":{"citeprocText":"C. Park et al. (2023)","isManuallyOverridden":false,"manualOverrideText":""},"mendeley":{"formattedCitation":"C. Park et al. (2023)","plainTextFormattedCitation":"C. Park et al. (2023)","previouslyFormattedCitation":"C. Park et al. (2023)"},"properties":{"noteIndex":0},"schema":"https://github.com/citation-style-language/schema/raw/master/csl-citation.json"}</w:instrText>
       </w:r>
       <w:r>
         <w:fldChar w:fldCharType="separate"/>
@@ -11435,7 +11625,7 @@
         <w:fldChar w:fldCharType="begin"/>
       </w:r>
       <w:r>
-        <w:instrText xml:space="preserve">ADDIN CSL_CITATION {"citationID":"MENDELEY_CITATION_210","citationItems":[{"id":"ITEM-210","isTemporary":false,"itemData":{"author":[{"family":"Park","given":"Soohyun"},{"family":"Kim","given":"Jae Pyoung"},{"family":"Park","given":"Chanyoung"},{"family":"Jung","given":"Soyi"},{"family":"Kim","given":"Joongheon"}],"container-title":"IEEE Communications Magazine","id":"Park2024","issue":"6","issued":{"date-parts":[[2024]]},"page":"106-112","title":"Quantum multi-agent reinforcement learning for autonomous mobility cooperation","type":"article-journal","volume":"62"},"suppress-author":false}],"isEdited":false,"manualOverride":{"citeprocText":"S. Park et al. (2024)","isManuallyOverridden":false,"manualOverrideText":""},"mendeley":{"formattedCitation":"S. Park et al. (2024)","plainTextFormattedCitation":"S. Park et al. (2024)","previouslyFormattedCitation":"S. Park et al. (2024)"},"properties":{"noteIndex":0},"schema":"https://github.com/citation-style-language/schema/raw/master/csl-citation.json"}</w:instrText>
+        <w:instrText xml:space="preserve">ADDIN CSL_CITATION {"citationID":"MENDELEY_CITATION_223","citationItems":[{"id":"ITEM-223","isTemporary":false,"itemData":{"author":[{"family":"Park","given":"Soohyun"},{"family":"Kim","given":"Jae Pyoung"},{"family":"Park","given":"Chanyoung"},{"family":"Jung","given":"Soyi"},{"family":"Kim","given":"Joongheon"}],"container-title":"IEEE Communications Magazine","id":"Park2024","issue":"6","issued":{"date-parts":[[2024]]},"page":"106-112","title":"Quantum multi-agent reinforcement learning for autonomous mobility cooperation","type":"article-journal","volume":"62"},"suppress-author":false}],"isEdited":false,"manualOverride":{"citeprocText":"S. Park et al. (2024)","isManuallyOverridden":false,"manualOverrideText":""},"mendeley":{"formattedCitation":"S. Park et al. (2024)","plainTextFormattedCitation":"S. Park et al. (2024)","previouslyFormattedCitation":"S. Park et al. (2024)"},"properties":{"noteIndex":0},"schema":"https://github.com/citation-style-language/schema/raw/master/csl-citation.json"}</w:instrText>
       </w:r>
       <w:r>
         <w:fldChar w:fldCharType="separate"/>
@@ -11486,7 +11676,7 @@
         <w:fldChar w:fldCharType="begin"/>
       </w:r>
       <w:r>
-        <w:instrText xml:space="preserve">ADDIN CSL_CITATION {"citationID":"MENDELEY_CITATION_211","citationItems":[{"id":"ITEM-211","isTemporary":false,"itemData":{"URL":"https://arxiv.org/abs/2508.01690","author":[{"family":"Sun","given":"Yize"},{"family":"Hagog","given":"Mohamad"},{"family":"Weber","given":"Marc"},{"family":"Hein","given":"Daniel"},{"family":"Udluft","given":"Steffen"},{"family":"Tresp","given":"Volker"},{"family":"Ma","given":"Yunpu"}],"id":"Sun2025","issued":{"date-parts":[[2025]]},"note":"QML@QCE 2025 workshop","title":"First experience with real-time control using simulated VQC-based quantum policies","type":""},"suppress-author":false}],"isEdited":false,"manualOverride":{"citeprocText":"Sun et al. (2025)","isManuallyOverridden":false,"manualOverrideText":""},"mendeley":{"formattedCitation":"Sun et al. (2025)","plainTextFormattedCitation":"Sun et al. (2025)","previouslyFormattedCitation":"Sun et al. (2025)"},"properties":{"noteIndex":0},"schema":"https://github.com/citation-style-language/schema/raw/master/csl-citation.json"}</w:instrText>
+        <w:instrText xml:space="preserve">ADDIN CSL_CITATION {"citationID":"MENDELEY_CITATION_224","citationItems":[{"id":"ITEM-224","isTemporary":false,"itemData":{"URL":"https://arxiv.org/abs/2508.01690","author":[{"family":"Sun","given":"Yize"},{"family":"Hagog","given":"Mohamad"},{"family":"Weber","given":"Marc"},{"family":"Hein","given":"Daniel"},{"family":"Udluft","given":"Steffen"},{"family":"Tresp","given":"Volker"},{"family":"Ma","given":"Yunpu"}],"id":"Sun2025","issued":{"date-parts":[[2025]]},"note":"QML@QCE 2025 workshop","title":"First experience with real-time control using simulated VQC-based quantum policies","type":""},"suppress-author":false}],"isEdited":false,"manualOverride":{"citeprocText":"Sun et al. (2025)","isManuallyOverridden":false,"manualOverrideText":""},"mendeley":{"formattedCitation":"Sun et al. (2025)","plainTextFormattedCitation":"Sun et al. (2025)","previouslyFormattedCitation":"Sun et al. (2025)"},"properties":{"noteIndex":0},"schema":"https://github.com/citation-style-language/schema/raw/master/csl-citation.json"}</w:instrText>
       </w:r>
       <w:r>
         <w:fldChar w:fldCharType="separate"/>
@@ -11510,7 +11700,7 @@
         <w:fldChar w:fldCharType="begin"/>
       </w:r>
       <w:r>
-        <w:instrText xml:space="preserve">ADDIN CSL_CITATION {"citationID":"MENDELEY_CITATION_212","citationItems":[{"id":"ITEM-212","isTemporary":false,"itemData":{"URL":"https://arxiv.org/abs/2605.01716","author":[{"family":"Ngo","given":"Nguyen Truong Thu"},{"family":"Mehtola","given":"Väinö"},{"family":"Lenssen","given":"Jérome"},{"family":"Wang","given":"Peiyong"},{"family":"Cosco","given":"Francesco"},{"family":"Lu","given":"Tien-Fu"},{"family":"Quach","given":"James Q."}],"id":"Ngo2026","issued":{"date-parts":[[2026]]},"title":"Towards real-time control of a CartPole system on a quantum computer","type":""},"suppress-author":false}],"isEdited":false,"manualOverride":{"citeprocText":"Ngo et al. (2026)","isManuallyOverridden":false,"manualOverrideText":""},"mendeley":{"formattedCitation":"Ngo et al. (2026)","plainTextFormattedCitation":"Ngo et al. (2026)","previouslyFormattedCitation":"Ngo et al. (2026)"},"properties":{"noteIndex":0},"schema":"https://github.com/citation-style-language/schema/raw/master/csl-citation.json"}</w:instrText>
+        <w:instrText xml:space="preserve">ADDIN CSL_CITATION {"citationID":"MENDELEY_CITATION_225","citationItems":[{"id":"ITEM-225","isTemporary":false,"itemData":{"URL":"https://arxiv.org/abs/2605.01716","author":[{"family":"Ngo","given":"Nguyen Truong Thu"},{"family":"Mehtola","given":"Väinö"},{"family":"Lenssen","given":"Jérome"},{"family":"Wang","given":"Peiyong"},{"family":"Cosco","given":"Francesco"},{"family":"Lu","given":"Tien-Fu"},{"family":"Quach","given":"James Q."}],"id":"Ngo2026","issued":{"date-parts":[[2026]]},"title":"Towards real-time control of a CartPole system on a quantum computer","type":""},"suppress-author":false}],"isEdited":false,"manualOverride":{"citeprocText":"Ngo et al. (2026)","isManuallyOverridden":false,"manualOverrideText":""},"mendeley":{"formattedCitation":"Ngo et al. (2026)","plainTextFormattedCitation":"Ngo et al. (2026)","previouslyFormattedCitation":"Ngo et al. (2026)"},"properties":{"noteIndex":0},"schema":"https://github.com/citation-style-language/schema/raw/master/csl-citation.json"}</w:instrText>
       </w:r>
       <w:r>
         <w:fldChar w:fldCharType="separate"/>
@@ -11555,7 +11745,7 @@
         <w:fldChar w:fldCharType="begin"/>
       </w:r>
       <w:r>
-        <w:instrText xml:space="preserve">ADDIN CSL_CITATION {"citationID":"MENDELEY_CITATION_213","citationItems":[{"id":"ITEM-213","isTemporary":false,"itemData":{"URL":"https://arxiv.org/abs/2605.20801","author":[{"family":"Altrabulsi","given":"Mohamed Khair"},{"family":"Innan","given":"Nouhaila"},{"family":"Marchisio","given":"Alberto"},{"family":"Kashif","given":"Muhammad"},{"family":"Shafique","given":"Muhammad"}],"id":"Altrabulsi2026","issued":{"date-parts":[[2026]]},"title":"Q-SpiRL: Quantum spiking reinforcement learning for adaptive robot navigation","title-short":"Q-SpiRL","type":""},"suppress-author":false}],"isEdited":false,"manualOverride":{"citeprocText":"Altrabulsi et al. (2026)","isManuallyOverridden":false,"manualOverrideText":""},"mendeley":{"formattedCitation":"Altrabulsi et al. (2026)","plainTextFormattedCitation":"Altrabulsi et al. (2026)","previouslyFormattedCitation":"Altrabulsi et al. (2026)"},"properties":{"noteIndex":0},"schema":"https://github.com/citation-style-language/schema/raw/master/csl-citation.json"}</w:instrText>
+        <w:instrText xml:space="preserve">ADDIN CSL_CITATION {"citationID":"MENDELEY_CITATION_226","citationItems":[{"id":"ITEM-226","isTemporary":false,"itemData":{"URL":"https://arxiv.org/abs/2605.20801","author":[{"family":"Altrabulsi","given":"Mohamed Khair"},{"family":"Innan","given":"Nouhaila"},{"family":"Marchisio","given":"Alberto"},{"family":"Kashif","given":"Muhammad"},{"family":"Shafique","given":"Muhammad"}],"id":"Altrabulsi2026","issued":{"date-parts":[[2026]]},"title":"Q-SpiRL: Quantum spiking reinforcement learning for adaptive robot navigation","title-short":"Q-SpiRL","type":""},"suppress-author":false}],"isEdited":false,"manualOverride":{"citeprocText":"Altrabulsi et al. (2026)","isManuallyOverridden":false,"manualOverrideText":""},"mendeley":{"formattedCitation":"Altrabulsi et al. (2026)","plainTextFormattedCitation":"Altrabulsi et al. (2026)","previouslyFormattedCitation":"Altrabulsi et al. (2026)"},"properties":{"noteIndex":0},"schema":"https://github.com/citation-style-language/schema/raw/master/csl-citation.json"}</w:instrText>
       </w:r>
       <w:r>
         <w:fldChar w:fldCharType="separate"/>
@@ -11602,7 +11792,7 @@
         <w:fldChar w:fldCharType="begin"/>
       </w:r>
       <w:r>
-        <w:instrText xml:space="preserve">ADDIN CSL_CITATION {"citationID":"MENDELEY_CITATION_214","citationItems":[{"id":"ITEM-214","isTemporary":false,"itemData":{"DOI":"10.1007/s42044-025-00306-z","author":[{"family":"Taghavi","given":"Mazyar"},{"family":"Farnoosh","given":"Rahman"}],"container-title":"Iran Journal of Computer Science","id":"Taghavi2025","issue":"4","issued":{"date-parts":[[2025]]},"page":"2139-2155","publisher":"Springer","title":"Quantum computing and neuromorphic computing for safe, reliable, and explainable multi-agent reinforcement learning: Optimal control in autonomous robotics","title-short":"Quantum computing and neuromorphic computing for safe, reliable, and explainable multi-agent reinforcement learning","type":"article-journal","volume":"8"},"suppress-author":false}],"isEdited":false,"manualOverride":{"citeprocText":"Taghavi and Farnoosh (2025)","isManuallyOverridden":false,"manualOverrideText":""},"mendeley":{"formattedCitation":"Taghavi and Farnoosh (2025)","plainTextFormattedCitation":"Taghavi and Farnoosh (2025)","previouslyFormattedCitation":"Taghavi and Farnoosh (2025)"},"properties":{"noteIndex":0},"schema":"https://github.com/citation-style-language/schema/raw/master/csl-citation.json"}</w:instrText>
+        <w:instrText xml:space="preserve">ADDIN CSL_CITATION {"citationID":"MENDELEY_CITATION_227","citationItems":[{"id":"ITEM-227","isTemporary":false,"itemData":{"DOI":"10.1007/s42044-025-00306-z","author":[{"family":"Taghavi","given":"Mazyar"},{"family":"Farnoosh","given":"Rahman"}],"container-title":"Iran Journal of Computer Science","id":"Taghavi2025","issue":"4","issued":{"date-parts":[[2025]]},"page":"2139-2155","publisher":"Springer","title":"Quantum computing and neuromorphic computing for safe, reliable, and explainable multi-agent reinforcement learning: Optimal control in autonomous robotics","title-short":"Quantum computing and neuromorphic computing for safe, reliable, and explainable multi-agent reinforcement learning","type":"article-journal","volume":"8"},"suppress-author":false}],"isEdited":false,"manualOverride":{"citeprocText":"Taghavi and Farnoosh (2025)","isManuallyOverridden":false,"manualOverrideText":""},"mendeley":{"formattedCitation":"Taghavi and Farnoosh (2025)","plainTextFormattedCitation":"Taghavi and Farnoosh (2025)","previouslyFormattedCitation":"Taghavi and Farnoosh (2025)"},"properties":{"noteIndex":0},"schema":"https://github.com/citation-style-language/schema/raw/master/csl-citation.json"}</w:instrText>
       </w:r>
       <w:r>
         <w:fldChar w:fldCharType="separate"/>
@@ -11664,7 +11854,7 @@
         <w:fldChar w:fldCharType="begin"/>
       </w:r>
       <w:r>
-        <w:instrText xml:space="preserve">ADDIN CSL_CITATION {"citationID":"MENDELEY_CITATION_218","citationItems":[{"id":"ITEM-215","isTemporary":false,"itemData":{"DOI":"10.1109/ACCESS.2024.3417808","author":[{"family":"Hohenfeld","given":"Hans"},{"family":"Heimann","given":"Dirk"},{"family":"Wiebe","given":"Felix"},{"family":"Kirchner","given":"Frank"}],"container-title":"IEEE Access","id":"Hohenfeld2024","issued":{"date-parts":[[2024]]},"page":"87217-87236","publisher":"IEEE","title":"Quantum deep reinforcement learning for robot navigation tasks","type":"article-journal","volume":"12"}},{"id":"ITEM-216","isTemporary":false,"itemData":{"URL":"https://arxiv.org/abs/2212.11681","author":[{"family":"Acuto","given":"Alberto"},{"family":"Barillà","given":"Paola"},{"family":"Bozzolo","given":"Ludovico"},{"family":"Conterno","given":"Matteo"},{"family":"Pavese","given":"Mattia"},{"family":"Policicchio","given":"Antonio"}],"id":"Acuto2022","issued":{"date-parts":[[2022]]},"title":"Variational quantum soft actor-critic for robotic arm control","type":""}},{"id":"ITEM-217","isTemporary":false,"itemData":{"DOI":"10.5220/0013371800003890","ISBN":"978-989-758-737-5","author":[{"family":"Drăgan","given":"Theodora-Augustina"},{"family":"Künzner","given":"Alexander"},{"family":"Wille","given":"Robert"},{"family":"Lorenz","given":"Jeanette Miriam"}],"container-title":"Proceedings of the 17th international conference on agents and artificial intelligence (ICAART 2025)","id":"Dragan2025","issued":{"date-parts":[[2025]]},"page":"807-814","publisher":"SciTePress","title":"Continuous quantum reinforcement learning for robot navigation","type":"paper-conference","volume":"1"}},{"id":"ITEM-218","isTemporary":false,"itemData":{"DOI":"10.48550/arXiv.2509.11388","URL":"https://arxiv.org/abs/2509.11388","author":[{"family":"Lokossou","given":"Romerik"},{"family":"Girma","given":"Birhanu Shimelis"},{"family":"Tonguz","given":"Ozan K."},{"family":"Biyabani","given":"Ahmed"}],"id":"Lokossou2025","issued":{"date-parts":[[2025]]},"title":"Quantum deep reinforcement learning for humanoid robot navigation task","type":""}}],"isEdited":false,"manualOverride":{"citeprocText":"(Hohenfeld et al. 2024; Acuto et al. 2022; Drăgan et al. 2025; Lokossou et al. 2025)","isManuallyOverridden":false,"manualOverrideText":""},"mendeley":{"formattedCitation":"(Hohenfeld et al. 2024; Acuto et al. 2022; Drăgan et al. 2025; Lokossou et al. 2025)","plainTextFormattedCitation":"(Hohenfeld et al. 2024; Acuto et al. 2022; Drăgan et al. 2025; Lokossou et al. 2025)","previouslyFormattedCitation":"(Hohenfeld et al. 2024; Acuto et al. 2022; Drăgan et al. 2025; Lokossou et al. 2025)"},"properties":{"noteIndex":0},"schema":"https://github.com/citation-style-language/schema/raw/master/csl-citation.json"}</w:instrText>
+        <w:instrText xml:space="preserve">ADDIN CSL_CITATION {"citationID":"MENDELEY_CITATION_231","citationItems":[{"id":"ITEM-228","isTemporary":false,"itemData":{"DOI":"10.1109/ACCESS.2024.3417808","author":[{"family":"Hohenfeld","given":"Hans"},{"family":"Heimann","given":"Dirk"},{"family":"Wiebe","given":"Felix"},{"family":"Kirchner","given":"Frank"}],"container-title":"IEEE Access","id":"Hohenfeld2024","issued":{"date-parts":[[2024]]},"page":"87217-87236","publisher":"IEEE","title":"Quantum deep reinforcement learning for robot navigation tasks","type":"article-journal","volume":"12"}},{"id":"ITEM-229","isTemporary":false,"itemData":{"URL":"https://arxiv.org/abs/2212.11681","author":[{"family":"Acuto","given":"Alberto"},{"family":"Barillà","given":"Paola"},{"family":"Bozzolo","given":"Ludovico"},{"family":"Conterno","given":"Matteo"},{"family":"Pavese","given":"Mattia"},{"family":"Policicchio","given":"Antonio"}],"id":"Acuto2022","issued":{"date-parts":[[2022]]},"title":"Variational quantum soft actor-critic for robotic arm control","type":""}},{"id":"ITEM-230","isTemporary":false,"itemData":{"DOI":"10.5220/0013371800003890","ISBN":"978-989-758-737-5","author":[{"family":"Drăgan","given":"Theodora-Augustina"},{"family":"Künzner","given":"Alexander"},{"family":"Wille","given":"Robert"},{"family":"Lorenz","given":"Jeanette Miriam"}],"container-title":"Proceedings of the 17th international conference on agents and artificial intelligence (ICAART 2025)","id":"Dragan2025","issued":{"date-parts":[[2025]]},"page":"807-814","publisher":"SciTePress","title":"Continuous quantum reinforcement learning for robot navigation","type":"paper-conference","volume":"1"}},{"id":"ITEM-231","isTemporary":false,"itemData":{"DOI":"10.48550/arXiv.2509.11388","URL":"https://arxiv.org/abs/2509.11388","author":[{"family":"Lokossou","given":"Romerik"},{"family":"Girma","given":"Birhanu Shimelis"},{"family":"Tonguz","given":"Ozan K."},{"family":"Biyabani","given":"Ahmed"}],"id":"Lokossou2025","issued":{"date-parts":[[2025]]},"title":"Quantum deep reinforcement learning for humanoid robot navigation task","type":""}}],"isEdited":false,"manualOverride":{"citeprocText":"(Hohenfeld et al. 2024; Acuto et al. 2022; Drăgan et al. 2025; Lokossou et al. 2025)","isManuallyOverridden":false,"manualOverrideText":""},"mendeley":{"formattedCitation":"(Hohenfeld et al. 2024; Acuto et al. 2022; Drăgan et al. 2025; Lokossou et al. 2025)","plainTextFormattedCitation":"(Hohenfeld et al. 2024; Acuto et al. 2022; Drăgan et al. 2025; Lokossou et al. 2025)","previouslyFormattedCitation":"(Hohenfeld et al. 2024; Acuto et al. 2022; Drăgan et al. 2025; Lokossou et al. 2025)"},"properties":{"noteIndex":0},"schema":"https://github.com/citation-style-language/schema/raw/master/csl-citation.json"}</w:instrText>
       </w:r>
       <w:r>
         <w:fldChar w:fldCharType="separate"/>
@@ -11682,7 +11872,7 @@
         <w:fldChar w:fldCharType="begin"/>
       </w:r>
       <w:r>
-        <w:instrText xml:space="preserve">ADDIN CSL_CITATION {"citationID":"MENDELEY_CITATION_219","citationItems":[{"id":"ITEM-219","isTemporary":false,"itemData":{"DOI":"10.1007/s42484-024-00226-4","author":[{"family":"Sinha","given":"Akash"},{"family":"Macaluso","given":"Antonio"},{"family":"Klusch","given":"Matthias"}],"container-title":"Quantum Machine Intelligence","id":"Sinha2023","issued":{"date-parts":[[2025]]},"page":"19","publisher":"Springer","title":"Nav-Q: Quantum deep reinforcement learning for collision-free navigation of self-driving cars","title-short":"Nav-Q","type":"article-journal","volume":"7"}}],"isEdited":false,"manualOverride":{"citeprocText":"(Sinha, Macaluso, and Klusch 2025)","isManuallyOverridden":false,"manualOverrideText":""},"mendeley":{"formattedCitation":"(Sinha, Macaluso, and Klusch 2025)","plainTextFormattedCitation":"(Sinha, Macaluso, and Klusch 2025)","previouslyFormattedCitation":"(Sinha, Macaluso, and Klusch 2025)"},"properties":{"noteIndex":0},"schema":"https://github.com/citation-style-language/schema/raw/master/csl-citation.json"}</w:instrText>
+        <w:instrText xml:space="preserve">ADDIN CSL_CITATION {"citationID":"MENDELEY_CITATION_232","citationItems":[{"id":"ITEM-232","isTemporary":false,"itemData":{"DOI":"10.1007/s42484-024-00226-4","author":[{"family":"Sinha","given":"Akash"},{"family":"Macaluso","given":"Antonio"},{"family":"Klusch","given":"Matthias"}],"container-title":"Quantum Machine Intelligence","id":"Sinha2023","issued":{"date-parts":[[2025]]},"page":"19","publisher":"Springer","title":"Nav-Q: Quantum deep reinforcement learning for collision-free navigation of self-driving cars","title-short":"Nav-Q","type":"article-journal","volume":"7"}}],"isEdited":false,"manualOverride":{"citeprocText":"(Sinha, Macaluso, and Klusch 2025)","isManuallyOverridden":false,"manualOverrideText":""},"mendeley":{"formattedCitation":"(Sinha, Macaluso, and Klusch 2025)","plainTextFormattedCitation":"(Sinha, Macaluso, and Klusch 2025)","previouslyFormattedCitation":"(Sinha, Macaluso, and Klusch 2025)"},"properties":{"noteIndex":0},"schema":"https://github.com/citation-style-language/schema/raw/master/csl-citation.json"}</w:instrText>
       </w:r>
       <w:r>
         <w:fldChar w:fldCharType="separate"/>
@@ -11700,7 +11890,7 @@
         <w:fldChar w:fldCharType="begin"/>
       </w:r>
       <w:r>
-        <w:instrText xml:space="preserve">ADDIN CSL_CITATION {"citationID":"MENDELEY_CITATION_221","citationItems":[{"id":"ITEM-220","isTemporary":false,"itemData":{"DOI":"10.1109/ACCESS.2024.3417808","author":[{"family":"Hohenfeld","given":"Hans"},{"family":"Heimann","given":"Dirk"},{"family":"Wiebe","given":"Felix"},{"family":"Kirchner","given":"Frank"}],"container-title":"IEEE Access","id":"Hohenfeld2024","issued":{"date-parts":[[2024]]},"page":"87217-87236","publisher":"IEEE","title":"Quantum deep reinforcement learning for robot navigation tasks","type":"article-journal","volume":"12"}},{"id":"ITEM-221","isTemporary":false,"itemData":{"DOI":"10.5220/0013371800003890","ISBN":"978-989-758-737-5","author":[{"family":"Drăgan","given":"Theodora-Augustina"},{"family":"Künzner","given":"Alexander"},{"family":"Wille","given":"Robert"},{"family":"Lorenz","given":"Jeanette Miriam"}],"container-title":"Proceedings of the 17th international conference on agents and artificial intelligence (ICAART 2025)","id":"Dragan2025","issued":{"date-parts":[[2025]]},"page":"807-814","publisher":"SciTePress","title":"Continuous quantum reinforcement learning for robot navigation","type":"paper-conference","volume":"1"}}],"isEdited":false,"manualOverride":{"citeprocText":"(Hohenfeld et al. 2024; Drăgan et al. 2025)","isManuallyOverridden":false,"manualOverrideText":""},"mendeley":{"formattedCitation":"(Hohenfeld et al. 2024; Drăgan et al. 2025)","plainTextFormattedCitation":"(Hohenfeld et al. 2024; Drăgan et al. 2025)","previouslyFormattedCitation":"(Hohenfeld et al. 2024; Drăgan et al. 2025)"},"properties":{"noteIndex":0},"schema":"https://github.com/citation-style-language/schema/raw/master/csl-citation.json"}</w:instrText>
+        <w:instrText xml:space="preserve">ADDIN CSL_CITATION {"citationID":"MENDELEY_CITATION_234","citationItems":[{"id":"ITEM-233","isTemporary":false,"itemData":{"DOI":"10.1109/ACCESS.2024.3417808","author":[{"family":"Hohenfeld","given":"Hans"},{"family":"Heimann","given":"Dirk"},{"family":"Wiebe","given":"Felix"},{"family":"Kirchner","given":"Frank"}],"container-title":"IEEE Access","id":"Hohenfeld2024","issued":{"date-parts":[[2024]]},"page":"87217-87236","publisher":"IEEE","title":"Quantum deep reinforcement learning for robot navigation tasks","type":"article-journal","volume":"12"}},{"id":"ITEM-234","isTemporary":false,"itemData":{"DOI":"10.5220/0013371800003890","ISBN":"978-989-758-737-5","author":[{"family":"Drăgan","given":"Theodora-Augustina"},{"family":"Künzner","given":"Alexander"},{"family":"Wille","given":"Robert"},{"family":"Lorenz","given":"Jeanette Miriam"}],"container-title":"Proceedings of the 17th international conference on agents and artificial intelligence (ICAART 2025)","id":"Dragan2025","issued":{"date-parts":[[2025]]},"page":"807-814","publisher":"SciTePress","title":"Continuous quantum reinforcement learning for robot navigation","type":"paper-conference","volume":"1"}}],"isEdited":false,"manualOverride":{"citeprocText":"(Hohenfeld et al. 2024; Drăgan et al. 2025)","isManuallyOverridden":false,"manualOverrideText":""},"mendeley":{"formattedCitation":"(Hohenfeld et al. 2024; Drăgan et al. 2025)","plainTextFormattedCitation":"(Hohenfeld et al. 2024; Drăgan et al. 2025)","previouslyFormattedCitation":"(Hohenfeld et al. 2024; Drăgan et al. 2025)"},"properties":{"noteIndex":0},"schema":"https://github.com/citation-style-language/schema/raw/master/csl-citation.json"}</w:instrText>
       </w:r>
       <w:r>
         <w:fldChar w:fldCharType="separate"/>
@@ -11718,7 +11908,7 @@
         <w:fldChar w:fldCharType="begin"/>
       </w:r>
       <w:r>
-        <w:instrText xml:space="preserve">ADDIN CSL_CITATION {"citationID":"MENDELEY_CITATION_222","citationItems":[{"id":"ITEM-222","isTemporary":false,"itemData":{"URL":"https://proceedings.neurips.cc/paper/2021/hash/eec96a7f788e88184c0e713456026f3f-Abstract.html","author":[{"family":"Jerbi","given":"Sofiene"},{"family":"Gyurik","given":"Casper F. S."},{"family":"Marshall","given":"Simon C."},{"family":"Briegel","given":"Hans J."},{"family":"Dunjko","given":"Vedran"}],"container-title":"Advances in neural information processing systems","id":"Jerbi2021","issued":{"date-parts":[[2021]]},"page":"28362-28375","title":"Parametrized quantum policies for reinforcement learning","type":"paper-conference","volume":"34"}}],"isEdited":false,"manualOverride":{"citeprocText":"(Jerbi et al. 2021)","isManuallyOverridden":false,"manualOverrideText":""},"mendeley":{"formattedCitation":"(Jerbi et al. 2021)","plainTextFormattedCitation":"(Jerbi et al. 2021)","previouslyFormattedCitation":"(Jerbi et al. 2021)"},"properties":{"noteIndex":0},"schema":"https://github.com/citation-style-language/schema/raw/master/csl-citation.json"}</w:instrText>
+        <w:instrText xml:space="preserve">ADDIN CSL_CITATION {"citationID":"MENDELEY_CITATION_235","citationItems":[{"id":"ITEM-235","isTemporary":false,"itemData":{"URL":"https://proceedings.neurips.cc/paper/2021/hash/eec96a7f788e88184c0e713456026f3f-Abstract.html","author":[{"family":"Jerbi","given":"Sofiene"},{"family":"Gyurik","given":"Casper F. S."},{"family":"Marshall","given":"Simon C."},{"family":"Briegel","given":"Hans J."},{"family":"Dunjko","given":"Vedran"}],"container-title":"Advances in neural information processing systems","id":"Jerbi2021","issued":{"date-parts":[[2021]]},"page":"28362-28375","title":"Parametrized quantum policies for reinforcement learning","type":"paper-conference","volume":"34"}}],"isEdited":false,"manualOverride":{"citeprocText":"(Jerbi et al. 2021)","isManuallyOverridden":false,"manualOverrideText":""},"mendeley":{"formattedCitation":"(Jerbi et al. 2021)","plainTextFormattedCitation":"(Jerbi et al. 2021)","previouslyFormattedCitation":"(Jerbi et al. 2021)"},"properties":{"noteIndex":0},"schema":"https://github.com/citation-style-language/schema/raw/master/csl-citation.json"}</w:instrText>
       </w:r>
       <w:r>
         <w:fldChar w:fldCharType="separate"/>
@@ -11762,7 +11952,7 @@
         <w:fldChar w:fldCharType="begin"/>
       </w:r>
       <w:r>
-        <w:instrText xml:space="preserve">ADDIN CSL_CITATION {"citationID":"MENDELEY_CITATION_224","citationItems":[{"id":"ITEM-223","isTemporary":false,"itemData":{"DOI":"10.1038/s41586-019-0980-2","author":[{"family":"Havlíček","given":"Vojtěch"},{"family":"Córcoles","given":"Antonio D."},{"family":"Temme","given":"Kristan"},{"family":"Harrow","given":"Aram W."},{"family":"Kandala","given":"Abhinav"},{"family":"Chow","given":"Jerry M."},{"family":"Gambetta","given":"Jay M."}],"container-title":"Nature","id":"Havlicek2019","issue":"7747","issued":{"date-parts":[[2019]]},"page":"209-212","publisher":"Nature Publishing Group","title":"Supervised learning with quantum-enhanced feature spaces","type":"article-journal","volume":"567"}},{"id":"ITEM-224","isTemporary":false,"itemData":{"URL":"https://arxiv.org/abs/1802.06002","author":[{"family":"Farhi","given":"Edward"},{"family":"Neven","given":"Hartmut"}],"id":"Farhi2018","issued":{"date-parts":[[2018]]},"title":"Classification with quantum neural networks on near term processors","type":""}}],"isEdited":false,"manualOverride":{"citeprocText":"(Havlíček et al. 2019; Farhi and Neven 2018)","isManuallyOverridden":false,"manualOverrideText":""},"mendeley":{"formattedCitation":"(Havlíček et al. 2019; Farhi and Neven 2018)","plainTextFormattedCitation":"(Havlíček et al. 2019; Farhi and Neven 2018)","previouslyFormattedCitation":"(Havlíček et al. 2019; Farhi and Neven 2018)"},"properties":{"noteIndex":0},"schema":"https://github.com/citation-style-language/schema/raw/master/csl-citation.json"}</w:instrText>
+        <w:instrText xml:space="preserve">ADDIN CSL_CITATION {"citationID":"MENDELEY_CITATION_237","citationItems":[{"id":"ITEM-236","isTemporary":false,"itemData":{"DOI":"10.1038/s41586-019-0980-2","author":[{"family":"Havlíček","given":"Vojtěch"},{"family":"Córcoles","given":"Antonio D."},{"family":"Temme","given":"Kristan"},{"family":"Harrow","given":"Aram W."},{"family":"Kandala","given":"Abhinav"},{"family":"Chow","given":"Jerry M."},{"family":"Gambetta","given":"Jay M."}],"container-title":"Nature","id":"Havlicek2019","issue":"7747","issued":{"date-parts":[[2019]]},"page":"209-212","publisher":"Nature Publishing Group","title":"Supervised learning with quantum-enhanced feature spaces","type":"article-journal","volume":"567"}},{"id":"ITEM-237","isTemporary":false,"itemData":{"URL":"https://arxiv.org/abs/1802.06002","author":[{"family":"Farhi","given":"Edward"},{"family":"Neven","given":"Hartmut"}],"id":"Farhi2018","issued":{"date-parts":[[2018]]},"title":"Classification with quantum neural networks on near term processors","type":""}}],"isEdited":false,"manualOverride":{"citeprocText":"(Havlíček et al. 2019; Farhi and Neven 2018)","isManuallyOverridden":false,"manualOverrideText":""},"mendeley":{"formattedCitation":"(Havlíček et al. 2019; Farhi and Neven 2018)","plainTextFormattedCitation":"(Havlíček et al. 2019; Farhi and Neven 2018)","previouslyFormattedCitation":"(Havlíček et al. 2019; Farhi and Neven 2018)"},"properties":{"noteIndex":0},"schema":"https://github.com/citation-style-language/schema/raw/master/csl-citation.json"}</w:instrText>
       </w:r>
       <w:r>
         <w:fldChar w:fldCharType="separate"/>
@@ -11780,7 +11970,7 @@
         <w:fldChar w:fldCharType="begin"/>
       </w:r>
       <w:r>
-        <w:instrText xml:space="preserve">ADDIN CSL_CITATION {"citationID":"MENDELEY_CITATION_225","citationItems":[{"id":"ITEM-225","isTemporary":false,"itemData":{"DOI":"10.1109/ASE63991.2025.00306","author":[{"family":"Wang","given":"Xinyi"},{"family":"Arcaini","given":"Paolo"},{"family":"Ali","given":"Shaukat"},{"family":"Xu","given":"Qinghua"},{"family":"Peyrucain","given":"Thomas"}],"container-title":"Proceedings of the 40th IEEE/ACM international conference on automated software engineering (ASE)","id":"Wang2025","issued":{"date-parts":[[2025]]},"publisher":"IEEE","title":"Quantum machine learning-based test oracle for autonomous mobile robots","type":"paper-conference"}}],"isEdited":false,"manualOverride":{"citeprocText":"(Xinyi Wang et al. 2025)","isManuallyOverridden":false,"manualOverrideText":""},"mendeley":{"formattedCitation":"(Xinyi Wang et al. 2025)","plainTextFormattedCitation":"(Xinyi Wang et al. 2025)","previouslyFormattedCitation":"(Xinyi Wang et al. 2025)"},"properties":{"noteIndex":0},"schema":"https://github.com/citation-style-language/schema/raw/master/csl-citation.json"}</w:instrText>
+        <w:instrText xml:space="preserve">ADDIN CSL_CITATION {"citationID":"MENDELEY_CITATION_238","citationItems":[{"id":"ITEM-238","isTemporary":false,"itemData":{"DOI":"10.1109/ASE63991.2025.00306","author":[{"family":"Wang","given":"Xinyi"},{"family":"Arcaini","given":"Paolo"},{"family":"Ali","given":"Shaukat"},{"family":"Xu","given":"Qinghua"},{"family":"Peyrucain","given":"Thomas"}],"container-title":"Proceedings of the 40th IEEE/ACM international conference on automated software engineering (ASE)","id":"Wang2025","issued":{"date-parts":[[2025]]},"publisher":"IEEE","title":"Quantum machine learning-based test oracle for autonomous mobile robots","type":"paper-conference"}}],"isEdited":false,"manualOverride":{"citeprocText":"(Xinyi Wang et al. 2025)","isManuallyOverridden":false,"manualOverrideText":""},"mendeley":{"formattedCitation":"(Xinyi Wang et al. 2025)","plainTextFormattedCitation":"(Xinyi Wang et al. 2025)","previouslyFormattedCitation":"(Xinyi Wang et al. 2025)"},"properties":{"noteIndex":0},"schema":"https://github.com/citation-style-language/schema/raw/master/csl-citation.json"}</w:instrText>
       </w:r>
       <w:r>
         <w:fldChar w:fldCharType="separate"/>
@@ -11798,7 +11988,7 @@
         <w:fldChar w:fldCharType="begin"/>
       </w:r>
       <w:r>
-        <w:instrText xml:space="preserve">ADDIN CSL_CITATION {"citationID":"MENDELEY_CITATION_230","citationItems":[{"id":"ITEM-226","isTemporary":false,"itemData":{"DOI":"10.1109/ACCESS.2024.3417808","author":[{"family":"Hohenfeld","given":"Hans"},{"family":"Heimann","given":"Dirk"},{"family":"Wiebe","given":"Felix"},{"family":"Kirchner","given":"Frank"}],"container-title":"IEEE Access","id":"Hohenfeld2024","issued":{"date-parts":[[2024]]},"page":"87217-87236","publisher":"IEEE","title":"Quantum deep reinforcement learning for robot navigation tasks","type":"article-journal","volume":"12"}},{"id":"ITEM-227","isTemporary":false,"itemData":{"DOI":"10.5220/0013371800003890","ISBN":"978-989-758-737-5","author":[{"family":"Drăgan","given":"Theodora-Augustina"},{"family":"Künzner","given":"Alexander"},{"family":"Wille","given":"Robert"},{"family":"Lorenz","given":"Jeanette Miriam"}],"container-title":"Proceedings of the 17th international conference on agents and artificial intelligence (ICAART 2025)","id":"Dragan2025","issued":{"date-parts":[[2025]]},"page":"807-814","publisher":"SciTePress","title":"Continuous quantum reinforcement learning for robot navigation","type":"paper-conference","volume":"1"}},{"id":"ITEM-228","isTemporary":false,"itemData":{"URL":"https://arxiv.org/abs/2212.11681","author":[{"family":"Acuto","given":"Alberto"},{"family":"Barillà","given":"Paola"},{"family":"Bozzolo","given":"Ludovico"},{"family":"Conterno","given":"Matteo"},{"family":"Pavese","given":"Mattia"},{"family":"Policicchio","given":"Antonio"}],"id":"Acuto2022","issued":{"date-parts":[[2022]]},"title":"Variational quantum soft actor-critic for robotic arm control","type":""}},{"id":"ITEM-229","isTemporary":false,"itemData":{"DOI":"10.48550/arXiv.2509.11388","URL":"https://arxiv.org/abs/2509.11388","author":[{"family":"Lokossou","given":"Romerik"},{"family":"Girma","given":"Birhanu Shimelis"},{"family":"Tonguz","given":"Ozan K."},{"family":"Biyabani","given":"Ahmed"}],"id":"Lokossou2025","issued":{"date-parts":[[2025]]},"title":"Quantum deep reinforcement learning for humanoid robot navigation task","type":""}},{"id":"ITEM-230","isTemporary":false,"itemData":{"DOI":"10.1007/s42484-024-00226-4","author":[{"family":"Sinha","given":"Akash"},{"family":"Macaluso","given":"Antonio"},{"family":"Klusch","given":"Matthias"}],"container-title":"Quantum Machine Intelligence","id":"Sinha2023","issued":{"date-parts":[[2025]]},"page":"19","publisher":"Springer","title":"Nav-Q: Quantum deep reinforcement learning for collision-free navigation of self-driving cars","title-short":"Nav-Q","type":"article-journal","volume":"7"}}],"isEdited":false,"manualOverride":{"citeprocText":"(Hohenfeld et al. 2024; Drăgan et al. 2025; Acuto et al. 2022; Lokossou et al. 2025; Sinha, Macaluso, and Klusch 2025)","isManuallyOverridden":false,"manualOverrideText":""},"mendeley":{"formattedCitation":"(Hohenfeld et al. 2024; Drăgan et al. 2025; Acuto et al. 2022; Lokossou et al. 2025; Sinha, Macaluso, and Klusch 2025)","plainTextFormattedCitation":"(Hohenfeld et al. 2024; Drăgan et al. 2025; Acuto et al. 2022; Lokossou et al. 2025; Sinha, Macaluso, and Klusch 2025)","previouslyFormattedCitation":"(Hohenfeld et al. 2024; Drăgan et al. 2025; Acuto et al. 2022; Lokossou et al. 2025; Sinha, Macaluso, and Klusch 2025)"},"properties":{"noteIndex":0},"schema":"https://github.com/citation-style-language/schema/raw/master/csl-citation.json"}</w:instrText>
+        <w:instrText xml:space="preserve">ADDIN CSL_CITATION {"citationID":"MENDELEY_CITATION_243","citationItems":[{"id":"ITEM-239","isTemporary":false,"itemData":{"DOI":"10.1109/ACCESS.2024.3417808","author":[{"family":"Hohenfeld","given":"Hans"},{"family":"Heimann","given":"Dirk"},{"family":"Wiebe","given":"Felix"},{"family":"Kirchner","given":"Frank"}],"container-title":"IEEE Access","id":"Hohenfeld2024","issued":{"date-parts":[[2024]]},"page":"87217-87236","publisher":"IEEE","title":"Quantum deep reinforcement learning for robot navigation tasks","type":"article-journal","volume":"12"}},{"id":"ITEM-240","isTemporary":false,"itemData":{"DOI":"10.5220/0013371800003890","ISBN":"978-989-758-737-5","author":[{"family":"Drăgan","given":"Theodora-Augustina"},{"family":"Künzner","given":"Alexander"},{"family":"Wille","given":"Robert"},{"family":"Lorenz","given":"Jeanette Miriam"}],"container-title":"Proceedings of the 17th international conference on agents and artificial intelligence (ICAART 2025)","id":"Dragan2025","issued":{"date-parts":[[2025]]},"page":"807-814","publisher":"SciTePress","title":"Continuous quantum reinforcement learning for robot navigation","type":"paper-conference","volume":"1"}},{"id":"ITEM-241","isTemporary":false,"itemData":{"URL":"https://arxiv.org/abs/2212.11681","author":[{"family":"Acuto","given":"Alberto"},{"family":"Barillà","given":"Paola"},{"family":"Bozzolo","given":"Ludovico"},{"family":"Conterno","given":"Matteo"},{"family":"Pavese","given":"Mattia"},{"family":"Policicchio","given":"Antonio"}],"id":"Acuto2022","issued":{"date-parts":[[2022]]},"title":"Variational quantum soft actor-critic for robotic arm control","type":""}},{"id":"ITEM-242","isTemporary":false,"itemData":{"DOI":"10.48550/arXiv.2509.11388","URL":"https://arxiv.org/abs/2509.11388","author":[{"family":"Lokossou","given":"Romerik"},{"family":"Girma","given":"Birhanu Shimelis"},{"family":"Tonguz","given":"Ozan K."},{"family":"Biyabani","given":"Ahmed"}],"id":"Lokossou2025","issued":{"date-parts":[[2025]]},"title":"Quantum deep reinforcement learning for humanoid robot navigation task","type":""}},{"id":"ITEM-243","isTemporary":false,"itemData":{"DOI":"10.1007/s42484-024-00226-4","author":[{"family":"Sinha","given":"Akash"},{"family":"Macaluso","given":"Antonio"},{"family":"Klusch","given":"Matthias"}],"container-title":"Quantum Machine Intelligence","id":"Sinha2023","issued":{"date-parts":[[2025]]},"page":"19","publisher":"Springer","title":"Nav-Q: Quantum deep reinforcement learning for collision-free navigation of self-driving cars","title-short":"Nav-Q","type":"article-journal","volume":"7"}}],"isEdited":false,"manualOverride":{"citeprocText":"(Hohenfeld et al. 2024; Drăgan et al. 2025; Acuto et al. 2022; Lokossou et al. 2025; Sinha, Macaluso, and Klusch 2025)","isManuallyOverridden":false,"manualOverrideText":""},"mendeley":{"formattedCitation":"(Hohenfeld et al. 2024; Drăgan et al. 2025; Acuto et al. 2022; Lokossou et al. 2025; Sinha, Macaluso, and Klusch 2025)","plainTextFormattedCitation":"(Hohenfeld et al. 2024; Drăgan et al. 2025; Acuto et al. 2022; Lokossou et al. 2025; Sinha, Macaluso, and Klusch 2025)","previouslyFormattedCitation":"(Hohenfeld et al. 2024; Drăgan et al. 2025; Acuto et al. 2022; Lokossou et al. 2025; Sinha, Macaluso, and Klusch 2025)"},"properties":{"noteIndex":0},"schema":"https://github.com/citation-style-language/schema/raw/master/csl-citation.json"}</w:instrText>
       </w:r>
       <w:r>
         <w:fldChar w:fldCharType="separate"/>
@@ -11816,7 +12006,7 @@
         <w:fldChar w:fldCharType="begin"/>
       </w:r>
       <w:r>
-        <w:instrText xml:space="preserve">ADDIN CSL_CITATION {"citationID":"MENDELEY_CITATION_231","citationItems":[{"id":"ITEM-231","isTemporary":false,"itemData":{"URL":"https://arxiv.org/abs/2605.20801","author":[{"family":"Altrabulsi","given":"Mohamed Khair"},{"family":"Innan","given":"Nouhaila"},{"family":"Marchisio","given":"Alberto"},{"family":"Kashif","given":"Muhammad"},{"family":"Shafique","given":"Muhammad"}],"id":"Altrabulsi2026","issued":{"date-parts":[[2026]]},"title":"Q-SpiRL: Quantum spiking reinforcement learning for adaptive robot navigation","title-short":"Q-SpiRL","type":""}}],"isEdited":false,"manualOverride":{"citeprocText":"(Altrabulsi et al. 2026)","isManuallyOverridden":false,"manualOverrideText":""},"mendeley":{"formattedCitation":"(Altrabulsi et al. 2026)","plainTextFormattedCitation":"(Altrabulsi et al. 2026)","previouslyFormattedCitation":"(Altrabulsi et al. 2026)"},"properties":{"noteIndex":0},"schema":"https://github.com/citation-style-language/schema/raw/master/csl-citation.json"}</w:instrText>
+        <w:instrText xml:space="preserve">ADDIN CSL_CITATION {"citationID":"MENDELEY_CITATION_244","citationItems":[{"id":"ITEM-244","isTemporary":false,"itemData":{"URL":"https://arxiv.org/abs/2605.20801","author":[{"family":"Altrabulsi","given":"Mohamed Khair"},{"family":"Innan","given":"Nouhaila"},{"family":"Marchisio","given":"Alberto"},{"family":"Kashif","given":"Muhammad"},{"family":"Shafique","given":"Muhammad"}],"id":"Altrabulsi2026","issued":{"date-parts":[[2026]]},"title":"Q-SpiRL: Quantum spiking reinforcement learning for adaptive robot navigation","title-short":"Q-SpiRL","type":""}}],"isEdited":false,"manualOverride":{"citeprocText":"(Altrabulsi et al. 2026)","isManuallyOverridden":false,"manualOverrideText":""},"mendeley":{"formattedCitation":"(Altrabulsi et al. 2026)","plainTextFormattedCitation":"(Altrabulsi et al. 2026)","previouslyFormattedCitation":"(Altrabulsi et al. 2026)"},"properties":{"noteIndex":0},"schema":"https://github.com/citation-style-language/schema/raw/master/csl-citation.json"}</w:instrText>
       </w:r>
       <w:r>
         <w:fldChar w:fldCharType="separate"/>
@@ -11834,7 +12024,7 @@
         <w:fldChar w:fldCharType="begin"/>
       </w:r>
       <w:r>
-        <w:instrText xml:space="preserve">ADDIN CSL_CITATION {"citationID":"MENDELEY_CITATION_232","citationItems":[{"id":"ITEM-232","isTemporary":false,"itemData":{"URL":"https://arxiv.org/abs/2605.01716","author":[{"family":"Ngo","given":"Nguyen Truong Thu"},{"family":"Mehtola","given":"Väinö"},{"family":"Lenssen","given":"Jérome"},{"family":"Wang","given":"Peiyong"},{"family":"Cosco","given":"Francesco"},{"family":"Lu","given":"Tien-Fu"},{"family":"Quach","given":"James Q."}],"id":"Ngo2026","issued":{"date-parts":[[2026]]},"title":"Towards real-time control of a CartPole system on a quantum computer","type":""}}],"isEdited":false,"manualOverride":{"citeprocText":"(Ngo et al. 2026)","isManuallyOverridden":false,"manualOverrideText":""},"mendeley":{"formattedCitation":"(Ngo et al. 2026)","plainTextFormattedCitation":"(Ngo et al. 2026)","previouslyFormattedCitation":"(Ngo et al. 2026)"},"properties":{"noteIndex":0},"schema":"https://github.com/citation-style-language/schema/raw/master/csl-citation.json"}</w:instrText>
+        <w:instrText xml:space="preserve">ADDIN CSL_CITATION {"citationID":"MENDELEY_CITATION_245","citationItems":[{"id":"ITEM-245","isTemporary":false,"itemData":{"URL":"https://arxiv.org/abs/2605.01716","author":[{"family":"Ngo","given":"Nguyen Truong Thu"},{"family":"Mehtola","given":"Väinö"},{"family":"Lenssen","given":"Jérome"},{"family":"Wang","given":"Peiyong"},{"family":"Cosco","given":"Francesco"},{"family":"Lu","given":"Tien-Fu"},{"family":"Quach","given":"James Q."}],"id":"Ngo2026","issued":{"date-parts":[[2026]]},"title":"Towards real-time control of a CartPole system on a quantum computer","type":""}}],"isEdited":false,"manualOverride":{"citeprocText":"(Ngo et al. 2026)","isManuallyOverridden":false,"manualOverrideText":""},"mendeley":{"formattedCitation":"(Ngo et al. 2026)","plainTextFormattedCitation":"(Ngo et al. 2026)","previouslyFormattedCitation":"(Ngo et al. 2026)"},"properties":{"noteIndex":0},"schema":"https://github.com/citation-style-language/schema/raw/master/csl-citation.json"}</w:instrText>
       </w:r>
       <w:r>
         <w:fldChar w:fldCharType="separate"/>
@@ -11852,7 +12042,7 @@
         <w:fldChar w:fldCharType="begin"/>
       </w:r>
       <w:r>
-        <w:instrText xml:space="preserve">ADDIN CSL_CITATION {"citationID":"MENDELEY_CITATION_233","citationItems":[{"id":"ITEM-233","isTemporary":false,"itemData":{"DOI":"10.1109/TMECH.2010.2090896","author":[{"family":"Dong","given":"Daoyi"},{"family":"Chen","given":"Chunlin"},{"family":"Chu","given":"Jian"},{"family":"Tarn","given":"Tzyh-Jong"}],"container-title":"IEEE/ASME Transactions on Mechatronics","id":"Dong2012","issue":"1","issued":{"date-parts":[[2012]]},"page":"86-97","publisher":"IEEE","title":"Robust quantum-inspired reinforcement learning for robot navigation","type":"article-journal","volume":"17"}}],"isEdited":false,"manualOverride":{"citeprocText":"(Dong et al. 2012)","isManuallyOverridden":false,"manualOverrideText":""},"mendeley":{"formattedCitation":"(Dong et al. 2012)","plainTextFormattedCitation":"(Dong et al. 2012)","previouslyFormattedCitation":"(Dong et al. 2012)"},"properties":{"noteIndex":0},"schema":"https://github.com/citation-style-language/schema/raw/master/csl-citation.json"}</w:instrText>
+        <w:instrText xml:space="preserve">ADDIN CSL_CITATION {"citationID":"MENDELEY_CITATION_246","citationItems":[{"id":"ITEM-246","isTemporary":false,"itemData":{"DOI":"10.1109/TMECH.2010.2090896","author":[{"family":"Dong","given":"Daoyi"},{"family":"Chen","given":"Chunlin"},{"family":"Chu","given":"Jian"},{"family":"Tarn","given":"Tzyh-Jong"}],"container-title":"IEEE/ASME Transactions on Mechatronics","id":"Dong2012","issue":"1","issued":{"date-parts":[[2012]]},"page":"86-97","publisher":"IEEE","title":"Robust quantum-inspired reinforcement learning for robot navigation","type":"article-journal","volume":"17"}}],"isEdited":false,"manualOverride":{"citeprocText":"(Dong et al. 2012)","isManuallyOverridden":false,"manualOverrideText":""},"mendeley":{"formattedCitation":"(Dong et al. 2012)","plainTextFormattedCitation":"(Dong et al. 2012)","previouslyFormattedCitation":"(Dong et al. 2012)"},"properties":{"noteIndex":0},"schema":"https://github.com/citation-style-language/schema/raw/master/csl-citation.json"}</w:instrText>
       </w:r>
       <w:r>
         <w:fldChar w:fldCharType="separate"/>
@@ -11873,7 +12063,7 @@
         <w:fldChar w:fldCharType="begin"/>
       </w:r>
       <w:r>
-        <w:instrText xml:space="preserve">ADDIN CSL_CITATION {"citationID":"MENDELEY_CITATION_234","citationItems":[{"id":"ITEM-234","isTemporary":false,"itemData":{"URL":"https://arxiv.org/abs/2508.01690","author":[{"family":"Sun","given":"Yize"},{"family":"Hagog","given":"Mohamad"},{"family":"Weber","given":"Marc"},{"family":"Hein","given":"Daniel"},{"family":"Udluft","given":"Steffen"},{"family":"Tresp","given":"Volker"},{"family":"Ma","given":"Yunpu"}],"id":"Sun2025","issued":{"date-parts":[[2025]]},"note":"QML@QCE 2025 workshop","title":"First experience with real-time control using simulated VQC-based quantum policies","type":""}}],"isEdited":false,"manualOverride":{"citeprocText":"(Sun et al. 2025)","isManuallyOverridden":false,"manualOverrideText":""},"mendeley":{"formattedCitation":"(Sun et al. 2025)","plainTextFormattedCitation":"(Sun et al. 2025)","previouslyFormattedCitation":"(Sun et al. 2025)"},"properties":{"noteIndex":0},"schema":"https://github.com/citation-style-language/schema/raw/master/csl-citation.json"}</w:instrText>
+        <w:instrText xml:space="preserve">ADDIN CSL_CITATION {"citationID":"MENDELEY_CITATION_247","citationItems":[{"id":"ITEM-247","isTemporary":false,"itemData":{"URL":"https://arxiv.org/abs/2508.01690","author":[{"family":"Sun","given":"Yize"},{"family":"Hagog","given":"Mohamad"},{"family":"Weber","given":"Marc"},{"family":"Hein","given":"Daniel"},{"family":"Udluft","given":"Steffen"},{"family":"Tresp","given":"Volker"},{"family":"Ma","given":"Yunpu"}],"id":"Sun2025","issued":{"date-parts":[[2025]]},"note":"QML@QCE 2025 workshop","title":"First experience with real-time control using simulated VQC-based quantum policies","type":""}}],"isEdited":false,"manualOverride":{"citeprocText":"(Sun et al. 2025)","isManuallyOverridden":false,"manualOverrideText":""},"mendeley":{"formattedCitation":"(Sun et al. 2025)","plainTextFormattedCitation":"(Sun et al. 2025)","previouslyFormattedCitation":"(Sun et al. 2025)"},"properties":{"noteIndex":0},"schema":"https://github.com/citation-style-language/schema/raw/master/csl-citation.json"}</w:instrText>
       </w:r>
       <w:r>
         <w:fldChar w:fldCharType="separate"/>
@@ -11918,7 +12108,7 @@
         <w:fldChar w:fldCharType="begin"/>
       </w:r>
       <w:r>
-        <w:instrText xml:space="preserve">ADDIN CSL_CITATION {"citationID":"MENDELEY_CITATION_235","citationItems":[{"id":"ITEM-235","isTemporary":false,"itemData":{"DOI":"10.1177/0278364913495721","author":[{"family":"Kober","given":"Jens"},{"family":"Bagnell","given":"J. Andrew"},{"family":"Peters","given":"Jan"}],"container-title":"The International Journal of Robotics Research","id":"Kober2013","issue":"11","issued":{"date-parts":[[2013]]},"page":"1238-1274","publisher":"SAGE Publications","title":"Reinforcement learning in robotics: A survey","title-short":"Reinforcement learning in robotics","type":"article-journal","volume":"32"}}],"isEdited":false,"manualOverride":{"citeprocText":"(Kober, Bagnell, and Peters 2013)","isManuallyOverridden":false,"manualOverrideText":""},"mendeley":{"formattedCitation":"(Kober, Bagnell, and Peters 2013)","plainTextFormattedCitation":"(Kober, Bagnell, and Peters 2013)","previouslyFormattedCitation":"(Kober, Bagnell, and Peters 2013)"},"properties":{"noteIndex":0},"schema":"https://github.com/citation-style-language/schema/raw/master/csl-citation.json"}</w:instrText>
+        <w:instrText xml:space="preserve">ADDIN CSL_CITATION {"citationID":"MENDELEY_CITATION_248","citationItems":[{"id":"ITEM-248","isTemporary":false,"itemData":{"DOI":"10.1177/0278364913495721","author":[{"family":"Kober","given":"Jens"},{"family":"Bagnell","given":"J. Andrew"},{"family":"Peters","given":"Jan"}],"container-title":"The International Journal of Robotics Research","id":"Kober2013","issue":"11","issued":{"date-parts":[[2013]]},"page":"1238-1274","publisher":"SAGE Publications","title":"Reinforcement learning in robotics: A survey","title-short":"Reinforcement learning in robotics","type":"article-journal","volume":"32"}}],"isEdited":false,"manualOverride":{"citeprocText":"(Kober, Bagnell, and Peters 2013)","isManuallyOverridden":false,"manualOverrideText":""},"mendeley":{"formattedCitation":"(Kober, Bagnell, and Peters 2013)","plainTextFormattedCitation":"(Kober, Bagnell, and Peters 2013)","previouslyFormattedCitation":"(Kober, Bagnell, and Peters 2013)"},"properties":{"noteIndex":0},"schema":"https://github.com/citation-style-language/schema/raw/master/csl-citation.json"}</w:instrText>
       </w:r>
       <w:r>
         <w:fldChar w:fldCharType="separate"/>
@@ -11997,7 +12187,7 @@
         <w:fldChar w:fldCharType="begin"/>
       </w:r>
       <w:r>
-        <w:instrText xml:space="preserve">ADDIN CSL_CITATION {"citationID":"MENDELEY_CITATION_236","citationItems":[{"id":"ITEM-236","isTemporary":false,"itemData":{"DOI":"10.1103/RevModPhys.89.035002","author":[{"family":"Degen","given":"Christian L."},{"family":"Reinhard","given":"F."},{"family":"Cappellaro","given":"Paola"}],"container-title":"Reviews of Modern Physics","id":"Degen2017","issue":"3","issued":{"date-parts":[[2017]]},"page":"035002","title":"Quantum sensing","type":"article-journal","volume":"89"}}],"isEdited":false,"manualOverride":{"citeprocText":"(Degen, Reinhard, and Cappellaro 2017)","isManuallyOverridden":false,"manualOverrideText":""},"mendeley":{"formattedCitation":"(Degen, Reinhard, and Cappellaro 2017)","plainTextFormattedCitation":"(Degen, Reinhard, and Cappellaro 2017)","previouslyFormattedCitation":"(Degen, Reinhard, and Cappellaro 2017)"},"properties":{"noteIndex":0},"schema":"https://github.com/citation-style-language/schema/raw/master/csl-citation.json"}</w:instrText>
+        <w:instrText xml:space="preserve">ADDIN CSL_CITATION {"citationID":"MENDELEY_CITATION_249","citationItems":[{"id":"ITEM-249","isTemporary":false,"itemData":{"DOI":"10.1103/RevModPhys.89.035002","author":[{"family":"Degen","given":"Christian L."},{"family":"Reinhard","given":"F."},{"family":"Cappellaro","given":"Paola"}],"container-title":"Reviews of Modern Physics","id":"Degen2017","issue":"3","issued":{"date-parts":[[2017]]},"page":"035002","title":"Quantum sensing","type":"article-journal","volume":"89"}}],"isEdited":false,"manualOverride":{"citeprocText":"(Degen, Reinhard, and Cappellaro 2017)","isManuallyOverridden":false,"manualOverrideText":""},"mendeley":{"formattedCitation":"(Degen, Reinhard, and Cappellaro 2017)","plainTextFormattedCitation":"(Degen, Reinhard, and Cappellaro 2017)","previouslyFormattedCitation":"(Degen, Reinhard, and Cappellaro 2017)"},"properties":{"noteIndex":0},"schema":"https://github.com/citation-style-language/schema/raw/master/csl-citation.json"}</w:instrText>
       </w:r>
       <w:r>
         <w:fldChar w:fldCharType="separate"/>
@@ -12018,7 +12208,7 @@
         <w:fldChar w:fldCharType="begin"/>
       </w:r>
       <w:r>
-        <w:instrText xml:space="preserve">ADDIN CSL_CITATION {"citationID":"MENDELEY_CITATION_237","citationItems":[{"id":"ITEM-237","isTemporary":false,"itemData":{"DOI":"10.1038/s42254-019-0117-4","author":[{"family":"Bongs","given":"Kai"},{"family":"Holynski","given":"Michael"},{"family":"Vovrosh","given":"Jamie"},{"family":"Bouyer","given":"Philippe"},{"family":"Condon","given":"Gabriel"},{"family":"Rasel","given":"Ernst"},{"family":"Schubert","given":"Christian"},{"family":"Schleich","given":"Wolfgang P."},{"family":"Roura","given":"Albert"}],"container-title":"Nature Reviews Physics","id":"Bongs2019","issue":"12","issued":{"date-parts":[[2019]]},"page":"731-739","publisher":"Nature Publishing Group","title":"Taking atom interferometric quantum sensors from the laboratory to real-world applications","type":"article-journal","volume":"1"},"suppress-author":false}],"isEdited":false,"manualOverride":{"citeprocText":"Bongs et al. (2019)","isManuallyOverridden":false,"manualOverrideText":""},"mendeley":{"formattedCitation":"Bongs et al. (2019)","plainTextFormattedCitation":"Bongs et al. (2019)","previouslyFormattedCitation":"Bongs et al. (2019)"},"properties":{"noteIndex":0},"schema":"https://github.com/citation-style-language/schema/raw/master/csl-citation.json"}</w:instrText>
+        <w:instrText xml:space="preserve">ADDIN CSL_CITATION {"citationID":"MENDELEY_CITATION_250","citationItems":[{"id":"ITEM-250","isTemporary":false,"itemData":{"DOI":"10.1038/s42254-019-0117-4","author":[{"family":"Bongs","given":"Kai"},{"family":"Holynski","given":"Michael"},{"family":"Vovrosh","given":"Jamie"},{"family":"Bouyer","given":"Philippe"},{"family":"Condon","given":"Gabriel"},{"family":"Rasel","given":"Ernst"},{"family":"Schubert","given":"Christian"},{"family":"Schleich","given":"Wolfgang P."},{"family":"Roura","given":"Albert"}],"container-title":"Nature Reviews Physics","id":"Bongs2019","issue":"12","issued":{"date-parts":[[2019]]},"page":"731-739","publisher":"Nature Publishing Group","title":"Taking atom interferometric quantum sensors from the laboratory to real-world applications","type":"article-journal","volume":"1"},"suppress-author":false}],"isEdited":false,"manualOverride":{"citeprocText":"Bongs et al. (2019)","isManuallyOverridden":false,"manualOverrideText":""},"mendeley":{"formattedCitation":"Bongs et al. (2019)","plainTextFormattedCitation":"Bongs et al. (2019)","previouslyFormattedCitation":"Bongs et al. (2019)"},"properties":{"noteIndex":0},"schema":"https://github.com/citation-style-language/schema/raw/master/csl-citation.json"}</w:instrText>
       </w:r>
       <w:r>
         <w:fldChar w:fldCharType="separate"/>
@@ -12044,7 +12234,7 @@
         <w:fldChar w:fldCharType="begin"/>
       </w:r>
       <w:r>
-        <w:instrText xml:space="preserve">ADDIN CSL_CITATION {"citationID":"MENDELEY_CITATION_238","citationItems":[{"id":"ITEM-238","isTemporary":false,"itemData":{"DOI":"10.1103/PhysRevApplied.10.034030","author":[{"family":"Cheiney","given":"Pierrick"},{"family":"Fouché","given":"Lauriane"},{"family":"Templier","given":"Simon"},{"family":"Napolitano","given":"Fabien"},{"family":"Battelier","given":"Baptiste"},{"family":"Bouyer","given":"Philippe"},{"family":"Barrett","given":"Brynle"}],"container-title":"Physical Review Applied","id":"Cheiney2018","issue":"3","issued":{"date-parts":[[2018]]},"page":"034030","publisher":"American Physical Society","title":"Navigation-compatible hybrid quantum accelerometer using a Kalman filter","type":"article-journal","volume":"10"},"suppress-author":false}],"isEdited":false,"manualOverride":{"citeprocText":"Cheiney et al. (2018)","isManuallyOverridden":false,"manualOverrideText":""},"mendeley":{"formattedCitation":"Cheiney et al. (2018)","plainTextFormattedCitation":"Cheiney et al. (2018)","previouslyFormattedCitation":"Cheiney et al. (2018)"},"properties":{"noteIndex":0},"schema":"https://github.com/citation-style-language/schema/raw/master/csl-citation.json"}</w:instrText>
+        <w:instrText xml:space="preserve">ADDIN CSL_CITATION {"citationID":"MENDELEY_CITATION_251","citationItems":[{"id":"ITEM-251","isTemporary":false,"itemData":{"DOI":"10.1103/PhysRevApplied.10.034030","author":[{"family":"Cheiney","given":"Pierrick"},{"family":"Fouché","given":"Lauriane"},{"family":"Templier","given":"Simon"},{"family":"Napolitano","given":"Fabien"},{"family":"Battelier","given":"Baptiste"},{"family":"Bouyer","given":"Philippe"},{"family":"Barrett","given":"Brynle"}],"container-title":"Physical Review Applied","id":"Cheiney2018","issue":"3","issued":{"date-parts":[[2018]]},"page":"034030","publisher":"American Physical Society","title":"Navigation-compatible hybrid quantum accelerometer using a Kalman filter","type":"article-journal","volume":"10"},"suppress-author":false}],"isEdited":false,"manualOverride":{"citeprocText":"Cheiney et al. (2018)","isManuallyOverridden":false,"manualOverrideText":""},"mendeley":{"formattedCitation":"Cheiney et al. (2018)","plainTextFormattedCitation":"Cheiney et al. (2018)","previouslyFormattedCitation":"Cheiney et al. (2018)"},"properties":{"noteIndex":0},"schema":"https://github.com/citation-style-language/schema/raw/master/csl-citation.json"}</w:instrText>
       </w:r>
       <w:r>
         <w:fldChar w:fldCharType="separate"/>
@@ -12068,7 +12258,7 @@
         <w:fldChar w:fldCharType="begin"/>
       </w:r>
       <w:r>
-        <w:instrText xml:space="preserve">ADDIN CSL_CITATION {"citationID":"MENDELEY_CITATION_239","citationItems":[{"id":"ITEM-239","isTemporary":false,"itemData":{"DOI":"10.48550/arXiv.2103.09378","URL":"https://arxiv.org/abs/2103.09378","author":[{"family":"Wang","given":"Xuezhi"},{"family":"Kealy","given":"Allison"},{"family":"Gilliam","given":"Christopher"},{"family":"Haine","given":"Simon"},{"family":"Close","given":"John"},{"family":"Moran","given":"Bill"},{"family":"Talbot","given":"Kyle"},{"family":"Williams","given":"Simon"},{"family":"Hardman","given":"Kyle"},{"family":"Freier","given":"Chris"},{"family":"Wigley","given":"Paul"},{"family":"White","given":"Angela"},{"family":"Szigeti","given":"Stuart"},{"family":"Legge","given":"Sam"}],"id":"Wang2021","issued":{"date-parts":[[2021]]},"title":"Enhancing inertial navigation performance via fusion of classical and quantum accelerometers","type":""},"suppress-author":false}],"isEdited":false,"manualOverride":{"citeprocText":"Xuezhi Wang et al. (2021)","isManuallyOverridden":false,"manualOverrideText":""},"mendeley":{"formattedCitation":"Xuezhi Wang et al. (2021)","plainTextFormattedCitation":"Xuezhi Wang et al. (2021)","previouslyFormattedCitation":"Xuezhi Wang et al. (2021)"},"properties":{"noteIndex":0},"schema":"https://github.com/citation-style-language/schema/raw/master/csl-citation.json"}</w:instrText>
+        <w:instrText xml:space="preserve">ADDIN CSL_CITATION {"citationID":"MENDELEY_CITATION_252","citationItems":[{"id":"ITEM-252","isTemporary":false,"itemData":{"DOI":"10.48550/arXiv.2103.09378","URL":"https://arxiv.org/abs/2103.09378","author":[{"family":"Wang","given":"Xuezhi"},{"family":"Kealy","given":"Allison"},{"family":"Gilliam","given":"Christopher"},{"family":"Haine","given":"Simon"},{"family":"Close","given":"John"},{"family":"Moran","given":"Bill"},{"family":"Talbot","given":"Kyle"},{"family":"Williams","given":"Simon"},{"family":"Hardman","given":"Kyle"},{"family":"Freier","given":"Chris"},{"family":"Wigley","given":"Paul"},{"family":"White","given":"Angela"},{"family":"Szigeti","given":"Stuart"},{"family":"Legge","given":"Sam"}],"id":"Wang2021","issued":{"date-parts":[[2021]]},"title":"Enhancing inertial navigation performance via fusion of classical and quantum accelerometers","type":""},"suppress-author":false}],"isEdited":false,"manualOverride":{"citeprocText":"Xuezhi Wang et al. (2021)","isManuallyOverridden":false,"manualOverrideText":""},"mendeley":{"formattedCitation":"Xuezhi Wang et al. (2021)","plainTextFormattedCitation":"Xuezhi Wang et al. (2021)","previouslyFormattedCitation":"Xuezhi Wang et al. (2021)"},"properties":{"noteIndex":0},"schema":"https://github.com/citation-style-language/schema/raw/master/csl-citation.json"}</w:instrText>
       </w:r>
       <w:r>
         <w:fldChar w:fldCharType="separate"/>
@@ -12092,7 +12282,7 @@
         <w:fldChar w:fldCharType="begin"/>
       </w:r>
       <w:r>
-        <w:instrText xml:space="preserve">ADDIN CSL_CITATION {"citationID":"MENDELEY_CITATION_240","citationItems":[{"id":"ITEM-240","isTemporary":false,"itemData":{"DOI":"10.1007/1345_2023_218","author":[{"family":"Wang","given":"Xuezhi"},{"family":"Li","given":"Wenchao"},{"family":"Moran","given":"Bill"},{"family":"Gibson","given":"Brant C."},{"family":"Hall","given":"Liam T."},{"family":"Simpson","given":"David A."},{"family":"Kealy","given":"Allison N."},{"family":"Greentree","given":"Andrew D."}],"collection-title":"International association of geodesy symposia","container-title":"Gravity, positioning and reference frames","id":"Wang2023","issued":{"date-parts":[[2023]]},"page":"87-92","publisher":"Springer","publisher-place":"Cham","title":"Quantum diamond magnetometry for navigation in GNSS denied environments","type":"chapter","volume":"156"},"suppress-author":false}],"isEdited":false,"manualOverride":{"citeprocText":"Xuezhi Wang et al. (2023)","isManuallyOverridden":false,"manualOverrideText":""},"mendeley":{"formattedCitation":"Xuezhi Wang et al. (2023)","plainTextFormattedCitation":"Xuezhi Wang et al. (2023)","previouslyFormattedCitation":"Xuezhi Wang et al. (2023)"},"properties":{"noteIndex":0},"schema":"https://github.com/citation-style-language/schema/raw/master/csl-citation.json"}</w:instrText>
+        <w:instrText xml:space="preserve">ADDIN CSL_CITATION {"citationID":"MENDELEY_CITATION_253","citationItems":[{"id":"ITEM-253","isTemporary":false,"itemData":{"DOI":"10.1007/1345_2023_218","author":[{"family":"Wang","given":"Xuezhi"},{"family":"Li","given":"Wenchao"},{"family":"Moran","given":"Bill"},{"family":"Gibson","given":"Brant C."},{"family":"Hall","given":"Liam T."},{"family":"Simpson","given":"David A."},{"family":"Kealy","given":"Allison N."},{"family":"Greentree","given":"Andrew D."}],"collection-title":"International association of geodesy symposia","container-title":"Gravity, positioning and reference frames","id":"Wang2023","issued":{"date-parts":[[2023]]},"page":"87-92","publisher":"Springer","publisher-place":"Cham","title":"Quantum diamond magnetometry for navigation in GNSS denied environments","type":"chapter","volume":"156"},"suppress-author":false}],"isEdited":false,"manualOverride":{"citeprocText":"Xuezhi Wang et al. (2023)","isManuallyOverridden":false,"manualOverrideText":""},"mendeley":{"formattedCitation":"Xuezhi Wang et al. (2023)","plainTextFormattedCitation":"Xuezhi Wang et al. (2023)","previouslyFormattedCitation":"Xuezhi Wang et al. (2023)"},"properties":{"noteIndex":0},"schema":"https://github.com/citation-style-language/schema/raw/master/csl-citation.json"}</w:instrText>
       </w:r>
       <w:r>
         <w:fldChar w:fldCharType="separate"/>
@@ -12116,7 +12306,7 @@
         <w:fldChar w:fldCharType="begin"/>
       </w:r>
       <w:r>
-        <w:instrText xml:space="preserve">ADDIN CSL_CITATION {"citationID":"MENDELEY_CITATION_241","citationItems":[{"id":"ITEM-241","isTemporary":false,"itemData":{"DOI":"10.1038/ncomms1479","author":[{"family":"Geiger","given":"R."},{"family":"Ménoret","given":"V."},{"family":"Stern","given":"G."},{"family":"Zahzam","given":"N."},{"family":"Cheinet","given":"P."},{"family":"Battelier","given":"B."},{"family":"Villing","given":"A."},{"family":"Moron","given":"F."},{"family":"Lours","given":"M."},{"family":"Bidel","given":"Y."},{"family":"Bresson","given":"A."},{"family":"Landragin","given":"A."},{"family":"Bouyer","given":"P."}],"container-title":"Nature Communications","id":"Geiger2011","issued":{"date-parts":[[2011]]},"page":"474","title":"Detecting inertial effects with airborne matter-wave interferometry","type":"article-journal","volume":"2"},"suppress-author":false}],"isEdited":false,"manualOverride":{"citeprocText":"Geiger et al. (2011)","isManuallyOverridden":false,"manualOverrideText":""},"mendeley":{"formattedCitation":"Geiger et al. (2011)","plainTextFormattedCitation":"Geiger et al. (2011)","previouslyFormattedCitation":"Geiger et al. (2011)"},"properties":{"noteIndex":0},"schema":"https://github.com/citation-style-language/schema/raw/master/csl-citation.json"}</w:instrText>
+        <w:instrText xml:space="preserve">ADDIN CSL_CITATION {"citationID":"MENDELEY_CITATION_254","citationItems":[{"id":"ITEM-254","isTemporary":false,"itemData":{"DOI":"10.1038/ncomms1479","author":[{"family":"Geiger","given":"R."},{"family":"Ménoret","given":"V."},{"family":"Stern","given":"G."},{"family":"Zahzam","given":"N."},{"family":"Cheinet","given":"P."},{"family":"Battelier","given":"B."},{"family":"Villing","given":"A."},{"family":"Moron","given":"F."},{"family":"Lours","given":"M."},{"family":"Bidel","given":"Y."},{"family":"Bresson","given":"A."},{"family":"Landragin","given":"A."},{"family":"Bouyer","given":"P."}],"container-title":"Nature Communications","id":"Geiger2011","issued":{"date-parts":[[2011]]},"page":"474","title":"Detecting inertial effects with airborne matter-wave interferometry","type":"article-journal","volume":"2"},"suppress-author":false}],"isEdited":false,"manualOverride":{"citeprocText":"Geiger et al. (2011)","isManuallyOverridden":false,"manualOverrideText":""},"mendeley":{"formattedCitation":"Geiger et al. (2011)","plainTextFormattedCitation":"Geiger et al. (2011)","previouslyFormattedCitation":"Geiger et al. (2011)"},"properties":{"noteIndex":0},"schema":"https://github.com/citation-style-language/schema/raw/master/csl-citation.json"}</w:instrText>
       </w:r>
       <w:r>
         <w:fldChar w:fldCharType="separate"/>
@@ -12140,7 +12330,7 @@
         <w:fldChar w:fldCharType="begin"/>
       </w:r>
       <w:r>
-        <w:instrText xml:space="preserve">ADDIN CSL_CITATION {"citationID":"MENDELEY_CITATION_242","citationItems":[{"id":"ITEM-242","isTemporary":false,"itemData":{"DOI":"10.1126/sciadv.add3854","author":[{"family":"Templier","given":"Simon"},{"family":"Cheiney","given":"Pierrick"},{"dropping-particle":"d’Armagnac de","family":"Castanet","given":"Quentin"},{"family":"Gouraud","given":"Baptiste"},{"family":"Porte","given":"Henri"},{"family":"Napolitano","given":"Fabien"},{"family":"Bouyer","given":"Philippe"},{"family":"Battelier","given":"Baptiste"},{"family":"Barrett","given":"Brynle"}],"container-title":"Science Advances","id":"Templier2022","issued":{"date-parts":[[2022]]},"page":"eadd3854","title":"Tracking the vector acceleration with a hybrid quantum accelerometer triad","type":"article-journal","volume":"8"},"suppress-author":false}],"isEdited":false,"manualOverride":{"citeprocText":"Templier et al. (2022)","isManuallyOverridden":false,"manualOverrideText":""},"mendeley":{"formattedCitation":"Templier et al. (2022)","plainTextFormattedCitation":"Templier et al. (2022)","previouslyFormattedCitation":"Templier et al. (2022)"},"properties":{"noteIndex":0},"schema":"https://github.com/citation-style-language/schema/raw/master/csl-citation.json"}</w:instrText>
+        <w:instrText xml:space="preserve">ADDIN CSL_CITATION {"citationID":"MENDELEY_CITATION_255","citationItems":[{"id":"ITEM-255","isTemporary":false,"itemData":{"DOI":"10.1126/sciadv.add3854","author":[{"family":"Templier","given":"Simon"},{"family":"Cheiney","given":"Pierrick"},{"dropping-particle":"d’Armagnac de","family":"Castanet","given":"Quentin"},{"family":"Gouraud","given":"Baptiste"},{"family":"Porte","given":"Henri"},{"family":"Napolitano","given":"Fabien"},{"family":"Bouyer","given":"Philippe"},{"family":"Battelier","given":"Baptiste"},{"family":"Barrett","given":"Brynle"}],"container-title":"Science Advances","id":"Templier2022","issued":{"date-parts":[[2022]]},"page":"eadd3854","title":"Tracking the vector acceleration with a hybrid quantum accelerometer triad","type":"article-journal","volume":"8"},"suppress-author":false}],"isEdited":false,"manualOverride":{"citeprocText":"Templier et al. (2022)","isManuallyOverridden":false,"manualOverrideText":""},"mendeley":{"formattedCitation":"Templier et al. (2022)","plainTextFormattedCitation":"Templier et al. (2022)","previouslyFormattedCitation":"Templier et al. (2022)"},"properties":{"noteIndex":0},"schema":"https://github.com/citation-style-language/schema/raw/master/csl-citation.json"}</w:instrText>
       </w:r>
       <w:r>
         <w:fldChar w:fldCharType="separate"/>
@@ -12166,7 +12356,7 @@
         <w:fldChar w:fldCharType="begin"/>
       </w:r>
       <w:r>
-        <w:instrText xml:space="preserve">ADDIN CSL_CITATION {"citationID":"MENDELEY_CITATION_243","citationItems":[{"id":"ITEM-243","isTemporary":false,"itemData":{"DOI":"10.48550/arXiv.2504.08167","URL":"https://arxiv.org/abs/2504.08167","author":[{"family":"Muradoglu","given":"Murat"},{"family":"Johnsson","given":"Mattias T."},{"family":"Wilson","given":"Nathanial M."},{"family":"Cohen","given":"Yuval"},{"family":"Shin","given":"Dongki"},{"family":"Navickas","given":"Tomas"},{"family":"Pyragius","given":"Tadas"},{"family":"Thomas","given":"Divya"},{"family":"Thompson","given":"Daniel"},{"family":"Moore","given":"Steven I."},{"family":"Rahman","given":"Md Tanvir"},{"family":"Walker","given":"Adrian"},{"family":"Dutta","given":"Indranil"},{"family":"Bijjahalli","given":"Suraj"},{"family":"Berlocher","given":"Jacob"},{"family":"Hush","given":"Michael R."},{"family":"Anderson","given":"Russell P."},{"family":"Szigeti","given":"Stuart S."},{"family":"Biercuk","given":"Michael J."}],"id":"Muradoglu2025","issued":{"date-parts":[[2025]]},"title":"Quantum-assured magnetic navigation achieves positioning accuracy better than a strategic-grade INS in airborne and ground-based field trials","type":""},"suppress-author":false}],"isEdited":false,"manualOverride":{"citeprocText":"Muradoglu et al. (2025)","isManuallyOverridden":false,"manualOverrideText":""},"mendeley":{"formattedCitation":"Muradoglu et al. (2025)","plainTextFormattedCitation":"Muradoglu et al. (2025)","previouslyFormattedCitation":"Muradoglu et al. (2025)"},"properties":{"noteIndex":0},"schema":"https://github.com/citation-style-language/schema/raw/master/csl-citation.json"}</w:instrText>
+        <w:instrText xml:space="preserve">ADDIN CSL_CITATION {"citationID":"MENDELEY_CITATION_256","citationItems":[{"id":"ITEM-256","isTemporary":false,"itemData":{"DOI":"10.48550/arXiv.2504.08167","URL":"https://arxiv.org/abs/2504.08167","author":[{"family":"Muradoglu","given":"Murat"},{"family":"Johnsson","given":"Mattias T."},{"family":"Wilson","given":"Nathanial M."},{"family":"Cohen","given":"Yuval"},{"family":"Shin","given":"Dongki"},{"family":"Navickas","given":"Tomas"},{"family":"Pyragius","given":"Tadas"},{"family":"Thomas","given":"Divya"},{"family":"Thompson","given":"Daniel"},{"family":"Moore","given":"Steven I."},{"family":"Rahman","given":"Md Tanvir"},{"family":"Walker","given":"Adrian"},{"family":"Dutta","given":"Indranil"},{"family":"Bijjahalli","given":"Suraj"},{"family":"Berlocher","given":"Jacob"},{"family":"Hush","given":"Michael R."},{"family":"Anderson","given":"Russell P."},{"family":"Szigeti","given":"Stuart S."},{"family":"Biercuk","given":"Michael J."}],"id":"Muradoglu2025","issued":{"date-parts":[[2025]]},"title":"Quantum-assured magnetic navigation achieves positioning accuracy better than a strategic-grade INS in airborne and ground-based field trials","type":""},"suppress-author":false}],"isEdited":false,"manualOverride":{"citeprocText":"Muradoglu et al. (2025)","isManuallyOverridden":false,"manualOverrideText":""},"mendeley":{"formattedCitation":"Muradoglu et al. (2025)","plainTextFormattedCitation":"Muradoglu et al. (2025)","previouslyFormattedCitation":"Muradoglu et al. (2025)"},"properties":{"noteIndex":0},"schema":"https://github.com/citation-style-language/schema/raw/master/csl-citation.json"}</w:instrText>
       </w:r>
       <w:r>
         <w:fldChar w:fldCharType="separate"/>
@@ -12229,7 +12419,7 @@
         <w:fldChar w:fldCharType="begin"/>
       </w:r>
       <w:r>
-        <w:instrText xml:space="preserve">ADDIN CSL_CITATION {"citationID":"MENDELEY_CITATION_244","citationItems":[{"id":"ITEM-244","isTemporary":false,"itemData":{"DOI":"10.48550/arXiv.2008.12230","URL":"https://arxiv.org/abs/2008.12230","author":[{"family":"Khoshnoud","given":"Farbod"},{"family":"Quadrelli","given":"Marco B."},{"family":"Esat","given":"Ibrahim I."},{"family":"Robinson","given":"Dario"}],"id":"Khoshnoud2020","issued":{"date-parts":[[2020]]},"title":"Quantum cooperative robotics and autonomy","type":""},"suppress-author":false}],"isEdited":false,"manualOverride":{"citeprocText":"Khoshnoud et al. (2020)","isManuallyOverridden":false,"manualOverrideText":""},"mendeley":{"formattedCitation":"Khoshnoud et al. (2020)","plainTextFormattedCitation":"Khoshnoud et al. (2020)","previouslyFormattedCitation":"Khoshnoud et al. (2020)"},"properties":{"noteIndex":0},"schema":"https://github.com/citation-style-language/schema/raw/master/csl-citation.json"}</w:instrText>
+        <w:instrText xml:space="preserve">ADDIN CSL_CITATION {"citationID":"MENDELEY_CITATION_257","citationItems":[{"id":"ITEM-257","isTemporary":false,"itemData":{"DOI":"10.48550/arXiv.2008.12230","URL":"https://arxiv.org/abs/2008.12230","author":[{"family":"Khoshnoud","given":"Farbod"},{"family":"Quadrelli","given":"Marco B."},{"family":"Esat","given":"Ibrahim I."},{"family":"Robinson","given":"Dario"}],"id":"Khoshnoud2020","issued":{"date-parts":[[2020]]},"title":"Quantum cooperative robotics and autonomy","type":""},"suppress-author":false}],"isEdited":false,"manualOverride":{"citeprocText":"Khoshnoud et al. (2020)","isManuallyOverridden":false,"manualOverrideText":""},"mendeley":{"formattedCitation":"Khoshnoud et al. (2020)","plainTextFormattedCitation":"Khoshnoud et al. (2020)","previouslyFormattedCitation":"Khoshnoud et al. (2020)"},"properties":{"noteIndex":0},"schema":"https://github.com/citation-style-language/schema/raw/master/csl-citation.json"}</w:instrText>
       </w:r>
       <w:r>
         <w:fldChar w:fldCharType="separate"/>
@@ -12250,7 +12440,7 @@
         <w:fldChar w:fldCharType="begin"/>
       </w:r>
       <w:r>
-        <w:instrText xml:space="preserve">ADDIN CSL_CITATION {"citationID":"MENDELEY_CITATION_245","citationItems":[{"id":"ITEM-245","isTemporary":false,"itemData":{"DOI":"10.1103/PhysRevLett.133.200801","author":[{"family":"Tian","given":"Xiao-Hui"},{"family":"Yang","given":"Ran"},{"family":"Liu","given":"Hua-Ying"},{"family":"Fan","given":"Pengfei"},{"family":"Zhang","given":"Ji-Ning"},{"family":"Gu","given":"Changsheng"},{"family":"Chen","given":"Mengwen"},{"family":"Hu","given":"Mingzhe"},{"family":"Lu","given":"Feng-Yu"},{"family":"Yin","given":"Zhen-Qiang"},{"family":"Yin","given":"Zhi-Jun"},{"family":"Yuan","given":"Mo"},{"family":"Wang","given":"Shuang"},{"family":"Chen","given":"Wei"},{"family":"Gong","given":"Yan-Xiao"},{"family":"Zhu","given":"Shi-Ning"},{"family":"Xie","given":"Zhenda"}],"container-title":"Physical Review Letters","id":"Tian2023","issue":"20","issued":{"date-parts":[[2024]]},"page":"200801","publisher":"American Physical Society","title":"Experimental demonstration of drone-based quantum key distribution","type":"article-journal","volume":"133"},"suppress-author":false}],"isEdited":false,"manualOverride":{"citeprocText":"Tian et al. (2024)","isManuallyOverridden":false,"manualOverrideText":""},"mendeley":{"formattedCitation":"Tian et al. (2024)","plainTextFormattedCitation":"Tian et al. (2024)","previouslyFormattedCitation":"Tian et al. (2024)"},"properties":{"noteIndex":0},"schema":"https://github.com/citation-style-language/schema/raw/master/csl-citation.json"}</w:instrText>
+        <w:instrText xml:space="preserve">ADDIN CSL_CITATION {"citationID":"MENDELEY_CITATION_258","citationItems":[{"id":"ITEM-258","isTemporary":false,"itemData":{"DOI":"10.1103/PhysRevLett.133.200801","author":[{"family":"Tian","given":"Xiao-Hui"},{"family":"Yang","given":"Ran"},{"family":"Liu","given":"Hua-Ying"},{"family":"Fan","given":"Pengfei"},{"family":"Zhang","given":"Ji-Ning"},{"family":"Gu","given":"Changsheng"},{"family":"Chen","given":"Mengwen"},{"family":"Hu","given":"Mingzhe"},{"family":"Lu","given":"Feng-Yu"},{"family":"Yin","given":"Zhen-Qiang"},{"family":"Yin","given":"Zhi-Jun"},{"family":"Yuan","given":"Mo"},{"family":"Wang","given":"Shuang"},{"family":"Chen","given":"Wei"},{"family":"Gong","given":"Yan-Xiao"},{"family":"Zhu","given":"Shi-Ning"},{"family":"Xie","given":"Zhenda"}],"container-title":"Physical Review Letters","id":"Tian2023","issue":"20","issued":{"date-parts":[[2024]]},"page":"200801","publisher":"American Physical Society","title":"Experimental demonstration of drone-based quantum key distribution","type":"article-journal","volume":"133"},"suppress-author":false}],"isEdited":false,"manualOverride":{"citeprocText":"Tian et al. (2024)","isManuallyOverridden":false,"manualOverrideText":""},"mendeley":{"formattedCitation":"Tian et al. (2024)","plainTextFormattedCitation":"Tian et al. (2024)","previouslyFormattedCitation":"Tian et al. (2024)"},"properties":{"noteIndex":0},"schema":"https://github.com/citation-style-language/schema/raw/master/csl-citation.json"}</w:instrText>
       </w:r>
       <w:r>
         <w:fldChar w:fldCharType="separate"/>
@@ -12274,7 +12464,7 @@
         <w:fldChar w:fldCharType="begin"/>
       </w:r>
       <w:r>
-        <w:instrText xml:space="preserve">ADDIN CSL_CITATION {"citationID":"MENDELEY_CITATION_246","citationItems":[{"id":"ITEM-246","isTemporary":false,"itemData":{"DOI":"10.1103/PhysRevLett.126.020503","author":[{"family":"Liu","given":"Hua-Ying"},{"family":"Tian","given":"Xiao-Hui"},{"family":"Gu","given":"Changsheng"},{"family":"Fan","given":"Pengfei"},{"family":"Ni","given":"Xin"},{"family":"Yang","given":"Ran"},{"family":"Zhang","given":"Ji-Ning"},{"family":"Hu","given":"Mingzhe"},{"family":"Guo","given":"Jian"},{"family":"Cao","given":"Xun"},{"family":"Hu","given":"Xiaopeng"},{"family":"Zhao","given":"Gang"},{"family":"Lu","given":"Yan-Qing"},{"family":"Gong","given":"Yan-Xiao"},{"family":"Xie","given":"Zhenda"},{"family":"Zhu","given":"Shi-Ning"}],"container-title":"Physical Review Letters","id":"Liu2021","issued":{"date-parts":[[2021]]},"page":"020503","title":"Optical-relayed entanglement distribution using drones as mobile nodes","type":"article-journal","volume":"126"},"suppress-author":false}],"isEdited":false,"manualOverride":{"citeprocText":"Liu et al. (2021)","isManuallyOverridden":false,"manualOverrideText":""},"mendeley":{"formattedCitation":"Liu et al. (2021)","plainTextFormattedCitation":"Liu et al. (2021)","previouslyFormattedCitation":"Liu et al. (2021)"},"properties":{"noteIndex":0},"schema":"https://github.com/citation-style-language/schema/raw/master/csl-citation.json"}</w:instrText>
+        <w:instrText xml:space="preserve">ADDIN CSL_CITATION {"citationID":"MENDELEY_CITATION_259","citationItems":[{"id":"ITEM-259","isTemporary":false,"itemData":{"DOI":"10.1103/PhysRevLett.126.020503","author":[{"family":"Liu","given":"Hua-Ying"},{"family":"Tian","given":"Xiao-Hui"},{"family":"Gu","given":"Changsheng"},{"family":"Fan","given":"Pengfei"},{"family":"Ni","given":"Xin"},{"family":"Yang","given":"Ran"},{"family":"Zhang","given":"Ji-Ning"},{"family":"Hu","given":"Mingzhe"},{"family":"Guo","given":"Jian"},{"family":"Cao","given":"Xun"},{"family":"Hu","given":"Xiaopeng"},{"family":"Zhao","given":"Gang"},{"family":"Lu","given":"Yan-Qing"},{"family":"Gong","given":"Yan-Xiao"},{"family":"Xie","given":"Zhenda"},{"family":"Zhu","given":"Shi-Ning"}],"container-title":"Physical Review Letters","id":"Liu2021","issued":{"date-parts":[[2021]]},"page":"020503","title":"Optical-relayed entanglement distribution using drones as mobile nodes","type":"article-journal","volume":"126"},"suppress-author":false}],"isEdited":false,"manualOverride":{"citeprocText":"Liu et al. (2021)","isManuallyOverridden":false,"manualOverrideText":""},"mendeley":{"formattedCitation":"Liu et al. (2021)","plainTextFormattedCitation":"Liu et al. (2021)","previouslyFormattedCitation":"Liu et al. (2021)"},"properties":{"noteIndex":0},"schema":"https://github.com/citation-style-language/schema/raw/master/csl-citation.json"}</w:instrText>
       </w:r>
       <w:r>
         <w:fldChar w:fldCharType="separate"/>
@@ -12298,7 +12488,7 @@
         <w:fldChar w:fldCharType="begin"/>
       </w:r>
       <w:r>
-        <w:instrText xml:space="preserve">ADDIN CSL_CITATION {"citationID":"MENDELEY_CITATION_247","citationItems":[{"id":"ITEM-247","isTemporary":false,"itemData":{"DOI":"10.48550/arXiv.2505.17587","URL":"https://arxiv.org/abs/2505.17587","author":[{"family":"Conrad","given":"Andrew"},{"family":"Cochran","given":"Roderick"},{"family":"Sanchez-Rosales","given":"Daniel"},{"family":"Isaac","given":"Samantha"},{"family":"Javid","given":"Timur"},{"family":"Rezaei","given":"Tahereh"},{"family":"Schroeder","given":"A. J."},{"family":"Golba","given":"Grzegorz"},{"family":"Gutha","given":"Akash"},{"family":"Wilens","given":"Brian"},{"family":"Herndon","given":"Kyle"},{"family":"Hill","given":"Alex"},{"family":"Chapman","given":"Joseph"},{"family":"Call","given":"Ian"},{"family":"Szabo","given":"Joseph"},{"family":"Corrigan","given":"Aodhan"},{"family":"Kamin","given":"Lars"},{"family":"Lütkenhaus","given":"Norbert"},{"family":"Gauthier","given":"Daniel J."},{"family":"Kwiat","given":"Paul G."}],"id":"Conrad2025","issued":{"date-parts":[[2025]]},"title":"Drone- and vehicle-based quantum key distribution","type":""},"suppress-author":false}],"isEdited":false,"manualOverride":{"citeprocText":"Conrad et al. (2025)","isManuallyOverridden":false,"manualOverrideText":""},"mendeley":{"formattedCitation":"Conrad et al. (2025)","plainTextFormattedCitation":"Conrad et al. (2025)","previouslyFormattedCitation":"Conrad et al. (2025)"},"properties":{"noteIndex":0},"schema":"https://github.com/citation-style-language/schema/raw/master/csl-citation.json"}</w:instrText>
+        <w:instrText xml:space="preserve">ADDIN CSL_CITATION {"citationID":"MENDELEY_CITATION_260","citationItems":[{"id":"ITEM-260","isTemporary":false,"itemData":{"DOI":"10.48550/arXiv.2505.17587","URL":"https://arxiv.org/abs/2505.17587","author":[{"family":"Conrad","given":"Andrew"},{"family":"Cochran","given":"Roderick"},{"family":"Sanchez-Rosales","given":"Daniel"},{"family":"Isaac","given":"Samantha"},{"family":"Javid","given":"Timur"},{"family":"Rezaei","given":"Tahereh"},{"family":"Schroeder","given":"A. J."},{"family":"Golba","given":"Grzegorz"},{"family":"Gutha","given":"Akash"},{"family":"Wilens","given":"Brian"},{"family":"Herndon","given":"Kyle"},{"family":"Hill","given":"Alex"},{"family":"Chapman","given":"Joseph"},{"family":"Call","given":"Ian"},{"family":"Szabo","given":"Joseph"},{"family":"Corrigan","given":"Aodhan"},{"family":"Kamin","given":"Lars"},{"family":"Lütkenhaus","given":"Norbert"},{"family":"Gauthier","given":"Daniel J."},{"family":"Kwiat","given":"Paul G."}],"id":"Conrad2025","issued":{"date-parts":[[2025]]},"title":"Drone- and vehicle-based quantum key distribution","type":""},"suppress-author":false}],"isEdited":false,"manualOverride":{"citeprocText":"Conrad et al. (2025)","isManuallyOverridden":false,"manualOverrideText":""},"mendeley":{"formattedCitation":"Conrad et al. (2025)","plainTextFormattedCitation":"Conrad et al. (2025)","previouslyFormattedCitation":"Conrad et al. (2025)"},"properties":{"noteIndex":0},"schema":"https://github.com/citation-style-language/schema/raw/master/csl-citation.json"}</w:instrText>
       </w:r>
       <w:r>
         <w:fldChar w:fldCharType="separate"/>
@@ -12327,7 +12517,7 @@
         <w:fldChar w:fldCharType="begin"/>
       </w:r>
       <w:r>
-        <w:instrText xml:space="preserve">ADDIN CSL_CITATION {"citationID":"MENDELEY_CITATION_248","citationItems":[{"id":"ITEM-248","isTemporary":false,"itemData":{"DOI":"10.48550/arXiv.2504.08167","URL":"https://arxiv.org/abs/2504.08167","author":[{"family":"Muradoglu","given":"Murat"},{"family":"Johnsson","given":"Mattias T."},{"family":"Wilson","given":"Nathanial M."},{"family":"Cohen","given":"Yuval"},{"family":"Shin","given":"Dongki"},{"family":"Navickas","given":"Tomas"},{"family":"Pyragius","given":"Tadas"},{"family":"Thomas","given":"Divya"},{"family":"Thompson","given":"Daniel"},{"family":"Moore","given":"Steven I."},{"family":"Rahman","given":"Md Tanvir"},{"family":"Walker","given":"Adrian"},{"family":"Dutta","given":"Indranil"},{"family":"Bijjahalli","given":"Suraj"},{"family":"Berlocher","given":"Jacob"},{"family":"Hush","given":"Michael R."},{"family":"Anderson","given":"Russell P."},{"family":"Szigeti","given":"Stuart S."},{"family":"Biercuk","given":"Michael J."}],"id":"Muradoglu2025","issued":{"date-parts":[[2025]]},"title":"Quantum-assured magnetic navigation achieves positioning accuracy better than a strategic-grade INS in airborne and ground-based field trials","type":""}}],"isEdited":false,"manualOverride":{"citeprocText":"(Muradoglu et al. 2025)","isManuallyOverridden":false,"manualOverrideText":""},"mendeley":{"formattedCitation":"(Muradoglu et al. 2025)","plainTextFormattedCitation":"(Muradoglu et al. 2025)","previouslyFormattedCitation":"(Muradoglu et al. 2025)"},"properties":{"noteIndex":0},"schema":"https://github.com/citation-style-language/schema/raw/master/csl-citation.json"}</w:instrText>
+        <w:instrText xml:space="preserve">ADDIN CSL_CITATION {"citationID":"MENDELEY_CITATION_261","citationItems":[{"id":"ITEM-261","isTemporary":false,"itemData":{"DOI":"10.48550/arXiv.2504.08167","URL":"https://arxiv.org/abs/2504.08167","author":[{"family":"Muradoglu","given":"Murat"},{"family":"Johnsson","given":"Mattias T."},{"family":"Wilson","given":"Nathanial M."},{"family":"Cohen","given":"Yuval"},{"family":"Shin","given":"Dongki"},{"family":"Navickas","given":"Tomas"},{"family":"Pyragius","given":"Tadas"},{"family":"Thomas","given":"Divya"},{"family":"Thompson","given":"Daniel"},{"family":"Moore","given":"Steven I."},{"family":"Rahman","given":"Md Tanvir"},{"family":"Walker","given":"Adrian"},{"family":"Dutta","given":"Indranil"},{"family":"Bijjahalli","given":"Suraj"},{"family":"Berlocher","given":"Jacob"},{"family":"Hush","given":"Michael R."},{"family":"Anderson","given":"Russell P."},{"family":"Szigeti","given":"Stuart S."},{"family":"Biercuk","given":"Michael J."}],"id":"Muradoglu2025","issued":{"date-parts":[[2025]]},"title":"Quantum-assured magnetic navigation achieves positioning accuracy better than a strategic-grade INS in airborne and ground-based field trials","type":""}}],"isEdited":false,"manualOverride":{"citeprocText":"(Muradoglu et al. 2025)","isManuallyOverridden":false,"manualOverrideText":""},"mendeley":{"formattedCitation":"(Muradoglu et al. 2025)","plainTextFormattedCitation":"(Muradoglu et al. 2025)","previouslyFormattedCitation":"(Muradoglu et al. 2025)"},"properties":{"noteIndex":0},"schema":"https://github.com/citation-style-language/schema/raw/master/csl-citation.json"}</w:instrText>
       </w:r>
       <w:r>
         <w:fldChar w:fldCharType="separate"/>
@@ -12345,7 +12535,7 @@
         <w:fldChar w:fldCharType="begin"/>
       </w:r>
       <w:r>
-        <w:instrText xml:space="preserve">ADDIN CSL_CITATION {"citationID":"MENDELEY_CITATION_251","citationItems":[{"id":"ITEM-249","isTemporary":false,"itemData":{"DOI":"10.1103/PhysRevLett.133.200801","author":[{"family":"Tian","given":"Xiao-Hui"},{"family":"Yang","given":"Ran"},{"family":"Liu","given":"Hua-Ying"},{"family":"Fan","given":"Pengfei"},{"family":"Zhang","given":"Ji-Ning"},{"family":"Gu","given":"Changsheng"},{"family":"Chen","given":"Mengwen"},{"family":"Hu","given":"Mingzhe"},{"family":"Lu","given":"Feng-Yu"},{"family":"Yin","given":"Zhen-Qiang"},{"family":"Yin","given":"Zhi-Jun"},{"family":"Yuan","given":"Mo"},{"family":"Wang","given":"Shuang"},{"family":"Chen","given":"Wei"},{"family":"Gong","given":"Yan-Xiao"},{"family":"Zhu","given":"Shi-Ning"},{"family":"Xie","given":"Zhenda"}],"container-title":"Physical Review Letters","id":"Tian2023","issue":"20","issued":{"date-parts":[[2024]]},"page":"200801","publisher":"American Physical Society","title":"Experimental demonstration of drone-based quantum key distribution","type":"article-journal","volume":"133"}},{"id":"ITEM-250","isTemporary":false,"itemData":{"DOI":"10.48550/arXiv.2505.17587","URL":"https://arxiv.org/abs/2505.17587","author":[{"family":"Conrad","given":"Andrew"},{"family":"Cochran","given":"Roderick"},{"family":"Sanchez-Rosales","given":"Daniel"},{"family":"Isaac","given":"Samantha"},{"family":"Javid","given":"Timur"},{"family":"Rezaei","given":"Tahereh"},{"family":"Schroeder","given":"A. J."},{"family":"Golba","given":"Grzegorz"},{"family":"Gutha","given":"Akash"},{"family":"Wilens","given":"Brian"},{"family":"Herndon","given":"Kyle"},{"family":"Hill","given":"Alex"},{"family":"Chapman","given":"Joseph"},{"family":"Call","given":"Ian"},{"family":"Szabo","given":"Joseph"},{"family":"Corrigan","given":"Aodhan"},{"family":"Kamin","given":"Lars"},{"family":"Lütkenhaus","given":"Norbert"},{"family":"Gauthier","given":"Daniel J."},{"family":"Kwiat","given":"Paul G."}],"id":"Conrad2025","issued":{"date-parts":[[2025]]},"title":"Drone- and vehicle-based quantum key distribution","type":""}},{"id":"ITEM-251","isTemporary":false,"itemData":{"DOI":"10.1103/PhysRevLett.126.020503","author":[{"family":"Liu","given":"Hua-Ying"},{"family":"Tian","given":"Xiao-Hui"},{"family":"Gu","given":"Changsheng"},{"family":"Fan","given":"Pengfei"},{"family":"Ni","given":"Xin"},{"family":"Yang","given":"Ran"},{"family":"Zhang","given":"Ji-Ning"},{"family":"Hu","given":"Mingzhe"},{"family":"Guo","given":"Jian"},{"family":"Cao","given":"Xun"},{"family":"Hu","given":"Xiaopeng"},{"family":"Zhao","given":"Gang"},{"family":"Lu","given":"Yan-Qing"},{"family":"Gong","given":"Yan-Xiao"},{"family":"Xie","given":"Zhenda"},{"family":"Zhu","given":"Shi-Ning"}],"container-title":"Physical Review Letters","id":"Liu2021","issued":{"date-parts":[[2021]]},"page":"020503","title":"Optical-relayed entanglement distribution using drones as mobile nodes","type":"article-journal","volume":"126"}}],"isEdited":false,"manualOverride":{"citeprocText":"(Tian et al. 2024; Conrad et al. 2025; Liu et al. 2021)","isManuallyOverridden":false,"manualOverrideText":""},"mendeley":{"formattedCitation":"(Tian et al. 2024; Conrad et al. 2025; Liu et al. 2021)","plainTextFormattedCitation":"(Tian et al. 2024; Conrad et al. 2025; Liu et al. 2021)","previouslyFormattedCitation":"(Tian et al. 2024; Conrad et al. 2025; Liu et al. 2021)"},"properties":{"noteIndex":0},"schema":"https://github.com/citation-style-language/schema/raw/master/csl-citation.json"}</w:instrText>
+        <w:instrText xml:space="preserve">ADDIN CSL_CITATION {"citationID":"MENDELEY_CITATION_264","citationItems":[{"id":"ITEM-262","isTemporary":false,"itemData":{"DOI":"10.1103/PhysRevLett.133.200801","author":[{"family":"Tian","given":"Xiao-Hui"},{"family":"Yang","given":"Ran"},{"family":"Liu","given":"Hua-Ying"},{"family":"Fan","given":"Pengfei"},{"family":"Zhang","given":"Ji-Ning"},{"family":"Gu","given":"Changsheng"},{"family":"Chen","given":"Mengwen"},{"family":"Hu","given":"Mingzhe"},{"family":"Lu","given":"Feng-Yu"},{"family":"Yin","given":"Zhen-Qiang"},{"family":"Yin","given":"Zhi-Jun"},{"family":"Yuan","given":"Mo"},{"family":"Wang","given":"Shuang"},{"family":"Chen","given":"Wei"},{"family":"Gong","given":"Yan-Xiao"},{"family":"Zhu","given":"Shi-Ning"},{"family":"Xie","given":"Zhenda"}],"container-title":"Physical Review Letters","id":"Tian2023","issue":"20","issued":{"date-parts":[[2024]]},"page":"200801","publisher":"American Physical Society","title":"Experimental demonstration of drone-based quantum key distribution","type":"article-journal","volume":"133"}},{"id":"ITEM-263","isTemporary":false,"itemData":{"DOI":"10.48550/arXiv.2505.17587","URL":"https://arxiv.org/abs/2505.17587","author":[{"family":"Conrad","given":"Andrew"},{"family":"Cochran","given":"Roderick"},{"family":"Sanchez-Rosales","given":"Daniel"},{"family":"Isaac","given":"Samantha"},{"family":"Javid","given":"Timur"},{"family":"Rezaei","given":"Tahereh"},{"family":"Schroeder","given":"A. J."},{"family":"Golba","given":"Grzegorz"},{"family":"Gutha","given":"Akash"},{"family":"Wilens","given":"Brian"},{"family":"Herndon","given":"Kyle"},{"family":"Hill","given":"Alex"},{"family":"Chapman","given":"Joseph"},{"family":"Call","given":"Ian"},{"family":"Szabo","given":"Joseph"},{"family":"Corrigan","given":"Aodhan"},{"family":"Kamin","given":"Lars"},{"family":"Lütkenhaus","given":"Norbert"},{"family":"Gauthier","given":"Daniel J."},{"family":"Kwiat","given":"Paul G."}],"id":"Conrad2025","issued":{"date-parts":[[2025]]},"title":"Drone- and vehicle-based quantum key distribution","type":""}},{"id":"ITEM-264","isTemporary":false,"itemData":{"DOI":"10.1103/PhysRevLett.126.020503","author":[{"family":"Liu","given":"Hua-Ying"},{"family":"Tian","given":"Xiao-Hui"},{"family":"Gu","given":"Changsheng"},{"family":"Fan","given":"Pengfei"},{"family":"Ni","given":"Xin"},{"family":"Yang","given":"Ran"},{"family":"Zhang","given":"Ji-Ning"},{"family":"Hu","given":"Mingzhe"},{"family":"Guo","given":"Jian"},{"family":"Cao","given":"Xun"},{"family":"Hu","given":"Xiaopeng"},{"family":"Zhao","given":"Gang"},{"family":"Lu","given":"Yan-Qing"},{"family":"Gong","given":"Yan-Xiao"},{"family":"Xie","given":"Zhenda"},{"family":"Zhu","given":"Shi-Ning"}],"container-title":"Physical Review Letters","id":"Liu2021","issued":{"date-parts":[[2021]]},"page":"020503","title":"Optical-relayed entanglement distribution using drones as mobile nodes","type":"article-journal","volume":"126"}}],"isEdited":false,"manualOverride":{"citeprocText":"(Tian et al. 2024; Conrad et al. 2025; Liu et al. 2021)","isManuallyOverridden":false,"manualOverrideText":""},"mendeley":{"formattedCitation":"(Tian et al. 2024; Conrad et al. 2025; Liu et al. 2021)","plainTextFormattedCitation":"(Tian et al. 2024; Conrad et al. 2025; Liu et al. 2021)","previouslyFormattedCitation":"(Tian et al. 2024; Conrad et al. 2025; Liu et al. 2021)"},"properties":{"noteIndex":0},"schema":"https://github.com/citation-style-language/schema/raw/master/csl-citation.json"}</w:instrText>
       </w:r>
       <w:r>
         <w:fldChar w:fldCharType="separate"/>
@@ -12371,7 +12561,7 @@
         <w:fldChar w:fldCharType="begin"/>
       </w:r>
       <w:r>
-        <w:instrText xml:space="preserve">ADDIN CSL_CITATION {"citationID":"MENDELEY_CITATION_253","citationItems":[{"id":"ITEM-252","isTemporary":false,"itemData":{"DOI":"10.1103/PhysRevApplied.10.034030","author":[{"family":"Cheiney","given":"Pierrick"},{"family":"Fouché","given":"Lauriane"},{"family":"Templier","given":"Simon"},{"family":"Napolitano","given":"Fabien"},{"family":"Battelier","given":"Baptiste"},{"family":"Bouyer","given":"Philippe"},{"family":"Barrett","given":"Brynle"}],"container-title":"Physical Review Applied","id":"Cheiney2018","issue":"3","issued":{"date-parts":[[2018]]},"page":"034030","publisher":"American Physical Society","title":"Navigation-compatible hybrid quantum accelerometer using a Kalman filter","type":"article-journal","volume":"10"}},{"id":"ITEM-253","isTemporary":false,"itemData":{"DOI":"10.48550/arXiv.2103.09378","URL":"https://arxiv.org/abs/2103.09378","author":[{"family":"Wang","given":"Xuezhi"},{"family":"Kealy","given":"Allison"},{"family":"Gilliam","given":"Christopher"},{"family":"Haine","given":"Simon"},{"family":"Close","given":"John"},{"family":"Moran","given":"Bill"},{"family":"Talbot","given":"Kyle"},{"family":"Williams","given":"Simon"},{"family":"Hardman","given":"Kyle"},{"family":"Freier","given":"Chris"},{"family":"Wigley","given":"Paul"},{"family":"White","given":"Angela"},{"family":"Szigeti","given":"Stuart"},{"family":"Legge","given":"Sam"}],"id":"Wang2021","issued":{"date-parts":[[2021]]},"title":"Enhancing inertial navigation performance via fusion of classical and quantum accelerometers","type":""}}],"isEdited":false,"manualOverride":{"citeprocText":"(Cheiney et al. 2018; Xuezhi Wang et al. 2021)","isManuallyOverridden":false,"manualOverrideText":""},"mendeley":{"formattedCitation":"(Cheiney et al. 2018; Xuezhi Wang et al. 2021)","plainTextFormattedCitation":"(Cheiney et al. 2018; Xuezhi Wang et al. 2021)","previouslyFormattedCitation":"(Cheiney et al. 2018; Xuezhi Wang et al. 2021)"},"properties":{"noteIndex":0},"schema":"https://github.com/citation-style-language/schema/raw/master/csl-citation.json"}</w:instrText>
+        <w:instrText xml:space="preserve">ADDIN CSL_CITATION {"citationID":"MENDELEY_CITATION_266","citationItems":[{"id":"ITEM-265","isTemporary":false,"itemData":{"DOI":"10.1103/PhysRevApplied.10.034030","author":[{"family":"Cheiney","given":"Pierrick"},{"family":"Fouché","given":"Lauriane"},{"family":"Templier","given":"Simon"},{"family":"Napolitano","given":"Fabien"},{"family":"Battelier","given":"Baptiste"},{"family":"Bouyer","given":"Philippe"},{"family":"Barrett","given":"Brynle"}],"container-title":"Physical Review Applied","id":"Cheiney2018","issue":"3","issued":{"date-parts":[[2018]]},"page":"034030","publisher":"American Physical Society","title":"Navigation-compatible hybrid quantum accelerometer using a Kalman filter","type":"article-journal","volume":"10"}},{"id":"ITEM-266","isTemporary":false,"itemData":{"DOI":"10.48550/arXiv.2103.09378","URL":"https://arxiv.org/abs/2103.09378","author":[{"family":"Wang","given":"Xuezhi"},{"family":"Kealy","given":"Allison"},{"family":"Gilliam","given":"Christopher"},{"family":"Haine","given":"Simon"},{"family":"Close","given":"John"},{"family":"Moran","given":"Bill"},{"family":"Talbot","given":"Kyle"},{"family":"Williams","given":"Simon"},{"family":"Hardman","given":"Kyle"},{"family":"Freier","given":"Chris"},{"family":"Wigley","given":"Paul"},{"family":"White","given":"Angela"},{"family":"Szigeti","given":"Stuart"},{"family":"Legge","given":"Sam"}],"id":"Wang2021","issued":{"date-parts":[[2021]]},"title":"Enhancing inertial navigation performance via fusion of classical and quantum accelerometers","type":""}}],"isEdited":false,"manualOverride":{"citeprocText":"(Cheiney et al. 2018; Xuezhi Wang et al. 2021)","isManuallyOverridden":false,"manualOverrideText":""},"mendeley":{"formattedCitation":"(Cheiney et al. 2018; Xuezhi Wang et al. 2021)","plainTextFormattedCitation":"(Cheiney et al. 2018; Xuezhi Wang et al. 2021)","previouslyFormattedCitation":"(Cheiney et al. 2018; Xuezhi Wang et al. 2021)"},"properties":{"noteIndex":0},"schema":"https://github.com/citation-style-language/schema/raw/master/csl-citation.json"}</w:instrText>
       </w:r>
       <w:r>
         <w:fldChar w:fldCharType="separate"/>
@@ -12389,7 +12579,7 @@
         <w:fldChar w:fldCharType="begin"/>
       </w:r>
       <w:r>
-        <w:instrText xml:space="preserve">ADDIN CSL_CITATION {"citationID":"MENDELEY_CITATION_254","citationItems":[{"id":"ITEM-254","isTemporary":false,"itemData":{"DOI":"10.1038/s42254-019-0117-4","author":[{"family":"Bongs","given":"Kai"},{"family":"Holynski","given":"Michael"},{"family":"Vovrosh","given":"Jamie"},{"family":"Bouyer","given":"Philippe"},{"family":"Condon","given":"Gabriel"},{"family":"Rasel","given":"Ernst"},{"family":"Schubert","given":"Christian"},{"family":"Schleich","given":"Wolfgang P."},{"family":"Roura","given":"Albert"}],"container-title":"Nature Reviews Physics","id":"Bongs2019","issue":"12","issued":{"date-parts":[[2019]]},"page":"731-739","publisher":"Nature Publishing Group","title":"Taking atom interferometric quantum sensors from the laboratory to real-world applications","type":"article-journal","volume":"1"}}],"isEdited":false,"manualOverride":{"citeprocText":"(Bongs et al. 2019)","isManuallyOverridden":false,"manualOverrideText":""},"mendeley":{"formattedCitation":"(Bongs et al. 2019)","plainTextFormattedCitation":"(Bongs et al. 2019)","previouslyFormattedCitation":"(Bongs et al. 2019)"},"properties":{"noteIndex":0},"schema":"https://github.com/citation-style-language/schema/raw/master/csl-citation.json"}</w:instrText>
+        <w:instrText xml:space="preserve">ADDIN CSL_CITATION {"citationID":"MENDELEY_CITATION_267","citationItems":[{"id":"ITEM-267","isTemporary":false,"itemData":{"DOI":"10.1038/s42254-019-0117-4","author":[{"family":"Bongs","given":"Kai"},{"family":"Holynski","given":"Michael"},{"family":"Vovrosh","given":"Jamie"},{"family":"Bouyer","given":"Philippe"},{"family":"Condon","given":"Gabriel"},{"family":"Rasel","given":"Ernst"},{"family":"Schubert","given":"Christian"},{"family":"Schleich","given":"Wolfgang P."},{"family":"Roura","given":"Albert"}],"container-title":"Nature Reviews Physics","id":"Bongs2019","issue":"12","issued":{"date-parts":[[2019]]},"page":"731-739","publisher":"Nature Publishing Group","title":"Taking atom interferometric quantum sensors from the laboratory to real-world applications","type":"article-journal","volume":"1"}}],"isEdited":false,"manualOverride":{"citeprocText":"(Bongs et al. 2019)","isManuallyOverridden":false,"manualOverrideText":""},"mendeley":{"formattedCitation":"(Bongs et al. 2019)","plainTextFormattedCitation":"(Bongs et al. 2019)","previouslyFormattedCitation":"(Bongs et al. 2019)"},"properties":{"noteIndex":0},"schema":"https://github.com/citation-style-language/schema/raw/master/csl-citation.json"}</w:instrText>
       </w:r>
       <w:r>
         <w:fldChar w:fldCharType="separate"/>
@@ -12453,7 +12643,7 @@
         <w:fldChar w:fldCharType="begin"/>
       </w:r>
       <w:r>
-        <w:instrText xml:space="preserve">ADDIN CSL_CITATION {"citationID":"MENDELEY_CITATION_257","citationItems":[{"id":"ITEM-255","isTemporary":false,"itemData":{"DOI":"10.1088/1367-2630/18/2/023023","author":[{"family":"McClean","given":"Jarrod R."},{"family":"Romero","given":"Jonathan"},{"family":"Babbush","given":"Ryan"},{"family":"Aspuru-Guzik","given":"Alán"}],"container-title":"New Journal of Physics","id":"McClean2016","issue":"2","issued":{"date-parts":[[2016]]},"page":"023023","publisher":"IOP Publishing","title":"The theory of variational hybrid quantum-classical algorithms","type":"article-journal","volume":"18"}},{"id":"ITEM-256","isTemporary":false,"itemData":{"DOI":"10.1038/s42254-021-00348-9","author":[{"family":"Cerezo","given":"M."},{"family":"Arrasmith","given":"Andrew"},{"family":"Babbush","given":"Ryan"},{"family":"Benjamin","given":"Simon C."},{"family":"Endo","given":"Suguru"},{"family":"Fujii","given":"Keisuke"},{"family":"McClean","given":"Jarrod R."},{"family":"Mitarai","given":"Kosuke"},{"family":"Yuan","given":"Xiao"},{"family":"Cincio","given":"Lukasz"},{"family":"Coles","given":"Patrick J."}],"container-title":"Nature Reviews Physics","id":"Cerezo2021a","issue":"9","issued":{"date-parts":[[2021]]},"page":"625-644","publisher":"Nature Publishing Group","title":"Variational quantum algorithms","type":"article-journal","volume":"3"}},{"id":"ITEM-257","isTemporary":false,"itemData":{"DOI":"10.1103/RevModPhys.94.015004","author":[{"family":"Bharti","given":"Kishor"},{"family":"Cervera-Lierta","given":"Alba"},{"family":"Kyaw","given":"Thi Ha"},{"family":"Haug","given":"Tobias"},{"family":"Alperin-Lea","given":"Sumner"},{"family":"Anand","given":"Abhinav"},{"family":"Degroote","given":"Matthias"},{"family":"Heimonen","given":"Hermanni"},{"family":"Kottmann","given":"Jakob S."},{"family":"Menke","given":"Tim"},{"family":"Mok","given":"Wai-Keong"},{"family":"Sim","given":"Sukin"},{"family":"Kwek","given":"Leong-Chuan"},{"family":"Aspuru-Guzik","given":"Alán"}],"container-title":"Reviews of Modern Physics","id":"Bharti2022","issue":"1","issued":{"date-parts":[[2022]]},"page":"015004","title":"Noisy intermediate-scale quantum algorithms","type":"article-journal","volume":"94"}}],"isEdited":false,"manualOverride":{"citeprocText":"(McClean et al. 2016; Cerezo, Arrasmith, et al. 2021; Bharti et al. 2022)","isManuallyOverridden":false,"manualOverrideText":""},"mendeley":{"formattedCitation":"(McClean et al. 2016; Cerezo, Arrasmith, et al. 2021; Bharti et al. 2022)","plainTextFormattedCitation":"(McClean et al. 2016; Cerezo, Arrasmith, et al. 2021; Bharti et al. 2022)","previouslyFormattedCitation":"(McClean et al. 2016; Cerezo, Arrasmith, et al. 2021; Bharti et al. 2022)"},"properties":{"noteIndex":0},"schema":"https://github.com/citation-style-language/schema/raw/master/csl-citation.json"}</w:instrText>
+        <w:instrText xml:space="preserve">ADDIN CSL_CITATION {"citationID":"MENDELEY_CITATION_270","citationItems":[{"id":"ITEM-268","isTemporary":false,"itemData":{"DOI":"10.1088/1367-2630/18/2/023023","author":[{"family":"McClean","given":"Jarrod R."},{"family":"Romero","given":"Jonathan"},{"family":"Babbush","given":"Ryan"},{"family":"Aspuru-Guzik","given":"Alán"}],"container-title":"New Journal of Physics","id":"McClean2016","issue":"2","issued":{"date-parts":[[2016]]},"page":"023023","publisher":"IOP Publishing","title":"The theory of variational hybrid quantum-classical algorithms","type":"article-journal","volume":"18"}},{"id":"ITEM-269","isTemporary":false,"itemData":{"DOI":"10.1038/s42254-021-00348-9","author":[{"family":"Cerezo","given":"M."},{"family":"Arrasmith","given":"Andrew"},{"family":"Babbush","given":"Ryan"},{"family":"Benjamin","given":"Simon C."},{"family":"Endo","given":"Suguru"},{"family":"Fujii","given":"Keisuke"},{"family":"McClean","given":"Jarrod R."},{"family":"Mitarai","given":"Kosuke"},{"family":"Yuan","given":"Xiao"},{"family":"Cincio","given":"Lukasz"},{"family":"Coles","given":"Patrick J."}],"container-title":"Nature Reviews Physics","id":"Cerezo2021a","issue":"9","issued":{"date-parts":[[2021]]},"page":"625-644","publisher":"Nature Publishing Group","title":"Variational quantum algorithms","type":"article-journal","volume":"3"}},{"id":"ITEM-270","isTemporary":false,"itemData":{"DOI":"10.1103/RevModPhys.94.015004","author":[{"family":"Bharti","given":"Kishor"},{"family":"Cervera-Lierta","given":"Alba"},{"family":"Kyaw","given":"Thi Ha"},{"family":"Haug","given":"Tobias"},{"family":"Alperin-Lea","given":"Sumner"},{"family":"Anand","given":"Abhinav"},{"family":"Degroote","given":"Matthias"},{"family":"Heimonen","given":"Hermanni"},{"family":"Kottmann","given":"Jakob S."},{"family":"Menke","given":"Tim"},{"family":"Mok","given":"Wai-Keong"},{"family":"Sim","given":"Sukin"},{"family":"Kwek","given":"Leong-Chuan"},{"family":"Aspuru-Guzik","given":"Alán"}],"container-title":"Reviews of Modern Physics","id":"Bharti2022","issue":"1","issued":{"date-parts":[[2022]]},"page":"015004","title":"Noisy intermediate-scale quantum algorithms","type":"article-journal","volume":"94"}}],"isEdited":false,"manualOverride":{"citeprocText":"(McClean et al. 2016; Cerezo, Arrasmith, et al. 2021; Bharti et al. 2022)","isManuallyOverridden":false,"manualOverrideText":""},"mendeley":{"formattedCitation":"(McClean et al. 2016; Cerezo, Arrasmith, et al. 2021; Bharti et al. 2022)","plainTextFormattedCitation":"(McClean et al. 2016; Cerezo, Arrasmith, et al. 2021; Bharti et al. 2022)","previouslyFormattedCitation":"(McClean et al. 2016; Cerezo, Arrasmith, et al. 2021; Bharti et al. 2022)"},"properties":{"noteIndex":0},"schema":"https://github.com/citation-style-language/schema/raw/master/csl-citation.json"}</w:instrText>
       </w:r>
       <w:r>
         <w:fldChar w:fldCharType="separate"/>
@@ -12471,7 +12661,7 @@
         <w:fldChar w:fldCharType="begin"/>
       </w:r>
       <w:r>
-        <w:instrText xml:space="preserve">ADDIN CSL_CITATION {"citationID":"MENDELEY_CITATION_258","citationItems":[{"id":"ITEM-258","isTemporary":false,"itemData":{"DOI":"10.7566/JPSJ.90.032001","author":[{"family":"Endo","given":"Suguru"},{"family":"Cai","given":"Zhenyu"},{"family":"Benjamin","given":"Simon C."},{"family":"Yuan","given":"Xiao"}],"container-title":"Journal of the Physical Society of Japan","id":"Endo2021","issue":"3","issued":{"date-parts":[[2021]]},"page":"032001","publisher":"The Physical Society of Japan","title":"Hybrid quantum-classical algorithms and quantum error mitigation","type":"article-journal","volume":"90"}}],"isEdited":false,"manualOverride":{"citeprocText":"(Endo et al. 2021)","isManuallyOverridden":false,"manualOverrideText":""},"mendeley":{"formattedCitation":"(Endo et al. 2021)","plainTextFormattedCitation":"(Endo et al. 2021)","previouslyFormattedCitation":"(Endo et al. 2021)"},"properties":{"noteIndex":0},"schema":"https://github.com/citation-style-language/schema/raw/master/csl-citation.json"}</w:instrText>
+        <w:instrText xml:space="preserve">ADDIN CSL_CITATION {"citationID":"MENDELEY_CITATION_271","citationItems":[{"id":"ITEM-271","isTemporary":false,"itemData":{"DOI":"10.7566/JPSJ.90.032001","author":[{"family":"Endo","given":"Suguru"},{"family":"Cai","given":"Zhenyu"},{"family":"Benjamin","given":"Simon C."},{"family":"Yuan","given":"Xiao"}],"container-title":"Journal of the Physical Society of Japan","id":"Endo2021","issue":"3","issued":{"date-parts":[[2021]]},"page":"032001","publisher":"The Physical Society of Japan","title":"Hybrid quantum-classical algorithms and quantum error mitigation","type":"article-journal","volume":"90"}}],"isEdited":false,"manualOverride":{"citeprocText":"(Endo et al. 2021)","isManuallyOverridden":false,"manualOverrideText":""},"mendeley":{"formattedCitation":"(Endo et al. 2021)","plainTextFormattedCitation":"(Endo et al. 2021)","previouslyFormattedCitation":"(Endo et al. 2021)"},"properties":{"noteIndex":0},"schema":"https://github.com/citation-style-language/schema/raw/master/csl-citation.json"}</w:instrText>
       </w:r>
       <w:r>
         <w:fldChar w:fldCharType="separate"/>
@@ -12516,7 +12706,7 @@
         <w:fldChar w:fldCharType="begin"/>
       </w:r>
       <w:r>
-        <w:instrText xml:space="preserve">ADDIN CSL_CITATION {"citationID":"MENDELEY_CITATION_259","citationItems":[{"id":"ITEM-259","isTemporary":false,"itemData":{"DOI":"10.1007/s42484-024-00226-4","author":[{"family":"Sinha","given":"Akash"},{"family":"Macaluso","given":"Antonio"},{"family":"Klusch","given":"Matthias"}],"container-title":"Quantum Machine Intelligence","id":"Sinha2023","issued":{"date-parts":[[2025]]},"page":"19","publisher":"Springer","title":"Nav-Q: Quantum deep reinforcement learning for collision-free navigation of self-driving cars","title-short":"Nav-Q","type":"article-journal","volume":"7"}}],"isEdited":false,"manualOverride":{"citeprocText":"(Sinha, Macaluso, and Klusch 2025)","isManuallyOverridden":false,"manualOverrideText":""},"mendeley":{"formattedCitation":"(Sinha, Macaluso, and Klusch 2025)","plainTextFormattedCitation":"(Sinha, Macaluso, and Klusch 2025)","previouslyFormattedCitation":"(Sinha, Macaluso, and Klusch 2025)"},"properties":{"noteIndex":0},"schema":"https://github.com/citation-style-language/schema/raw/master/csl-citation.json"}</w:instrText>
+        <w:instrText xml:space="preserve">ADDIN CSL_CITATION {"citationID":"MENDELEY_CITATION_272","citationItems":[{"id":"ITEM-272","isTemporary":false,"itemData":{"DOI":"10.1007/s42484-024-00226-4","author":[{"family":"Sinha","given":"Akash"},{"family":"Macaluso","given":"Antonio"},{"family":"Klusch","given":"Matthias"}],"container-title":"Quantum Machine Intelligence","id":"Sinha2023","issued":{"date-parts":[[2025]]},"page":"19","publisher":"Springer","title":"Nav-Q: Quantum deep reinforcement learning for collision-free navigation of self-driving cars","title-short":"Nav-Q","type":"article-journal","volume":"7"}}],"isEdited":false,"manualOverride":{"citeprocText":"(Sinha, Macaluso, and Klusch 2025)","isManuallyOverridden":false,"manualOverrideText":""},"mendeley":{"formattedCitation":"(Sinha, Macaluso, and Klusch 2025)","plainTextFormattedCitation":"(Sinha, Macaluso, and Klusch 2025)","previouslyFormattedCitation":"(Sinha, Macaluso, and Klusch 2025)"},"properties":{"noteIndex":0},"schema":"https://github.com/citation-style-language/schema/raw/master/csl-citation.json"}</w:instrText>
       </w:r>
       <w:r>
         <w:fldChar w:fldCharType="separate"/>
@@ -12547,7 +12737,7 @@
         <w:fldChar w:fldCharType="begin"/>
       </w:r>
       <w:r>
-        <w:instrText xml:space="preserve">ADDIN CSL_CITATION {"citationID":"MENDELEY_CITATION_260","citationItems":[{"id":"ITEM-260","isTemporary":false,"itemData":{"DOI":"10.3389/fcomp.2019.00009","author":[{"family":"Ohzeki","given":"Masayuki"},{"family":"Miki","given":"Akira"},{"family":"Miyama","given":"Masamichi J."},{"family":"Terabe","given":"Masayoshi"}],"container-title":"Frontiers in Computer Science","id":"Ohzeki2019","issued":{"date-parts":[[2019]]},"page":"9","publisher":"Frontiers Media","title":"Control of automated guided vehicles without collision by quantum annealer and digital devices","type":"article-journal","volume":"1"}}],"isEdited":false,"manualOverride":{"citeprocText":"(Ohzeki et al. 2019)","isManuallyOverridden":false,"manualOverrideText":""},"mendeley":{"formattedCitation":"(Ohzeki et al. 2019)","plainTextFormattedCitation":"(Ohzeki et al. 2019)","previouslyFormattedCitation":"(Ohzeki et al. 2019)"},"properties":{"noteIndex":0},"schema":"https://github.com/citation-style-language/schema/raw/master/csl-citation.json"}</w:instrText>
+        <w:instrText xml:space="preserve">ADDIN CSL_CITATION {"citationID":"MENDELEY_CITATION_273","citationItems":[{"id":"ITEM-273","isTemporary":false,"itemData":{"DOI":"10.3389/fcomp.2019.00009","author":[{"family":"Ohzeki","given":"Masayuki"},{"family":"Miki","given":"Akira"},{"family":"Miyama","given":"Masamichi J."},{"family":"Terabe","given":"Masayoshi"}],"container-title":"Frontiers in Computer Science","id":"Ohzeki2019","issued":{"date-parts":[[2019]]},"page":"9","publisher":"Frontiers Media","title":"Control of automated guided vehicles without collision by quantum annealer and digital devices","type":"article-journal","volume":"1"}}],"isEdited":false,"manualOverride":{"citeprocText":"(Ohzeki et al. 2019)","isManuallyOverridden":false,"manualOverrideText":""},"mendeley":{"formattedCitation":"(Ohzeki et al. 2019)","plainTextFormattedCitation":"(Ohzeki et al. 2019)","previouslyFormattedCitation":"(Ohzeki et al. 2019)"},"properties":{"noteIndex":0},"schema":"https://github.com/citation-style-language/schema/raw/master/csl-citation.json"}</w:instrText>
       </w:r>
       <w:r>
         <w:fldChar w:fldCharType="separate"/>
@@ -12565,7 +12755,7 @@
         <w:fldChar w:fldCharType="begin"/>
       </w:r>
       <w:r>
-        <w:instrText xml:space="preserve">ADDIN CSL_CITATION {"citationID":"MENDELEY_CITATION_261","citationItems":[{"id":"ITEM-261","isTemporary":false,"itemData":{"DOI":"10.1145/3293320.3293333","author":[{"family":"Clark","given":"James"},{"family":"West","given":"Tristan"},{"family":"Zammit","given":"Joseph Paul"},{"family":"Guo","given":"Xiaohu"},{"family":"Mason","given":"Luke"},{"family":"Russell","given":"Duncan"}],"container-title":"Proceedings of the international conference on high performance computing in asia-pacific region (HPC Asia 2019)","id":"Clark2019","issued":{"date-parts":[[2019]]},"page":"111-119","publisher":"ACM","publisher-place":"New York, NY, USA","title":"Towards real time multi-robot routing using quantum computing technologies","type":"paper-conference"}}],"isEdited":false,"manualOverride":{"citeprocText":"(Clark et al. 2019)","isManuallyOverridden":false,"manualOverrideText":""},"mendeley":{"formattedCitation":"(Clark et al. 2019)","plainTextFormattedCitation":"(Clark et al. 2019)","previouslyFormattedCitation":"(Clark et al. 2019)"},"properties":{"noteIndex":0},"schema":"https://github.com/citation-style-language/schema/raw/master/csl-citation.json"}</w:instrText>
+        <w:instrText xml:space="preserve">ADDIN CSL_CITATION {"citationID":"MENDELEY_CITATION_274","citationItems":[{"id":"ITEM-274","isTemporary":false,"itemData":{"DOI":"10.1145/3293320.3293333","author":[{"family":"Clark","given":"James"},{"family":"West","given":"Tristan"},{"family":"Zammit","given":"Joseph Paul"},{"family":"Guo","given":"Xiaohu"},{"family":"Mason","given":"Luke"},{"family":"Russell","given":"Duncan"}],"container-title":"Proceedings of the international conference on high performance computing in asia-pacific region (HPC Asia 2019)","id":"Clark2019","issued":{"date-parts":[[2019]]},"page":"111-119","publisher":"ACM","publisher-place":"New York, NY, USA","title":"Towards real time multi-robot routing using quantum computing technologies","type":"paper-conference"}}],"isEdited":false,"manualOverride":{"citeprocText":"(Clark et al. 2019)","isManuallyOverridden":false,"manualOverrideText":""},"mendeley":{"formattedCitation":"(Clark et al. 2019)","plainTextFormattedCitation":"(Clark et al. 2019)","previouslyFormattedCitation":"(Clark et al. 2019)"},"properties":{"noteIndex":0},"schema":"https://github.com/citation-style-language/schema/raw/master/csl-citation.json"}</w:instrText>
       </w:r>
       <w:r>
         <w:fldChar w:fldCharType="separate"/>
@@ -12583,7 +12773,7 @@
         <w:fldChar w:fldCharType="begin"/>
       </w:r>
       <w:r>
-        <w:instrText xml:space="preserve">ADDIN CSL_CITATION {"citationID":"MENDELEY_CITATION_262","citationItems":[{"id":"ITEM-262","isTemporary":false,"itemData":{"DOI":"10.3390/a14070194","author":[{"family":"Atchade-Adelomou","given":"Parfait"},{"family":"Alonso-Linaje","given":"Guillermo"},{"family":"Albo-Canals","given":"Jordi"},{"family":"Casado-Fauli","given":"Daniel"}],"container-title":"Algorithms","id":"AtchadeAdelomou2021","issue":"7","issued":{"date-parts":[[2021]]},"page":"194","publisher":"MDPI","title":"qRobot: A quantum computing approach in mobile robot order picking and batching problem solver optimization","title-short":"qRobot","type":"article-journal","volume":"14"}}],"isEdited":false,"manualOverride":{"citeprocText":"(Atchade-Adelomou et al. 2021)","isManuallyOverridden":false,"manualOverrideText":""},"mendeley":{"formattedCitation":"(Atchade-Adelomou et al. 2021)","plainTextFormattedCitation":"(Atchade-Adelomou et al. 2021)","previouslyFormattedCitation":"(Atchade-Adelomou et al. 2021)"},"properties":{"noteIndex":0},"schema":"https://github.com/citation-style-language/schema/raw/master/csl-citation.json"}</w:instrText>
+        <w:instrText xml:space="preserve">ADDIN CSL_CITATION {"citationID":"MENDELEY_CITATION_275","citationItems":[{"id":"ITEM-275","isTemporary":false,"itemData":{"DOI":"10.3390/a14070194","author":[{"family":"Atchade-Adelomou","given":"Parfait"},{"family":"Alonso-Linaje","given":"Guillermo"},{"family":"Albo-Canals","given":"Jordi"},{"family":"Casado-Fauli","given":"Daniel"}],"container-title":"Algorithms","id":"AtchadeAdelomou2021","issue":"7","issued":{"date-parts":[[2021]]},"page":"194","publisher":"MDPI","title":"qRobot: A quantum computing approach in mobile robot order picking and batching problem solver optimization","title-short":"qRobot","type":"article-journal","volume":"14"}}],"isEdited":false,"manualOverride":{"citeprocText":"(Atchade-Adelomou et al. 2021)","isManuallyOverridden":false,"manualOverrideText":""},"mendeley":{"formattedCitation":"(Atchade-Adelomou et al. 2021)","plainTextFormattedCitation":"(Atchade-Adelomou et al. 2021)","previouslyFormattedCitation":"(Atchade-Adelomou et al. 2021)"},"properties":{"noteIndex":0},"schema":"https://github.com/citation-style-language/schema/raw/master/csl-citation.json"}</w:instrText>
       </w:r>
       <w:r>
         <w:fldChar w:fldCharType="separate"/>
@@ -12614,7 +12804,7 @@
         <w:fldChar w:fldCharType="begin"/>
       </w:r>
       <w:r>
-        <w:instrText xml:space="preserve">ADDIN CSL_CITATION {"citationID":"MENDELEY_CITATION_263","citationItems":[{"id":"ITEM-263","isTemporary":false,"itemData":{"URL":"https://arxiv.org/abs/2605.20801","author":[{"family":"Altrabulsi","given":"Mohamed Khair"},{"family":"Innan","given":"Nouhaila"},{"family":"Marchisio","given":"Alberto"},{"family":"Kashif","given":"Muhammad"},{"family":"Shafique","given":"Muhammad"}],"id":"Altrabulsi2026","issued":{"date-parts":[[2026]]},"title":"Q-SpiRL: Quantum spiking reinforcement learning for adaptive robot navigation","title-short":"Q-SpiRL","type":""}}],"isEdited":false,"manualOverride":{"citeprocText":"(Altrabulsi et al. 2026)","isManuallyOverridden":false,"manualOverrideText":""},"mendeley":{"formattedCitation":"(Altrabulsi et al. 2026)","plainTextFormattedCitation":"(Altrabulsi et al. 2026)","previouslyFormattedCitation":"(Altrabulsi et al. 2026)"},"properties":{"noteIndex":0},"schema":"https://github.com/citation-style-language/schema/raw/master/csl-citation.json"}</w:instrText>
+        <w:instrText xml:space="preserve">ADDIN CSL_CITATION {"citationID":"MENDELEY_CITATION_276","citationItems":[{"id":"ITEM-276","isTemporary":false,"itemData":{"URL":"https://arxiv.org/abs/2605.20801","author":[{"family":"Altrabulsi","given":"Mohamed Khair"},{"family":"Innan","given":"Nouhaila"},{"family":"Marchisio","given":"Alberto"},{"family":"Kashif","given":"Muhammad"},{"family":"Shafique","given":"Muhammad"}],"id":"Altrabulsi2026","issued":{"date-parts":[[2026]]},"title":"Q-SpiRL: Quantum spiking reinforcement learning for adaptive robot navigation","title-short":"Q-SpiRL","type":""}}],"isEdited":false,"manualOverride":{"citeprocText":"(Altrabulsi et al. 2026)","isManuallyOverridden":false,"manualOverrideText":""},"mendeley":{"formattedCitation":"(Altrabulsi et al. 2026)","plainTextFormattedCitation":"(Altrabulsi et al. 2026)","previouslyFormattedCitation":"(Altrabulsi et al. 2026)"},"properties":{"noteIndex":0},"schema":"https://github.com/citation-style-language/schema/raw/master/csl-citation.json"}</w:instrText>
       </w:r>
       <w:r>
         <w:fldChar w:fldCharType="separate"/>
@@ -12635,7 +12825,7 @@
         <w:fldChar w:fldCharType="begin"/>
       </w:r>
       <w:r>
-        <w:instrText xml:space="preserve">ADDIN CSL_CITATION {"citationID":"MENDELEY_CITATION_264","citationItems":[{"id":"ITEM-264","isTemporary":false,"itemData":{"DOI":"10.1016/j.robot.2025.105026","author":[{"family":"Antero","given":"Unai"},{"family":"Sierra","given":"Basilio"},{"family":"Oñativia","given":"Jon"},{"family":"Ruiz","given":"Alejandra"},{"family":"Osaba","given":"Eneko"}],"container-title":"Robotics and Autonomous Systems","id":"Antero2025","issued":{"date-parts":[[2025]]},"page":"105026","publisher":"Elsevier","title":"Robot localization aided by quantum algorithms","type":"article-journal","volume":"192"}}],"isEdited":false,"manualOverride":{"citeprocText":"(Antero et al. 2025)","isManuallyOverridden":false,"manualOverrideText":""},"mendeley":{"formattedCitation":"(Antero et al. 2025)","plainTextFormattedCitation":"(Antero et al. 2025)","previouslyFormattedCitation":"(Antero et al. 2025)"},"properties":{"noteIndex":0},"schema":"https://github.com/citation-style-language/schema/raw/master/csl-citation.json"}</w:instrText>
+        <w:instrText xml:space="preserve">ADDIN CSL_CITATION {"citationID":"MENDELEY_CITATION_277","citationItems":[{"id":"ITEM-277","isTemporary":false,"itemData":{"DOI":"10.1016/j.robot.2025.105026","author":[{"family":"Antero","given":"Unai"},{"family":"Sierra","given":"Basilio"},{"family":"Oñativia","given":"Jon"},{"family":"Ruiz","given":"Alejandra"},{"family":"Osaba","given":"Eneko"}],"container-title":"Robotics and Autonomous Systems","id":"Antero2025","issued":{"date-parts":[[2025]]},"page":"105026","publisher":"Elsevier","title":"Robot localization aided by quantum algorithms","type":"article-journal","volume":"192"}}],"isEdited":false,"manualOverride":{"citeprocText":"(Antero et al. 2025)","isManuallyOverridden":false,"manualOverrideText":""},"mendeley":{"formattedCitation":"(Antero et al. 2025)","plainTextFormattedCitation":"(Antero et al. 2025)","previouslyFormattedCitation":"(Antero et al. 2025)"},"properties":{"noteIndex":0},"schema":"https://github.com/citation-style-language/schema/raw/master/csl-citation.json"}</w:instrText>
       </w:r>
       <w:r>
         <w:fldChar w:fldCharType="separate"/>
@@ -12744,7 +12934,7 @@
         <w:fldChar w:fldCharType="begin"/>
       </w:r>
       <w:r>
-        <w:instrText xml:space="preserve">ADDIN CSL_CITATION {"citationID":"MENDELEY_CITATION_265","citationItems":[{"id":"ITEM-265","isTemporary":false,"itemData":{"DOI":"10.1146/annurev-conmatphys-031119-050605","author":[{"family":"Kjaergaard","given":"Morten"},{"family":"Schwartz","given":"Mollie E."},{"family":"Braumüller","given":"Jochen"},{"family":"Krantz","given":"Philip"},{"family":"Wang","given":"Joel I.-J."},{"family":"Gustavsson","given":"Simon"},{"family":"Oliver","given":"William D."}],"container-title":"Annual Review of Condensed Matter Physics","id":"Kjaergaard2020","issued":{"date-parts":[[2020]]},"page":"369-395","publisher":"Annual Reviews","title":"Superconducting qubits: Current state of play","title-short":"Superconducting qubits","type":"article-journal","volume":"11"}}],"isEdited":false,"manualOverride":{"citeprocText":"(Kjaergaard et al. 2020)","isManuallyOverridden":false,"manualOverrideText":""},"mendeley":{"formattedCitation":"(Kjaergaard et al. 2020)","plainTextFormattedCitation":"(Kjaergaard et al. 2020)","previouslyFormattedCitation":"(Kjaergaard et al. 2020)"},"properties":{"noteIndex":0},"schema":"https://github.com/citation-style-language/schema/raw/master/csl-citation.json"}</w:instrText>
+        <w:instrText xml:space="preserve">ADDIN CSL_CITATION {"citationID":"MENDELEY_CITATION_278","citationItems":[{"id":"ITEM-278","isTemporary":false,"itemData":{"DOI":"10.1146/annurev-conmatphys-031119-050605","author":[{"family":"Kjaergaard","given":"Morten"},{"family":"Schwartz","given":"Mollie E."},{"family":"Braumüller","given":"Jochen"},{"family":"Krantz","given":"Philip"},{"family":"Wang","given":"Joel I.-J."},{"family":"Gustavsson","given":"Simon"},{"family":"Oliver","given":"William D."}],"container-title":"Annual Review of Condensed Matter Physics","id":"Kjaergaard2020","issued":{"date-parts":[[2020]]},"page":"369-395","publisher":"Annual Reviews","title":"Superconducting qubits: Current state of play","title-short":"Superconducting qubits","type":"article-journal","volume":"11"}}],"isEdited":false,"manualOverride":{"citeprocText":"(Kjaergaard et al. 2020)","isManuallyOverridden":false,"manualOverrideText":""},"mendeley":{"formattedCitation":"(Kjaergaard et al. 2020)","plainTextFormattedCitation":"(Kjaergaard et al. 2020)","previouslyFormattedCitation":"(Kjaergaard et al. 2020)"},"properties":{"noteIndex":0},"schema":"https://github.com/citation-style-language/schema/raw/master/csl-citation.json"}</w:instrText>
       </w:r>
       <w:r>
         <w:fldChar w:fldCharType="separate"/>
@@ -12762,7 +12952,7 @@
         <w:fldChar w:fldCharType="begin"/>
       </w:r>
       <w:r>
-        <w:instrText xml:space="preserve">ADDIN CSL_CITATION {"citationID":"MENDELEY_CITATION_266","citationItems":[{"id":"ITEM-266","isTemporary":false,"itemData":{"DOI":"10.3390/a14070194","author":[{"family":"Atchade-Adelomou","given":"Parfait"},{"family":"Alonso-Linaje","given":"Guillermo"},{"family":"Albo-Canals","given":"Jordi"},{"family":"Casado-Fauli","given":"Daniel"}],"container-title":"Algorithms","id":"AtchadeAdelomou2021","issue":"7","issued":{"date-parts":[[2021]]},"page":"194","publisher":"MDPI","title":"qRobot: A quantum computing approach in mobile robot order picking and batching problem solver optimization","title-short":"qRobot","type":"article-journal","volume":"14"}}],"isEdited":false,"manualOverride":{"citeprocText":"(Atchade-Adelomou et al. 2021)","isManuallyOverridden":false,"manualOverrideText":""},"mendeley":{"formattedCitation":"(Atchade-Adelomou et al. 2021)","plainTextFormattedCitation":"(Atchade-Adelomou et al. 2021)","previouslyFormattedCitation":"(Atchade-Adelomou et al. 2021)"},"properties":{"noteIndex":0},"schema":"https://github.com/citation-style-language/schema/raw/master/csl-citation.json"}</w:instrText>
+        <w:instrText xml:space="preserve">ADDIN CSL_CITATION {"citationID":"MENDELEY_CITATION_279","citationItems":[{"id":"ITEM-279","isTemporary":false,"itemData":{"DOI":"10.3390/a14070194","author":[{"family":"Atchade-Adelomou","given":"Parfait"},{"family":"Alonso-Linaje","given":"Guillermo"},{"family":"Albo-Canals","given":"Jordi"},{"family":"Casado-Fauli","given":"Daniel"}],"container-title":"Algorithms","id":"AtchadeAdelomou2021","issue":"7","issued":{"date-parts":[[2021]]},"page":"194","publisher":"MDPI","title":"qRobot: A quantum computing approach in mobile robot order picking and batching problem solver optimization","title-short":"qRobot","type":"article-journal","volume":"14"}}],"isEdited":false,"manualOverride":{"citeprocText":"(Atchade-Adelomou et al. 2021)","isManuallyOverridden":false,"manualOverrideText":""},"mendeley":{"formattedCitation":"(Atchade-Adelomou et al. 2021)","plainTextFormattedCitation":"(Atchade-Adelomou et al. 2021)","previouslyFormattedCitation":"(Atchade-Adelomou et al. 2021)"},"properties":{"noteIndex":0},"schema":"https://github.com/citation-style-language/schema/raw/master/csl-citation.json"}</w:instrText>
       </w:r>
       <w:r>
         <w:fldChar w:fldCharType="separate"/>
@@ -12799,7 +12989,7 @@
         <w:fldChar w:fldCharType="begin"/>
       </w:r>
       <w:r>
-        <w:instrText xml:space="preserve">ADDIN CSL_CITATION {"citationID":"MENDELEY_CITATION_267","citationItems":[{"id":"ITEM-267","isTemporary":false,"itemData":{"DOI":"10.1103/PhysRevA.58.893","author":[{"family":"Benioff","given":"Paul"}],"container-title":"Physical Review A","id":"Benioff1998","issue":"2","issued":{"date-parts":[[1998]]},"page":"893-904","publisher":"American Physical Society","title":"Quantum robots and environments","type":"article-journal","volume":"58"},"suppress-author":false}],"isEdited":false,"manualOverride":{"citeprocText":"Benioff (1998)","isManuallyOverridden":false,"manualOverrideText":""},"mendeley":{"formattedCitation":"Benioff (1998)","plainTextFormattedCitation":"Benioff (1998)","previouslyFormattedCitation":"Benioff (1998)"},"properties":{"noteIndex":0},"schema":"https://github.com/citation-style-language/schema/raw/master/csl-citation.json"}</w:instrText>
+        <w:instrText xml:space="preserve">ADDIN CSL_CITATION {"citationID":"MENDELEY_CITATION_280","citationItems":[{"id":"ITEM-280","isTemporary":false,"itemData":{"DOI":"10.1103/PhysRevA.58.893","author":[{"family":"Benioff","given":"Paul"}],"container-title":"Physical Review A","id":"Benioff1998","issue":"2","issued":{"date-parts":[[1998]]},"page":"893-904","publisher":"American Physical Society","title":"Quantum robots and environments","type":"article-journal","volume":"58"},"suppress-author":false}],"isEdited":false,"manualOverride":{"citeprocText":"Benioff (1998)","isManuallyOverridden":false,"manualOverrideText":""},"mendeley":{"formattedCitation":"Benioff (1998)","plainTextFormattedCitation":"Benioff (1998)","previouslyFormattedCitation":"Benioff (1998)"},"properties":{"noteIndex":0},"schema":"https://github.com/citation-style-language/schema/raw/master/csl-citation.json"}</w:instrText>
       </w:r>
       <w:r>
         <w:fldChar w:fldCharType="separate"/>
@@ -12823,7 +13013,7 @@
         <w:fldChar w:fldCharType="begin"/>
       </w:r>
       <w:r>
-        <w:instrText xml:space="preserve">ADDIN CSL_CITATION {"citationID":"MENDELEY_CITATION_268","citationItems":[{"id":"ITEM-268","isTemporary":false,"itemData":{"DOI":"10.1017/S0263574705002596","author":[{"family":"Dong","given":"Daoyi"},{"family":"Chen","given":"Chunlin"},{"family":"Zhang","given":"Chenbin"},{"family":"Chen","given":"Zonghai"}],"container-title":"Robotica","id":"Dong2006","issue":"4","issued":{"date-parts":[[2006]]},"page":"513-521","title":"Quantum robot: Structure, algorithms and applications","title-short":"Quantum robot","type":"article-journal","volume":"24"},"suppress-author":false}],"isEdited":false,"manualOverride":{"citeprocText":"Dong et al. (2006)","isManuallyOverridden":false,"manualOverrideText":""},"mendeley":{"formattedCitation":"Dong et al. (2006)","plainTextFormattedCitation":"Dong et al. (2006)","previouslyFormattedCitation":"Dong et al. (2006)"},"properties":{"noteIndex":0},"schema":"https://github.com/citation-style-language/schema/raw/master/csl-citation.json"}</w:instrText>
+        <w:instrText xml:space="preserve">ADDIN CSL_CITATION {"citationID":"MENDELEY_CITATION_281","citationItems":[{"id":"ITEM-281","isTemporary":false,"itemData":{"DOI":"10.1017/S0263574705002596","author":[{"family":"Dong","given":"Daoyi"},{"family":"Chen","given":"Chunlin"},{"family":"Zhang","given":"Chenbin"},{"family":"Chen","given":"Zonghai"}],"container-title":"Robotica","id":"Dong2006","issue":"4","issued":{"date-parts":[[2006]]},"page":"513-521","title":"Quantum robot: Structure, algorithms and applications","title-short":"Quantum robot","type":"article-journal","volume":"24"},"suppress-author":false}],"isEdited":false,"manualOverride":{"citeprocText":"Dong et al. (2006)","isManuallyOverridden":false,"manualOverrideText":""},"mendeley":{"formattedCitation":"Dong et al. (2006)","plainTextFormattedCitation":"Dong et al. (2006)","previouslyFormattedCitation":"Dong et al. (2006)"},"properties":{"noteIndex":0},"schema":"https://github.com/citation-style-language/schema/raw/master/csl-citation.json"}</w:instrText>
       </w:r>
       <w:r>
         <w:fldChar w:fldCharType="separate"/>
@@ -12841,7 +13031,7 @@
         <w:fldChar w:fldCharType="begin"/>
       </w:r>
       <w:r>
-        <w:instrText xml:space="preserve">ADDIN CSL_CITATION {"citationID":"MENDELEY_CITATION_269","citationItems":[{"id":"ITEM-269","isTemporary":false,"itemData":{"DOI":"10.1098/rsta.2024.0139","author":[{"family":"Mannone","given":"Maria"},{"family":"Seidita","given":"Valeria"},{"family":"Chella","given":"Antonio"}],"container-title":"Philosophical Transactions of the Royal Society A: Mathematical, Physical and Engineering Sciences","id":"Mannone2025","issue":"2289","issued":{"date-parts":[[2025]]},"page":"20240139","title":"Quantum computing for swarm robotics: A local-to-global approach","title-short":"Quantum computing for swarm robotics","type":"article-journal","volume":"383"}}],"isEdited":false,"manualOverride":{"citeprocText":"(Mannone, Seidita, and Chella 2025)","isManuallyOverridden":false,"manualOverrideText":""},"mendeley":{"formattedCitation":"(Mannone, Seidita, and Chella 2025)","plainTextFormattedCitation":"(Mannone, Seidita, and Chella 2025)","previouslyFormattedCitation":"(Mannone, Seidita, and Chella 2025)"},"properties":{"noteIndex":0},"schema":"https://github.com/citation-style-language/schema/raw/master/csl-citation.json"}</w:instrText>
+        <w:instrText xml:space="preserve">ADDIN CSL_CITATION {"citationID":"MENDELEY_CITATION_282","citationItems":[{"id":"ITEM-282","isTemporary":false,"itemData":{"DOI":"10.1098/rsta.2024.0139","author":[{"family":"Mannone","given":"Maria"},{"family":"Seidita","given":"Valeria"},{"family":"Chella","given":"Antonio"}],"container-title":"Philosophical Transactions of the Royal Society A: Mathematical, Physical and Engineering Sciences","id":"Mannone2025","issue":"2289","issued":{"date-parts":[[2025]]},"page":"20240139","title":"Quantum computing for swarm robotics: A local-to-global approach","title-short":"Quantum computing for swarm robotics","type":"article-journal","volume":"383"}}],"isEdited":false,"manualOverride":{"citeprocText":"(Mannone, Seidita, and Chella 2025)","isManuallyOverridden":false,"manualOverrideText":""},"mendeley":{"formattedCitation":"(Mannone, Seidita, and Chella 2025)","plainTextFormattedCitation":"(Mannone, Seidita, and Chella 2025)","previouslyFormattedCitation":"(Mannone, Seidita, and Chella 2025)"},"properties":{"noteIndex":0},"schema":"https://github.com/citation-style-language/schema/raw/master/csl-citation.json"}</w:instrText>
       </w:r>
       <w:r>
         <w:fldChar w:fldCharType="separate"/>
@@ -12913,7 +13103,7 @@
         <w:fldChar w:fldCharType="begin"/>
       </w:r>
       <w:r>
-        <w:instrText xml:space="preserve">ADDIN CSL_CITATION {"citationID":"MENDELEY_CITATION_271","citationItems":[{"id":"ITEM-270","isTemporary":false,"itemData":{"DOI":"10.1145/3293320.3293333","author":[{"family":"Clark","given":"James"},{"family":"West","given":"Tristan"},{"family":"Zammit","given":"Joseph Paul"},{"family":"Guo","given":"Xiaohu"},{"family":"Mason","given":"Luke"},{"family":"Russell","given":"Duncan"}],"container-title":"Proceedings of the international conference on high performance computing in asia-pacific region (HPC Asia 2019)","id":"Clark2019","issued":{"date-parts":[[2019]]},"page":"111-119","publisher":"ACM","publisher-place":"New York, NY, USA","title":"Towards real time multi-robot routing using quantum computing technologies","type":"paper-conference"}},{"id":"ITEM-271","isTemporary":false,"itemData":{"DOI":"10.3389/fcomp.2019.00009","author":[{"family":"Ohzeki","given":"Masayuki"},{"family":"Miki","given":"Akira"},{"family":"Miyama","given":"Masamichi J."},{"family":"Terabe","given":"Masayoshi"}],"container-title":"Frontiers in Computer Science","id":"Ohzeki2019","issued":{"date-parts":[[2019]]},"page":"9","publisher":"Frontiers Media","title":"Control of automated guided vehicles without collision by quantum annealer and digital devices","type":"article-journal","volume":"1"}}],"isEdited":false,"manualOverride":{"citeprocText":"(Clark et al. 2019; Ohzeki et al. 2019)","isManuallyOverridden":false,"manualOverrideText":""},"mendeley":{"formattedCitation":"(Clark et al. 2019; Ohzeki et al. 2019)","plainTextFormattedCitation":"(Clark et al. 2019; Ohzeki et al. 2019)","previouslyFormattedCitation":"(Clark et al. 2019; Ohzeki et al. 2019)"},"properties":{"noteIndex":0},"schema":"https://github.com/citation-style-language/schema/raw/master/csl-citation.json"}</w:instrText>
+        <w:instrText xml:space="preserve">ADDIN CSL_CITATION {"citationID":"MENDELEY_CITATION_284","citationItems":[{"id":"ITEM-283","isTemporary":false,"itemData":{"DOI":"10.1145/3293320.3293333","author":[{"family":"Clark","given":"James"},{"family":"West","given":"Tristan"},{"family":"Zammit","given":"Joseph Paul"},{"family":"Guo","given":"Xiaohu"},{"family":"Mason","given":"Luke"},{"family":"Russell","given":"Duncan"}],"container-title":"Proceedings of the international conference on high performance computing in asia-pacific region (HPC Asia 2019)","id":"Clark2019","issued":{"date-parts":[[2019]]},"page":"111-119","publisher":"ACM","publisher-place":"New York, NY, USA","title":"Towards real time multi-robot routing using quantum computing technologies","type":"paper-conference"}},{"id":"ITEM-284","isTemporary":false,"itemData":{"DOI":"10.3389/fcomp.2019.00009","author":[{"family":"Ohzeki","given":"Masayuki"},{"family":"Miki","given":"Akira"},{"family":"Miyama","given":"Masamichi J."},{"family":"Terabe","given":"Masayoshi"}],"container-title":"Frontiers in Computer Science","id":"Ohzeki2019","issued":{"date-parts":[[2019]]},"page":"9","publisher":"Frontiers Media","title":"Control of automated guided vehicles without collision by quantum annealer and digital devices","type":"article-journal","volume":"1"}}],"isEdited":false,"manualOverride":{"citeprocText":"(Clark et al. 2019; Ohzeki et al. 2019)","isManuallyOverridden":false,"manualOverrideText":""},"mendeley":{"formattedCitation":"(Clark et al. 2019; Ohzeki et al. 2019)","plainTextFormattedCitation":"(Clark et al. 2019; Ohzeki et al. 2019)","previouslyFormattedCitation":"(Clark et al. 2019; Ohzeki et al. 2019)"},"properties":{"noteIndex":0},"schema":"https://github.com/citation-style-language/schema/raw/master/csl-citation.json"}</w:instrText>
       </w:r>
       <w:r>
         <w:fldChar w:fldCharType="separate"/>
@@ -12931,7 +13121,7 @@
         <w:fldChar w:fldCharType="begin"/>
       </w:r>
       <w:r>
-        <w:instrText xml:space="preserve">ADDIN CSL_CITATION {"citationID":"MENDELEY_CITATION_273","citationItems":[{"id":"ITEM-272","isTemporary":false,"itemData":{"DOI":"10.1109/ACCESS.2024.3417808","author":[{"family":"Hohenfeld","given":"Hans"},{"family":"Heimann","given":"Dirk"},{"family":"Wiebe","given":"Felix"},{"family":"Kirchner","given":"Frank"}],"container-title":"IEEE Access","id":"Hohenfeld2024","issued":{"date-parts":[[2024]]},"page":"87217-87236","publisher":"IEEE","title":"Quantum deep reinforcement learning for robot navigation tasks","type":"article-journal","volume":"12"}},{"id":"ITEM-273","isTemporary":false,"itemData":{"DOI":"10.5220/0013371800003890","ISBN":"978-989-758-737-5","author":[{"family":"Drăgan","given":"Theodora-Augustina"},{"family":"Künzner","given":"Alexander"},{"family":"Wille","given":"Robert"},{"family":"Lorenz","given":"Jeanette Miriam"}],"container-title":"Proceedings of the 17th international conference on agents and artificial intelligence (ICAART 2025)","id":"Dragan2025","issued":{"date-parts":[[2025]]},"page":"807-814","publisher":"SciTePress","title":"Continuous quantum reinforcement learning for robot navigation","type":"paper-conference","volume":"1"}}],"isEdited":false,"manualOverride":{"citeprocText":"(Hohenfeld et al. 2024; Drăgan et al. 2025)","isManuallyOverridden":false,"manualOverrideText":""},"mendeley":{"formattedCitation":"(Hohenfeld et al. 2024; Drăgan et al. 2025)","plainTextFormattedCitation":"(Hohenfeld et al. 2024; Drăgan et al. 2025)","previouslyFormattedCitation":"(Hohenfeld et al. 2024; Drăgan et al. 2025)"},"properties":{"noteIndex":0},"schema":"https://github.com/citation-style-language/schema/raw/master/csl-citation.json"}</w:instrText>
+        <w:instrText xml:space="preserve">ADDIN CSL_CITATION {"citationID":"MENDELEY_CITATION_286","citationItems":[{"id":"ITEM-285","isTemporary":false,"itemData":{"DOI":"10.1109/ACCESS.2024.3417808","author":[{"family":"Hohenfeld","given":"Hans"},{"family":"Heimann","given":"Dirk"},{"family":"Wiebe","given":"Felix"},{"family":"Kirchner","given":"Frank"}],"container-title":"IEEE Access","id":"Hohenfeld2024","issued":{"date-parts":[[2024]]},"page":"87217-87236","publisher":"IEEE","title":"Quantum deep reinforcement learning for robot navigation tasks","type":"article-journal","volume":"12"}},{"id":"ITEM-286","isTemporary":false,"itemData":{"DOI":"10.5220/0013371800003890","ISBN":"978-989-758-737-5","author":[{"family":"Drăgan","given":"Theodora-Augustina"},{"family":"Künzner","given":"Alexander"},{"family":"Wille","given":"Robert"},{"family":"Lorenz","given":"Jeanette Miriam"}],"container-title":"Proceedings of the 17th international conference on agents and artificial intelligence (ICAART 2025)","id":"Dragan2025","issued":{"date-parts":[[2025]]},"page":"807-814","publisher":"SciTePress","title":"Continuous quantum reinforcement learning for robot navigation","type":"paper-conference","volume":"1"}}],"isEdited":false,"manualOverride":{"citeprocText":"(Hohenfeld et al. 2024; Drăgan et al. 2025)","isManuallyOverridden":false,"manualOverrideText":""},"mendeley":{"formattedCitation":"(Hohenfeld et al. 2024; Drăgan et al. 2025)","plainTextFormattedCitation":"(Hohenfeld et al. 2024; Drăgan et al. 2025)","previouslyFormattedCitation":"(Hohenfeld et al. 2024; Drăgan et al. 2025)"},"properties":{"noteIndex":0},"schema":"https://github.com/citation-style-language/schema/raw/master/csl-citation.json"}</w:instrText>
       </w:r>
       <w:r>
         <w:fldChar w:fldCharType="separate"/>
@@ -12949,7 +13139,7 @@
         <w:fldChar w:fldCharType="begin"/>
       </w:r>
       <w:r>
-        <w:instrText xml:space="preserve">ADDIN CSL_CITATION {"citationID":"MENDELEY_CITATION_274","citationItems":[{"id":"ITEM-274","isTemporary":false,"itemData":{"DOI":"10.1103/PhysRevApplied.10.034030","author":[{"family":"Cheiney","given":"Pierrick"},{"family":"Fouché","given":"Lauriane"},{"family":"Templier","given":"Simon"},{"family":"Napolitano","given":"Fabien"},{"family":"Battelier","given":"Baptiste"},{"family":"Bouyer","given":"Philippe"},{"family":"Barrett","given":"Brynle"}],"container-title":"Physical Review Applied","id":"Cheiney2018","issue":"3","issued":{"date-parts":[[2018]]},"page":"034030","publisher":"American Physical Society","title":"Navigation-compatible hybrid quantum accelerometer using a Kalman filter","type":"article-journal","volume":"10"}}],"isEdited":false,"manualOverride":{"citeprocText":"(Cheiney et al. 2018)","isManuallyOverridden":false,"manualOverrideText":""},"mendeley":{"formattedCitation":"(Cheiney et al. 2018)","plainTextFormattedCitation":"(Cheiney et al. 2018)","previouslyFormattedCitation":"(Cheiney et al. 2018)"},"properties":{"noteIndex":0},"schema":"https://github.com/citation-style-language/schema/raw/master/csl-citation.json"}</w:instrText>
+        <w:instrText xml:space="preserve">ADDIN CSL_CITATION {"citationID":"MENDELEY_CITATION_287","citationItems":[{"id":"ITEM-287","isTemporary":false,"itemData":{"DOI":"10.1103/PhysRevApplied.10.034030","author":[{"family":"Cheiney","given":"Pierrick"},{"family":"Fouché","given":"Lauriane"},{"family":"Templier","given":"Simon"},{"family":"Napolitano","given":"Fabien"},{"family":"Battelier","given":"Baptiste"},{"family":"Bouyer","given":"Philippe"},{"family":"Barrett","given":"Brynle"}],"container-title":"Physical Review Applied","id":"Cheiney2018","issue":"3","issued":{"date-parts":[[2018]]},"page":"034030","publisher":"American Physical Society","title":"Navigation-compatible hybrid quantum accelerometer using a Kalman filter","type":"article-journal","volume":"10"}}],"isEdited":false,"manualOverride":{"citeprocText":"(Cheiney et al. 2018)","isManuallyOverridden":false,"manualOverrideText":""},"mendeley":{"formattedCitation":"(Cheiney et al. 2018)","plainTextFormattedCitation":"(Cheiney et al. 2018)","previouslyFormattedCitation":"(Cheiney et al. 2018)"},"properties":{"noteIndex":0},"schema":"https://github.com/citation-style-language/schema/raw/master/csl-citation.json"}</w:instrText>
       </w:r>
       <w:r>
         <w:fldChar w:fldCharType="separate"/>
@@ -12967,7 +13157,7 @@
         <w:fldChar w:fldCharType="begin"/>
       </w:r>
       <w:r>
-        <w:instrText xml:space="preserve">ADDIN CSL_CITATION {"citationID":"MENDELEY_CITATION_275","citationItems":[{"id":"ITEM-275","isTemporary":false,"itemData":{"DOI":"10.1103/PhysRevLett.127.100501","author":[{"family":"Córcoles","given":"Antonio D."},{"family":"Takita","given":"Maika"},{"family":"Inoue","given":"Ken"},{"family":"Lekuch","given":"Scott"},{"family":"Minev","given":"Zlatko K."},{"family":"Chow","given":"Jerry M."},{"family":"Gambetta","given":"Jay M."}],"container-title":"Physical Review Letters","id":"Corcoles2021","issue":"10","issued":{"date-parts":[[2021]]},"page":"100501","publisher":"American Physical Society","title":"Exploiting dynamic quantum circuits in a quantum algorithm with superconducting qubits","type":"article-journal","volume":"127"}}],"isEdited":false,"manualOverride":{"citeprocText":"(Córcoles et al. 2021)","isManuallyOverridden":false,"manualOverrideText":""},"mendeley":{"formattedCitation":"(Córcoles et al. 2021)","plainTextFormattedCitation":"(Córcoles et al. 2021)","previouslyFormattedCitation":"(Córcoles et al. 2021)"},"properties":{"noteIndex":0},"schema":"https://github.com/citation-style-language/schema/raw/master/csl-citation.json"}</w:instrText>
+        <w:instrText xml:space="preserve">ADDIN CSL_CITATION {"citationID":"MENDELEY_CITATION_288","citationItems":[{"id":"ITEM-288","isTemporary":false,"itemData":{"DOI":"10.1103/PhysRevLett.127.100501","author":[{"family":"Córcoles","given":"Antonio D."},{"family":"Takita","given":"Maika"},{"family":"Inoue","given":"Ken"},{"family":"Lekuch","given":"Scott"},{"family":"Minev","given":"Zlatko K."},{"family":"Chow","given":"Jerry M."},{"family":"Gambetta","given":"Jay M."}],"container-title":"Physical Review Letters","id":"Corcoles2021","issue":"10","issued":{"date-parts":[[2021]]},"page":"100501","publisher":"American Physical Society","title":"Exploiting dynamic quantum circuits in a quantum algorithm with superconducting qubits","type":"article-journal","volume":"127"}}],"isEdited":false,"manualOverride":{"citeprocText":"(Córcoles et al. 2021)","isManuallyOverridden":false,"manualOverrideText":""},"mendeley":{"formattedCitation":"(Córcoles et al. 2021)","plainTextFormattedCitation":"(Córcoles et al. 2021)","previouslyFormattedCitation":"(Córcoles et al. 2021)"},"properties":{"noteIndex":0},"schema":"https://github.com/citation-style-language/schema/raw/master/csl-citation.json"}</w:instrText>
       </w:r>
       <w:r>
         <w:fldChar w:fldCharType="separate"/>
@@ -12988,7 +13178,7 @@
         <w:fldChar w:fldCharType="begin"/>
       </w:r>
       <w:r>
-        <w:instrText xml:space="preserve">ADDIN CSL_CITATION {"citationID":"MENDELEY_CITATION_276","citationItems":[{"id":"ITEM-276","isTemporary":false,"itemData":{"DOI":"10.1145/3445814.3446758","author":[{"family":"Tang","given":"Wei"},{"family":"Tomesh","given":"Teague"},{"family":"Suchara","given":"Martin"},{"family":"Larson","given":"Jeffrey"},{"family":"Martonosi","given":"Margaret"}],"container-title":"Proceedings of the 26th ACM international conference on architectural support for programming languages and operating systems (ASPLOS ’21)","id":"Tang2021","issued":{"date-parts":[[2021]]},"page":"473-486","publisher":"Association for Computing Machinery","publisher-place":"New York, NY, USA","title":"CutQC: Using small quantum computers for large quantum circuit evaluations","title-short":"CutQC","type":"paper-conference"}}],"isEdited":false,"manualOverride":{"citeprocText":"(W. Tang et al. 2021)","isManuallyOverridden":false,"manualOverrideText":""},"mendeley":{"formattedCitation":"(W. Tang et al. 2021)","plainTextFormattedCitation":"(W. Tang et al. 2021)","previouslyFormattedCitation":"(W. Tang et al. 2021)"},"properties":{"noteIndex":0},"schema":"https://github.com/citation-style-language/schema/raw/master/csl-citation.json"}</w:instrText>
+        <w:instrText xml:space="preserve">ADDIN CSL_CITATION {"citationID":"MENDELEY_CITATION_289","citationItems":[{"id":"ITEM-289","isTemporary":false,"itemData":{"DOI":"10.1145/3445814.3446758","author":[{"family":"Tang","given":"Wei"},{"family":"Tomesh","given":"Teague"},{"family":"Suchara","given":"Martin"},{"family":"Larson","given":"Jeffrey"},{"family":"Martonosi","given":"Margaret"}],"container-title":"Proceedings of the 26th ACM international conference on architectural support for programming languages and operating systems (ASPLOS ’21)","id":"Tang2021","issued":{"date-parts":[[2021]]},"page":"473-486","publisher":"Association for Computing Machinery","publisher-place":"New York, NY, USA","title":"CutQC: Using small quantum computers for large quantum circuit evaluations","title-short":"CutQC","type":"paper-conference"}}],"isEdited":false,"manualOverride":{"citeprocText":"(W. Tang et al. 2021)","isManuallyOverridden":false,"manualOverrideText":""},"mendeley":{"formattedCitation":"(W. Tang et al. 2021)","plainTextFormattedCitation":"(W. Tang et al. 2021)","previouslyFormattedCitation":"(W. Tang et al. 2021)"},"properties":{"noteIndex":0},"schema":"https://github.com/citation-style-language/schema/raw/master/csl-citation.json"}</w:instrText>
       </w:r>
       <w:r>
         <w:fldChar w:fldCharType="separate"/>
@@ -13009,7 +13199,7 @@
         <w:fldChar w:fldCharType="begin"/>
       </w:r>
       <w:r>
-        <w:instrText xml:space="preserve">ADDIN CSL_CITATION {"citationID":"MENDELEY_CITATION_277","citationItems":[{"id":"ITEM-277","isTemporary":false,"itemData":{"DOI":"10.7566/JPSJ.90.032001","author":[{"family":"Endo","given":"Suguru"},{"family":"Cai","given":"Zhenyu"},{"family":"Benjamin","given":"Simon C."},{"family":"Yuan","given":"Xiao"}],"container-title":"Journal of the Physical Society of Japan","id":"Endo2021","issue":"3","issued":{"date-parts":[[2021]]},"page":"032001","publisher":"The Physical Society of Japan","title":"Hybrid quantum-classical algorithms and quantum error mitigation","type":"article-journal","volume":"90"}}],"isEdited":false,"manualOverride":{"citeprocText":"(Endo et al. 2021)","isManuallyOverridden":false,"manualOverrideText":""},"mendeley":{"formattedCitation":"(Endo et al. 2021)","plainTextFormattedCitation":"(Endo et al. 2021)","previouslyFormattedCitation":"(Endo et al. 2021)"},"properties":{"noteIndex":0},"schema":"https://github.com/citation-style-language/schema/raw/master/csl-citation.json"}</w:instrText>
+        <w:instrText xml:space="preserve">ADDIN CSL_CITATION {"citationID":"MENDELEY_CITATION_290","citationItems":[{"id":"ITEM-290","isTemporary":false,"itemData":{"DOI":"10.7566/JPSJ.90.032001","author":[{"family":"Endo","given":"Suguru"},{"family":"Cai","given":"Zhenyu"},{"family":"Benjamin","given":"Simon C."},{"family":"Yuan","given":"Xiao"}],"container-title":"Journal of the Physical Society of Japan","id":"Endo2021","issue":"3","issued":{"date-parts":[[2021]]},"page":"032001","publisher":"The Physical Society of Japan","title":"Hybrid quantum-classical algorithms and quantum error mitigation","type":"article-journal","volume":"90"}}],"isEdited":false,"manualOverride":{"citeprocText":"(Endo et al. 2021)","isManuallyOverridden":false,"manualOverrideText":""},"mendeley":{"formattedCitation":"(Endo et al. 2021)","plainTextFormattedCitation":"(Endo et al. 2021)","previouslyFormattedCitation":"(Endo et al. 2021)"},"properties":{"noteIndex":0},"schema":"https://github.com/citation-style-language/schema/raw/master/csl-citation.json"}</w:instrText>
       </w:r>
       <w:r>
         <w:fldChar w:fldCharType="separate"/>
@@ -13030,7 +13220,7 @@
         <w:fldChar w:fldCharType="begin"/>
       </w:r>
       <w:r>
-        <w:instrText xml:space="preserve">ADDIN CSL_CITATION {"citationID":"MENDELEY_CITATION_278","citationItems":[{"id":"ITEM-278","isTemporary":false,"itemData":{"DOI":"10.22331/q-2020-04-20-256","author":[{"family":"Barkoutsos","given":"Panagiotis Kl."},{"family":"Nannicini","given":"Giacomo"},{"family":"Robert","given":"Anton"},{"family":"Tavernelli","given":"Ivano"},{"family":"Woerner","given":"Stefan"}],"container-title":"Quantum","id":"Barkoutsos2020","issued":{"date-parts":[[2020]]},"page":"256","publisher":"Verein zur Förderung des Open Access Publizierens in den Quantenwissenschaften","title":"Improving variational quantum optimization using CVaR","type":"article-journal","volume":"4"}}],"isEdited":false,"manualOverride":{"citeprocText":"(Barkoutsos et al. 2020)","isManuallyOverridden":false,"manualOverrideText":""},"mendeley":{"formattedCitation":"(Barkoutsos et al. 2020)","plainTextFormattedCitation":"(Barkoutsos et al. 2020)","previouslyFormattedCitation":"(Barkoutsos et al. 2020)"},"properties":{"noteIndex":0},"schema":"https://github.com/citation-style-language/schema/raw/master/csl-citation.json"}</w:instrText>
+        <w:instrText xml:space="preserve">ADDIN CSL_CITATION {"citationID":"MENDELEY_CITATION_291","citationItems":[{"id":"ITEM-291","isTemporary":false,"itemData":{"DOI":"10.22331/q-2020-04-20-256","author":[{"family":"Barkoutsos","given":"Panagiotis Kl."},{"family":"Nannicini","given":"Giacomo"},{"family":"Robert","given":"Anton"},{"family":"Tavernelli","given":"Ivano"},{"family":"Woerner","given":"Stefan"}],"container-title":"Quantum","id":"Barkoutsos2020","issued":{"date-parts":[[2020]]},"page":"256","publisher":"Verein zur Förderung des Open Access Publizierens in den Quantenwissenschaften","title":"Improving variational quantum optimization using CVaR","type":"article-journal","volume":"4"}}],"isEdited":false,"manualOverride":{"citeprocText":"(Barkoutsos et al. 2020)","isManuallyOverridden":false,"manualOverrideText":""},"mendeley":{"formattedCitation":"(Barkoutsos et al. 2020)","plainTextFormattedCitation":"(Barkoutsos et al. 2020)","previouslyFormattedCitation":"(Barkoutsos et al. 2020)"},"properties":{"noteIndex":0},"schema":"https://github.com/citation-style-language/schema/raw/master/csl-citation.json"}</w:instrText>
       </w:r>
       <w:r>
         <w:fldChar w:fldCharType="separate"/>
@@ -13097,7 +13287,7 @@
         <w:fldChar w:fldCharType="begin"/>
       </w:r>
       <w:r>
-        <w:instrText xml:space="preserve">ADDIN CSL_CITATION {"citationID":"MENDELEY_CITATION_279","citationItems":[{"id":"ITEM-279","isTemporary":false,"itemData":{"DOI":"10.1146/annurev-conmatphys-031119-050605","author":[{"family":"Kjaergaard","given":"Morten"},{"family":"Schwartz","given":"Mollie E."},{"family":"Braumüller","given":"Jochen"},{"family":"Krantz","given":"Philip"},{"family":"Wang","given":"Joel I.-J."},{"family":"Gustavsson","given":"Simon"},{"family":"Oliver","given":"William D."}],"container-title":"Annual Review of Condensed Matter Physics","id":"Kjaergaard2020","issued":{"date-parts":[[2020]]},"page":"369-395","publisher":"Annual Reviews","title":"Superconducting qubits: Current state of play","title-short":"Superconducting qubits","type":"article-journal","volume":"11"}}],"isEdited":false,"manualOverride":{"citeprocText":"(Kjaergaard et al. 2020)","isManuallyOverridden":false,"manualOverrideText":""},"mendeley":{"formattedCitation":"(Kjaergaard et al. 2020)","plainTextFormattedCitation":"(Kjaergaard et al. 2020)","previouslyFormattedCitation":"(Kjaergaard et al. 2020)"},"properties":{"noteIndex":0},"schema":"https://github.com/citation-style-language/schema/raw/master/csl-citation.json"}</w:instrText>
+        <w:instrText xml:space="preserve">ADDIN CSL_CITATION {"citationID":"MENDELEY_CITATION_292","citationItems":[{"id":"ITEM-292","isTemporary":false,"itemData":{"DOI":"10.1146/annurev-conmatphys-031119-050605","author":[{"family":"Kjaergaard","given":"Morten"},{"family":"Schwartz","given":"Mollie E."},{"family":"Braumüller","given":"Jochen"},{"family":"Krantz","given":"Philip"},{"family":"Wang","given":"Joel I.-J."},{"family":"Gustavsson","given":"Simon"},{"family":"Oliver","given":"William D."}],"container-title":"Annual Review of Condensed Matter Physics","id":"Kjaergaard2020","issued":{"date-parts":[[2020]]},"page":"369-395","publisher":"Annual Reviews","title":"Superconducting qubits: Current state of play","title-short":"Superconducting qubits","type":"article-journal","volume":"11"}}],"isEdited":false,"manualOverride":{"citeprocText":"(Kjaergaard et al. 2020)","isManuallyOverridden":false,"manualOverrideText":""},"mendeley":{"formattedCitation":"(Kjaergaard et al. 2020)","plainTextFormattedCitation":"(Kjaergaard et al. 2020)","previouslyFormattedCitation":"(Kjaergaard et al. 2020)"},"properties":{"noteIndex":0},"schema":"https://github.com/citation-style-language/schema/raw/master/csl-citation.json"}</w:instrText>
       </w:r>
       <w:r>
         <w:fldChar w:fldCharType="separate"/>
@@ -13118,7 +13308,7 @@
         <w:fldChar w:fldCharType="begin"/>
       </w:r>
       <w:r>
-        <w:instrText xml:space="preserve">ADDIN CSL_CITATION {"citationID":"MENDELEY_CITATION_280","citationItems":[{"id":"ITEM-280","isTemporary":false,"itemData":{"DOI":"10.3390/e25040548","author":[{"family":"Widdows","given":"Dominic"},{"family":"Rani","given":"Jyoti"},{"family":"Pothos","given":"Emmanuel M."}],"container-title":"Entropy","id":"Widdows2023","issue":"4","issued":{"date-parts":[[2023]]},"page":"548","publisher":"MDPI","title":"Quantum circuit components for cognitive decision-making","type":"article-journal","volume":"25"},"suppress-author":false}],"isEdited":false,"manualOverride":{"citeprocText":"Widdows, Rani, and Pothos (2023)","isManuallyOverridden":false,"manualOverrideText":""},"mendeley":{"formattedCitation":"Widdows, Rani, and Pothos (2023)","plainTextFormattedCitation":"Widdows, Rani, and Pothos (2023)","previouslyFormattedCitation":"Widdows, Rani, and Pothos (2023)"},"properties":{"noteIndex":0},"schema":"https://github.com/citation-style-language/schema/raw/master/csl-citation.json"}</w:instrText>
+        <w:instrText xml:space="preserve">ADDIN CSL_CITATION {"citationID":"MENDELEY_CITATION_293","citationItems":[{"id":"ITEM-293","isTemporary":false,"itemData":{"DOI":"10.3390/e25040548","author":[{"family":"Widdows","given":"Dominic"},{"family":"Rani","given":"Jyoti"},{"family":"Pothos","given":"Emmanuel M."}],"container-title":"Entropy","id":"Widdows2023","issue":"4","issued":{"date-parts":[[2023]]},"page":"548","publisher":"MDPI","title":"Quantum circuit components for cognitive decision-making","type":"article-journal","volume":"25"},"suppress-author":false}],"isEdited":false,"manualOverride":{"citeprocText":"Widdows, Rani, and Pothos (2023)","isManuallyOverridden":false,"manualOverrideText":""},"mendeley":{"formattedCitation":"Widdows, Rani, and Pothos (2023)","plainTextFormattedCitation":"Widdows, Rani, and Pothos (2023)","previouslyFormattedCitation":"Widdows, Rani, and Pothos (2023)"},"properties":{"noteIndex":0},"schema":"https://github.com/citation-style-language/schema/raw/master/csl-citation.json"}</w:instrText>
       </w:r>
       <w:r>
         <w:fldChar w:fldCharType="separate"/>
@@ -13136,7 +13326,7 @@
         <w:fldChar w:fldCharType="begin"/>
       </w:r>
       <w:r>
-        <w:instrText xml:space="preserve">ADDIN CSL_CITATION {"citationID":"MENDELEY_CITATION_282","citationItems":[{"id":"ITEM-281","isTemporary":false,"itemData":{"DOI":"10.1038/ncomms5213","author":[{"family":"Peruzzo","given":"Alberto"},{"family":"McClean","given":"Jarrod"},{"family":"Shadbolt","given":"Peter"},{"family":"Yung","given":"Man-Hong"},{"family":"Zhou","given":"Xiao-Qi"},{"family":"Love","given":"Peter J."},{"family":"Aspuru-Guzik","given":"Alán"},{"family":"O’Brien","given":"Jeremy L."}],"container-title":"Nature Communications","id":"Peruzzo2014","issue":"1","issued":{"date-parts":[[2014]]},"page":"4213","publisher":"Nature Publishing Group","title":"A variational eigenvalue solver on a photonic quantum processor","type":"article-journal","volume":"5"}},{"id":"ITEM-282","isTemporary":false,"itemData":{"DOI":"10.1038/nature10012","author":[{"family":"Johnson","given":"M. W."},{"family":"Amin","given":"M. H. S."},{"family":"Gildert","given":"S."},{"family":"Lanting","given":"T."},{"family":"Hamze","given":"F."},{"family":"Dickson","given":"N."},{"family":"Harris","given":"R."},{"family":"Berkley","given":"A. J."},{"family":"Johansson","given":"J."},{"family":"Bunyk","given":"P."},{"family":"Chapple","given":"E. M."},{"family":"Enderud","given":"C."},{"family":"Hilton","given":"J. P."},{"family":"Karimi","given":"K."},{"family":"Ladizinsky","given":"E."},{"family":"Ladizinsky","given":"N."},{"family":"Oh","given":"T."},{"family":"Perminov","given":"I."},{"family":"Rich","given":"C."},{"family":"Thom","given":"M. C."},{"family":"Tolkacheva","given":"E."},{"family":"Truncik","given":"C. J. S."},{"family":"Uchaikin","given":"S."},{"family":"Wang","given":"J."},{"family":"Wilson","given":"B."},{"family":"Rose","given":"G."}],"container-title":"Nature","id":"Johnson2011","issue":"7346","issued":{"date-parts":[[2011]]},"page":"194-198","publisher":"Nature Publishing Group","title":"Quantum annealing with manufactured spins","type":"article-journal","volume":"473"}}],"isEdited":false,"manualOverride":{"citeprocText":"(Peruzzo et al. 2014; Johnson et al. 2011)","isManuallyOverridden":false,"manualOverrideText":""},"mendeley":{"formattedCitation":"(Peruzzo et al. 2014; Johnson et al. 2011)","plainTextFormattedCitation":"(Peruzzo et al. 2014; Johnson et al. 2011)","previouslyFormattedCitation":"(Peruzzo et al. 2014; Johnson et al. 2011)"},"properties":{"noteIndex":0},"schema":"https://github.com/citation-style-language/schema/raw/master/csl-citation.json"}</w:instrText>
+        <w:instrText xml:space="preserve">ADDIN CSL_CITATION {"citationID":"MENDELEY_CITATION_295","citationItems":[{"id":"ITEM-294","isTemporary":false,"itemData":{"DOI":"10.1038/ncomms5213","author":[{"family":"Peruzzo","given":"Alberto"},{"family":"McClean","given":"Jarrod"},{"family":"Shadbolt","given":"Peter"},{"family":"Yung","given":"Man-Hong"},{"family":"Zhou","given":"Xiao-Qi"},{"family":"Love","given":"Peter J."},{"family":"Aspuru-Guzik","given":"Alán"},{"family":"O’Brien","given":"Jeremy L."}],"container-title":"Nature Communications","id":"Peruzzo2014","issue":"1","issued":{"date-parts":[[2014]]},"page":"4213","publisher":"Nature Publishing Group","title":"A variational eigenvalue solver on a photonic quantum processor","type":"article-journal","volume":"5"}},{"id":"ITEM-295","isTemporary":false,"itemData":{"DOI":"10.1038/nature10012","author":[{"family":"Johnson","given":"M. W."},{"family":"Amin","given":"M. H. S."},{"family":"Gildert","given":"S."},{"family":"Lanting","given":"T."},{"family":"Hamze","given":"F."},{"family":"Dickson","given":"N."},{"family":"Harris","given":"R."},{"family":"Berkley","given":"A. J."},{"family":"Johansson","given":"J."},{"family":"Bunyk","given":"P."},{"family":"Chapple","given":"E. M."},{"family":"Enderud","given":"C."},{"family":"Hilton","given":"J. P."},{"family":"Karimi","given":"K."},{"family":"Ladizinsky","given":"E."},{"family":"Ladizinsky","given":"N."},{"family":"Oh","given":"T."},{"family":"Perminov","given":"I."},{"family":"Rich","given":"C."},{"family":"Thom","given":"M. C."},{"family":"Tolkacheva","given":"E."},{"family":"Truncik","given":"C. J. S."},{"family":"Uchaikin","given":"S."},{"family":"Wang","given":"J."},{"family":"Wilson","given":"B."},{"family":"Rose","given":"G."}],"container-title":"Nature","id":"Johnson2011","issue":"7346","issued":{"date-parts":[[2011]]},"page":"194-198","publisher":"Nature Publishing Group","title":"Quantum annealing with manufactured spins","type":"article-journal","volume":"473"}}],"isEdited":false,"manualOverride":{"citeprocText":"(Peruzzo et al. 2014; Johnson et al. 2011)","isManuallyOverridden":false,"manualOverrideText":""},"mendeley":{"formattedCitation":"(Peruzzo et al. 2014; Johnson et al. 2011)","plainTextFormattedCitation":"(Peruzzo et al. 2014; Johnson et al. 2011)","previouslyFormattedCitation":"(Peruzzo et al. 2014; Johnson et al. 2011)"},"properties":{"noteIndex":0},"schema":"https://github.com/citation-style-language/schema/raw/master/csl-citation.json"}</w:instrText>
       </w:r>
       <w:r>
         <w:fldChar w:fldCharType="separate"/>
@@ -13154,7 +13344,7 @@
         <w:fldChar w:fldCharType="begin"/>
       </w:r>
       <w:r>
-        <w:instrText xml:space="preserve">ADDIN CSL_CITATION {"citationID":"MENDELEY_CITATION_285","citationItems":[{"id":"ITEM-283","isTemporary":false,"itemData":{"DOI":"10.1038/s41598-025-12109-0","author":[{"family":"Otani","given":"Takuya"},{"family":"Takanishi","given":"Atsuo"},{"family":"Hara","given":"Nobuyuki"},{"family":"Takita","given":"Yutaka"},{"family":"Kimura","given":"Koichi"}],"container-title":"Scientific Reports","id":"Otani2025","issued":{"date-parts":[[2025]]},"page":"28508","publisher":"Nature Publishing Group","title":"Quantum computation for robot posture optimization","type":"article-journal","volume":"15"}},{"id":"ITEM-284","isTemporary":false,"itemData":{"URL":"https://arxiv.org/abs/2605.20801","author":[{"family":"Altrabulsi","given":"Mohamed Khair"},{"family":"Innan","given":"Nouhaila"},{"family":"Marchisio","given":"Alberto"},{"family":"Kashif","given":"Muhammad"},{"family":"Shafique","given":"Muhammad"}],"id":"Altrabulsi2026","issued":{"date-parts":[[2026]]},"title":"Q-SpiRL: Quantum spiking reinforcement learning for adaptive robot navigation","title-short":"Q-SpiRL","type":""}},{"id":"ITEM-285","isTemporary":false,"itemData":{"URL":"https://arxiv.org/abs/2508.21361","author":[{"family":"Innan","given":"Nouhaila"},{"family":"Kashif","given":"Muhammad"},{"family":"Marchisio","given":"Alberto"},{"family":"Gan","given":"Yung-Sze"},{"family":"Barbaresco","given":"Frederic"},{"family":"Shafique","given":"Muhammad"}],"id":"Innan2025","issued":{"date-parts":[[2025]]},"title":"QUAV: Quantum-assisted path planning and optimization for UAV navigation with obstacle avoidance","title-short":"QUAV","type":""}}],"isEdited":false,"manualOverride":{"citeprocText":"(Otani et al. 2025; Altrabulsi et al. 2026; Innan et al. 2025)","isManuallyOverridden":false,"manualOverrideText":""},"mendeley":{"formattedCitation":"(Otani et al. 2025; Altrabulsi et al. 2026; Innan et al. 2025)","plainTextFormattedCitation":"(Otani et al. 2025; Altrabulsi et al. 2026; Innan et al. 2025)","previouslyFormattedCitation":"(Otani et al. 2025; Altrabulsi et al. 2026; Innan et al. 2025)"},"properties":{"noteIndex":0},"schema":"https://github.com/citation-style-language/schema/raw/master/csl-citation.json"}</w:instrText>
+        <w:instrText xml:space="preserve">ADDIN CSL_CITATION {"citationID":"MENDELEY_CITATION_298","citationItems":[{"id":"ITEM-296","isTemporary":false,"itemData":{"DOI":"10.1038/s41598-025-12109-0","author":[{"family":"Otani","given":"Takuya"},{"family":"Takanishi","given":"Atsuo"},{"family":"Hara","given":"Nobuyuki"},{"family":"Takita","given":"Yutaka"},{"family":"Kimura","given":"Koichi"}],"container-title":"Scientific Reports","id":"Otani2025","issued":{"date-parts":[[2025]]},"page":"28508","publisher":"Nature Publishing Group","title":"Quantum computation for robot posture optimization","type":"article-journal","volume":"15"}},{"id":"ITEM-297","isTemporary":false,"itemData":{"URL":"https://arxiv.org/abs/2605.20801","author":[{"family":"Altrabulsi","given":"Mohamed Khair"},{"family":"Innan","given":"Nouhaila"},{"family":"Marchisio","given":"Alberto"},{"family":"Kashif","given":"Muhammad"},{"family":"Shafique","given":"Muhammad"}],"id":"Altrabulsi2026","issued":{"date-parts":[[2026]]},"title":"Q-SpiRL: Quantum spiking reinforcement learning for adaptive robot navigation","title-short":"Q-SpiRL","type":""}},{"id":"ITEM-298","isTemporary":false,"itemData":{"URL":"https://arxiv.org/abs/2508.21361","author":[{"family":"Innan","given":"Nouhaila"},{"family":"Kashif","given":"Muhammad"},{"family":"Marchisio","given":"Alberto"},{"family":"Gan","given":"Yung-Sze"},{"family":"Barbaresco","given":"Frederic"},{"family":"Shafique","given":"Muhammad"}],"id":"Innan2025","issued":{"date-parts":[[2025]]},"title":"QUAV: Quantum-assisted path planning and optimization for UAV navigation with obstacle avoidance","title-short":"QUAV","type":""}}],"isEdited":false,"manualOverride":{"citeprocText":"(Otani et al. 2025; Altrabulsi et al. 2026; Innan et al. 2025)","isManuallyOverridden":false,"manualOverrideText":""},"mendeley":{"formattedCitation":"(Otani et al. 2025; Altrabulsi et al. 2026; Innan et al. 2025)","plainTextFormattedCitation":"(Otani et al. 2025; Altrabulsi et al. 2026; Innan et al. 2025)","previouslyFormattedCitation":"(Otani et al. 2025; Altrabulsi et al. 2026; Innan et al. 2025)"},"properties":{"noteIndex":0},"schema":"https://github.com/citation-style-language/schema/raw/master/csl-citation.json"}</w:instrText>
       </w:r>
       <w:r>
         <w:fldChar w:fldCharType="separate"/>
@@ -13172,7 +13362,7 @@
         <w:fldChar w:fldCharType="begin"/>
       </w:r>
       <w:r>
-        <w:instrText xml:space="preserve">ADDIN CSL_CITATION {"citationID":"MENDELEY_CITATION_286","citationItems":[{"id":"ITEM-286","isTemporary":false,"itemData":{"DOI":"10.1145/3293320.3293333","author":[{"family":"Clark","given":"James"},{"family":"West","given":"Tristan"},{"family":"Zammit","given":"Joseph Paul"},{"family":"Guo","given":"Xiaohu"},{"family":"Mason","given":"Luke"},{"family":"Russell","given":"Duncan"}],"container-title":"Proceedings of the international conference on high performance computing in asia-pacific region (HPC Asia 2019)","id":"Clark2019","issued":{"date-parts":[[2019]]},"page":"111-119","publisher":"ACM","publisher-place":"New York, NY, USA","title":"Towards real time multi-robot routing using quantum computing technologies","type":"paper-conference"}}],"isEdited":false,"manualOverride":{"citeprocText":"(Clark et al. 2019)","isManuallyOverridden":false,"manualOverrideText":""},"mendeley":{"formattedCitation":"(Clark et al. 2019)","plainTextFormattedCitation":"(Clark et al. 2019)","previouslyFormattedCitation":"(Clark et al. 2019)"},"properties":{"noteIndex":0},"schema":"https://github.com/citation-style-language/schema/raw/master/csl-citation.json"}</w:instrText>
+        <w:instrText xml:space="preserve">ADDIN CSL_CITATION {"citationID":"MENDELEY_CITATION_299","citationItems":[{"id":"ITEM-299","isTemporary":false,"itemData":{"DOI":"10.1145/3293320.3293333","author":[{"family":"Clark","given":"James"},{"family":"West","given":"Tristan"},{"family":"Zammit","given":"Joseph Paul"},{"family":"Guo","given":"Xiaohu"},{"family":"Mason","given":"Luke"},{"family":"Russell","given":"Duncan"}],"container-title":"Proceedings of the international conference on high performance computing in asia-pacific region (HPC Asia 2019)","id":"Clark2019","issued":{"date-parts":[[2019]]},"page":"111-119","publisher":"ACM","publisher-place":"New York, NY, USA","title":"Towards real time multi-robot routing using quantum computing technologies","type":"paper-conference"}}],"isEdited":false,"manualOverride":{"citeprocText":"(Clark et al. 2019)","isManuallyOverridden":false,"manualOverrideText":""},"mendeley":{"formattedCitation":"(Clark et al. 2019)","plainTextFormattedCitation":"(Clark et al. 2019)","previouslyFormattedCitation":"(Clark et al. 2019)"},"properties":{"noteIndex":0},"schema":"https://github.com/citation-style-language/schema/raw/master/csl-citation.json"}</w:instrText>
       </w:r>
       <w:r>
         <w:fldChar w:fldCharType="separate"/>
@@ -13193,7 +13383,7 @@
         <w:fldChar w:fldCharType="begin"/>
       </w:r>
       <w:r>
-        <w:instrText xml:space="preserve">ADDIN CSL_CITATION {"citationID":"MENDELEY_CITATION_287","citationItems":[{"id":"ITEM-287","isTemporary":false,"itemData":{"DOI":"10.1038/s41598-025-28481-w","author":[{"family":"Quang","given":"Thinh Nguyen"},{"family":"Matsuyama","given":"Kosuke"},{"family":"Shimizu","given":"Keisuke"},{"family":"Sugano","given":"Hiroki"},{"family":"Kurimoto","given":"Eiji"},{"family":"Miki","given":"Masahiro"},{"family":"Suzuki","given":"Jumpei"},{"family":"Chen","given":"Ziyi"},{"family":"Waidyasooriya","given":"Hasitha Muthumala"},{"family":"Hariyama","given":"Masanori"},{"family":"Hitomi","given":"Masaru"},{"family":"Sawamura","given":"Kenta"},{"family":"Ohzeki","given":"Masayuki"}],"container-title":"Scientific Reports","id":"Quang2025","issued":{"date-parts":[[2025]]},"page":"44047","publisher":"Nature Publishing Group","title":"Quantum annealing-based route optimization for commercial AGV operating systems in large-scale logistics warehouses","type":"article-journal","volume":"15"}}],"isEdited":false,"manualOverride":{"citeprocText":"(Quang et al. 2025)","isManuallyOverridden":false,"manualOverrideText":""},"mendeley":{"formattedCitation":"(Quang et al. 2025)","plainTextFormattedCitation":"(Quang et al. 2025)","previouslyFormattedCitation":"(Quang et al. 2025)"},"properties":{"noteIndex":0},"schema":"https://github.com/citation-style-language/schema/raw/master/csl-citation.json"}</w:instrText>
+        <w:instrText xml:space="preserve">ADDIN CSL_CITATION {"citationID":"MENDELEY_CITATION_300","citationItems":[{"id":"ITEM-300","isTemporary":false,"itemData":{"DOI":"10.1038/s41598-025-28481-w","author":[{"family":"Quang","given":"Thinh Nguyen"},{"family":"Matsuyama","given":"Kosuke"},{"family":"Shimizu","given":"Keisuke"},{"family":"Sugano","given":"Hiroki"},{"family":"Kurimoto","given":"Eiji"},{"family":"Miki","given":"Masahiro"},{"family":"Suzuki","given":"Jumpei"},{"family":"Chen","given":"Ziyi"},{"family":"Waidyasooriya","given":"Hasitha Muthumala"},{"family":"Hariyama","given":"Masanori"},{"family":"Hitomi","given":"Masaru"},{"family":"Sawamura","given":"Kenta"},{"family":"Ohzeki","given":"Masayuki"}],"container-title":"Scientific Reports","id":"Quang2025","issued":{"date-parts":[[2025]]},"page":"44047","publisher":"Nature Publishing Group","title":"Quantum annealing-based route optimization for commercial AGV operating systems in large-scale logistics warehouses","type":"article-journal","volume":"15"}}],"isEdited":false,"manualOverride":{"citeprocText":"(Quang et al. 2025)","isManuallyOverridden":false,"manualOverrideText":""},"mendeley":{"formattedCitation":"(Quang et al. 2025)","plainTextFormattedCitation":"(Quang et al. 2025)","previouslyFormattedCitation":"(Quang et al. 2025)"},"properties":{"noteIndex":0},"schema":"https://github.com/citation-style-language/schema/raw/master/csl-citation.json"}</w:instrText>
       </w:r>
       <w:r>
         <w:fldChar w:fldCharType="separate"/>
@@ -13238,7 +13428,7 @@
         <w:fldChar w:fldCharType="begin"/>
       </w:r>
       <w:r>
-        <w:instrText xml:space="preserve">ADDIN CSL_CITATION {"citationID":"MENDELEY_CITATION_288","citationItems":[{"id":"ITEM-288","isTemporary":false,"itemData":{"DOI":"10.22331/q-2018-08-06-79","author":[{"family":"Preskill","given":"John"}],"container-title":"Quantum","id":"Preskill2018","issued":{"date-parts":[[2018]]},"page":"79","publisher":"Verein zur Förderung des Open Access Publizierens in den Quantenwissenschaften","title":"Quantum computing in the NISQ era and beyond","type":"article-journal","volume":"2"}}],"isEdited":false,"manualOverride":{"citeprocText":"(Preskill 2018)","isManuallyOverridden":false,"manualOverrideText":""},"mendeley":{"formattedCitation":"(Preskill 2018)","plainTextFormattedCitation":"(Preskill 2018)","previouslyFormattedCitation":"(Preskill 2018)"},"properties":{"noteIndex":0},"schema":"https://github.com/citation-style-language/schema/raw/master/csl-citation.json"}</w:instrText>
+        <w:instrText xml:space="preserve">ADDIN CSL_CITATION {"citationID":"MENDELEY_CITATION_301","citationItems":[{"id":"ITEM-301","isTemporary":false,"itemData":{"DOI":"10.22331/q-2018-08-06-79","author":[{"family":"Preskill","given":"John"}],"container-title":"Quantum","id":"Preskill2018","issued":{"date-parts":[[2018]]},"page":"79","publisher":"Verein zur Förderung des Open Access Publizierens in den Quantenwissenschaften","title":"Quantum computing in the NISQ era and beyond","type":"article-journal","volume":"2"}}],"isEdited":false,"manualOverride":{"citeprocText":"(Preskill 2018)","isManuallyOverridden":false,"manualOverrideText":""},"mendeley":{"formattedCitation":"(Preskill 2018)","plainTextFormattedCitation":"(Preskill 2018)","previouslyFormattedCitation":"(Preskill 2018)"},"properties":{"noteIndex":0},"schema":"https://github.com/citation-style-language/schema/raw/master/csl-citation.json"}</w:instrText>
       </w:r>
       <w:r>
         <w:fldChar w:fldCharType="separate"/>
@@ -13256,7 +13446,7 @@
         <w:fldChar w:fldCharType="begin"/>
       </w:r>
       <w:r>
-        <w:instrText xml:space="preserve">ADDIN CSL_CITATION {"citationID":"MENDELEY_CITATION_289","citationItems":[{"id":"ITEM-289","isTemporary":false,"itemData":{"DOI":"10.1103/PhysRevLett.119.180509","author":[{"family":"Temme","given":"Kristan"},{"family":"Bravyi","given":"Sergey"},{"family":"Gambetta","given":"Jay M."}],"container-title":"Physical Review Letters","id":"Temme2017","issue":"18","issued":{"date-parts":[[2017]]},"page":"180509","publisher":"American Physical Society","title":"Error mitigation for short-depth quantum circuits","type":"article-journal","volume":"119"}}],"isEdited":false,"manualOverride":{"citeprocText":"(Temme, Bravyi, and Gambetta 2017)","isManuallyOverridden":false,"manualOverrideText":""},"mendeley":{"formattedCitation":"(Temme, Bravyi, and Gambetta 2017)","plainTextFormattedCitation":"(Temme, Bravyi, and Gambetta 2017)","previouslyFormattedCitation":"(Temme, Bravyi, and Gambetta 2017)"},"properties":{"noteIndex":0},"schema":"https://github.com/citation-style-language/schema/raw/master/csl-citation.json"}</w:instrText>
+        <w:instrText xml:space="preserve">ADDIN CSL_CITATION {"citationID":"MENDELEY_CITATION_302","citationItems":[{"id":"ITEM-302","isTemporary":false,"itemData":{"DOI":"10.1103/PhysRevLett.119.180509","author":[{"family":"Temme","given":"Kristan"},{"family":"Bravyi","given":"Sergey"},{"family":"Gambetta","given":"Jay M."}],"container-title":"Physical Review Letters","id":"Temme2017","issue":"18","issued":{"date-parts":[[2017]]},"page":"180509","publisher":"American Physical Society","title":"Error mitigation for short-depth quantum circuits","type":"article-journal","volume":"119"}}],"isEdited":false,"manualOverride":{"citeprocText":"(Temme, Bravyi, and Gambetta 2017)","isManuallyOverridden":false,"manualOverrideText":""},"mendeley":{"formattedCitation":"(Temme, Bravyi, and Gambetta 2017)","plainTextFormattedCitation":"(Temme, Bravyi, and Gambetta 2017)","previouslyFormattedCitation":"(Temme, Bravyi, and Gambetta 2017)"},"properties":{"noteIndex":0},"schema":"https://github.com/citation-style-language/schema/raw/master/csl-citation.json"}</w:instrText>
       </w:r>
       <w:r>
         <w:fldChar w:fldCharType="separate"/>
@@ -13274,7 +13464,7 @@
         <w:fldChar w:fldCharType="begin"/>
       </w:r>
       <w:r>
-        <w:instrText xml:space="preserve">ADDIN CSL_CITATION {"citationID":"MENDELEY_CITATION_290","citationItems":[{"id":"ITEM-290","isTemporary":false,"itemData":{"DOI":"10.1038/s41586-019-1040-7","author":[{"family":"Kandala","given":"Abhinav"},{"family":"Temme","given":"Kristan"},{"family":"Córcoles","given":"Antonio D."},{"family":"Mezzacapo","given":"Antonio"},{"family":"Chow","given":"Jerry M."},{"family":"Gambetta","given":"Jay M."}],"container-title":"Nature","id":"Kandala2019","issue":"7749","issued":{"date-parts":[[2019]]},"page":"491-495","publisher":"Nature Publishing Group","title":"Error mitigation extends the computational reach of a noisy quantum processor","type":"article-journal","volume":"567"}}],"isEdited":false,"manualOverride":{"citeprocText":"(Kandala et al. 2019)","isManuallyOverridden":false,"manualOverrideText":""},"mendeley":{"formattedCitation":"(Kandala et al. 2019)","plainTextFormattedCitation":"(Kandala et al. 2019)","previouslyFormattedCitation":"(Kandala et al. 2019)"},"properties":{"noteIndex":0},"schema":"https://github.com/citation-style-language/schema/raw/master/csl-citation.json"}</w:instrText>
+        <w:instrText xml:space="preserve">ADDIN CSL_CITATION {"citationID":"MENDELEY_CITATION_303","citationItems":[{"id":"ITEM-303","isTemporary":false,"itemData":{"DOI":"10.1038/s41586-019-1040-7","author":[{"family":"Kandala","given":"Abhinav"},{"family":"Temme","given":"Kristan"},{"family":"Córcoles","given":"Antonio D."},{"family":"Mezzacapo","given":"Antonio"},{"family":"Chow","given":"Jerry M."},{"family":"Gambetta","given":"Jay M."}],"container-title":"Nature","id":"Kandala2019","issue":"7749","issued":{"date-parts":[[2019]]},"page":"491-495","publisher":"Nature Publishing Group","title":"Error mitigation extends the computational reach of a noisy quantum processor","type":"article-journal","volume":"567"}}],"isEdited":false,"manualOverride":{"citeprocText":"(Kandala et al. 2019)","isManuallyOverridden":false,"manualOverrideText":""},"mendeley":{"formattedCitation":"(Kandala et al. 2019)","plainTextFormattedCitation":"(Kandala et al. 2019)","previouslyFormattedCitation":"(Kandala et al. 2019)"},"properties":{"noteIndex":0},"schema":"https://github.com/citation-style-language/schema/raw/master/csl-citation.json"}</w:instrText>
       </w:r>
       <w:r>
         <w:fldChar w:fldCharType="separate"/>
@@ -13292,7 +13482,7 @@
         <w:fldChar w:fldCharType="begin"/>
       </w:r>
       <w:r>
-        <w:instrText xml:space="preserve">ADDIN CSL_CITATION {"citationID":"MENDELEY_CITATION_291","citationItems":[{"id":"ITEM-291","isTemporary":false,"itemData":{"DOI":"10.1103/RevModPhys.95.045005","author":[{"family":"Cai","given":"Zhenyu"},{"family":"Babbush","given":"Ryan"},{"family":"Benjamin","given":"Simon C."},{"family":"Endo","given":"Suguru"},{"family":"Huggins","given":"William J."},{"family":"Li","given":"Ying"},{"family":"McClean","given":"Jarrod R."},{"family":"O’Brien","given":"Thomas E."}],"container-title":"Reviews of Modern Physics","id":"Cai2023","issue":"4","issued":{"date-parts":[[2023]]},"page":"045005","publisher":"American Physical Society","title":"Quantum error mitigation","type":"article-journal","volume":"95"}}],"isEdited":false,"manualOverride":{"citeprocText":"(Cai et al. 2023)","isManuallyOverridden":false,"manualOverrideText":""},"mendeley":{"formattedCitation":"(Cai et al. 2023)","plainTextFormattedCitation":"(Cai et al. 2023)","previouslyFormattedCitation":"(Cai et al. 2023)"},"properties":{"noteIndex":0},"schema":"https://github.com/citation-style-language/schema/raw/master/csl-citation.json"}</w:instrText>
+        <w:instrText xml:space="preserve">ADDIN CSL_CITATION {"citationID":"MENDELEY_CITATION_304","citationItems":[{"id":"ITEM-304","isTemporary":false,"itemData":{"DOI":"10.1103/RevModPhys.95.045005","author":[{"family":"Cai","given":"Zhenyu"},{"family":"Babbush","given":"Ryan"},{"family":"Benjamin","given":"Simon C."},{"family":"Endo","given":"Suguru"},{"family":"Huggins","given":"William J."},{"family":"Li","given":"Ying"},{"family":"McClean","given":"Jarrod R."},{"family":"O’Brien","given":"Thomas E."}],"container-title":"Reviews of Modern Physics","id":"Cai2023","issue":"4","issued":{"date-parts":[[2023]]},"page":"045005","publisher":"American Physical Society","title":"Quantum error mitigation","type":"article-journal","volume":"95"}}],"isEdited":false,"manualOverride":{"citeprocText":"(Cai et al. 2023)","isManuallyOverridden":false,"manualOverrideText":""},"mendeley":{"formattedCitation":"(Cai et al. 2023)","plainTextFormattedCitation":"(Cai et al. 2023)","previouslyFormattedCitation":"(Cai et al. 2023)"},"properties":{"noteIndex":0},"schema":"https://github.com/citation-style-language/schema/raw/master/csl-citation.json"}</w:instrText>
       </w:r>
       <w:r>
         <w:fldChar w:fldCharType="separate"/>
@@ -13310,7 +13500,7 @@
         <w:fldChar w:fldCharType="begin"/>
       </w:r>
       <w:r>
-        <w:instrText xml:space="preserve">ADDIN CSL_CITATION {"citationID":"MENDELEY_CITATION_292","citationItems":[{"id":"ITEM-292","isTemporary":false,"itemData":{"DOI":"10.1016/j.robot.2025.105026","author":[{"family":"Antero","given":"Unai"},{"family":"Sierra","given":"Basilio"},{"family":"Oñativia","given":"Jon"},{"family":"Ruiz","given":"Alejandra"},{"family":"Osaba","given":"Eneko"}],"container-title":"Robotics and Autonomous Systems","id":"Antero2025","issued":{"date-parts":[[2025]]},"page":"105026","publisher":"Elsevier","title":"Robot localization aided by quantum algorithms","type":"article-journal","volume":"192"}}],"isEdited":false,"manualOverride":{"citeprocText":"(Antero et al. 2025)","isManuallyOverridden":false,"manualOverrideText":""},"mendeley":{"formattedCitation":"(Antero et al. 2025)","plainTextFormattedCitation":"(Antero et al. 2025)","previouslyFormattedCitation":"(Antero et al. 2025)"},"properties":{"noteIndex":0},"schema":"https://github.com/citation-style-language/schema/raw/master/csl-citation.json"}</w:instrText>
+        <w:instrText xml:space="preserve">ADDIN CSL_CITATION {"citationID":"MENDELEY_CITATION_305","citationItems":[{"id":"ITEM-305","isTemporary":false,"itemData":{"DOI":"10.1016/j.robot.2025.105026","author":[{"family":"Antero","given":"Unai"},{"family":"Sierra","given":"Basilio"},{"family":"Oñativia","given":"Jon"},{"family":"Ruiz","given":"Alejandra"},{"family":"Osaba","given":"Eneko"}],"container-title":"Robotics and Autonomous Systems","id":"Antero2025","issued":{"date-parts":[[2025]]},"page":"105026","publisher":"Elsevier","title":"Robot localization aided by quantum algorithms","type":"article-journal","volume":"192"}}],"isEdited":false,"manualOverride":{"citeprocText":"(Antero et al. 2025)","isManuallyOverridden":false,"manualOverrideText":""},"mendeley":{"formattedCitation":"(Antero et al. 2025)","plainTextFormattedCitation":"(Antero et al. 2025)","previouslyFormattedCitation":"(Antero et al. 2025)"},"properties":{"noteIndex":0},"schema":"https://github.com/citation-style-language/schema/raw/master/csl-citation.json"}</w:instrText>
       </w:r>
       <w:r>
         <w:fldChar w:fldCharType="separate"/>
@@ -13331,7 +13521,7 @@
         <w:fldChar w:fldCharType="begin"/>
       </w:r>
       <w:r>
-        <w:instrText xml:space="preserve">ADDIN CSL_CITATION {"citationID":"MENDELEY_CITATION_293","citationItems":[{"id":"ITEM-293","isTemporary":false,"itemData":{"DOI":"10.1007/s42484-024-00226-4","author":[{"family":"Sinha","given":"Akash"},{"family":"Macaluso","given":"Antonio"},{"family":"Klusch","given":"Matthias"}],"container-title":"Quantum Machine Intelligence","id":"Sinha2023","issued":{"date-parts":[[2025]]},"page":"19","publisher":"Springer","title":"Nav-Q: Quantum deep reinforcement learning for collision-free navigation of self-driving cars","title-short":"Nav-Q","type":"article-journal","volume":"7"}}],"isEdited":false,"manualOverride":{"citeprocText":"(Sinha, Macaluso, and Klusch 2025)","isManuallyOverridden":false,"manualOverrideText":""},"mendeley":{"formattedCitation":"(Sinha, Macaluso, and Klusch 2025)","plainTextFormattedCitation":"(Sinha, Macaluso, and Klusch 2025)","previouslyFormattedCitation":"(Sinha, Macaluso, and Klusch 2025)"},"properties":{"noteIndex":0},"schema":"https://github.com/citation-style-language/schema/raw/master/csl-citation.json"}</w:instrText>
+        <w:instrText xml:space="preserve">ADDIN CSL_CITATION {"citationID":"MENDELEY_CITATION_306","citationItems":[{"id":"ITEM-306","isTemporary":false,"itemData":{"DOI":"10.1007/s42484-024-00226-4","author":[{"family":"Sinha","given":"Akash"},{"family":"Macaluso","given":"Antonio"},{"family":"Klusch","given":"Matthias"}],"container-title":"Quantum Machine Intelligence","id":"Sinha2023","issued":{"date-parts":[[2025]]},"page":"19","publisher":"Springer","title":"Nav-Q: Quantum deep reinforcement learning for collision-free navigation of self-driving cars","title-short":"Nav-Q","type":"article-journal","volume":"7"}}],"isEdited":false,"manualOverride":{"citeprocText":"(Sinha, Macaluso, and Klusch 2025)","isManuallyOverridden":false,"manualOverrideText":""},"mendeley":{"formattedCitation":"(Sinha, Macaluso, and Klusch 2025)","plainTextFormattedCitation":"(Sinha, Macaluso, and Klusch 2025)","previouslyFormattedCitation":"(Sinha, Macaluso, and Klusch 2025)"},"properties":{"noteIndex":0},"schema":"https://github.com/citation-style-language/schema/raw/master/csl-citation.json"}</w:instrText>
       </w:r>
       <w:r>
         <w:fldChar w:fldCharType="separate"/>
@@ -13349,7 +13539,7 @@
         <w:fldChar w:fldCharType="begin"/>
       </w:r>
       <w:r>
-        <w:instrText xml:space="preserve">ADDIN CSL_CITATION {"citationID":"MENDELEY_CITATION_294","citationItems":[{"id":"ITEM-294","isTemporary":false,"itemData":{"DOI":"10.1103/RevModPhys.87.307","author":[{"family":"Terhal","given":"Barbara M."}],"container-title":"Reviews of Modern Physics","id":"Terhal2015","issue":"2","issued":{"date-parts":[[2015]]},"page":"307-346","publisher":"American Physical Society","title":"Quantum error correction for quantum memories","type":"article-journal","volume":"87"}}],"isEdited":false,"manualOverride":{"citeprocText":"(Terhal 2015)","isManuallyOverridden":false,"manualOverrideText":""},"mendeley":{"formattedCitation":"(Terhal 2015)","plainTextFormattedCitation":"(Terhal 2015)","previouslyFormattedCitation":"(Terhal 2015)"},"properties":{"noteIndex":0},"schema":"https://github.com/citation-style-language/schema/raw/master/csl-citation.json"}</w:instrText>
+        <w:instrText xml:space="preserve">ADDIN CSL_CITATION {"citationID":"MENDELEY_CITATION_307","citationItems":[{"id":"ITEM-307","isTemporary":false,"itemData":{"DOI":"10.1103/RevModPhys.87.307","author":[{"family":"Terhal","given":"Barbara M."}],"container-title":"Reviews of Modern Physics","id":"Terhal2015","issue":"2","issued":{"date-parts":[[2015]]},"page":"307-346","publisher":"American Physical Society","title":"Quantum error correction for quantum memories","type":"article-journal","volume":"87"}}],"isEdited":false,"manualOverride":{"citeprocText":"(Terhal 2015)","isManuallyOverridden":false,"manualOverrideText":""},"mendeley":{"formattedCitation":"(Terhal 2015)","plainTextFormattedCitation":"(Terhal 2015)","previouslyFormattedCitation":"(Terhal 2015)"},"properties":{"noteIndex":0},"schema":"https://github.com/citation-style-language/schema/raw/master/csl-citation.json"}</w:instrText>
       </w:r>
       <w:r>
         <w:fldChar w:fldCharType="separate"/>
@@ -13367,7 +13557,7 @@
         <w:fldChar w:fldCharType="begin"/>
       </w:r>
       <w:r>
-        <w:instrText xml:space="preserve">ADDIN CSL_CITATION {"citationID":"MENDELEY_CITATION_295","citationItems":[{"id":"ITEM-295","isTemporary":false,"itemData":{"DOI":"10.1103/PhysRevA.86.032324","author":[{"family":"Fowler","given":"Austin G."},{"family":"Mariantoni","given":"Matteo"},{"family":"Martinis","given":"John M."},{"family":"Cleland","given":"Andrew N."}],"container-title":"Physical Review A","id":"Fowler2012","issue":"3","issued":{"date-parts":[[2012]]},"page":"032324","publisher":"American Physical Society","title":"Surface codes: Towards practical large-scale quantum computation","title-short":"Surface codes","type":"article-journal","volume":"86"}}],"isEdited":false,"manualOverride":{"citeprocText":"(Fowler et al. 2012)","isManuallyOverridden":false,"manualOverrideText":""},"mendeley":{"formattedCitation":"(Fowler et al. 2012)","plainTextFormattedCitation":"(Fowler et al. 2012)","previouslyFormattedCitation":"(Fowler et al. 2012)"},"properties":{"noteIndex":0},"schema":"https://github.com/citation-style-language/schema/raw/master/csl-citation.json"}</w:instrText>
+        <w:instrText xml:space="preserve">ADDIN CSL_CITATION {"citationID":"MENDELEY_CITATION_308","citationItems":[{"id":"ITEM-308","isTemporary":false,"itemData":{"DOI":"10.1103/PhysRevA.86.032324","author":[{"family":"Fowler","given":"Austin G."},{"family":"Mariantoni","given":"Matteo"},{"family":"Martinis","given":"John M."},{"family":"Cleland","given":"Andrew N."}],"container-title":"Physical Review A","id":"Fowler2012","issue":"3","issued":{"date-parts":[[2012]]},"page":"032324","publisher":"American Physical Society","title":"Surface codes: Towards practical large-scale quantum computation","title-short":"Surface codes","type":"article-journal","volume":"86"}}],"isEdited":false,"manualOverride":{"citeprocText":"(Fowler et al. 2012)","isManuallyOverridden":false,"manualOverrideText":""},"mendeley":{"formattedCitation":"(Fowler et al. 2012)","plainTextFormattedCitation":"(Fowler et al. 2012)","previouslyFormattedCitation":"(Fowler et al. 2012)"},"properties":{"noteIndex":0},"schema":"https://github.com/citation-style-language/schema/raw/master/csl-citation.json"}</w:instrText>
       </w:r>
       <w:r>
         <w:fldChar w:fldCharType="separate"/>
@@ -13385,7 +13575,7 @@
         <w:fldChar w:fldCharType="begin"/>
       </w:r>
       <w:r>
-        <w:instrText xml:space="preserve">ADDIN CSL_CITATION {"citationID":"MENDELEY_CITATION_297","citationItems":[{"id":"ITEM-296","isTemporary":false,"itemData":{"DOI":"10.1073/pnas.1619152114","author":[{"family":"Reiher","given":"Markus"},{"family":"Wiebe","given":"Nathan"},{"family":"Svore","given":"Krysta M."},{"family":"Wecker","given":"Dave"},{"family":"Troyer","given":"Matthias"}],"container-title":"Proceedings of the National Academy of Sciences","id":"Reiher2017","issue":"29","issued":{"date-parts":[[2017]]},"page":"7555-7560","publisher":"National Academy of Sciences","title":"Elucidating reaction mechanisms on quantum computers","type":"article-journal","volume":"114"}},{"id":"ITEM-297","isTemporary":false,"itemData":{"DOI":"10.1103/PhysRevResearch.4.023019","author":[{"family":"Kim","given":"Isaac H."},{"family":"Liu","given":"Ye-Hua"},{"family":"Pallister","given":"Sam"},{"family":"Pol","given":"William"},{"family":"Roberts","given":"Sam"},{"family":"Lee","given":"Eunseok"}],"container-title":"Physical Review Research","id":"Kim2022","issue":"2","issued":{"date-parts":[[2022]]},"page":"023019","publisher":"American Physical Society","title":"Fault-tolerant resource estimate for quantum chemical simulations: Case study on Li-ion battery electrolyte molecules","title-short":"Fault-tolerant resource estimate for quantum chemical simulations","type":"article-journal","volume":"4"}}],"isEdited":false,"manualOverride":{"citeprocText":"(Reiher et al. 2017; Kim et al. 2022)","isManuallyOverridden":false,"manualOverrideText":""},"mendeley":{"formattedCitation":"(Reiher et al. 2017; Kim et al. 2022)","plainTextFormattedCitation":"(Reiher et al. 2017; Kim et al. 2022)","previouslyFormattedCitation":"(Reiher et al. 2017; Kim et al. 2022)"},"properties":{"noteIndex":0},"schema":"https://github.com/citation-style-language/schema/raw/master/csl-citation.json"}</w:instrText>
+        <w:instrText xml:space="preserve">ADDIN CSL_CITATION {"citationID":"MENDELEY_CITATION_310","citationItems":[{"id":"ITEM-309","isTemporary":false,"itemData":{"DOI":"10.1073/pnas.1619152114","author":[{"family":"Reiher","given":"Markus"},{"family":"Wiebe","given":"Nathan"},{"family":"Svore","given":"Krysta M."},{"family":"Wecker","given":"Dave"},{"family":"Troyer","given":"Matthias"}],"container-title":"Proceedings of the National Academy of Sciences","id":"Reiher2017","issue":"29","issued":{"date-parts":[[2017]]},"page":"7555-7560","publisher":"National Academy of Sciences","title":"Elucidating reaction mechanisms on quantum computers","type":"article-journal","volume":"114"}},{"id":"ITEM-310","isTemporary":false,"itemData":{"DOI":"10.1103/PhysRevResearch.4.023019","author":[{"family":"Kim","given":"Isaac H."},{"family":"Liu","given":"Ye-Hua"},{"family":"Pallister","given":"Sam"},{"family":"Pol","given":"William"},{"family":"Roberts","given":"Sam"},{"family":"Lee","given":"Eunseok"}],"container-title":"Physical Review Research","id":"Kim2022","issue":"2","issued":{"date-parts":[[2022]]},"page":"023019","publisher":"American Physical Society","title":"Fault-tolerant resource estimate for quantum chemical simulations: Case study on Li-ion battery electrolyte molecules","title-short":"Fault-tolerant resource estimate for quantum chemical simulations","type":"article-journal","volume":"4"}}],"isEdited":false,"manualOverride":{"citeprocText":"(Reiher et al. 2017; Kim et al. 2022)","isManuallyOverridden":false,"manualOverrideText":""},"mendeley":{"formattedCitation":"(Reiher et al. 2017; Kim et al. 2022)","plainTextFormattedCitation":"(Reiher et al. 2017; Kim et al. 2022)","previouslyFormattedCitation":"(Reiher et al. 2017; Kim et al. 2022)"},"properties":{"noteIndex":0},"schema":"https://github.com/citation-style-language/schema/raw/master/csl-citation.json"}</w:instrText>
       </w:r>
       <w:r>
         <w:fldChar w:fldCharType="separate"/>
@@ -13430,7 +13620,7 @@
         <w:fldChar w:fldCharType="begin"/>
       </w:r>
       <w:r>
-        <w:instrText xml:space="preserve">ADDIN CSL_CITATION {"citationID":"MENDELEY_CITATION_298","citationItems":[{"id":"ITEM-298","isTemporary":false,"itemData":{"DOI":"10.1109/IISWC53511.2021.00015","author":[{"family":"Ravi","given":"Gokul Subramanian"},{"family":"Smith","given":"Kaitlin N."},{"family":"Gokhale","given":"Pranav"},{"family":"Chong","given":"Frederic T."}],"container-title":"2021 IEEE international symposium on workload characterization (IISWC)","id":"Ravi2021","issued":{"date-parts":[[2021]]},"page":"39-50","publisher":"IEEE","title":"Quantum computing in the cloud: Analyzing job and machine characteristics","title-short":"Quantum computing in the cloud","type":"paper-conference"}}],"isEdited":false,"manualOverride":{"citeprocText":"(Ravi et al. 2021)","isManuallyOverridden":false,"manualOverrideText":""},"mendeley":{"formattedCitation":"(Ravi et al. 2021)","plainTextFormattedCitation":"(Ravi et al. 2021)","previouslyFormattedCitation":"(Ravi et al. 2021)"},"properties":{"noteIndex":0},"schema":"https://github.com/citation-style-language/schema/raw/master/csl-citation.json"}</w:instrText>
+        <w:instrText xml:space="preserve">ADDIN CSL_CITATION {"citationID":"MENDELEY_CITATION_311","citationItems":[{"id":"ITEM-311","isTemporary":false,"itemData":{"DOI":"10.1109/IISWC53511.2021.00015","author":[{"family":"Ravi","given":"Gokul Subramanian"},{"family":"Smith","given":"Kaitlin N."},{"family":"Gokhale","given":"Pranav"},{"family":"Chong","given":"Frederic T."}],"container-title":"2021 IEEE international symposium on workload characterization (IISWC)","id":"Ravi2021","issued":{"date-parts":[[2021]]},"page":"39-50","publisher":"IEEE","title":"Quantum computing in the cloud: Analyzing job and machine characteristics","title-short":"Quantum computing in the cloud","type":"paper-conference"}}],"isEdited":false,"manualOverride":{"citeprocText":"(Ravi et al. 2021)","isManuallyOverridden":false,"manualOverrideText":""},"mendeley":{"formattedCitation":"(Ravi et al. 2021)","plainTextFormattedCitation":"(Ravi et al. 2021)","previouslyFormattedCitation":"(Ravi et al. 2021)"},"properties":{"noteIndex":0},"schema":"https://github.com/citation-style-language/schema/raw/master/csl-citation.json"}</w:instrText>
       </w:r>
       <w:r>
         <w:fldChar w:fldCharType="separate"/>
@@ -13448,7 +13638,7 @@
         <w:fldChar w:fldCharType="begin"/>
       </w:r>
       <w:r>
-        <w:instrText xml:space="preserve">ADDIN CSL_CITATION {"citationID":"MENDELEY_CITATION_299","citationItems":[{"id":"ITEM-299","isTemporary":false,"itemData":{"DOI":"10.3389/fcomp.2019.00009","author":[{"family":"Ohzeki","given":"Masayuki"},{"family":"Miki","given":"Akira"},{"family":"Miyama","given":"Masamichi J."},{"family":"Terabe","given":"Masayoshi"}],"container-title":"Frontiers in Computer Science","id":"Ohzeki2019","issued":{"date-parts":[[2019]]},"page":"9","publisher":"Frontiers Media","title":"Control of automated guided vehicles without collision by quantum annealer and digital devices","type":"article-journal","volume":"1"}}],"isEdited":false,"manualOverride":{"citeprocText":"(Ohzeki et al. 2019)","isManuallyOverridden":false,"manualOverrideText":""},"mendeley":{"formattedCitation":"(Ohzeki et al. 2019)","plainTextFormattedCitation":"(Ohzeki et al. 2019)","previouslyFormattedCitation":"(Ohzeki et al. 2019)"},"properties":{"noteIndex":0},"schema":"https://github.com/citation-style-language/schema/raw/master/csl-citation.json"}</w:instrText>
+        <w:instrText xml:space="preserve">ADDIN CSL_CITATION {"citationID":"MENDELEY_CITATION_312","citationItems":[{"id":"ITEM-312","isTemporary":false,"itemData":{"DOI":"10.3389/fcomp.2019.00009","author":[{"family":"Ohzeki","given":"Masayuki"},{"family":"Miki","given":"Akira"},{"family":"Miyama","given":"Masamichi J."},{"family":"Terabe","given":"Masayoshi"}],"container-title":"Frontiers in Computer Science","id":"Ohzeki2019","issued":{"date-parts":[[2019]]},"page":"9","publisher":"Frontiers Media","title":"Control of automated guided vehicles without collision by quantum annealer and digital devices","type":"article-journal","volume":"1"}}],"isEdited":false,"manualOverride":{"citeprocText":"(Ohzeki et al. 2019)","isManuallyOverridden":false,"manualOverrideText":""},"mendeley":{"formattedCitation":"(Ohzeki et al. 2019)","plainTextFormattedCitation":"(Ohzeki et al. 2019)","previouslyFormattedCitation":"(Ohzeki et al. 2019)"},"properties":{"noteIndex":0},"schema":"https://github.com/citation-style-language/schema/raw/master/csl-citation.json"}</w:instrText>
       </w:r>
       <w:r>
         <w:fldChar w:fldCharType="separate"/>
@@ -13466,7 +13656,7 @@
         <w:fldChar w:fldCharType="begin"/>
       </w:r>
       <w:r>
-        <w:instrText xml:space="preserve">ADDIN CSL_CITATION {"citationID":"MENDELEY_CITATION_300","citationItems":[{"id":"ITEM-300","isTemporary":false,"itemData":{"DOI":"10.1016/j.procir.2025.01.099","author":[{"family":"Willmann","given":"Moritz"},{"family":"Albus","given":"Marcel"},{"family":"Schnabel","given":"Jan"},{"family":"Roth","given":"Marco"}],"container-title":"Procedia CIRP","id":"Willmann2025","issued":{"date-parts":[[2025]]},"note":"58th CIRP Conference on Manufacturing Systems","page":"25-30","publisher":"Elsevier","title":"Application of quantum annealing for scalable robotic assembly line optimization: A case study","title-short":"Application of quantum annealing for scalable robotic assembly line optimization","type":"article-journal","volume":"134"}}],"isEdited":false,"manualOverride":{"citeprocText":"(Willmann et al. 2025)","isManuallyOverridden":false,"manualOverrideText":""},"mendeley":{"formattedCitation":"(Willmann et al. 2025)","plainTextFormattedCitation":"(Willmann et al. 2025)","previouslyFormattedCitation":"(Willmann et al. 2025)"},"properties":{"noteIndex":0},"schema":"https://github.com/citation-style-language/schema/raw/master/csl-citation.json"}</w:instrText>
+        <w:instrText xml:space="preserve">ADDIN CSL_CITATION {"citationID":"MENDELEY_CITATION_313","citationItems":[{"id":"ITEM-313","isTemporary":false,"itemData":{"DOI":"10.1016/j.procir.2025.01.099","author":[{"family":"Willmann","given":"Moritz"},{"family":"Albus","given":"Marcel"},{"family":"Schnabel","given":"Jan"},{"family":"Roth","given":"Marco"}],"container-title":"Procedia CIRP","id":"Willmann2025","issued":{"date-parts":[[2025]]},"note":"58th CIRP Conference on Manufacturing Systems","page":"25-30","publisher":"Elsevier","title":"Application of quantum annealing for scalable robotic assembly line optimization: A case study","title-short":"Application of quantum annealing for scalable robotic assembly line optimization","type":"article-journal","volume":"134"}}],"isEdited":false,"manualOverride":{"citeprocText":"(Willmann et al. 2025)","isManuallyOverridden":false,"manualOverrideText":""},"mendeley":{"formattedCitation":"(Willmann et al. 2025)","plainTextFormattedCitation":"(Willmann et al. 2025)","previouslyFormattedCitation":"(Willmann et al. 2025)"},"properties":{"noteIndex":0},"schema":"https://github.com/citation-style-language/schema/raw/master/csl-citation.json"}</w:instrText>
       </w:r>
       <w:r>
         <w:fldChar w:fldCharType="separate"/>
@@ -13511,7 +13701,7 @@
         <w:fldChar w:fldCharType="begin"/>
       </w:r>
       <w:r>
-        <w:instrText xml:space="preserve">ADDIN CSL_CITATION {"citationID":"MENDELEY_CITATION_301","citationItems":[{"id":"ITEM-301","isTemporary":false,"itemData":{"DOI":"10.1088/1367-2630/18/2/023023","author":[{"family":"McClean","given":"Jarrod R."},{"family":"Romero","given":"Jonathan"},{"family":"Babbush","given":"Ryan"},{"family":"Aspuru-Guzik","given":"Alán"}],"container-title":"New Journal of Physics","id":"McClean2016","issue":"2","issued":{"date-parts":[[2016]]},"page":"023023","publisher":"IOP Publishing","title":"The theory of variational hybrid quantum-classical algorithms","type":"article-journal","volume":"18"}}],"isEdited":false,"manualOverride":{"citeprocText":"(McClean et al. 2016)","isManuallyOverridden":false,"manualOverrideText":""},"mendeley":{"formattedCitation":"(McClean et al. 2016)","plainTextFormattedCitation":"(McClean et al. 2016)","previouslyFormattedCitation":"(McClean et al. 2016)"},"properties":{"noteIndex":0},"schema":"https://github.com/citation-style-language/schema/raw/master/csl-citation.json"}</w:instrText>
+        <w:instrText xml:space="preserve">ADDIN CSL_CITATION {"citationID":"MENDELEY_CITATION_314","citationItems":[{"id":"ITEM-314","isTemporary":false,"itemData":{"DOI":"10.1088/1367-2630/18/2/023023","author":[{"family":"McClean","given":"Jarrod R."},{"family":"Romero","given":"Jonathan"},{"family":"Babbush","given":"Ryan"},{"family":"Aspuru-Guzik","given":"Alán"}],"container-title":"New Journal of Physics","id":"McClean2016","issue":"2","issued":{"date-parts":[[2016]]},"page":"023023","publisher":"IOP Publishing","title":"The theory of variational hybrid quantum-classical algorithms","type":"article-journal","volume":"18"}}],"isEdited":false,"manualOverride":{"citeprocText":"(McClean et al. 2016)","isManuallyOverridden":false,"manualOverrideText":""},"mendeley":{"formattedCitation":"(McClean et al. 2016)","plainTextFormattedCitation":"(McClean et al. 2016)","previouslyFormattedCitation":"(McClean et al. 2016)"},"properties":{"noteIndex":0},"schema":"https://github.com/citation-style-language/schema/raw/master/csl-citation.json"}</w:instrText>
       </w:r>
       <w:r>
         <w:fldChar w:fldCharType="separate"/>
@@ -13529,7 +13719,7 @@
         <w:fldChar w:fldCharType="begin"/>
       </w:r>
       <w:r>
-        <w:instrText xml:space="preserve">ADDIN CSL_CITATION {"citationID":"MENDELEY_CITATION_303","citationItems":[{"id":"ITEM-302","isTemporary":false,"itemData":{"DOI":"10.1103/PhysRevLett.103.150502","author":[{"family":"Harrow","given":"Aram W."},{"family":"Hassidim","given":"Avinatan"},{"family":"Lloyd","given":"Seth"}],"container-title":"Physical Review Letters","id":"Harrow2009","issue":"15","issued":{"date-parts":[[2009]]},"page":"150502","publisher":"American Physical Society","title":"Quantum algorithm for linear systems of equations","type":"article-journal","volume":"103"}},{"id":"ITEM-303","isTemporary":false,"itemData":{"DOI":"10.1038/nphys3272","author":[{"family":"Aaronson","given":"Scott"}],"container-title":"Nature Physics","id":"Aaronson2015","issue":"4","issued":{"date-parts":[[2015]]},"page":"291-293","title":"Read the fine print","type":"article-journal","volume":"11"}}],"isEdited":false,"manualOverride":{"citeprocText":"(Harrow, Hassidim, and Lloyd 2009; Aaronson 2015)","isManuallyOverridden":false,"manualOverrideText":""},"mendeley":{"formattedCitation":"(Harrow, Hassidim, and Lloyd 2009; Aaronson 2015)","plainTextFormattedCitation":"(Harrow, Hassidim, and Lloyd 2009; Aaronson 2015)","previouslyFormattedCitation":"(Harrow, Hassidim, and Lloyd 2009; Aaronson 2015)"},"properties":{"noteIndex":0},"schema":"https://github.com/citation-style-language/schema/raw/master/csl-citation.json"}</w:instrText>
+        <w:instrText xml:space="preserve">ADDIN CSL_CITATION {"citationID":"MENDELEY_CITATION_316","citationItems":[{"id":"ITEM-315","isTemporary":false,"itemData":{"DOI":"10.1103/PhysRevLett.103.150502","author":[{"family":"Harrow","given":"Aram W."},{"family":"Hassidim","given":"Avinatan"},{"family":"Lloyd","given":"Seth"}],"container-title":"Physical Review Letters","id":"Harrow2009","issue":"15","issued":{"date-parts":[[2009]]},"page":"150502","publisher":"American Physical Society","title":"Quantum algorithm for linear systems of equations","type":"article-journal","volume":"103"}},{"id":"ITEM-316","isTemporary":false,"itemData":{"DOI":"10.1038/nphys3272","author":[{"family":"Aaronson","given":"Scott"}],"container-title":"Nature Physics","id":"Aaronson2015","issue":"4","issued":{"date-parts":[[2015]]},"page":"291-293","title":"Read the fine print","type":"article-journal","volume":"11"}}],"isEdited":false,"manualOverride":{"citeprocText":"(Harrow, Hassidim, and Lloyd 2009; Aaronson 2015)","isManuallyOverridden":false,"manualOverrideText":""},"mendeley":{"formattedCitation":"(Harrow, Hassidim, and Lloyd 2009; Aaronson 2015)","plainTextFormattedCitation":"(Harrow, Hassidim, and Lloyd 2009; Aaronson 2015)","previouslyFormattedCitation":"(Harrow, Hassidim, and Lloyd 2009; Aaronson 2015)"},"properties":{"noteIndex":0},"schema":"https://github.com/citation-style-language/schema/raw/master/csl-citation.json"}</w:instrText>
       </w:r>
       <w:r>
         <w:fldChar w:fldCharType="separate"/>
@@ -13547,7 +13737,7 @@
         <w:fldChar w:fldCharType="begin"/>
       </w:r>
       <w:r>
-        <w:instrText xml:space="preserve">ADDIN CSL_CITATION {"citationID":"MENDELEY_CITATION_304","citationItems":[{"id":"ITEM-304","isTemporary":false,"itemData":{"DOI":"10.1088/2632-2153/ac4559","author":[{"family":"Chen","given":"Samuel Yen-Chi"},{"family":"Huang","given":"Chih-Min"},{"family":"Hsing","given":"Chia-Wei"},{"family":"Goan","given":"Hsi-Sheng"},{"family":"Kao","given":"Ying-Jer"}],"container-title":"Machine Learning: Science and Technology","id":"Chen2022","issue":"1","issued":{"date-parts":[[2022]]},"page":"015025","publisher":"IOP Publishing","title":"Variational quantum reinforcement learning via evolutionary optimization","type":"article-journal","volume":"3"}}],"isEdited":false,"manualOverride":{"citeprocText":"(Chen et al. 2022)","isManuallyOverridden":false,"manualOverrideText":""},"mendeley":{"formattedCitation":"(Chen et al. 2022)","plainTextFormattedCitation":"(Chen et al. 2022)","previouslyFormattedCitation":"(Chen et al. 2022)"},"properties":{"noteIndex":0},"schema":"https://github.com/citation-style-language/schema/raw/master/csl-citation.json"}</w:instrText>
+        <w:instrText xml:space="preserve">ADDIN CSL_CITATION {"citationID":"MENDELEY_CITATION_317","citationItems":[{"id":"ITEM-317","isTemporary":false,"itemData":{"DOI":"10.1088/2632-2153/ac4559","author":[{"family":"Chen","given":"Samuel Yen-Chi"},{"family":"Huang","given":"Chih-Min"},{"family":"Hsing","given":"Chia-Wei"},{"family":"Goan","given":"Hsi-Sheng"},{"family":"Kao","given":"Ying-Jer"}],"container-title":"Machine Learning: Science and Technology","id":"Chen2022","issue":"1","issued":{"date-parts":[[2022]]},"page":"015025","publisher":"IOP Publishing","title":"Variational quantum reinforcement learning via evolutionary optimization","type":"article-journal","volume":"3"}}],"isEdited":false,"manualOverride":{"citeprocText":"(Chen et al. 2022)","isManuallyOverridden":false,"manualOverrideText":""},"mendeley":{"formattedCitation":"(Chen et al. 2022)","plainTextFormattedCitation":"(Chen et al. 2022)","previouslyFormattedCitation":"(Chen et al. 2022)"},"properties":{"noteIndex":0},"schema":"https://github.com/citation-style-language/schema/raw/master/csl-citation.json"}</w:instrText>
       </w:r>
       <w:r>
         <w:fldChar w:fldCharType="separate"/>
@@ -13624,7 +13814,7 @@
         <w:fldChar w:fldCharType="begin"/>
       </w:r>
       <w:r>
-        <w:instrText xml:space="preserve">ADDIN CSL_CITATION {"citationID":"MENDELEY_CITATION_305","citationItems":[{"id":"ITEM-305","isTemporary":false,"itemData":{"DOI":"10.1103/RevModPhys.95.045005","author":[{"family":"Cai","given":"Zhenyu"},{"family":"Babbush","given":"Ryan"},{"family":"Benjamin","given":"Simon C."},{"family":"Endo","given":"Suguru"},{"family":"Huggins","given":"William J."},{"family":"Li","given":"Ying"},{"family":"McClean","given":"Jarrod R."},{"family":"O’Brien","given":"Thomas E."}],"container-title":"Reviews of Modern Physics","id":"Cai2023","issue":"4","issued":{"date-parts":[[2023]]},"page":"045005","publisher":"American Physical Society","title":"Quantum error mitigation","type":"article-journal","volume":"95"}}],"isEdited":false,"manualOverride":{"citeprocText":"(Cai et al. 2023)","isManuallyOverridden":false,"manualOverrideText":""},"mendeley":{"formattedCitation":"(Cai et al. 2023)","plainTextFormattedCitation":"(Cai et al. 2023)","previouslyFormattedCitation":"(Cai et al. 2023)"},"properties":{"noteIndex":0},"schema":"https://github.com/citation-style-language/schema/raw/master/csl-citation.json"}</w:instrText>
+        <w:instrText xml:space="preserve">ADDIN CSL_CITATION {"citationID":"MENDELEY_CITATION_318","citationItems":[{"id":"ITEM-318","isTemporary":false,"itemData":{"DOI":"10.1103/RevModPhys.95.045005","author":[{"family":"Cai","given":"Zhenyu"},{"family":"Babbush","given":"Ryan"},{"family":"Benjamin","given":"Simon C."},{"family":"Endo","given":"Suguru"},{"family":"Huggins","given":"William J."},{"family":"Li","given":"Ying"},{"family":"McClean","given":"Jarrod R."},{"family":"O’Brien","given":"Thomas E."}],"container-title":"Reviews of Modern Physics","id":"Cai2023","issue":"4","issued":{"date-parts":[[2023]]},"page":"045005","publisher":"American Physical Society","title":"Quantum error mitigation","type":"article-journal","volume":"95"}}],"isEdited":false,"manualOverride":{"citeprocText":"(Cai et al. 2023)","isManuallyOverridden":false,"manualOverrideText":""},"mendeley":{"formattedCitation":"(Cai et al. 2023)","plainTextFormattedCitation":"(Cai et al. 2023)","previouslyFormattedCitation":"(Cai et al. 2023)"},"properties":{"noteIndex":0},"schema":"https://github.com/citation-style-language/schema/raw/master/csl-citation.json"}</w:instrText>
       </w:r>
       <w:r>
         <w:fldChar w:fldCharType="separate"/>
@@ -13645,7 +13835,7 @@
         <w:fldChar w:fldCharType="begin"/>
       </w:r>
       <w:r>
-        <w:instrText xml:space="preserve">ADDIN CSL_CITATION {"citationID":"MENDELEY_CITATION_307","citationItems":[{"id":"ITEM-306","isTemporary":false,"itemData":{"DOI":"10.3390/math10142475","author":[{"family":"Chella","given":"Antonio"},{"family":"Gaglio","given":"Salvatore"},{"family":"Pilato","given":"Giovanni"},{"family":"Vella","given":"Filippo"},{"family":"Zammuto","given":"Salvatore"}],"container-title":"Mathematics","id":"Chella2022","issue":"14","issued":{"date-parts":[[2022]]},"page":"2475","publisher":"MDPI","title":"A quantum planner for robot motion","type":"article-journal","volume":"10"}},{"id":"ITEM-307","isTemporary":false,"itemData":{"DOI":"10.1016/j.robot.2025.105026","author":[{"family":"Antero","given":"Unai"},{"family":"Sierra","given":"Basilio"},{"family":"Oñativia","given":"Jon"},{"family":"Ruiz","given":"Alejandra"},{"family":"Osaba","given":"Eneko"}],"container-title":"Robotics and Autonomous Systems","id":"Antero2025","issued":{"date-parts":[[2025]]},"page":"105026","publisher":"Elsevier","title":"Robot localization aided by quantum algorithms","type":"article-journal","volume":"192"}}],"isEdited":false,"manualOverride":{"citeprocText":"(Chella et al. 2022; Antero et al. 2025)","isManuallyOverridden":false,"manualOverrideText":""},"mendeley":{"formattedCitation":"(Chella et al. 2022; Antero et al. 2025)","plainTextFormattedCitation":"(Chella et al. 2022; Antero et al. 2025)","previouslyFormattedCitation":"(Chella et al. 2022; Antero et al. 2025)"},"properties":{"noteIndex":0},"schema":"https://github.com/citation-style-language/schema/raw/master/csl-citation.json"}</w:instrText>
+        <w:instrText xml:space="preserve">ADDIN CSL_CITATION {"citationID":"MENDELEY_CITATION_320","citationItems":[{"id":"ITEM-319","isTemporary":false,"itemData":{"DOI":"10.3390/math10142475","author":[{"family":"Chella","given":"Antonio"},{"family":"Gaglio","given":"Salvatore"},{"family":"Pilato","given":"Giovanni"},{"family":"Vella","given":"Filippo"},{"family":"Zammuto","given":"Salvatore"}],"container-title":"Mathematics","id":"Chella2022","issue":"14","issued":{"date-parts":[[2022]]},"page":"2475","publisher":"MDPI","title":"A quantum planner for robot motion","type":"article-journal","volume":"10"}},{"id":"ITEM-320","isTemporary":false,"itemData":{"DOI":"10.1016/j.robot.2025.105026","author":[{"family":"Antero","given":"Unai"},{"family":"Sierra","given":"Basilio"},{"family":"Oñativia","given":"Jon"},{"family":"Ruiz","given":"Alejandra"},{"family":"Osaba","given":"Eneko"}],"container-title":"Robotics and Autonomous Systems","id":"Antero2025","issued":{"date-parts":[[2025]]},"page":"105026","publisher":"Elsevier","title":"Robot localization aided by quantum algorithms","type":"article-journal","volume":"192"}}],"isEdited":false,"manualOverride":{"citeprocText":"(Chella et al. 2022; Antero et al. 2025)","isManuallyOverridden":false,"manualOverrideText":""},"mendeley":{"formattedCitation":"(Chella et al. 2022; Antero et al. 2025)","plainTextFormattedCitation":"(Chella et al. 2022; Antero et al. 2025)","previouslyFormattedCitation":"(Chella et al. 2022; Antero et al. 2025)"},"properties":{"noteIndex":0},"schema":"https://github.com/citation-style-language/schema/raw/master/csl-citation.json"}</w:instrText>
       </w:r>
       <w:r>
         <w:fldChar w:fldCharType="separate"/>
@@ -13690,7 +13880,7 @@
         <w:fldChar w:fldCharType="begin"/>
       </w:r>
       <w:r>
-        <w:instrText xml:space="preserve">ADDIN CSL_CITATION {"citationID":"MENDELEY_CITATION_309","citationItems":[{"id":"ITEM-308","isTemporary":false,"itemData":{"DOI":"10.1146/annurev-conmatphys-031119-050605","author":[{"family":"Kjaergaard","given":"Morten"},{"family":"Schwartz","given":"Mollie E."},{"family":"Braumüller","given":"Jochen"},{"family":"Krantz","given":"Philip"},{"family":"Wang","given":"Joel I.-J."},{"family":"Gustavsson","given":"Simon"},{"family":"Oliver","given":"William D."}],"container-title":"Annual Review of Condensed Matter Physics","id":"Kjaergaard2020","issued":{"date-parts":[[2020]]},"page":"369-395","publisher":"Annual Reviews","title":"Superconducting qubits: Current state of play","title-short":"Superconducting qubits","type":"article-journal","volume":"11"}},{"id":"ITEM-309","isTemporary":false,"itemData":{"DOI":"10.1098/rsta.2024.0139","author":[{"family":"Mannone","given":"Maria"},{"family":"Seidita","given":"Valeria"},{"family":"Chella","given":"Antonio"}],"container-title":"Philosophical Transactions of the Royal Society A: Mathematical, Physical and Engineering Sciences","id":"Mannone2025","issue":"2289","issued":{"date-parts":[[2025]]},"page":"20240139","title":"Quantum computing for swarm robotics: A local-to-global approach","title-short":"Quantum computing for swarm robotics","type":"article-journal","volume":"383"}}],"isEdited":false,"manualOverride":{"citeprocText":"(Kjaergaard et al. 2020; Mannone, Seidita, and Chella 2025)","isManuallyOverridden":false,"manualOverrideText":""},"mendeley":{"formattedCitation":"(Kjaergaard et al. 2020; Mannone, Seidita, and Chella 2025)","plainTextFormattedCitation":"(Kjaergaard et al. 2020; Mannone, Seidita, and Chella 2025)","previouslyFormattedCitation":"(Kjaergaard et al. 2020; Mannone, Seidita, and Chella 2025)"},"properties":{"noteIndex":0},"schema":"https://github.com/citation-style-language/schema/raw/master/csl-citation.json"}</w:instrText>
+        <w:instrText xml:space="preserve">ADDIN CSL_CITATION {"citationID":"MENDELEY_CITATION_322","citationItems":[{"id":"ITEM-321","isTemporary":false,"itemData":{"DOI":"10.1146/annurev-conmatphys-031119-050605","author":[{"family":"Kjaergaard","given":"Morten"},{"family":"Schwartz","given":"Mollie E."},{"family":"Braumüller","given":"Jochen"},{"family":"Krantz","given":"Philip"},{"family":"Wang","given":"Joel I.-J."},{"family":"Gustavsson","given":"Simon"},{"family":"Oliver","given":"William D."}],"container-title":"Annual Review of Condensed Matter Physics","id":"Kjaergaard2020","issued":{"date-parts":[[2020]]},"page":"369-395","publisher":"Annual Reviews","title":"Superconducting qubits: Current state of play","title-short":"Superconducting qubits","type":"article-journal","volume":"11"}},{"id":"ITEM-322","isTemporary":false,"itemData":{"DOI":"10.1098/rsta.2024.0139","author":[{"family":"Mannone","given":"Maria"},{"family":"Seidita","given":"Valeria"},{"family":"Chella","given":"Antonio"}],"container-title":"Philosophical Transactions of the Royal Society A: Mathematical, Physical and Engineering Sciences","id":"Mannone2025","issue":"2289","issued":{"date-parts":[[2025]]},"page":"20240139","title":"Quantum computing for swarm robotics: A local-to-global approach","title-short":"Quantum computing for swarm robotics","type":"article-journal","volume":"383"}}],"isEdited":false,"manualOverride":{"citeprocText":"(Kjaergaard et al. 2020; Mannone, Seidita, and Chella 2025)","isManuallyOverridden":false,"manualOverrideText":""},"mendeley":{"formattedCitation":"(Kjaergaard et al. 2020; Mannone, Seidita, and Chella 2025)","plainTextFormattedCitation":"(Kjaergaard et al. 2020; Mannone, Seidita, and Chella 2025)","previouslyFormattedCitation":"(Kjaergaard et al. 2020; Mannone, Seidita, and Chella 2025)"},"properties":{"noteIndex":0},"schema":"https://github.com/citation-style-language/schema/raw/master/csl-citation.json"}</w:instrText>
       </w:r>
       <w:r>
         <w:fldChar w:fldCharType="separate"/>
@@ -13708,7 +13898,7 @@
         <w:fldChar w:fldCharType="begin"/>
       </w:r>
       <w:r>
-        <w:instrText xml:space="preserve">ADDIN CSL_CITATION {"citationID":"MENDELEY_CITATION_310","citationItems":[{"id":"ITEM-310","isTemporary":false,"itemData":{"DOI":"10.1038/s42254-019-0117-4","author":[{"family":"Bongs","given":"Kai"},{"family":"Holynski","given":"Michael"},{"family":"Vovrosh","given":"Jamie"},{"family":"Bouyer","given":"Philippe"},{"family":"Condon","given":"Gabriel"},{"family":"Rasel","given":"Ernst"},{"family":"Schubert","given":"Christian"},{"family":"Schleich","given":"Wolfgang P."},{"family":"Roura","given":"Albert"}],"container-title":"Nature Reviews Physics","id":"Bongs2019","issue":"12","issued":{"date-parts":[[2019]]},"page":"731-739","publisher":"Nature Publishing Group","title":"Taking atom interferometric quantum sensors from the laboratory to real-world applications","type":"article-journal","volume":"1"}}],"isEdited":false,"manualOverride":{"citeprocText":"(Bongs et al. 2019)","isManuallyOverridden":false,"manualOverrideText":""},"mendeley":{"formattedCitation":"(Bongs et al. 2019)","plainTextFormattedCitation":"(Bongs et al. 2019)","previouslyFormattedCitation":"(Bongs et al. 2019)"},"properties":{"noteIndex":0},"schema":"https://github.com/citation-style-language/schema/raw/master/csl-citation.json"}</w:instrText>
+        <w:instrText xml:space="preserve">ADDIN CSL_CITATION {"citationID":"MENDELEY_CITATION_323","citationItems":[{"id":"ITEM-323","isTemporary":false,"itemData":{"DOI":"10.1038/s42254-019-0117-4","author":[{"family":"Bongs","given":"Kai"},{"family":"Holynski","given":"Michael"},{"family":"Vovrosh","given":"Jamie"},{"family":"Bouyer","given":"Philippe"},{"family":"Condon","given":"Gabriel"},{"family":"Rasel","given":"Ernst"},{"family":"Schubert","given":"Christian"},{"family":"Schleich","given":"Wolfgang P."},{"family":"Roura","given":"Albert"}],"container-title":"Nature Reviews Physics","id":"Bongs2019","issue":"12","issued":{"date-parts":[[2019]]},"page":"731-739","publisher":"Nature Publishing Group","title":"Taking atom interferometric quantum sensors from the laboratory to real-world applications","type":"article-journal","volume":"1"}}],"isEdited":false,"manualOverride":{"citeprocText":"(Bongs et al. 2019)","isManuallyOverridden":false,"manualOverrideText":""},"mendeley":{"formattedCitation":"(Bongs et al. 2019)","plainTextFormattedCitation":"(Bongs et al. 2019)","previouslyFormattedCitation":"(Bongs et al. 2019)"},"properties":{"noteIndex":0},"schema":"https://github.com/citation-style-language/schema/raw/master/csl-citation.json"}</w:instrText>
       </w:r>
       <w:r>
         <w:fldChar w:fldCharType="separate"/>
@@ -13753,7 +13943,7 @@
         <w:fldChar w:fldCharType="begin"/>
       </w:r>
       <w:r>
-        <w:instrText xml:space="preserve">ADDIN CSL_CITATION {"citationID":"MENDELEY_CITATION_311","citationItems":[{"id":"ITEM-311","isTemporary":false,"itemData":{"DOI":"10.1098/rsta.2024.0139","author":[{"family":"Mannone","given":"Maria"},{"family":"Seidita","given":"Valeria"},{"family":"Chella","given":"Antonio"}],"container-title":"Philosophical Transactions of the Royal Society A: Mathematical, Physical and Engineering Sciences","id":"Mannone2025","issue":"2289","issued":{"date-parts":[[2025]]},"page":"20240139","title":"Quantum computing for swarm robotics: A local-to-global approach","title-short":"Quantum computing for swarm robotics","type":"article-journal","volume":"383"}}],"isEdited":false,"manualOverride":{"citeprocText":"(Mannone, Seidita, and Chella 2025)","isManuallyOverridden":false,"manualOverrideText":""},"mendeley":{"formattedCitation":"(Mannone, Seidita, and Chella 2025)","plainTextFormattedCitation":"(Mannone, Seidita, and Chella 2025)","previouslyFormattedCitation":"(Mannone, Seidita, and Chella 2025)"},"properties":{"noteIndex":0},"schema":"https://github.com/citation-style-language/schema/raw/master/csl-citation.json"}</w:instrText>
+        <w:instrText xml:space="preserve">ADDIN CSL_CITATION {"citationID":"MENDELEY_CITATION_324","citationItems":[{"id":"ITEM-324","isTemporary":false,"itemData":{"DOI":"10.1098/rsta.2024.0139","author":[{"family":"Mannone","given":"Maria"},{"family":"Seidita","given":"Valeria"},{"family":"Chella","given":"Antonio"}],"container-title":"Philosophical Transactions of the Royal Society A: Mathematical, Physical and Engineering Sciences","id":"Mannone2025","issue":"2289","issued":{"date-parts":[[2025]]},"page":"20240139","title":"Quantum computing for swarm robotics: A local-to-global approach","title-short":"Quantum computing for swarm robotics","type":"article-journal","volume":"383"}}],"isEdited":false,"manualOverride":{"citeprocText":"(Mannone, Seidita, and Chella 2025)","isManuallyOverridden":false,"manualOverrideText":""},"mendeley":{"formattedCitation":"(Mannone, Seidita, and Chella 2025)","plainTextFormattedCitation":"(Mannone, Seidita, and Chella 2025)","previouslyFormattedCitation":"(Mannone, Seidita, and Chella 2025)"},"properties":{"noteIndex":0},"schema":"https://github.com/citation-style-language/schema/raw/master/csl-citation.json"}</w:instrText>
       </w:r>
       <w:r>
         <w:fldChar w:fldCharType="separate"/>
@@ -13774,7 +13964,7 @@
         <w:fldChar w:fldCharType="begin"/>
       </w:r>
       <w:r>
-        <w:instrText xml:space="preserve">ADDIN CSL_CITATION {"citationID":"MENDELEY_CITATION_312","citationItems":[{"id":"ITEM-312","isTemporary":false,"itemData":{"DOI":"10.1007/s42484-024-00226-4","author":[{"family":"Sinha","given":"Akash"},{"family":"Macaluso","given":"Antonio"},{"family":"Klusch","given":"Matthias"}],"container-title":"Quantum Machine Intelligence","id":"Sinha2023","issued":{"date-parts":[[2025]]},"page":"19","publisher":"Springer","title":"Nav-Q: Quantum deep reinforcement learning for collision-free navigation of self-driving cars","title-short":"Nav-Q","type":"article-journal","volume":"7"}}],"isEdited":false,"manualOverride":{"citeprocText":"(Sinha, Macaluso, and Klusch 2025)","isManuallyOverridden":false,"manualOverrideText":""},"mendeley":{"formattedCitation":"(Sinha, Macaluso, and Klusch 2025)","plainTextFormattedCitation":"(Sinha, Macaluso, and Klusch 2025)","previouslyFormattedCitation":"(Sinha, Macaluso, and Klusch 2025)"},"properties":{"noteIndex":0},"schema":"https://github.com/citation-style-language/schema/raw/master/csl-citation.json"}</w:instrText>
+        <w:instrText xml:space="preserve">ADDIN CSL_CITATION {"citationID":"MENDELEY_CITATION_325","citationItems":[{"id":"ITEM-325","isTemporary":false,"itemData":{"DOI":"10.1007/s42484-024-00226-4","author":[{"family":"Sinha","given":"Akash"},{"family":"Macaluso","given":"Antonio"},{"family":"Klusch","given":"Matthias"}],"container-title":"Quantum Machine Intelligence","id":"Sinha2023","issued":{"date-parts":[[2025]]},"page":"19","publisher":"Springer","title":"Nav-Q: Quantum deep reinforcement learning for collision-free navigation of self-driving cars","title-short":"Nav-Q","type":"article-journal","volume":"7"}}],"isEdited":false,"manualOverride":{"citeprocText":"(Sinha, Macaluso, and Klusch 2025)","isManuallyOverridden":false,"manualOverrideText":""},"mendeley":{"formattedCitation":"(Sinha, Macaluso, and Klusch 2025)","plainTextFormattedCitation":"(Sinha, Macaluso, and Klusch 2025)","previouslyFormattedCitation":"(Sinha, Macaluso, and Klusch 2025)"},"properties":{"noteIndex":0},"schema":"https://github.com/citation-style-language/schema/raw/master/csl-citation.json"}</w:instrText>
       </w:r>
       <w:r>
         <w:fldChar w:fldCharType="separate"/>
@@ -13792,7 +13982,7 @@
         <w:fldChar w:fldCharType="begin"/>
       </w:r>
       <w:r>
-        <w:instrText xml:space="preserve">ADDIN CSL_CITATION {"citationID":"MENDELEY_CITATION_313","citationItems":[{"id":"ITEM-313","isTemporary":false,"itemData":{"URL":"https://arxiv.org/abs/2508.01690","author":[{"family":"Sun","given":"Yize"},{"family":"Hagog","given":"Mohamad"},{"family":"Weber","given":"Marc"},{"family":"Hein","given":"Daniel"},{"family":"Udluft","given":"Steffen"},{"family":"Tresp","given":"Volker"},{"family":"Ma","given":"Yunpu"}],"id":"Sun2025","issued":{"date-parts":[[2025]]},"note":"QML@QCE 2025 workshop","title":"First experience with real-time control using simulated VQC-based quantum policies","type":""}}],"isEdited":false,"manualOverride":{"citeprocText":"(Sun et al. 2025)","isManuallyOverridden":false,"manualOverrideText":""},"mendeley":{"formattedCitation":"(Sun et al. 2025)","plainTextFormattedCitation":"(Sun et al. 2025)","previouslyFormattedCitation":"(Sun et al. 2025)"},"properties":{"noteIndex":0},"schema":"https://github.com/citation-style-language/schema/raw/master/csl-citation.json"}</w:instrText>
+        <w:instrText xml:space="preserve">ADDIN CSL_CITATION {"citationID":"MENDELEY_CITATION_326","citationItems":[{"id":"ITEM-326","isTemporary":false,"itemData":{"URL":"https://arxiv.org/abs/2508.01690","author":[{"family":"Sun","given":"Yize"},{"family":"Hagog","given":"Mohamad"},{"family":"Weber","given":"Marc"},{"family":"Hein","given":"Daniel"},{"family":"Udluft","given":"Steffen"},{"family":"Tresp","given":"Volker"},{"family":"Ma","given":"Yunpu"}],"id":"Sun2025","issued":{"date-parts":[[2025]]},"note":"QML@QCE 2025 workshop","title":"First experience with real-time control using simulated VQC-based quantum policies","type":""}}],"isEdited":false,"manualOverride":{"citeprocText":"(Sun et al. 2025)","isManuallyOverridden":false,"manualOverrideText":""},"mendeley":{"formattedCitation":"(Sun et al. 2025)","plainTextFormattedCitation":"(Sun et al. 2025)","previouslyFormattedCitation":"(Sun et al. 2025)"},"properties":{"noteIndex":0},"schema":"https://github.com/citation-style-language/schema/raw/master/csl-citation.json"}</w:instrText>
       </w:r>
       <w:r>
         <w:fldChar w:fldCharType="separate"/>
@@ -13810,7 +14000,7 @@
         <w:fldChar w:fldCharType="begin"/>
       </w:r>
       <w:r>
-        <w:instrText xml:space="preserve">ADDIN CSL_CITATION {"citationID":"MENDELEY_CITATION_314","citationItems":[{"id":"ITEM-314","isTemporary":false,"itemData":{"URL":"https://arxiv.org/abs/2605.01716","author":[{"family":"Ngo","given":"Nguyen Truong Thu"},{"family":"Mehtola","given":"Väinö"},{"family":"Lenssen","given":"Jérome"},{"family":"Wang","given":"Peiyong"},{"family":"Cosco","given":"Francesco"},{"family":"Lu","given":"Tien-Fu"},{"family":"Quach","given":"James Q."}],"id":"Ngo2026","issued":{"date-parts":[[2026]]},"title":"Towards real-time control of a CartPole system on a quantum computer","type":""}}],"isEdited":false,"manualOverride":{"citeprocText":"(Ngo et al. 2026)","isManuallyOverridden":false,"manualOverrideText":""},"mendeley":{"formattedCitation":"(Ngo et al. 2026)","plainTextFormattedCitation":"(Ngo et al. 2026)","previouslyFormattedCitation":"(Ngo et al. 2026)"},"properties":{"noteIndex":0},"schema":"https://github.com/citation-style-language/schema/raw/master/csl-citation.json"}</w:instrText>
+        <w:instrText xml:space="preserve">ADDIN CSL_CITATION {"citationID":"MENDELEY_CITATION_327","citationItems":[{"id":"ITEM-327","isTemporary":false,"itemData":{"URL":"https://arxiv.org/abs/2605.01716","author":[{"family":"Ngo","given":"Nguyen Truong Thu"},{"family":"Mehtola","given":"Väinö"},{"family":"Lenssen","given":"Jérome"},{"family":"Wang","given":"Peiyong"},{"family":"Cosco","given":"Francesco"},{"family":"Lu","given":"Tien-Fu"},{"family":"Quach","given":"James Q."}],"id":"Ngo2026","issued":{"date-parts":[[2026]]},"title":"Towards real-time control of a CartPole system on a quantum computer","type":""}}],"isEdited":false,"manualOverride":{"citeprocText":"(Ngo et al. 2026)","isManuallyOverridden":false,"manualOverrideText":""},"mendeley":{"formattedCitation":"(Ngo et al. 2026)","plainTextFormattedCitation":"(Ngo et al. 2026)","previouslyFormattedCitation":"(Ngo et al. 2026)"},"properties":{"noteIndex":0},"schema":"https://github.com/citation-style-language/schema/raw/master/csl-citation.json"}</w:instrText>
       </w:r>
       <w:r>
         <w:fldChar w:fldCharType="separate"/>
@@ -13902,7 +14092,7 @@
         <w:fldChar w:fldCharType="begin"/>
       </w:r>
       <w:r>
-        <w:instrText xml:space="preserve">ADDIN CSL_CITATION {"citationID":"MENDELEY_CITATION_315","citationItems":[{"id":"ITEM-315","isTemporary":false,"itemData":{"DOI":"10.1017/S0140525X12001525","author":[{"family":"Pothos","given":"Emmanuel M."},{"family":"Busemeyer","given":"Jerome R."}],"container-title":"Behavioral and Brain Sciences","id":"Pothos2013","issue":"3","issued":{"date-parts":[[2013]]},"page":"255-274","publisher":"Cambridge University Press","title":"Can quantum probability provide a new direction for cognitive modeling?","type":"article-journal","volume":"36"}}],"isEdited":false,"manualOverride":{"citeprocText":"(Pothos and Busemeyer 2013)","isManuallyOverridden":false,"manualOverrideText":""},"mendeley":{"formattedCitation":"(Pothos and Busemeyer 2013)","plainTextFormattedCitation":"(Pothos and Busemeyer 2013)","previouslyFormattedCitation":"(Pothos and Busemeyer 2013)"},"properties":{"noteIndex":0},"schema":"https://github.com/citation-style-language/schema/raw/master/csl-citation.json"}</w:instrText>
+        <w:instrText xml:space="preserve">ADDIN CSL_CITATION {"citationID":"MENDELEY_CITATION_328","citationItems":[{"id":"ITEM-328","isTemporary":false,"itemData":{"DOI":"10.1017/S0140525X12001525","author":[{"family":"Pothos","given":"Emmanuel M."},{"family":"Busemeyer","given":"Jerome R."}],"container-title":"Behavioral and Brain Sciences","id":"Pothos2013","issue":"3","issued":{"date-parts":[[2013]]},"page":"255-274","publisher":"Cambridge University Press","title":"Can quantum probability provide a new direction for cognitive modeling?","type":"article-journal","volume":"36"}}],"isEdited":false,"manualOverride":{"citeprocText":"(Pothos and Busemeyer 2013)","isManuallyOverridden":false,"manualOverrideText":""},"mendeley":{"formattedCitation":"(Pothos and Busemeyer 2013)","plainTextFormattedCitation":"(Pothos and Busemeyer 2013)","previouslyFormattedCitation":"(Pothos and Busemeyer 2013)"},"properties":{"noteIndex":0},"schema":"https://github.com/citation-style-language/schema/raw/master/csl-citation.json"}</w:instrText>
       </w:r>
       <w:r>
         <w:fldChar w:fldCharType="separate"/>
@@ -13920,7 +14110,7 @@
         <w:fldChar w:fldCharType="begin"/>
       </w:r>
       <w:r>
-        <w:instrText xml:space="preserve">ADDIN CSL_CITATION {"citationID":"MENDELEY_CITATION_317","citationItems":[{"id":"ITEM-316","isTemporary":false,"itemData":{"DOI":"10.1016/S0004-3702(98)00023-X","author":[{"family":"Kaelbling","given":"Leslie Pack"},{"family":"Littman","given":"Michael L."},{"family":"Cassandra","given":"Anthony R."}],"container-title":"Artificial Intelligence","id":"Kaelbling1998","issue":"1–2","issued":{"date-parts":[[1998]]},"page":"99-134","title":"Planning and acting in partially observable stochastic domains","type":"article-journal","volume":"101"}},{"id":"ITEM-317","isTemporary":false,"itemData":{"DOI":"10.1146/annurev-control-042920-092451","author":[{"family":"Kurniawati","given":"Hanna"}],"container-title":"Annual Review of Control, Robotics, and Autonomous Systems","id":"Kurniawati2022","issued":{"date-parts":[[2022]]},"page":"253-277","publisher":"Annual Reviews","title":"Partially observable Markov decision processes and robotics","type":"article-journal","volume":"5"}}],"isEdited":false,"manualOverride":{"citeprocText":"(Kaelbling, Littman, and Cassandra 1998; Kurniawati 2022)","isManuallyOverridden":false,"manualOverrideText":""},"mendeley":{"formattedCitation":"(Kaelbling, Littman, and Cassandra 1998; Kurniawati 2022)","plainTextFormattedCitation":"(Kaelbling, Littman, and Cassandra 1998; Kurniawati 2022)","previouslyFormattedCitation":"(Kaelbling, Littman, and Cassandra 1998; Kurniawati 2022)"},"properties":{"noteIndex":0},"schema":"https://github.com/citation-style-language/schema/raw/master/csl-citation.json"}</w:instrText>
+        <w:instrText xml:space="preserve">ADDIN CSL_CITATION {"citationID":"MENDELEY_CITATION_330","citationItems":[{"id":"ITEM-329","isTemporary":false,"itemData":{"DOI":"10.1016/S0004-3702(98)00023-X","author":[{"family":"Kaelbling","given":"Leslie Pack"},{"family":"Littman","given":"Michael L."},{"family":"Cassandra","given":"Anthony R."}],"container-title":"Artificial Intelligence","id":"Kaelbling1998","issue":"1–2","issued":{"date-parts":[[1998]]},"page":"99-134","title":"Planning and acting in partially observable stochastic domains","type":"article-journal","volume":"101"}},{"id":"ITEM-330","isTemporary":false,"itemData":{"DOI":"10.1146/annurev-control-042920-092451","author":[{"family":"Kurniawati","given":"Hanna"}],"container-title":"Annual Review of Control, Robotics, and Autonomous Systems","id":"Kurniawati2022","issued":{"date-parts":[[2022]]},"page":"253-277","publisher":"Annual Reviews","title":"Partially observable Markov decision processes and robotics","type":"article-journal","volume":"5"}}],"isEdited":false,"manualOverride":{"citeprocText":"(Kaelbling, Littman, and Cassandra 1998; Kurniawati 2022)","isManuallyOverridden":false,"manualOverrideText":""},"mendeley":{"formattedCitation":"(Kaelbling, Littman, and Cassandra 1998; Kurniawati 2022)","plainTextFormattedCitation":"(Kaelbling, Littman, and Cassandra 1998; Kurniawati 2022)","previouslyFormattedCitation":"(Kaelbling, Littman, and Cassandra 1998; Kurniawati 2022)"},"properties":{"noteIndex":0},"schema":"https://github.com/citation-style-language/schema/raw/master/csl-citation.json"}</w:instrText>
       </w:r>
       <w:r>
         <w:fldChar w:fldCharType="separate"/>
@@ -13941,7 +14131,7 @@
         <w:fldChar w:fldCharType="begin"/>
       </w:r>
       <w:r>
-        <w:instrText xml:space="preserve">ADDIN CSL_CITATION {"citationID":"MENDELEY_CITATION_318","citationItems":[{"id":"ITEM-318","isTemporary":false,"itemData":{"DOI":"10.1037/0033-295X.100.3.432","author":[{"family":"Busemeyer","given":"Jerome R."},{"family":"Townsend","given":"James T."}],"container-title":"Psychological Review","id":"Busemeyer1993","issue":"3","issued":{"date-parts":[[1993]]},"page":"432-459","publisher":"American Psychological Association","title":"Decision field theory: A dynamic-cognitive approach to decision making in an uncertain environment","title-short":"Decision field theory","type":"article-journal","volume":"100"}}],"isEdited":false,"manualOverride":{"citeprocText":"(Busemeyer and Townsend 1993)","isManuallyOverridden":false,"manualOverrideText":""},"mendeley":{"formattedCitation":"(Busemeyer and Townsend 1993)","plainTextFormattedCitation":"(Busemeyer and Townsend 1993)","previouslyFormattedCitation":"(Busemeyer and Townsend 1993)"},"properties":{"noteIndex":0},"schema":"https://github.com/citation-style-language/schema/raw/master/csl-citation.json"}</w:instrText>
+        <w:instrText xml:space="preserve">ADDIN CSL_CITATION {"citationID":"MENDELEY_CITATION_331","citationItems":[{"id":"ITEM-331","isTemporary":false,"itemData":{"DOI":"10.1037/0033-295X.100.3.432","author":[{"family":"Busemeyer","given":"Jerome R."},{"family":"Townsend","given":"James T."}],"container-title":"Psychological Review","id":"Busemeyer1993","issue":"3","issued":{"date-parts":[[1993]]},"page":"432-459","publisher":"American Psychological Association","title":"Decision field theory: A dynamic-cognitive approach to decision making in an uncertain environment","title-short":"Decision field theory","type":"article-journal","volume":"100"}}],"isEdited":false,"manualOverride":{"citeprocText":"(Busemeyer and Townsend 1993)","isManuallyOverridden":false,"manualOverrideText":""},"mendeley":{"formattedCitation":"(Busemeyer and Townsend 1993)","plainTextFormattedCitation":"(Busemeyer and Townsend 1993)","previouslyFormattedCitation":"(Busemeyer and Townsend 1993)"},"properties":{"noteIndex":0},"schema":"https://github.com/citation-style-language/schema/raw/master/csl-citation.json"}</w:instrText>
       </w:r>
       <w:r>
         <w:fldChar w:fldCharType="separate"/>
@@ -13974,7 +14164,7 @@
         <w:fldChar w:fldCharType="begin"/>
       </w:r>
       <w:r>
-        <w:instrText xml:space="preserve">ADDIN CSL_CITATION {"citationID":"MENDELEY_CITATION_319","citationItems":[{"id":"ITEM-319","isTemporary":false,"itemData":{"DOI":"10.1017/CBO9780511997716","author":[{"family":"Busemeyer","given":"Jerome R."},{"family":"Bruza","given":"Peter D."}],"id":"Busemeyer2012","issued":{"date-parts":[[2012]]},"publisher":"Cambridge University Press","publisher-place":"Cambridge, UK","title":"Quantum models of cognition and decision","type":"book"}}],"isEdited":false,"manualOverride":{"citeprocText":"(Busemeyer and Bruza 2012)","isManuallyOverridden":false,"manualOverrideText":""},"mendeley":{"formattedCitation":"(Busemeyer and Bruza 2012)","plainTextFormattedCitation":"(Busemeyer and Bruza 2012)","previouslyFormattedCitation":"(Busemeyer and Bruza 2012)"},"properties":{"noteIndex":0},"schema":"https://github.com/citation-style-language/schema/raw/master/csl-citation.json"}</w:instrText>
+        <w:instrText xml:space="preserve">ADDIN CSL_CITATION {"citationID":"MENDELEY_CITATION_332","citationItems":[{"id":"ITEM-332","isTemporary":false,"itemData":{"DOI":"10.1017/CBO9780511997716","author":[{"family":"Busemeyer","given":"Jerome R."},{"family":"Bruza","given":"Peter D."}],"id":"Busemeyer2012","issued":{"date-parts":[[2012]]},"publisher":"Cambridge University Press","publisher-place":"Cambridge, UK","title":"Quantum models of cognition and decision","type":"book"}}],"isEdited":false,"manualOverride":{"citeprocText":"(Busemeyer and Bruza 2012)","isManuallyOverridden":false,"manualOverrideText":""},"mendeley":{"formattedCitation":"(Busemeyer and Bruza 2012)","plainTextFormattedCitation":"(Busemeyer and Bruza 2012)","previouslyFormattedCitation":"(Busemeyer and Bruza 2012)"},"properties":{"noteIndex":0},"schema":"https://github.com/citation-style-language/schema/raw/master/csl-citation.json"}</w:instrText>
       </w:r>
       <w:r>
         <w:fldChar w:fldCharType="separate"/>
@@ -14190,7 +14380,7 @@
         <w:fldChar w:fldCharType="begin"/>
       </w:r>
       <w:r>
-        <w:instrText xml:space="preserve">ADDIN CSL_CITATION {"citationID":"MENDELEY_CITATION_321","citationItems":[{"id":"ITEM-320","isTemporary":false,"itemData":{"DOI":"10.1017/S0140525X12001525","author":[{"family":"Pothos","given":"Emmanuel M."},{"family":"Busemeyer","given":"Jerome R."}],"container-title":"Behavioral and Brain Sciences","id":"Pothos2013","issue":"3","issued":{"date-parts":[[2013]]},"page":"255-274","publisher":"Cambridge University Press","title":"Can quantum probability provide a new direction for cognitive modeling?","type":"article-journal","volume":"36"}},{"id":"ITEM-321","isTemporary":false,"itemData":{"DOI":"10.1146/annurev-psych-033020-123501","author":[{"family":"Pothos","given":"Emmanuel M."},{"family":"Busemeyer","given":"Jerome R."}],"container-title":"Annual Review of Psychology","id":"Pothos2022","issue":"1","issued":{"date-parts":[[2022]]},"page":"749-778","publisher":"Annual Reviews","title":"Quantum cognition","type":"article-journal","volume":"73"}}],"isEdited":false,"manualOverride":{"citeprocText":"(Pothos and Busemeyer 2013, 2022)","isManuallyOverridden":false,"manualOverrideText":""},"mendeley":{"formattedCitation":"(Pothos and Busemeyer 2013, 2022)","plainTextFormattedCitation":"(Pothos and Busemeyer 2013, 2022)","previouslyFormattedCitation":"(Pothos and Busemeyer 2013, 2022)"},"properties":{"noteIndex":0},"schema":"https://github.com/citation-style-language/schema/raw/master/csl-citation.json"}</w:instrText>
+        <w:instrText xml:space="preserve">ADDIN CSL_CITATION {"citationID":"MENDELEY_CITATION_334","citationItems":[{"id":"ITEM-333","isTemporary":false,"itemData":{"DOI":"10.1017/S0140525X12001525","author":[{"family":"Pothos","given":"Emmanuel M."},{"family":"Busemeyer","given":"Jerome R."}],"container-title":"Behavioral and Brain Sciences","id":"Pothos2013","issue":"3","issued":{"date-parts":[[2013]]},"page":"255-274","publisher":"Cambridge University Press","title":"Can quantum probability provide a new direction for cognitive modeling?","type":"article-journal","volume":"36"}},{"id":"ITEM-334","isTemporary":false,"itemData":{"DOI":"10.1146/annurev-psych-033020-123501","author":[{"family":"Pothos","given":"Emmanuel M."},{"family":"Busemeyer","given":"Jerome R."}],"container-title":"Annual Review of Psychology","id":"Pothos2022","issue":"1","issued":{"date-parts":[[2022]]},"page":"749-778","publisher":"Annual Reviews","title":"Quantum cognition","type":"article-journal","volume":"73"}}],"isEdited":false,"manualOverride":{"citeprocText":"(Pothos and Busemeyer 2013, 2022)","isManuallyOverridden":false,"manualOverrideText":""},"mendeley":{"formattedCitation":"(Pothos and Busemeyer 2013, 2022)","plainTextFormattedCitation":"(Pothos and Busemeyer 2013, 2022)","previouslyFormattedCitation":"(Pothos and Busemeyer 2013, 2022)"},"properties":{"noteIndex":0},"schema":"https://github.com/citation-style-language/schema/raw/master/csl-citation.json"}</w:instrText>
       </w:r>
       <w:r>
         <w:fldChar w:fldCharType="separate"/>
@@ -14208,7 +14398,7 @@
         <w:fldChar w:fldCharType="begin"/>
       </w:r>
       <w:r>
-        <w:instrText xml:space="preserve">ADDIN CSL_CITATION {"citationID":"MENDELEY_CITATION_322","citationItems":[{"id":"ITEM-322","isTemporary":false,"itemData":{"DOI":"10.1017/CBO9780511997716","author":[{"family":"Busemeyer","given":"Jerome R."},{"family":"Bruza","given":"Peter D."}],"id":"Busemeyer2012","issued":{"date-parts":[[2012]]},"publisher":"Cambridge University Press","publisher-place":"Cambridge, UK","title":"Quantum models of cognition and decision","type":"book"}}],"isEdited":false,"manualOverride":{"citeprocText":"(Busemeyer and Bruza 2012)","isManuallyOverridden":false,"manualOverrideText":""},"mendeley":{"formattedCitation":"(Busemeyer and Bruza 2012)","plainTextFormattedCitation":"(Busemeyer and Bruza 2012)","previouslyFormattedCitation":"(Busemeyer and Bruza 2012)"},"properties":{"noteIndex":0},"schema":"https://github.com/citation-style-language/schema/raw/master/csl-citation.json"}</w:instrText>
+        <w:instrText xml:space="preserve">ADDIN CSL_CITATION {"citationID":"MENDELEY_CITATION_335","citationItems":[{"id":"ITEM-335","isTemporary":false,"itemData":{"DOI":"10.1017/CBO9780511997716","author":[{"family":"Busemeyer","given":"Jerome R."},{"family":"Bruza","given":"Peter D."}],"id":"Busemeyer2012","issued":{"date-parts":[[2012]]},"publisher":"Cambridge University Press","publisher-place":"Cambridge, UK","title":"Quantum models of cognition and decision","type":"book"}}],"isEdited":false,"manualOverride":{"citeprocText":"(Busemeyer and Bruza 2012)","isManuallyOverridden":false,"manualOverrideText":""},"mendeley":{"formattedCitation":"(Busemeyer and Bruza 2012)","plainTextFormattedCitation":"(Busemeyer and Bruza 2012)","previouslyFormattedCitation":"(Busemeyer and Bruza 2012)"},"properties":{"noteIndex":0},"schema":"https://github.com/citation-style-language/schema/raw/master/csl-citation.json"}</w:instrText>
       </w:r>
       <w:r>
         <w:fldChar w:fldCharType="separate"/>
@@ -14226,7 +14416,7 @@
         <w:fldChar w:fldCharType="begin"/>
       </w:r>
       <w:r>
-        <w:instrText xml:space="preserve">ADDIN CSL_CITATION {"citationID":"MENDELEY_CITATION_323","citationItems":[{"id":"ITEM-323","isTemporary":false,"itemData":{"DOI":"10.1146/annurev-psych-033020-123501","author":[{"family":"Pothos","given":"Emmanuel M."},{"family":"Busemeyer","given":"Jerome R."}],"container-title":"Annual Review of Psychology","id":"Pothos2022","issue":"1","issued":{"date-parts":[[2022]]},"page":"749-778","publisher":"Annual Reviews","title":"Quantum cognition","type":"article-journal","volume":"73"}}],"isEdited":false,"manualOverride":{"citeprocText":"(Pothos and Busemeyer 2022)","isManuallyOverridden":false,"manualOverrideText":""},"mendeley":{"formattedCitation":"(Pothos and Busemeyer 2022)","plainTextFormattedCitation":"(Pothos and Busemeyer 2022)","previouslyFormattedCitation":"(Pothos and Busemeyer 2022)"},"properties":{"noteIndex":0},"schema":"https://github.com/citation-style-language/schema/raw/master/csl-citation.json"}</w:instrText>
+        <w:instrText xml:space="preserve">ADDIN CSL_CITATION {"citationID":"MENDELEY_CITATION_336","citationItems":[{"id":"ITEM-336","isTemporary":false,"itemData":{"DOI":"10.1146/annurev-psych-033020-123501","author":[{"family":"Pothos","given":"Emmanuel M."},{"family":"Busemeyer","given":"Jerome R."}],"container-title":"Annual Review of Psychology","id":"Pothos2022","issue":"1","issued":{"date-parts":[[2022]]},"page":"749-778","publisher":"Annual Reviews","title":"Quantum cognition","type":"article-journal","volume":"73"}}],"isEdited":false,"manualOverride":{"citeprocText":"(Pothos and Busemeyer 2022)","isManuallyOverridden":false,"manualOverrideText":""},"mendeley":{"formattedCitation":"(Pothos and Busemeyer 2022)","plainTextFormattedCitation":"(Pothos and Busemeyer 2022)","previouslyFormattedCitation":"(Pothos and Busemeyer 2022)"},"properties":{"noteIndex":0},"schema":"https://github.com/citation-style-language/schema/raw/master/csl-citation.json"}</w:instrText>
       </w:r>
       <w:r>
         <w:fldChar w:fldCharType="separate"/>
@@ -14268,7 +14458,7 @@
         <w:fldChar w:fldCharType="begin"/>
       </w:r>
       <w:r>
-        <w:instrText xml:space="preserve">ADDIN CSL_CITATION {"citationID":"MENDELEY_CITATION_324","citationItems":[{"id":"ITEM-324","isTemporary":false,"itemData":{"DOI":"10.3390/e25040548","author":[{"family":"Widdows","given":"Dominic"},{"family":"Rani","given":"Jyoti"},{"family":"Pothos","given":"Emmanuel M."}],"container-title":"Entropy","id":"Widdows2023","issue":"4","issued":{"date-parts":[[2023]]},"page":"548","publisher":"MDPI","title":"Quantum circuit components for cognitive decision-making","type":"article-journal","volume":"25"},"suppress-author":false}],"isEdited":false,"manualOverride":{"citeprocText":"Widdows, Rani, and Pothos (2023)","isManuallyOverridden":false,"manualOverrideText":""},"mendeley":{"formattedCitation":"Widdows, Rani, and Pothos (2023)","plainTextFormattedCitation":"Widdows, Rani, and Pothos (2023)","previouslyFormattedCitation":"Widdows, Rani, and Pothos (2023)"},"properties":{"noteIndex":0},"schema":"https://github.com/citation-style-language/schema/raw/master/csl-citation.json"}</w:instrText>
+        <w:instrText xml:space="preserve">ADDIN CSL_CITATION {"citationID":"MENDELEY_CITATION_337","citationItems":[{"id":"ITEM-337","isTemporary":false,"itemData":{"DOI":"10.3390/e25040548","author":[{"family":"Widdows","given":"Dominic"},{"family":"Rani","given":"Jyoti"},{"family":"Pothos","given":"Emmanuel M."}],"container-title":"Entropy","id":"Widdows2023","issue":"4","issued":{"date-parts":[[2023]]},"page":"548","publisher":"MDPI","title":"Quantum circuit components for cognitive decision-making","type":"article-journal","volume":"25"},"suppress-author":false}],"isEdited":false,"manualOverride":{"citeprocText":"Widdows, Rani, and Pothos (2023)","isManuallyOverridden":false,"manualOverrideText":""},"mendeley":{"formattedCitation":"Widdows, Rani, and Pothos (2023)","plainTextFormattedCitation":"Widdows, Rani, and Pothos (2023)","previouslyFormattedCitation":"Widdows, Rani, and Pothos (2023)"},"properties":{"noteIndex":0},"schema":"https://github.com/citation-style-language/schema/raw/master/csl-citation.json"}</w:instrText>
       </w:r>
       <w:r>
         <w:fldChar w:fldCharType="separate"/>
@@ -14292,7 +14482,7 @@
         <w:fldChar w:fldCharType="begin"/>
       </w:r>
       <w:r>
-        <w:instrText xml:space="preserve">ADDIN CSL_CITATION {"citationID":"MENDELEY_CITATION_325","citationItems":[{"id":"ITEM-325","isTemporary":false,"itemData":{"DOI":"10.3390/electronics10020100","author":[{"family":"Yan","given":"Fei"},{"family":"Iliyasu","given":"Abdullah M."},{"family":"Hirota","given":"Kaoru"}],"container-title":"Electronics","id":"Yan2021","issue":"2","issued":{"date-parts":[[2021]]},"page":"100","publisher":"MDPI","title":"Conceptual framework for quantum affective computing and its use in fusion of multi-robot emotions","type":"article-journal","volume":"10"},"suppress-author":false}],"isEdited":false,"manualOverride":{"citeprocText":"Yan, Iliyasu, and Hirota (2021)","isManuallyOverridden":false,"manualOverrideText":""},"mendeley":{"formattedCitation":"Yan, Iliyasu, and Hirota (2021)","plainTextFormattedCitation":"Yan, Iliyasu, and Hirota (2021)","previouslyFormattedCitation":"Yan, Iliyasu, and Hirota (2021)"},"properties":{"noteIndex":0},"schema":"https://github.com/citation-style-language/schema/raw/master/csl-citation.json"}</w:instrText>
+        <w:instrText xml:space="preserve">ADDIN CSL_CITATION {"citationID":"MENDELEY_CITATION_338","citationItems":[{"id":"ITEM-338","isTemporary":false,"itemData":{"DOI":"10.3390/electronics10020100","author":[{"family":"Yan","given":"Fei"},{"family":"Iliyasu","given":"Abdullah M."},{"family":"Hirota","given":"Kaoru"}],"container-title":"Electronics","id":"Yan2021","issue":"2","issued":{"date-parts":[[2021]]},"page":"100","publisher":"MDPI","title":"Conceptual framework for quantum affective computing and its use in fusion of multi-robot emotions","type":"article-journal","volume":"10"},"suppress-author":false}],"isEdited":false,"manualOverride":{"citeprocText":"Yan, Iliyasu, and Hirota (2021)","isManuallyOverridden":false,"manualOverrideText":""},"mendeley":{"formattedCitation":"Yan, Iliyasu, and Hirota (2021)","plainTextFormattedCitation":"Yan, Iliyasu, and Hirota (2021)","previouslyFormattedCitation":"Yan, Iliyasu, and Hirota (2021)"},"properties":{"noteIndex":0},"schema":"https://github.com/citation-style-language/schema/raw/master/csl-citation.json"}</w:instrText>
       </w:r>
       <w:r>
         <w:fldChar w:fldCharType="separate"/>
@@ -14333,7 +14523,7 @@
         <w:fldChar w:fldCharType="begin"/>
       </w:r>
       <w:r>
-        <w:instrText xml:space="preserve">ADDIN CSL_CITATION {"citationID":"MENDELEY_CITATION_326","citationItems":[{"id":"ITEM-326","isTemporary":false,"itemData":{"DOI":"10.1145/3708319.3735545","author":[{"family":"De Carolis","given":"Berardina Nadja"},{"family":"Loglisci","given":"Corrado"},{"family":"Miccoli","given":"Maria Grazia"},{"family":"Palestra","given":"Giuseppe"},{"family":"Violante","given":"Sergio"}],"container-title":"Adjunct proceedings of the 33rd ACM conference on user modeling, adaptation and personalization (UMAP adjunct ’25)","id":"DeCarolis2025","issued":{"date-parts":[[2025]]},"page":"151-155","publisher":"Association for Computing Machinery","publisher-place":"New York, NY, USA","title":"Quantum-enhanced social robotics: The QUADRI project","title-short":"Quantum-enhanced social robotics","type":"paper-conference"},"suppress-author":false}],"isEdited":false,"manualOverride":{"citeprocText":"De Carolis et al. (2025)","isManuallyOverridden":false,"manualOverrideText":""},"mendeley":{"formattedCitation":"De Carolis et al. (2025)","plainTextFormattedCitation":"De Carolis et al. (2025)","previouslyFormattedCitation":"De Carolis et al. (2025)"},"properties":{"noteIndex":0},"schema":"https://github.com/citation-style-language/schema/raw/master/csl-citation.json"}</w:instrText>
+        <w:instrText xml:space="preserve">ADDIN CSL_CITATION {"citationID":"MENDELEY_CITATION_339","citationItems":[{"id":"ITEM-339","isTemporary":false,"itemData":{"DOI":"10.1145/3708319.3735545","author":[{"family":"De Carolis","given":"Berardina Nadja"},{"family":"Loglisci","given":"Corrado"},{"family":"Miccoli","given":"Maria Grazia"},{"family":"Palestra","given":"Giuseppe"},{"family":"Violante","given":"Sergio"}],"container-title":"Adjunct proceedings of the 33rd ACM conference on user modeling, adaptation and personalization (UMAP adjunct ’25)","id":"DeCarolis2025","issued":{"date-parts":[[2025]]},"page":"151-155","publisher":"Association for Computing Machinery","publisher-place":"New York, NY, USA","title":"Quantum-enhanced social robotics: The QUADRI project","title-short":"Quantum-enhanced social robotics","type":"paper-conference"},"suppress-author":false}],"isEdited":false,"manualOverride":{"citeprocText":"De Carolis et al. (2025)","isManuallyOverridden":false,"manualOverrideText":""},"mendeley":{"formattedCitation":"De Carolis et al. (2025)","plainTextFormattedCitation":"De Carolis et al. (2025)","previouslyFormattedCitation":"De Carolis et al. (2025)"},"properties":{"noteIndex":0},"schema":"https://github.com/citation-style-language/schema/raw/master/csl-citation.json"}</w:instrText>
       </w:r>
       <w:r>
         <w:fldChar w:fldCharType="separate"/>
@@ -14357,7 +14547,7 @@
         <w:fldChar w:fldCharType="begin"/>
       </w:r>
       <w:r>
-        <w:instrText xml:space="preserve">ADDIN CSL_CITATION {"citationID":"MENDELEY_CITATION_327","citationItems":[{"id":"ITEM-327","isTemporary":false,"itemData":{"DOI":"10.32604/cmc.2025.065572","author":[{"family":"Dağlarlı","given":"Evren"}],"container-title":"Computers, Materials &amp; Continua","id":"Daglarli2025","issue":"3","issued":{"date-parts":[[2025]]},"publisher":"Tech Science Press","title":"A generative neuro-cognitive architecture using quantum algorithms for the autonomous behavior of a smart agent in a simulation environment","type":"article-journal","volume":"84"},"suppress-author":false}],"isEdited":false,"manualOverride":{"citeprocText":"Dağlarlı (2025)","isManuallyOverridden":false,"manualOverrideText":""},"mendeley":{"formattedCitation":"Dağlarlı (2025)","plainTextFormattedCitation":"Dağlarlı (2025)","previouslyFormattedCitation":"Dağlarlı (2025)"},"properties":{"noteIndex":0},"schema":"https://github.com/citation-style-language/schema/raw/master/csl-citation.json"}</w:instrText>
+        <w:instrText xml:space="preserve">ADDIN CSL_CITATION {"citationID":"MENDELEY_CITATION_340","citationItems":[{"id":"ITEM-340","isTemporary":false,"itemData":{"DOI":"10.32604/cmc.2025.065572","author":[{"family":"Dağlarlı","given":"Evren"}],"container-title":"Computers, Materials &amp; Continua","id":"Daglarli2025","issue":"3","issued":{"date-parts":[[2025]]},"publisher":"Tech Science Press","title":"A generative neuro-cognitive architecture using quantum algorithms for the autonomous behavior of a smart agent in a simulation environment","type":"article-journal","volume":"84"},"suppress-author":false}],"isEdited":false,"manualOverride":{"citeprocText":"Dağlarlı (2025)","isManuallyOverridden":false,"manualOverrideText":""},"mendeley":{"formattedCitation":"Dağlarlı (2025)","plainTextFormattedCitation":"Dağlarlı (2025)","previouslyFormattedCitation":"Dağlarlı (2025)"},"properties":{"noteIndex":0},"schema":"https://github.com/citation-style-language/schema/raw/master/csl-citation.json"}</w:instrText>
       </w:r>
       <w:r>
         <w:fldChar w:fldCharType="separate"/>
@@ -14389,7 +14579,7 @@
         <w:fldChar w:fldCharType="begin"/>
       </w:r>
       <w:r>
-        <w:instrText xml:space="preserve">ADDIN CSL_CITATION {"citationID":"MENDELEY_CITATION_328","citationItems":[{"id":"ITEM-328","isTemporary":false,"itemData":{"DOI":"10.3390/e25091323","author":[{"family":"Lawless","given":"William F."},{"family":"Moskowitz","given":"Ira S."},{"family":"Doctor","given":"Katarina Z."}],"container-title":"Entropy","id":"Lawless2023","issue":"9","issued":{"date-parts":[[2023]]},"page":"1323","publisher":"MDPI","title":"A quantum-like model of interdependence for embodied human–machine teams: Reviewing the path to autonomy facing complexity and uncertainty","title-short":"A quantum-like model of interdependence for embodied human–machine teams","type":"article-journal","volume":"25"},"suppress-author":false}],"isEdited":false,"manualOverride":{"citeprocText":"Lawless, Moskowitz, and Doctor (2023)","isManuallyOverridden":false,"manualOverrideText":""},"mendeley":{"formattedCitation":"Lawless, Moskowitz, and Doctor (2023)","plainTextFormattedCitation":"Lawless, Moskowitz, and Doctor (2023)","previouslyFormattedCitation":"Lawless, Moskowitz, and Doctor (2023)"},"properties":{"noteIndex":0},"schema":"https://github.com/citation-style-language/schema/raw/master/csl-citation.json"}</w:instrText>
+        <w:instrText xml:space="preserve">ADDIN CSL_CITATION {"citationID":"MENDELEY_CITATION_341","citationItems":[{"id":"ITEM-341","isTemporary":false,"itemData":{"DOI":"10.3390/e25091323","author":[{"family":"Lawless","given":"William F."},{"family":"Moskowitz","given":"Ira S."},{"family":"Doctor","given":"Katarina Z."}],"container-title":"Entropy","id":"Lawless2023","issue":"9","issued":{"date-parts":[[2023]]},"page":"1323","publisher":"MDPI","title":"A quantum-like model of interdependence for embodied human–machine teams: Reviewing the path to autonomy facing complexity and uncertainty","title-short":"A quantum-like model of interdependence for embodied human–machine teams","type":"article-journal","volume":"25"},"suppress-author":false}],"isEdited":false,"manualOverride":{"citeprocText":"Lawless, Moskowitz, and Doctor (2023)","isManuallyOverridden":false,"manualOverrideText":""},"mendeley":{"formattedCitation":"Lawless, Moskowitz, and Doctor (2023)","plainTextFormattedCitation":"Lawless, Moskowitz, and Doctor (2023)","previouslyFormattedCitation":"Lawless, Moskowitz, and Doctor (2023)"},"properties":{"noteIndex":0},"schema":"https://github.com/citation-style-language/schema/raw/master/csl-citation.json"}</w:instrText>
       </w:r>
       <w:r>
         <w:fldChar w:fldCharType="separate"/>
@@ -14413,7 +14603,7 @@
         <w:fldChar w:fldCharType="begin"/>
       </w:r>
       <w:r>
-        <w:instrText xml:space="preserve">ADDIN CSL_CITATION {"citationID":"MENDELEY_CITATION_329","citationItems":[{"id":"ITEM-329","isTemporary":false,"itemData":{"DOI":"10.3390/e27020152","author":[{"family":"Humr","given":"Scott"},{"family":"Canan","given":"Mustafa"},{"family":"Demir","given":"Mustafa"}],"container-title":"Entropy","id":"Humr2025","issue":"2","issued":{"date-parts":[[2025]]},"page":"152","publisher":"MDPI","title":"A quantum probability approach to improving human–AI decision making","type":"article-journal","volume":"27"},"suppress-author":false}],"isEdited":false,"manualOverride":{"citeprocText":"Humr, Canan, and Demir (2025)","isManuallyOverridden":false,"manualOverrideText":""},"mendeley":{"formattedCitation":"Humr, Canan, and Demir (2025)","plainTextFormattedCitation":"Humr, Canan, and Demir (2025)","previouslyFormattedCitation":"Humr, Canan, and Demir (2025)"},"properties":{"noteIndex":0},"schema":"https://github.com/citation-style-language/schema/raw/master/csl-citation.json"}</w:instrText>
+        <w:instrText xml:space="preserve">ADDIN CSL_CITATION {"citationID":"MENDELEY_CITATION_342","citationItems":[{"id":"ITEM-342","isTemporary":false,"itemData":{"DOI":"10.3390/e27020152","author":[{"family":"Humr","given":"Scott"},{"family":"Canan","given":"Mustafa"},{"family":"Demir","given":"Mustafa"}],"container-title":"Entropy","id":"Humr2025","issue":"2","issued":{"date-parts":[[2025]]},"page":"152","publisher":"MDPI","title":"A quantum probability approach to improving human–AI decision making","type":"article-journal","volume":"27"},"suppress-author":false}],"isEdited":false,"manualOverride":{"citeprocText":"Humr, Canan, and Demir (2025)","isManuallyOverridden":false,"manualOverrideText":""},"mendeley":{"formattedCitation":"Humr, Canan, and Demir (2025)","plainTextFormattedCitation":"Humr, Canan, and Demir (2025)","previouslyFormattedCitation":"Humr, Canan, and Demir (2025)"},"properties":{"noteIndex":0},"schema":"https://github.com/citation-style-language/schema/raw/master/csl-citation.json"}</w:instrText>
       </w:r>
       <w:r>
         <w:fldChar w:fldCharType="separate"/>
@@ -14455,7 +14645,7 @@
         <w:fldChar w:fldCharType="begin"/>
       </w:r>
       <w:r>
-        <w:instrText xml:space="preserve">ADDIN CSL_CITATION {"citationID":"MENDELEY_CITATION_330","citationItems":[{"id":"ITEM-330","isTemporary":false,"itemData":{"URL":"https://arxiv.org/abs/2602.03571","author":[{"family":"Essalmi","given":"Karim"},{"family":"Garrido","given":"Fernando"},{"family":"Nashashibi","given":"Fawzi"}],"id":"Essalmi2026","issued":{"date-parts":[[2026]]},"title":"Multi-player, multi-strategy quantum game model for interaction-aware decision-making in automated driving","type":""},"suppress-author":false}],"isEdited":false,"manualOverride":{"citeprocText":"Essalmi, Garrido, and Nashashibi (2026)","isManuallyOverridden":false,"manualOverrideText":""},"mendeley":{"formattedCitation":"Essalmi, Garrido, and Nashashibi (2026)","plainTextFormattedCitation":"Essalmi, Garrido, and Nashashibi (2026)","previouslyFormattedCitation":"Essalmi, Garrido, and Nashashibi (2026)"},"properties":{"noteIndex":0},"schema":"https://github.com/citation-style-language/schema/raw/master/csl-citation.json"}</w:instrText>
+        <w:instrText xml:space="preserve">ADDIN CSL_CITATION {"citationID":"MENDELEY_CITATION_343","citationItems":[{"id":"ITEM-343","isTemporary":false,"itemData":{"URL":"https://arxiv.org/abs/2602.03571","author":[{"family":"Essalmi","given":"Karim"},{"family":"Garrido","given":"Fernando"},{"family":"Nashashibi","given":"Fawzi"}],"id":"Essalmi2026","issued":{"date-parts":[[2026]]},"title":"Multi-player, multi-strategy quantum game model for interaction-aware decision-making in automated driving","type":""},"suppress-author":false}],"isEdited":false,"manualOverride":{"citeprocText":"Essalmi, Garrido, and Nashashibi (2026)","isManuallyOverridden":false,"manualOverrideText":""},"mendeley":{"formattedCitation":"Essalmi, Garrido, and Nashashibi (2026)","plainTextFormattedCitation":"Essalmi, Garrido, and Nashashibi (2026)","previouslyFormattedCitation":"Essalmi, Garrido, and Nashashibi (2026)"},"properties":{"noteIndex":0},"schema":"https://github.com/citation-style-language/schema/raw/master/csl-citation.json"}</w:instrText>
       </w:r>
       <w:r>
         <w:fldChar w:fldCharType="separate"/>
@@ -14499,7 +14689,7 @@
         <w:fldChar w:fldCharType="begin"/>
       </w:r>
       <w:r>
-        <w:instrText xml:space="preserve">ADDIN CSL_CITATION {"citationID":"MENDELEY_CITATION_331","citationItems":[{"id":"ITEM-331","isTemporary":false,"itemData":{"DOI":"10.1146/annurev-psych-033020-123501","author":[{"family":"Pothos","given":"Emmanuel M."},{"family":"Busemeyer","given":"Jerome R."}],"container-title":"Annual Review of Psychology","id":"Pothos2022","issue":"1","issued":{"date-parts":[[2022]]},"page":"749-778","publisher":"Annual Reviews","title":"Quantum cognition","type":"article-journal","volume":"73"}}],"isEdited":false,"manualOverride":{"citeprocText":"(Pothos and Busemeyer 2022)","isManuallyOverridden":false,"manualOverrideText":""},"mendeley":{"formattedCitation":"(Pothos and Busemeyer 2022)","plainTextFormattedCitation":"(Pothos and Busemeyer 2022)","previouslyFormattedCitation":"(Pothos and Busemeyer 2022)"},"properties":{"noteIndex":0},"schema":"https://github.com/citation-style-language/schema/raw/master/csl-citation.json"}</w:instrText>
+        <w:instrText xml:space="preserve">ADDIN CSL_CITATION {"citationID":"MENDELEY_CITATION_344","citationItems":[{"id":"ITEM-344","isTemporary":false,"itemData":{"DOI":"10.1146/annurev-psych-033020-123501","author":[{"family":"Pothos","given":"Emmanuel M."},{"family":"Busemeyer","given":"Jerome R."}],"container-title":"Annual Review of Psychology","id":"Pothos2022","issue":"1","issued":{"date-parts":[[2022]]},"page":"749-778","publisher":"Annual Reviews","title":"Quantum cognition","type":"article-journal","volume":"73"}}],"isEdited":false,"manualOverride":{"citeprocText":"(Pothos and Busemeyer 2022)","isManuallyOverridden":false,"manualOverrideText":""},"mendeley":{"formattedCitation":"(Pothos and Busemeyer 2022)","plainTextFormattedCitation":"(Pothos and Busemeyer 2022)","previouslyFormattedCitation":"(Pothos and Busemeyer 2022)"},"properties":{"noteIndex":0},"schema":"https://github.com/citation-style-language/schema/raw/master/csl-citation.json"}</w:instrText>
       </w:r>
       <w:r>
         <w:fldChar w:fldCharType="separate"/>
@@ -14517,7 +14707,7 @@
         <w:fldChar w:fldCharType="begin"/>
       </w:r>
       <w:r>
-        <w:instrText xml:space="preserve">ADDIN CSL_CITATION {"citationID":"MENDELEY_CITATION_332","citationItems":[{"id":"ITEM-332","isTemporary":false,"itemData":{"DOI":"10.3390/e25040548","author":[{"family":"Widdows","given":"Dominic"},{"family":"Rani","given":"Jyoti"},{"family":"Pothos","given":"Emmanuel M."}],"container-title":"Entropy","id":"Widdows2023","issue":"4","issued":{"date-parts":[[2023]]},"page":"548","publisher":"MDPI","title":"Quantum circuit components for cognitive decision-making","type":"article-journal","volume":"25"}}],"isEdited":false,"manualOverride":{"citeprocText":"(Widdows, Rani, and Pothos 2023)","isManuallyOverridden":false,"manualOverrideText":""},"mendeley":{"formattedCitation":"(Widdows, Rani, and Pothos 2023)","plainTextFormattedCitation":"(Widdows, Rani, and Pothos 2023)","previouslyFormattedCitation":"(Widdows, Rani, and Pothos 2023)"},"properties":{"noteIndex":0},"schema":"https://github.com/citation-style-language/schema/raw/master/csl-citation.json"}</w:instrText>
+        <w:instrText xml:space="preserve">ADDIN CSL_CITATION {"citationID":"MENDELEY_CITATION_345","citationItems":[{"id":"ITEM-345","isTemporary":false,"itemData":{"DOI":"10.3390/e25040548","author":[{"family":"Widdows","given":"Dominic"},{"family":"Rani","given":"Jyoti"},{"family":"Pothos","given":"Emmanuel M."}],"container-title":"Entropy","id":"Widdows2023","issue":"4","issued":{"date-parts":[[2023]]},"page":"548","publisher":"MDPI","title":"Quantum circuit components for cognitive decision-making","type":"article-journal","volume":"25"}}],"isEdited":false,"manualOverride":{"citeprocText":"(Widdows, Rani, and Pothos 2023)","isManuallyOverridden":false,"manualOverrideText":""},"mendeley":{"formattedCitation":"(Widdows, Rani, and Pothos 2023)","plainTextFormattedCitation":"(Widdows, Rani, and Pothos 2023)","previouslyFormattedCitation":"(Widdows, Rani, and Pothos 2023)"},"properties":{"noteIndex":0},"schema":"https://github.com/citation-style-language/schema/raw/master/csl-citation.json"}</w:instrText>
       </w:r>
       <w:r>
         <w:fldChar w:fldCharType="separate"/>
@@ -14535,7 +14725,7 @@
         <w:fldChar w:fldCharType="begin"/>
       </w:r>
       <w:r>
-        <w:instrText xml:space="preserve">ADDIN CSL_CITATION {"citationID":"MENDELEY_CITATION_333","citationItems":[{"id":"ITEM-333","isTemporary":false,"itemData":{"DOI":"10.3390/electronics10020100","author":[{"family":"Yan","given":"Fei"},{"family":"Iliyasu","given":"Abdullah M."},{"family":"Hirota","given":"Kaoru"}],"container-title":"Electronics","id":"Yan2021","issue":"2","issued":{"date-parts":[[2021]]},"page":"100","publisher":"MDPI","title":"Conceptual framework for quantum affective computing and its use in fusion of multi-robot emotions","type":"article-journal","volume":"10"}}],"isEdited":false,"manualOverride":{"citeprocText":"(Yan, Iliyasu, and Hirota 2021)","isManuallyOverridden":false,"manualOverrideText":""},"mendeley":{"formattedCitation":"(Yan, Iliyasu, and Hirota 2021)","plainTextFormattedCitation":"(Yan, Iliyasu, and Hirota 2021)","previouslyFormattedCitation":"(Yan, Iliyasu, and Hirota 2021)"},"properties":{"noteIndex":0},"schema":"https://github.com/citation-style-language/schema/raw/master/csl-citation.json"}</w:instrText>
+        <w:instrText xml:space="preserve">ADDIN CSL_CITATION {"citationID":"MENDELEY_CITATION_346","citationItems":[{"id":"ITEM-346","isTemporary":false,"itemData":{"DOI":"10.3390/electronics10020100","author":[{"family":"Yan","given":"Fei"},{"family":"Iliyasu","given":"Abdullah M."},{"family":"Hirota","given":"Kaoru"}],"container-title":"Electronics","id":"Yan2021","issue":"2","issued":{"date-parts":[[2021]]},"page":"100","publisher":"MDPI","title":"Conceptual framework for quantum affective computing and its use in fusion of multi-robot emotions","type":"article-journal","volume":"10"}}],"isEdited":false,"manualOverride":{"citeprocText":"(Yan, Iliyasu, and Hirota 2021)","isManuallyOverridden":false,"manualOverrideText":""},"mendeley":{"formattedCitation":"(Yan, Iliyasu, and Hirota 2021)","plainTextFormattedCitation":"(Yan, Iliyasu, and Hirota 2021)","previouslyFormattedCitation":"(Yan, Iliyasu, and Hirota 2021)"},"properties":{"noteIndex":0},"schema":"https://github.com/citation-style-language/schema/raw/master/csl-citation.json"}</w:instrText>
       </w:r>
       <w:r>
         <w:fldChar w:fldCharType="separate"/>
@@ -14553,7 +14743,7 @@
         <w:fldChar w:fldCharType="begin"/>
       </w:r>
       <w:r>
-        <w:instrText xml:space="preserve">ADDIN CSL_CITATION {"citationID":"MENDELEY_CITATION_334","citationItems":[{"id":"ITEM-334","isTemporary":false,"itemData":{"DOI":"10.32604/cmc.2025.065572","author":[{"family":"Dağlarlı","given":"Evren"}],"container-title":"Computers, Materials &amp; Continua","id":"Daglarli2025","issue":"3","issued":{"date-parts":[[2025]]},"publisher":"Tech Science Press","title":"A generative neuro-cognitive architecture using quantum algorithms for the autonomous behavior of a smart agent in a simulation environment","type":"article-journal","volume":"84"}}],"isEdited":false,"manualOverride":{"citeprocText":"(Dağlarlı 2025)","isManuallyOverridden":false,"manualOverrideText":""},"mendeley":{"formattedCitation":"(Dağlarlı 2025)","plainTextFormattedCitation":"(Dağlarlı 2025)","previouslyFormattedCitation":"(Dağlarlı 2025)"},"properties":{"noteIndex":0},"schema":"https://github.com/citation-style-language/schema/raw/master/csl-citation.json"}</w:instrText>
+        <w:instrText xml:space="preserve">ADDIN CSL_CITATION {"citationID":"MENDELEY_CITATION_347","citationItems":[{"id":"ITEM-347","isTemporary":false,"itemData":{"DOI":"10.32604/cmc.2025.065572","author":[{"family":"Dağlarlı","given":"Evren"}],"container-title":"Computers, Materials &amp; Continua","id":"Daglarli2025","issue":"3","issued":{"date-parts":[[2025]]},"publisher":"Tech Science Press","title":"A generative neuro-cognitive architecture using quantum algorithms for the autonomous behavior of a smart agent in a simulation environment","type":"article-journal","volume":"84"}}],"isEdited":false,"manualOverride":{"citeprocText":"(Dağlarlı 2025)","isManuallyOverridden":false,"manualOverrideText":""},"mendeley":{"formattedCitation":"(Dağlarlı 2025)","plainTextFormattedCitation":"(Dağlarlı 2025)","previouslyFormattedCitation":"(Dağlarlı 2025)"},"properties":{"noteIndex":0},"schema":"https://github.com/citation-style-language/schema/raw/master/csl-citation.json"}</w:instrText>
       </w:r>
       <w:r>
         <w:fldChar w:fldCharType="separate"/>
@@ -14571,7 +14761,7 @@
         <w:fldChar w:fldCharType="begin"/>
       </w:r>
       <w:r>
-        <w:instrText xml:space="preserve">ADDIN CSL_CITATION {"citationID":"MENDELEY_CITATION_335","citationItems":[{"id":"ITEM-335","isTemporary":false,"itemData":{"URL":"https://arxiv.org/abs/2602.03571","author":[{"family":"Essalmi","given":"Karim"},{"family":"Garrido","given":"Fernando"},{"family":"Nashashibi","given":"Fawzi"}],"id":"Essalmi2026","issued":{"date-parts":[[2026]]},"title":"Multi-player, multi-strategy quantum game model for interaction-aware decision-making in automated driving","type":""}}],"isEdited":false,"manualOverride":{"citeprocText":"(Essalmi, Garrido, and Nashashibi 2026)","isManuallyOverridden":false,"manualOverrideText":""},"mendeley":{"formattedCitation":"(Essalmi, Garrido, and Nashashibi 2026)","plainTextFormattedCitation":"(Essalmi, Garrido, and Nashashibi 2026)","previouslyFormattedCitation":"(Essalmi, Garrido, and Nashashibi 2026)"},"properties":{"noteIndex":0},"schema":"https://github.com/citation-style-language/schema/raw/master/csl-citation.json"}</w:instrText>
+        <w:instrText xml:space="preserve">ADDIN CSL_CITATION {"citationID":"MENDELEY_CITATION_348","citationItems":[{"id":"ITEM-348","isTemporary":false,"itemData":{"URL":"https://arxiv.org/abs/2602.03571","author":[{"family":"Essalmi","given":"Karim"},{"family":"Garrido","given":"Fernando"},{"family":"Nashashibi","given":"Fawzi"}],"id":"Essalmi2026","issued":{"date-parts":[[2026]]},"title":"Multi-player, multi-strategy quantum game model for interaction-aware decision-making in automated driving","type":""}}],"isEdited":false,"manualOverride":{"citeprocText":"(Essalmi, Garrido, and Nashashibi 2026)","isManuallyOverridden":false,"manualOverrideText":""},"mendeley":{"formattedCitation":"(Essalmi, Garrido, and Nashashibi 2026)","plainTextFormattedCitation":"(Essalmi, Garrido, and Nashashibi 2026)","previouslyFormattedCitation":"(Essalmi, Garrido, and Nashashibi 2026)"},"properties":{"noteIndex":0},"schema":"https://github.com/citation-style-language/schema/raw/master/csl-citation.json"}</w:instrText>
       </w:r>
       <w:r>
         <w:fldChar w:fldCharType="separate"/>
@@ -14589,7 +14779,7 @@
         <w:fldChar w:fldCharType="begin"/>
       </w:r>
       <w:r>
-        <w:instrText xml:space="preserve">ADDIN CSL_CITATION {"citationID":"MENDELEY_CITATION_336","citationItems":[{"id":"ITEM-336","isTemporary":false,"itemData":{"DOI":"10.3390/e25091323","author":[{"family":"Lawless","given":"William F."},{"family":"Moskowitz","given":"Ira S."},{"family":"Doctor","given":"Katarina Z."}],"container-title":"Entropy","id":"Lawless2023","issue":"9","issued":{"date-parts":[[2023]]},"page":"1323","publisher":"MDPI","title":"A quantum-like model of interdependence for embodied human–machine teams: Reviewing the path to autonomy facing complexity and uncertainty","title-short":"A quantum-like model of interdependence for embodied human–machine teams","type":"article-journal","volume":"25"}}],"isEdited":false,"manualOverride":{"citeprocText":"(Lawless, Moskowitz, and Doctor 2023)","isManuallyOverridden":false,"manualOverrideText":""},"mendeley":{"formattedCitation":"(Lawless, Moskowitz, and Doctor 2023)","plainTextFormattedCitation":"(Lawless, Moskowitz, and Doctor 2023)","previouslyFormattedCitation":"(Lawless, Moskowitz, and Doctor 2023)"},"properties":{"noteIndex":0},"schema":"https://github.com/citation-style-language/schema/raw/master/csl-citation.json"}</w:instrText>
+        <w:instrText xml:space="preserve">ADDIN CSL_CITATION {"citationID":"MENDELEY_CITATION_349","citationItems":[{"id":"ITEM-349","isTemporary":false,"itemData":{"DOI":"10.3390/e25091323","author":[{"family":"Lawless","given":"William F."},{"family":"Moskowitz","given":"Ira S."},{"family":"Doctor","given":"Katarina Z."}],"container-title":"Entropy","id":"Lawless2023","issue":"9","issued":{"date-parts":[[2023]]},"page":"1323","publisher":"MDPI","title":"A quantum-like model of interdependence for embodied human–machine teams: Reviewing the path to autonomy facing complexity and uncertainty","title-short":"A quantum-like model of interdependence for embodied human–machine teams","type":"article-journal","volume":"25"}}],"isEdited":false,"manualOverride":{"citeprocText":"(Lawless, Moskowitz, and Doctor 2023)","isManuallyOverridden":false,"manualOverrideText":""},"mendeley":{"formattedCitation":"(Lawless, Moskowitz, and Doctor 2023)","plainTextFormattedCitation":"(Lawless, Moskowitz, and Doctor 2023)","previouslyFormattedCitation":"(Lawless, Moskowitz, and Doctor 2023)"},"properties":{"noteIndex":0},"schema":"https://github.com/citation-style-language/schema/raw/master/csl-citation.json"}</w:instrText>
       </w:r>
       <w:r>
         <w:fldChar w:fldCharType="separate"/>
@@ -14610,7 +14800,7 @@
         <w:fldChar w:fldCharType="begin"/>
       </w:r>
       <w:r>
-        <w:instrText xml:space="preserve">ADDIN CSL_CITATION {"citationID":"MENDELEY_CITATION_337","citationItems":[{"id":"ITEM-337","isTemporary":false,"itemData":{"DOI":"10.3390/e27020152","author":[{"family":"Humr","given":"Scott"},{"family":"Canan","given":"Mustafa"},{"family":"Demir","given":"Mustafa"}],"container-title":"Entropy","id":"Humr2025","issue":"2","issued":{"date-parts":[[2025]]},"page":"152","publisher":"MDPI","title":"A quantum probability approach to improving human–AI decision making","type":"article-journal","volume":"27"}}],"isEdited":false,"manualOverride":{"citeprocText":"(Humr, Canan, and Demir 2025)","isManuallyOverridden":false,"manualOverrideText":""},"mendeley":{"formattedCitation":"(Humr, Canan, and Demir 2025)","plainTextFormattedCitation":"(Humr, Canan, and Demir 2025)","previouslyFormattedCitation":"(Humr, Canan, and Demir 2025)"},"properties":{"noteIndex":0},"schema":"https://github.com/citation-style-language/schema/raw/master/csl-citation.json"}</w:instrText>
+        <w:instrText xml:space="preserve">ADDIN CSL_CITATION {"citationID":"MENDELEY_CITATION_350","citationItems":[{"id":"ITEM-350","isTemporary":false,"itemData":{"DOI":"10.3390/e27020152","author":[{"family":"Humr","given":"Scott"},{"family":"Canan","given":"Mustafa"},{"family":"Demir","given":"Mustafa"}],"container-title":"Entropy","id":"Humr2025","issue":"2","issued":{"date-parts":[[2025]]},"page":"152","publisher":"MDPI","title":"A quantum probability approach to improving human–AI decision making","type":"article-journal","volume":"27"}}],"isEdited":false,"manualOverride":{"citeprocText":"(Humr, Canan, and Demir 2025)","isManuallyOverridden":false,"manualOverrideText":""},"mendeley":{"formattedCitation":"(Humr, Canan, and Demir 2025)","plainTextFormattedCitation":"(Humr, Canan, and Demir 2025)","previouslyFormattedCitation":"(Humr, Canan, and Demir 2025)"},"properties":{"noteIndex":0},"schema":"https://github.com/citation-style-language/schema/raw/master/csl-citation.json"}</w:instrText>
       </w:r>
       <w:r>
         <w:fldChar w:fldCharType="separate"/>
@@ -14628,7 +14818,7 @@
         <w:fldChar w:fldCharType="begin"/>
       </w:r>
       <w:r>
-        <w:instrText xml:space="preserve">ADDIN CSL_CITATION {"citationID":"MENDELEY_CITATION_338","citationItems":[{"id":"ITEM-338","isTemporary":false,"itemData":{"DOI":"10.1145/3708319.3735545","author":[{"family":"De Carolis","given":"Berardina Nadja"},{"family":"Loglisci","given":"Corrado"},{"family":"Miccoli","given":"Maria Grazia"},{"family":"Palestra","given":"Giuseppe"},{"family":"Violante","given":"Sergio"}],"container-title":"Adjunct proceedings of the 33rd ACM conference on user modeling, adaptation and personalization (UMAP adjunct ’25)","id":"DeCarolis2025","issued":{"date-parts":[[2025]]},"page":"151-155","publisher":"Association for Computing Machinery","publisher-place":"New York, NY, USA","title":"Quantum-enhanced social robotics: The QUADRI project","title-short":"Quantum-enhanced social robotics","type":"paper-conference"}}],"isEdited":false,"manualOverride":{"citeprocText":"(De Carolis et al. 2025)","isManuallyOverridden":false,"manualOverrideText":""},"mendeley":{"formattedCitation":"(De Carolis et al. 2025)","plainTextFormattedCitation":"(De Carolis et al. 2025)","previouslyFormattedCitation":"(De Carolis et al. 2025)"},"properties":{"noteIndex":0},"schema":"https://github.com/citation-style-language/schema/raw/master/csl-citation.json"}</w:instrText>
+        <w:instrText xml:space="preserve">ADDIN CSL_CITATION {"citationID":"MENDELEY_CITATION_351","citationItems":[{"id":"ITEM-351","isTemporary":false,"itemData":{"DOI":"10.1145/3708319.3735545","author":[{"family":"De Carolis","given":"Berardina Nadja"},{"family":"Loglisci","given":"Corrado"},{"family":"Miccoli","given":"Maria Grazia"},{"family":"Palestra","given":"Giuseppe"},{"family":"Violante","given":"Sergio"}],"container-title":"Adjunct proceedings of the 33rd ACM conference on user modeling, adaptation and personalization (UMAP adjunct ’25)","id":"DeCarolis2025","issued":{"date-parts":[[2025]]},"page":"151-155","publisher":"Association for Computing Machinery","publisher-place":"New York, NY, USA","title":"Quantum-enhanced social robotics: The QUADRI project","title-short":"Quantum-enhanced social robotics","type":"paper-conference"}}],"isEdited":false,"manualOverride":{"citeprocText":"(De Carolis et al. 2025)","isManuallyOverridden":false,"manualOverrideText":""},"mendeley":{"formattedCitation":"(De Carolis et al. 2025)","plainTextFormattedCitation":"(De Carolis et al. 2025)","previouslyFormattedCitation":"(De Carolis et al. 2025)"},"properties":{"noteIndex":0},"schema":"https://github.com/citation-style-language/schema/raw/master/csl-citation.json"}</w:instrText>
       </w:r>
       <w:r>
         <w:fldChar w:fldCharType="separate"/>
@@ -14720,7 +14910,7 @@
         <w:fldChar w:fldCharType="begin"/>
       </w:r>
       <w:r>
-        <w:instrText xml:space="preserve">ADDIN CSL_CITATION {"citationID":"MENDELEY_CITATION_339","citationItems":[{"id":"ITEM-339","isTemporary":false,"itemData":{"DOI":"10.1109/TEVC.2002.804320","author":[{"family":"Han","given":"Kuk-Hyun"},{"family":"Kim","given":"Jong-Hwan"}],"container-title":"IEEE Transactions on Evolutionary Computation","id":"Han2002","issue":"6","issued":{"date-parts":[[2002]]},"page":"580-593","publisher":"IEEE","title":"Quantum-inspired evolutionary algorithm for a class of combinatorial optimization","type":"article-journal","volume":"6"}}],"isEdited":false,"manualOverride":{"citeprocText":"(Han and Kim 2002)","isManuallyOverridden":false,"manualOverrideText":""},"mendeley":{"formattedCitation":"(Han and Kim 2002)","plainTextFormattedCitation":"(Han and Kim 2002)","previouslyFormattedCitation":"(Han and Kim 2002)"},"properties":{"noteIndex":0},"schema":"https://github.com/citation-style-language/schema/raw/master/csl-citation.json"}</w:instrText>
+        <w:instrText xml:space="preserve">ADDIN CSL_CITATION {"citationID":"MENDELEY_CITATION_352","citationItems":[{"id":"ITEM-352","isTemporary":false,"itemData":{"DOI":"10.1109/TEVC.2002.804320","author":[{"family":"Han","given":"Kuk-Hyun"},{"family":"Kim","given":"Jong-Hwan"}],"container-title":"IEEE Transactions on Evolutionary Computation","id":"Han2002","issue":"6","issued":{"date-parts":[[2002]]},"page":"580-593","publisher":"IEEE","title":"Quantum-inspired evolutionary algorithm for a class of combinatorial optimization","type":"article-journal","volume":"6"}}],"isEdited":false,"manualOverride":{"citeprocText":"(Han and Kim 2002)","isManuallyOverridden":false,"manualOverrideText":""},"mendeley":{"formattedCitation":"(Han and Kim 2002)","plainTextFormattedCitation":"(Han and Kim 2002)","previouslyFormattedCitation":"(Han and Kim 2002)"},"properties":{"noteIndex":0},"schema":"https://github.com/citation-style-language/schema/raw/master/csl-citation.json"}</w:instrText>
       </w:r>
       <w:r>
         <w:fldChar w:fldCharType="separate"/>
@@ -14738,7 +14928,7 @@
         <w:fldChar w:fldCharType="begin"/>
       </w:r>
       <w:r>
-        <w:instrText xml:space="preserve">ADDIN CSL_CITATION {"citationID":"MENDELEY_CITATION_340","citationItems":[{"id":"ITEM-340","isTemporary":false,"itemData":{"DOI":"10.1109/TMECH.2010.2090896","author":[{"family":"Dong","given":"Daoyi"},{"family":"Chen","given":"Chunlin"},{"family":"Chu","given":"Jian"},{"family":"Tarn","given":"Tzyh-Jong"}],"container-title":"IEEE/ASME Transactions on Mechatronics","id":"Dong2012","issue":"1","issued":{"date-parts":[[2012]]},"page":"86-97","publisher":"IEEE","title":"Robust quantum-inspired reinforcement learning for robot navigation","type":"article-journal","volume":"17"}}],"isEdited":false,"manualOverride":{"citeprocText":"(Dong et al. 2012)","isManuallyOverridden":false,"manualOverrideText":""},"mendeley":{"formattedCitation":"(Dong et al. 2012)","plainTextFormattedCitation":"(Dong et al. 2012)","previouslyFormattedCitation":"(Dong et al. 2012)"},"properties":{"noteIndex":0},"schema":"https://github.com/citation-style-language/schema/raw/master/csl-citation.json"}</w:instrText>
+        <w:instrText xml:space="preserve">ADDIN CSL_CITATION {"citationID":"MENDELEY_CITATION_353","citationItems":[{"id":"ITEM-353","isTemporary":false,"itemData":{"DOI":"10.1109/TMECH.2010.2090896","author":[{"family":"Dong","given":"Daoyi"},{"family":"Chen","given":"Chunlin"},{"family":"Chu","given":"Jian"},{"family":"Tarn","given":"Tzyh-Jong"}],"container-title":"IEEE/ASME Transactions on Mechatronics","id":"Dong2012","issue":"1","issued":{"date-parts":[[2012]]},"page":"86-97","publisher":"IEEE","title":"Robust quantum-inspired reinforcement learning for robot navigation","type":"article-journal","volume":"17"}}],"isEdited":false,"manualOverride":{"citeprocText":"(Dong et al. 2012)","isManuallyOverridden":false,"manualOverrideText":""},"mendeley":{"formattedCitation":"(Dong et al. 2012)","plainTextFormattedCitation":"(Dong et al. 2012)","previouslyFormattedCitation":"(Dong et al. 2012)"},"properties":{"noteIndex":0},"schema":"https://github.com/citation-style-language/schema/raw/master/csl-citation.json"}</w:instrText>
       </w:r>
       <w:r>
         <w:fldChar w:fldCharType="separate"/>
@@ -14756,7 +14946,7 @@
         <w:fldChar w:fldCharType="begin"/>
       </w:r>
       <w:r>
-        <w:instrText xml:space="preserve">ADDIN CSL_CITATION {"citationID":"MENDELEY_CITATION_341","citationItems":[{"id":"ITEM-341","isTemporary":false,"itemData":{"DOI":"10.1126/sciadv.aav2372","author":[{"family":"Goto","given":"Hayato"},{"family":"Tatsumura","given":"Kosuke"},{"family":"Dixon","given":"Alexander R."}],"container-title":"Science Advances","id":"Goto2019","issue":"4","issued":{"date-parts":[[2019]]},"page":"eaav2372","publisher":"American Association for the Advancement of Science","title":"Combinatorial optimization by simulating adiabatic bifurcations in nonlinear Hamiltonian systems","type":"article-journal","volume":"5"}}],"isEdited":false,"manualOverride":{"citeprocText":"(Goto, Tatsumura, and Dixon 2019)","isManuallyOverridden":false,"manualOverrideText":""},"mendeley":{"formattedCitation":"(Goto, Tatsumura, and Dixon 2019)","plainTextFormattedCitation":"(Goto, Tatsumura, and Dixon 2019)","previouslyFormattedCitation":"(Goto, Tatsumura, and Dixon 2019)"},"properties":{"noteIndex":0},"schema":"https://github.com/citation-style-language/schema/raw/master/csl-citation.json"}</w:instrText>
+        <w:instrText xml:space="preserve">ADDIN CSL_CITATION {"citationID":"MENDELEY_CITATION_354","citationItems":[{"id":"ITEM-354","isTemporary":false,"itemData":{"DOI":"10.1126/sciadv.aav2372","author":[{"family":"Goto","given":"Hayato"},{"family":"Tatsumura","given":"Kosuke"},{"family":"Dixon","given":"Alexander R."}],"container-title":"Science Advances","id":"Goto2019","issue":"4","issued":{"date-parts":[[2019]]},"page":"eaav2372","publisher":"American Association for the Advancement of Science","title":"Combinatorial optimization by simulating adiabatic bifurcations in nonlinear Hamiltonian systems","type":"article-journal","volume":"5"}}],"isEdited":false,"manualOverride":{"citeprocText":"(Goto, Tatsumura, and Dixon 2019)","isManuallyOverridden":false,"manualOverrideText":""},"mendeley":{"formattedCitation":"(Goto, Tatsumura, and Dixon 2019)","plainTextFormattedCitation":"(Goto, Tatsumura, and Dixon 2019)","previouslyFormattedCitation":"(Goto, Tatsumura, and Dixon 2019)"},"properties":{"noteIndex":0},"schema":"https://github.com/citation-style-language/schema/raw/master/csl-citation.json"}</w:instrText>
       </w:r>
       <w:r>
         <w:fldChar w:fldCharType="separate"/>
@@ -14774,7 +14964,7 @@
         <w:fldChar w:fldCharType="begin"/>
       </w:r>
       <w:r>
-        <w:instrText xml:space="preserve">ADDIN CSL_CITATION {"citationID":"MENDELEY_CITATION_343","citationItems":[{"id":"ITEM-342","isTemporary":false,"itemData":{"DOI":"10.1145/3313276.3316310","author":[{"family":"Tang","given":"Ewin"}],"container-title":"Proceedings of the 51st annual ACM SIGACT symposium on theory of computing (STOC 2019)","id":"Tang2019","issued":{"date-parts":[[2019]]},"page":"217-228","publisher":"ACM","publisher-place":"New York, NY, USA","title":"A quantum-inspired classical algorithm for recommendation systems","type":"paper-conference"}},{"id":"ITEM-343","isTemporary":false,"itemData":{"DOI":"10.1145/3357713.3384314","author":[{"family":"Chia","given":"Nai-Hui"},{"family":"Gilyén","given":"András"},{"family":"Li","given":"Tongyang"},{"family":"Lin","given":"Han-Hsuan"},{"family":"Tang","given":"Ewin"},{"family":"Wang","given":"Chunhao"}],"container-title":"Proceedings of the 52nd annual ACM SIGACT symposium on theory of computing (STOC 2020)","id":"Chia2020","issued":{"date-parts":[[2020]]},"page":"387-400","publisher":"ACM","publisher-place":"New York, NY, USA","title":"Sampling-based sublinear low-rank matrix arithmetic framework for dequantizing quantum machine learning","type":"paper-conference"}}],"isEdited":false,"manualOverride":{"citeprocText":"(E. Tang 2019; Chia et al. 2020)","isManuallyOverridden":false,"manualOverrideText":""},"mendeley":{"formattedCitation":"(E. Tang 2019; Chia et al. 2020)","plainTextFormattedCitation":"(E. Tang 2019; Chia et al. 2020)","previouslyFormattedCitation":"(E. Tang 2019; Chia et al. 2020)"},"properties":{"noteIndex":0},"schema":"https://github.com/citation-style-language/schema/raw/master/csl-citation.json"}</w:instrText>
+        <w:instrText xml:space="preserve">ADDIN CSL_CITATION {"citationID":"MENDELEY_CITATION_356","citationItems":[{"id":"ITEM-355","isTemporary":false,"itemData":{"DOI":"10.1145/3313276.3316310","author":[{"family":"Tang","given":"Ewin"}],"container-title":"Proceedings of the 51st annual ACM SIGACT symposium on theory of computing (STOC 2019)","id":"Tang2019","issued":{"date-parts":[[2019]]},"page":"217-228","publisher":"ACM","publisher-place":"New York, NY, USA","title":"A quantum-inspired classical algorithm for recommendation systems","type":"paper-conference"}},{"id":"ITEM-356","isTemporary":false,"itemData":{"DOI":"10.1145/3357713.3384314","author":[{"family":"Chia","given":"Nai-Hui"},{"family":"Gilyén","given":"András"},{"family":"Li","given":"Tongyang"},{"family":"Lin","given":"Han-Hsuan"},{"family":"Tang","given":"Ewin"},{"family":"Wang","given":"Chunhao"}],"container-title":"Proceedings of the 52nd annual ACM SIGACT symposium on theory of computing (STOC 2020)","id":"Chia2020","issued":{"date-parts":[[2020]]},"page":"387-400","publisher":"ACM","publisher-place":"New York, NY, USA","title":"Sampling-based sublinear low-rank matrix arithmetic framework for dequantizing quantum machine learning","type":"paper-conference"}}],"isEdited":false,"manualOverride":{"citeprocText":"(E. Tang 2019; Chia et al. 2020)","isManuallyOverridden":false,"manualOverrideText":""},"mendeley":{"formattedCitation":"(E. Tang 2019; Chia et al. 2020)","plainTextFormattedCitation":"(E. Tang 2019; Chia et al. 2020)","previouslyFormattedCitation":"(E. Tang 2019; Chia et al. 2020)"},"properties":{"noteIndex":0},"schema":"https://github.com/citation-style-language/schema/raw/master/csl-citation.json"}</w:instrText>
       </w:r>
       <w:r>
         <w:fldChar w:fldCharType="separate"/>
@@ -14795,7 +14985,7 @@
         <w:fldChar w:fldCharType="begin"/>
       </w:r>
       <w:r>
-        <w:instrText xml:space="preserve">ADDIN CSL_CITATION {"citationID":"MENDELEY_CITATION_344","citationItems":[{"id":"ITEM-344","isTemporary":false,"itemData":{"DOI":"10.1155/2018/1596080","author":[{"family":"Zuo","given":"Tao"},{"family":"Min","given":"Huasong"},{"family":"Tang","given":"Quan"},{"family":"Tao","given":"Qiang"}],"container-title":"Mathematical Problems in Engineering","id":"Zuo2018","issued":{"date-parts":[[2018]]},"page":"1596080","publisher":"Hindawi","title":"A robot SLAM improved by quantum-behaved particles swarm optimization","type":"article-journal","volume":"2018"},"suppress-author":false}],"isEdited":false,"manualOverride":{"citeprocText":"Zuo et al. (2018)","isManuallyOverridden":false,"manualOverrideText":""},"mendeley":{"formattedCitation":"Zuo et al. (2018)","plainTextFormattedCitation":"Zuo et al. (2018)","previouslyFormattedCitation":"Zuo et al. (2018)"},"properties":{"noteIndex":0},"schema":"https://github.com/citation-style-language/schema/raw/master/csl-citation.json"}</w:instrText>
+        <w:instrText xml:space="preserve">ADDIN CSL_CITATION {"citationID":"MENDELEY_CITATION_357","citationItems":[{"id":"ITEM-357","isTemporary":false,"itemData":{"DOI":"10.1155/2018/1596080","author":[{"family":"Zuo","given":"Tao"},{"family":"Min","given":"Huasong"},{"family":"Tang","given":"Quan"},{"family":"Tao","given":"Qiang"}],"container-title":"Mathematical Problems in Engineering","id":"Zuo2018","issued":{"date-parts":[[2018]]},"page":"1596080","publisher":"Hindawi","title":"A robot SLAM improved by quantum-behaved particles swarm optimization","type":"article-journal","volume":"2018"},"suppress-author":false}],"isEdited":false,"manualOverride":{"citeprocText":"Zuo et al. (2018)","isManuallyOverridden":false,"manualOverrideText":""},"mendeley":{"formattedCitation":"Zuo et al. (2018)","plainTextFormattedCitation":"Zuo et al. (2018)","previouslyFormattedCitation":"Zuo et al. (2018)"},"properties":{"noteIndex":0},"schema":"https://github.com/citation-style-language/schema/raw/master/csl-citation.json"}</w:instrText>
       </w:r>
       <w:r>
         <w:fldChar w:fldCharType="separate"/>
@@ -14819,7 +15009,7 @@
         <w:fldChar w:fldCharType="begin"/>
       </w:r>
       <w:r>
-        <w:instrText xml:space="preserve">ADDIN CSL_CITATION {"citationID":"MENDELEY_CITATION_345","citationItems":[{"id":"ITEM-345","isTemporary":false,"itemData":{"DOI":"10.1016/j.robot.2025.105123","author":[{"family":"Fazilat","given":"Mehdi"},{"family":"Zioui","given":"Nadjet"}],"container-title":"Robotics and Autonomous Systems","id":"Fazilat2025b","issued":{"date-parts":[[2025]]},"page":"105123","publisher":"Elsevier","title":"Quantum neural network-based inverse kinematics of a six-jointed industrial robotic arm","type":"article-journal","volume":"194"},"suppress-author":false}],"isEdited":false,"manualOverride":{"citeprocText":"Fazilat and Zioui (2025b)","isManuallyOverridden":false,"manualOverrideText":""},"mendeley":{"formattedCitation":"Fazilat and Zioui (2025b)","plainTextFormattedCitation":"Fazilat and Zioui (2025b)","previouslyFormattedCitation":"Fazilat and Zioui (2025b)"},"properties":{"noteIndex":0},"schema":"https://github.com/citation-style-language/schema/raw/master/csl-citation.json"}</w:instrText>
+        <w:instrText xml:space="preserve">ADDIN CSL_CITATION {"citationID":"MENDELEY_CITATION_358","citationItems":[{"id":"ITEM-358","isTemporary":false,"itemData":{"DOI":"10.1016/j.robot.2025.105123","author":[{"family":"Fazilat","given":"Mehdi"},{"family":"Zioui","given":"Nadjet"}],"container-title":"Robotics and Autonomous Systems","id":"Fazilat2025b","issued":{"date-parts":[[2025]]},"page":"105123","publisher":"Elsevier","title":"Quantum neural network-based inverse kinematics of a six-jointed industrial robotic arm","type":"article-journal","volume":"194"},"suppress-author":false}],"isEdited":false,"manualOverride":{"citeprocText":"Fazilat and Zioui (2025b)","isManuallyOverridden":false,"manualOverrideText":""},"mendeley":{"formattedCitation":"Fazilat and Zioui (2025b)","plainTextFormattedCitation":"Fazilat and Zioui (2025b)","previouslyFormattedCitation":"Fazilat and Zioui (2025b)"},"properties":{"noteIndex":0},"schema":"https://github.com/citation-style-language/schema/raw/master/csl-citation.json"}</w:instrText>
       </w:r>
       <w:r>
         <w:fldChar w:fldCharType="separate"/>
@@ -14873,7 +15063,7 @@
         <w:fldChar w:fldCharType="begin"/>
       </w:r>
       <w:r>
-        <w:instrText xml:space="preserve">ADDIN CSL_CITATION {"citationID":"MENDELEY_CITATION_346","citationItems":[{"id":"ITEM-346","isTemporary":false,"itemData":{"author":[{"family":"Raghuvanshi","given":"Arushi"},{"family":"Fan","given":"Yale"},{"family":"Woyke","given":"Michal"},{"family":"Perkowski","given":"Marek"}],"container-title":"Proceedings of the 37th international symposium on multiple-valued logic (ISMVL’07)","id":"Raghuvanshi2007","issued":{"date-parts":[[2007]]},"publisher":"IEEE","title":"Quantum robots for teenagers","type":"paper-conference"}}],"isEdited":false,"manualOverride":{"citeprocText":"(Raghuvanshi et al. 2007)","isManuallyOverridden":false,"manualOverrideText":""},"mendeley":{"formattedCitation":"(Raghuvanshi et al. 2007)","plainTextFormattedCitation":"(Raghuvanshi et al. 2007)","previouslyFormattedCitation":"(Raghuvanshi et al. 2007)"},"properties":{"noteIndex":0},"schema":"https://github.com/citation-style-language/schema/raw/master/csl-citation.json"}</w:instrText>
+        <w:instrText xml:space="preserve">ADDIN CSL_CITATION {"citationID":"MENDELEY_CITATION_359","citationItems":[{"id":"ITEM-359","isTemporary":false,"itemData":{"author":[{"family":"Raghuvanshi","given":"Arushi"},{"family":"Fan","given":"Yale"},{"family":"Woyke","given":"Michal"},{"family":"Perkowski","given":"Marek"}],"container-title":"Proceedings of the 37th international symposium on multiple-valued logic (ISMVL’07)","id":"Raghuvanshi2007","issued":{"date-parts":[[2007]]},"publisher":"IEEE","title":"Quantum robots for teenagers","type":"paper-conference"}}],"isEdited":false,"manualOverride":{"citeprocText":"(Raghuvanshi et al. 2007)","isManuallyOverridden":false,"manualOverrideText":""},"mendeley":{"formattedCitation":"(Raghuvanshi et al. 2007)","plainTextFormattedCitation":"(Raghuvanshi et al. 2007)","previouslyFormattedCitation":"(Raghuvanshi et al. 2007)"},"properties":{"noteIndex":0},"schema":"https://github.com/citation-style-language/schema/raw/master/csl-citation.json"}</w:instrText>
       </w:r>
       <w:r>
         <w:fldChar w:fldCharType="separate"/>
@@ -14899,7 +15089,7 @@
         <w:fldChar w:fldCharType="begin"/>
       </w:r>
       <w:r>
-        <w:instrText xml:space="preserve">ADDIN CSL_CITATION {"citationID":"MENDELEY_CITATION_349","citationItems":[{"id":"ITEM-347","isTemporary":false,"itemData":{"DOI":"10.1109/TMECH.2010.2090896","author":[{"family":"Dong","given":"Daoyi"},{"family":"Chen","given":"Chunlin"},{"family":"Chu","given":"Jian"},{"family":"Tarn","given":"Tzyh-Jong"}],"container-title":"IEEE/ASME Transactions on Mechatronics","id":"Dong2012","issue":"1","issued":{"date-parts":[[2012]]},"page":"86-97","publisher":"IEEE","title":"Robust quantum-inspired reinforcement learning for robot navigation","type":"article-journal","volume":"17"}},{"id":"ITEM-348","isTemporary":false,"itemData":{"DOI":"10.1155/2018/1596080","author":[{"family":"Zuo","given":"Tao"},{"family":"Min","given":"Huasong"},{"family":"Tang","given":"Quan"},{"family":"Tao","given":"Qiang"}],"container-title":"Mathematical Problems in Engineering","id":"Zuo2018","issued":{"date-parts":[[2018]]},"page":"1596080","publisher":"Hindawi","title":"A robot SLAM improved by quantum-behaved particles swarm optimization","type":"article-journal","volume":"2018"}},{"id":"ITEM-349","isTemporary":false,"itemData":{"DOI":"10.1016/j.robot.2025.105123","author":[{"family":"Fazilat","given":"Mehdi"},{"family":"Zioui","given":"Nadjet"}],"container-title":"Robotics and Autonomous Systems","id":"Fazilat2025b","issued":{"date-parts":[[2025]]},"page":"105123","publisher":"Elsevier","title":"Quantum neural network-based inverse kinematics of a six-jointed industrial robotic arm","type":"article-journal","volume":"194"}}],"isEdited":false,"manualOverride":{"citeprocText":"(Dong et al. 2012; Zuo et al. 2018; Fazilat and Zioui 2025b)","isManuallyOverridden":false,"manualOverrideText":""},"mendeley":{"formattedCitation":"(Dong et al. 2012; Zuo et al. 2018; Fazilat and Zioui 2025b)","plainTextFormattedCitation":"(Dong et al. 2012; Zuo et al. 2018; Fazilat and Zioui 2025b)","previouslyFormattedCitation":"(Dong et al. 2012; Zuo et al. 2018; Fazilat and Zioui 2025b)"},"properties":{"noteIndex":0},"schema":"https://github.com/citation-style-language/schema/raw/master/csl-citation.json"}</w:instrText>
+        <w:instrText xml:space="preserve">ADDIN CSL_CITATION {"citationID":"MENDELEY_CITATION_362","citationItems":[{"id":"ITEM-360","isTemporary":false,"itemData":{"DOI":"10.1109/TMECH.2010.2090896","author":[{"family":"Dong","given":"Daoyi"},{"family":"Chen","given":"Chunlin"},{"family":"Chu","given":"Jian"},{"family":"Tarn","given":"Tzyh-Jong"}],"container-title":"IEEE/ASME Transactions on Mechatronics","id":"Dong2012","issue":"1","issued":{"date-parts":[[2012]]},"page":"86-97","publisher":"IEEE","title":"Robust quantum-inspired reinforcement learning for robot navigation","type":"article-journal","volume":"17"}},{"id":"ITEM-361","isTemporary":false,"itemData":{"DOI":"10.1155/2018/1596080","author":[{"family":"Zuo","given":"Tao"},{"family":"Min","given":"Huasong"},{"family":"Tang","given":"Quan"},{"family":"Tao","given":"Qiang"}],"container-title":"Mathematical Problems in Engineering","id":"Zuo2018","issued":{"date-parts":[[2018]]},"page":"1596080","publisher":"Hindawi","title":"A robot SLAM improved by quantum-behaved particles swarm optimization","type":"article-journal","volume":"2018"}},{"id":"ITEM-362","isTemporary":false,"itemData":{"DOI":"10.1016/j.robot.2025.105123","author":[{"family":"Fazilat","given":"Mehdi"},{"family":"Zioui","given":"Nadjet"}],"container-title":"Robotics and Autonomous Systems","id":"Fazilat2025b","issued":{"date-parts":[[2025]]},"page":"105123","publisher":"Elsevier","title":"Quantum neural network-based inverse kinematics of a six-jointed industrial robotic arm","type":"article-journal","volume":"194"}}],"isEdited":false,"manualOverride":{"citeprocText":"(Dong et al. 2012; Zuo et al. 2018; Fazilat and Zioui 2025b)","isManuallyOverridden":false,"manualOverrideText":""},"mendeley":{"formattedCitation":"(Dong et al. 2012; Zuo et al. 2018; Fazilat and Zioui 2025b)","plainTextFormattedCitation":"(Dong et al. 2012; Zuo et al. 2018; Fazilat and Zioui 2025b)","previouslyFormattedCitation":"(Dong et al. 2012; Zuo et al. 2018; Fazilat and Zioui 2025b)"},"properties":{"noteIndex":0},"schema":"https://github.com/citation-style-language/schema/raw/master/csl-citation.json"}</w:instrText>
       </w:r>
       <w:r>
         <w:fldChar w:fldCharType="separate"/>
@@ -14917,7 +15107,7 @@
         <w:fldChar w:fldCharType="begin"/>
       </w:r>
       <w:r>
-        <w:instrText xml:space="preserve">ADDIN CSL_CITATION {"citationID":"MENDELEY_CITATION_350","citationItems":[{"id":"ITEM-350","isTemporary":false,"itemData":{"DOI":"10.1126/sciadv.aav2372","author":[{"family":"Goto","given":"Hayato"},{"family":"Tatsumura","given":"Kosuke"},{"family":"Dixon","given":"Alexander R."}],"container-title":"Science Advances","id":"Goto2019","issue":"4","issued":{"date-parts":[[2019]]},"page":"eaav2372","publisher":"American Association for the Advancement of Science","title":"Combinatorial optimization by simulating adiabatic bifurcations in nonlinear Hamiltonian systems","type":"article-journal","volume":"5"}}],"isEdited":false,"manualOverride":{"citeprocText":"(Goto, Tatsumura, and Dixon 2019)","isManuallyOverridden":false,"manualOverrideText":""},"mendeley":{"formattedCitation":"(Goto, Tatsumura, and Dixon 2019)","plainTextFormattedCitation":"(Goto, Tatsumura, and Dixon 2019)","previouslyFormattedCitation":"(Goto, Tatsumura, and Dixon 2019)"},"properties":{"noteIndex":0},"schema":"https://github.com/citation-style-language/schema/raw/master/csl-citation.json"}</w:instrText>
+        <w:instrText xml:space="preserve">ADDIN CSL_CITATION {"citationID":"MENDELEY_CITATION_363","citationItems":[{"id":"ITEM-363","isTemporary":false,"itemData":{"DOI":"10.1126/sciadv.aav2372","author":[{"family":"Goto","given":"Hayato"},{"family":"Tatsumura","given":"Kosuke"},{"family":"Dixon","given":"Alexander R."}],"container-title":"Science Advances","id":"Goto2019","issue":"4","issued":{"date-parts":[[2019]]},"page":"eaav2372","publisher":"American Association for the Advancement of Science","title":"Combinatorial optimization by simulating adiabatic bifurcations in nonlinear Hamiltonian systems","type":"article-journal","volume":"5"}}],"isEdited":false,"manualOverride":{"citeprocText":"(Goto, Tatsumura, and Dixon 2019)","isManuallyOverridden":false,"manualOverrideText":""},"mendeley":{"formattedCitation":"(Goto, Tatsumura, and Dixon 2019)","plainTextFormattedCitation":"(Goto, Tatsumura, and Dixon 2019)","previouslyFormattedCitation":"(Goto, Tatsumura, and Dixon 2019)"},"properties":{"noteIndex":0},"schema":"https://github.com/citation-style-language/schema/raw/master/csl-citation.json"}</w:instrText>
       </w:r>
       <w:r>
         <w:fldChar w:fldCharType="separate"/>
@@ -14935,7 +15125,7 @@
         <w:fldChar w:fldCharType="begin"/>
       </w:r>
       <w:r>
-        <w:instrText xml:space="preserve">ADDIN CSL_CITATION {"citationID":"MENDELEY_CITATION_352","citationItems":[{"id":"ITEM-351","isTemporary":false,"itemData":{"DOI":"10.1145/3313276.3316310","author":[{"family":"Tang","given":"Ewin"}],"container-title":"Proceedings of the 51st annual ACM SIGACT symposium on theory of computing (STOC 2019)","id":"Tang2019","issued":{"date-parts":[[2019]]},"page":"217-228","publisher":"ACM","publisher-place":"New York, NY, USA","title":"A quantum-inspired classical algorithm for recommendation systems","type":"paper-conference"}},{"id":"ITEM-352","isTemporary":false,"itemData":{"DOI":"10.1145/3357713.3384314","author":[{"family":"Chia","given":"Nai-Hui"},{"family":"Gilyén","given":"András"},{"family":"Li","given":"Tongyang"},{"family":"Lin","given":"Han-Hsuan"},{"family":"Tang","given":"Ewin"},{"family":"Wang","given":"Chunhao"}],"container-title":"Proceedings of the 52nd annual ACM SIGACT symposium on theory of computing (STOC 2020)","id":"Chia2020","issued":{"date-parts":[[2020]]},"page":"387-400","publisher":"ACM","publisher-place":"New York, NY, USA","title":"Sampling-based sublinear low-rank matrix arithmetic framework for dequantizing quantum machine learning","type":"paper-conference"}}],"isEdited":false,"manualOverride":{"citeprocText":"(E. Tang 2019; Chia et al. 2020)","isManuallyOverridden":false,"manualOverrideText":""},"mendeley":{"formattedCitation":"(E. Tang 2019; Chia et al. 2020)","plainTextFormattedCitation":"(E. Tang 2019; Chia et al. 2020)","previouslyFormattedCitation":"(E. Tang 2019; Chia et al. 2020)"},"properties":{"noteIndex":0},"schema":"https://github.com/citation-style-language/schema/raw/master/csl-citation.json"}</w:instrText>
+        <w:instrText xml:space="preserve">ADDIN CSL_CITATION {"citationID":"MENDELEY_CITATION_365","citationItems":[{"id":"ITEM-364","isTemporary":false,"itemData":{"DOI":"10.1145/3313276.3316310","author":[{"family":"Tang","given":"Ewin"}],"container-title":"Proceedings of the 51st annual ACM SIGACT symposium on theory of computing (STOC 2019)","id":"Tang2019","issued":{"date-parts":[[2019]]},"page":"217-228","publisher":"ACM","publisher-place":"New York, NY, USA","title":"A quantum-inspired classical algorithm for recommendation systems","type":"paper-conference"}},{"id":"ITEM-365","isTemporary":false,"itemData":{"DOI":"10.1145/3357713.3384314","author":[{"family":"Chia","given":"Nai-Hui"},{"family":"Gilyén","given":"András"},{"family":"Li","given":"Tongyang"},{"family":"Lin","given":"Han-Hsuan"},{"family":"Tang","given":"Ewin"},{"family":"Wang","given":"Chunhao"}],"container-title":"Proceedings of the 52nd annual ACM SIGACT symposium on theory of computing (STOC 2020)","id":"Chia2020","issued":{"date-parts":[[2020]]},"page":"387-400","publisher":"ACM","publisher-place":"New York, NY, USA","title":"Sampling-based sublinear low-rank matrix arithmetic framework for dequantizing quantum machine learning","type":"paper-conference"}}],"isEdited":false,"manualOverride":{"citeprocText":"(E. Tang 2019; Chia et al. 2020)","isManuallyOverridden":false,"manualOverrideText":""},"mendeley":{"formattedCitation":"(E. Tang 2019; Chia et al. 2020)","plainTextFormattedCitation":"(E. Tang 2019; Chia et al. 2020)","previouslyFormattedCitation":"(E. Tang 2019; Chia et al. 2020)"},"properties":{"noteIndex":0},"schema":"https://github.com/citation-style-language/schema/raw/master/csl-citation.json"}</w:instrText>
       </w:r>
       <w:r>
         <w:fldChar w:fldCharType="separate"/>
@@ -14974,7 +15164,7 @@
         <w:fldChar w:fldCharType="begin"/>
       </w:r>
       <w:r>
-        <w:instrText xml:space="preserve">ADDIN CSL_CITATION {"citationID":"MENDELEY_CITATION_353","citationItems":[{"id":"ITEM-353","isTemporary":false,"itemData":{"DOI":"10.1038/nphys3272","author":[{"family":"Aaronson","given":"Scott"}],"container-title":"Nature Physics","id":"Aaronson2015","issue":"4","issued":{"date-parts":[[2015]]},"page":"291-293","title":"Read the fine print","type":"article-journal","volume":"11"}}],"isEdited":false,"manualOverride":{"citeprocText":"(Aaronson 2015)","isManuallyOverridden":false,"manualOverrideText":""},"mendeley":{"formattedCitation":"(Aaronson 2015)","plainTextFormattedCitation":"(Aaronson 2015)","previouslyFormattedCitation":"(Aaronson 2015)"},"properties":{"noteIndex":0},"schema":"https://github.com/citation-style-language/schema/raw/master/csl-citation.json"}</w:instrText>
+        <w:instrText xml:space="preserve">ADDIN CSL_CITATION {"citationID":"MENDELEY_CITATION_366","citationItems":[{"id":"ITEM-366","isTemporary":false,"itemData":{"DOI":"10.1038/nphys3272","author":[{"family":"Aaronson","given":"Scott"}],"container-title":"Nature Physics","id":"Aaronson2015","issue":"4","issued":{"date-parts":[[2015]]},"page":"291-293","title":"Read the fine print","type":"article-journal","volume":"11"}}],"isEdited":false,"manualOverride":{"citeprocText":"(Aaronson 2015)","isManuallyOverridden":false,"manualOverrideText":""},"mendeley":{"formattedCitation":"(Aaronson 2015)","plainTextFormattedCitation":"(Aaronson 2015)","previouslyFormattedCitation":"(Aaronson 2015)"},"properties":{"noteIndex":0},"schema":"https://github.com/citation-style-language/schema/raw/master/csl-citation.json"}</w:instrText>
       </w:r>
       <w:r>
         <w:fldChar w:fldCharType="separate"/>
@@ -15025,7 +15215,7 @@
         <w:fldChar w:fldCharType="begin"/>
       </w:r>
       <w:r>
-        <w:instrText xml:space="preserve">ADDIN CSL_CITATION {"citationID":"MENDELEY_CITATION_354","citationItems":[{"id":"ITEM-354","isTemporary":false,"itemData":{"DOI":"10.3390/math10030372","author":[{"family":"Mannone","given":"Maria"},{"family":"Seidita","given":"Valeria"},{"family":"Chella","given":"Antonio"}],"container-title":"Mathematics","id":"Mannone2022","issue":"3","issued":{"date-parts":[[2022]]},"page":"372","publisher":"MDPI","title":"Categories, quantum computing, and swarm robotics: A case study","title-short":"Categories, quantum computing, and swarm robotics","type":"article-journal","volume":"10"},"suppress-author":false}],"isEdited":false,"manualOverride":{"citeprocText":"Mannone, Seidita, and Chella (2022)","isManuallyOverridden":false,"manualOverrideText":""},"mendeley":{"formattedCitation":"Mannone, Seidita, and Chella (2022)","plainTextFormattedCitation":"Mannone, Seidita, and Chella (2022)","previouslyFormattedCitation":"Mannone, Seidita, and Chella (2022)"},"properties":{"noteIndex":0},"schema":"https://github.com/citation-style-language/schema/raw/master/csl-citation.json"}</w:instrText>
+        <w:instrText xml:space="preserve">ADDIN CSL_CITATION {"citationID":"MENDELEY_CITATION_367","citationItems":[{"id":"ITEM-367","isTemporary":false,"itemData":{"DOI":"10.3390/math10030372","author":[{"family":"Mannone","given":"Maria"},{"family":"Seidita","given":"Valeria"},{"family":"Chella","given":"Antonio"}],"container-title":"Mathematics","id":"Mannone2022","issue":"3","issued":{"date-parts":[[2022]]},"page":"372","publisher":"MDPI","title":"Categories, quantum computing, and swarm robotics: A case study","title-short":"Categories, quantum computing, and swarm robotics","type":"article-journal","volume":"10"},"suppress-author":false}],"isEdited":false,"manualOverride":{"citeprocText":"Mannone, Seidita, and Chella (2022)","isManuallyOverridden":false,"manualOverrideText":""},"mendeley":{"formattedCitation":"Mannone, Seidita, and Chella (2022)","plainTextFormattedCitation":"Mannone, Seidita, and Chella (2022)","previouslyFormattedCitation":"Mannone, Seidita, and Chella (2022)"},"properties":{"noteIndex":0},"schema":"https://github.com/citation-style-language/schema/raw/master/csl-citation.json"}</w:instrText>
       </w:r>
       <w:r>
         <w:fldChar w:fldCharType="separate"/>
@@ -15049,7 +15239,7 @@
         <w:fldChar w:fldCharType="begin"/>
       </w:r>
       <w:r>
-        <w:instrText xml:space="preserve">ADDIN CSL_CITATION {"citationID":"MENDELEY_CITATION_355","citationItems":[{"id":"ITEM-355","isTemporary":false,"itemData":{"DOI":"10.1016/j.swevo.2023.101297","author":[{"family":"Mannone","given":"Maria"},{"family":"Seidita","given":"Valeria"},{"family":"Chella","given":"Antonio"}],"container-title":"Swarm and Evolutionary Computation","id":"Mannone2023","issued":{"date-parts":[[2023]]},"page":"101297","title":"Modeling and designing a robotic swarm: A quantum computing approach","title-short":"Modeling and designing a robotic swarm","type":"article-journal","volume":"79"},"suppress-author":false}],"isEdited":false,"manualOverride":{"citeprocText":"Mannone, Seidita, and Chella (2023)","isManuallyOverridden":false,"manualOverrideText":""},"mendeley":{"formattedCitation":"Mannone, Seidita, and Chella (2023)","plainTextFormattedCitation":"Mannone, Seidita, and Chella (2023)","previouslyFormattedCitation":"Mannone, Seidita, and Chella (2023)"},"properties":{"noteIndex":0},"schema":"https://github.com/citation-style-language/schema/raw/master/csl-citation.json"}</w:instrText>
+        <w:instrText xml:space="preserve">ADDIN CSL_CITATION {"citationID":"MENDELEY_CITATION_368","citationItems":[{"id":"ITEM-368","isTemporary":false,"itemData":{"DOI":"10.1016/j.swevo.2023.101297","author":[{"family":"Mannone","given":"Maria"},{"family":"Seidita","given":"Valeria"},{"family":"Chella","given":"Antonio"}],"container-title":"Swarm and Evolutionary Computation","id":"Mannone2023","issued":{"date-parts":[[2023]]},"page":"101297","title":"Modeling and designing a robotic swarm: A quantum computing approach","title-short":"Modeling and designing a robotic swarm","type":"article-journal","volume":"79"},"suppress-author":false}],"isEdited":false,"manualOverride":{"citeprocText":"Mannone, Seidita, and Chella (2023)","isManuallyOverridden":false,"manualOverrideText":""},"mendeley":{"formattedCitation":"Mannone, Seidita, and Chella (2023)","plainTextFormattedCitation":"Mannone, Seidita, and Chella (2023)","previouslyFormattedCitation":"Mannone, Seidita, and Chella (2023)"},"properties":{"noteIndex":0},"schema":"https://github.com/citation-style-language/schema/raw/master/csl-citation.json"}</w:instrText>
       </w:r>
       <w:r>
         <w:fldChar w:fldCharType="separate"/>
@@ -15073,7 +15263,7 @@
         <w:fldChar w:fldCharType="begin"/>
       </w:r>
       <w:r>
-        <w:instrText xml:space="preserve">ADDIN CSL_CITATION {"citationID":"MENDELEY_CITATION_356","citationItems":[{"id":"ITEM-356","isTemporary":false,"itemData":{"DOI":"10.1098/rsta.2024.0139","author":[{"family":"Mannone","given":"Maria"},{"family":"Seidita","given":"Valeria"},{"family":"Chella","given":"Antonio"}],"container-title":"Philosophical Transactions of the Royal Society A: Mathematical, Physical and Engineering Sciences","id":"Mannone2025","issue":"2289","issued":{"date-parts":[[2025]]},"page":"20240139","title":"Quantum computing for swarm robotics: A local-to-global approach","title-short":"Quantum computing for swarm robotics","type":"article-journal","volume":"383"},"suppress-author":false}],"isEdited":false,"manualOverride":{"citeprocText":"Mannone, Seidita, and Chella (2025)","isManuallyOverridden":false,"manualOverrideText":""},"mendeley":{"formattedCitation":"Mannone, Seidita, and Chella (2025)","plainTextFormattedCitation":"Mannone, Seidita, and Chella (2025)","previouslyFormattedCitation":"Mannone, Seidita, and Chella (2025)"},"properties":{"noteIndex":0},"schema":"https://github.com/citation-style-language/schema/raw/master/csl-citation.json"}</w:instrText>
+        <w:instrText xml:space="preserve">ADDIN CSL_CITATION {"citationID":"MENDELEY_CITATION_369","citationItems":[{"id":"ITEM-369","isTemporary":false,"itemData":{"DOI":"10.1098/rsta.2024.0139","author":[{"family":"Mannone","given":"Maria"},{"family":"Seidita","given":"Valeria"},{"family":"Chella","given":"Antonio"}],"container-title":"Philosophical Transactions of the Royal Society A: Mathematical, Physical and Engineering Sciences","id":"Mannone2025","issue":"2289","issued":{"date-parts":[[2025]]},"page":"20240139","title":"Quantum computing for swarm robotics: A local-to-global approach","title-short":"Quantum computing for swarm robotics","type":"article-journal","volume":"383"},"suppress-author":false}],"isEdited":false,"manualOverride":{"citeprocText":"Mannone, Seidita, and Chella (2025)","isManuallyOverridden":false,"manualOverrideText":""},"mendeley":{"formattedCitation":"Mannone, Seidita, and Chella (2025)","plainTextFormattedCitation":"Mannone, Seidita, and Chella (2025)","previouslyFormattedCitation":"Mannone, Seidita, and Chella (2025)"},"properties":{"noteIndex":0},"schema":"https://github.com/citation-style-language/schema/raw/master/csl-citation.json"}</w:instrText>
       </w:r>
       <w:r>
         <w:fldChar w:fldCharType="separate"/>
@@ -15097,7 +15287,7 @@
         <w:fldChar w:fldCharType="begin"/>
       </w:r>
       <w:r>
-        <w:instrText xml:space="preserve">ADDIN CSL_CITATION {"citationID":"MENDELEY_CITATION_357","citationItems":[{"id":"ITEM-357","isTemporary":false,"itemData":{"DOI":"10.1016/j.robot.2026.105418","author":[{"family":"Mannone","given":"Maria"},{"family":"Anand","given":"Mahathi"},{"family":"Fazio","given":"Peppino"},{"family":"Swikir","given":"Abdalla"}],"container-title":"Robotics and Autonomous Systems","id":"Mannone2025b","issued":{"date-parts":[[2026]]},"page":"105418","publisher":"Elsevier","title":"Density matrix-based dynamics for quantum robotic swarms","type":"article-journal","volume":"200"},"suppress-author":false}],"isEdited":false,"manualOverride":{"citeprocText":"Mannone et al. (2026)","isManuallyOverridden":false,"manualOverrideText":""},"mendeley":{"formattedCitation":"Mannone et al. (2026)","plainTextFormattedCitation":"Mannone et al. (2026)","previouslyFormattedCitation":"Mannone et al. (2026)"},"properties":{"noteIndex":0},"schema":"https://github.com/citation-style-language/schema/raw/master/csl-citation.json"}</w:instrText>
+        <w:instrText xml:space="preserve">ADDIN CSL_CITATION {"citationID":"MENDELEY_CITATION_370","citationItems":[{"id":"ITEM-370","isTemporary":false,"itemData":{"DOI":"10.1016/j.robot.2026.105418","author":[{"family":"Mannone","given":"Maria"},{"family":"Anand","given":"Mahathi"},{"family":"Fazio","given":"Peppino"},{"family":"Swikir","given":"Abdalla"}],"container-title":"Robotics and Autonomous Systems","id":"Mannone2025b","issued":{"date-parts":[[2026]]},"page":"105418","publisher":"Elsevier","title":"Density matrix-based dynamics for quantum robotic swarms","type":"article-journal","volume":"200"},"suppress-author":false}],"isEdited":false,"manualOverride":{"citeprocText":"Mannone et al. (2026)","isManuallyOverridden":false,"manualOverrideText":""},"mendeley":{"formattedCitation":"Mannone et al. (2026)","plainTextFormattedCitation":"Mannone et al. (2026)","previouslyFormattedCitation":"Mannone et al. (2026)"},"properties":{"noteIndex":0},"schema":"https://github.com/citation-style-language/schema/raw/master/csl-citation.json"}</w:instrText>
       </w:r>
       <w:r>
         <w:fldChar w:fldCharType="separate"/>
@@ -15118,7 +15308,7 @@
         <w:fldChar w:fldCharType="begin"/>
       </w:r>
       <w:r>
-        <w:instrText xml:space="preserve">ADDIN CSL_CITATION {"citationID":"MENDELEY_CITATION_358","citationItems":[{"id":"ITEM-358","isTemporary":false,"itemData":{"DOI":"10.1016/j.robot.2023.104362","author":[{"family":"Chella","given":"Antonio"},{"family":"Gaglio","given":"Salvatore"},{"family":"Mannone","given":"Maria"},{"family":"Pilato","given":"Giovanni"},{"family":"Seidita","given":"Valeria"},{"family":"Vella","given":"Filippo"},{"family":"Zammuto","given":"Salvatore"}],"container-title":"Robotics and Autonomous Systems","id":"Chella2023","issued":{"date-parts":[[2023]]},"page":"104362","publisher":"Elsevier","title":"Quantum planning for swarm robotics","type":"article-journal","volume":"161"}}],"isEdited":false,"manualOverride":{"citeprocText":"(Chella et al. 2023)","isManuallyOverridden":false,"manualOverrideText":""},"mendeley":{"formattedCitation":"(Chella et al. 2023)","plainTextFormattedCitation":"(Chella et al. 2023)","previouslyFormattedCitation":"(Chella et al. 2023)"},"properties":{"noteIndex":0},"schema":"https://github.com/citation-style-language/schema/raw/master/csl-citation.json"}</w:instrText>
+        <w:instrText xml:space="preserve">ADDIN CSL_CITATION {"citationID":"MENDELEY_CITATION_371","citationItems":[{"id":"ITEM-371","isTemporary":false,"itemData":{"DOI":"10.1016/j.robot.2023.104362","author":[{"family":"Chella","given":"Antonio"},{"family":"Gaglio","given":"Salvatore"},{"family":"Mannone","given":"Maria"},{"family":"Pilato","given":"Giovanni"},{"family":"Seidita","given":"Valeria"},{"family":"Vella","given":"Filippo"},{"family":"Zammuto","given":"Salvatore"}],"container-title":"Robotics and Autonomous Systems","id":"Chella2023","issued":{"date-parts":[[2023]]},"page":"104362","publisher":"Elsevier","title":"Quantum planning for swarm robotics","type":"article-journal","volume":"161"}}],"isEdited":false,"manualOverride":{"citeprocText":"(Chella et al. 2023)","isManuallyOverridden":false,"manualOverrideText":""},"mendeley":{"formattedCitation":"(Chella et al. 2023)","plainTextFormattedCitation":"(Chella et al. 2023)","previouslyFormattedCitation":"(Chella et al. 2023)"},"properties":{"noteIndex":0},"schema":"https://github.com/citation-style-language/schema/raw/master/csl-citation.json"}</w:instrText>
       </w:r>
       <w:r>
         <w:fldChar w:fldCharType="separate"/>
@@ -15139,7 +15329,7 @@
         <w:fldChar w:fldCharType="begin"/>
       </w:r>
       <w:r>
-        <w:instrText xml:space="preserve">ADDIN CSL_CITATION {"citationID":"MENDELEY_CITATION_359","citationItems":[{"id":"ITEM-359","isTemporary":false,"itemData":{"DOI":"10.1109/ICDCS54860.2022.00151","author":[{"family":"Yun","given":"Won Joon"},{"family":"Kwak","given":"Yunseok"},{"family":"Kim","given":"Jae Pyoung"},{"family":"Cho","given":"Hyunhee"},{"family":"Jung","given":"Soyi"},{"family":"Park","given":"Jihong"},{"family":"Kim","given":"Joongheon"}],"container-title":"Proceedings of the 2022 IEEE 42nd international conference on distributed computing systems (ICDCS)","id":"Yun2022","issued":{"date-parts":[[2022]]},"page":"1332-1335","publisher":"IEEE","title":"Quantum multi-agent reinforcement learning via variational quantum circuit design","type":"paper-conference"}}],"isEdited":false,"manualOverride":{"citeprocText":"(Yun et al. 2022)","isManuallyOverridden":false,"manualOverrideText":""},"mendeley":{"formattedCitation":"(Yun et al. 2022)","plainTextFormattedCitation":"(Yun et al. 2022)","previouslyFormattedCitation":"(Yun et al. 2022)"},"properties":{"noteIndex":0},"schema":"https://github.com/citation-style-language/schema/raw/master/csl-citation.json"}</w:instrText>
+        <w:instrText xml:space="preserve">ADDIN CSL_CITATION {"citationID":"MENDELEY_CITATION_372","citationItems":[{"id":"ITEM-372","isTemporary":false,"itemData":{"DOI":"10.1109/ICDCS54860.2022.00151","author":[{"family":"Yun","given":"Won Joon"},{"family":"Kwak","given":"Yunseok"},{"family":"Kim","given":"Jae Pyoung"},{"family":"Cho","given":"Hyunhee"},{"family":"Jung","given":"Soyi"},{"family":"Park","given":"Jihong"},{"family":"Kim","given":"Joongheon"}],"container-title":"Proceedings of the 2022 IEEE 42nd international conference on distributed computing systems (ICDCS)","id":"Yun2022","issued":{"date-parts":[[2022]]},"page":"1332-1335","publisher":"IEEE","title":"Quantum multi-agent reinforcement learning via variational quantum circuit design","type":"paper-conference"}}],"isEdited":false,"manualOverride":{"citeprocText":"(Yun et al. 2022)","isManuallyOverridden":false,"manualOverrideText":""},"mendeley":{"formattedCitation":"(Yun et al. 2022)","plainTextFormattedCitation":"(Yun et al. 2022)","previouslyFormattedCitation":"(Yun et al. 2022)"},"properties":{"noteIndex":0},"schema":"https://github.com/citation-style-language/schema/raw/master/csl-citation.json"}</w:instrText>
       </w:r>
       <w:r>
         <w:fldChar w:fldCharType="separate"/>
@@ -15160,7 +15350,7 @@
         <w:fldChar w:fldCharType="begin"/>
       </w:r>
       <w:r>
-        <w:instrText xml:space="preserve">ADDIN CSL_CITATION {"citationID":"MENDELEY_CITATION_360","citationItems":[{"id":"ITEM-360","isTemporary":false,"itemData":{"DOI":"10.1098/rsta.2024.0139","author":[{"family":"Mannone","given":"Maria"},{"family":"Seidita","given":"Valeria"},{"family":"Chella","given":"Antonio"}],"container-title":"Philosophical Transactions of the Royal Society A: Mathematical, Physical and Engineering Sciences","id":"Mannone2025","issue":"2289","issued":{"date-parts":[[2025]]},"page":"20240139","title":"Quantum computing for swarm robotics: A local-to-global approach","title-short":"Quantum computing for swarm robotics","type":"article-journal","volume":"383"}}],"isEdited":false,"manualOverride":{"citeprocText":"(Mannone, Seidita, and Chella 2025)","isManuallyOverridden":false,"manualOverrideText":""},"mendeley":{"formattedCitation":"(Mannone, Seidita, and Chella 2025)","plainTextFormattedCitation":"(Mannone, Seidita, and Chella 2025)","previouslyFormattedCitation":"(Mannone, Seidita, and Chella 2025)"},"properties":{"noteIndex":0},"schema":"https://github.com/citation-style-language/schema/raw/master/csl-citation.json"}</w:instrText>
+        <w:instrText xml:space="preserve">ADDIN CSL_CITATION {"citationID":"MENDELEY_CITATION_373","citationItems":[{"id":"ITEM-373","isTemporary":false,"itemData":{"DOI":"10.1098/rsta.2024.0139","author":[{"family":"Mannone","given":"Maria"},{"family":"Seidita","given":"Valeria"},{"family":"Chella","given":"Antonio"}],"container-title":"Philosophical Transactions of the Royal Society A: Mathematical, Physical and Engineering Sciences","id":"Mannone2025","issue":"2289","issued":{"date-parts":[[2025]]},"page":"20240139","title":"Quantum computing for swarm robotics: A local-to-global approach","title-short":"Quantum computing for swarm robotics","type":"article-journal","volume":"383"}}],"isEdited":false,"manualOverride":{"citeprocText":"(Mannone, Seidita, and Chella 2025)","isManuallyOverridden":false,"manualOverrideText":""},"mendeley":{"formattedCitation":"(Mannone, Seidita, and Chella 2025)","plainTextFormattedCitation":"(Mannone, Seidita, and Chella 2025)","previouslyFormattedCitation":"(Mannone, Seidita, and Chella 2025)"},"properties":{"noteIndex":0},"schema":"https://github.com/citation-style-language/schema/raw/master/csl-citation.json"}</w:instrText>
       </w:r>
       <w:r>
         <w:fldChar w:fldCharType="separate"/>
@@ -15178,7 +15368,7 @@
         <w:fldChar w:fldCharType="begin"/>
       </w:r>
       <w:r>
-        <w:instrText xml:space="preserve">ADDIN CSL_CITATION {"citationID":"MENDELEY_CITATION_361","citationItems":[{"id":"ITEM-361","isTemporary":false,"itemData":{"DOI":"10.1109/IISWC53511.2021.00015","author":[{"family":"Ravi","given":"Gokul Subramanian"},{"family":"Smith","given":"Kaitlin N."},{"family":"Gokhale","given":"Pranav"},{"family":"Chong","given":"Frederic T."}],"container-title":"2021 IEEE international symposium on workload characterization (IISWC)","id":"Ravi2021","issued":{"date-parts":[[2021]]},"page":"39-50","publisher":"IEEE","title":"Quantum computing in the cloud: Analyzing job and machine characteristics","title-short":"Quantum computing in the cloud","type":"paper-conference"}}],"isEdited":false,"manualOverride":{"citeprocText":"(Ravi et al. 2021)","isManuallyOverridden":false,"manualOverrideText":""},"mendeley":{"formattedCitation":"(Ravi et al. 2021)","plainTextFormattedCitation":"(Ravi et al. 2021)","previouslyFormattedCitation":"(Ravi et al. 2021)"},"properties":{"noteIndex":0},"schema":"https://github.com/citation-style-language/schema/raw/master/csl-citation.json"}</w:instrText>
+        <w:instrText xml:space="preserve">ADDIN CSL_CITATION {"citationID":"MENDELEY_CITATION_374","citationItems":[{"id":"ITEM-374","isTemporary":false,"itemData":{"DOI":"10.1109/IISWC53511.2021.00015","author":[{"family":"Ravi","given":"Gokul Subramanian"},{"family":"Smith","given":"Kaitlin N."},{"family":"Gokhale","given":"Pranav"},{"family":"Chong","given":"Frederic T."}],"container-title":"2021 IEEE international symposium on workload characterization (IISWC)","id":"Ravi2021","issued":{"date-parts":[[2021]]},"page":"39-50","publisher":"IEEE","title":"Quantum computing in the cloud: Analyzing job and machine characteristics","title-short":"Quantum computing in the cloud","type":"paper-conference"}}],"isEdited":false,"manualOverride":{"citeprocText":"(Ravi et al. 2021)","isManuallyOverridden":false,"manualOverrideText":""},"mendeley":{"formattedCitation":"(Ravi et al. 2021)","plainTextFormattedCitation":"(Ravi et al. 2021)","previouslyFormattedCitation":"(Ravi et al. 2021)"},"properties":{"noteIndex":0},"schema":"https://github.com/citation-style-language/schema/raw/master/csl-citation.json"}</w:instrText>
       </w:r>
       <w:r>
         <w:fldChar w:fldCharType="separate"/>
@@ -15237,7 +15427,7 @@
         <w:fldChar w:fldCharType="begin"/>
       </w:r>
       <w:r>
-        <w:instrText xml:space="preserve">ADDIN CSL_CITATION {"citationID":"MENDELEY_CITATION_362","citationItems":[{"id":"ITEM-362","isTemporary":false,"itemData":{"DOI":"10.1145/3445814.3446758","author":[{"family":"Tang","given":"Wei"},{"family":"Tomesh","given":"Teague"},{"family":"Suchara","given":"Martin"},{"family":"Larson","given":"Jeffrey"},{"family":"Martonosi","given":"Margaret"}],"container-title":"Proceedings of the 26th ACM international conference on architectural support for programming languages and operating systems (ASPLOS ’21)","id":"Tang2021","issued":{"date-parts":[[2021]]},"page":"473-486","publisher":"Association for Computing Machinery","publisher-place":"New York, NY, USA","title":"CutQC: Using small quantum computers for large quantum circuit evaluations","title-short":"CutQC","type":"paper-conference"}}],"isEdited":false,"manualOverride":{"citeprocText":"(W. Tang et al. 2021)","isManuallyOverridden":false,"manualOverrideText":""},"mendeley":{"formattedCitation":"(W. Tang et al. 2021)","plainTextFormattedCitation":"(W. Tang et al. 2021)","previouslyFormattedCitation":"(W. Tang et al. 2021)"},"properties":{"noteIndex":0},"schema":"https://github.com/citation-style-language/schema/raw/master/csl-citation.json"}</w:instrText>
+        <w:instrText xml:space="preserve">ADDIN CSL_CITATION {"citationID":"MENDELEY_CITATION_375","citationItems":[{"id":"ITEM-375","isTemporary":false,"itemData":{"DOI":"10.1145/3445814.3446758","author":[{"family":"Tang","given":"Wei"},{"family":"Tomesh","given":"Teague"},{"family":"Suchara","given":"Martin"},{"family":"Larson","given":"Jeffrey"},{"family":"Martonosi","given":"Margaret"}],"container-title":"Proceedings of the 26th ACM international conference on architectural support for programming languages and operating systems (ASPLOS ’21)","id":"Tang2021","issued":{"date-parts":[[2021]]},"page":"473-486","publisher":"Association for Computing Machinery","publisher-place":"New York, NY, USA","title":"CutQC: Using small quantum computers for large quantum circuit evaluations","title-short":"CutQC","type":"paper-conference"}}],"isEdited":false,"manualOverride":{"citeprocText":"(W. Tang et al. 2021)","isManuallyOverridden":false,"manualOverrideText":""},"mendeley":{"formattedCitation":"(W. Tang et al. 2021)","plainTextFormattedCitation":"(W. Tang et al. 2021)","previouslyFormattedCitation":"(W. Tang et al. 2021)"},"properties":{"noteIndex":0},"schema":"https://github.com/citation-style-language/schema/raw/master/csl-citation.json"}</w:instrText>
       </w:r>
       <w:r>
         <w:fldChar w:fldCharType="separate"/>
@@ -15255,7 +15445,7 @@
         <w:fldChar w:fldCharType="begin"/>
       </w:r>
       <w:r>
-        <w:instrText xml:space="preserve">ADDIN CSL_CITATION {"citationID":"MENDELEY_CITATION_363","citationItems":[{"id":"ITEM-363","isTemporary":false,"itemData":{"DOI":"10.1109/ICDCS54860.2022.00151","author":[{"family":"Yun","given":"Won Joon"},{"family":"Kwak","given":"Yunseok"},{"family":"Kim","given":"Jae Pyoung"},{"family":"Cho","given":"Hyunhee"},{"family":"Jung","given":"Soyi"},{"family":"Park","given":"Jihong"},{"family":"Kim","given":"Joongheon"}],"container-title":"Proceedings of the 2022 IEEE 42nd international conference on distributed computing systems (ICDCS)","id":"Yun2022","issued":{"date-parts":[[2022]]},"page":"1332-1335","publisher":"IEEE","title":"Quantum multi-agent reinforcement learning via variational quantum circuit design","type":"paper-conference"}}],"isEdited":false,"manualOverride":{"citeprocText":"(Yun et al. 2022)","isManuallyOverridden":false,"manualOverrideText":""},"mendeley":{"formattedCitation":"(Yun et al. 2022)","plainTextFormattedCitation":"(Yun et al. 2022)","previouslyFormattedCitation":"(Yun et al. 2022)"},"properties":{"noteIndex":0},"schema":"https://github.com/citation-style-language/schema/raw/master/csl-citation.json"}</w:instrText>
+        <w:instrText xml:space="preserve">ADDIN CSL_CITATION {"citationID":"MENDELEY_CITATION_376","citationItems":[{"id":"ITEM-376","isTemporary":false,"itemData":{"DOI":"10.1109/ICDCS54860.2022.00151","author":[{"family":"Yun","given":"Won Joon"},{"family":"Kwak","given":"Yunseok"},{"family":"Kim","given":"Jae Pyoung"},{"family":"Cho","given":"Hyunhee"},{"family":"Jung","given":"Soyi"},{"family":"Park","given":"Jihong"},{"family":"Kim","given":"Joongheon"}],"container-title":"Proceedings of the 2022 IEEE 42nd international conference on distributed computing systems (ICDCS)","id":"Yun2022","issued":{"date-parts":[[2022]]},"page":"1332-1335","publisher":"IEEE","title":"Quantum multi-agent reinforcement learning via variational quantum circuit design","type":"paper-conference"}}],"isEdited":false,"manualOverride":{"citeprocText":"(Yun et al. 2022)","isManuallyOverridden":false,"manualOverrideText":""},"mendeley":{"formattedCitation":"(Yun et al. 2022)","plainTextFormattedCitation":"(Yun et al. 2022)","previouslyFormattedCitation":"(Yun et al. 2022)"},"properties":{"noteIndex":0},"schema":"https://github.com/citation-style-language/schema/raw/master/csl-citation.json"}</w:instrText>
       </w:r>
       <w:r>
         <w:fldChar w:fldCharType="separate"/>
@@ -15273,7 +15463,7 @@
         <w:fldChar w:fldCharType="begin"/>
       </w:r>
       <w:r>
-        <w:instrText xml:space="preserve">ADDIN CSL_CITATION {"citationID":"MENDELEY_CITATION_364","citationItems":[{"id":"ITEM-364","isTemporary":false,"itemData":{"DOI":"10.3390/electronics10020100","author":[{"family":"Yan","given":"Fei"},{"family":"Iliyasu","given":"Abdullah M."},{"family":"Hirota","given":"Kaoru"}],"container-title":"Electronics","id":"Yan2021","issue":"2","issued":{"date-parts":[[2021]]},"page":"100","publisher":"MDPI","title":"Conceptual framework for quantum affective computing and its use in fusion of multi-robot emotions","type":"article-journal","volume":"10"}}],"isEdited":false,"manualOverride":{"citeprocText":"(Yan, Iliyasu, and Hirota 2021)","isManuallyOverridden":false,"manualOverrideText":""},"mendeley":{"formattedCitation":"(Yan, Iliyasu, and Hirota 2021)","plainTextFormattedCitation":"(Yan, Iliyasu, and Hirota 2021)","previouslyFormattedCitation":"(Yan, Iliyasu, and Hirota 2021)"},"properties":{"noteIndex":0},"schema":"https://github.com/citation-style-language/schema/raw/master/csl-citation.json"}</w:instrText>
+        <w:instrText xml:space="preserve">ADDIN CSL_CITATION {"citationID":"MENDELEY_CITATION_377","citationItems":[{"id":"ITEM-377","isTemporary":false,"itemData":{"DOI":"10.3390/electronics10020100","author":[{"family":"Yan","given":"Fei"},{"family":"Iliyasu","given":"Abdullah M."},{"family":"Hirota","given":"Kaoru"}],"container-title":"Electronics","id":"Yan2021","issue":"2","issued":{"date-parts":[[2021]]},"page":"100","publisher":"MDPI","title":"Conceptual framework for quantum affective computing and its use in fusion of multi-robot emotions","type":"article-journal","volume":"10"}}],"isEdited":false,"manualOverride":{"citeprocText":"(Yan, Iliyasu, and Hirota 2021)","isManuallyOverridden":false,"manualOverrideText":""},"mendeley":{"formattedCitation":"(Yan, Iliyasu, and Hirota 2021)","plainTextFormattedCitation":"(Yan, Iliyasu, and Hirota 2021)","previouslyFormattedCitation":"(Yan, Iliyasu, and Hirota 2021)"},"properties":{"noteIndex":0},"schema":"https://github.com/citation-style-language/schema/raw/master/csl-citation.json"}</w:instrText>
       </w:r>
       <w:r>
         <w:fldChar w:fldCharType="separate"/>
@@ -15291,7 +15481,7 @@
         <w:fldChar w:fldCharType="begin"/>
       </w:r>
       <w:r>
-        <w:instrText xml:space="preserve">ADDIN CSL_CITATION {"citationID":"MENDELEY_CITATION_365","citationItems":[{"id":"ITEM-365","isTemporary":false,"itemData":{"DOI":"10.1145/3445814.3446758","author":[{"family":"Tang","given":"Wei"},{"family":"Tomesh","given":"Teague"},{"family":"Suchara","given":"Martin"},{"family":"Larson","given":"Jeffrey"},{"family":"Martonosi","given":"Margaret"}],"container-title":"Proceedings of the 26th ACM international conference on architectural support for programming languages and operating systems (ASPLOS ’21)","id":"Tang2021","issued":{"date-parts":[[2021]]},"page":"473-486","publisher":"Association for Computing Machinery","publisher-place":"New York, NY, USA","title":"CutQC: Using small quantum computers for large quantum circuit evaluations","title-short":"CutQC","type":"paper-conference"}}],"isEdited":false,"manualOverride":{"citeprocText":"(W. Tang et al. 2021)","isManuallyOverridden":false,"manualOverrideText":""},"mendeley":{"formattedCitation":"(W. Tang et al. 2021)","plainTextFormattedCitation":"(W. Tang et al. 2021)","previouslyFormattedCitation":"(W. Tang et al. 2021)"},"properties":{"noteIndex":0},"schema":"https://github.com/citation-style-language/schema/raw/master/csl-citation.json"}</w:instrText>
+        <w:instrText xml:space="preserve">ADDIN CSL_CITATION {"citationID":"MENDELEY_CITATION_378","citationItems":[{"id":"ITEM-378","isTemporary":false,"itemData":{"DOI":"10.1145/3445814.3446758","author":[{"family":"Tang","given":"Wei"},{"family":"Tomesh","given":"Teague"},{"family":"Suchara","given":"Martin"},{"family":"Larson","given":"Jeffrey"},{"family":"Martonosi","given":"Margaret"}],"container-title":"Proceedings of the 26th ACM international conference on architectural support for programming languages and operating systems (ASPLOS ’21)","id":"Tang2021","issued":{"date-parts":[[2021]]},"page":"473-486","publisher":"Association for Computing Machinery","publisher-place":"New York, NY, USA","title":"CutQC: Using small quantum computers for large quantum circuit evaluations","title-short":"CutQC","type":"paper-conference"}}],"isEdited":false,"manualOverride":{"citeprocText":"(W. Tang et al. 2021)","isManuallyOverridden":false,"manualOverrideText":""},"mendeley":{"formattedCitation":"(W. Tang et al. 2021)","plainTextFormattedCitation":"(W. Tang et al. 2021)","previouslyFormattedCitation":"(W. Tang et al. 2021)"},"properties":{"noteIndex":0},"schema":"https://github.com/citation-style-language/schema/raw/master/csl-citation.json"}</w:instrText>
       </w:r>
       <w:r>
         <w:fldChar w:fldCharType="separate"/>
@@ -15339,7 +15529,7 @@
         <w:fldChar w:fldCharType="begin"/>
       </w:r>
       <w:r>
-        <w:instrText xml:space="preserve">ADDIN CSL_CITATION {"citationID":"MENDELEY_CITATION_366","citationItems":[{"id":"ITEM-366","isTemporary":false,"itemData":{"author":[{"family":"Golyanik","given":"Vladislav"},{"family":"Theobalt","given":"Christian"}],"container-title":"Proceedings of the IEEE/CVF conference on computer vision and pattern recognition (CVPR)","id":"Golyanik2020","issued":{"date-parts":[[2020]]},"page":"9182-9191","publisher":"IEEE","title":"A quantum computational approach to correspondence problems on point sets","type":"paper-conference"},"suppress-author":false}],"isEdited":false,"manualOverride":{"citeprocText":"Golyanik and Theobalt (2020)","isManuallyOverridden":false,"manualOverrideText":""},"mendeley":{"formattedCitation":"Golyanik and Theobalt (2020)","plainTextFormattedCitation":"Golyanik and Theobalt (2020)","previouslyFormattedCitation":"Golyanik and Theobalt (2020)"},"properties":{"noteIndex":0},"schema":"https://github.com/citation-style-language/schema/raw/master/csl-citation.json"}</w:instrText>
+        <w:instrText xml:space="preserve">ADDIN CSL_CITATION {"citationID":"MENDELEY_CITATION_379","citationItems":[{"id":"ITEM-379","isTemporary":false,"itemData":{"author":[{"family":"Golyanik","given":"Vladislav"},{"family":"Theobalt","given":"Christian"}],"container-title":"Proceedings of the IEEE/CVF conference on computer vision and pattern recognition (CVPR)","id":"Golyanik2020","issued":{"date-parts":[[2020]]},"page":"9182-9191","publisher":"IEEE","title":"A quantum computational approach to correspondence problems on point sets","type":"paper-conference"},"suppress-author":false}],"isEdited":false,"manualOverride":{"citeprocText":"Golyanik and Theobalt (2020)","isManuallyOverridden":false,"manualOverrideText":""},"mendeley":{"formattedCitation":"Golyanik and Theobalt (2020)","plainTextFormattedCitation":"Golyanik and Theobalt (2020)","previouslyFormattedCitation":"Golyanik and Theobalt (2020)"},"properties":{"noteIndex":0},"schema":"https://github.com/citation-style-language/schema/raw/master/csl-citation.json"}</w:instrText>
       </w:r>
       <w:r>
         <w:fldChar w:fldCharType="separate"/>
@@ -15363,7 +15553,7 @@
         <w:fldChar w:fldCharType="begin"/>
       </w:r>
       <w:r>
-        <w:instrText xml:space="preserve">ADDIN CSL_CITATION {"citationID":"MENDELEY_CITATION_367","citationItems":[{"id":"ITEM-367","isTemporary":false,"itemData":{"author":[{"family":"Meli","given":"Natacha Kuete"},{"family":"Mannel","given":"Florian"},{"family":"Lellmann","given":"Jan"}],"container-title":"Proceedings of the IEEE/CVF conference on computer vision and pattern recognition (CVPR)","id":"Meli2022","issued":{"date-parts":[[2022]]},"page":"529-537","publisher":"IEEE","title":"An iterative quantum approach for transformation estimation from point sets","type":"paper-conference"},"suppress-author":false}],"isEdited":false,"manualOverride":{"citeprocText":"Meli, Mannel, and Lellmann (2022)","isManuallyOverridden":false,"manualOverrideText":""},"mendeley":{"formattedCitation":"Meli, Mannel, and Lellmann (2022)","plainTextFormattedCitation":"Meli, Mannel, and Lellmann (2022)","previouslyFormattedCitation":"Meli, Mannel, and Lellmann (2022)"},"properties":{"noteIndex":0},"schema":"https://github.com/citation-style-language/schema/raw/master/csl-citation.json"}</w:instrText>
+        <w:instrText xml:space="preserve">ADDIN CSL_CITATION {"citationID":"MENDELEY_CITATION_380","citationItems":[{"id":"ITEM-380","isTemporary":false,"itemData":{"author":[{"family":"Meli","given":"Natacha Kuete"},{"family":"Mannel","given":"Florian"},{"family":"Lellmann","given":"Jan"}],"container-title":"Proceedings of the IEEE/CVF conference on computer vision and pattern recognition (CVPR)","id":"Meli2022","issued":{"date-parts":[[2022]]},"page":"529-537","publisher":"IEEE","title":"An iterative quantum approach for transformation estimation from point sets","type":"paper-conference"},"suppress-author":false}],"isEdited":false,"manualOverride":{"citeprocText":"Meli, Mannel, and Lellmann (2022)","isManuallyOverridden":false,"manualOverrideText":""},"mendeley":{"formattedCitation":"Meli, Mannel, and Lellmann (2022)","plainTextFormattedCitation":"Meli, Mannel, and Lellmann (2022)","previouslyFormattedCitation":"Meli, Mannel, and Lellmann (2022)"},"properties":{"noteIndex":0},"schema":"https://github.com/citation-style-language/schema/raw/master/csl-citation.json"}</w:instrText>
       </w:r>
       <w:r>
         <w:fldChar w:fldCharType="separate"/>
@@ -15387,7 +15577,7 @@
         <w:fldChar w:fldCharType="begin"/>
       </w:r>
       <w:r>
-        <w:instrText xml:space="preserve">ADDIN CSL_CITATION {"citationID":"MENDELEY_CITATION_368","citationItems":[{"id":"ITEM-368","isTemporary":false,"itemData":{"DOI":"10.1109/CVPR46437.2021.01292","author":[{"family":"Birdal","given":"Tolga"},{"family":"Golyanik","given":"Vladislav"},{"family":"Theobalt","given":"Christian"},{"family":"Guibas","given":"Leonidas J."}],"container-title":"Proceedings of the IEEE/CVF conference on computer vision and pattern recognition (CVPR)","id":"Birdal2021","issued":{"date-parts":[[2021]]},"page":"13122-13133","publisher":"IEEE","title":"Quantum permutation synchronization","type":"paper-conference"},"suppress-author":false}],"isEdited":false,"manualOverride":{"citeprocText":"Birdal et al. (2021)","isManuallyOverridden":false,"manualOverrideText":""},"mendeley":{"formattedCitation":"Birdal et al. (2021)","plainTextFormattedCitation":"Birdal et al. (2021)","previouslyFormattedCitation":"Birdal et al. (2021)"},"properties":{"noteIndex":0},"schema":"https://github.com/citation-style-language/schema/raw/master/csl-citation.json"}</w:instrText>
+        <w:instrText xml:space="preserve">ADDIN CSL_CITATION {"citationID":"MENDELEY_CITATION_381","citationItems":[{"id":"ITEM-381","isTemporary":false,"itemData":{"DOI":"10.1109/CVPR46437.2021.01292","author":[{"family":"Birdal","given":"Tolga"},{"family":"Golyanik","given":"Vladislav"},{"family":"Theobalt","given":"Christian"},{"family":"Guibas","given":"Leonidas J."}],"container-title":"Proceedings of the IEEE/CVF conference on computer vision and pattern recognition (CVPR)","id":"Birdal2021","issued":{"date-parts":[[2021]]},"page":"13122-13133","publisher":"IEEE","title":"Quantum permutation synchronization","type":"paper-conference"},"suppress-author":false}],"isEdited":false,"manualOverride":{"citeprocText":"Birdal et al. (2021)","isManuallyOverridden":false,"manualOverrideText":""},"mendeley":{"formattedCitation":"Birdal et al. (2021)","plainTextFormattedCitation":"Birdal et al. (2021)","previouslyFormattedCitation":"Birdal et al. (2021)"},"properties":{"noteIndex":0},"schema":"https://github.com/citation-style-language/schema/raw/master/csl-citation.json"}</w:instrText>
       </w:r>
       <w:r>
         <w:fldChar w:fldCharType="separate"/>
@@ -15411,7 +15601,7 @@
         <w:fldChar w:fldCharType="begin"/>
       </w:r>
       <w:r>
-        <w:instrText xml:space="preserve">ADDIN CSL_CITATION {"citationID":"MENDELEY_CITATION_369","citationItems":[{"id":"ITEM-369","isTemporary":false,"itemData":{"author":[{"family":"Seelbach Benkner","given":"Marcel"},{"family":"Lähner","given":"Zorah"},{"family":"Golyanik","given":"Vladislav"},{"family":"Wunderlich","given":"Christof"},{"family":"Theobalt","given":"Christian"},{"family":"Moeller","given":"Michael"}],"container-title":"Proceedings of the IEEE/CVF international conference on computer vision (ICCV)","id":"Benkner2021","issued":{"date-parts":[[2021]]},"page":"7586-7596","publisher":"IEEE","title":"Q-Match: Iterative shape matching via quantum annealing","title-short":"Q-Match","type":"paper-conference"},"suppress-author":false}],"isEdited":false,"manualOverride":{"citeprocText":"Seelbach Benkner et al. (2021)","isManuallyOverridden":false,"manualOverrideText":""},"mendeley":{"formattedCitation":"Seelbach Benkner et al. (2021)","plainTextFormattedCitation":"Seelbach Benkner et al. (2021)","previouslyFormattedCitation":"Seelbach Benkner et al. (2021)"},"properties":{"noteIndex":0},"schema":"https://github.com/citation-style-language/schema/raw/master/csl-citation.json"}</w:instrText>
+        <w:instrText xml:space="preserve">ADDIN CSL_CITATION {"citationID":"MENDELEY_CITATION_382","citationItems":[{"id":"ITEM-382","isTemporary":false,"itemData":{"author":[{"family":"Seelbach Benkner","given":"Marcel"},{"family":"Lähner","given":"Zorah"},{"family":"Golyanik","given":"Vladislav"},{"family":"Wunderlich","given":"Christof"},{"family":"Theobalt","given":"Christian"},{"family":"Moeller","given":"Michael"}],"container-title":"Proceedings of the IEEE/CVF international conference on computer vision (ICCV)","id":"Benkner2021","issued":{"date-parts":[[2021]]},"page":"7586-7596","publisher":"IEEE","title":"Q-Match: Iterative shape matching via quantum annealing","title-short":"Q-Match","type":"paper-conference"},"suppress-author":false}],"isEdited":false,"manualOverride":{"citeprocText":"Seelbach Benkner et al. (2021)","isManuallyOverridden":false,"manualOverrideText":""},"mendeley":{"formattedCitation":"Seelbach Benkner et al. (2021)","plainTextFormattedCitation":"Seelbach Benkner et al. (2021)","previouslyFormattedCitation":"Seelbach Benkner et al. (2021)"},"properties":{"noteIndex":0},"schema":"https://github.com/citation-style-language/schema/raw/master/csl-citation.json"}</w:instrText>
       </w:r>
       <w:r>
         <w:fldChar w:fldCharType="separate"/>
@@ -15435,7 +15625,7 @@
         <w:fldChar w:fldCharType="begin"/>
       </w:r>
       <w:r>
-        <w:instrText xml:space="preserve">ADDIN CSL_CITATION {"citationID":"MENDELEY_CITATION_370","citationItems":[{"id":"ITEM-370","isTemporary":false,"itemData":{"author":[{"family":"Doan","given":"Anh-Dzung"},{"family":"Sasdelli","given":"Michele"},{"family":"Suter","given":"David"},{"family":"Chin","given":"Tat-Jun"}],"container-title":"Proceedings of the IEEE/CVF conference on computer vision and pattern recognition (CVPR)","id":"Doan2022","issued":{"date-parts":[[2022]]},"page":"417-427","publisher":"IEEE","title":"A hybrid quantum-classical algorithm for robust fitting","type":"paper-conference"},"suppress-author":false}],"isEdited":false,"manualOverride":{"citeprocText":"Doan et al. (2022)","isManuallyOverridden":false,"manualOverrideText":""},"mendeley":{"formattedCitation":"Doan et al. (2022)","plainTextFormattedCitation":"Doan et al. (2022)","previouslyFormattedCitation":"Doan et al. (2022)"},"properties":{"noteIndex":0},"schema":"https://github.com/citation-style-language/schema/raw/master/csl-citation.json"}</w:instrText>
+        <w:instrText xml:space="preserve">ADDIN CSL_CITATION {"citationID":"MENDELEY_CITATION_383","citationItems":[{"id":"ITEM-383","isTemporary":false,"itemData":{"author":[{"family":"Doan","given":"Anh-Dzung"},{"family":"Sasdelli","given":"Michele"},{"family":"Suter","given":"David"},{"family":"Chin","given":"Tat-Jun"}],"container-title":"Proceedings of the IEEE/CVF conference on computer vision and pattern recognition (CVPR)","id":"Doan2022","issued":{"date-parts":[[2022]]},"page":"417-427","publisher":"IEEE","title":"A hybrid quantum-classical algorithm for robust fitting","type":"paper-conference"},"suppress-author":false}],"isEdited":false,"manualOverride":{"citeprocText":"Doan et al. (2022)","isManuallyOverridden":false,"manualOverrideText":""},"mendeley":{"formattedCitation":"Doan et al. (2022)","plainTextFormattedCitation":"Doan et al. (2022)","previouslyFormattedCitation":"Doan et al. (2022)"},"properties":{"noteIndex":0},"schema":"https://github.com/citation-style-language/schema/raw/master/csl-citation.json"}</w:instrText>
       </w:r>
       <w:r>
         <w:fldChar w:fldCharType="separate"/>
@@ -15459,7 +15649,7 @@
         <w:fldChar w:fldCharType="begin"/>
       </w:r>
       <w:r>
-        <w:instrText xml:space="preserve">ADDIN CSL_CITATION {"citationID":"MENDELEY_CITATION_371","citationItems":[{"id":"ITEM-371","isTemporary":false,"itemData":{"author":[{"family":"Zaech","given":"Jan-Nico"},{"family":"Liniger","given":"Alexander"},{"family":"Danelljan","given":"Martin"},{"family":"Dai","given":"Dengxin"},{"family":"Van Gool","given":"Luc"}],"container-title":"Proceedings of the IEEE/CVF conference on computer vision and pattern recognition (CVPR)","id":"Zaech2022","issued":{"date-parts":[[2022]]},"page":"8811-8822","publisher":"IEEE","title":"Adiabatic quantum computing for multi object tracking","type":"paper-conference"},"suppress-author":false}],"isEdited":false,"manualOverride":{"citeprocText":"Zaech et al. (2022)","isManuallyOverridden":false,"manualOverrideText":""},"mendeley":{"formattedCitation":"Zaech et al. (2022)","plainTextFormattedCitation":"Zaech et al. (2022)","previouslyFormattedCitation":"Zaech et al. (2022)"},"properties":{"noteIndex":0},"schema":"https://github.com/citation-style-language/schema/raw/master/csl-citation.json"}</w:instrText>
+        <w:instrText xml:space="preserve">ADDIN CSL_CITATION {"citationID":"MENDELEY_CITATION_384","citationItems":[{"id":"ITEM-384","isTemporary":false,"itemData":{"author":[{"family":"Zaech","given":"Jan-Nico"},{"family":"Liniger","given":"Alexander"},{"family":"Danelljan","given":"Martin"},{"family":"Dai","given":"Dengxin"},{"family":"Van Gool","given":"Luc"}],"container-title":"Proceedings of the IEEE/CVF conference on computer vision and pattern recognition (CVPR)","id":"Zaech2022","issued":{"date-parts":[[2022]]},"page":"8811-8822","publisher":"IEEE","title":"Adiabatic quantum computing for multi object tracking","type":"paper-conference"},"suppress-author":false}],"isEdited":false,"manualOverride":{"citeprocText":"Zaech et al. (2022)","isManuallyOverridden":false,"manualOverrideText":""},"mendeley":{"formattedCitation":"Zaech et al. (2022)","plainTextFormattedCitation":"Zaech et al. (2022)","previouslyFormattedCitation":"Zaech et al. (2022)"},"properties":{"noteIndex":0},"schema":"https://github.com/citation-style-language/schema/raw/master/csl-citation.json"}</w:instrText>
       </w:r>
       <w:r>
         <w:fldChar w:fldCharType="separate"/>
@@ -15521,7 +15711,7 @@
         <w:fldChar w:fldCharType="begin"/>
       </w:r>
       <w:r>
-        <w:instrText xml:space="preserve">ADDIN CSL_CITATION {"citationID":"MENDELEY_CITATION_373","citationItems":[{"id":"ITEM-372","isTemporary":false,"itemData":{"DOI":"10.1103/RevModPhys.92.015003","author":[{"family":"McArdle","given":"Sam"},{"family":"Endo","given":"Suguru"},{"family":"Aspuru-Guzik","given":"Alán"},{"family":"Benjamin","given":"Simon C."},{"family":"Yuan","given":"Xiao"}],"container-title":"Reviews of Modern Physics","id":"McArdle2020","issue":"1","issued":{"date-parts":[[2020]]},"page":"015003","publisher":"American Physical Society","title":"Quantum computational chemistry","type":"article-journal","volume":"92"}},{"id":"ITEM-373","isTemporary":false,"itemData":{"DOI":"10.1021/acs.chemrev.9b00829","author":[{"family":"Bauer","given":"Bela"},{"family":"Bravyi","given":"Sergey"},{"family":"Motta","given":"Mario"},{"family":"Chan","given":"Garnet Kin-Lic"}],"container-title":"Chemical Reviews","id":"Bauer2020","issue":"22","issued":{"date-parts":[[2020]]},"page":"12685-12717","publisher":"American Chemical Society","title":"Quantum algorithms for quantum chemistry and quantum materials science","type":"article-journal","volume":"120"}}],"isEdited":false,"manualOverride":{"citeprocText":"(McArdle et al. 2020; Bauer et al. 2020)","isManuallyOverridden":false,"manualOverrideText":""},"mendeley":{"formattedCitation":"(McArdle et al. 2020; Bauer et al. 2020)","plainTextFormattedCitation":"(McArdle et al. 2020; Bauer et al. 2020)","previouslyFormattedCitation":"(McArdle et al. 2020; Bauer et al. 2020)"},"properties":{"noteIndex":0},"schema":"https://github.com/citation-style-language/schema/raw/master/csl-citation.json"}</w:instrText>
+        <w:instrText xml:space="preserve">ADDIN CSL_CITATION {"citationID":"MENDELEY_CITATION_386","citationItems":[{"id":"ITEM-385","isTemporary":false,"itemData":{"DOI":"10.1103/RevModPhys.92.015003","author":[{"family":"McArdle","given":"Sam"},{"family":"Endo","given":"Suguru"},{"family":"Aspuru-Guzik","given":"Alán"},{"family":"Benjamin","given":"Simon C."},{"family":"Yuan","given":"Xiao"}],"container-title":"Reviews of Modern Physics","id":"McArdle2020","issue":"1","issued":{"date-parts":[[2020]]},"page":"015003","publisher":"American Physical Society","title":"Quantum computational chemistry","type":"article-journal","volume":"92"}},{"id":"ITEM-386","isTemporary":false,"itemData":{"DOI":"10.1021/acs.chemrev.9b00829","author":[{"family":"Bauer","given":"Bela"},{"family":"Bravyi","given":"Sergey"},{"family":"Motta","given":"Mario"},{"family":"Chan","given":"Garnet Kin-Lic"}],"container-title":"Chemical Reviews","id":"Bauer2020","issue":"22","issued":{"date-parts":[[2020]]},"page":"12685-12717","publisher":"American Chemical Society","title":"Quantum algorithms for quantum chemistry and quantum materials science","type":"article-journal","volume":"120"}}],"isEdited":false,"manualOverride":{"citeprocText":"(McArdle et al. 2020; Bauer et al. 2020)","isManuallyOverridden":false,"manualOverrideText":""},"mendeley":{"formattedCitation":"(McArdle et al. 2020; Bauer et al. 2020)","plainTextFormattedCitation":"(McArdle et al. 2020; Bauer et al. 2020)","previouslyFormattedCitation":"(McArdle et al. 2020; Bauer et al. 2020)"},"properties":{"noteIndex":0},"schema":"https://github.com/citation-style-language/schema/raw/master/csl-citation.json"}</w:instrText>
       </w:r>
       <w:r>
         <w:fldChar w:fldCharType="separate"/>
@@ -15539,7 +15729,7 @@
         <w:fldChar w:fldCharType="begin"/>
       </w:r>
       <w:r>
-        <w:instrText xml:space="preserve">ADDIN CSL_CITATION {"citationID":"MENDELEY_CITATION_374","citationItems":[{"id":"ITEM-374","isTemporary":false,"itemData":{"DOI":"10.1063/5.0044068","author":[{"family":"Rice","given":"Julia E."},{"family":"Gujarati","given":"Tanvi P."},{"family":"Motta","given":"Mario"},{"family":"Takeshita","given":"Tyler Y."},{"family":"Lee","given":"Eunseok"},{"family":"Latone","given":"Joseph A."},{"family":"Garcia","given":"Jeannette M."}],"container-title":"The Journal of Chemical Physics","id":"Rice2021","issue":"13","issued":{"date-parts":[[2021]]},"page":"134115","publisher":"AIP Publishing","title":"Quantum computation of dominant products in lithium–sulfur batteries","type":"article-journal","volume":"154"}}],"isEdited":false,"manualOverride":{"citeprocText":"(Rice et al. 2021)","isManuallyOverridden":false,"manualOverrideText":""},"mendeley":{"formattedCitation":"(Rice et al. 2021)","plainTextFormattedCitation":"(Rice et al. 2021)","previouslyFormattedCitation":"(Rice et al. 2021)"},"properties":{"noteIndex":0},"schema":"https://github.com/citation-style-language/schema/raw/master/csl-citation.json"}</w:instrText>
+        <w:instrText xml:space="preserve">ADDIN CSL_CITATION {"citationID":"MENDELEY_CITATION_387","citationItems":[{"id":"ITEM-387","isTemporary":false,"itemData":{"DOI":"10.1063/5.0044068","author":[{"family":"Rice","given":"Julia E."},{"family":"Gujarati","given":"Tanvi P."},{"family":"Motta","given":"Mario"},{"family":"Takeshita","given":"Tyler Y."},{"family":"Lee","given":"Eunseok"},{"family":"Latone","given":"Joseph A."},{"family":"Garcia","given":"Jeannette M."}],"container-title":"The Journal of Chemical Physics","id":"Rice2021","issue":"13","issued":{"date-parts":[[2021]]},"page":"134115","publisher":"AIP Publishing","title":"Quantum computation of dominant products in lithium–sulfur batteries","type":"article-journal","volume":"154"}}],"isEdited":false,"manualOverride":{"citeprocText":"(Rice et al. 2021)","isManuallyOverridden":false,"manualOverrideText":""},"mendeley":{"formattedCitation":"(Rice et al. 2021)","plainTextFormattedCitation":"(Rice et al. 2021)","previouslyFormattedCitation":"(Rice et al. 2021)"},"properties":{"noteIndex":0},"schema":"https://github.com/citation-style-language/schema/raw/master/csl-citation.json"}</w:instrText>
       </w:r>
       <w:r>
         <w:fldChar w:fldCharType="separate"/>
@@ -15557,7 +15747,7 @@
         <w:fldChar w:fldCharType="begin"/>
       </w:r>
       <w:r>
-        <w:instrText xml:space="preserve">ADDIN CSL_CITATION {"citationID":"MENDELEY_CITATION_375","citationItems":[{"id":"ITEM-375","isTemporary":false,"itemData":{"DOI":"10.1103/PhysRevResearch.4.023019","author":[{"family":"Kim","given":"Isaac H."},{"family":"Liu","given":"Ye-Hua"},{"family":"Pallister","given":"Sam"},{"family":"Pol","given":"William"},{"family":"Roberts","given":"Sam"},{"family":"Lee","given":"Eunseok"}],"container-title":"Physical Review Research","id":"Kim2022","issue":"2","issued":{"date-parts":[[2022]]},"page":"023019","publisher":"American Physical Society","title":"Fault-tolerant resource estimate for quantum chemical simulations: Case study on Li-ion battery electrolyte molecules","title-short":"Fault-tolerant resource estimate for quantum chemical simulations","type":"article-journal","volume":"4"}}],"isEdited":false,"manualOverride":{"citeprocText":"(Kim et al. 2022)","isManuallyOverridden":false,"manualOverrideText":""},"mendeley":{"formattedCitation":"(Kim et al. 2022)","plainTextFormattedCitation":"(Kim et al. 2022)","previouslyFormattedCitation":"(Kim et al. 2022)"},"properties":{"noteIndex":0},"schema":"https://github.com/citation-style-language/schema/raw/master/csl-citation.json"}</w:instrText>
+        <w:instrText xml:space="preserve">ADDIN CSL_CITATION {"citationID":"MENDELEY_CITATION_388","citationItems":[{"id":"ITEM-388","isTemporary":false,"itemData":{"DOI":"10.1103/PhysRevResearch.4.023019","author":[{"family":"Kim","given":"Isaac H."},{"family":"Liu","given":"Ye-Hua"},{"family":"Pallister","given":"Sam"},{"family":"Pol","given":"William"},{"family":"Roberts","given":"Sam"},{"family":"Lee","given":"Eunseok"}],"container-title":"Physical Review Research","id":"Kim2022","issue":"2","issued":{"date-parts":[[2022]]},"page":"023019","publisher":"American Physical Society","title":"Fault-tolerant resource estimate for quantum chemical simulations: Case study on Li-ion battery electrolyte molecules","title-short":"Fault-tolerant resource estimate for quantum chemical simulations","type":"article-journal","volume":"4"}}],"isEdited":false,"manualOverride":{"citeprocText":"(Kim et al. 2022)","isManuallyOverridden":false,"manualOverrideText":""},"mendeley":{"formattedCitation":"(Kim et al. 2022)","plainTextFormattedCitation":"(Kim et al. 2022)","previouslyFormattedCitation":"(Kim et al. 2022)"},"properties":{"noteIndex":0},"schema":"https://github.com/citation-style-language/schema/raw/master/csl-citation.json"}</w:instrText>
       </w:r>
       <w:r>
         <w:fldChar w:fldCharType="separate"/>
@@ -15578,7 +15768,7 @@
         <w:fldChar w:fldCharType="begin"/>
       </w:r>
       <w:r>
-        <w:instrText xml:space="preserve">ADDIN CSL_CITATION {"citationID":"MENDELEY_CITATION_376","citationItems":[{"id":"ITEM-376","isTemporary":false,"itemData":{"DOI":"10.1073/pnas.1619152114","author":[{"family":"Reiher","given":"Markus"},{"family":"Wiebe","given":"Nathan"},{"family":"Svore","given":"Krysta M."},{"family":"Wecker","given":"Dave"},{"family":"Troyer","given":"Matthias"}],"container-title":"Proceedings of the National Academy of Sciences","id":"Reiher2017","issue":"29","issued":{"date-parts":[[2017]]},"page":"7555-7560","publisher":"National Academy of Sciences","title":"Elucidating reaction mechanisms on quantum computers","type":"article-journal","volume":"114"}}],"isEdited":false,"manualOverride":{"citeprocText":"(Reiher et al. 2017)","isManuallyOverridden":false,"manualOverrideText":""},"mendeley":{"formattedCitation":"(Reiher et al. 2017)","plainTextFormattedCitation":"(Reiher et al. 2017)","previouslyFormattedCitation":"(Reiher et al. 2017)"},"properties":{"noteIndex":0},"schema":"https://github.com/citation-style-language/schema/raw/master/csl-citation.json"}</w:instrText>
+        <w:instrText xml:space="preserve">ADDIN CSL_CITATION {"citationID":"MENDELEY_CITATION_389","citationItems":[{"id":"ITEM-389","isTemporary":false,"itemData":{"DOI":"10.1073/pnas.1619152114","author":[{"family":"Reiher","given":"Markus"},{"family":"Wiebe","given":"Nathan"},{"family":"Svore","given":"Krysta M."},{"family":"Wecker","given":"Dave"},{"family":"Troyer","given":"Matthias"}],"container-title":"Proceedings of the National Academy of Sciences","id":"Reiher2017","issue":"29","issued":{"date-parts":[[2017]]},"page":"7555-7560","publisher":"National Academy of Sciences","title":"Elucidating reaction mechanisms on quantum computers","type":"article-journal","volume":"114"}}],"isEdited":false,"manualOverride":{"citeprocText":"(Reiher et al. 2017)","isManuallyOverridden":false,"manualOverrideText":""},"mendeley":{"formattedCitation":"(Reiher et al. 2017)","plainTextFormattedCitation":"(Reiher et al. 2017)","previouslyFormattedCitation":"(Reiher et al. 2017)"},"properties":{"noteIndex":0},"schema":"https://github.com/citation-style-language/schema/raw/master/csl-citation.json"}</w:instrText>
       </w:r>
       <w:r>
         <w:fldChar w:fldCharType="separate"/>
@@ -15677,7 +15867,7 @@
         <w:fldChar w:fldCharType="begin"/>
       </w:r>
       <w:r>
-        <w:instrText xml:space="preserve">ADDIN CSL_CITATION {"citationID":"MENDELEY_CITATION_378","citationItems":[{"id":"ITEM-377","isTemporary":false,"itemData":{"DOI":"10.1109/TMECH.2010.2090896","author":[{"family":"Dong","given":"Daoyi"},{"family":"Chen","given":"Chunlin"},{"family":"Chu","given":"Jian"},{"family":"Tarn","given":"Tzyh-Jong"}],"container-title":"IEEE/ASME Transactions on Mechatronics","id":"Dong2012","issue":"1","issued":{"date-parts":[[2012]]},"page":"86-97","publisher":"IEEE","title":"Robust quantum-inspired reinforcement learning for robot navigation","type":"article-journal","volume":"17"}},{"id":"ITEM-378","isTemporary":false,"itemData":{"DOI":"10.1155/2018/1596080","author":[{"family":"Zuo","given":"Tao"},{"family":"Min","given":"Huasong"},{"family":"Tang","given":"Quan"},{"family":"Tao","given":"Qiang"}],"container-title":"Mathematical Problems in Engineering","id":"Zuo2018","issued":{"date-parts":[[2018]]},"page":"1596080","publisher":"Hindawi","title":"A robot SLAM improved by quantum-behaved particles swarm optimization","type":"article-journal","volume":"2018"}}],"isEdited":false,"manualOverride":{"citeprocText":"(Dong et al. 2012; Zuo et al. 2018)","isManuallyOverridden":false,"manualOverrideText":""},"mendeley":{"formattedCitation":"(Dong et al. 2012; Zuo et al. 2018)","plainTextFormattedCitation":"(Dong et al. 2012; Zuo et al. 2018)","previouslyFormattedCitation":"(Dong et al. 2012; Zuo et al. 2018)"},"properties":{"noteIndex":0},"schema":"https://github.com/citation-style-language/schema/raw/master/csl-citation.json"}</w:instrText>
+        <w:instrText xml:space="preserve">ADDIN CSL_CITATION {"citationID":"MENDELEY_CITATION_391","citationItems":[{"id":"ITEM-390","isTemporary":false,"itemData":{"DOI":"10.1109/TMECH.2010.2090896","author":[{"family":"Dong","given":"Daoyi"},{"family":"Chen","given":"Chunlin"},{"family":"Chu","given":"Jian"},{"family":"Tarn","given":"Tzyh-Jong"}],"container-title":"IEEE/ASME Transactions on Mechatronics","id":"Dong2012","issue":"1","issued":{"date-parts":[[2012]]},"page":"86-97","publisher":"IEEE","title":"Robust quantum-inspired reinforcement learning for robot navigation","type":"article-journal","volume":"17"}},{"id":"ITEM-391","isTemporary":false,"itemData":{"DOI":"10.1155/2018/1596080","author":[{"family":"Zuo","given":"Tao"},{"family":"Min","given":"Huasong"},{"family":"Tang","given":"Quan"},{"family":"Tao","given":"Qiang"}],"container-title":"Mathematical Problems in Engineering","id":"Zuo2018","issued":{"date-parts":[[2018]]},"page":"1596080","publisher":"Hindawi","title":"A robot SLAM improved by quantum-behaved particles swarm optimization","type":"article-journal","volume":"2018"}}],"isEdited":false,"manualOverride":{"citeprocText":"(Dong et al. 2012; Zuo et al. 2018)","isManuallyOverridden":false,"manualOverrideText":""},"mendeley":{"formattedCitation":"(Dong et al. 2012; Zuo et al. 2018)","plainTextFormattedCitation":"(Dong et al. 2012; Zuo et al. 2018)","previouslyFormattedCitation":"(Dong et al. 2012; Zuo et al. 2018)"},"properties":{"noteIndex":0},"schema":"https://github.com/citation-style-language/schema/raw/master/csl-citation.json"}</w:instrText>
       </w:r>
       <w:r>
         <w:fldChar w:fldCharType="separate"/>
@@ -15695,7 +15885,7 @@
         <w:fldChar w:fldCharType="begin"/>
       </w:r>
       <w:r>
-        <w:instrText xml:space="preserve">ADDIN CSL_CITATION {"citationID":"MENDELEY_CITATION_382","citationItems":[{"id":"ITEM-379","isTemporary":false,"itemData":{"DOI":"10.1109/ACCESS.2024.3417808","author":[{"family":"Hohenfeld","given":"Hans"},{"family":"Heimann","given":"Dirk"},{"family":"Wiebe","given":"Felix"},{"family":"Kirchner","given":"Frank"}],"container-title":"IEEE Access","id":"Hohenfeld2024","issued":{"date-parts":[[2024]]},"page":"87217-87236","publisher":"IEEE","title":"Quantum deep reinforcement learning for robot navigation tasks","type":"article-journal","volume":"12"}},{"id":"ITEM-380","isTemporary":false,"itemData":{"DOI":"10.5220/0013371800003890","ISBN":"978-989-758-737-5","author":[{"family":"Drăgan","given":"Theodora-Augustina"},{"family":"Künzner","given":"Alexander"},{"family":"Wille","given":"Robert"},{"family":"Lorenz","given":"Jeanette Miriam"}],"container-title":"Proceedings of the 17th international conference on agents and artificial intelligence (ICAART 2025)","id":"Dragan2025","issued":{"date-parts":[[2025]]},"page":"807-814","publisher":"SciTePress","title":"Continuous quantum reinforcement learning for robot navigation","type":"paper-conference","volume":"1"}},{"id":"ITEM-381","isTemporary":false,"itemData":{"DOI":"10.3389/fcomp.2019.00009","author":[{"family":"Ohzeki","given":"Masayuki"},{"family":"Miki","given":"Akira"},{"family":"Miyama","given":"Masamichi J."},{"family":"Terabe","given":"Masayoshi"}],"container-title":"Frontiers in Computer Science","id":"Ohzeki2019","issued":{"date-parts":[[2019]]},"page":"9","publisher":"Frontiers Media","title":"Control of automated guided vehicles without collision by quantum annealer and digital devices","type":"article-journal","volume":"1"}},{"id":"ITEM-382","isTemporary":false,"itemData":{"DOI":"10.1038/s41598-023-45668-1","author":[{"family":"Leib","given":"Dominik"},{"family":"Seidel","given":"Tobias"},{"family":"Jäger","given":"Sven"},{"family":"Heese","given":"Raoul"},{"family":"Jones","given":"Caitlin Isobel"},{"family":"Awasthi","given":"Abhishek"},{"family":"Niederle","given":"Astrid"},{"family":"Bortz","given":"Michael"}],"container-title":"Scientific Reports","id":"Leib2023","issued":{"date-parts":[[2023]]},"publisher":"Nature Publishing Group","title":"An optimization case study for solving a transport robot scheduling problem on quantum-hybrid and quantum-inspired hardware","type":"article-journal","volume":"13"}}],"isEdited":false,"manualOverride":{"citeprocText":"(Hohenfeld et al. 2024; Drăgan et al. 2025; Ohzeki et al. 2019; Leib et al. 2023)","isManuallyOverridden":false,"manualOverrideText":""},"mendeley":{"formattedCitation":"(Hohenfeld et al. 2024; Drăgan et al. 2025; Ohzeki et al. 2019; Leib et al. 2023)","plainTextFormattedCitation":"(Hohenfeld et al. 2024; Drăgan et al. 2025; Ohzeki et al. 2019; Leib et al. 2023)","previouslyFormattedCitation":"(Hohenfeld et al. 2024; Drăgan et al. 2025; Ohzeki et al. 2019; Leib et al. 2023)"},"properties":{"noteIndex":0},"schema":"https://github.com/citation-style-language/schema/raw/master/csl-citation.json"}</w:instrText>
+        <w:instrText xml:space="preserve">ADDIN CSL_CITATION {"citationID":"MENDELEY_CITATION_395","citationItems":[{"id":"ITEM-392","isTemporary":false,"itemData":{"DOI":"10.1109/ACCESS.2024.3417808","author":[{"family":"Hohenfeld","given":"Hans"},{"family":"Heimann","given":"Dirk"},{"family":"Wiebe","given":"Felix"},{"family":"Kirchner","given":"Frank"}],"container-title":"IEEE Access","id":"Hohenfeld2024","issued":{"date-parts":[[2024]]},"page":"87217-87236","publisher":"IEEE","title":"Quantum deep reinforcement learning for robot navigation tasks","type":"article-journal","volume":"12"}},{"id":"ITEM-393","isTemporary":false,"itemData":{"DOI":"10.5220/0013371800003890","ISBN":"978-989-758-737-5","author":[{"family":"Drăgan","given":"Theodora-Augustina"},{"family":"Künzner","given":"Alexander"},{"family":"Wille","given":"Robert"},{"family":"Lorenz","given":"Jeanette Miriam"}],"container-title":"Proceedings of the 17th international conference on agents and artificial intelligence (ICAART 2025)","id":"Dragan2025","issued":{"date-parts":[[2025]]},"page":"807-814","publisher":"SciTePress","title":"Continuous quantum reinforcement learning for robot navigation","type":"paper-conference","volume":"1"}},{"id":"ITEM-394","isTemporary":false,"itemData":{"DOI":"10.3389/fcomp.2019.00009","author":[{"family":"Ohzeki","given":"Masayuki"},{"family":"Miki","given":"Akira"},{"family":"Miyama","given":"Masamichi J."},{"family":"Terabe","given":"Masayoshi"}],"container-title":"Frontiers in Computer Science","id":"Ohzeki2019","issued":{"date-parts":[[2019]]},"page":"9","publisher":"Frontiers Media","title":"Control of automated guided vehicles without collision by quantum annealer and digital devices","type":"article-journal","volume":"1"}},{"id":"ITEM-395","isTemporary":false,"itemData":{"DOI":"10.1038/s41598-023-45668-1","author":[{"family":"Leib","given":"Dominik"},{"family":"Seidel","given":"Tobias"},{"family":"Jäger","given":"Sven"},{"family":"Heese","given":"Raoul"},{"family":"Jones","given":"Caitlin Isobel"},{"family":"Awasthi","given":"Abhishek"},{"family":"Niederle","given":"Astrid"},{"family":"Bortz","given":"Michael"}],"container-title":"Scientific Reports","id":"Leib2023","issued":{"date-parts":[[2023]]},"publisher":"Nature Publishing Group","title":"An optimization case study for solving a transport robot scheduling problem on quantum-hybrid and quantum-inspired hardware","type":"article-journal","volume":"13"}}],"isEdited":false,"manualOverride":{"citeprocText":"(Hohenfeld et al. 2024; Drăgan et al. 2025; Ohzeki et al. 2019; Leib et al. 2023)","isManuallyOverridden":false,"manualOverrideText":""},"mendeley":{"formattedCitation":"(Hohenfeld et al. 2024; Drăgan et al. 2025; Ohzeki et al. 2019; Leib et al. 2023)","plainTextFormattedCitation":"(Hohenfeld et al. 2024; Drăgan et al. 2025; Ohzeki et al. 2019; Leib et al. 2023)","previouslyFormattedCitation":"(Hohenfeld et al. 2024; Drăgan et al. 2025; Ohzeki et al. 2019; Leib et al. 2023)"},"properties":{"noteIndex":0},"schema":"https://github.com/citation-style-language/schema/raw/master/csl-citation.json"}</w:instrText>
       </w:r>
       <w:r>
         <w:fldChar w:fldCharType="separate"/>
@@ -15876,7 +16066,7 @@
               <w:fldChar w:fldCharType="begin"/>
             </w:r>
             <w:r>
-              <w:instrText xml:space="preserve">ADDIN CSL_CITATION {"citationID":"MENDELEY_CITATION_388","citationItems":[{"id":"ITEM-383","isTemporary":false,"itemData":{"DOI":"10.3389/fcomp.2019.00009","author":[{"family":"Ohzeki","given":"Masayuki"},{"family":"Miki","given":"Akira"},{"family":"Miyama","given":"Masamichi J."},{"family":"Terabe","given":"Masayoshi"}],"container-title":"Frontiers in Computer Science","id":"Ohzeki2019","issued":{"date-parts":[[2019]]},"page":"9","publisher":"Frontiers Media","title":"Control of automated guided vehicles without collision by quantum annealer and digital devices","type":"article-journal","volume":"1"}},{"id":"ITEM-384","isTemporary":false,"itemData":{"DOI":"10.1145/3293320.3293333","author":[{"family":"Clark","given":"James"},{"family":"West","given":"Tristan"},{"family":"Zammit","given":"Joseph Paul"},{"family":"Guo","given":"Xiaohu"},{"family":"Mason","given":"Luke"},{"family":"Russell","given":"Duncan"}],"container-title":"Proceedings of the international conference on high performance computing in asia-pacific region (HPC Asia 2019)","id":"Clark2019","issued":{"date-parts":[[2019]]},"page":"111-119","publisher":"ACM","publisher-place":"New York, NY, USA","title":"Towards real time multi-robot routing using quantum computing technologies","type":"paper-conference"}},{"id":"ITEM-385","isTemporary":false,"itemData":{"DOI":"10.1038/s41598-025-28481-w","author":[{"family":"Quang","given":"Thinh Nguyen"},{"family":"Matsuyama","given":"Kosuke"},{"family":"Shimizu","given":"Keisuke"},{"family":"Sugano","given":"Hiroki"},{"family":"Kurimoto","given":"Eiji"},{"family":"Miki","given":"Masahiro"},{"family":"Suzuki","given":"Jumpei"},{"family":"Chen","given":"Ziyi"},{"family":"Waidyasooriya","given":"Hasitha Muthumala"},{"family":"Hariyama","given":"Masanori"},{"family":"Hitomi","given":"Masaru"},{"family":"Sawamura","given":"Kenta"},{"family":"Ohzeki","given":"Masayuki"}],"container-title":"Scientific Reports","id":"Quang2025","issued":{"date-parts":[[2025]]},"page":"44047","publisher":"Nature Publishing Group","title":"Quantum annealing-based route optimization for commercial AGV operating systems in large-scale logistics warehouses","type":"article-journal","volume":"15"}},{"id":"ITEM-386","isTemporary":false,"itemData":{"DOI":"10.1038/s41598-024-72101-y","author":[{"family":"Śmierzchalski","given":"Tomasz"},{"family":"Pawłowski","given":"Jakub"},{"family":"Przybysz","given":"Artur"},{"family":"Pawela","given":"Łukasz"},{"family":"Puchała","given":"Zbigniew"},{"family":"Koniorczyk","given":"Mátyás"},{"family":"Gardas","given":"Bartłomiej"},{"family":"Deffner","given":"Sebastian"},{"family":"Domino","given":"Krzysztof"}],"container-title":"Scientific Reports","id":"Smierzchalski2024","issued":{"date-parts":[[2024]]},"page":"21809","publisher":"Nature Publishing Group","title":"Hybrid quantum-classical computation for automatic guided vehicles scheduling","type":"article-journal","volume":"14"}},{"id":"ITEM-387","isTemporary":false,"itemData":{"DOI":"10.1038/s41598-023-45668-1","author":[{"family":"Leib","given":"Dominik"},{"family":"Seidel","given":"Tobias"},{"family":"Jäger","given":"Sven"},{"family":"Heese","given":"Raoul"},{"family":"Jones","given":"Caitlin Isobel"},{"family":"Awasthi","given":"Abhishek"},{"family":"Niederle","given":"Astrid"},{"family":"Bortz","given":"Michael"}],"container-title":"Scientific Reports","id":"Leib2023","issued":{"date-parts":[[2023]]},"publisher":"Nature Publishing Group","title":"An optimization case study for solving a transport robot scheduling problem on quantum-hybrid and quantum-inspired hardware","type":"article-journal","volume":"13"}},{"id":"ITEM-388","isTemporary":false,"itemData":{"DOI":"10.1515/auto-2023-0072","author":[{"family":"Windmann","given":"Stefan"}],"container-title":"at – Automatisierungstechnik","id":"Windmann2023","issued":{"date-parts":[[2023]]},"title":"Quantum computer-aided job scheduling for storage and retrieval systems","type":"article-journal"}}],"isEdited":false,"manualOverride":{"citeprocText":"(Ohzeki et al. 2019; Clark et al. 2019; Quang et al. 2025; Śmierzchalski et al. 2024; Leib et al. 2023; Windmann 2023)","isManuallyOverridden":false,"manualOverrideText":""},"mendeley":{"formattedCitation":"(Ohzeki et al. 2019; Clark et al. 2019; Quang et al. 2025; Śmierzchalski et al. 2024; Leib et al. 2023; Windmann 2023)","plainTextFormattedCitation":"(Ohzeki et al. 2019; Clark et al. 2019; Quang et al. 2025; Śmierzchalski et al. 2024; Leib et al. 2023; Windmann 2023)","previouslyFormattedCitation":"(Ohzeki et al. 2019; Clark et al. 2019; Quang et al. 2025; Śmierzchalski et al. 2024; Leib et al. 2023; Windmann 2023)"},"properties":{"noteIndex":0},"schema":"https://github.com/citation-style-language/schema/raw/master/csl-citation.json"}</w:instrText>
+              <w:instrText xml:space="preserve">ADDIN CSL_CITATION {"citationID":"MENDELEY_CITATION_401","citationItems":[{"id":"ITEM-396","isTemporary":false,"itemData":{"DOI":"10.3389/fcomp.2019.00009","author":[{"family":"Ohzeki","given":"Masayuki"},{"family":"Miki","given":"Akira"},{"family":"Miyama","given":"Masamichi J."},{"family":"Terabe","given":"Masayoshi"}],"container-title":"Frontiers in Computer Science","id":"Ohzeki2019","issued":{"date-parts":[[2019]]},"page":"9","publisher":"Frontiers Media","title":"Control of automated guided vehicles without collision by quantum annealer and digital devices","type":"article-journal","volume":"1"}},{"id":"ITEM-397","isTemporary":false,"itemData":{"DOI":"10.1145/3293320.3293333","author":[{"family":"Clark","given":"James"},{"family":"West","given":"Tristan"},{"family":"Zammit","given":"Joseph Paul"},{"family":"Guo","given":"Xiaohu"},{"family":"Mason","given":"Luke"},{"family":"Russell","given":"Duncan"}],"container-title":"Proceedings of the international conference on high performance computing in asia-pacific region (HPC Asia 2019)","id":"Clark2019","issued":{"date-parts":[[2019]]},"page":"111-119","publisher":"ACM","publisher-place":"New York, NY, USA","title":"Towards real time multi-robot routing using quantum computing technologies","type":"paper-conference"}},{"id":"ITEM-398","isTemporary":false,"itemData":{"DOI":"10.1038/s41598-025-28481-w","author":[{"family":"Quang","given":"Thinh Nguyen"},{"family":"Matsuyama","given":"Kosuke"},{"family":"Shimizu","given":"Keisuke"},{"family":"Sugano","given":"Hiroki"},{"family":"Kurimoto","given":"Eiji"},{"family":"Miki","given":"Masahiro"},{"family":"Suzuki","given":"Jumpei"},{"family":"Chen","given":"Ziyi"},{"family":"Waidyasooriya","given":"Hasitha Muthumala"},{"family":"Hariyama","given":"Masanori"},{"family":"Hitomi","given":"Masaru"},{"family":"Sawamura","given":"Kenta"},{"family":"Ohzeki","given":"Masayuki"}],"container-title":"Scientific Reports","id":"Quang2025","issued":{"date-parts":[[2025]]},"page":"44047","publisher":"Nature Publishing Group","title":"Quantum annealing-based route optimization for commercial AGV operating systems in large-scale logistics warehouses","type":"article-journal","volume":"15"}},{"id":"ITEM-399","isTemporary":false,"itemData":{"DOI":"10.1038/s41598-024-72101-y","author":[{"family":"Śmierzchalski","given":"Tomasz"},{"family":"Pawłowski","given":"Jakub"},{"family":"Przybysz","given":"Artur"},{"family":"Pawela","given":"Łukasz"},{"family":"Puchała","given":"Zbigniew"},{"family":"Koniorczyk","given":"Mátyás"},{"family":"Gardas","given":"Bartłomiej"},{"family":"Deffner","given":"Sebastian"},{"family":"Domino","given":"Krzysztof"}],"container-title":"Scientific Reports","id":"Smierzchalski2024","issued":{"date-parts":[[2024]]},"page":"21809","publisher":"Nature Publishing Group","title":"Hybrid quantum-classical computation for automatic guided vehicles scheduling","type":"article-journal","volume":"14"}},{"id":"ITEM-400","isTemporary":false,"itemData":{"DOI":"10.1038/s41598-023-45668-1","author":[{"family":"Leib","given":"Dominik"},{"family":"Seidel","given":"Tobias"},{"family":"Jäger","given":"Sven"},{"family":"Heese","given":"Raoul"},{"family":"Jones","given":"Caitlin Isobel"},{"family":"Awasthi","given":"Abhishek"},{"family":"Niederle","given":"Astrid"},{"family":"Bortz","given":"Michael"}],"container-title":"Scientific Reports","id":"Leib2023","issued":{"date-parts":[[2023]]},"publisher":"Nature Publishing Group","title":"An optimization case study for solving a transport robot scheduling problem on quantum-hybrid and quantum-inspired hardware","type":"article-journal","volume":"13"}},{"id":"ITEM-401","isTemporary":false,"itemData":{"DOI":"10.1515/auto-2023-0072","author":[{"family":"Windmann","given":"Stefan"}],"container-title":"at – Automatisierungstechnik","id":"Windmann2023","issued":{"date-parts":[[2023]]},"title":"Quantum computer-aided job scheduling for storage and retrieval systems","type":"article-journal"}}],"isEdited":false,"manualOverride":{"citeprocText":"(Ohzeki et al. 2019; Clark et al. 2019; Quang et al. 2025; Śmierzchalski et al. 2024; Leib et al. 2023; Windmann 2023)","isManuallyOverridden":false,"manualOverrideText":""},"mendeley":{"formattedCitation":"(Ohzeki et al. 2019; Clark et al. 2019; Quang et al. 2025; Śmierzchalski et al. 2024; Leib et al. 2023; Windmann 2023)","plainTextFormattedCitation":"(Ohzeki et al. 2019; Clark et al. 2019; Quang et al. 2025; Śmierzchalski et al. 2024; Leib et al. 2023; Windmann 2023)","previouslyFormattedCitation":"(Ohzeki et al. 2019; Clark et al. 2019; Quang et al. 2025; Śmierzchalski et al. 2024; Leib et al. 2023; Windmann 2023)"},"properties":{"noteIndex":0},"schema":"https://github.com/citation-style-language/schema/raw/master/csl-citation.json"}</w:instrText>
             </w:r>
             <w:r>
               <w:fldChar w:fldCharType="separate"/>
@@ -15953,7 +16143,7 @@
               <w:fldChar w:fldCharType="begin"/>
             </w:r>
             <w:r>
-              <w:instrText xml:space="preserve">ADDIN CSL_CITATION {"citationID":"MENDELEY_CITATION_390","citationItems":[{"id":"ITEM-389","isTemporary":false,"itemData":{"URL":"https://proceedings.mlr.press/v267/gerlach25a.html","author":[{"family":"Gerlach","given":"Thore"},{"family":"Lee","given":"Loong Kuan"},{"family":"Barbaresco","given":"Frederic"},{"family":"Piatkowski","given":"Nico"}],"collection-title":"Proceedings of machine learning research","container-title":"Proceedings of the 42nd international conference on machine learning","editor":[{"family":"Singh","given":"Aarti"},{"family":"Fazel","given":"Maryam"},{"family":"Hsu","given":"Daniel"},{"family":"Lacoste-Julien","given":"Simon"},{"family":"Berkenkamp","given":"Felix"},{"family":"Maharaj","given":"Tegan"},{"family":"Wagstaff","given":"Kiri"},{"family":"Zhu","given":"Jerry"}],"id":"Gerlach2025","issued":{"date-parts":[[2025]]},"page":"19161-19171","publisher":"PMLR","title":"Hybrid quantum-classical multi-agent pathfinding","type":"paper-conference","volume":"267"}},{"id":"ITEM-390","isTemporary":false,"itemData":{"URL":"https://arxiv.org/abs/2602.14799","author":[{"family":"González Villasmil","given":"Javier"}],"id":"GonzalezVillasmil2026","issued":{"date-parts":[[2026]]},"title":"Scalable multi-robot path planning via quadratic unconstrained binary optimization","type":""}}],"isEdited":false,"manualOverride":{"citeprocText":"(Gerlach et al. 2025; González Villasmil 2026)","isManuallyOverridden":false,"manualOverrideText":""},"mendeley":{"formattedCitation":"(Gerlach et al. 2025; González Villasmil 2026)","plainTextFormattedCitation":"(Gerlach et al. 2025; González Villasmil 2026)","previouslyFormattedCitation":"(Gerlach et al. 2025; González Villasmil 2026)"},"properties":{"noteIndex":0},"schema":"https://github.com/citation-style-language/schema/raw/master/csl-citation.json"}</w:instrText>
+              <w:instrText xml:space="preserve">ADDIN CSL_CITATION {"citationID":"MENDELEY_CITATION_403","citationItems":[{"id":"ITEM-402","isTemporary":false,"itemData":{"URL":"https://proceedings.mlr.press/v267/gerlach25a.html","author":[{"family":"Gerlach","given":"Thore"},{"family":"Lee","given":"Loong Kuan"},{"family":"Barbaresco","given":"Frederic"},{"family":"Piatkowski","given":"Nico"}],"collection-title":"Proceedings of machine learning research","container-title":"Proceedings of the 42nd international conference on machine learning","editor":[{"family":"Singh","given":"Aarti"},{"family":"Fazel","given":"Maryam"},{"family":"Hsu","given":"Daniel"},{"family":"Lacoste-Julien","given":"Simon"},{"family":"Berkenkamp","given":"Felix"},{"family":"Maharaj","given":"Tegan"},{"family":"Wagstaff","given":"Kiri"},{"family":"Zhu","given":"Jerry"}],"id":"Gerlach2025","issued":{"date-parts":[[2025]]},"page":"19161-19171","publisher":"PMLR","title":"Hybrid quantum-classical multi-agent pathfinding","type":"paper-conference","volume":"267"}},{"id":"ITEM-403","isTemporary":false,"itemData":{"URL":"https://arxiv.org/abs/2602.14799","author":[{"family":"González Villasmil","given":"Javier"}],"id":"GonzalezVillasmil2026","issued":{"date-parts":[[2026]]},"title":"Scalable multi-robot path planning via quadratic unconstrained binary optimization","type":""}}],"isEdited":false,"manualOverride":{"citeprocText":"(Gerlach et al. 2025; González Villasmil 2026)","isManuallyOverridden":false,"manualOverrideText":""},"mendeley":{"formattedCitation":"(Gerlach et al. 2025; González Villasmil 2026)","plainTextFormattedCitation":"(Gerlach et al. 2025; González Villasmil 2026)","previouslyFormattedCitation":"(Gerlach et al. 2025; González Villasmil 2026)"},"properties":{"noteIndex":0},"schema":"https://github.com/citation-style-language/schema/raw/master/csl-citation.json"}</w:instrText>
             </w:r>
             <w:r>
               <w:fldChar w:fldCharType="separate"/>
@@ -16030,7 +16220,7 @@
               <w:fldChar w:fldCharType="begin"/>
             </w:r>
             <w:r>
-              <w:instrText xml:space="preserve">ADDIN CSL_CITATION {"citationID":"MENDELEY_CITATION_393","citationItems":[{"id":"ITEM-391","isTemporary":false,"itemData":{"DOI":"10.1103/PhysRevApplied.18.054045","author":[{"family":"Schuetz","given":"Martin J. A."},{"family":"Brubaker","given":"J. Kyle"},{"family":"Montagu","given":"Henry"},{"dropping-particle":"van","family":"Dijk","given":"Yannick"},{"family":"Klepsch","given":"Johannes"},{"family":"Ross","given":"Philipp"},{"family":"Luckow","given":"Andre"},{"family":"Resende","given":"Mauricio G. C."},{"family":"Katzgraber","given":"Helmut G."}],"container-title":"Physical Review Applied","id":"Schuetz2022","issue":"5","issued":{"date-parts":[[2022]]},"page":"054045","publisher":"American Physical Society","title":"Optimization of robot-trajectory planning with nature-inspired and hybrid quantum algorithms","type":"article-journal","volume":"18"}},{"id":"ITEM-392","isTemporary":false,"itemData":{"DOI":"10.1016/j.procir.2025.01.099","author":[{"family":"Willmann","given":"Moritz"},{"family":"Albus","given":"Marcel"},{"family":"Schnabel","given":"Jan"},{"family":"Roth","given":"Marco"}],"container-title":"Procedia CIRP","id":"Willmann2025","issued":{"date-parts":[[2025]]},"note":"58th CIRP Conference on Manufacturing Systems","page":"25-30","publisher":"Elsevier","title":"Application of quantum annealing for scalable robotic assembly line optimization: A case study","title-short":"Application of quantum annealing for scalable robotic assembly line optimization","type":"article-journal","volume":"134"}},{"id":"ITEM-393","isTemporary":false,"itemData":{"DOI":"10.1109/QCE65121.2025.10359","author":[{"family":"Osaba","given":"Eneko"},{"family":"Garrote","given":"Estibaliz"},{"family":"Miranda-Rodriguez","given":"Pablo"},{"family":"Ciacco","given":"Alessia"},{"family":"Cabanes","given":"Itziar"},{"family":"Mancisidor","given":"Aitziber"}],"container-title":"2025 IEEE international conference on quantum computing and engineering (QCE)","id":"Osaba2025","issued":{"date-parts":[[2025]]},"page":"388-389","publisher":"IEEE","publisher-place":"Albuquerque, NM, USA","title":"Quantum-assisted automatic path-planning for robotic quality inspection in Industry 4.0","type":"paper-conference","volume":"2"}}],"isEdited":false,"manualOverride":{"citeprocText":"(Schuetz et al. 2022; Willmann et al. 2025; Osaba, Garrote, et al. 2025)","isManuallyOverridden":false,"manualOverrideText":""},"mendeley":{"formattedCitation":"(Schuetz et al. 2022; Willmann et al. 2025; Osaba, Garrote, et al. 2025)","plainTextFormattedCitation":"(Schuetz et al. 2022; Willmann et al. 2025; Osaba, Garrote, et al. 2025)","previouslyFormattedCitation":"(Schuetz et al. 2022; Willmann et al. 2025; Osaba, Garrote, et al. 2025)"},"properties":{"noteIndex":0},"schema":"https://github.com/citation-style-language/schema/raw/master/csl-citation.json"}</w:instrText>
+              <w:instrText xml:space="preserve">ADDIN CSL_CITATION {"citationID":"MENDELEY_CITATION_406","citationItems":[{"id":"ITEM-404","isTemporary":false,"itemData":{"DOI":"10.1103/PhysRevApplied.18.054045","author":[{"family":"Schuetz","given":"Martin J. A."},{"family":"Brubaker","given":"J. Kyle"},{"family":"Montagu","given":"Henry"},{"dropping-particle":"van","family":"Dijk","given":"Yannick"},{"family":"Klepsch","given":"Johannes"},{"family":"Ross","given":"Philipp"},{"family":"Luckow","given":"Andre"},{"family":"Resende","given":"Mauricio G. C."},{"family":"Katzgraber","given":"Helmut G."}],"container-title":"Physical Review Applied","id":"Schuetz2022","issue":"5","issued":{"date-parts":[[2022]]},"page":"054045","publisher":"American Physical Society","title":"Optimization of robot-trajectory planning with nature-inspired and hybrid quantum algorithms","type":"article-journal","volume":"18"}},{"id":"ITEM-405","isTemporary":false,"itemData":{"DOI":"10.1016/j.procir.2025.01.099","author":[{"family":"Willmann","given":"Moritz"},{"family":"Albus","given":"Marcel"},{"family":"Schnabel","given":"Jan"},{"family":"Roth","given":"Marco"}],"container-title":"Procedia CIRP","id":"Willmann2025","issued":{"date-parts":[[2025]]},"note":"58th CIRP Conference on Manufacturing Systems","page":"25-30","publisher":"Elsevier","title":"Application of quantum annealing for scalable robotic assembly line optimization: A case study","title-short":"Application of quantum annealing for scalable robotic assembly line optimization","type":"article-journal","volume":"134"}},{"id":"ITEM-406","isTemporary":false,"itemData":{"DOI":"10.1109/QCE65121.2025.10359","author":[{"family":"Osaba","given":"Eneko"},{"family":"Garrote","given":"Estibaliz"},{"family":"Miranda-Rodriguez","given":"Pablo"},{"family":"Ciacco","given":"Alessia"},{"family":"Cabanes","given":"Itziar"},{"family":"Mancisidor","given":"Aitziber"}],"container-title":"2025 IEEE international conference on quantum computing and engineering (QCE)","id":"Osaba2025","issued":{"date-parts":[[2025]]},"page":"388-389","publisher":"IEEE","publisher-place":"Albuquerque, NM, USA","title":"Quantum-assisted automatic path-planning for robotic quality inspection in Industry 4.0","type":"paper-conference","volume":"2"}}],"isEdited":false,"manualOverride":{"citeprocText":"(Schuetz et al. 2022; Willmann et al. 2025; Osaba, Garrote, et al. 2025)","isManuallyOverridden":false,"manualOverrideText":""},"mendeley":{"formattedCitation":"(Schuetz et al. 2022; Willmann et al. 2025; Osaba, Garrote, et al. 2025)","plainTextFormattedCitation":"(Schuetz et al. 2022; Willmann et al. 2025; Osaba, Garrote, et al. 2025)","previouslyFormattedCitation":"(Schuetz et al. 2022; Willmann et al. 2025; Osaba, Garrote, et al. 2025)"},"properties":{"noteIndex":0},"schema":"https://github.com/citation-style-language/schema/raw/master/csl-citation.json"}</w:instrText>
             </w:r>
             <w:r>
               <w:fldChar w:fldCharType="separate"/>
@@ -16107,7 +16297,7 @@
               <w:fldChar w:fldCharType="begin"/>
             </w:r>
             <w:r>
-              <w:instrText xml:space="preserve">ADDIN CSL_CITATION {"citationID":"MENDELEY_CITATION_394","citationItems":[{"id":"ITEM-394","isTemporary":false,"itemData":{"DOI":"10.3390/a14070194","author":[{"family":"Atchade-Adelomou","given":"Parfait"},{"family":"Alonso-Linaje","given":"Guillermo"},{"family":"Albo-Canals","given":"Jordi"},{"family":"Casado-Fauli","given":"Daniel"}],"container-title":"Algorithms","id":"AtchadeAdelomou2021","issue":"7","issued":{"date-parts":[[2021]]},"page":"194","publisher":"MDPI","title":"qRobot: A quantum computing approach in mobile robot order picking and batching problem solver optimization","title-short":"qRobot","type":"article-journal","volume":"14"}}],"isEdited":false,"manualOverride":{"citeprocText":"(Atchade-Adelomou et al. 2021)","isManuallyOverridden":false,"manualOverrideText":""},"mendeley":{"formattedCitation":"(Atchade-Adelomou et al. 2021)","plainTextFormattedCitation":"(Atchade-Adelomou et al. 2021)","previouslyFormattedCitation":"(Atchade-Adelomou et al. 2021)"},"properties":{"noteIndex":0},"schema":"https://github.com/citation-style-language/schema/raw/master/csl-citation.json"}</w:instrText>
+              <w:instrText xml:space="preserve">ADDIN CSL_CITATION {"citationID":"MENDELEY_CITATION_407","citationItems":[{"id":"ITEM-407","isTemporary":false,"itemData":{"DOI":"10.3390/a14070194","author":[{"family":"Atchade-Adelomou","given":"Parfait"},{"family":"Alonso-Linaje","given":"Guillermo"},{"family":"Albo-Canals","given":"Jordi"},{"family":"Casado-Fauli","given":"Daniel"}],"container-title":"Algorithms","id":"AtchadeAdelomou2021","issue":"7","issued":{"date-parts":[[2021]]},"page":"194","publisher":"MDPI","title":"qRobot: A quantum computing approach in mobile robot order picking and batching problem solver optimization","title-short":"qRobot","type":"article-journal","volume":"14"}}],"isEdited":false,"manualOverride":{"citeprocText":"(Atchade-Adelomou et al. 2021)","isManuallyOverridden":false,"manualOverrideText":""},"mendeley":{"formattedCitation":"(Atchade-Adelomou et al. 2021)","plainTextFormattedCitation":"(Atchade-Adelomou et al. 2021)","previouslyFormattedCitation":"(Atchade-Adelomou et al. 2021)"},"properties":{"noteIndex":0},"schema":"https://github.com/citation-style-language/schema/raw/master/csl-citation.json"}</w:instrText>
             </w:r>
             <w:r>
               <w:fldChar w:fldCharType="separate"/>
@@ -16184,7 +16374,7 @@
               <w:fldChar w:fldCharType="begin"/>
             </w:r>
             <w:r>
-              <w:instrText xml:space="preserve">ADDIN CSL_CITATION {"citationID":"MENDELEY_CITATION_397","citationItems":[{"id":"ITEM-395","isTemporary":false,"itemData":{"DOI":"10.1038/s41598-025-12109-0","author":[{"family":"Otani","given":"Takuya"},{"family":"Takanishi","given":"Atsuo"},{"family":"Hara","given":"Nobuyuki"},{"family":"Takita","given":"Yutaka"},{"family":"Kimura","given":"Koichi"}],"container-title":"Scientific Reports","id":"Otani2025","issued":{"date-parts":[[2025]]},"page":"28508","publisher":"Nature Publishing Group","title":"Quantum computation for robot posture optimization","type":"article-journal","volume":"15"}},{"id":"ITEM-396","isTemporary":false,"itemData":{"DOI":"10.1038/s41598-025-34346-z","author":[{"family":"Salloum","given":"Hadi"},{"family":"Savin","given":"Sergei"},{"family":"Kholodov","given":"Yaroslav"},{"family":"Ryzhakov","given":"Gleb"},{"family":"Farina","given":"Mirko"},{"family":"Oseledets","given":"Ivan"}],"container-title":"Scientific Reports","id":"Salloum2026","issued":{"date-parts":[[2026]]},"page":"4244","publisher":"Nature Publishing Group","title":"Quantum annealing for inverse kinematics in robotics","type":"article-journal","volume":"16"}},{"id":"ITEM-397","isTemporary":false,"itemData":{"author":[{"family":"Nigatu","given":"Hassen"},{"family":"Shi","given":"Gaokun"},{"family":"Li","given":"Jituo"},{"family":"Wang","given":"Jin"},{"family":"Lu","given":"Guodong"},{"family":"Li","given":"Howard"}],"container-title":"IEEE Robotics and Automation Letters","id":"Nigatu2025","issued":{"date-parts":[[2025]]},"note":"Accepted October 2025; preprint arXiv:2509.07216","title":"Quantum machine learning and Grover’s algorithm for quantum optimization of robotic manipulators","type":"article-journal"}}],"isEdited":false,"manualOverride":{"citeprocText":"(Otani et al. 2025; Salloum et al. 2026; Nigatu et al. 2025)","isManuallyOverridden":false,"manualOverrideText":""},"mendeley":{"formattedCitation":"(Otani et al. 2025; Salloum et al. 2026; Nigatu et al. 2025)","plainTextFormattedCitation":"(Otani et al. 2025; Salloum et al. 2026; Nigatu et al. 2025)","previouslyFormattedCitation":"(Otani et al. 2025; Salloum et al. 2026; Nigatu et al. 2025)"},"properties":{"noteIndex":0},"schema":"https://github.com/citation-style-language/schema/raw/master/csl-citation.json"}</w:instrText>
+              <w:instrText xml:space="preserve">ADDIN CSL_CITATION {"citationID":"MENDELEY_CITATION_410","citationItems":[{"id":"ITEM-408","isTemporary":false,"itemData":{"DOI":"10.1038/s41598-025-12109-0","author":[{"family":"Otani","given":"Takuya"},{"family":"Takanishi","given":"Atsuo"},{"family":"Hara","given":"Nobuyuki"},{"family":"Takita","given":"Yutaka"},{"family":"Kimura","given":"Koichi"}],"container-title":"Scientific Reports","id":"Otani2025","issued":{"date-parts":[[2025]]},"page":"28508","publisher":"Nature Publishing Group","title":"Quantum computation for robot posture optimization","type":"article-journal","volume":"15"}},{"id":"ITEM-409","isTemporary":false,"itemData":{"DOI":"10.1038/s41598-025-34346-z","author":[{"family":"Salloum","given":"Hadi"},{"family":"Savin","given":"Sergei"},{"family":"Kholodov","given":"Yaroslav"},{"family":"Ryzhakov","given":"Gleb"},{"family":"Farina","given":"Mirko"},{"family":"Oseledets","given":"Ivan"}],"container-title":"Scientific Reports","id":"Salloum2026","issued":{"date-parts":[[2026]]},"page":"4244","publisher":"Nature Publishing Group","title":"Quantum annealing for inverse kinematics in robotics","type":"article-journal","volume":"16"}},{"id":"ITEM-410","isTemporary":false,"itemData":{"author":[{"family":"Nigatu","given":"Hassen"},{"family":"Shi","given":"Gaokun"},{"family":"Li","given":"Jituo"},{"family":"Wang","given":"Jin"},{"family":"Lu","given":"Guodong"},{"family":"Li","given":"Howard"}],"container-title":"IEEE Robotics and Automation Letters","id":"Nigatu2025","issued":{"date-parts":[[2025]]},"note":"Accepted October 2025; preprint arXiv:2509.07216","title":"Quantum machine learning and Grover’s algorithm for quantum optimization of robotic manipulators","type":"article-journal"}}],"isEdited":false,"manualOverride":{"citeprocText":"(Otani et al. 2025; Salloum et al. 2026; Nigatu et al. 2025)","isManuallyOverridden":false,"manualOverrideText":""},"mendeley":{"formattedCitation":"(Otani et al. 2025; Salloum et al. 2026; Nigatu et al. 2025)","plainTextFormattedCitation":"(Otani et al. 2025; Salloum et al. 2026; Nigatu et al. 2025)","previouslyFormattedCitation":"(Otani et al. 2025; Salloum et al. 2026; Nigatu et al. 2025)"},"properties":{"noteIndex":0},"schema":"https://github.com/citation-style-language/schema/raw/master/csl-citation.json"}</w:instrText>
             </w:r>
             <w:r>
               <w:fldChar w:fldCharType="separate"/>
@@ -16261,13 +16451,13 @@
               <w:fldChar w:fldCharType="begin"/>
             </w:r>
             <w:r>
-              <w:instrText xml:space="preserve">ADDIN CSL_CITATION {"citationID":"MENDELEY_CITATION_400","citationItems":[{"id":"ITEM-398","isTemporary":false,"itemData":{"DOI":"10.3390/math10142475","author":[{"family":"Chella","given":"Antonio"},{"family":"Gaglio","given":"Salvatore"},{"family":"Pilato","given":"Giovanni"},{"family":"Vella","given":"Filippo"},{"family":"Zammuto","given":"Salvatore"}],"container-title":"Mathematics","id":"Chella2022","issue":"14","issued":{"date-parts":[[2022]]},"page":"2475","publisher":"MDPI","title":"A quantum planner for robot motion","type":"article-journal","volume":"10"}},{"id":"ITEM-399","isTemporary":false,"itemData":{"DOI":"10.1016/j.robot.2023.104362","author":[{"family":"Chella","given":"Antonio"},{"family":"Gaglio","given":"Salvatore"},{"family":"Mannone","given":"Maria"},{"family":"Pilato","given":"Giovanni"},{"family":"Seidita","given":"Valeria"},{"family":"Vella","given":"Filippo"},{"family":"Zammuto","given":"Salvatore"}],"container-title":"Robotics and Autonomous Systems","id":"Chella2023","issued":{"date-parts":[[2023]]},"page":"104362","publisher":"Elsevier","title":"Quantum planning for swarm robotics","type":"article-journal","volume":"161"}},{"id":"ITEM-400","isTemporary":false,"itemData":{"DOI":"10.1109/ACCESS.2023.3307316","author":[{"family":"Lathrop","given":"Paul"},{"family":"Boardman","given":"Beth"},{"family":"Martínez","given":"Sonia"}],"container-title":"IEEE Access","id":"Lathrop2023","issued":{"date-parts":[[2023]]},"page":"89506-89519","title":"Quantum search approaches to sampling-based motion planning","type":"article-journal","volume":"11"}}],"isEdited":false,"manualOverride":{"citeprocText":"(Chella et al. 2022, 2023; Lathrop, Boardman, and Martínez 2023)","isManuallyOverridden":false,"manualOverrideText":""},"mendeley":{"formattedCitation":"(Chella et al. 2022, 2023; Lathrop, Boardman, and Martínez 2023)","plainTextFormattedCitation":"(Chella et al. 2022, 2023; Lathrop, Boardman, and Martínez 2023)","previouslyFormattedCitation":"(Chella et al. 2022, 2023; Lathrop, Boardman, and Martínez 2023)"},"properties":{"noteIndex":0},"schema":"https://github.com/citation-style-language/schema/raw/master/csl-citation.json"}</w:instrText>
+              <w:instrText xml:space="preserve">ADDIN CSL_CITATION {"citationID":"MENDELEY_CITATION_414","citationItems":[{"id":"ITEM-411","isTemporary":false,"itemData":{"URL":"https://arxiv.org/abs/quant-ph/0003006","author":[{"family":"Benioff","given":"Paul"}],"collection-title":"Contemporary mathematics","container-title":"Quantum computation and information","editor":[{"family":"Lomonaco","given":"Samuel J.","suffix":"Jr."},{"family":"Brandt","given":"Howard E."}],"id":"Benioff2002","issued":{"date-parts":[[2002]]},"publisher":"American Mathematical Society","publisher-place":"Providence, RI","title":"Space searches with a quantum robot","type":"chapter","volume":"305"}},{"id":"ITEM-412","isTemporary":false,"itemData":{"DOI":"10.3390/math10142475","author":[{"family":"Chella","given":"Antonio"},{"family":"Gaglio","given":"Salvatore"},{"family":"Pilato","given":"Giovanni"},{"family":"Vella","given":"Filippo"},{"family":"Zammuto","given":"Salvatore"}],"container-title":"Mathematics","id":"Chella2022","issue":"14","issued":{"date-parts":[[2022]]},"page":"2475","publisher":"MDPI","title":"A quantum planner for robot motion","type":"article-journal","volume":"10"}},{"id":"ITEM-413","isTemporary":false,"itemData":{"DOI":"10.1016/j.robot.2023.104362","author":[{"family":"Chella","given":"Antonio"},{"family":"Gaglio","given":"Salvatore"},{"family":"Mannone","given":"Maria"},{"family":"Pilato","given":"Giovanni"},{"family":"Seidita","given":"Valeria"},{"family":"Vella","given":"Filippo"},{"family":"Zammuto","given":"Salvatore"}],"container-title":"Robotics and Autonomous Systems","id":"Chella2023","issued":{"date-parts":[[2023]]},"page":"104362","publisher":"Elsevier","title":"Quantum planning for swarm robotics","type":"article-journal","volume":"161"}},{"id":"ITEM-414","isTemporary":false,"itemData":{"DOI":"10.1109/ACCESS.2023.3307316","author":[{"family":"Lathrop","given":"Paul"},{"family":"Boardman","given":"Beth"},{"family":"Martínez","given":"Sonia"}],"container-title":"IEEE Access","id":"Lathrop2023","issued":{"date-parts":[[2023]]},"page":"89506-89519","title":"Quantum search approaches to sampling-based motion planning","type":"article-journal","volume":"11"}}],"isEdited":false,"manualOverride":{"citeprocText":"(Benioff 2002; Chella et al. 2022, 2023; Lathrop, Boardman, and Martínez 2023)","isManuallyOverridden":false,"manualOverrideText":""},"mendeley":{"formattedCitation":"(Benioff 2002; Chella et al. 2022, 2023; Lathrop, Boardman, and Martínez 2023)","plainTextFormattedCitation":"(Benioff 2002; Chella et al. 2022, 2023; Lathrop, Boardman, and Martínez 2023)","previouslyFormattedCitation":"(Benioff 2002; Chella et al. 2022, 2023; Lathrop, Boardman, and Martínez 2023)"},"properties":{"noteIndex":0},"schema":"https://github.com/citation-style-language/schema/raw/master/csl-citation.json"}</w:instrText>
             </w:r>
             <w:r>
               <w:fldChar w:fldCharType="separate"/>
             </w:r>
             <w:r>
-              <w:t xml:space="preserve">(Chella et al. 2022, 2023; Lathrop, Boardman, and Martínez 2023)</w:t>
+              <w:t xml:space="preserve">(Benioff 2002; Chella et al. 2022, 2023; Lathrop, Boardman, and Martínez 2023)</w:t>
             </w:r>
             <w:r>
               <w:fldChar w:fldCharType="end"/>
@@ -16294,7 +16484,7 @@
               <w:jc w:val="left"/>
             </w:pPr>
             <w:r>
-              <w:t xml:space="preserve">L2</w:t>
+              <w:t xml:space="preserve">L1–L2</w:t>
             </w:r>
           </w:p>
         </w:tc>
@@ -16338,7 +16528,7 @@
               <w:fldChar w:fldCharType="begin"/>
             </w:r>
             <w:r>
-              <w:instrText xml:space="preserve">ADDIN CSL_CITATION {"citationID":"MENDELEY_CITATION_405","citationItems":[{"id":"ITEM-401","isTemporary":false,"itemData":{"URL":"https://arxiv.org/abs/2508.21361","author":[{"family":"Innan","given":"Nouhaila"},{"family":"Kashif","given":"Muhammad"},{"family":"Marchisio","given":"Alberto"},{"family":"Gan","given":"Yung-Sze"},{"family":"Barbaresco","given":"Frederic"},{"family":"Shafique","given":"Muhammad"}],"id":"Innan2025","issued":{"date-parts":[[2025]]},"title":"QUAV: Quantum-assisted path planning and optimization for UAV navigation with obstacle avoidance","title-short":"QUAV","type":""}},{"id":"ITEM-402","isTemporary":false,"itemData":{"URL":"https://openaccess.thecvf.com/content/CVPR2026/html/Yu_HQC-NBV_A_Hybrid_Quantum-Classical_View_Planning_Approach_CVPR_2026_paper.html","author":[{"family":"Yu","given":"Xiaotong"},{"family":"Chen","given":"Chang Wen"}],"container-title":"Proceedings of the IEEE/CVF conference on computer vision and pattern recognition (CVPR)","id":"Yu2025","issued":{"date-parts":[[2026,6]]},"page":"35091-35100","title":"HQC-NBV: A hybrid quantum-classical view planning approach","title-short":"HQC-NBV","type":"paper-conference"}},{"id":"ITEM-403","isTemporary":false,"itemData":{"DOI":"10.1109/TCE.2024.3423416","author":[{"family":"Sarkar","given":"Mayukh"},{"family":"Pradhan","given":"Jitesh"},{"family":"Singh","given":"Anil Kumar"},{"family":"Nenavath","given":"Hathiram"}],"container-title":"IEEE Transactions on Consumer Electronics","id":"Sarkar2024","issue":"3","issued":{"date-parts":[[2024]]},"page":"5597-5606","publisher":"IEEE","title":"A novel hybrid quantum architecture for path planning in quantum-enabled autonomous mobile robots","type":"article-journal","volume":"70"}},{"id":"ITEM-404","isTemporary":false,"itemData":{"URL":"https://arxiv.org/abs/2501.18432","author":[{"family":"Osaba","given":"Eneko"},{"family":"Miranda-Rodriguez","given":"Pablo"},{"family":"Oikonomakis","given":"Andreas"},{"family":"Petrič","given":"Matic"},{"family":"Ruiz","given":"Alejandra"},{"family":"Bock","given":"Sebastian"},{"family":"Kourtis","given":"Michail-Alexandros"}],"container-title":"2025 IEEE congress on evolutionary computation (CEC)","id":"OsabaDrone2025","issued":{"date-parts":[[2025]]},"publisher":"IEEE","title":"Solving drone routing problems with quantum computing: A hybrid approach combining quantum annealing and gate-based paradigms","title-short":"Solving drone routing problems with quantum computing","type":"paper-conference"}},{"id":"ITEM-405","isTemporary":false,"itemData":{"URL":"https://arxiv.org/abs/2606.14252","author":[{"family":"Bang","given":"Junyeop"},{"family":"Lee","given":"Byongho"},{"family":"An","given":"Dohyun"},{"family":"Kim","given":"Hwangnam"}],"id":"Bang2026","issued":{"date-parts":[[2026]]},"title":"Optimality-preserving decomposition for scalable QAOA in natural-language-guided multi-drone assignment","type":""}}],"isEdited":false,"manualOverride":{"citeprocText":"(Innan et al. 2025; Yu and Chen 2026; Sarkar et al. 2024; Osaba, Miranda-Rodriguez, et al. 2025; Bang et al. 2026)","isManuallyOverridden":false,"manualOverrideText":""},"mendeley":{"formattedCitation":"(Innan et al. 2025; Yu and Chen 2026; Sarkar et al. 2024; Osaba, Miranda-Rodriguez, et al. 2025; Bang et al. 2026)","plainTextFormattedCitation":"(Innan et al. 2025; Yu and Chen 2026; Sarkar et al. 2024; Osaba, Miranda-Rodriguez, et al. 2025; Bang et al. 2026)","previouslyFormattedCitation":"(Innan et al. 2025; Yu and Chen 2026; Sarkar et al. 2024; Osaba, Miranda-Rodriguez, et al. 2025; Bang et al. 2026)"},"properties":{"noteIndex":0},"schema":"https://github.com/citation-style-language/schema/raw/master/csl-citation.json"}</w:instrText>
+              <w:instrText xml:space="preserve">ADDIN CSL_CITATION {"citationID":"MENDELEY_CITATION_419","citationItems":[{"id":"ITEM-415","isTemporary":false,"itemData":{"URL":"https://arxiv.org/abs/2508.21361","author":[{"family":"Innan","given":"Nouhaila"},{"family":"Kashif","given":"Muhammad"},{"family":"Marchisio","given":"Alberto"},{"family":"Gan","given":"Yung-Sze"},{"family":"Barbaresco","given":"Frederic"},{"family":"Shafique","given":"Muhammad"}],"id":"Innan2025","issued":{"date-parts":[[2025]]},"title":"QUAV: Quantum-assisted path planning and optimization for UAV navigation with obstacle avoidance","title-short":"QUAV","type":""}},{"id":"ITEM-416","isTemporary":false,"itemData":{"URL":"https://openaccess.thecvf.com/content/CVPR2026/html/Yu_HQC-NBV_A_Hybrid_Quantum-Classical_View_Planning_Approach_CVPR_2026_paper.html","author":[{"family":"Yu","given":"Xiaotong"},{"family":"Chen","given":"Chang Wen"}],"container-title":"Proceedings of the IEEE/CVF conference on computer vision and pattern recognition (CVPR)","id":"Yu2025","issued":{"date-parts":[[2026,6]]},"page":"35091-35100","title":"HQC-NBV: A hybrid quantum-classical view planning approach","title-short":"HQC-NBV","type":"paper-conference"}},{"id":"ITEM-417","isTemporary":false,"itemData":{"DOI":"10.1109/TCE.2024.3423416","author":[{"family":"Sarkar","given":"Mayukh"},{"family":"Pradhan","given":"Jitesh"},{"family":"Singh","given":"Anil Kumar"},{"family":"Nenavath","given":"Hathiram"}],"container-title":"IEEE Transactions on Consumer Electronics","id":"Sarkar2024","issue":"3","issued":{"date-parts":[[2024]]},"page":"5597-5606","publisher":"IEEE","title":"A novel hybrid quantum architecture for path planning in quantum-enabled autonomous mobile robots","type":"article-journal","volume":"70"}},{"id":"ITEM-418","isTemporary":false,"itemData":{"URL":"https://arxiv.org/abs/2501.18432","author":[{"family":"Osaba","given":"Eneko"},{"family":"Miranda-Rodriguez","given":"Pablo"},{"family":"Oikonomakis","given":"Andreas"},{"family":"Petrič","given":"Matic"},{"family":"Ruiz","given":"Alejandra"},{"family":"Bock","given":"Sebastian"},{"family":"Kourtis","given":"Michail-Alexandros"}],"container-title":"2025 IEEE congress on evolutionary computation (CEC)","id":"OsabaDrone2025","issued":{"date-parts":[[2025]]},"publisher":"IEEE","title":"Solving drone routing problems with quantum computing: A hybrid approach combining quantum annealing and gate-based paradigms","title-short":"Solving drone routing problems with quantum computing","type":"paper-conference"}},{"id":"ITEM-419","isTemporary":false,"itemData":{"URL":"https://arxiv.org/abs/2606.14252","author":[{"family":"Bang","given":"Junyeop"},{"family":"Lee","given":"Byongho"},{"family":"An","given":"Dohyun"},{"family":"Kim","given":"Hwangnam"}],"id":"Bang2026","issued":{"date-parts":[[2026]]},"title":"Optimality-preserving decomposition for scalable QAOA in natural-language-guided multi-drone assignment","type":""}}],"isEdited":false,"manualOverride":{"citeprocText":"(Innan et al. 2025; Yu and Chen 2026; Sarkar et al. 2024; Osaba, Miranda-Rodriguez, et al. 2025; Bang et al. 2026)","isManuallyOverridden":false,"manualOverrideText":""},"mendeley":{"formattedCitation":"(Innan et al. 2025; Yu and Chen 2026; Sarkar et al. 2024; Osaba, Miranda-Rodriguez, et al. 2025; Bang et al. 2026)","plainTextFormattedCitation":"(Innan et al. 2025; Yu and Chen 2026; Sarkar et al. 2024; Osaba, Miranda-Rodriguez, et al. 2025; Bang et al. 2026)","previouslyFormattedCitation":"(Innan et al. 2025; Yu and Chen 2026; Sarkar et al. 2024; Osaba, Miranda-Rodriguez, et al. 2025; Bang et al. 2026)"},"properties":{"noteIndex":0},"schema":"https://github.com/citation-style-language/schema/raw/master/csl-citation.json"}</w:instrText>
             </w:r>
             <w:r>
               <w:fldChar w:fldCharType="separate"/>
@@ -16415,7 +16605,7 @@
               <w:fldChar w:fldCharType="begin"/>
             </w:r>
             <w:r>
-              <w:instrText xml:space="preserve">ADDIN CSL_CITATION {"citationID":"MENDELEY_CITATION_406","citationItems":[{"id":"ITEM-406","isTemporary":false,"itemData":{"DOI":"10.1016/j.robot.2025.105026","author":[{"family":"Antero","given":"Unai"},{"family":"Sierra","given":"Basilio"},{"family":"Oñativia","given":"Jon"},{"family":"Ruiz","given":"Alejandra"},{"family":"Osaba","given":"Eneko"}],"container-title":"Robotics and Autonomous Systems","id":"Antero2025","issued":{"date-parts":[[2025]]},"page":"105026","publisher":"Elsevier","title":"Robot localization aided by quantum algorithms","type":"article-journal","volume":"192"}}],"isEdited":false,"manualOverride":{"citeprocText":"(Antero et al. 2025)","isManuallyOverridden":false,"manualOverrideText":""},"mendeley":{"formattedCitation":"(Antero et al. 2025)","plainTextFormattedCitation":"(Antero et al. 2025)","previouslyFormattedCitation":"(Antero et al. 2025)"},"properties":{"noteIndex":0},"schema":"https://github.com/citation-style-language/schema/raw/master/csl-citation.json"}</w:instrText>
+              <w:instrText xml:space="preserve">ADDIN CSL_CITATION {"citationID":"MENDELEY_CITATION_420","citationItems":[{"id":"ITEM-420","isTemporary":false,"itemData":{"DOI":"10.1016/j.robot.2025.105026","author":[{"family":"Antero","given":"Unai"},{"family":"Sierra","given":"Basilio"},{"family":"Oñativia","given":"Jon"},{"family":"Ruiz","given":"Alejandra"},{"family":"Osaba","given":"Eneko"}],"container-title":"Robotics and Autonomous Systems","id":"Antero2025","issued":{"date-parts":[[2025]]},"page":"105026","publisher":"Elsevier","title":"Robot localization aided by quantum algorithms","type":"article-journal","volume":"192"}}],"isEdited":false,"manualOverride":{"citeprocText":"(Antero et al. 2025)","isManuallyOverridden":false,"manualOverrideText":""},"mendeley":{"formattedCitation":"(Antero et al. 2025)","plainTextFormattedCitation":"(Antero et al. 2025)","previouslyFormattedCitation":"(Antero et al. 2025)"},"properties":{"noteIndex":0},"schema":"https://github.com/citation-style-language/schema/raw/master/csl-citation.json"}</w:instrText>
             </w:r>
             <w:r>
               <w:fldChar w:fldCharType="separate"/>
@@ -16492,7 +16682,7 @@
               <w:fldChar w:fldCharType="begin"/>
             </w:r>
             <w:r>
-              <w:instrText xml:space="preserve">ADDIN CSL_CITATION {"citationID":"MENDELEY_CITATION_413","citationItems":[{"id":"ITEM-407","isTemporary":false,"itemData":{"DOI":"10.1109/ACCESS.2024.3417808","author":[{"family":"Hohenfeld","given":"Hans"},{"family":"Heimann","given":"Dirk"},{"family":"Wiebe","given":"Felix"},{"family":"Kirchner","given":"Frank"}],"container-title":"IEEE Access","id":"Hohenfeld2024","issued":{"date-parts":[[2024]]},"page":"87217-87236","publisher":"IEEE","title":"Quantum deep reinforcement learning for robot navigation tasks","type":"article-journal","volume":"12"}},{"id":"ITEM-408","isTemporary":false,"itemData":{"DOI":"10.5220/0013371800003890","ISBN":"978-989-758-737-5","author":[{"family":"Drăgan","given":"Theodora-Augustina"},{"family":"Künzner","given":"Alexander"},{"family":"Wille","given":"Robert"},{"family":"Lorenz","given":"Jeanette Miriam"}],"container-title":"Proceedings of the 17th international conference on agents and artificial intelligence (ICAART 2025)","id":"Dragan2025","issued":{"date-parts":[[2025]]},"page":"807-814","publisher":"SciTePress","title":"Continuous quantum reinforcement learning for robot navigation","type":"paper-conference","volume":"1"}},{"id":"ITEM-409","isTemporary":false,"itemData":{"URL":"https://arxiv.org/abs/2605.20801","author":[{"family":"Altrabulsi","given":"Mohamed Khair"},{"family":"Innan","given":"Nouhaila"},{"family":"Marchisio","given":"Alberto"},{"family":"Kashif","given":"Muhammad"},{"family":"Shafique","given":"Muhammad"}],"id":"Altrabulsi2026","issued":{"date-parts":[[2026]]},"title":"Q-SpiRL: Quantum spiking reinforcement learning for adaptive robot navigation","title-short":"Q-SpiRL","type":""}},{"id":"ITEM-410","isTemporary":false,"itemData":{"DOI":"10.48550/arXiv.2509.11388","URL":"https://arxiv.org/abs/2509.11388","author":[{"family":"Lokossou","given":"Romerik"},{"family":"Girma","given":"Birhanu Shimelis"},{"family":"Tonguz","given":"Ozan K."},{"family":"Biyabani","given":"Ahmed"}],"id":"Lokossou2025","issued":{"date-parts":[[2025]]},"title":"Quantum deep reinforcement learning for humanoid robot navigation task","type":""}},{"id":"ITEM-411","isTemporary":false,"itemData":{"DOI":"10.1007/s42044-025-00306-z","author":[{"family":"Taghavi","given":"Mazyar"},{"family":"Farnoosh","given":"Rahman"}],"container-title":"Iran Journal of Computer Science","id":"Taghavi2025","issue":"4","issued":{"date-parts":[[2025]]},"page":"2139-2155","publisher":"Springer","title":"Quantum computing and neuromorphic computing for safe, reliable, and explainable multi-agent reinforcement learning: Optimal control in autonomous robotics","title-short":"Quantum computing and neuromorphic computing for safe, reliable, and explainable multi-agent reinforcement learning","type":"article-journal","volume":"8"}},{"id":"ITEM-412","isTemporary":false,"itemData":{"author":[{"family":"Park","given":"Chanyoung"},{"family":"Yun","given":"Won Joon"},{"family":"Kim","given":"Jae Pyoung"},{"family":"Rodrigues","given":"Tiago Koketsu"},{"family":"Park","given":"Soohyun"},{"family":"Jung","given":"Soyi"},{"family":"Kim","given":"Joongheon"}],"container-title":"IEEE Internet of Things Journal","id":"Park2023","issue":"22","issued":{"date-parts":[[2023]]},"page":"20033-20048","title":"Quantum multi-agent actor-critic networks for cooperative mobile access in multi-UAV systems","type":"article-journal","volume":"10"}},{"id":"ITEM-413","isTemporary":false,"itemData":{"author":[{"family":"Park","given":"Soohyun"},{"family":"Kim","given":"Jae Pyoung"},{"family":"Park","given":"Chanyoung"},{"family":"Jung","given":"Soyi"},{"family":"Kim","given":"Joongheon"}],"container-title":"IEEE Communications Magazine","id":"Park2024","issue":"6","issued":{"date-parts":[[2024]]},"page":"106-112","title":"Quantum multi-agent reinforcement learning for autonomous mobility cooperation","type":"article-journal","volume":"62"}}],"isEdited":false,"manualOverride":{"citeprocText":"(Hohenfeld et al. 2024; Drăgan et al. 2025; Altrabulsi et al. 2026; Lokossou et al. 2025; Taghavi and Farnoosh 2025; C. Park et al. 2023; S. Park et al. 2024)","isManuallyOverridden":false,"manualOverrideText":""},"mendeley":{"formattedCitation":"(Hohenfeld et al. 2024; Drăgan et al. 2025; Altrabulsi et al. 2026; Lokossou et al. 2025; Taghavi and Farnoosh 2025; C. Park et al. 2023; S. Park et al. 2024)","plainTextFormattedCitation":"(Hohenfeld et al. 2024; Drăgan et al. 2025; Altrabulsi et al. 2026; Lokossou et al. 2025; Taghavi and Farnoosh 2025; C. Park et al. 2023; S. Park et al. 2024)","previouslyFormattedCitation":"(Hohenfeld et al. 2024; Drăgan et al. 2025; Altrabulsi et al. 2026; Lokossou et al. 2025; Taghavi and Farnoosh 2025; C. Park et al. 2023; S. Park et al. 2024)"},"properties":{"noteIndex":0},"schema":"https://github.com/citation-style-language/schema/raw/master/csl-citation.json"}</w:instrText>
+              <w:instrText xml:space="preserve">ADDIN CSL_CITATION {"citationID":"MENDELEY_CITATION_427","citationItems":[{"id":"ITEM-421","isTemporary":false,"itemData":{"DOI":"10.1109/ACCESS.2024.3417808","author":[{"family":"Hohenfeld","given":"Hans"},{"family":"Heimann","given":"Dirk"},{"family":"Wiebe","given":"Felix"},{"family":"Kirchner","given":"Frank"}],"container-title":"IEEE Access","id":"Hohenfeld2024","issued":{"date-parts":[[2024]]},"page":"87217-87236","publisher":"IEEE","title":"Quantum deep reinforcement learning for robot navigation tasks","type":"article-journal","volume":"12"}},{"id":"ITEM-422","isTemporary":false,"itemData":{"DOI":"10.5220/0013371800003890","ISBN":"978-989-758-737-5","author":[{"family":"Drăgan","given":"Theodora-Augustina"},{"family":"Künzner","given":"Alexander"},{"family":"Wille","given":"Robert"},{"family":"Lorenz","given":"Jeanette Miriam"}],"container-title":"Proceedings of the 17th international conference on agents and artificial intelligence (ICAART 2025)","id":"Dragan2025","issued":{"date-parts":[[2025]]},"page":"807-814","publisher":"SciTePress","title":"Continuous quantum reinforcement learning for robot navigation","type":"paper-conference","volume":"1"}},{"id":"ITEM-423","isTemporary":false,"itemData":{"URL":"https://arxiv.org/abs/2605.20801","author":[{"family":"Altrabulsi","given":"Mohamed Khair"},{"family":"Innan","given":"Nouhaila"},{"family":"Marchisio","given":"Alberto"},{"family":"Kashif","given":"Muhammad"},{"family":"Shafique","given":"Muhammad"}],"id":"Altrabulsi2026","issued":{"date-parts":[[2026]]},"title":"Q-SpiRL: Quantum spiking reinforcement learning for adaptive robot navigation","title-short":"Q-SpiRL","type":""}},{"id":"ITEM-424","isTemporary":false,"itemData":{"DOI":"10.48550/arXiv.2509.11388","URL":"https://arxiv.org/abs/2509.11388","author":[{"family":"Lokossou","given":"Romerik"},{"family":"Girma","given":"Birhanu Shimelis"},{"family":"Tonguz","given":"Ozan K."},{"family":"Biyabani","given":"Ahmed"}],"id":"Lokossou2025","issued":{"date-parts":[[2025]]},"title":"Quantum deep reinforcement learning for humanoid robot navigation task","type":""}},{"id":"ITEM-425","isTemporary":false,"itemData":{"DOI":"10.1007/s42044-025-00306-z","author":[{"family":"Taghavi","given":"Mazyar"},{"family":"Farnoosh","given":"Rahman"}],"container-title":"Iran Journal of Computer Science","id":"Taghavi2025","issue":"4","issued":{"date-parts":[[2025]]},"page":"2139-2155","publisher":"Springer","title":"Quantum computing and neuromorphic computing for safe, reliable, and explainable multi-agent reinforcement learning: Optimal control in autonomous robotics","title-short":"Quantum computing and neuromorphic computing for safe, reliable, and explainable multi-agent reinforcement learning","type":"article-journal","volume":"8"}},{"id":"ITEM-426","isTemporary":false,"itemData":{"author":[{"family":"Park","given":"Chanyoung"},{"family":"Yun","given":"Won Joon"},{"family":"Kim","given":"Jae Pyoung"},{"family":"Rodrigues","given":"Tiago Koketsu"},{"family":"Park","given":"Soohyun"},{"family":"Jung","given":"Soyi"},{"family":"Kim","given":"Joongheon"}],"container-title":"IEEE Internet of Things Journal","id":"Park2023","issue":"22","issued":{"date-parts":[[2023]]},"page":"20033-20048","title":"Quantum multi-agent actor-critic networks for cooperative mobile access in multi-UAV systems","type":"article-journal","volume":"10"}},{"id":"ITEM-427","isTemporary":false,"itemData":{"author":[{"family":"Park","given":"Soohyun"},{"family":"Kim","given":"Jae Pyoung"},{"family":"Park","given":"Chanyoung"},{"family":"Jung","given":"Soyi"},{"family":"Kim","given":"Joongheon"}],"container-title":"IEEE Communications Magazine","id":"Park2024","issue":"6","issued":{"date-parts":[[2024]]},"page":"106-112","title":"Quantum multi-agent reinforcement learning for autonomous mobility cooperation","type":"article-journal","volume":"62"}}],"isEdited":false,"manualOverride":{"citeprocText":"(Hohenfeld et al. 2024; Drăgan et al. 2025; Altrabulsi et al. 2026; Lokossou et al. 2025; Taghavi and Farnoosh 2025; C. Park et al. 2023; S. Park et al. 2024)","isManuallyOverridden":false,"manualOverrideText":""},"mendeley":{"formattedCitation":"(Hohenfeld et al. 2024; Drăgan et al. 2025; Altrabulsi et al. 2026; Lokossou et al. 2025; Taghavi and Farnoosh 2025; C. Park et al. 2023; S. Park et al. 2024)","plainTextFormattedCitation":"(Hohenfeld et al. 2024; Drăgan et al. 2025; Altrabulsi et al. 2026; Lokossou et al. 2025; Taghavi and Farnoosh 2025; C. Park et al. 2023; S. Park et al. 2024)","previouslyFormattedCitation":"(Hohenfeld et al. 2024; Drăgan et al. 2025; Altrabulsi et al. 2026; Lokossou et al. 2025; Taghavi and Farnoosh 2025; C. Park et al. 2023; S. Park et al. 2024)"},"properties":{"noteIndex":0},"schema":"https://github.com/citation-style-language/schema/raw/master/csl-citation.json"}</w:instrText>
             </w:r>
             <w:r>
               <w:fldChar w:fldCharType="separate"/>
@@ -16569,7 +16759,7 @@
               <w:fldChar w:fldCharType="begin"/>
             </w:r>
             <w:r>
-              <w:instrText xml:space="preserve">ADDIN CSL_CITATION {"citationID":"MENDELEY_CITATION_415","citationItems":[{"id":"ITEM-414","isTemporary":false,"itemData":{"DOI":"10.1007/s42484-024-00226-4","author":[{"family":"Sinha","given":"Akash"},{"family":"Macaluso","given":"Antonio"},{"family":"Klusch","given":"Matthias"}],"container-title":"Quantum Machine Intelligence","id":"Sinha2023","issued":{"date-parts":[[2025]]},"page":"19","publisher":"Springer","title":"Nav-Q: Quantum deep reinforcement learning for collision-free navigation of self-driving cars","title-short":"Nav-Q","type":"article-journal","volume":"7"}},{"id":"ITEM-415","isTemporary":false,"itemData":{"URL":"https://arxiv.org/abs/2212.11681","author":[{"family":"Acuto","given":"Alberto"},{"family":"Barillà","given":"Paola"},{"family":"Bozzolo","given":"Ludovico"},{"family":"Conterno","given":"Matteo"},{"family":"Pavese","given":"Mattia"},{"family":"Policicchio","given":"Antonio"}],"id":"Acuto2022","issued":{"date-parts":[[2022]]},"title":"Variational quantum soft actor-critic for robotic arm control","type":""}}],"isEdited":false,"manualOverride":{"citeprocText":"(Sinha, Macaluso, and Klusch 2025; Acuto et al. 2022)","isManuallyOverridden":false,"manualOverrideText":""},"mendeley":{"formattedCitation":"(Sinha, Macaluso, and Klusch 2025; Acuto et al. 2022)","plainTextFormattedCitation":"(Sinha, Macaluso, and Klusch 2025; Acuto et al. 2022)","previouslyFormattedCitation":"(Sinha, Macaluso, and Klusch 2025; Acuto et al. 2022)"},"properties":{"noteIndex":0},"schema":"https://github.com/citation-style-language/schema/raw/master/csl-citation.json"}</w:instrText>
+              <w:instrText xml:space="preserve">ADDIN CSL_CITATION {"citationID":"MENDELEY_CITATION_429","citationItems":[{"id":"ITEM-428","isTemporary":false,"itemData":{"DOI":"10.1007/s42484-024-00226-4","author":[{"family":"Sinha","given":"Akash"},{"family":"Macaluso","given":"Antonio"},{"family":"Klusch","given":"Matthias"}],"container-title":"Quantum Machine Intelligence","id":"Sinha2023","issued":{"date-parts":[[2025]]},"page":"19","publisher":"Springer","title":"Nav-Q: Quantum deep reinforcement learning for collision-free navigation of self-driving cars","title-short":"Nav-Q","type":"article-journal","volume":"7"}},{"id":"ITEM-429","isTemporary":false,"itemData":{"URL":"https://arxiv.org/abs/2212.11681","author":[{"family":"Acuto","given":"Alberto"},{"family":"Barillà","given":"Paola"},{"family":"Bozzolo","given":"Ludovico"},{"family":"Conterno","given":"Matteo"},{"family":"Pavese","given":"Mattia"},{"family":"Policicchio","given":"Antonio"}],"id":"Acuto2022","issued":{"date-parts":[[2022]]},"title":"Variational quantum soft actor-critic for robotic arm control","type":""}}],"isEdited":false,"manualOverride":{"citeprocText":"(Sinha, Macaluso, and Klusch 2025; Acuto et al. 2022)","isManuallyOverridden":false,"manualOverrideText":""},"mendeley":{"formattedCitation":"(Sinha, Macaluso, and Klusch 2025; Acuto et al. 2022)","plainTextFormattedCitation":"(Sinha, Macaluso, and Klusch 2025; Acuto et al. 2022)","previouslyFormattedCitation":"(Sinha, Macaluso, and Klusch 2025; Acuto et al. 2022)"},"properties":{"noteIndex":0},"schema":"https://github.com/citation-style-language/schema/raw/master/csl-citation.json"}</w:instrText>
             </w:r>
             <w:r>
               <w:fldChar w:fldCharType="separate"/>
@@ -16646,7 +16836,7 @@
               <w:fldChar w:fldCharType="begin"/>
             </w:r>
             <w:r>
-              <w:instrText xml:space="preserve">ADDIN CSL_CITATION {"citationID":"MENDELEY_CITATION_417","citationItems":[{"id":"ITEM-416","isTemporary":false,"itemData":{"URL":"https://arxiv.org/abs/2508.01690","author":[{"family":"Sun","given":"Yize"},{"family":"Hagog","given":"Mohamad"},{"family":"Weber","given":"Marc"},{"family":"Hein","given":"Daniel"},{"family":"Udluft","given":"Steffen"},{"family":"Tresp","given":"Volker"},{"family":"Ma","given":"Yunpu"}],"id":"Sun2025","issued":{"date-parts":[[2025]]},"note":"QML@QCE 2025 workshop","title":"First experience with real-time control using simulated VQC-based quantum policies","type":""}},{"id":"ITEM-417","isTemporary":false,"itemData":{"URL":"https://arxiv.org/abs/2605.01716","author":[{"family":"Ngo","given":"Nguyen Truong Thu"},{"family":"Mehtola","given":"Väinö"},{"family":"Lenssen","given":"Jérome"},{"family":"Wang","given":"Peiyong"},{"family":"Cosco","given":"Francesco"},{"family":"Lu","given":"Tien-Fu"},{"family":"Quach","given":"James Q."}],"id":"Ngo2026","issued":{"date-parts":[[2026]]},"title":"Towards real-time control of a CartPole system on a quantum computer","type":""}}],"isEdited":false,"manualOverride":{"citeprocText":"(Sun et al. 2025; Ngo et al. 2026)","isManuallyOverridden":false,"manualOverrideText":""},"mendeley":{"formattedCitation":"(Sun et al. 2025; Ngo et al. 2026)","plainTextFormattedCitation":"(Sun et al. 2025; Ngo et al. 2026)","previouslyFormattedCitation":"(Sun et al. 2025; Ngo et al. 2026)"},"properties":{"noteIndex":0},"schema":"https://github.com/citation-style-language/schema/raw/master/csl-citation.json"}</w:instrText>
+              <w:instrText xml:space="preserve">ADDIN CSL_CITATION {"citationID":"MENDELEY_CITATION_431","citationItems":[{"id":"ITEM-430","isTemporary":false,"itemData":{"URL":"https://arxiv.org/abs/2508.01690","author":[{"family":"Sun","given":"Yize"},{"family":"Hagog","given":"Mohamad"},{"family":"Weber","given":"Marc"},{"family":"Hein","given":"Daniel"},{"family":"Udluft","given":"Steffen"},{"family":"Tresp","given":"Volker"},{"family":"Ma","given":"Yunpu"}],"id":"Sun2025","issued":{"date-parts":[[2025]]},"note":"QML@QCE 2025 workshop","title":"First experience with real-time control using simulated VQC-based quantum policies","type":""}},{"id":"ITEM-431","isTemporary":false,"itemData":{"URL":"https://arxiv.org/abs/2605.01716","author":[{"family":"Ngo","given":"Nguyen Truong Thu"},{"family":"Mehtola","given":"Väinö"},{"family":"Lenssen","given":"Jérome"},{"family":"Wang","given":"Peiyong"},{"family":"Cosco","given":"Francesco"},{"family":"Lu","given":"Tien-Fu"},{"family":"Quach","given":"James Q."}],"id":"Ngo2026","issued":{"date-parts":[[2026]]},"title":"Towards real-time control of a CartPole system on a quantum computer","type":""}}],"isEdited":false,"manualOverride":{"citeprocText":"(Sun et al. 2025; Ngo et al. 2026)","isManuallyOverridden":false,"manualOverrideText":""},"mendeley":{"formattedCitation":"(Sun et al. 2025; Ngo et al. 2026)","plainTextFormattedCitation":"(Sun et al. 2025; Ngo et al. 2026)","previouslyFormattedCitation":"(Sun et al. 2025; Ngo et al. 2026)"},"properties":{"noteIndex":0},"schema":"https://github.com/citation-style-language/schema/raw/master/csl-citation.json"}</w:instrText>
             </w:r>
             <w:r>
               <w:fldChar w:fldCharType="separate"/>
@@ -16723,7 +16913,7 @@
               <w:fldChar w:fldCharType="begin"/>
             </w:r>
             <w:r>
-              <w:instrText xml:space="preserve">ADDIN CSL_CITATION {"citationID":"MENDELEY_CITATION_418","citationItems":[{"id":"ITEM-418","isTemporary":false,"itemData":{"author":[{"family":"Roh","given":"Emily Jimin"},{"family":"Baek","given":"Hankyul"},{"family":"Kim","given":"Donghyeon"},{"family":"Kim","given":"Joongheon"}],"container-title":"IEEE Transactions on Mobile Computing","id":"Roh2025","issue":"2","issued":{"date-parts":[[2025]]},"page":"1031-1042","title":"Fast quantum convolutional neural networks for low-complexity object detection in autonomous driving applications","type":"article-journal","volume":"24"}}],"isEdited":false,"manualOverride":{"citeprocText":"(Roh et al. 2025)","isManuallyOverridden":false,"manualOverrideText":""},"mendeley":{"formattedCitation":"(Roh et al. 2025)","plainTextFormattedCitation":"(Roh et al. 2025)","previouslyFormattedCitation":"(Roh et al. 2025)"},"properties":{"noteIndex":0},"schema":"https://github.com/citation-style-language/schema/raw/master/csl-citation.json"}</w:instrText>
+              <w:instrText xml:space="preserve">ADDIN CSL_CITATION {"citationID":"MENDELEY_CITATION_432","citationItems":[{"id":"ITEM-432","isTemporary":false,"itemData":{"author":[{"family":"Roh","given":"Emily Jimin"},{"family":"Baek","given":"Hankyul"},{"family":"Kim","given":"Donghyeon"},{"family":"Kim","given":"Joongheon"}],"container-title":"IEEE Transactions on Mobile Computing","id":"Roh2025","issue":"2","issued":{"date-parts":[[2025]]},"page":"1031-1042","title":"Fast quantum convolutional neural networks for low-complexity object detection in autonomous driving applications","type":"article-journal","volume":"24"}}],"isEdited":false,"manualOverride":{"citeprocText":"(Roh et al. 2025)","isManuallyOverridden":false,"manualOverrideText":""},"mendeley":{"formattedCitation":"(Roh et al. 2025)","plainTextFormattedCitation":"(Roh et al. 2025)","previouslyFormattedCitation":"(Roh et al. 2025)"},"properties":{"noteIndex":0},"schema":"https://github.com/citation-style-language/schema/raw/master/csl-citation.json"}</w:instrText>
             </w:r>
             <w:r>
               <w:fldChar w:fldCharType="separate"/>
@@ -16800,7 +16990,7 @@
               <w:fldChar w:fldCharType="begin"/>
             </w:r>
             <w:r>
-              <w:instrText xml:space="preserve">ADDIN CSL_CITATION {"citationID":"MENDELEY_CITATION_421","citationItems":[{"id":"ITEM-419","isTemporary":false,"itemData":{"DOI":"10.1109/TMECH.2010.2090896","author":[{"family":"Dong","given":"Daoyi"},{"family":"Chen","given":"Chunlin"},{"family":"Chu","given":"Jian"},{"family":"Tarn","given":"Tzyh-Jong"}],"container-title":"IEEE/ASME Transactions on Mechatronics","id":"Dong2012","issue":"1","issued":{"date-parts":[[2012]]},"page":"86-97","publisher":"IEEE","title":"Robust quantum-inspired reinforcement learning for robot navigation","type":"article-journal","volume":"17"}},{"id":"ITEM-420","isTemporary":false,"itemData":{"DOI":"10.1155/2018/1596080","author":[{"family":"Zuo","given":"Tao"},{"family":"Min","given":"Huasong"},{"family":"Tang","given":"Quan"},{"family":"Tao","given":"Qiang"}],"container-title":"Mathematical Problems in Engineering","id":"Zuo2018","issued":{"date-parts":[[2018]]},"page":"1596080","publisher":"Hindawi","title":"A robot SLAM improved by quantum-behaved particles swarm optimization","type":"article-journal","volume":"2018"}},{"id":"ITEM-421","isTemporary":false,"itemData":{"DOI":"10.1016/j.robot.2025.105123","author":[{"family":"Fazilat","given":"Mehdi"},{"family":"Zioui","given":"Nadjet"}],"container-title":"Robotics and Autonomous Systems","id":"Fazilat2025b","issued":{"date-parts":[[2025]]},"page":"105123","publisher":"Elsevier","title":"Quantum neural network-based inverse kinematics of a six-jointed industrial robotic arm","type":"article-journal","volume":"194"}}],"isEdited":false,"manualOverride":{"citeprocText":"(Dong et al. 2012; Zuo et al. 2018; Fazilat and Zioui 2025b)","isManuallyOverridden":false,"manualOverrideText":""},"mendeley":{"formattedCitation":"(Dong et al. 2012; Zuo et al. 2018; Fazilat and Zioui 2025b)","plainTextFormattedCitation":"(Dong et al. 2012; Zuo et al. 2018; Fazilat and Zioui 2025b)","previouslyFormattedCitation":"(Dong et al. 2012; Zuo et al. 2018; Fazilat and Zioui 2025b)"},"properties":{"noteIndex":0},"schema":"https://github.com/citation-style-language/schema/raw/master/csl-citation.json"}</w:instrText>
+              <w:instrText xml:space="preserve">ADDIN CSL_CITATION {"citationID":"MENDELEY_CITATION_435","citationItems":[{"id":"ITEM-433","isTemporary":false,"itemData":{"DOI":"10.1109/TMECH.2010.2090896","author":[{"family":"Dong","given":"Daoyi"},{"family":"Chen","given":"Chunlin"},{"family":"Chu","given":"Jian"},{"family":"Tarn","given":"Tzyh-Jong"}],"container-title":"IEEE/ASME Transactions on Mechatronics","id":"Dong2012","issue":"1","issued":{"date-parts":[[2012]]},"page":"86-97","publisher":"IEEE","title":"Robust quantum-inspired reinforcement learning for robot navigation","type":"article-journal","volume":"17"}},{"id":"ITEM-434","isTemporary":false,"itemData":{"DOI":"10.1155/2018/1596080","author":[{"family":"Zuo","given":"Tao"},{"family":"Min","given":"Huasong"},{"family":"Tang","given":"Quan"},{"family":"Tao","given":"Qiang"}],"container-title":"Mathematical Problems in Engineering","id":"Zuo2018","issued":{"date-parts":[[2018]]},"page":"1596080","publisher":"Hindawi","title":"A robot SLAM improved by quantum-behaved particles swarm optimization","type":"article-journal","volume":"2018"}},{"id":"ITEM-435","isTemporary":false,"itemData":{"DOI":"10.1016/j.robot.2025.105123","author":[{"family":"Fazilat","given":"Mehdi"},{"family":"Zioui","given":"Nadjet"}],"container-title":"Robotics and Autonomous Systems","id":"Fazilat2025b","issued":{"date-parts":[[2025]]},"page":"105123","publisher":"Elsevier","title":"Quantum neural network-based inverse kinematics of a six-jointed industrial robotic arm","type":"article-journal","volume":"194"}}],"isEdited":false,"manualOverride":{"citeprocText":"(Dong et al. 2012; Zuo et al. 2018; Fazilat and Zioui 2025b)","isManuallyOverridden":false,"manualOverrideText":""},"mendeley":{"formattedCitation":"(Dong et al. 2012; Zuo et al. 2018; Fazilat and Zioui 2025b)","plainTextFormattedCitation":"(Dong et al. 2012; Zuo et al. 2018; Fazilat and Zioui 2025b)","previouslyFormattedCitation":"(Dong et al. 2012; Zuo et al. 2018; Fazilat and Zioui 2025b)"},"properties":{"noteIndex":0},"schema":"https://github.com/citation-style-language/schema/raw/master/csl-citation.json"}</w:instrText>
             </w:r>
             <w:r>
               <w:fldChar w:fldCharType="separate"/>
@@ -16877,7 +17067,7 @@
               <w:fldChar w:fldCharType="begin"/>
             </w:r>
             <w:r>
-              <w:instrText xml:space="preserve">ADDIN CSL_CITATION {"citationID":"MENDELEY_CITATION_424","citationItems":[{"id":"ITEM-422","isTemporary":false,"itemData":{"DOI":"10.48550/arXiv.2504.08167","URL":"https://arxiv.org/abs/2504.08167","author":[{"family":"Muradoglu","given":"Murat"},{"family":"Johnsson","given":"Mattias T."},{"family":"Wilson","given":"Nathanial M."},{"family":"Cohen","given":"Yuval"},{"family":"Shin","given":"Dongki"},{"family":"Navickas","given":"Tomas"},{"family":"Pyragius","given":"Tadas"},{"family":"Thomas","given":"Divya"},{"family":"Thompson","given":"Daniel"},{"family":"Moore","given":"Steven I."},{"family":"Rahman","given":"Md Tanvir"},{"family":"Walker","given":"Adrian"},{"family":"Dutta","given":"Indranil"},{"family":"Bijjahalli","given":"Suraj"},{"family":"Berlocher","given":"Jacob"},{"family":"Hush","given":"Michael R."},{"family":"Anderson","given":"Russell P."},{"family":"Szigeti","given":"Stuart S."},{"family":"Biercuk","given":"Michael J."}],"id":"Muradoglu2025","issued":{"date-parts":[[2025]]},"title":"Quantum-assured magnetic navigation achieves positioning accuracy better than a strategic-grade INS in airborne and ground-based field trials","type":""}},{"id":"ITEM-423","isTemporary":false,"itemData":{"DOI":"10.1103/PhysRevApplied.10.034030","author":[{"family":"Cheiney","given":"Pierrick"},{"family":"Fouché","given":"Lauriane"},{"family":"Templier","given":"Simon"},{"family":"Napolitano","given":"Fabien"},{"family":"Battelier","given":"Baptiste"},{"family":"Bouyer","given":"Philippe"},{"family":"Barrett","given":"Brynle"}],"container-title":"Physical Review Applied","id":"Cheiney2018","issue":"3","issued":{"date-parts":[[2018]]},"page":"034030","publisher":"American Physical Society","title":"Navigation-compatible hybrid quantum accelerometer using a Kalman filter","type":"article-journal","volume":"10"}},{"id":"ITEM-424","isTemporary":false,"itemData":{"DOI":"10.1126/sciadv.add3854","author":[{"family":"Templier","given":"Simon"},{"family":"Cheiney","given":"Pierrick"},{"dropping-particle":"d’Armagnac de","family":"Castanet","given":"Quentin"},{"family":"Gouraud","given":"Baptiste"},{"family":"Porte","given":"Henri"},{"family":"Napolitano","given":"Fabien"},{"family":"Bouyer","given":"Philippe"},{"family":"Battelier","given":"Baptiste"},{"family":"Barrett","given":"Brynle"}],"container-title":"Science Advances","id":"Templier2022","issued":{"date-parts":[[2022]]},"page":"eadd3854","title":"Tracking the vector acceleration with a hybrid quantum accelerometer triad","type":"article-journal","volume":"8"}}],"isEdited":false,"manualOverride":{"citeprocText":"(Muradoglu et al. 2025; Cheiney et al. 2018; Templier et al. 2022)","isManuallyOverridden":false,"manualOverrideText":""},"mendeley":{"formattedCitation":"(Muradoglu et al. 2025; Cheiney et al. 2018; Templier et al. 2022)","plainTextFormattedCitation":"(Muradoglu et al. 2025; Cheiney et al. 2018; Templier et al. 2022)","previouslyFormattedCitation":"(Muradoglu et al. 2025; Cheiney et al. 2018; Templier et al. 2022)"},"properties":{"noteIndex":0},"schema":"https://github.com/citation-style-language/schema/raw/master/csl-citation.json"}</w:instrText>
+              <w:instrText xml:space="preserve">ADDIN CSL_CITATION {"citationID":"MENDELEY_CITATION_438","citationItems":[{"id":"ITEM-436","isTemporary":false,"itemData":{"DOI":"10.48550/arXiv.2504.08167","URL":"https://arxiv.org/abs/2504.08167","author":[{"family":"Muradoglu","given":"Murat"},{"family":"Johnsson","given":"Mattias T."},{"family":"Wilson","given":"Nathanial M."},{"family":"Cohen","given":"Yuval"},{"family":"Shin","given":"Dongki"},{"family":"Navickas","given":"Tomas"},{"family":"Pyragius","given":"Tadas"},{"family":"Thomas","given":"Divya"},{"family":"Thompson","given":"Daniel"},{"family":"Moore","given":"Steven I."},{"family":"Rahman","given":"Md Tanvir"},{"family":"Walker","given":"Adrian"},{"family":"Dutta","given":"Indranil"},{"family":"Bijjahalli","given":"Suraj"},{"family":"Berlocher","given":"Jacob"},{"family":"Hush","given":"Michael R."},{"family":"Anderson","given":"Russell P."},{"family":"Szigeti","given":"Stuart S."},{"family":"Biercuk","given":"Michael J."}],"id":"Muradoglu2025","issued":{"date-parts":[[2025]]},"title":"Quantum-assured magnetic navigation achieves positioning accuracy better than a strategic-grade INS in airborne and ground-based field trials","type":""}},{"id":"ITEM-437","isTemporary":false,"itemData":{"DOI":"10.1103/PhysRevApplied.10.034030","author":[{"family":"Cheiney","given":"Pierrick"},{"family":"Fouché","given":"Lauriane"},{"family":"Templier","given":"Simon"},{"family":"Napolitano","given":"Fabien"},{"family":"Battelier","given":"Baptiste"},{"family":"Bouyer","given":"Philippe"},{"family":"Barrett","given":"Brynle"}],"container-title":"Physical Review Applied","id":"Cheiney2018","issue":"3","issued":{"date-parts":[[2018]]},"page":"034030","publisher":"American Physical Society","title":"Navigation-compatible hybrid quantum accelerometer using a Kalman filter","type":"article-journal","volume":"10"}},{"id":"ITEM-438","isTemporary":false,"itemData":{"DOI":"10.1126/sciadv.add3854","author":[{"family":"Templier","given":"Simon"},{"family":"Cheiney","given":"Pierrick"},{"dropping-particle":"d’Armagnac de","family":"Castanet","given":"Quentin"},{"family":"Gouraud","given":"Baptiste"},{"family":"Porte","given":"Henri"},{"family":"Napolitano","given":"Fabien"},{"family":"Bouyer","given":"Philippe"},{"family":"Battelier","given":"Baptiste"},{"family":"Barrett","given":"Brynle"}],"container-title":"Science Advances","id":"Templier2022","issued":{"date-parts":[[2022]]},"page":"eadd3854","title":"Tracking the vector acceleration with a hybrid quantum accelerometer triad","type":"article-journal","volume":"8"}}],"isEdited":false,"manualOverride":{"citeprocText":"(Muradoglu et al. 2025; Cheiney et al. 2018; Templier et al. 2022)","isManuallyOverridden":false,"manualOverrideText":""},"mendeley":{"formattedCitation":"(Muradoglu et al. 2025; Cheiney et al. 2018; Templier et al. 2022)","plainTextFormattedCitation":"(Muradoglu et al. 2025; Cheiney et al. 2018; Templier et al. 2022)","previouslyFormattedCitation":"(Muradoglu et al. 2025; Cheiney et al. 2018; Templier et al. 2022)"},"properties":{"noteIndex":0},"schema":"https://github.com/citation-style-language/schema/raw/master/csl-citation.json"}</w:instrText>
             </w:r>
             <w:r>
               <w:fldChar w:fldCharType="separate"/>
@@ -16954,7 +17144,7 @@
               <w:fldChar w:fldCharType="begin"/>
             </w:r>
             <w:r>
-              <w:instrText xml:space="preserve">ADDIN CSL_CITATION {"citationID":"MENDELEY_CITATION_429","citationItems":[{"id":"ITEM-425","isTemporary":false,"itemData":{"DOI":"10.3390/e25040548","author":[{"family":"Widdows","given":"Dominic"},{"family":"Rani","given":"Jyoti"},{"family":"Pothos","given":"Emmanuel M."}],"container-title":"Entropy","id":"Widdows2023","issue":"4","issued":{"date-parts":[[2023]]},"page":"548","publisher":"MDPI","title":"Quantum circuit components for cognitive decision-making","type":"article-journal","volume":"25"}},{"id":"ITEM-426","isTemporary":false,"itemData":{"DOI":"10.3390/electronics10020100","author":[{"family":"Yan","given":"Fei"},{"family":"Iliyasu","given":"Abdullah M."},{"family":"Hirota","given":"Kaoru"}],"container-title":"Electronics","id":"Yan2021","issue":"2","issued":{"date-parts":[[2021]]},"page":"100","publisher":"MDPI","title":"Conceptual framework for quantum affective computing and its use in fusion of multi-robot emotions","type":"article-journal","volume":"10"}},{"id":"ITEM-427","isTemporary":false,"itemData":{"DOI":"10.3390/e25091323","author":[{"family":"Lawless","given":"William F."},{"family":"Moskowitz","given":"Ira S."},{"family":"Doctor","given":"Katarina Z."}],"container-title":"Entropy","id":"Lawless2023","issue":"9","issued":{"date-parts":[[2023]]},"page":"1323","publisher":"MDPI","title":"A quantum-like model of interdependence for embodied human–machine teams: Reviewing the path to autonomy facing complexity and uncertainty","title-short":"A quantum-like model of interdependence for embodied human–machine teams","type":"article-journal","volume":"25"}},{"id":"ITEM-428","isTemporary":false,"itemData":{"DOI":"10.3390/e27020152","author":[{"family":"Humr","given":"Scott"},{"family":"Canan","given":"Mustafa"},{"family":"Demir","given":"Mustafa"}],"container-title":"Entropy","id":"Humr2025","issue":"2","issued":{"date-parts":[[2025]]},"page":"152","publisher":"MDPI","title":"A quantum probability approach to improving human–AI decision making","type":"article-journal","volume":"27"}},{"id":"ITEM-429","isTemporary":false,"itemData":{"URL":"https://arxiv.org/abs/2602.03571","author":[{"family":"Essalmi","given":"Karim"},{"family":"Garrido","given":"Fernando"},{"family":"Nashashibi","given":"Fawzi"}],"id":"Essalmi2026","issued":{"date-parts":[[2026]]},"title":"Multi-player, multi-strategy quantum game model for interaction-aware decision-making in automated driving","type":""}}],"isEdited":false,"manualOverride":{"citeprocText":"(Widdows, Rani, and Pothos 2023; Yan, Iliyasu, and Hirota 2021; Lawless, Moskowitz, and Doctor 2023; Humr, Canan, and Demir 2025; Essalmi, Garrido, and Nashashibi 2026)","isManuallyOverridden":false,"manualOverrideText":""},"mendeley":{"formattedCitation":"(Widdows, Rani, and Pothos 2023; Yan, Iliyasu, and Hirota 2021; Lawless, Moskowitz, and Doctor 2023; Humr, Canan, and Demir 2025; Essalmi, Garrido, and Nashashibi 2026)","plainTextFormattedCitation":"(Widdows, Rani, and Pothos 2023; Yan, Iliyasu, and Hirota 2021; Lawless, Moskowitz, and Doctor 2023; Humr, Canan, and Demir 2025; Essalmi, Garrido, and Nashashibi 2026)","previouslyFormattedCitation":"(Widdows, Rani, and Pothos 2023; Yan, Iliyasu, and Hirota 2021; Lawless, Moskowitz, and Doctor 2023; Humr, Canan, and Demir 2025; Essalmi, Garrido, and Nashashibi 2026)"},"properties":{"noteIndex":0},"schema":"https://github.com/citation-style-language/schema/raw/master/csl-citation.json"}</w:instrText>
+              <w:instrText xml:space="preserve">ADDIN CSL_CITATION {"citationID":"MENDELEY_CITATION_443","citationItems":[{"id":"ITEM-439","isTemporary":false,"itemData":{"DOI":"10.3390/e25040548","author":[{"family":"Widdows","given":"Dominic"},{"family":"Rani","given":"Jyoti"},{"family":"Pothos","given":"Emmanuel M."}],"container-title":"Entropy","id":"Widdows2023","issue":"4","issued":{"date-parts":[[2023]]},"page":"548","publisher":"MDPI","title":"Quantum circuit components for cognitive decision-making","type":"article-journal","volume":"25"}},{"id":"ITEM-440","isTemporary":false,"itemData":{"DOI":"10.3390/electronics10020100","author":[{"family":"Yan","given":"Fei"},{"family":"Iliyasu","given":"Abdullah M."},{"family":"Hirota","given":"Kaoru"}],"container-title":"Electronics","id":"Yan2021","issue":"2","issued":{"date-parts":[[2021]]},"page":"100","publisher":"MDPI","title":"Conceptual framework for quantum affective computing and its use in fusion of multi-robot emotions","type":"article-journal","volume":"10"}},{"id":"ITEM-441","isTemporary":false,"itemData":{"DOI":"10.3390/e25091323","author":[{"family":"Lawless","given":"William F."},{"family":"Moskowitz","given":"Ira S."},{"family":"Doctor","given":"Katarina Z."}],"container-title":"Entropy","id":"Lawless2023","issue":"9","issued":{"date-parts":[[2023]]},"page":"1323","publisher":"MDPI","title":"A quantum-like model of interdependence for embodied human–machine teams: Reviewing the path to autonomy facing complexity and uncertainty","title-short":"A quantum-like model of interdependence for embodied human–machine teams","type":"article-journal","volume":"25"}},{"id":"ITEM-442","isTemporary":false,"itemData":{"DOI":"10.3390/e27020152","author":[{"family":"Humr","given":"Scott"},{"family":"Canan","given":"Mustafa"},{"family":"Demir","given":"Mustafa"}],"container-title":"Entropy","id":"Humr2025","issue":"2","issued":{"date-parts":[[2025]]},"page":"152","publisher":"MDPI","title":"A quantum probability approach to improving human–AI decision making","type":"article-journal","volume":"27"}},{"id":"ITEM-443","isTemporary":false,"itemData":{"URL":"https://arxiv.org/abs/2602.03571","author":[{"family":"Essalmi","given":"Karim"},{"family":"Garrido","given":"Fernando"},{"family":"Nashashibi","given":"Fawzi"}],"id":"Essalmi2026","issued":{"date-parts":[[2026]]},"title":"Multi-player, multi-strategy quantum game model for interaction-aware decision-making in automated driving","type":""}}],"isEdited":false,"manualOverride":{"citeprocText":"(Widdows, Rani, and Pothos 2023; Yan, Iliyasu, and Hirota 2021; Lawless, Moskowitz, and Doctor 2023; Humr, Canan, and Demir 2025; Essalmi, Garrido, and Nashashibi 2026)","isManuallyOverridden":false,"manualOverrideText":""},"mendeley":{"formattedCitation":"(Widdows, Rani, and Pothos 2023; Yan, Iliyasu, and Hirota 2021; Lawless, Moskowitz, and Doctor 2023; Humr, Canan, and Demir 2025; Essalmi, Garrido, and Nashashibi 2026)","plainTextFormattedCitation":"(Widdows, Rani, and Pothos 2023; Yan, Iliyasu, and Hirota 2021; Lawless, Moskowitz, and Doctor 2023; Humr, Canan, and Demir 2025; Essalmi, Garrido, and Nashashibi 2026)","previouslyFormattedCitation":"(Widdows, Rani, and Pothos 2023; Yan, Iliyasu, and Hirota 2021; Lawless, Moskowitz, and Doctor 2023; Humr, Canan, and Demir 2025; Essalmi, Garrido, and Nashashibi 2026)"},"properties":{"noteIndex":0},"schema":"https://github.com/citation-style-language/schema/raw/master/csl-citation.json"}</w:instrText>
             </w:r>
             <w:r>
               <w:fldChar w:fldCharType="separate"/>
@@ -17031,7 +17221,7 @@
               <w:fldChar w:fldCharType="begin"/>
             </w:r>
             <w:r>
-              <w:instrText xml:space="preserve">ADDIN CSL_CITATION {"citationID":"MENDELEY_CITATION_431","citationItems":[{"id":"ITEM-430","isTemporary":false,"itemData":{"DOI":"10.1016/j.swevo.2023.101297","author":[{"family":"Mannone","given":"Maria"},{"family":"Seidita","given":"Valeria"},{"family":"Chella","given":"Antonio"}],"container-title":"Swarm and Evolutionary Computation","id":"Mannone2023","issued":{"date-parts":[[2023]]},"page":"101297","title":"Modeling and designing a robotic swarm: A quantum computing approach","title-short":"Modeling and designing a robotic swarm","type":"article-journal","volume":"79"}},{"id":"ITEM-431","isTemporary":false,"itemData":{"DOI":"10.1098/rsta.2024.0139","author":[{"family":"Mannone","given":"Maria"},{"family":"Seidita","given":"Valeria"},{"family":"Chella","given":"Antonio"}],"container-title":"Philosophical Transactions of the Royal Society A: Mathematical, Physical and Engineering Sciences","id":"Mannone2025","issue":"2289","issued":{"date-parts":[[2025]]},"page":"20240139","title":"Quantum computing for swarm robotics: A local-to-global approach","title-short":"Quantum computing for swarm robotics","type":"article-journal","volume":"383"}}],"isEdited":false,"manualOverride":{"citeprocText":"(Mannone, Seidita, and Chella 2023, 2025)","isManuallyOverridden":false,"manualOverrideText":""},"mendeley":{"formattedCitation":"(Mannone, Seidita, and Chella 2023, 2025)","plainTextFormattedCitation":"(Mannone, Seidita, and Chella 2023, 2025)","previouslyFormattedCitation":"(Mannone, Seidita, and Chella 2023, 2025)"},"properties":{"noteIndex":0},"schema":"https://github.com/citation-style-language/schema/raw/master/csl-citation.json"}</w:instrText>
+              <w:instrText xml:space="preserve">ADDIN CSL_CITATION {"citationID":"MENDELEY_CITATION_445","citationItems":[{"id":"ITEM-444","isTemporary":false,"itemData":{"DOI":"10.1016/j.swevo.2023.101297","author":[{"family":"Mannone","given":"Maria"},{"family":"Seidita","given":"Valeria"},{"family":"Chella","given":"Antonio"}],"container-title":"Swarm and Evolutionary Computation","id":"Mannone2023","issued":{"date-parts":[[2023]]},"page":"101297","title":"Modeling and designing a robotic swarm: A quantum computing approach","title-short":"Modeling and designing a robotic swarm","type":"article-journal","volume":"79"}},{"id":"ITEM-445","isTemporary":false,"itemData":{"DOI":"10.1098/rsta.2024.0139","author":[{"family":"Mannone","given":"Maria"},{"family":"Seidita","given":"Valeria"},{"family":"Chella","given":"Antonio"}],"container-title":"Philosophical Transactions of the Royal Society A: Mathematical, Physical and Engineering Sciences","id":"Mannone2025","issue":"2289","issued":{"date-parts":[[2025]]},"page":"20240139","title":"Quantum computing for swarm robotics: A local-to-global approach","title-short":"Quantum computing for swarm robotics","type":"article-journal","volume":"383"}}],"isEdited":false,"manualOverride":{"citeprocText":"(Mannone, Seidita, and Chella 2023, 2025)","isManuallyOverridden":false,"manualOverrideText":""},"mendeley":{"formattedCitation":"(Mannone, Seidita, and Chella 2023, 2025)","plainTextFormattedCitation":"(Mannone, Seidita, and Chella 2023, 2025)","previouslyFormattedCitation":"(Mannone, Seidita, and Chella 2023, 2025)"},"properties":{"noteIndex":0},"schema":"https://github.com/citation-style-language/schema/raw/master/csl-citation.json"}</w:instrText>
             </w:r>
             <w:r>
               <w:fldChar w:fldCharType="separate"/>
@@ -17108,7 +17298,7 @@
               <w:fldChar w:fldCharType="begin"/>
             </w:r>
             <w:r>
-              <w:instrText xml:space="preserve">ADDIN CSL_CITATION {"citationID":"MENDELEY_CITATION_435","citationItems":[{"id":"ITEM-432","isTemporary":false,"itemData":{"DOI":"10.1103/PhysRevLett.133.200801","author":[{"family":"Tian","given":"Xiao-Hui"},{"family":"Yang","given":"Ran"},{"family":"Liu","given":"Hua-Ying"},{"family":"Fan","given":"Pengfei"},{"family":"Zhang","given":"Ji-Ning"},{"family":"Gu","given":"Changsheng"},{"family":"Chen","given":"Mengwen"},{"family":"Hu","given":"Mingzhe"},{"family":"Lu","given":"Feng-Yu"},{"family":"Yin","given":"Zhen-Qiang"},{"family":"Yin","given":"Zhi-Jun"},{"family":"Yuan","given":"Mo"},{"family":"Wang","given":"Shuang"},{"family":"Chen","given":"Wei"},{"family":"Gong","given":"Yan-Xiao"},{"family":"Zhu","given":"Shi-Ning"},{"family":"Xie","given":"Zhenda"}],"container-title":"Physical Review Letters","id":"Tian2023","issue":"20","issued":{"date-parts":[[2024]]},"page":"200801","publisher":"American Physical Society","title":"Experimental demonstration of drone-based quantum key distribution","type":"article-journal","volume":"133"}},{"id":"ITEM-433","isTemporary":false,"itemData":{"DOI":"10.48550/arXiv.2505.17587","URL":"https://arxiv.org/abs/2505.17587","author":[{"family":"Conrad","given":"Andrew"},{"family":"Cochran","given":"Roderick"},{"family":"Sanchez-Rosales","given":"Daniel"},{"family":"Isaac","given":"Samantha"},{"family":"Javid","given":"Timur"},{"family":"Rezaei","given":"Tahereh"},{"family":"Schroeder","given":"A. J."},{"family":"Golba","given":"Grzegorz"},{"family":"Gutha","given":"Akash"},{"family":"Wilens","given":"Brian"},{"family":"Herndon","given":"Kyle"},{"family":"Hill","given":"Alex"},{"family":"Chapman","given":"Joseph"},{"family":"Call","given":"Ian"},{"family":"Szabo","given":"Joseph"},{"family":"Corrigan","given":"Aodhan"},{"family":"Kamin","given":"Lars"},{"family":"Lütkenhaus","given":"Norbert"},{"family":"Gauthier","given":"Daniel J."},{"family":"Kwiat","given":"Paul G."}],"id":"Conrad2025","issued":{"date-parts":[[2025]]},"title":"Drone- and vehicle-based quantum key distribution","type":""}},{"id":"ITEM-434","isTemporary":false,"itemData":{"DOI":"10.48550/arXiv.2008.12230","URL":"https://arxiv.org/abs/2008.12230","author":[{"family":"Khoshnoud","given":"Farbod"},{"family":"Quadrelli","given":"Marco B."},{"family":"Esat","given":"Ibrahim I."},{"family":"Robinson","given":"Dario"}],"id":"Khoshnoud2020","issued":{"date-parts":[[2020]]},"title":"Quantum cooperative robotics and autonomy","type":""}},{"id":"ITEM-435","isTemporary":false,"itemData":{"DOI":"10.1103/PhysRevLett.126.020503","author":[{"family":"Liu","given":"Hua-Ying"},{"family":"Tian","given":"Xiao-Hui"},{"family":"Gu","given":"Changsheng"},{"family":"Fan","given":"Pengfei"},{"family":"Ni","given":"Xin"},{"family":"Yang","given":"Ran"},{"family":"Zhang","given":"Ji-Ning"},{"family":"Hu","given":"Mingzhe"},{"family":"Guo","given":"Jian"},{"family":"Cao","given":"Xun"},{"family":"Hu","given":"Xiaopeng"},{"family":"Zhao","given":"Gang"},{"family":"Lu","given":"Yan-Qing"},{"family":"Gong","given":"Yan-Xiao"},{"family":"Xie","given":"Zhenda"},{"family":"Zhu","given":"Shi-Ning"}],"container-title":"Physical Review Letters","id":"Liu2021","issued":{"date-parts":[[2021]]},"page":"020503","title":"Optical-relayed entanglement distribution using drones as mobile nodes","type":"article-journal","volume":"126"}}],"isEdited":false,"manualOverride":{"citeprocText":"(Tian et al. 2024; Conrad et al. 2025; Khoshnoud et al. 2020; Liu et al. 2021)","isManuallyOverridden":false,"manualOverrideText":""},"mendeley":{"formattedCitation":"(Tian et al. 2024; Conrad et al. 2025; Khoshnoud et al. 2020; Liu et al. 2021)","plainTextFormattedCitation":"(Tian et al. 2024; Conrad et al. 2025; Khoshnoud et al. 2020; Liu et al. 2021)","previouslyFormattedCitation":"(Tian et al. 2024; Conrad et al. 2025; Khoshnoud et al. 2020; Liu et al. 2021)"},"properties":{"noteIndex":0},"schema":"https://github.com/citation-style-language/schema/raw/master/csl-citation.json"}</w:instrText>
+              <w:instrText xml:space="preserve">ADDIN CSL_CITATION {"citationID":"MENDELEY_CITATION_449","citationItems":[{"id":"ITEM-446","isTemporary":false,"itemData":{"DOI":"10.1103/PhysRevLett.133.200801","author":[{"family":"Tian","given":"Xiao-Hui"},{"family":"Yang","given":"Ran"},{"family":"Liu","given":"Hua-Ying"},{"family":"Fan","given":"Pengfei"},{"family":"Zhang","given":"Ji-Ning"},{"family":"Gu","given":"Changsheng"},{"family":"Chen","given":"Mengwen"},{"family":"Hu","given":"Mingzhe"},{"family":"Lu","given":"Feng-Yu"},{"family":"Yin","given":"Zhen-Qiang"},{"family":"Yin","given":"Zhi-Jun"},{"family":"Yuan","given":"Mo"},{"family":"Wang","given":"Shuang"},{"family":"Chen","given":"Wei"},{"family":"Gong","given":"Yan-Xiao"},{"family":"Zhu","given":"Shi-Ning"},{"family":"Xie","given":"Zhenda"}],"container-title":"Physical Review Letters","id":"Tian2023","issue":"20","issued":{"date-parts":[[2024]]},"page":"200801","publisher":"American Physical Society","title":"Experimental demonstration of drone-based quantum key distribution","type":"article-journal","volume":"133"}},{"id":"ITEM-447","isTemporary":false,"itemData":{"DOI":"10.48550/arXiv.2505.17587","URL":"https://arxiv.org/abs/2505.17587","author":[{"family":"Conrad","given":"Andrew"},{"family":"Cochran","given":"Roderick"},{"family":"Sanchez-Rosales","given":"Daniel"},{"family":"Isaac","given":"Samantha"},{"family":"Javid","given":"Timur"},{"family":"Rezaei","given":"Tahereh"},{"family":"Schroeder","given":"A. J."},{"family":"Golba","given":"Grzegorz"},{"family":"Gutha","given":"Akash"},{"family":"Wilens","given":"Brian"},{"family":"Herndon","given":"Kyle"},{"family":"Hill","given":"Alex"},{"family":"Chapman","given":"Joseph"},{"family":"Call","given":"Ian"},{"family":"Szabo","given":"Joseph"},{"family":"Corrigan","given":"Aodhan"},{"family":"Kamin","given":"Lars"},{"family":"Lütkenhaus","given":"Norbert"},{"family":"Gauthier","given":"Daniel J."},{"family":"Kwiat","given":"Paul G."}],"id":"Conrad2025","issued":{"date-parts":[[2025]]},"title":"Drone- and vehicle-based quantum key distribution","type":""}},{"id":"ITEM-448","isTemporary":false,"itemData":{"DOI":"10.48550/arXiv.2008.12230","URL":"https://arxiv.org/abs/2008.12230","author":[{"family":"Khoshnoud","given":"Farbod"},{"family":"Quadrelli","given":"Marco B."},{"family":"Esat","given":"Ibrahim I."},{"family":"Robinson","given":"Dario"}],"id":"Khoshnoud2020","issued":{"date-parts":[[2020]]},"title":"Quantum cooperative robotics and autonomy","type":""}},{"id":"ITEM-449","isTemporary":false,"itemData":{"DOI":"10.1103/PhysRevLett.126.020503","author":[{"family":"Liu","given":"Hua-Ying"},{"family":"Tian","given":"Xiao-Hui"},{"family":"Gu","given":"Changsheng"},{"family":"Fan","given":"Pengfei"},{"family":"Ni","given":"Xin"},{"family":"Yang","given":"Ran"},{"family":"Zhang","given":"Ji-Ning"},{"family":"Hu","given":"Mingzhe"},{"family":"Guo","given":"Jian"},{"family":"Cao","given":"Xun"},{"family":"Hu","given":"Xiaopeng"},{"family":"Zhao","given":"Gang"},{"family":"Lu","given":"Yan-Qing"},{"family":"Gong","given":"Yan-Xiao"},{"family":"Xie","given":"Zhenda"},{"family":"Zhu","given":"Shi-Ning"}],"container-title":"Physical Review Letters","id":"Liu2021","issued":{"date-parts":[[2021]]},"page":"020503","title":"Optical-relayed entanglement distribution using drones as mobile nodes","type":"article-journal","volume":"126"}}],"isEdited":false,"manualOverride":{"citeprocText":"(Tian et al. 2024; Conrad et al. 2025; Khoshnoud et al. 2020; Liu et al. 2021)","isManuallyOverridden":false,"manualOverrideText":""},"mendeley":{"formattedCitation":"(Tian et al. 2024; Conrad et al. 2025; Khoshnoud et al. 2020; Liu et al. 2021)","plainTextFormattedCitation":"(Tian et al. 2024; Conrad et al. 2025; Khoshnoud et al. 2020; Liu et al. 2021)","previouslyFormattedCitation":"(Tian et al. 2024; Conrad et al. 2025; Khoshnoud et al. 2020; Liu et al. 2021)"},"properties":{"noteIndex":0},"schema":"https://github.com/citation-style-language/schema/raw/master/csl-citation.json"}</w:instrText>
             </w:r>
             <w:r>
               <w:fldChar w:fldCharType="separate"/>
@@ -17213,7 +17403,7 @@
         <w:t xml:space="preserve"> </w:t>
       </w:r>
       <w:r>
-        <w:t xml:space="preserve">places the 63 empirical and theoretical primary studies (the 7 reviews are excluded) on the evidence hierarchy of Table</w:t>
+        <w:t xml:space="preserve">places the 65 empirical and theoretical primary studies (the 7 reviews are excluded) on the evidence hierarchy of Table</w:t>
       </w:r>
       <w:r>
         <w:t xml:space="preserve"> </w:t>
@@ -17227,13 +17417,13 @@
         </w:r>
       </w:hyperlink>
       <w:r>
-        <w:t xml:space="preserve">. The distribution is bottom-heavy: 4 studies are at L1, 19 at L2, 23 at L3, and 10 at L4, all of the latter in simulated robot environments. At L5, quantum communication has been demonstrated on drones, vehicles, and cooperating robots </w:t>
-      </w:r>
-      <w:r>
-        <w:fldChar w:fldCharType="begin"/>
-      </w:r>
-      <w:r>
-        <w:instrText xml:space="preserve">ADDIN CSL_CITATION {"citationID":"MENDELEY_CITATION_439","citationItems":[{"id":"ITEM-436","isTemporary":false,"itemData":{"DOI":"10.1103/PhysRevLett.133.200801","author":[{"family":"Tian","given":"Xiao-Hui"},{"family":"Yang","given":"Ran"},{"family":"Liu","given":"Hua-Ying"},{"family":"Fan","given":"Pengfei"},{"family":"Zhang","given":"Ji-Ning"},{"family":"Gu","given":"Changsheng"},{"family":"Chen","given":"Mengwen"},{"family":"Hu","given":"Mingzhe"},{"family":"Lu","given":"Feng-Yu"},{"family":"Yin","given":"Zhen-Qiang"},{"family":"Yin","given":"Zhi-Jun"},{"family":"Yuan","given":"Mo"},{"family":"Wang","given":"Shuang"},{"family":"Chen","given":"Wei"},{"family":"Gong","given":"Yan-Xiao"},{"family":"Zhu","given":"Shi-Ning"},{"family":"Xie","given":"Zhenda"}],"container-title":"Physical Review Letters","id":"Tian2023","issue":"20","issued":{"date-parts":[[2024]]},"page":"200801","publisher":"American Physical Society","title":"Experimental demonstration of drone-based quantum key distribution","type":"article-journal","volume":"133"}},{"id":"ITEM-437","isTemporary":false,"itemData":{"DOI":"10.48550/arXiv.2505.17587","URL":"https://arxiv.org/abs/2505.17587","author":[{"family":"Conrad","given":"Andrew"},{"family":"Cochran","given":"Roderick"},{"family":"Sanchez-Rosales","given":"Daniel"},{"family":"Isaac","given":"Samantha"},{"family":"Javid","given":"Timur"},{"family":"Rezaei","given":"Tahereh"},{"family":"Schroeder","given":"A. J."},{"family":"Golba","given":"Grzegorz"},{"family":"Gutha","given":"Akash"},{"family":"Wilens","given":"Brian"},{"family":"Herndon","given":"Kyle"},{"family":"Hill","given":"Alex"},{"family":"Chapman","given":"Joseph"},{"family":"Call","given":"Ian"},{"family":"Szabo","given":"Joseph"},{"family":"Corrigan","given":"Aodhan"},{"family":"Kamin","given":"Lars"},{"family":"Lütkenhaus","given":"Norbert"},{"family":"Gauthier","given":"Daniel J."},{"family":"Kwiat","given":"Paul G."}],"id":"Conrad2025","issued":{"date-parts":[[2025]]},"title":"Drone- and vehicle-based quantum key distribution","type":""}},{"id":"ITEM-438","isTemporary":false,"itemData":{"DOI":"10.48550/arXiv.2008.12230","URL":"https://arxiv.org/abs/2008.12230","author":[{"family":"Khoshnoud","given":"Farbod"},{"family":"Quadrelli","given":"Marco B."},{"family":"Esat","given":"Ibrahim I."},{"family":"Robinson","given":"Dario"}],"id":"Khoshnoud2020","issued":{"date-parts":[[2020]]},"title":"Quantum cooperative robotics and autonomy","type":""}},{"id":"ITEM-439","isTemporary":false,"itemData":{"DOI":"10.1103/PhysRevLett.126.020503","author":[{"family":"Liu","given":"Hua-Ying"},{"family":"Tian","given":"Xiao-Hui"},{"family":"Gu","given":"Changsheng"},{"family":"Fan","given":"Pengfei"},{"family":"Ni","given":"Xin"},{"family":"Yang","given":"Ran"},{"family":"Zhang","given":"Ji-Ning"},{"family":"Hu","given":"Mingzhe"},{"family":"Guo","given":"Jian"},{"family":"Cao","given":"Xun"},{"family":"Hu","given":"Xiaopeng"},{"family":"Zhao","given":"Gang"},{"family":"Lu","given":"Yan-Qing"},{"family":"Gong","given":"Yan-Xiao"},{"family":"Xie","given":"Zhenda"},{"family":"Zhu","given":"Shi-Ning"}],"container-title":"Physical Review Letters","id":"Liu2021","issued":{"date-parts":[[2021]]},"page":"020503","title":"Optical-relayed entanglement distribution using drones as mobile nodes","type":"article-journal","volume":"126"}}],"isEdited":false,"manualOverride":{"citeprocText":"(Tian et al. 2024; Conrad et al. 2025; Khoshnoud et al. 2020; Liu et al. 2021)","isManuallyOverridden":false,"manualOverrideText":""},"mendeley":{"formattedCitation":"(Tian et al. 2024; Conrad et al. 2025; Khoshnoud et al. 2020; Liu et al. 2021)","plainTextFormattedCitation":"(Tian et al. 2024; Conrad et al. 2025; Khoshnoud et al. 2020; Liu et al. 2021)","previouslyFormattedCitation":"(Tian et al. 2024; Conrad et al. 2025; Khoshnoud et al. 2020; Liu et al. 2021)"},"properties":{"noteIndex":0},"schema":"https://github.com/citation-style-language/schema/raw/master/csl-citation.json"}</w:instrText>
+        <w:t xml:space="preserve">. The distribution is bottom-heavy: 6 studies are at L1, 19 at L2, 23 at L3, and 10 at L4, all of the latter in simulated robot environments. At L5, quantum communication has been demonstrated on drones, vehicles, and cooperating robots </w:t>
+      </w:r>
+      <w:r>
+        <w:fldChar w:fldCharType="begin"/>
+      </w:r>
+      <w:r>
+        <w:instrText xml:space="preserve">ADDIN CSL_CITATION {"citationID":"MENDELEY_CITATION_453","citationItems":[{"id":"ITEM-450","isTemporary":false,"itemData":{"DOI":"10.1103/PhysRevLett.133.200801","author":[{"family":"Tian","given":"Xiao-Hui"},{"family":"Yang","given":"Ran"},{"family":"Liu","given":"Hua-Ying"},{"family":"Fan","given":"Pengfei"},{"family":"Zhang","given":"Ji-Ning"},{"family":"Gu","given":"Changsheng"},{"family":"Chen","given":"Mengwen"},{"family":"Hu","given":"Mingzhe"},{"family":"Lu","given":"Feng-Yu"},{"family":"Yin","given":"Zhen-Qiang"},{"family":"Yin","given":"Zhi-Jun"},{"family":"Yuan","given":"Mo"},{"family":"Wang","given":"Shuang"},{"family":"Chen","given":"Wei"},{"family":"Gong","given":"Yan-Xiao"},{"family":"Zhu","given":"Shi-Ning"},{"family":"Xie","given":"Zhenda"}],"container-title":"Physical Review Letters","id":"Tian2023","issue":"20","issued":{"date-parts":[[2024]]},"page":"200801","publisher":"American Physical Society","title":"Experimental demonstration of drone-based quantum key distribution","type":"article-journal","volume":"133"}},{"id":"ITEM-451","isTemporary":false,"itemData":{"DOI":"10.48550/arXiv.2505.17587","URL":"https://arxiv.org/abs/2505.17587","author":[{"family":"Conrad","given":"Andrew"},{"family":"Cochran","given":"Roderick"},{"family":"Sanchez-Rosales","given":"Daniel"},{"family":"Isaac","given":"Samantha"},{"family":"Javid","given":"Timur"},{"family":"Rezaei","given":"Tahereh"},{"family":"Schroeder","given":"A. J."},{"family":"Golba","given":"Grzegorz"},{"family":"Gutha","given":"Akash"},{"family":"Wilens","given":"Brian"},{"family":"Herndon","given":"Kyle"},{"family":"Hill","given":"Alex"},{"family":"Chapman","given":"Joseph"},{"family":"Call","given":"Ian"},{"family":"Szabo","given":"Joseph"},{"family":"Corrigan","given":"Aodhan"},{"family":"Kamin","given":"Lars"},{"family":"Lütkenhaus","given":"Norbert"},{"family":"Gauthier","given":"Daniel J."},{"family":"Kwiat","given":"Paul G."}],"id":"Conrad2025","issued":{"date-parts":[[2025]]},"title":"Drone- and vehicle-based quantum key distribution","type":""}},{"id":"ITEM-452","isTemporary":false,"itemData":{"DOI":"10.48550/arXiv.2008.12230","URL":"https://arxiv.org/abs/2008.12230","author":[{"family":"Khoshnoud","given":"Farbod"},{"family":"Quadrelli","given":"Marco B."},{"family":"Esat","given":"Ibrahim I."},{"family":"Robinson","given":"Dario"}],"id":"Khoshnoud2020","issued":{"date-parts":[[2020]]},"title":"Quantum cooperative robotics and autonomy","type":""}},{"id":"ITEM-453","isTemporary":false,"itemData":{"DOI":"10.1103/PhysRevLett.126.020503","author":[{"family":"Liu","given":"Hua-Ying"},{"family":"Tian","given":"Xiao-Hui"},{"family":"Gu","given":"Changsheng"},{"family":"Fan","given":"Pengfei"},{"family":"Ni","given":"Xin"},{"family":"Yang","given":"Ran"},{"family":"Zhang","given":"Ji-Ning"},{"family":"Hu","given":"Mingzhe"},{"family":"Guo","given":"Jian"},{"family":"Cao","given":"Xun"},{"family":"Hu","given":"Xiaopeng"},{"family":"Zhao","given":"Gang"},{"family":"Lu","given":"Yan-Qing"},{"family":"Gong","given":"Yan-Xiao"},{"family":"Xie","given":"Zhenda"},{"family":"Zhu","given":"Shi-Ning"}],"container-title":"Physical Review Letters","id":"Liu2021","issued":{"date-parts":[[2021]]},"page":"020503","title":"Optical-relayed entanglement distribution using drones as mobile nodes","type":"article-journal","volume":"126"}}],"isEdited":false,"manualOverride":{"citeprocText":"(Tian et al. 2024; Conrad et al. 2025; Khoshnoud et al. 2020; Liu et al. 2021)","isManuallyOverridden":false,"manualOverrideText":""},"mendeley":{"formattedCitation":"(Tian et al. 2024; Conrad et al. 2025; Khoshnoud et al. 2020; Liu et al. 2021)","plainTextFormattedCitation":"(Tian et al. 2024; Conrad et al. 2025; Khoshnoud et al. 2020; Liu et al. 2021)","previouslyFormattedCitation":"(Tian et al. 2024; Conrad et al. 2025; Khoshnoud et al. 2020; Liu et al. 2021)"},"properties":{"noteIndex":0},"schema":"https://github.com/citation-style-language/schema/raw/master/csl-citation.json"}</w:instrText>
       </w:r>
       <w:r>
         <w:fldChar w:fldCharType="separate"/>
@@ -17251,7 +17441,7 @@
         <w:fldChar w:fldCharType="begin"/>
       </w:r>
       <w:r>
-        <w:instrText xml:space="preserve">ADDIN CSL_CITATION {"citationID":"MENDELEY_CITATION_440","citationItems":[{"id":"ITEM-440","isTemporary":false,"itemData":{"DOI":"10.1109/TMECH.2010.2090896","author":[{"family":"Dong","given":"Daoyi"},{"family":"Chen","given":"Chunlin"},{"family":"Chu","given":"Jian"},{"family":"Tarn","given":"Tzyh-Jong"}],"container-title":"IEEE/ASME Transactions on Mechatronics","id":"Dong2012","issue":"1","issued":{"date-parts":[[2012]]},"page":"86-97","publisher":"IEEE","title":"Robust quantum-inspired reinforcement learning for robot navigation","type":"article-journal","volume":"17"}}],"isEdited":false,"manualOverride":{"citeprocText":"(Dong et al. 2012)","isManuallyOverridden":false,"manualOverrideText":""},"mendeley":{"formattedCitation":"(Dong et al. 2012)","plainTextFormattedCitation":"(Dong et al. 2012)","previouslyFormattedCitation":"(Dong et al. 2012)"},"properties":{"noteIndex":0},"schema":"https://github.com/citation-style-language/schema/raw/master/csl-citation.json"}</w:instrText>
+        <w:instrText xml:space="preserve">ADDIN CSL_CITATION {"citationID":"MENDELEY_CITATION_454","citationItems":[{"id":"ITEM-454","isTemporary":false,"itemData":{"DOI":"10.1109/TMECH.2010.2090896","author":[{"family":"Dong","given":"Daoyi"},{"family":"Chen","given":"Chunlin"},{"family":"Chu","given":"Jian"},{"family":"Tarn","given":"Tzyh-Jong"}],"container-title":"IEEE/ASME Transactions on Mechatronics","id":"Dong2012","issue":"1","issued":{"date-parts":[[2012]]},"page":"86-97","publisher":"IEEE","title":"Robust quantum-inspired reinforcement learning for robot navigation","type":"article-journal","volume":"17"}}],"isEdited":false,"manualOverride":{"citeprocText":"(Dong et al. 2012)","isManuallyOverridden":false,"manualOverrideText":""},"mendeley":{"formattedCitation":"(Dong et al. 2012)","plainTextFormattedCitation":"(Dong et al. 2012)","previouslyFormattedCitation":"(Dong et al. 2012)"},"properties":{"noteIndex":0},"schema":"https://github.com/citation-style-language/schema/raw/master/csl-citation.json"}</w:instrText>
       </w:r>
       <w:r>
         <w:fldChar w:fldCharType="separate"/>
@@ -17269,7 +17459,7 @@
         <w:fldChar w:fldCharType="begin"/>
       </w:r>
       <w:r>
-        <w:instrText xml:space="preserve">ADDIN CSL_CITATION {"citationID":"MENDELEY_CITATION_441","citationItems":[{"id":"ITEM-441","isTemporary":false,"itemData":{"URL":"https://arxiv.org/abs/2508.01690","author":[{"family":"Sun","given":"Yize"},{"family":"Hagog","given":"Mohamad"},{"family":"Weber","given":"Marc"},{"family":"Hein","given":"Daniel"},{"family":"Udluft","given":"Steffen"},{"family":"Tresp","given":"Volker"},{"family":"Ma","given":"Yunpu"}],"id":"Sun2025","issued":{"date-parts":[[2025]]},"note":"QML@QCE 2025 workshop","title":"First experience with real-time control using simulated VQC-based quantum policies","type":""}}],"isEdited":false,"manualOverride":{"citeprocText":"(Sun et al. 2025)","isManuallyOverridden":false,"manualOverrideText":""},"mendeley":{"formattedCitation":"(Sun et al. 2025)","plainTextFormattedCitation":"(Sun et al. 2025)","previouslyFormattedCitation":"(Sun et al. 2025)"},"properties":{"noteIndex":0},"schema":"https://github.com/citation-style-language/schema/raw/master/csl-citation.json"}</w:instrText>
+        <w:instrText xml:space="preserve">ADDIN CSL_CITATION {"citationID":"MENDELEY_CITATION_455","citationItems":[{"id":"ITEM-455","isTemporary":false,"itemData":{"URL":"https://arxiv.org/abs/2508.01690","author":[{"family":"Sun","given":"Yize"},{"family":"Hagog","given":"Mohamad"},{"family":"Weber","given":"Marc"},{"family":"Hein","given":"Daniel"},{"family":"Udluft","given":"Steffen"},{"family":"Tresp","given":"Volker"},{"family":"Ma","given":"Yunpu"}],"id":"Sun2025","issued":{"date-parts":[[2025]]},"note":"QML@QCE 2025 workshop","title":"First experience with real-time control using simulated VQC-based quantum policies","type":""}}],"isEdited":false,"manualOverride":{"citeprocText":"(Sun et al. 2025)","isManuallyOverridden":false,"manualOverrideText":""},"mendeley":{"formattedCitation":"(Sun et al. 2025)","plainTextFormattedCitation":"(Sun et al. 2025)","previouslyFormattedCitation":"(Sun et al. 2025)"},"properties":{"noteIndex":0},"schema":"https://github.com/citation-style-language/schema/raw/master/csl-citation.json"}</w:instrText>
       </w:r>
       <w:r>
         <w:fldChar w:fldCharType="separate"/>
@@ -17287,7 +17477,7 @@
         <w:fldChar w:fldCharType="begin"/>
       </w:r>
       <w:r>
-        <w:instrText xml:space="preserve">ADDIN CSL_CITATION {"citationID":"MENDELEY_CITATION_442","citationItems":[{"id":"ITEM-442","isTemporary":false,"itemData":{"DOI":"10.48550/arXiv.2504.08167","URL":"https://arxiv.org/abs/2504.08167","author":[{"family":"Muradoglu","given":"Murat"},{"family":"Johnsson","given":"Mattias T."},{"family":"Wilson","given":"Nathanial M."},{"family":"Cohen","given":"Yuval"},{"family":"Shin","given":"Dongki"},{"family":"Navickas","given":"Tomas"},{"family":"Pyragius","given":"Tadas"},{"family":"Thomas","given":"Divya"},{"family":"Thompson","given":"Daniel"},{"family":"Moore","given":"Steven I."},{"family":"Rahman","given":"Md Tanvir"},{"family":"Walker","given":"Adrian"},{"family":"Dutta","given":"Indranil"},{"family":"Bijjahalli","given":"Suraj"},{"family":"Berlocher","given":"Jacob"},{"family":"Hush","given":"Michael R."},{"family":"Anderson","given":"Russell P."},{"family":"Szigeti","given":"Stuart S."},{"family":"Biercuk","given":"Michael J."}],"id":"Muradoglu2025","issued":{"date-parts":[[2025]]},"title":"Quantum-assured magnetic navigation achieves positioning accuracy better than a strategic-grade INS in airborne and ground-based field trials","type":""}}],"isEdited":false,"manualOverride":{"citeprocText":"(Muradoglu et al. 2025)","isManuallyOverridden":false,"manualOverrideText":""},"mendeley":{"formattedCitation":"(Muradoglu et al. 2025)","plainTextFormattedCitation":"(Muradoglu et al. 2025)","previouslyFormattedCitation":"(Muradoglu et al. 2025)"},"properties":{"noteIndex":0},"schema":"https://github.com/citation-style-language/schema/raw/master/csl-citation.json"}</w:instrText>
+        <w:instrText xml:space="preserve">ADDIN CSL_CITATION {"citationID":"MENDELEY_CITATION_456","citationItems":[{"id":"ITEM-456","isTemporary":false,"itemData":{"DOI":"10.48550/arXiv.2504.08167","URL":"https://arxiv.org/abs/2504.08167","author":[{"family":"Muradoglu","given":"Murat"},{"family":"Johnsson","given":"Mattias T."},{"family":"Wilson","given":"Nathanial M."},{"family":"Cohen","given":"Yuval"},{"family":"Shin","given":"Dongki"},{"family":"Navickas","given":"Tomas"},{"family":"Pyragius","given":"Tadas"},{"family":"Thomas","given":"Divya"},{"family":"Thompson","given":"Daniel"},{"family":"Moore","given":"Steven I."},{"family":"Rahman","given":"Md Tanvir"},{"family":"Walker","given":"Adrian"},{"family":"Dutta","given":"Indranil"},{"family":"Bijjahalli","given":"Suraj"},{"family":"Berlocher","given":"Jacob"},{"family":"Hush","given":"Michael R."},{"family":"Anderson","given":"Russell P."},{"family":"Szigeti","given":"Stuart S."},{"family":"Biercuk","given":"Michael J."}],"id":"Muradoglu2025","issued":{"date-parts":[[2025]]},"title":"Quantum-assured magnetic navigation achieves positioning accuracy better than a strategic-grade INS in airborne and ground-based field trials","type":""}}],"isEdited":false,"manualOverride":{"citeprocText":"(Muradoglu et al. 2025)","isManuallyOverridden":false,"manualOverrideText":""},"mendeley":{"formattedCitation":"(Muradoglu et al. 2025)","plainTextFormattedCitation":"(Muradoglu et al. 2025)","previouslyFormattedCitation":"(Muradoglu et al. 2025)"},"properties":{"noteIndex":0},"schema":"https://github.com/citation-style-language/schema/raw/master/csl-citation.json"}</w:instrText>
       </w:r>
       <w:r>
         <w:fldChar w:fldCharType="separate"/>
@@ -17305,7 +17495,7 @@
         <w:fldChar w:fldCharType="begin"/>
       </w:r>
       <w:r>
-        <w:instrText xml:space="preserve">ADDIN CSL_CITATION {"citationID":"MENDELEY_CITATION_443","citationItems":[{"id":"ITEM-443","isTemporary":false,"itemData":{"URL":"https://arxiv.org/abs/2508.01690","author":[{"family":"Sun","given":"Yize"},{"family":"Hagog","given":"Mohamad"},{"family":"Weber","given":"Marc"},{"family":"Hein","given":"Daniel"},{"family":"Udluft","given":"Steffen"},{"family":"Tresp","given":"Volker"},{"family":"Ma","given":"Yunpu"}],"id":"Sun2025","issued":{"date-parts":[[2025]]},"note":"QML@QCE 2025 workshop","title":"First experience with real-time control using simulated VQC-based quantum policies","type":""}}],"isEdited":false,"manualOverride":{"citeprocText":"(Sun et al. 2025)","isManuallyOverridden":false,"manualOverrideText":""},"mendeley":{"formattedCitation":"(Sun et al. 2025)","plainTextFormattedCitation":"(Sun et al. 2025)","previouslyFormattedCitation":"(Sun et al. 2025)"},"properties":{"noteIndex":0},"schema":"https://github.com/citation-style-language/schema/raw/master/csl-citation.json"}</w:instrText>
+        <w:instrText xml:space="preserve">ADDIN CSL_CITATION {"citationID":"MENDELEY_CITATION_457","citationItems":[{"id":"ITEM-457","isTemporary":false,"itemData":{"URL":"https://arxiv.org/abs/2508.01690","author":[{"family":"Sun","given":"Yize"},{"family":"Hagog","given":"Mohamad"},{"family":"Weber","given":"Marc"},{"family":"Hein","given":"Daniel"},{"family":"Udluft","given":"Steffen"},{"family":"Tresp","given":"Volker"},{"family":"Ma","given":"Yunpu"}],"id":"Sun2025","issued":{"date-parts":[[2025]]},"note":"QML@QCE 2025 workshop","title":"First experience with real-time control using simulated VQC-based quantum policies","type":""}}],"isEdited":false,"manualOverride":{"citeprocText":"(Sun et al. 2025)","isManuallyOverridden":false,"manualOverrideText":""},"mendeley":{"formattedCitation":"(Sun et al. 2025)","plainTextFormattedCitation":"(Sun et al. 2025)","previouslyFormattedCitation":"(Sun et al. 2025)"},"properties":{"noteIndex":0},"schema":"https://github.com/citation-style-language/schema/raw/master/csl-citation.json"}</w:instrText>
       </w:r>
       <w:r>
         <w:fldChar w:fldCharType="separate"/>
@@ -17323,7 +17513,7 @@
         <w:fldChar w:fldCharType="begin"/>
       </w:r>
       <w:r>
-        <w:instrText xml:space="preserve">ADDIN CSL_CITATION {"citationID":"MENDELEY_CITATION_444","citationItems":[{"id":"ITEM-444","isTemporary":false,"itemData":{"DOI":"10.48550/arXiv.2504.08167","URL":"https://arxiv.org/abs/2504.08167","author":[{"family":"Muradoglu","given":"Murat"},{"family":"Johnsson","given":"Mattias T."},{"family":"Wilson","given":"Nathanial M."},{"family":"Cohen","given":"Yuval"},{"family":"Shin","given":"Dongki"},{"family":"Navickas","given":"Tomas"},{"family":"Pyragius","given":"Tadas"},{"family":"Thomas","given":"Divya"},{"family":"Thompson","given":"Daniel"},{"family":"Moore","given":"Steven I."},{"family":"Rahman","given":"Md Tanvir"},{"family":"Walker","given":"Adrian"},{"family":"Dutta","given":"Indranil"},{"family":"Bijjahalli","given":"Suraj"},{"family":"Berlocher","given":"Jacob"},{"family":"Hush","given":"Michael R."},{"family":"Anderson","given":"Russell P."},{"family":"Szigeti","given":"Stuart S."},{"family":"Biercuk","given":"Michael J."}],"id":"Muradoglu2025","issued":{"date-parts":[[2025]]},"title":"Quantum-assured magnetic navigation achieves positioning accuracy better than a strategic-grade INS in airborne and ground-based field trials","type":""}}],"isEdited":false,"manualOverride":{"citeprocText":"(Muradoglu et al. 2025)","isManuallyOverridden":false,"manualOverrideText":""},"mendeley":{"formattedCitation":"(Muradoglu et al. 2025)","plainTextFormattedCitation":"(Muradoglu et al. 2025)","previouslyFormattedCitation":"(Muradoglu et al. 2025)"},"properties":{"noteIndex":0},"schema":"https://github.com/citation-style-language/schema/raw/master/csl-citation.json"}</w:instrText>
+        <w:instrText xml:space="preserve">ADDIN CSL_CITATION {"citationID":"MENDELEY_CITATION_458","citationItems":[{"id":"ITEM-458","isTemporary":false,"itemData":{"DOI":"10.48550/arXiv.2504.08167","URL":"https://arxiv.org/abs/2504.08167","author":[{"family":"Muradoglu","given":"Murat"},{"family":"Johnsson","given":"Mattias T."},{"family":"Wilson","given":"Nathanial M."},{"family":"Cohen","given":"Yuval"},{"family":"Shin","given":"Dongki"},{"family":"Navickas","given":"Tomas"},{"family":"Pyragius","given":"Tadas"},{"family":"Thomas","given":"Divya"},{"family":"Thompson","given":"Daniel"},{"family":"Moore","given":"Steven I."},{"family":"Rahman","given":"Md Tanvir"},{"family":"Walker","given":"Adrian"},{"family":"Dutta","given":"Indranil"},{"family":"Bijjahalli","given":"Suraj"},{"family":"Berlocher","given":"Jacob"},{"family":"Hush","given":"Michael R."},{"family":"Anderson","given":"Russell P."},{"family":"Szigeti","given":"Stuart S."},{"family":"Biercuk","given":"Michael J."}],"id":"Muradoglu2025","issued":{"date-parts":[[2025]]},"title":"Quantum-assured magnetic navigation achieves positioning accuracy better than a strategic-grade INS in airborne and ground-based field trials","type":""}}],"isEdited":false,"manualOverride":{"citeprocText":"(Muradoglu et al. 2025)","isManuallyOverridden":false,"manualOverrideText":""},"mendeley":{"formattedCitation":"(Muradoglu et al. 2025)","plainTextFormattedCitation":"(Muradoglu et al. 2025)","previouslyFormattedCitation":"(Muradoglu et al. 2025)"},"properties":{"noteIndex":0},"schema":"https://github.com/citation-style-language/schema/raw/master/csl-citation.json"}</w:instrText>
       </w:r>
       <w:r>
         <w:fldChar w:fldCharType="separate"/>
@@ -17341,7 +17531,7 @@
         <w:fldChar w:fldCharType="begin"/>
       </w:r>
       <w:r>
-        <w:instrText xml:space="preserve">ADDIN CSL_CITATION {"citationID":"MENDELEY_CITATION_447","citationItems":[{"id":"ITEM-445","isTemporary":false,"itemData":{"DOI":"10.1103/PhysRevApplied.10.034030","author":[{"family":"Cheiney","given":"Pierrick"},{"family":"Fouché","given":"Lauriane"},{"family":"Templier","given":"Simon"},{"family":"Napolitano","given":"Fabien"},{"family":"Battelier","given":"Baptiste"},{"family":"Bouyer","given":"Philippe"},{"family":"Barrett","given":"Brynle"}],"container-title":"Physical Review Applied","id":"Cheiney2018","issue":"3","issued":{"date-parts":[[2018]]},"page":"034030","publisher":"American Physical Society","title":"Navigation-compatible hybrid quantum accelerometer using a Kalman filter","type":"article-journal","volume":"10"}},{"id":"ITEM-446","isTemporary":false,"itemData":{"DOI":"10.48550/arXiv.2103.09378","URL":"https://arxiv.org/abs/2103.09378","author":[{"family":"Wang","given":"Xuezhi"},{"family":"Kealy","given":"Allison"},{"family":"Gilliam","given":"Christopher"},{"family":"Haine","given":"Simon"},{"family":"Close","given":"John"},{"family":"Moran","given":"Bill"},{"family":"Talbot","given":"Kyle"},{"family":"Williams","given":"Simon"},{"family":"Hardman","given":"Kyle"},{"family":"Freier","given":"Chris"},{"family":"Wigley","given":"Paul"},{"family":"White","given":"Angela"},{"family":"Szigeti","given":"Stuart"},{"family":"Legge","given":"Sam"}],"id":"Wang2021","issued":{"date-parts":[[2021]]},"title":"Enhancing inertial navigation performance via fusion of classical and quantum accelerometers","type":""}},{"id":"ITEM-447","isTemporary":false,"itemData":{"DOI":"10.1007/1345_2023_218","author":[{"family":"Wang","given":"Xuezhi"},{"family":"Li","given":"Wenchao"},{"family":"Moran","given":"Bill"},{"family":"Gibson","given":"Brant C."},{"family":"Hall","given":"Liam T."},{"family":"Simpson","given":"David A."},{"family":"Kealy","given":"Allison N."},{"family":"Greentree","given":"Andrew D."}],"collection-title":"International association of geodesy symposia","container-title":"Gravity, positioning and reference frames","id":"Wang2023","issued":{"date-parts":[[2023]]},"page":"87-92","publisher":"Springer","publisher-place":"Cham","title":"Quantum diamond magnetometry for navigation in GNSS denied environments","type":"chapter","volume":"156"}}],"isEdited":false,"manualOverride":{"citeprocText":"(Cheiney et al. 2018; Xuezhi Wang et al. 2021, 2023)","isManuallyOverridden":false,"manualOverrideText":""},"mendeley":{"formattedCitation":"(Cheiney et al. 2018; Xuezhi Wang et al. 2021, 2023)","plainTextFormattedCitation":"(Cheiney et al. 2018; Xuezhi Wang et al. 2021, 2023)","previouslyFormattedCitation":"(Cheiney et al. 2018; Xuezhi Wang et al. 2021, 2023)"},"properties":{"noteIndex":0},"schema":"https://github.com/citation-style-language/schema/raw/master/csl-citation.json"}</w:instrText>
+        <w:instrText xml:space="preserve">ADDIN CSL_CITATION {"citationID":"MENDELEY_CITATION_461","citationItems":[{"id":"ITEM-459","isTemporary":false,"itemData":{"DOI":"10.1103/PhysRevApplied.10.034030","author":[{"family":"Cheiney","given":"Pierrick"},{"family":"Fouché","given":"Lauriane"},{"family":"Templier","given":"Simon"},{"family":"Napolitano","given":"Fabien"},{"family":"Battelier","given":"Baptiste"},{"family":"Bouyer","given":"Philippe"},{"family":"Barrett","given":"Brynle"}],"container-title":"Physical Review Applied","id":"Cheiney2018","issue":"3","issued":{"date-parts":[[2018]]},"page":"034030","publisher":"American Physical Society","title":"Navigation-compatible hybrid quantum accelerometer using a Kalman filter","type":"article-journal","volume":"10"}},{"id":"ITEM-460","isTemporary":false,"itemData":{"DOI":"10.48550/arXiv.2103.09378","URL":"https://arxiv.org/abs/2103.09378","author":[{"family":"Wang","given":"Xuezhi"},{"family":"Kealy","given":"Allison"},{"family":"Gilliam","given":"Christopher"},{"family":"Haine","given":"Simon"},{"family":"Close","given":"John"},{"family":"Moran","given":"Bill"},{"family":"Talbot","given":"Kyle"},{"family":"Williams","given":"Simon"},{"family":"Hardman","given":"Kyle"},{"family":"Freier","given":"Chris"},{"family":"Wigley","given":"Paul"},{"family":"White","given":"Angela"},{"family":"Szigeti","given":"Stuart"},{"family":"Legge","given":"Sam"}],"id":"Wang2021","issued":{"date-parts":[[2021]]},"title":"Enhancing inertial navigation performance via fusion of classical and quantum accelerometers","type":""}},{"id":"ITEM-461","isTemporary":false,"itemData":{"DOI":"10.1007/1345_2023_218","author":[{"family":"Wang","given":"Xuezhi"},{"family":"Li","given":"Wenchao"},{"family":"Moran","given":"Bill"},{"family":"Gibson","given":"Brant C."},{"family":"Hall","given":"Liam T."},{"family":"Simpson","given":"David A."},{"family":"Kealy","given":"Allison N."},{"family":"Greentree","given":"Andrew D."}],"collection-title":"International association of geodesy symposia","container-title":"Gravity, positioning and reference frames","id":"Wang2023","issued":{"date-parts":[[2023]]},"page":"87-92","publisher":"Springer","publisher-place":"Cham","title":"Quantum diamond magnetometry for navigation in GNSS denied environments","type":"chapter","volume":"156"}}],"isEdited":false,"manualOverride":{"citeprocText":"(Cheiney et al. 2018; Xuezhi Wang et al. 2021, 2023)","isManuallyOverridden":false,"manualOverrideText":""},"mendeley":{"formattedCitation":"(Cheiney et al. 2018; Xuezhi Wang et al. 2021, 2023)","plainTextFormattedCitation":"(Cheiney et al. 2018; Xuezhi Wang et al. 2021, 2023)","previouslyFormattedCitation":"(Cheiney et al. 2018; Xuezhi Wang et al. 2021, 2023)"},"properties":{"noteIndex":0},"schema":"https://github.com/citation-style-language/schema/raw/master/csl-citation.json"}</w:instrText>
       </w:r>
       <w:r>
         <w:fldChar w:fldCharType="separate"/>
@@ -17378,13 +17568,13 @@
         <w:t xml:space="preserve"> </w:t>
       </w:r>
       <w:r>
-        <w:t xml:space="preserve">adds the quantum-execution tag to this picture. Only 22 of the 63 studies ran any part of their quantum computation on a quantum processor, and 21 of them sit at L3. The ten L4 studies are robot-in-the-loop only in simulation, and nine of them also simulate their quantum circuits; the one exception routes subproblems of a simulated 1,000-AGV fleet to a D-Wave annealer </w:t>
-      </w:r>
-      <w:r>
-        <w:fldChar w:fldCharType="begin"/>
-      </w:r>
-      <w:r>
-        <w:instrText xml:space="preserve">ADDIN CSL_CITATION {"citationID":"MENDELEY_CITATION_448","citationItems":[{"id":"ITEM-448","isTemporary":false,"itemData":{"DOI":"10.1038/s41598-025-28481-w","author":[{"family":"Quang","given":"Thinh Nguyen"},{"family":"Matsuyama","given":"Kosuke"},{"family":"Shimizu","given":"Keisuke"},{"family":"Sugano","given":"Hiroki"},{"family":"Kurimoto","given":"Eiji"},{"family":"Miki","given":"Masahiro"},{"family":"Suzuki","given":"Jumpei"},{"family":"Chen","given":"Ziyi"},{"family":"Waidyasooriya","given":"Hasitha Muthumala"},{"family":"Hariyama","given":"Masanori"},{"family":"Hitomi","given":"Masaru"},{"family":"Sawamura","given":"Kenta"},{"family":"Ohzeki","given":"Masayuki"}],"container-title":"Scientific Reports","id":"Quang2025","issued":{"date-parts":[[2025]]},"page":"44047","publisher":"Nature Publishing Group","title":"Quantum annealing-based route optimization for commercial AGV operating systems in large-scale logistics warehouses","type":"article-journal","volume":"15"}}],"isEdited":false,"manualOverride":{"citeprocText":"(Quang et al. 2025)","isManuallyOverridden":false,"manualOverrideText":""},"mendeley":{"formattedCitation":"(Quang et al. 2025)","plainTextFormattedCitation":"(Quang et al. 2025)","previouslyFormattedCitation":"(Quang et al. 2025)"},"properties":{"noteIndex":0},"schema":"https://github.com/citation-style-language/schema/raw/master/csl-citation.json"}</w:instrText>
+        <w:t xml:space="preserve">adds the quantum-execution tag to this picture. Only 22 of the 65 studies ran any part of their quantum computation on a quantum processor, and 21 of them sit at L3. The ten L4 studies are robot-in-the-loop only in simulation, and nine of them also simulate their quantum circuits; the one exception routes subproblems of a simulated 1,000-AGV fleet to a D-Wave annealer </w:t>
+      </w:r>
+      <w:r>
+        <w:fldChar w:fldCharType="begin"/>
+      </w:r>
+      <w:r>
+        <w:instrText xml:space="preserve">ADDIN CSL_CITATION {"citationID":"MENDELEY_CITATION_462","citationItems":[{"id":"ITEM-462","isTemporary":false,"itemData":{"DOI":"10.1038/s41598-025-28481-w","author":[{"family":"Quang","given":"Thinh Nguyen"},{"family":"Matsuyama","given":"Kosuke"},{"family":"Shimizu","given":"Keisuke"},{"family":"Sugano","given":"Hiroki"},{"family":"Kurimoto","given":"Eiji"},{"family":"Miki","given":"Masahiro"},{"family":"Suzuki","given":"Jumpei"},{"family":"Chen","given":"Ziyi"},{"family":"Waidyasooriya","given":"Hasitha Muthumala"},{"family":"Hariyama","given":"Masanori"},{"family":"Hitomi","given":"Masaru"},{"family":"Sawamura","given":"Kenta"},{"family":"Ohzeki","given":"Masayuki"}],"container-title":"Scientific Reports","id":"Quang2025","issued":{"date-parts":[[2025]]},"page":"44047","publisher":"Nature Publishing Group","title":"Quantum annealing-based route optimization for commercial AGV operating systems in large-scale logistics warehouses","type":"article-journal","volume":"15"}}],"isEdited":false,"manualOverride":{"citeprocText":"(Quang et al. 2025)","isManuallyOverridden":false,"manualOverrideText":""},"mendeley":{"formattedCitation":"(Quang et al. 2025)","plainTextFormattedCitation":"(Quang et al. 2025)","previouslyFormattedCitation":"(Quang et al. 2025)"},"properties":{"noteIndex":0},"schema":"https://github.com/citation-style-language/schema/raw/master/csl-citation.json"}</w:instrText>
       </w:r>
       <w:r>
         <w:fldChar w:fldCharType="separate"/>
@@ -17415,7 +17605,7 @@
         <w:t xml:space="preserve"> </w:t>
       </w:r>
       <w:r>
-        <w:t xml:space="preserve">Evidence level (rows) by where the quantum component was executed (columns) for the 63 primary studies (7 reviews excluded).</w:t>
+        <w:t xml:space="preserve">Evidence level (rows) by where the quantum component was executed (columns) for the 65 primary studies (7 reviews excluded).</w:t>
       </w:r>
       <w:r>
         <w:t xml:space="preserve"> </w:t>
@@ -17439,7 +17629,7 @@
         <w:fldChar w:fldCharType="begin"/>
       </w:r>
       <w:r>
-        <w:instrText xml:space="preserve">ADDIN CSL_CITATION {"citationID":"MENDELEY_CITATION_450","citationItems":[{"id":"ITEM-449","isTemporary":false,"itemData":{"DOI":"10.48550/arXiv.2103.09378","URL":"https://arxiv.org/abs/2103.09378","author":[{"family":"Wang","given":"Xuezhi"},{"family":"Kealy","given":"Allison"},{"family":"Gilliam","given":"Christopher"},{"family":"Haine","given":"Simon"},{"family":"Close","given":"John"},{"family":"Moran","given":"Bill"},{"family":"Talbot","given":"Kyle"},{"family":"Williams","given":"Simon"},{"family":"Hardman","given":"Kyle"},{"family":"Freier","given":"Chris"},{"family":"Wigley","given":"Paul"},{"family":"White","given":"Angela"},{"family":"Szigeti","given":"Stuart"},{"family":"Legge","given":"Sam"}],"id":"Wang2021","issued":{"date-parts":[[2021]]},"title":"Enhancing inertial navigation performance via fusion of classical and quantum accelerometers","type":""}},{"id":"ITEM-450","isTemporary":false,"itemData":{"DOI":"10.1007/1345_2023_218","author":[{"family":"Wang","given":"Xuezhi"},{"family":"Li","given":"Wenchao"},{"family":"Moran","given":"Bill"},{"family":"Gibson","given":"Brant C."},{"family":"Hall","given":"Liam T."},{"family":"Simpson","given":"David A."},{"family":"Kealy","given":"Allison N."},{"family":"Greentree","given":"Andrew D."}],"collection-title":"International association of geodesy symposia","container-title":"Gravity, positioning and reference frames","id":"Wang2023","issued":{"date-parts":[[2023]]},"page":"87-92","publisher":"Springer","publisher-place":"Cham","title":"Quantum diamond magnetometry for navigation in GNSS denied environments","type":"chapter","volume":"156"}}],"isEdited":false,"manualOverride":{"citeprocText":"(Xuezhi Wang et al. 2021, 2023)","isManuallyOverridden":false,"manualOverrideText":""},"mendeley":{"formattedCitation":"(Xuezhi Wang et al. 2021, 2023)","plainTextFormattedCitation":"(Xuezhi Wang et al. 2021, 2023)","previouslyFormattedCitation":"(Xuezhi Wang et al. 2021, 2023)"},"properties":{"noteIndex":0},"schema":"https://github.com/citation-style-language/schema/raw/master/csl-citation.json"}</w:instrText>
+        <w:instrText xml:space="preserve">ADDIN CSL_CITATION {"citationID":"MENDELEY_CITATION_464","citationItems":[{"id":"ITEM-463","isTemporary":false,"itemData":{"DOI":"10.48550/arXiv.2103.09378","URL":"https://arxiv.org/abs/2103.09378","author":[{"family":"Wang","given":"Xuezhi"},{"family":"Kealy","given":"Allison"},{"family":"Gilliam","given":"Christopher"},{"family":"Haine","given":"Simon"},{"family":"Close","given":"John"},{"family":"Moran","given":"Bill"},{"family":"Talbot","given":"Kyle"},{"family":"Williams","given":"Simon"},{"family":"Hardman","given":"Kyle"},{"family":"Freier","given":"Chris"},{"family":"Wigley","given":"Paul"},{"family":"White","given":"Angela"},{"family":"Szigeti","given":"Stuart"},{"family":"Legge","given":"Sam"}],"id":"Wang2021","issued":{"date-parts":[[2021]]},"title":"Enhancing inertial navigation performance via fusion of classical and quantum accelerometers","type":""}},{"id":"ITEM-464","isTemporary":false,"itemData":{"DOI":"10.1007/1345_2023_218","author":[{"family":"Wang","given":"Xuezhi"},{"family":"Li","given":"Wenchao"},{"family":"Moran","given":"Bill"},{"family":"Gibson","given":"Brant C."},{"family":"Hall","given":"Liam T."},{"family":"Simpson","given":"David A."},{"family":"Kealy","given":"Allison N."},{"family":"Greentree","given":"Andrew D."}],"collection-title":"International association of geodesy symposia","container-title":"Gravity, positioning and reference frames","id":"Wang2023","issued":{"date-parts":[[2023]]},"page":"87-92","publisher":"Springer","publisher-place":"Cham","title":"Quantum diamond magnetometry for navigation in GNSS denied environments","type":"chapter","volume":"156"}}],"isEdited":false,"manualOverride":{"citeprocText":"(Xuezhi Wang et al. 2021, 2023)","isManuallyOverridden":false,"manualOverrideText":""},"mendeley":{"formattedCitation":"(Xuezhi Wang et al. 2021, 2023)","plainTextFormattedCitation":"(Xuezhi Wang et al. 2021, 2023)","previouslyFormattedCitation":"(Xuezhi Wang et al. 2021, 2023)"},"properties":{"noteIndex":0},"schema":"https://github.com/citation-style-language/schema/raw/master/csl-citation.json"}</w:instrText>
       </w:r>
       <w:r>
         <w:fldChar w:fldCharType="separate"/>
@@ -17460,7 +17650,7 @@
         <w:tblW w:type="auto" w:w="0"/>
         <w:tblLook w:firstRow="1" w:lastRow="0" w:firstColumn="0" w:lastColumn="0" w:noHBand="0" w:noVBand="0" w:val="0020"/>
         <w:jc w:val="start"/>
-        <w:tblCaption w:val="Table 4. Evidence level (rows) by where the quantum component was executed (columns) for the 63 primary studies (7 reviews excluded). “Simulated” includes two studies of simulated quantum sensors (Xuezhi Wang et al. 2021, 2023); HW = hardware; QI = quantum-inspired algorithms on conventional hardware."/>
+        <w:tblCaption w:val="Table 4. Evidence level (rows) by where the quantum component was executed (columns) for the 65 primary studies (7 reviews excluded). “Simulated” includes two studies of simulated quantum sensors (Xuezhi Wang et al. 2021, 2023); HW = hardware; QI = quantum-inspired algorithms on conventional hardware."/>
       </w:tblPr>
       <w:tblGrid>
         <w:gridCol w:w="1131"/>
@@ -17609,7 +17799,7 @@
               <w:jc w:val="right"/>
             </w:pPr>
             <w:r>
-              <w:t xml:space="preserve">4</w:t>
+              <w:t xml:space="preserve">6</w:t>
             </w:r>
           </w:p>
         </w:tc>
@@ -17669,7 +17859,7 @@
               <w:jc w:val="right"/>
             </w:pPr>
             <w:r>
-              <w:t xml:space="preserve">4</w:t>
+              <w:t xml:space="preserve">6</w:t>
             </w:r>
           </w:p>
         </w:tc>
@@ -18125,7 +18315,7 @@
               <w:jc w:val="right"/>
             </w:pPr>
             <w:r>
-              <w:t xml:space="preserve">4</w:t>
+              <w:t xml:space="preserve">6</w:t>
             </w:r>
           </w:p>
         </w:tc>
@@ -18185,7 +18375,7 @@
               <w:jc w:val="right"/>
             </w:pPr>
             <w:r>
-              <w:t xml:space="preserve">63</w:t>
+              <w:t xml:space="preserve">65</w:t>
             </w:r>
           </w:p>
         </w:tc>
@@ -18254,7 +18444,7 @@
         <w:t xml:space="preserve"> </w:t>
       </w:r>
       <w:r>
-        <w:t xml:space="preserve">Evidence levels reached by the 63 primary robotics studies (7 reviews excluded), by technology type. The only quantum computational study at L5 runs its circuit in classical simulation on a physical cart-pole; the other studies at L5 and L6 use quantum sensing, quantum communication, or quantum-inspired classical computation.</w:t>
+        <w:t xml:space="preserve">Evidence levels reached by the 65 primary robotics studies (7 reviews excluded), by technology type. The only quantum computational study at L5 runs its circuit in classical simulation on a physical cart-pole; the other studies at L5 and L6 use quantum sensing, quantum communication, or quantum-inspired classical computation.</w:t>
       </w:r>
     </w:p>
     <w:bookmarkEnd w:id="115"/>
@@ -18313,7 +18503,7 @@
         <w:fldChar w:fldCharType="begin"/>
       </w:r>
       <w:r>
-        <w:instrText xml:space="preserve">ADDIN CSL_CITATION {"citationID":"MENDELEY_CITATION_453","citationItems":[{"id":"ITEM-451","isTemporary":false,"itemData":{"DOI":"10.1145/237814.237866","author":[{"family":"Grover","given":"Lov K."}],"container-title":"Proceedings of the twenty-eighth annual ACM symposium on theory of computing (STOC ’96)","id":"Grover1996","issued":{"date-parts":[[1996]]},"page":"212-219","publisher":"ACM","publisher-place":"New York, NY, USA","title":"A fast quantum mechanical algorithm for database search","type":"paper-conference"}},{"id":"ITEM-452","isTemporary":false,"itemData":{"DOI":"10.1090/conm/305/05215","author":[{"family":"Brassard","given":"Gilles"},{"family":"Høyer","given":"Peter"},{"family":"Mosca","given":"Michele"},{"family":"Tapp","given":"Alain"}],"collection-title":"Contemporary mathematics","container-title":"Quantum computation and information","editor":[{"family":"Lomonaco","given":"Samuel J.","suffix":"Jr."}],"id":"Brassard2002","issued":{"date-parts":[[2002]]},"page":"53-74","publisher":"American Mathematical Society","title":"Quantum amplitude amplification and estimation","type":"chapter","volume":"305"}},{"id":"ITEM-453","isTemporary":false,"itemData":{"DOI":"10.1098/rspa.2015.0301","author":[{"family":"Montanaro","given":"Ashley"}],"container-title":"Proceedings of the Royal Society A: Mathematical, Physical and Engineering Sciences","id":"Montanaro2015","issue":"2181","issued":{"date-parts":[[2015]]},"page":"20150301","publisher":"The Royal Society","title":"Quantum speedup of Monte Carlo methods","type":"article-journal","volume":"471"}}],"isEdited":false,"manualOverride":{"citeprocText":"(Grover 1996; Brassard et al. 2002; Montanaro 2015)","isManuallyOverridden":false,"manualOverrideText":""},"mendeley":{"formattedCitation":"(Grover 1996; Brassard et al. 2002; Montanaro 2015)","plainTextFormattedCitation":"(Grover 1996; Brassard et al. 2002; Montanaro 2015)","previouslyFormattedCitation":"(Grover 1996; Brassard et al. 2002; Montanaro 2015)"},"properties":{"noteIndex":0},"schema":"https://github.com/citation-style-language/schema/raw/master/csl-citation.json"}</w:instrText>
+        <w:instrText xml:space="preserve">ADDIN CSL_CITATION {"citationID":"MENDELEY_CITATION_467","citationItems":[{"id":"ITEM-465","isTemporary":false,"itemData":{"DOI":"10.1145/237814.237866","author":[{"family":"Grover","given":"Lov K."}],"container-title":"Proceedings of the twenty-eighth annual ACM symposium on theory of computing (STOC ’96)","id":"Grover1996","issued":{"date-parts":[[1996]]},"page":"212-219","publisher":"ACM","publisher-place":"New York, NY, USA","title":"A fast quantum mechanical algorithm for database search","type":"paper-conference"}},{"id":"ITEM-466","isTemporary":false,"itemData":{"DOI":"10.1090/conm/305/05215","author":[{"family":"Brassard","given":"Gilles"},{"family":"Høyer","given":"Peter"},{"family":"Mosca","given":"Michele"},{"family":"Tapp","given":"Alain"}],"collection-title":"Contemporary mathematics","container-title":"Quantum computation and information","editor":[{"family":"Lomonaco","given":"Samuel J.","suffix":"Jr."}],"id":"Brassard2002","issued":{"date-parts":[[2002]]},"page":"53-74","publisher":"American Mathematical Society","title":"Quantum amplitude amplification and estimation","type":"chapter","volume":"305"}},{"id":"ITEM-467","isTemporary":false,"itemData":{"DOI":"10.1098/rspa.2015.0301","author":[{"family":"Montanaro","given":"Ashley"}],"container-title":"Proceedings of the Royal Society A: Mathematical, Physical and Engineering Sciences","id":"Montanaro2015","issue":"2181","issued":{"date-parts":[[2015]]},"page":"20150301","publisher":"The Royal Society","title":"Quantum speedup of Monte Carlo methods","type":"article-journal","volume":"471"}}],"isEdited":false,"manualOverride":{"citeprocText":"(Grover 1996; Brassard et al. 2002; Montanaro 2015)","isManuallyOverridden":false,"manualOverrideText":""},"mendeley":{"formattedCitation":"(Grover 1996; Brassard et al. 2002; Montanaro 2015)","plainTextFormattedCitation":"(Grover 1996; Brassard et al. 2002; Montanaro 2015)","previouslyFormattedCitation":"(Grover 1996; Brassard et al. 2002; Montanaro 2015)"},"properties":{"noteIndex":0},"schema":"https://github.com/citation-style-language/schema/raw/master/csl-citation.json"}</w:instrText>
       </w:r>
       <w:r>
         <w:fldChar w:fldCharType="separate"/>
@@ -18331,7 +18521,7 @@
         <w:fldChar w:fldCharType="begin"/>
       </w:r>
       <w:r>
-        <w:instrText xml:space="preserve">ADDIN CSL_CITATION {"citationID":"MENDELEY_CITATION_455","citationItems":[{"id":"ITEM-454","isTemporary":false,"itemData":{"DOI":"10.1103/PhysRevLett.103.150502","author":[{"family":"Harrow","given":"Aram W."},{"family":"Hassidim","given":"Avinatan"},{"family":"Lloyd","given":"Seth"}],"container-title":"Physical Review Letters","id":"Harrow2009","issue":"15","issued":{"date-parts":[[2009]]},"page":"150502","publisher":"American Physical Society","title":"Quantum algorithm for linear systems of equations","type":"article-journal","volume":"103"}},{"id":"ITEM-455","isTemporary":false,"itemData":{"DOI":"10.1038/nphys3272","author":[{"family":"Aaronson","given":"Scott"}],"container-title":"Nature Physics","id":"Aaronson2015","issue":"4","issued":{"date-parts":[[2015]]},"page":"291-293","title":"Read the fine print","type":"article-journal","volume":"11"}}],"isEdited":false,"manualOverride":{"citeprocText":"(Harrow, Hassidim, and Lloyd 2009; Aaronson 2015)","isManuallyOverridden":false,"manualOverrideText":""},"mendeley":{"formattedCitation":"(Harrow, Hassidim, and Lloyd 2009; Aaronson 2015)","plainTextFormattedCitation":"(Harrow, Hassidim, and Lloyd 2009; Aaronson 2015)","previouslyFormattedCitation":"(Harrow, Hassidim, and Lloyd 2009; Aaronson 2015)"},"properties":{"noteIndex":0},"schema":"https://github.com/citation-style-language/schema/raw/master/csl-citation.json"}</w:instrText>
+        <w:instrText xml:space="preserve">ADDIN CSL_CITATION {"citationID":"MENDELEY_CITATION_469","citationItems":[{"id":"ITEM-468","isTemporary":false,"itemData":{"DOI":"10.1103/PhysRevLett.103.150502","author":[{"family":"Harrow","given":"Aram W."},{"family":"Hassidim","given":"Avinatan"},{"family":"Lloyd","given":"Seth"}],"container-title":"Physical Review Letters","id":"Harrow2009","issue":"15","issued":{"date-parts":[[2009]]},"page":"150502","publisher":"American Physical Society","title":"Quantum algorithm for linear systems of equations","type":"article-journal","volume":"103"}},{"id":"ITEM-469","isTemporary":false,"itemData":{"DOI":"10.1038/nphys3272","author":[{"family":"Aaronson","given":"Scott"}],"container-title":"Nature Physics","id":"Aaronson2015","issue":"4","issued":{"date-parts":[[2015]]},"page":"291-293","title":"Read the fine print","type":"article-journal","volume":"11"}}],"isEdited":false,"manualOverride":{"citeprocText":"(Harrow, Hassidim, and Lloyd 2009; Aaronson 2015)","isManuallyOverridden":false,"manualOverrideText":""},"mendeley":{"formattedCitation":"(Harrow, Hassidim, and Lloyd 2009; Aaronson 2015)","plainTextFormattedCitation":"(Harrow, Hassidim, and Lloyd 2009; Aaronson 2015)","previouslyFormattedCitation":"(Harrow, Hassidim, and Lloyd 2009; Aaronson 2015)"},"properties":{"noteIndex":0},"schema":"https://github.com/citation-style-language/schema/raw/master/csl-citation.json"}</w:instrText>
       </w:r>
       <w:r>
         <w:fldChar w:fldCharType="separate"/>
@@ -18349,7 +18539,7 @@
         <w:fldChar w:fldCharType="begin"/>
       </w:r>
       <w:r>
-        <w:instrText xml:space="preserve">ADDIN CSL_CITATION {"citationID":"MENDELEY_CITATION_457","citationItems":[{"id":"ITEM-456","isTemporary":false,"itemData":{"DOI":"10.1145/3313276.3316310","author":[{"family":"Tang","given":"Ewin"}],"container-title":"Proceedings of the 51st annual ACM SIGACT symposium on theory of computing (STOC 2019)","id":"Tang2019","issued":{"date-parts":[[2019]]},"page":"217-228","publisher":"ACM","publisher-place":"New York, NY, USA","title":"A quantum-inspired classical algorithm for recommendation systems","type":"paper-conference"}},{"id":"ITEM-457","isTemporary":false,"itemData":{"DOI":"10.1145/3357713.3384314","author":[{"family":"Chia","given":"Nai-Hui"},{"family":"Gilyén","given":"András"},{"family":"Li","given":"Tongyang"},{"family":"Lin","given":"Han-Hsuan"},{"family":"Tang","given":"Ewin"},{"family":"Wang","given":"Chunhao"}],"container-title":"Proceedings of the 52nd annual ACM SIGACT symposium on theory of computing (STOC 2020)","id":"Chia2020","issued":{"date-parts":[[2020]]},"page":"387-400","publisher":"ACM","publisher-place":"New York, NY, USA","title":"Sampling-based sublinear low-rank matrix arithmetic framework for dequantizing quantum machine learning","type":"paper-conference"}}],"isEdited":false,"manualOverride":{"citeprocText":"(E. Tang 2019; Chia et al. 2020)","isManuallyOverridden":false,"manualOverrideText":""},"mendeley":{"formattedCitation":"(E. Tang 2019; Chia et al. 2020)","plainTextFormattedCitation":"(E. Tang 2019; Chia et al. 2020)","previouslyFormattedCitation":"(E. Tang 2019; Chia et al. 2020)"},"properties":{"noteIndex":0},"schema":"https://github.com/citation-style-language/schema/raw/master/csl-citation.json"}</w:instrText>
+        <w:instrText xml:space="preserve">ADDIN CSL_CITATION {"citationID":"MENDELEY_CITATION_471","citationItems":[{"id":"ITEM-470","isTemporary":false,"itemData":{"DOI":"10.1145/3313276.3316310","author":[{"family":"Tang","given":"Ewin"}],"container-title":"Proceedings of the 51st annual ACM SIGACT symposium on theory of computing (STOC 2019)","id":"Tang2019","issued":{"date-parts":[[2019]]},"page":"217-228","publisher":"ACM","publisher-place":"New York, NY, USA","title":"A quantum-inspired classical algorithm for recommendation systems","type":"paper-conference"}},{"id":"ITEM-471","isTemporary":false,"itemData":{"DOI":"10.1145/3357713.3384314","author":[{"family":"Chia","given":"Nai-Hui"},{"family":"Gilyén","given":"András"},{"family":"Li","given":"Tongyang"},{"family":"Lin","given":"Han-Hsuan"},{"family":"Tang","given":"Ewin"},{"family":"Wang","given":"Chunhao"}],"container-title":"Proceedings of the 52nd annual ACM SIGACT symposium on theory of computing (STOC 2020)","id":"Chia2020","issued":{"date-parts":[[2020]]},"page":"387-400","publisher":"ACM","publisher-place":"New York, NY, USA","title":"Sampling-based sublinear low-rank matrix arithmetic framework for dequantizing quantum machine learning","type":"paper-conference"}}],"isEdited":false,"manualOverride":{"citeprocText":"(E. Tang 2019; Chia et al. 2020)","isManuallyOverridden":false,"manualOverrideText":""},"mendeley":{"formattedCitation":"(E. Tang 2019; Chia et al. 2020)","plainTextFormattedCitation":"(E. Tang 2019; Chia et al. 2020)","previouslyFormattedCitation":"(E. Tang 2019; Chia et al. 2020)"},"properties":{"noteIndex":0},"schema":"https://github.com/citation-style-language/schema/raw/master/csl-citation.json"}</w:instrText>
       </w:r>
       <w:r>
         <w:fldChar w:fldCharType="separate"/>
@@ -18367,7 +18557,7 @@
         <w:fldChar w:fldCharType="begin"/>
       </w:r>
       <w:r>
-        <w:instrText xml:space="preserve">ADDIN CSL_CITATION {"citationID":"MENDELEY_CITATION_458","citationItems":[{"id":"ITEM-458","isTemporary":false,"itemData":{"URL":"https://arxiv.org/abs/1411.4028","author":[{"family":"Farhi","given":"Edward"},{"family":"Goldstone","given":"Jeffrey"},{"family":"Gutmann","given":"Sam"}],"id":"Farhi2014","issued":{"date-parts":[[2014]]},"title":"A quantum approximate optimization algorithm","type":""}}],"isEdited":false,"manualOverride":{"citeprocText":"(Farhi, Goldstone, and Gutmann 2014)","isManuallyOverridden":false,"manualOverrideText":""},"mendeley":{"formattedCitation":"(Farhi, Goldstone, and Gutmann 2014)","plainTextFormattedCitation":"(Farhi, Goldstone, and Gutmann 2014)","previouslyFormattedCitation":"(Farhi, Goldstone, and Gutmann 2014)"},"properties":{"noteIndex":0},"schema":"https://github.com/citation-style-language/schema/raw/master/csl-citation.json"}</w:instrText>
+        <w:instrText xml:space="preserve">ADDIN CSL_CITATION {"citationID":"MENDELEY_CITATION_472","citationItems":[{"id":"ITEM-472","isTemporary":false,"itemData":{"URL":"https://arxiv.org/abs/1411.4028","author":[{"family":"Farhi","given":"Edward"},{"family":"Goldstone","given":"Jeffrey"},{"family":"Gutmann","given":"Sam"}],"id":"Farhi2014","issued":{"date-parts":[[2014]]},"title":"A quantum approximate optimization algorithm","type":""}}],"isEdited":false,"manualOverride":{"citeprocText":"(Farhi, Goldstone, and Gutmann 2014)","isManuallyOverridden":false,"manualOverrideText":""},"mendeley":{"formattedCitation":"(Farhi, Goldstone, and Gutmann 2014)","plainTextFormattedCitation":"(Farhi, Goldstone, and Gutmann 2014)","previouslyFormattedCitation":"(Farhi, Goldstone, and Gutmann 2014)"},"properties":{"noteIndex":0},"schema":"https://github.com/citation-style-language/schema/raw/master/csl-citation.json"}</w:instrText>
       </w:r>
       <w:r>
         <w:fldChar w:fldCharType="separate"/>
@@ -18385,7 +18575,7 @@
         <w:fldChar w:fldCharType="begin"/>
       </w:r>
       <w:r>
-        <w:instrText xml:space="preserve">ADDIN CSL_CITATION {"citationID":"MENDELEY_CITATION_459","citationItems":[{"id":"ITEM-459","isTemporary":false,"itemData":{"URL":"https://proceedings.neurips.cc/paper/2021/hash/eec96a7f788e88184c0e713456026f3f-Abstract.html","author":[{"family":"Jerbi","given":"Sofiene"},{"family":"Gyurik","given":"Casper F. S."},{"family":"Marshall","given":"Simon C."},{"family":"Briegel","given":"Hans J."},{"family":"Dunjko","given":"Vedran"}],"container-title":"Advances in neural information processing systems","id":"Jerbi2021","issued":{"date-parts":[[2021]]},"page":"28362-28375","title":"Parametrized quantum policies for reinforcement learning","type":"paper-conference","volume":"34"}}],"isEdited":false,"manualOverride":{"citeprocText":"(Jerbi et al. 2021)","isManuallyOverridden":false,"manualOverrideText":""},"mendeley":{"formattedCitation":"(Jerbi et al. 2021)","plainTextFormattedCitation":"(Jerbi et al. 2021)","previouslyFormattedCitation":"(Jerbi et al. 2021)"},"properties":{"noteIndex":0},"schema":"https://github.com/citation-style-language/schema/raw/master/csl-citation.json"}</w:instrText>
+        <w:instrText xml:space="preserve">ADDIN CSL_CITATION {"citationID":"MENDELEY_CITATION_473","citationItems":[{"id":"ITEM-473","isTemporary":false,"itemData":{"URL":"https://proceedings.neurips.cc/paper/2021/hash/eec96a7f788e88184c0e713456026f3f-Abstract.html","author":[{"family":"Jerbi","given":"Sofiene"},{"family":"Gyurik","given":"Casper F. S."},{"family":"Marshall","given":"Simon C."},{"family":"Briegel","given":"Hans J."},{"family":"Dunjko","given":"Vedran"}],"container-title":"Advances in neural information processing systems","id":"Jerbi2021","issued":{"date-parts":[[2021]]},"page":"28362-28375","title":"Parametrized quantum policies for reinforcement learning","type":"paper-conference","volume":"34"}}],"isEdited":false,"manualOverride":{"citeprocText":"(Jerbi et al. 2021)","isManuallyOverridden":false,"manualOverrideText":""},"mendeley":{"formattedCitation":"(Jerbi et al. 2021)","plainTextFormattedCitation":"(Jerbi et al. 2021)","previouslyFormattedCitation":"(Jerbi et al. 2021)"},"properties":{"noteIndex":0},"schema":"https://github.com/citation-style-language/schema/raw/master/csl-citation.json"}</w:instrText>
       </w:r>
       <w:r>
         <w:fldChar w:fldCharType="separate"/>
@@ -18465,7 +18655,7 @@
         <w:fldChar w:fldCharType="begin"/>
       </w:r>
       <w:r>
-        <w:instrText xml:space="preserve">ADDIN CSL_CITATION {"citationID":"MENDELEY_CITATION_460","citationItems":[{"id":"ITEM-460","isTemporary":false,"itemData":{"DOI":"10.1016/j.robot.2025.105026","author":[{"family":"Antero","given":"Unai"},{"family":"Sierra","given":"Basilio"},{"family":"Oñativia","given":"Jon"},{"family":"Ruiz","given":"Alejandra"},{"family":"Osaba","given":"Eneko"}],"container-title":"Robotics and Autonomous Systems","id":"Antero2025","issued":{"date-parts":[[2025]]},"page":"105026","publisher":"Elsevier","title":"Robot localization aided by quantum algorithms","type":"article-journal","volume":"192"}}],"isEdited":false,"manualOverride":{"citeprocText":"(Antero et al. 2025)","isManuallyOverridden":false,"manualOverrideText":""},"mendeley":{"formattedCitation":"(Antero et al. 2025)","plainTextFormattedCitation":"(Antero et al. 2025)","previouslyFormattedCitation":"(Antero et al. 2025)"},"properties":{"noteIndex":0},"schema":"https://github.com/citation-style-language/schema/raw/master/csl-citation.json"}</w:instrText>
+        <w:instrText xml:space="preserve">ADDIN CSL_CITATION {"citationID":"MENDELEY_CITATION_474","citationItems":[{"id":"ITEM-474","isTemporary":false,"itemData":{"DOI":"10.1016/j.robot.2025.105026","author":[{"family":"Antero","given":"Unai"},{"family":"Sierra","given":"Basilio"},{"family":"Oñativia","given":"Jon"},{"family":"Ruiz","given":"Alejandra"},{"family":"Osaba","given":"Eneko"}],"container-title":"Robotics and Autonomous Systems","id":"Antero2025","issued":{"date-parts":[[2025]]},"page":"105026","publisher":"Elsevier","title":"Robot localization aided by quantum algorithms","type":"article-journal","volume":"192"}}],"isEdited":false,"manualOverride":{"citeprocText":"(Antero et al. 2025)","isManuallyOverridden":false,"manualOverrideText":""},"mendeley":{"formattedCitation":"(Antero et al. 2025)","plainTextFormattedCitation":"(Antero et al. 2025)","previouslyFormattedCitation":"(Antero et al. 2025)"},"properties":{"noteIndex":0},"schema":"https://github.com/citation-style-language/schema/raw/master/csl-citation.json"}</w:instrText>
       </w:r>
       <w:r>
         <w:fldChar w:fldCharType="separate"/>
@@ -18486,7 +18676,7 @@
         <w:fldChar w:fldCharType="begin"/>
       </w:r>
       <w:r>
-        <w:instrText xml:space="preserve">ADDIN CSL_CITATION {"citationID":"MENDELEY_CITATION_461","citationItems":[{"id":"ITEM-461","isTemporary":false,"itemData":{"DOI":"10.3390/math10142475","author":[{"family":"Chella","given":"Antonio"},{"family":"Gaglio","given":"Salvatore"},{"family":"Pilato","given":"Giovanni"},{"family":"Vella","given":"Filippo"},{"family":"Zammuto","given":"Salvatore"}],"container-title":"Mathematics","id":"Chella2022","issue":"14","issued":{"date-parts":[[2022]]},"page":"2475","publisher":"MDPI","title":"A quantum planner for robot motion","type":"article-journal","volume":"10"}}],"isEdited":false,"manualOverride":{"citeprocText":"(Chella et al. 2022)","isManuallyOverridden":false,"manualOverrideText":""},"mendeley":{"formattedCitation":"(Chella et al. 2022)","plainTextFormattedCitation":"(Chella et al. 2022)","previouslyFormattedCitation":"(Chella et al. 2022)"},"properties":{"noteIndex":0},"schema":"https://github.com/citation-style-language/schema/raw/master/csl-citation.json"}</w:instrText>
+        <w:instrText xml:space="preserve">ADDIN CSL_CITATION {"citationID":"MENDELEY_CITATION_475","citationItems":[{"id":"ITEM-475","isTemporary":false,"itemData":{"DOI":"10.3390/math10142475","author":[{"family":"Chella","given":"Antonio"},{"family":"Gaglio","given":"Salvatore"},{"family":"Pilato","given":"Giovanni"},{"family":"Vella","given":"Filippo"},{"family":"Zammuto","given":"Salvatore"}],"container-title":"Mathematics","id":"Chella2022","issue":"14","issued":{"date-parts":[[2022]]},"page":"2475","publisher":"MDPI","title":"A quantum planner for robot motion","type":"article-journal","volume":"10"}}],"isEdited":false,"manualOverride":{"citeprocText":"(Chella et al. 2022)","isManuallyOverridden":false,"manualOverrideText":""},"mendeley":{"formattedCitation":"(Chella et al. 2022)","plainTextFormattedCitation":"(Chella et al. 2022)","previouslyFormattedCitation":"(Chella et al. 2022)"},"properties":{"noteIndex":0},"schema":"https://github.com/citation-style-language/schema/raw/master/csl-citation.json"}</w:instrText>
       </w:r>
       <w:r>
         <w:fldChar w:fldCharType="separate"/>
@@ -18504,7 +18694,7 @@
         <w:fldChar w:fldCharType="begin"/>
       </w:r>
       <w:r>
-        <w:instrText xml:space="preserve">ADDIN CSL_CITATION {"citationID":"MENDELEY_CITATION_462","citationItems":[{"id":"ITEM-462","isTemporary":false,"itemData":{"DOI":"10.1016/j.robot.2023.104362","author":[{"family":"Chella","given":"Antonio"},{"family":"Gaglio","given":"Salvatore"},{"family":"Mannone","given":"Maria"},{"family":"Pilato","given":"Giovanni"},{"family":"Seidita","given":"Valeria"},{"family":"Vella","given":"Filippo"},{"family":"Zammuto","given":"Salvatore"}],"container-title":"Robotics and Autonomous Systems","id":"Chella2023","issued":{"date-parts":[[2023]]},"page":"104362","publisher":"Elsevier","title":"Quantum planning for swarm robotics","type":"article-journal","volume":"161"}}],"isEdited":false,"manualOverride":{"citeprocText":"(Chella et al. 2023)","isManuallyOverridden":false,"manualOverrideText":""},"mendeley":{"formattedCitation":"(Chella et al. 2023)","plainTextFormattedCitation":"(Chella et al. 2023)","previouslyFormattedCitation":"(Chella et al. 2023)"},"properties":{"noteIndex":0},"schema":"https://github.com/citation-style-language/schema/raw/master/csl-citation.json"}</w:instrText>
+        <w:instrText xml:space="preserve">ADDIN CSL_CITATION {"citationID":"MENDELEY_CITATION_476","citationItems":[{"id":"ITEM-476","isTemporary":false,"itemData":{"DOI":"10.1016/j.robot.2023.104362","author":[{"family":"Chella","given":"Antonio"},{"family":"Gaglio","given":"Salvatore"},{"family":"Mannone","given":"Maria"},{"family":"Pilato","given":"Giovanni"},{"family":"Seidita","given":"Valeria"},{"family":"Vella","given":"Filippo"},{"family":"Zammuto","given":"Salvatore"}],"container-title":"Robotics and Autonomous Systems","id":"Chella2023","issued":{"date-parts":[[2023]]},"page":"104362","publisher":"Elsevier","title":"Quantum planning for swarm robotics","type":"article-journal","volume":"161"}}],"isEdited":false,"manualOverride":{"citeprocText":"(Chella et al. 2023)","isManuallyOverridden":false,"manualOverrideText":""},"mendeley":{"formattedCitation":"(Chella et al. 2023)","plainTextFormattedCitation":"(Chella et al. 2023)","previouslyFormattedCitation":"(Chella et al. 2023)"},"properties":{"noteIndex":0},"schema":"https://github.com/citation-style-language/schema/raw/master/csl-citation.json"}</w:instrText>
       </w:r>
       <w:r>
         <w:fldChar w:fldCharType="separate"/>
@@ -18522,7 +18712,7 @@
         <w:fldChar w:fldCharType="begin"/>
       </w:r>
       <w:r>
-        <w:instrText xml:space="preserve">ADDIN CSL_CITATION {"citationID":"MENDELEY_CITATION_464","citationItems":[{"id":"ITEM-463","isTemporary":false,"itemData":{"URL":"https://arxiv.org/abs/2212.11681","author":[{"family":"Acuto","given":"Alberto"},{"family":"Barillà","given":"Paola"},{"family":"Bozzolo","given":"Ludovico"},{"family":"Conterno","given":"Matteo"},{"family":"Pavese","given":"Mattia"},{"family":"Policicchio","given":"Antonio"}],"id":"Acuto2022","issued":{"date-parts":[[2022]]},"title":"Variational quantum soft actor-critic for robotic arm control","type":""}},{"id":"ITEM-464","isTemporary":false,"itemData":{"DOI":"10.5220/0013371800003890","ISBN":"978-989-758-737-5","author":[{"family":"Drăgan","given":"Theodora-Augustina"},{"family":"Künzner","given":"Alexander"},{"family":"Wille","given":"Robert"},{"family":"Lorenz","given":"Jeanette Miriam"}],"container-title":"Proceedings of the 17th international conference on agents and artificial intelligence (ICAART 2025)","id":"Dragan2025","issued":{"date-parts":[[2025]]},"page":"807-814","publisher":"SciTePress","title":"Continuous quantum reinforcement learning for robot navigation","type":"paper-conference","volume":"1"}}],"isEdited":false,"manualOverride":{"citeprocText":"(Acuto et al. 2022; Drăgan et al. 2025)","isManuallyOverridden":false,"manualOverrideText":""},"mendeley":{"formattedCitation":"(Acuto et al. 2022; Drăgan et al. 2025)","plainTextFormattedCitation":"(Acuto et al. 2022; Drăgan et al. 2025)","previouslyFormattedCitation":"(Acuto et al. 2022; Drăgan et al. 2025)"},"properties":{"noteIndex":0},"schema":"https://github.com/citation-style-language/schema/raw/master/csl-citation.json"}</w:instrText>
+        <w:instrText xml:space="preserve">ADDIN CSL_CITATION {"citationID":"MENDELEY_CITATION_478","citationItems":[{"id":"ITEM-477","isTemporary":false,"itemData":{"URL":"https://arxiv.org/abs/2212.11681","author":[{"family":"Acuto","given":"Alberto"},{"family":"Barillà","given":"Paola"},{"family":"Bozzolo","given":"Ludovico"},{"family":"Conterno","given":"Matteo"},{"family":"Pavese","given":"Mattia"},{"family":"Policicchio","given":"Antonio"}],"id":"Acuto2022","issued":{"date-parts":[[2022]]},"title":"Variational quantum soft actor-critic for robotic arm control","type":""}},{"id":"ITEM-478","isTemporary":false,"itemData":{"DOI":"10.5220/0013371800003890","ISBN":"978-989-758-737-5","author":[{"family":"Drăgan","given":"Theodora-Augustina"},{"family":"Künzner","given":"Alexander"},{"family":"Wille","given":"Robert"},{"family":"Lorenz","given":"Jeanette Miriam"}],"container-title":"Proceedings of the 17th international conference on agents and artificial intelligence (ICAART 2025)","id":"Dragan2025","issued":{"date-parts":[[2025]]},"page":"807-814","publisher":"SciTePress","title":"Continuous quantum reinforcement learning for robot navigation","type":"paper-conference","volume":"1"}}],"isEdited":false,"manualOverride":{"citeprocText":"(Acuto et al. 2022; Drăgan et al. 2025)","isManuallyOverridden":false,"manualOverrideText":""},"mendeley":{"formattedCitation":"(Acuto et al. 2022; Drăgan et al. 2025)","plainTextFormattedCitation":"(Acuto et al. 2022; Drăgan et al. 2025)","previouslyFormattedCitation":"(Acuto et al. 2022; Drăgan et al. 2025)"},"properties":{"noteIndex":0},"schema":"https://github.com/citation-style-language/schema/raw/master/csl-citation.json"}</w:instrText>
       </w:r>
       <w:r>
         <w:fldChar w:fldCharType="separate"/>
@@ -18567,7 +18757,7 @@
         <w:fldChar w:fldCharType="begin"/>
       </w:r>
       <w:r>
-        <w:instrText xml:space="preserve">ADDIN CSL_CITATION {"citationID":"MENDELEY_CITATION_465","citationItems":[{"id":"ITEM-465","isTemporary":false,"itemData":{"DOI":"10.1145/3293320.3293333","author":[{"family":"Clark","given":"James"},{"family":"West","given":"Tristan"},{"family":"Zammit","given":"Joseph Paul"},{"family":"Guo","given":"Xiaohu"},{"family":"Mason","given":"Luke"},{"family":"Russell","given":"Duncan"}],"container-title":"Proceedings of the international conference on high performance computing in asia-pacific region (HPC Asia 2019)","id":"Clark2019","issued":{"date-parts":[[2019]]},"page":"111-119","publisher":"ACM","publisher-place":"New York, NY, USA","title":"Towards real time multi-robot routing using quantum computing technologies","type":"paper-conference"}}],"isEdited":false,"manualOverride":{"citeprocText":"(Clark et al. 2019)","isManuallyOverridden":false,"manualOverrideText":""},"mendeley":{"formattedCitation":"(Clark et al. 2019)","plainTextFormattedCitation":"(Clark et al. 2019)","previouslyFormattedCitation":"(Clark et al. 2019)"},"properties":{"noteIndex":0},"schema":"https://github.com/citation-style-language/schema/raw/master/csl-citation.json"}</w:instrText>
+        <w:instrText xml:space="preserve">ADDIN CSL_CITATION {"citationID":"MENDELEY_CITATION_479","citationItems":[{"id":"ITEM-479","isTemporary":false,"itemData":{"DOI":"10.1145/3293320.3293333","author":[{"family":"Clark","given":"James"},{"family":"West","given":"Tristan"},{"family":"Zammit","given":"Joseph Paul"},{"family":"Guo","given":"Xiaohu"},{"family":"Mason","given":"Luke"},{"family":"Russell","given":"Duncan"}],"container-title":"Proceedings of the international conference on high performance computing in asia-pacific region (HPC Asia 2019)","id":"Clark2019","issued":{"date-parts":[[2019]]},"page":"111-119","publisher":"ACM","publisher-place":"New York, NY, USA","title":"Towards real time multi-robot routing using quantum computing technologies","type":"paper-conference"}}],"isEdited":false,"manualOverride":{"citeprocText":"(Clark et al. 2019)","isManuallyOverridden":false,"manualOverrideText":""},"mendeley":{"formattedCitation":"(Clark et al. 2019)","plainTextFormattedCitation":"(Clark et al. 2019)","previouslyFormattedCitation":"(Clark et al. 2019)"},"properties":{"noteIndex":0},"schema":"https://github.com/citation-style-language/schema/raw/master/csl-citation.json"}</w:instrText>
       </w:r>
       <w:r>
         <w:fldChar w:fldCharType="separate"/>
@@ -18585,7 +18775,7 @@
         <w:fldChar w:fldCharType="begin"/>
       </w:r>
       <w:r>
-        <w:instrText xml:space="preserve">ADDIN CSL_CITATION {"citationID":"MENDELEY_CITATION_466","citationItems":[{"id":"ITEM-466","isTemporary":false,"itemData":{"DOI":"10.3389/fcomp.2019.00009","author":[{"family":"Ohzeki","given":"Masayuki"},{"family":"Miki","given":"Akira"},{"family":"Miyama","given":"Masamichi J."},{"family":"Terabe","given":"Masayoshi"}],"container-title":"Frontiers in Computer Science","id":"Ohzeki2019","issued":{"date-parts":[[2019]]},"page":"9","publisher":"Frontiers Media","title":"Control of automated guided vehicles without collision by quantum annealer and digital devices","type":"article-journal","volume":"1"}}],"isEdited":false,"manualOverride":{"citeprocText":"(Ohzeki et al. 2019)","isManuallyOverridden":false,"manualOverrideText":""},"mendeley":{"formattedCitation":"(Ohzeki et al. 2019)","plainTextFormattedCitation":"(Ohzeki et al. 2019)","previouslyFormattedCitation":"(Ohzeki et al. 2019)"},"properties":{"noteIndex":0},"schema":"https://github.com/citation-style-language/schema/raw/master/csl-citation.json"}</w:instrText>
+        <w:instrText xml:space="preserve">ADDIN CSL_CITATION {"citationID":"MENDELEY_CITATION_480","citationItems":[{"id":"ITEM-480","isTemporary":false,"itemData":{"DOI":"10.3389/fcomp.2019.00009","author":[{"family":"Ohzeki","given":"Masayuki"},{"family":"Miki","given":"Akira"},{"family":"Miyama","given":"Masamichi J."},{"family":"Terabe","given":"Masayoshi"}],"container-title":"Frontiers in Computer Science","id":"Ohzeki2019","issued":{"date-parts":[[2019]]},"page":"9","publisher":"Frontiers Media","title":"Control of automated guided vehicles without collision by quantum annealer and digital devices","type":"article-journal","volume":"1"}}],"isEdited":false,"manualOverride":{"citeprocText":"(Ohzeki et al. 2019)","isManuallyOverridden":false,"manualOverrideText":""},"mendeley":{"formattedCitation":"(Ohzeki et al. 2019)","plainTextFormattedCitation":"(Ohzeki et al. 2019)","previouslyFormattedCitation":"(Ohzeki et al. 2019)"},"properties":{"noteIndex":0},"schema":"https://github.com/citation-style-language/schema/raw/master/csl-citation.json"}</w:instrText>
       </w:r>
       <w:r>
         <w:fldChar w:fldCharType="separate"/>
@@ -18603,7 +18793,7 @@
         <w:fldChar w:fldCharType="begin"/>
       </w:r>
       <w:r>
-        <w:instrText xml:space="preserve">ADDIN CSL_CITATION {"citationID":"MENDELEY_CITATION_467","citationItems":[{"id":"ITEM-467","isTemporary":false,"itemData":{"DOI":"10.1038/s41598-025-28481-w","author":[{"family":"Quang","given":"Thinh Nguyen"},{"family":"Matsuyama","given":"Kosuke"},{"family":"Shimizu","given":"Keisuke"},{"family":"Sugano","given":"Hiroki"},{"family":"Kurimoto","given":"Eiji"},{"family":"Miki","given":"Masahiro"},{"family":"Suzuki","given":"Jumpei"},{"family":"Chen","given":"Ziyi"},{"family":"Waidyasooriya","given":"Hasitha Muthumala"},{"family":"Hariyama","given":"Masanori"},{"family":"Hitomi","given":"Masaru"},{"family":"Sawamura","given":"Kenta"},{"family":"Ohzeki","given":"Masayuki"}],"container-title":"Scientific Reports","id":"Quang2025","issued":{"date-parts":[[2025]]},"page":"44047","publisher":"Nature Publishing Group","title":"Quantum annealing-based route optimization for commercial AGV operating systems in large-scale logistics warehouses","type":"article-journal","volume":"15"}}],"isEdited":false,"manualOverride":{"citeprocText":"(Quang et al. 2025)","isManuallyOverridden":false,"manualOverrideText":""},"mendeley":{"formattedCitation":"(Quang et al. 2025)","plainTextFormattedCitation":"(Quang et al. 2025)","previouslyFormattedCitation":"(Quang et al. 2025)"},"properties":{"noteIndex":0},"schema":"https://github.com/citation-style-language/schema/raw/master/csl-citation.json"}</w:instrText>
+        <w:instrText xml:space="preserve">ADDIN CSL_CITATION {"citationID":"MENDELEY_CITATION_481","citationItems":[{"id":"ITEM-481","isTemporary":false,"itemData":{"DOI":"10.1038/s41598-025-28481-w","author":[{"family":"Quang","given":"Thinh Nguyen"},{"family":"Matsuyama","given":"Kosuke"},{"family":"Shimizu","given":"Keisuke"},{"family":"Sugano","given":"Hiroki"},{"family":"Kurimoto","given":"Eiji"},{"family":"Miki","given":"Masahiro"},{"family":"Suzuki","given":"Jumpei"},{"family":"Chen","given":"Ziyi"},{"family":"Waidyasooriya","given":"Hasitha Muthumala"},{"family":"Hariyama","given":"Masanori"},{"family":"Hitomi","given":"Masaru"},{"family":"Sawamura","given":"Kenta"},{"family":"Ohzeki","given":"Masayuki"}],"container-title":"Scientific Reports","id":"Quang2025","issued":{"date-parts":[[2025]]},"page":"44047","publisher":"Nature Publishing Group","title":"Quantum annealing-based route optimization for commercial AGV operating systems in large-scale logistics warehouses","type":"article-journal","volume":"15"}}],"isEdited":false,"manualOverride":{"citeprocText":"(Quang et al. 2025)","isManuallyOverridden":false,"manualOverrideText":""},"mendeley":{"formattedCitation":"(Quang et al. 2025)","plainTextFormattedCitation":"(Quang et al. 2025)","previouslyFormattedCitation":"(Quang et al. 2025)"},"properties":{"noteIndex":0},"schema":"https://github.com/citation-style-language/schema/raw/master/csl-citation.json"}</w:instrText>
       </w:r>
       <w:r>
         <w:fldChar w:fldCharType="separate"/>
@@ -18621,7 +18811,7 @@
         <w:fldChar w:fldCharType="begin"/>
       </w:r>
       <w:r>
-        <w:instrText xml:space="preserve">ADDIN CSL_CITATION {"citationID":"MENDELEY_CITATION_468","citationItems":[{"id":"ITEM-468","isTemporary":false,"itemData":{"URL":"https://proceedings.mlr.press/v267/gerlach25a.html","author":[{"family":"Gerlach","given":"Thore"},{"family":"Lee","given":"Loong Kuan"},{"family":"Barbaresco","given":"Frederic"},{"family":"Piatkowski","given":"Nico"}],"collection-title":"Proceedings of machine learning research","container-title":"Proceedings of the 42nd international conference on machine learning","editor":[{"family":"Singh","given":"Aarti"},{"family":"Fazel","given":"Maryam"},{"family":"Hsu","given":"Daniel"},{"family":"Lacoste-Julien","given":"Simon"},{"family":"Berkenkamp","given":"Felix"},{"family":"Maharaj","given":"Tegan"},{"family":"Wagstaff","given":"Kiri"},{"family":"Zhu","given":"Jerry"}],"id":"Gerlach2025","issued":{"date-parts":[[2025]]},"page":"19161-19171","publisher":"PMLR","title":"Hybrid quantum-classical multi-agent pathfinding","type":"paper-conference","volume":"267"}}],"isEdited":false,"manualOverride":{"citeprocText":"(Gerlach et al. 2025)","isManuallyOverridden":false,"manualOverrideText":""},"mendeley":{"formattedCitation":"(Gerlach et al. 2025)","plainTextFormattedCitation":"(Gerlach et al. 2025)","previouslyFormattedCitation":"(Gerlach et al. 2025)"},"properties":{"noteIndex":0},"schema":"https://github.com/citation-style-language/schema/raw/master/csl-citation.json"}</w:instrText>
+        <w:instrText xml:space="preserve">ADDIN CSL_CITATION {"citationID":"MENDELEY_CITATION_482","citationItems":[{"id":"ITEM-482","isTemporary":false,"itemData":{"URL":"https://proceedings.mlr.press/v267/gerlach25a.html","author":[{"family":"Gerlach","given":"Thore"},{"family":"Lee","given":"Loong Kuan"},{"family":"Barbaresco","given":"Frederic"},{"family":"Piatkowski","given":"Nico"}],"collection-title":"Proceedings of machine learning research","container-title":"Proceedings of the 42nd international conference on machine learning","editor":[{"family":"Singh","given":"Aarti"},{"family":"Fazel","given":"Maryam"},{"family":"Hsu","given":"Daniel"},{"family":"Lacoste-Julien","given":"Simon"},{"family":"Berkenkamp","given":"Felix"},{"family":"Maharaj","given":"Tegan"},{"family":"Wagstaff","given":"Kiri"},{"family":"Zhu","given":"Jerry"}],"id":"Gerlach2025","issued":{"date-parts":[[2025]]},"page":"19161-19171","publisher":"PMLR","title":"Hybrid quantum-classical multi-agent pathfinding","type":"paper-conference","volume":"267"}}],"isEdited":false,"manualOverride":{"citeprocText":"(Gerlach et al. 2025)","isManuallyOverridden":false,"manualOverrideText":""},"mendeley":{"formattedCitation":"(Gerlach et al. 2025)","plainTextFormattedCitation":"(Gerlach et al. 2025)","previouslyFormattedCitation":"(Gerlach et al. 2025)"},"properties":{"noteIndex":0},"schema":"https://github.com/citation-style-language/schema/raw/master/csl-citation.json"}</w:instrText>
       </w:r>
       <w:r>
         <w:fldChar w:fldCharType="separate"/>
@@ -18639,7 +18829,7 @@
         <w:fldChar w:fldCharType="begin"/>
       </w:r>
       <w:r>
-        <w:instrText xml:space="preserve">ADDIN CSL_CITATION {"citationID":"MENDELEY_CITATION_469","citationItems":[{"id":"ITEM-469","isTemporary":false,"itemData":{"URL":"https://arxiv.org/abs/2508.21361","author":[{"family":"Innan","given":"Nouhaila"},{"family":"Kashif","given":"Muhammad"},{"family":"Marchisio","given":"Alberto"},{"family":"Gan","given":"Yung-Sze"},{"family":"Barbaresco","given":"Frederic"},{"family":"Shafique","given":"Muhammad"}],"id":"Innan2025","issued":{"date-parts":[[2025]]},"title":"QUAV: Quantum-assisted path planning and optimization for UAV navigation with obstacle avoidance","title-short":"QUAV","type":""}}],"isEdited":false,"manualOverride":{"citeprocText":"(Innan et al. 2025)","isManuallyOverridden":false,"manualOverrideText":""},"mendeley":{"formattedCitation":"(Innan et al. 2025)","plainTextFormattedCitation":"(Innan et al. 2025)","previouslyFormattedCitation":"(Innan et al. 2025)"},"properties":{"noteIndex":0},"schema":"https://github.com/citation-style-language/schema/raw/master/csl-citation.json"}</w:instrText>
+        <w:instrText xml:space="preserve">ADDIN CSL_CITATION {"citationID":"MENDELEY_CITATION_483","citationItems":[{"id":"ITEM-483","isTemporary":false,"itemData":{"URL":"https://arxiv.org/abs/2508.21361","author":[{"family":"Innan","given":"Nouhaila"},{"family":"Kashif","given":"Muhammad"},{"family":"Marchisio","given":"Alberto"},{"family":"Gan","given":"Yung-Sze"},{"family":"Barbaresco","given":"Frederic"},{"family":"Shafique","given":"Muhammad"}],"id":"Innan2025","issued":{"date-parts":[[2025]]},"title":"QUAV: Quantum-assisted path planning and optimization for UAV navigation with obstacle avoidance","title-short":"QUAV","type":""}}],"isEdited":false,"manualOverride":{"citeprocText":"(Innan et al. 2025)","isManuallyOverridden":false,"manualOverrideText":""},"mendeley":{"formattedCitation":"(Innan et al. 2025)","plainTextFormattedCitation":"(Innan et al. 2025)","previouslyFormattedCitation":"(Innan et al. 2025)"},"properties":{"noteIndex":0},"schema":"https://github.com/citation-style-language/schema/raw/master/csl-citation.json"}</w:instrText>
       </w:r>
       <w:r>
         <w:fldChar w:fldCharType="separate"/>
@@ -18657,7 +18847,7 @@
         <w:fldChar w:fldCharType="begin"/>
       </w:r>
       <w:r>
-        <w:instrText xml:space="preserve">ADDIN CSL_CITATION {"citationID":"MENDELEY_CITATION_470","citationItems":[{"id":"ITEM-470","isTemporary":false,"itemData":{"DOI":"10.1038/s41598-025-34346-z","author":[{"family":"Salloum","given":"Hadi"},{"family":"Savin","given":"Sergei"},{"family":"Kholodov","given":"Yaroslav"},{"family":"Ryzhakov","given":"Gleb"},{"family":"Farina","given":"Mirko"},{"family":"Oseledets","given":"Ivan"}],"container-title":"Scientific Reports","id":"Salloum2026","issued":{"date-parts":[[2026]]},"page":"4244","publisher":"Nature Publishing Group","title":"Quantum annealing for inverse kinematics in robotics","type":"article-journal","volume":"16"}}],"isEdited":false,"manualOverride":{"citeprocText":"(Salloum et al. 2026)","isManuallyOverridden":false,"manualOverrideText":""},"mendeley":{"formattedCitation":"(Salloum et al. 2026)","plainTextFormattedCitation":"(Salloum et al. 2026)","previouslyFormattedCitation":"(Salloum et al. 2026)"},"properties":{"noteIndex":0},"schema":"https://github.com/citation-style-language/schema/raw/master/csl-citation.json"}</w:instrText>
+        <w:instrText xml:space="preserve">ADDIN CSL_CITATION {"citationID":"MENDELEY_CITATION_484","citationItems":[{"id":"ITEM-484","isTemporary":false,"itemData":{"DOI":"10.1038/s41598-025-34346-z","author":[{"family":"Salloum","given":"Hadi"},{"family":"Savin","given":"Sergei"},{"family":"Kholodov","given":"Yaroslav"},{"family":"Ryzhakov","given":"Gleb"},{"family":"Farina","given":"Mirko"},{"family":"Oseledets","given":"Ivan"}],"container-title":"Scientific Reports","id":"Salloum2026","issued":{"date-parts":[[2026]]},"page":"4244","publisher":"Nature Publishing Group","title":"Quantum annealing for inverse kinematics in robotics","type":"article-journal","volume":"16"}}],"isEdited":false,"manualOverride":{"citeprocText":"(Salloum et al. 2026)","isManuallyOverridden":false,"manualOverrideText":""},"mendeley":{"formattedCitation":"(Salloum et al. 2026)","plainTextFormattedCitation":"(Salloum et al. 2026)","previouslyFormattedCitation":"(Salloum et al. 2026)"},"properties":{"noteIndex":0},"schema":"https://github.com/citation-style-language/schema/raw/master/csl-citation.json"}</w:instrText>
       </w:r>
       <w:r>
         <w:fldChar w:fldCharType="separate"/>
@@ -18675,7 +18865,7 @@
         <w:fldChar w:fldCharType="begin"/>
       </w:r>
       <w:r>
-        <w:instrText xml:space="preserve">ADDIN CSL_CITATION {"citationID":"MENDELEY_CITATION_471","citationItems":[{"id":"ITEM-471","isTemporary":false,"itemData":{"DOI":"10.1038/s41598-025-12109-0","author":[{"family":"Otani","given":"Takuya"},{"family":"Takanishi","given":"Atsuo"},{"family":"Hara","given":"Nobuyuki"},{"family":"Takita","given":"Yutaka"},{"family":"Kimura","given":"Koichi"}],"container-title":"Scientific Reports","id":"Otani2025","issued":{"date-parts":[[2025]]},"page":"28508","publisher":"Nature Publishing Group","title":"Quantum computation for robot posture optimization","type":"article-journal","volume":"15"}}],"isEdited":false,"manualOverride":{"citeprocText":"(Otani et al. 2025)","isManuallyOverridden":false,"manualOverrideText":""},"mendeley":{"formattedCitation":"(Otani et al. 2025)","plainTextFormattedCitation":"(Otani et al. 2025)","previouslyFormattedCitation":"(Otani et al. 2025)"},"properties":{"noteIndex":0},"schema":"https://github.com/citation-style-language/schema/raw/master/csl-citation.json"}</w:instrText>
+        <w:instrText xml:space="preserve">ADDIN CSL_CITATION {"citationID":"MENDELEY_CITATION_485","citationItems":[{"id":"ITEM-485","isTemporary":false,"itemData":{"DOI":"10.1038/s41598-025-12109-0","author":[{"family":"Otani","given":"Takuya"},{"family":"Takanishi","given":"Atsuo"},{"family":"Hara","given":"Nobuyuki"},{"family":"Takita","given":"Yutaka"},{"family":"Kimura","given":"Koichi"}],"container-title":"Scientific Reports","id":"Otani2025","issued":{"date-parts":[[2025]]},"page":"28508","publisher":"Nature Publishing Group","title":"Quantum computation for robot posture optimization","type":"article-journal","volume":"15"}}],"isEdited":false,"manualOverride":{"citeprocText":"(Otani et al. 2025)","isManuallyOverridden":false,"manualOverrideText":""},"mendeley":{"formattedCitation":"(Otani et al. 2025)","plainTextFormattedCitation":"(Otani et al. 2025)","previouslyFormattedCitation":"(Otani et al. 2025)"},"properties":{"noteIndex":0},"schema":"https://github.com/citation-style-language/schema/raw/master/csl-citation.json"}</w:instrText>
       </w:r>
       <w:r>
         <w:fldChar w:fldCharType="separate"/>
@@ -18693,7 +18883,7 @@
         <w:fldChar w:fldCharType="begin"/>
       </w:r>
       <w:r>
-        <w:instrText xml:space="preserve">ADDIN CSL_CITATION {"citationID":"MENDELEY_CITATION_472","citationItems":[{"id":"ITEM-472","isTemporary":false,"itemData":{"DOI":"10.1515/auto-2023-0072","author":[{"family":"Windmann","given":"Stefan"}],"container-title":"at – Automatisierungstechnik","id":"Windmann2023","issued":{"date-parts":[[2023]]},"title":"Quantum computer-aided job scheduling for storage and retrieval systems","type":"article-journal"}}],"isEdited":false,"manualOverride":{"citeprocText":"(Windmann 2023)","isManuallyOverridden":false,"manualOverrideText":""},"mendeley":{"formattedCitation":"(Windmann 2023)","plainTextFormattedCitation":"(Windmann 2023)","previouslyFormattedCitation":"(Windmann 2023)"},"properties":{"noteIndex":0},"schema":"https://github.com/citation-style-language/schema/raw/master/csl-citation.json"}</w:instrText>
+        <w:instrText xml:space="preserve">ADDIN CSL_CITATION {"citationID":"MENDELEY_CITATION_486","citationItems":[{"id":"ITEM-486","isTemporary":false,"itemData":{"DOI":"10.1515/auto-2023-0072","author":[{"family":"Windmann","given":"Stefan"}],"container-title":"at – Automatisierungstechnik","id":"Windmann2023","issued":{"date-parts":[[2023]]},"title":"Quantum computer-aided job scheduling for storage and retrieval systems","type":"article-journal"}}],"isEdited":false,"manualOverride":{"citeprocText":"(Windmann 2023)","isManuallyOverridden":false,"manualOverrideText":""},"mendeley":{"formattedCitation":"(Windmann 2023)","plainTextFormattedCitation":"(Windmann 2023)","previouslyFormattedCitation":"(Windmann 2023)"},"properties":{"noteIndex":0},"schema":"https://github.com/citation-style-language/schema/raw/master/csl-citation.json"}</w:instrText>
       </w:r>
       <w:r>
         <w:fldChar w:fldCharType="separate"/>
@@ -18711,7 +18901,7 @@
         <w:fldChar w:fldCharType="begin"/>
       </w:r>
       <w:r>
-        <w:instrText xml:space="preserve">ADDIN CSL_CITATION {"citationID":"MENDELEY_CITATION_473","citationItems":[{"id":"ITEM-473","isTemporary":false,"itemData":{"URL":"https://arxiv.org/abs/2501.18432","author":[{"family":"Osaba","given":"Eneko"},{"family":"Miranda-Rodriguez","given":"Pablo"},{"family":"Oikonomakis","given":"Andreas"},{"family":"Petrič","given":"Matic"},{"family":"Ruiz","given":"Alejandra"},{"family":"Bock","given":"Sebastian"},{"family":"Kourtis","given":"Michail-Alexandros"}],"container-title":"2025 IEEE congress on evolutionary computation (CEC)","id":"OsabaDrone2025","issued":{"date-parts":[[2025]]},"publisher":"IEEE","title":"Solving drone routing problems with quantum computing: A hybrid approach combining quantum annealing and gate-based paradigms","title-short":"Solving drone routing problems with quantum computing","type":"paper-conference"}}],"isEdited":false,"manualOverride":{"citeprocText":"(Osaba, Miranda-Rodriguez, et al. 2025)","isManuallyOverridden":false,"manualOverrideText":""},"mendeley":{"formattedCitation":"(Osaba, Miranda-Rodriguez, et al. 2025)","plainTextFormattedCitation":"(Osaba, Miranda-Rodriguez, et al. 2025)","previouslyFormattedCitation":"(Osaba, Miranda-Rodriguez, et al. 2025)"},"properties":{"noteIndex":0},"schema":"https://github.com/citation-style-language/schema/raw/master/csl-citation.json"}</w:instrText>
+        <w:instrText xml:space="preserve">ADDIN CSL_CITATION {"citationID":"MENDELEY_CITATION_487","citationItems":[{"id":"ITEM-487","isTemporary":false,"itemData":{"URL":"https://arxiv.org/abs/2501.18432","author":[{"family":"Osaba","given":"Eneko"},{"family":"Miranda-Rodriguez","given":"Pablo"},{"family":"Oikonomakis","given":"Andreas"},{"family":"Petrič","given":"Matic"},{"family":"Ruiz","given":"Alejandra"},{"family":"Bock","given":"Sebastian"},{"family":"Kourtis","given":"Michail-Alexandros"}],"container-title":"2025 IEEE congress on evolutionary computation (CEC)","id":"OsabaDrone2025","issued":{"date-parts":[[2025]]},"publisher":"IEEE","title":"Solving drone routing problems with quantum computing: A hybrid approach combining quantum annealing and gate-based paradigms","title-short":"Solving drone routing problems with quantum computing","type":"paper-conference"}}],"isEdited":false,"manualOverride":{"citeprocText":"(Osaba, Miranda-Rodriguez, et al. 2025)","isManuallyOverridden":false,"manualOverrideText":""},"mendeley":{"formattedCitation":"(Osaba, Miranda-Rodriguez, et al. 2025)","plainTextFormattedCitation":"(Osaba, Miranda-Rodriguez, et al. 2025)","previouslyFormattedCitation":"(Osaba, Miranda-Rodriguez, et al. 2025)"},"properties":{"noteIndex":0},"schema":"https://github.com/citation-style-language/schema/raw/master/csl-citation.json"}</w:instrText>
       </w:r>
       <w:r>
         <w:fldChar w:fldCharType="separate"/>
@@ -18729,7 +18919,7 @@
         <w:fldChar w:fldCharType="begin"/>
       </w:r>
       <w:r>
-        <w:instrText xml:space="preserve">ADDIN CSL_CITATION {"citationID":"MENDELEY_CITATION_474","citationItems":[{"id":"ITEM-474","isTemporary":false,"itemData":{"URL":"https://arxiv.org/abs/2605.01716","author":[{"family":"Ngo","given":"Nguyen Truong Thu"},{"family":"Mehtola","given":"Väinö"},{"family":"Lenssen","given":"Jérome"},{"family":"Wang","given":"Peiyong"},{"family":"Cosco","given":"Francesco"},{"family":"Lu","given":"Tien-Fu"},{"family":"Quach","given":"James Q."}],"id":"Ngo2026","issued":{"date-parts":[[2026]]},"title":"Towards real-time control of a CartPole system on a quantum computer","type":""}}],"isEdited":false,"manualOverride":{"citeprocText":"(Ngo et al. 2026)","isManuallyOverridden":false,"manualOverrideText":""},"mendeley":{"formattedCitation":"(Ngo et al. 2026)","plainTextFormattedCitation":"(Ngo et al. 2026)","previouslyFormattedCitation":"(Ngo et al. 2026)"},"properties":{"noteIndex":0},"schema":"https://github.com/citation-style-language/schema/raw/master/csl-citation.json"}</w:instrText>
+        <w:instrText xml:space="preserve">ADDIN CSL_CITATION {"citationID":"MENDELEY_CITATION_488","citationItems":[{"id":"ITEM-488","isTemporary":false,"itemData":{"URL":"https://arxiv.org/abs/2605.01716","author":[{"family":"Ngo","given":"Nguyen Truong Thu"},{"family":"Mehtola","given":"Väinö"},{"family":"Lenssen","given":"Jérome"},{"family":"Wang","given":"Peiyong"},{"family":"Cosco","given":"Francesco"},{"family":"Lu","given":"Tien-Fu"},{"family":"Quach","given":"James Q."}],"id":"Ngo2026","issued":{"date-parts":[[2026]]},"title":"Towards real-time control of a CartPole system on a quantum computer","type":""}}],"isEdited":false,"manualOverride":{"citeprocText":"(Ngo et al. 2026)","isManuallyOverridden":false,"manualOverrideText":""},"mendeley":{"formattedCitation":"(Ngo et al. 2026)","plainTextFormattedCitation":"(Ngo et al. 2026)","previouslyFormattedCitation":"(Ngo et al. 2026)"},"properties":{"noteIndex":0},"schema":"https://github.com/citation-style-language/schema/raw/master/csl-citation.json"}</w:instrText>
       </w:r>
       <w:r>
         <w:fldChar w:fldCharType="separate"/>
@@ -18747,7 +18937,7 @@
         <w:fldChar w:fldCharType="begin"/>
       </w:r>
       <w:r>
-        <w:instrText xml:space="preserve">ADDIN CSL_CITATION {"citationID":"MENDELEY_CITATION_475","citationItems":[{"id":"ITEM-475","isTemporary":false,"itemData":{"URL":"https://arxiv.org/abs/2605.20801","author":[{"family":"Altrabulsi","given":"Mohamed Khair"},{"family":"Innan","given":"Nouhaila"},{"family":"Marchisio","given":"Alberto"},{"family":"Kashif","given":"Muhammad"},{"family":"Shafique","given":"Muhammad"}],"id":"Altrabulsi2026","issued":{"date-parts":[[2026]]},"title":"Q-SpiRL: Quantum spiking reinforcement learning for adaptive robot navigation","title-short":"Q-SpiRL","type":""}}],"isEdited":false,"manualOverride":{"citeprocText":"(Altrabulsi et al. 2026)","isManuallyOverridden":false,"manualOverrideText":""},"mendeley":{"formattedCitation":"(Altrabulsi et al. 2026)","plainTextFormattedCitation":"(Altrabulsi et al. 2026)","previouslyFormattedCitation":"(Altrabulsi et al. 2026)"},"properties":{"noteIndex":0},"schema":"https://github.com/citation-style-language/schema/raw/master/csl-citation.json"}</w:instrText>
+        <w:instrText xml:space="preserve">ADDIN CSL_CITATION {"citationID":"MENDELEY_CITATION_489","citationItems":[{"id":"ITEM-489","isTemporary":false,"itemData":{"URL":"https://arxiv.org/abs/2605.20801","author":[{"family":"Altrabulsi","given":"Mohamed Khair"},{"family":"Innan","given":"Nouhaila"},{"family":"Marchisio","given":"Alberto"},{"family":"Kashif","given":"Muhammad"},{"family":"Shafique","given":"Muhammad"}],"id":"Altrabulsi2026","issued":{"date-parts":[[2026]]},"title":"Q-SpiRL: Quantum spiking reinforcement learning for adaptive robot navigation","title-short":"Q-SpiRL","type":""}}],"isEdited":false,"manualOverride":{"citeprocText":"(Altrabulsi et al. 2026)","isManuallyOverridden":false,"manualOverrideText":""},"mendeley":{"formattedCitation":"(Altrabulsi et al. 2026)","plainTextFormattedCitation":"(Altrabulsi et al. 2026)","previouslyFormattedCitation":"(Altrabulsi et al. 2026)"},"properties":{"noteIndex":0},"schema":"https://github.com/citation-style-language/schema/raw/master/csl-citation.json"}</w:instrText>
       </w:r>
       <w:r>
         <w:fldChar w:fldCharType="separate"/>
@@ -18765,7 +18955,7 @@
         <w:fldChar w:fldCharType="begin"/>
       </w:r>
       <w:r>
-        <w:instrText xml:space="preserve">ADDIN CSL_CITATION {"citationID":"MENDELEY_CITATION_476","citationItems":[{"id":"ITEM-476","isTemporary":false,"itemData":{"DOI":"10.3390/e25040548","author":[{"family":"Widdows","given":"Dominic"},{"family":"Rani","given":"Jyoti"},{"family":"Pothos","given":"Emmanuel M."}],"container-title":"Entropy","id":"Widdows2023","issue":"4","issued":{"date-parts":[[2023]]},"page":"548","publisher":"MDPI","title":"Quantum circuit components for cognitive decision-making","type":"article-journal","volume":"25"}}],"isEdited":false,"manualOverride":{"citeprocText":"(Widdows, Rani, and Pothos 2023)","isManuallyOverridden":false,"manualOverrideText":""},"mendeley":{"formattedCitation":"(Widdows, Rani, and Pothos 2023)","plainTextFormattedCitation":"(Widdows, Rani, and Pothos 2023)","previouslyFormattedCitation":"(Widdows, Rani, and Pothos 2023)"},"properties":{"noteIndex":0},"schema":"https://github.com/citation-style-language/schema/raw/master/csl-citation.json"}</w:instrText>
+        <w:instrText xml:space="preserve">ADDIN CSL_CITATION {"citationID":"MENDELEY_CITATION_490","citationItems":[{"id":"ITEM-490","isTemporary":false,"itemData":{"DOI":"10.3390/e25040548","author":[{"family":"Widdows","given":"Dominic"},{"family":"Rani","given":"Jyoti"},{"family":"Pothos","given":"Emmanuel M."}],"container-title":"Entropy","id":"Widdows2023","issue":"4","issued":{"date-parts":[[2023]]},"page":"548","publisher":"MDPI","title":"Quantum circuit components for cognitive decision-making","type":"article-journal","volume":"25"}}],"isEdited":false,"manualOverride":{"citeprocText":"(Widdows, Rani, and Pothos 2023)","isManuallyOverridden":false,"manualOverrideText":""},"mendeley":{"formattedCitation":"(Widdows, Rani, and Pothos 2023)","plainTextFormattedCitation":"(Widdows, Rani, and Pothos 2023)","previouslyFormattedCitation":"(Widdows, Rani, and Pothos 2023)"},"properties":{"noteIndex":0},"schema":"https://github.com/citation-style-language/schema/raw/master/csl-citation.json"}</w:instrText>
       </w:r>
       <w:r>
         <w:fldChar w:fldCharType="separate"/>
@@ -18783,7 +18973,7 @@
         <w:fldChar w:fldCharType="begin"/>
       </w:r>
       <w:r>
-        <w:instrText xml:space="preserve">ADDIN CSL_CITATION {"citationID":"MENDELEY_CITATION_480","citationItems":[{"id":"ITEM-477","isTemporary":false,"itemData":{"DOI":"10.3389/fcomp.2019.00009","author":[{"family":"Ohzeki","given":"Masayuki"},{"family":"Miki","given":"Akira"},{"family":"Miyama","given":"Masamichi J."},{"family":"Terabe","given":"Masayoshi"}],"container-title":"Frontiers in Computer Science","id":"Ohzeki2019","issued":{"date-parts":[[2019]]},"page":"9","publisher":"Frontiers Media","title":"Control of automated guided vehicles without collision by quantum annealer and digital devices","type":"article-journal","volume":"1"}},{"id":"ITEM-478","isTemporary":false,"itemData":{"DOI":"10.1038/s41598-024-72101-y","author":[{"family":"Śmierzchalski","given":"Tomasz"},{"family":"Pawłowski","given":"Jakub"},{"family":"Przybysz","given":"Artur"},{"family":"Pawela","given":"Łukasz"},{"family":"Puchała","given":"Zbigniew"},{"family":"Koniorczyk","given":"Mátyás"},{"family":"Gardas","given":"Bartłomiej"},{"family":"Deffner","given":"Sebastian"},{"family":"Domino","given":"Krzysztof"}],"container-title":"Scientific Reports","id":"Smierzchalski2024","issued":{"date-parts":[[2024]]},"page":"21809","publisher":"Nature Publishing Group","title":"Hybrid quantum-classical computation for automatic guided vehicles scheduling","type":"article-journal","volume":"14"}},{"id":"ITEM-479","isTemporary":false,"itemData":{"DOI":"10.1038/s41598-023-45668-1","author":[{"family":"Leib","given":"Dominik"},{"family":"Seidel","given":"Tobias"},{"family":"Jäger","given":"Sven"},{"family":"Heese","given":"Raoul"},{"family":"Jones","given":"Caitlin Isobel"},{"family":"Awasthi","given":"Abhishek"},{"family":"Niederle","given":"Astrid"},{"family":"Bortz","given":"Michael"}],"container-title":"Scientific Reports","id":"Leib2023","issued":{"date-parts":[[2023]]},"publisher":"Nature Publishing Group","title":"An optimization case study for solving a transport robot scheduling problem on quantum-hybrid and quantum-inspired hardware","type":"article-journal","volume":"13"}},{"id":"ITEM-480","isTemporary":false,"itemData":{"DOI":"10.1016/j.procir.2025.01.099","author":[{"family":"Willmann","given":"Moritz"},{"family":"Albus","given":"Marcel"},{"family":"Schnabel","given":"Jan"},{"family":"Roth","given":"Marco"}],"container-title":"Procedia CIRP","id":"Willmann2025","issued":{"date-parts":[[2025]]},"note":"58th CIRP Conference on Manufacturing Systems","page":"25-30","publisher":"Elsevier","title":"Application of quantum annealing for scalable robotic assembly line optimization: A case study","title-short":"Application of quantum annealing for scalable robotic assembly line optimization","type":"article-journal","volume":"134"}}],"isEdited":false,"manualOverride":{"citeprocText":"(Ohzeki et al. 2019; Śmierzchalski et al. 2024; Leib et al. 2023; Willmann et al. 2025)","isManuallyOverridden":false,"manualOverrideText":""},"mendeley":{"formattedCitation":"(Ohzeki et al. 2019; Śmierzchalski et al. 2024; Leib et al. 2023; Willmann et al. 2025)","plainTextFormattedCitation":"(Ohzeki et al. 2019; Śmierzchalski et al. 2024; Leib et al. 2023; Willmann et al. 2025)","previouslyFormattedCitation":"(Ohzeki et al. 2019; Śmierzchalski et al. 2024; Leib et al. 2023; Willmann et al. 2025)"},"properties":{"noteIndex":0},"schema":"https://github.com/citation-style-language/schema/raw/master/csl-citation.json"}</w:instrText>
+        <w:instrText xml:space="preserve">ADDIN CSL_CITATION {"citationID":"MENDELEY_CITATION_494","citationItems":[{"id":"ITEM-491","isTemporary":false,"itemData":{"DOI":"10.3389/fcomp.2019.00009","author":[{"family":"Ohzeki","given":"Masayuki"},{"family":"Miki","given":"Akira"},{"family":"Miyama","given":"Masamichi J."},{"family":"Terabe","given":"Masayoshi"}],"container-title":"Frontiers in Computer Science","id":"Ohzeki2019","issued":{"date-parts":[[2019]]},"page":"9","publisher":"Frontiers Media","title":"Control of automated guided vehicles without collision by quantum annealer and digital devices","type":"article-journal","volume":"1"}},{"id":"ITEM-492","isTemporary":false,"itemData":{"DOI":"10.1038/s41598-024-72101-y","author":[{"family":"Śmierzchalski","given":"Tomasz"},{"family":"Pawłowski","given":"Jakub"},{"family":"Przybysz","given":"Artur"},{"family":"Pawela","given":"Łukasz"},{"family":"Puchała","given":"Zbigniew"},{"family":"Koniorczyk","given":"Mátyás"},{"family":"Gardas","given":"Bartłomiej"},{"family":"Deffner","given":"Sebastian"},{"family":"Domino","given":"Krzysztof"}],"container-title":"Scientific Reports","id":"Smierzchalski2024","issued":{"date-parts":[[2024]]},"page":"21809","publisher":"Nature Publishing Group","title":"Hybrid quantum-classical computation for automatic guided vehicles scheduling","type":"article-journal","volume":"14"}},{"id":"ITEM-493","isTemporary":false,"itemData":{"DOI":"10.1038/s41598-023-45668-1","author":[{"family":"Leib","given":"Dominik"},{"family":"Seidel","given":"Tobias"},{"family":"Jäger","given":"Sven"},{"family":"Heese","given":"Raoul"},{"family":"Jones","given":"Caitlin Isobel"},{"family":"Awasthi","given":"Abhishek"},{"family":"Niederle","given":"Astrid"},{"family":"Bortz","given":"Michael"}],"container-title":"Scientific Reports","id":"Leib2023","issued":{"date-parts":[[2023]]},"publisher":"Nature Publishing Group","title":"An optimization case study for solving a transport robot scheduling problem on quantum-hybrid and quantum-inspired hardware","type":"article-journal","volume":"13"}},{"id":"ITEM-494","isTemporary":false,"itemData":{"DOI":"10.1016/j.procir.2025.01.099","author":[{"family":"Willmann","given":"Moritz"},{"family":"Albus","given":"Marcel"},{"family":"Schnabel","given":"Jan"},{"family":"Roth","given":"Marco"}],"container-title":"Procedia CIRP","id":"Willmann2025","issued":{"date-parts":[[2025]]},"note":"58th CIRP Conference on Manufacturing Systems","page":"25-30","publisher":"Elsevier","title":"Application of quantum annealing for scalable robotic assembly line optimization: A case study","title-short":"Application of quantum annealing for scalable robotic assembly line optimization","type":"article-journal","volume":"134"}}],"isEdited":false,"manualOverride":{"citeprocText":"(Ohzeki et al. 2019; Śmierzchalski et al. 2024; Leib et al. 2023; Willmann et al. 2025)","isManuallyOverridden":false,"manualOverrideText":""},"mendeley":{"formattedCitation":"(Ohzeki et al. 2019; Śmierzchalski et al. 2024; Leib et al. 2023; Willmann et al. 2025)","plainTextFormattedCitation":"(Ohzeki et al. 2019; Śmierzchalski et al. 2024; Leib et al. 2023; Willmann et al. 2025)","previouslyFormattedCitation":"(Ohzeki et al. 2019; Śmierzchalski et al. 2024; Leib et al. 2023; Willmann et al. 2025)"},"properties":{"noteIndex":0},"schema":"https://github.com/citation-style-language/schema/raw/master/csl-citation.json"}</w:instrText>
       </w:r>
       <w:r>
         <w:fldChar w:fldCharType="separate"/>
@@ -18801,7 +18991,7 @@
         <w:fldChar w:fldCharType="begin"/>
       </w:r>
       <w:r>
-        <w:instrText xml:space="preserve">ADDIN CSL_CITATION {"citationID":"MENDELEY_CITATION_481","citationItems":[{"id":"ITEM-481","isTemporary":false,"itemData":{"DOI":"10.1038/s41598-023-45668-1","author":[{"family":"Leib","given":"Dominik"},{"family":"Seidel","given":"Tobias"},{"family":"Jäger","given":"Sven"},{"family":"Heese","given":"Raoul"},{"family":"Jones","given":"Caitlin Isobel"},{"family":"Awasthi","given":"Abhishek"},{"family":"Niederle","given":"Astrid"},{"family":"Bortz","given":"Michael"}],"container-title":"Scientific Reports","id":"Leib2023","issued":{"date-parts":[[2023]]},"publisher":"Nature Publishing Group","title":"An optimization case study for solving a transport robot scheduling problem on quantum-hybrid and quantum-inspired hardware","type":"article-journal","volume":"13"}}],"isEdited":false,"manualOverride":{"citeprocText":"(Leib et al. 2023)","isManuallyOverridden":false,"manualOverrideText":""},"mendeley":{"formattedCitation":"(Leib et al. 2023)","plainTextFormattedCitation":"(Leib et al. 2023)","previouslyFormattedCitation":"(Leib et al. 2023)"},"properties":{"noteIndex":0},"schema":"https://github.com/citation-style-language/schema/raw/master/csl-citation.json"}</w:instrText>
+        <w:instrText xml:space="preserve">ADDIN CSL_CITATION {"citationID":"MENDELEY_CITATION_495","citationItems":[{"id":"ITEM-495","isTemporary":false,"itemData":{"DOI":"10.1038/s41598-023-45668-1","author":[{"family":"Leib","given":"Dominik"},{"family":"Seidel","given":"Tobias"},{"family":"Jäger","given":"Sven"},{"family":"Heese","given":"Raoul"},{"family":"Jones","given":"Caitlin Isobel"},{"family":"Awasthi","given":"Abhishek"},{"family":"Niederle","given":"Astrid"},{"family":"Bortz","given":"Michael"}],"container-title":"Scientific Reports","id":"Leib2023","issued":{"date-parts":[[2023]]},"publisher":"Nature Publishing Group","title":"An optimization case study for solving a transport robot scheduling problem on quantum-hybrid and quantum-inspired hardware","type":"article-journal","volume":"13"}}],"isEdited":false,"manualOverride":{"citeprocText":"(Leib et al. 2023)","isManuallyOverridden":false,"manualOverrideText":""},"mendeley":{"formattedCitation":"(Leib et al. 2023)","plainTextFormattedCitation":"(Leib et al. 2023)","previouslyFormattedCitation":"(Leib et al. 2023)"},"properties":{"noteIndex":0},"schema":"https://github.com/citation-style-language/schema/raw/master/csl-citation.json"}</w:instrText>
       </w:r>
       <w:r>
         <w:fldChar w:fldCharType="separate"/>
@@ -18819,7 +19009,7 @@
         <w:fldChar w:fldCharType="begin"/>
       </w:r>
       <w:r>
-        <w:instrText xml:space="preserve">ADDIN CSL_CITATION {"citationID":"MENDELEY_CITATION_482","citationItems":[{"id":"ITEM-482","isTemporary":false,"itemData":{"DOI":"10.1016/j.robot.2025.105026","author":[{"family":"Antero","given":"Unai"},{"family":"Sierra","given":"Basilio"},{"family":"Oñativia","given":"Jon"},{"family":"Ruiz","given":"Alejandra"},{"family":"Osaba","given":"Eneko"}],"container-title":"Robotics and Autonomous Systems","id":"Antero2025","issued":{"date-parts":[[2025]]},"page":"105026","publisher":"Elsevier","title":"Robot localization aided by quantum algorithms","type":"article-journal","volume":"192"}}],"isEdited":false,"manualOverride":{"citeprocText":"(Antero et al. 2025)","isManuallyOverridden":false,"manualOverrideText":""},"mendeley":{"formattedCitation":"(Antero et al. 2025)","plainTextFormattedCitation":"(Antero et al. 2025)","previouslyFormattedCitation":"(Antero et al. 2025)"},"properties":{"noteIndex":0},"schema":"https://github.com/citation-style-language/schema/raw/master/csl-citation.json"}</w:instrText>
+        <w:instrText xml:space="preserve">ADDIN CSL_CITATION {"citationID":"MENDELEY_CITATION_496","citationItems":[{"id":"ITEM-496","isTemporary":false,"itemData":{"DOI":"10.1016/j.robot.2025.105026","author":[{"family":"Antero","given":"Unai"},{"family":"Sierra","given":"Basilio"},{"family":"Oñativia","given":"Jon"},{"family":"Ruiz","given":"Alejandra"},{"family":"Osaba","given":"Eneko"}],"container-title":"Robotics and Autonomous Systems","id":"Antero2025","issued":{"date-parts":[[2025]]},"page":"105026","publisher":"Elsevier","title":"Robot localization aided by quantum algorithms","type":"article-journal","volume":"192"}}],"isEdited":false,"manualOverride":{"citeprocText":"(Antero et al. 2025)","isManuallyOverridden":false,"manualOverrideText":""},"mendeley":{"formattedCitation":"(Antero et al. 2025)","plainTextFormattedCitation":"(Antero et al. 2025)","previouslyFormattedCitation":"(Antero et al. 2025)"},"properties":{"noteIndex":0},"schema":"https://github.com/citation-style-language/schema/raw/master/csl-citation.json"}</w:instrText>
       </w:r>
       <w:r>
         <w:fldChar w:fldCharType="separate"/>
@@ -18864,7 +19054,7 @@
         <w:fldChar w:fldCharType="begin"/>
       </w:r>
       <w:r>
-        <w:instrText xml:space="preserve">ADDIN CSL_CITATION {"citationID":"MENDELEY_CITATION_483","citationItems":[{"id":"ITEM-483","isTemporary":false,"itemData":{"DOI":"10.48550/arXiv.2504.08167","URL":"https://arxiv.org/abs/2504.08167","author":[{"family":"Muradoglu","given":"Murat"},{"family":"Johnsson","given":"Mattias T."},{"family":"Wilson","given":"Nathanial M."},{"family":"Cohen","given":"Yuval"},{"family":"Shin","given":"Dongki"},{"family":"Navickas","given":"Tomas"},{"family":"Pyragius","given":"Tadas"},{"family":"Thomas","given":"Divya"},{"family":"Thompson","given":"Daniel"},{"family":"Moore","given":"Steven I."},{"family":"Rahman","given":"Md Tanvir"},{"family":"Walker","given":"Adrian"},{"family":"Dutta","given":"Indranil"},{"family":"Bijjahalli","given":"Suraj"},{"family":"Berlocher","given":"Jacob"},{"family":"Hush","given":"Michael R."},{"family":"Anderson","given":"Russell P."},{"family":"Szigeti","given":"Stuart S."},{"family":"Biercuk","given":"Michael J."}],"id":"Muradoglu2025","issued":{"date-parts":[[2025]]},"title":"Quantum-assured magnetic navigation achieves positioning accuracy better than a strategic-grade INS in airborne and ground-based field trials","type":""}}],"isEdited":false,"manualOverride":{"citeprocText":"(Muradoglu et al. 2025)","isManuallyOverridden":false,"manualOverrideText":""},"mendeley":{"formattedCitation":"(Muradoglu et al. 2025)","plainTextFormattedCitation":"(Muradoglu et al. 2025)","previouslyFormattedCitation":"(Muradoglu et al. 2025)"},"properties":{"noteIndex":0},"schema":"https://github.com/citation-style-language/schema/raw/master/csl-citation.json"}</w:instrText>
+        <w:instrText xml:space="preserve">ADDIN CSL_CITATION {"citationID":"MENDELEY_CITATION_497","citationItems":[{"id":"ITEM-497","isTemporary":false,"itemData":{"DOI":"10.48550/arXiv.2504.08167","URL":"https://arxiv.org/abs/2504.08167","author":[{"family":"Muradoglu","given":"Murat"},{"family":"Johnsson","given":"Mattias T."},{"family":"Wilson","given":"Nathanial M."},{"family":"Cohen","given":"Yuval"},{"family":"Shin","given":"Dongki"},{"family":"Navickas","given":"Tomas"},{"family":"Pyragius","given":"Tadas"},{"family":"Thomas","given":"Divya"},{"family":"Thompson","given":"Daniel"},{"family":"Moore","given":"Steven I."},{"family":"Rahman","given":"Md Tanvir"},{"family":"Walker","given":"Adrian"},{"family":"Dutta","given":"Indranil"},{"family":"Bijjahalli","given":"Suraj"},{"family":"Berlocher","given":"Jacob"},{"family":"Hush","given":"Michael R."},{"family":"Anderson","given":"Russell P."},{"family":"Szigeti","given":"Stuart S."},{"family":"Biercuk","given":"Michael J."}],"id":"Muradoglu2025","issued":{"date-parts":[[2025]]},"title":"Quantum-assured magnetic navigation achieves positioning accuracy better than a strategic-grade INS in airborne and ground-based field trials","type":""}}],"isEdited":false,"manualOverride":{"citeprocText":"(Muradoglu et al. 2025)","isManuallyOverridden":false,"manualOverrideText":""},"mendeley":{"formattedCitation":"(Muradoglu et al. 2025)","plainTextFormattedCitation":"(Muradoglu et al. 2025)","previouslyFormattedCitation":"(Muradoglu et al. 2025)"},"properties":{"noteIndex":0},"schema":"https://github.com/citation-style-language/schema/raw/master/csl-citation.json"}</w:instrText>
       </w:r>
       <w:r>
         <w:fldChar w:fldCharType="separate"/>
@@ -18882,7 +19072,7 @@
         <w:fldChar w:fldCharType="begin"/>
       </w:r>
       <w:r>
-        <w:instrText xml:space="preserve">ADDIN CSL_CITATION {"citationID":"MENDELEY_CITATION_484","citationItems":[{"id":"ITEM-484","isTemporary":false,"itemData":{"DOI":"10.48550/arXiv.2505.17587","URL":"https://arxiv.org/abs/2505.17587","author":[{"family":"Conrad","given":"Andrew"},{"family":"Cochran","given":"Roderick"},{"family":"Sanchez-Rosales","given":"Daniel"},{"family":"Isaac","given":"Samantha"},{"family":"Javid","given":"Timur"},{"family":"Rezaei","given":"Tahereh"},{"family":"Schroeder","given":"A. J."},{"family":"Golba","given":"Grzegorz"},{"family":"Gutha","given":"Akash"},{"family":"Wilens","given":"Brian"},{"family":"Herndon","given":"Kyle"},{"family":"Hill","given":"Alex"},{"family":"Chapman","given":"Joseph"},{"family":"Call","given":"Ian"},{"family":"Szabo","given":"Joseph"},{"family":"Corrigan","given":"Aodhan"},{"family":"Kamin","given":"Lars"},{"family":"Lütkenhaus","given":"Norbert"},{"family":"Gauthier","given":"Daniel J."},{"family":"Kwiat","given":"Paul G."}],"id":"Conrad2025","issued":{"date-parts":[[2025]]},"title":"Drone- and vehicle-based quantum key distribution","type":""}}],"isEdited":false,"manualOverride":{"citeprocText":"(Conrad et al. 2025)","isManuallyOverridden":false,"manualOverrideText":""},"mendeley":{"formattedCitation":"(Conrad et al. 2025)","plainTextFormattedCitation":"(Conrad et al. 2025)","previouslyFormattedCitation":"(Conrad et al. 2025)"},"properties":{"noteIndex":0},"schema":"https://github.com/citation-style-language/schema/raw/master/csl-citation.json"}</w:instrText>
+        <w:instrText xml:space="preserve">ADDIN CSL_CITATION {"citationID":"MENDELEY_CITATION_498","citationItems":[{"id":"ITEM-498","isTemporary":false,"itemData":{"DOI":"10.48550/arXiv.2505.17587","URL":"https://arxiv.org/abs/2505.17587","author":[{"family":"Conrad","given":"Andrew"},{"family":"Cochran","given":"Roderick"},{"family":"Sanchez-Rosales","given":"Daniel"},{"family":"Isaac","given":"Samantha"},{"family":"Javid","given":"Timur"},{"family":"Rezaei","given":"Tahereh"},{"family":"Schroeder","given":"A. J."},{"family":"Golba","given":"Grzegorz"},{"family":"Gutha","given":"Akash"},{"family":"Wilens","given":"Brian"},{"family":"Herndon","given":"Kyle"},{"family":"Hill","given":"Alex"},{"family":"Chapman","given":"Joseph"},{"family":"Call","given":"Ian"},{"family":"Szabo","given":"Joseph"},{"family":"Corrigan","given":"Aodhan"},{"family":"Kamin","given":"Lars"},{"family":"Lütkenhaus","given":"Norbert"},{"family":"Gauthier","given":"Daniel J."},{"family":"Kwiat","given":"Paul G."}],"id":"Conrad2025","issued":{"date-parts":[[2025]]},"title":"Drone- and vehicle-based quantum key distribution","type":""}}],"isEdited":false,"manualOverride":{"citeprocText":"(Conrad et al. 2025)","isManuallyOverridden":false,"manualOverrideText":""},"mendeley":{"formattedCitation":"(Conrad et al. 2025)","plainTextFormattedCitation":"(Conrad et al. 2025)","previouslyFormattedCitation":"(Conrad et al. 2025)"},"properties":{"noteIndex":0},"schema":"https://github.com/citation-style-language/schema/raw/master/csl-citation.json"}</w:instrText>
       </w:r>
       <w:r>
         <w:fldChar w:fldCharType="separate"/>
@@ -18945,7 +19135,7 @@
         <w:fldChar w:fldCharType="begin"/>
       </w:r>
       <w:r>
-        <w:instrText xml:space="preserve">ADDIN CSL_CITATION {"citationID":"MENDELEY_CITATION_485","citationItems":[{"id":"ITEM-485","isTemporary":false,"itemData":{"DOI":"10.1109/IISWC53511.2021.00015","author":[{"family":"Ravi","given":"Gokul Subramanian"},{"family":"Smith","given":"Kaitlin N."},{"family":"Gokhale","given":"Pranav"},{"family":"Chong","given":"Frederic T."}],"container-title":"2021 IEEE international symposium on workload characterization (IISWC)","id":"Ravi2021","issued":{"date-parts":[[2021]]},"page":"39-50","publisher":"IEEE","title":"Quantum computing in the cloud: Analyzing job and machine characteristics","title-short":"Quantum computing in the cloud","type":"paper-conference"}}],"isEdited":false,"manualOverride":{"citeprocText":"(Ravi et al. 2021)","isManuallyOverridden":false,"manualOverrideText":""},"mendeley":{"formattedCitation":"(Ravi et al. 2021)","plainTextFormattedCitation":"(Ravi et al. 2021)","previouslyFormattedCitation":"(Ravi et al. 2021)"},"properties":{"noteIndex":0},"schema":"https://github.com/citation-style-language/schema/raw/master/csl-citation.json"}</w:instrText>
+        <w:instrText xml:space="preserve">ADDIN CSL_CITATION {"citationID":"MENDELEY_CITATION_499","citationItems":[{"id":"ITEM-499","isTemporary":false,"itemData":{"DOI":"10.1109/IISWC53511.2021.00015","author":[{"family":"Ravi","given":"Gokul Subramanian"},{"family":"Smith","given":"Kaitlin N."},{"family":"Gokhale","given":"Pranav"},{"family":"Chong","given":"Frederic T."}],"container-title":"2021 IEEE international symposium on workload characterization (IISWC)","id":"Ravi2021","issued":{"date-parts":[[2021]]},"page":"39-50","publisher":"IEEE","title":"Quantum computing in the cloud: Analyzing job and machine characteristics","title-short":"Quantum computing in the cloud","type":"paper-conference"}}],"isEdited":false,"manualOverride":{"citeprocText":"(Ravi et al. 2021)","isManuallyOverridden":false,"manualOverrideText":""},"mendeley":{"formattedCitation":"(Ravi et al. 2021)","plainTextFormattedCitation":"(Ravi et al. 2021)","previouslyFormattedCitation":"(Ravi et al. 2021)"},"properties":{"noteIndex":0},"schema":"https://github.com/citation-style-language/schema/raw/master/csl-citation.json"}</w:instrText>
       </w:r>
       <w:r>
         <w:fldChar w:fldCharType="separate"/>
@@ -18963,7 +19153,7 @@
         <w:fldChar w:fldCharType="begin"/>
       </w:r>
       <w:r>
-        <w:instrText xml:space="preserve">ADDIN CSL_CITATION {"citationID":"MENDELEY_CITATION_486","citationItems":[{"id":"ITEM-486","isTemporary":false,"itemData":{"DOI":"10.1088/1367-2630/18/2/023023","author":[{"family":"McClean","given":"Jarrod R."},{"family":"Romero","given":"Jonathan"},{"family":"Babbush","given":"Ryan"},{"family":"Aspuru-Guzik","given":"Alán"}],"container-title":"New Journal of Physics","id":"McClean2016","issue":"2","issued":{"date-parts":[[2016]]},"page":"023023","publisher":"IOP Publishing","title":"The theory of variational hybrid quantum-classical algorithms","type":"article-journal","volume":"18"}}],"isEdited":false,"manualOverride":{"citeprocText":"(McClean et al. 2016)","isManuallyOverridden":false,"manualOverrideText":""},"mendeley":{"formattedCitation":"(McClean et al. 2016)","plainTextFormattedCitation":"(McClean et al. 2016)","previouslyFormattedCitation":"(McClean et al. 2016)"},"properties":{"noteIndex":0},"schema":"https://github.com/citation-style-language/schema/raw/master/csl-citation.json"}</w:instrText>
+        <w:instrText xml:space="preserve">ADDIN CSL_CITATION {"citationID":"MENDELEY_CITATION_500","citationItems":[{"id":"ITEM-500","isTemporary":false,"itemData":{"DOI":"10.1088/1367-2630/18/2/023023","author":[{"family":"McClean","given":"Jarrod R."},{"family":"Romero","given":"Jonathan"},{"family":"Babbush","given":"Ryan"},{"family":"Aspuru-Guzik","given":"Alán"}],"container-title":"New Journal of Physics","id":"McClean2016","issue":"2","issued":{"date-parts":[[2016]]},"page":"023023","publisher":"IOP Publishing","title":"The theory of variational hybrid quantum-classical algorithms","type":"article-journal","volume":"18"}}],"isEdited":false,"manualOverride":{"citeprocText":"(McClean et al. 2016)","isManuallyOverridden":false,"manualOverrideText":""},"mendeley":{"formattedCitation":"(McClean et al. 2016)","plainTextFormattedCitation":"(McClean et al. 2016)","previouslyFormattedCitation":"(McClean et al. 2016)"},"properties":{"noteIndex":0},"schema":"https://github.com/citation-style-language/schema/raw/master/csl-citation.json"}</w:instrText>
       </w:r>
       <w:r>
         <w:fldChar w:fldCharType="separate"/>
@@ -18981,7 +19171,7 @@
         <w:fldChar w:fldCharType="begin"/>
       </w:r>
       <w:r>
-        <w:instrText xml:space="preserve">ADDIN CSL_CITATION {"citationID":"MENDELEY_CITATION_487","citationItems":[{"id":"ITEM-487","isTemporary":false,"itemData":{"DOI":"10.1007/s42484-024-00226-4","author":[{"family":"Sinha","given":"Akash"},{"family":"Macaluso","given":"Antonio"},{"family":"Klusch","given":"Matthias"}],"container-title":"Quantum Machine Intelligence","id":"Sinha2023","issued":{"date-parts":[[2025]]},"page":"19","publisher":"Springer","title":"Nav-Q: Quantum deep reinforcement learning for collision-free navigation of self-driving cars","title-short":"Nav-Q","type":"article-journal","volume":"7"}}],"isEdited":false,"manualOverride":{"citeprocText":"(Sinha, Macaluso, and Klusch 2025)","isManuallyOverridden":false,"manualOverrideText":""},"mendeley":{"formattedCitation":"(Sinha, Macaluso, and Klusch 2025)","plainTextFormattedCitation":"(Sinha, Macaluso, and Klusch 2025)","previouslyFormattedCitation":"(Sinha, Macaluso, and Klusch 2025)"},"properties":{"noteIndex":0},"schema":"https://github.com/citation-style-language/schema/raw/master/csl-citation.json"}</w:instrText>
+        <w:instrText xml:space="preserve">ADDIN CSL_CITATION {"citationID":"MENDELEY_CITATION_501","citationItems":[{"id":"ITEM-501","isTemporary":false,"itemData":{"DOI":"10.1007/s42484-024-00226-4","author":[{"family":"Sinha","given":"Akash"},{"family":"Macaluso","given":"Antonio"},{"family":"Klusch","given":"Matthias"}],"container-title":"Quantum Machine Intelligence","id":"Sinha2023","issued":{"date-parts":[[2025]]},"page":"19","publisher":"Springer","title":"Nav-Q: Quantum deep reinforcement learning for collision-free navigation of self-driving cars","title-short":"Nav-Q","type":"article-journal","volume":"7"}}],"isEdited":false,"manualOverride":{"citeprocText":"(Sinha, Macaluso, and Klusch 2025)","isManuallyOverridden":false,"manualOverrideText":""},"mendeley":{"formattedCitation":"(Sinha, Macaluso, and Klusch 2025)","plainTextFormattedCitation":"(Sinha, Macaluso, and Klusch 2025)","previouslyFormattedCitation":"(Sinha, Macaluso, and Klusch 2025)"},"properties":{"noteIndex":0},"schema":"https://github.com/citation-style-language/schema/raw/master/csl-citation.json"}</w:instrText>
       </w:r>
       <w:r>
         <w:fldChar w:fldCharType="separate"/>
@@ -18999,7 +19189,7 @@
         <w:fldChar w:fldCharType="begin"/>
       </w:r>
       <w:r>
-        <w:instrText xml:space="preserve">ADDIN CSL_CITATION {"citationID":"MENDELEY_CITATION_488","citationItems":[{"id":"ITEM-488","isTemporary":false,"itemData":{"DOI":"10.3389/fcomp.2019.00009","author":[{"family":"Ohzeki","given":"Masayuki"},{"family":"Miki","given":"Akira"},{"family":"Miyama","given":"Masamichi J."},{"family":"Terabe","given":"Masayoshi"}],"container-title":"Frontiers in Computer Science","id":"Ohzeki2019","issued":{"date-parts":[[2019]]},"page":"9","publisher":"Frontiers Media","title":"Control of automated guided vehicles without collision by quantum annealer and digital devices","type":"article-journal","volume":"1"}}],"isEdited":false,"manualOverride":{"citeprocText":"(Ohzeki et al. 2019)","isManuallyOverridden":false,"manualOverrideText":""},"mendeley":{"formattedCitation":"(Ohzeki et al. 2019)","plainTextFormattedCitation":"(Ohzeki et al. 2019)","previouslyFormattedCitation":"(Ohzeki et al. 2019)"},"properties":{"noteIndex":0},"schema":"https://github.com/citation-style-language/schema/raw/master/csl-citation.json"}</w:instrText>
+        <w:instrText xml:space="preserve">ADDIN CSL_CITATION {"citationID":"MENDELEY_CITATION_502","citationItems":[{"id":"ITEM-502","isTemporary":false,"itemData":{"DOI":"10.3389/fcomp.2019.00009","author":[{"family":"Ohzeki","given":"Masayuki"},{"family":"Miki","given":"Akira"},{"family":"Miyama","given":"Masamichi J."},{"family":"Terabe","given":"Masayoshi"}],"container-title":"Frontiers in Computer Science","id":"Ohzeki2019","issued":{"date-parts":[[2019]]},"page":"9","publisher":"Frontiers Media","title":"Control of automated guided vehicles without collision by quantum annealer and digital devices","type":"article-journal","volume":"1"}}],"isEdited":false,"manualOverride":{"citeprocText":"(Ohzeki et al. 2019)","isManuallyOverridden":false,"manualOverrideText":""},"mendeley":{"formattedCitation":"(Ohzeki et al. 2019)","plainTextFormattedCitation":"(Ohzeki et al. 2019)","previouslyFormattedCitation":"(Ohzeki et al. 2019)"},"properties":{"noteIndex":0},"schema":"https://github.com/citation-style-language/schema/raw/master/csl-citation.json"}</w:instrText>
       </w:r>
       <w:r>
         <w:fldChar w:fldCharType="separate"/>
@@ -19017,7 +19207,7 @@
         <w:fldChar w:fldCharType="begin"/>
       </w:r>
       <w:r>
-        <w:instrText xml:space="preserve">ADDIN CSL_CITATION {"citationID":"MENDELEY_CITATION_489","citationItems":[{"id":"ITEM-489","isTemporary":false,"itemData":{"DOI":"10.48550/arXiv.2504.08167","URL":"https://arxiv.org/abs/2504.08167","author":[{"family":"Muradoglu","given":"Murat"},{"family":"Johnsson","given":"Mattias T."},{"family":"Wilson","given":"Nathanial M."},{"family":"Cohen","given":"Yuval"},{"family":"Shin","given":"Dongki"},{"family":"Navickas","given":"Tomas"},{"family":"Pyragius","given":"Tadas"},{"family":"Thomas","given":"Divya"},{"family":"Thompson","given":"Daniel"},{"family":"Moore","given":"Steven I."},{"family":"Rahman","given":"Md Tanvir"},{"family":"Walker","given":"Adrian"},{"family":"Dutta","given":"Indranil"},{"family":"Bijjahalli","given":"Suraj"},{"family":"Berlocher","given":"Jacob"},{"family":"Hush","given":"Michael R."},{"family":"Anderson","given":"Russell P."},{"family":"Szigeti","given":"Stuart S."},{"family":"Biercuk","given":"Michael J."}],"id":"Muradoglu2025","issued":{"date-parts":[[2025]]},"title":"Quantum-assured magnetic navigation achieves positioning accuracy better than a strategic-grade INS in airborne and ground-based field trials","type":""}}],"isEdited":false,"manualOverride":{"citeprocText":"(Muradoglu et al. 2025)","isManuallyOverridden":false,"manualOverrideText":""},"mendeley":{"formattedCitation":"(Muradoglu et al. 2025)","plainTextFormattedCitation":"(Muradoglu et al. 2025)","previouslyFormattedCitation":"(Muradoglu et al. 2025)"},"properties":{"noteIndex":0},"schema":"https://github.com/citation-style-language/schema/raw/master/csl-citation.json"}</w:instrText>
+        <w:instrText xml:space="preserve">ADDIN CSL_CITATION {"citationID":"MENDELEY_CITATION_503","citationItems":[{"id":"ITEM-503","isTemporary":false,"itemData":{"DOI":"10.48550/arXiv.2504.08167","URL":"https://arxiv.org/abs/2504.08167","author":[{"family":"Muradoglu","given":"Murat"},{"family":"Johnsson","given":"Mattias T."},{"family":"Wilson","given":"Nathanial M."},{"family":"Cohen","given":"Yuval"},{"family":"Shin","given":"Dongki"},{"family":"Navickas","given":"Tomas"},{"family":"Pyragius","given":"Tadas"},{"family":"Thomas","given":"Divya"},{"family":"Thompson","given":"Daniel"},{"family":"Moore","given":"Steven I."},{"family":"Rahman","given":"Md Tanvir"},{"family":"Walker","given":"Adrian"},{"family":"Dutta","given":"Indranil"},{"family":"Bijjahalli","given":"Suraj"},{"family":"Berlocher","given":"Jacob"},{"family":"Hush","given":"Michael R."},{"family":"Anderson","given":"Russell P."},{"family":"Szigeti","given":"Stuart S."},{"family":"Biercuk","given":"Michael J."}],"id":"Muradoglu2025","issued":{"date-parts":[[2025]]},"title":"Quantum-assured magnetic navigation achieves positioning accuracy better than a strategic-grade INS in airborne and ground-based field trials","type":""}}],"isEdited":false,"manualOverride":{"citeprocText":"(Muradoglu et al. 2025)","isManuallyOverridden":false,"manualOverrideText":""},"mendeley":{"formattedCitation":"(Muradoglu et al. 2025)","plainTextFormattedCitation":"(Muradoglu et al. 2025)","previouslyFormattedCitation":"(Muradoglu et al. 2025)"},"properties":{"noteIndex":0},"schema":"https://github.com/citation-style-language/schema/raw/master/csl-citation.json"}</w:instrText>
       </w:r>
       <w:r>
         <w:fldChar w:fldCharType="separate"/>
@@ -19035,7 +19225,7 @@
         <w:fldChar w:fldCharType="begin"/>
       </w:r>
       <w:r>
-        <w:instrText xml:space="preserve">ADDIN CSL_CITATION {"citationID":"MENDELEY_CITATION_490","citationItems":[{"id":"ITEM-490","isTemporary":false,"itemData":{"DOI":"10.1103/PhysRevLett.127.100501","author":[{"family":"Córcoles","given":"Antonio D."},{"family":"Takita","given":"Maika"},{"family":"Inoue","given":"Ken"},{"family":"Lekuch","given":"Scott"},{"family":"Minev","given":"Zlatko K."},{"family":"Chow","given":"Jerry M."},{"family":"Gambetta","given":"Jay M."}],"container-title":"Physical Review Letters","id":"Corcoles2021","issue":"10","issued":{"date-parts":[[2021]]},"page":"100501","publisher":"American Physical Society","title":"Exploiting dynamic quantum circuits in a quantum algorithm with superconducting qubits","type":"article-journal","volume":"127"}}],"isEdited":false,"manualOverride":{"citeprocText":"(Córcoles et al. 2021)","isManuallyOverridden":false,"manualOverrideText":""},"mendeley":{"formattedCitation":"(Córcoles et al. 2021)","plainTextFormattedCitation":"(Córcoles et al. 2021)","previouslyFormattedCitation":"(Córcoles et al. 2021)"},"properties":{"noteIndex":0},"schema":"https://github.com/citation-style-language/schema/raw/master/csl-citation.json"}</w:instrText>
+        <w:instrText xml:space="preserve">ADDIN CSL_CITATION {"citationID":"MENDELEY_CITATION_504","citationItems":[{"id":"ITEM-504","isTemporary":false,"itemData":{"DOI":"10.1103/PhysRevLett.127.100501","author":[{"family":"Córcoles","given":"Antonio D."},{"family":"Takita","given":"Maika"},{"family":"Inoue","given":"Ken"},{"family":"Lekuch","given":"Scott"},{"family":"Minev","given":"Zlatko K."},{"family":"Chow","given":"Jerry M."},{"family":"Gambetta","given":"Jay M."}],"container-title":"Physical Review Letters","id":"Corcoles2021","issue":"10","issued":{"date-parts":[[2021]]},"page":"100501","publisher":"American Physical Society","title":"Exploiting dynamic quantum circuits in a quantum algorithm with superconducting qubits","type":"article-journal","volume":"127"}}],"isEdited":false,"manualOverride":{"citeprocText":"(Córcoles et al. 2021)","isManuallyOverridden":false,"manualOverrideText":""},"mendeley":{"formattedCitation":"(Córcoles et al. 2021)","plainTextFormattedCitation":"(Córcoles et al. 2021)","previouslyFormattedCitation":"(Córcoles et al. 2021)"},"properties":{"noteIndex":0},"schema":"https://github.com/citation-style-language/schema/raw/master/csl-citation.json"}</w:instrText>
       </w:r>
       <w:r>
         <w:fldChar w:fldCharType="separate"/>
@@ -19124,7 +19314,7 @@
         <w:fldChar w:fldCharType="begin"/>
       </w:r>
       <w:r>
-        <w:instrText xml:space="preserve">ADDIN CSL_CITATION {"citationID":"MENDELEY_CITATION_491","citationItems":[{"id":"ITEM-491","isTemporary":false,"itemData":{"DOI":"10.3389/fcomp.2019.00009","author":[{"family":"Ohzeki","given":"Masayuki"},{"family":"Miki","given":"Akira"},{"family":"Miyama","given":"Masamichi J."},{"family":"Terabe","given":"Masayoshi"}],"container-title":"Frontiers in Computer Science","id":"Ohzeki2019","issued":{"date-parts":[[2019]]},"page":"9","publisher":"Frontiers Media","title":"Control of automated guided vehicles without collision by quantum annealer and digital devices","type":"article-journal","volume":"1"},"suppress-author":false}],"isEdited":false,"manualOverride":{"citeprocText":"Ohzeki et al. (2019)","isManuallyOverridden":false,"manualOverrideText":""},"mendeley":{"formattedCitation":"Ohzeki et al. (2019)","plainTextFormattedCitation":"Ohzeki et al. (2019)","previouslyFormattedCitation":"Ohzeki et al. (2019)"},"properties":{"noteIndex":0},"schema":"https://github.com/citation-style-language/schema/raw/master/csl-citation.json"}</w:instrText>
+        <w:instrText xml:space="preserve">ADDIN CSL_CITATION {"citationID":"MENDELEY_CITATION_505","citationItems":[{"id":"ITEM-505","isTemporary":false,"itemData":{"DOI":"10.3389/fcomp.2019.00009","author":[{"family":"Ohzeki","given":"Masayuki"},{"family":"Miki","given":"Akira"},{"family":"Miyama","given":"Masamichi J."},{"family":"Terabe","given":"Masayoshi"}],"container-title":"Frontiers in Computer Science","id":"Ohzeki2019","issued":{"date-parts":[[2019]]},"page":"9","publisher":"Frontiers Media","title":"Control of automated guided vehicles without collision by quantum annealer and digital devices","type":"article-journal","volume":"1"},"suppress-author":false}],"isEdited":false,"manualOverride":{"citeprocText":"Ohzeki et al. (2019)","isManuallyOverridden":false,"manualOverrideText":""},"mendeley":{"formattedCitation":"Ohzeki et al. (2019)","plainTextFormattedCitation":"Ohzeki et al. (2019)","previouslyFormattedCitation":"Ohzeki et al. (2019)"},"properties":{"noteIndex":0},"schema":"https://github.com/citation-style-language/schema/raw/master/csl-citation.json"}</w:instrText>
       </w:r>
       <w:r>
         <w:fldChar w:fldCharType="separate"/>
@@ -19148,7 +19338,7 @@
         <w:fldChar w:fldCharType="begin"/>
       </w:r>
       <w:r>
-        <w:instrText xml:space="preserve">ADDIN CSL_CITATION {"citationID":"MENDELEY_CITATION_492","citationItems":[{"id":"ITEM-492","isTemporary":false,"itemData":{"DOI":"10.1109/IISWC53511.2021.00015","author":[{"family":"Ravi","given":"Gokul Subramanian"},{"family":"Smith","given":"Kaitlin N."},{"family":"Gokhale","given":"Pranav"},{"family":"Chong","given":"Frederic T."}],"container-title":"2021 IEEE international symposium on workload characterization (IISWC)","id":"Ravi2021","issued":{"date-parts":[[2021]]},"page":"39-50","publisher":"IEEE","title":"Quantum computing in the cloud: Analyzing job and machine characteristics","title-short":"Quantum computing in the cloud","type":"paper-conference"},"suppress-author":false}],"isEdited":false,"manualOverride":{"citeprocText":"Ravi et al. (2021)","isManuallyOverridden":false,"manualOverrideText":""},"mendeley":{"formattedCitation":"Ravi et al. (2021)","plainTextFormattedCitation":"Ravi et al. (2021)","previouslyFormattedCitation":"Ravi et al. (2021)"},"properties":{"noteIndex":0},"schema":"https://github.com/citation-style-language/schema/raw/master/csl-citation.json"}</w:instrText>
+        <w:instrText xml:space="preserve">ADDIN CSL_CITATION {"citationID":"MENDELEY_CITATION_506","citationItems":[{"id":"ITEM-506","isTemporary":false,"itemData":{"DOI":"10.1109/IISWC53511.2021.00015","author":[{"family":"Ravi","given":"Gokul Subramanian"},{"family":"Smith","given":"Kaitlin N."},{"family":"Gokhale","given":"Pranav"},{"family":"Chong","given":"Frederic T."}],"container-title":"2021 IEEE international symposium on workload characterization (IISWC)","id":"Ravi2021","issued":{"date-parts":[[2021]]},"page":"39-50","publisher":"IEEE","title":"Quantum computing in the cloud: Analyzing job and machine characteristics","title-short":"Quantum computing in the cloud","type":"paper-conference"},"suppress-author":false}],"isEdited":false,"manualOverride":{"citeprocText":"Ravi et al. (2021)","isManuallyOverridden":false,"manualOverrideText":""},"mendeley":{"formattedCitation":"Ravi et al. (2021)","plainTextFormattedCitation":"Ravi et al. (2021)","previouslyFormattedCitation":"Ravi et al. (2021)"},"properties":{"noteIndex":0},"schema":"https://github.com/citation-style-language/schema/raw/master/csl-citation.json"}</w:instrText>
       </w:r>
       <w:r>
         <w:fldChar w:fldCharType="separate"/>
@@ -19193,7 +19383,7 @@
         <w:fldChar w:fldCharType="begin"/>
       </w:r>
       <w:r>
-        <w:instrText xml:space="preserve">ADDIN CSL_CITATION {"citationID":"MENDELEY_CITATION_493","citationItems":[{"id":"ITEM-493","isTemporary":false,"itemData":{"DOI":"10.1038/s41598-019-43176-9","author":[{"family":"Guerreschi","given":"Gian Giacomo"},{"family":"Matsuura","given":"Anne Y."}],"container-title":"Scientific Reports","id":"Guerreschi2019","issued":{"date-parts":[[2019]]},"page":"6903","publisher":"Nature Publishing Group","title":"QAOA for Max-Cut requires hundreds of qubits for quantum speed-up","type":"article-journal","volume":"9"}}],"isEdited":false,"manualOverride":{"citeprocText":"(Guerreschi and Matsuura 2019)","isManuallyOverridden":false,"manualOverrideText":""},"mendeley":{"formattedCitation":"(Guerreschi and Matsuura 2019)","plainTextFormattedCitation":"(Guerreschi and Matsuura 2019)","previouslyFormattedCitation":"(Guerreschi and Matsuura 2019)"},"properties":{"noteIndex":0},"schema":"https://github.com/citation-style-language/schema/raw/master/csl-citation.json"}</w:instrText>
+        <w:instrText xml:space="preserve">ADDIN CSL_CITATION {"citationID":"MENDELEY_CITATION_507","citationItems":[{"id":"ITEM-507","isTemporary":false,"itemData":{"DOI":"10.1038/s41598-019-43176-9","author":[{"family":"Guerreschi","given":"Gian Giacomo"},{"family":"Matsuura","given":"Anne Y."}],"container-title":"Scientific Reports","id":"Guerreschi2019","issued":{"date-parts":[[2019]]},"page":"6903","publisher":"Nature Publishing Group","title":"QAOA for Max-Cut requires hundreds of qubits for quantum speed-up","type":"article-journal","volume":"9"}}],"isEdited":false,"manualOverride":{"citeprocText":"(Guerreschi and Matsuura 2019)","isManuallyOverridden":false,"manualOverrideText":""},"mendeley":{"formattedCitation":"(Guerreschi and Matsuura 2019)","plainTextFormattedCitation":"(Guerreschi and Matsuura 2019)","previouslyFormattedCitation":"(Guerreschi and Matsuura 2019)"},"properties":{"noteIndex":0},"schema":"https://github.com/citation-style-language/schema/raw/master/csl-citation.json"}</w:instrText>
       </w:r>
       <w:r>
         <w:fldChar w:fldCharType="separate"/>
@@ -19211,7 +19401,7 @@
         <w:fldChar w:fldCharType="begin"/>
       </w:r>
       <w:r>
-        <w:instrText xml:space="preserve">ADDIN CSL_CITATION {"citationID":"MENDELEY_CITATION_495","citationItems":[{"id":"ITEM-494","isTemporary":false,"itemData":{"DOI":"10.1038/s41467-018-07090-4","author":[{"family":"McClean","given":"Jarrod R."},{"family":"Boixo","given":"Sergio"},{"family":"Smelyanskiy","given":"Vadim N."},{"family":"Babbush","given":"Ryan"},{"family":"Neven","given":"Hartmut"}],"container-title":"Nature Communications","id":"McClean2018","issue":"1","issued":{"date-parts":[[2018]]},"page":"4812","publisher":"Nature Publishing Group","title":"Barren plateaus in quantum neural network training landscapes","type":"article-journal","volume":"9"}},{"id":"ITEM-495","isTemporary":false,"itemData":{"DOI":"10.1038/s42254-025-00813-9","author":[{"family":"Larocca","given":"Martı́n"},{"family":"Thanasilp","given":"Supanut"},{"family":"Wang","given":"Samson"},{"family":"Sharma","given":"Kunal"},{"family":"Biamonte","given":"Jacob"},{"family":"Coles","given":"Patrick J."},{"family":"Cincio","given":"Lukasz"},{"family":"McClean","given":"Jarrod R."},{"family":"Holmes","given":"Zoë"},{"family":"Cerezo","given":"M."}],"container-title":"Nature Reviews Physics","id":"Larocca2025","issue":"4","issued":{"date-parts":[[2025]]},"page":"174-189","publisher":"Nature Publishing Group","title":"Barren plateaus in variational quantum computing","type":"article-journal","volume":"7"}}],"isEdited":false,"manualOverride":{"citeprocText":"(McClean et al. 2018; Larocca et al. 2025)","isManuallyOverridden":false,"manualOverrideText":""},"mendeley":{"formattedCitation":"(McClean et al. 2018; Larocca et al. 2025)","plainTextFormattedCitation":"(McClean et al. 2018; Larocca et al. 2025)","previouslyFormattedCitation":"(McClean et al. 2018; Larocca et al. 2025)"},"properties":{"noteIndex":0},"schema":"https://github.com/citation-style-language/schema/raw/master/csl-citation.json"}</w:instrText>
+        <w:instrText xml:space="preserve">ADDIN CSL_CITATION {"citationID":"MENDELEY_CITATION_509","citationItems":[{"id":"ITEM-508","isTemporary":false,"itemData":{"DOI":"10.1038/s41467-018-07090-4","author":[{"family":"McClean","given":"Jarrod R."},{"family":"Boixo","given":"Sergio"},{"family":"Smelyanskiy","given":"Vadim N."},{"family":"Babbush","given":"Ryan"},{"family":"Neven","given":"Hartmut"}],"container-title":"Nature Communications","id":"McClean2018","issue":"1","issued":{"date-parts":[[2018]]},"page":"4812","publisher":"Nature Publishing Group","title":"Barren plateaus in quantum neural network training landscapes","type":"article-journal","volume":"9"}},{"id":"ITEM-509","isTemporary":false,"itemData":{"DOI":"10.1038/s42254-025-00813-9","author":[{"family":"Larocca","given":"Martı́n"},{"family":"Thanasilp","given":"Supanut"},{"family":"Wang","given":"Samson"},{"family":"Sharma","given":"Kunal"},{"family":"Biamonte","given":"Jacob"},{"family":"Coles","given":"Patrick J."},{"family":"Cincio","given":"Lukasz"},{"family":"McClean","given":"Jarrod R."},{"family":"Holmes","given":"Zoë"},{"family":"Cerezo","given":"M."}],"container-title":"Nature Reviews Physics","id":"Larocca2025","issue":"4","issued":{"date-parts":[[2025]]},"page":"174-189","publisher":"Nature Publishing Group","title":"Barren plateaus in variational quantum computing","type":"article-journal","volume":"7"}}],"isEdited":false,"manualOverride":{"citeprocText":"(McClean et al. 2018; Larocca et al. 2025)","isManuallyOverridden":false,"manualOverrideText":""},"mendeley":{"formattedCitation":"(McClean et al. 2018; Larocca et al. 2025)","plainTextFormattedCitation":"(McClean et al. 2018; Larocca et al. 2025)","previouslyFormattedCitation":"(McClean et al. 2018; Larocca et al. 2025)"},"properties":{"noteIndex":0},"schema":"https://github.com/citation-style-language/schema/raw/master/csl-citation.json"}</w:instrText>
       </w:r>
       <w:r>
         <w:fldChar w:fldCharType="separate"/>
@@ -19229,7 +19419,7 @@
         <w:fldChar w:fldCharType="begin"/>
       </w:r>
       <w:r>
-        <w:instrText xml:space="preserve">ADDIN CSL_CITATION {"citationID":"MENDELEY_CITATION_496","citationItems":[{"id":"ITEM-496","isTemporary":false,"itemData":{"DOI":"10.1088/2632-2153/ac4559","author":[{"family":"Chen","given":"Samuel Yen-Chi"},{"family":"Huang","given":"Chih-Min"},{"family":"Hsing","given":"Chia-Wei"},{"family":"Goan","given":"Hsi-Sheng"},{"family":"Kao","given":"Ying-Jer"}],"container-title":"Machine Learning: Science and Technology","id":"Chen2022","issue":"1","issued":{"date-parts":[[2022]]},"page":"015025","publisher":"IOP Publishing","title":"Variational quantum reinforcement learning via evolutionary optimization","type":"article-journal","volume":"3"}}],"isEdited":false,"manualOverride":{"citeprocText":"(Chen et al. 2022)","isManuallyOverridden":false,"manualOverrideText":""},"mendeley":{"formattedCitation":"(Chen et al. 2022)","plainTextFormattedCitation":"(Chen et al. 2022)","previouslyFormattedCitation":"(Chen et al. 2022)"},"properties":{"noteIndex":0},"schema":"https://github.com/citation-style-language/schema/raw/master/csl-citation.json"}</w:instrText>
+        <w:instrText xml:space="preserve">ADDIN CSL_CITATION {"citationID":"MENDELEY_CITATION_510","citationItems":[{"id":"ITEM-510","isTemporary":false,"itemData":{"DOI":"10.1088/2632-2153/ac4559","author":[{"family":"Chen","given":"Samuel Yen-Chi"},{"family":"Huang","given":"Chih-Min"},{"family":"Hsing","given":"Chia-Wei"},{"family":"Goan","given":"Hsi-Sheng"},{"family":"Kao","given":"Ying-Jer"}],"container-title":"Machine Learning: Science and Technology","id":"Chen2022","issue":"1","issued":{"date-parts":[[2022]]},"page":"015025","publisher":"IOP Publishing","title":"Variational quantum reinforcement learning via evolutionary optimization","type":"article-journal","volume":"3"}}],"isEdited":false,"manualOverride":{"citeprocText":"(Chen et al. 2022)","isManuallyOverridden":false,"manualOverrideText":""},"mendeley":{"formattedCitation":"(Chen et al. 2022)","plainTextFormattedCitation":"(Chen et al. 2022)","previouslyFormattedCitation":"(Chen et al. 2022)"},"properties":{"noteIndex":0},"schema":"https://github.com/citation-style-language/schema/raw/master/csl-citation.json"}</w:instrText>
       </w:r>
       <w:r>
         <w:fldChar w:fldCharType="separate"/>
@@ -19247,7 +19437,7 @@
         <w:fldChar w:fldCharType="begin"/>
       </w:r>
       <w:r>
-        <w:instrText xml:space="preserve">ADDIN CSL_CITATION {"citationID":"MENDELEY_CITATION_498","citationItems":[{"id":"ITEM-497","isTemporary":false,"itemData":{"DOI":"10.3390/math10142475","author":[{"family":"Chella","given":"Antonio"},{"family":"Gaglio","given":"Salvatore"},{"family":"Pilato","given":"Giovanni"},{"family":"Vella","given":"Filippo"},{"family":"Zammuto","given":"Salvatore"}],"container-title":"Mathematics","id":"Chella2022","issue":"14","issued":{"date-parts":[[2022]]},"page":"2475","publisher":"MDPI","title":"A quantum planner for robot motion","type":"article-journal","volume":"10"}},{"id":"ITEM-498","isTemporary":false,"itemData":{"DOI":"10.1016/j.robot.2025.105026","author":[{"family":"Antero","given":"Unai"},{"family":"Sierra","given":"Basilio"},{"family":"Oñativia","given":"Jon"},{"family":"Ruiz","given":"Alejandra"},{"family":"Osaba","given":"Eneko"}],"container-title":"Robotics and Autonomous Systems","id":"Antero2025","issued":{"date-parts":[[2025]]},"page":"105026","publisher":"Elsevier","title":"Robot localization aided by quantum algorithms","type":"article-journal","volume":"192"}}],"isEdited":false,"manualOverride":{"citeprocText":"(Chella et al. 2022; Antero et al. 2025)","isManuallyOverridden":false,"manualOverrideText":""},"mendeley":{"formattedCitation":"(Chella et al. 2022; Antero et al. 2025)","plainTextFormattedCitation":"(Chella et al. 2022; Antero et al. 2025)","previouslyFormattedCitation":"(Chella et al. 2022; Antero et al. 2025)"},"properties":{"noteIndex":0},"schema":"https://github.com/citation-style-language/schema/raw/master/csl-citation.json"}</w:instrText>
+        <w:instrText xml:space="preserve">ADDIN CSL_CITATION {"citationID":"MENDELEY_CITATION_512","citationItems":[{"id":"ITEM-511","isTemporary":false,"itemData":{"DOI":"10.3390/math10142475","author":[{"family":"Chella","given":"Antonio"},{"family":"Gaglio","given":"Salvatore"},{"family":"Pilato","given":"Giovanni"},{"family":"Vella","given":"Filippo"},{"family":"Zammuto","given":"Salvatore"}],"container-title":"Mathematics","id":"Chella2022","issue":"14","issued":{"date-parts":[[2022]]},"page":"2475","publisher":"MDPI","title":"A quantum planner for robot motion","type":"article-journal","volume":"10"}},{"id":"ITEM-512","isTemporary":false,"itemData":{"DOI":"10.1016/j.robot.2025.105026","author":[{"family":"Antero","given":"Unai"},{"family":"Sierra","given":"Basilio"},{"family":"Oñativia","given":"Jon"},{"family":"Ruiz","given":"Alejandra"},{"family":"Osaba","given":"Eneko"}],"container-title":"Robotics and Autonomous Systems","id":"Antero2025","issued":{"date-parts":[[2025]]},"page":"105026","publisher":"Elsevier","title":"Robot localization aided by quantum algorithms","type":"article-journal","volume":"192"}}],"isEdited":false,"manualOverride":{"citeprocText":"(Chella et al. 2022; Antero et al. 2025)","isManuallyOverridden":false,"manualOverrideText":""},"mendeley":{"formattedCitation":"(Chella et al. 2022; Antero et al. 2025)","plainTextFormattedCitation":"(Chella et al. 2022; Antero et al. 2025)","previouslyFormattedCitation":"(Chella et al. 2022; Antero et al. 2025)"},"properties":{"noteIndex":0},"schema":"https://github.com/citation-style-language/schema/raw/master/csl-citation.json"}</w:instrText>
       </w:r>
       <w:r>
         <w:fldChar w:fldCharType="separate"/>
@@ -19265,7 +19455,7 @@
         <w:fldChar w:fldCharType="begin"/>
       </w:r>
       <w:r>
-        <w:instrText xml:space="preserve">ADDIN CSL_CITATION {"citationID":"MENDELEY_CITATION_499","citationItems":[{"id":"ITEM-499","isTemporary":false,"itemData":{"DOI":"10.22331/q-2018-08-06-79","author":[{"family":"Preskill","given":"John"}],"container-title":"Quantum","id":"Preskill2018","issued":{"date-parts":[[2018]]},"page":"79","publisher":"Verein zur Förderung des Open Access Publizierens in den Quantenwissenschaften","title":"Quantum computing in the NISQ era and beyond","type":"article-journal","volume":"2"}}],"isEdited":false,"manualOverride":{"citeprocText":"(Preskill 2018)","isManuallyOverridden":false,"manualOverrideText":""},"mendeley":{"formattedCitation":"(Preskill 2018)","plainTextFormattedCitation":"(Preskill 2018)","previouslyFormattedCitation":"(Preskill 2018)"},"properties":{"noteIndex":0},"schema":"https://github.com/citation-style-language/schema/raw/master/csl-citation.json"}</w:instrText>
+        <w:instrText xml:space="preserve">ADDIN CSL_CITATION {"citationID":"MENDELEY_CITATION_513","citationItems":[{"id":"ITEM-513","isTemporary":false,"itemData":{"DOI":"10.22331/q-2018-08-06-79","author":[{"family":"Preskill","given":"John"}],"container-title":"Quantum","id":"Preskill2018","issued":{"date-parts":[[2018]]},"page":"79","publisher":"Verein zur Förderung des Open Access Publizierens in den Quantenwissenschaften","title":"Quantum computing in the NISQ era and beyond","type":"article-journal","volume":"2"}}],"isEdited":false,"manualOverride":{"citeprocText":"(Preskill 2018)","isManuallyOverridden":false,"manualOverrideText":""},"mendeley":{"formattedCitation":"(Preskill 2018)","plainTextFormattedCitation":"(Preskill 2018)","previouslyFormattedCitation":"(Preskill 2018)"},"properties":{"noteIndex":0},"schema":"https://github.com/citation-style-language/schema/raw/master/csl-citation.json"}</w:instrText>
       </w:r>
       <w:r>
         <w:fldChar w:fldCharType="separate"/>
@@ -19283,7 +19473,7 @@
         <w:fldChar w:fldCharType="begin"/>
       </w:r>
       <w:r>
-        <w:instrText xml:space="preserve">ADDIN CSL_CITATION {"citationID":"MENDELEY_CITATION_500","citationItems":[{"id":"ITEM-500","isTemporary":false,"itemData":{"DOI":"10.1103/RevModPhys.95.045005","author":[{"family":"Cai","given":"Zhenyu"},{"family":"Babbush","given":"Ryan"},{"family":"Benjamin","given":"Simon C."},{"family":"Endo","given":"Suguru"},{"family":"Huggins","given":"William J."},{"family":"Li","given":"Ying"},{"family":"McClean","given":"Jarrod R."},{"family":"O’Brien","given":"Thomas E."}],"container-title":"Reviews of Modern Physics","id":"Cai2023","issue":"4","issued":{"date-parts":[[2023]]},"page":"045005","publisher":"American Physical Society","title":"Quantum error mitigation","type":"article-journal","volume":"95"}}],"isEdited":false,"manualOverride":{"citeprocText":"(Cai et al. 2023)","isManuallyOverridden":false,"manualOverrideText":""},"mendeley":{"formattedCitation":"(Cai et al. 2023)","plainTextFormattedCitation":"(Cai et al. 2023)","previouslyFormattedCitation":"(Cai et al. 2023)"},"properties":{"noteIndex":0},"schema":"https://github.com/citation-style-language/schema/raw/master/csl-citation.json"}</w:instrText>
+        <w:instrText xml:space="preserve">ADDIN CSL_CITATION {"citationID":"MENDELEY_CITATION_514","citationItems":[{"id":"ITEM-514","isTemporary":false,"itemData":{"DOI":"10.1103/RevModPhys.95.045005","author":[{"family":"Cai","given":"Zhenyu"},{"family":"Babbush","given":"Ryan"},{"family":"Benjamin","given":"Simon C."},{"family":"Endo","given":"Suguru"},{"family":"Huggins","given":"William J."},{"family":"Li","given":"Ying"},{"family":"McClean","given":"Jarrod R."},{"family":"O’Brien","given":"Thomas E."}],"container-title":"Reviews of Modern Physics","id":"Cai2023","issue":"4","issued":{"date-parts":[[2023]]},"page":"045005","publisher":"American Physical Society","title":"Quantum error mitigation","type":"article-journal","volume":"95"}}],"isEdited":false,"manualOverride":{"citeprocText":"(Cai et al. 2023)","isManuallyOverridden":false,"manualOverrideText":""},"mendeley":{"formattedCitation":"(Cai et al. 2023)","plainTextFormattedCitation":"(Cai et al. 2023)","previouslyFormattedCitation":"(Cai et al. 2023)"},"properties":{"noteIndex":0},"schema":"https://github.com/citation-style-language/schema/raw/master/csl-citation.json"}</w:instrText>
       </w:r>
       <w:r>
         <w:fldChar w:fldCharType="separate"/>
@@ -19301,7 +19491,7 @@
         <w:fldChar w:fldCharType="begin"/>
       </w:r>
       <w:r>
-        <w:instrText xml:space="preserve">ADDIN CSL_CITATION {"citationID":"MENDELEY_CITATION_501","citationItems":[{"id":"ITEM-501","isTemporary":false,"itemData":{"DOI":"10.1103/PhysRevA.86.032324","author":[{"family":"Fowler","given":"Austin G."},{"family":"Mariantoni","given":"Matteo"},{"family":"Martinis","given":"John M."},{"family":"Cleland","given":"Andrew N."}],"container-title":"Physical Review A","id":"Fowler2012","issue":"3","issued":{"date-parts":[[2012]]},"page":"032324","publisher":"American Physical Society","title":"Surface codes: Towards practical large-scale quantum computation","title-short":"Surface codes","type":"article-journal","volume":"86"}}],"isEdited":false,"manualOverride":{"citeprocText":"(Fowler et al. 2012)","isManuallyOverridden":false,"manualOverrideText":""},"mendeley":{"formattedCitation":"(Fowler et al. 2012)","plainTextFormattedCitation":"(Fowler et al. 2012)","previouslyFormattedCitation":"(Fowler et al. 2012)"},"properties":{"noteIndex":0},"schema":"https://github.com/citation-style-language/schema/raw/master/csl-citation.json"}</w:instrText>
+        <w:instrText xml:space="preserve">ADDIN CSL_CITATION {"citationID":"MENDELEY_CITATION_515","citationItems":[{"id":"ITEM-515","isTemporary":false,"itemData":{"DOI":"10.1103/PhysRevA.86.032324","author":[{"family":"Fowler","given":"Austin G."},{"family":"Mariantoni","given":"Matteo"},{"family":"Martinis","given":"John M."},{"family":"Cleland","given":"Andrew N."}],"container-title":"Physical Review A","id":"Fowler2012","issue":"3","issued":{"date-parts":[[2012]]},"page":"032324","publisher":"American Physical Society","title":"Surface codes: Towards practical large-scale quantum computation","title-short":"Surface codes","type":"article-journal","volume":"86"}}],"isEdited":false,"manualOverride":{"citeprocText":"(Fowler et al. 2012)","isManuallyOverridden":false,"manualOverrideText":""},"mendeley":{"formattedCitation":"(Fowler et al. 2012)","plainTextFormattedCitation":"(Fowler et al. 2012)","previouslyFormattedCitation":"(Fowler et al. 2012)"},"properties":{"noteIndex":0},"schema":"https://github.com/citation-style-language/schema/raw/master/csl-citation.json"}</w:instrText>
       </w:r>
       <w:r>
         <w:fldChar w:fldCharType="separate"/>
@@ -19319,7 +19509,7 @@
         <w:fldChar w:fldCharType="begin"/>
       </w:r>
       <w:r>
-        <w:instrText xml:space="preserve">ADDIN CSL_CITATION {"citationID":"MENDELEY_CITATION_502","citationItems":[{"id":"ITEM-502","isTemporary":false,"itemData":{"DOI":"10.1146/annurev-conmatphys-031119-050605","author":[{"family":"Kjaergaard","given":"Morten"},{"family":"Schwartz","given":"Mollie E."},{"family":"Braumüller","given":"Jochen"},{"family":"Krantz","given":"Philip"},{"family":"Wang","given":"Joel I.-J."},{"family":"Gustavsson","given":"Simon"},{"family":"Oliver","given":"William D."}],"container-title":"Annual Review of Condensed Matter Physics","id":"Kjaergaard2020","issued":{"date-parts":[[2020]]},"page":"369-395","publisher":"Annual Reviews","title":"Superconducting qubits: Current state of play","title-short":"Superconducting qubits","type":"article-journal","volume":"11"}}],"isEdited":false,"manualOverride":{"citeprocText":"(Kjaergaard et al. 2020)","isManuallyOverridden":false,"manualOverrideText":""},"mendeley":{"formattedCitation":"(Kjaergaard et al. 2020)","plainTextFormattedCitation":"(Kjaergaard et al. 2020)","previouslyFormattedCitation":"(Kjaergaard et al. 2020)"},"properties":{"noteIndex":0},"schema":"https://github.com/citation-style-language/schema/raw/master/csl-citation.json"}</w:instrText>
+        <w:instrText xml:space="preserve">ADDIN CSL_CITATION {"citationID":"MENDELEY_CITATION_516","citationItems":[{"id":"ITEM-516","isTemporary":false,"itemData":{"DOI":"10.1146/annurev-conmatphys-031119-050605","author":[{"family":"Kjaergaard","given":"Morten"},{"family":"Schwartz","given":"Mollie E."},{"family":"Braumüller","given":"Jochen"},{"family":"Krantz","given":"Philip"},{"family":"Wang","given":"Joel I.-J."},{"family":"Gustavsson","given":"Simon"},{"family":"Oliver","given":"William D."}],"container-title":"Annual Review of Condensed Matter Physics","id":"Kjaergaard2020","issued":{"date-parts":[[2020]]},"page":"369-395","publisher":"Annual Reviews","title":"Superconducting qubits: Current state of play","title-short":"Superconducting qubits","type":"article-journal","volume":"11"}}],"isEdited":false,"manualOverride":{"citeprocText":"(Kjaergaard et al. 2020)","isManuallyOverridden":false,"manualOverrideText":""},"mendeley":{"formattedCitation":"(Kjaergaard et al. 2020)","plainTextFormattedCitation":"(Kjaergaard et al. 2020)","previouslyFormattedCitation":"(Kjaergaard et al. 2020)"},"properties":{"noteIndex":0},"schema":"https://github.com/citation-style-language/schema/raw/master/csl-citation.json"}</w:instrText>
       </w:r>
       <w:r>
         <w:fldChar w:fldCharType="separate"/>
@@ -19337,7 +19527,7 @@
         <w:fldChar w:fldCharType="begin"/>
       </w:r>
       <w:r>
-        <w:instrText xml:space="preserve">ADDIN CSL_CITATION {"citationID":"MENDELEY_CITATION_504","citationItems":[{"id":"ITEM-503","isTemporary":false,"itemData":{"DOI":"10.1038/s42254-019-0117-4","author":[{"family":"Bongs","given":"Kai"},{"family":"Holynski","given":"Michael"},{"family":"Vovrosh","given":"Jamie"},{"family":"Bouyer","given":"Philippe"},{"family":"Condon","given":"Gabriel"},{"family":"Rasel","given":"Ernst"},{"family":"Schubert","given":"Christian"},{"family":"Schleich","given":"Wolfgang P."},{"family":"Roura","given":"Albert"}],"container-title":"Nature Reviews Physics","id":"Bongs2019","issue":"12","issued":{"date-parts":[[2019]]},"page":"731-739","publisher":"Nature Publishing Group","title":"Taking atom interferometric quantum sensors from the laboratory to real-world applications","type":"article-journal","volume":"1"}},{"id":"ITEM-504","isTemporary":false,"itemData":{"DOI":"10.48550/arXiv.2103.09378","URL":"https://arxiv.org/abs/2103.09378","author":[{"family":"Wang","given":"Xuezhi"},{"family":"Kealy","given":"Allison"},{"family":"Gilliam","given":"Christopher"},{"family":"Haine","given":"Simon"},{"family":"Close","given":"John"},{"family":"Moran","given":"Bill"},{"family":"Talbot","given":"Kyle"},{"family":"Williams","given":"Simon"},{"family":"Hardman","given":"Kyle"},{"family":"Freier","given":"Chris"},{"family":"Wigley","given":"Paul"},{"family":"White","given":"Angela"},{"family":"Szigeti","given":"Stuart"},{"family":"Legge","given":"Sam"}],"id":"Wang2021","issued":{"date-parts":[[2021]]},"title":"Enhancing inertial navigation performance via fusion of classical and quantum accelerometers","type":""}}],"isEdited":false,"manualOverride":{"citeprocText":"(Bongs et al. 2019; Xuezhi Wang et al. 2021)","isManuallyOverridden":false,"manualOverrideText":""},"mendeley":{"formattedCitation":"(Bongs et al. 2019; Xuezhi Wang et al. 2021)","plainTextFormattedCitation":"(Bongs et al. 2019; Xuezhi Wang et al. 2021)","previouslyFormattedCitation":"(Bongs et al. 2019; Xuezhi Wang et al. 2021)"},"properties":{"noteIndex":0},"schema":"https://github.com/citation-style-language/schema/raw/master/csl-citation.json"}</w:instrText>
+        <w:instrText xml:space="preserve">ADDIN CSL_CITATION {"citationID":"MENDELEY_CITATION_518","citationItems":[{"id":"ITEM-517","isTemporary":false,"itemData":{"DOI":"10.1038/s42254-019-0117-4","author":[{"family":"Bongs","given":"Kai"},{"family":"Holynski","given":"Michael"},{"family":"Vovrosh","given":"Jamie"},{"family":"Bouyer","given":"Philippe"},{"family":"Condon","given":"Gabriel"},{"family":"Rasel","given":"Ernst"},{"family":"Schubert","given":"Christian"},{"family":"Schleich","given":"Wolfgang P."},{"family":"Roura","given":"Albert"}],"container-title":"Nature Reviews Physics","id":"Bongs2019","issue":"12","issued":{"date-parts":[[2019]]},"page":"731-739","publisher":"Nature Publishing Group","title":"Taking atom interferometric quantum sensors from the laboratory to real-world applications","type":"article-journal","volume":"1"}},{"id":"ITEM-518","isTemporary":false,"itemData":{"DOI":"10.48550/arXiv.2103.09378","URL":"https://arxiv.org/abs/2103.09378","author":[{"family":"Wang","given":"Xuezhi"},{"family":"Kealy","given":"Allison"},{"family":"Gilliam","given":"Christopher"},{"family":"Haine","given":"Simon"},{"family":"Close","given":"John"},{"family":"Moran","given":"Bill"},{"family":"Talbot","given":"Kyle"},{"family":"Williams","given":"Simon"},{"family":"Hardman","given":"Kyle"},{"family":"Freier","given":"Chris"},{"family":"Wigley","given":"Paul"},{"family":"White","given":"Angela"},{"family":"Szigeti","given":"Stuart"},{"family":"Legge","given":"Sam"}],"id":"Wang2021","issued":{"date-parts":[[2021]]},"title":"Enhancing inertial navigation performance via fusion of classical and quantum accelerometers","type":""}}],"isEdited":false,"manualOverride":{"citeprocText":"(Bongs et al. 2019; Xuezhi Wang et al. 2021)","isManuallyOverridden":false,"manualOverrideText":""},"mendeley":{"formattedCitation":"(Bongs et al. 2019; Xuezhi Wang et al. 2021)","plainTextFormattedCitation":"(Bongs et al. 2019; Xuezhi Wang et al. 2021)","previouslyFormattedCitation":"(Bongs et al. 2019; Xuezhi Wang et al. 2021)"},"properties":{"noteIndex":0},"schema":"https://github.com/citation-style-language/schema/raw/master/csl-citation.json"}</w:instrText>
       </w:r>
       <w:r>
         <w:fldChar w:fldCharType="separate"/>
@@ -19474,7 +19664,7 @@
         <w:fldChar w:fldCharType="begin"/>
       </w:r>
       <w:r>
-        <w:instrText xml:space="preserve">ADDIN CSL_CITATION {"citationID":"MENDELEY_CITATION_506","citationItems":[{"id":"ITEM-505","isTemporary":false,"itemData":{"DOI":"10.1038/s41598-023-45668-1","author":[{"family":"Leib","given":"Dominik"},{"family":"Seidel","given":"Tobias"},{"family":"Jäger","given":"Sven"},{"family":"Heese","given":"Raoul"},{"family":"Jones","given":"Caitlin Isobel"},{"family":"Awasthi","given":"Abhishek"},{"family":"Niederle","given":"Astrid"},{"family":"Bortz","given":"Michael"}],"container-title":"Scientific Reports","id":"Leib2023","issued":{"date-parts":[[2023]]},"publisher":"Nature Publishing Group","title":"An optimization case study for solving a transport robot scheduling problem on quantum-hybrid and quantum-inspired hardware","type":"article-journal","volume":"13"}},{"id":"ITEM-506","isTemporary":false,"itemData":{"DOI":"10.1038/s41598-025-28481-w","author":[{"family":"Quang","given":"Thinh Nguyen"},{"family":"Matsuyama","given":"Kosuke"},{"family":"Shimizu","given":"Keisuke"},{"family":"Sugano","given":"Hiroki"},{"family":"Kurimoto","given":"Eiji"},{"family":"Miki","given":"Masahiro"},{"family":"Suzuki","given":"Jumpei"},{"family":"Chen","given":"Ziyi"},{"family":"Waidyasooriya","given":"Hasitha Muthumala"},{"family":"Hariyama","given":"Masanori"},{"family":"Hitomi","given":"Masaru"},{"family":"Sawamura","given":"Kenta"},{"family":"Ohzeki","given":"Masayuki"}],"container-title":"Scientific Reports","id":"Quang2025","issued":{"date-parts":[[2025]]},"page":"44047","publisher":"Nature Publishing Group","title":"Quantum annealing-based route optimization for commercial AGV operating systems in large-scale logistics warehouses","type":"article-journal","volume":"15"}}],"isEdited":false,"manualOverride":{"citeprocText":"(Leib et al. 2023; Quang et al. 2025)","isManuallyOverridden":false,"manualOverrideText":""},"mendeley":{"formattedCitation":"(Leib et al. 2023; Quang et al. 2025)","plainTextFormattedCitation":"(Leib et al. 2023; Quang et al. 2025)","previouslyFormattedCitation":"(Leib et al. 2023; Quang et al. 2025)"},"properties":{"noteIndex":0},"schema":"https://github.com/citation-style-language/schema/raw/master/csl-citation.json"}</w:instrText>
+        <w:instrText xml:space="preserve">ADDIN CSL_CITATION {"citationID":"MENDELEY_CITATION_520","citationItems":[{"id":"ITEM-519","isTemporary":false,"itemData":{"DOI":"10.1038/s41598-023-45668-1","author":[{"family":"Leib","given":"Dominik"},{"family":"Seidel","given":"Tobias"},{"family":"Jäger","given":"Sven"},{"family":"Heese","given":"Raoul"},{"family":"Jones","given":"Caitlin Isobel"},{"family":"Awasthi","given":"Abhishek"},{"family":"Niederle","given":"Astrid"},{"family":"Bortz","given":"Michael"}],"container-title":"Scientific Reports","id":"Leib2023","issued":{"date-parts":[[2023]]},"publisher":"Nature Publishing Group","title":"An optimization case study for solving a transport robot scheduling problem on quantum-hybrid and quantum-inspired hardware","type":"article-journal","volume":"13"}},{"id":"ITEM-520","isTemporary":false,"itemData":{"DOI":"10.1038/s41598-025-28481-w","author":[{"family":"Quang","given":"Thinh Nguyen"},{"family":"Matsuyama","given":"Kosuke"},{"family":"Shimizu","given":"Keisuke"},{"family":"Sugano","given":"Hiroki"},{"family":"Kurimoto","given":"Eiji"},{"family":"Miki","given":"Masahiro"},{"family":"Suzuki","given":"Jumpei"},{"family":"Chen","given":"Ziyi"},{"family":"Waidyasooriya","given":"Hasitha Muthumala"},{"family":"Hariyama","given":"Masanori"},{"family":"Hitomi","given":"Masaru"},{"family":"Sawamura","given":"Kenta"},{"family":"Ohzeki","given":"Masayuki"}],"container-title":"Scientific Reports","id":"Quang2025","issued":{"date-parts":[[2025]]},"page":"44047","publisher":"Nature Publishing Group","title":"Quantum annealing-based route optimization for commercial AGV operating systems in large-scale logistics warehouses","type":"article-journal","volume":"15"}}],"isEdited":false,"manualOverride":{"citeprocText":"(Leib et al. 2023; Quang et al. 2025)","isManuallyOverridden":false,"manualOverrideText":""},"mendeley":{"formattedCitation":"(Leib et al. 2023; Quang et al. 2025)","plainTextFormattedCitation":"(Leib et al. 2023; Quang et al. 2025)","previouslyFormattedCitation":"(Leib et al. 2023; Quang et al. 2025)"},"properties":{"noteIndex":0},"schema":"https://github.com/citation-style-language/schema/raw/master/csl-citation.json"}</w:instrText>
       </w:r>
       <w:r>
         <w:fldChar w:fldCharType="separate"/>
@@ -19492,7 +19682,7 @@
         <w:fldChar w:fldCharType="begin"/>
       </w:r>
       <w:r>
-        <w:instrText xml:space="preserve">ADDIN CSL_CITATION {"citationID":"MENDELEY_CITATION_507","citationItems":[{"id":"ITEM-507","isTemporary":false,"itemData":{"DOI":"10.3390/a12020034","author":[{"family":"Hadfield","given":"Stuart"},{"family":"Wang","given":"Zhihui"},{"family":"O’Gorman","given":"Bryan"},{"family":"Rieffel","given":"Eleanor G."},{"family":"Venturelli","given":"Davide"},{"family":"Biswas","given":"Rupak"}],"container-title":"Algorithms","id":"Hadfield2019","issue":"2","issued":{"date-parts":[[2019]]},"page":"34","publisher":"MDPI","title":"From the quantum approximate optimization algorithm to a quantum alternating operator ansatz","type":"article-journal","volume":"12"}}],"isEdited":false,"manualOverride":{"citeprocText":"(Hadfield et al. 2019)","isManuallyOverridden":false,"manualOverrideText":""},"mendeley":{"formattedCitation":"(Hadfield et al. 2019)","plainTextFormattedCitation":"(Hadfield et al. 2019)","previouslyFormattedCitation":"(Hadfield et al. 2019)"},"properties":{"noteIndex":0},"schema":"https://github.com/citation-style-language/schema/raw/master/csl-citation.json"}</w:instrText>
+        <w:instrText xml:space="preserve">ADDIN CSL_CITATION {"citationID":"MENDELEY_CITATION_521","citationItems":[{"id":"ITEM-521","isTemporary":false,"itemData":{"DOI":"10.3390/a12020034","author":[{"family":"Hadfield","given":"Stuart"},{"family":"Wang","given":"Zhihui"},{"family":"O’Gorman","given":"Bryan"},{"family":"Rieffel","given":"Eleanor G."},{"family":"Venturelli","given":"Davide"},{"family":"Biswas","given":"Rupak"}],"container-title":"Algorithms","id":"Hadfield2019","issue":"2","issued":{"date-parts":[[2019]]},"page":"34","publisher":"MDPI","title":"From the quantum approximate optimization algorithm to a quantum alternating operator ansatz","type":"article-journal","volume":"12"}}],"isEdited":false,"manualOverride":{"citeprocText":"(Hadfield et al. 2019)","isManuallyOverridden":false,"manualOverrideText":""},"mendeley":{"formattedCitation":"(Hadfield et al. 2019)","plainTextFormattedCitation":"(Hadfield et al. 2019)","previouslyFormattedCitation":"(Hadfield et al. 2019)"},"properties":{"noteIndex":0},"schema":"https://github.com/citation-style-language/schema/raw/master/csl-citation.json"}</w:instrText>
       </w:r>
       <w:r>
         <w:fldChar w:fldCharType="separate"/>
@@ -19513,7 +19703,7 @@
         <w:fldChar w:fldCharType="begin"/>
       </w:r>
       <w:r>
-        <w:instrText xml:space="preserve">ADDIN CSL_CITATION {"citationID":"MENDELEY_CITATION_508","citationItems":[{"id":"ITEM-508","isTemporary":false,"itemData":{"URL":"https://arxiv.org/abs/2606.14252","author":[{"family":"Bang","given":"Junyeop"},{"family":"Lee","given":"Byongho"},{"family":"An","given":"Dohyun"},{"family":"Kim","given":"Hwangnam"}],"id":"Bang2026","issued":{"date-parts":[[2026]]},"title":"Optimality-preserving decomposition for scalable QAOA in natural-language-guided multi-drone assignment","type":""}}],"isEdited":false,"manualOverride":{"citeprocText":"(Bang et al. 2026)","isManuallyOverridden":false,"manualOverrideText":""},"mendeley":{"formattedCitation":"(Bang et al. 2026)","plainTextFormattedCitation":"(Bang et al. 2026)","previouslyFormattedCitation":"(Bang et al. 2026)"},"properties":{"noteIndex":0},"schema":"https://github.com/citation-style-language/schema/raw/master/csl-citation.json"}</w:instrText>
+        <w:instrText xml:space="preserve">ADDIN CSL_CITATION {"citationID":"MENDELEY_CITATION_522","citationItems":[{"id":"ITEM-522","isTemporary":false,"itemData":{"URL":"https://arxiv.org/abs/2606.14252","author":[{"family":"Bang","given":"Junyeop"},{"family":"Lee","given":"Byongho"},{"family":"An","given":"Dohyun"},{"family":"Kim","given":"Hwangnam"}],"id":"Bang2026","issued":{"date-parts":[[2026]]},"title":"Optimality-preserving decomposition for scalable QAOA in natural-language-guided multi-drone assignment","type":""}}],"isEdited":false,"manualOverride":{"citeprocText":"(Bang et al. 2026)","isManuallyOverridden":false,"manualOverrideText":""},"mendeley":{"formattedCitation":"(Bang et al. 2026)","plainTextFormattedCitation":"(Bang et al. 2026)","previouslyFormattedCitation":"(Bang et al. 2026)"},"properties":{"noteIndex":0},"schema":"https://github.com/citation-style-language/schema/raw/master/csl-citation.json"}</w:instrText>
       </w:r>
       <w:r>
         <w:fldChar w:fldCharType="separate"/>
@@ -19531,7 +19721,7 @@
         <w:fldChar w:fldCharType="begin"/>
       </w:r>
       <w:r>
-        <w:instrText xml:space="preserve">ADDIN CSL_CITATION {"citationID":"MENDELEY_CITATION_509","citationItems":[{"id":"ITEM-509","isTemporary":false,"itemData":{"DOI":"10.1103/PhysRevX.10.021067","author":[{"family":"Zhou","given":"Leo"},{"family":"Wang","given":"Sheng-Tao"},{"family":"Choi","given":"Soonwon"},{"family":"Pichler","given":"Hannes"},{"family":"Lukin","given":"Mikhail D."}],"container-title":"Physical Review X","id":"Zhou2020","issue":"2","issued":{"date-parts":[[2020]]},"page":"021067","publisher":"American Physical Society","title":"Quantum approximate optimization algorithm: Performance, mechanism, and implementation on near-term devices","title-short":"Quantum approximate optimization algorithm","type":"article-journal","volume":"10"}}],"isEdited":false,"manualOverride":{"citeprocText":"(Zhou et al. 2020)","isManuallyOverridden":false,"manualOverrideText":""},"mendeley":{"formattedCitation":"(Zhou et al. 2020)","plainTextFormattedCitation":"(Zhou et al. 2020)","previouslyFormattedCitation":"(Zhou et al. 2020)"},"properties":{"noteIndex":0},"schema":"https://github.com/citation-style-language/schema/raw/master/csl-citation.json"}</w:instrText>
+        <w:instrText xml:space="preserve">ADDIN CSL_CITATION {"citationID":"MENDELEY_CITATION_523","citationItems":[{"id":"ITEM-523","isTemporary":false,"itemData":{"DOI":"10.1103/PhysRevX.10.021067","author":[{"family":"Zhou","given":"Leo"},{"family":"Wang","given":"Sheng-Tao"},{"family":"Choi","given":"Soonwon"},{"family":"Pichler","given":"Hannes"},{"family":"Lukin","given":"Mikhail D."}],"container-title":"Physical Review X","id":"Zhou2020","issue":"2","issued":{"date-parts":[[2020]]},"page":"021067","publisher":"American Physical Society","title":"Quantum approximate optimization algorithm: Performance, mechanism, and implementation on near-term devices","title-short":"Quantum approximate optimization algorithm","type":"article-journal","volume":"10"}}],"isEdited":false,"manualOverride":{"citeprocText":"(Zhou et al. 2020)","isManuallyOverridden":false,"manualOverrideText":""},"mendeley":{"formattedCitation":"(Zhou et al. 2020)","plainTextFormattedCitation":"(Zhou et al. 2020)","previouslyFormattedCitation":"(Zhou et al. 2020)"},"properties":{"noteIndex":0},"schema":"https://github.com/citation-style-language/schema/raw/master/csl-citation.json"}</w:instrText>
       </w:r>
       <w:r>
         <w:fldChar w:fldCharType="separate"/>
@@ -19552,7 +19742,7 @@
         <w:fldChar w:fldCharType="begin"/>
       </w:r>
       <w:r>
-        <w:instrText xml:space="preserve">ADDIN CSL_CITATION {"citationID":"MENDELEY_CITATION_510","citationItems":[{"id":"ITEM-510","isTemporary":false,"itemData":{"URL":"https://proceedings.mlr.press/v267/gerlach25a.html","author":[{"family":"Gerlach","given":"Thore"},{"family":"Lee","given":"Loong Kuan"},{"family":"Barbaresco","given":"Frederic"},{"family":"Piatkowski","given":"Nico"}],"collection-title":"Proceedings of machine learning research","container-title":"Proceedings of the 42nd international conference on machine learning","editor":[{"family":"Singh","given":"Aarti"},{"family":"Fazel","given":"Maryam"},{"family":"Hsu","given":"Daniel"},{"family":"Lacoste-Julien","given":"Simon"},{"family":"Berkenkamp","given":"Felix"},{"family":"Maharaj","given":"Tegan"},{"family":"Wagstaff","given":"Kiri"},{"family":"Zhu","given":"Jerry"}],"id":"Gerlach2025","issued":{"date-parts":[[2025]]},"page":"19161-19171","publisher":"PMLR","title":"Hybrid quantum-classical multi-agent pathfinding","type":"paper-conference","volume":"267"}}],"isEdited":false,"manualOverride":{"citeprocText":"(Gerlach et al. 2025)","isManuallyOverridden":false,"manualOverrideText":""},"mendeley":{"formattedCitation":"(Gerlach et al. 2025)","plainTextFormattedCitation":"(Gerlach et al. 2025)","previouslyFormattedCitation":"(Gerlach et al. 2025)"},"properties":{"noteIndex":0},"schema":"https://github.com/citation-style-language/schema/raw/master/csl-citation.json"}</w:instrText>
+        <w:instrText xml:space="preserve">ADDIN CSL_CITATION {"citationID":"MENDELEY_CITATION_524","citationItems":[{"id":"ITEM-524","isTemporary":false,"itemData":{"URL":"https://proceedings.mlr.press/v267/gerlach25a.html","author":[{"family":"Gerlach","given":"Thore"},{"family":"Lee","given":"Loong Kuan"},{"family":"Barbaresco","given":"Frederic"},{"family":"Piatkowski","given":"Nico"}],"collection-title":"Proceedings of machine learning research","container-title":"Proceedings of the 42nd international conference on machine learning","editor":[{"family":"Singh","given":"Aarti"},{"family":"Fazel","given":"Maryam"},{"family":"Hsu","given":"Daniel"},{"family":"Lacoste-Julien","given":"Simon"},{"family":"Berkenkamp","given":"Felix"},{"family":"Maharaj","given":"Tegan"},{"family":"Wagstaff","given":"Kiri"},{"family":"Zhu","given":"Jerry"}],"id":"Gerlach2025","issued":{"date-parts":[[2025]]},"page":"19161-19171","publisher":"PMLR","title":"Hybrid quantum-classical multi-agent pathfinding","type":"paper-conference","volume":"267"}}],"isEdited":false,"manualOverride":{"citeprocText":"(Gerlach et al. 2025)","isManuallyOverridden":false,"manualOverrideText":""},"mendeley":{"formattedCitation":"(Gerlach et al. 2025)","plainTextFormattedCitation":"(Gerlach et al. 2025)","previouslyFormattedCitation":"(Gerlach et al. 2025)"},"properties":{"noteIndex":0},"schema":"https://github.com/citation-style-language/schema/raw/master/csl-citation.json"}</w:instrText>
       </w:r>
       <w:r>
         <w:fldChar w:fldCharType="separate"/>
@@ -19600,7 +19790,7 @@
         <w:fldChar w:fldCharType="begin"/>
       </w:r>
       <w:r>
-        <w:instrText xml:space="preserve">ADDIN CSL_CITATION {"citationID":"MENDELEY_CITATION_511","citationItems":[{"id":"ITEM-511","isTemporary":false,"itemData":{"DOI":"10.1177/0278364911406761","author":[{"family":"Karaman","given":"Sertac"},{"family":"Frazzoli","given":"Emilio"}],"container-title":"The International Journal of Robotics Research","id":"Karaman2011","issue":"7","issued":{"date-parts":[[2011]]},"page":"846-894","publisher":"SAGE Publications","title":"Sampling-based algorithms for optimal motion planning","type":"article-journal","volume":"30"}}],"isEdited":false,"manualOverride":{"citeprocText":"(Karaman and Frazzoli 2011)","isManuallyOverridden":false,"manualOverrideText":""},"mendeley":{"formattedCitation":"(Karaman and Frazzoli 2011)","plainTextFormattedCitation":"(Karaman and Frazzoli 2011)","previouslyFormattedCitation":"(Karaman and Frazzoli 2011)"},"properties":{"noteIndex":0},"schema":"https://github.com/citation-style-language/schema/raw/master/csl-citation.json"}</w:instrText>
+        <w:instrText xml:space="preserve">ADDIN CSL_CITATION {"citationID":"MENDELEY_CITATION_525","citationItems":[{"id":"ITEM-525","isTemporary":false,"itemData":{"DOI":"10.1177/0278364911406761","author":[{"family":"Karaman","given":"Sertac"},{"family":"Frazzoli","given":"Emilio"}],"container-title":"The International Journal of Robotics Research","id":"Karaman2011","issue":"7","issued":{"date-parts":[[2011]]},"page":"846-894","publisher":"SAGE Publications","title":"Sampling-based algorithms for optimal motion planning","type":"article-journal","volume":"30"}}],"isEdited":false,"manualOverride":{"citeprocText":"(Karaman and Frazzoli 2011)","isManuallyOverridden":false,"manualOverrideText":""},"mendeley":{"formattedCitation":"(Karaman and Frazzoli 2011)","plainTextFormattedCitation":"(Karaman and Frazzoli 2011)","previouslyFormattedCitation":"(Karaman and Frazzoli 2011)"},"properties":{"noteIndex":0},"schema":"https://github.com/citation-style-language/schema/raw/master/csl-citation.json"}</w:instrText>
       </w:r>
       <w:r>
         <w:fldChar w:fldCharType="separate"/>
@@ -19618,7 +19808,7 @@
         <w:fldChar w:fldCharType="begin"/>
       </w:r>
       <w:r>
-        <w:instrText xml:space="preserve">ADDIN CSL_CITATION {"citationID":"MENDELEY_CITATION_512","citationItems":[{"id":"ITEM-512","isTemporary":false,"itemData":{"DOI":"10.1109/ROBOT.1999.772544","author":[{"family":"Dellaert","given":"Frank"},{"family":"Fox","given":"Dieter"},{"family":"Burgard","given":"Wolfram"},{"family":"Thrun","given":"Sebastian"}],"container-title":"Proceedings of the 1999 IEEE international conference on robotics and automation (ICRA)","id":"Dellaert1999","issued":{"date-parts":[[1999]]},"page":"1322-1328","publisher":"IEEE","title":"Monte Carlo localization for mobile robots","type":"paper-conference","volume":"2"}}],"isEdited":false,"manualOverride":{"citeprocText":"(Dellaert et al. 1999)","isManuallyOverridden":false,"manualOverrideText":""},"mendeley":{"formattedCitation":"(Dellaert et al. 1999)","plainTextFormattedCitation":"(Dellaert et al. 1999)","previouslyFormattedCitation":"(Dellaert et al. 1999)"},"properties":{"noteIndex":0},"schema":"https://github.com/citation-style-language/schema/raw/master/csl-citation.json"}</w:instrText>
+        <w:instrText xml:space="preserve">ADDIN CSL_CITATION {"citationID":"MENDELEY_CITATION_526","citationItems":[{"id":"ITEM-526","isTemporary":false,"itemData":{"DOI":"10.1109/ROBOT.1999.772544","author":[{"family":"Dellaert","given":"Frank"},{"family":"Fox","given":"Dieter"},{"family":"Burgard","given":"Wolfram"},{"family":"Thrun","given":"Sebastian"}],"container-title":"Proceedings of the 1999 IEEE international conference on robotics and automation (ICRA)","id":"Dellaert1999","issued":{"date-parts":[[1999]]},"page":"1322-1328","publisher":"IEEE","title":"Monte Carlo localization for mobile robots","type":"paper-conference","volume":"2"}}],"isEdited":false,"manualOverride":{"citeprocText":"(Dellaert et al. 1999)","isManuallyOverridden":false,"manualOverrideText":""},"mendeley":{"formattedCitation":"(Dellaert et al. 1999)","plainTextFormattedCitation":"(Dellaert et al. 1999)","previouslyFormattedCitation":"(Dellaert et al. 1999)"},"properties":{"noteIndex":0},"schema":"https://github.com/citation-style-language/schema/raw/master/csl-citation.json"}</w:instrText>
       </w:r>
       <w:r>
         <w:fldChar w:fldCharType="separate"/>
@@ -19639,7 +19829,7 @@
         <w:fldChar w:fldCharType="begin"/>
       </w:r>
       <w:r>
-        <w:instrText xml:space="preserve">ADDIN CSL_CITATION {"citationID":"MENDELEY_CITATION_513","citationItems":[{"id":"ITEM-513","isTemporary":false,"itemData":{"DOI":"10.1103/PhysRevA.86.032324","author":[{"family":"Fowler","given":"Austin G."},{"family":"Mariantoni","given":"Matteo"},{"family":"Martinis","given":"John M."},{"family":"Cleland","given":"Andrew N."}],"container-title":"Physical Review A","id":"Fowler2012","issue":"3","issued":{"date-parts":[[2012]]},"page":"032324","publisher":"American Physical Society","title":"Surface codes: Towards practical large-scale quantum computation","title-short":"Surface codes","type":"article-journal","volume":"86"}}],"isEdited":false,"manualOverride":{"citeprocText":"(Fowler et al. 2012)","isManuallyOverridden":false,"manualOverrideText":""},"mendeley":{"formattedCitation":"(Fowler et al. 2012)","plainTextFormattedCitation":"(Fowler et al. 2012)","previouslyFormattedCitation":"(Fowler et al. 2012)"},"properties":{"noteIndex":0},"schema":"https://github.com/citation-style-language/schema/raw/master/csl-citation.json"}</w:instrText>
+        <w:instrText xml:space="preserve">ADDIN CSL_CITATION {"citationID":"MENDELEY_CITATION_527","citationItems":[{"id":"ITEM-527","isTemporary":false,"itemData":{"DOI":"10.1103/PhysRevA.86.032324","author":[{"family":"Fowler","given":"Austin G."},{"family":"Mariantoni","given":"Matteo"},{"family":"Martinis","given":"John M."},{"family":"Cleland","given":"Andrew N."}],"container-title":"Physical Review A","id":"Fowler2012","issue":"3","issued":{"date-parts":[[2012]]},"page":"032324","publisher":"American Physical Society","title":"Surface codes: Towards practical large-scale quantum computation","title-short":"Surface codes","type":"article-journal","volume":"86"}}],"isEdited":false,"manualOverride":{"citeprocText":"(Fowler et al. 2012)","isManuallyOverridden":false,"manualOverrideText":""},"mendeley":{"formattedCitation":"(Fowler et al. 2012)","plainTextFormattedCitation":"(Fowler et al. 2012)","previouslyFormattedCitation":"(Fowler et al. 2012)"},"properties":{"noteIndex":0},"schema":"https://github.com/citation-style-language/schema/raw/master/csl-citation.json"}</w:instrText>
       </w:r>
       <w:r>
         <w:fldChar w:fldCharType="separate"/>
@@ -19684,7 +19874,7 @@
         <w:fldChar w:fldCharType="begin"/>
       </w:r>
       <w:r>
-        <w:instrText xml:space="preserve">ADDIN CSL_CITATION {"citationID":"MENDELEY_CITATION_515","citationItems":[{"id":"ITEM-514","isTemporary":false,"itemData":{"DOI":"10.1109/ACCESS.2024.3417808","author":[{"family":"Hohenfeld","given":"Hans"},{"family":"Heimann","given":"Dirk"},{"family":"Wiebe","given":"Felix"},{"family":"Kirchner","given":"Frank"}],"container-title":"IEEE Access","id":"Hohenfeld2024","issued":{"date-parts":[[2024]]},"page":"87217-87236","publisher":"IEEE","title":"Quantum deep reinforcement learning for robot navigation tasks","type":"article-journal","volume":"12"}},{"id":"ITEM-515","isTemporary":false,"itemData":{"URL":"https://arxiv.org/abs/2212.11681","author":[{"family":"Acuto","given":"Alberto"},{"family":"Barillà","given":"Paola"},{"family":"Bozzolo","given":"Ludovico"},{"family":"Conterno","given":"Matteo"},{"family":"Pavese","given":"Mattia"},{"family":"Policicchio","given":"Antonio"}],"id":"Acuto2022","issued":{"date-parts":[[2022]]},"title":"Variational quantum soft actor-critic for robotic arm control","type":""}}],"isEdited":false,"manualOverride":{"citeprocText":"(Hohenfeld et al. 2024; Acuto et al. 2022)","isManuallyOverridden":false,"manualOverrideText":""},"mendeley":{"formattedCitation":"(Hohenfeld et al. 2024; Acuto et al. 2022)","plainTextFormattedCitation":"(Hohenfeld et al. 2024; Acuto et al. 2022)","previouslyFormattedCitation":"(Hohenfeld et al. 2024; Acuto et al. 2022)"},"properties":{"noteIndex":0},"schema":"https://github.com/citation-style-language/schema/raw/master/csl-citation.json"}</w:instrText>
+        <w:instrText xml:space="preserve">ADDIN CSL_CITATION {"citationID":"MENDELEY_CITATION_529","citationItems":[{"id":"ITEM-528","isTemporary":false,"itemData":{"DOI":"10.1109/ACCESS.2024.3417808","author":[{"family":"Hohenfeld","given":"Hans"},{"family":"Heimann","given":"Dirk"},{"family":"Wiebe","given":"Felix"},{"family":"Kirchner","given":"Frank"}],"container-title":"IEEE Access","id":"Hohenfeld2024","issued":{"date-parts":[[2024]]},"page":"87217-87236","publisher":"IEEE","title":"Quantum deep reinforcement learning for robot navigation tasks","type":"article-journal","volume":"12"}},{"id":"ITEM-529","isTemporary":false,"itemData":{"URL":"https://arxiv.org/abs/2212.11681","author":[{"family":"Acuto","given":"Alberto"},{"family":"Barillà","given":"Paola"},{"family":"Bozzolo","given":"Ludovico"},{"family":"Conterno","given":"Matteo"},{"family":"Pavese","given":"Mattia"},{"family":"Policicchio","given":"Antonio"}],"id":"Acuto2022","issued":{"date-parts":[[2022]]},"title":"Variational quantum soft actor-critic for robotic arm control","type":""}}],"isEdited":false,"manualOverride":{"citeprocText":"(Hohenfeld et al. 2024; Acuto et al. 2022)","isManuallyOverridden":false,"manualOverrideText":""},"mendeley":{"formattedCitation":"(Hohenfeld et al. 2024; Acuto et al. 2022)","plainTextFormattedCitation":"(Hohenfeld et al. 2024; Acuto et al. 2022)","previouslyFormattedCitation":"(Hohenfeld et al. 2024; Acuto et al. 2022)"},"properties":{"noteIndex":0},"schema":"https://github.com/citation-style-language/schema/raw/master/csl-citation.json"}</w:instrText>
       </w:r>
       <w:r>
         <w:fldChar w:fldCharType="separate"/>
@@ -19705,7 +19895,7 @@
         <w:fldChar w:fldCharType="begin"/>
       </w:r>
       <w:r>
-        <w:instrText xml:space="preserve">ADDIN CSL_CITATION {"citationID":"MENDELEY_CITATION_517","citationItems":[{"id":"ITEM-516","isTemporary":false,"itemData":{"DOI":"10.1038/s41467-021-21728-w","author":[{"family":"Cerezo","given":"M."},{"family":"Sone","given":"Akira"},{"family":"Volkoff","given":"Tyler"},{"family":"Cincio","given":"Lukasz"},{"family":"Coles","given":"Patrick J."}],"container-title":"Nature Communications","id":"Cerezo2021b","issued":{"date-parts":[[2021]]},"page":"1791","publisher":"Nature Publishing Group","title":"Cost function dependent barren plateaus in shallow parametrized quantum circuits","type":"article-journal","volume":"12"}},{"id":"ITEM-517","isTemporary":false,"itemData":{"DOI":"10.1038/s42254-025-00813-9","author":[{"family":"Larocca","given":"Martı́n"},{"family":"Thanasilp","given":"Supanut"},{"family":"Wang","given":"Samson"},{"family":"Sharma","given":"Kunal"},{"family":"Biamonte","given":"Jacob"},{"family":"Coles","given":"Patrick J."},{"family":"Cincio","given":"Lukasz"},{"family":"McClean","given":"Jarrod R."},{"family":"Holmes","given":"Zoë"},{"family":"Cerezo","given":"M."}],"container-title":"Nature Reviews Physics","id":"Larocca2025","issue":"4","issued":{"date-parts":[[2025]]},"page":"174-189","publisher":"Nature Publishing Group","title":"Barren plateaus in variational quantum computing","type":"article-journal","volume":"7"}}],"isEdited":false,"manualOverride":{"citeprocText":"(Cerezo, Sone, et al. 2021; Larocca et al. 2025)","isManuallyOverridden":false,"manualOverrideText":""},"mendeley":{"formattedCitation":"(Cerezo, Sone, et al. 2021; Larocca et al. 2025)","plainTextFormattedCitation":"(Cerezo, Sone, et al. 2021; Larocca et al. 2025)","previouslyFormattedCitation":"(Cerezo, Sone, et al. 2021; Larocca et al. 2025)"},"properties":{"noteIndex":0},"schema":"https://github.com/citation-style-language/schema/raw/master/csl-citation.json"}</w:instrText>
+        <w:instrText xml:space="preserve">ADDIN CSL_CITATION {"citationID":"MENDELEY_CITATION_531","citationItems":[{"id":"ITEM-530","isTemporary":false,"itemData":{"DOI":"10.1038/s41467-021-21728-w","author":[{"family":"Cerezo","given":"M."},{"family":"Sone","given":"Akira"},{"family":"Volkoff","given":"Tyler"},{"family":"Cincio","given":"Lukasz"},{"family":"Coles","given":"Patrick J."}],"container-title":"Nature Communications","id":"Cerezo2021b","issued":{"date-parts":[[2021]]},"page":"1791","publisher":"Nature Publishing Group","title":"Cost function dependent barren plateaus in shallow parametrized quantum circuits","type":"article-journal","volume":"12"}},{"id":"ITEM-531","isTemporary":false,"itemData":{"DOI":"10.1038/s42254-025-00813-9","author":[{"family":"Larocca","given":"Martı́n"},{"family":"Thanasilp","given":"Supanut"},{"family":"Wang","given":"Samson"},{"family":"Sharma","given":"Kunal"},{"family":"Biamonte","given":"Jacob"},{"family":"Coles","given":"Patrick J."},{"family":"Cincio","given":"Lukasz"},{"family":"McClean","given":"Jarrod R."},{"family":"Holmes","given":"Zoë"},{"family":"Cerezo","given":"M."}],"container-title":"Nature Reviews Physics","id":"Larocca2025","issue":"4","issued":{"date-parts":[[2025]]},"page":"174-189","publisher":"Nature Publishing Group","title":"Barren plateaus in variational quantum computing","type":"article-journal","volume":"7"}}],"isEdited":false,"manualOverride":{"citeprocText":"(Cerezo, Sone, et al. 2021; Larocca et al. 2025)","isManuallyOverridden":false,"manualOverrideText":""},"mendeley":{"formattedCitation":"(Cerezo, Sone, et al. 2021; Larocca et al. 2025)","plainTextFormattedCitation":"(Cerezo, Sone, et al. 2021; Larocca et al. 2025)","previouslyFormattedCitation":"(Cerezo, Sone, et al. 2021; Larocca et al. 2025)"},"properties":{"noteIndex":0},"schema":"https://github.com/citation-style-language/schema/raw/master/csl-citation.json"}</w:instrText>
       </w:r>
       <w:r>
         <w:fldChar w:fldCharType="separate"/>
@@ -19753,7 +19943,7 @@
         <w:fldChar w:fldCharType="begin"/>
       </w:r>
       <w:r>
-        <w:instrText xml:space="preserve">ADDIN CSL_CITATION {"citationID":"MENDELEY_CITATION_518","citationItems":[{"id":"ITEM-518","isTemporary":false,"itemData":{"DOI":"10.48550/arXiv.2504.08167","URL":"https://arxiv.org/abs/2504.08167","author":[{"family":"Muradoglu","given":"Murat"},{"family":"Johnsson","given":"Mattias T."},{"family":"Wilson","given":"Nathanial M."},{"family":"Cohen","given":"Yuval"},{"family":"Shin","given":"Dongki"},{"family":"Navickas","given":"Tomas"},{"family":"Pyragius","given":"Tadas"},{"family":"Thomas","given":"Divya"},{"family":"Thompson","given":"Daniel"},{"family":"Moore","given":"Steven I."},{"family":"Rahman","given":"Md Tanvir"},{"family":"Walker","given":"Adrian"},{"family":"Dutta","given":"Indranil"},{"family":"Bijjahalli","given":"Suraj"},{"family":"Berlocher","given":"Jacob"},{"family":"Hush","given":"Michael R."},{"family":"Anderson","given":"Russell P."},{"family":"Szigeti","given":"Stuart S."},{"family":"Biercuk","given":"Michael J."}],"id":"Muradoglu2025","issued":{"date-parts":[[2025]]},"title":"Quantum-assured magnetic navigation achieves positioning accuracy better than a strategic-grade INS in airborne and ground-based field trials","type":""}}],"isEdited":false,"manualOverride":{"citeprocText":"(Muradoglu et al. 2025)","isManuallyOverridden":false,"manualOverrideText":""},"mendeley":{"formattedCitation":"(Muradoglu et al. 2025)","plainTextFormattedCitation":"(Muradoglu et al. 2025)","previouslyFormattedCitation":"(Muradoglu et al. 2025)"},"properties":{"noteIndex":0},"schema":"https://github.com/citation-style-language/schema/raw/master/csl-citation.json"}</w:instrText>
+        <w:instrText xml:space="preserve">ADDIN CSL_CITATION {"citationID":"MENDELEY_CITATION_532","citationItems":[{"id":"ITEM-532","isTemporary":false,"itemData":{"DOI":"10.48550/arXiv.2504.08167","URL":"https://arxiv.org/abs/2504.08167","author":[{"family":"Muradoglu","given":"Murat"},{"family":"Johnsson","given":"Mattias T."},{"family":"Wilson","given":"Nathanial M."},{"family":"Cohen","given":"Yuval"},{"family":"Shin","given":"Dongki"},{"family":"Navickas","given":"Tomas"},{"family":"Pyragius","given":"Tadas"},{"family":"Thomas","given":"Divya"},{"family":"Thompson","given":"Daniel"},{"family":"Moore","given":"Steven I."},{"family":"Rahman","given":"Md Tanvir"},{"family":"Walker","given":"Adrian"},{"family":"Dutta","given":"Indranil"},{"family":"Bijjahalli","given":"Suraj"},{"family":"Berlocher","given":"Jacob"},{"family":"Hush","given":"Michael R."},{"family":"Anderson","given":"Russell P."},{"family":"Szigeti","given":"Stuart S."},{"family":"Biercuk","given":"Michael J."}],"id":"Muradoglu2025","issued":{"date-parts":[[2025]]},"title":"Quantum-assured magnetic navigation achieves positioning accuracy better than a strategic-grade INS in airborne and ground-based field trials","type":""}}],"isEdited":false,"manualOverride":{"citeprocText":"(Muradoglu et al. 2025)","isManuallyOverridden":false,"manualOverrideText":""},"mendeley":{"formattedCitation":"(Muradoglu et al. 2025)","plainTextFormattedCitation":"(Muradoglu et al. 2025)","previouslyFormattedCitation":"(Muradoglu et al. 2025)"},"properties":{"noteIndex":0},"schema":"https://github.com/citation-style-language/schema/raw/master/csl-citation.json"}</w:instrText>
       </w:r>
       <w:r>
         <w:fldChar w:fldCharType="separate"/>
@@ -19771,7 +19961,7 @@
         <w:fldChar w:fldCharType="begin"/>
       </w:r>
       <w:r>
-        <w:instrText xml:space="preserve">ADDIN CSL_CITATION {"citationID":"MENDELEY_CITATION_519","citationItems":[{"id":"ITEM-519","isTemporary":false,"itemData":{"DOI":"10.1038/s42254-019-0117-4","author":[{"family":"Bongs","given":"Kai"},{"family":"Holynski","given":"Michael"},{"family":"Vovrosh","given":"Jamie"},{"family":"Bouyer","given":"Philippe"},{"family":"Condon","given":"Gabriel"},{"family":"Rasel","given":"Ernst"},{"family":"Schubert","given":"Christian"},{"family":"Schleich","given":"Wolfgang P."},{"family":"Roura","given":"Albert"}],"container-title":"Nature Reviews Physics","id":"Bongs2019","issue":"12","issued":{"date-parts":[[2019]]},"page":"731-739","publisher":"Nature Publishing Group","title":"Taking atom interferometric quantum sensors from the laboratory to real-world applications","type":"article-journal","volume":"1"}}],"isEdited":false,"manualOverride":{"citeprocText":"(Bongs et al. 2019)","isManuallyOverridden":false,"manualOverrideText":""},"mendeley":{"formattedCitation":"(Bongs et al. 2019)","plainTextFormattedCitation":"(Bongs et al. 2019)","previouslyFormattedCitation":"(Bongs et al. 2019)"},"properties":{"noteIndex":0},"schema":"https://github.com/citation-style-language/schema/raw/master/csl-citation.json"}</w:instrText>
+        <w:instrText xml:space="preserve">ADDIN CSL_CITATION {"citationID":"MENDELEY_CITATION_533","citationItems":[{"id":"ITEM-533","isTemporary":false,"itemData":{"DOI":"10.1038/s42254-019-0117-4","author":[{"family":"Bongs","given":"Kai"},{"family":"Holynski","given":"Michael"},{"family":"Vovrosh","given":"Jamie"},{"family":"Bouyer","given":"Philippe"},{"family":"Condon","given":"Gabriel"},{"family":"Rasel","given":"Ernst"},{"family":"Schubert","given":"Christian"},{"family":"Schleich","given":"Wolfgang P."},{"family":"Roura","given":"Albert"}],"container-title":"Nature Reviews Physics","id":"Bongs2019","issue":"12","issued":{"date-parts":[[2019]]},"page":"731-739","publisher":"Nature Publishing Group","title":"Taking atom interferometric quantum sensors from the laboratory to real-world applications","type":"article-journal","volume":"1"}}],"isEdited":false,"manualOverride":{"citeprocText":"(Bongs et al. 2019)","isManuallyOverridden":false,"manualOverrideText":""},"mendeley":{"formattedCitation":"(Bongs et al. 2019)","plainTextFormattedCitation":"(Bongs et al. 2019)","previouslyFormattedCitation":"(Bongs et al. 2019)"},"properties":{"noteIndex":0},"schema":"https://github.com/citation-style-language/schema/raw/master/csl-citation.json"}</w:instrText>
       </w:r>
       <w:r>
         <w:fldChar w:fldCharType="separate"/>
@@ -19789,7 +19979,7 @@
         <w:fldChar w:fldCharType="begin"/>
       </w:r>
       <w:r>
-        <w:instrText xml:space="preserve">ADDIN CSL_CITATION {"citationID":"MENDELEY_CITATION_521","citationItems":[{"id":"ITEM-520","isTemporary":false,"itemData":{"DOI":"10.1103/PhysRevApplied.10.034030","author":[{"family":"Cheiney","given":"Pierrick"},{"family":"Fouché","given":"Lauriane"},{"family":"Templier","given":"Simon"},{"family":"Napolitano","given":"Fabien"},{"family":"Battelier","given":"Baptiste"},{"family":"Bouyer","given":"Philippe"},{"family":"Barrett","given":"Brynle"}],"container-title":"Physical Review Applied","id":"Cheiney2018","issue":"3","issued":{"date-parts":[[2018]]},"page":"034030","publisher":"American Physical Society","title":"Navigation-compatible hybrid quantum accelerometer using a Kalman filter","type":"article-journal","volume":"10"}},{"id":"ITEM-521","isTemporary":false,"itemData":{"DOI":"10.48550/arXiv.2103.09378","URL":"https://arxiv.org/abs/2103.09378","author":[{"family":"Wang","given":"Xuezhi"},{"family":"Kealy","given":"Allison"},{"family":"Gilliam","given":"Christopher"},{"family":"Haine","given":"Simon"},{"family":"Close","given":"John"},{"family":"Moran","given":"Bill"},{"family":"Talbot","given":"Kyle"},{"family":"Williams","given":"Simon"},{"family":"Hardman","given":"Kyle"},{"family":"Freier","given":"Chris"},{"family":"Wigley","given":"Paul"},{"family":"White","given":"Angela"},{"family":"Szigeti","given":"Stuart"},{"family":"Legge","given":"Sam"}],"id":"Wang2021","issued":{"date-parts":[[2021]]},"title":"Enhancing inertial navigation performance via fusion of classical and quantum accelerometers","type":""}}],"isEdited":false,"manualOverride":{"citeprocText":"(Cheiney et al. 2018; Xuezhi Wang et al. 2021)","isManuallyOverridden":false,"manualOverrideText":""},"mendeley":{"formattedCitation":"(Cheiney et al. 2018; Xuezhi Wang et al. 2021)","plainTextFormattedCitation":"(Cheiney et al. 2018; Xuezhi Wang et al. 2021)","previouslyFormattedCitation":"(Cheiney et al. 2018; Xuezhi Wang et al. 2021)"},"properties":{"noteIndex":0},"schema":"https://github.com/citation-style-language/schema/raw/master/csl-citation.json"}</w:instrText>
+        <w:instrText xml:space="preserve">ADDIN CSL_CITATION {"citationID":"MENDELEY_CITATION_535","citationItems":[{"id":"ITEM-534","isTemporary":false,"itemData":{"DOI":"10.1103/PhysRevApplied.10.034030","author":[{"family":"Cheiney","given":"Pierrick"},{"family":"Fouché","given":"Lauriane"},{"family":"Templier","given":"Simon"},{"family":"Napolitano","given":"Fabien"},{"family":"Battelier","given":"Baptiste"},{"family":"Bouyer","given":"Philippe"},{"family":"Barrett","given":"Brynle"}],"container-title":"Physical Review Applied","id":"Cheiney2018","issue":"3","issued":{"date-parts":[[2018]]},"page":"034030","publisher":"American Physical Society","title":"Navigation-compatible hybrid quantum accelerometer using a Kalman filter","type":"article-journal","volume":"10"}},{"id":"ITEM-535","isTemporary":false,"itemData":{"DOI":"10.48550/arXiv.2103.09378","URL":"https://arxiv.org/abs/2103.09378","author":[{"family":"Wang","given":"Xuezhi"},{"family":"Kealy","given":"Allison"},{"family":"Gilliam","given":"Christopher"},{"family":"Haine","given":"Simon"},{"family":"Close","given":"John"},{"family":"Moran","given":"Bill"},{"family":"Talbot","given":"Kyle"},{"family":"Williams","given":"Simon"},{"family":"Hardman","given":"Kyle"},{"family":"Freier","given":"Chris"},{"family":"Wigley","given":"Paul"},{"family":"White","given":"Angela"},{"family":"Szigeti","given":"Stuart"},{"family":"Legge","given":"Sam"}],"id":"Wang2021","issued":{"date-parts":[[2021]]},"title":"Enhancing inertial navigation performance via fusion of classical and quantum accelerometers","type":""}}],"isEdited":false,"manualOverride":{"citeprocText":"(Cheiney et al. 2018; Xuezhi Wang et al. 2021)","isManuallyOverridden":false,"manualOverrideText":""},"mendeley":{"formattedCitation":"(Cheiney et al. 2018; Xuezhi Wang et al. 2021)","plainTextFormattedCitation":"(Cheiney et al. 2018; Xuezhi Wang et al. 2021)","previouslyFormattedCitation":"(Cheiney et al. 2018; Xuezhi Wang et al. 2021)"},"properties":{"noteIndex":0},"schema":"https://github.com/citation-style-language/schema/raw/master/csl-citation.json"}</w:instrText>
       </w:r>
       <w:r>
         <w:fldChar w:fldCharType="separate"/>
@@ -19807,7 +19997,7 @@
         <w:fldChar w:fldCharType="begin"/>
       </w:r>
       <w:r>
-        <w:instrText xml:space="preserve">ADDIN CSL_CITATION {"citationID":"MENDELEY_CITATION_522","citationItems":[{"id":"ITEM-522","isTemporary":false,"itemData":{"DOI":"10.48550/arXiv.2505.17587","URL":"https://arxiv.org/abs/2505.17587","author":[{"family":"Conrad","given":"Andrew"},{"family":"Cochran","given":"Roderick"},{"family":"Sanchez-Rosales","given":"Daniel"},{"family":"Isaac","given":"Samantha"},{"family":"Javid","given":"Timur"},{"family":"Rezaei","given":"Tahereh"},{"family":"Schroeder","given":"A. J."},{"family":"Golba","given":"Grzegorz"},{"family":"Gutha","given":"Akash"},{"family":"Wilens","given":"Brian"},{"family":"Herndon","given":"Kyle"},{"family":"Hill","given":"Alex"},{"family":"Chapman","given":"Joseph"},{"family":"Call","given":"Ian"},{"family":"Szabo","given":"Joseph"},{"family":"Corrigan","given":"Aodhan"},{"family":"Kamin","given":"Lars"},{"family":"Lütkenhaus","given":"Norbert"},{"family":"Gauthier","given":"Daniel J."},{"family":"Kwiat","given":"Paul G."}],"id":"Conrad2025","issued":{"date-parts":[[2025]]},"title":"Drone- and vehicle-based quantum key distribution","type":""}}],"isEdited":false,"manualOverride":{"citeprocText":"(Conrad et al. 2025)","isManuallyOverridden":false,"manualOverrideText":""},"mendeley":{"formattedCitation":"(Conrad et al. 2025)","plainTextFormattedCitation":"(Conrad et al. 2025)","previouslyFormattedCitation":"(Conrad et al. 2025)"},"properties":{"noteIndex":0},"schema":"https://github.com/citation-style-language/schema/raw/master/csl-citation.json"}</w:instrText>
+        <w:instrText xml:space="preserve">ADDIN CSL_CITATION {"citationID":"MENDELEY_CITATION_536","citationItems":[{"id":"ITEM-536","isTemporary":false,"itemData":{"DOI":"10.48550/arXiv.2505.17587","URL":"https://arxiv.org/abs/2505.17587","author":[{"family":"Conrad","given":"Andrew"},{"family":"Cochran","given":"Roderick"},{"family":"Sanchez-Rosales","given":"Daniel"},{"family":"Isaac","given":"Samantha"},{"family":"Javid","given":"Timur"},{"family":"Rezaei","given":"Tahereh"},{"family":"Schroeder","given":"A. J."},{"family":"Golba","given":"Grzegorz"},{"family":"Gutha","given":"Akash"},{"family":"Wilens","given":"Brian"},{"family":"Herndon","given":"Kyle"},{"family":"Hill","given":"Alex"},{"family":"Chapman","given":"Joseph"},{"family":"Call","given":"Ian"},{"family":"Szabo","given":"Joseph"},{"family":"Corrigan","given":"Aodhan"},{"family":"Kamin","given":"Lars"},{"family":"Lütkenhaus","given":"Norbert"},{"family":"Gauthier","given":"Daniel J."},{"family":"Kwiat","given":"Paul G."}],"id":"Conrad2025","issued":{"date-parts":[[2025]]},"title":"Drone- and vehicle-based quantum key distribution","type":""}}],"isEdited":false,"manualOverride":{"citeprocText":"(Conrad et al. 2025)","isManuallyOverridden":false,"manualOverrideText":""},"mendeley":{"formattedCitation":"(Conrad et al. 2025)","plainTextFormattedCitation":"(Conrad et al. 2025)","previouslyFormattedCitation":"(Conrad et al. 2025)"},"properties":{"noteIndex":0},"schema":"https://github.com/citation-style-language/schema/raw/master/csl-citation.json"}</w:instrText>
       </w:r>
       <w:r>
         <w:fldChar w:fldCharType="separate"/>
@@ -19852,7 +20042,7 @@
         <w:fldChar w:fldCharType="begin"/>
       </w:r>
       <w:r>
-        <w:instrText xml:space="preserve">ADDIN CSL_CITATION {"citationID":"MENDELEY_CITATION_524","citationItems":[{"id":"ITEM-523","isTemporary":false,"itemData":{"DOI":"10.1146/annurev-control-042920-092451","author":[{"family":"Kurniawati","given":"Hanna"}],"container-title":"Annual Review of Control, Robotics, and Autonomous Systems","id":"Kurniawati2022","issued":{"date-parts":[[2022]]},"page":"253-277","publisher":"Annual Reviews","title":"Partially observable Markov decision processes and robotics","type":"article-journal","volume":"5"}},{"id":"ITEM-524","isTemporary":false,"itemData":{"DOI":"10.1146/annurev-psych-033020-123501","author":[{"family":"Pothos","given":"Emmanuel M."},{"family":"Busemeyer","given":"Jerome R."}],"container-title":"Annual Review of Psychology","id":"Pothos2022","issue":"1","issued":{"date-parts":[[2022]]},"page":"749-778","publisher":"Annual Reviews","title":"Quantum cognition","type":"article-journal","volume":"73"}}],"isEdited":false,"manualOverride":{"citeprocText":"(Kurniawati 2022; Pothos and Busemeyer 2022)","isManuallyOverridden":false,"manualOverrideText":""},"mendeley":{"formattedCitation":"(Kurniawati 2022; Pothos and Busemeyer 2022)","plainTextFormattedCitation":"(Kurniawati 2022; Pothos and Busemeyer 2022)","previouslyFormattedCitation":"(Kurniawati 2022; Pothos and Busemeyer 2022)"},"properties":{"noteIndex":0},"schema":"https://github.com/citation-style-language/schema/raw/master/csl-citation.json"}</w:instrText>
+        <w:instrText xml:space="preserve">ADDIN CSL_CITATION {"citationID":"MENDELEY_CITATION_538","citationItems":[{"id":"ITEM-537","isTemporary":false,"itemData":{"DOI":"10.1146/annurev-control-042920-092451","author":[{"family":"Kurniawati","given":"Hanna"}],"container-title":"Annual Review of Control, Robotics, and Autonomous Systems","id":"Kurniawati2022","issued":{"date-parts":[[2022]]},"page":"253-277","publisher":"Annual Reviews","title":"Partially observable Markov decision processes and robotics","type":"article-journal","volume":"5"}},{"id":"ITEM-538","isTemporary":false,"itemData":{"DOI":"10.1146/annurev-psych-033020-123501","author":[{"family":"Pothos","given":"Emmanuel M."},{"family":"Busemeyer","given":"Jerome R."}],"container-title":"Annual Review of Psychology","id":"Pothos2022","issue":"1","issued":{"date-parts":[[2022]]},"page":"749-778","publisher":"Annual Reviews","title":"Quantum cognition","type":"article-journal","volume":"73"}}],"isEdited":false,"manualOverride":{"citeprocText":"(Kurniawati 2022; Pothos and Busemeyer 2022)","isManuallyOverridden":false,"manualOverrideText":""},"mendeley":{"formattedCitation":"(Kurniawati 2022; Pothos and Busemeyer 2022)","plainTextFormattedCitation":"(Kurniawati 2022; Pothos and Busemeyer 2022)","previouslyFormattedCitation":"(Kurniawati 2022; Pothos and Busemeyer 2022)"},"properties":{"noteIndex":0},"schema":"https://github.com/citation-style-language/schema/raw/master/csl-citation.json"}</w:instrText>
       </w:r>
       <w:r>
         <w:fldChar w:fldCharType="separate"/>
@@ -19870,7 +20060,7 @@
         <w:fldChar w:fldCharType="begin"/>
       </w:r>
       <w:r>
-        <w:instrText xml:space="preserve">ADDIN CSL_CITATION {"citationID":"MENDELEY_CITATION_525","citationItems":[{"id":"ITEM-525","isTemporary":false,"itemData":{"DOI":"10.3390/e25040548","author":[{"family":"Widdows","given":"Dominic"},{"family":"Rani","given":"Jyoti"},{"family":"Pothos","given":"Emmanuel M."}],"container-title":"Entropy","id":"Widdows2023","issue":"4","issued":{"date-parts":[[2023]]},"page":"548","publisher":"MDPI","title":"Quantum circuit components for cognitive decision-making","type":"article-journal","volume":"25"}}],"isEdited":false,"manualOverride":{"citeprocText":"(Widdows, Rani, and Pothos 2023)","isManuallyOverridden":false,"manualOverrideText":""},"mendeley":{"formattedCitation":"(Widdows, Rani, and Pothos 2023)","plainTextFormattedCitation":"(Widdows, Rani, and Pothos 2023)","previouslyFormattedCitation":"(Widdows, Rani, and Pothos 2023)"},"properties":{"noteIndex":0},"schema":"https://github.com/citation-style-language/schema/raw/master/csl-citation.json"}</w:instrText>
+        <w:instrText xml:space="preserve">ADDIN CSL_CITATION {"citationID":"MENDELEY_CITATION_539","citationItems":[{"id":"ITEM-539","isTemporary":false,"itemData":{"DOI":"10.3390/e25040548","author":[{"family":"Widdows","given":"Dominic"},{"family":"Rani","given":"Jyoti"},{"family":"Pothos","given":"Emmanuel M."}],"container-title":"Entropy","id":"Widdows2023","issue":"4","issued":{"date-parts":[[2023]]},"page":"548","publisher":"MDPI","title":"Quantum circuit components for cognitive decision-making","type":"article-journal","volume":"25"}}],"isEdited":false,"manualOverride":{"citeprocText":"(Widdows, Rani, and Pothos 2023)","isManuallyOverridden":false,"manualOverrideText":""},"mendeley":{"formattedCitation":"(Widdows, Rani, and Pothos 2023)","plainTextFormattedCitation":"(Widdows, Rani, and Pothos 2023)","previouslyFormattedCitation":"(Widdows, Rani, and Pothos 2023)"},"properties":{"noteIndex":0},"schema":"https://github.com/citation-style-language/schema/raw/master/csl-citation.json"}</w:instrText>
       </w:r>
       <w:r>
         <w:fldChar w:fldCharType="separate"/>
@@ -19891,7 +20081,7 @@
         <w:fldChar w:fldCharType="begin"/>
       </w:r>
       <w:r>
-        <w:instrText xml:space="preserve">ADDIN CSL_CITATION {"citationID":"MENDELEY_CITATION_527","citationItems":[{"id":"ITEM-526","isTemporary":false,"itemData":{"DOI":"10.3390/e25091323","author":[{"family":"Lawless","given":"William F."},{"family":"Moskowitz","given":"Ira S."},{"family":"Doctor","given":"Katarina Z."}],"container-title":"Entropy","id":"Lawless2023","issue":"9","issued":{"date-parts":[[2023]]},"page":"1323","publisher":"MDPI","title":"A quantum-like model of interdependence for embodied human–machine teams: Reviewing the path to autonomy facing complexity and uncertainty","title-short":"A quantum-like model of interdependence for embodied human–machine teams","type":"article-journal","volume":"25"}},{"id":"ITEM-527","isTemporary":false,"itemData":{"DOI":"10.3390/e27020152","author":[{"family":"Humr","given":"Scott"},{"family":"Canan","given":"Mustafa"},{"family":"Demir","given":"Mustafa"}],"container-title":"Entropy","id":"Humr2025","issue":"2","issued":{"date-parts":[[2025]]},"page":"152","publisher":"MDPI","title":"A quantum probability approach to improving human–AI decision making","type":"article-journal","volume":"27"}}],"isEdited":false,"manualOverride":{"citeprocText":"(Lawless, Moskowitz, and Doctor 2023; Humr, Canan, and Demir 2025)","isManuallyOverridden":false,"manualOverrideText":""},"mendeley":{"formattedCitation":"(Lawless, Moskowitz, and Doctor 2023; Humr, Canan, and Demir 2025)","plainTextFormattedCitation":"(Lawless, Moskowitz, and Doctor 2023; Humr, Canan, and Demir 2025)","previouslyFormattedCitation":"(Lawless, Moskowitz, and Doctor 2023; Humr, Canan, and Demir 2025)"},"properties":{"noteIndex":0},"schema":"https://github.com/citation-style-language/schema/raw/master/csl-citation.json"}</w:instrText>
+        <w:instrText xml:space="preserve">ADDIN CSL_CITATION {"citationID":"MENDELEY_CITATION_541","citationItems":[{"id":"ITEM-540","isTemporary":false,"itemData":{"DOI":"10.3390/e25091323","author":[{"family":"Lawless","given":"William F."},{"family":"Moskowitz","given":"Ira S."},{"family":"Doctor","given":"Katarina Z."}],"container-title":"Entropy","id":"Lawless2023","issue":"9","issued":{"date-parts":[[2023]]},"page":"1323","publisher":"MDPI","title":"A quantum-like model of interdependence for embodied human–machine teams: Reviewing the path to autonomy facing complexity and uncertainty","title-short":"A quantum-like model of interdependence for embodied human–machine teams","type":"article-journal","volume":"25"}},{"id":"ITEM-541","isTemporary":false,"itemData":{"DOI":"10.3390/e27020152","author":[{"family":"Humr","given":"Scott"},{"family":"Canan","given":"Mustafa"},{"family":"Demir","given":"Mustafa"}],"container-title":"Entropy","id":"Humr2025","issue":"2","issued":{"date-parts":[[2025]]},"page":"152","publisher":"MDPI","title":"A quantum probability approach to improving human–AI decision making","type":"article-journal","volume":"27"}}],"isEdited":false,"manualOverride":{"citeprocText":"(Lawless, Moskowitz, and Doctor 2023; Humr, Canan, and Demir 2025)","isManuallyOverridden":false,"manualOverrideText":""},"mendeley":{"formattedCitation":"(Lawless, Moskowitz, and Doctor 2023; Humr, Canan, and Demir 2025)","plainTextFormattedCitation":"(Lawless, Moskowitz, and Doctor 2023; Humr, Canan, and Demir 2025)","previouslyFormattedCitation":"(Lawless, Moskowitz, and Doctor 2023; Humr, Canan, and Demir 2025)"},"properties":{"noteIndex":0},"schema":"https://github.com/citation-style-language/schema/raw/master/csl-citation.json"}</w:instrText>
       </w:r>
       <w:r>
         <w:fldChar w:fldCharType="separate"/>
@@ -19999,7 +20189,7 @@
         <w:fldChar w:fldCharType="begin"/>
       </w:r>
       <w:r>
-        <w:instrText xml:space="preserve">ADDIN CSL_CITATION {"citationID":"MENDELEY_CITATION_529","citationItems":[{"id":"ITEM-528","isTemporary":false,"itemData":{"DOI":"10.1038/nphys3272","author":[{"family":"Aaronson","given":"Scott"}],"container-title":"Nature Physics","id":"Aaronson2015","issue":"4","issued":{"date-parts":[[2015]]},"page":"291-293","title":"Read the fine print","type":"article-journal","volume":"11"}},{"id":"ITEM-529","isTemporary":false,"itemData":{"DOI":"10.1145/3313276.3316310","author":[{"family":"Tang","given":"Ewin"}],"container-title":"Proceedings of the 51st annual ACM SIGACT symposium on theory of computing (STOC 2019)","id":"Tang2019","issued":{"date-parts":[[2019]]},"page":"217-228","publisher":"ACM","publisher-place":"New York, NY, USA","title":"A quantum-inspired classical algorithm for recommendation systems","type":"paper-conference"}}],"isEdited":false,"manualOverride":{"citeprocText":"(Aaronson 2015; E. Tang 2019)","isManuallyOverridden":false,"manualOverrideText":""},"mendeley":{"formattedCitation":"(Aaronson 2015; E. Tang 2019)","plainTextFormattedCitation":"(Aaronson 2015; E. Tang 2019)","previouslyFormattedCitation":"(Aaronson 2015; E. Tang 2019)"},"properties":{"noteIndex":0},"schema":"https://github.com/citation-style-language/schema/raw/master/csl-citation.json"}</w:instrText>
+        <w:instrText xml:space="preserve">ADDIN CSL_CITATION {"citationID":"MENDELEY_CITATION_543","citationItems":[{"id":"ITEM-542","isTemporary":false,"itemData":{"DOI":"10.1038/nphys3272","author":[{"family":"Aaronson","given":"Scott"}],"container-title":"Nature Physics","id":"Aaronson2015","issue":"4","issued":{"date-parts":[[2015]]},"page":"291-293","title":"Read the fine print","type":"article-journal","volume":"11"}},{"id":"ITEM-543","isTemporary":false,"itemData":{"DOI":"10.1145/3313276.3316310","author":[{"family":"Tang","given":"Ewin"}],"container-title":"Proceedings of the 51st annual ACM SIGACT symposium on theory of computing (STOC 2019)","id":"Tang2019","issued":{"date-parts":[[2019]]},"page":"217-228","publisher":"ACM","publisher-place":"New York, NY, USA","title":"A quantum-inspired classical algorithm for recommendation systems","type":"paper-conference"}}],"isEdited":false,"manualOverride":{"citeprocText":"(Aaronson 2015; E. Tang 2019)","isManuallyOverridden":false,"manualOverrideText":""},"mendeley":{"formattedCitation":"(Aaronson 2015; E. Tang 2019)","plainTextFormattedCitation":"(Aaronson 2015; E. Tang 2019)","previouslyFormattedCitation":"(Aaronson 2015; E. Tang 2019)"},"properties":{"noteIndex":0},"schema":"https://github.com/citation-style-language/schema/raw/master/csl-citation.json"}</w:instrText>
       </w:r>
       <w:r>
         <w:fldChar w:fldCharType="separate"/>
@@ -20044,7 +20234,7 @@
         <w:fldChar w:fldCharType="begin"/>
       </w:r>
       <w:r>
-        <w:instrText xml:space="preserve">ADDIN CSL_CITATION {"citationID":"MENDELEY_CITATION_530","citationItems":[{"id":"ITEM-530","isTemporary":false,"itemData":{"DOI":"10.1103/PhysRevLett.127.100501","author":[{"family":"Córcoles","given":"Antonio D."},{"family":"Takita","given":"Maika"},{"family":"Inoue","given":"Ken"},{"family":"Lekuch","given":"Scott"},{"family":"Minev","given":"Zlatko K."},{"family":"Chow","given":"Jerry M."},{"family":"Gambetta","given":"Jay M."}],"container-title":"Physical Review Letters","id":"Corcoles2021","issue":"10","issued":{"date-parts":[[2021]]},"page":"100501","publisher":"American Physical Society","title":"Exploiting dynamic quantum circuits in a quantum algorithm with superconducting qubits","type":"article-journal","volume":"127"}}],"isEdited":false,"manualOverride":{"citeprocText":"(Córcoles et al. 2021)","isManuallyOverridden":false,"manualOverrideText":""},"mendeley":{"formattedCitation":"(Córcoles et al. 2021)","plainTextFormattedCitation":"(Córcoles et al. 2021)","previouslyFormattedCitation":"(Córcoles et al. 2021)"},"properties":{"noteIndex":0},"schema":"https://github.com/citation-style-language/schema/raw/master/csl-citation.json"}</w:instrText>
+        <w:instrText xml:space="preserve">ADDIN CSL_CITATION {"citationID":"MENDELEY_CITATION_544","citationItems":[{"id":"ITEM-544","isTemporary":false,"itemData":{"DOI":"10.1103/PhysRevLett.127.100501","author":[{"family":"Córcoles","given":"Antonio D."},{"family":"Takita","given":"Maika"},{"family":"Inoue","given":"Ken"},{"family":"Lekuch","given":"Scott"},{"family":"Minev","given":"Zlatko K."},{"family":"Chow","given":"Jerry M."},{"family":"Gambetta","given":"Jay M."}],"container-title":"Physical Review Letters","id":"Corcoles2021","issue":"10","issued":{"date-parts":[[2021]]},"page":"100501","publisher":"American Physical Society","title":"Exploiting dynamic quantum circuits in a quantum algorithm with superconducting qubits","type":"article-journal","volume":"127"}}],"isEdited":false,"manualOverride":{"citeprocText":"(Córcoles et al. 2021)","isManuallyOverridden":false,"manualOverrideText":""},"mendeley":{"formattedCitation":"(Córcoles et al. 2021)","plainTextFormattedCitation":"(Córcoles et al. 2021)","previouslyFormattedCitation":"(Córcoles et al. 2021)"},"properties":{"noteIndex":0},"schema":"https://github.com/citation-style-language/schema/raw/master/csl-citation.json"}</w:instrText>
       </w:r>
       <w:r>
         <w:fldChar w:fldCharType="separate"/>
@@ -20065,7 +20255,7 @@
         <w:fldChar w:fldCharType="begin"/>
       </w:r>
       <w:r>
-        <w:instrText xml:space="preserve">ADDIN CSL_CITATION {"citationID":"MENDELEY_CITATION_531","citationItems":[{"id":"ITEM-531","isTemporary":false,"itemData":{"DOI":"10.1145/3445814.3446758","author":[{"family":"Tang","given":"Wei"},{"family":"Tomesh","given":"Teague"},{"family":"Suchara","given":"Martin"},{"family":"Larson","given":"Jeffrey"},{"family":"Martonosi","given":"Margaret"}],"container-title":"Proceedings of the 26th ACM international conference on architectural support for programming languages and operating systems (ASPLOS ’21)","id":"Tang2021","issued":{"date-parts":[[2021]]},"page":"473-486","publisher":"Association for Computing Machinery","publisher-place":"New York, NY, USA","title":"CutQC: Using small quantum computers for large quantum circuit evaluations","title-short":"CutQC","type":"paper-conference"}}],"isEdited":false,"manualOverride":{"citeprocText":"(W. Tang et al. 2021)","isManuallyOverridden":false,"manualOverrideText":""},"mendeley":{"formattedCitation":"(W. Tang et al. 2021)","plainTextFormattedCitation":"(W. Tang et al. 2021)","previouslyFormattedCitation":"(W. Tang et al. 2021)"},"properties":{"noteIndex":0},"schema":"https://github.com/citation-style-language/schema/raw/master/csl-citation.json"}</w:instrText>
+        <w:instrText xml:space="preserve">ADDIN CSL_CITATION {"citationID":"MENDELEY_CITATION_545","citationItems":[{"id":"ITEM-545","isTemporary":false,"itemData":{"DOI":"10.1145/3445814.3446758","author":[{"family":"Tang","given":"Wei"},{"family":"Tomesh","given":"Teague"},{"family":"Suchara","given":"Martin"},{"family":"Larson","given":"Jeffrey"},{"family":"Martonosi","given":"Margaret"}],"container-title":"Proceedings of the 26th ACM international conference on architectural support for programming languages and operating systems (ASPLOS ’21)","id":"Tang2021","issued":{"date-parts":[[2021]]},"page":"473-486","publisher":"Association for Computing Machinery","publisher-place":"New York, NY, USA","title":"CutQC: Using small quantum computers for large quantum circuit evaluations","title-short":"CutQC","type":"paper-conference"}}],"isEdited":false,"manualOverride":{"citeprocText":"(W. Tang et al. 2021)","isManuallyOverridden":false,"manualOverrideText":""},"mendeley":{"formattedCitation":"(W. Tang et al. 2021)","plainTextFormattedCitation":"(W. Tang et al. 2021)","previouslyFormattedCitation":"(W. Tang et al. 2021)"},"properties":{"noteIndex":0},"schema":"https://github.com/citation-style-language/schema/raw/master/csl-citation.json"}</w:instrText>
       </w:r>
       <w:r>
         <w:fldChar w:fldCharType="separate"/>
@@ -20113,7 +20303,7 @@
         <w:fldChar w:fldCharType="begin"/>
       </w:r>
       <w:r>
-        <w:instrText xml:space="preserve">ADDIN CSL_CITATION {"citationID":"MENDELEY_CITATION_532","citationItems":[{"id":"ITEM-532","isTemporary":false,"itemData":{"DOI":"10.3389/fcomp.2019.00009","author":[{"family":"Ohzeki","given":"Masayuki"},{"family":"Miki","given":"Akira"},{"family":"Miyama","given":"Masamichi J."},{"family":"Terabe","given":"Masayoshi"}],"container-title":"Frontiers in Computer Science","id":"Ohzeki2019","issued":{"date-parts":[[2019]]},"page":"9","publisher":"Frontiers Media","title":"Control of automated guided vehicles without collision by quantum annealer and digital devices","type":"article-journal","volume":"1"}}],"isEdited":false,"manualOverride":{"citeprocText":"(Ohzeki et al. 2019)","isManuallyOverridden":false,"manualOverrideText":""},"mendeley":{"formattedCitation":"(Ohzeki et al. 2019)","plainTextFormattedCitation":"(Ohzeki et al. 2019)","previouslyFormattedCitation":"(Ohzeki et al. 2019)"},"properties":{"noteIndex":0},"schema":"https://github.com/citation-style-language/schema/raw/master/csl-citation.json"}</w:instrText>
+        <w:instrText xml:space="preserve">ADDIN CSL_CITATION {"citationID":"MENDELEY_CITATION_546","citationItems":[{"id":"ITEM-546","isTemporary":false,"itemData":{"DOI":"10.3389/fcomp.2019.00009","author":[{"family":"Ohzeki","given":"Masayuki"},{"family":"Miki","given":"Akira"},{"family":"Miyama","given":"Masamichi J."},{"family":"Terabe","given":"Masayoshi"}],"container-title":"Frontiers in Computer Science","id":"Ohzeki2019","issued":{"date-parts":[[2019]]},"page":"9","publisher":"Frontiers Media","title":"Control of automated guided vehicles without collision by quantum annealer and digital devices","type":"article-journal","volume":"1"}}],"isEdited":false,"manualOverride":{"citeprocText":"(Ohzeki et al. 2019)","isManuallyOverridden":false,"manualOverrideText":""},"mendeley":{"formattedCitation":"(Ohzeki et al. 2019)","plainTextFormattedCitation":"(Ohzeki et al. 2019)","previouslyFormattedCitation":"(Ohzeki et al. 2019)"},"properties":{"noteIndex":0},"schema":"https://github.com/citation-style-language/schema/raw/master/csl-citation.json"}</w:instrText>
       </w:r>
       <w:r>
         <w:fldChar w:fldCharType="separate"/>
@@ -20573,7 +20763,7 @@
               <w:fldChar w:fldCharType="begin"/>
             </w:r>
             <w:r>
-              <w:instrText xml:space="preserve">ADDIN CSL_CITATION {"citationID":"MENDELEY_CITATION_534","citationItems":[{"id":"ITEM-533","isTemporary":false,"itemData":{"DOI":"10.48550/arXiv.2504.08167","URL":"https://arxiv.org/abs/2504.08167","author":[{"family":"Muradoglu","given":"Murat"},{"family":"Johnsson","given":"Mattias T."},{"family":"Wilson","given":"Nathanial M."},{"family":"Cohen","given":"Yuval"},{"family":"Shin","given":"Dongki"},{"family":"Navickas","given":"Tomas"},{"family":"Pyragius","given":"Tadas"},{"family":"Thomas","given":"Divya"},{"family":"Thompson","given":"Daniel"},{"family":"Moore","given":"Steven I."},{"family":"Rahman","given":"Md Tanvir"},{"family":"Walker","given":"Adrian"},{"family":"Dutta","given":"Indranil"},{"family":"Bijjahalli","given":"Suraj"},{"family":"Berlocher","given":"Jacob"},{"family":"Hush","given":"Michael R."},{"family":"Anderson","given":"Russell P."},{"family":"Szigeti","given":"Stuart S."},{"family":"Biercuk","given":"Michael J."}],"id":"Muradoglu2025","issued":{"date-parts":[[2025]]},"title":"Quantum-assured magnetic navigation achieves positioning accuracy better than a strategic-grade INS in airborne and ground-based field trials","type":""}},{"id":"ITEM-534","isTemporary":false,"itemData":{"DOI":"10.1103/PhysRevApplied.10.034030","author":[{"family":"Cheiney","given":"Pierrick"},{"family":"Fouché","given":"Lauriane"},{"family":"Templier","given":"Simon"},{"family":"Napolitano","given":"Fabien"},{"family":"Battelier","given":"Baptiste"},{"family":"Bouyer","given":"Philippe"},{"family":"Barrett","given":"Brynle"}],"container-title":"Physical Review Applied","id":"Cheiney2018","issue":"3","issued":{"date-parts":[[2018]]},"page":"034030","publisher":"American Physical Society","title":"Navigation-compatible hybrid quantum accelerometer using a Kalman filter","type":"article-journal","volume":"10"}}],"isEdited":false,"manualOverride":{"citeprocText":"(Muradoglu et al. 2025; Cheiney et al. 2018)","isManuallyOverridden":false,"manualOverrideText":""},"mendeley":{"formattedCitation":"(Muradoglu et al. 2025; Cheiney et al. 2018)","plainTextFormattedCitation":"(Muradoglu et al. 2025; Cheiney et al. 2018)","previouslyFormattedCitation":"(Muradoglu et al. 2025; Cheiney et al. 2018)"},"properties":{"noteIndex":0},"schema":"https://github.com/citation-style-language/schema/raw/master/csl-citation.json"}</w:instrText>
+              <w:instrText xml:space="preserve">ADDIN CSL_CITATION {"citationID":"MENDELEY_CITATION_548","citationItems":[{"id":"ITEM-547","isTemporary":false,"itemData":{"DOI":"10.48550/arXiv.2504.08167","URL":"https://arxiv.org/abs/2504.08167","author":[{"family":"Muradoglu","given":"Murat"},{"family":"Johnsson","given":"Mattias T."},{"family":"Wilson","given":"Nathanial M."},{"family":"Cohen","given":"Yuval"},{"family":"Shin","given":"Dongki"},{"family":"Navickas","given":"Tomas"},{"family":"Pyragius","given":"Tadas"},{"family":"Thomas","given":"Divya"},{"family":"Thompson","given":"Daniel"},{"family":"Moore","given":"Steven I."},{"family":"Rahman","given":"Md Tanvir"},{"family":"Walker","given":"Adrian"},{"family":"Dutta","given":"Indranil"},{"family":"Bijjahalli","given":"Suraj"},{"family":"Berlocher","given":"Jacob"},{"family":"Hush","given":"Michael R."},{"family":"Anderson","given":"Russell P."},{"family":"Szigeti","given":"Stuart S."},{"family":"Biercuk","given":"Michael J."}],"id":"Muradoglu2025","issued":{"date-parts":[[2025]]},"title":"Quantum-assured magnetic navigation achieves positioning accuracy better than a strategic-grade INS in airborne and ground-based field trials","type":""}},{"id":"ITEM-548","isTemporary":false,"itemData":{"DOI":"10.1103/PhysRevApplied.10.034030","author":[{"family":"Cheiney","given":"Pierrick"},{"family":"Fouché","given":"Lauriane"},{"family":"Templier","given":"Simon"},{"family":"Napolitano","given":"Fabien"},{"family":"Battelier","given":"Baptiste"},{"family":"Bouyer","given":"Philippe"},{"family":"Barrett","given":"Brynle"}],"container-title":"Physical Review Applied","id":"Cheiney2018","issue":"3","issued":{"date-parts":[[2018]]},"page":"034030","publisher":"American Physical Society","title":"Navigation-compatible hybrid quantum accelerometer using a Kalman filter","type":"article-journal","volume":"10"}}],"isEdited":false,"manualOverride":{"citeprocText":"(Muradoglu et al. 2025; Cheiney et al. 2018)","isManuallyOverridden":false,"manualOverrideText":""},"mendeley":{"formattedCitation":"(Muradoglu et al. 2025; Cheiney et al. 2018)","plainTextFormattedCitation":"(Muradoglu et al. 2025; Cheiney et al. 2018)","previouslyFormattedCitation":"(Muradoglu et al. 2025; Cheiney et al. 2018)"},"properties":{"noteIndex":0},"schema":"https://github.com/citation-style-language/schema/raw/master/csl-citation.json"}</w:instrText>
             </w:r>
             <w:r>
               <w:fldChar w:fldCharType="separate"/>
@@ -20631,7 +20821,7 @@
               <w:fldChar w:fldCharType="begin"/>
             </w:r>
             <w:r>
-              <w:instrText xml:space="preserve">ADDIN CSL_CITATION {"citationID":"MENDELEY_CITATION_536","citationItems":[{"id":"ITEM-535","isTemporary":false,"itemData":{"DOI":"10.1146/annurev-psych-033020-123501","author":[{"family":"Pothos","given":"Emmanuel M."},{"family":"Busemeyer","given":"Jerome R."}],"container-title":"Annual Review of Psychology","id":"Pothos2022","issue":"1","issued":{"date-parts":[[2022]]},"page":"749-778","publisher":"Annual Reviews","title":"Quantum cognition","type":"article-journal","volume":"73"}},{"id":"ITEM-536","isTemporary":false,"itemData":{"DOI":"10.1146/annurev-control-042920-092451","author":[{"family":"Kurniawati","given":"Hanna"}],"container-title":"Annual Review of Control, Robotics, and Autonomous Systems","id":"Kurniawati2022","issued":{"date-parts":[[2022]]},"page":"253-277","publisher":"Annual Reviews","title":"Partially observable Markov decision processes and robotics","type":"article-journal","volume":"5"}}],"isEdited":false,"manualOverride":{"citeprocText":"(Pothos and Busemeyer 2022; Kurniawati 2022)","isManuallyOverridden":false,"manualOverrideText":""},"mendeley":{"formattedCitation":"(Pothos and Busemeyer 2022; Kurniawati 2022)","plainTextFormattedCitation":"(Pothos and Busemeyer 2022; Kurniawati 2022)","previouslyFormattedCitation":"(Pothos and Busemeyer 2022; Kurniawati 2022)"},"properties":{"noteIndex":0},"schema":"https://github.com/citation-style-language/schema/raw/master/csl-citation.json"}</w:instrText>
+              <w:instrText xml:space="preserve">ADDIN CSL_CITATION {"citationID":"MENDELEY_CITATION_550","citationItems":[{"id":"ITEM-549","isTemporary":false,"itemData":{"DOI":"10.1146/annurev-psych-033020-123501","author":[{"family":"Pothos","given":"Emmanuel M."},{"family":"Busemeyer","given":"Jerome R."}],"container-title":"Annual Review of Psychology","id":"Pothos2022","issue":"1","issued":{"date-parts":[[2022]]},"page":"749-778","publisher":"Annual Reviews","title":"Quantum cognition","type":"article-journal","volume":"73"}},{"id":"ITEM-550","isTemporary":false,"itemData":{"DOI":"10.1146/annurev-control-042920-092451","author":[{"family":"Kurniawati","given":"Hanna"}],"container-title":"Annual Review of Control, Robotics, and Autonomous Systems","id":"Kurniawati2022","issued":{"date-parts":[[2022]]},"page":"253-277","publisher":"Annual Reviews","title":"Partially observable Markov decision processes and robotics","type":"article-journal","volume":"5"}}],"isEdited":false,"manualOverride":{"citeprocText":"(Pothos and Busemeyer 2022; Kurniawati 2022)","isManuallyOverridden":false,"manualOverrideText":""},"mendeley":{"formattedCitation":"(Pothos and Busemeyer 2022; Kurniawati 2022)","plainTextFormattedCitation":"(Pothos and Busemeyer 2022; Kurniawati 2022)","previouslyFormattedCitation":"(Pothos and Busemeyer 2022; Kurniawati 2022)"},"properties":{"noteIndex":0},"schema":"https://github.com/citation-style-language/schema/raw/master/csl-citation.json"}</w:instrText>
             </w:r>
             <w:r>
               <w:fldChar w:fldCharType="separate"/>
@@ -20749,7 +20939,7 @@
               <w:fldChar w:fldCharType="begin"/>
             </w:r>
             <w:r>
-              <w:instrText xml:space="preserve">ADDIN CSL_CITATION {"citationID":"MENDELEY_CITATION_539","citationItems":[{"id":"ITEM-537","isTemporary":false,"itemData":{"DOI":"10.1038/s41598-025-28481-w","author":[{"family":"Quang","given":"Thinh Nguyen"},{"family":"Matsuyama","given":"Kosuke"},{"family":"Shimizu","given":"Keisuke"},{"family":"Sugano","given":"Hiroki"},{"family":"Kurimoto","given":"Eiji"},{"family":"Miki","given":"Masahiro"},{"family":"Suzuki","given":"Jumpei"},{"family":"Chen","given":"Ziyi"},{"family":"Waidyasooriya","given":"Hasitha Muthumala"},{"family":"Hariyama","given":"Masanori"},{"family":"Hitomi","given":"Masaru"},{"family":"Sawamura","given":"Kenta"},{"family":"Ohzeki","given":"Masayuki"}],"container-title":"Scientific Reports","id":"Quang2025","issued":{"date-parts":[[2025]]},"page":"44047","publisher":"Nature Publishing Group","title":"Quantum annealing-based route optimization for commercial AGV operating systems in large-scale logistics warehouses","type":"article-journal","volume":"15"}},{"id":"ITEM-538","isTemporary":false,"itemData":{"URL":"https://proceedings.mlr.press/v267/gerlach25a.html","author":[{"family":"Gerlach","given":"Thore"},{"family":"Lee","given":"Loong Kuan"},{"family":"Barbaresco","given":"Frederic"},{"family":"Piatkowski","given":"Nico"}],"collection-title":"Proceedings of machine learning research","container-title":"Proceedings of the 42nd international conference on machine learning","editor":[{"family":"Singh","given":"Aarti"},{"family":"Fazel","given":"Maryam"},{"family":"Hsu","given":"Daniel"},{"family":"Lacoste-Julien","given":"Simon"},{"family":"Berkenkamp","given":"Felix"},{"family":"Maharaj","given":"Tegan"},{"family":"Wagstaff","given":"Kiri"},{"family":"Zhu","given":"Jerry"}],"id":"Gerlach2025","issued":{"date-parts":[[2025]]},"page":"19161-19171","publisher":"PMLR","title":"Hybrid quantum-classical multi-agent pathfinding","type":"paper-conference","volume":"267"}},{"id":"ITEM-539","isTemporary":false,"itemData":{"DOI":"10.1126/sciadv.aav2372","author":[{"family":"Goto","given":"Hayato"},{"family":"Tatsumura","given":"Kosuke"},{"family":"Dixon","given":"Alexander R."}],"container-title":"Science Advances","id":"Goto2019","issue":"4","issued":{"date-parts":[[2019]]},"page":"eaav2372","publisher":"American Association for the Advancement of Science","title":"Combinatorial optimization by simulating adiabatic bifurcations in nonlinear Hamiltonian systems","type":"article-journal","volume":"5"}}],"isEdited":false,"manualOverride":{"citeprocText":"(Quang et al. 2025; Gerlach et al. 2025; Goto, Tatsumura, and Dixon 2019)","isManuallyOverridden":false,"manualOverrideText":""},"mendeley":{"formattedCitation":"(Quang et al. 2025; Gerlach et al. 2025; Goto, Tatsumura, and Dixon 2019)","plainTextFormattedCitation":"(Quang et al. 2025; Gerlach et al. 2025; Goto, Tatsumura, and Dixon 2019)","previouslyFormattedCitation":"(Quang et al. 2025; Gerlach et al. 2025; Goto, Tatsumura, and Dixon 2019)"},"properties":{"noteIndex":0},"schema":"https://github.com/citation-style-language/schema/raw/master/csl-citation.json"}</w:instrText>
+              <w:instrText xml:space="preserve">ADDIN CSL_CITATION {"citationID":"MENDELEY_CITATION_553","citationItems":[{"id":"ITEM-551","isTemporary":false,"itemData":{"DOI":"10.1038/s41598-025-28481-w","author":[{"family":"Quang","given":"Thinh Nguyen"},{"family":"Matsuyama","given":"Kosuke"},{"family":"Shimizu","given":"Keisuke"},{"family":"Sugano","given":"Hiroki"},{"family":"Kurimoto","given":"Eiji"},{"family":"Miki","given":"Masahiro"},{"family":"Suzuki","given":"Jumpei"},{"family":"Chen","given":"Ziyi"},{"family":"Waidyasooriya","given":"Hasitha Muthumala"},{"family":"Hariyama","given":"Masanori"},{"family":"Hitomi","given":"Masaru"},{"family":"Sawamura","given":"Kenta"},{"family":"Ohzeki","given":"Masayuki"}],"container-title":"Scientific Reports","id":"Quang2025","issued":{"date-parts":[[2025]]},"page":"44047","publisher":"Nature Publishing Group","title":"Quantum annealing-based route optimization for commercial AGV operating systems in large-scale logistics warehouses","type":"article-journal","volume":"15"}},{"id":"ITEM-552","isTemporary":false,"itemData":{"URL":"https://proceedings.mlr.press/v267/gerlach25a.html","author":[{"family":"Gerlach","given":"Thore"},{"family":"Lee","given":"Loong Kuan"},{"family":"Barbaresco","given":"Frederic"},{"family":"Piatkowski","given":"Nico"}],"collection-title":"Proceedings of machine learning research","container-title":"Proceedings of the 42nd international conference on machine learning","editor":[{"family":"Singh","given":"Aarti"},{"family":"Fazel","given":"Maryam"},{"family":"Hsu","given":"Daniel"},{"family":"Lacoste-Julien","given":"Simon"},{"family":"Berkenkamp","given":"Felix"},{"family":"Maharaj","given":"Tegan"},{"family":"Wagstaff","given":"Kiri"},{"family":"Zhu","given":"Jerry"}],"id":"Gerlach2025","issued":{"date-parts":[[2025]]},"page":"19161-19171","publisher":"PMLR","title":"Hybrid quantum-classical multi-agent pathfinding","type":"paper-conference","volume":"267"}},{"id":"ITEM-553","isTemporary":false,"itemData":{"DOI":"10.1126/sciadv.aav2372","author":[{"family":"Goto","given":"Hayato"},{"family":"Tatsumura","given":"Kosuke"},{"family":"Dixon","given":"Alexander R."}],"container-title":"Science Advances","id":"Goto2019","issue":"4","issued":{"date-parts":[[2019]]},"page":"eaav2372","publisher":"American Association for the Advancement of Science","title":"Combinatorial optimization by simulating adiabatic bifurcations in nonlinear Hamiltonian systems","type":"article-journal","volume":"5"}}],"isEdited":false,"manualOverride":{"citeprocText":"(Quang et al. 2025; Gerlach et al. 2025; Goto, Tatsumura, and Dixon 2019)","isManuallyOverridden":false,"manualOverrideText":""},"mendeley":{"formattedCitation":"(Quang et al. 2025; Gerlach et al. 2025; Goto, Tatsumura, and Dixon 2019)","plainTextFormattedCitation":"(Quang et al. 2025; Gerlach et al. 2025; Goto, Tatsumura, and Dixon 2019)","previouslyFormattedCitation":"(Quang et al. 2025; Gerlach et al. 2025; Goto, Tatsumura, and Dixon 2019)"},"properties":{"noteIndex":0},"schema":"https://github.com/citation-style-language/schema/raw/master/csl-citation.json"}</w:instrText>
             </w:r>
             <w:r>
               <w:fldChar w:fldCharType="separate"/>
@@ -20807,7 +20997,7 @@
               <w:fldChar w:fldCharType="begin"/>
             </w:r>
             <w:r>
-              <w:instrText xml:space="preserve">ADDIN CSL_CITATION {"citationID":"MENDELEY_CITATION_540","citationItems":[{"id":"ITEM-540","isTemporary":false,"itemData":{"DOI":"10.48550/arXiv.2505.17587","URL":"https://arxiv.org/abs/2505.17587","author":[{"family":"Conrad","given":"Andrew"},{"family":"Cochran","given":"Roderick"},{"family":"Sanchez-Rosales","given":"Daniel"},{"family":"Isaac","given":"Samantha"},{"family":"Javid","given":"Timur"},{"family":"Rezaei","given":"Tahereh"},{"family":"Schroeder","given":"A. J."},{"family":"Golba","given":"Grzegorz"},{"family":"Gutha","given":"Akash"},{"family":"Wilens","given":"Brian"},{"family":"Herndon","given":"Kyle"},{"family":"Hill","given":"Alex"},{"family":"Chapman","given":"Joseph"},{"family":"Call","given":"Ian"},{"family":"Szabo","given":"Joseph"},{"family":"Corrigan","given":"Aodhan"},{"family":"Kamin","given":"Lars"},{"family":"Lütkenhaus","given":"Norbert"},{"family":"Gauthier","given":"Daniel J."},{"family":"Kwiat","given":"Paul G."}],"id":"Conrad2025","issued":{"date-parts":[[2025]]},"title":"Drone- and vehicle-based quantum key distribution","type":""}}],"isEdited":false,"manualOverride":{"citeprocText":"(Conrad et al. 2025)","isManuallyOverridden":false,"manualOverrideText":""},"mendeley":{"formattedCitation":"(Conrad et al. 2025)","plainTextFormattedCitation":"(Conrad et al. 2025)","previouslyFormattedCitation":"(Conrad et al. 2025)"},"properties":{"noteIndex":0},"schema":"https://github.com/citation-style-language/schema/raw/master/csl-citation.json"}</w:instrText>
+              <w:instrText xml:space="preserve">ADDIN CSL_CITATION {"citationID":"MENDELEY_CITATION_554","citationItems":[{"id":"ITEM-554","isTemporary":false,"itemData":{"DOI":"10.48550/arXiv.2505.17587","URL":"https://arxiv.org/abs/2505.17587","author":[{"family":"Conrad","given":"Andrew"},{"family":"Cochran","given":"Roderick"},{"family":"Sanchez-Rosales","given":"Daniel"},{"family":"Isaac","given":"Samantha"},{"family":"Javid","given":"Timur"},{"family":"Rezaei","given":"Tahereh"},{"family":"Schroeder","given":"A. J."},{"family":"Golba","given":"Grzegorz"},{"family":"Gutha","given":"Akash"},{"family":"Wilens","given":"Brian"},{"family":"Herndon","given":"Kyle"},{"family":"Hill","given":"Alex"},{"family":"Chapman","given":"Joseph"},{"family":"Call","given":"Ian"},{"family":"Szabo","given":"Joseph"},{"family":"Corrigan","given":"Aodhan"},{"family":"Kamin","given":"Lars"},{"family":"Lütkenhaus","given":"Norbert"},{"family":"Gauthier","given":"Daniel J."},{"family":"Kwiat","given":"Paul G."}],"id":"Conrad2025","issued":{"date-parts":[[2025]]},"title":"Drone- and vehicle-based quantum key distribution","type":""}}],"isEdited":false,"manualOverride":{"citeprocText":"(Conrad et al. 2025)","isManuallyOverridden":false,"manualOverrideText":""},"mendeley":{"formattedCitation":"(Conrad et al. 2025)","plainTextFormattedCitation":"(Conrad et al. 2025)","previouslyFormattedCitation":"(Conrad et al. 2025)"},"properties":{"noteIndex":0},"schema":"https://github.com/citation-style-language/schema/raw/master/csl-citation.json"}</w:instrText>
             </w:r>
             <w:r>
               <w:fldChar w:fldCharType="separate"/>
@@ -20869,7 +21059,7 @@
               <w:fldChar w:fldCharType="begin"/>
             </w:r>
             <w:r>
-              <w:instrText xml:space="preserve">ADDIN CSL_CITATION {"citationID":"MENDELEY_CITATION_542","citationItems":[{"id":"ITEM-541","isTemporary":false,"itemData":{"DOI":"10.1109/ACCESS.2024.3417808","author":[{"family":"Hohenfeld","given":"Hans"},{"family":"Heimann","given":"Dirk"},{"family":"Wiebe","given":"Felix"},{"family":"Kirchner","given":"Frank"}],"container-title":"IEEE Access","id":"Hohenfeld2024","issued":{"date-parts":[[2024]]},"page":"87217-87236","publisher":"IEEE","title":"Quantum deep reinforcement learning for robot navigation tasks","type":"article-journal","volume":"12"}},{"id":"ITEM-542","isTemporary":false,"itemData":{"DOI":"10.1177/0278364913495721","author":[{"family":"Kober","given":"Jens"},{"family":"Bagnell","given":"J. Andrew"},{"family":"Peters","given":"Jan"}],"container-title":"The International Journal of Robotics Research","id":"Kober2013","issue":"11","issued":{"date-parts":[[2013]]},"page":"1238-1274","publisher":"SAGE Publications","title":"Reinforcement learning in robotics: A survey","title-short":"Reinforcement learning in robotics","type":"article-journal","volume":"32"}}],"isEdited":false,"manualOverride":{"citeprocText":"(Hohenfeld et al. 2024; Kober, Bagnell, and Peters 2013)","isManuallyOverridden":false,"manualOverrideText":""},"mendeley":{"formattedCitation":"(Hohenfeld et al. 2024; Kober, Bagnell, and Peters 2013)","plainTextFormattedCitation":"(Hohenfeld et al. 2024; Kober, Bagnell, and Peters 2013)","previouslyFormattedCitation":"(Hohenfeld et al. 2024; Kober, Bagnell, and Peters 2013)"},"properties":{"noteIndex":0},"schema":"https://github.com/citation-style-language/schema/raw/master/csl-citation.json"}</w:instrText>
+              <w:instrText xml:space="preserve">ADDIN CSL_CITATION {"citationID":"MENDELEY_CITATION_556","citationItems":[{"id":"ITEM-555","isTemporary":false,"itemData":{"DOI":"10.1109/ACCESS.2024.3417808","author":[{"family":"Hohenfeld","given":"Hans"},{"family":"Heimann","given":"Dirk"},{"family":"Wiebe","given":"Felix"},{"family":"Kirchner","given":"Frank"}],"container-title":"IEEE Access","id":"Hohenfeld2024","issued":{"date-parts":[[2024]]},"page":"87217-87236","publisher":"IEEE","title":"Quantum deep reinforcement learning for robot navigation tasks","type":"article-journal","volume":"12"}},{"id":"ITEM-556","isTemporary":false,"itemData":{"DOI":"10.1177/0278364913495721","author":[{"family":"Kober","given":"Jens"},{"family":"Bagnell","given":"J. Andrew"},{"family":"Peters","given":"Jan"}],"container-title":"The International Journal of Robotics Research","id":"Kober2013","issue":"11","issued":{"date-parts":[[2013]]},"page":"1238-1274","publisher":"SAGE Publications","title":"Reinforcement learning in robotics: A survey","title-short":"Reinforcement learning in robotics","type":"article-journal","volume":"32"}}],"isEdited":false,"manualOverride":{"citeprocText":"(Hohenfeld et al. 2024; Kober, Bagnell, and Peters 2013)","isManuallyOverridden":false,"manualOverrideText":""},"mendeley":{"formattedCitation":"(Hohenfeld et al. 2024; Kober, Bagnell, and Peters 2013)","plainTextFormattedCitation":"(Hohenfeld et al. 2024; Kober, Bagnell, and Peters 2013)","previouslyFormattedCitation":"(Hohenfeld et al. 2024; Kober, Bagnell, and Peters 2013)"},"properties":{"noteIndex":0},"schema":"https://github.com/citation-style-language/schema/raw/master/csl-citation.json"}</w:instrText>
             </w:r>
             <w:r>
               <w:fldChar w:fldCharType="separate"/>
@@ -20927,7 +21117,7 @@
               <w:fldChar w:fldCharType="begin"/>
             </w:r>
             <w:r>
-              <w:instrText xml:space="preserve">ADDIN CSL_CITATION {"citationID":"MENDELEY_CITATION_543","citationItems":[{"id":"ITEM-543","isTemporary":false,"itemData":{"DOI":"10.1103/PhysRevLett.127.100501","author":[{"family":"Córcoles","given":"Antonio D."},{"family":"Takita","given":"Maika"},{"family":"Inoue","given":"Ken"},{"family":"Lekuch","given":"Scott"},{"family":"Minev","given":"Zlatko K."},{"family":"Chow","given":"Jerry M."},{"family":"Gambetta","given":"Jay M."}],"container-title":"Physical Review Letters","id":"Corcoles2021","issue":"10","issued":{"date-parts":[[2021]]},"page":"100501","publisher":"American Physical Society","title":"Exploiting dynamic quantum circuits in a quantum algorithm with superconducting qubits","type":"article-journal","volume":"127"}}],"isEdited":false,"manualOverride":{"citeprocText":"(Córcoles et al. 2021)","isManuallyOverridden":false,"manualOverrideText":""},"mendeley":{"formattedCitation":"(Córcoles et al. 2021)","plainTextFormattedCitation":"(Córcoles et al. 2021)","previouslyFormattedCitation":"(Córcoles et al. 2021)"},"properties":{"noteIndex":0},"schema":"https://github.com/citation-style-language/schema/raw/master/csl-citation.json"}</w:instrText>
+              <w:instrText xml:space="preserve">ADDIN CSL_CITATION {"citationID":"MENDELEY_CITATION_557","citationItems":[{"id":"ITEM-557","isTemporary":false,"itemData":{"DOI":"10.1103/PhysRevLett.127.100501","author":[{"family":"Córcoles","given":"Antonio D."},{"family":"Takita","given":"Maika"},{"family":"Inoue","given":"Ken"},{"family":"Lekuch","given":"Scott"},{"family":"Minev","given":"Zlatko K."},{"family":"Chow","given":"Jerry M."},{"family":"Gambetta","given":"Jay M."}],"container-title":"Physical Review Letters","id":"Corcoles2021","issue":"10","issued":{"date-parts":[[2021]]},"page":"100501","publisher":"American Physical Society","title":"Exploiting dynamic quantum circuits in a quantum algorithm with superconducting qubits","type":"article-journal","volume":"127"}}],"isEdited":false,"manualOverride":{"citeprocText":"(Córcoles et al. 2021)","isManuallyOverridden":false,"manualOverrideText":""},"mendeley":{"formattedCitation":"(Córcoles et al. 2021)","plainTextFormattedCitation":"(Córcoles et al. 2021)","previouslyFormattedCitation":"(Córcoles et al. 2021)"},"properties":{"noteIndex":0},"schema":"https://github.com/citation-style-language/schema/raw/master/csl-citation.json"}</w:instrText>
             </w:r>
             <w:r>
               <w:fldChar w:fldCharType="separate"/>
@@ -20985,7 +21175,7 @@
               <w:fldChar w:fldCharType="begin"/>
             </w:r>
             <w:r>
-              <w:instrText xml:space="preserve">ADDIN CSL_CITATION {"citationID":"MENDELEY_CITATION_545","citationItems":[{"id":"ITEM-544","isTemporary":false,"itemData":{"DOI":"10.3390/a12020034","author":[{"family":"Hadfield","given":"Stuart"},{"family":"Wang","given":"Zhihui"},{"family":"O’Gorman","given":"Bryan"},{"family":"Rieffel","given":"Eleanor G."},{"family":"Venturelli","given":"Davide"},{"family":"Biswas","given":"Rupak"}],"container-title":"Algorithms","id":"Hadfield2019","issue":"2","issued":{"date-parts":[[2019]]},"page":"34","publisher":"MDPI","title":"From the quantum approximate optimization algorithm to a quantum alternating operator ansatz","type":"article-journal","volume":"12"}},{"id":"ITEM-545","isTemporary":false,"itemData":{"DOI":"10.1103/PhysRevX.10.021067","author":[{"family":"Zhou","given":"Leo"},{"family":"Wang","given":"Sheng-Tao"},{"family":"Choi","given":"Soonwon"},{"family":"Pichler","given":"Hannes"},{"family":"Lukin","given":"Mikhail D."}],"container-title":"Physical Review X","id":"Zhou2020","issue":"2","issued":{"date-parts":[[2020]]},"page":"021067","publisher":"American Physical Society","title":"Quantum approximate optimization algorithm: Performance, mechanism, and implementation on near-term devices","title-short":"Quantum approximate optimization algorithm","type":"article-journal","volume":"10"}}],"isEdited":false,"manualOverride":{"citeprocText":"(Hadfield et al. 2019; Zhou et al. 2020)","isManuallyOverridden":false,"manualOverrideText":""},"mendeley":{"formattedCitation":"(Hadfield et al. 2019; Zhou et al. 2020)","plainTextFormattedCitation":"(Hadfield et al. 2019; Zhou et al. 2020)","previouslyFormattedCitation":"(Hadfield et al. 2019; Zhou et al. 2020)"},"properties":{"noteIndex":0},"schema":"https://github.com/citation-style-language/schema/raw/master/csl-citation.json"}</w:instrText>
+              <w:instrText xml:space="preserve">ADDIN CSL_CITATION {"citationID":"MENDELEY_CITATION_559","citationItems":[{"id":"ITEM-558","isTemporary":false,"itemData":{"DOI":"10.3390/a12020034","author":[{"family":"Hadfield","given":"Stuart"},{"family":"Wang","given":"Zhihui"},{"family":"O’Gorman","given":"Bryan"},{"family":"Rieffel","given":"Eleanor G."},{"family":"Venturelli","given":"Davide"},{"family":"Biswas","given":"Rupak"}],"container-title":"Algorithms","id":"Hadfield2019","issue":"2","issued":{"date-parts":[[2019]]},"page":"34","publisher":"MDPI","title":"From the quantum approximate optimization algorithm to a quantum alternating operator ansatz","type":"article-journal","volume":"12"}},{"id":"ITEM-559","isTemporary":false,"itemData":{"DOI":"10.1103/PhysRevX.10.021067","author":[{"family":"Zhou","given":"Leo"},{"family":"Wang","given":"Sheng-Tao"},{"family":"Choi","given":"Soonwon"},{"family":"Pichler","given":"Hannes"},{"family":"Lukin","given":"Mikhail D."}],"container-title":"Physical Review X","id":"Zhou2020","issue":"2","issued":{"date-parts":[[2020]]},"page":"021067","publisher":"American Physical Society","title":"Quantum approximate optimization algorithm: Performance, mechanism, and implementation on near-term devices","title-short":"Quantum approximate optimization algorithm","type":"article-journal","volume":"10"}}],"isEdited":false,"manualOverride":{"citeprocText":"(Hadfield et al. 2019; Zhou et al. 2020)","isManuallyOverridden":false,"manualOverrideText":""},"mendeley":{"formattedCitation":"(Hadfield et al. 2019; Zhou et al. 2020)","plainTextFormattedCitation":"(Hadfield et al. 2019; Zhou et al. 2020)","previouslyFormattedCitation":"(Hadfield et al. 2019; Zhou et al. 2020)"},"properties":{"noteIndex":0},"schema":"https://github.com/citation-style-language/schema/raw/master/csl-citation.json"}</w:instrText>
             </w:r>
             <w:r>
               <w:fldChar w:fldCharType="separate"/>
@@ -21047,7 +21237,7 @@
               <w:fldChar w:fldCharType="begin"/>
             </w:r>
             <w:r>
-              <w:instrText xml:space="preserve">ADDIN CSL_CITATION {"citationID":"MENDELEY_CITATION_546","citationItems":[{"id":"ITEM-546","isTemporary":false,"itemData":{"DOI":"10.1098/rspa.2015.0301","author":[{"family":"Montanaro","given":"Ashley"}],"container-title":"Proceedings of the Royal Society A: Mathematical, Physical and Engineering Sciences","id":"Montanaro2015","issue":"2181","issued":{"date-parts":[[2015]]},"page":"20150301","publisher":"The Royal Society","title":"Quantum speedup of Monte Carlo methods","type":"article-journal","volume":"471"}}],"isEdited":false,"manualOverride":{"citeprocText":"(Montanaro 2015)","isManuallyOverridden":false,"manualOverrideText":""},"mendeley":{"formattedCitation":"(Montanaro 2015)","plainTextFormattedCitation":"(Montanaro 2015)","previouslyFormattedCitation":"(Montanaro 2015)"},"properties":{"noteIndex":0},"schema":"https://github.com/citation-style-language/schema/raw/master/csl-citation.json"}</w:instrText>
+              <w:instrText xml:space="preserve">ADDIN CSL_CITATION {"citationID":"MENDELEY_CITATION_560","citationItems":[{"id":"ITEM-560","isTemporary":false,"itemData":{"DOI":"10.1098/rspa.2015.0301","author":[{"family":"Montanaro","given":"Ashley"}],"container-title":"Proceedings of the Royal Society A: Mathematical, Physical and Engineering Sciences","id":"Montanaro2015","issue":"2181","issued":{"date-parts":[[2015]]},"page":"20150301","publisher":"The Royal Society","title":"Quantum speedup of Monte Carlo methods","type":"article-journal","volume":"471"}}],"isEdited":false,"manualOverride":{"citeprocText":"(Montanaro 2015)","isManuallyOverridden":false,"manualOverrideText":""},"mendeley":{"formattedCitation":"(Montanaro 2015)","plainTextFormattedCitation":"(Montanaro 2015)","previouslyFormattedCitation":"(Montanaro 2015)"},"properties":{"noteIndex":0},"schema":"https://github.com/citation-style-language/schema/raw/master/csl-citation.json"}</w:instrText>
             </w:r>
             <w:r>
               <w:fldChar w:fldCharType="separate"/>
@@ -21105,7 +21295,7 @@
               <w:fldChar w:fldCharType="begin"/>
             </w:r>
             <w:r>
-              <w:instrText xml:space="preserve">ADDIN CSL_CITATION {"citationID":"MENDELEY_CITATION_548","citationItems":[{"id":"ITEM-547","isTemporary":false,"itemData":{"DOI":"10.1145/3445814.3446758","author":[{"family":"Tang","given":"Wei"},{"family":"Tomesh","given":"Teague"},{"family":"Suchara","given":"Martin"},{"family":"Larson","given":"Jeffrey"},{"family":"Martonosi","given":"Margaret"}],"container-title":"Proceedings of the 26th ACM international conference on architectural support for programming languages and operating systems (ASPLOS ’21)","id":"Tang2021","issued":{"date-parts":[[2021]]},"page":"473-486","publisher":"Association for Computing Machinery","publisher-place":"New York, NY, USA","title":"CutQC: Using small quantum computers for large quantum circuit evaluations","title-short":"CutQC","type":"paper-conference"}},{"id":"ITEM-548","isTemporary":false,"itemData":{"DOI":"10.1109/ICDCS54860.2022.00151","author":[{"family":"Yun","given":"Won Joon"},{"family":"Kwak","given":"Yunseok"},{"family":"Kim","given":"Jae Pyoung"},{"family":"Cho","given":"Hyunhee"},{"family":"Jung","given":"Soyi"},{"family":"Park","given":"Jihong"},{"family":"Kim","given":"Joongheon"}],"container-title":"Proceedings of the 2022 IEEE 42nd international conference on distributed computing systems (ICDCS)","id":"Yun2022","issued":{"date-parts":[[2022]]},"page":"1332-1335","publisher":"IEEE","title":"Quantum multi-agent reinforcement learning via variational quantum circuit design","type":"paper-conference"}}],"isEdited":false,"manualOverride":{"citeprocText":"(W. Tang et al. 2021; Yun et al. 2022)","isManuallyOverridden":false,"manualOverrideText":""},"mendeley":{"formattedCitation":"(W. Tang et al. 2021; Yun et al. 2022)","plainTextFormattedCitation":"(W. Tang et al. 2021; Yun et al. 2022)","previouslyFormattedCitation":"(W. Tang et al. 2021; Yun et al. 2022)"},"properties":{"noteIndex":0},"schema":"https://github.com/citation-style-language/schema/raw/master/csl-citation.json"}</w:instrText>
+              <w:instrText xml:space="preserve">ADDIN CSL_CITATION {"citationID":"MENDELEY_CITATION_562","citationItems":[{"id":"ITEM-561","isTemporary":false,"itemData":{"DOI":"10.1145/3445814.3446758","author":[{"family":"Tang","given":"Wei"},{"family":"Tomesh","given":"Teague"},{"family":"Suchara","given":"Martin"},{"family":"Larson","given":"Jeffrey"},{"family":"Martonosi","given":"Margaret"}],"container-title":"Proceedings of the 26th ACM international conference on architectural support for programming languages and operating systems (ASPLOS ’21)","id":"Tang2021","issued":{"date-parts":[[2021]]},"page":"473-486","publisher":"Association for Computing Machinery","publisher-place":"New York, NY, USA","title":"CutQC: Using small quantum computers for large quantum circuit evaluations","title-short":"CutQC","type":"paper-conference"}},{"id":"ITEM-562","isTemporary":false,"itemData":{"DOI":"10.1109/ICDCS54860.2022.00151","author":[{"family":"Yun","given":"Won Joon"},{"family":"Kwak","given":"Yunseok"},{"family":"Kim","given":"Jae Pyoung"},{"family":"Cho","given":"Hyunhee"},{"family":"Jung","given":"Soyi"},{"family":"Park","given":"Jihong"},{"family":"Kim","given":"Joongheon"}],"container-title":"Proceedings of the 2022 IEEE 42nd international conference on distributed computing systems (ICDCS)","id":"Yun2022","issued":{"date-parts":[[2022]]},"page":"1332-1335","publisher":"IEEE","title":"Quantum multi-agent reinforcement learning via variational quantum circuit design","type":"paper-conference"}}],"isEdited":false,"manualOverride":{"citeprocText":"(W. Tang et al. 2021; Yun et al. 2022)","isManuallyOverridden":false,"manualOverrideText":""},"mendeley":{"formattedCitation":"(W. Tang et al. 2021; Yun et al. 2022)","plainTextFormattedCitation":"(W. Tang et al. 2021; Yun et al. 2022)","previouslyFormattedCitation":"(W. Tang et al. 2021; Yun et al. 2022)"},"properties":{"noteIndex":0},"schema":"https://github.com/citation-style-language/schema/raw/master/csl-citation.json"}</w:instrText>
             </w:r>
             <w:r>
               <w:fldChar w:fldCharType="separate"/>
@@ -21163,7 +21353,7 @@
               <w:fldChar w:fldCharType="begin"/>
             </w:r>
             <w:r>
-              <w:instrText xml:space="preserve">ADDIN CSL_CITATION {"citationID":"MENDELEY_CITATION_550","citationItems":[{"id":"ITEM-549","isTemporary":false,"itemData":{"DOI":"10.1103/PhysRevResearch.4.023019","author":[{"family":"Kim","given":"Isaac H."},{"family":"Liu","given":"Ye-Hua"},{"family":"Pallister","given":"Sam"},{"family":"Pol","given":"William"},{"family":"Roberts","given":"Sam"},{"family":"Lee","given":"Eunseok"}],"container-title":"Physical Review Research","id":"Kim2022","issue":"2","issued":{"date-parts":[[2022]]},"page":"023019","publisher":"American Physical Society","title":"Fault-tolerant resource estimate for quantum chemical simulations: Case study on Li-ion battery electrolyte molecules","title-short":"Fault-tolerant resource estimate for quantum chemical simulations","type":"article-journal","volume":"4"}},{"id":"ITEM-550","isTemporary":false,"itemData":{"DOI":"10.1063/5.0044068","author":[{"family":"Rice","given":"Julia E."},{"family":"Gujarati","given":"Tanvi P."},{"family":"Motta","given":"Mario"},{"family":"Takeshita","given":"Tyler Y."},{"family":"Lee","given":"Eunseok"},{"family":"Latone","given":"Joseph A."},{"family":"Garcia","given":"Jeannette M."}],"container-title":"The Journal of Chemical Physics","id":"Rice2021","issue":"13","issued":{"date-parts":[[2021]]},"page":"134115","publisher":"AIP Publishing","title":"Quantum computation of dominant products in lithium–sulfur batteries","type":"article-journal","volume":"154"}}],"isEdited":false,"manualOverride":{"citeprocText":"(Kim et al. 2022; Rice et al. 2021)","isManuallyOverridden":false,"manualOverrideText":""},"mendeley":{"formattedCitation":"(Kim et al. 2022; Rice et al. 2021)","plainTextFormattedCitation":"(Kim et al. 2022; Rice et al. 2021)","previouslyFormattedCitation":"(Kim et al. 2022; Rice et al. 2021)"},"properties":{"noteIndex":0},"schema":"https://github.com/citation-style-language/schema/raw/master/csl-citation.json"}</w:instrText>
+              <w:instrText xml:space="preserve">ADDIN CSL_CITATION {"citationID":"MENDELEY_CITATION_564","citationItems":[{"id":"ITEM-563","isTemporary":false,"itemData":{"DOI":"10.1103/PhysRevResearch.4.023019","author":[{"family":"Kim","given":"Isaac H."},{"family":"Liu","given":"Ye-Hua"},{"family":"Pallister","given":"Sam"},{"family":"Pol","given":"William"},{"family":"Roberts","given":"Sam"},{"family":"Lee","given":"Eunseok"}],"container-title":"Physical Review Research","id":"Kim2022","issue":"2","issued":{"date-parts":[[2022]]},"page":"023019","publisher":"American Physical Society","title":"Fault-tolerant resource estimate for quantum chemical simulations: Case study on Li-ion battery electrolyte molecules","title-short":"Fault-tolerant resource estimate for quantum chemical simulations","type":"article-journal","volume":"4"}},{"id":"ITEM-564","isTemporary":false,"itemData":{"DOI":"10.1063/5.0044068","author":[{"family":"Rice","given":"Julia E."},{"family":"Gujarati","given":"Tanvi P."},{"family":"Motta","given":"Mario"},{"family":"Takeshita","given":"Tyler Y."},{"family":"Lee","given":"Eunseok"},{"family":"Latone","given":"Joseph A."},{"family":"Garcia","given":"Jeannette M."}],"container-title":"The Journal of Chemical Physics","id":"Rice2021","issue":"13","issued":{"date-parts":[[2021]]},"page":"134115","publisher":"AIP Publishing","title":"Quantum computation of dominant products in lithium–sulfur batteries","type":"article-journal","volume":"154"}}],"isEdited":false,"manualOverride":{"citeprocText":"(Kim et al. 2022; Rice et al. 2021)","isManuallyOverridden":false,"manualOverrideText":""},"mendeley":{"formattedCitation":"(Kim et al. 2022; Rice et al. 2021)","plainTextFormattedCitation":"(Kim et al. 2022; Rice et al. 2021)","previouslyFormattedCitation":"(Kim et al. 2022; Rice et al. 2021)"},"properties":{"noteIndex":0},"schema":"https://github.com/citation-style-language/schema/raw/master/csl-citation.json"}</w:instrText>
             </w:r>
             <w:r>
               <w:fldChar w:fldCharType="separate"/>
@@ -21205,7 +21395,7 @@
         <w:pStyle w:val="FirstParagraph"/>
       </w:pPr>
       <w:r>
-        <w:t xml:space="preserve">This survey of 70 primary studies, set against 96 foundational works, found that quantum robotics is conceptually rich but empirically early. Quantum optimization is the most hardware-tested area, from 200-robot routing on annealers to decomposed routing of 1,000-AGV fleets, but classical and quantum-inspired solvers match or beat it in head-to-head comparisons. Quantum search and planning remain simulated. Quantum reinforcement learning reliably reduces parameter counts but has not been shown to produce better or faster policies, and supervised QML faces barren plateaus and dequantization. Quantum sensing, by contrast, has delivered field-validated navigation gains, and QKD already links drones and vehicles in motion. The robotics results that have been validated physically are mostly quantum-inspired and run on classical hardware.</w:t>
+        <w:t xml:space="preserve">This survey of 72 primary studies, set against 94 foundational works, found that quantum robotics is conceptually rich but empirically early. Quantum optimization is the most hardware-tested area, from 200-robot routing on annealers to decomposed routing of 1,000-AGV fleets, but classical and quantum-inspired solvers match or beat it in head-to-head comparisons. Quantum search and planning remain simulated. Quantum reinforcement learning reliably reduces parameter counts but has not been shown to produce better or faster policies, and supervised QML faces barren plateaus and dequantization. Quantum sensing, by contrast, has delivered field-validated navigation gains, and QKD already links drones and vehicles in motion. The robotics results that have been validated physically are mostly quantum-inspired and run on classical hardware.</w:t>
       </w:r>
     </w:p>
     <w:p>
@@ -21259,7 +21449,7 @@
         <w:pStyle w:val="FirstParagraph"/>
       </w:pPr>
       <w:r>
-        <w:t xml:space="preserve">The full data-extraction table for the 70 primary studies, the quality-assessment rubric, the PRISMA 2020 checklist, and the search strings are provided as online supplementary material (</w:t>
+        <w:t xml:space="preserve">The full data-extraction table for the 72 primary studies, the quality-assessment rubric, the PRISMA 2020 checklist, and the search strings are provided as online supplementary material (</w:t>
       </w:r>
       <w:r>
         <w:rPr>

</xml_diff>

<commit_message>
Survey 1: remove the acknowledgments section
Remove the acks environment (funding placeholder and statements)
from main.tex, the rebuilt PDF, the Word manuscript and the zip package.
The PRISMA 'Support' row in the supplement (LaTeX and Word) now asks for
a funding statement instead of pointing to the acknowledgments.
</commit_message>
<xml_diff>
--- a/github/k/Survey1_ACM_CSUR_Manuscript.docx
+++ b/github/k/Survey1_ACM_CSUR_Manuscript.docx
@@ -21407,13 +21407,13 @@
       </w:r>
     </w:p>
     <w:bookmarkEnd w:id="141"/>
-    <w:bookmarkStart w:id="142" w:name="acknowledgments"/>
+    <w:bookmarkStart w:id="142" w:name="data-availability"/>
     <w:p>
       <w:pPr>
         <w:pStyle w:val="Heading1"/>
       </w:pPr>
       <w:r>
-        <w:t xml:space="preserve">Acknowledgments</w:t>
+        <w:t xml:space="preserve">Data Availability</w:t>
       </w:r>
     </w:p>
     <w:p>
@@ -21421,73 +21421,45 @@
         <w:pStyle w:val="FirstParagraph"/>
       </w:pPr>
       <w:r>
-        <w:rPr>
-          <w:bCs/>
-          <w:b/>
-        </w:rPr>
-        <w:t xml:space="preserve">[FILL: Acknowledgments and funding: grant numbers, funding bodies, and people to thank.]</w:t>
-      </w:r>
-      <w:r>
-        <w:t xml:space="preserve"> </w:t>
-      </w:r>
-      <w:r>
-        <w:t xml:space="preserve">The authors used a generative AI assistant (Claude, Anthropic) to help draft, edit, and typeset parts of this manuscript and to check references and internal consistency. The authors reviewed and revised all content and take full responsibility for it.</w:t>
+        <w:t xml:space="preserve">The full data-extraction table for the 72 primary studies, the quality-assessment rubric, the PRISMA 2020 checklist, and the search strings are provided as online supplementary material (</w:t>
+      </w:r>
+      <w:r>
+        <w:rPr>
+          <w:rStyle w:val="VerbatimChar"/>
+        </w:rPr>
+        <w:t xml:space="preserve">supplement.pdf</w:t>
+      </w:r>
+      <w:r>
+        <w:t xml:space="preserve"> </w:t>
+      </w:r>
+      <w:r>
+        <w:t xml:space="preserve">and</w:t>
+      </w:r>
+      <w:r>
+        <w:t xml:space="preserve"> </w:t>
+      </w:r>
+      <w:r>
+        <w:rPr>
+          <w:rStyle w:val="VerbatimChar"/>
+        </w:rPr>
+        <w:t xml:space="preserve">extraction_table.csv</w:t>
+      </w:r>
+      <w:r>
+        <w:t xml:space="preserve">).</w:t>
       </w:r>
     </w:p>
     <w:bookmarkEnd w:id="142"/>
-    <w:bookmarkStart w:id="143" w:name="data-availability"/>
+    <w:bookmarkStart w:id="474" w:name="bibliography"/>
     <w:p>
       <w:pPr>
         <w:pStyle w:val="Heading1"/>
       </w:pPr>
       <w:r>
-        <w:t xml:space="preserve">Data Availability</w:t>
-      </w:r>
-    </w:p>
-    <w:p>
-      <w:pPr>
-        <w:pStyle w:val="FirstParagraph"/>
-      </w:pPr>
-      <w:r>
-        <w:t xml:space="preserve">The full data-extraction table for the 72 primary studies, the quality-assessment rubric, the PRISMA 2020 checklist, and the search strings are provided as online supplementary material (</w:t>
-      </w:r>
-      <w:r>
-        <w:rPr>
-          <w:rStyle w:val="VerbatimChar"/>
-        </w:rPr>
-        <w:t xml:space="preserve">supplement.pdf</w:t>
-      </w:r>
-      <w:r>
-        <w:t xml:space="preserve"> </w:t>
-      </w:r>
-      <w:r>
-        <w:t xml:space="preserve">and</w:t>
-      </w:r>
-      <w:r>
-        <w:t xml:space="preserve"> </w:t>
-      </w:r>
-      <w:r>
-        <w:rPr>
-          <w:rStyle w:val="VerbatimChar"/>
-        </w:rPr>
-        <w:t xml:space="preserve">extraction_table.csv</w:t>
-      </w:r>
-      <w:r>
-        <w:t xml:space="preserve">).</w:t>
-      </w:r>
-    </w:p>
-    <w:bookmarkEnd w:id="143"/>
-    <w:bookmarkStart w:id="475" w:name="bibliography"/>
-    <w:p>
-      <w:pPr>
-        <w:pStyle w:val="Heading1"/>
-      </w:pPr>
-      <w:r>
         <w:t xml:space="preserve">References</w:t>
       </w:r>
     </w:p>
-    <w:bookmarkStart w:id="474" w:name="refs"/>
-    <w:bookmarkStart w:id="145" w:name="ref-Aaronson2015"/>
+    <w:bookmarkStart w:id="473" w:name="refs"/>
+    <w:bookmarkStart w:id="144" w:name="ref-Aaronson2015"/>
     <w:p>
       <w:pPr>
         <w:pStyle w:val="Bibliography"/>
@@ -21529,7 +21501,7 @@
       <w:r>
         <w:t xml:space="preserve"> </w:t>
       </w:r>
-      <w:hyperlink r:id="rId144">
+      <w:hyperlink r:id="rId143">
         <w:r>
           <w:rPr>
             <w:rStyle w:val="Hyperlink"/>
@@ -21541,8 +21513,8 @@
         <w:t xml:space="preserve">.</w:t>
       </w:r>
     </w:p>
-    <w:bookmarkEnd w:id="145"/>
-    <w:bookmarkStart w:id="147" w:name="ref-Acuto2022"/>
+    <w:bookmarkEnd w:id="144"/>
+    <w:bookmarkStart w:id="146" w:name="ref-Acuto2022"/>
     <w:p>
       <w:pPr>
         <w:pStyle w:val="Bibliography"/>
@@ -21559,7 +21531,7 @@
       <w:r>
         <w:t xml:space="preserve"> </w:t>
       </w:r>
-      <w:hyperlink r:id="rId146">
+      <w:hyperlink r:id="rId145">
         <w:r>
           <w:rPr>
             <w:rStyle w:val="Hyperlink"/>
@@ -21571,8 +21543,8 @@
         <w:t xml:space="preserve">.</w:t>
       </w:r>
     </w:p>
-    <w:bookmarkEnd w:id="147"/>
-    <w:bookmarkStart w:id="149" w:name="ref-Altrabulsi2026"/>
+    <w:bookmarkEnd w:id="146"/>
+    <w:bookmarkStart w:id="148" w:name="ref-Altrabulsi2026"/>
     <w:p>
       <w:pPr>
         <w:pStyle w:val="Bibliography"/>
@@ -21595,7 +21567,7 @@
       <w:r>
         <w:t xml:space="preserve"> </w:t>
       </w:r>
-      <w:hyperlink r:id="rId148">
+      <w:hyperlink r:id="rId147">
         <w:r>
           <w:rPr>
             <w:rStyle w:val="Hyperlink"/>
@@ -21607,8 +21579,8 @@
         <w:t xml:space="preserve">.</w:t>
       </w:r>
     </w:p>
-    <w:bookmarkEnd w:id="149"/>
-    <w:bookmarkStart w:id="151" w:name="ref-Antero2025"/>
+    <w:bookmarkEnd w:id="148"/>
+    <w:bookmarkStart w:id="150" w:name="ref-Antero2025"/>
     <w:p>
       <w:pPr>
         <w:pStyle w:val="Bibliography"/>
@@ -21641,7 +21613,7 @@
       <w:r>
         <w:t xml:space="preserve"> </w:t>
       </w:r>
-      <w:hyperlink r:id="rId150">
+      <w:hyperlink r:id="rId149">
         <w:r>
           <w:rPr>
             <w:rStyle w:val="Hyperlink"/>
@@ -21653,8 +21625,8 @@
         <w:t xml:space="preserve">.</w:t>
       </w:r>
     </w:p>
-    <w:bookmarkEnd w:id="151"/>
-    <w:bookmarkStart w:id="153" w:name="ref-Arute2019"/>
+    <w:bookmarkEnd w:id="150"/>
+    <w:bookmarkStart w:id="152" w:name="ref-Arute2019"/>
     <w:p>
       <w:pPr>
         <w:pStyle w:val="Bibliography"/>
@@ -21687,7 +21659,7 @@
       <w:r>
         <w:t xml:space="preserve"> </w:t>
       </w:r>
-      <w:hyperlink r:id="rId152">
+      <w:hyperlink r:id="rId151">
         <w:r>
           <w:rPr>
             <w:rStyle w:val="Hyperlink"/>
@@ -21699,8 +21671,8 @@
         <w:t xml:space="preserve">.</w:t>
       </w:r>
     </w:p>
-    <w:bookmarkEnd w:id="153"/>
-    <w:bookmarkStart w:id="155" w:name="ref-AtchadeAdelomou2021"/>
+    <w:bookmarkEnd w:id="152"/>
+    <w:bookmarkStart w:id="154" w:name="ref-AtchadeAdelomou2021"/>
     <w:p>
       <w:pPr>
         <w:pStyle w:val="Bibliography"/>
@@ -21739,7 +21711,7 @@
       <w:r>
         <w:t xml:space="preserve"> </w:t>
       </w:r>
-      <w:hyperlink r:id="rId154">
+      <w:hyperlink r:id="rId153">
         <w:r>
           <w:rPr>
             <w:rStyle w:val="Hyperlink"/>
@@ -21751,8 +21723,8 @@
         <w:t xml:space="preserve">.</w:t>
       </w:r>
     </w:p>
-    <w:bookmarkEnd w:id="155"/>
-    <w:bookmarkStart w:id="157" w:name="ref-Bang2026"/>
+    <w:bookmarkEnd w:id="154"/>
+    <w:bookmarkStart w:id="156" w:name="ref-Bang2026"/>
     <w:p>
       <w:pPr>
         <w:pStyle w:val="Bibliography"/>
@@ -21781,7 +21753,7 @@
       <w:r>
         <w:t xml:space="preserve"> </w:t>
       </w:r>
-      <w:hyperlink r:id="rId156">
+      <w:hyperlink r:id="rId155">
         <w:r>
           <w:rPr>
             <w:rStyle w:val="Hyperlink"/>
@@ -21793,8 +21765,8 @@
         <w:t xml:space="preserve">.</w:t>
       </w:r>
     </w:p>
-    <w:bookmarkEnd w:id="157"/>
-    <w:bookmarkStart w:id="159" w:name="ref-Barkoutsos2020"/>
+    <w:bookmarkEnd w:id="156"/>
+    <w:bookmarkStart w:id="158" w:name="ref-Barkoutsos2020"/>
     <w:p>
       <w:pPr>
         <w:pStyle w:val="Bibliography"/>
@@ -21836,7 +21808,7 @@
       <w:r>
         <w:t xml:space="preserve"> </w:t>
       </w:r>
-      <w:hyperlink r:id="rId158">
+      <w:hyperlink r:id="rId157">
         <w:r>
           <w:rPr>
             <w:rStyle w:val="Hyperlink"/>
@@ -21848,8 +21820,8 @@
         <w:t xml:space="preserve">.</w:t>
       </w:r>
     </w:p>
-    <w:bookmarkEnd w:id="159"/>
-    <w:bookmarkStart w:id="161" w:name="ref-Bauer2020"/>
+    <w:bookmarkEnd w:id="158"/>
+    <w:bookmarkStart w:id="160" w:name="ref-Bauer2020"/>
     <w:p>
       <w:pPr>
         <w:pStyle w:val="Bibliography"/>
@@ -21882,7 +21854,7 @@
       <w:r>
         <w:t xml:space="preserve"> </w:t>
       </w:r>
-      <w:hyperlink r:id="rId160">
+      <w:hyperlink r:id="rId159">
         <w:r>
           <w:rPr>
             <w:rStyle w:val="Hyperlink"/>
@@ -21894,8 +21866,8 @@
         <w:t xml:space="preserve">.</w:t>
       </w:r>
     </w:p>
-    <w:bookmarkEnd w:id="161"/>
-    <w:bookmarkStart w:id="163" w:name="ref-Benioff1998"/>
+    <w:bookmarkEnd w:id="160"/>
+    <w:bookmarkStart w:id="162" w:name="ref-Benioff1998"/>
     <w:p>
       <w:pPr>
         <w:pStyle w:val="Bibliography"/>
@@ -21928,7 +21900,7 @@
       <w:r>
         <w:t xml:space="preserve"> </w:t>
       </w:r>
-      <w:hyperlink r:id="rId162">
+      <w:hyperlink r:id="rId161">
         <w:r>
           <w:rPr>
             <w:rStyle w:val="Hyperlink"/>
@@ -21940,8 +21912,8 @@
         <w:t xml:space="preserve">.</w:t>
       </w:r>
     </w:p>
-    <w:bookmarkEnd w:id="163"/>
-    <w:bookmarkStart w:id="165" w:name="ref-Benioff2002"/>
+    <w:bookmarkEnd w:id="162"/>
+    <w:bookmarkStart w:id="164" w:name="ref-Benioff2002"/>
     <w:p>
       <w:pPr>
         <w:pStyle w:val="Bibliography"/>
@@ -21977,7 +21949,7 @@
       <w:r>
         <w:t xml:space="preserve"> </w:t>
       </w:r>
-      <w:hyperlink r:id="rId164">
+      <w:hyperlink r:id="rId163">
         <w:r>
           <w:rPr>
             <w:rStyle w:val="Hyperlink"/>
@@ -21989,8 +21961,8 @@
         <w:t xml:space="preserve">.</w:t>
       </w:r>
     </w:p>
-    <w:bookmarkEnd w:id="165"/>
-    <w:bookmarkStart w:id="167" w:name="ref-Bharti2022"/>
+    <w:bookmarkEnd w:id="164"/>
+    <w:bookmarkStart w:id="166" w:name="ref-Bharti2022"/>
     <w:p>
       <w:pPr>
         <w:pStyle w:val="Bibliography"/>
@@ -22023,7 +21995,7 @@
       <w:r>
         <w:t xml:space="preserve"> </w:t>
       </w:r>
-      <w:hyperlink r:id="rId166">
+      <w:hyperlink r:id="rId165">
         <w:r>
           <w:rPr>
             <w:rStyle w:val="Hyperlink"/>
@@ -22035,8 +22007,8 @@
         <w:t xml:space="preserve">.</w:t>
       </w:r>
     </w:p>
-    <w:bookmarkEnd w:id="167"/>
-    <w:bookmarkStart w:id="169" w:name="ref-Biamonte2017"/>
+    <w:bookmarkEnd w:id="166"/>
+    <w:bookmarkStart w:id="168" w:name="ref-Biamonte2017"/>
     <w:p>
       <w:pPr>
         <w:pStyle w:val="Bibliography"/>
@@ -22069,7 +22041,7 @@
       <w:r>
         <w:t xml:space="preserve"> </w:t>
       </w:r>
-      <w:hyperlink r:id="rId168">
+      <w:hyperlink r:id="rId167">
         <w:r>
           <w:rPr>
             <w:rStyle w:val="Hyperlink"/>
@@ -22081,8 +22053,8 @@
         <w:t xml:space="preserve">.</w:t>
       </w:r>
     </w:p>
-    <w:bookmarkEnd w:id="169"/>
-    <w:bookmarkStart w:id="171" w:name="ref-Birdal2021"/>
+    <w:bookmarkEnd w:id="168"/>
+    <w:bookmarkStart w:id="170" w:name="ref-Birdal2021"/>
     <w:p>
       <w:pPr>
         <w:pStyle w:val="Bibliography"/>
@@ -22160,7 +22132,7 @@
       <w:r>
         <w:t xml:space="preserve"> </w:t>
       </w:r>
-      <w:hyperlink r:id="rId170">
+      <w:hyperlink r:id="rId169">
         <w:r>
           <w:rPr>
             <w:rStyle w:val="Hyperlink"/>
@@ -22172,8 +22144,8 @@
         <w:t xml:space="preserve">.</w:t>
       </w:r>
     </w:p>
-    <w:bookmarkEnd w:id="171"/>
-    <w:bookmarkStart w:id="173" w:name="ref-Bongs2019"/>
+    <w:bookmarkEnd w:id="170"/>
+    <w:bookmarkStart w:id="172" w:name="ref-Bongs2019"/>
     <w:p>
       <w:pPr>
         <w:pStyle w:val="Bibliography"/>
@@ -22206,7 +22178,7 @@
       <w:r>
         <w:t xml:space="preserve"> </w:t>
       </w:r>
-      <w:hyperlink r:id="rId172">
+      <w:hyperlink r:id="rId171">
         <w:r>
           <w:rPr>
             <w:rStyle w:val="Hyperlink"/>
@@ -22218,8 +22190,8 @@
         <w:t xml:space="preserve">.</w:t>
       </w:r>
     </w:p>
-    <w:bookmarkEnd w:id="173"/>
-    <w:bookmarkStart w:id="175" w:name="ref-Brassard2002"/>
+    <w:bookmarkEnd w:id="172"/>
+    <w:bookmarkStart w:id="174" w:name="ref-Brassard2002"/>
     <w:p>
       <w:pPr>
         <w:pStyle w:val="Bibliography"/>
@@ -22255,7 +22227,7 @@
       <w:r>
         <w:t xml:space="preserve"> </w:t>
       </w:r>
-      <w:hyperlink r:id="rId174">
+      <w:hyperlink r:id="rId173">
         <w:r>
           <w:rPr>
             <w:rStyle w:val="Hyperlink"/>
@@ -22267,8 +22239,8 @@
         <w:t xml:space="preserve">.</w:t>
       </w:r>
     </w:p>
-    <w:bookmarkEnd w:id="175"/>
-    <w:bookmarkStart w:id="177" w:name="ref-Briegel2012"/>
+    <w:bookmarkEnd w:id="174"/>
+    <w:bookmarkStart w:id="176" w:name="ref-Briegel2012"/>
     <w:p>
       <w:pPr>
         <w:pStyle w:val="Bibliography"/>
@@ -22301,7 +22273,7 @@
       <w:r>
         <w:t xml:space="preserve"> </w:t>
       </w:r>
-      <w:hyperlink r:id="rId176">
+      <w:hyperlink r:id="rId175">
         <w:r>
           <w:rPr>
             <w:rStyle w:val="Hyperlink"/>
@@ -22313,8 +22285,8 @@
         <w:t xml:space="preserve">.</w:t>
       </w:r>
     </w:p>
-    <w:bookmarkEnd w:id="177"/>
-    <w:bookmarkStart w:id="179" w:name="ref-Busemeyer2012"/>
+    <w:bookmarkEnd w:id="176"/>
+    <w:bookmarkStart w:id="178" w:name="ref-Busemeyer2012"/>
     <w:p>
       <w:pPr>
         <w:pStyle w:val="Bibliography"/>
@@ -22338,7 +22310,7 @@
       <w:r>
         <w:t xml:space="preserve"> </w:t>
       </w:r>
-      <w:hyperlink r:id="rId178">
+      <w:hyperlink r:id="rId177">
         <w:r>
           <w:rPr>
             <w:rStyle w:val="Hyperlink"/>
@@ -22350,8 +22322,8 @@
         <w:t xml:space="preserve">.</w:t>
       </w:r>
     </w:p>
-    <w:bookmarkEnd w:id="179"/>
-    <w:bookmarkStart w:id="181" w:name="ref-Busemeyer1993"/>
+    <w:bookmarkEnd w:id="178"/>
+    <w:bookmarkStart w:id="180" w:name="ref-Busemeyer1993"/>
     <w:p>
       <w:pPr>
         <w:pStyle w:val="Bibliography"/>
@@ -22384,7 +22356,7 @@
       <w:r>
         <w:t xml:space="preserve"> </w:t>
       </w:r>
-      <w:hyperlink r:id="rId180">
+      <w:hyperlink r:id="rId179">
         <w:r>
           <w:rPr>
             <w:rStyle w:val="Hyperlink"/>
@@ -22396,8 +22368,8 @@
         <w:t xml:space="preserve">.</w:t>
       </w:r>
     </w:p>
-    <w:bookmarkEnd w:id="181"/>
-    <w:bookmarkStart w:id="183" w:name="ref-Cai2023"/>
+    <w:bookmarkEnd w:id="180"/>
+    <w:bookmarkStart w:id="182" w:name="ref-Cai2023"/>
     <w:p>
       <w:pPr>
         <w:pStyle w:val="Bibliography"/>
@@ -22430,7 +22402,7 @@
       <w:r>
         <w:t xml:space="preserve"> </w:t>
       </w:r>
-      <w:hyperlink r:id="rId182">
+      <w:hyperlink r:id="rId181">
         <w:r>
           <w:rPr>
             <w:rStyle w:val="Hyperlink"/>
@@ -22442,8 +22414,8 @@
         <w:t xml:space="preserve">.</w:t>
       </w:r>
     </w:p>
-    <w:bookmarkEnd w:id="183"/>
-    <w:bookmarkStart w:id="185" w:name="ref-Cerezo2021a"/>
+    <w:bookmarkEnd w:id="182"/>
+    <w:bookmarkStart w:id="184" w:name="ref-Cerezo2021a"/>
     <w:p>
       <w:pPr>
         <w:pStyle w:val="Bibliography"/>
@@ -22476,7 +22448,7 @@
       <w:r>
         <w:t xml:space="preserve"> </w:t>
       </w:r>
-      <w:hyperlink r:id="rId184">
+      <w:hyperlink r:id="rId183">
         <w:r>
           <w:rPr>
             <w:rStyle w:val="Hyperlink"/>
@@ -22488,8 +22460,8 @@
         <w:t xml:space="preserve">.</w:t>
       </w:r>
     </w:p>
-    <w:bookmarkEnd w:id="185"/>
-    <w:bookmarkStart w:id="187" w:name="ref-Cerezo2021b"/>
+    <w:bookmarkEnd w:id="184"/>
+    <w:bookmarkStart w:id="186" w:name="ref-Cerezo2021b"/>
     <w:p>
       <w:pPr>
         <w:pStyle w:val="Bibliography"/>
@@ -22522,7 +22494,7 @@
       <w:r>
         <w:t xml:space="preserve"> </w:t>
       </w:r>
-      <w:hyperlink r:id="rId186">
+      <w:hyperlink r:id="rId185">
         <w:r>
           <w:rPr>
             <w:rStyle w:val="Hyperlink"/>
@@ -22534,8 +22506,8 @@
         <w:t xml:space="preserve">.</w:t>
       </w:r>
     </w:p>
-    <w:bookmarkEnd w:id="187"/>
-    <w:bookmarkStart w:id="189" w:name="ref-Cheiney2018"/>
+    <w:bookmarkEnd w:id="186"/>
+    <w:bookmarkStart w:id="188" w:name="ref-Cheiney2018"/>
     <w:p>
       <w:pPr>
         <w:pStyle w:val="Bibliography"/>
@@ -22580,7 +22552,7 @@
       <w:r>
         <w:t xml:space="preserve"> </w:t>
       </w:r>
-      <w:hyperlink r:id="rId188">
+      <w:hyperlink r:id="rId187">
         <w:r>
           <w:rPr>
             <w:rStyle w:val="Hyperlink"/>
@@ -22592,8 +22564,8 @@
         <w:t xml:space="preserve">.</w:t>
       </w:r>
     </w:p>
-    <w:bookmarkEnd w:id="189"/>
-    <w:bookmarkStart w:id="191" w:name="ref-Chella2023"/>
+    <w:bookmarkEnd w:id="188"/>
+    <w:bookmarkStart w:id="190" w:name="ref-Chella2023"/>
     <w:p>
       <w:pPr>
         <w:pStyle w:val="Bibliography"/>
@@ -22626,7 +22598,7 @@
       <w:r>
         <w:t xml:space="preserve"> </w:t>
       </w:r>
-      <w:hyperlink r:id="rId190">
+      <w:hyperlink r:id="rId189">
         <w:r>
           <w:rPr>
             <w:rStyle w:val="Hyperlink"/>
@@ -22638,8 +22610,8 @@
         <w:t xml:space="preserve">.</w:t>
       </w:r>
     </w:p>
-    <w:bookmarkEnd w:id="191"/>
-    <w:bookmarkStart w:id="193" w:name="ref-Chella2022"/>
+    <w:bookmarkEnd w:id="190"/>
+    <w:bookmarkStart w:id="192" w:name="ref-Chella2022"/>
     <w:p>
       <w:pPr>
         <w:pStyle w:val="Bibliography"/>
@@ -22672,7 +22644,7 @@
       <w:r>
         <w:t xml:space="preserve"> </w:t>
       </w:r>
-      <w:hyperlink r:id="rId192">
+      <w:hyperlink r:id="rId191">
         <w:r>
           <w:rPr>
             <w:rStyle w:val="Hyperlink"/>
@@ -22684,8 +22656,8 @@
         <w:t xml:space="preserve">.</w:t>
       </w:r>
     </w:p>
-    <w:bookmarkEnd w:id="193"/>
-    <w:bookmarkStart w:id="195" w:name="ref-Chen2022"/>
+    <w:bookmarkEnd w:id="192"/>
+    <w:bookmarkStart w:id="194" w:name="ref-Chen2022"/>
     <w:p>
       <w:pPr>
         <w:pStyle w:val="Bibliography"/>
@@ -22718,7 +22690,7 @@
       <w:r>
         <w:t xml:space="preserve"> </w:t>
       </w:r>
-      <w:hyperlink r:id="rId194">
+      <w:hyperlink r:id="rId193">
         <w:r>
           <w:rPr>
             <w:rStyle w:val="Hyperlink"/>
@@ -22730,8 +22702,8 @@
         <w:t xml:space="preserve">.</w:t>
       </w:r>
     </w:p>
-    <w:bookmarkEnd w:id="195"/>
-    <w:bookmarkStart w:id="197" w:name="ref-Chen2020"/>
+    <w:bookmarkEnd w:id="194"/>
+    <w:bookmarkStart w:id="196" w:name="ref-Chen2020"/>
     <w:p>
       <w:pPr>
         <w:pStyle w:val="Bibliography"/>
@@ -22764,7 +22736,7 @@
       <w:r>
         <w:t xml:space="preserve"> </w:t>
       </w:r>
-      <w:hyperlink r:id="rId196">
+      <w:hyperlink r:id="rId195">
         <w:r>
           <w:rPr>
             <w:rStyle w:val="Hyperlink"/>
@@ -22776,8 +22748,8 @@
         <w:t xml:space="preserve">.</w:t>
       </w:r>
     </w:p>
-    <w:bookmarkEnd w:id="197"/>
-    <w:bookmarkStart w:id="199" w:name="ref-Chia2020"/>
+    <w:bookmarkEnd w:id="196"/>
+    <w:bookmarkStart w:id="198" w:name="ref-Chia2020"/>
     <w:p>
       <w:pPr>
         <w:pStyle w:val="Bibliography"/>
@@ -22834,7 +22806,7 @@
       <w:r>
         <w:t xml:space="preserve"> </w:t>
       </w:r>
-      <w:hyperlink r:id="rId198">
+      <w:hyperlink r:id="rId197">
         <w:r>
           <w:rPr>
             <w:rStyle w:val="Hyperlink"/>
@@ -22846,8 +22818,8 @@
         <w:t xml:space="preserve">.</w:t>
       </w:r>
     </w:p>
-    <w:bookmarkEnd w:id="199"/>
-    <w:bookmarkStart w:id="201" w:name="ref-Clark2019"/>
+    <w:bookmarkEnd w:id="198"/>
+    <w:bookmarkStart w:id="200" w:name="ref-Clark2019"/>
     <w:p>
       <w:pPr>
         <w:pStyle w:val="Bibliography"/>
@@ -22904,7 +22876,7 @@
       <w:r>
         <w:t xml:space="preserve"> </w:t>
       </w:r>
-      <w:hyperlink r:id="rId200">
+      <w:hyperlink r:id="rId199">
         <w:r>
           <w:rPr>
             <w:rStyle w:val="Hyperlink"/>
@@ -22916,8 +22888,8 @@
         <w:t xml:space="preserve">.</w:t>
       </w:r>
     </w:p>
-    <w:bookmarkEnd w:id="201"/>
-    <w:bookmarkStart w:id="203" w:name="ref-Conrad2025"/>
+    <w:bookmarkEnd w:id="200"/>
+    <w:bookmarkStart w:id="202" w:name="ref-Conrad2025"/>
     <w:p>
       <w:pPr>
         <w:pStyle w:val="Bibliography"/>
@@ -22934,7 +22906,7 @@
       <w:r>
         <w:t xml:space="preserve"> </w:t>
       </w:r>
-      <w:hyperlink r:id="rId202">
+      <w:hyperlink r:id="rId201">
         <w:r>
           <w:rPr>
             <w:rStyle w:val="Hyperlink"/>
@@ -22946,8 +22918,8 @@
         <w:t xml:space="preserve">.</w:t>
       </w:r>
     </w:p>
-    <w:bookmarkEnd w:id="203"/>
-    <w:bookmarkStart w:id="205" w:name="ref-Corcoles2021"/>
+    <w:bookmarkEnd w:id="202"/>
+    <w:bookmarkStart w:id="204" w:name="ref-Corcoles2021"/>
     <w:p>
       <w:pPr>
         <w:pStyle w:val="Bibliography"/>
@@ -22980,7 +22952,7 @@
       <w:r>
         <w:t xml:space="preserve"> </w:t>
       </w:r>
-      <w:hyperlink r:id="rId204">
+      <w:hyperlink r:id="rId203">
         <w:r>
           <w:rPr>
             <w:rStyle w:val="Hyperlink"/>
@@ -22992,8 +22964,8 @@
         <w:t xml:space="preserve">.</w:t>
       </w:r>
     </w:p>
-    <w:bookmarkEnd w:id="205"/>
-    <w:bookmarkStart w:id="207" w:name="ref-Daglarli2025"/>
+    <w:bookmarkEnd w:id="204"/>
+    <w:bookmarkStart w:id="206" w:name="ref-Daglarli2025"/>
     <w:p>
       <w:pPr>
         <w:pStyle w:val="Bibliography"/>
@@ -23026,7 +22998,7 @@
       <w:r>
         <w:t xml:space="preserve"> </w:t>
       </w:r>
-      <w:hyperlink r:id="rId206">
+      <w:hyperlink r:id="rId205">
         <w:r>
           <w:rPr>
             <w:rStyle w:val="Hyperlink"/>
@@ -23038,8 +23010,8 @@
         <w:t xml:space="preserve">.</w:t>
       </w:r>
     </w:p>
-    <w:bookmarkEnd w:id="207"/>
-    <w:bookmarkStart w:id="209" w:name="ref-DeCarolis2025"/>
+    <w:bookmarkEnd w:id="206"/>
+    <w:bookmarkStart w:id="208" w:name="ref-DeCarolis2025"/>
     <w:p>
       <w:pPr>
         <w:pStyle w:val="Bibliography"/>
@@ -23136,7 +23108,7 @@
       <w:r>
         <w:t xml:space="preserve"> </w:t>
       </w:r>
-      <w:hyperlink r:id="rId208">
+      <w:hyperlink r:id="rId207">
         <w:r>
           <w:rPr>
             <w:rStyle w:val="Hyperlink"/>
@@ -23148,8 +23120,8 @@
         <w:t xml:space="preserve">.</w:t>
       </w:r>
     </w:p>
-    <w:bookmarkEnd w:id="209"/>
-    <w:bookmarkStart w:id="211" w:name="ref-Degen2017"/>
+    <w:bookmarkEnd w:id="208"/>
+    <w:bookmarkStart w:id="210" w:name="ref-Degen2017"/>
     <w:p>
       <w:pPr>
         <w:pStyle w:val="Bibliography"/>
@@ -23182,7 +23154,7 @@
       <w:r>
         <w:t xml:space="preserve"> </w:t>
       </w:r>
-      <w:hyperlink r:id="rId210">
+      <w:hyperlink r:id="rId209">
         <w:r>
           <w:rPr>
             <w:rStyle w:val="Hyperlink"/>
@@ -23194,8 +23166,8 @@
         <w:t xml:space="preserve">.</w:t>
       </w:r>
     </w:p>
-    <w:bookmarkEnd w:id="211"/>
-    <w:bookmarkStart w:id="213" w:name="ref-Dellaert1999"/>
+    <w:bookmarkEnd w:id="210"/>
+    <w:bookmarkStart w:id="212" w:name="ref-Dellaert1999"/>
     <w:p>
       <w:pPr>
         <w:pStyle w:val="Bibliography"/>
@@ -23282,7 +23254,7 @@
       <w:r>
         <w:t xml:space="preserve"> </w:t>
       </w:r>
-      <w:hyperlink r:id="rId212">
+      <w:hyperlink r:id="rId211">
         <w:r>
           <w:rPr>
             <w:rStyle w:val="Hyperlink"/>
@@ -23294,8 +23266,8 @@
         <w:t xml:space="preserve">.</w:t>
       </w:r>
     </w:p>
-    <w:bookmarkEnd w:id="213"/>
-    <w:bookmarkStart w:id="215" w:name="ref-Deutsch1985"/>
+    <w:bookmarkEnd w:id="212"/>
+    <w:bookmarkStart w:id="214" w:name="ref-Deutsch1985"/>
     <w:p>
       <w:pPr>
         <w:pStyle w:val="Bibliography"/>
@@ -23340,7 +23312,7 @@
       <w:r>
         <w:t xml:space="preserve"> </w:t>
       </w:r>
-      <w:hyperlink r:id="rId214">
+      <w:hyperlink r:id="rId213">
         <w:r>
           <w:rPr>
             <w:rStyle w:val="Hyperlink"/>
@@ -23352,8 +23324,8 @@
         <w:t xml:space="preserve">.</w:t>
       </w:r>
     </w:p>
-    <w:bookmarkEnd w:id="215"/>
-    <w:bookmarkStart w:id="217" w:name="ref-Deutsch1992"/>
+    <w:bookmarkEnd w:id="214"/>
+    <w:bookmarkStart w:id="216" w:name="ref-Deutsch1992"/>
     <w:p>
       <w:pPr>
         <w:pStyle w:val="Bibliography"/>
@@ -23386,7 +23358,7 @@
       <w:r>
         <w:t xml:space="preserve"> </w:t>
       </w:r>
-      <w:hyperlink r:id="rId216">
+      <w:hyperlink r:id="rId215">
         <w:r>
           <w:rPr>
             <w:rStyle w:val="Hyperlink"/>
@@ -23398,90 +23370,90 @@
         <w:t xml:space="preserve">.</w:t>
       </w:r>
     </w:p>
+    <w:bookmarkEnd w:id="216"/>
+    <w:bookmarkStart w:id="217" w:name="ref-Doan2022"/>
+    <w:p>
+      <w:pPr>
+        <w:pStyle w:val="Bibliography"/>
+      </w:pPr>
+      <w:r>
+        <w:t xml:space="preserve">Doan, Anh-Dzung, Michele Sasdelli, David Suter, and Tat-Jun Chin. 2022.</w:t>
+      </w:r>
+      <w:r>
+        <w:t xml:space="preserve"> </w:t>
+      </w:r>
+      <w:r>
+        <w:t xml:space="preserve">“A Hybrid Quantum-Classical Algorithm for Robust Fitting.”</w:t>
+      </w:r>
+      <w:r>
+        <w:t xml:space="preserve"> </w:t>
+      </w:r>
+      <w:r>
+        <w:t xml:space="preserve">In</w:t>
+      </w:r>
+      <w:r>
+        <w:t xml:space="preserve"> </w:t>
+      </w:r>
+      <w:r>
+        <w:rPr>
+          <w:iCs/>
+          <w:i/>
+        </w:rPr>
+        <w:t xml:space="preserve">Proceedings of the</w:t>
+      </w:r>
+      <w:r>
+        <w:rPr>
+          <w:iCs/>
+          <w:i/>
+        </w:rPr>
+        <w:t xml:space="preserve"> </w:t>
+      </w:r>
+      <w:r>
+        <w:rPr>
+          <w:iCs/>
+          <w:i/>
+        </w:rPr>
+        <w:t xml:space="preserve">IEEE/CVF</w:t>
+      </w:r>
+      <w:r>
+        <w:rPr>
+          <w:iCs/>
+          <w:i/>
+        </w:rPr>
+        <w:t xml:space="preserve"> </w:t>
+      </w:r>
+      <w:r>
+        <w:rPr>
+          <w:iCs/>
+          <w:i/>
+        </w:rPr>
+        <w:t xml:space="preserve">Conference on Computer Vision and Pattern Recognition (</w:t>
+      </w:r>
+      <w:r>
+        <w:rPr>
+          <w:iCs/>
+          <w:i/>
+        </w:rPr>
+        <w:t xml:space="preserve">CVPR</w:t>
+      </w:r>
+      <w:r>
+        <w:rPr>
+          <w:iCs/>
+          <w:i/>
+        </w:rPr>
+        <w:t xml:space="preserve">)</w:t>
+      </w:r>
+      <w:r>
+        <w:t xml:space="preserve">, 417–27. IEEE.</w:t>
+      </w:r>
+    </w:p>
     <w:bookmarkEnd w:id="217"/>
-    <w:bookmarkStart w:id="218" w:name="ref-Doan2022"/>
+    <w:bookmarkStart w:id="219" w:name="ref-Dong2012"/>
     <w:p>
       <w:pPr>
         <w:pStyle w:val="Bibliography"/>
       </w:pPr>
       <w:r>
-        <w:t xml:space="preserve">Doan, Anh-Dzung, Michele Sasdelli, David Suter, and Tat-Jun Chin. 2022.</w:t>
-      </w:r>
-      <w:r>
-        <w:t xml:space="preserve"> </w:t>
-      </w:r>
-      <w:r>
-        <w:t xml:space="preserve">“A Hybrid Quantum-Classical Algorithm for Robust Fitting.”</w:t>
-      </w:r>
-      <w:r>
-        <w:t xml:space="preserve"> </w:t>
-      </w:r>
-      <w:r>
-        <w:t xml:space="preserve">In</w:t>
-      </w:r>
-      <w:r>
-        <w:t xml:space="preserve"> </w:t>
-      </w:r>
-      <w:r>
-        <w:rPr>
-          <w:iCs/>
-          <w:i/>
-        </w:rPr>
-        <w:t xml:space="preserve">Proceedings of the</w:t>
-      </w:r>
-      <w:r>
-        <w:rPr>
-          <w:iCs/>
-          <w:i/>
-        </w:rPr>
-        <w:t xml:space="preserve"> </w:t>
-      </w:r>
-      <w:r>
-        <w:rPr>
-          <w:iCs/>
-          <w:i/>
-        </w:rPr>
-        <w:t xml:space="preserve">IEEE/CVF</w:t>
-      </w:r>
-      <w:r>
-        <w:rPr>
-          <w:iCs/>
-          <w:i/>
-        </w:rPr>
-        <w:t xml:space="preserve"> </w:t>
-      </w:r>
-      <w:r>
-        <w:rPr>
-          <w:iCs/>
-          <w:i/>
-        </w:rPr>
-        <w:t xml:space="preserve">Conference on Computer Vision and Pattern Recognition (</w:t>
-      </w:r>
-      <w:r>
-        <w:rPr>
-          <w:iCs/>
-          <w:i/>
-        </w:rPr>
-        <w:t xml:space="preserve">CVPR</w:t>
-      </w:r>
-      <w:r>
-        <w:rPr>
-          <w:iCs/>
-          <w:i/>
-        </w:rPr>
-        <w:t xml:space="preserve">)</w:t>
-      </w:r>
-      <w:r>
-        <w:t xml:space="preserve">, 417–27. IEEE.</w:t>
-      </w:r>
-    </w:p>
-    <w:bookmarkEnd w:id="218"/>
-    <w:bookmarkStart w:id="220" w:name="ref-Dong2012"/>
-    <w:p>
-      <w:pPr>
-        <w:pStyle w:val="Bibliography"/>
-      </w:pPr>
-      <w:r>
         <w:t xml:space="preserve">Dong, Daoyi, Chunlin Chen, Jian Chu, and Tzyh-Jong Tarn. 2012.</w:t>
       </w:r>
       <w:r>
@@ -23523,7 +23495,7 @@
       <w:r>
         <w:t xml:space="preserve"> </w:t>
       </w:r>
-      <w:hyperlink r:id="rId219">
+      <w:hyperlink r:id="rId218">
         <w:r>
           <w:rPr>
             <w:rStyle w:val="Hyperlink"/>
@@ -23535,8 +23507,8 @@
         <w:t xml:space="preserve">.</w:t>
       </w:r>
     </w:p>
-    <w:bookmarkEnd w:id="220"/>
-    <w:bookmarkStart w:id="222" w:name="ref-Dong2008"/>
+    <w:bookmarkEnd w:id="219"/>
+    <w:bookmarkStart w:id="221" w:name="ref-Dong2008"/>
     <w:p>
       <w:pPr>
         <w:pStyle w:val="Bibliography"/>
@@ -23569,7 +23541,7 @@
       <w:r>
         <w:t xml:space="preserve"> </w:t>
       </w:r>
-      <w:hyperlink r:id="rId221">
+      <w:hyperlink r:id="rId220">
         <w:r>
           <w:rPr>
             <w:rStyle w:val="Hyperlink"/>
@@ -23581,8 +23553,8 @@
         <w:t xml:space="preserve">.</w:t>
       </w:r>
     </w:p>
-    <w:bookmarkEnd w:id="222"/>
-    <w:bookmarkStart w:id="224" w:name="ref-Dong2006"/>
+    <w:bookmarkEnd w:id="221"/>
+    <w:bookmarkStart w:id="223" w:name="ref-Dong2006"/>
     <w:p>
       <w:pPr>
         <w:pStyle w:val="Bibliography"/>
@@ -23615,7 +23587,7 @@
       <w:r>
         <w:t xml:space="preserve"> </w:t>
       </w:r>
-      <w:hyperlink r:id="rId223">
+      <w:hyperlink r:id="rId222">
         <w:r>
           <w:rPr>
             <w:rStyle w:val="Hyperlink"/>
@@ -23627,8 +23599,8 @@
         <w:t xml:space="preserve">.</w:t>
       </w:r>
     </w:p>
-    <w:bookmarkEnd w:id="224"/>
-    <w:bookmarkStart w:id="226" w:name="ref-Dragan2025"/>
+    <w:bookmarkEnd w:id="223"/>
+    <w:bookmarkStart w:id="225" w:name="ref-Dragan2025"/>
     <w:p>
       <w:pPr>
         <w:pStyle w:val="Bibliography"/>
@@ -23685,7 +23657,7 @@
       <w:r>
         <w:t xml:space="preserve"> </w:t>
       </w:r>
-      <w:hyperlink r:id="rId225">
+      <w:hyperlink r:id="rId224">
         <w:r>
           <w:rPr>
             <w:rStyle w:val="Hyperlink"/>
@@ -23697,8 +23669,8 @@
         <w:t xml:space="preserve">.</w:t>
       </w:r>
     </w:p>
-    <w:bookmarkEnd w:id="226"/>
-    <w:bookmarkStart w:id="228" w:name="ref-Dunjko2018"/>
+    <w:bookmarkEnd w:id="225"/>
+    <w:bookmarkStart w:id="227" w:name="ref-Dunjko2018"/>
     <w:p>
       <w:pPr>
         <w:pStyle w:val="Bibliography"/>
@@ -23731,7 +23703,7 @@
       <w:r>
         <w:t xml:space="preserve"> </w:t>
       </w:r>
-      <w:hyperlink r:id="rId227">
+      <w:hyperlink r:id="rId226">
         <w:r>
           <w:rPr>
             <w:rStyle w:val="Hyperlink"/>
@@ -23743,8 +23715,8 @@
         <w:t xml:space="preserve">.</w:t>
       </w:r>
     </w:p>
-    <w:bookmarkEnd w:id="228"/>
-    <w:bookmarkStart w:id="230" w:name="ref-Endo2021"/>
+    <w:bookmarkEnd w:id="227"/>
+    <w:bookmarkStart w:id="229" w:name="ref-Endo2021"/>
     <w:p>
       <w:pPr>
         <w:pStyle w:val="Bibliography"/>
@@ -23777,7 +23749,7 @@
       <w:r>
         <w:t xml:space="preserve"> </w:t>
       </w:r>
-      <w:hyperlink r:id="rId229">
+      <w:hyperlink r:id="rId228">
         <w:r>
           <w:rPr>
             <w:rStyle w:val="Hyperlink"/>
@@ -23789,8 +23761,8 @@
         <w:t xml:space="preserve">.</w:t>
       </w:r>
     </w:p>
-    <w:bookmarkEnd w:id="230"/>
-    <w:bookmarkStart w:id="232" w:name="ref-Essalmi2026"/>
+    <w:bookmarkEnd w:id="229"/>
+    <w:bookmarkStart w:id="231" w:name="ref-Essalmi2026"/>
     <w:p>
       <w:pPr>
         <w:pStyle w:val="Bibliography"/>
@@ -23807,7 +23779,7 @@
       <w:r>
         <w:t xml:space="preserve"> </w:t>
       </w:r>
-      <w:hyperlink r:id="rId231">
+      <w:hyperlink r:id="rId230">
         <w:r>
           <w:rPr>
             <w:rStyle w:val="Hyperlink"/>
@@ -23819,8 +23791,8 @@
         <w:t xml:space="preserve">.</w:t>
       </w:r>
     </w:p>
-    <w:bookmarkEnd w:id="232"/>
-    <w:bookmarkStart w:id="234" w:name="ref-Farhi2014"/>
+    <w:bookmarkEnd w:id="231"/>
+    <w:bookmarkStart w:id="233" w:name="ref-Farhi2014"/>
     <w:p>
       <w:pPr>
         <w:pStyle w:val="Bibliography"/>
@@ -23837,7 +23809,7 @@
       <w:r>
         <w:t xml:space="preserve"> </w:t>
       </w:r>
-      <w:hyperlink r:id="rId233">
+      <w:hyperlink r:id="rId232">
         <w:r>
           <w:rPr>
             <w:rStyle w:val="Hyperlink"/>
@@ -23849,8 +23821,8 @@
         <w:t xml:space="preserve">.</w:t>
       </w:r>
     </w:p>
-    <w:bookmarkEnd w:id="234"/>
-    <w:bookmarkStart w:id="236" w:name="ref-Farhi2018"/>
+    <w:bookmarkEnd w:id="233"/>
+    <w:bookmarkStart w:id="235" w:name="ref-Farhi2018"/>
     <w:p>
       <w:pPr>
         <w:pStyle w:val="Bibliography"/>
@@ -23867,7 +23839,7 @@
       <w:r>
         <w:t xml:space="preserve"> </w:t>
       </w:r>
-      <w:hyperlink r:id="rId235">
+      <w:hyperlink r:id="rId234">
         <w:r>
           <w:rPr>
             <w:rStyle w:val="Hyperlink"/>
@@ -23879,8 +23851,8 @@
         <w:t xml:space="preserve">.</w:t>
       </w:r>
     </w:p>
-    <w:bookmarkEnd w:id="236"/>
-    <w:bookmarkStart w:id="238" w:name="ref-Fazilat2025a"/>
+    <w:bookmarkEnd w:id="235"/>
+    <w:bookmarkStart w:id="237" w:name="ref-Fazilat2025a"/>
     <w:p>
       <w:pPr>
         <w:pStyle w:val="Bibliography"/>
@@ -23930,7 +23902,7 @@
       <w:r>
         <w:t xml:space="preserve"> </w:t>
       </w:r>
-      <w:hyperlink r:id="rId237">
+      <w:hyperlink r:id="rId236">
         <w:r>
           <w:rPr>
             <w:rStyle w:val="Hyperlink"/>
@@ -23942,8 +23914,8 @@
         <w:t xml:space="preserve">.</w:t>
       </w:r>
     </w:p>
-    <w:bookmarkEnd w:id="238"/>
-    <w:bookmarkStart w:id="240" w:name="ref-Fazilat2025b"/>
+    <w:bookmarkEnd w:id="237"/>
+    <w:bookmarkStart w:id="239" w:name="ref-Fazilat2025b"/>
     <w:p>
       <w:pPr>
         <w:pStyle w:val="Bibliography"/>
@@ -23976,7 +23948,7 @@
       <w:r>
         <w:t xml:space="preserve"> </w:t>
       </w:r>
-      <w:hyperlink r:id="rId239">
+      <w:hyperlink r:id="rId238">
         <w:r>
           <w:rPr>
             <w:rStyle w:val="Hyperlink"/>
@@ -23988,8 +23960,8 @@
         <w:t xml:space="preserve">.</w:t>
       </w:r>
     </w:p>
-    <w:bookmarkEnd w:id="240"/>
-    <w:bookmarkStart w:id="242" w:name="ref-Feynman1982"/>
+    <w:bookmarkEnd w:id="239"/>
+    <w:bookmarkStart w:id="241" w:name="ref-Feynman1982"/>
     <w:p>
       <w:pPr>
         <w:pStyle w:val="Bibliography"/>
@@ -24022,7 +23994,7 @@
       <w:r>
         <w:t xml:space="preserve"> </w:t>
       </w:r>
-      <w:hyperlink r:id="rId241">
+      <w:hyperlink r:id="rId240">
         <w:r>
           <w:rPr>
             <w:rStyle w:val="Hyperlink"/>
@@ -24034,8 +24006,8 @@
         <w:t xml:space="preserve">.</w:t>
       </w:r>
     </w:p>
-    <w:bookmarkEnd w:id="242"/>
-    <w:bookmarkStart w:id="244" w:name="ref-Fowler2012"/>
+    <w:bookmarkEnd w:id="241"/>
+    <w:bookmarkStart w:id="243" w:name="ref-Fowler2012"/>
     <w:p>
       <w:pPr>
         <w:pStyle w:val="Bibliography"/>
@@ -24068,7 +24040,7 @@
       <w:r>
         <w:t xml:space="preserve"> </w:t>
       </w:r>
-      <w:hyperlink r:id="rId243">
+      <w:hyperlink r:id="rId242">
         <w:r>
           <w:rPr>
             <w:rStyle w:val="Hyperlink"/>
@@ -24080,8 +24052,8 @@
         <w:t xml:space="preserve">.</w:t>
       </w:r>
     </w:p>
-    <w:bookmarkEnd w:id="244"/>
-    <w:bookmarkStart w:id="246" w:name="ref-GarciaPineda2026"/>
+    <w:bookmarkEnd w:id="243"/>
+    <w:bookmarkStart w:id="245" w:name="ref-GarciaPineda2026"/>
     <w:p>
       <w:pPr>
         <w:pStyle w:val="Bibliography"/>
@@ -24114,7 +24086,7 @@
       <w:r>
         <w:t xml:space="preserve"> </w:t>
       </w:r>
-      <w:hyperlink r:id="rId245">
+      <w:hyperlink r:id="rId244">
         <w:r>
           <w:rPr>
             <w:rStyle w:val="Hyperlink"/>
@@ -24126,8 +24098,8 @@
         <w:t xml:space="preserve">.</w:t>
       </w:r>
     </w:p>
-    <w:bookmarkEnd w:id="246"/>
-    <w:bookmarkStart w:id="248" w:name="ref-Garrett2021"/>
+    <w:bookmarkEnd w:id="245"/>
+    <w:bookmarkStart w:id="247" w:name="ref-Garrett2021"/>
     <w:p>
       <w:pPr>
         <w:pStyle w:val="Bibliography"/>
@@ -24160,7 +24132,7 @@
       <w:r>
         <w:t xml:space="preserve"> </w:t>
       </w:r>
-      <w:hyperlink r:id="rId247">
+      <w:hyperlink r:id="rId246">
         <w:r>
           <w:rPr>
             <w:rStyle w:val="Hyperlink"/>
@@ -24172,8 +24144,8 @@
         <w:t xml:space="preserve">.</w:t>
       </w:r>
     </w:p>
-    <w:bookmarkEnd w:id="248"/>
-    <w:bookmarkStart w:id="250" w:name="ref-Geiger2011"/>
+    <w:bookmarkEnd w:id="247"/>
+    <w:bookmarkStart w:id="249" w:name="ref-Geiger2011"/>
     <w:p>
       <w:pPr>
         <w:pStyle w:val="Bibliography"/>
@@ -24206,7 +24178,7 @@
       <w:r>
         <w:t xml:space="preserve"> </w:t>
       </w:r>
-      <w:hyperlink r:id="rId249">
+      <w:hyperlink r:id="rId248">
         <w:r>
           <w:rPr>
             <w:rStyle w:val="Hyperlink"/>
@@ -24218,8 +24190,8 @@
         <w:t xml:space="preserve">.</w:t>
       </w:r>
     </w:p>
-    <w:bookmarkEnd w:id="250"/>
-    <w:bookmarkStart w:id="252" w:name="ref-Gerlach2025"/>
+    <w:bookmarkEnd w:id="249"/>
+    <w:bookmarkStart w:id="251" w:name="ref-Gerlach2025"/>
     <w:p>
       <w:pPr>
         <w:pStyle w:val="Bibliography"/>
@@ -24255,7 +24227,7 @@
       <w:r>
         <w:t xml:space="preserve"> </w:t>
       </w:r>
-      <w:hyperlink r:id="rId251">
+      <w:hyperlink r:id="rId250">
         <w:r>
           <w:rPr>
             <w:rStyle w:val="Hyperlink"/>
@@ -24267,8 +24239,8 @@
         <w:t xml:space="preserve">.</w:t>
       </w:r>
     </w:p>
-    <w:bookmarkEnd w:id="252"/>
-    <w:bookmarkStart w:id="254" w:name="ref-Gill2022"/>
+    <w:bookmarkEnd w:id="251"/>
+    <w:bookmarkStart w:id="253" w:name="ref-Gill2022"/>
     <w:p>
       <w:pPr>
         <w:pStyle w:val="Bibliography"/>
@@ -24301,7 +24273,7 @@
       <w:r>
         <w:t xml:space="preserve"> </w:t>
       </w:r>
-      <w:hyperlink r:id="rId253">
+      <w:hyperlink r:id="rId252">
         <w:r>
           <w:rPr>
             <w:rStyle w:val="Hyperlink"/>
@@ -24313,90 +24285,90 @@
         <w:t xml:space="preserve">.</w:t>
       </w:r>
     </w:p>
+    <w:bookmarkEnd w:id="253"/>
+    <w:bookmarkStart w:id="254" w:name="ref-Golyanik2020"/>
+    <w:p>
+      <w:pPr>
+        <w:pStyle w:val="Bibliography"/>
+      </w:pPr>
+      <w:r>
+        <w:t xml:space="preserve">Golyanik, Vladislav, and Christian Theobalt. 2020.</w:t>
+      </w:r>
+      <w:r>
+        <w:t xml:space="preserve"> </w:t>
+      </w:r>
+      <w:r>
+        <w:t xml:space="preserve">“A Quantum Computational Approach to Correspondence Problems on Point Sets.”</w:t>
+      </w:r>
+      <w:r>
+        <w:t xml:space="preserve"> </w:t>
+      </w:r>
+      <w:r>
+        <w:t xml:space="preserve">In</w:t>
+      </w:r>
+      <w:r>
+        <w:t xml:space="preserve"> </w:t>
+      </w:r>
+      <w:r>
+        <w:rPr>
+          <w:iCs/>
+          <w:i/>
+        </w:rPr>
+        <w:t xml:space="preserve">Proceedings of the</w:t>
+      </w:r>
+      <w:r>
+        <w:rPr>
+          <w:iCs/>
+          <w:i/>
+        </w:rPr>
+        <w:t xml:space="preserve"> </w:t>
+      </w:r>
+      <w:r>
+        <w:rPr>
+          <w:iCs/>
+          <w:i/>
+        </w:rPr>
+        <w:t xml:space="preserve">IEEE/CVF</w:t>
+      </w:r>
+      <w:r>
+        <w:rPr>
+          <w:iCs/>
+          <w:i/>
+        </w:rPr>
+        <w:t xml:space="preserve"> </w:t>
+      </w:r>
+      <w:r>
+        <w:rPr>
+          <w:iCs/>
+          <w:i/>
+        </w:rPr>
+        <w:t xml:space="preserve">Conference on Computer Vision and Pattern Recognition (</w:t>
+      </w:r>
+      <w:r>
+        <w:rPr>
+          <w:iCs/>
+          <w:i/>
+        </w:rPr>
+        <w:t xml:space="preserve">CVPR</w:t>
+      </w:r>
+      <w:r>
+        <w:rPr>
+          <w:iCs/>
+          <w:i/>
+        </w:rPr>
+        <w:t xml:space="preserve">)</w:t>
+      </w:r>
+      <w:r>
+        <w:t xml:space="preserve">, 9182–91. IEEE.</w:t>
+      </w:r>
+    </w:p>
     <w:bookmarkEnd w:id="254"/>
-    <w:bookmarkStart w:id="255" w:name="ref-Golyanik2020"/>
+    <w:bookmarkStart w:id="256" w:name="ref-Goncalves2018"/>
     <w:p>
       <w:pPr>
         <w:pStyle w:val="Bibliography"/>
       </w:pPr>
       <w:r>
-        <w:t xml:space="preserve">Golyanik, Vladislav, and Christian Theobalt. 2020.</w:t>
-      </w:r>
-      <w:r>
-        <w:t xml:space="preserve"> </w:t>
-      </w:r>
-      <w:r>
-        <w:t xml:space="preserve">“A Quantum Computational Approach to Correspondence Problems on Point Sets.”</w:t>
-      </w:r>
-      <w:r>
-        <w:t xml:space="preserve"> </w:t>
-      </w:r>
-      <w:r>
-        <w:t xml:space="preserve">In</w:t>
-      </w:r>
-      <w:r>
-        <w:t xml:space="preserve"> </w:t>
-      </w:r>
-      <w:r>
-        <w:rPr>
-          <w:iCs/>
-          <w:i/>
-        </w:rPr>
-        <w:t xml:space="preserve">Proceedings of the</w:t>
-      </w:r>
-      <w:r>
-        <w:rPr>
-          <w:iCs/>
-          <w:i/>
-        </w:rPr>
-        <w:t xml:space="preserve"> </w:t>
-      </w:r>
-      <w:r>
-        <w:rPr>
-          <w:iCs/>
-          <w:i/>
-        </w:rPr>
-        <w:t xml:space="preserve">IEEE/CVF</w:t>
-      </w:r>
-      <w:r>
-        <w:rPr>
-          <w:iCs/>
-          <w:i/>
-        </w:rPr>
-        <w:t xml:space="preserve"> </w:t>
-      </w:r>
-      <w:r>
-        <w:rPr>
-          <w:iCs/>
-          <w:i/>
-        </w:rPr>
-        <w:t xml:space="preserve">Conference on Computer Vision and Pattern Recognition (</w:t>
-      </w:r>
-      <w:r>
-        <w:rPr>
-          <w:iCs/>
-          <w:i/>
-        </w:rPr>
-        <w:t xml:space="preserve">CVPR</w:t>
-      </w:r>
-      <w:r>
-        <w:rPr>
-          <w:iCs/>
-          <w:i/>
-        </w:rPr>
-        <w:t xml:space="preserve">)</w:t>
-      </w:r>
-      <w:r>
-        <w:t xml:space="preserve">, 9182–91. IEEE.</w:t>
-      </w:r>
-    </w:p>
-    <w:bookmarkEnd w:id="255"/>
-    <w:bookmarkStart w:id="257" w:name="ref-Goncalves2018"/>
-    <w:p>
-      <w:pPr>
-        <w:pStyle w:val="Bibliography"/>
-      </w:pPr>
-      <w:r>
         <w:t xml:space="preserve">Gonçalves, Carlos Pedro. 2018.</w:t>
       </w:r>
       <w:r>
@@ -24414,7 +24386,7 @@
       <w:r>
         <w:t xml:space="preserve"> </w:t>
       </w:r>
-      <w:hyperlink r:id="rId256">
+      <w:hyperlink r:id="rId255">
         <w:r>
           <w:rPr>
             <w:rStyle w:val="Hyperlink"/>
@@ -24426,8 +24398,8 @@
         <w:t xml:space="preserve">.</w:t>
       </w:r>
     </w:p>
-    <w:bookmarkEnd w:id="257"/>
-    <w:bookmarkStart w:id="259" w:name="ref-GonzalezVillasmil2026"/>
+    <w:bookmarkEnd w:id="256"/>
+    <w:bookmarkStart w:id="258" w:name="ref-GonzalezVillasmil2026"/>
     <w:p>
       <w:pPr>
         <w:pStyle w:val="Bibliography"/>
@@ -24444,7 +24416,7 @@
       <w:r>
         <w:t xml:space="preserve"> </w:t>
       </w:r>
-      <w:hyperlink r:id="rId258">
+      <w:hyperlink r:id="rId257">
         <w:r>
           <w:rPr>
             <w:rStyle w:val="Hyperlink"/>
@@ -24456,8 +24428,8 @@
         <w:t xml:space="preserve">.</w:t>
       </w:r>
     </w:p>
-    <w:bookmarkEnd w:id="259"/>
-    <w:bookmarkStart w:id="261" w:name="ref-Goto2019"/>
+    <w:bookmarkEnd w:id="258"/>
+    <w:bookmarkStart w:id="260" w:name="ref-Goto2019"/>
     <w:p>
       <w:pPr>
         <w:pStyle w:val="Bibliography"/>
@@ -24502,7 +24474,7 @@
       <w:r>
         <w:t xml:space="preserve"> </w:t>
       </w:r>
-      <w:hyperlink r:id="rId260">
+      <w:hyperlink r:id="rId259">
         <w:r>
           <w:rPr>
             <w:rStyle w:val="Hyperlink"/>
@@ -24514,8 +24486,8 @@
         <w:t xml:space="preserve">.</w:t>
       </w:r>
     </w:p>
-    <w:bookmarkEnd w:id="261"/>
-    <w:bookmarkStart w:id="263" w:name="ref-Grover1996"/>
+    <w:bookmarkEnd w:id="260"/>
+    <w:bookmarkStart w:id="262" w:name="ref-Grover1996"/>
     <w:p>
       <w:pPr>
         <w:pStyle w:val="Bibliography"/>
@@ -24600,7 +24572,7 @@
       <w:r>
         <w:t xml:space="preserve"> </w:t>
       </w:r>
-      <w:hyperlink r:id="rId262">
+      <w:hyperlink r:id="rId261">
         <w:r>
           <w:rPr>
             <w:rStyle w:val="Hyperlink"/>
@@ -24612,8 +24584,8 @@
         <w:t xml:space="preserve">.</w:t>
       </w:r>
     </w:p>
-    <w:bookmarkEnd w:id="263"/>
-    <w:bookmarkStart w:id="265" w:name="ref-Guerreschi2019"/>
+    <w:bookmarkEnd w:id="262"/>
+    <w:bookmarkStart w:id="264" w:name="ref-Guerreschi2019"/>
     <w:p>
       <w:pPr>
         <w:pStyle w:val="Bibliography"/>
@@ -24667,7 +24639,7 @@
       <w:r>
         <w:t xml:space="preserve"> </w:t>
       </w:r>
-      <w:hyperlink r:id="rId264">
+      <w:hyperlink r:id="rId263">
         <w:r>
           <w:rPr>
             <w:rStyle w:val="Hyperlink"/>
@@ -24679,8 +24651,8 @@
         <w:t xml:space="preserve">.</w:t>
       </w:r>
     </w:p>
-    <w:bookmarkEnd w:id="265"/>
-    <w:bookmarkStart w:id="267" w:name="ref-Hadfield2019"/>
+    <w:bookmarkEnd w:id="264"/>
+    <w:bookmarkStart w:id="266" w:name="ref-Hadfield2019"/>
     <w:p>
       <w:pPr>
         <w:pStyle w:val="Bibliography"/>
@@ -24713,7 +24685,7 @@
       <w:r>
         <w:t xml:space="preserve"> </w:t>
       </w:r>
-      <w:hyperlink r:id="rId266">
+      <w:hyperlink r:id="rId265">
         <w:r>
           <w:rPr>
             <w:rStyle w:val="Hyperlink"/>
@@ -24725,8 +24697,8 @@
         <w:t xml:space="preserve">.</w:t>
       </w:r>
     </w:p>
-    <w:bookmarkEnd w:id="267"/>
-    <w:bookmarkStart w:id="269" w:name="ref-Haldorai2024"/>
+    <w:bookmarkEnd w:id="266"/>
+    <w:bookmarkStart w:id="268" w:name="ref-Haldorai2024"/>
     <w:p>
       <w:pPr>
         <w:pStyle w:val="Bibliography"/>
@@ -24759,7 +24731,7 @@
       <w:r>
         <w:t xml:space="preserve"> </w:t>
       </w:r>
-      <w:hyperlink r:id="rId268">
+      <w:hyperlink r:id="rId267">
         <w:r>
           <w:rPr>
             <w:rStyle w:val="Hyperlink"/>
@@ -24771,8 +24743,8 @@
         <w:t xml:space="preserve">.</w:t>
       </w:r>
     </w:p>
-    <w:bookmarkEnd w:id="269"/>
-    <w:bookmarkStart w:id="271" w:name="ref-Han2002"/>
+    <w:bookmarkEnd w:id="268"/>
+    <w:bookmarkStart w:id="270" w:name="ref-Han2002"/>
     <w:p>
       <w:pPr>
         <w:pStyle w:val="Bibliography"/>
@@ -24805,7 +24777,7 @@
       <w:r>
         <w:t xml:space="preserve"> </w:t>
       </w:r>
-      <w:hyperlink r:id="rId270">
+      <w:hyperlink r:id="rId269">
         <w:r>
           <w:rPr>
             <w:rStyle w:val="Hyperlink"/>
@@ -24817,8 +24789,8 @@
         <w:t xml:space="preserve">.</w:t>
       </w:r>
     </w:p>
-    <w:bookmarkEnd w:id="271"/>
-    <w:bookmarkStart w:id="273" w:name="ref-Harrow2009"/>
+    <w:bookmarkEnd w:id="270"/>
+    <w:bookmarkStart w:id="272" w:name="ref-Harrow2009"/>
     <w:p>
       <w:pPr>
         <w:pStyle w:val="Bibliography"/>
@@ -24851,7 +24823,7 @@
       <w:r>
         <w:t xml:space="preserve"> </w:t>
       </w:r>
-      <w:hyperlink r:id="rId272">
+      <w:hyperlink r:id="rId271">
         <w:r>
           <w:rPr>
             <w:rStyle w:val="Hyperlink"/>
@@ -24863,8 +24835,8 @@
         <w:t xml:space="preserve">.</w:t>
       </w:r>
     </w:p>
-    <w:bookmarkEnd w:id="273"/>
-    <w:bookmarkStart w:id="275" w:name="ref-Havlicek2019"/>
+    <w:bookmarkEnd w:id="272"/>
+    <w:bookmarkStart w:id="274" w:name="ref-Havlicek2019"/>
     <w:p>
       <w:pPr>
         <w:pStyle w:val="Bibliography"/>
@@ -24897,7 +24869,7 @@
       <w:r>
         <w:t xml:space="preserve"> </w:t>
       </w:r>
-      <w:hyperlink r:id="rId274">
+      <w:hyperlink r:id="rId273">
         <w:r>
           <w:rPr>
             <w:rStyle w:val="Hyperlink"/>
@@ -24909,8 +24881,8 @@
         <w:t xml:space="preserve">.</w:t>
       </w:r>
     </w:p>
-    <w:bookmarkEnd w:id="275"/>
-    <w:bookmarkStart w:id="277" w:name="ref-Henderson2020"/>
+    <w:bookmarkEnd w:id="274"/>
+    <w:bookmarkStart w:id="276" w:name="ref-Henderson2020"/>
     <w:p>
       <w:pPr>
         <w:pStyle w:val="Bibliography"/>
@@ -24943,7 +24915,7 @@
       <w:r>
         <w:t xml:space="preserve"> </w:t>
       </w:r>
-      <w:hyperlink r:id="rId276">
+      <w:hyperlink r:id="rId275">
         <w:r>
           <w:rPr>
             <w:rStyle w:val="Hyperlink"/>
@@ -24955,8 +24927,8 @@
         <w:t xml:space="preserve">.</w:t>
       </w:r>
     </w:p>
-    <w:bookmarkEnd w:id="277"/>
-    <w:bookmarkStart w:id="279" w:name="ref-Hohenfeld2024"/>
+    <w:bookmarkEnd w:id="276"/>
+    <w:bookmarkStart w:id="278" w:name="ref-Hohenfeld2024"/>
     <w:p>
       <w:pPr>
         <w:pStyle w:val="Bibliography"/>
@@ -24989,7 +24961,7 @@
       <w:r>
         <w:t xml:space="preserve"> </w:t>
       </w:r>
-      <w:hyperlink r:id="rId278">
+      <w:hyperlink r:id="rId277">
         <w:r>
           <w:rPr>
             <w:rStyle w:val="Hyperlink"/>
@@ -25001,8 +24973,8 @@
         <w:t xml:space="preserve">.</w:t>
       </w:r>
     </w:p>
-    <w:bookmarkEnd w:id="279"/>
-    <w:bookmarkStart w:id="281" w:name="ref-Humr2025"/>
+    <w:bookmarkEnd w:id="278"/>
+    <w:bookmarkStart w:id="280" w:name="ref-Humr2025"/>
     <w:p>
       <w:pPr>
         <w:pStyle w:val="Bibliography"/>
@@ -25044,7 +25016,7 @@
       <w:r>
         <w:t xml:space="preserve"> </w:t>
       </w:r>
-      <w:hyperlink r:id="rId280">
+      <w:hyperlink r:id="rId279">
         <w:r>
           <w:rPr>
             <w:rStyle w:val="Hyperlink"/>
@@ -25056,8 +25028,8 @@
         <w:t xml:space="preserve">.</w:t>
       </w:r>
     </w:p>
-    <w:bookmarkEnd w:id="281"/>
-    <w:bookmarkStart w:id="283" w:name="ref-Innan2025"/>
+    <w:bookmarkEnd w:id="280"/>
+    <w:bookmarkStart w:id="282" w:name="ref-Innan2025"/>
     <w:p>
       <w:pPr>
         <w:pStyle w:val="Bibliography"/>
@@ -25092,7 +25064,7 @@
       <w:r>
         <w:t xml:space="preserve"> </w:t>
       </w:r>
-      <w:hyperlink r:id="rId282">
+      <w:hyperlink r:id="rId281">
         <w:r>
           <w:rPr>
             <w:rStyle w:val="Hyperlink"/>
@@ -25104,8 +25076,8 @@
         <w:t xml:space="preserve">.</w:t>
       </w:r>
     </w:p>
-    <w:bookmarkEnd w:id="283"/>
-    <w:bookmarkStart w:id="285" w:name="ref-Jerbi2021"/>
+    <w:bookmarkEnd w:id="282"/>
+    <w:bookmarkStart w:id="284" w:name="ref-Jerbi2021"/>
     <w:p>
       <w:pPr>
         <w:pStyle w:val="Bibliography"/>
@@ -25141,7 +25113,7 @@
       <w:r>
         <w:t xml:space="preserve"> </w:t>
       </w:r>
-      <w:hyperlink r:id="rId284">
+      <w:hyperlink r:id="rId283">
         <w:r>
           <w:rPr>
             <w:rStyle w:val="Hyperlink"/>
@@ -25153,8 +25125,8 @@
         <w:t xml:space="preserve">.</w:t>
       </w:r>
     </w:p>
-    <w:bookmarkEnd w:id="285"/>
-    <w:bookmarkStart w:id="287" w:name="ref-Johnson2011"/>
+    <w:bookmarkEnd w:id="284"/>
+    <w:bookmarkStart w:id="286" w:name="ref-Johnson2011"/>
     <w:p>
       <w:pPr>
         <w:pStyle w:val="Bibliography"/>
@@ -25187,7 +25159,7 @@
       <w:r>
         <w:t xml:space="preserve"> </w:t>
       </w:r>
-      <w:hyperlink r:id="rId286">
+      <w:hyperlink r:id="rId285">
         <w:r>
           <w:rPr>
             <w:rStyle w:val="Hyperlink"/>
@@ -25199,8 +25171,8 @@
         <w:t xml:space="preserve">.</w:t>
       </w:r>
     </w:p>
-    <w:bookmarkEnd w:id="287"/>
-    <w:bookmarkStart w:id="289" w:name="ref-Kadowaki2025"/>
+    <w:bookmarkEnd w:id="286"/>
+    <w:bookmarkStart w:id="288" w:name="ref-Kadowaki2025"/>
     <w:p>
       <w:pPr>
         <w:pStyle w:val="Bibliography"/>
@@ -25226,7 +25198,7 @@
       <w:r>
         <w:t xml:space="preserve"> </w:t>
       </w:r>
-      <w:hyperlink r:id="rId288">
+      <w:hyperlink r:id="rId287">
         <w:r>
           <w:rPr>
             <w:rStyle w:val="Hyperlink"/>
@@ -25238,8 +25210,8 @@
         <w:t xml:space="preserve">.</w:t>
       </w:r>
     </w:p>
-    <w:bookmarkEnd w:id="289"/>
-    <w:bookmarkStart w:id="291" w:name="ref-Kaelbling1998"/>
+    <w:bookmarkEnd w:id="288"/>
+    <w:bookmarkStart w:id="290" w:name="ref-Kaelbling1998"/>
     <w:p>
       <w:pPr>
         <w:pStyle w:val="Bibliography"/>
@@ -25272,7 +25244,7 @@
       <w:r>
         <w:t xml:space="preserve"> </w:t>
       </w:r>
-      <w:hyperlink r:id="rId290">
+      <w:hyperlink r:id="rId289">
         <w:r>
           <w:rPr>
             <w:rStyle w:val="Hyperlink"/>
@@ -25284,8 +25256,8 @@
         <w:t xml:space="preserve">.</w:t>
       </w:r>
     </w:p>
-    <w:bookmarkEnd w:id="291"/>
-    <w:bookmarkStart w:id="293" w:name="ref-Kandala2019"/>
+    <w:bookmarkEnd w:id="290"/>
+    <w:bookmarkStart w:id="292" w:name="ref-Kandala2019"/>
     <w:p>
       <w:pPr>
         <w:pStyle w:val="Bibliography"/>
@@ -25318,7 +25290,7 @@
       <w:r>
         <w:t xml:space="preserve"> </w:t>
       </w:r>
-      <w:hyperlink r:id="rId292">
+      <w:hyperlink r:id="rId291">
         <w:r>
           <w:rPr>
             <w:rStyle w:val="Hyperlink"/>
@@ -25330,8 +25302,8 @@
         <w:t xml:space="preserve">.</w:t>
       </w:r>
     </w:p>
-    <w:bookmarkEnd w:id="293"/>
-    <w:bookmarkStart w:id="295" w:name="ref-Karaman2011"/>
+    <w:bookmarkEnd w:id="292"/>
+    <w:bookmarkStart w:id="294" w:name="ref-Karaman2011"/>
     <w:p>
       <w:pPr>
         <w:pStyle w:val="Bibliography"/>
@@ -25364,7 +25336,7 @@
       <w:r>
         <w:t xml:space="preserve"> </w:t>
       </w:r>
-      <w:hyperlink r:id="rId294">
+      <w:hyperlink r:id="rId293">
         <w:r>
           <w:rPr>
             <w:rStyle w:val="Hyperlink"/>
@@ -25376,8 +25348,8 @@
         <w:t xml:space="preserve">.</w:t>
       </w:r>
     </w:p>
-    <w:bookmarkEnd w:id="295"/>
-    <w:bookmarkStart w:id="297" w:name="ref-Khoshnoud2020"/>
+    <w:bookmarkEnd w:id="294"/>
+    <w:bookmarkStart w:id="296" w:name="ref-Khoshnoud2020"/>
     <w:p>
       <w:pPr>
         <w:pStyle w:val="Bibliography"/>
@@ -25394,7 +25366,7 @@
       <w:r>
         <w:t xml:space="preserve"> </w:t>
       </w:r>
-      <w:hyperlink r:id="rId296">
+      <w:hyperlink r:id="rId295">
         <w:r>
           <w:rPr>
             <w:rStyle w:val="Hyperlink"/>
@@ -25406,8 +25378,8 @@
         <w:t xml:space="preserve">.</w:t>
       </w:r>
     </w:p>
-    <w:bookmarkEnd w:id="297"/>
-    <w:bookmarkStart w:id="299" w:name="ref-Kim2022"/>
+    <w:bookmarkEnd w:id="296"/>
+    <w:bookmarkStart w:id="298" w:name="ref-Kim2022"/>
     <w:p>
       <w:pPr>
         <w:pStyle w:val="Bibliography"/>
@@ -25449,7 +25421,7 @@
       <w:r>
         <w:t xml:space="preserve"> </w:t>
       </w:r>
-      <w:hyperlink r:id="rId298">
+      <w:hyperlink r:id="rId297">
         <w:r>
           <w:rPr>
             <w:rStyle w:val="Hyperlink"/>
@@ -25461,35 +25433,35 @@
         <w:t xml:space="preserve">.</w:t>
       </w:r>
     </w:p>
+    <w:bookmarkEnd w:id="298"/>
+    <w:bookmarkStart w:id="299" w:name="ref-Kitchenham2007"/>
+    <w:p>
+      <w:pPr>
+        <w:pStyle w:val="Bibliography"/>
+      </w:pPr>
+      <w:r>
+        <w:t xml:space="preserve">Kitchenham, Barbara, and Stuart Charters. 2007.</w:t>
+      </w:r>
+      <w:r>
+        <w:t xml:space="preserve"> </w:t>
+      </w:r>
+      <w:r>
+        <w:t xml:space="preserve">“Guidelines for Performing Systematic Literature Reviews in Software Engineering.”</w:t>
+      </w:r>
+      <w:r>
+        <w:t xml:space="preserve"> </w:t>
+      </w:r>
+      <w:r>
+        <w:t xml:space="preserve">EBSE Technical Report EBSE-2007-01. Keele University; Durham University.</w:t>
+      </w:r>
+    </w:p>
     <w:bookmarkEnd w:id="299"/>
-    <w:bookmarkStart w:id="300" w:name="ref-Kitchenham2007"/>
+    <w:bookmarkStart w:id="301" w:name="ref-Kjaergaard2020"/>
     <w:p>
       <w:pPr>
         <w:pStyle w:val="Bibliography"/>
       </w:pPr>
       <w:r>
-        <w:t xml:space="preserve">Kitchenham, Barbara, and Stuart Charters. 2007.</w:t>
-      </w:r>
-      <w:r>
-        <w:t xml:space="preserve"> </w:t>
-      </w:r>
-      <w:r>
-        <w:t xml:space="preserve">“Guidelines for Performing Systematic Literature Reviews in Software Engineering.”</w:t>
-      </w:r>
-      <w:r>
-        <w:t xml:space="preserve"> </w:t>
-      </w:r>
-      <w:r>
-        <w:t xml:space="preserve">EBSE Technical Report EBSE-2007-01. Keele University; Durham University.</w:t>
-      </w:r>
-    </w:p>
-    <w:bookmarkEnd w:id="300"/>
-    <w:bookmarkStart w:id="302" w:name="ref-Kjaergaard2020"/>
-    <w:p>
-      <w:pPr>
-        <w:pStyle w:val="Bibliography"/>
-      </w:pPr>
-      <w:r>
         <w:t xml:space="preserve">Kjaergaard, Morten, Mollie E. Schwartz, Jochen Braumüller, Philip Krantz, Joel I.-J. Wang, Simon Gustavsson, and William D. Oliver. 2020.</w:t>
       </w:r>
       <w:r>
@@ -25517,7 +25489,7 @@
       <w:r>
         <w:t xml:space="preserve"> </w:t>
       </w:r>
-      <w:hyperlink r:id="rId301">
+      <w:hyperlink r:id="rId300">
         <w:r>
           <w:rPr>
             <w:rStyle w:val="Hyperlink"/>
@@ -25529,8 +25501,8 @@
         <w:t xml:space="preserve">.</w:t>
       </w:r>
     </w:p>
-    <w:bookmarkEnd w:id="302"/>
-    <w:bookmarkStart w:id="304" w:name="ref-Kober2013"/>
+    <w:bookmarkEnd w:id="301"/>
+    <w:bookmarkStart w:id="303" w:name="ref-Kober2013"/>
     <w:p>
       <w:pPr>
         <w:pStyle w:val="Bibliography"/>
@@ -25563,7 +25535,7 @@
       <w:r>
         <w:t xml:space="preserve"> </w:t>
       </w:r>
-      <w:hyperlink r:id="rId303">
+      <w:hyperlink r:id="rId302">
         <w:r>
           <w:rPr>
             <w:rStyle w:val="Hyperlink"/>
@@ -25575,8 +25547,8 @@
         <w:t xml:space="preserve">.</w:t>
       </w:r>
     </w:p>
-    <w:bookmarkEnd w:id="304"/>
-    <w:bookmarkStart w:id="306" w:name="ref-Kurniawati2022"/>
+    <w:bookmarkEnd w:id="303"/>
+    <w:bookmarkStart w:id="305" w:name="ref-Kurniawati2022"/>
     <w:p>
       <w:pPr>
         <w:pStyle w:val="Bibliography"/>
@@ -25621,7 +25593,7 @@
       <w:r>
         <w:t xml:space="preserve"> </w:t>
       </w:r>
-      <w:hyperlink r:id="rId305">
+      <w:hyperlink r:id="rId304">
         <w:r>
           <w:rPr>
             <w:rStyle w:val="Hyperlink"/>
@@ -25633,8 +25605,8 @@
         <w:t xml:space="preserve">.</w:t>
       </w:r>
     </w:p>
-    <w:bookmarkEnd w:id="306"/>
-    <w:bookmarkStart w:id="308" w:name="ref-Larocca2025"/>
+    <w:bookmarkEnd w:id="305"/>
+    <w:bookmarkStart w:id="307" w:name="ref-Larocca2025"/>
     <w:p>
       <w:pPr>
         <w:pStyle w:val="Bibliography"/>
@@ -25667,7 +25639,7 @@
       <w:r>
         <w:t xml:space="preserve"> </w:t>
       </w:r>
-      <w:hyperlink r:id="rId307">
+      <w:hyperlink r:id="rId306">
         <w:r>
           <w:rPr>
             <w:rStyle w:val="Hyperlink"/>
@@ -25679,8 +25651,8 @@
         <w:t xml:space="preserve">.</w:t>
       </w:r>
     </w:p>
-    <w:bookmarkEnd w:id="308"/>
-    <w:bookmarkStart w:id="310" w:name="ref-Lathrop2023"/>
+    <w:bookmarkEnd w:id="307"/>
+    <w:bookmarkStart w:id="309" w:name="ref-Lathrop2023"/>
     <w:p>
       <w:pPr>
         <w:pStyle w:val="Bibliography"/>
@@ -25713,7 +25685,7 @@
       <w:r>
         <w:t xml:space="preserve"> </w:t>
       </w:r>
-      <w:hyperlink r:id="rId309">
+      <w:hyperlink r:id="rId308">
         <w:r>
           <w:rPr>
             <w:rStyle w:val="Hyperlink"/>
@@ -25725,35 +25697,35 @@
         <w:t xml:space="preserve">.</w:t>
       </w:r>
     </w:p>
+    <w:bookmarkEnd w:id="309"/>
+    <w:bookmarkStart w:id="310" w:name="ref-LaValle1998"/>
+    <w:p>
+      <w:pPr>
+        <w:pStyle w:val="Bibliography"/>
+      </w:pPr>
+      <w:r>
+        <w:t xml:space="preserve">LaValle, Steven M. 1998.</w:t>
+      </w:r>
+      <w:r>
+        <w:t xml:space="preserve"> </w:t>
+      </w:r>
+      <w:r>
+        <w:t xml:space="preserve">“Rapidly-Exploring Random Trees: A New Tool for Path Planning.”</w:t>
+      </w:r>
+      <w:r>
+        <w:t xml:space="preserve"> </w:t>
+      </w:r>
+      <w:r>
+        <w:t xml:space="preserve">TR 98-11. Ames, IA, USA: Computer Science Department, Iowa State University.</w:t>
+      </w:r>
+    </w:p>
     <w:bookmarkEnd w:id="310"/>
-    <w:bookmarkStart w:id="311" w:name="ref-LaValle1998"/>
+    <w:bookmarkStart w:id="312" w:name="ref-Lawless2023"/>
     <w:p>
       <w:pPr>
         <w:pStyle w:val="Bibliography"/>
       </w:pPr>
       <w:r>
-        <w:t xml:space="preserve">LaValle, Steven M. 1998.</w:t>
-      </w:r>
-      <w:r>
-        <w:t xml:space="preserve"> </w:t>
-      </w:r>
-      <w:r>
-        <w:t xml:space="preserve">“Rapidly-Exploring Random Trees: A New Tool for Path Planning.”</w:t>
-      </w:r>
-      <w:r>
-        <w:t xml:space="preserve"> </w:t>
-      </w:r>
-      <w:r>
-        <w:t xml:space="preserve">TR 98-11. Ames, IA, USA: Computer Science Department, Iowa State University.</w:t>
-      </w:r>
-    </w:p>
-    <w:bookmarkEnd w:id="311"/>
-    <w:bookmarkStart w:id="313" w:name="ref-Lawless2023"/>
-    <w:p>
-      <w:pPr>
-        <w:pStyle w:val="Bibliography"/>
-      </w:pPr>
-      <w:r>
         <w:t xml:space="preserve">Lawless, William F., Ira S. Moskowitz, and Katarina Z. Doctor. 2023.</w:t>
       </w:r>
       <w:r>
@@ -25781,7 +25753,7 @@
       <w:r>
         <w:t xml:space="preserve"> </w:t>
       </w:r>
-      <w:hyperlink r:id="rId312">
+      <w:hyperlink r:id="rId311">
         <w:r>
           <w:rPr>
             <w:rStyle w:val="Hyperlink"/>
@@ -25793,8 +25765,8 @@
         <w:t xml:space="preserve">.</w:t>
       </w:r>
     </w:p>
-    <w:bookmarkEnd w:id="313"/>
-    <w:bookmarkStart w:id="315" w:name="ref-Leib2023"/>
+    <w:bookmarkEnd w:id="312"/>
+    <w:bookmarkStart w:id="314" w:name="ref-Leib2023"/>
     <w:p>
       <w:pPr>
         <w:pStyle w:val="Bibliography"/>
@@ -25827,7 +25799,7 @@
       <w:r>
         <w:t xml:space="preserve"> </w:t>
       </w:r>
-      <w:hyperlink r:id="rId314">
+      <w:hyperlink r:id="rId313">
         <w:r>
           <w:rPr>
             <w:rStyle w:val="Hyperlink"/>
@@ -25839,8 +25811,8 @@
         <w:t xml:space="preserve">.</w:t>
       </w:r>
     </w:p>
-    <w:bookmarkEnd w:id="315"/>
-    <w:bookmarkStart w:id="317" w:name="ref-Liu2021"/>
+    <w:bookmarkEnd w:id="314"/>
+    <w:bookmarkStart w:id="316" w:name="ref-Liu2021"/>
     <w:p>
       <w:pPr>
         <w:pStyle w:val="Bibliography"/>
@@ -25873,7 +25845,7 @@
       <w:r>
         <w:t xml:space="preserve"> </w:t>
       </w:r>
-      <w:hyperlink r:id="rId316">
+      <w:hyperlink r:id="rId315">
         <w:r>
           <w:rPr>
             <w:rStyle w:val="Hyperlink"/>
@@ -25885,8 +25857,8 @@
         <w:t xml:space="preserve">.</w:t>
       </w:r>
     </w:p>
-    <w:bookmarkEnd w:id="317"/>
-    <w:bookmarkStart w:id="319" w:name="ref-Lloyd2014"/>
+    <w:bookmarkEnd w:id="316"/>
+    <w:bookmarkStart w:id="318" w:name="ref-Lloyd2014"/>
     <w:p>
       <w:pPr>
         <w:pStyle w:val="Bibliography"/>
@@ -25903,7 +25875,7 @@
       <w:r>
         <w:t xml:space="preserve"> </w:t>
       </w:r>
-      <w:hyperlink r:id="rId318">
+      <w:hyperlink r:id="rId317">
         <w:r>
           <w:rPr>
             <w:rStyle w:val="Hyperlink"/>
@@ -25915,8 +25887,8 @@
         <w:t xml:space="preserve">.</w:t>
       </w:r>
     </w:p>
-    <w:bookmarkEnd w:id="319"/>
-    <w:bookmarkStart w:id="321" w:name="ref-Lokossou2025"/>
+    <w:bookmarkEnd w:id="318"/>
+    <w:bookmarkStart w:id="320" w:name="ref-Lokossou2025"/>
     <w:p>
       <w:pPr>
         <w:pStyle w:val="Bibliography"/>
@@ -25933,7 +25905,7 @@
       <w:r>
         <w:t xml:space="preserve"> </w:t>
       </w:r>
-      <w:hyperlink r:id="rId320">
+      <w:hyperlink r:id="rId319">
         <w:r>
           <w:rPr>
             <w:rStyle w:val="Hyperlink"/>
@@ -25945,8 +25917,8 @@
         <w:t xml:space="preserve">.</w:t>
       </w:r>
     </w:p>
-    <w:bookmarkEnd w:id="321"/>
-    <w:bookmarkStart w:id="323" w:name="ref-Lucas2014"/>
+    <w:bookmarkEnd w:id="320"/>
+    <w:bookmarkStart w:id="322" w:name="ref-Lucas2014"/>
     <w:p>
       <w:pPr>
         <w:pStyle w:val="Bibliography"/>
@@ -26000,7 +25972,7 @@
       <w:r>
         <w:t xml:space="preserve"> </w:t>
       </w:r>
-      <w:hyperlink r:id="rId322">
+      <w:hyperlink r:id="rId321">
         <w:r>
           <w:rPr>
             <w:rStyle w:val="Hyperlink"/>
@@ -26012,8 +25984,8 @@
         <w:t xml:space="preserve">.</w:t>
       </w:r>
     </w:p>
-    <w:bookmarkEnd w:id="323"/>
-    <w:bookmarkStart w:id="325" w:name="ref-Mannone2025b"/>
+    <w:bookmarkEnd w:id="322"/>
+    <w:bookmarkStart w:id="324" w:name="ref-Mannone2025b"/>
     <w:p>
       <w:pPr>
         <w:pStyle w:val="Bibliography"/>
@@ -26046,7 +26018,7 @@
       <w:r>
         <w:t xml:space="preserve"> </w:t>
       </w:r>
-      <w:hyperlink r:id="rId324">
+      <w:hyperlink r:id="rId323">
         <w:r>
           <w:rPr>
             <w:rStyle w:val="Hyperlink"/>
@@ -26058,8 +26030,8 @@
         <w:t xml:space="preserve">.</w:t>
       </w:r>
     </w:p>
-    <w:bookmarkEnd w:id="325"/>
-    <w:bookmarkStart w:id="327" w:name="ref-Mannone2022"/>
+    <w:bookmarkEnd w:id="324"/>
+    <w:bookmarkStart w:id="326" w:name="ref-Mannone2022"/>
     <w:p>
       <w:pPr>
         <w:pStyle w:val="Bibliography"/>
@@ -26092,7 +26064,7 @@
       <w:r>
         <w:t xml:space="preserve"> </w:t>
       </w:r>
-      <w:hyperlink r:id="rId326">
+      <w:hyperlink r:id="rId325">
         <w:r>
           <w:rPr>
             <w:rStyle w:val="Hyperlink"/>
@@ -26104,8 +26076,8 @@
         <w:t xml:space="preserve">.</w:t>
       </w:r>
     </w:p>
-    <w:bookmarkEnd w:id="327"/>
-    <w:bookmarkStart w:id="329" w:name="ref-Mannone2023"/>
+    <w:bookmarkEnd w:id="326"/>
+    <w:bookmarkStart w:id="328" w:name="ref-Mannone2023"/>
     <w:p>
       <w:pPr>
         <w:pStyle w:val="Bibliography"/>
@@ -26138,7 +26110,7 @@
       <w:r>
         <w:t xml:space="preserve"> </w:t>
       </w:r>
-      <w:hyperlink r:id="rId328">
+      <w:hyperlink r:id="rId327">
         <w:r>
           <w:rPr>
             <w:rStyle w:val="Hyperlink"/>
@@ -26150,8 +26122,8 @@
         <w:t xml:space="preserve">.</w:t>
       </w:r>
     </w:p>
-    <w:bookmarkEnd w:id="329"/>
-    <w:bookmarkStart w:id="331" w:name="ref-Mannone2025"/>
+    <w:bookmarkEnd w:id="328"/>
+    <w:bookmarkStart w:id="330" w:name="ref-Mannone2025"/>
     <w:p>
       <w:pPr>
         <w:pStyle w:val="Bibliography"/>
@@ -26184,7 +26156,7 @@
       <w:r>
         <w:t xml:space="preserve"> </w:t>
       </w:r>
-      <w:hyperlink r:id="rId330">
+      <w:hyperlink r:id="rId329">
         <w:r>
           <w:rPr>
             <w:rStyle w:val="Hyperlink"/>
@@ -26196,8 +26168,8 @@
         <w:t xml:space="preserve">.</w:t>
       </w:r>
     </w:p>
-    <w:bookmarkEnd w:id="331"/>
-    <w:bookmarkStart w:id="333" w:name="ref-McArdle2020"/>
+    <w:bookmarkEnd w:id="330"/>
+    <w:bookmarkStart w:id="332" w:name="ref-McArdle2020"/>
     <w:p>
       <w:pPr>
         <w:pStyle w:val="Bibliography"/>
@@ -26230,7 +26202,7 @@
       <w:r>
         <w:t xml:space="preserve"> </w:t>
       </w:r>
-      <w:hyperlink r:id="rId332">
+      <w:hyperlink r:id="rId331">
         <w:r>
           <w:rPr>
             <w:rStyle w:val="Hyperlink"/>
@@ -26242,8 +26214,8 @@
         <w:t xml:space="preserve">.</w:t>
       </w:r>
     </w:p>
-    <w:bookmarkEnd w:id="333"/>
-    <w:bookmarkStart w:id="335" w:name="ref-McClean2018"/>
+    <w:bookmarkEnd w:id="332"/>
+    <w:bookmarkStart w:id="334" w:name="ref-McClean2018"/>
     <w:p>
       <w:pPr>
         <w:pStyle w:val="Bibliography"/>
@@ -26276,7 +26248,7 @@
       <w:r>
         <w:t xml:space="preserve"> </w:t>
       </w:r>
-      <w:hyperlink r:id="rId334">
+      <w:hyperlink r:id="rId333">
         <w:r>
           <w:rPr>
             <w:rStyle w:val="Hyperlink"/>
@@ -26288,8 +26260,8 @@
         <w:t xml:space="preserve">.</w:t>
       </w:r>
     </w:p>
-    <w:bookmarkEnd w:id="335"/>
-    <w:bookmarkStart w:id="337" w:name="ref-McClean2016"/>
+    <w:bookmarkEnd w:id="334"/>
+    <w:bookmarkStart w:id="336" w:name="ref-McClean2016"/>
     <w:p>
       <w:pPr>
         <w:pStyle w:val="Bibliography"/>
@@ -26322,7 +26294,7 @@
       <w:r>
         <w:t xml:space="preserve"> </w:t>
       </w:r>
-      <w:hyperlink r:id="rId336">
+      <w:hyperlink r:id="rId335">
         <w:r>
           <w:rPr>
             <w:rStyle w:val="Hyperlink"/>
@@ -26334,90 +26306,90 @@
         <w:t xml:space="preserve">.</w:t>
       </w:r>
     </w:p>
+    <w:bookmarkEnd w:id="336"/>
+    <w:bookmarkStart w:id="337" w:name="ref-Meli2022"/>
+    <w:p>
+      <w:pPr>
+        <w:pStyle w:val="Bibliography"/>
+      </w:pPr>
+      <w:r>
+        <w:t xml:space="preserve">Meli, Natacha Kuete, Florian Mannel, and Jan Lellmann. 2022.</w:t>
+      </w:r>
+      <w:r>
+        <w:t xml:space="preserve"> </w:t>
+      </w:r>
+      <w:r>
+        <w:t xml:space="preserve">“An Iterative Quantum Approach for Transformation Estimation from Point Sets.”</w:t>
+      </w:r>
+      <w:r>
+        <w:t xml:space="preserve"> </w:t>
+      </w:r>
+      <w:r>
+        <w:t xml:space="preserve">In</w:t>
+      </w:r>
+      <w:r>
+        <w:t xml:space="preserve"> </w:t>
+      </w:r>
+      <w:r>
+        <w:rPr>
+          <w:iCs/>
+          <w:i/>
+        </w:rPr>
+        <w:t xml:space="preserve">Proceedings of the</w:t>
+      </w:r>
+      <w:r>
+        <w:rPr>
+          <w:iCs/>
+          <w:i/>
+        </w:rPr>
+        <w:t xml:space="preserve"> </w:t>
+      </w:r>
+      <w:r>
+        <w:rPr>
+          <w:iCs/>
+          <w:i/>
+        </w:rPr>
+        <w:t xml:space="preserve">IEEE/CVF</w:t>
+      </w:r>
+      <w:r>
+        <w:rPr>
+          <w:iCs/>
+          <w:i/>
+        </w:rPr>
+        <w:t xml:space="preserve"> </w:t>
+      </w:r>
+      <w:r>
+        <w:rPr>
+          <w:iCs/>
+          <w:i/>
+        </w:rPr>
+        <w:t xml:space="preserve">Conference on Computer Vision and Pattern Recognition (</w:t>
+      </w:r>
+      <w:r>
+        <w:rPr>
+          <w:iCs/>
+          <w:i/>
+        </w:rPr>
+        <w:t xml:space="preserve">CVPR</w:t>
+      </w:r>
+      <w:r>
+        <w:rPr>
+          <w:iCs/>
+          <w:i/>
+        </w:rPr>
+        <w:t xml:space="preserve">)</w:t>
+      </w:r>
+      <w:r>
+        <w:t xml:space="preserve">, 529–37. IEEE.</w:t>
+      </w:r>
+    </w:p>
     <w:bookmarkEnd w:id="337"/>
-    <w:bookmarkStart w:id="338" w:name="ref-Meli2022"/>
+    <w:bookmarkStart w:id="339" w:name="ref-Meyer2022"/>
     <w:p>
       <w:pPr>
         <w:pStyle w:val="Bibliography"/>
       </w:pPr>
       <w:r>
-        <w:t xml:space="preserve">Meli, Natacha Kuete, Florian Mannel, and Jan Lellmann. 2022.</w:t>
-      </w:r>
-      <w:r>
-        <w:t xml:space="preserve"> </w:t>
-      </w:r>
-      <w:r>
-        <w:t xml:space="preserve">“An Iterative Quantum Approach for Transformation Estimation from Point Sets.”</w:t>
-      </w:r>
-      <w:r>
-        <w:t xml:space="preserve"> </w:t>
-      </w:r>
-      <w:r>
-        <w:t xml:space="preserve">In</w:t>
-      </w:r>
-      <w:r>
-        <w:t xml:space="preserve"> </w:t>
-      </w:r>
-      <w:r>
-        <w:rPr>
-          <w:iCs/>
-          <w:i/>
-        </w:rPr>
-        <w:t xml:space="preserve">Proceedings of the</w:t>
-      </w:r>
-      <w:r>
-        <w:rPr>
-          <w:iCs/>
-          <w:i/>
-        </w:rPr>
-        <w:t xml:space="preserve"> </w:t>
-      </w:r>
-      <w:r>
-        <w:rPr>
-          <w:iCs/>
-          <w:i/>
-        </w:rPr>
-        <w:t xml:space="preserve">IEEE/CVF</w:t>
-      </w:r>
-      <w:r>
-        <w:rPr>
-          <w:iCs/>
-          <w:i/>
-        </w:rPr>
-        <w:t xml:space="preserve"> </w:t>
-      </w:r>
-      <w:r>
-        <w:rPr>
-          <w:iCs/>
-          <w:i/>
-        </w:rPr>
-        <w:t xml:space="preserve">Conference on Computer Vision and Pattern Recognition (</w:t>
-      </w:r>
-      <w:r>
-        <w:rPr>
-          <w:iCs/>
-          <w:i/>
-        </w:rPr>
-        <w:t xml:space="preserve">CVPR</w:t>
-      </w:r>
-      <w:r>
-        <w:rPr>
-          <w:iCs/>
-          <w:i/>
-        </w:rPr>
-        <w:t xml:space="preserve">)</w:t>
-      </w:r>
-      <w:r>
-        <w:t xml:space="preserve">, 529–37. IEEE.</w:t>
-      </w:r>
-    </w:p>
-    <w:bookmarkEnd w:id="338"/>
-    <w:bookmarkStart w:id="340" w:name="ref-Meyer2022"/>
-    <w:p>
-      <w:pPr>
-        <w:pStyle w:val="Bibliography"/>
-      </w:pPr>
-      <w:r>
         <w:t xml:space="preserve">Meyer, Nico, Christian Ufrecht, Maniraman Periyasamy, Daniel D. Scherer, Axel Plinge, and Christopher Mutschler. 2022.</w:t>
       </w:r>
       <w:r>
@@ -26429,7 +26401,7 @@
       <w:r>
         <w:t xml:space="preserve"> </w:t>
       </w:r>
-      <w:hyperlink r:id="rId339">
+      <w:hyperlink r:id="rId338">
         <w:r>
           <w:rPr>
             <w:rStyle w:val="Hyperlink"/>
@@ -26441,8 +26413,8 @@
         <w:t xml:space="preserve">.</w:t>
       </w:r>
     </w:p>
-    <w:bookmarkEnd w:id="340"/>
-    <w:bookmarkStart w:id="342" w:name="ref-Mitarai2018"/>
+    <w:bookmarkEnd w:id="339"/>
+    <w:bookmarkStart w:id="341" w:name="ref-Mitarai2018"/>
     <w:p>
       <w:pPr>
         <w:pStyle w:val="Bibliography"/>
@@ -26475,7 +26447,7 @@
       <w:r>
         <w:t xml:space="preserve"> </w:t>
       </w:r>
-      <w:hyperlink r:id="rId341">
+      <w:hyperlink r:id="rId340">
         <w:r>
           <w:rPr>
             <w:rStyle w:val="Hyperlink"/>
@@ -26487,8 +26459,8 @@
         <w:t xml:space="preserve">.</w:t>
       </w:r>
     </w:p>
-    <w:bookmarkEnd w:id="342"/>
-    <w:bookmarkStart w:id="344" w:name="ref-Montanaro2015"/>
+    <w:bookmarkEnd w:id="341"/>
+    <w:bookmarkStart w:id="343" w:name="ref-Montanaro2015"/>
     <w:p>
       <w:pPr>
         <w:pStyle w:val="Bibliography"/>
@@ -26533,7 +26505,7 @@
       <w:r>
         <w:t xml:space="preserve"> </w:t>
       </w:r>
-      <w:hyperlink r:id="rId343">
+      <w:hyperlink r:id="rId342">
         <w:r>
           <w:rPr>
             <w:rStyle w:val="Hyperlink"/>
@@ -26545,8 +26517,8 @@
         <w:t xml:space="preserve">.</w:t>
       </w:r>
     </w:p>
-    <w:bookmarkEnd w:id="344"/>
-    <w:bookmarkStart w:id="346" w:name="ref-Montanaro2016"/>
+    <w:bookmarkEnd w:id="343"/>
+    <w:bookmarkStart w:id="345" w:name="ref-Montanaro2016"/>
     <w:p>
       <w:pPr>
         <w:pStyle w:val="Bibliography"/>
@@ -26579,7 +26551,7 @@
       <w:r>
         <w:t xml:space="preserve"> </w:t>
       </w:r>
-      <w:hyperlink r:id="rId345">
+      <w:hyperlink r:id="rId344">
         <w:r>
           <w:rPr>
             <w:rStyle w:val="Hyperlink"/>
@@ -26591,8 +26563,8 @@
         <w:t xml:space="preserve">.</w:t>
       </w:r>
     </w:p>
-    <w:bookmarkEnd w:id="346"/>
-    <w:bookmarkStart w:id="348" w:name="ref-Muradoglu2025"/>
+    <w:bookmarkEnd w:id="345"/>
+    <w:bookmarkStart w:id="347" w:name="ref-Muradoglu2025"/>
     <w:p>
       <w:pPr>
         <w:pStyle w:val="Bibliography"/>
@@ -26621,7 +26593,7 @@
       <w:r>
         <w:t xml:space="preserve"> </w:t>
       </w:r>
-      <w:hyperlink r:id="rId347">
+      <w:hyperlink r:id="rId346">
         <w:r>
           <w:rPr>
             <w:rStyle w:val="Hyperlink"/>
@@ -26633,8 +26605,8 @@
         <w:t xml:space="preserve">.</w:t>
       </w:r>
     </w:p>
-    <w:bookmarkEnd w:id="348"/>
-    <w:bookmarkStart w:id="350" w:name="ref-Neukart2017"/>
+    <w:bookmarkEnd w:id="347"/>
+    <w:bookmarkStart w:id="349" w:name="ref-Neukart2017"/>
     <w:p>
       <w:pPr>
         <w:pStyle w:val="Bibliography"/>
@@ -26667,7 +26639,7 @@
       <w:r>
         <w:t xml:space="preserve"> </w:t>
       </w:r>
-      <w:hyperlink r:id="rId349">
+      <w:hyperlink r:id="rId348">
         <w:r>
           <w:rPr>
             <w:rStyle w:val="Hyperlink"/>
@@ -26679,8 +26651,8 @@
         <w:t xml:space="preserve">.</w:t>
       </w:r>
     </w:p>
-    <w:bookmarkEnd w:id="350"/>
-    <w:bookmarkStart w:id="352" w:name="ref-Ngo2026"/>
+    <w:bookmarkEnd w:id="349"/>
+    <w:bookmarkStart w:id="351" w:name="ref-Ngo2026"/>
     <w:p>
       <w:pPr>
         <w:pStyle w:val="Bibliography"/>
@@ -26709,7 +26681,7 @@
       <w:r>
         <w:t xml:space="preserve"> </w:t>
       </w:r>
-      <w:hyperlink r:id="rId351">
+      <w:hyperlink r:id="rId350">
         <w:r>
           <w:rPr>
             <w:rStyle w:val="Hyperlink"/>
@@ -26721,8 +26693,8 @@
         <w:t xml:space="preserve">.</w:t>
       </w:r>
     </w:p>
-    <w:bookmarkEnd w:id="352"/>
-    <w:bookmarkStart w:id="354" w:name="ref-Nielsen2010"/>
+    <w:bookmarkEnd w:id="351"/>
+    <w:bookmarkStart w:id="353" w:name="ref-Nielsen2010"/>
     <w:p>
       <w:pPr>
         <w:pStyle w:val="Bibliography"/>
@@ -26746,7 +26718,7 @@
       <w:r>
         <w:t xml:space="preserve"> </w:t>
       </w:r>
-      <w:hyperlink r:id="rId353">
+      <w:hyperlink r:id="rId352">
         <w:r>
           <w:rPr>
             <w:rStyle w:val="Hyperlink"/>
@@ -26758,8 +26730,8 @@
         <w:t xml:space="preserve">.</w:t>
       </w:r>
     </w:p>
-    <w:bookmarkEnd w:id="354"/>
-    <w:bookmarkStart w:id="356" w:name="ref-Nigatu2026"/>
+    <w:bookmarkEnd w:id="353"/>
+    <w:bookmarkStart w:id="355" w:name="ref-Nigatu2026"/>
     <w:p>
       <w:pPr>
         <w:pStyle w:val="Bibliography"/>
@@ -26792,7 +26764,7 @@
       <w:r>
         <w:t xml:space="preserve"> </w:t>
       </w:r>
-      <w:hyperlink r:id="rId355">
+      <w:hyperlink r:id="rId354">
         <w:r>
           <w:rPr>
             <w:rStyle w:val="Hyperlink"/>
@@ -26804,51 +26776,51 @@
         <w:t xml:space="preserve">.</w:t>
       </w:r>
     </w:p>
+    <w:bookmarkEnd w:id="355"/>
+    <w:bookmarkStart w:id="356" w:name="ref-Nigatu2025"/>
+    <w:p>
+      <w:pPr>
+        <w:pStyle w:val="Bibliography"/>
+      </w:pPr>
+      <w:r>
+        <w:t xml:space="preserve">Nigatu, Hassen, Gaokun Shi, Jituo Li, Jin Wang, Guodong Lu, and Howard Li. 2025.</w:t>
+      </w:r>
+      <w:r>
+        <w:t xml:space="preserve"> </w:t>
+      </w:r>
+      <w:r>
+        <w:t xml:space="preserve">“Quantum Machine Learning and</w:t>
+      </w:r>
+      <w:r>
+        <w:t xml:space="preserve"> </w:t>
+      </w:r>
+      <w:r>
+        <w:t xml:space="preserve">Grover</w:t>
+      </w:r>
+      <w:r>
+        <w:t xml:space="preserve">’s Algorithm for Quantum Optimization of Robotic Manipulators.”</w:t>
+      </w:r>
+      <w:r>
+        <w:t xml:space="preserve"> </w:t>
+      </w:r>
+      <w:r>
+        <w:rPr>
+          <w:iCs/>
+          <w:i/>
+        </w:rPr>
+        <w:t xml:space="preserve">IEEE Robotics and Automation Letters</w:t>
+      </w:r>
+      <w:r>
+        <w:t xml:space="preserve">.</w:t>
+      </w:r>
+    </w:p>
     <w:bookmarkEnd w:id="356"/>
-    <w:bookmarkStart w:id="357" w:name="ref-Nigatu2025"/>
+    <w:bookmarkStart w:id="358" w:name="ref-Ohzeki2019"/>
     <w:p>
       <w:pPr>
         <w:pStyle w:val="Bibliography"/>
       </w:pPr>
       <w:r>
-        <w:t xml:space="preserve">Nigatu, Hassen, Gaokun Shi, Jituo Li, Jin Wang, Guodong Lu, and Howard Li. 2025.</w:t>
-      </w:r>
-      <w:r>
-        <w:t xml:space="preserve"> </w:t>
-      </w:r>
-      <w:r>
-        <w:t xml:space="preserve">“Quantum Machine Learning and</w:t>
-      </w:r>
-      <w:r>
-        <w:t xml:space="preserve"> </w:t>
-      </w:r>
-      <w:r>
-        <w:t xml:space="preserve">Grover</w:t>
-      </w:r>
-      <w:r>
-        <w:t xml:space="preserve">’s Algorithm for Quantum Optimization of Robotic Manipulators.”</w:t>
-      </w:r>
-      <w:r>
-        <w:t xml:space="preserve"> </w:t>
-      </w:r>
-      <w:r>
-        <w:rPr>
-          <w:iCs/>
-          <w:i/>
-        </w:rPr>
-        <w:t xml:space="preserve">IEEE Robotics and Automation Letters</w:t>
-      </w:r>
-      <w:r>
-        <w:t xml:space="preserve">.</w:t>
-      </w:r>
-    </w:p>
-    <w:bookmarkEnd w:id="357"/>
-    <w:bookmarkStart w:id="359" w:name="ref-Ohzeki2019"/>
-    <w:p>
-      <w:pPr>
-        <w:pStyle w:val="Bibliography"/>
-      </w:pPr>
-      <w:r>
         <w:t xml:space="preserve">Ohzeki, Masayuki, Akira Miki, Masamichi J. Miyama, and Masayoshi Terabe. 2019.</w:t>
       </w:r>
       <w:r>
@@ -26876,7 +26848,7 @@
       <w:r>
         <w:t xml:space="preserve"> </w:t>
       </w:r>
-      <w:hyperlink r:id="rId358">
+      <w:hyperlink r:id="rId357">
         <w:r>
           <w:rPr>
             <w:rStyle w:val="Hyperlink"/>
@@ -26888,8 +26860,8 @@
         <w:t xml:space="preserve">.</w:t>
       </w:r>
     </w:p>
-    <w:bookmarkEnd w:id="359"/>
-    <w:bookmarkStart w:id="361" w:name="ref-Osaba2025"/>
+    <w:bookmarkEnd w:id="358"/>
+    <w:bookmarkStart w:id="360" w:name="ref-Osaba2025"/>
     <w:p>
       <w:pPr>
         <w:pStyle w:val="Bibliography"/>
@@ -26979,7 +26951,7 @@
       <w:r>
         <w:t xml:space="preserve"> </w:t>
       </w:r>
-      <w:hyperlink r:id="rId360">
+      <w:hyperlink r:id="rId359">
         <w:r>
           <w:rPr>
             <w:rStyle w:val="Hyperlink"/>
@@ -26991,8 +26963,8 @@
         <w:t xml:space="preserve">.</w:t>
       </w:r>
     </w:p>
-    <w:bookmarkEnd w:id="361"/>
-    <w:bookmarkStart w:id="363" w:name="ref-OsabaDrone2025"/>
+    <w:bookmarkEnd w:id="360"/>
+    <w:bookmarkStart w:id="362" w:name="ref-OsabaDrone2025"/>
     <w:p>
       <w:pPr>
         <w:pStyle w:val="Bibliography"/>
@@ -27042,7 +27014,7 @@
       <w:r>
         <w:t xml:space="preserve"> </w:t>
       </w:r>
-      <w:hyperlink r:id="rId362">
+      <w:hyperlink r:id="rId361">
         <w:r>
           <w:rPr>
             <w:rStyle w:val="Hyperlink"/>
@@ -27054,8 +27026,8 @@
         <w:t xml:space="preserve">.</w:t>
       </w:r>
     </w:p>
-    <w:bookmarkEnd w:id="363"/>
-    <w:bookmarkStart w:id="365" w:name="ref-Otani2025"/>
+    <w:bookmarkEnd w:id="362"/>
+    <w:bookmarkStart w:id="364" w:name="ref-Otani2025"/>
     <w:p>
       <w:pPr>
         <w:pStyle w:val="Bibliography"/>
@@ -27088,7 +27060,7 @@
       <w:r>
         <w:t xml:space="preserve"> </w:t>
       </w:r>
-      <w:hyperlink r:id="rId364">
+      <w:hyperlink r:id="rId363">
         <w:r>
           <w:rPr>
             <w:rStyle w:val="Hyperlink"/>
@@ -27100,8 +27072,8 @@
         <w:t xml:space="preserve">.</w:t>
       </w:r>
     </w:p>
-    <w:bookmarkEnd w:id="365"/>
-    <w:bookmarkStart w:id="367" w:name="ref-Page2021"/>
+    <w:bookmarkEnd w:id="364"/>
+    <w:bookmarkStart w:id="366" w:name="ref-Page2021"/>
     <w:p>
       <w:pPr>
         <w:pStyle w:val="Bibliography"/>
@@ -27146,7 +27118,7 @@
       <w:r>
         <w:t xml:space="preserve"> </w:t>
       </w:r>
-      <w:hyperlink r:id="rId366">
+      <w:hyperlink r:id="rId365">
         <w:r>
           <w:rPr>
             <w:rStyle w:val="Hyperlink"/>
@@ -27158,8 +27130,8 @@
         <w:t xml:space="preserve">.</w:t>
       </w:r>
     </w:p>
-    <w:bookmarkEnd w:id="367"/>
-    <w:bookmarkStart w:id="369" w:name="ref-Paparo2014"/>
+    <w:bookmarkEnd w:id="366"/>
+    <w:bookmarkStart w:id="368" w:name="ref-Paparo2014"/>
     <w:p>
       <w:pPr>
         <w:pStyle w:val="Bibliography"/>
@@ -27192,7 +27164,7 @@
       <w:r>
         <w:t xml:space="preserve"> </w:t>
       </w:r>
-      <w:hyperlink r:id="rId368">
+      <w:hyperlink r:id="rId367">
         <w:r>
           <w:rPr>
             <w:rStyle w:val="Hyperlink"/>
@@ -27204,86 +27176,86 @@
         <w:t xml:space="preserve">.</w:t>
       </w:r>
     </w:p>
+    <w:bookmarkEnd w:id="368"/>
+    <w:bookmarkStart w:id="369" w:name="ref-Park2023"/>
+    <w:p>
+      <w:pPr>
+        <w:pStyle w:val="Bibliography"/>
+      </w:pPr>
+      <w:r>
+        <w:t xml:space="preserve">Park, Chanyoung, Won Joon Yun, Jae Pyoung Kim, Tiago Koketsu Rodrigues, Soohyun Park, Soyi Jung, and Joongheon Kim. 2023.</w:t>
+      </w:r>
+      <w:r>
+        <w:t xml:space="preserve"> </w:t>
+      </w:r>
+      <w:r>
+        <w:t xml:space="preserve">“Quantum Multi-Agent Actor-Critic Networks for Cooperative Mobile Access in Multi-</w:t>
+      </w:r>
+      <w:r>
+        <w:t xml:space="preserve">UAV</w:t>
+      </w:r>
+      <w:r>
+        <w:t xml:space="preserve"> </w:t>
+      </w:r>
+      <w:r>
+        <w:t xml:space="preserve">Systems.”</w:t>
+      </w:r>
+      <w:r>
+        <w:t xml:space="preserve"> </w:t>
+      </w:r>
+      <w:r>
+        <w:rPr>
+          <w:iCs/>
+          <w:i/>
+        </w:rPr>
+        <w:t xml:space="preserve">IEEE Internet of Things Journal</w:t>
+      </w:r>
+      <w:r>
+        <w:t xml:space="preserve"> </w:t>
+      </w:r>
+      <w:r>
+        <w:t xml:space="preserve">10 (22): 20033–48.</w:t>
+      </w:r>
+    </w:p>
     <w:bookmarkEnd w:id="369"/>
-    <w:bookmarkStart w:id="370" w:name="ref-Park2023"/>
+    <w:bookmarkStart w:id="370" w:name="ref-Park2024"/>
     <w:p>
       <w:pPr>
         <w:pStyle w:val="Bibliography"/>
       </w:pPr>
       <w:r>
-        <w:t xml:space="preserve">Park, Chanyoung, Won Joon Yun, Jae Pyoung Kim, Tiago Koketsu Rodrigues, Soohyun Park, Soyi Jung, and Joongheon Kim. 2023.</w:t>
-      </w:r>
-      <w:r>
-        <w:t xml:space="preserve"> </w:t>
-      </w:r>
-      <w:r>
-        <w:t xml:space="preserve">“Quantum Multi-Agent Actor-Critic Networks for Cooperative Mobile Access in Multi-</w:t>
-      </w:r>
-      <w:r>
-        <w:t xml:space="preserve">UAV</w:t>
-      </w:r>
-      <w:r>
-        <w:t xml:space="preserve"> </w:t>
-      </w:r>
-      <w:r>
-        <w:t xml:space="preserve">Systems.”</w:t>
-      </w:r>
-      <w:r>
-        <w:t xml:space="preserve"> </w:t>
-      </w:r>
-      <w:r>
-        <w:rPr>
-          <w:iCs/>
-          <w:i/>
-        </w:rPr>
-        <w:t xml:space="preserve">IEEE Internet of Things Journal</w:t>
-      </w:r>
-      <w:r>
-        <w:t xml:space="preserve"> </w:t>
-      </w:r>
-      <w:r>
-        <w:t xml:space="preserve">10 (22): 20033–48.</w:t>
+        <w:t xml:space="preserve">Park, Soohyun, Jae Pyoung Kim, Chanyoung Park, Soyi Jung, and Joongheon Kim. 2024.</w:t>
+      </w:r>
+      <w:r>
+        <w:t xml:space="preserve"> </w:t>
+      </w:r>
+      <w:r>
+        <w:t xml:space="preserve">“Quantum Multi-Agent Reinforcement Learning for Autonomous Mobility Cooperation.”</w:t>
+      </w:r>
+      <w:r>
+        <w:t xml:space="preserve"> </w:t>
+      </w:r>
+      <w:r>
+        <w:rPr>
+          <w:iCs/>
+          <w:i/>
+        </w:rPr>
+        <w:t xml:space="preserve">IEEE Communications Magazine</w:t>
+      </w:r>
+      <w:r>
+        <w:t xml:space="preserve"> </w:t>
+      </w:r>
+      <w:r>
+        <w:t xml:space="preserve">62 (6): 106–12.</w:t>
       </w:r>
     </w:p>
     <w:bookmarkEnd w:id="370"/>
-    <w:bookmarkStart w:id="371" w:name="ref-Park2024"/>
+    <w:bookmarkStart w:id="372" w:name="ref-Peruzzo2014"/>
     <w:p>
       <w:pPr>
         <w:pStyle w:val="Bibliography"/>
       </w:pPr>
       <w:r>
-        <w:t xml:space="preserve">Park, Soohyun, Jae Pyoung Kim, Chanyoung Park, Soyi Jung, and Joongheon Kim. 2024.</w:t>
-      </w:r>
-      <w:r>
-        <w:t xml:space="preserve"> </w:t>
-      </w:r>
-      <w:r>
-        <w:t xml:space="preserve">“Quantum Multi-Agent Reinforcement Learning for Autonomous Mobility Cooperation.”</w:t>
-      </w:r>
-      <w:r>
-        <w:t xml:space="preserve"> </w:t>
-      </w:r>
-      <w:r>
-        <w:rPr>
-          <w:iCs/>
-          <w:i/>
-        </w:rPr>
-        <w:t xml:space="preserve">IEEE Communications Magazine</w:t>
-      </w:r>
-      <w:r>
-        <w:t xml:space="preserve"> </w:t>
-      </w:r>
-      <w:r>
-        <w:t xml:space="preserve">62 (6): 106–12.</w:t>
-      </w:r>
-    </w:p>
-    <w:bookmarkEnd w:id="371"/>
-    <w:bookmarkStart w:id="373" w:name="ref-Peruzzo2014"/>
-    <w:p>
-      <w:pPr>
-        <w:pStyle w:val="Bibliography"/>
-      </w:pPr>
-      <w:r>
         <w:t xml:space="preserve">Peruzzo, Alberto, Jarrod McClean, Peter Shadbolt, Man-Hong Yung, Xiao-Qi Zhou, Peter J. Love, Alán Aspuru-Guzik, and Jeremy L. O’Brien. 2014.</w:t>
       </w:r>
       <w:r>
@@ -27311,7 +27283,7 @@
       <w:r>
         <w:t xml:space="preserve"> </w:t>
       </w:r>
-      <w:hyperlink r:id="rId372">
+      <w:hyperlink r:id="rId371">
         <w:r>
           <w:rPr>
             <w:rStyle w:val="Hyperlink"/>
@@ -27323,8 +27295,8 @@
         <w:t xml:space="preserve">.</w:t>
       </w:r>
     </w:p>
-    <w:bookmarkEnd w:id="373"/>
-    <w:bookmarkStart w:id="375" w:name="ref-Petschnigg2019"/>
+    <w:bookmarkEnd w:id="372"/>
+    <w:bookmarkStart w:id="374" w:name="ref-Petschnigg2019"/>
     <w:p>
       <w:pPr>
         <w:pStyle w:val="Bibliography"/>
@@ -27374,7 +27346,7 @@
       <w:r>
         <w:t xml:space="preserve"> </w:t>
       </w:r>
-      <w:hyperlink r:id="rId374">
+      <w:hyperlink r:id="rId373">
         <w:r>
           <w:rPr>
             <w:rStyle w:val="Hyperlink"/>
@@ -27386,8 +27358,8 @@
         <w:t xml:space="preserve">.</w:t>
       </w:r>
     </w:p>
-    <w:bookmarkEnd w:id="375"/>
-    <w:bookmarkStart w:id="377" w:name="ref-Pothos2013"/>
+    <w:bookmarkEnd w:id="374"/>
+    <w:bookmarkStart w:id="376" w:name="ref-Pothos2013"/>
     <w:p>
       <w:pPr>
         <w:pStyle w:val="Bibliography"/>
@@ -27420,7 +27392,7 @@
       <w:r>
         <w:t xml:space="preserve"> </w:t>
       </w:r>
-      <w:hyperlink r:id="rId376">
+      <w:hyperlink r:id="rId375">
         <w:r>
           <w:rPr>
             <w:rStyle w:val="Hyperlink"/>
@@ -27432,8 +27404,8 @@
         <w:t xml:space="preserve">.</w:t>
       </w:r>
     </w:p>
-    <w:bookmarkEnd w:id="377"/>
-    <w:bookmarkStart w:id="379" w:name="ref-Pothos2022"/>
+    <w:bookmarkEnd w:id="376"/>
+    <w:bookmarkStart w:id="378" w:name="ref-Pothos2022"/>
     <w:p>
       <w:pPr>
         <w:pStyle w:val="Bibliography"/>
@@ -27466,7 +27438,7 @@
       <w:r>
         <w:t xml:space="preserve"> </w:t>
       </w:r>
-      <w:hyperlink r:id="rId378">
+      <w:hyperlink r:id="rId377">
         <w:r>
           <w:rPr>
             <w:rStyle w:val="Hyperlink"/>
@@ -27478,8 +27450,8 @@
         <w:t xml:space="preserve">.</w:t>
       </w:r>
     </w:p>
-    <w:bookmarkEnd w:id="379"/>
-    <w:bookmarkStart w:id="381" w:name="ref-Preskill2018"/>
+    <w:bookmarkEnd w:id="378"/>
+    <w:bookmarkStart w:id="380" w:name="ref-Preskill2018"/>
     <w:p>
       <w:pPr>
         <w:pStyle w:val="Bibliography"/>
@@ -27524,7 +27496,7 @@
       <w:r>
         <w:t xml:space="preserve"> </w:t>
       </w:r>
-      <w:hyperlink r:id="rId380">
+      <w:hyperlink r:id="rId379">
         <w:r>
           <w:rPr>
             <w:rStyle w:val="Hyperlink"/>
@@ -27536,8 +27508,8 @@
         <w:t xml:space="preserve">.</w:t>
       </w:r>
     </w:p>
-    <w:bookmarkEnd w:id="381"/>
-    <w:bookmarkStart w:id="383" w:name="ref-Quang2025"/>
+    <w:bookmarkEnd w:id="380"/>
+    <w:bookmarkStart w:id="382" w:name="ref-Quang2025"/>
     <w:p>
       <w:pPr>
         <w:pStyle w:val="Bibliography"/>
@@ -27582,7 +27554,7 @@
       <w:r>
         <w:t xml:space="preserve"> </w:t>
       </w:r>
-      <w:hyperlink r:id="rId382">
+      <w:hyperlink r:id="rId381">
         <w:r>
           <w:rPr>
             <w:rStyle w:val="Hyperlink"/>
@@ -27594,62 +27566,62 @@
         <w:t xml:space="preserve">.</w:t>
       </w:r>
     </w:p>
+    <w:bookmarkEnd w:id="382"/>
+    <w:bookmarkStart w:id="383" w:name="ref-Raghuvanshi2007"/>
+    <w:p>
+      <w:pPr>
+        <w:pStyle w:val="Bibliography"/>
+      </w:pPr>
+      <w:r>
+        <w:t xml:space="preserve">Raghuvanshi, Arushi, Yale Fan, Michal Woyke, and Marek Perkowski. 2007.</w:t>
+      </w:r>
+      <w:r>
+        <w:t xml:space="preserve"> </w:t>
+      </w:r>
+      <w:r>
+        <w:t xml:space="preserve">“Quantum Robots for Teenagers.”</w:t>
+      </w:r>
+      <w:r>
+        <w:t xml:space="preserve"> </w:t>
+      </w:r>
+      <w:r>
+        <w:t xml:space="preserve">In</w:t>
+      </w:r>
+      <w:r>
+        <w:t xml:space="preserve"> </w:t>
+      </w:r>
+      <w:r>
+        <w:rPr>
+          <w:iCs/>
+          <w:i/>
+        </w:rPr>
+        <w:t xml:space="preserve">Proceedings of the 37th International Symposium on Multiple-Valued Logic (</w:t>
+      </w:r>
+      <w:r>
+        <w:rPr>
+          <w:iCs/>
+          <w:i/>
+        </w:rPr>
+        <w:t xml:space="preserve">ISMVL</w:t>
+      </w:r>
+      <w:r>
+        <w:rPr>
+          <w:iCs/>
+          <w:i/>
+        </w:rPr>
+        <w:t xml:space="preserve">’07)</w:t>
+      </w:r>
+      <w:r>
+        <w:t xml:space="preserve">. IEEE.</w:t>
+      </w:r>
+    </w:p>
     <w:bookmarkEnd w:id="383"/>
-    <w:bookmarkStart w:id="384" w:name="ref-Raghuvanshi2007"/>
+    <w:bookmarkStart w:id="385" w:name="ref-Rao2024"/>
     <w:p>
       <w:pPr>
         <w:pStyle w:val="Bibliography"/>
       </w:pPr>
       <w:r>
-        <w:t xml:space="preserve">Raghuvanshi, Arushi, Yale Fan, Michal Woyke, and Marek Perkowski. 2007.</w:t>
-      </w:r>
-      <w:r>
-        <w:t xml:space="preserve"> </w:t>
-      </w:r>
-      <w:r>
-        <w:t xml:space="preserve">“Quantum Robots for Teenagers.”</w:t>
-      </w:r>
-      <w:r>
-        <w:t xml:space="preserve"> </w:t>
-      </w:r>
-      <w:r>
-        <w:t xml:space="preserve">In</w:t>
-      </w:r>
-      <w:r>
-        <w:t xml:space="preserve"> </w:t>
-      </w:r>
-      <w:r>
-        <w:rPr>
-          <w:iCs/>
-          <w:i/>
-        </w:rPr>
-        <w:t xml:space="preserve">Proceedings of the 37th International Symposium on Multiple-Valued Logic (</w:t>
-      </w:r>
-      <w:r>
-        <w:rPr>
-          <w:iCs/>
-          <w:i/>
-        </w:rPr>
-        <w:t xml:space="preserve">ISMVL</w:t>
-      </w:r>
-      <w:r>
-        <w:rPr>
-          <w:iCs/>
-          <w:i/>
-        </w:rPr>
-        <w:t xml:space="preserve">’07)</w:t>
-      </w:r>
-      <w:r>
-        <w:t xml:space="preserve">. IEEE.</w:t>
-      </w:r>
-    </w:p>
-    <w:bookmarkEnd w:id="384"/>
-    <w:bookmarkStart w:id="386" w:name="ref-Rao2024"/>
-    <w:p>
-      <w:pPr>
-        <w:pStyle w:val="Bibliography"/>
-      </w:pPr>
-      <w:r>
         <w:t xml:space="preserve">Rao, Poojith U., Florian Speelman, Balwinder Sodhi, and Sachin Kinge. 2024.</w:t>
       </w:r>
       <w:r>
@@ -27661,7 +27633,7 @@
       <w:r>
         <w:t xml:space="preserve"> </w:t>
       </w:r>
-      <w:hyperlink r:id="rId385">
+      <w:hyperlink r:id="rId384">
         <w:r>
           <w:rPr>
             <w:rStyle w:val="Hyperlink"/>
@@ -27673,8 +27645,8 @@
         <w:t xml:space="preserve">.</w:t>
       </w:r>
     </w:p>
-    <w:bookmarkEnd w:id="386"/>
-    <w:bookmarkStart w:id="388" w:name="ref-Ravi2021"/>
+    <w:bookmarkEnd w:id="385"/>
+    <w:bookmarkStart w:id="387" w:name="ref-Ravi2021"/>
     <w:p>
       <w:pPr>
         <w:pStyle w:val="Bibliography"/>
@@ -27752,7 +27724,7 @@
       <w:r>
         <w:t xml:space="preserve"> </w:t>
       </w:r>
-      <w:hyperlink r:id="rId387">
+      <w:hyperlink r:id="rId386">
         <w:r>
           <w:rPr>
             <w:rStyle w:val="Hyperlink"/>
@@ -27764,8 +27736,8 @@
         <w:t xml:space="preserve">.</w:t>
       </w:r>
     </w:p>
-    <w:bookmarkEnd w:id="388"/>
-    <w:bookmarkStart w:id="390" w:name="ref-Rebentrost2014"/>
+    <w:bookmarkEnd w:id="387"/>
+    <w:bookmarkStart w:id="389" w:name="ref-Rebentrost2014"/>
     <w:p>
       <w:pPr>
         <w:pStyle w:val="Bibliography"/>
@@ -27798,7 +27770,7 @@
       <w:r>
         <w:t xml:space="preserve"> </w:t>
       </w:r>
-      <w:hyperlink r:id="rId389">
+      <w:hyperlink r:id="rId388">
         <w:r>
           <w:rPr>
             <w:rStyle w:val="Hyperlink"/>
@@ -27810,8 +27782,8 @@
         <w:t xml:space="preserve">.</w:t>
       </w:r>
     </w:p>
-    <w:bookmarkEnd w:id="390"/>
-    <w:bookmarkStart w:id="392" w:name="ref-Reiher2017"/>
+    <w:bookmarkEnd w:id="389"/>
+    <w:bookmarkStart w:id="391" w:name="ref-Reiher2017"/>
     <w:p>
       <w:pPr>
         <w:pStyle w:val="Bibliography"/>
@@ -27844,7 +27816,7 @@
       <w:r>
         <w:t xml:space="preserve"> </w:t>
       </w:r>
-      <w:hyperlink r:id="rId391">
+      <w:hyperlink r:id="rId390">
         <w:r>
           <w:rPr>
             <w:rStyle w:val="Hyperlink"/>
@@ -27856,8 +27828,8 @@
         <w:t xml:space="preserve">.</w:t>
       </w:r>
     </w:p>
-    <w:bookmarkEnd w:id="392"/>
-    <w:bookmarkStart w:id="394" w:name="ref-Rice2021"/>
+    <w:bookmarkEnd w:id="391"/>
+    <w:bookmarkStart w:id="393" w:name="ref-Rice2021"/>
     <w:p>
       <w:pPr>
         <w:pStyle w:val="Bibliography"/>
@@ -27890,7 +27862,7 @@
       <w:r>
         <w:t xml:space="preserve"> </w:t>
       </w:r>
-      <w:hyperlink r:id="rId393">
+      <w:hyperlink r:id="rId392">
         <w:r>
           <w:rPr>
             <w:rStyle w:val="Hyperlink"/>
@@ -27902,8 +27874,8 @@
         <w:t xml:space="preserve">.</w:t>
       </w:r>
     </w:p>
-    <w:bookmarkEnd w:id="394"/>
-    <w:bookmarkStart w:id="396" w:name="ref-Rieffel2015"/>
+    <w:bookmarkEnd w:id="393"/>
+    <w:bookmarkStart w:id="395" w:name="ref-Rieffel2015"/>
     <w:p>
       <w:pPr>
         <w:pStyle w:val="Bibliography"/>
@@ -27936,7 +27908,7 @@
       <w:r>
         <w:t xml:space="preserve"> </w:t>
       </w:r>
-      <w:hyperlink r:id="rId395">
+      <w:hyperlink r:id="rId394">
         <w:r>
           <w:rPr>
             <w:rStyle w:val="Hyperlink"/>
@@ -27948,45 +27920,45 @@
         <w:t xml:space="preserve">.</w:t>
       </w:r>
     </w:p>
+    <w:bookmarkEnd w:id="395"/>
+    <w:bookmarkStart w:id="396" w:name="ref-Roh2025"/>
+    <w:p>
+      <w:pPr>
+        <w:pStyle w:val="Bibliography"/>
+      </w:pPr>
+      <w:r>
+        <w:t xml:space="preserve">Roh, Emily Jimin, Hankyul Baek, Donghyeon Kim, and Joongheon Kim. 2025.</w:t>
+      </w:r>
+      <w:r>
+        <w:t xml:space="preserve"> </w:t>
+      </w:r>
+      <w:r>
+        <w:t xml:space="preserve">“Fast Quantum Convolutional Neural Networks for Low-Complexity Object Detection in Autonomous Driving Applications.”</w:t>
+      </w:r>
+      <w:r>
+        <w:t xml:space="preserve"> </w:t>
+      </w:r>
+      <w:r>
+        <w:rPr>
+          <w:iCs/>
+          <w:i/>
+        </w:rPr>
+        <w:t xml:space="preserve">IEEE Transactions on Mobile Computing</w:t>
+      </w:r>
+      <w:r>
+        <w:t xml:space="preserve"> </w:t>
+      </w:r>
+      <w:r>
+        <w:t xml:space="preserve">24 (2): 1031–42.</w:t>
+      </w:r>
+    </w:p>
     <w:bookmarkEnd w:id="396"/>
-    <w:bookmarkStart w:id="397" w:name="ref-Roh2025"/>
+    <w:bookmarkStart w:id="398" w:name="ref-Salloum2026"/>
     <w:p>
       <w:pPr>
         <w:pStyle w:val="Bibliography"/>
       </w:pPr>
       <w:r>
-        <w:t xml:space="preserve">Roh, Emily Jimin, Hankyul Baek, Donghyeon Kim, and Joongheon Kim. 2025.</w:t>
-      </w:r>
-      <w:r>
-        <w:t xml:space="preserve"> </w:t>
-      </w:r>
-      <w:r>
-        <w:t xml:space="preserve">“Fast Quantum Convolutional Neural Networks for Low-Complexity Object Detection in Autonomous Driving Applications.”</w:t>
-      </w:r>
-      <w:r>
-        <w:t xml:space="preserve"> </w:t>
-      </w:r>
-      <w:r>
-        <w:rPr>
-          <w:iCs/>
-          <w:i/>
-        </w:rPr>
-        <w:t xml:space="preserve">IEEE Transactions on Mobile Computing</w:t>
-      </w:r>
-      <w:r>
-        <w:t xml:space="preserve"> </w:t>
-      </w:r>
-      <w:r>
-        <w:t xml:space="preserve">24 (2): 1031–42.</w:t>
-      </w:r>
-    </w:p>
-    <w:bookmarkEnd w:id="397"/>
-    <w:bookmarkStart w:id="399" w:name="ref-Salloum2026"/>
-    <w:p>
-      <w:pPr>
-        <w:pStyle w:val="Bibliography"/>
-      </w:pPr>
-      <w:r>
         <w:t xml:space="preserve">Salloum, Hadi, Sergei Savin, Yaroslav Kholodov, Gleb Ryzhakov, Mirko Farina, and Ivan Oseledets. 2026.</w:t>
       </w:r>
       <w:r>
@@ -28014,7 +27986,7 @@
       <w:r>
         <w:t xml:space="preserve"> </w:t>
       </w:r>
-      <w:hyperlink r:id="rId398">
+      <w:hyperlink r:id="rId397">
         <w:r>
           <w:rPr>
             <w:rStyle w:val="Hyperlink"/>
@@ -28026,8 +27998,8 @@
         <w:t xml:space="preserve">.</w:t>
       </w:r>
     </w:p>
-    <w:bookmarkEnd w:id="399"/>
-    <w:bookmarkStart w:id="401" w:name="ref-Sarkar2024"/>
+    <w:bookmarkEnd w:id="398"/>
+    <w:bookmarkStart w:id="400" w:name="ref-Sarkar2024"/>
     <w:p>
       <w:pPr>
         <w:pStyle w:val="Bibliography"/>
@@ -28060,7 +28032,7 @@
       <w:r>
         <w:t xml:space="preserve"> </w:t>
       </w:r>
-      <w:hyperlink r:id="rId400">
+      <w:hyperlink r:id="rId399">
         <w:r>
           <w:rPr>
             <w:rStyle w:val="Hyperlink"/>
@@ -28072,8 +28044,8 @@
         <w:t xml:space="preserve">.</w:t>
       </w:r>
     </w:p>
-    <w:bookmarkEnd w:id="401"/>
-    <w:bookmarkStart w:id="403" w:name="ref-Schuetz2022"/>
+    <w:bookmarkEnd w:id="400"/>
+    <w:bookmarkStart w:id="402" w:name="ref-Schuetz2022"/>
     <w:p>
       <w:pPr>
         <w:pStyle w:val="Bibliography"/>
@@ -28106,7 +28078,7 @@
       <w:r>
         <w:t xml:space="preserve"> </w:t>
       </w:r>
-      <w:hyperlink r:id="rId402">
+      <w:hyperlink r:id="rId401">
         <w:r>
           <w:rPr>
             <w:rStyle w:val="Hyperlink"/>
@@ -28118,8 +28090,8 @@
         <w:t xml:space="preserve">.</w:t>
       </w:r>
     </w:p>
-    <w:bookmarkEnd w:id="403"/>
-    <w:bookmarkStart w:id="405" w:name="ref-Schuld2019"/>
+    <w:bookmarkEnd w:id="402"/>
+    <w:bookmarkStart w:id="404" w:name="ref-Schuld2019"/>
     <w:p>
       <w:pPr>
         <w:pStyle w:val="Bibliography"/>
@@ -28164,7 +28136,7 @@
       <w:r>
         <w:t xml:space="preserve"> </w:t>
       </w:r>
-      <w:hyperlink r:id="rId404">
+      <w:hyperlink r:id="rId403">
         <w:r>
           <w:rPr>
             <w:rStyle w:val="Hyperlink"/>
@@ -28176,8 +28148,8 @@
         <w:t xml:space="preserve">.</w:t>
       </w:r>
     </w:p>
-    <w:bookmarkEnd w:id="405"/>
-    <w:bookmarkStart w:id="407" w:name="ref-Schuld2021"/>
+    <w:bookmarkEnd w:id="404"/>
+    <w:bookmarkStart w:id="406" w:name="ref-Schuld2021"/>
     <w:p>
       <w:pPr>
         <w:pStyle w:val="Bibliography"/>
@@ -28201,7 +28173,7 @@
       <w:r>
         <w:t xml:space="preserve"> </w:t>
       </w:r>
-      <w:hyperlink r:id="rId406">
+      <w:hyperlink r:id="rId405">
         <w:r>
           <w:rPr>
             <w:rStyle w:val="Hyperlink"/>
@@ -28213,96 +28185,96 @@
         <w:t xml:space="preserve">.</w:t>
       </w:r>
     </w:p>
+    <w:bookmarkEnd w:id="406"/>
+    <w:bookmarkStart w:id="407" w:name="ref-Benkner2021"/>
+    <w:p>
+      <w:pPr>
+        <w:pStyle w:val="Bibliography"/>
+      </w:pPr>
+      <w:r>
+        <w:t xml:space="preserve">Seelbach Benkner, Marcel, Zorah Lähner, Vladislav Golyanik, Christof Wunderlich, Christian Theobalt, and Michael Moeller. 2021.</w:t>
+      </w:r>
+      <w:r>
+        <w:t xml:space="preserve"> </w:t>
+      </w:r>
+      <w:r>
+        <w:t xml:space="preserve">“</w:t>
+      </w:r>
+      <w:r>
+        <w:t xml:space="preserve">Q-Match</w:t>
+      </w:r>
+      <w:r>
+        <w:t xml:space="preserve">: Iterative Shape Matching via Quantum Annealing.”</w:t>
+      </w:r>
+      <w:r>
+        <w:t xml:space="preserve"> </w:t>
+      </w:r>
+      <w:r>
+        <w:t xml:space="preserve">In</w:t>
+      </w:r>
+      <w:r>
+        <w:t xml:space="preserve"> </w:t>
+      </w:r>
+      <w:r>
+        <w:rPr>
+          <w:iCs/>
+          <w:i/>
+        </w:rPr>
+        <w:t xml:space="preserve">Proceedings of the</w:t>
+      </w:r>
+      <w:r>
+        <w:rPr>
+          <w:iCs/>
+          <w:i/>
+        </w:rPr>
+        <w:t xml:space="preserve"> </w:t>
+      </w:r>
+      <w:r>
+        <w:rPr>
+          <w:iCs/>
+          <w:i/>
+        </w:rPr>
+        <w:t xml:space="preserve">IEEE/CVF</w:t>
+      </w:r>
+      <w:r>
+        <w:rPr>
+          <w:iCs/>
+          <w:i/>
+        </w:rPr>
+        <w:t xml:space="preserve"> </w:t>
+      </w:r>
+      <w:r>
+        <w:rPr>
+          <w:iCs/>
+          <w:i/>
+        </w:rPr>
+        <w:t xml:space="preserve">International Conference on Computer Vision (</w:t>
+      </w:r>
+      <w:r>
+        <w:rPr>
+          <w:iCs/>
+          <w:i/>
+        </w:rPr>
+        <w:t xml:space="preserve">ICCV</w:t>
+      </w:r>
+      <w:r>
+        <w:rPr>
+          <w:iCs/>
+          <w:i/>
+        </w:rPr>
+        <w:t xml:space="preserve">)</w:t>
+      </w:r>
+      <w:r>
+        <w:t xml:space="preserve">, 7586–96. IEEE.</w:t>
+      </w:r>
+    </w:p>
     <w:bookmarkEnd w:id="407"/>
-    <w:bookmarkStart w:id="408" w:name="ref-Benkner2021"/>
+    <w:bookmarkStart w:id="409" w:name="ref-Shor1997"/>
     <w:p>
       <w:pPr>
         <w:pStyle w:val="Bibliography"/>
       </w:pPr>
       <w:r>
-        <w:t xml:space="preserve">Seelbach Benkner, Marcel, Zorah Lähner, Vladislav Golyanik, Christof Wunderlich, Christian Theobalt, and Michael Moeller. 2021.</w:t>
-      </w:r>
-      <w:r>
-        <w:t xml:space="preserve"> </w:t>
-      </w:r>
-      <w:r>
-        <w:t xml:space="preserve">“</w:t>
-      </w:r>
-      <w:r>
-        <w:t xml:space="preserve">Q-Match</w:t>
-      </w:r>
-      <w:r>
-        <w:t xml:space="preserve">: Iterative Shape Matching via Quantum Annealing.”</w:t>
-      </w:r>
-      <w:r>
-        <w:t xml:space="preserve"> </w:t>
-      </w:r>
-      <w:r>
-        <w:t xml:space="preserve">In</w:t>
-      </w:r>
-      <w:r>
-        <w:t xml:space="preserve"> </w:t>
-      </w:r>
-      <w:r>
-        <w:rPr>
-          <w:iCs/>
-          <w:i/>
-        </w:rPr>
-        <w:t xml:space="preserve">Proceedings of the</w:t>
-      </w:r>
-      <w:r>
-        <w:rPr>
-          <w:iCs/>
-          <w:i/>
-        </w:rPr>
-        <w:t xml:space="preserve"> </w:t>
-      </w:r>
-      <w:r>
-        <w:rPr>
-          <w:iCs/>
-          <w:i/>
-        </w:rPr>
-        <w:t xml:space="preserve">IEEE/CVF</w:t>
-      </w:r>
-      <w:r>
-        <w:rPr>
-          <w:iCs/>
-          <w:i/>
-        </w:rPr>
-        <w:t xml:space="preserve"> </w:t>
-      </w:r>
-      <w:r>
-        <w:rPr>
-          <w:iCs/>
-          <w:i/>
-        </w:rPr>
-        <w:t xml:space="preserve">International Conference on Computer Vision (</w:t>
-      </w:r>
-      <w:r>
-        <w:rPr>
-          <w:iCs/>
-          <w:i/>
-        </w:rPr>
-        <w:t xml:space="preserve">ICCV</w:t>
-      </w:r>
-      <w:r>
-        <w:rPr>
-          <w:iCs/>
-          <w:i/>
-        </w:rPr>
-        <w:t xml:space="preserve">)</w:t>
-      </w:r>
-      <w:r>
-        <w:t xml:space="preserve">, 7586–96. IEEE.</w:t>
-      </w:r>
-    </w:p>
-    <w:bookmarkEnd w:id="408"/>
-    <w:bookmarkStart w:id="410" w:name="ref-Shor1997"/>
-    <w:p>
-      <w:pPr>
-        <w:pStyle w:val="Bibliography"/>
-      </w:pPr>
-      <w:r>
         <w:t xml:space="preserve">Shor, Peter W. 1997.</w:t>
       </w:r>
       <w:r>
@@ -28330,7 +28302,7 @@
       <w:r>
         <w:t xml:space="preserve"> </w:t>
       </w:r>
-      <w:hyperlink r:id="rId409">
+      <w:hyperlink r:id="rId408">
         <w:r>
           <w:rPr>
             <w:rStyle w:val="Hyperlink"/>
@@ -28342,8 +28314,8 @@
         <w:t xml:space="preserve">.</w:t>
       </w:r>
     </w:p>
-    <w:bookmarkEnd w:id="410"/>
-    <w:bookmarkStart w:id="412" w:name="ref-Siciliano2016"/>
+    <w:bookmarkEnd w:id="409"/>
+    <w:bookmarkStart w:id="411" w:name="ref-Siciliano2016"/>
     <w:p>
       <w:pPr>
         <w:pStyle w:val="Bibliography"/>
@@ -28367,7 +28339,7 @@
       <w:r>
         <w:t xml:space="preserve"> </w:t>
       </w:r>
-      <w:hyperlink r:id="rId411">
+      <w:hyperlink r:id="rId410">
         <w:r>
           <w:rPr>
             <w:rStyle w:val="Hyperlink"/>
@@ -28379,8 +28351,8 @@
         <w:t xml:space="preserve">.</w:t>
       </w:r>
     </w:p>
-    <w:bookmarkEnd w:id="412"/>
-    <w:bookmarkStart w:id="414" w:name="ref-Sinha2023"/>
+    <w:bookmarkEnd w:id="411"/>
+    <w:bookmarkStart w:id="413" w:name="ref-Sinha2023"/>
     <w:p>
       <w:pPr>
         <w:pStyle w:val="Bibliography"/>
@@ -28419,7 +28391,7 @@
       <w:r>
         <w:t xml:space="preserve"> </w:t>
       </w:r>
-      <w:hyperlink r:id="rId413">
+      <w:hyperlink r:id="rId412">
         <w:r>
           <w:rPr>
             <w:rStyle w:val="Hyperlink"/>
@@ -28431,8 +28403,8 @@
         <w:t xml:space="preserve">.</w:t>
       </w:r>
     </w:p>
-    <w:bookmarkEnd w:id="414"/>
-    <w:bookmarkStart w:id="416" w:name="ref-Skolik2022"/>
+    <w:bookmarkEnd w:id="413"/>
+    <w:bookmarkStart w:id="415" w:name="ref-Skolik2022"/>
     <w:p>
       <w:pPr>
         <w:pStyle w:val="Bibliography"/>
@@ -28474,7 +28446,7 @@
       <w:r>
         <w:t xml:space="preserve"> </w:t>
       </w:r>
-      <w:hyperlink r:id="rId415">
+      <w:hyperlink r:id="rId414">
         <w:r>
           <w:rPr>
             <w:rStyle w:val="Hyperlink"/>
@@ -28486,8 +28458,8 @@
         <w:t xml:space="preserve">.</w:t>
       </w:r>
     </w:p>
-    <w:bookmarkEnd w:id="416"/>
-    <w:bookmarkStart w:id="418" w:name="ref-Smierzchalski2024"/>
+    <w:bookmarkEnd w:id="415"/>
+    <w:bookmarkStart w:id="417" w:name="ref-Smierzchalski2024"/>
     <w:p>
       <w:pPr>
         <w:pStyle w:val="Bibliography"/>
@@ -28520,7 +28492,7 @@
       <w:r>
         <w:t xml:space="preserve"> </w:t>
       </w:r>
-      <w:hyperlink r:id="rId417">
+      <w:hyperlink r:id="rId416">
         <w:r>
           <w:rPr>
             <w:rStyle w:val="Hyperlink"/>
@@ -28532,8 +28504,8 @@
         <w:t xml:space="preserve">.</w:t>
       </w:r>
     </w:p>
-    <w:bookmarkEnd w:id="418"/>
-    <w:bookmarkStart w:id="420" w:name="ref-Sun2025"/>
+    <w:bookmarkEnd w:id="417"/>
+    <w:bookmarkStart w:id="419" w:name="ref-Sun2025"/>
     <w:p>
       <w:pPr>
         <w:pStyle w:val="Bibliography"/>
@@ -28559,7 +28531,7 @@
       <w:r>
         <w:t xml:space="preserve"> </w:t>
       </w:r>
-      <w:hyperlink r:id="rId419">
+      <w:hyperlink r:id="rId418">
         <w:r>
           <w:rPr>
             <w:rStyle w:val="Hyperlink"/>
@@ -28571,36 +28543,36 @@
         <w:t xml:space="preserve">.</w:t>
       </w:r>
     </w:p>
+    <w:bookmarkEnd w:id="419"/>
+    <w:bookmarkStart w:id="420" w:name="ref-Sutton2018"/>
+    <w:p>
+      <w:pPr>
+        <w:pStyle w:val="Bibliography"/>
+      </w:pPr>
+      <w:r>
+        <w:t xml:space="preserve">Sutton, Richard S., and Andrew G. Barto. 2018.</w:t>
+      </w:r>
+      <w:r>
+        <w:t xml:space="preserve"> </w:t>
+      </w:r>
+      <w:r>
+        <w:rPr>
+          <w:iCs/>
+          <w:i/>
+        </w:rPr>
+        <w:t xml:space="preserve">Reinforcement Learning: An Introduction</w:t>
+      </w:r>
+      <w:r>
+        <w:t xml:space="preserve">. 2nd ed. Adaptive Computation and Machine Learning. Cambridge, MA, USA: MIT Press.</w:t>
+      </w:r>
+    </w:p>
     <w:bookmarkEnd w:id="420"/>
-    <w:bookmarkStart w:id="421" w:name="ref-Sutton2018"/>
+    <w:bookmarkStart w:id="422" w:name="ref-Taghavi2025"/>
     <w:p>
       <w:pPr>
         <w:pStyle w:val="Bibliography"/>
       </w:pPr>
       <w:r>
-        <w:t xml:space="preserve">Sutton, Richard S., and Andrew G. Barto. 2018.</w:t>
-      </w:r>
-      <w:r>
-        <w:t xml:space="preserve"> </w:t>
-      </w:r>
-      <w:r>
-        <w:rPr>
-          <w:iCs/>
-          <w:i/>
-        </w:rPr>
-        <w:t xml:space="preserve">Reinforcement Learning: An Introduction</w:t>
-      </w:r>
-      <w:r>
-        <w:t xml:space="preserve">. 2nd ed. Adaptive Computation and Machine Learning. Cambridge, MA, USA: MIT Press.</w:t>
-      </w:r>
-    </w:p>
-    <w:bookmarkEnd w:id="421"/>
-    <w:bookmarkStart w:id="423" w:name="ref-Taghavi2025"/>
-    <w:p>
-      <w:pPr>
-        <w:pStyle w:val="Bibliography"/>
-      </w:pPr>
-      <w:r>
         <w:t xml:space="preserve">Taghavi, Mazyar, and Rahman Farnoosh. 2025.</w:t>
       </w:r>
       <w:r>
@@ -28628,7 +28600,7 @@
       <w:r>
         <w:t xml:space="preserve"> </w:t>
       </w:r>
-      <w:hyperlink r:id="rId422">
+      <w:hyperlink r:id="rId421">
         <w:r>
           <w:rPr>
             <w:rStyle w:val="Hyperlink"/>
@@ -28640,8 +28612,8 @@
         <w:t xml:space="preserve">.</w:t>
       </w:r>
     </w:p>
-    <w:bookmarkEnd w:id="423"/>
-    <w:bookmarkStart w:id="425" w:name="ref-Tandon2017"/>
+    <w:bookmarkEnd w:id="422"/>
+    <w:bookmarkStart w:id="424" w:name="ref-Tandon2017"/>
     <w:p>
       <w:pPr>
         <w:pStyle w:val="Bibliography"/>
@@ -28665,7 +28637,7 @@
       <w:r>
         <w:t xml:space="preserve"> </w:t>
       </w:r>
-      <w:hyperlink r:id="rId424">
+      <w:hyperlink r:id="rId423">
         <w:r>
           <w:rPr>
             <w:rStyle w:val="Hyperlink"/>
@@ -28677,8 +28649,8 @@
         <w:t xml:space="preserve">.</w:t>
       </w:r>
     </w:p>
-    <w:bookmarkEnd w:id="425"/>
-    <w:bookmarkStart w:id="427" w:name="ref-Tang2019"/>
+    <w:bookmarkEnd w:id="424"/>
+    <w:bookmarkStart w:id="426" w:name="ref-Tang2019"/>
     <w:p>
       <w:pPr>
         <w:pStyle w:val="Bibliography"/>
@@ -28777,7 +28749,7 @@
       <w:r>
         <w:t xml:space="preserve"> </w:t>
       </w:r>
-      <w:hyperlink r:id="rId426">
+      <w:hyperlink r:id="rId425">
         <w:r>
           <w:rPr>
             <w:rStyle w:val="Hyperlink"/>
@@ -28789,8 +28761,8 @@
         <w:t xml:space="preserve">.</w:t>
       </w:r>
     </w:p>
-    <w:bookmarkEnd w:id="427"/>
-    <w:bookmarkStart w:id="429" w:name="ref-Tang2021"/>
+    <w:bookmarkEnd w:id="426"/>
+    <w:bookmarkStart w:id="428" w:name="ref-Tang2021"/>
     <w:p>
       <w:pPr>
         <w:pStyle w:val="Bibliography"/>
@@ -28853,7 +28825,7 @@
       <w:r>
         <w:t xml:space="preserve"> </w:t>
       </w:r>
-      <w:hyperlink r:id="rId428">
+      <w:hyperlink r:id="rId427">
         <w:r>
           <w:rPr>
             <w:rStyle w:val="Hyperlink"/>
@@ -28865,8 +28837,8 @@
         <w:t xml:space="preserve">.</w:t>
       </w:r>
     </w:p>
-    <w:bookmarkEnd w:id="429"/>
-    <w:bookmarkStart w:id="431" w:name="ref-Temme2017"/>
+    <w:bookmarkEnd w:id="428"/>
+    <w:bookmarkStart w:id="430" w:name="ref-Temme2017"/>
     <w:p>
       <w:pPr>
         <w:pStyle w:val="Bibliography"/>
@@ -28899,7 +28871,7 @@
       <w:r>
         <w:t xml:space="preserve"> </w:t>
       </w:r>
-      <w:hyperlink r:id="rId430">
+      <w:hyperlink r:id="rId429">
         <w:r>
           <w:rPr>
             <w:rStyle w:val="Hyperlink"/>
@@ -28911,8 +28883,8 @@
         <w:t xml:space="preserve">.</w:t>
       </w:r>
     </w:p>
-    <w:bookmarkEnd w:id="431"/>
-    <w:bookmarkStart w:id="433" w:name="ref-Templier2022"/>
+    <w:bookmarkEnd w:id="430"/>
+    <w:bookmarkStart w:id="432" w:name="ref-Templier2022"/>
     <w:p>
       <w:pPr>
         <w:pStyle w:val="Bibliography"/>
@@ -28945,7 +28917,7 @@
       <w:r>
         <w:t xml:space="preserve"> </w:t>
       </w:r>
-      <w:hyperlink r:id="rId432">
+      <w:hyperlink r:id="rId431">
         <w:r>
           <w:rPr>
             <w:rStyle w:val="Hyperlink"/>
@@ -28957,8 +28929,8 @@
         <w:t xml:space="preserve">.</w:t>
       </w:r>
     </w:p>
-    <w:bookmarkEnd w:id="433"/>
-    <w:bookmarkStart w:id="435" w:name="ref-Terhal2015"/>
+    <w:bookmarkEnd w:id="432"/>
+    <w:bookmarkStart w:id="434" w:name="ref-Terhal2015"/>
     <w:p>
       <w:pPr>
         <w:pStyle w:val="Bibliography"/>
@@ -28991,7 +28963,7 @@
       <w:r>
         <w:t xml:space="preserve"> </w:t>
       </w:r>
-      <w:hyperlink r:id="rId434">
+      <w:hyperlink r:id="rId433">
         <w:r>
           <w:rPr>
             <w:rStyle w:val="Hyperlink"/>
@@ -29003,36 +28975,36 @@
         <w:t xml:space="preserve">.</w:t>
       </w:r>
     </w:p>
+    <w:bookmarkEnd w:id="434"/>
+    <w:bookmarkStart w:id="435" w:name="ref-Thrun2005"/>
+    <w:p>
+      <w:pPr>
+        <w:pStyle w:val="Bibliography"/>
+      </w:pPr>
+      <w:r>
+        <w:t xml:space="preserve">Thrun, Sebastian, Wolfram Burgard, and Dieter Fox. 2005.</w:t>
+      </w:r>
+      <w:r>
+        <w:t xml:space="preserve"> </w:t>
+      </w:r>
+      <w:r>
+        <w:rPr>
+          <w:iCs/>
+          <w:i/>
+        </w:rPr>
+        <w:t xml:space="preserve">Probabilistic Robotics</w:t>
+      </w:r>
+      <w:r>
+        <w:t xml:space="preserve">. Intelligent Robotics and Autonomous Agents. Cambridge, MA, USA: MIT Press.</w:t>
+      </w:r>
+    </w:p>
     <w:bookmarkEnd w:id="435"/>
-    <w:bookmarkStart w:id="436" w:name="ref-Thrun2005"/>
+    <w:bookmarkStart w:id="437" w:name="ref-Tian2023"/>
     <w:p>
       <w:pPr>
         <w:pStyle w:val="Bibliography"/>
       </w:pPr>
       <w:r>
-        <w:t xml:space="preserve">Thrun, Sebastian, Wolfram Burgard, and Dieter Fox. 2005.</w:t>
-      </w:r>
-      <w:r>
-        <w:t xml:space="preserve"> </w:t>
-      </w:r>
-      <w:r>
-        <w:rPr>
-          <w:iCs/>
-          <w:i/>
-        </w:rPr>
-        <w:t xml:space="preserve">Probabilistic Robotics</w:t>
-      </w:r>
-      <w:r>
-        <w:t xml:space="preserve">. Intelligent Robotics and Autonomous Agents. Cambridge, MA, USA: MIT Press.</w:t>
-      </w:r>
-    </w:p>
-    <w:bookmarkEnd w:id="436"/>
-    <w:bookmarkStart w:id="438" w:name="ref-Tian2023"/>
-    <w:p>
-      <w:pPr>
-        <w:pStyle w:val="Bibliography"/>
-      </w:pPr>
-      <w:r>
         <w:t xml:space="preserve">Tian, Xiao-Hui, Ran Yang, Hua-Ying Liu, Pengfei Fan, Ji-Ning Zhang, Changsheng Gu, Mengwen Chen, et al. 2024.</w:t>
       </w:r>
       <w:r>
@@ -29060,7 +29032,7 @@
       <w:r>
         <w:t xml:space="preserve"> </w:t>
       </w:r>
-      <w:hyperlink r:id="rId437">
+      <w:hyperlink r:id="rId436">
         <w:r>
           <w:rPr>
             <w:rStyle w:val="Hyperlink"/>
@@ -29072,8 +29044,8 @@
         <w:t xml:space="preserve">.</w:t>
       </w:r>
     </w:p>
-    <w:bookmarkEnd w:id="438"/>
-    <w:bookmarkStart w:id="440" w:name="ref-Udekwe2025"/>
+    <w:bookmarkEnd w:id="437"/>
+    <w:bookmarkStart w:id="439" w:name="ref-Udekwe2025"/>
     <w:p>
       <w:pPr>
         <w:pStyle w:val="Bibliography"/>
@@ -29096,7 +29068,7 @@
       <w:r>
         <w:t xml:space="preserve"> </w:t>
       </w:r>
-      <w:hyperlink r:id="rId439">
+      <w:hyperlink r:id="rId438">
         <w:r>
           <w:rPr>
             <w:rStyle w:val="Hyperlink"/>
@@ -29108,8 +29080,8 @@
         <w:t xml:space="preserve">.</w:t>
       </w:r>
     </w:p>
-    <w:bookmarkEnd w:id="440"/>
-    <w:bookmarkStart w:id="442" w:name="ref-Wang2025"/>
+    <w:bookmarkEnd w:id="439"/>
+    <w:bookmarkStart w:id="441" w:name="ref-Wang2025"/>
     <w:p>
       <w:pPr>
         <w:pStyle w:val="Bibliography"/>
@@ -29187,7 +29159,7 @@
       <w:r>
         <w:t xml:space="preserve"> </w:t>
       </w:r>
-      <w:hyperlink r:id="rId441">
+      <w:hyperlink r:id="rId440">
         <w:r>
           <w:rPr>
             <w:rStyle w:val="Hyperlink"/>
@@ -29199,8 +29171,8 @@
         <w:t xml:space="preserve">.</w:t>
       </w:r>
     </w:p>
-    <w:bookmarkEnd w:id="442"/>
-    <w:bookmarkStart w:id="444" w:name="ref-Wang2021"/>
+    <w:bookmarkEnd w:id="441"/>
+    <w:bookmarkStart w:id="443" w:name="ref-Wang2021"/>
     <w:p>
       <w:pPr>
         <w:pStyle w:val="Bibliography"/>
@@ -29217,7 +29189,7 @@
       <w:r>
         <w:t xml:space="preserve"> </w:t>
       </w:r>
-      <w:hyperlink r:id="rId443">
+      <w:hyperlink r:id="rId442">
         <w:r>
           <w:rPr>
             <w:rStyle w:val="Hyperlink"/>
@@ -29229,8 +29201,8 @@
         <w:t xml:space="preserve">.</w:t>
       </w:r>
     </w:p>
-    <w:bookmarkEnd w:id="444"/>
-    <w:bookmarkStart w:id="446" w:name="ref-Wang2023"/>
+    <w:bookmarkEnd w:id="443"/>
+    <w:bookmarkStart w:id="445" w:name="ref-Wang2023"/>
     <w:p>
       <w:pPr>
         <w:pStyle w:val="Bibliography"/>
@@ -29278,7 +29250,7 @@
       <w:r>
         <w:t xml:space="preserve"> </w:t>
       </w:r>
-      <w:hyperlink r:id="rId445">
+      <w:hyperlink r:id="rId444">
         <w:r>
           <w:rPr>
             <w:rStyle w:val="Hyperlink"/>
@@ -29290,8 +29262,8 @@
         <w:t xml:space="preserve">.</w:t>
       </w:r>
     </w:p>
-    <w:bookmarkEnd w:id="446"/>
-    <w:bookmarkStart w:id="448" w:name="ref-Wang2024"/>
+    <w:bookmarkEnd w:id="445"/>
+    <w:bookmarkStart w:id="447" w:name="ref-Wang2024"/>
     <w:p>
       <w:pPr>
         <w:pStyle w:val="Bibliography"/>
@@ -29320,7 +29292,7 @@
       <w:r>
         <w:t xml:space="preserve"> </w:t>
       </w:r>
-      <w:hyperlink r:id="rId447">
+      <w:hyperlink r:id="rId446">
         <w:r>
           <w:rPr>
             <w:rStyle w:val="Hyperlink"/>
@@ -29332,8 +29304,8 @@
         <w:t xml:space="preserve">.</w:t>
       </w:r>
     </w:p>
-    <w:bookmarkEnd w:id="448"/>
-    <w:bookmarkStart w:id="450" w:name="ref-Widdows2023"/>
+    <w:bookmarkEnd w:id="447"/>
+    <w:bookmarkStart w:id="449" w:name="ref-Widdows2023"/>
     <w:p>
       <w:pPr>
         <w:pStyle w:val="Bibliography"/>
@@ -29366,7 +29338,7 @@
       <w:r>
         <w:t xml:space="preserve"> </w:t>
       </w:r>
-      <w:hyperlink r:id="rId449">
+      <w:hyperlink r:id="rId448">
         <w:r>
           <w:rPr>
             <w:rStyle w:val="Hyperlink"/>
@@ -29378,8 +29350,8 @@
         <w:t xml:space="preserve">.</w:t>
       </w:r>
     </w:p>
-    <w:bookmarkEnd w:id="450"/>
-    <w:bookmarkStart w:id="452" w:name="ref-Wiebe2015"/>
+    <w:bookmarkEnd w:id="449"/>
+    <w:bookmarkStart w:id="451" w:name="ref-Wiebe2015"/>
     <w:p>
       <w:pPr>
         <w:pStyle w:val="Bibliography"/>
@@ -29412,7 +29384,7 @@
       <w:r>
         <w:t xml:space="preserve"> </w:t>
       </w:r>
-      <w:hyperlink r:id="rId451">
+      <w:hyperlink r:id="rId450">
         <w:r>
           <w:rPr>
             <w:rStyle w:val="Hyperlink"/>
@@ -29424,8 +29396,8 @@
         <w:t xml:space="preserve">.</w:t>
       </w:r>
     </w:p>
-    <w:bookmarkEnd w:id="452"/>
-    <w:bookmarkStart w:id="454" w:name="ref-Willmann2025"/>
+    <w:bookmarkEnd w:id="451"/>
+    <w:bookmarkStart w:id="453" w:name="ref-Willmann2025"/>
     <w:p>
       <w:pPr>
         <w:pStyle w:val="Bibliography"/>
@@ -29472,7 +29444,7 @@
       <w:r>
         <w:t xml:space="preserve"> </w:t>
       </w:r>
-      <w:hyperlink r:id="rId453">
+      <w:hyperlink r:id="rId452">
         <w:r>
           <w:rPr>
             <w:rStyle w:val="Hyperlink"/>
@@ -29484,8 +29456,8 @@
         <w:t xml:space="preserve">.</w:t>
       </w:r>
     </w:p>
-    <w:bookmarkEnd w:id="454"/>
-    <w:bookmarkStart w:id="456" w:name="ref-Windmann2023"/>
+    <w:bookmarkEnd w:id="453"/>
+    <w:bookmarkStart w:id="455" w:name="ref-Windmann2023"/>
     <w:p>
       <w:pPr>
         <w:pStyle w:val="Bibliography"/>
@@ -29515,7 +29487,7 @@
       <w:r>
         <w:t xml:space="preserve"> </w:t>
       </w:r>
-      <w:hyperlink r:id="rId455">
+      <w:hyperlink r:id="rId454">
         <w:r>
           <w:rPr>
             <w:rStyle w:val="Hyperlink"/>
@@ -29527,8 +29499,8 @@
         <w:t xml:space="preserve">.</w:t>
       </w:r>
     </w:p>
-    <w:bookmarkEnd w:id="456"/>
-    <w:bookmarkStart w:id="458" w:name="ref-Yan2021"/>
+    <w:bookmarkEnd w:id="455"/>
+    <w:bookmarkStart w:id="457" w:name="ref-Yan2021"/>
     <w:p>
       <w:pPr>
         <w:pStyle w:val="Bibliography"/>
@@ -29561,7 +29533,7 @@
       <w:r>
         <w:t xml:space="preserve"> </w:t>
       </w:r>
-      <w:hyperlink r:id="rId457">
+      <w:hyperlink r:id="rId456">
         <w:r>
           <w:rPr>
             <w:rStyle w:val="Hyperlink"/>
@@ -29573,8 +29545,8 @@
         <w:t xml:space="preserve">.</w:t>
       </w:r>
     </w:p>
-    <w:bookmarkEnd w:id="458"/>
-    <w:bookmarkStart w:id="460" w:name="ref-Yan2024"/>
+    <w:bookmarkEnd w:id="457"/>
+    <w:bookmarkStart w:id="459" w:name="ref-Yan2024"/>
     <w:p>
       <w:pPr>
         <w:pStyle w:val="Bibliography"/>
@@ -29607,7 +29579,7 @@
       <w:r>
         <w:t xml:space="preserve"> </w:t>
       </w:r>
-      <w:hyperlink r:id="rId459">
+      <w:hyperlink r:id="rId458">
         <w:r>
           <w:rPr>
             <w:rStyle w:val="Hyperlink"/>
@@ -29619,8 +29591,8 @@
         <w:t xml:space="preserve">.</w:t>
       </w:r>
     </w:p>
-    <w:bookmarkEnd w:id="460"/>
-    <w:bookmarkStart w:id="462" w:name="ref-Yarkoni2022"/>
+    <w:bookmarkEnd w:id="459"/>
+    <w:bookmarkStart w:id="461" w:name="ref-Yarkoni2022"/>
     <w:p>
       <w:pPr>
         <w:pStyle w:val="Bibliography"/>
@@ -29653,7 +29625,7 @@
       <w:r>
         <w:t xml:space="preserve"> </w:t>
       </w:r>
-      <w:hyperlink r:id="rId461">
+      <w:hyperlink r:id="rId460">
         <w:r>
           <w:rPr>
             <w:rStyle w:val="Hyperlink"/>
@@ -29665,8 +29637,8 @@
         <w:t xml:space="preserve">.</w:t>
       </w:r>
     </w:p>
-    <w:bookmarkEnd w:id="462"/>
-    <w:bookmarkStart w:id="464" w:name="ref-Yu2025"/>
+    <w:bookmarkEnd w:id="461"/>
+    <w:bookmarkStart w:id="463" w:name="ref-Yu2025"/>
     <w:p>
       <w:pPr>
         <w:pStyle w:val="Bibliography"/>
@@ -29750,7 +29722,7 @@
       <w:r>
         <w:t xml:space="preserve"> </w:t>
       </w:r>
-      <w:hyperlink r:id="rId463">
+      <w:hyperlink r:id="rId462">
         <w:r>
           <w:rPr>
             <w:rStyle w:val="Hyperlink"/>
@@ -29762,8 +29734,8 @@
         <w:t xml:space="preserve">.</w:t>
       </w:r>
     </w:p>
-    <w:bookmarkEnd w:id="464"/>
-    <w:bookmarkStart w:id="466" w:name="ref-Yun2022"/>
+    <w:bookmarkEnd w:id="463"/>
+    <w:bookmarkStart w:id="465" w:name="ref-Yun2022"/>
     <w:p>
       <w:pPr>
         <w:pStyle w:val="Bibliography"/>
@@ -29841,7 +29813,7 @@
       <w:r>
         <w:t xml:space="preserve"> </w:t>
       </w:r>
-      <w:hyperlink r:id="rId465">
+      <w:hyperlink r:id="rId464">
         <w:r>
           <w:rPr>
             <w:rStyle w:val="Hyperlink"/>
@@ -29853,90 +29825,90 @@
         <w:t xml:space="preserve">.</w:t>
       </w:r>
     </w:p>
+    <w:bookmarkEnd w:id="465"/>
+    <w:bookmarkStart w:id="466" w:name="ref-Zaech2022"/>
+    <w:p>
+      <w:pPr>
+        <w:pStyle w:val="Bibliography"/>
+      </w:pPr>
+      <w:r>
+        <w:t xml:space="preserve">Zaech, Jan-Nico, Alexander Liniger, Martin Danelljan, Dengxin Dai, and Luc Van Gool. 2022.</w:t>
+      </w:r>
+      <w:r>
+        <w:t xml:space="preserve"> </w:t>
+      </w:r>
+      <w:r>
+        <w:t xml:space="preserve">“Adiabatic Quantum Computing for Multi Object Tracking.”</w:t>
+      </w:r>
+      <w:r>
+        <w:t xml:space="preserve"> </w:t>
+      </w:r>
+      <w:r>
+        <w:t xml:space="preserve">In</w:t>
+      </w:r>
+      <w:r>
+        <w:t xml:space="preserve"> </w:t>
+      </w:r>
+      <w:r>
+        <w:rPr>
+          <w:iCs/>
+          <w:i/>
+        </w:rPr>
+        <w:t xml:space="preserve">Proceedings of the</w:t>
+      </w:r>
+      <w:r>
+        <w:rPr>
+          <w:iCs/>
+          <w:i/>
+        </w:rPr>
+        <w:t xml:space="preserve"> </w:t>
+      </w:r>
+      <w:r>
+        <w:rPr>
+          <w:iCs/>
+          <w:i/>
+        </w:rPr>
+        <w:t xml:space="preserve">IEEE/CVF</w:t>
+      </w:r>
+      <w:r>
+        <w:rPr>
+          <w:iCs/>
+          <w:i/>
+        </w:rPr>
+        <w:t xml:space="preserve"> </w:t>
+      </w:r>
+      <w:r>
+        <w:rPr>
+          <w:iCs/>
+          <w:i/>
+        </w:rPr>
+        <w:t xml:space="preserve">Conference on Computer Vision and Pattern Recognition (</w:t>
+      </w:r>
+      <w:r>
+        <w:rPr>
+          <w:iCs/>
+          <w:i/>
+        </w:rPr>
+        <w:t xml:space="preserve">CVPR</w:t>
+      </w:r>
+      <w:r>
+        <w:rPr>
+          <w:iCs/>
+          <w:i/>
+        </w:rPr>
+        <w:t xml:space="preserve">)</w:t>
+      </w:r>
+      <w:r>
+        <w:t xml:space="preserve">, 8811–22. IEEE.</w:t>
+      </w:r>
+    </w:p>
     <w:bookmarkEnd w:id="466"/>
-    <w:bookmarkStart w:id="467" w:name="ref-Zaech2022"/>
+    <w:bookmarkStart w:id="468" w:name="ref-Zhou2020"/>
     <w:p>
       <w:pPr>
         <w:pStyle w:val="Bibliography"/>
       </w:pPr>
       <w:r>
-        <w:t xml:space="preserve">Zaech, Jan-Nico, Alexander Liniger, Martin Danelljan, Dengxin Dai, and Luc Van Gool. 2022.</w:t>
-      </w:r>
-      <w:r>
-        <w:t xml:space="preserve"> </w:t>
-      </w:r>
-      <w:r>
-        <w:t xml:space="preserve">“Adiabatic Quantum Computing for Multi Object Tracking.”</w:t>
-      </w:r>
-      <w:r>
-        <w:t xml:space="preserve"> </w:t>
-      </w:r>
-      <w:r>
-        <w:t xml:space="preserve">In</w:t>
-      </w:r>
-      <w:r>
-        <w:t xml:space="preserve"> </w:t>
-      </w:r>
-      <w:r>
-        <w:rPr>
-          <w:iCs/>
-          <w:i/>
-        </w:rPr>
-        <w:t xml:space="preserve">Proceedings of the</w:t>
-      </w:r>
-      <w:r>
-        <w:rPr>
-          <w:iCs/>
-          <w:i/>
-        </w:rPr>
-        <w:t xml:space="preserve"> </w:t>
-      </w:r>
-      <w:r>
-        <w:rPr>
-          <w:iCs/>
-          <w:i/>
-        </w:rPr>
-        <w:t xml:space="preserve">IEEE/CVF</w:t>
-      </w:r>
-      <w:r>
-        <w:rPr>
-          <w:iCs/>
-          <w:i/>
-        </w:rPr>
-        <w:t xml:space="preserve"> </w:t>
-      </w:r>
-      <w:r>
-        <w:rPr>
-          <w:iCs/>
-          <w:i/>
-        </w:rPr>
-        <w:t xml:space="preserve">Conference on Computer Vision and Pattern Recognition (</w:t>
-      </w:r>
-      <w:r>
-        <w:rPr>
-          <w:iCs/>
-          <w:i/>
-        </w:rPr>
-        <w:t xml:space="preserve">CVPR</w:t>
-      </w:r>
-      <w:r>
-        <w:rPr>
-          <w:iCs/>
-          <w:i/>
-        </w:rPr>
-        <w:t xml:space="preserve">)</w:t>
-      </w:r>
-      <w:r>
-        <w:t xml:space="preserve">, 8811–22. IEEE.</w:t>
-      </w:r>
-    </w:p>
-    <w:bookmarkEnd w:id="467"/>
-    <w:bookmarkStart w:id="469" w:name="ref-Zhou2020"/>
-    <w:p>
-      <w:pPr>
-        <w:pStyle w:val="Bibliography"/>
-      </w:pPr>
-      <w:r>
         <w:t xml:space="preserve">Zhou, Leo, Sheng-Tao Wang, Soonwon Choi, Hannes Pichler, and Mikhail D. Lukin. 2020.</w:t>
       </w:r>
       <w:r>
@@ -29964,7 +29936,7 @@
       <w:r>
         <w:t xml:space="preserve"> </w:t>
       </w:r>
-      <w:hyperlink r:id="rId468">
+      <w:hyperlink r:id="rId467">
         <w:r>
           <w:rPr>
             <w:rStyle w:val="Hyperlink"/>
@@ -29976,8 +29948,8 @@
         <w:t xml:space="preserve">.</w:t>
       </w:r>
     </w:p>
-    <w:bookmarkEnd w:id="469"/>
-    <w:bookmarkStart w:id="471" w:name="ref-Zhuang2024"/>
+    <w:bookmarkEnd w:id="468"/>
+    <w:bookmarkStart w:id="470" w:name="ref-Zhuang2024"/>
     <w:p>
       <w:pPr>
         <w:pStyle w:val="Bibliography"/>
@@ -29994,7 +29966,7 @@
       <w:r>
         <w:t xml:space="preserve"> </w:t>
       </w:r>
-      <w:hyperlink r:id="rId470">
+      <w:hyperlink r:id="rId469">
         <w:r>
           <w:rPr>
             <w:rStyle w:val="Hyperlink"/>
@@ -30006,8 +29978,8 @@
         <w:t xml:space="preserve">.</w:t>
       </w:r>
     </w:p>
-    <w:bookmarkEnd w:id="471"/>
-    <w:bookmarkStart w:id="473" w:name="ref-Zuo2018"/>
+    <w:bookmarkEnd w:id="470"/>
+    <w:bookmarkStart w:id="472" w:name="ref-Zuo2018"/>
     <w:p>
       <w:pPr>
         <w:pStyle w:val="Bibliography"/>
@@ -30052,7 +30024,7 @@
       <w:r>
         <w:t xml:space="preserve"> </w:t>
       </w:r>
-      <w:hyperlink r:id="rId472">
+      <w:hyperlink r:id="rId471">
         <w:r>
           <w:rPr>
             <w:rStyle w:val="Hyperlink"/>
@@ -30067,9 +30039,9 @@
         <w:fldChar w:fldCharType="end"/>
       </w:r>
     </w:p>
+    <w:bookmarkEnd w:id="472"/>
     <w:bookmarkEnd w:id="473"/>
     <w:bookmarkEnd w:id="474"/>
-    <w:bookmarkEnd w:id="475"/>
     <w:sectPr/>
   </w:body>
 </w:document>

</xml_diff>

<commit_message>
Survey 1: fill Q4/Q6 from full texts; correct Table 5 devices
- Q4 (hardware/noise) and Q6 (reproducibility) judged from the full
  texts for 43 studies; 16 without full text remain marked.
- Table 5: Gerlach2025 ran on a D-Wave Advantage, Antero2025 on IBM
  Brisbane plus an IonQ noise model, Altrabulsi2026 on ibm_fez.
- Section 3.5 reports that 13 of 43 checked studies released code or data.
- README lists missing and mislabeled full-text files.
</commit_message>
<xml_diff>
--- a/github/k/Survey1_ACM_CSUR_Manuscript.docx
+++ b/github/k/Survey1_ACM_CSUR_Manuscript.docx
@@ -7488,7 +7488,7 @@
         </w:r>
       </w:hyperlink>
       <w:r>
-        <w:t xml:space="preserve">, and they feed the assessment at the end of each section. The per-study judgments are given in the supplementary material. Two criteria fail most often: only 12 of the 59 appraised studies compared against a state-of-the-art, tuned classical baseline, 19 used no classical baseline at all, and only 6 were tested on a physical robot or in a realistic field setting. [who extracted and appraised the data, and how disagreements were resolved].</w:t>
+        <w:t xml:space="preserve">, and they feed the assessment at the end of each section. The per-study judgments are given in the supplementary material. Two criteria fail most often: only 12 of the 59 appraised studies compared against a state-of-the-art, tuned classical baseline, 19 used no classical baseline at all, and only 6 were tested on a physical robot or in a realistic field setting. Reproducibility is the third weak point: of the 43 studies whose full texts we could check, only 13 released their code or data. [who extracted and appraised the data, and how disagreements were resolved].</w:t>
       </w:r>
     </w:p>
     <w:bookmarkEnd w:id="41"/>
@@ -21172,7 +21172,7 @@
               <w:jc w:val="left"/>
             </w:pPr>
             <w:r>
-              <w:t xml:space="preserve">Gate-based QPU</w:t>
+              <w:t xml:space="preserve">D-Wave Advantage</w:t>
             </w:r>
           </w:p>
         </w:tc>
@@ -21394,7 +21394,7 @@
               <w:jc w:val="left"/>
             </w:pPr>
             <w:r>
-              <w:t xml:space="preserve">Cloud QPU</w:t>
+              <w:t xml:space="preserve">IBM Brisbane (127-qubit); IonQ noise model</w:t>
             </w:r>
           </w:p>
         </w:tc>
@@ -21468,7 +21468,7 @@
               <w:jc w:val="left"/>
             </w:pPr>
             <w:r>
-              <w:t xml:space="preserve">IBM</w:t>
+              <w:t xml:space="preserve">IBM ibm_fez</w:t>
             </w:r>
           </w:p>
         </w:tc>

</xml_diff>

<commit_message>
Survey 1: add 13 newly downloaded full texts; correct Liu2021 and Lathrop2023
- Q4/Q6 judged for 13 more studies (56 of 59 now); 14 of 56 share code/data.
- Liu2021: report CHSH S=2.59 at 1 km (no rainy-night claim in the paper).
- Lathrop2023: speed-up of q-RRT shown in classical simulation.
- Ngo2026: up to 6.2 inference steps per second.
- Survey1_fulltexts now holds 68 of 72 primary studies.
</commit_message>
<xml_diff>
--- a/github/k/Survey1_ACM_CSUR_Manuscript.docx
+++ b/github/k/Survey1_ACM_CSUR_Manuscript.docx
@@ -7488,7 +7488,7 @@
         </w:r>
       </w:hyperlink>
       <w:r>
-        <w:t xml:space="preserve">, and they feed the assessment at the end of each section. The per-study judgments are given in the supplementary material. Two criteria fail most often: only 12 of the 59 appraised studies compared against a state-of-the-art, tuned classical baseline, 19 used no classical baseline at all, and only 6 were tested on a physical robot or in a realistic field setting. Reproducibility is the third weak point: of the 43 studies whose full texts we could check, only 13 released their code or data. [who extracted and appraised the data, and how disagreements were resolved].</w:t>
+        <w:t xml:space="preserve">, and they feed the assessment at the end of each section. The per-study judgments are given in the supplementary material. Two criteria fail most often: only 12 of the 59 appraised studies compared against a state-of-the-art, tuned classical baseline, 19 used no classical baseline at all, and only 6 were tested on a physical robot or in a realistic field setting. Reproducibility is the third weak point: of the 56 studies whose full texts we could check, only 14 released their code or data. [who extracted and appraised the data, and how disagreements were resolved].</w:t>
       </w:r>
     </w:p>
     <w:bookmarkEnd w:id="41"/>
@@ -10655,7 +10655,7 @@
         <w:t xml:space="preserve"> </w:t>
       </w:r>
       <w:r>
-        <w:t xml:space="preserve">started from the sampling-based planners themselves. They recast sampling-based motion planning as a database-oracle problem and solved it with Grover-type quantum search, including a quantum full path search, which reduces the number of oracle queries quadratically. Of all the studies we read, this one comes closest to the planners robots actually use. Even so, the gain is again a query count, and only fault-tolerant hardware would turn it into a wall-clock speed-up. Figure</w:t>
+        <w:t xml:space="preserve">started from the sampling-based planners themselves. They recast sampling-based motion planning as a database-oracle problem and solved it with Grover-type quantum search, with a quantum full path search for sparse environments and a quantum RRT for dense ones. In a classical simulation of the quantum algorithm, q-RRT showed the expected quadratic speed-up over classical RRT on two-dimensional random lattices. Of all the studies we read, this one comes closest to the planners robots actually use. Even so, the speed-up was measured in a classical simulation of the quantum algorithm, and only fault-tolerant hardware would turn it into a real one. Figure</w:t>
       </w:r>
       <w:r>
         <w:t xml:space="preserve"> </w:t>
@@ -12613,7 +12613,7 @@
         <w:t xml:space="preserve"> </w:t>
       </w:r>
       <w:r>
-        <w:t xml:space="preserve">went the other way and kept the QPU. Their single-qubit actor-critic agent ran on the VTT Q5 superconducting processor, and by programming the readout electronics directly instead of going through the standard software stack, they made circuit execution more than ten times faster. That is still short of the tens of hertz a closed control loop needs. Between them, these two papers give the first real measurements of what it would take to put a QPU inside a control loop. The variational policies in this section share one template (Figure</w:t>
+        <w:t xml:space="preserve">went the other way and kept the QPU. Their single-qubit actor-critic agent ran on the VTT Q5 superconducting processor, and by programming the readout electronics directly instead of going through the standard software stack, they made circuit execution more than ten times faster, reaching up to 6.2 inference steps per second. That is still short of the tens of hertz a closed control loop needs. Between them, these two papers give the first real measurements of what it would take to put a QPU inside a control loop. The variational policies in this section share one template (Figure</w:t>
       </w:r>
       <w:r>
         <w:t xml:space="preserve"> </w:t>
@@ -13614,7 +13614,33 @@
         <w:t xml:space="preserve"> </w:t>
       </w:r>
       <w:r>
-        <w:t xml:space="preserve">distributed entangled photons from one drone to another and from a drone to the ground over 1 km, by day and on rainy nights, using the second drone as an optical relay.</w:t>
+        <w:t xml:space="preserve">distributed entangled photons over 1 km, with one drone carrying the entangled-photon source and a second drone acting as an optical relay, and still violated the CHSH inequality (</w:t>
+      </w:r>
+      <m:oMath>
+        <m:r>
+          <m:t>S</m:t>
+        </m:r>
+        <m:r>
+          <m:rPr>
+            <m:sty m:val="p"/>
+          </m:rPr>
+          <m:t>=</m:t>
+        </m:r>
+        <m:r>
+          <m:t>2.59</m:t>
+        </m:r>
+        <m:r>
+          <m:rPr>
+            <m:sty m:val="p"/>
+          </m:rPr>
+          <m:t>±</m:t>
+        </m:r>
+        <m:r>
+          <m:t>0.11</m:t>
+        </m:r>
+      </m:oMath>
+      <w:r>
+        <w:t xml:space="preserve">).</w:t>
       </w:r>
       <w:r>
         <w:t xml:space="preserve"> </w:t>

</xml_diff>

<commit_message>
Survey 1: report PRISMA honestly where record counts were not logged
- Section 3.2/3.4/3.5/3.7, Table S2, Table S4 and Figure S1 now describe
  the stages followed and state that per-stage counts were not logged,
  instead of leaving [n] placeholders; search window 1982 to Oct 2026.
- Single-reviewer screening and grading stated as a threat to validity.
- Abstract, Table 1, contributions and cover letter: 'reported following
  PRISMA 2020 where it applies'; protocol not registered.
- README: optional upgrade path with the method workbook.
</commit_message>
<xml_diff>
--- a/github/k/Survey1_ACM_CSUR_Manuscript.docx
+++ b/github/k/Survey1_ACM_CSUR_Manuscript.docx
@@ -615,25 +615,67 @@
         <w:t xml:space="preserve"> </w:t>
       </w:r>
       <w:r>
+        <w:t xml:space="preserve">systematic</w:t>
+      </w:r>
+      <w:r>
+        <w:t xml:space="preserve"> </w:t>
+      </w:r>
+      <w:r>
+        <w:t xml:space="preserve">survey,</w:t>
+      </w:r>
+      <w:r>
+        <w:t xml:space="preserve"> </w:t>
+      </w:r>
+      <w:r>
+        <w:t xml:space="preserve">reported</w:t>
+      </w:r>
+      <w:r>
+        <w:t xml:space="preserve"> </w:t>
+      </w:r>
+      <w:r>
+        <w:t xml:space="preserve">following</w:t>
+      </w:r>
+      <w:r>
+        <w:t xml:space="preserve"> </w:t>
+      </w:r>
+      <w:r>
+        <w:t xml:space="preserve">the</w:t>
+      </w:r>
+      <w:r>
+        <w:t xml:space="preserve"> </w:t>
+      </w:r>
+      <w:r>
         <w:t xml:space="preserve">PRISMA</w:t>
       </w:r>
       <w:r>
         <w:t xml:space="preserve"> </w:t>
       </w:r>
       <w:r>
-        <w:t xml:space="preserve">2020-guided</w:t>
-      </w:r>
-      <w:r>
-        <w:t xml:space="preserve"> </w:t>
-      </w:r>
-      <w:r>
-        <w:t xml:space="preserve">systematic</w:t>
-      </w:r>
-      <w:r>
-        <w:t xml:space="preserve"> </w:t>
-      </w:r>
-      <w:r>
-        <w:t xml:space="preserve">survey</w:t>
+        <w:t xml:space="preserve">2020</w:t>
+      </w:r>
+      <w:r>
+        <w:t xml:space="preserve"> </w:t>
+      </w:r>
+      <w:r>
+        <w:t xml:space="preserve">statement</w:t>
+      </w:r>
+      <w:r>
+        <w:t xml:space="preserve"> </w:t>
+      </w:r>
+      <w:r>
+        <w:t xml:space="preserve">where</w:t>
+      </w:r>
+      <w:r>
+        <w:t xml:space="preserve"> </w:t>
+      </w:r>
+      <w:r>
+        <w:t xml:space="preserve">it</w:t>
+      </w:r>
+      <w:r>
+        <w:t xml:space="preserve"> </w:t>
+      </w:r>
+      <w:r>
+        <w:t xml:space="preserve">applies,</w:t>
       </w:r>
       <w:r>
         <w:t xml:space="preserve"> </w:t>
@@ -4000,7 +4042,7 @@
               <w:jc w:val="left"/>
             </w:pPr>
             <w:r>
-              <w:t xml:space="preserve">Systematic review (PRISMA 2020)</w:t>
+              <w:t xml:space="preserve">Systematic review (PRISMA-informed)</w:t>
             </w:r>
           </w:p>
         </w:tc>
@@ -4139,7 +4181,7 @@
         </w:numPr>
       </w:pPr>
       <w:r>
-        <w:t xml:space="preserve">A systematic, PRISMA 2020-guided review of 72 primary studies on quantum and quantum-inspired methods for robotics, published between 1998 and 2026, set against 106 foundational works and six related quantum computer-vision studies (Section</w:t>
+        <w:t xml:space="preserve">A systematic review, reported following PRISMA 2020 where it applies, of 72 primary studies on quantum and quantum-inspired methods for robotics, published between 1998 and 2026, set against 106 foundational works and six related quantum computer-vision studies (Section</w:t>
       </w:r>
       <w:r>
         <w:t xml:space="preserve"> </w:t>
@@ -6842,7 +6884,24 @@
         <w:fldChar w:fldCharType="end"/>
       </w:r>
       <w:r>
-        <w:t xml:space="preserve">, which divides a review into planning, conduct, and reporting stages.</w:t>
+        <w:t xml:space="preserve">, which divides a review into planning, conduct, and reporting stages. We report the PRISMA items that apply to a review of a fast-moving computing literature, and we say plainly in Section</w:t>
+      </w:r>
+      <w:r>
+        <w:t xml:space="preserve"> </w:t>
+      </w:r>
+      <w:hyperlink w:anchor="sec:selection">
+        <w:r>
+          <w:rPr>
+            <w:rStyle w:val="Hyperlink"/>
+          </w:rPr>
+          <w:t xml:space="preserve">3.4</w:t>
+        </w:r>
+      </w:hyperlink>
+      <w:r>
+        <w:t xml:space="preserve"> </w:t>
+      </w:r>
+      <w:r>
+        <w:t xml:space="preserve">which record counts we cannot report.</w:t>
       </w:r>
     </w:p>
     <w:bookmarkStart w:id="34" w:name="sec:rqs"/>
@@ -7153,7 +7212,7 @@
         <w:t xml:space="preserve">”</w:t>
       </w:r>
       <w:r>
-        <w:t xml:space="preserve">, SLAM, kinematics). A second string retrieved foundational reviews and tutorials on NISQ algorithms, error mitigation, barren plateaus, fault tolerance, and dequantization. We soon found that a good part of the quantum-robotics work is published outside robotics venues, so we also searched the application areas where it tends to appear: drones and UAVs, multi-agent and autonomous mobility, autonomous driving, control benchmarks such as the cart-pole, and automated storage and retrieval. The search covered publications from 1982 to [month year]; the exact strings for each database are listed in the supplementary material.</w:t>
+        <w:t xml:space="preserve">, SLAM, kinematics). A second string retrieved foundational reviews and tutorials on NISQ algorithms, error mitigation, barren plateaus, fault tolerance, and dequantization. We soon found that a good part of the quantum-robotics work is published outside robotics venues, so we also searched the application areas where it tends to appear: drones and UAVs, multi-agent and autonomous mobility, autonomous driving, control benchmarks such as the cart-pole, and automated storage and retrieval. The search covered publications from 1982 onward. We closed the corpus in October 2026; the most recent study it contains was posted in August 2026. The exact strings for each database are listed in the supplementary material.</w:t>
       </w:r>
     </w:p>
     <w:bookmarkEnd w:id="35"/>
@@ -7295,7 +7354,7 @@
         <w:pStyle w:val="FirstParagraph"/>
       </w:pPr>
       <w:r>
-        <w:t xml:space="preserve">Of the [n] records identified, [n] remained after de-duplication; their titles and abstracts were screened, and [n] full texts were assessed against the eligibility criteria. The final corpus comprises 72 primary studies (65 empirical or theoretical studies and 7 reviews) and 106 foundational works, and six related quantum computer-vision studies are discussed separately (Section</w:t>
+        <w:t xml:space="preserve">We ran the searches iteratively, refining the strings as the scope of the review settled, and screened candidates first on title and abstract and then in full text against the criteria above. We did not log how many records each search returned or how many were excluded at each stage. We therefore cannot give the record counts of a complete PRISMA 2020 flow diagram; the flow diagram in the supplementary material shows the stages we followed and the counts we can document. The final corpus comprises 72 primary studies (65 empirical or theoretical studies and 7 reviews) and 106 foundational works, and six related quantum computer-vision studies are discussed separately (Section</w:t>
       </w:r>
       <w:r>
         <w:t xml:space="preserve"> </w:t>
@@ -7488,7 +7547,21 @@
         </w:r>
       </w:hyperlink>
       <w:r>
-        <w:t xml:space="preserve">, and they feed the assessment at the end of each section. The per-study judgments are given in the supplementary material. Two criteria fail most often: only 12 of the 59 appraised studies compared against a state-of-the-art, tuned classical baseline, 19 used no classical baseline at all, and only 6 were tested on a physical robot or in a realistic field setting. Reproducibility is the third weak point: of the 56 studies whose full texts we could check, only 14 released their code or data. [who extracted and appraised the data, and how disagreements were resolved].</w:t>
+        <w:t xml:space="preserve">, and they feed the assessment at the end of each section. The per-study judgments are given in the supplementary material. Two criteria fail most often: only 12 of the 59 appraised studies compared against a state-of-the-art, tuned classical baseline, 19 used no classical baseline at all, and only 6 were tested on a physical robot or in a realistic field setting. Reproducibility is the third weak point: of the 56 studies whose full texts we could check, only 14 released their code or data. The first author screened the records, extracted the data, and assigned all evidence levels, execution tags, and appraisal judgments; with a single reviewer there were no disagreements to resolve, and inter-rater agreement could not be measured (Section</w:t>
+      </w:r>
+      <w:r>
+        <w:t xml:space="preserve"> </w:t>
+      </w:r>
+      <w:hyperlink w:anchor="sec:validity">
+        <w:r>
+          <w:rPr>
+            <w:rStyle w:val="Hyperlink"/>
+          </w:rPr>
+          <w:t xml:space="preserve">3.7</w:t>
+        </w:r>
+      </w:hyperlink>
+      <w:r>
+        <w:t xml:space="preserve">).</w:t>
       </w:r>
     </w:p>
     <w:bookmarkEnd w:id="41"/>
@@ -8813,6 +8886,19 @@
       </w:r>
       <w:r>
         <w:t xml:space="preserve">: evidence levels were assigned from the information reported, which is often incomplete on hardware, shots, and latency; when in doubt, we assigned the lower level.</w:t>
+      </w:r>
+      <w:r>
+        <w:t xml:space="preserve"> </w:t>
+      </w:r>
+      <w:r>
+        <w:rPr>
+          <w:iCs/>
+          <w:i/>
+        </w:rPr>
+        <w:t xml:space="preserve">Selection and grading</w:t>
+      </w:r>
+      <w:r>
+        <w:t xml:space="preserve">: one reviewer screened, extracted, and graded every study, and the number of records at each screening stage was not logged, so neither the completeness of the search nor the reliability of the grading can be measured directly. To make this checkable, we publish every evidence level, execution tag, and appraisal judgment in the supplementary material and dataset, so that readers can verify or contest each one.</w:t>
       </w:r>
       <w:r>
         <w:t xml:space="preserve"> </w:t>

</xml_diff>

<commit_message>
Survey 1: second author reviewed evidence levels; fix checklist table refs
- Section 3.5 and 3.7: the second author (supervisor) reviewed the
  evidence levels and appraisal judgments; disagreements resolved by
  discussion; agreement not measured because grading was not independent.
- PRISMA checklist items 6, 7 and 11 now reference the search table (S6)
  and the appraisal criteria (S4) automatically.
</commit_message>
<xml_diff>
--- a/github/k/Survey1_ACM_CSUR_Manuscript.docx
+++ b/github/k/Survey1_ACM_CSUR_Manuscript.docx
@@ -7583,7 +7583,7 @@
         </w:r>
       </w:hyperlink>
       <w:r>
-        <w:t xml:space="preserve">, and they feed the assessment at the end of each section. The per-study judgments are given in the supplementary material. Two criteria fail most often: only 12 of the 59 appraised studies compared against a state-of-the-art, tuned classical baseline, 19 used no classical baseline at all, and only 6 were tested on a physical robot or in a realistic field setting. Reproducibility is the third weak point: of the 56 studies whose full texts we could check, only 14 released their code or data. The first author screened the records, extracted the data, and assigned all evidence levels, execution tags, and appraisal judgments; with a single reviewer there were no disagreements to resolve, and inter-rater agreement could not be measured (Section</w:t>
+        <w:t xml:space="preserve">, and they feed the assessment at the end of each section. The per-study judgments are given in the supplementary material. Two criteria fail most often: only 12 of the 59 appraised studies compared against a state-of-the-art, tuned classical baseline, 19 used no classical baseline at all, and only 6 were tested on a physical robot or in a realistic field setting. Reproducibility is the third weak point: of the 56 studies whose full texts we could check, only 14 released their code or data. The first author screened the records, extracted the data, and assigned the evidence levels, execution tags, and appraisal judgments. The second author reviewed these levels and judgments, and disagreements were resolved by discussion. Because the second author reviewed the first author’s assignments rather than grading independently, inter-rater agreement could not be measured (Section</w:t>
       </w:r>
       <w:r>
         <w:t xml:space="preserve"> </w:t>
@@ -8934,7 +8934,7 @@
         <w:t xml:space="preserve">Selection and grading</w:t>
       </w:r>
       <w:r>
-        <w:t xml:space="preserve">: one reviewer screened, extracted, and graded every study, and the number of records at each screening stage was not logged, so neither the completeness of the search nor the reliability of the grading can be measured directly. To make this checkable, we publish every evidence level, execution tag, and appraisal judgment in the supplementary material and dataset, so that readers can verify or contest each one.</w:t>
+        <w:t xml:space="preserve">: one reviewer screened the records and extracted the data, the number of records at each screening stage was not logged, and the evidence levels were reviewed by the second author rather than assigned independently, so neither the completeness of the search nor the reliability of the grading can be measured directly. To make this checkable, we publish every evidence level, execution tag, and appraisal judgment in the supplementary material and dataset, so that readers can verify or contest each one.</w:t>
       </w:r>
       <w:r>
         <w:t xml:space="preserve"> </w:t>

</xml_diff>

<commit_message>
Survey 1: competing interests, Wang2021 journal note, tidy files
- Checklist item 26 and cover letter: no competing interests.
- Wang2021: note pointing to the revised J. Navigation 2023 version.
- Move the literature cross-check to the method workbook folder as the
  provenance record of the targeted search; rename the old drafts folder.
- README: flag the CSUR 35-page limit (including references).
</commit_message>
<xml_diff>
--- a/github/k/Survey1_ACM_CSUR_Manuscript.docx
+++ b/github/k/Survey1_ACM_CSUR_Manuscript.docx
@@ -13515,7 +13515,7 @@
         <w:fldChar w:fldCharType="begin"/>
       </w:r>
       <w:r>
-        <w:instrText xml:space="preserve">ADDIN CSL_CITATION {"citationID":"MENDELEY_CITATION_281","citationItems":[{"id":"ITEM-281","isTemporary":false,"itemData":{"DOI":"10.48550/arXiv.2103.09378","URL":"https://arxiv.org/abs/2103.09378","author":[{"family":"Wang","given":"Xuezhi"},{"family":"Kealy","given":"Allison"},{"family":"Gilliam","given":"Christopher"},{"family":"Haine","given":"Simon"},{"family":"Close","given":"John"},{"family":"Moran","given":"Bill"},{"family":"Talbot","given":"Kyle"},{"family":"Williams","given":"Simon"},{"family":"Hardman","given":"Kyle"},{"family":"Freier","given":"Chris"},{"family":"Wigley","given":"Paul"},{"family":"White","given":"Angela"},{"family":"Szigeti","given":"Stuart"},{"family":"Legge","given":"Sam"}],"id":"Wang2021","issued":{"date-parts":[[2021]]},"title":"Enhancing inertial navigation performance via fusion of classical and quantum accelerometers","type":""},"suppress-author":false}],"isEdited":false,"manualOverride":{"citeprocText":"Xuezhi Wang et al. (2021)","isManuallyOverridden":false,"manualOverrideText":""},"mendeley":{"formattedCitation":"Xuezhi Wang et al. (2021)","plainTextFormattedCitation":"Xuezhi Wang et al. (2021)","previouslyFormattedCitation":"Xuezhi Wang et al. (2021)"},"properties":{"noteIndex":0},"schema":"https://github.com/citation-style-language/schema/raw/master/csl-citation.json"}</w:instrText>
+        <w:instrText xml:space="preserve">ADDIN CSL_CITATION {"citationID":"MENDELEY_CITATION_281","citationItems":[{"id":"ITEM-281","isTemporary":false,"itemData":{"DOI":"10.48550/arXiv.2103.09378","URL":"https://arxiv.org/abs/2103.09378","author":[{"family":"Wang","given":"Xuezhi"},{"family":"Kealy","given":"Allison"},{"family":"Gilliam","given":"Christopher"},{"family":"Haine","given":"Simon"},{"family":"Close","given":"John"},{"family":"Moran","given":"Bill"},{"family":"Talbot","given":"Kyle"},{"family":"Williams","given":"Simon"},{"family":"Hardman","given":"Kyle"},{"family":"Freier","given":"Chris"},{"family":"Wigley","given":"Paul"},{"family":"White","given":"Angela"},{"family":"Szigeti","given":"Stuart"},{"family":"Legge","given":"Sam"}],"id":"Wang2021","issued":{"date-parts":[[2021]]},"note":"Revised version published as “Improving measurement performance via fusion of classical and quantum accelerometers,” The Journal of Navigation 76(1):91–102, 2023, doi:10.1017/S0373463322000637","title":"Enhancing inertial navigation performance via fusion of classical and quantum accelerometers","type":""},"suppress-author":false}],"isEdited":false,"manualOverride":{"citeprocText":"Xuezhi Wang et al. (2021)","isManuallyOverridden":false,"manualOverrideText":""},"mendeley":{"formattedCitation":"Xuezhi Wang et al. (2021)","plainTextFormattedCitation":"Xuezhi Wang et al. (2021)","previouslyFormattedCitation":"Xuezhi Wang et al. (2021)"},"properties":{"noteIndex":0},"schema":"https://github.com/citation-style-language/schema/raw/master/csl-citation.json"}</w:instrText>
       </w:r>
       <w:r>
         <w:fldChar w:fldCharType="separate"/>
@@ -13844,7 +13844,7 @@
         <w:fldChar w:fldCharType="begin"/>
       </w:r>
       <w:r>
-        <w:instrText xml:space="preserve">ADDIN CSL_CITATION {"citationID":"MENDELEY_CITATION_295","citationItems":[{"id":"ITEM-294","isTemporary":false,"itemData":{"DOI":"10.1103/PhysRevApplied.10.034030","author":[{"family":"Cheiney","given":"Pierrick"},{"family":"Fouché","given":"Lauriane"},{"family":"Templier","given":"Simon"},{"family":"Napolitano","given":"Fabien"},{"family":"Battelier","given":"Baptiste"},{"family":"Bouyer","given":"Philippe"},{"family":"Barrett","given":"Brynle"}],"container-title":"Physical Review Applied","id":"Cheiney2018","issue":"3","issued":{"date-parts":[[2018]]},"page":"034030","publisher":"American Physical Society","title":"Navigation-compatible hybrid quantum accelerometer using a Kalman filter","type":"article-journal","volume":"10"}},{"id":"ITEM-295","isTemporary":false,"itemData":{"DOI":"10.48550/arXiv.2103.09378","URL":"https://arxiv.org/abs/2103.09378","author":[{"family":"Wang","given":"Xuezhi"},{"family":"Kealy","given":"Allison"},{"family":"Gilliam","given":"Christopher"},{"family":"Haine","given":"Simon"},{"family":"Close","given":"John"},{"family":"Moran","given":"Bill"},{"family":"Talbot","given":"Kyle"},{"family":"Williams","given":"Simon"},{"family":"Hardman","given":"Kyle"},{"family":"Freier","given":"Chris"},{"family":"Wigley","given":"Paul"},{"family":"White","given":"Angela"},{"family":"Szigeti","given":"Stuart"},{"family":"Legge","given":"Sam"}],"id":"Wang2021","issued":{"date-parts":[[2021]]},"title":"Enhancing inertial navigation performance via fusion of classical and quantum accelerometers","type":""}}],"isEdited":false,"manualOverride":{"citeprocText":"(Cheiney et al. 2018; Xuezhi Wang et al. 2021)","isManuallyOverridden":false,"manualOverrideText":""},"mendeley":{"formattedCitation":"(Cheiney et al. 2018; Xuezhi Wang et al. 2021)","plainTextFormattedCitation":"(Cheiney et al. 2018; Xuezhi Wang et al. 2021)","previouslyFormattedCitation":"(Cheiney et al. 2018; Xuezhi Wang et al. 2021)"},"properties":{"noteIndex":0},"schema":"https://github.com/citation-style-language/schema/raw/master/csl-citation.json"}</w:instrText>
+        <w:instrText xml:space="preserve">ADDIN CSL_CITATION {"citationID":"MENDELEY_CITATION_295","citationItems":[{"id":"ITEM-294","isTemporary":false,"itemData":{"DOI":"10.1103/PhysRevApplied.10.034030","author":[{"family":"Cheiney","given":"Pierrick"},{"family":"Fouché","given":"Lauriane"},{"family":"Templier","given":"Simon"},{"family":"Napolitano","given":"Fabien"},{"family":"Battelier","given":"Baptiste"},{"family":"Bouyer","given":"Philippe"},{"family":"Barrett","given":"Brynle"}],"container-title":"Physical Review Applied","id":"Cheiney2018","issue":"3","issued":{"date-parts":[[2018]]},"page":"034030","publisher":"American Physical Society","title":"Navigation-compatible hybrid quantum accelerometer using a Kalman filter","type":"article-journal","volume":"10"}},{"id":"ITEM-295","isTemporary":false,"itemData":{"DOI":"10.48550/arXiv.2103.09378","URL":"https://arxiv.org/abs/2103.09378","author":[{"family":"Wang","given":"Xuezhi"},{"family":"Kealy","given":"Allison"},{"family":"Gilliam","given":"Christopher"},{"family":"Haine","given":"Simon"},{"family":"Close","given":"John"},{"family":"Moran","given":"Bill"},{"family":"Talbot","given":"Kyle"},{"family":"Williams","given":"Simon"},{"family":"Hardman","given":"Kyle"},{"family":"Freier","given":"Chris"},{"family":"Wigley","given":"Paul"},{"family":"White","given":"Angela"},{"family":"Szigeti","given":"Stuart"},{"family":"Legge","given":"Sam"}],"id":"Wang2021","issued":{"date-parts":[[2021]]},"note":"Revised version published as “Improving measurement performance via fusion of classical and quantum accelerometers,” The Journal of Navigation 76(1):91–102, 2023, doi:10.1017/S0373463322000637","title":"Enhancing inertial navigation performance via fusion of classical and quantum accelerometers","type":""}}],"isEdited":false,"manualOverride":{"citeprocText":"(Cheiney et al. 2018; Xuezhi Wang et al. 2021)","isManuallyOverridden":false,"manualOverrideText":""},"mendeley":{"formattedCitation":"(Cheiney et al. 2018; Xuezhi Wang et al. 2021)","plainTextFormattedCitation":"(Cheiney et al. 2018; Xuezhi Wang et al. 2021)","previouslyFormattedCitation":"(Cheiney et al. 2018; Xuezhi Wang et al. 2021)"},"properties":{"noteIndex":0},"schema":"https://github.com/citation-style-language/schema/raw/master/csl-citation.json"}</w:instrText>
       </w:r>
       <w:r>
         <w:fldChar w:fldCharType="separate"/>
@@ -13906,7 +13906,7 @@
         <w:fldChar w:fldCharType="begin"/>
       </w:r>
       <w:r>
-        <w:instrText xml:space="preserve">ADDIN CSL_CITATION {"citationID":"MENDELEY_CITATION_298","citationItems":[{"id":"ITEM-297","isTemporary":false,"itemData":{"DOI":"10.1103/PhysRevApplied.10.034030","author":[{"family":"Cheiney","given":"Pierrick"},{"family":"Fouché","given":"Lauriane"},{"family":"Templier","given":"Simon"},{"family":"Napolitano","given":"Fabien"},{"family":"Battelier","given":"Baptiste"},{"family":"Bouyer","given":"Philippe"},{"family":"Barrett","given":"Brynle"}],"container-title":"Physical Review Applied","id":"Cheiney2018","issue":"3","issued":{"date-parts":[[2018]]},"page":"034030","publisher":"American Physical Society","title":"Navigation-compatible hybrid quantum accelerometer using a Kalman filter","type":"article-journal","volume":"10"}},{"id":"ITEM-298","isTemporary":false,"itemData":{"DOI":"10.48550/arXiv.2103.09378","URL":"https://arxiv.org/abs/2103.09378","author":[{"family":"Wang","given":"Xuezhi"},{"family":"Kealy","given":"Allison"},{"family":"Gilliam","given":"Christopher"},{"family":"Haine","given":"Simon"},{"family":"Close","given":"John"},{"family":"Moran","given":"Bill"},{"family":"Talbot","given":"Kyle"},{"family":"Williams","given":"Simon"},{"family":"Hardman","given":"Kyle"},{"family":"Freier","given":"Chris"},{"family":"Wigley","given":"Paul"},{"family":"White","given":"Angela"},{"family":"Szigeti","given":"Stuart"},{"family":"Legge","given":"Sam"}],"id":"Wang2021","issued":{"date-parts":[[2021]]},"title":"Enhancing inertial navigation performance via fusion of classical and quantum accelerometers","type":""}}],"isEdited":false,"manualOverride":{"citeprocText":"(Cheiney et al. 2018; Xuezhi Wang et al. 2021)","isManuallyOverridden":false,"manualOverrideText":""},"mendeley":{"formattedCitation":"(Cheiney et al. 2018; Xuezhi Wang et al. 2021)","plainTextFormattedCitation":"(Cheiney et al. 2018; Xuezhi Wang et al. 2021)","previouslyFormattedCitation":"(Cheiney et al. 2018; Xuezhi Wang et al. 2021)"},"properties":{"noteIndex":0},"schema":"https://github.com/citation-style-language/schema/raw/master/csl-citation.json"}</w:instrText>
+        <w:instrText xml:space="preserve">ADDIN CSL_CITATION {"citationID":"MENDELEY_CITATION_298","citationItems":[{"id":"ITEM-297","isTemporary":false,"itemData":{"DOI":"10.1103/PhysRevApplied.10.034030","author":[{"family":"Cheiney","given":"Pierrick"},{"family":"Fouché","given":"Lauriane"},{"family":"Templier","given":"Simon"},{"family":"Napolitano","given":"Fabien"},{"family":"Battelier","given":"Baptiste"},{"family":"Bouyer","given":"Philippe"},{"family":"Barrett","given":"Brynle"}],"container-title":"Physical Review Applied","id":"Cheiney2018","issue":"3","issued":{"date-parts":[[2018]]},"page":"034030","publisher":"American Physical Society","title":"Navigation-compatible hybrid quantum accelerometer using a Kalman filter","type":"article-journal","volume":"10"}},{"id":"ITEM-298","isTemporary":false,"itemData":{"DOI":"10.48550/arXiv.2103.09378","URL":"https://arxiv.org/abs/2103.09378","author":[{"family":"Wang","given":"Xuezhi"},{"family":"Kealy","given":"Allison"},{"family":"Gilliam","given":"Christopher"},{"family":"Haine","given":"Simon"},{"family":"Close","given":"John"},{"family":"Moran","given":"Bill"},{"family":"Talbot","given":"Kyle"},{"family":"Williams","given":"Simon"},{"family":"Hardman","given":"Kyle"},{"family":"Freier","given":"Chris"},{"family":"Wigley","given":"Paul"},{"family":"White","given":"Angela"},{"family":"Szigeti","given":"Stuart"},{"family":"Legge","given":"Sam"}],"id":"Wang2021","issued":{"date-parts":[[2021]]},"note":"Revised version published as “Improving measurement performance via fusion of classical and quantum accelerometers,” The Journal of Navigation 76(1):91–102, 2023, doi:10.1017/S0373463322000637","title":"Enhancing inertial navigation performance via fusion of classical and quantum accelerometers","type":""}}],"isEdited":false,"manualOverride":{"citeprocText":"(Cheiney et al. 2018; Xuezhi Wang et al. 2021)","isManuallyOverridden":false,"manualOverrideText":""},"mendeley":{"formattedCitation":"(Cheiney et al. 2018; Xuezhi Wang et al. 2021)","plainTextFormattedCitation":"(Cheiney et al. 2018; Xuezhi Wang et al. 2021)","previouslyFormattedCitation":"(Cheiney et al. 2018; Xuezhi Wang et al. 2021)"},"properties":{"noteIndex":0},"schema":"https://github.com/citation-style-language/schema/raw/master/csl-citation.json"}</w:instrText>
       </w:r>
       <w:r>
         <w:fldChar w:fldCharType="separate"/>
@@ -19213,7 +19213,7 @@
         <w:fldChar w:fldCharType="begin"/>
       </w:r>
       <w:r>
-        <w:instrText xml:space="preserve">ADDIN CSL_CITATION {"citationID":"MENDELEY_CITATION_501","citationItems":[{"id":"ITEM-499","isTemporary":false,"itemData":{"DOI":"10.1103/PhysRevApplied.10.034030","author":[{"family":"Cheiney","given":"Pierrick"},{"family":"Fouché","given":"Lauriane"},{"family":"Templier","given":"Simon"},{"family":"Napolitano","given":"Fabien"},{"family":"Battelier","given":"Baptiste"},{"family":"Bouyer","given":"Philippe"},{"family":"Barrett","given":"Brynle"}],"container-title":"Physical Review Applied","id":"Cheiney2018","issue":"3","issued":{"date-parts":[[2018]]},"page":"034030","publisher":"American Physical Society","title":"Navigation-compatible hybrid quantum accelerometer using a Kalman filter","type":"article-journal","volume":"10"}},{"id":"ITEM-500","isTemporary":false,"itemData":{"DOI":"10.48550/arXiv.2103.09378","URL":"https://arxiv.org/abs/2103.09378","author":[{"family":"Wang","given":"Xuezhi"},{"family":"Kealy","given":"Allison"},{"family":"Gilliam","given":"Christopher"},{"family":"Haine","given":"Simon"},{"family":"Close","given":"John"},{"family":"Moran","given":"Bill"},{"family":"Talbot","given":"Kyle"},{"family":"Williams","given":"Simon"},{"family":"Hardman","given":"Kyle"},{"family":"Freier","given":"Chris"},{"family":"Wigley","given":"Paul"},{"family":"White","given":"Angela"},{"family":"Szigeti","given":"Stuart"},{"family":"Legge","given":"Sam"}],"id":"Wang2021","issued":{"date-parts":[[2021]]},"title":"Enhancing inertial navigation performance via fusion of classical and quantum accelerometers","type":""}},{"id":"ITEM-501","isTemporary":false,"itemData":{"DOI":"10.1007/1345_2023_218","author":[{"family":"Wang","given":"Xuezhi"},{"family":"Li","given":"Wenchao"},{"family":"Moran","given":"Bill"},{"family":"Gibson","given":"Brant C."},{"family":"Hall","given":"Liam T."},{"family":"Simpson","given":"David A."},{"family":"Kealy","given":"Allison N."},{"family":"Greentree","given":"Andrew D."}],"collection-title":"International association of geodesy symposia","container-title":"Gravity, positioning and reference frames","id":"Wang2023","issued":{"date-parts":[[2023]]},"page":"87-92","publisher":"Springer","publisher-place":"Cham","title":"Quantum diamond magnetometry for navigation in GNSS denied environments","type":"chapter","volume":"156"}}],"isEdited":false,"manualOverride":{"citeprocText":"(Cheiney et al. 2018; Xuezhi Wang et al. 2021, 2023)","isManuallyOverridden":false,"manualOverrideText":""},"mendeley":{"formattedCitation":"(Cheiney et al. 2018; Xuezhi Wang et al. 2021, 2023)","plainTextFormattedCitation":"(Cheiney et al. 2018; Xuezhi Wang et al. 2021, 2023)","previouslyFormattedCitation":"(Cheiney et al. 2018; Xuezhi Wang et al. 2021, 2023)"},"properties":{"noteIndex":0},"schema":"https://github.com/citation-style-language/schema/raw/master/csl-citation.json"}</w:instrText>
+        <w:instrText xml:space="preserve">ADDIN CSL_CITATION {"citationID":"MENDELEY_CITATION_501","citationItems":[{"id":"ITEM-499","isTemporary":false,"itemData":{"DOI":"10.1103/PhysRevApplied.10.034030","author":[{"family":"Cheiney","given":"Pierrick"},{"family":"Fouché","given":"Lauriane"},{"family":"Templier","given":"Simon"},{"family":"Napolitano","given":"Fabien"},{"family":"Battelier","given":"Baptiste"},{"family":"Bouyer","given":"Philippe"},{"family":"Barrett","given":"Brynle"}],"container-title":"Physical Review Applied","id":"Cheiney2018","issue":"3","issued":{"date-parts":[[2018]]},"page":"034030","publisher":"American Physical Society","title":"Navigation-compatible hybrid quantum accelerometer using a Kalman filter","type":"article-journal","volume":"10"}},{"id":"ITEM-500","isTemporary":false,"itemData":{"DOI":"10.48550/arXiv.2103.09378","URL":"https://arxiv.org/abs/2103.09378","author":[{"family":"Wang","given":"Xuezhi"},{"family":"Kealy","given":"Allison"},{"family":"Gilliam","given":"Christopher"},{"family":"Haine","given":"Simon"},{"family":"Close","given":"John"},{"family":"Moran","given":"Bill"},{"family":"Talbot","given":"Kyle"},{"family":"Williams","given":"Simon"},{"family":"Hardman","given":"Kyle"},{"family":"Freier","given":"Chris"},{"family":"Wigley","given":"Paul"},{"family":"White","given":"Angela"},{"family":"Szigeti","given":"Stuart"},{"family":"Legge","given":"Sam"}],"id":"Wang2021","issued":{"date-parts":[[2021]]},"note":"Revised version published as “Improving measurement performance via fusion of classical and quantum accelerometers,” The Journal of Navigation 76(1):91–102, 2023, doi:10.1017/S0373463322000637","title":"Enhancing inertial navigation performance via fusion of classical and quantum accelerometers","type":""}},{"id":"ITEM-501","isTemporary":false,"itemData":{"DOI":"10.1007/1345_2023_218","author":[{"family":"Wang","given":"Xuezhi"},{"family":"Li","given":"Wenchao"},{"family":"Moran","given":"Bill"},{"family":"Gibson","given":"Brant C."},{"family":"Hall","given":"Liam T."},{"family":"Simpson","given":"David A."},{"family":"Kealy","given":"Allison N."},{"family":"Greentree","given":"Andrew D."}],"collection-title":"International association of geodesy symposia","container-title":"Gravity, positioning and reference frames","id":"Wang2023","issued":{"date-parts":[[2023]]},"page":"87-92","publisher":"Springer","publisher-place":"Cham","title":"Quantum diamond magnetometry for navigation in GNSS denied environments","type":"chapter","volume":"156"}}],"isEdited":false,"manualOverride":{"citeprocText":"(Cheiney et al. 2018; Xuezhi Wang et al. 2021, 2023)","isManuallyOverridden":false,"manualOverrideText":""},"mendeley":{"formattedCitation":"(Cheiney et al. 2018; Xuezhi Wang et al. 2021, 2023)","plainTextFormattedCitation":"(Cheiney et al. 2018; Xuezhi Wang et al. 2021, 2023)","previouslyFormattedCitation":"(Cheiney et al. 2018; Xuezhi Wang et al. 2021, 2023)"},"properties":{"noteIndex":0},"schema":"https://github.com/citation-style-language/schema/raw/master/csl-citation.json"}</w:instrText>
       </w:r>
       <w:r>
         <w:fldChar w:fldCharType="separate"/>
@@ -19403,7 +19403,7 @@
         <w:fldChar w:fldCharType="begin"/>
       </w:r>
       <w:r>
-        <w:instrText xml:space="preserve">ADDIN CSL_CITATION {"citationID":"MENDELEY_CITATION_513","citationItems":[{"id":"ITEM-512","isTemporary":false,"itemData":{"DOI":"10.48550/arXiv.2103.09378","URL":"https://arxiv.org/abs/2103.09378","author":[{"family":"Wang","given":"Xuezhi"},{"family":"Kealy","given":"Allison"},{"family":"Gilliam","given":"Christopher"},{"family":"Haine","given":"Simon"},{"family":"Close","given":"John"},{"family":"Moran","given":"Bill"},{"family":"Talbot","given":"Kyle"},{"family":"Williams","given":"Simon"},{"family":"Hardman","given":"Kyle"},{"family":"Freier","given":"Chris"},{"family":"Wigley","given":"Paul"},{"family":"White","given":"Angela"},{"family":"Szigeti","given":"Stuart"},{"family":"Legge","given":"Sam"}],"id":"Wang2021","issued":{"date-parts":[[2021]]},"title":"Enhancing inertial navigation performance via fusion of classical and quantum accelerometers","type":""}},{"id":"ITEM-513","isTemporary":false,"itemData":{"DOI":"10.1007/1345_2023_218","author":[{"family":"Wang","given":"Xuezhi"},{"family":"Li","given":"Wenchao"},{"family":"Moran","given":"Bill"},{"family":"Gibson","given":"Brant C."},{"family":"Hall","given":"Liam T."},{"family":"Simpson","given":"David A."},{"family":"Kealy","given":"Allison N."},{"family":"Greentree","given":"Andrew D."}],"collection-title":"International association of geodesy symposia","container-title":"Gravity, positioning and reference frames","id":"Wang2023","issued":{"date-parts":[[2023]]},"page":"87-92","publisher":"Springer","publisher-place":"Cham","title":"Quantum diamond magnetometry for navigation in GNSS denied environments","type":"chapter","volume":"156"}}],"isEdited":false,"manualOverride":{"citeprocText":"(Xuezhi Wang et al. 2021, 2023)","isManuallyOverridden":false,"manualOverrideText":""},"mendeley":{"formattedCitation":"(Xuezhi Wang et al. 2021, 2023)","plainTextFormattedCitation":"(Xuezhi Wang et al. 2021, 2023)","previouslyFormattedCitation":"(Xuezhi Wang et al. 2021, 2023)"},"properties":{"noteIndex":0},"schema":"https://github.com/citation-style-language/schema/raw/master/csl-citation.json"}</w:instrText>
+        <w:instrText xml:space="preserve">ADDIN CSL_CITATION {"citationID":"MENDELEY_CITATION_513","citationItems":[{"id":"ITEM-512","isTemporary":false,"itemData":{"DOI":"10.48550/arXiv.2103.09378","URL":"https://arxiv.org/abs/2103.09378","author":[{"family":"Wang","given":"Xuezhi"},{"family":"Kealy","given":"Allison"},{"family":"Gilliam","given":"Christopher"},{"family":"Haine","given":"Simon"},{"family":"Close","given":"John"},{"family":"Moran","given":"Bill"},{"family":"Talbot","given":"Kyle"},{"family":"Williams","given":"Simon"},{"family":"Hardman","given":"Kyle"},{"family":"Freier","given":"Chris"},{"family":"Wigley","given":"Paul"},{"family":"White","given":"Angela"},{"family":"Szigeti","given":"Stuart"},{"family":"Legge","given":"Sam"}],"id":"Wang2021","issued":{"date-parts":[[2021]]},"note":"Revised version published as “Improving measurement performance via fusion of classical and quantum accelerometers,” The Journal of Navigation 76(1):91–102, 2023, doi:10.1017/S0373463322000637","title":"Enhancing inertial navigation performance via fusion of classical and quantum accelerometers","type":""}},{"id":"ITEM-513","isTemporary":false,"itemData":{"DOI":"10.1007/1345_2023_218","author":[{"family":"Wang","given":"Xuezhi"},{"family":"Li","given":"Wenchao"},{"family":"Moran","given":"Bill"},{"family":"Gibson","given":"Brant C."},{"family":"Hall","given":"Liam T."},{"family":"Simpson","given":"David A."},{"family":"Kealy","given":"Allison N."},{"family":"Greentree","given":"Andrew D."}],"collection-title":"International association of geodesy symposia","container-title":"Gravity, positioning and reference frames","id":"Wang2023","issued":{"date-parts":[[2023]]},"page":"87-92","publisher":"Springer","publisher-place":"Cham","title":"Quantum diamond magnetometry for navigation in GNSS denied environments","type":"chapter","volume":"156"}}],"isEdited":false,"manualOverride":{"citeprocText":"(Xuezhi Wang et al. 2021, 2023)","isManuallyOverridden":false,"manualOverrideText":""},"mendeley":{"formattedCitation":"(Xuezhi Wang et al. 2021, 2023)","plainTextFormattedCitation":"(Xuezhi Wang et al. 2021, 2023)","previouslyFormattedCitation":"(Xuezhi Wang et al. 2021, 2023)"},"properties":{"noteIndex":0},"schema":"https://github.com/citation-style-language/schema/raw/master/csl-citation.json"}</w:instrText>
       </w:r>
       <w:r>
         <w:fldChar w:fldCharType="separate"/>
@@ -23122,7 +23122,7 @@
         <w:fldChar w:fldCharType="begin"/>
       </w:r>
       <w:r>
-        <w:instrText xml:space="preserve">ADDIN CSL_CITATION {"citationID":"MENDELEY_CITATION_590","citationItems":[{"id":"ITEM-589","isTemporary":false,"itemData":{"DOI":"10.1038/s42254-019-0117-4","author":[{"family":"Bongs","given":"Kai"},{"family":"Holynski","given":"Michael"},{"family":"Vovrosh","given":"Jamie"},{"family":"Bouyer","given":"Philippe"},{"family":"Condon","given":"Gabriel"},{"family":"Rasel","given":"Ernst"},{"family":"Schubert","given":"Christian"},{"family":"Schleich","given":"Wolfgang P."},{"family":"Roura","given":"Albert"}],"container-title":"Nature Reviews Physics","id":"Bongs2019","issue":"12","issued":{"date-parts":[[2019]]},"page":"731-739","publisher":"Nature Publishing Group","title":"Taking atom interferometric quantum sensors from the laboratory to real-world applications","type":"article-journal","volume":"1"}},{"id":"ITEM-590","isTemporary":false,"itemData":{"DOI":"10.48550/arXiv.2103.09378","URL":"https://arxiv.org/abs/2103.09378","author":[{"family":"Wang","given":"Xuezhi"},{"family":"Kealy","given":"Allison"},{"family":"Gilliam","given":"Christopher"},{"family":"Haine","given":"Simon"},{"family":"Close","given":"John"},{"family":"Moran","given":"Bill"},{"family":"Talbot","given":"Kyle"},{"family":"Williams","given":"Simon"},{"family":"Hardman","given":"Kyle"},{"family":"Freier","given":"Chris"},{"family":"Wigley","given":"Paul"},{"family":"White","given":"Angela"},{"family":"Szigeti","given":"Stuart"},{"family":"Legge","given":"Sam"}],"id":"Wang2021","issued":{"date-parts":[[2021]]},"title":"Enhancing inertial navigation performance via fusion of classical and quantum accelerometers","type":""}}],"isEdited":false,"manualOverride":{"citeprocText":"(Bongs et al. 2019; Xuezhi Wang et al. 2021)","isManuallyOverridden":false,"manualOverrideText":""},"mendeley":{"formattedCitation":"(Bongs et al. 2019; Xuezhi Wang et al. 2021)","plainTextFormattedCitation":"(Bongs et al. 2019; Xuezhi Wang et al. 2021)","previouslyFormattedCitation":"(Bongs et al. 2019; Xuezhi Wang et al. 2021)"},"properties":{"noteIndex":0},"schema":"https://github.com/citation-style-language/schema/raw/master/csl-citation.json"}</w:instrText>
+        <w:instrText xml:space="preserve">ADDIN CSL_CITATION {"citationID":"MENDELEY_CITATION_590","citationItems":[{"id":"ITEM-589","isTemporary":false,"itemData":{"DOI":"10.1038/s42254-019-0117-4","author":[{"family":"Bongs","given":"Kai"},{"family":"Holynski","given":"Michael"},{"family":"Vovrosh","given":"Jamie"},{"family":"Bouyer","given":"Philippe"},{"family":"Condon","given":"Gabriel"},{"family":"Rasel","given":"Ernst"},{"family":"Schubert","given":"Christian"},{"family":"Schleich","given":"Wolfgang P."},{"family":"Roura","given":"Albert"}],"container-title":"Nature Reviews Physics","id":"Bongs2019","issue":"12","issued":{"date-parts":[[2019]]},"page":"731-739","publisher":"Nature Publishing Group","title":"Taking atom interferometric quantum sensors from the laboratory to real-world applications","type":"article-journal","volume":"1"}},{"id":"ITEM-590","isTemporary":false,"itemData":{"DOI":"10.48550/arXiv.2103.09378","URL":"https://arxiv.org/abs/2103.09378","author":[{"family":"Wang","given":"Xuezhi"},{"family":"Kealy","given":"Allison"},{"family":"Gilliam","given":"Christopher"},{"family":"Haine","given":"Simon"},{"family":"Close","given":"John"},{"family":"Moran","given":"Bill"},{"family":"Talbot","given":"Kyle"},{"family":"Williams","given":"Simon"},{"family":"Hardman","given":"Kyle"},{"family":"Freier","given":"Chris"},{"family":"Wigley","given":"Paul"},{"family":"White","given":"Angela"},{"family":"Szigeti","given":"Stuart"},{"family":"Legge","given":"Sam"}],"id":"Wang2021","issued":{"date-parts":[[2021]]},"note":"Revised version published as “Improving measurement performance via fusion of classical and quantum accelerometers,” The Journal of Navigation 76(1):91–102, 2023, doi:10.1017/S0373463322000637","title":"Enhancing inertial navigation performance via fusion of classical and quantum accelerometers","type":""}}],"isEdited":false,"manualOverride":{"citeprocText":"(Bongs et al. 2019; Xuezhi Wang et al. 2021)","isManuallyOverridden":false,"manualOverrideText":""},"mendeley":{"formattedCitation":"(Bongs et al. 2019; Xuezhi Wang et al. 2021)","plainTextFormattedCitation":"(Bongs et al. 2019; Xuezhi Wang et al. 2021)","previouslyFormattedCitation":"(Bongs et al. 2019; Xuezhi Wang et al. 2021)"},"properties":{"noteIndex":0},"schema":"https://github.com/citation-style-language/schema/raw/master/csl-citation.json"}</w:instrText>
       </w:r>
       <w:r>
         <w:fldChar w:fldCharType="separate"/>
@@ -24809,7 +24809,7 @@
         <w:fldChar w:fldCharType="begin"/>
       </w:r>
       <w:r>
-        <w:instrText xml:space="preserve">ADDIN CSL_CITATION {"citationID":"MENDELEY_CITATION_614","citationItems":[{"id":"ITEM-613","isTemporary":false,"itemData":{"DOI":"10.1103/PhysRevApplied.10.034030","author":[{"family":"Cheiney","given":"Pierrick"},{"family":"Fouché","given":"Lauriane"},{"family":"Templier","given":"Simon"},{"family":"Napolitano","given":"Fabien"},{"family":"Battelier","given":"Baptiste"},{"family":"Bouyer","given":"Philippe"},{"family":"Barrett","given":"Brynle"}],"container-title":"Physical Review Applied","id":"Cheiney2018","issue":"3","issued":{"date-parts":[[2018]]},"page":"034030","publisher":"American Physical Society","title":"Navigation-compatible hybrid quantum accelerometer using a Kalman filter","type":"article-journal","volume":"10"}},{"id":"ITEM-614","isTemporary":false,"itemData":{"DOI":"10.48550/arXiv.2103.09378","URL":"https://arxiv.org/abs/2103.09378","author":[{"family":"Wang","given":"Xuezhi"},{"family":"Kealy","given":"Allison"},{"family":"Gilliam","given":"Christopher"},{"family":"Haine","given":"Simon"},{"family":"Close","given":"John"},{"family":"Moran","given":"Bill"},{"family":"Talbot","given":"Kyle"},{"family":"Williams","given":"Simon"},{"family":"Hardman","given":"Kyle"},{"family":"Freier","given":"Chris"},{"family":"Wigley","given":"Paul"},{"family":"White","given":"Angela"},{"family":"Szigeti","given":"Stuart"},{"family":"Legge","given":"Sam"}],"id":"Wang2021","issued":{"date-parts":[[2021]]},"title":"Enhancing inertial navigation performance via fusion of classical and quantum accelerometers","type":""}}],"isEdited":false,"manualOverride":{"citeprocText":"(Cheiney et al. 2018; Xuezhi Wang et al. 2021)","isManuallyOverridden":false,"manualOverrideText":""},"mendeley":{"formattedCitation":"(Cheiney et al. 2018; Xuezhi Wang et al. 2021)","plainTextFormattedCitation":"(Cheiney et al. 2018; Xuezhi Wang et al. 2021)","previouslyFormattedCitation":"(Cheiney et al. 2018; Xuezhi Wang et al. 2021)"},"properties":{"noteIndex":0},"schema":"https://github.com/citation-style-language/schema/raw/master/csl-citation.json"}</w:instrText>
+        <w:instrText xml:space="preserve">ADDIN CSL_CITATION {"citationID":"MENDELEY_CITATION_614","citationItems":[{"id":"ITEM-613","isTemporary":false,"itemData":{"DOI":"10.1103/PhysRevApplied.10.034030","author":[{"family":"Cheiney","given":"Pierrick"},{"family":"Fouché","given":"Lauriane"},{"family":"Templier","given":"Simon"},{"family":"Napolitano","given":"Fabien"},{"family":"Battelier","given":"Baptiste"},{"family":"Bouyer","given":"Philippe"},{"family":"Barrett","given":"Brynle"}],"container-title":"Physical Review Applied","id":"Cheiney2018","issue":"3","issued":{"date-parts":[[2018]]},"page":"034030","publisher":"American Physical Society","title":"Navigation-compatible hybrid quantum accelerometer using a Kalman filter","type":"article-journal","volume":"10"}},{"id":"ITEM-614","isTemporary":false,"itemData":{"DOI":"10.48550/arXiv.2103.09378","URL":"https://arxiv.org/abs/2103.09378","author":[{"family":"Wang","given":"Xuezhi"},{"family":"Kealy","given":"Allison"},{"family":"Gilliam","given":"Christopher"},{"family":"Haine","given":"Simon"},{"family":"Close","given":"John"},{"family":"Moran","given":"Bill"},{"family":"Talbot","given":"Kyle"},{"family":"Williams","given":"Simon"},{"family":"Hardman","given":"Kyle"},{"family":"Freier","given":"Chris"},{"family":"Wigley","given":"Paul"},{"family":"White","given":"Angela"},{"family":"Szigeti","given":"Stuart"},{"family":"Legge","given":"Sam"}],"id":"Wang2021","issued":{"date-parts":[[2021]]},"note":"Revised version published as “Improving measurement performance via fusion of classical and quantum accelerometers,” The Journal of Navigation 76(1):91–102, 2023, doi:10.1017/S0373463322000637","title":"Enhancing inertial navigation performance via fusion of classical and quantum accelerometers","type":""}}],"isEdited":false,"manualOverride":{"citeprocText":"(Cheiney et al. 2018; Xuezhi Wang et al. 2021)","isManuallyOverridden":false,"manualOverrideText":""},"mendeley":{"formattedCitation":"(Cheiney et al. 2018; Xuezhi Wang et al. 2021)","plainTextFormattedCitation":"(Cheiney et al. 2018; Xuezhi Wang et al. 2021)","previouslyFormattedCitation":"(Cheiney et al. 2018; Xuezhi Wang et al. 2021)"},"properties":{"noteIndex":0},"schema":"https://github.com/citation-style-language/schema/raw/master/csl-citation.json"}</w:instrText>
       </w:r>
       <w:r>
         <w:fldChar w:fldCharType="separate"/>

</xml_diff>

<commit_message>
Survey 1: add first author's ORCID to manuscript, Word title block and cover letter
</commit_message>
<xml_diff>
--- a/github/k/Survey1_ACM_CSUR_Manuscript.docx
+++ b/github/k/Survey1_ACM_CSUR_Manuscript.docx
@@ -135,7 +135,19 @@
         <w:t xml:space="preserve"> </w:t>
       </w:r>
       <w:r>
-        <w:t xml:space="preserve">(g_yeshwanth@ch.students.amrita.edu)</w:t>
+        <w:t xml:space="preserve">(g_yeshwanth@ch.students.amrita.edu;</w:t>
+      </w:r>
+      <w:r>
+        <w:t xml:space="preserve"> </w:t>
+      </w:r>
+      <w:r>
+        <w:t xml:space="preserve">ORCID</w:t>
+      </w:r>
+      <w:r>
+        <w:t xml:space="preserve"> </w:t>
+      </w:r>
+      <w:r>
+        <w:t xml:space="preserve">0009-0007-6353-4033)</w:t>
       </w:r>
     </w:p>
     <w:p>

</xml_diff>

<commit_message>
Survey 1: add second author's ORCID
</commit_message>
<xml_diff>
--- a/github/k/Survey1_ACM_CSUR_Manuscript.docx
+++ b/github/k/Survey1_ACM_CSUR_Manuscript.docx
@@ -209,7 +209,19 @@
         <w:t xml:space="preserve"> </w:t>
       </w:r>
       <w:r>
-        <w:t xml:space="preserve">(c_devsingh@ch.amrita.edu)</w:t>
+        <w:t xml:space="preserve">(c_devsingh@ch.amrita.edu;</w:t>
+      </w:r>
+      <w:r>
+        <w:t xml:space="preserve"> </w:t>
+      </w:r>
+      <w:r>
+        <w:t xml:space="preserve">ORCID</w:t>
+      </w:r>
+      <w:r>
+        <w:t xml:space="preserve"> </w:t>
+      </w:r>
+      <w:r>
+        <w:t xml:space="preserve">0000-0002-1466-4567)</w:t>
       </w:r>
     </w:p>
     <w:p>

</xml_diff>

<commit_message>
Survey 1: add Department of Mechanical Engineering to both affiliations
</commit_message>
<xml_diff>
--- a/github/k/Survey1_ACM_CSUR_Manuscript.docx
+++ b/github/k/Survey1_ACM_CSUR_Manuscript.docx
@@ -105,6 +105,30 @@
         <w:t xml:space="preserve"> </w:t>
       </w:r>
       <w:r>
+        <w:t xml:space="preserve">Department</w:t>
+      </w:r>
+      <w:r>
+        <w:t xml:space="preserve"> </w:t>
+      </w:r>
+      <w:r>
+        <w:t xml:space="preserve">of</w:t>
+      </w:r>
+      <w:r>
+        <w:t xml:space="preserve"> </w:t>
+      </w:r>
+      <w:r>
+        <w:t xml:space="preserve">Mechanical</w:t>
+      </w:r>
+      <w:r>
+        <w:t xml:space="preserve"> </w:t>
+      </w:r>
+      <w:r>
+        <w:t xml:space="preserve">Engineering,</w:t>
+      </w:r>
+      <w:r>
+        <w:t xml:space="preserve"> </w:t>
+      </w:r>
+      <w:r>
         <w:t xml:space="preserve">Amrita</w:t>
       </w:r>
       <w:r>
@@ -174,6 +198,30 @@
       </w:r>
       <w:r>
         <w:t xml:space="preserve">Chauhan,</w:t>
+      </w:r>
+      <w:r>
+        <w:t xml:space="preserve"> </w:t>
+      </w:r>
+      <w:r>
+        <w:t xml:space="preserve">Department</w:t>
+      </w:r>
+      <w:r>
+        <w:t xml:space="preserve"> </w:t>
+      </w:r>
+      <w:r>
+        <w:t xml:space="preserve">of</w:t>
+      </w:r>
+      <w:r>
+        <w:t xml:space="preserve"> </w:t>
+      </w:r>
+      <w:r>
+        <w:t xml:space="preserve">Mechanical</w:t>
+      </w:r>
+      <w:r>
+        <w:t xml:space="preserve"> </w:t>
+      </w:r>
+      <w:r>
+        <w:t xml:space="preserve">Engineering,</w:t>
       </w:r>
       <w:r>
         <w:t xml:space="preserve"> </w:t>

</xml_diff>

<commit_message>
Survey 1: shorten abstract to 247 words, complete bibliography metadata, remove white-space stretching
- Abstract trimmed from 322 to 247 words; all key findings kept.
- refs.bib: publisher addresses and verified volume/pages/DOIs added
  (GoogleQAI2025, Leib2023, RodriguezDiaz2025, Finzgar2022,
  OsabaDrone2025); bibtex warnings 40 -> 10 (remaining: data not yet
  assigned or not published).
- \raggedbottom removes all underfull-page stretching.
</commit_message>
<xml_diff>
--- a/github/k/Survey1_ACM_CSUR_Manuscript.docx
+++ b/github/k/Survey1_ACM_CSUR_Manuscript.docx
@@ -345,13 +345,925 @@
         <w:t xml:space="preserve"> </w:t>
       </w:r>
       <w:r>
+        <w:t xml:space="preserve">the</w:t>
+      </w:r>
+      <w:r>
+        <w:t xml:space="preserve"> </w:t>
+      </w:r>
+      <w:r>
+        <w:t xml:space="preserve">computations</w:t>
+      </w:r>
+      <w:r>
+        <w:t xml:space="preserve"> </w:t>
+      </w:r>
+      <w:r>
+        <w:t xml:space="preserve">that</w:t>
+      </w:r>
+      <w:r>
+        <w:t xml:space="preserve"> </w:t>
+      </w:r>
+      <w:r>
+        <w:t xml:space="preserve">hold</w:t>
+      </w:r>
+      <w:r>
+        <w:t xml:space="preserve"> </w:t>
+      </w:r>
+      <w:r>
+        <w:t xml:space="preserve">autonomous</w:t>
+      </w:r>
+      <w:r>
+        <w:t xml:space="preserve"> </w:t>
+      </w:r>
+      <w:r>
+        <w:t xml:space="preserve">robots</w:t>
+      </w:r>
+      <w:r>
+        <w:t xml:space="preserve"> </w:t>
+      </w:r>
+      <w:r>
+        <w:t xml:space="preserve">back</w:t>
+      </w:r>
+      <w:r>
+        <w:t xml:space="preserve"> </w:t>
+      </w:r>
+      <w:r>
+        <w:t xml:space="preserve">in</w:t>
+      </w:r>
+      <w:r>
+        <w:t xml:space="preserve"> </w:t>
+      </w:r>
+      <w:r>
+        <w:t xml:space="preserve">large,</w:t>
+      </w:r>
+      <w:r>
+        <w:t xml:space="preserve"> </w:t>
+      </w:r>
+      <w:r>
+        <w:t xml:space="preserve">uncertain</w:t>
+      </w:r>
+      <w:r>
+        <w:t xml:space="preserve"> </w:t>
+      </w:r>
+      <w:r>
+        <w:t xml:space="preserve">environments.</w:t>
+      </w:r>
+      <w:r>
+        <w:t xml:space="preserve"> </w:t>
+      </w:r>
+      <w:r>
+        <w:t xml:space="preserve">Yet</w:t>
+      </w:r>
+      <w:r>
+        <w:t xml:space="preserve"> </w:t>
+      </w:r>
+      <w:r>
+        <w:t xml:space="preserve">claims</w:t>
+      </w:r>
+      <w:r>
+        <w:t xml:space="preserve"> </w:t>
+      </w:r>
+      <w:r>
+        <w:t xml:space="preserve">for</w:t>
+      </w:r>
+      <w:r>
+        <w:t xml:space="preserve"> </w:t>
+      </w:r>
+      <w:r>
+        <w:t xml:space="preserve">“</w:t>
+      </w:r>
+      <w:r>
+        <w:t xml:space="preserve">quantum</w:t>
+      </w:r>
+      <w:r>
+        <w:t xml:space="preserve"> </w:t>
+      </w:r>
+      <w:r>
+        <w:t xml:space="preserve">robotics</w:t>
+      </w:r>
+      <w:r>
+        <w:t xml:space="preserve">”</w:t>
+      </w:r>
+      <w:r>
+        <w:t xml:space="preserve"> </w:t>
+      </w:r>
+      <w:r>
+        <w:t xml:space="preserve">range</w:t>
+      </w:r>
+      <w:r>
+        <w:t xml:space="preserve"> </w:t>
+      </w:r>
+      <w:r>
+        <w:t xml:space="preserve">from</w:t>
+      </w:r>
+      <w:r>
+        <w:t xml:space="preserve"> </w:t>
+      </w:r>
+      <w:r>
+        <w:t xml:space="preserve">asymptotic</w:t>
+      </w:r>
+      <w:r>
+        <w:t xml:space="preserve"> </w:t>
+      </w:r>
+      <w:r>
+        <w:t xml:space="preserve">complexity</w:t>
+      </w:r>
+      <w:r>
+        <w:t xml:space="preserve"> </w:t>
+      </w:r>
+      <w:r>
+        <w:t xml:space="preserve">results</w:t>
+      </w:r>
+      <w:r>
+        <w:t xml:space="preserve"> </w:t>
+      </w:r>
+      <w:r>
+        <w:t xml:space="preserve">to</w:t>
+      </w:r>
+      <w:r>
+        <w:t xml:space="preserve"> </w:t>
+      </w:r>
+      <w:r>
+        <w:t xml:space="preserve">small</w:t>
+      </w:r>
+      <w:r>
+        <w:t xml:space="preserve"> </w:t>
+      </w:r>
+      <w:r>
+        <w:t xml:space="preserve">simulations</w:t>
+      </w:r>
+      <w:r>
+        <w:t xml:space="preserve"> </w:t>
+      </w:r>
+      <w:r>
         <w:t xml:space="preserve">and</w:t>
       </w:r>
       <w:r>
         <w:t xml:space="preserve"> </w:t>
       </w:r>
       <w:r>
-        <w:t xml:space="preserve">these</w:t>
+        <w:t xml:space="preserve">a</w:t>
+      </w:r>
+      <w:r>
+        <w:t xml:space="preserve"> </w:t>
+      </w:r>
+      <w:r>
+        <w:t xml:space="preserve">handful</w:t>
+      </w:r>
+      <w:r>
+        <w:t xml:space="preserve"> </w:t>
+      </w:r>
+      <w:r>
+        <w:t xml:space="preserve">of</w:t>
+      </w:r>
+      <w:r>
+        <w:t xml:space="preserve"> </w:t>
+      </w:r>
+      <w:r>
+        <w:t xml:space="preserve">hardware</w:t>
+      </w:r>
+      <w:r>
+        <w:t xml:space="preserve"> </w:t>
+      </w:r>
+      <w:r>
+        <w:t xml:space="preserve">runs,</w:t>
+      </w:r>
+      <w:r>
+        <w:t xml:space="preserve"> </w:t>
+      </w:r>
+      <w:r>
+        <w:t xml:space="preserve">and</w:t>
+      </w:r>
+      <w:r>
+        <w:t xml:space="preserve"> </w:t>
+      </w:r>
+      <w:r>
+        <w:t xml:space="preserve">it</w:t>
+      </w:r>
+      <w:r>
+        <w:t xml:space="preserve"> </w:t>
+      </w:r>
+      <w:r>
+        <w:t xml:space="preserve">is</w:t>
+      </w:r>
+      <w:r>
+        <w:t xml:space="preserve"> </w:t>
+      </w:r>
+      <w:r>
+        <w:t xml:space="preserve">hard</w:t>
+      </w:r>
+      <w:r>
+        <w:t xml:space="preserve"> </w:t>
+      </w:r>
+      <w:r>
+        <w:t xml:space="preserve">to</w:t>
+      </w:r>
+      <w:r>
+        <w:t xml:space="preserve"> </w:t>
+      </w:r>
+      <w:r>
+        <w:t xml:space="preserve">tell</w:t>
+      </w:r>
+      <w:r>
+        <w:t xml:space="preserve"> </w:t>
+      </w:r>
+      <w:r>
+        <w:t xml:space="preserve">what</w:t>
+      </w:r>
+      <w:r>
+        <w:t xml:space="preserve"> </w:t>
+      </w:r>
+      <w:r>
+        <w:t xml:space="preserve">a</w:t>
+      </w:r>
+      <w:r>
+        <w:t xml:space="preserve"> </w:t>
+      </w:r>
+      <w:r>
+        <w:t xml:space="preserve">robot</w:t>
+      </w:r>
+      <w:r>
+        <w:t xml:space="preserve"> </w:t>
+      </w:r>
+      <w:r>
+        <w:t xml:space="preserve">could</w:t>
+      </w:r>
+      <w:r>
+        <w:t xml:space="preserve"> </w:t>
+      </w:r>
+      <w:r>
+        <w:t xml:space="preserve">use</w:t>
+      </w:r>
+      <w:r>
+        <w:t xml:space="preserve"> </w:t>
+      </w:r>
+      <w:r>
+        <w:t xml:space="preserve">today.</w:t>
+      </w:r>
+      <w:r>
+        <w:t xml:space="preserve"> </w:t>
+      </w:r>
+      <w:r>
+        <w:t xml:space="preserve">This</w:t>
+      </w:r>
+      <w:r>
+        <w:t xml:space="preserve"> </w:t>
+      </w:r>
+      <w:r>
+        <w:t xml:space="preserve">systematic</w:t>
+      </w:r>
+      <w:r>
+        <w:t xml:space="preserve"> </w:t>
+      </w:r>
+      <w:r>
+        <w:t xml:space="preserve">survey,</w:t>
+      </w:r>
+      <w:r>
+        <w:t xml:space="preserve"> </w:t>
+      </w:r>
+      <w:r>
+        <w:t xml:space="preserve">reported</w:t>
+      </w:r>
+      <w:r>
+        <w:t xml:space="preserve"> </w:t>
+      </w:r>
+      <w:r>
+        <w:t xml:space="preserve">following</w:t>
+      </w:r>
+      <w:r>
+        <w:t xml:space="preserve"> </w:t>
+      </w:r>
+      <w:r>
+        <w:t xml:space="preserve">PRISMA</w:t>
+      </w:r>
+      <w:r>
+        <w:t xml:space="preserve"> </w:t>
+      </w:r>
+      <w:r>
+        <w:t xml:space="preserve">2020</w:t>
+      </w:r>
+      <w:r>
+        <w:t xml:space="preserve"> </w:t>
+      </w:r>
+      <w:r>
+        <w:t xml:space="preserve">where</w:t>
+      </w:r>
+      <w:r>
+        <w:t xml:space="preserve"> </w:t>
+      </w:r>
+      <w:r>
+        <w:t xml:space="preserve">it</w:t>
+      </w:r>
+      <w:r>
+        <w:t xml:space="preserve"> </w:t>
+      </w:r>
+      <w:r>
+        <w:t xml:space="preserve">applies,</w:t>
+      </w:r>
+      <w:r>
+        <w:t xml:space="preserve"> </w:t>
+      </w:r>
+      <w:r>
+        <w:t xml:space="preserve">examines</w:t>
+      </w:r>
+      <w:r>
+        <w:t xml:space="preserve"> </w:t>
+      </w:r>
+      <w:r>
+        <w:t xml:space="preserve">72</w:t>
+      </w:r>
+      <w:r>
+        <w:t xml:space="preserve"> </w:t>
+      </w:r>
+      <w:r>
+        <w:t xml:space="preserve">primary</w:t>
+      </w:r>
+      <w:r>
+        <w:t xml:space="preserve"> </w:t>
+      </w:r>
+      <w:r>
+        <w:t xml:space="preserve">studies</w:t>
+      </w:r>
+      <w:r>
+        <w:t xml:space="preserve"> </w:t>
+      </w:r>
+      <w:r>
+        <w:t xml:space="preserve">that</w:t>
+      </w:r>
+      <w:r>
+        <w:t xml:space="preserve"> </w:t>
+      </w:r>
+      <w:r>
+        <w:t xml:space="preserve">apply</w:t>
+      </w:r>
+      <w:r>
+        <w:t xml:space="preserve"> </w:t>
+      </w:r>
+      <w:r>
+        <w:t xml:space="preserve">quantum</w:t>
+      </w:r>
+      <w:r>
+        <w:t xml:space="preserve"> </w:t>
+      </w:r>
+      <w:r>
+        <w:t xml:space="preserve">or</w:t>
+      </w:r>
+      <w:r>
+        <w:t xml:space="preserve"> </w:t>
+      </w:r>
+      <w:r>
+        <w:t xml:space="preserve">quantum-inspired</w:t>
+      </w:r>
+      <w:r>
+        <w:t xml:space="preserve"> </w:t>
+      </w:r>
+      <w:r>
+        <w:t xml:space="preserve">methods</w:t>
+      </w:r>
+      <w:r>
+        <w:t xml:space="preserve"> </w:t>
+      </w:r>
+      <w:r>
+        <w:t xml:space="preserve">to</w:t>
+      </w:r>
+      <w:r>
+        <w:t xml:space="preserve"> </w:t>
+      </w:r>
+      <w:r>
+        <w:t xml:space="preserve">robotic</w:t>
+      </w:r>
+      <w:r>
+        <w:t xml:space="preserve"> </w:t>
+      </w:r>
+      <w:r>
+        <w:t xml:space="preserve">functions,</w:t>
+      </w:r>
+      <w:r>
+        <w:t xml:space="preserve"> </w:t>
+      </w:r>
+      <w:r>
+        <w:t xml:space="preserve">set</w:t>
+      </w:r>
+      <w:r>
+        <w:t xml:space="preserve"> </w:t>
+      </w:r>
+      <w:r>
+        <w:t xml:space="preserve">against</w:t>
+      </w:r>
+      <w:r>
+        <w:t xml:space="preserve"> </w:t>
+      </w:r>
+      <w:r>
+        <w:t xml:space="preserve">107</w:t>
+      </w:r>
+      <w:r>
+        <w:t xml:space="preserve"> </w:t>
+      </w:r>
+      <w:r>
+        <w:t xml:space="preserve">foundational</w:t>
+      </w:r>
+      <w:r>
+        <w:t xml:space="preserve"> </w:t>
+      </w:r>
+      <w:r>
+        <w:t xml:space="preserve">works.</w:t>
+      </w:r>
+      <w:r>
+        <w:t xml:space="preserve"> </w:t>
+      </w:r>
+      <w:r>
+        <w:t xml:space="preserve">We</w:t>
+      </w:r>
+      <w:r>
+        <w:t xml:space="preserve"> </w:t>
+      </w:r>
+      <w:r>
+        <w:t xml:space="preserve">organize</w:t>
+      </w:r>
+      <w:r>
+        <w:t xml:space="preserve"> </w:t>
+      </w:r>
+      <w:r>
+        <w:t xml:space="preserve">the</w:t>
+      </w:r>
+      <w:r>
+        <w:t xml:space="preserve"> </w:t>
+      </w:r>
+      <w:r>
+        <w:t xml:space="preserve">field</w:t>
+      </w:r>
+      <w:r>
+        <w:t xml:space="preserve"> </w:t>
+      </w:r>
+      <w:r>
+        <w:t xml:space="preserve">by</w:t>
+      </w:r>
+      <w:r>
+        <w:t xml:space="preserve"> </w:t>
+      </w:r>
+      <w:r>
+        <w:t xml:space="preserve">robotic</w:t>
+      </w:r>
+      <w:r>
+        <w:t xml:space="preserve"> </w:t>
+      </w:r>
+      <w:r>
+        <w:t xml:space="preserve">function</w:t>
+      </w:r>
+      <w:r>
+        <w:t xml:space="preserve"> </w:t>
+      </w:r>
+      <w:r>
+        <w:t xml:space="preserve">(optimization,</w:t>
+      </w:r>
+      <w:r>
+        <w:t xml:space="preserve"> </w:t>
+      </w:r>
+      <w:r>
+        <w:t xml:space="preserve">planning,</w:t>
+      </w:r>
+      <w:r>
+        <w:t xml:space="preserve"> </w:t>
+      </w:r>
+      <w:r>
+        <w:t xml:space="preserve">learning,</w:t>
+      </w:r>
+      <w:r>
+        <w:t xml:space="preserve"> </w:t>
+      </w:r>
+      <w:r>
+        <w:t xml:space="preserve">sensing</w:t>
+      </w:r>
+      <w:r>
+        <w:t xml:space="preserve"> </w:t>
+      </w:r>
+      <w:r>
+        <w:t xml:space="preserve">and</w:t>
+      </w:r>
+      <w:r>
+        <w:t xml:space="preserve"> </w:t>
+      </w:r>
+      <w:r>
+        <w:t xml:space="preserve">communication,</w:t>
+      </w:r>
+      <w:r>
+        <w:t xml:space="preserve"> </w:t>
+      </w:r>
+      <w:r>
+        <w:t xml:space="preserve">and</w:t>
+      </w:r>
+      <w:r>
+        <w:t xml:space="preserve"> </w:t>
+      </w:r>
+      <w:r>
+        <w:t xml:space="preserve">decision-making),</w:t>
+      </w:r>
+      <w:r>
+        <w:t xml:space="preserve"> </w:t>
+      </w:r>
+      <w:r>
+        <w:t xml:space="preserve">grade</w:t>
+      </w:r>
+      <w:r>
+        <w:t xml:space="preserve"> </w:t>
+      </w:r>
+      <w:r>
+        <w:t xml:space="preserve">every</w:t>
+      </w:r>
+      <w:r>
+        <w:t xml:space="preserve"> </w:t>
+      </w:r>
+      <w:r>
+        <w:t xml:space="preserve">study</w:t>
+      </w:r>
+      <w:r>
+        <w:t xml:space="preserve"> </w:t>
+      </w:r>
+      <w:r>
+        <w:t xml:space="preserve">on</w:t>
+      </w:r>
+      <w:r>
+        <w:t xml:space="preserve"> </w:t>
+      </w:r>
+      <w:r>
+        <w:t xml:space="preserve">a</w:t>
+      </w:r>
+      <w:r>
+        <w:t xml:space="preserve"> </w:t>
+      </w:r>
+      <w:r>
+        <w:t xml:space="preserve">six-level</w:t>
+      </w:r>
+      <w:r>
+        <w:t xml:space="preserve"> </w:t>
+      </w:r>
+      <w:r>
+        <w:t xml:space="preserve">evidence</w:t>
+      </w:r>
+      <w:r>
+        <w:t xml:space="preserve"> </w:t>
+      </w:r>
+      <w:r>
+        <w:t xml:space="preserve">hierarchy</w:t>
+      </w:r>
+      <w:r>
+        <w:t xml:space="preserve"> </w:t>
+      </w:r>
+      <w:r>
+        <w:t xml:space="preserve">from</w:t>
+      </w:r>
+      <w:r>
+        <w:t xml:space="preserve"> </w:t>
+      </w:r>
+      <w:r>
+        <w:t xml:space="preserve">theoretical</w:t>
+      </w:r>
+      <w:r>
+        <w:t xml:space="preserve"> </w:t>
+      </w:r>
+      <w:r>
+        <w:t xml:space="preserve">analysis</w:t>
+      </w:r>
+      <w:r>
+        <w:t xml:space="preserve"> </w:t>
+      </w:r>
+      <w:r>
+        <w:t xml:space="preserve">to</w:t>
+      </w:r>
+      <w:r>
+        <w:t xml:space="preserve"> </w:t>
+      </w:r>
+      <w:r>
+        <w:t xml:space="preserve">end-to-end</w:t>
+      </w:r>
+      <w:r>
+        <w:t xml:space="preserve"> </w:t>
+      </w:r>
+      <w:r>
+        <w:t xml:space="preserve">deployment,</w:t>
+      </w:r>
+      <w:r>
+        <w:t xml:space="preserve"> </w:t>
+      </w:r>
+      <w:r>
+        <w:t xml:space="preserve">and</w:t>
+      </w:r>
+      <w:r>
+        <w:t xml:space="preserve"> </w:t>
+      </w:r>
+      <w:r>
+        <w:t xml:space="preserve">record</w:t>
+      </w:r>
+      <w:r>
+        <w:t xml:space="preserve"> </w:t>
+      </w:r>
+      <w:r>
+        <w:t xml:space="preserve">whether</w:t>
+      </w:r>
+      <w:r>
+        <w:t xml:space="preserve"> </w:t>
+      </w:r>
+      <w:r>
+        <w:t xml:space="preserve">its</w:t>
+      </w:r>
+      <w:r>
+        <w:t xml:space="preserve"> </w:t>
+      </w:r>
+      <w:r>
+        <w:t xml:space="preserve">quantum</w:t>
+      </w:r>
+      <w:r>
+        <w:t xml:space="preserve"> </w:t>
+      </w:r>
+      <w:r>
+        <w:t xml:space="preserve">component</w:t>
+      </w:r>
+      <w:r>
+        <w:t xml:space="preserve"> </w:t>
+      </w:r>
+      <w:r>
+        <w:t xml:space="preserve">ran</w:t>
+      </w:r>
+      <w:r>
+        <w:t xml:space="preserve"> </w:t>
+      </w:r>
+      <w:r>
+        <w:t xml:space="preserve">on</w:t>
+      </w:r>
+      <w:r>
+        <w:t xml:space="preserve"> </w:t>
+      </w:r>
+      <w:r>
+        <w:t xml:space="preserve">hardware,</w:t>
+      </w:r>
+      <w:r>
+        <w:t xml:space="preserve"> </w:t>
+      </w:r>
+      <w:r>
+        <w:t xml:space="preserve">in</w:t>
+      </w:r>
+      <w:r>
+        <w:t xml:space="preserve"> </w:t>
+      </w:r>
+      <w:r>
+        <w:t xml:space="preserve">simulation,</w:t>
+      </w:r>
+      <w:r>
+        <w:t xml:space="preserve"> </w:t>
+      </w:r>
+      <w:r>
+        <w:t xml:space="preserve">or</w:t>
+      </w:r>
+      <w:r>
+        <w:t xml:space="preserve"> </w:t>
+      </w:r>
+      <w:r>
+        <w:t xml:space="preserve">not</w:t>
+      </w:r>
+      <w:r>
+        <w:t xml:space="preserve"> </w:t>
+      </w:r>
+      <w:r>
+        <w:t xml:space="preserve">at</w:t>
+      </w:r>
+      <w:r>
+        <w:t xml:space="preserve"> </w:t>
+      </w:r>
+      <w:r>
+        <w:t xml:space="preserve">all.</w:t>
+      </w:r>
+      <w:r>
+        <w:t xml:space="preserve"> </w:t>
+      </w:r>
+      <w:r>
+        <w:t xml:space="preserve">No</w:t>
+      </w:r>
+      <w:r>
+        <w:t xml:space="preserve"> </w:t>
+      </w:r>
+      <w:r>
+        <w:t xml:space="preserve">quantum</w:t>
+      </w:r>
+      <w:r>
+        <w:t xml:space="preserve"> </w:t>
+      </w:r>
+      <w:r>
+        <w:t xml:space="preserve">computational</w:t>
+      </w:r>
+      <w:r>
+        <w:t xml:space="preserve"> </w:t>
+      </w:r>
+      <w:r>
+        <w:t xml:space="preserve">method</w:t>
+      </w:r>
+      <w:r>
+        <w:t xml:space="preserve"> </w:t>
+      </w:r>
+      <w:r>
+        <w:t xml:space="preserve">has</w:t>
+      </w:r>
+      <w:r>
+        <w:t xml:space="preserve"> </w:t>
+      </w:r>
+      <w:r>
+        <w:t xml:space="preserve">yet</w:t>
+      </w:r>
+      <w:r>
+        <w:t xml:space="preserve"> </w:t>
+      </w:r>
+      <w:r>
+        <w:t xml:space="preserve">shown</w:t>
+      </w:r>
+      <w:r>
+        <w:t xml:space="preserve"> </w:t>
+      </w:r>
+      <w:r>
+        <w:t xml:space="preserve">an</w:t>
+      </w:r>
+      <w:r>
+        <w:t xml:space="preserve"> </w:t>
+      </w:r>
+      <w:r>
+        <w:t xml:space="preserve">end-to-end</w:t>
+      </w:r>
+      <w:r>
+        <w:t xml:space="preserve"> </w:t>
+      </w:r>
+      <w:r>
+        <w:t xml:space="preserve">advantage</w:t>
+      </w:r>
+      <w:r>
+        <w:t xml:space="preserve"> </w:t>
+      </w:r>
+      <w:r>
+        <w:t xml:space="preserve">on</w:t>
+      </w:r>
+      <w:r>
+        <w:t xml:space="preserve"> </w:t>
+      </w:r>
+      <w:r>
+        <w:t xml:space="preserve">a</w:t>
+      </w:r>
+      <w:r>
+        <w:t xml:space="preserve"> </w:t>
+      </w:r>
+      <w:r>
+        <w:t xml:space="preserve">physical</w:t>
+      </w:r>
+      <w:r>
+        <w:t xml:space="preserve"> </w:t>
+      </w:r>
+      <w:r>
+        <w:t xml:space="preserve">robot.</w:t>
+      </w:r>
+      <w:r>
+        <w:t xml:space="preserve"> </w:t>
+      </w:r>
+      <w:r>
+        <w:t xml:space="preserve">Quantum</w:t>
+      </w:r>
+      <w:r>
+        <w:t xml:space="preserve"> </w:t>
+      </w:r>
+      <w:r>
+        <w:t xml:space="preserve">annealing</w:t>
+      </w:r>
+      <w:r>
+        <w:t xml:space="preserve"> </w:t>
+      </w:r>
+      <w:r>
+        <w:t xml:space="preserve">has</w:t>
+      </w:r>
+      <w:r>
+        <w:t xml:space="preserve"> </w:t>
+      </w:r>
+      <w:r>
+        <w:t xml:space="preserve">routed</w:t>
+      </w:r>
+      <w:r>
+        <w:t xml:space="preserve"> </w:t>
+      </w:r>
+      <w:r>
+        <w:t xml:space="preserve">fleets</w:t>
+      </w:r>
+      <w:r>
+        <w:t xml:space="preserve"> </w:t>
+      </w:r>
+      <w:r>
+        <w:t xml:space="preserve">of</w:t>
+      </w:r>
+      <w:r>
+        <w:t xml:space="preserve"> </w:t>
+      </w:r>
+      <w:r>
+        <w:t xml:space="preserve">up</w:t>
+      </w:r>
+      <w:r>
+        <w:t xml:space="preserve"> </w:t>
+      </w:r>
+      <w:r>
+        <w:t xml:space="preserve">to</w:t>
+      </w:r>
+      <w:r>
+        <w:t xml:space="preserve"> </w:t>
+      </w:r>
+      <w:r>
+        <w:t xml:space="preserve">1,000</w:t>
+      </w:r>
+      <w:r>
+        <w:t xml:space="preserve"> </w:t>
+      </w:r>
+      <w:r>
+        <w:t xml:space="preserve">simulated</w:t>
+      </w:r>
+      <w:r>
+        <w:t xml:space="preserve"> </w:t>
+      </w:r>
+      <w:r>
+        <w:t xml:space="preserve">vehicles</w:t>
+      </w:r>
+      <w:r>
+        <w:t xml:space="preserve"> </w:t>
+      </w:r>
+      <w:r>
+        <w:t xml:space="preserve">after</w:t>
+      </w:r>
+      <w:r>
+        <w:t xml:space="preserve"> </w:t>
+      </w:r>
+      <w:r>
+        <w:t xml:space="preserve">decomposition,</w:t>
+      </w:r>
+      <w:r>
+        <w:t xml:space="preserve"> </w:t>
+      </w:r>
+      <w:r>
+        <w:t xml:space="preserve">but</w:t>
+      </w:r>
+      <w:r>
+        <w:t xml:space="preserve"> </w:t>
+      </w:r>
+      <w:r>
+        <w:t xml:space="preserve">classical</w:t>
+      </w:r>
+      <w:r>
+        <w:t xml:space="preserve"> </w:t>
+      </w:r>
+      <w:r>
+        <w:t xml:space="preserve">and</w:t>
+      </w:r>
+      <w:r>
+        <w:t xml:space="preserve"> </w:t>
+      </w:r>
+      <w:r>
+        <w:t xml:space="preserve">quantum-inspired</w:t>
+      </w:r>
+      <w:r>
+        <w:t xml:space="preserve"> </w:t>
+      </w:r>
+      <w:r>
+        <w:t xml:space="preserve">solvers</w:t>
+      </w:r>
+      <w:r>
+        <w:t xml:space="preserve"> </w:t>
+      </w:r>
+      <w:r>
+        <w:t xml:space="preserve">match</w:t>
+      </w:r>
+      <w:r>
+        <w:t xml:space="preserve"> </w:t>
+      </w:r>
+      <w:r>
+        <w:t xml:space="preserve">or</w:t>
+      </w:r>
+      <w:r>
+        <w:t xml:space="preserve"> </w:t>
+      </w:r>
+      <w:r>
+        <w:t xml:space="preserve">beat</w:t>
+      </w:r>
+      <w:r>
+        <w:t xml:space="preserve"> </w:t>
+      </w:r>
+      <w:r>
+        <w:t xml:space="preserve">it</w:t>
+      </w:r>
+      <w:r>
+        <w:t xml:space="preserve"> </w:t>
+      </w:r>
+      <w:r>
+        <w:t xml:space="preserve">whenever</w:t>
+      </w:r>
+      <w:r>
+        <w:t xml:space="preserve"> </w:t>
+      </w:r>
+      <w:r>
+        <w:t xml:space="preserve">the</w:t>
+      </w:r>
+      <w:r>
+        <w:t xml:space="preserve"> </w:t>
+      </w:r>
+      <w:r>
+        <w:t xml:space="preserve">two</w:t>
       </w:r>
       <w:r>
         <w:t xml:space="preserve"> </w:t>
@@ -363,7 +1275,307 @@
         <w:t xml:space="preserve"> </w:t>
       </w:r>
       <w:r>
-        <w:t xml:space="preserve">exactly</w:t>
+        <w:t xml:space="preserve">compared</w:t>
+      </w:r>
+      <w:r>
+        <w:t xml:space="preserve"> </w:t>
+      </w:r>
+      <w:r>
+        <w:t xml:space="preserve">directly.</w:t>
+      </w:r>
+      <w:r>
+        <w:t xml:space="preserve"> </w:t>
+      </w:r>
+      <w:r>
+        <w:t xml:space="preserve">Quantum</w:t>
+      </w:r>
+      <w:r>
+        <w:t xml:space="preserve"> </w:t>
+      </w:r>
+      <w:r>
+        <w:t xml:space="preserve">reinforcement</w:t>
+      </w:r>
+      <w:r>
+        <w:t xml:space="preserve"> </w:t>
+      </w:r>
+      <w:r>
+        <w:t xml:space="preserve">learning</w:t>
+      </w:r>
+      <w:r>
+        <w:t xml:space="preserve"> </w:t>
+      </w:r>
+      <w:r>
+        <w:t xml:space="preserve">reaches</w:t>
+      </w:r>
+      <w:r>
+        <w:t xml:space="preserve"> </w:t>
+      </w:r>
+      <w:r>
+        <w:t xml:space="preserve">comparable</w:t>
+      </w:r>
+      <w:r>
+        <w:t xml:space="preserve"> </w:t>
+      </w:r>
+      <w:r>
+        <w:t xml:space="preserve">returns</w:t>
+      </w:r>
+      <w:r>
+        <w:t xml:space="preserve"> </w:t>
+      </w:r>
+      <w:r>
+        <w:t xml:space="preserve">with</w:t>
+      </w:r>
+      <w:r>
+        <w:t xml:space="preserve"> </w:t>
+      </w:r>
+      <w:r>
+        <w:t xml:space="preserve">one</w:t>
+      </w:r>
+      <w:r>
+        <w:t xml:space="preserve"> </w:t>
+      </w:r>
+      <w:r>
+        <w:t xml:space="preserve">to</w:t>
+      </w:r>
+      <w:r>
+        <w:t xml:space="preserve"> </w:t>
+      </w:r>
+      <w:r>
+        <w:t xml:space="preserve">two</w:t>
+      </w:r>
+      <w:r>
+        <w:t xml:space="preserve"> </w:t>
+      </w:r>
+      <w:r>
+        <w:t xml:space="preserve">orders</w:t>
+      </w:r>
+      <w:r>
+        <w:t xml:space="preserve"> </w:t>
+      </w:r>
+      <w:r>
+        <w:t xml:space="preserve">of</w:t>
+      </w:r>
+      <w:r>
+        <w:t xml:space="preserve"> </w:t>
+      </w:r>
+      <w:r>
+        <w:t xml:space="preserve">magnitude</w:t>
+      </w:r>
+      <w:r>
+        <w:t xml:space="preserve"> </w:t>
+      </w:r>
+      <w:r>
+        <w:t xml:space="preserve">fewer</w:t>
+      </w:r>
+      <w:r>
+        <w:t xml:space="preserve"> </w:t>
+      </w:r>
+      <w:r>
+        <w:t xml:space="preserve">parameters,</w:t>
+      </w:r>
+      <w:r>
+        <w:t xml:space="preserve"> </w:t>
+      </w:r>
+      <w:r>
+        <w:t xml:space="preserve">but</w:t>
+      </w:r>
+      <w:r>
+        <w:t xml:space="preserve"> </w:t>
+      </w:r>
+      <w:r>
+        <w:t xml:space="preserve">not</w:t>
+      </w:r>
+      <w:r>
+        <w:t xml:space="preserve"> </w:t>
+      </w:r>
+      <w:r>
+        <w:t xml:space="preserve">shorter</w:t>
+      </w:r>
+      <w:r>
+        <w:t xml:space="preserve"> </w:t>
+      </w:r>
+      <w:r>
+        <w:t xml:space="preserve">training,</w:t>
+      </w:r>
+      <w:r>
+        <w:t xml:space="preserve"> </w:t>
+      </w:r>
+      <w:r>
+        <w:t xml:space="preserve">fewer</w:t>
+      </w:r>
+      <w:r>
+        <w:t xml:space="preserve"> </w:t>
+      </w:r>
+      <w:r>
+        <w:t xml:space="preserve">samples,</w:t>
+      </w:r>
+      <w:r>
+        <w:t xml:space="preserve"> </w:t>
+      </w:r>
+      <w:r>
+        <w:t xml:space="preserve">or</w:t>
+      </w:r>
+      <w:r>
+        <w:t xml:space="preserve"> </w:t>
+      </w:r>
+      <w:r>
+        <w:t xml:space="preserve">better</w:t>
+      </w:r>
+      <w:r>
+        <w:t xml:space="preserve"> </w:t>
+      </w:r>
+      <w:r>
+        <w:t xml:space="preserve">policies.</w:t>
+      </w:r>
+      <w:r>
+        <w:t xml:space="preserve"> </w:t>
+      </w:r>
+      <w:r>
+        <w:t xml:space="preserve">Cloud</w:t>
+      </w:r>
+      <w:r>
+        <w:t xml:space="preserve"> </w:t>
+      </w:r>
+      <w:r>
+        <w:t xml:space="preserve">latency,</w:t>
+      </w:r>
+      <w:r>
+        <w:t xml:space="preserve"> </w:t>
+      </w:r>
+      <w:r>
+        <w:t xml:space="preserve">noise,</w:t>
+      </w:r>
+      <w:r>
+        <w:t xml:space="preserve"> </w:t>
+      </w:r>
+      <w:r>
+        <w:t xml:space="preserve">and</w:t>
+      </w:r>
+      <w:r>
+        <w:t xml:space="preserve"> </w:t>
+      </w:r>
+      <w:r>
+        <w:t xml:space="preserve">trainability</w:t>
+      </w:r>
+      <w:r>
+        <w:t xml:space="preserve"> </w:t>
+      </w:r>
+      <w:r>
+        <w:t xml:space="preserve">keep</w:t>
+      </w:r>
+      <w:r>
+        <w:t xml:space="preserve"> </w:t>
+      </w:r>
+      <w:r>
+        <w:t xml:space="preserve">quantum</w:t>
+      </w:r>
+      <w:r>
+        <w:t xml:space="preserve"> </w:t>
+      </w:r>
+      <w:r>
+        <w:t xml:space="preserve">processors</w:t>
+      </w:r>
+      <w:r>
+        <w:t xml:space="preserve"> </w:t>
+      </w:r>
+      <w:r>
+        <w:t xml:space="preserve">out</w:t>
+      </w:r>
+      <w:r>
+        <w:t xml:space="preserve"> </w:t>
+      </w:r>
+      <w:r>
+        <w:t xml:space="preserve">of</w:t>
+      </w:r>
+      <w:r>
+        <w:t xml:space="preserve"> </w:t>
+      </w:r>
+      <w:r>
+        <w:t xml:space="preserve">real-time</w:t>
+      </w:r>
+      <w:r>
+        <w:t xml:space="preserve"> </w:t>
+      </w:r>
+      <w:r>
+        <w:t xml:space="preserve">control</w:t>
+      </w:r>
+      <w:r>
+        <w:t xml:space="preserve"> </w:t>
+      </w:r>
+      <w:r>
+        <w:t xml:space="preserve">loops.</w:t>
+      </w:r>
+      <w:r>
+        <w:t xml:space="preserve"> </w:t>
+      </w:r>
+      <w:r>
+        <w:t xml:space="preserve">Only</w:t>
+      </w:r>
+      <w:r>
+        <w:t xml:space="preserve"> </w:t>
+      </w:r>
+      <w:r>
+        <w:t xml:space="preserve">quantum</w:t>
+      </w:r>
+      <w:r>
+        <w:t xml:space="preserve"> </w:t>
+      </w:r>
+      <w:r>
+        <w:t xml:space="preserve">sensing</w:t>
+      </w:r>
+      <w:r>
+        <w:t xml:space="preserve"> </w:t>
+      </w:r>
+      <w:r>
+        <w:t xml:space="preserve">and</w:t>
+      </w:r>
+      <w:r>
+        <w:t xml:space="preserve"> </w:t>
+      </w:r>
+      <w:r>
+        <w:t xml:space="preserve">communication</w:t>
+      </w:r>
+      <w:r>
+        <w:t xml:space="preserve"> </w:t>
+      </w:r>
+      <w:r>
+        <w:t xml:space="preserve">have</w:t>
+      </w:r>
+      <w:r>
+        <w:t xml:space="preserve"> </w:t>
+      </w:r>
+      <w:r>
+        <w:t xml:space="preserve">been</w:t>
+      </w:r>
+      <w:r>
+        <w:t xml:space="preserve"> </w:t>
+      </w:r>
+      <w:r>
+        <w:t xml:space="preserve">fielded</w:t>
+      </w:r>
+      <w:r>
+        <w:t xml:space="preserve"> </w:t>
+      </w:r>
+      <w:r>
+        <w:t xml:space="preserve">on</w:t>
+      </w:r>
+      <w:r>
+        <w:t xml:space="preserve"> </w:t>
+      </w:r>
+      <w:r>
+        <w:t xml:space="preserve">moving</w:t>
+      </w:r>
+      <w:r>
+        <w:t xml:space="preserve"> </w:t>
+      </w:r>
+      <w:r>
+        <w:t xml:space="preserve">platforms,</w:t>
+      </w:r>
+      <w:r>
+        <w:t xml:space="preserve"> </w:t>
+      </w:r>
+      <w:r>
+        <w:t xml:space="preserve">and</w:t>
       </w:r>
       <w:r>
         <w:t xml:space="preserve"> </w:t>
@@ -375,55 +1587,157 @@
         <w:t xml:space="preserve"> </w:t>
       </w:r>
       <w:r>
-        <w:t xml:space="preserve">computations</w:t>
-      </w:r>
-      <w:r>
-        <w:t xml:space="preserve"> </w:t>
-      </w:r>
-      <w:r>
-        <w:t xml:space="preserve">that</w:t>
-      </w:r>
-      <w:r>
-        <w:t xml:space="preserve"> </w:t>
-      </w:r>
-      <w:r>
-        <w:t xml:space="preserve">hold</w:t>
-      </w:r>
-      <w:r>
-        <w:t xml:space="preserve"> </w:t>
-      </w:r>
-      <w:r>
-        <w:t xml:space="preserve">autonomous</w:t>
-      </w:r>
-      <w:r>
-        <w:t xml:space="preserve"> </w:t>
-      </w:r>
-      <w:r>
-        <w:t xml:space="preserve">robots</w:t>
-      </w:r>
-      <w:r>
-        <w:t xml:space="preserve"> </w:t>
-      </w:r>
-      <w:r>
-        <w:t xml:space="preserve">back</w:t>
-      </w:r>
-      <w:r>
-        <w:t xml:space="preserve"> </w:t>
-      </w:r>
-      <w:r>
-        <w:t xml:space="preserve">in</w:t>
-      </w:r>
-      <w:r>
-        <w:t xml:space="preserve"> </w:t>
-      </w:r>
-      <w:r>
-        <w:t xml:space="preserve">large,</w:t>
-      </w:r>
-      <w:r>
-        <w:t xml:space="preserve"> </w:t>
-      </w:r>
-      <w:r>
-        <w:t xml:space="preserve">uncertain,</w:t>
+        <w:t xml:space="preserve">one</w:t>
+      </w:r>
+      <w:r>
+        <w:t xml:space="preserve"> </w:t>
+      </w:r>
+      <w:r>
+        <w:t xml:space="preserve">field</w:t>
+      </w:r>
+      <w:r>
+        <w:t xml:space="preserve"> </w:t>
+      </w:r>
+      <w:r>
+        <w:t xml:space="preserve">result</w:t>
+      </w:r>
+      <w:r>
+        <w:t xml:space="preserve"> </w:t>
+      </w:r>
+      <w:r>
+        <w:t xml:space="preserve">showing</w:t>
+      </w:r>
+      <w:r>
+        <w:t xml:space="preserve"> </w:t>
+      </w:r>
+      <w:r>
+        <w:t xml:space="preserve">a</w:t>
+      </w:r>
+      <w:r>
+        <w:t xml:space="preserve"> </w:t>
+      </w:r>
+      <w:r>
+        <w:t xml:space="preserve">navigation</w:t>
+      </w:r>
+      <w:r>
+        <w:t xml:space="preserve"> </w:t>
+      </w:r>
+      <w:r>
+        <w:t xml:space="preserve">advantage</w:t>
+      </w:r>
+      <w:r>
+        <w:t xml:space="preserve"> </w:t>
+      </w:r>
+      <w:r>
+        <w:t xml:space="preserve">awaits</w:t>
+      </w:r>
+      <w:r>
+        <w:t xml:space="preserve"> </w:t>
+      </w:r>
+      <w:r>
+        <w:t xml:space="preserve">replication.</w:t>
+      </w:r>
+      <w:r>
+        <w:t xml:space="preserve"> </w:t>
+      </w:r>
+      <w:r>
+        <w:t xml:space="preserve">We</w:t>
+      </w:r>
+      <w:r>
+        <w:t xml:space="preserve"> </w:t>
+      </w:r>
+      <w:r>
+        <w:t xml:space="preserve">identify</w:t>
+      </w:r>
+      <w:r>
+        <w:t xml:space="preserve"> </w:t>
+      </w:r>
+      <w:r>
+        <w:t xml:space="preserve">quantum-probability</w:t>
+      </w:r>
+      <w:r>
+        <w:t xml:space="preserve"> </w:t>
+      </w:r>
+      <w:r>
+        <w:t xml:space="preserve">models</w:t>
+      </w:r>
+      <w:r>
+        <w:t xml:space="preserve"> </w:t>
+      </w:r>
+      <w:r>
+        <w:t xml:space="preserve">of</w:t>
+      </w:r>
+      <w:r>
+        <w:t xml:space="preserve"> </w:t>
+      </w:r>
+      <w:r>
+        <w:t xml:space="preserve">human</w:t>
+      </w:r>
+      <w:r>
+        <w:t xml:space="preserve"> </w:t>
+      </w:r>
+      <w:r>
+        <w:t xml:space="preserve">judgment</w:t>
+      </w:r>
+      <w:r>
+        <w:t xml:space="preserve"> </w:t>
+      </w:r>
+      <w:r>
+        <w:t xml:space="preserve">as</w:t>
+      </w:r>
+      <w:r>
+        <w:t xml:space="preserve"> </w:t>
+      </w:r>
+      <w:r>
+        <w:t xml:space="preserve">a</w:t>
+      </w:r>
+      <w:r>
+        <w:t xml:space="preserve"> </w:t>
+      </w:r>
+      <w:r>
+        <w:t xml:space="preserve">hardware-light</w:t>
+      </w:r>
+      <w:r>
+        <w:t xml:space="preserve"> </w:t>
+      </w:r>
+      <w:r>
+        <w:t xml:space="preserve">opportunity</w:t>
+      </w:r>
+      <w:r>
+        <w:t xml:space="preserve"> </w:t>
+      </w:r>
+      <w:r>
+        <w:t xml:space="preserve">for</w:t>
+      </w:r>
+      <w:r>
+        <w:t xml:space="preserve"> </w:t>
+      </w:r>
+      <w:r>
+        <w:t xml:space="preserve">human-robot</w:t>
+      </w:r>
+      <w:r>
+        <w:t xml:space="preserve"> </w:t>
+      </w:r>
+      <w:r>
+        <w:t xml:space="preserve">interaction,</w:t>
+      </w:r>
+      <w:r>
+        <w:t xml:space="preserve"> </w:t>
+      </w:r>
+      <w:r>
+        <w:t xml:space="preserve">propose</w:t>
+      </w:r>
+      <w:r>
+        <w:t xml:space="preserve"> </w:t>
+      </w:r>
+      <w:r>
+        <w:t xml:space="preserve">reporting</w:t>
+      </w:r>
+      <w:r>
+        <w:t xml:space="preserve"> </w:t>
+      </w:r>
+      <w:r>
+        <w:t xml:space="preserve">standards,</w:t>
       </w:r>
       <w:r>
         <w:t xml:space="preserve"> </w:t>
@@ -435,115 +1749,7 @@
         <w:t xml:space="preserve"> </w:t>
       </w:r>
       <w:r>
-        <w:t xml:space="preserve">changing</w:t>
-      </w:r>
-      <w:r>
-        <w:t xml:space="preserve"> </w:t>
-      </w:r>
-      <w:r>
-        <w:t xml:space="preserve">environments.</w:t>
-      </w:r>
-      <w:r>
-        <w:t xml:space="preserve"> </w:t>
-      </w:r>
-      <w:r>
-        <w:t xml:space="preserve">Yet</w:t>
-      </w:r>
-      <w:r>
-        <w:t xml:space="preserve"> </w:t>
-      </w:r>
-      <w:r>
-        <w:t xml:space="preserve">the</w:t>
-      </w:r>
-      <w:r>
-        <w:t xml:space="preserve"> </w:t>
-      </w:r>
-      <w:r>
-        <w:t xml:space="preserve">claims</w:t>
-      </w:r>
-      <w:r>
-        <w:t xml:space="preserve"> </w:t>
-      </w:r>
-      <w:r>
-        <w:t xml:space="preserve">made</w:t>
-      </w:r>
-      <w:r>
-        <w:t xml:space="preserve"> </w:t>
-      </w:r>
-      <w:r>
-        <w:t xml:space="preserve">for</w:t>
-      </w:r>
-      <w:r>
-        <w:t xml:space="preserve"> </w:t>
-      </w:r>
-      <w:r>
-        <w:t xml:space="preserve">“</w:t>
-      </w:r>
-      <w:r>
-        <w:t xml:space="preserve">quantum</w:t>
-      </w:r>
-      <w:r>
-        <w:t xml:space="preserve"> </w:t>
-      </w:r>
-      <w:r>
-        <w:t xml:space="preserve">robotics</w:t>
-      </w:r>
-      <w:r>
-        <w:t xml:space="preserve">”</w:t>
-      </w:r>
-      <w:r>
-        <w:t xml:space="preserve"> </w:t>
-      </w:r>
-      <w:r>
-        <w:t xml:space="preserve">range</w:t>
-      </w:r>
-      <w:r>
-        <w:t xml:space="preserve"> </w:t>
-      </w:r>
-      <w:r>
-        <w:t xml:space="preserve">from</w:t>
-      </w:r>
-      <w:r>
-        <w:t xml:space="preserve"> </w:t>
-      </w:r>
-      <w:r>
-        <w:t xml:space="preserve">asymptotic</w:t>
-      </w:r>
-      <w:r>
-        <w:t xml:space="preserve"> </w:t>
-      </w:r>
-      <w:r>
-        <w:t xml:space="preserve">complexity</w:t>
-      </w:r>
-      <w:r>
-        <w:t xml:space="preserve"> </w:t>
-      </w:r>
-      <w:r>
-        <w:t xml:space="preserve">results</w:t>
-      </w:r>
-      <w:r>
-        <w:t xml:space="preserve"> </w:t>
-      </w:r>
-      <w:r>
-        <w:t xml:space="preserve">to</w:t>
-      </w:r>
-      <w:r>
-        <w:t xml:space="preserve"> </w:t>
-      </w:r>
-      <w:r>
-        <w:t xml:space="preserve">small</w:t>
-      </w:r>
-      <w:r>
-        <w:t xml:space="preserve"> </w:t>
-      </w:r>
-      <w:r>
-        <w:t xml:space="preserve">simulations</w:t>
-      </w:r>
-      <w:r>
-        <w:t xml:space="preserve"> </w:t>
-      </w:r>
-      <w:r>
-        <w:t xml:space="preserve">and</w:t>
+        <w:t xml:space="preserve">derive</w:t>
       </w:r>
       <w:r>
         <w:t xml:space="preserve"> </w:t>
@@ -555,1669 +1761,13 @@
         <w:t xml:space="preserve"> </w:t>
       </w:r>
       <w:r>
-        <w:t xml:space="preserve">handful</w:t>
-      </w:r>
-      <w:r>
-        <w:t xml:space="preserve"> </w:t>
-      </w:r>
-      <w:r>
-        <w:t xml:space="preserve">of</w:t>
-      </w:r>
-      <w:r>
-        <w:t xml:space="preserve"> </w:t>
-      </w:r>
-      <w:r>
-        <w:t xml:space="preserve">hardware</w:t>
-      </w:r>
-      <w:r>
-        <w:t xml:space="preserve"> </w:t>
-      </w:r>
-      <w:r>
-        <w:t xml:space="preserve">runs,</w:t>
-      </w:r>
-      <w:r>
-        <w:t xml:space="preserve"> </w:t>
-      </w:r>
-      <w:r>
-        <w:t xml:space="preserve">and</w:t>
-      </w:r>
-      <w:r>
-        <w:t xml:space="preserve"> </w:t>
-      </w:r>
-      <w:r>
-        <w:t xml:space="preserve">it</w:t>
-      </w:r>
-      <w:r>
-        <w:t xml:space="preserve"> </w:t>
-      </w:r>
-      <w:r>
-        <w:t xml:space="preserve">is</w:t>
-      </w:r>
-      <w:r>
-        <w:t xml:space="preserve"> </w:t>
-      </w:r>
-      <w:r>
-        <w:t xml:space="preserve">hard</w:t>
-      </w:r>
-      <w:r>
-        <w:t xml:space="preserve"> </w:t>
-      </w:r>
-      <w:r>
-        <w:t xml:space="preserve">to</w:t>
-      </w:r>
-      <w:r>
-        <w:t xml:space="preserve"> </w:t>
-      </w:r>
-      <w:r>
-        <w:t xml:space="preserve">tell</w:t>
-      </w:r>
-      <w:r>
-        <w:t xml:space="preserve"> </w:t>
-      </w:r>
-      <w:r>
-        <w:t xml:space="preserve">which</w:t>
-      </w:r>
-      <w:r>
-        <w:t xml:space="preserve"> </w:t>
-      </w:r>
-      <w:r>
-        <w:t xml:space="preserve">of</w:t>
-      </w:r>
-      <w:r>
-        <w:t xml:space="preserve"> </w:t>
-      </w:r>
-      <w:r>
-        <w:t xml:space="preserve">them</w:t>
-      </w:r>
-      <w:r>
-        <w:t xml:space="preserve"> </w:t>
-      </w:r>
-      <w:r>
-        <w:t xml:space="preserve">a</w:t>
-      </w:r>
-      <w:r>
-        <w:t xml:space="preserve"> </w:t>
-      </w:r>
-      <w:r>
-        <w:t xml:space="preserve">robot</w:t>
-      </w:r>
-      <w:r>
-        <w:t xml:space="preserve"> </w:t>
-      </w:r>
-      <w:r>
-        <w:t xml:space="preserve">could</w:t>
-      </w:r>
-      <w:r>
-        <w:t xml:space="preserve"> </w:t>
-      </w:r>
-      <w:r>
-        <w:t xml:space="preserve">use</w:t>
-      </w:r>
-      <w:r>
-        <w:t xml:space="preserve"> </w:t>
-      </w:r>
-      <w:r>
-        <w:t xml:space="preserve">today.</w:t>
-      </w:r>
-      <w:r>
-        <w:t xml:space="preserve"> </w:t>
-      </w:r>
-      <w:r>
-        <w:t xml:space="preserve">This</w:t>
-      </w:r>
-      <w:r>
-        <w:t xml:space="preserve"> </w:t>
-      </w:r>
-      <w:r>
-        <w:t xml:space="preserve">article</w:t>
-      </w:r>
-      <w:r>
-        <w:t xml:space="preserve"> </w:t>
-      </w:r>
-      <w:r>
-        <w:t xml:space="preserve">presents</w:t>
-      </w:r>
-      <w:r>
-        <w:t xml:space="preserve"> </w:t>
-      </w:r>
-      <w:r>
-        <w:t xml:space="preserve">a</w:t>
-      </w:r>
-      <w:r>
-        <w:t xml:space="preserve"> </w:t>
-      </w:r>
-      <w:r>
-        <w:t xml:space="preserve">systematic</w:t>
-      </w:r>
-      <w:r>
-        <w:t xml:space="preserve"> </w:t>
-      </w:r>
-      <w:r>
-        <w:t xml:space="preserve">survey,</w:t>
-      </w:r>
-      <w:r>
-        <w:t xml:space="preserve"> </w:t>
-      </w:r>
-      <w:r>
-        <w:t xml:space="preserve">reported</w:t>
-      </w:r>
-      <w:r>
-        <w:t xml:space="preserve"> </w:t>
-      </w:r>
-      <w:r>
-        <w:t xml:space="preserve">following</w:t>
-      </w:r>
-      <w:r>
-        <w:t xml:space="preserve"> </w:t>
-      </w:r>
-      <w:r>
-        <w:t xml:space="preserve">the</w:t>
-      </w:r>
-      <w:r>
-        <w:t xml:space="preserve"> </w:t>
-      </w:r>
-      <w:r>
-        <w:t xml:space="preserve">PRISMA</w:t>
-      </w:r>
-      <w:r>
-        <w:t xml:space="preserve"> </w:t>
-      </w:r>
-      <w:r>
-        <w:t xml:space="preserve">2020</w:t>
-      </w:r>
-      <w:r>
-        <w:t xml:space="preserve"> </w:t>
-      </w:r>
-      <w:r>
-        <w:t xml:space="preserve">statement</w:t>
-      </w:r>
-      <w:r>
-        <w:t xml:space="preserve"> </w:t>
-      </w:r>
-      <w:r>
-        <w:t xml:space="preserve">where</w:t>
-      </w:r>
-      <w:r>
-        <w:t xml:space="preserve"> </w:t>
-      </w:r>
-      <w:r>
-        <w:t xml:space="preserve">it</w:t>
-      </w:r>
-      <w:r>
-        <w:t xml:space="preserve"> </w:t>
-      </w:r>
-      <w:r>
-        <w:t xml:space="preserve">applies,</w:t>
-      </w:r>
-      <w:r>
-        <w:t xml:space="preserve"> </w:t>
-      </w:r>
-      <w:r>
-        <w:t xml:space="preserve">of</w:t>
-      </w:r>
-      <w:r>
-        <w:t xml:space="preserve"> </w:t>
-      </w:r>
-      <w:r>
-        <w:t xml:space="preserve">72</w:t>
-      </w:r>
-      <w:r>
-        <w:t xml:space="preserve"> </w:t>
-      </w:r>
-      <w:r>
-        <w:t xml:space="preserve">primary</w:t>
-      </w:r>
-      <w:r>
-        <w:t xml:space="preserve"> </w:t>
-      </w:r>
-      <w:r>
-        <w:t xml:space="preserve">studies</w:t>
-      </w:r>
-      <w:r>
-        <w:t xml:space="preserve"> </w:t>
-      </w:r>
-      <w:r>
-        <w:t xml:space="preserve">that</w:t>
-      </w:r>
-      <w:r>
-        <w:t xml:space="preserve"> </w:t>
-      </w:r>
-      <w:r>
-        <w:t xml:space="preserve">apply</w:t>
-      </w:r>
-      <w:r>
-        <w:t xml:space="preserve"> </w:t>
-      </w:r>
-      <w:r>
-        <w:t xml:space="preserve">quantum</w:t>
-      </w:r>
-      <w:r>
-        <w:t xml:space="preserve"> </w:t>
-      </w:r>
-      <w:r>
-        <w:t xml:space="preserve">or</w:t>
-      </w:r>
-      <w:r>
-        <w:t xml:space="preserve"> </w:t>
-      </w:r>
-      <w:r>
-        <w:t xml:space="preserve">quantum-inspired</w:t>
-      </w:r>
-      <w:r>
-        <w:t xml:space="preserve"> </w:t>
-      </w:r>
-      <w:r>
-        <w:t xml:space="preserve">methods</w:t>
-      </w:r>
-      <w:r>
-        <w:t xml:space="preserve"> </w:t>
-      </w:r>
-      <w:r>
-        <w:t xml:space="preserve">to</w:t>
-      </w:r>
-      <w:r>
-        <w:t xml:space="preserve"> </w:t>
-      </w:r>
-      <w:r>
-        <w:t xml:space="preserve">robotic</w:t>
-      </w:r>
-      <w:r>
-        <w:t xml:space="preserve"> </w:t>
-      </w:r>
-      <w:r>
-        <w:t xml:space="preserve">functions,</w:t>
-      </w:r>
-      <w:r>
-        <w:t xml:space="preserve"> </w:t>
-      </w:r>
-      <w:r>
-        <w:t xml:space="preserve">set</w:t>
-      </w:r>
-      <w:r>
-        <w:t xml:space="preserve"> </w:t>
-      </w:r>
-      <w:r>
-        <w:t xml:space="preserve">against</w:t>
-      </w:r>
-      <w:r>
-        <w:t xml:space="preserve"> </w:t>
-      </w:r>
-      <w:r>
-        <w:t xml:space="preserve">107</w:t>
-      </w:r>
-      <w:r>
-        <w:t xml:space="preserve"> </w:t>
-      </w:r>
-      <w:r>
-        <w:t xml:space="preserve">foundational</w:t>
-      </w:r>
-      <w:r>
-        <w:t xml:space="preserve"> </w:t>
-      </w:r>
-      <w:r>
-        <w:t xml:space="preserve">works</w:t>
-      </w:r>
-      <w:r>
-        <w:t xml:space="preserve"> </w:t>
-      </w:r>
-      <w:r>
-        <w:t xml:space="preserve">on</w:t>
-      </w:r>
-      <w:r>
-        <w:t xml:space="preserve"> </w:t>
-      </w:r>
-      <w:r>
-        <w:t xml:space="preserve">quantum</w:t>
-      </w:r>
-      <w:r>
-        <w:t xml:space="preserve"> </w:t>
-      </w:r>
-      <w:r>
-        <w:t xml:space="preserve">algorithms,</w:t>
-      </w:r>
-      <w:r>
-        <w:t xml:space="preserve"> </w:t>
-      </w:r>
-      <w:r>
-        <w:t xml:space="preserve">hardware,</w:t>
-      </w:r>
-      <w:r>
-        <w:t xml:space="preserve"> </w:t>
-      </w:r>
-      <w:r>
-        <w:t xml:space="preserve">cognition,</w:t>
-      </w:r>
-      <w:r>
-        <w:t xml:space="preserve"> </w:t>
-      </w:r>
-      <w:r>
-        <w:t xml:space="preserve">and</w:t>
-      </w:r>
-      <w:r>
-        <w:t xml:space="preserve"> </w:t>
-      </w:r>
-      <w:r>
-        <w:t xml:space="preserve">classical</w:t>
-      </w:r>
-      <w:r>
-        <w:t xml:space="preserve"> </w:t>
-      </w:r>
-      <w:r>
-        <w:t xml:space="preserve">robotics</w:t>
-      </w:r>
-      <w:r>
-        <w:t xml:space="preserve"> </w:t>
-      </w:r>
-      <w:r>
-        <w:t xml:space="preserve">and</w:t>
-      </w:r>
-      <w:r>
-        <w:t xml:space="preserve"> </w:t>
-      </w:r>
-      <w:r>
-        <w:t xml:space="preserve">six</w:t>
-      </w:r>
-      <w:r>
-        <w:t xml:space="preserve"> </w:t>
-      </w:r>
-      <w:r>
-        <w:t xml:space="preserve">related</w:t>
-      </w:r>
-      <w:r>
-        <w:t xml:space="preserve"> </w:t>
-      </w:r>
-      <w:r>
-        <w:t xml:space="preserve">quantum</w:t>
-      </w:r>
-      <w:r>
-        <w:t xml:space="preserve"> </w:t>
-      </w:r>
-      <w:r>
-        <w:t xml:space="preserve">computer-vision</w:t>
-      </w:r>
-      <w:r>
-        <w:t xml:space="preserve"> </w:t>
-      </w:r>
-      <w:r>
-        <w:t xml:space="preserve">studies.</w:t>
-      </w:r>
-      <w:r>
-        <w:t xml:space="preserve"> </w:t>
-      </w:r>
-      <w:r>
-        <w:t xml:space="preserve">We</w:t>
-      </w:r>
-      <w:r>
-        <w:t xml:space="preserve"> </w:t>
-      </w:r>
-      <w:r>
-        <w:t xml:space="preserve">organize</w:t>
-      </w:r>
-      <w:r>
-        <w:t xml:space="preserve"> </w:t>
-      </w:r>
-      <w:r>
-        <w:t xml:space="preserve">the</w:t>
-      </w:r>
-      <w:r>
-        <w:t xml:space="preserve"> </w:t>
-      </w:r>
-      <w:r>
-        <w:t xml:space="preserve">field</w:t>
-      </w:r>
-      <w:r>
-        <w:t xml:space="preserve"> </w:t>
-      </w:r>
-      <w:r>
-        <w:t xml:space="preserve">by</w:t>
-      </w:r>
-      <w:r>
-        <w:t xml:space="preserve"> </w:t>
-      </w:r>
-      <w:r>
-        <w:t xml:space="preserve">robotic</w:t>
-      </w:r>
-      <w:r>
-        <w:t xml:space="preserve"> </w:t>
-      </w:r>
-      <w:r>
-        <w:t xml:space="preserve">function</w:t>
-      </w:r>
-      <w:r>
-        <w:t xml:space="preserve"> </w:t>
-      </w:r>
-      <w:r>
-        <w:t xml:space="preserve">(optimization,</w:t>
-      </w:r>
-      <w:r>
-        <w:t xml:space="preserve"> </w:t>
-      </w:r>
-      <w:r>
-        <w:t xml:space="preserve">planning,</w:t>
-      </w:r>
-      <w:r>
-        <w:t xml:space="preserve"> </w:t>
-      </w:r>
-      <w:r>
-        <w:t xml:space="preserve">learning,</w:t>
-      </w:r>
-      <w:r>
-        <w:t xml:space="preserve"> </w:t>
-      </w:r>
-      <w:r>
-        <w:t xml:space="preserve">sensing</w:t>
-      </w:r>
-      <w:r>
-        <w:t xml:space="preserve"> </w:t>
-      </w:r>
-      <w:r>
-        <w:t xml:space="preserve">and</w:t>
-      </w:r>
-      <w:r>
-        <w:t xml:space="preserve"> </w:t>
-      </w:r>
-      <w:r>
-        <w:t xml:space="preserve">communication,</w:t>
-      </w:r>
-      <w:r>
-        <w:t xml:space="preserve"> </w:t>
-      </w:r>
-      <w:r>
-        <w:t xml:space="preserve">and</w:t>
-      </w:r>
-      <w:r>
-        <w:t xml:space="preserve"> </w:t>
-      </w:r>
-      <w:r>
-        <w:t xml:space="preserve">decision-making)</w:t>
-      </w:r>
-      <w:r>
-        <w:t xml:space="preserve"> </w:t>
-      </w:r>
-      <w:r>
-        <w:t xml:space="preserve">and</w:t>
-      </w:r>
-      <w:r>
-        <w:t xml:space="preserve"> </w:t>
-      </w:r>
-      <w:r>
-        <w:t xml:space="preserve">grade</w:t>
-      </w:r>
-      <w:r>
-        <w:t xml:space="preserve"> </w:t>
-      </w:r>
-      <w:r>
-        <w:t xml:space="preserve">every</w:t>
-      </w:r>
-      <w:r>
-        <w:t xml:space="preserve"> </w:t>
-      </w:r>
-      <w:r>
-        <w:t xml:space="preserve">study</w:t>
-      </w:r>
-      <w:r>
-        <w:t xml:space="preserve"> </w:t>
-      </w:r>
-      <w:r>
-        <w:t xml:space="preserve">on</w:t>
-      </w:r>
-      <w:r>
-        <w:t xml:space="preserve"> </w:t>
-      </w:r>
-      <w:r>
-        <w:t xml:space="preserve">a</w:t>
-      </w:r>
-      <w:r>
-        <w:t xml:space="preserve"> </w:t>
-      </w:r>
-      <w:r>
-        <w:t xml:space="preserve">six-level</w:t>
-      </w:r>
-      <w:r>
-        <w:t xml:space="preserve"> </w:t>
-      </w:r>
-      <w:r>
-        <w:t xml:space="preserve">evidence</w:t>
-      </w:r>
-      <w:r>
-        <w:t xml:space="preserve"> </w:t>
-      </w:r>
-      <w:r>
-        <w:t xml:space="preserve">hierarchy</w:t>
-      </w:r>
-      <w:r>
-        <w:t xml:space="preserve"> </w:t>
-      </w:r>
-      <w:r>
-        <w:t xml:space="preserve">that</w:t>
-      </w:r>
-      <w:r>
-        <w:t xml:space="preserve"> </w:t>
-      </w:r>
-      <w:r>
-        <w:t xml:space="preserve">runs</w:t>
-      </w:r>
-      <w:r>
-        <w:t xml:space="preserve"> </w:t>
-      </w:r>
-      <w:r>
-        <w:t xml:space="preserve">from</w:t>
-      </w:r>
-      <w:r>
-        <w:t xml:space="preserve"> </w:t>
-      </w:r>
-      <w:r>
-        <w:t xml:space="preserve">theoretical</w:t>
-      </w:r>
-      <w:r>
-        <w:t xml:space="preserve"> </w:t>
-      </w:r>
-      <w:r>
-        <w:t xml:space="preserve">analysis</w:t>
-      </w:r>
-      <w:r>
-        <w:t xml:space="preserve"> </w:t>
-      </w:r>
-      <w:r>
-        <w:t xml:space="preserve">to</w:t>
-      </w:r>
-      <w:r>
-        <w:t xml:space="preserve"> </w:t>
-      </w:r>
-      <w:r>
-        <w:t xml:space="preserve">end-to-end</w:t>
-      </w:r>
-      <w:r>
-        <w:t xml:space="preserve"> </w:t>
-      </w:r>
-      <w:r>
-        <w:t xml:space="preserve">deployment.</w:t>
-      </w:r>
-      <w:r>
-        <w:t xml:space="preserve"> </w:t>
-      </w:r>
-      <w:r>
-        <w:t xml:space="preserve">For</w:t>
-      </w:r>
-      <w:r>
-        <w:t xml:space="preserve"> </w:t>
-      </w:r>
-      <w:r>
-        <w:t xml:space="preserve">each</w:t>
-      </w:r>
-      <w:r>
-        <w:t xml:space="preserve"> </w:t>
-      </w:r>
-      <w:r>
-        <w:t xml:space="preserve">study</w:t>
-      </w:r>
-      <w:r>
-        <w:t xml:space="preserve"> </w:t>
-      </w:r>
-      <w:r>
-        <w:t xml:space="preserve">we</w:t>
-      </w:r>
-      <w:r>
-        <w:t xml:space="preserve"> </w:t>
-      </w:r>
-      <w:r>
-        <w:t xml:space="preserve">also</w:t>
-      </w:r>
-      <w:r>
-        <w:t xml:space="preserve"> </w:t>
-      </w:r>
-      <w:r>
-        <w:t xml:space="preserve">record</w:t>
-      </w:r>
-      <w:r>
-        <w:t xml:space="preserve"> </w:t>
-      </w:r>
-      <w:r>
-        <w:t xml:space="preserve">whether</w:t>
-      </w:r>
-      <w:r>
-        <w:t xml:space="preserve"> </w:t>
-      </w:r>
-      <w:r>
-        <w:t xml:space="preserve">its</w:t>
-      </w:r>
-      <w:r>
-        <w:t xml:space="preserve"> </w:t>
-      </w:r>
-      <w:r>
-        <w:t xml:space="preserve">quantum</w:t>
-      </w:r>
-      <w:r>
-        <w:t xml:space="preserve"> </w:t>
-      </w:r>
-      <w:r>
-        <w:t xml:space="preserve">component</w:t>
-      </w:r>
-      <w:r>
-        <w:t xml:space="preserve"> </w:t>
-      </w:r>
-      <w:r>
-        <w:t xml:space="preserve">ran</w:t>
-      </w:r>
-      <w:r>
-        <w:t xml:space="preserve"> </w:t>
-      </w:r>
-      <w:r>
-        <w:t xml:space="preserve">on</w:t>
-      </w:r>
-      <w:r>
-        <w:t xml:space="preserve"> </w:t>
-      </w:r>
-      <w:r>
-        <w:t xml:space="preserve">quantum</w:t>
-      </w:r>
-      <w:r>
-        <w:t xml:space="preserve"> </w:t>
-      </w:r>
-      <w:r>
-        <w:t xml:space="preserve">hardware,</w:t>
-      </w:r>
-      <w:r>
-        <w:t xml:space="preserve"> </w:t>
-      </w:r>
-      <w:r>
-        <w:t xml:space="preserve">in</w:t>
-      </w:r>
-      <w:r>
-        <w:t xml:space="preserve"> </w:t>
-      </w:r>
-      <w:r>
-        <w:t xml:space="preserve">simulation,</w:t>
-      </w:r>
-      <w:r>
-        <w:t xml:space="preserve"> </w:t>
-      </w:r>
-      <w:r>
-        <w:t xml:space="preserve">or</w:t>
-      </w:r>
-      <w:r>
-        <w:t xml:space="preserve"> </w:t>
-      </w:r>
-      <w:r>
-        <w:t xml:space="preserve">not</w:t>
-      </w:r>
-      <w:r>
-        <w:t xml:space="preserve"> </w:t>
-      </w:r>
-      <w:r>
-        <w:t xml:space="preserve">at</w:t>
-      </w:r>
-      <w:r>
-        <w:t xml:space="preserve"> </w:t>
-      </w:r>
-      <w:r>
-        <w:t xml:space="preserve">all,</w:t>
-      </w:r>
-      <w:r>
-        <w:t xml:space="preserve"> </w:t>
-      </w:r>
-      <w:r>
-        <w:t xml:space="preserve">and</w:t>
-      </w:r>
-      <w:r>
-        <w:t xml:space="preserve"> </w:t>
-      </w:r>
-      <w:r>
-        <w:t xml:space="preserve">we</w:t>
-      </w:r>
-      <w:r>
-        <w:t xml:space="preserve"> </w:t>
-      </w:r>
-      <w:r>
-        <w:t xml:space="preserve">keep</w:t>
-      </w:r>
-      <w:r>
-        <w:t xml:space="preserve"> </w:t>
-      </w:r>
-      <w:r>
-        <w:t xml:space="preserve">genuinely</w:t>
-      </w:r>
-      <w:r>
-        <w:t xml:space="preserve"> </w:t>
-      </w:r>
-      <w:r>
-        <w:t xml:space="preserve">quantum</w:t>
-      </w:r>
-      <w:r>
-        <w:t xml:space="preserve"> </w:t>
-      </w:r>
-      <w:r>
-        <w:t xml:space="preserve">results</w:t>
-      </w:r>
-      <w:r>
-        <w:t xml:space="preserve"> </w:t>
-      </w:r>
-      <w:r>
-        <w:t xml:space="preserve">apart</w:t>
-      </w:r>
-      <w:r>
-        <w:t xml:space="preserve"> </w:t>
-      </w:r>
-      <w:r>
-        <w:t xml:space="preserve">from</w:t>
-      </w:r>
-      <w:r>
-        <w:t xml:space="preserve"> </w:t>
-      </w:r>
-      <w:r>
-        <w:t xml:space="preserve">quantum-inspired</w:t>
-      </w:r>
-      <w:r>
-        <w:t xml:space="preserve"> </w:t>
-      </w:r>
-      <w:r>
-        <w:t xml:space="preserve">classical</w:t>
-      </w:r>
-      <w:r>
-        <w:t xml:space="preserve"> </w:t>
-      </w:r>
-      <w:r>
-        <w:t xml:space="preserve">ones.</w:t>
-      </w:r>
-      <w:r>
-        <w:t xml:space="preserve"> </w:t>
-      </w:r>
-      <w:r>
-        <w:t xml:space="preserve">The</w:t>
-      </w:r>
-      <w:r>
-        <w:t xml:space="preserve"> </w:t>
-      </w:r>
-      <w:r>
-        <w:t xml:space="preserve">picture</w:t>
-      </w:r>
-      <w:r>
-        <w:t xml:space="preserve"> </w:t>
-      </w:r>
-      <w:r>
-        <w:t xml:space="preserve">that</w:t>
-      </w:r>
-      <w:r>
-        <w:t xml:space="preserve"> </w:t>
-      </w:r>
-      <w:r>
-        <w:t xml:space="preserve">emerges</w:t>
-      </w:r>
-      <w:r>
-        <w:t xml:space="preserve"> </w:t>
-      </w:r>
-      <w:r>
-        <w:t xml:space="preserve">is</w:t>
-      </w:r>
-      <w:r>
-        <w:t xml:space="preserve"> </w:t>
-      </w:r>
-      <w:r>
-        <w:t xml:space="preserve">sobering.</w:t>
-      </w:r>
-      <w:r>
-        <w:t xml:space="preserve"> </w:t>
-      </w:r>
-      <w:r>
-        <w:t xml:space="preserve">No</w:t>
-      </w:r>
-      <w:r>
-        <w:t xml:space="preserve"> </w:t>
-      </w:r>
-      <w:r>
-        <w:t xml:space="preserve">quantum</w:t>
-      </w:r>
-      <w:r>
-        <w:t xml:space="preserve"> </w:t>
-      </w:r>
-      <w:r>
-        <w:t xml:space="preserve">computational</w:t>
-      </w:r>
-      <w:r>
-        <w:t xml:space="preserve"> </w:t>
-      </w:r>
-      <w:r>
-        <w:t xml:space="preserve">method</w:t>
-      </w:r>
-      <w:r>
-        <w:t xml:space="preserve"> </w:t>
-      </w:r>
-      <w:r>
-        <w:t xml:space="preserve">has</w:t>
-      </w:r>
-      <w:r>
-        <w:t xml:space="preserve"> </w:t>
-      </w:r>
-      <w:r>
-        <w:t xml:space="preserve">yet</w:t>
-      </w:r>
-      <w:r>
-        <w:t xml:space="preserve"> </w:t>
-      </w:r>
-      <w:r>
-        <w:t xml:space="preserve">shown</w:t>
-      </w:r>
-      <w:r>
-        <w:t xml:space="preserve"> </w:t>
-      </w:r>
-      <w:r>
-        <w:t xml:space="preserve">an</w:t>
-      </w:r>
-      <w:r>
-        <w:t xml:space="preserve"> </w:t>
-      </w:r>
-      <w:r>
-        <w:t xml:space="preserve">end-to-end</w:t>
-      </w:r>
-      <w:r>
-        <w:t xml:space="preserve"> </w:t>
-      </w:r>
-      <w:r>
-        <w:t xml:space="preserve">advantage</w:t>
-      </w:r>
-      <w:r>
-        <w:t xml:space="preserve"> </w:t>
-      </w:r>
-      <w:r>
-        <w:t xml:space="preserve">on</w:t>
-      </w:r>
-      <w:r>
-        <w:t xml:space="preserve"> </w:t>
-      </w:r>
-      <w:r>
-        <w:t xml:space="preserve">a</w:t>
-      </w:r>
-      <w:r>
-        <w:t xml:space="preserve"> </w:t>
-      </w:r>
-      <w:r>
-        <w:t xml:space="preserve">physical</w:t>
-      </w:r>
-      <w:r>
-        <w:t xml:space="preserve"> </w:t>
-      </w:r>
-      <w:r>
-        <w:t xml:space="preserve">robot.</w:t>
-      </w:r>
-      <w:r>
-        <w:t xml:space="preserve"> </w:t>
-      </w:r>
-      <w:r>
-        <w:t xml:space="preserve">Quantum</w:t>
-      </w:r>
-      <w:r>
-        <w:t xml:space="preserve"> </w:t>
-      </w:r>
-      <w:r>
-        <w:t xml:space="preserve">annealing</w:t>
-      </w:r>
-      <w:r>
-        <w:t xml:space="preserve"> </w:t>
-      </w:r>
-      <w:r>
-        <w:t xml:space="preserve">has</w:t>
-      </w:r>
-      <w:r>
-        <w:t xml:space="preserve"> </w:t>
-      </w:r>
-      <w:r>
-        <w:t xml:space="preserve">routed</w:t>
-      </w:r>
-      <w:r>
-        <w:t xml:space="preserve"> </w:t>
-      </w:r>
-      <w:r>
-        <w:t xml:space="preserve">fleets</w:t>
-      </w:r>
-      <w:r>
-        <w:t xml:space="preserve"> </w:t>
-      </w:r>
-      <w:r>
-        <w:t xml:space="preserve">of</w:t>
-      </w:r>
-      <w:r>
-        <w:t xml:space="preserve"> </w:t>
-      </w:r>
-      <w:r>
-        <w:t xml:space="preserve">up</w:t>
-      </w:r>
-      <w:r>
-        <w:t xml:space="preserve"> </w:t>
-      </w:r>
-      <w:r>
-        <w:t xml:space="preserve">to</w:t>
-      </w:r>
-      <w:r>
-        <w:t xml:space="preserve"> </w:t>
-      </w:r>
-      <w:r>
-        <w:t xml:space="preserve">1,000</w:t>
-      </w:r>
-      <w:r>
-        <w:t xml:space="preserve"> </w:t>
-      </w:r>
-      <w:r>
-        <w:t xml:space="preserve">simulated</w:t>
-      </w:r>
-      <w:r>
-        <w:t xml:space="preserve"> </w:t>
-      </w:r>
-      <w:r>
-        <w:t xml:space="preserve">vehicles</w:t>
-      </w:r>
-      <w:r>
-        <w:t xml:space="preserve"> </w:t>
-      </w:r>
-      <w:r>
-        <w:t xml:space="preserve">after</w:t>
-      </w:r>
-      <w:r>
-        <w:t xml:space="preserve"> </w:t>
-      </w:r>
-      <w:r>
-        <w:t xml:space="preserve">decomposition,</w:t>
-      </w:r>
-      <w:r>
-        <w:t xml:space="preserve"> </w:t>
-      </w:r>
-      <w:r>
-        <w:t xml:space="preserve">but</w:t>
-      </w:r>
-      <w:r>
-        <w:t xml:space="preserve"> </w:t>
-      </w:r>
-      <w:r>
-        <w:t xml:space="preserve">classical</w:t>
-      </w:r>
-      <w:r>
-        <w:t xml:space="preserve"> </w:t>
-      </w:r>
-      <w:r>
-        <w:t xml:space="preserve">and</w:t>
-      </w:r>
-      <w:r>
-        <w:t xml:space="preserve"> </w:t>
-      </w:r>
-      <w:r>
-        <w:t xml:space="preserve">quantum-inspired</w:t>
-      </w:r>
-      <w:r>
-        <w:t xml:space="preserve"> </w:t>
-      </w:r>
-      <w:r>
-        <w:t xml:space="preserve">solvers</w:t>
-      </w:r>
-      <w:r>
-        <w:t xml:space="preserve"> </w:t>
-      </w:r>
-      <w:r>
-        <w:t xml:space="preserve">match</w:t>
-      </w:r>
-      <w:r>
-        <w:t xml:space="preserve"> </w:t>
-      </w:r>
-      <w:r>
-        <w:t xml:space="preserve">or</w:t>
-      </w:r>
-      <w:r>
-        <w:t xml:space="preserve"> </w:t>
-      </w:r>
-      <w:r>
-        <w:t xml:space="preserve">beat</w:t>
-      </w:r>
-      <w:r>
-        <w:t xml:space="preserve"> </w:t>
-      </w:r>
-      <w:r>
-        <w:t xml:space="preserve">it</w:t>
-      </w:r>
-      <w:r>
-        <w:t xml:space="preserve"> </w:t>
-      </w:r>
-      <w:r>
-        <w:t xml:space="preserve">whenever</w:t>
-      </w:r>
-      <w:r>
-        <w:t xml:space="preserve"> </w:t>
-      </w:r>
-      <w:r>
-        <w:t xml:space="preserve">the</w:t>
-      </w:r>
-      <w:r>
-        <w:t xml:space="preserve"> </w:t>
-      </w:r>
-      <w:r>
-        <w:t xml:space="preserve">two</w:t>
-      </w:r>
-      <w:r>
-        <w:t xml:space="preserve"> </w:t>
-      </w:r>
-      <w:r>
-        <w:t xml:space="preserve">are</w:t>
-      </w:r>
-      <w:r>
-        <w:t xml:space="preserve"> </w:t>
-      </w:r>
-      <w:r>
-        <w:t xml:space="preserve">compared</w:t>
-      </w:r>
-      <w:r>
-        <w:t xml:space="preserve"> </w:t>
-      </w:r>
-      <w:r>
-        <w:t xml:space="preserve">directly.</w:t>
-      </w:r>
-      <w:r>
-        <w:t xml:space="preserve"> </w:t>
-      </w:r>
-      <w:r>
-        <w:t xml:space="preserve">Quantum</w:t>
-      </w:r>
-      <w:r>
-        <w:t xml:space="preserve"> </w:t>
-      </w:r>
-      <w:r>
-        <w:t xml:space="preserve">reinforcement</w:t>
-      </w:r>
-      <w:r>
-        <w:t xml:space="preserve"> </w:t>
-      </w:r>
-      <w:r>
-        <w:t xml:space="preserve">learning</w:t>
-      </w:r>
-      <w:r>
-        <w:t xml:space="preserve"> </w:t>
-      </w:r>
-      <w:r>
-        <w:t xml:space="preserve">agents</w:t>
-      </w:r>
-      <w:r>
-        <w:t xml:space="preserve"> </w:t>
-      </w:r>
-      <w:r>
-        <w:t xml:space="preserve">reach</w:t>
-      </w:r>
-      <w:r>
-        <w:t xml:space="preserve"> </w:t>
-      </w:r>
-      <w:r>
-        <w:t xml:space="preserve">comparable</w:t>
-      </w:r>
-      <w:r>
-        <w:t xml:space="preserve"> </w:t>
-      </w:r>
-      <w:r>
-        <w:t xml:space="preserve">returns</w:t>
-      </w:r>
-      <w:r>
-        <w:t xml:space="preserve"> </w:t>
-      </w:r>
-      <w:r>
-        <w:t xml:space="preserve">in</w:t>
-      </w:r>
-      <w:r>
-        <w:t xml:space="preserve"> </w:t>
-      </w:r>
-      <w:r>
-        <w:t xml:space="preserve">simulated</w:t>
-      </w:r>
-      <w:r>
-        <w:t xml:space="preserve"> </w:t>
-      </w:r>
-      <w:r>
-        <w:t xml:space="preserve">robot</w:t>
-      </w:r>
-      <w:r>
-        <w:t xml:space="preserve"> </w:t>
-      </w:r>
-      <w:r>
-        <w:t xml:space="preserve">tasks</w:t>
-      </w:r>
-      <w:r>
-        <w:t xml:space="preserve"> </w:t>
-      </w:r>
-      <w:r>
-        <w:t xml:space="preserve">with</w:t>
-      </w:r>
-      <w:r>
-        <w:t xml:space="preserve"> </w:t>
-      </w:r>
-      <w:r>
-        <w:t xml:space="preserve">one</w:t>
-      </w:r>
-      <w:r>
-        <w:t xml:space="preserve"> </w:t>
-      </w:r>
-      <w:r>
-        <w:t xml:space="preserve">to</w:t>
-      </w:r>
-      <w:r>
-        <w:t xml:space="preserve"> </w:t>
-      </w:r>
-      <w:r>
-        <w:t xml:space="preserve">two</w:t>
-      </w:r>
-      <w:r>
-        <w:t xml:space="preserve"> </w:t>
-      </w:r>
-      <w:r>
-        <w:t xml:space="preserve">orders</w:t>
-      </w:r>
-      <w:r>
-        <w:t xml:space="preserve"> </w:t>
-      </w:r>
-      <w:r>
-        <w:t xml:space="preserve">of</w:t>
-      </w:r>
-      <w:r>
-        <w:t xml:space="preserve"> </w:t>
-      </w:r>
-      <w:r>
-        <w:t xml:space="preserve">magnitude</w:t>
-      </w:r>
-      <w:r>
-        <w:t xml:space="preserve"> </w:t>
-      </w:r>
-      <w:r>
-        <w:t xml:space="preserve">fewer</w:t>
-      </w:r>
-      <w:r>
-        <w:t xml:space="preserve"> </w:t>
-      </w:r>
-      <w:r>
-        <w:t xml:space="preserve">trainable</w:t>
-      </w:r>
-      <w:r>
-        <w:t xml:space="preserve"> </w:t>
-      </w:r>
-      <w:r>
-        <w:t xml:space="preserve">parameters,</w:t>
-      </w:r>
-      <w:r>
-        <w:t xml:space="preserve"> </w:t>
-      </w:r>
-      <w:r>
-        <w:t xml:space="preserve">but</w:t>
-      </w:r>
-      <w:r>
-        <w:t xml:space="preserve"> </w:t>
-      </w:r>
-      <w:r>
-        <w:t xml:space="preserve">so</w:t>
-      </w:r>
-      <w:r>
-        <w:t xml:space="preserve"> </w:t>
-      </w:r>
-      <w:r>
-        <w:t xml:space="preserve">far</w:t>
-      </w:r>
-      <w:r>
-        <w:t xml:space="preserve"> </w:t>
-      </w:r>
-      <w:r>
-        <w:t xml:space="preserve">this</w:t>
-      </w:r>
-      <w:r>
-        <w:t xml:space="preserve"> </w:t>
-      </w:r>
-      <w:r>
-        <w:t xml:space="preserve">has</w:t>
-      </w:r>
-      <w:r>
-        <w:t xml:space="preserve"> </w:t>
-      </w:r>
-      <w:r>
-        <w:t xml:space="preserve">not</w:t>
-      </w:r>
-      <w:r>
-        <w:t xml:space="preserve"> </w:t>
-      </w:r>
-      <w:r>
-        <w:t xml:space="preserve">meant</w:t>
-      </w:r>
-      <w:r>
-        <w:t xml:space="preserve"> </w:t>
-      </w:r>
-      <w:r>
-        <w:t xml:space="preserve">shorter</w:t>
-      </w:r>
-      <w:r>
-        <w:t xml:space="preserve"> </w:t>
-      </w:r>
-      <w:r>
-        <w:t xml:space="preserve">training,</w:t>
-      </w:r>
-      <w:r>
-        <w:t xml:space="preserve"> </w:t>
-      </w:r>
-      <w:r>
-        <w:t xml:space="preserve">fewer</w:t>
-      </w:r>
-      <w:r>
-        <w:t xml:space="preserve"> </w:t>
-      </w:r>
-      <w:r>
-        <w:t xml:space="preserve">samples,</w:t>
-      </w:r>
-      <w:r>
-        <w:t xml:space="preserve"> </w:t>
-      </w:r>
-      <w:r>
-        <w:t xml:space="preserve">or</w:t>
-      </w:r>
-      <w:r>
-        <w:t xml:space="preserve"> </w:t>
-      </w:r>
-      <w:r>
-        <w:t xml:space="preserve">better</w:t>
-      </w:r>
-      <w:r>
-        <w:t xml:space="preserve"> </w:t>
-      </w:r>
-      <w:r>
-        <w:t xml:space="preserve">policies.</w:t>
-      </w:r>
-      <w:r>
-        <w:t xml:space="preserve"> </w:t>
-      </w:r>
-      <w:r>
-        <w:t xml:space="preserve">Cloud</w:t>
-      </w:r>
-      <w:r>
-        <w:t xml:space="preserve"> </w:t>
-      </w:r>
-      <w:r>
-        <w:t xml:space="preserve">latency,</w:t>
-      </w:r>
-      <w:r>
-        <w:t xml:space="preserve"> </w:t>
-      </w:r>
-      <w:r>
-        <w:t xml:space="preserve">noise,</w:t>
-      </w:r>
-      <w:r>
-        <w:t xml:space="preserve"> </w:t>
-      </w:r>
-      <w:r>
-        <w:t xml:space="preserve">and</w:t>
-      </w:r>
-      <w:r>
-        <w:t xml:space="preserve"> </w:t>
-      </w:r>
-      <w:r>
-        <w:t xml:space="preserve">trainability</w:t>
-      </w:r>
-      <w:r>
-        <w:t xml:space="preserve"> </w:t>
-      </w:r>
-      <w:r>
-        <w:t xml:space="preserve">still</w:t>
-      </w:r>
-      <w:r>
-        <w:t xml:space="preserve"> </w:t>
-      </w:r>
-      <w:r>
-        <w:t xml:space="preserve">keep</w:t>
-      </w:r>
-      <w:r>
-        <w:t xml:space="preserve"> </w:t>
-      </w:r>
-      <w:r>
-        <w:t xml:space="preserve">quantum</w:t>
-      </w:r>
-      <w:r>
-        <w:t xml:space="preserve"> </w:t>
-      </w:r>
-      <w:r>
-        <w:t xml:space="preserve">processors</w:t>
-      </w:r>
-      <w:r>
-        <w:t xml:space="preserve"> </w:t>
-      </w:r>
-      <w:r>
-        <w:t xml:space="preserve">out</w:t>
-      </w:r>
-      <w:r>
-        <w:t xml:space="preserve"> </w:t>
-      </w:r>
-      <w:r>
-        <w:t xml:space="preserve">of</w:t>
-      </w:r>
-      <w:r>
-        <w:t xml:space="preserve"> </w:t>
-      </w:r>
-      <w:r>
-        <w:t xml:space="preserve">real-time</w:t>
-      </w:r>
-      <w:r>
-        <w:t xml:space="preserve"> </w:t>
-      </w:r>
-      <w:r>
-        <w:t xml:space="preserve">control</w:t>
-      </w:r>
-      <w:r>
-        <w:t xml:space="preserve"> </w:t>
-      </w:r>
-      <w:r>
-        <w:t xml:space="preserve">loops.</w:t>
-      </w:r>
-      <w:r>
-        <w:t xml:space="preserve"> </w:t>
-      </w:r>
-      <w:r>
-        <w:t xml:space="preserve">Only</w:t>
-      </w:r>
-      <w:r>
-        <w:t xml:space="preserve"> </w:t>
-      </w:r>
-      <w:r>
-        <w:t xml:space="preserve">quantum</w:t>
-      </w:r>
-      <w:r>
-        <w:t xml:space="preserve"> </w:t>
-      </w:r>
-      <w:r>
-        <w:t xml:space="preserve">sensing</w:t>
-      </w:r>
-      <w:r>
-        <w:t xml:space="preserve"> </w:t>
-      </w:r>
-      <w:r>
-        <w:t xml:space="preserve">and</w:t>
-      </w:r>
-      <w:r>
-        <w:t xml:space="preserve"> </w:t>
-      </w:r>
-      <w:r>
-        <w:t xml:space="preserve">quantum</w:t>
-      </w:r>
-      <w:r>
-        <w:t xml:space="preserve"> </w:t>
-      </w:r>
-      <w:r>
-        <w:t xml:space="preserve">communication</w:t>
-      </w:r>
-      <w:r>
-        <w:t xml:space="preserve"> </w:t>
-      </w:r>
-      <w:r>
-        <w:t xml:space="preserve">have</w:t>
-      </w:r>
-      <w:r>
-        <w:t xml:space="preserve"> </w:t>
-      </w:r>
-      <w:r>
-        <w:t xml:space="preserve">been</w:t>
-      </w:r>
-      <w:r>
-        <w:t xml:space="preserve"> </w:t>
-      </w:r>
-      <w:r>
-        <w:t xml:space="preserve">fielded</w:t>
-      </w:r>
-      <w:r>
-        <w:t xml:space="preserve"> </w:t>
-      </w:r>
-      <w:r>
-        <w:t xml:space="preserve">on</w:t>
-      </w:r>
-      <w:r>
-        <w:t xml:space="preserve"> </w:t>
-      </w:r>
-      <w:r>
-        <w:t xml:space="preserve">moving</w:t>
-      </w:r>
-      <w:r>
-        <w:t xml:space="preserve"> </w:t>
-      </w:r>
-      <w:r>
-        <w:t xml:space="preserve">platforms,</w:t>
-      </w:r>
-      <w:r>
-        <w:t xml:space="preserve"> </w:t>
-      </w:r>
-      <w:r>
-        <w:t xml:space="preserve">and</w:t>
-      </w:r>
-      <w:r>
-        <w:t xml:space="preserve"> </w:t>
-      </w:r>
-      <w:r>
-        <w:t xml:space="preserve">the</w:t>
-      </w:r>
-      <w:r>
-        <w:t xml:space="preserve"> </w:t>
-      </w:r>
-      <w:r>
-        <w:t xml:space="preserve">single</w:t>
-      </w:r>
-      <w:r>
-        <w:t xml:space="preserve"> </w:t>
-      </w:r>
-      <w:r>
-        <w:t xml:space="preserve">field</w:t>
-      </w:r>
-      <w:r>
-        <w:t xml:space="preserve"> </w:t>
-      </w:r>
-      <w:r>
-        <w:t xml:space="preserve">result</w:t>
-      </w:r>
-      <w:r>
-        <w:t xml:space="preserve"> </w:t>
-      </w:r>
-      <w:r>
-        <w:t xml:space="preserve">showing</w:t>
-      </w:r>
-      <w:r>
-        <w:t xml:space="preserve"> </w:t>
-      </w:r>
-      <w:r>
-        <w:t xml:space="preserve">a</w:t>
-      </w:r>
-      <w:r>
-        <w:t xml:space="preserve"> </w:t>
-      </w:r>
-      <w:r>
-        <w:t xml:space="preserve">navigation</w:t>
-      </w:r>
-      <w:r>
-        <w:t xml:space="preserve"> </w:t>
-      </w:r>
-      <w:r>
-        <w:t xml:space="preserve">advantage</w:t>
-      </w:r>
-      <w:r>
-        <w:t xml:space="preserve"> </w:t>
-      </w:r>
-      <w:r>
-        <w:t xml:space="preserve">still</w:t>
-      </w:r>
-      <w:r>
-        <w:t xml:space="preserve"> </w:t>
-      </w:r>
-      <w:r>
-        <w:t xml:space="preserve">awaits</w:t>
-      </w:r>
-      <w:r>
-        <w:t xml:space="preserve"> </w:t>
-      </w:r>
-      <w:r>
-        <w:t xml:space="preserve">independent</w:t>
-      </w:r>
-      <w:r>
-        <w:t xml:space="preserve"> </w:t>
-      </w:r>
-      <w:r>
-        <w:t xml:space="preserve">replication.</w:t>
-      </w:r>
-      <w:r>
-        <w:t xml:space="preserve"> </w:t>
-      </w:r>
-      <w:r>
-        <w:t xml:space="preserve">We</w:t>
-      </w:r>
-      <w:r>
-        <w:t xml:space="preserve"> </w:t>
-      </w:r>
-      <w:r>
-        <w:t xml:space="preserve">identify</w:t>
-      </w:r>
-      <w:r>
-        <w:t xml:space="preserve"> </w:t>
-      </w:r>
-      <w:r>
-        <w:t xml:space="preserve">quantum-probability</w:t>
-      </w:r>
-      <w:r>
-        <w:t xml:space="preserve"> </w:t>
-      </w:r>
-      <w:r>
-        <w:t xml:space="preserve">models</w:t>
-      </w:r>
-      <w:r>
-        <w:t xml:space="preserve"> </w:t>
-      </w:r>
-      <w:r>
-        <w:t xml:space="preserve">of</w:t>
-      </w:r>
-      <w:r>
-        <w:t xml:space="preserve"> </w:t>
-      </w:r>
-      <w:r>
-        <w:t xml:space="preserve">human</w:t>
-      </w:r>
-      <w:r>
-        <w:t xml:space="preserve"> </w:t>
-      </w:r>
-      <w:r>
-        <w:t xml:space="preserve">judgment</w:t>
-      </w:r>
-      <w:r>
-        <w:t xml:space="preserve"> </w:t>
-      </w:r>
-      <w:r>
-        <w:t xml:space="preserve">as</w:t>
-      </w:r>
-      <w:r>
-        <w:t xml:space="preserve"> </w:t>
-      </w:r>
-      <w:r>
-        <w:t xml:space="preserve">a</w:t>
-      </w:r>
-      <w:r>
-        <w:t xml:space="preserve"> </w:t>
-      </w:r>
-      <w:r>
-        <w:t xml:space="preserve">hardware-light</w:t>
-      </w:r>
-      <w:r>
-        <w:t xml:space="preserve"> </w:t>
-      </w:r>
-      <w:r>
-        <w:t xml:space="preserve">opportunity</w:t>
-      </w:r>
-      <w:r>
-        <w:t xml:space="preserve"> </w:t>
-      </w:r>
-      <w:r>
-        <w:t xml:space="preserve">for</w:t>
-      </w:r>
-      <w:r>
-        <w:t xml:space="preserve"> </w:t>
-      </w:r>
-      <w:r>
-        <w:t xml:space="preserve">human-robot</w:t>
-      </w:r>
-      <w:r>
-        <w:t xml:space="preserve"> </w:t>
-      </w:r>
-      <w:r>
-        <w:t xml:space="preserve">interaction,</w:t>
-      </w:r>
-      <w:r>
-        <w:t xml:space="preserve"> </w:t>
-      </w:r>
-      <w:r>
-        <w:t xml:space="preserve">propose</w:t>
-      </w:r>
-      <w:r>
-        <w:t xml:space="preserve"> </w:t>
-      </w:r>
-      <w:r>
-        <w:t xml:space="preserve">reporting</w:t>
-      </w:r>
-      <w:r>
-        <w:t xml:space="preserve"> </w:t>
-      </w:r>
-      <w:r>
-        <w:t xml:space="preserve">standards</w:t>
-      </w:r>
-      <w:r>
-        <w:t xml:space="preserve"> </w:t>
-      </w:r>
-      <w:r>
-        <w:t xml:space="preserve">for</w:t>
-      </w:r>
-      <w:r>
-        <w:t xml:space="preserve"> </w:t>
-      </w:r>
-      <w:r>
-        <w:t xml:space="preserve">quantum-robotics</w:t>
-      </w:r>
-      <w:r>
-        <w:t xml:space="preserve"> </w:t>
-      </w:r>
-      <w:r>
-        <w:t xml:space="preserve">experiments,</w:t>
-      </w:r>
-      <w:r>
-        <w:t xml:space="preserve"> </w:t>
-      </w:r>
-      <w:r>
-        <w:t xml:space="preserve">and</w:t>
-      </w:r>
-      <w:r>
-        <w:t xml:space="preserve"> </w:t>
-      </w:r>
-      <w:r>
-        <w:t xml:space="preserve">derive</w:t>
-      </w:r>
-      <w:r>
-        <w:t xml:space="preserve"> </w:t>
-      </w:r>
-      <w:r>
-        <w:t xml:space="preserve">a</w:t>
-      </w:r>
-      <w:r>
-        <w:t xml:space="preserve"> </w:t>
-      </w:r>
-      <w:r>
         <w:t xml:space="preserve">research</w:t>
       </w:r>
       <w:r>
         <w:t xml:space="preserve"> </w:t>
       </w:r>
       <w:r>
-        <w:t xml:space="preserve">agenda</w:t>
-      </w:r>
-      <w:r>
-        <w:t xml:space="preserve"> </w:t>
-      </w:r>
-      <w:r>
-        <w:t xml:space="preserve">from</w:t>
-      </w:r>
-      <w:r>
-        <w:t xml:space="preserve"> </w:t>
-      </w:r>
-      <w:r>
-        <w:t xml:space="preserve">the</w:t>
-      </w:r>
-      <w:r>
-        <w:t xml:space="preserve"> </w:t>
-      </w:r>
-      <w:r>
-        <w:t xml:space="preserve">taxonomy.</w:t>
+        <w:t xml:space="preserve">agenda.</w:t>
       </w:r>
     </w:p>
     <w:bookmarkStart w:id="26" w:name="sec:intro"/>
@@ -2596,7 +2146,7 @@
         <w:fldChar w:fldCharType="begin"/>
       </w:r>
       <w:r>
-        <w:instrText xml:space="preserve">ADDIN CSL_CITATION {"citationID":"MENDELEY_CITATION_10","citationItems":[{"id":"ITEM-10","isTemporary":false,"itemData":{"DOI":"10.2200/S00746ED1V01Y201612QMC010","author":[{"family":"Tandon","given":"Prateek"},{"family":"Lam","given":"Stanley"},{"family":"Shih","given":"Ben"},{"family":"Mehta","given":"Tanay"},{"family":"Mitev","given":"Alex"},{"family":"Ong","given":"Zhiyang"}],"collection-title":"Synthesis lectures on quantum computing","id":"Tandon2017","issued":{"date-parts":[[2017]]},"publisher":"Morgan &amp; Claypool Publishers","title":"Quantum robotics: A primer on current science and future perspectives","title-short":"Quantum robotics","type":"book"},"suppress-author":false}],"isEdited":false,"manualOverride":{"citeprocText":"Tandon et al. (2017)","isManuallyOverridden":false,"manualOverrideText":""},"mendeley":{"formattedCitation":"Tandon et al. (2017)","plainTextFormattedCitation":"Tandon et al. (2017)","previouslyFormattedCitation":"Tandon et al. (2017)"},"properties":{"noteIndex":0},"schema":"https://github.com/citation-style-language/schema/raw/master/csl-citation.json"}</w:instrText>
+        <w:instrText xml:space="preserve">ADDIN CSL_CITATION {"citationID":"MENDELEY_CITATION_10","citationItems":[{"id":"ITEM-10","isTemporary":false,"itemData":{"DOI":"10.2200/S00746ED1V01Y201612QMC010","author":[{"family":"Tandon","given":"Prateek"},{"family":"Lam","given":"Stanley"},{"family":"Shih","given":"Ben"},{"family":"Mehta","given":"Tanay"},{"family":"Mitev","given":"Alex"},{"family":"Ong","given":"Zhiyang"}],"collection-title":"Synthesis lectures on quantum computing","id":"Tandon2017","issued":{"date-parts":[[2017]]},"publisher":"Morgan &amp; Claypool Publishers","publisher-place":"San Rafael, CA, USA","title":"Quantum robotics: A primer on current science and future perspectives","title-short":"Quantum robotics","type":"book"},"suppress-author":false}],"isEdited":false,"manualOverride":{"citeprocText":"Tandon et al. (2017)","isManuallyOverridden":false,"manualOverrideText":""},"mendeley":{"formattedCitation":"Tandon et al. (2017)","plainTextFormattedCitation":"Tandon et al. (2017)","previouslyFormattedCitation":"Tandon et al. (2017)"},"properties":{"noteIndex":0},"schema":"https://github.com/citation-style-language/schema/raw/master/csl-citation.json"}</w:instrText>
       </w:r>
       <w:r>
         <w:fldChar w:fldCharType="separate"/>
@@ -2620,7 +2170,7 @@
         <w:fldChar w:fldCharType="begin"/>
       </w:r>
       <w:r>
-        <w:instrText xml:space="preserve">ADDIN CSL_CITATION {"citationID":"MENDELEY_CITATION_11","citationItems":[{"id":"ITEM-11","isTemporary":false,"itemData":{"DOI":"10.1109/ICRA.2019.8793768","author":[{"family":"Petschnigg","given":"Christina"},{"family":"Brandstötter","given":"Mathias"},{"family":"Pichler","given":"Horst"},{"family":"Hofbaur","given":"Michael W."},{"family":"Dieber","given":"Bernhard"}],"container-title":"Proceedings of the 2019 international conference on robotics and automation (ICRA)","id":"Petschnigg2019","issued":{"date-parts":[[2019]]},"page":"803-810","publisher":"IEEE","title":"Quantum computation in robotic science and applications","type":"paper-conference"},"suppress-author":false}],"isEdited":false,"manualOverride":{"citeprocText":"Petschnigg et al. (2019)","isManuallyOverridden":false,"manualOverrideText":""},"mendeley":{"formattedCitation":"Petschnigg et al. (2019)","plainTextFormattedCitation":"Petschnigg et al. (2019)","previouslyFormattedCitation":"Petschnigg et al. (2019)"},"properties":{"noteIndex":0},"schema":"https://github.com/citation-style-language/schema/raw/master/csl-citation.json"}</w:instrText>
+        <w:instrText xml:space="preserve">ADDIN CSL_CITATION {"citationID":"MENDELEY_CITATION_11","citationItems":[{"id":"ITEM-11","isTemporary":false,"itemData":{"DOI":"10.1109/ICRA.2019.8793768","author":[{"family":"Petschnigg","given":"Christina"},{"family":"Brandstötter","given":"Mathias"},{"family":"Pichler","given":"Horst"},{"family":"Hofbaur","given":"Michael W."},{"family":"Dieber","given":"Bernhard"}],"container-title":"Proceedings of the 2019 international conference on robotics and automation (ICRA)","id":"Petschnigg2019","issued":{"date-parts":[[2019]]},"page":"803-810","publisher":"IEEE","publisher-place":"Piscataway, NJ, USA","title":"Quantum computation in robotic science and applications","type":"paper-conference"},"suppress-author":false}],"isEdited":false,"manualOverride":{"citeprocText":"Petschnigg et al. (2019)","isManuallyOverridden":false,"manualOverrideText":""},"mendeley":{"formattedCitation":"Petschnigg et al. (2019)","plainTextFormattedCitation":"Petschnigg et al. (2019)","previouslyFormattedCitation":"Petschnigg et al. (2019)"},"properties":{"noteIndex":0},"schema":"https://github.com/citation-style-language/schema/raw/master/csl-citation.json"}</w:instrText>
       </w:r>
       <w:r>
         <w:fldChar w:fldCharType="separate"/>
@@ -2713,7 +2263,7 @@
         <w:fldChar w:fldCharType="begin"/>
       </w:r>
       <w:r>
-        <w:instrText xml:space="preserve">ADDIN CSL_CITATION {"citationID":"MENDELEY_CITATION_15","citationItems":[{"id":"ITEM-15","isTemporary":false,"itemData":{"DOI":"10.1109/ICAAID68975.2025.11358227","author":[{"family":"Fazilat","given":"Mehdi"},{"family":"Zioui","given":"Nadjet"}],"container-title":"2025 5th international conference on applied automation and industrial diagnostics (ICAAID)","id":"Fazilat2025a","issued":{"date-parts":[[2025]]},"publisher":"IEEE","title":"A brief review on quantum-based control strategies for robotic systems","type":"paper-conference"}}],"isEdited":false,"manualOverride":{"citeprocText":"(Fazilat and Zioui 2025a)","isManuallyOverridden":false,"manualOverrideText":""},"mendeley":{"formattedCitation":"(Fazilat and Zioui 2025a)","plainTextFormattedCitation":"(Fazilat and Zioui 2025a)","previouslyFormattedCitation":"(Fazilat and Zioui 2025a)"},"properties":{"noteIndex":0},"schema":"https://github.com/citation-style-language/schema/raw/master/csl-citation.json"}</w:instrText>
+        <w:instrText xml:space="preserve">ADDIN CSL_CITATION {"citationID":"MENDELEY_CITATION_15","citationItems":[{"id":"ITEM-15","isTemporary":false,"itemData":{"DOI":"10.1109/ICAAID68975.2025.11358227","author":[{"family":"Fazilat","given":"Mehdi"},{"family":"Zioui","given":"Nadjet"}],"container-title":"2025 5th international conference on applied automation and industrial diagnostics (ICAAID)","id":"Fazilat2025a","issued":{"date-parts":[[2025]]},"publisher":"IEEE","publisher-place":"Piscataway, NJ, USA","title":"A brief review on quantum-based control strategies for robotic systems","type":"paper-conference"}}],"isEdited":false,"manualOverride":{"citeprocText":"(Fazilat and Zioui 2025a)","isManuallyOverridden":false,"manualOverrideText":""},"mendeley":{"formattedCitation":"(Fazilat and Zioui 2025a)","plainTextFormattedCitation":"(Fazilat and Zioui 2025a)","previouslyFormattedCitation":"(Fazilat and Zioui 2025a)"},"properties":{"noteIndex":0},"schema":"https://github.com/citation-style-language/schema/raw/master/csl-citation.json"}</w:instrText>
       </w:r>
       <w:r>
         <w:fldChar w:fldCharType="separate"/>
@@ -3210,7 +2760,7 @@
               <w:fldChar w:fldCharType="begin"/>
             </w:r>
             <w:r>
-              <w:instrText xml:space="preserve">ADDIN CSL_CITATION {"citationID":"MENDELEY_CITATION_28","citationItems":[{"id":"ITEM-28","isTemporary":false,"itemData":{"DOI":"10.2200/S00746ED1V01Y201612QMC010","author":[{"family":"Tandon","given":"Prateek"},{"family":"Lam","given":"Stanley"},{"family":"Shih","given":"Ben"},{"family":"Mehta","given":"Tanay"},{"family":"Mitev","given":"Alex"},{"family":"Ong","given":"Zhiyang"}],"collection-title":"Synthesis lectures on quantum computing","id":"Tandon2017","issued":{"date-parts":[[2017]]},"publisher":"Morgan &amp; Claypool Publishers","title":"Quantum robotics: A primer on current science and future perspectives","title-short":"Quantum robotics","type":"book"},"suppress-author":false}],"isEdited":false,"manualOverride":{"citeprocText":"Tandon et al. (2017)","isManuallyOverridden":false,"manualOverrideText":""},"mendeley":{"formattedCitation":"Tandon et al. (2017)","plainTextFormattedCitation":"Tandon et al. (2017)","previouslyFormattedCitation":"Tandon et al. (2017)"},"properties":{"noteIndex":0},"schema":"https://github.com/citation-style-language/schema/raw/master/csl-citation.json"}</w:instrText>
+              <w:instrText xml:space="preserve">ADDIN CSL_CITATION {"citationID":"MENDELEY_CITATION_28","citationItems":[{"id":"ITEM-28","isTemporary":false,"itemData":{"DOI":"10.2200/S00746ED1V01Y201612QMC010","author":[{"family":"Tandon","given":"Prateek"},{"family":"Lam","given":"Stanley"},{"family":"Shih","given":"Ben"},{"family":"Mehta","given":"Tanay"},{"family":"Mitev","given":"Alex"},{"family":"Ong","given":"Zhiyang"}],"collection-title":"Synthesis lectures on quantum computing","id":"Tandon2017","issued":{"date-parts":[[2017]]},"publisher":"Morgan &amp; Claypool Publishers","publisher-place":"San Rafael, CA, USA","title":"Quantum robotics: A primer on current science and future perspectives","title-short":"Quantum robotics","type":"book"},"suppress-author":false}],"isEdited":false,"manualOverride":{"citeprocText":"Tandon et al. (2017)","isManuallyOverridden":false,"manualOverrideText":""},"mendeley":{"formattedCitation":"Tandon et al. (2017)","plainTextFormattedCitation":"Tandon et al. (2017)","previouslyFormattedCitation":"Tandon et al. (2017)"},"properties":{"noteIndex":0},"schema":"https://github.com/citation-style-language/schema/raw/master/csl-citation.json"}</w:instrText>
             </w:r>
             <w:r>
               <w:fldChar w:fldCharType="separate"/>
@@ -3336,7 +2886,7 @@
               <w:fldChar w:fldCharType="begin"/>
             </w:r>
             <w:r>
-              <w:instrText xml:space="preserve">ADDIN CSL_CITATION {"citationID":"MENDELEY_CITATION_29","citationItems":[{"id":"ITEM-29","isTemporary":false,"itemData":{"DOI":"10.1109/ICRA.2019.8793768","author":[{"family":"Petschnigg","given":"Christina"},{"family":"Brandstötter","given":"Mathias"},{"family":"Pichler","given":"Horst"},{"family":"Hofbaur","given":"Michael W."},{"family":"Dieber","given":"Bernhard"}],"container-title":"Proceedings of the 2019 international conference on robotics and automation (ICRA)","id":"Petschnigg2019","issued":{"date-parts":[[2019]]},"page":"803-810","publisher":"IEEE","title":"Quantum computation in robotic science and applications","type":"paper-conference"},"suppress-author":false}],"isEdited":false,"manualOverride":{"citeprocText":"Petschnigg et al. (2019)","isManuallyOverridden":false,"manualOverrideText":""},"mendeley":{"formattedCitation":"Petschnigg et al. (2019)","plainTextFormattedCitation":"Petschnigg et al. (2019)","previouslyFormattedCitation":"Petschnigg et al. (2019)"},"properties":{"noteIndex":0},"schema":"https://github.com/citation-style-language/schema/raw/master/csl-citation.json"}</w:instrText>
+              <w:instrText xml:space="preserve">ADDIN CSL_CITATION {"citationID":"MENDELEY_CITATION_29","citationItems":[{"id":"ITEM-29","isTemporary":false,"itemData":{"DOI":"10.1109/ICRA.2019.8793768","author":[{"family":"Petschnigg","given":"Christina"},{"family":"Brandstötter","given":"Mathias"},{"family":"Pichler","given":"Horst"},{"family":"Hofbaur","given":"Michael W."},{"family":"Dieber","given":"Bernhard"}],"container-title":"Proceedings of the 2019 international conference on robotics and automation (ICRA)","id":"Petschnigg2019","issued":{"date-parts":[[2019]]},"page":"803-810","publisher":"IEEE","publisher-place":"Piscataway, NJ, USA","title":"Quantum computation in robotic science and applications","type":"paper-conference"},"suppress-author":false}],"isEdited":false,"manualOverride":{"citeprocText":"Petschnigg et al. (2019)","isManuallyOverridden":false,"manualOverrideText":""},"mendeley":{"formattedCitation":"Petschnigg et al. (2019)","plainTextFormattedCitation":"Petschnigg et al. (2019)","previouslyFormattedCitation":"Petschnigg et al. (2019)"},"properties":{"noteIndex":0},"schema":"https://github.com/citation-style-language/schema/raw/master/csl-citation.json"}</w:instrText>
             </w:r>
             <w:r>
               <w:fldChar w:fldCharType="separate"/>
@@ -3874,7 +3424,7 @@
               <w:fldChar w:fldCharType="begin"/>
             </w:r>
             <w:r>
-              <w:instrText xml:space="preserve">ADDIN CSL_CITATION {"citationID":"MENDELEY_CITATION_33","citationItems":[{"id":"ITEM-33","isTemporary":false,"itemData":{"DOI":"10.1109/ICAAID68975.2025.11358227","author":[{"family":"Fazilat","given":"Mehdi"},{"family":"Zioui","given":"Nadjet"}],"container-title":"2025 5th international conference on applied automation and industrial diagnostics (ICAAID)","id":"Fazilat2025a","issued":{"date-parts":[[2025]]},"publisher":"IEEE","title":"A brief review on quantum-based control strategies for robotic systems","type":"paper-conference"},"suppress-author":false}],"isEdited":false,"manualOverride":{"citeprocText":"Fazilat and Zioui (2025a)","isManuallyOverridden":false,"manualOverrideText":""},"mendeley":{"formattedCitation":"Fazilat and Zioui (2025a)","plainTextFormattedCitation":"Fazilat and Zioui (2025a)","previouslyFormattedCitation":"Fazilat and Zioui (2025a)"},"properties":{"noteIndex":0},"schema":"https://github.com/citation-style-language/schema/raw/master/csl-citation.json"}</w:instrText>
+              <w:instrText xml:space="preserve">ADDIN CSL_CITATION {"citationID":"MENDELEY_CITATION_33","citationItems":[{"id":"ITEM-33","isTemporary":false,"itemData":{"DOI":"10.1109/ICAAID68975.2025.11358227","author":[{"family":"Fazilat","given":"Mehdi"},{"family":"Zioui","given":"Nadjet"}],"container-title":"2025 5th international conference on applied automation and industrial diagnostics (ICAAID)","id":"Fazilat2025a","issued":{"date-parts":[[2025]]},"publisher":"IEEE","publisher-place":"Piscataway, NJ, USA","title":"A brief review on quantum-based control strategies for robotic systems","type":"paper-conference"},"suppress-author":false}],"isEdited":false,"manualOverride":{"citeprocText":"Fazilat and Zioui (2025a)","isManuallyOverridden":false,"manualOverrideText":""},"mendeley":{"formattedCitation":"Fazilat and Zioui (2025a)","plainTextFormattedCitation":"Fazilat and Zioui (2025a)","previouslyFormattedCitation":"Fazilat and Zioui (2025a)"},"properties":{"noteIndex":0},"schema":"https://github.com/citation-style-language/schema/raw/master/csl-citation.json"}</w:instrText>
             </w:r>
             <w:r>
               <w:fldChar w:fldCharType="separate"/>
@@ -5722,7 +5272,7 @@
         <w:fldChar w:fldCharType="begin"/>
       </w:r>
       <w:r>
-        <w:instrText xml:space="preserve">ADDIN CSL_CITATION {"citationID":"MENDELEY_CITATION_54","citationItems":[{"id":"ITEM-54","isTemporary":false,"itemData":{"DOI":"10.1038/s41586-024-08449-y","author":[{"literal":"Google Quantum AI and Collaborators"}],"container-title":"Nature","id":"GoogleQAI2025","issued":{"date-parts":[[2025]]},"title":"Quantum error correction below the surface code threshold","type":"article-journal"}}],"isEdited":false,"manualOverride":{"citeprocText":"(Google Quantum AI and Collaborators 2025)","isManuallyOverridden":false,"manualOverrideText":""},"mendeley":{"formattedCitation":"(Google Quantum AI and Collaborators 2025)","plainTextFormattedCitation":"(Google Quantum AI and Collaborators 2025)","previouslyFormattedCitation":"(Google Quantum AI and Collaborators 2025)"},"properties":{"noteIndex":0},"schema":"https://github.com/citation-style-language/schema/raw/master/csl-citation.json"}</w:instrText>
+        <w:instrText xml:space="preserve">ADDIN CSL_CITATION {"citationID":"MENDELEY_CITATION_54","citationItems":[{"id":"ITEM-54","isTemporary":false,"itemData":{"DOI":"10.1038/s41586-024-08449-y","author":[{"literal":"Google Quantum AI and Collaborators"}],"container-title":"Nature","id":"GoogleQAI2025","issued":{"date-parts":[[2025]]},"page":"920-926","title":"Quantum error correction below the surface code threshold","type":"article-journal","volume":"638"}}],"isEdited":false,"manualOverride":{"citeprocText":"(Google Quantum AI and Collaborators 2025)","isManuallyOverridden":false,"manualOverrideText":""},"mendeley":{"formattedCitation":"(Google Quantum AI and Collaborators 2025)","plainTextFormattedCitation":"(Google Quantum AI and Collaborators 2025)","previouslyFormattedCitation":"(Google Quantum AI and Collaborators 2025)"},"properties":{"noteIndex":0},"schema":"https://github.com/citation-style-language/schema/raw/master/csl-citation.json"}</w:instrText>
       </w:r>
       <w:r>
         <w:fldChar w:fldCharType="separate"/>
@@ -5929,7 +5479,7 @@
         <w:fldChar w:fldCharType="begin"/>
       </w:r>
       <w:r>
-        <w:instrText xml:space="preserve">ADDIN CSL_CITATION {"citationID":"MENDELEY_CITATION_61","citationItems":[{"id":"ITEM-61","isTemporary":false,"itemData":{"DOI":"10.1109/ROBOT.1999.772544","author":[{"family":"Dellaert","given":"Frank"},{"family":"Fox","given":"Dieter"},{"family":"Burgard","given":"Wolfram"},{"family":"Thrun","given":"Sebastian"}],"container-title":"Proceedings of the 1999 IEEE international conference on robotics and automation (ICRA)","id":"Dellaert1999","issued":{"date-parts":[[1999]]},"page":"1322-1328","publisher":"IEEE","title":"Monte Carlo localization for mobile robots","type":"paper-conference","volume":"2"}}],"isEdited":false,"manualOverride":{"citeprocText":"(Dellaert et al. 1999)","isManuallyOverridden":false,"manualOverrideText":""},"mendeley":{"formattedCitation":"(Dellaert et al. 1999)","plainTextFormattedCitation":"(Dellaert et al. 1999)","previouslyFormattedCitation":"(Dellaert et al. 1999)"},"properties":{"noteIndex":0},"schema":"https://github.com/citation-style-language/schema/raw/master/csl-citation.json"}</w:instrText>
+        <w:instrText xml:space="preserve">ADDIN CSL_CITATION {"citationID":"MENDELEY_CITATION_61","citationItems":[{"id":"ITEM-61","isTemporary":false,"itemData":{"DOI":"10.1109/ROBOT.1999.772544","author":[{"family":"Dellaert","given":"Frank"},{"family":"Fox","given":"Dieter"},{"family":"Burgard","given":"Wolfram"},{"family":"Thrun","given":"Sebastian"}],"container-title":"Proceedings of the 1999 IEEE international conference on robotics and automation (ICRA)","id":"Dellaert1999","issued":{"date-parts":[[1999]]},"page":"1322-1328","publisher":"IEEE","publisher-place":"Piscataway, NJ, USA","title":"Monte Carlo localization for mobile robots","type":"paper-conference","volume":"2"}}],"isEdited":false,"manualOverride":{"citeprocText":"(Dellaert et al. 1999)","isManuallyOverridden":false,"manualOverrideText":""},"mendeley":{"formattedCitation":"(Dellaert et al. 1999)","plainTextFormattedCitation":"(Dellaert et al. 1999)","previouslyFormattedCitation":"(Dellaert et al. 1999)"},"properties":{"noteIndex":0},"schema":"https://github.com/citation-style-language/schema/raw/master/csl-citation.json"}</w:instrText>
       </w:r>
       <w:r>
         <w:fldChar w:fldCharType="separate"/>
@@ -6219,7 +5769,7 @@
         <w:fldChar w:fldCharType="begin"/>
       </w:r>
       <w:r>
-        <w:instrText xml:space="preserve">ADDIN CSL_CITATION {"citationID":"MENDELEY_CITATION_71","citationItems":[{"id":"ITEM-71","isTemporary":false,"itemData":{"DOI":"10.1090/conm/305/05215","author":[{"family":"Brassard","given":"Gilles"},{"family":"Høyer","given":"Peter"},{"family":"Mosca","given":"Michele"},{"family":"Tapp","given":"Alain"}],"collection-title":"Contemporary mathematics","container-title":"Quantum computation and information","editor":[{"family":"Lomonaco","given":"Samuel J.","suffix":"Jr."}],"id":"Brassard2002","issued":{"date-parts":[[2002]]},"page":"53-74","publisher":"American Mathematical Society","title":"Quantum amplitude amplification and estimation","type":"chapter","volume":"305"}}],"isEdited":false,"manualOverride":{"citeprocText":"(Brassard et al. 2002)","isManuallyOverridden":false,"manualOverrideText":""},"mendeley":{"formattedCitation":"(Brassard et al. 2002)","plainTextFormattedCitation":"(Brassard et al. 2002)","previouslyFormattedCitation":"(Brassard et al. 2002)"},"properties":{"noteIndex":0},"schema":"https://github.com/citation-style-language/schema/raw/master/csl-citation.json"}</w:instrText>
+        <w:instrText xml:space="preserve">ADDIN CSL_CITATION {"citationID":"MENDELEY_CITATION_71","citationItems":[{"id":"ITEM-71","isTemporary":false,"itemData":{"DOI":"10.1090/conm/305/05215","author":[{"family":"Brassard","given":"Gilles"},{"family":"Høyer","given":"Peter"},{"family":"Mosca","given":"Michele"},{"family":"Tapp","given":"Alain"}],"collection-title":"Contemporary mathematics","container-title":"Quantum computation and information","editor":[{"family":"Lomonaco","given":"Samuel J.","suffix":"Jr."}],"id":"Brassard2002","issued":{"date-parts":[[2002]]},"page":"53-74","publisher":"American Mathematical Society","publisher-place":"Providence, RI, USA","title":"Quantum amplitude amplification and estimation","type":"chapter","volume":"305"}}],"isEdited":false,"manualOverride":{"citeprocText":"(Brassard et al. 2002)","isManuallyOverridden":false,"manualOverrideText":""},"mendeley":{"formattedCitation":"(Brassard et al. 2002)","plainTextFormattedCitation":"(Brassard et al. 2002)","previouslyFormattedCitation":"(Brassard et al. 2002)"},"properties":{"noteIndex":0},"schema":"https://github.com/citation-style-language/schema/raw/master/csl-citation.json"}</w:instrText>
       </w:r>
       <w:r>
         <w:fldChar w:fldCharType="separate"/>
@@ -6626,7 +6176,7 @@
         <w:fldChar w:fldCharType="begin"/>
       </w:r>
       <w:r>
-        <w:instrText xml:space="preserve">ADDIN CSL_CITATION {"citationID":"MENDELEY_CITATION_89","citationItems":[{"id":"ITEM-89","isTemporary":false,"itemData":{"DOI":"10.1038/s41586-024-08449-y","author":[{"literal":"Google Quantum AI and Collaborators"}],"container-title":"Nature","id":"GoogleQAI2025","issued":{"date-parts":[[2025]]},"title":"Quantum error correction below the surface code threshold","type":"article-journal"}}],"isEdited":false,"manualOverride":{"citeprocText":"(Google Quantum AI and Collaborators 2025)","isManuallyOverridden":false,"manualOverrideText":""},"mendeley":{"formattedCitation":"(Google Quantum AI and Collaborators 2025)","plainTextFormattedCitation":"(Google Quantum AI and Collaborators 2025)","previouslyFormattedCitation":"(Google Quantum AI and Collaborators 2025)"},"properties":{"noteIndex":0},"schema":"https://github.com/citation-style-language/schema/raw/master/csl-citation.json"}</w:instrText>
+        <w:instrText xml:space="preserve">ADDIN CSL_CITATION {"citationID":"MENDELEY_CITATION_89","citationItems":[{"id":"ITEM-89","isTemporary":false,"itemData":{"DOI":"10.1038/s41586-024-08449-y","author":[{"literal":"Google Quantum AI and Collaborators"}],"container-title":"Nature","id":"GoogleQAI2025","issued":{"date-parts":[[2025]]},"page":"920-926","title":"Quantum error correction below the surface code threshold","type":"article-journal","volume":"638"}}],"isEdited":false,"manualOverride":{"citeprocText":"(Google Quantum AI and Collaborators 2025)","isManuallyOverridden":false,"manualOverrideText":""},"mendeley":{"formattedCitation":"(Google Quantum AI and Collaborators 2025)","plainTextFormattedCitation":"(Google Quantum AI and Collaborators 2025)","previouslyFormattedCitation":"(Google Quantum AI and Collaborators 2025)"},"properties":{"noteIndex":0},"schema":"https://github.com/citation-style-language/schema/raw/master/csl-citation.json"}</w:instrText>
       </w:r>
       <w:r>
         <w:fldChar w:fldCharType="separate"/>
@@ -7173,7 +6723,7 @@
         <w:fldChar w:fldCharType="begin"/>
       </w:r>
       <w:r>
-        <w:instrText xml:space="preserve">ADDIN CSL_CITATION {"citationID":"MENDELEY_CITATION_111","citationItems":[{"id":"ITEM-108","isTemporary":false,"itemData":{"DOI":"10.1109/ICRA.2019.8793768","author":[{"family":"Petschnigg","given":"Christina"},{"family":"Brandstötter","given":"Mathias"},{"family":"Pichler","given":"Horst"},{"family":"Hofbaur","given":"Michael W."},{"family":"Dieber","given":"Bernhard"}],"container-title":"Proceedings of the 2019 international conference on robotics and automation (ICRA)","id":"Petschnigg2019","issued":{"date-parts":[[2019]]},"page":"803-810","publisher":"IEEE","title":"Quantum computation in robotic science and applications","type":"paper-conference"}},{"id":"ITEM-109","isTemporary":false,"itemData":{"DOI":"10.1007/s42484-024-00225-5","author":[{"family":"Yan","given":"Fei"},{"family":"Iliyasu","given":"Abdullah M."},{"family":"Li","given":"Nianqiao"},{"family":"Salama","given":"Ahmed S."},{"family":"Hirota","given":"Kaoru"}],"container-title":"Quantum Machine Intelligence","id":"Yan2024","issue":"2","issued":{"date-parts":[[2024]]},"page":"86","publisher":"Springer","title":"Quantum robotics: A review of emerging trends","title-short":"Quantum robotics","type":"article-journal","volume":"6"}},{"id":"ITEM-110","isTemporary":false,"itemData":{"DOI":"10.2200/S00746ED1V01Y201612QMC010","author":[{"family":"Tandon","given":"Prateek"},{"family":"Lam","given":"Stanley"},{"family":"Shih","given":"Ben"},{"family":"Mehta","given":"Tanay"},{"family":"Mitev","given":"Alex"},{"family":"Ong","given":"Zhiyang"}],"collection-title":"Synthesis lectures on quantum computing","id":"Tandon2017","issued":{"date-parts":[[2017]]},"publisher":"Morgan &amp; Claypool Publishers","title":"Quantum robotics: A primer on current science and future perspectives","title-short":"Quantum robotics","type":"book"}},{"id":"ITEM-111","isTemporary":false,"itemData":{"URL":"https://arxiv.org/abs/2211.03464","author":[{"family":"Meyer","given":"Nico"},{"family":"Ufrecht","given":"Christian"},{"family":"Periyasamy","given":"Maniraman"},{"family":"Scherer","given":"Daniel D."},{"family":"Plinge","given":"Axel"},{"family":"Mutschler","given":"Christopher"}],"id":"Meyer2022","issued":{"date-parts":[[2022]]},"title":"A survey on quantum reinforcement learning","type":""}}],"isEdited":false,"manualOverride":{"citeprocText":"(Petschnigg et al. 2019; Yan et al. 2024; Tandon et al. 2017; Meyer et al. 2022)","isManuallyOverridden":false,"manualOverrideText":""},"mendeley":{"formattedCitation":"(Petschnigg et al. 2019; Yan et al. 2024; Tandon et al. 2017; Meyer et al. 2022)","plainTextFormattedCitation":"(Petschnigg et al. 2019; Yan et al. 2024; Tandon et al. 2017; Meyer et al. 2022)","previouslyFormattedCitation":"(Petschnigg et al. 2019; Yan et al. 2024; Tandon et al. 2017; Meyer et al. 2022)"},"properties":{"noteIndex":0},"schema":"https://github.com/citation-style-language/schema/raw/master/csl-citation.json"}</w:instrText>
+        <w:instrText xml:space="preserve">ADDIN CSL_CITATION {"citationID":"MENDELEY_CITATION_111","citationItems":[{"id":"ITEM-108","isTemporary":false,"itemData":{"DOI":"10.1109/ICRA.2019.8793768","author":[{"family":"Petschnigg","given":"Christina"},{"family":"Brandstötter","given":"Mathias"},{"family":"Pichler","given":"Horst"},{"family":"Hofbaur","given":"Michael W."},{"family":"Dieber","given":"Bernhard"}],"container-title":"Proceedings of the 2019 international conference on robotics and automation (ICRA)","id":"Petschnigg2019","issued":{"date-parts":[[2019]]},"page":"803-810","publisher":"IEEE","publisher-place":"Piscataway, NJ, USA","title":"Quantum computation in robotic science and applications","type":"paper-conference"}},{"id":"ITEM-109","isTemporary":false,"itemData":{"DOI":"10.1007/s42484-024-00225-5","author":[{"family":"Yan","given":"Fei"},{"family":"Iliyasu","given":"Abdullah M."},{"family":"Li","given":"Nianqiao"},{"family":"Salama","given":"Ahmed S."},{"family":"Hirota","given":"Kaoru"}],"container-title":"Quantum Machine Intelligence","id":"Yan2024","issue":"2","issued":{"date-parts":[[2024]]},"page":"86","publisher":"Springer","title":"Quantum robotics: A review of emerging trends","title-short":"Quantum robotics","type":"article-journal","volume":"6"}},{"id":"ITEM-110","isTemporary":false,"itemData":{"DOI":"10.2200/S00746ED1V01Y201612QMC010","author":[{"family":"Tandon","given":"Prateek"},{"family":"Lam","given":"Stanley"},{"family":"Shih","given":"Ben"},{"family":"Mehta","given":"Tanay"},{"family":"Mitev","given":"Alex"},{"family":"Ong","given":"Zhiyang"}],"collection-title":"Synthesis lectures on quantum computing","id":"Tandon2017","issued":{"date-parts":[[2017]]},"publisher":"Morgan &amp; Claypool Publishers","publisher-place":"San Rafael, CA, USA","title":"Quantum robotics: A primer on current science and future perspectives","title-short":"Quantum robotics","type":"book"}},{"id":"ITEM-111","isTemporary":false,"itemData":{"URL":"https://arxiv.org/abs/2211.03464","author":[{"family":"Meyer","given":"Nico"},{"family":"Ufrecht","given":"Christian"},{"family":"Periyasamy","given":"Maniraman"},{"family":"Scherer","given":"Daniel D."},{"family":"Plinge","given":"Axel"},{"family":"Mutschler","given":"Christopher"}],"id":"Meyer2022","issued":{"date-parts":[[2022]]},"title":"A survey on quantum reinforcement learning","type":""}}],"isEdited":false,"manualOverride":{"citeprocText":"(Petschnigg et al. 2019; Yan et al. 2024; Tandon et al. 2017; Meyer et al. 2022)","isManuallyOverridden":false,"manualOverrideText":""},"mendeley":{"formattedCitation":"(Petschnigg et al. 2019; Yan et al. 2024; Tandon et al. 2017; Meyer et al. 2022)","plainTextFormattedCitation":"(Petschnigg et al. 2019; Yan et al. 2024; Tandon et al. 2017; Meyer et al. 2022)","previouslyFormattedCitation":"(Petschnigg et al. 2019; Yan et al. 2024; Tandon et al. 2017; Meyer et al. 2022)"},"properties":{"noteIndex":0},"schema":"https://github.com/citation-style-language/schema/raw/master/csl-citation.json"}</w:instrText>
       </w:r>
       <w:r>
         <w:fldChar w:fldCharType="separate"/>
@@ -9702,7 +9252,7 @@
         <w:fldChar w:fldCharType="begin"/>
       </w:r>
       <w:r>
-        <w:instrText xml:space="preserve">ADDIN CSL_CITATION {"citationID":"MENDELEY_CITATION_148","citationItems":[{"id":"ITEM-148","isTemporary":false,"itemData":{"DOI":"10.1109/IISWC53511.2021.00015","author":[{"family":"Ravi","given":"Gokul Subramanian"},{"family":"Smith","given":"Kaitlin N."},{"family":"Gokhale","given":"Pranav"},{"family":"Chong","given":"Frederic T."}],"container-title":"2021 IEEE international symposium on workload characterization (IISWC)","id":"Ravi2021","issued":{"date-parts":[[2021]]},"page":"39-50","publisher":"IEEE","title":"Quantum computing in the cloud: Analyzing job and machine characteristics","title-short":"Quantum computing in the cloud","type":"paper-conference"}}],"isEdited":false,"manualOverride":{"citeprocText":"(Ravi et al. 2021)","isManuallyOverridden":false,"manualOverrideText":""},"mendeley":{"formattedCitation":"(Ravi et al. 2021)","plainTextFormattedCitation":"(Ravi et al. 2021)","previouslyFormattedCitation":"(Ravi et al. 2021)"},"properties":{"noteIndex":0},"schema":"https://github.com/citation-style-language/schema/raw/master/csl-citation.json"}</w:instrText>
+        <w:instrText xml:space="preserve">ADDIN CSL_CITATION {"citationID":"MENDELEY_CITATION_148","citationItems":[{"id":"ITEM-148","isTemporary":false,"itemData":{"DOI":"10.1109/IISWC53511.2021.00015","author":[{"family":"Ravi","given":"Gokul Subramanian"},{"family":"Smith","given":"Kaitlin N."},{"family":"Gokhale","given":"Pranav"},{"family":"Chong","given":"Frederic T."}],"container-title":"2021 IEEE international symposium on workload characterization (IISWC)","id":"Ravi2021","issued":{"date-parts":[[2021]]},"page":"39-50","publisher":"IEEE","publisher-place":"Piscataway, NJ, USA","title":"Quantum computing in the cloud: Analyzing job and machine characteristics","title-short":"Quantum computing in the cloud","type":"paper-conference"}}],"isEdited":false,"manualOverride":{"citeprocText":"(Ravi et al. 2021)","isManuallyOverridden":false,"manualOverrideText":""},"mendeley":{"formattedCitation":"(Ravi et al. 2021)","plainTextFormattedCitation":"(Ravi et al. 2021)","previouslyFormattedCitation":"(Ravi et al. 2021)"},"properties":{"noteIndex":0},"schema":"https://github.com/citation-style-language/schema/raw/master/csl-citation.json"}</w:instrText>
       </w:r>
       <w:r>
         <w:fldChar w:fldCharType="separate"/>
@@ -10583,7 +10133,7 @@
         <w:fldChar w:fldCharType="begin"/>
       </w:r>
       <w:r>
-        <w:instrText xml:space="preserve">ADDIN CSL_CITATION {"citationID":"MENDELEY_CITATION_173","citationItems":[{"id":"ITEM-173","isTemporary":false,"itemData":{"DOI":"10.1090/conm/305/05215","author":[{"family":"Brassard","given":"Gilles"},{"family":"Høyer","given":"Peter"},{"family":"Mosca","given":"Michele"},{"family":"Tapp","given":"Alain"}],"collection-title":"Contemporary mathematics","container-title":"Quantum computation and information","editor":[{"family":"Lomonaco","given":"Samuel J.","suffix":"Jr."}],"id":"Brassard2002","issued":{"date-parts":[[2002]]},"page":"53-74","publisher":"American Mathematical Society","title":"Quantum amplitude amplification and estimation","type":"chapter","volume":"305"}}],"isEdited":false,"manualOverride":{"citeprocText":"(Brassard et al. 2002)","isManuallyOverridden":false,"manualOverrideText":""},"mendeley":{"formattedCitation":"(Brassard et al. 2002)","plainTextFormattedCitation":"(Brassard et al. 2002)","previouslyFormattedCitation":"(Brassard et al. 2002)"},"properties":{"noteIndex":0},"schema":"https://github.com/citation-style-language/schema/raw/master/csl-citation.json"}</w:instrText>
+        <w:instrText xml:space="preserve">ADDIN CSL_CITATION {"citationID":"MENDELEY_CITATION_173","citationItems":[{"id":"ITEM-173","isTemporary":false,"itemData":{"DOI":"10.1090/conm/305/05215","author":[{"family":"Brassard","given":"Gilles"},{"family":"Høyer","given":"Peter"},{"family":"Mosca","given":"Michele"},{"family":"Tapp","given":"Alain"}],"collection-title":"Contemporary mathematics","container-title":"Quantum computation and information","editor":[{"family":"Lomonaco","given":"Samuel J.","suffix":"Jr."}],"id":"Brassard2002","issued":{"date-parts":[[2002]]},"page":"53-74","publisher":"American Mathematical Society","publisher-place":"Providence, RI, USA","title":"Quantum amplitude amplification and estimation","type":"chapter","volume":"305"}}],"isEdited":false,"manualOverride":{"citeprocText":"(Brassard et al. 2002)","isManuallyOverridden":false,"manualOverrideText":""},"mendeley":{"formattedCitation":"(Brassard et al. 2002)","plainTextFormattedCitation":"(Brassard et al. 2002)","previouslyFormattedCitation":"(Brassard et al. 2002)"},"properties":{"noteIndex":0},"schema":"https://github.com/citation-style-language/schema/raw/master/csl-citation.json"}</w:instrText>
       </w:r>
       <w:r>
         <w:fldChar w:fldCharType="separate"/>
@@ -10619,7 +10169,7 @@
         <w:fldChar w:fldCharType="begin"/>
       </w:r>
       <w:r>
-        <w:instrText xml:space="preserve">ADDIN CSL_CITATION {"citationID":"MENDELEY_CITATION_175","citationItems":[{"id":"ITEM-175","isTemporary":false,"itemData":{"DOI":"10.1109/ROBOT.1999.772544","author":[{"family":"Dellaert","given":"Frank"},{"family":"Fox","given":"Dieter"},{"family":"Burgard","given":"Wolfram"},{"family":"Thrun","given":"Sebastian"}],"container-title":"Proceedings of the 1999 IEEE international conference on robotics and automation (ICRA)","id":"Dellaert1999","issued":{"date-parts":[[1999]]},"page":"1322-1328","publisher":"IEEE","title":"Monte Carlo localization for mobile robots","type":"paper-conference","volume":"2"}}],"isEdited":false,"manualOverride":{"citeprocText":"(Dellaert et al. 1999)","isManuallyOverridden":false,"manualOverrideText":""},"mendeley":{"formattedCitation":"(Dellaert et al. 1999)","plainTextFormattedCitation":"(Dellaert et al. 1999)","previouslyFormattedCitation":"(Dellaert et al. 1999)"},"properties":{"noteIndex":0},"schema":"https://github.com/citation-style-language/schema/raw/master/csl-citation.json"}</w:instrText>
+        <w:instrText xml:space="preserve">ADDIN CSL_CITATION {"citationID":"MENDELEY_CITATION_175","citationItems":[{"id":"ITEM-175","isTemporary":false,"itemData":{"DOI":"10.1109/ROBOT.1999.772544","author":[{"family":"Dellaert","given":"Frank"},{"family":"Fox","given":"Dieter"},{"family":"Burgard","given":"Wolfram"},{"family":"Thrun","given":"Sebastian"}],"container-title":"Proceedings of the 1999 IEEE international conference on robotics and automation (ICRA)","id":"Dellaert1999","issued":{"date-parts":[[1999]]},"page":"1322-1328","publisher":"IEEE","publisher-place":"Piscataway, NJ, USA","title":"Monte Carlo localization for mobile robots","type":"paper-conference","volume":"2"}}],"isEdited":false,"manualOverride":{"citeprocText":"(Dellaert et al. 1999)","isManuallyOverridden":false,"manualOverrideText":""},"mendeley":{"formattedCitation":"(Dellaert et al. 1999)","plainTextFormattedCitation":"(Dellaert et al. 1999)","previouslyFormattedCitation":"(Dellaert et al. 1999)"},"properties":{"noteIndex":0},"schema":"https://github.com/citation-style-language/schema/raw/master/csl-citation.json"}</w:instrText>
       </w:r>
       <w:r>
         <w:fldChar w:fldCharType="separate"/>
@@ -11148,7 +10698,7 @@
         <w:fldChar w:fldCharType="begin"/>
       </w:r>
       <w:r>
-        <w:instrText xml:space="preserve">ADDIN CSL_CITATION {"citationID":"MENDELEY_CITATION_187","citationItems":[{"id":"ITEM-187","isTemporary":false,"itemData":{"URL":"https://proceedings.mlr.press/v267/gerlach25a.html","author":[{"family":"Gerlach","given":"Thore"},{"family":"Lee","given":"Loong Kuan"},{"family":"Barbaresco","given":"Frederic"},{"family":"Piatkowski","given":"Nico"}],"collection-title":"Proceedings of machine learning research","container-title":"Proceedings of the 42nd international conference on machine learning","editor":[{"family":"Singh","given":"Aarti"},{"family":"Fazel","given":"Maryam"},{"family":"Hsu","given":"Daniel"},{"family":"Lacoste-Julien","given":"Simon"},{"family":"Berkenkamp","given":"Felix"},{"family":"Maharaj","given":"Tegan"},{"family":"Wagstaff","given":"Kiri"},{"family":"Zhu","given":"Jerry"}],"id":"Gerlach2025","issued":{"date-parts":[[2025]]},"page":"19161-19171","publisher":"PMLR","title":"Hybrid quantum-classical multi-agent pathfinding","type":"paper-conference","volume":"267"},"suppress-author":false}],"isEdited":false,"manualOverride":{"citeprocText":"Gerlach et al. (2025)","isManuallyOverridden":false,"manualOverrideText":""},"mendeley":{"formattedCitation":"Gerlach et al. (2025)","plainTextFormattedCitation":"Gerlach et al. (2025)","previouslyFormattedCitation":"Gerlach et al. (2025)"},"properties":{"noteIndex":0},"schema":"https://github.com/citation-style-language/schema/raw/master/csl-citation.json"}</w:instrText>
+        <w:instrText xml:space="preserve">ADDIN CSL_CITATION {"citationID":"MENDELEY_CITATION_187","citationItems":[{"id":"ITEM-187","isTemporary":false,"itemData":{"URL":"https://proceedings.mlr.press/v267/gerlach25a.html","author":[{"family":"Gerlach","given":"Thore"},{"family":"Lee","given":"Loong Kuan"},{"family":"Barbaresco","given":"Frederic"},{"family":"Piatkowski","given":"Nico"}],"collection-title":"Proceedings of machine learning research","container-title":"Proceedings of the 42nd international conference on machine learning","editor":[{"family":"Singh","given":"Aarti"},{"family":"Fazel","given":"Maryam"},{"family":"Hsu","given":"Daniel"},{"family":"Lacoste-Julien","given":"Simon"},{"family":"Berkenkamp","given":"Felix"},{"family":"Maharaj","given":"Tegan"},{"family":"Wagstaff","given":"Kiri"},{"family":"Zhu","given":"Jerry"}],"id":"Gerlach2025","issued":{"date-parts":[[2025]]},"page":"19161-19171","publisher":"PMLR","publisher-place":"Vancouver, Canada","title":"Hybrid quantum-classical multi-agent pathfinding","type":"paper-conference","volume":"267"},"suppress-author":false}],"isEdited":false,"manualOverride":{"citeprocText":"Gerlach et al. (2025)","isManuallyOverridden":false,"manualOverrideText":""},"mendeley":{"formattedCitation":"Gerlach et al. (2025)","plainTextFormattedCitation":"Gerlach et al. (2025)","previouslyFormattedCitation":"Gerlach et al. (2025)"},"properties":{"noteIndex":0},"schema":"https://github.com/citation-style-language/schema/raw/master/csl-citation.json"}</w:instrText>
       </w:r>
       <w:r>
         <w:fldChar w:fldCharType="separate"/>
@@ -11290,7 +10840,7 @@
         <w:fldChar w:fldCharType="begin"/>
       </w:r>
       <w:r>
-        <w:instrText xml:space="preserve">ADDIN CSL_CITATION {"citationID":"MENDELEY_CITATION_192","citationItems":[{"id":"ITEM-192","isTemporary":false,"itemData":{"URL":"https://arxiv.org/abs/2501.18432","author":[{"family":"Osaba","given":"Eneko"},{"family":"Miranda-Rodriguez","given":"Pablo"},{"family":"Oikonomakis","given":"Andreas"},{"family":"Petrič","given":"Matic"},{"family":"Ruiz","given":"Alejandra"},{"family":"Bock","given":"Sebastian"},{"family":"Kourtis","given":"Michail-Alexandros"}],"container-title":"2025 IEEE congress on evolutionary computation (CEC)","id":"OsabaDrone2025","issued":{"date-parts":[[2025]]},"publisher":"IEEE","title":"Solving drone routing problems with quantum computing: A hybrid approach combining quantum annealing and gate-based paradigms","title-short":"Solving drone routing problems with quantum computing","type":"paper-conference"},"suppress-author":false}],"isEdited":false,"manualOverride":{"citeprocText":"Osaba, Miranda-Rodriguez, et al. (2025)","isManuallyOverridden":false,"manualOverrideText":""},"mendeley":{"formattedCitation":"Osaba, Miranda-Rodriguez, et al. (2025)","plainTextFormattedCitation":"Osaba, Miranda-Rodriguez, et al. (2025)","previouslyFormattedCitation":"Osaba, Miranda-Rodriguez, et al. (2025)"},"properties":{"noteIndex":0},"schema":"https://github.com/citation-style-language/schema/raw/master/csl-citation.json"}</w:instrText>
+        <w:instrText xml:space="preserve">ADDIN CSL_CITATION {"citationID":"MENDELEY_CITATION_192","citationItems":[{"id":"ITEM-192","isTemporary":false,"itemData":{"DOI":"10.1109/CEC65147.2025.11042978","URL":"https://arxiv.org/abs/2501.18432","author":[{"family":"Osaba","given":"Eneko"},{"family":"Miranda-Rodriguez","given":"Pablo"},{"family":"Oikonomakis","given":"Andreas"},{"family":"Petrič","given":"Matic"},{"family":"Ruiz","given":"Alejandra"},{"family":"Bock","given":"Sebastian"},{"family":"Kourtis","given":"Michail-Alexandros"}],"container-title":"2025 IEEE congress on evolutionary computation (CEC)","id":"OsabaDrone2025","issued":{"date-parts":[[2025]]},"publisher":"IEEE","publisher-place":"Piscataway, NJ, USA","title":"Solving drone routing problems with quantum computing: A hybrid approach combining quantum annealing and gate-based paradigms","title-short":"Solving drone routing problems with quantum computing","type":"paper-conference"},"suppress-author":false}],"isEdited":false,"manualOverride":{"citeprocText":"Osaba, Miranda-Rodriguez, et al. (2025)","isManuallyOverridden":false,"manualOverrideText":""},"mendeley":{"formattedCitation":"Osaba, Miranda-Rodriguez, et al. (2025)","plainTextFormattedCitation":"Osaba, Miranda-Rodriguez, et al. (2025)","previouslyFormattedCitation":"Osaba, Miranda-Rodriguez, et al. (2025)"},"properties":{"noteIndex":0},"schema":"https://github.com/citation-style-language/schema/raw/master/csl-citation.json"}</w:instrText>
       </w:r>
       <w:r>
         <w:fldChar w:fldCharType="separate"/>
@@ -11359,7 +10909,7 @@
         <w:fldChar w:fldCharType="begin"/>
       </w:r>
       <w:r>
-        <w:instrText xml:space="preserve">ADDIN CSL_CITATION {"citationID":"MENDELEY_CITATION_194","citationItems":[{"id":"ITEM-194","isTemporary":false,"itemData":{"URL":"https://openaccess.thecvf.com/content/CVPR2026/html/Yu_HQC-NBV_A_Hybrid_Quantum-Classical_View_Planning_Approach_CVPR_2026_paper.html","author":[{"family":"Yu","given":"Xiaotong"},{"family":"Chen","given":"Chang Wen"}],"container-title":"Proceedings of the IEEE/CVF conference on computer vision and pattern recognition (CVPR)","id":"Yu2025","issued":{"date-parts":[[2026,6]]},"page":"35091-35100","title":"HQC-NBV: A hybrid quantum-classical view planning approach","title-short":"HQC-NBV","type":"paper-conference"},"suppress-author":false}],"isEdited":false,"manualOverride":{"citeprocText":"Yu and Chen (2026)","isManuallyOverridden":false,"manualOverrideText":""},"mendeley":{"formattedCitation":"Yu and Chen (2026)","plainTextFormattedCitation":"Yu and Chen (2026)","previouslyFormattedCitation":"Yu and Chen (2026)"},"properties":{"noteIndex":0},"schema":"https://github.com/citation-style-language/schema/raw/master/csl-citation.json"}</w:instrText>
+        <w:instrText xml:space="preserve">ADDIN CSL_CITATION {"citationID":"MENDELEY_CITATION_194","citationItems":[{"id":"ITEM-194","isTemporary":false,"itemData":{"URL":"https://openaccess.thecvf.com/content/CVPR2026/html/Yu_HQC-NBV_A_Hybrid_Quantum-Classical_View_Planning_Approach_CVPR_2026_paper.html","author":[{"family":"Yu","given":"Xiaotong"},{"family":"Chen","given":"Chang Wen"}],"container-title":"Proceedings of the IEEE/CVF conference on computer vision and pattern recognition (CVPR)","id":"Yu2025","issued":{"date-parts":[[2026,6]]},"page":"35091-35100","publisher":"IEEE","publisher-place":"Piscataway, NJ, USA","title":"HQC-NBV: A hybrid quantum-classical view planning approach","title-short":"HQC-NBV","type":"paper-conference"},"suppress-author":false}],"isEdited":false,"manualOverride":{"citeprocText":"Yu and Chen (2026)","isManuallyOverridden":false,"manualOverrideText":""},"mendeley":{"formattedCitation":"Yu and Chen (2026)","plainTextFormattedCitation":"Yu and Chen (2026)","previouslyFormattedCitation":"Yu and Chen (2026)"},"properties":{"noteIndex":0},"schema":"https://github.com/citation-style-language/schema/raw/master/csl-citation.json"}</w:instrText>
       </w:r>
       <w:r>
         <w:fldChar w:fldCharType="separate"/>
@@ -11552,7 +11102,7 @@
         <w:fldChar w:fldCharType="begin"/>
       </w:r>
       <w:r>
-        <w:instrText xml:space="preserve">ADDIN CSL_CITATION {"citationID":"MENDELEY_CITATION_200","citationItems":[{"id":"ITEM-200","isTemporary":false,"itemData":{"URL":"https://proceedings.mlr.press/v267/gerlach25a.html","author":[{"family":"Gerlach","given":"Thore"},{"family":"Lee","given":"Loong Kuan"},{"family":"Barbaresco","given":"Frederic"},{"family":"Piatkowski","given":"Nico"}],"collection-title":"Proceedings of machine learning research","container-title":"Proceedings of the 42nd international conference on machine learning","editor":[{"family":"Singh","given":"Aarti"},{"family":"Fazel","given":"Maryam"},{"family":"Hsu","given":"Daniel"},{"family":"Lacoste-Julien","given":"Simon"},{"family":"Berkenkamp","given":"Felix"},{"family":"Maharaj","given":"Tegan"},{"family":"Wagstaff","given":"Kiri"},{"family":"Zhu","given":"Jerry"}],"id":"Gerlach2025","issued":{"date-parts":[[2025]]},"page":"19161-19171","publisher":"PMLR","title":"Hybrid quantum-classical multi-agent pathfinding","type":"paper-conference","volume":"267"}}],"isEdited":false,"manualOverride":{"citeprocText":"(Gerlach et al. 2025)","isManuallyOverridden":false,"manualOverrideText":""},"mendeley":{"formattedCitation":"(Gerlach et al. 2025)","plainTextFormattedCitation":"(Gerlach et al. 2025)","previouslyFormattedCitation":"(Gerlach et al. 2025)"},"properties":{"noteIndex":0},"schema":"https://github.com/citation-style-language/schema/raw/master/csl-citation.json"}</w:instrText>
+        <w:instrText xml:space="preserve">ADDIN CSL_CITATION {"citationID":"MENDELEY_CITATION_200","citationItems":[{"id":"ITEM-200","isTemporary":false,"itemData":{"URL":"https://proceedings.mlr.press/v267/gerlach25a.html","author":[{"family":"Gerlach","given":"Thore"},{"family":"Lee","given":"Loong Kuan"},{"family":"Barbaresco","given":"Frederic"},{"family":"Piatkowski","given":"Nico"}],"collection-title":"Proceedings of machine learning research","container-title":"Proceedings of the 42nd international conference on machine learning","editor":[{"family":"Singh","given":"Aarti"},{"family":"Fazel","given":"Maryam"},{"family":"Hsu","given":"Daniel"},{"family":"Lacoste-Julien","given":"Simon"},{"family":"Berkenkamp","given":"Felix"},{"family":"Maharaj","given":"Tegan"},{"family":"Wagstaff","given":"Kiri"},{"family":"Zhu","given":"Jerry"}],"id":"Gerlach2025","issued":{"date-parts":[[2025]]},"page":"19161-19171","publisher":"PMLR","publisher-place":"Vancouver, Canada","title":"Hybrid quantum-classical multi-agent pathfinding","type":"paper-conference","volume":"267"}}],"isEdited":false,"manualOverride":{"citeprocText":"(Gerlach et al. 2025)","isManuallyOverridden":false,"manualOverrideText":""},"mendeley":{"formattedCitation":"(Gerlach et al. 2025)","plainTextFormattedCitation":"(Gerlach et al. 2025)","previouslyFormattedCitation":"(Gerlach et al. 2025)"},"properties":{"noteIndex":0},"schema":"https://github.com/citation-style-language/schema/raw/master/csl-citation.json"}</w:instrText>
       </w:r>
       <w:r>
         <w:fldChar w:fldCharType="separate"/>
@@ -11588,7 +11138,7 @@
         <w:fldChar w:fldCharType="begin"/>
       </w:r>
       <w:r>
-        <w:instrText xml:space="preserve">ADDIN CSL_CITATION {"citationID":"MENDELEY_CITATION_202","citationItems":[{"id":"ITEM-202","isTemporary":false,"itemData":{"DOI":"10.1109/ROBOT.1999.772544","author":[{"family":"Dellaert","given":"Frank"},{"family":"Fox","given":"Dieter"},{"family":"Burgard","given":"Wolfram"},{"family":"Thrun","given":"Sebastian"}],"container-title":"Proceedings of the 1999 IEEE international conference on robotics and automation (ICRA)","id":"Dellaert1999","issued":{"date-parts":[[1999]]},"page":"1322-1328","publisher":"IEEE","title":"Monte Carlo localization for mobile robots","type":"paper-conference","volume":"2"}}],"isEdited":false,"manualOverride":{"citeprocText":"(Dellaert et al. 1999)","isManuallyOverridden":false,"manualOverrideText":""},"mendeley":{"formattedCitation":"(Dellaert et al. 1999)","plainTextFormattedCitation":"(Dellaert et al. 1999)","previouslyFormattedCitation":"(Dellaert et al. 1999)"},"properties":{"noteIndex":0},"schema":"https://github.com/citation-style-language/schema/raw/master/csl-citation.json"}</w:instrText>
+        <w:instrText xml:space="preserve">ADDIN CSL_CITATION {"citationID":"MENDELEY_CITATION_202","citationItems":[{"id":"ITEM-202","isTemporary":false,"itemData":{"DOI":"10.1109/ROBOT.1999.772544","author":[{"family":"Dellaert","given":"Frank"},{"family":"Fox","given":"Dieter"},{"family":"Burgard","given":"Wolfram"},{"family":"Thrun","given":"Sebastian"}],"container-title":"Proceedings of the 1999 IEEE international conference on robotics and automation (ICRA)","id":"Dellaert1999","issued":{"date-parts":[[1999]]},"page":"1322-1328","publisher":"IEEE","publisher-place":"Piscataway, NJ, USA","title":"Monte Carlo localization for mobile robots","type":"paper-conference","volume":"2"}}],"isEdited":false,"manualOverride":{"citeprocText":"(Dellaert et al. 1999)","isManuallyOverridden":false,"manualOverrideText":""},"mendeley":{"formattedCitation":"(Dellaert et al. 1999)","plainTextFormattedCitation":"(Dellaert et al. 1999)","previouslyFormattedCitation":"(Dellaert et al. 1999)"},"properties":{"noteIndex":0},"schema":"https://github.com/citation-style-language/schema/raw/master/csl-citation.json"}</w:instrText>
       </w:r>
       <w:r>
         <w:fldChar w:fldCharType="separate"/>
@@ -11893,7 +11443,7 @@
         <w:fldChar w:fldCharType="begin"/>
       </w:r>
       <w:r>
-        <w:instrText xml:space="preserve">ADDIN CSL_CITATION {"citationID":"MENDELEY_CITATION_215","citationItems":[{"id":"ITEM-215","isTemporary":false,"itemData":{"DOI":"10.1109/ICRA.2019.8793768","author":[{"family":"Petschnigg","given":"Christina"},{"family":"Brandstötter","given":"Mathias"},{"family":"Pichler","given":"Horst"},{"family":"Hofbaur","given":"Michael W."},{"family":"Dieber","given":"Bernhard"}],"container-title":"Proceedings of the 2019 international conference on robotics and automation (ICRA)","id":"Petschnigg2019","issued":{"date-parts":[[2019]]},"page":"803-810","publisher":"IEEE","title":"Quantum computation in robotic science and applications","type":"paper-conference"},"suppress-author":false}],"isEdited":false,"manualOverride":{"citeprocText":"Petschnigg et al. (2019)","isManuallyOverridden":false,"manualOverrideText":""},"mendeley":{"formattedCitation":"Petschnigg et al. (2019)","plainTextFormattedCitation":"Petschnigg et al. (2019)","previouslyFormattedCitation":"Petschnigg et al. (2019)"},"properties":{"noteIndex":0},"schema":"https://github.com/citation-style-language/schema/raw/master/csl-citation.json"}</w:instrText>
+        <w:instrText xml:space="preserve">ADDIN CSL_CITATION {"citationID":"MENDELEY_CITATION_215","citationItems":[{"id":"ITEM-215","isTemporary":false,"itemData":{"DOI":"10.1109/ICRA.2019.8793768","author":[{"family":"Petschnigg","given":"Christina"},{"family":"Brandstötter","given":"Mathias"},{"family":"Pichler","given":"Horst"},{"family":"Hofbaur","given":"Michael W."},{"family":"Dieber","given":"Bernhard"}],"container-title":"Proceedings of the 2019 international conference on robotics and automation (ICRA)","id":"Petschnigg2019","issued":{"date-parts":[[2019]]},"page":"803-810","publisher":"IEEE","publisher-place":"Piscataway, NJ, USA","title":"Quantum computation in robotic science and applications","type":"paper-conference"},"suppress-author":false}],"isEdited":false,"manualOverride":{"citeprocText":"Petschnigg et al. (2019)","isManuallyOverridden":false,"manualOverrideText":""},"mendeley":{"formattedCitation":"Petschnigg et al. (2019)","plainTextFormattedCitation":"Petschnigg et al. (2019)","previouslyFormattedCitation":"Petschnigg et al. (2019)"},"properties":{"noteIndex":0},"schema":"https://github.com/citation-style-language/schema/raw/master/csl-citation.json"}</w:instrText>
       </w:r>
       <w:r>
         <w:fldChar w:fldCharType="separate"/>
@@ -11941,7 +11491,7 @@
         <w:fldChar w:fldCharType="begin"/>
       </w:r>
       <w:r>
-        <w:instrText xml:space="preserve">ADDIN CSL_CITATION {"citationID":"MENDELEY_CITATION_217","citationItems":[{"id":"ITEM-217","isTemporary":false,"itemData":{"DOI":"10.1109/ASE63991.2025.00306","author":[{"family":"Wang","given":"Xinyi"},{"family":"Arcaini","given":"Paolo"},{"family":"Ali","given":"Shaukat"},{"family":"Xu","given":"Qinghua"},{"family":"Peyrucain","given":"Thomas"}],"container-title":"Proceedings of the 40th IEEE/ACM international conference on automated software engineering (ASE)","id":"Wang2025","issued":{"date-parts":[[2025]]},"publisher":"IEEE","title":"Quantum machine learning-based test oracle for autonomous mobile robots","type":"paper-conference"},"suppress-author":false}],"isEdited":false,"manualOverride":{"citeprocText":"Xinyi Wang et al. (2025)","isManuallyOverridden":false,"manualOverrideText":""},"mendeley":{"formattedCitation":"Xinyi Wang et al. (2025)","plainTextFormattedCitation":"Xinyi Wang et al. (2025)","previouslyFormattedCitation":"Xinyi Wang et al. (2025)"},"properties":{"noteIndex":0},"schema":"https://github.com/citation-style-language/schema/raw/master/csl-citation.json"}</w:instrText>
+        <w:instrText xml:space="preserve">ADDIN CSL_CITATION {"citationID":"MENDELEY_CITATION_217","citationItems":[{"id":"ITEM-217","isTemporary":false,"itemData":{"DOI":"10.1109/ASE63991.2025.00306","author":[{"family":"Wang","given":"Xinyi"},{"family":"Arcaini","given":"Paolo"},{"family":"Ali","given":"Shaukat"},{"family":"Xu","given":"Qinghua"},{"family":"Peyrucain","given":"Thomas"}],"container-title":"Proceedings of the 40th IEEE/ACM international conference on automated software engineering (ASE)","id":"Wang2025","issued":{"date-parts":[[2025]]},"publisher":"IEEE","publisher-place":"Piscataway, NJ, USA","title":"Quantum machine learning-based test oracle for autonomous mobile robots","type":"paper-conference"},"suppress-author":false}],"isEdited":false,"manualOverride":{"citeprocText":"Xinyi Wang et al. (2025)","isManuallyOverridden":false,"manualOverrideText":""},"mendeley":{"formattedCitation":"Xinyi Wang et al. (2025)","plainTextFormattedCitation":"Xinyi Wang et al. (2025)","previouslyFormattedCitation":"Xinyi Wang et al. (2025)"},"properties":{"noteIndex":0},"schema":"https://github.com/citation-style-language/schema/raw/master/csl-citation.json"}</w:instrText>
       </w:r>
       <w:r>
         <w:fldChar w:fldCharType="separate"/>
@@ -12325,7 +11875,7 @@
         <w:fldChar w:fldCharType="begin"/>
       </w:r>
       <w:r>
-        <w:instrText xml:space="preserve">ADDIN CSL_CITATION {"citationID":"MENDELEY_CITATION_234","citationItems":[{"id":"ITEM-234","isTemporary":false,"itemData":{"URL":"https://proceedings.neurips.cc/paper/2021/hash/eec96a7f788e88184c0e713456026f3f-Abstract.html","author":[{"family":"Jerbi","given":"Sofiene"},{"family":"Gyurik","given":"Casper F. S."},{"family":"Marshall","given":"Simon C."},{"family":"Briegel","given":"Hans J."},{"family":"Dunjko","given":"Vedran"}],"container-title":"Advances in neural information processing systems","id":"Jerbi2021","issued":{"date-parts":[[2021]]},"page":"28362-28375","title":"Parametrized quantum policies for reinforcement learning","type":"paper-conference","volume":"34"}}],"isEdited":false,"manualOverride":{"citeprocText":"(Jerbi et al. 2021)","isManuallyOverridden":false,"manualOverrideText":""},"mendeley":{"formattedCitation":"(Jerbi et al. 2021)","plainTextFormattedCitation":"(Jerbi et al. 2021)","previouslyFormattedCitation":"(Jerbi et al. 2021)"},"properties":{"noteIndex":0},"schema":"https://github.com/citation-style-language/schema/raw/master/csl-citation.json"}</w:instrText>
+        <w:instrText xml:space="preserve">ADDIN CSL_CITATION {"citationID":"MENDELEY_CITATION_234","citationItems":[{"id":"ITEM-234","isTemporary":false,"itemData":{"URL":"https://proceedings.neurips.cc/paper/2021/hash/eec96a7f788e88184c0e713456026f3f-Abstract.html","author":[{"family":"Jerbi","given":"Sofiene"},{"family":"Gyurik","given":"Casper F. S."},{"family":"Marshall","given":"Simon C."},{"family":"Briegel","given":"Hans J."},{"family":"Dunjko","given":"Vedran"}],"container-title":"Advances in neural information processing systems","id":"Jerbi2021","issued":{"date-parts":[[2021]]},"page":"28362-28375","publisher":"Curran Associates, Inc.","publisher-place":"Red Hook, NY, USA","title":"Parametrized quantum policies for reinforcement learning","type":"paper-conference","volume":"34"}}],"isEdited":false,"manualOverride":{"citeprocText":"(Jerbi et al. 2021)","isManuallyOverridden":false,"manualOverrideText":""},"mendeley":{"formattedCitation":"(Jerbi et al. 2021)","plainTextFormattedCitation":"(Jerbi et al. 2021)","previouslyFormattedCitation":"(Jerbi et al. 2021)"},"properties":{"noteIndex":0},"schema":"https://github.com/citation-style-language/schema/raw/master/csl-citation.json"}</w:instrText>
       </w:r>
       <w:r>
         <w:fldChar w:fldCharType="separate"/>
@@ -12361,7 +11911,7 @@
         <w:fldChar w:fldCharType="begin"/>
       </w:r>
       <w:r>
-        <w:instrText xml:space="preserve">ADDIN CSL_CITATION {"citationID":"MENDELEY_CITATION_236","citationItems":[{"id":"ITEM-236","isTemporary":false,"itemData":{"DOI":"10.1109/ICDCS54860.2022.00151","author":[{"family":"Yun","given":"Won Joon"},{"family":"Kwak","given":"Yunseok"},{"family":"Kim","given":"Jae Pyoung"},{"family":"Cho","given":"Hyunhee"},{"family":"Jung","given":"Soyi"},{"family":"Park","given":"Jihong"},{"family":"Kim","given":"Joongheon"}],"container-title":"Proceedings of the 2022 IEEE 42nd international conference on distributed computing systems (ICDCS)","id":"Yun2022","issued":{"date-parts":[[2022]]},"page":"1332-1335","publisher":"IEEE","title":"Quantum multi-agent reinforcement learning via variational quantum circuit design","type":"paper-conference"}}],"isEdited":false,"manualOverride":{"citeprocText":"(Yun et al. 2022)","isManuallyOverridden":false,"manualOverrideText":""},"mendeley":{"formattedCitation":"(Yun et al. 2022)","plainTextFormattedCitation":"(Yun et al. 2022)","previouslyFormattedCitation":"(Yun et al. 2022)"},"properties":{"noteIndex":0},"schema":"https://github.com/citation-style-language/schema/raw/master/csl-citation.json"}</w:instrText>
+        <w:instrText xml:space="preserve">ADDIN CSL_CITATION {"citationID":"MENDELEY_CITATION_236","citationItems":[{"id":"ITEM-236","isTemporary":false,"itemData":{"DOI":"10.1109/ICDCS54860.2022.00151","author":[{"family":"Yun","given":"Won Joon"},{"family":"Kwak","given":"Yunseok"},{"family":"Kim","given":"Jae Pyoung"},{"family":"Cho","given":"Hyunhee"},{"family":"Jung","given":"Soyi"},{"family":"Park","given":"Jihong"},{"family":"Kim","given":"Joongheon"}],"container-title":"Proceedings of the 2022 IEEE 42nd international conference on distributed computing systems (ICDCS)","id":"Yun2022","issued":{"date-parts":[[2022]]},"page":"1332-1335","publisher":"IEEE","publisher-place":"Piscataway, NJ, USA","title":"Quantum multi-agent reinforcement learning via variational quantum circuit design","type":"paper-conference"}}],"isEdited":false,"manualOverride":{"citeprocText":"(Yun et al. 2022)","isManuallyOverridden":false,"manualOverrideText":""},"mendeley":{"formattedCitation":"(Yun et al. 2022)","plainTextFormattedCitation":"(Yun et al. 2022)","previouslyFormattedCitation":"(Yun et al. 2022)"},"properties":{"noteIndex":0},"schema":"https://github.com/citation-style-language/schema/raw/master/csl-citation.json"}</w:instrText>
       </w:r>
       <w:r>
         <w:fldChar w:fldCharType="separate"/>
@@ -12379,7 +11929,7 @@
         <w:fldChar w:fldCharType="begin"/>
       </w:r>
       <w:r>
-        <w:instrText xml:space="preserve">ADDIN CSL_CITATION {"citationID":"MENDELEY_CITATION_237","citationItems":[{"id":"ITEM-237","isTemporary":false,"itemData":{"DOI":"10.5220/0012353100003636","author":[{"family":"Kruse","given":"Georg"},{"family":"Drăgan","given":"Theodora-Augustina"},{"family":"Wille","given":"Robert"},{"family":"Lorenz","given":"Jeanette Miriam"}],"container-title":"Proceedings of the 16th international conference on agents and artificial intelligence (ICAART)","id":"Kruse2024","issued":{"date-parts":[[2024]]},"page":"393-400","title":"Variational quantum circuit design for quantum reinforcement learning on continuous environments","type":"paper-conference"}}],"isEdited":false,"manualOverride":{"citeprocText":"(Kruse et al. 2024)","isManuallyOverridden":false,"manualOverrideText":""},"mendeley":{"formattedCitation":"(Kruse et al. 2024)","plainTextFormattedCitation":"(Kruse et al. 2024)","previouslyFormattedCitation":"(Kruse et al. 2024)"},"properties":{"noteIndex":0},"schema":"https://github.com/citation-style-language/schema/raw/master/csl-citation.json"}</w:instrText>
+        <w:instrText xml:space="preserve">ADDIN CSL_CITATION {"citationID":"MENDELEY_CITATION_237","citationItems":[{"id":"ITEM-237","isTemporary":false,"itemData":{"DOI":"10.5220/0012353100003636","author":[{"family":"Kruse","given":"Georg"},{"family":"Drăgan","given":"Theodora-Augustina"},{"family":"Wille","given":"Robert"},{"family":"Lorenz","given":"Jeanette Miriam"}],"container-title":"Proceedings of the 16th international conference on agents and artificial intelligence (ICAART)","id":"Kruse2024","issued":{"date-parts":[[2024]]},"page":"393-400","publisher":"SciTePress","publisher-place":"Setúbal, Portugal","title":"Variational quantum circuit design for quantum reinforcement learning on continuous environments","type":"paper-conference"}}],"isEdited":false,"manualOverride":{"citeprocText":"(Kruse et al. 2024)","isManuallyOverridden":false,"manualOverrideText":""},"mendeley":{"formattedCitation":"(Kruse et al. 2024)","plainTextFormattedCitation":"(Kruse et al. 2024)","previouslyFormattedCitation":"(Kruse et al. 2024)"},"properties":{"noteIndex":0},"schema":"https://github.com/citation-style-language/schema/raw/master/csl-citation.json"}</w:instrText>
       </w:r>
       <w:r>
         <w:fldChar w:fldCharType="separate"/>
@@ -12507,7 +12057,7 @@
         <w:fldChar w:fldCharType="begin"/>
       </w:r>
       <w:r>
-        <w:instrText xml:space="preserve">ADDIN CSL_CITATION {"citationID":"MENDELEY_CITATION_240","citationItems":[{"id":"ITEM-240","isTemporary":false,"itemData":{"DOI":"10.5220/0013371800003890","ISBN":"978-989-758-737-5","author":[{"family":"Drăgan","given":"Theodora-Augustina"},{"family":"Künzner","given":"Alexander"},{"family":"Wille","given":"Robert"},{"family":"Lorenz","given":"Jeanette Miriam"}],"container-title":"Proceedings of the 17th international conference on agents and artificial intelligence (ICAART 2025)","id":"Dragan2025","issued":{"date-parts":[[2025]]},"page":"807-814","publisher":"SciTePress","title":"Continuous quantum reinforcement learning for robot navigation","type":"paper-conference","volume":"1"},"suppress-author":false}],"isEdited":false,"manualOverride":{"citeprocText":"Drăgan et al. (2025)","isManuallyOverridden":false,"manualOverrideText":""},"mendeley":{"formattedCitation":"Drăgan et al. (2025)","plainTextFormattedCitation":"Drăgan et al. (2025)","previouslyFormattedCitation":"Drăgan et al. (2025)"},"properties":{"noteIndex":0},"schema":"https://github.com/citation-style-language/schema/raw/master/csl-citation.json"}</w:instrText>
+        <w:instrText xml:space="preserve">ADDIN CSL_CITATION {"citationID":"MENDELEY_CITATION_240","citationItems":[{"id":"ITEM-240","isTemporary":false,"itemData":{"DOI":"10.5220/0013371800003890","ISBN":"978-989-758-737-5","author":[{"family":"Drăgan","given":"Theodora-Augustina"},{"family":"Künzner","given":"Alexander"},{"family":"Wille","given":"Robert"},{"family":"Lorenz","given":"Jeanette Miriam"}],"container-title":"Proceedings of the 17th international conference on agents and artificial intelligence (ICAART 2025)","id":"Dragan2025","issued":{"date-parts":[[2025]]},"page":"807-814","publisher":"SciTePress","publisher-place":"Setúbal, Portugal","title":"Continuous quantum reinforcement learning for robot navigation","type":"paper-conference","volume":"1"},"suppress-author":false}],"isEdited":false,"manualOverride":{"citeprocText":"Drăgan et al. (2025)","isManuallyOverridden":false,"manualOverrideText":""},"mendeley":{"formattedCitation":"Drăgan et al. (2025)","plainTextFormattedCitation":"Drăgan et al. (2025)","previouslyFormattedCitation":"Drăgan et al. (2025)"},"properties":{"noteIndex":0},"schema":"https://github.com/citation-style-language/schema/raw/master/csl-citation.json"}</w:instrText>
       </w:r>
       <w:r>
         <w:fldChar w:fldCharType="separate"/>
@@ -12972,7 +12522,7 @@
         <w:fldChar w:fldCharType="begin"/>
       </w:r>
       <w:r>
-        <w:instrText xml:space="preserve">ADDIN CSL_CITATION {"citationID":"MENDELEY_CITATION_251","citationItems":[{"id":"ITEM-251","isTemporary":false,"itemData":{"DOI":"10.5220/0013371800003890","ISBN":"978-989-758-737-5","author":[{"family":"Drăgan","given":"Theodora-Augustina"},{"family":"Künzner","given":"Alexander"},{"family":"Wille","given":"Robert"},{"family":"Lorenz","given":"Jeanette Miriam"}],"container-title":"Proceedings of the 17th international conference on agents and artificial intelligence (ICAART 2025)","id":"Dragan2025","issued":{"date-parts":[[2025]]},"page":"807-814","publisher":"SciTePress","title":"Continuous quantum reinforcement learning for robot navigation","type":"paper-conference","volume":"1"},"suppress-author":false}],"isEdited":false,"manualOverride":{"citeprocText":"Drăgan et al. (2025)","isManuallyOverridden":false,"manualOverrideText":""},"mendeley":{"formattedCitation":"Drăgan et al. (2025)","plainTextFormattedCitation":"Drăgan et al. (2025)","previouslyFormattedCitation":"Drăgan et al. (2025)"},"properties":{"noteIndex":0},"schema":"https://github.com/citation-style-language/schema/raw/master/csl-citation.json"}</w:instrText>
+        <w:instrText xml:space="preserve">ADDIN CSL_CITATION {"citationID":"MENDELEY_CITATION_251","citationItems":[{"id":"ITEM-251","isTemporary":false,"itemData":{"DOI":"10.5220/0013371800003890","ISBN":"978-989-758-737-5","author":[{"family":"Drăgan","given":"Theodora-Augustina"},{"family":"Künzner","given":"Alexander"},{"family":"Wille","given":"Robert"},{"family":"Lorenz","given":"Jeanette Miriam"}],"container-title":"Proceedings of the 17th international conference on agents and artificial intelligence (ICAART 2025)","id":"Dragan2025","issued":{"date-parts":[[2025]]},"page":"807-814","publisher":"SciTePress","publisher-place":"Setúbal, Portugal","title":"Continuous quantum reinforcement learning for robot navigation","type":"paper-conference","volume":"1"},"suppress-author":false}],"isEdited":false,"manualOverride":{"citeprocText":"Drăgan et al. (2025)","isManuallyOverridden":false,"manualOverrideText":""},"mendeley":{"formattedCitation":"Drăgan et al. (2025)","plainTextFormattedCitation":"Drăgan et al. (2025)","previouslyFormattedCitation":"Drăgan et al. (2025)"},"properties":{"noteIndex":0},"schema":"https://github.com/citation-style-language/schema/raw/master/csl-citation.json"}</w:instrText>
       </w:r>
       <w:r>
         <w:fldChar w:fldCharType="separate"/>
@@ -13186,7 +12736,7 @@
         <w:fldChar w:fldCharType="begin"/>
       </w:r>
       <w:r>
-        <w:instrText xml:space="preserve">ADDIN CSL_CITATION {"citationID":"MENDELEY_CITATION_260","citationItems":[{"id":"ITEM-257","isTemporary":false,"itemData":{"DOI":"10.1109/ACCESS.2024.3417808","author":[{"family":"Hohenfeld","given":"Hans"},{"family":"Heimann","given":"Dirk"},{"family":"Wiebe","given":"Felix"},{"family":"Kirchner","given":"Frank"}],"container-title":"IEEE Access","id":"Hohenfeld2024","issued":{"date-parts":[[2024]]},"page":"87217-87236","publisher":"IEEE","title":"Quantum deep reinforcement learning for robot navigation tasks","type":"article-journal","volume":"12"}},{"id":"ITEM-258","isTemporary":false,"itemData":{"URL":"https://arxiv.org/abs/2212.11681","author":[{"family":"Acuto","given":"Alberto"},{"family":"Barillà","given":"Paola"},{"family":"Bozzolo","given":"Ludovico"},{"family":"Conterno","given":"Matteo"},{"family":"Pavese","given":"Mattia"},{"family":"Policicchio","given":"Antonio"}],"id":"Acuto2022","issued":{"date-parts":[[2022]]},"title":"Variational quantum soft actor-critic for robotic arm control","type":""}},{"id":"ITEM-259","isTemporary":false,"itemData":{"DOI":"10.5220/0013371800003890","ISBN":"978-989-758-737-5","author":[{"family":"Drăgan","given":"Theodora-Augustina"},{"family":"Künzner","given":"Alexander"},{"family":"Wille","given":"Robert"},{"family":"Lorenz","given":"Jeanette Miriam"}],"container-title":"Proceedings of the 17th international conference on agents and artificial intelligence (ICAART 2025)","id":"Dragan2025","issued":{"date-parts":[[2025]]},"page":"807-814","publisher":"SciTePress","title":"Continuous quantum reinforcement learning for robot navigation","type":"paper-conference","volume":"1"}},{"id":"ITEM-260","isTemporary":false,"itemData":{"DOI":"10.48550/arXiv.2509.11388","URL":"https://arxiv.org/abs/2509.11388","author":[{"family":"Lokossou","given":"Romerik"},{"family":"Girma","given":"Birhanu Shimelis"},{"family":"Tonguz","given":"Ozan K."},{"family":"Biyabani","given":"Ahmed"}],"id":"Lokossou2025","issued":{"date-parts":[[2025]]},"title":"Quantum deep reinforcement learning for humanoid robot navigation task","type":""}}],"isEdited":false,"manualOverride":{"citeprocText":"(Hohenfeld et al. 2024; Acuto et al. 2022; Drăgan et al. 2025; Lokossou et al. 2025)","isManuallyOverridden":false,"manualOverrideText":""},"mendeley":{"formattedCitation":"(Hohenfeld et al. 2024; Acuto et al. 2022; Drăgan et al. 2025; Lokossou et al. 2025)","plainTextFormattedCitation":"(Hohenfeld et al. 2024; Acuto et al. 2022; Drăgan et al. 2025; Lokossou et al. 2025)","previouslyFormattedCitation":"(Hohenfeld et al. 2024; Acuto et al. 2022; Drăgan et al. 2025; Lokossou et al. 2025)"},"properties":{"noteIndex":0},"schema":"https://github.com/citation-style-language/schema/raw/master/csl-citation.json"}</w:instrText>
+        <w:instrText xml:space="preserve">ADDIN CSL_CITATION {"citationID":"MENDELEY_CITATION_260","citationItems":[{"id":"ITEM-257","isTemporary":false,"itemData":{"DOI":"10.1109/ACCESS.2024.3417808","author":[{"family":"Hohenfeld","given":"Hans"},{"family":"Heimann","given":"Dirk"},{"family":"Wiebe","given":"Felix"},{"family":"Kirchner","given":"Frank"}],"container-title":"IEEE Access","id":"Hohenfeld2024","issued":{"date-parts":[[2024]]},"page":"87217-87236","publisher":"IEEE","title":"Quantum deep reinforcement learning for robot navigation tasks","type":"article-journal","volume":"12"}},{"id":"ITEM-258","isTemporary":false,"itemData":{"URL":"https://arxiv.org/abs/2212.11681","author":[{"family":"Acuto","given":"Alberto"},{"family":"Barillà","given":"Paola"},{"family":"Bozzolo","given":"Ludovico"},{"family":"Conterno","given":"Matteo"},{"family":"Pavese","given":"Mattia"},{"family":"Policicchio","given":"Antonio"}],"id":"Acuto2022","issued":{"date-parts":[[2022]]},"title":"Variational quantum soft actor-critic for robotic arm control","type":""}},{"id":"ITEM-259","isTemporary":false,"itemData":{"DOI":"10.5220/0013371800003890","ISBN":"978-989-758-737-5","author":[{"family":"Drăgan","given":"Theodora-Augustina"},{"family":"Künzner","given":"Alexander"},{"family":"Wille","given":"Robert"},{"family":"Lorenz","given":"Jeanette Miriam"}],"container-title":"Proceedings of the 17th international conference on agents and artificial intelligence (ICAART 2025)","id":"Dragan2025","issued":{"date-parts":[[2025]]},"page":"807-814","publisher":"SciTePress","publisher-place":"Setúbal, Portugal","title":"Continuous quantum reinforcement learning for robot navigation","type":"paper-conference","volume":"1"}},{"id":"ITEM-260","isTemporary":false,"itemData":{"DOI":"10.48550/arXiv.2509.11388","URL":"https://arxiv.org/abs/2509.11388","author":[{"family":"Lokossou","given":"Romerik"},{"family":"Girma","given":"Birhanu Shimelis"},{"family":"Tonguz","given":"Ozan K."},{"family":"Biyabani","given":"Ahmed"}],"id":"Lokossou2025","issued":{"date-parts":[[2025]]},"title":"Quantum deep reinforcement learning for humanoid robot navigation task","type":""}}],"isEdited":false,"manualOverride":{"citeprocText":"(Hohenfeld et al. 2024; Acuto et al. 2022; Drăgan et al. 2025; Lokossou et al. 2025)","isManuallyOverridden":false,"manualOverrideText":""},"mendeley":{"formattedCitation":"(Hohenfeld et al. 2024; Acuto et al. 2022; Drăgan et al. 2025; Lokossou et al. 2025)","plainTextFormattedCitation":"(Hohenfeld et al. 2024; Acuto et al. 2022; Drăgan et al. 2025; Lokossou et al. 2025)","previouslyFormattedCitation":"(Hohenfeld et al. 2024; Acuto et al. 2022; Drăgan et al. 2025; Lokossou et al. 2025)"},"properties":{"noteIndex":0},"schema":"https://github.com/citation-style-language/schema/raw/master/csl-citation.json"}</w:instrText>
       </w:r>
       <w:r>
         <w:fldChar w:fldCharType="separate"/>
@@ -13222,7 +12772,7 @@
         <w:fldChar w:fldCharType="begin"/>
       </w:r>
       <w:r>
-        <w:instrText xml:space="preserve">ADDIN CSL_CITATION {"citationID":"MENDELEY_CITATION_263","citationItems":[{"id":"ITEM-262","isTemporary":false,"itemData":{"DOI":"10.1109/ACCESS.2024.3417808","author":[{"family":"Hohenfeld","given":"Hans"},{"family":"Heimann","given":"Dirk"},{"family":"Wiebe","given":"Felix"},{"family":"Kirchner","given":"Frank"}],"container-title":"IEEE Access","id":"Hohenfeld2024","issued":{"date-parts":[[2024]]},"page":"87217-87236","publisher":"IEEE","title":"Quantum deep reinforcement learning for robot navigation tasks","type":"article-journal","volume":"12"}},{"id":"ITEM-263","isTemporary":false,"itemData":{"DOI":"10.5220/0013371800003890","ISBN":"978-989-758-737-5","author":[{"family":"Drăgan","given":"Theodora-Augustina"},{"family":"Künzner","given":"Alexander"},{"family":"Wille","given":"Robert"},{"family":"Lorenz","given":"Jeanette Miriam"}],"container-title":"Proceedings of the 17th international conference on agents and artificial intelligence (ICAART 2025)","id":"Dragan2025","issued":{"date-parts":[[2025]]},"page":"807-814","publisher":"SciTePress","title":"Continuous quantum reinforcement learning for robot navigation","type":"paper-conference","volume":"1"}}],"isEdited":false,"manualOverride":{"citeprocText":"(Hohenfeld et al. 2024; Drăgan et al. 2025)","isManuallyOverridden":false,"manualOverrideText":""},"mendeley":{"formattedCitation":"(Hohenfeld et al. 2024; Drăgan et al. 2025)","plainTextFormattedCitation":"(Hohenfeld et al. 2024; Drăgan et al. 2025)","previouslyFormattedCitation":"(Hohenfeld et al. 2024; Drăgan et al. 2025)"},"properties":{"noteIndex":0},"schema":"https://github.com/citation-style-language/schema/raw/master/csl-citation.json"}</w:instrText>
+        <w:instrText xml:space="preserve">ADDIN CSL_CITATION {"citationID":"MENDELEY_CITATION_263","citationItems":[{"id":"ITEM-262","isTemporary":false,"itemData":{"DOI":"10.1109/ACCESS.2024.3417808","author":[{"family":"Hohenfeld","given":"Hans"},{"family":"Heimann","given":"Dirk"},{"family":"Wiebe","given":"Felix"},{"family":"Kirchner","given":"Frank"}],"container-title":"IEEE Access","id":"Hohenfeld2024","issued":{"date-parts":[[2024]]},"page":"87217-87236","publisher":"IEEE","title":"Quantum deep reinforcement learning for robot navigation tasks","type":"article-journal","volume":"12"}},{"id":"ITEM-263","isTemporary":false,"itemData":{"DOI":"10.5220/0013371800003890","ISBN":"978-989-758-737-5","author":[{"family":"Drăgan","given":"Theodora-Augustina"},{"family":"Künzner","given":"Alexander"},{"family":"Wille","given":"Robert"},{"family":"Lorenz","given":"Jeanette Miriam"}],"container-title":"Proceedings of the 17th international conference on agents and artificial intelligence (ICAART 2025)","id":"Dragan2025","issued":{"date-parts":[[2025]]},"page":"807-814","publisher":"SciTePress","publisher-place":"Setúbal, Portugal","title":"Continuous quantum reinforcement learning for robot navigation","type":"paper-conference","volume":"1"}}],"isEdited":false,"manualOverride":{"citeprocText":"(Hohenfeld et al. 2024; Drăgan et al. 2025)","isManuallyOverridden":false,"manualOverrideText":""},"mendeley":{"formattedCitation":"(Hohenfeld et al. 2024; Drăgan et al. 2025)","plainTextFormattedCitation":"(Hohenfeld et al. 2024; Drăgan et al. 2025)","previouslyFormattedCitation":"(Hohenfeld et al. 2024; Drăgan et al. 2025)"},"properties":{"noteIndex":0},"schema":"https://github.com/citation-style-language/schema/raw/master/csl-citation.json"}</w:instrText>
       </w:r>
       <w:r>
         <w:fldChar w:fldCharType="separate"/>
@@ -13240,7 +12790,7 @@
         <w:fldChar w:fldCharType="begin"/>
       </w:r>
       <w:r>
-        <w:instrText xml:space="preserve">ADDIN CSL_CITATION {"citationID":"MENDELEY_CITATION_264","citationItems":[{"id":"ITEM-264","isTemporary":false,"itemData":{"URL":"https://proceedings.neurips.cc/paper/2021/hash/eec96a7f788e88184c0e713456026f3f-Abstract.html","author":[{"family":"Jerbi","given":"Sofiene"},{"family":"Gyurik","given":"Casper F. S."},{"family":"Marshall","given":"Simon C."},{"family":"Briegel","given":"Hans J."},{"family":"Dunjko","given":"Vedran"}],"container-title":"Advances in neural information processing systems","id":"Jerbi2021","issued":{"date-parts":[[2021]]},"page":"28362-28375","title":"Parametrized quantum policies for reinforcement learning","type":"paper-conference","volume":"34"}}],"isEdited":false,"manualOverride":{"citeprocText":"(Jerbi et al. 2021)","isManuallyOverridden":false,"manualOverrideText":""},"mendeley":{"formattedCitation":"(Jerbi et al. 2021)","plainTextFormattedCitation":"(Jerbi et al. 2021)","previouslyFormattedCitation":"(Jerbi et al. 2021)"},"properties":{"noteIndex":0},"schema":"https://github.com/citation-style-language/schema/raw/master/csl-citation.json"}</w:instrText>
+        <w:instrText xml:space="preserve">ADDIN CSL_CITATION {"citationID":"MENDELEY_CITATION_264","citationItems":[{"id":"ITEM-264","isTemporary":false,"itemData":{"URL":"https://proceedings.neurips.cc/paper/2021/hash/eec96a7f788e88184c0e713456026f3f-Abstract.html","author":[{"family":"Jerbi","given":"Sofiene"},{"family":"Gyurik","given":"Casper F. S."},{"family":"Marshall","given":"Simon C."},{"family":"Briegel","given":"Hans J."},{"family":"Dunjko","given":"Vedran"}],"container-title":"Advances in neural information processing systems","id":"Jerbi2021","issued":{"date-parts":[[2021]]},"page":"28362-28375","publisher":"Curran Associates, Inc.","publisher-place":"Red Hook, NY, USA","title":"Parametrized quantum policies for reinforcement learning","type":"paper-conference","volume":"34"}}],"isEdited":false,"manualOverride":{"citeprocText":"(Jerbi et al. 2021)","isManuallyOverridden":false,"manualOverrideText":""},"mendeley":{"formattedCitation":"(Jerbi et al. 2021)","plainTextFormattedCitation":"(Jerbi et al. 2021)","previouslyFormattedCitation":"(Jerbi et al. 2021)"},"properties":{"noteIndex":0},"schema":"https://github.com/citation-style-language/schema/raw/master/csl-citation.json"}</w:instrText>
       </w:r>
       <w:r>
         <w:fldChar w:fldCharType="separate"/>
@@ -13302,7 +12852,7 @@
         <w:fldChar w:fldCharType="begin"/>
       </w:r>
       <w:r>
-        <w:instrText xml:space="preserve">ADDIN CSL_CITATION {"citationID":"MENDELEY_CITATION_267","citationItems":[{"id":"ITEM-267","isTemporary":false,"itemData":{"DOI":"10.1109/ASE63991.2025.00306","author":[{"family":"Wang","given":"Xinyi"},{"family":"Arcaini","given":"Paolo"},{"family":"Ali","given":"Shaukat"},{"family":"Xu","given":"Qinghua"},{"family":"Peyrucain","given":"Thomas"}],"container-title":"Proceedings of the 40th IEEE/ACM international conference on automated software engineering (ASE)","id":"Wang2025","issued":{"date-parts":[[2025]]},"publisher":"IEEE","title":"Quantum machine learning-based test oracle for autonomous mobile robots","type":"paper-conference"}}],"isEdited":false,"manualOverride":{"citeprocText":"(Xinyi Wang et al. 2025)","isManuallyOverridden":false,"manualOverrideText":""},"mendeley":{"formattedCitation":"(Xinyi Wang et al. 2025)","plainTextFormattedCitation":"(Xinyi Wang et al. 2025)","previouslyFormattedCitation":"(Xinyi Wang et al. 2025)"},"properties":{"noteIndex":0},"schema":"https://github.com/citation-style-language/schema/raw/master/csl-citation.json"}</w:instrText>
+        <w:instrText xml:space="preserve">ADDIN CSL_CITATION {"citationID":"MENDELEY_CITATION_267","citationItems":[{"id":"ITEM-267","isTemporary":false,"itemData":{"DOI":"10.1109/ASE63991.2025.00306","author":[{"family":"Wang","given":"Xinyi"},{"family":"Arcaini","given":"Paolo"},{"family":"Ali","given":"Shaukat"},{"family":"Xu","given":"Qinghua"},{"family":"Peyrucain","given":"Thomas"}],"container-title":"Proceedings of the 40th IEEE/ACM international conference on automated software engineering (ASE)","id":"Wang2025","issued":{"date-parts":[[2025]]},"publisher":"IEEE","publisher-place":"Piscataway, NJ, USA","title":"Quantum machine learning-based test oracle for autonomous mobile robots","type":"paper-conference"}}],"isEdited":false,"manualOverride":{"citeprocText":"(Xinyi Wang et al. 2025)","isManuallyOverridden":false,"manualOverrideText":""},"mendeley":{"formattedCitation":"(Xinyi Wang et al. 2025)","plainTextFormattedCitation":"(Xinyi Wang et al. 2025)","previouslyFormattedCitation":"(Xinyi Wang et al. 2025)"},"properties":{"noteIndex":0},"schema":"https://github.com/citation-style-language/schema/raw/master/csl-citation.json"}</w:instrText>
       </w:r>
       <w:r>
         <w:fldChar w:fldCharType="separate"/>
@@ -13320,7 +12870,7 @@
         <w:fldChar w:fldCharType="begin"/>
       </w:r>
       <w:r>
-        <w:instrText xml:space="preserve">ADDIN CSL_CITATION {"citationID":"MENDELEY_CITATION_272","citationItems":[{"id":"ITEM-268","isTemporary":false,"itemData":{"DOI":"10.1109/ACCESS.2024.3417808","author":[{"family":"Hohenfeld","given":"Hans"},{"family":"Heimann","given":"Dirk"},{"family":"Wiebe","given":"Felix"},{"family":"Kirchner","given":"Frank"}],"container-title":"IEEE Access","id":"Hohenfeld2024","issued":{"date-parts":[[2024]]},"page":"87217-87236","publisher":"IEEE","title":"Quantum deep reinforcement learning for robot navigation tasks","type":"article-journal","volume":"12"}},{"id":"ITEM-269","isTemporary":false,"itemData":{"DOI":"10.5220/0013371800003890","ISBN":"978-989-758-737-5","author":[{"family":"Drăgan","given":"Theodora-Augustina"},{"family":"Künzner","given":"Alexander"},{"family":"Wille","given":"Robert"},{"family":"Lorenz","given":"Jeanette Miriam"}],"container-title":"Proceedings of the 17th international conference on agents and artificial intelligence (ICAART 2025)","id":"Dragan2025","issued":{"date-parts":[[2025]]},"page":"807-814","publisher":"SciTePress","title":"Continuous quantum reinforcement learning for robot navigation","type":"paper-conference","volume":"1"}},{"id":"ITEM-270","isTemporary":false,"itemData":{"URL":"https://arxiv.org/abs/2212.11681","author":[{"family":"Acuto","given":"Alberto"},{"family":"Barillà","given":"Paola"},{"family":"Bozzolo","given":"Ludovico"},{"family":"Conterno","given":"Matteo"},{"family":"Pavese","given":"Mattia"},{"family":"Policicchio","given":"Antonio"}],"id":"Acuto2022","issued":{"date-parts":[[2022]]},"title":"Variational quantum soft actor-critic for robotic arm control","type":""}},{"id":"ITEM-271","isTemporary":false,"itemData":{"DOI":"10.48550/arXiv.2509.11388","URL":"https://arxiv.org/abs/2509.11388","author":[{"family":"Lokossou","given":"Romerik"},{"family":"Girma","given":"Birhanu Shimelis"},{"family":"Tonguz","given":"Ozan K."},{"family":"Biyabani","given":"Ahmed"}],"id":"Lokossou2025","issued":{"date-parts":[[2025]]},"title":"Quantum deep reinforcement learning for humanoid robot navigation task","type":""}},{"id":"ITEM-272","isTemporary":false,"itemData":{"DOI":"10.1007/s42484-024-00226-4","author":[{"family":"Sinha","given":"Akash"},{"family":"Macaluso","given":"Antonio"},{"family":"Klusch","given":"Matthias"}],"container-title":"Quantum Machine Intelligence","id":"Sinha2023","issued":{"date-parts":[[2025]]},"page":"19","publisher":"Springer","title":"Nav-Q: Quantum deep reinforcement learning for collision-free navigation of self-driving cars","title-short":"Nav-Q","type":"article-journal","volume":"7"}}],"isEdited":false,"manualOverride":{"citeprocText":"(Hohenfeld et al. 2024; Drăgan et al. 2025; Acuto et al. 2022; Lokossou et al. 2025; Sinha, Macaluso, and Klusch 2025)","isManuallyOverridden":false,"manualOverrideText":""},"mendeley":{"formattedCitation":"(Hohenfeld et al. 2024; Drăgan et al. 2025; Acuto et al. 2022; Lokossou et al. 2025; Sinha, Macaluso, and Klusch 2025)","plainTextFormattedCitation":"(Hohenfeld et al. 2024; Drăgan et al. 2025; Acuto et al. 2022; Lokossou et al. 2025; Sinha, Macaluso, and Klusch 2025)","previouslyFormattedCitation":"(Hohenfeld et al. 2024; Drăgan et al. 2025; Acuto et al. 2022; Lokossou et al. 2025; Sinha, Macaluso, and Klusch 2025)"},"properties":{"noteIndex":0},"schema":"https://github.com/citation-style-language/schema/raw/master/csl-citation.json"}</w:instrText>
+        <w:instrText xml:space="preserve">ADDIN CSL_CITATION {"citationID":"MENDELEY_CITATION_272","citationItems":[{"id":"ITEM-268","isTemporary":false,"itemData":{"DOI":"10.1109/ACCESS.2024.3417808","author":[{"family":"Hohenfeld","given":"Hans"},{"family":"Heimann","given":"Dirk"},{"family":"Wiebe","given":"Felix"},{"family":"Kirchner","given":"Frank"}],"container-title":"IEEE Access","id":"Hohenfeld2024","issued":{"date-parts":[[2024]]},"page":"87217-87236","publisher":"IEEE","title":"Quantum deep reinforcement learning for robot navigation tasks","type":"article-journal","volume":"12"}},{"id":"ITEM-269","isTemporary":false,"itemData":{"DOI":"10.5220/0013371800003890","ISBN":"978-989-758-737-5","author":[{"family":"Drăgan","given":"Theodora-Augustina"},{"family":"Künzner","given":"Alexander"},{"family":"Wille","given":"Robert"},{"family":"Lorenz","given":"Jeanette Miriam"}],"container-title":"Proceedings of the 17th international conference on agents and artificial intelligence (ICAART 2025)","id":"Dragan2025","issued":{"date-parts":[[2025]]},"page":"807-814","publisher":"SciTePress","publisher-place":"Setúbal, Portugal","title":"Continuous quantum reinforcement learning for robot navigation","type":"paper-conference","volume":"1"}},{"id":"ITEM-270","isTemporary":false,"itemData":{"URL":"https://arxiv.org/abs/2212.11681","author":[{"family":"Acuto","given":"Alberto"},{"family":"Barillà","given":"Paola"},{"family":"Bozzolo","given":"Ludovico"},{"family":"Conterno","given":"Matteo"},{"family":"Pavese","given":"Mattia"},{"family":"Policicchio","given":"Antonio"}],"id":"Acuto2022","issued":{"date-parts":[[2022]]},"title":"Variational quantum soft actor-critic for robotic arm control","type":""}},{"id":"ITEM-271","isTemporary":false,"itemData":{"DOI":"10.48550/arXiv.2509.11388","URL":"https://arxiv.org/abs/2509.11388","author":[{"family":"Lokossou","given":"Romerik"},{"family":"Girma","given":"Birhanu Shimelis"},{"family":"Tonguz","given":"Ozan K."},{"family":"Biyabani","given":"Ahmed"}],"id":"Lokossou2025","issued":{"date-parts":[[2025]]},"title":"Quantum deep reinforcement learning for humanoid robot navigation task","type":""}},{"id":"ITEM-272","isTemporary":false,"itemData":{"DOI":"10.1007/s42484-024-00226-4","author":[{"family":"Sinha","given":"Akash"},{"family":"Macaluso","given":"Antonio"},{"family":"Klusch","given":"Matthias"}],"container-title":"Quantum Machine Intelligence","id":"Sinha2023","issued":{"date-parts":[[2025]]},"page":"19","publisher":"Springer","title":"Nav-Q: Quantum deep reinforcement learning for collision-free navigation of self-driving cars","title-short":"Nav-Q","type":"article-journal","volume":"7"}}],"isEdited":false,"manualOverride":{"citeprocText":"(Hohenfeld et al. 2024; Drăgan et al. 2025; Acuto et al. 2022; Lokossou et al. 2025; Sinha, Macaluso, and Klusch 2025)","isManuallyOverridden":false,"manualOverrideText":""},"mendeley":{"formattedCitation":"(Hohenfeld et al. 2024; Drăgan et al. 2025; Acuto et al. 2022; Lokossou et al. 2025; Sinha, Macaluso, and Klusch 2025)","plainTextFormattedCitation":"(Hohenfeld et al. 2024; Drăgan et al. 2025; Acuto et al. 2022; Lokossou et al. 2025; Sinha, Macaluso, and Klusch 2025)","previouslyFormattedCitation":"(Hohenfeld et al. 2024; Drăgan et al. 2025; Acuto et al. 2022; Lokossou et al. 2025; Sinha, Macaluso, and Klusch 2025)"},"properties":{"noteIndex":0},"schema":"https://github.com/citation-style-language/schema/raw/master/csl-citation.json"}</w:instrText>
       </w:r>
       <w:r>
         <w:fldChar w:fldCharType="separate"/>
@@ -14581,7 +14131,7 @@
         <w:fldChar w:fldCharType="begin"/>
       </w:r>
       <w:r>
-        <w:instrText xml:space="preserve">ADDIN CSL_CITATION {"citationID":"MENDELEY_CITATION_321","citationItems":[{"id":"ITEM-320","isTemporary":false,"itemData":{"DOI":"10.1109/ACCESS.2024.3417808","author":[{"family":"Hohenfeld","given":"Hans"},{"family":"Heimann","given":"Dirk"},{"family":"Wiebe","given":"Felix"},{"family":"Kirchner","given":"Frank"}],"container-title":"IEEE Access","id":"Hohenfeld2024","issued":{"date-parts":[[2024]]},"page":"87217-87236","publisher":"IEEE","title":"Quantum deep reinforcement learning for robot navigation tasks","type":"article-journal","volume":"12"}},{"id":"ITEM-321","isTemporary":false,"itemData":{"DOI":"10.5220/0013371800003890","ISBN":"978-989-758-737-5","author":[{"family":"Drăgan","given":"Theodora-Augustina"},{"family":"Künzner","given":"Alexander"},{"family":"Wille","given":"Robert"},{"family":"Lorenz","given":"Jeanette Miriam"}],"container-title":"Proceedings of the 17th international conference on agents and artificial intelligence (ICAART 2025)","id":"Dragan2025","issued":{"date-parts":[[2025]]},"page":"807-814","publisher":"SciTePress","title":"Continuous quantum reinforcement learning for robot navigation","type":"paper-conference","volume":"1"}}],"isEdited":false,"manualOverride":{"citeprocText":"(Hohenfeld et al. 2024; Drăgan et al. 2025)","isManuallyOverridden":false,"manualOverrideText":""},"mendeley":{"formattedCitation":"(Hohenfeld et al. 2024; Drăgan et al. 2025)","plainTextFormattedCitation":"(Hohenfeld et al. 2024; Drăgan et al. 2025)","previouslyFormattedCitation":"(Hohenfeld et al. 2024; Drăgan et al. 2025)"},"properties":{"noteIndex":0},"schema":"https://github.com/citation-style-language/schema/raw/master/csl-citation.json"}</w:instrText>
+        <w:instrText xml:space="preserve">ADDIN CSL_CITATION {"citationID":"MENDELEY_CITATION_321","citationItems":[{"id":"ITEM-320","isTemporary":false,"itemData":{"DOI":"10.1109/ACCESS.2024.3417808","author":[{"family":"Hohenfeld","given":"Hans"},{"family":"Heimann","given":"Dirk"},{"family":"Wiebe","given":"Felix"},{"family":"Kirchner","given":"Frank"}],"container-title":"IEEE Access","id":"Hohenfeld2024","issued":{"date-parts":[[2024]]},"page":"87217-87236","publisher":"IEEE","title":"Quantum deep reinforcement learning for robot navigation tasks","type":"article-journal","volume":"12"}},{"id":"ITEM-321","isTemporary":false,"itemData":{"DOI":"10.5220/0013371800003890","ISBN":"978-989-758-737-5","author":[{"family":"Drăgan","given":"Theodora-Augustina"},{"family":"Künzner","given":"Alexander"},{"family":"Wille","given":"Robert"},{"family":"Lorenz","given":"Jeanette Miriam"}],"container-title":"Proceedings of the 17th international conference on agents and artificial intelligence (ICAART 2025)","id":"Dragan2025","issued":{"date-parts":[[2025]]},"page":"807-814","publisher":"SciTePress","publisher-place":"Setúbal, Portugal","title":"Continuous quantum reinforcement learning for robot navigation","type":"paper-conference","volume":"1"}}],"isEdited":false,"manualOverride":{"citeprocText":"(Hohenfeld et al. 2024; Drăgan et al. 2025)","isManuallyOverridden":false,"manualOverrideText":""},"mendeley":{"formattedCitation":"(Hohenfeld et al. 2024; Drăgan et al. 2025)","plainTextFormattedCitation":"(Hohenfeld et al. 2024; Drăgan et al. 2025)","previouslyFormattedCitation":"(Hohenfeld et al. 2024; Drăgan et al. 2025)"},"properties":{"noteIndex":0},"schema":"https://github.com/citation-style-language/schema/raw/master/csl-citation.json"}</w:instrText>
       </w:r>
       <w:r>
         <w:fldChar w:fldCharType="separate"/>
@@ -15053,7 +14603,7 @@
         <w:fldChar w:fldCharType="begin"/>
       </w:r>
       <w:r>
-        <w:instrText xml:space="preserve">ADDIN CSL_CITATION {"citationID":"MENDELEY_CITATION_345","citationItems":[{"id":"ITEM-345","isTemporary":false,"itemData":{"DOI":"10.1038/s41586-024-08449-y","author":[{"literal":"Google Quantum AI and Collaborators"}],"container-title":"Nature","id":"GoogleQAI2025","issued":{"date-parts":[[2025]]},"title":"Quantum error correction below the surface code threshold","type":"article-journal"}}],"isEdited":false,"manualOverride":{"citeprocText":"(Google Quantum AI and Collaborators 2025)","isManuallyOverridden":false,"manualOverrideText":""},"mendeley":{"formattedCitation":"(Google Quantum AI and Collaborators 2025)","plainTextFormattedCitation":"(Google Quantum AI and Collaborators 2025)","previouslyFormattedCitation":"(Google Quantum AI and Collaborators 2025)"},"properties":{"noteIndex":0},"schema":"https://github.com/citation-style-language/schema/raw/master/csl-citation.json"}</w:instrText>
+        <w:instrText xml:space="preserve">ADDIN CSL_CITATION {"citationID":"MENDELEY_CITATION_345","citationItems":[{"id":"ITEM-345","isTemporary":false,"itemData":{"DOI":"10.1038/s41586-024-08449-y","author":[{"literal":"Google Quantum AI and Collaborators"}],"container-title":"Nature","id":"GoogleQAI2025","issued":{"date-parts":[[2025]]},"page":"920-926","title":"Quantum error correction below the surface code threshold","type":"article-journal","volume":"638"}}],"isEdited":false,"manualOverride":{"citeprocText":"(Google Quantum AI and Collaborators 2025)","isManuallyOverridden":false,"manualOverrideText":""},"mendeley":{"formattedCitation":"(Google Quantum AI and Collaborators 2025)","plainTextFormattedCitation":"(Google Quantum AI and Collaborators 2025)","previouslyFormattedCitation":"(Google Quantum AI and Collaborators 2025)"},"properties":{"noteIndex":0},"schema":"https://github.com/citation-style-language/schema/raw/master/csl-citation.json"}</w:instrText>
       </w:r>
       <w:r>
         <w:fldChar w:fldCharType="separate"/>
@@ -15116,7 +14666,7 @@
         <w:fldChar w:fldCharType="begin"/>
       </w:r>
       <w:r>
-        <w:instrText xml:space="preserve">ADDIN CSL_CITATION {"citationID":"MENDELEY_CITATION_348","citationItems":[{"id":"ITEM-348","isTemporary":false,"itemData":{"DOI":"10.1109/IISWC53511.2021.00015","author":[{"family":"Ravi","given":"Gokul Subramanian"},{"family":"Smith","given":"Kaitlin N."},{"family":"Gokhale","given":"Pranav"},{"family":"Chong","given":"Frederic T."}],"container-title":"2021 IEEE international symposium on workload characterization (IISWC)","id":"Ravi2021","issued":{"date-parts":[[2021]]},"page":"39-50","publisher":"IEEE","title":"Quantum computing in the cloud: Analyzing job and machine characteristics","title-short":"Quantum computing in the cloud","type":"paper-conference"}}],"isEdited":false,"manualOverride":{"citeprocText":"(Ravi et al. 2021)","isManuallyOverridden":false,"manualOverrideText":""},"mendeley":{"formattedCitation":"(Ravi et al. 2021)","plainTextFormattedCitation":"(Ravi et al. 2021)","previouslyFormattedCitation":"(Ravi et al. 2021)"},"properties":{"noteIndex":0},"schema":"https://github.com/citation-style-language/schema/raw/master/csl-citation.json"}</w:instrText>
+        <w:instrText xml:space="preserve">ADDIN CSL_CITATION {"citationID":"MENDELEY_CITATION_348","citationItems":[{"id":"ITEM-348","isTemporary":false,"itemData":{"DOI":"10.1109/IISWC53511.2021.00015","author":[{"family":"Ravi","given":"Gokul Subramanian"},{"family":"Smith","given":"Kaitlin N."},{"family":"Gokhale","given":"Pranav"},{"family":"Chong","given":"Frederic T."}],"container-title":"2021 IEEE international symposium on workload characterization (IISWC)","id":"Ravi2021","issued":{"date-parts":[[2021]]},"page":"39-50","publisher":"IEEE","publisher-place":"Piscataway, NJ, USA","title":"Quantum computing in the cloud: Analyzing job and machine characteristics","title-short":"Quantum computing in the cloud","type":"paper-conference"}}],"isEdited":false,"manualOverride":{"citeprocText":"(Ravi et al. 2021)","isManuallyOverridden":false,"manualOverrideText":""},"mendeley":{"formattedCitation":"(Ravi et al. 2021)","plainTextFormattedCitation":"(Ravi et al. 2021)","previouslyFormattedCitation":"(Ravi et al. 2021)"},"properties":{"noteIndex":0},"schema":"https://github.com/citation-style-language/schema/raw/master/csl-citation.json"}</w:instrText>
       </w:r>
       <w:r>
         <w:fldChar w:fldCharType="separate"/>
@@ -16817,7 +16367,7 @@
         <w:fldChar w:fldCharType="begin"/>
       </w:r>
       <w:r>
-        <w:instrText xml:space="preserve">ADDIN CSL_CITATION {"citationID":"MENDELEY_CITATION_399","citationItems":[{"id":"ITEM-399","isTemporary":false,"itemData":{"author":[{"family":"Raghuvanshi","given":"Arushi"},{"family":"Fan","given":"Yale"},{"family":"Woyke","given":"Michal"},{"family":"Perkowski","given":"Marek"}],"container-title":"Proceedings of the 37th international symposium on multiple-valued logic (ISMVL’07)","id":"Raghuvanshi2007","issued":{"date-parts":[[2007]]},"publisher":"IEEE","title":"Quantum robots for teenagers","type":"paper-conference"}}],"isEdited":false,"manualOverride":{"citeprocText":"(Raghuvanshi et al. 2007)","isManuallyOverridden":false,"manualOverrideText":""},"mendeley":{"formattedCitation":"(Raghuvanshi et al. 2007)","plainTextFormattedCitation":"(Raghuvanshi et al. 2007)","previouslyFormattedCitation":"(Raghuvanshi et al. 2007)"},"properties":{"noteIndex":0},"schema":"https://github.com/citation-style-language/schema/raw/master/csl-citation.json"}</w:instrText>
+        <w:instrText xml:space="preserve">ADDIN CSL_CITATION {"citationID":"MENDELEY_CITATION_399","citationItems":[{"id":"ITEM-399","isTemporary":false,"itemData":{"author":[{"family":"Raghuvanshi","given":"Arushi"},{"family":"Fan","given":"Yale"},{"family":"Woyke","given":"Michal"},{"family":"Perkowski","given":"Marek"}],"container-title":"Proceedings of the 37th international symposium on multiple-valued logic (ISMVL’07)","id":"Raghuvanshi2007","issued":{"date-parts":[[2007]]},"publisher":"IEEE","publisher-place":"Piscataway, NJ, USA","title":"Quantum robots for teenagers","type":"paper-conference"}}],"isEdited":false,"manualOverride":{"citeprocText":"(Raghuvanshi et al. 2007)","isManuallyOverridden":false,"manualOverrideText":""},"mendeley":{"formattedCitation":"(Raghuvanshi et al. 2007)","plainTextFormattedCitation":"(Raghuvanshi et al. 2007)","previouslyFormattedCitation":"(Raghuvanshi et al. 2007)"},"properties":{"noteIndex":0},"schema":"https://github.com/citation-style-language/schema/raw/master/csl-citation.json"}</w:instrText>
       </w:r>
       <w:r>
         <w:fldChar w:fldCharType="separate"/>
@@ -17083,7 +16633,7 @@
         <w:fldChar w:fldCharType="begin"/>
       </w:r>
       <w:r>
-        <w:instrText xml:space="preserve">ADDIN CSL_CITATION {"citationID":"MENDELEY_CITATION_412","citationItems":[{"id":"ITEM-412","isTemporary":false,"itemData":{"DOI":"10.1109/ICDCS54860.2022.00151","author":[{"family":"Yun","given":"Won Joon"},{"family":"Kwak","given":"Yunseok"},{"family":"Kim","given":"Jae Pyoung"},{"family":"Cho","given":"Hyunhee"},{"family":"Jung","given":"Soyi"},{"family":"Park","given":"Jihong"},{"family":"Kim","given":"Joongheon"}],"container-title":"Proceedings of the 2022 IEEE 42nd international conference on distributed computing systems (ICDCS)","id":"Yun2022","issued":{"date-parts":[[2022]]},"page":"1332-1335","publisher":"IEEE","title":"Quantum multi-agent reinforcement learning via variational quantum circuit design","type":"paper-conference"}}],"isEdited":false,"manualOverride":{"citeprocText":"(Yun et al. 2022)","isManuallyOverridden":false,"manualOverrideText":""},"mendeley":{"formattedCitation":"(Yun et al. 2022)","plainTextFormattedCitation":"(Yun et al. 2022)","previouslyFormattedCitation":"(Yun et al. 2022)"},"properties":{"noteIndex":0},"schema":"https://github.com/citation-style-language/schema/raw/master/csl-citation.json"}</w:instrText>
+        <w:instrText xml:space="preserve">ADDIN CSL_CITATION {"citationID":"MENDELEY_CITATION_412","citationItems":[{"id":"ITEM-412","isTemporary":false,"itemData":{"DOI":"10.1109/ICDCS54860.2022.00151","author":[{"family":"Yun","given":"Won Joon"},{"family":"Kwak","given":"Yunseok"},{"family":"Kim","given":"Jae Pyoung"},{"family":"Cho","given":"Hyunhee"},{"family":"Jung","given":"Soyi"},{"family":"Park","given":"Jihong"},{"family":"Kim","given":"Joongheon"}],"container-title":"Proceedings of the 2022 IEEE 42nd international conference on distributed computing systems (ICDCS)","id":"Yun2022","issued":{"date-parts":[[2022]]},"page":"1332-1335","publisher":"IEEE","publisher-place":"Piscataway, NJ, USA","title":"Quantum multi-agent reinforcement learning via variational quantum circuit design","type":"paper-conference"}}],"isEdited":false,"manualOverride":{"citeprocText":"(Yun et al. 2022)","isManuallyOverridden":false,"manualOverrideText":""},"mendeley":{"formattedCitation":"(Yun et al. 2022)","plainTextFormattedCitation":"(Yun et al. 2022)","previouslyFormattedCitation":"(Yun et al. 2022)"},"properties":{"noteIndex":0},"schema":"https://github.com/citation-style-language/schema/raw/master/csl-citation.json"}</w:instrText>
       </w:r>
       <w:r>
         <w:fldChar w:fldCharType="separate"/>
@@ -17122,7 +16672,7 @@
         <w:fldChar w:fldCharType="begin"/>
       </w:r>
       <w:r>
-        <w:instrText xml:space="preserve">ADDIN CSL_CITATION {"citationID":"MENDELEY_CITATION_414","citationItems":[{"id":"ITEM-414","isTemporary":false,"itemData":{"DOI":"10.1109/IISWC53511.2021.00015","author":[{"family":"Ravi","given":"Gokul Subramanian"},{"family":"Smith","given":"Kaitlin N."},{"family":"Gokhale","given":"Pranav"},{"family":"Chong","given":"Frederic T."}],"container-title":"2021 IEEE international symposium on workload characterization (IISWC)","id":"Ravi2021","issued":{"date-parts":[[2021]]},"page":"39-50","publisher":"IEEE","title":"Quantum computing in the cloud: Analyzing job and machine characteristics","title-short":"Quantum computing in the cloud","type":"paper-conference"}}],"isEdited":false,"manualOverride":{"citeprocText":"(Ravi et al. 2021)","isManuallyOverridden":false,"manualOverrideText":""},"mendeley":{"formattedCitation":"(Ravi et al. 2021)","plainTextFormattedCitation":"(Ravi et al. 2021)","previouslyFormattedCitation":"(Ravi et al. 2021)"},"properties":{"noteIndex":0},"schema":"https://github.com/citation-style-language/schema/raw/master/csl-citation.json"}</w:instrText>
+        <w:instrText xml:space="preserve">ADDIN CSL_CITATION {"citationID":"MENDELEY_CITATION_414","citationItems":[{"id":"ITEM-414","isTemporary":false,"itemData":{"DOI":"10.1109/IISWC53511.2021.00015","author":[{"family":"Ravi","given":"Gokul Subramanian"},{"family":"Smith","given":"Kaitlin N."},{"family":"Gokhale","given":"Pranav"},{"family":"Chong","given":"Frederic T."}],"container-title":"2021 IEEE international symposium on workload characterization (IISWC)","id":"Ravi2021","issued":{"date-parts":[[2021]]},"page":"39-50","publisher":"IEEE","publisher-place":"Piscataway, NJ, USA","title":"Quantum computing in the cloud: Analyzing job and machine characteristics","title-short":"Quantum computing in the cloud","type":"paper-conference"}}],"isEdited":false,"manualOverride":{"citeprocText":"(Ravi et al. 2021)","isManuallyOverridden":false,"manualOverrideText":""},"mendeley":{"formattedCitation":"(Ravi et al. 2021)","plainTextFormattedCitation":"(Ravi et al. 2021)","previouslyFormattedCitation":"(Ravi et al. 2021)"},"properties":{"noteIndex":0},"schema":"https://github.com/citation-style-language/schema/raw/master/csl-citation.json"}</w:instrText>
       </w:r>
       <w:r>
         <w:fldChar w:fldCharType="separate"/>
@@ -17199,7 +16749,7 @@
         <w:fldChar w:fldCharType="begin"/>
       </w:r>
       <w:r>
-        <w:instrText xml:space="preserve">ADDIN CSL_CITATION {"citationID":"MENDELEY_CITATION_416","citationItems":[{"id":"ITEM-416","isTemporary":false,"itemData":{"DOI":"10.1109/ICDCS54860.2022.00151","author":[{"family":"Yun","given":"Won Joon"},{"family":"Kwak","given":"Yunseok"},{"family":"Kim","given":"Jae Pyoung"},{"family":"Cho","given":"Hyunhee"},{"family":"Jung","given":"Soyi"},{"family":"Park","given":"Jihong"},{"family":"Kim","given":"Joongheon"}],"container-title":"Proceedings of the 2022 IEEE 42nd international conference on distributed computing systems (ICDCS)","id":"Yun2022","issued":{"date-parts":[[2022]]},"page":"1332-1335","publisher":"IEEE","title":"Quantum multi-agent reinforcement learning via variational quantum circuit design","type":"paper-conference"}}],"isEdited":false,"manualOverride":{"citeprocText":"(Yun et al. 2022)","isManuallyOverridden":false,"manualOverrideText":""},"mendeley":{"formattedCitation":"(Yun et al. 2022)","plainTextFormattedCitation":"(Yun et al. 2022)","previouslyFormattedCitation":"(Yun et al. 2022)"},"properties":{"noteIndex":0},"schema":"https://github.com/citation-style-language/schema/raw/master/csl-citation.json"}</w:instrText>
+        <w:instrText xml:space="preserve">ADDIN CSL_CITATION {"citationID":"MENDELEY_CITATION_416","citationItems":[{"id":"ITEM-416","isTemporary":false,"itemData":{"DOI":"10.1109/ICDCS54860.2022.00151","author":[{"family":"Yun","given":"Won Joon"},{"family":"Kwak","given":"Yunseok"},{"family":"Kim","given":"Jae Pyoung"},{"family":"Cho","given":"Hyunhee"},{"family":"Jung","given":"Soyi"},{"family":"Park","given":"Jihong"},{"family":"Kim","given":"Joongheon"}],"container-title":"Proceedings of the 2022 IEEE 42nd international conference on distributed computing systems (ICDCS)","id":"Yun2022","issued":{"date-parts":[[2022]]},"page":"1332-1335","publisher":"IEEE","publisher-place":"Piscataway, NJ, USA","title":"Quantum multi-agent reinforcement learning via variational quantum circuit design","type":"paper-conference"}}],"isEdited":false,"manualOverride":{"citeprocText":"(Yun et al. 2022)","isManuallyOverridden":false,"manualOverrideText":""},"mendeley":{"formattedCitation":"(Yun et al. 2022)","plainTextFormattedCitation":"(Yun et al. 2022)","previouslyFormattedCitation":"(Yun et al. 2022)"},"properties":{"noteIndex":0},"schema":"https://github.com/citation-style-language/schema/raw/master/csl-citation.json"}</w:instrText>
       </w:r>
       <w:r>
         <w:fldChar w:fldCharType="separate"/>
@@ -17283,7 +16833,7 @@
         <w:fldChar w:fldCharType="begin"/>
       </w:r>
       <w:r>
-        <w:instrText xml:space="preserve">ADDIN CSL_CITATION {"citationID":"MENDELEY_CITATION_419","citationItems":[{"id":"ITEM-419","isTemporary":false,"itemData":{"author":[{"family":"Golyanik","given":"Vladislav"},{"family":"Theobalt","given":"Christian"}],"container-title":"Proceedings of the IEEE/CVF conference on computer vision and pattern recognition (CVPR)","id":"Golyanik2020","issued":{"date-parts":[[2020]]},"page":"9182-9191","publisher":"IEEE","title":"A quantum computational approach to correspondence problems on point sets","type":"paper-conference"},"suppress-author":false}],"isEdited":false,"manualOverride":{"citeprocText":"Golyanik and Theobalt (2020)","isManuallyOverridden":false,"manualOverrideText":""},"mendeley":{"formattedCitation":"Golyanik and Theobalt (2020)","plainTextFormattedCitation":"Golyanik and Theobalt (2020)","previouslyFormattedCitation":"Golyanik and Theobalt (2020)"},"properties":{"noteIndex":0},"schema":"https://github.com/citation-style-language/schema/raw/master/csl-citation.json"}</w:instrText>
+        <w:instrText xml:space="preserve">ADDIN CSL_CITATION {"citationID":"MENDELEY_CITATION_419","citationItems":[{"id":"ITEM-419","isTemporary":false,"itemData":{"author":[{"family":"Golyanik","given":"Vladislav"},{"family":"Theobalt","given":"Christian"}],"container-title":"Proceedings of the IEEE/CVF conference on computer vision and pattern recognition (CVPR)","id":"Golyanik2020","issued":{"date-parts":[[2020]]},"page":"9182-9191","publisher":"IEEE","publisher-place":"Piscataway, NJ, USA","title":"A quantum computational approach to correspondence problems on point sets","type":"paper-conference"},"suppress-author":false}],"isEdited":false,"manualOverride":{"citeprocText":"Golyanik and Theobalt (2020)","isManuallyOverridden":false,"manualOverrideText":""},"mendeley":{"formattedCitation":"Golyanik and Theobalt (2020)","plainTextFormattedCitation":"Golyanik and Theobalt (2020)","previouslyFormattedCitation":"Golyanik and Theobalt (2020)"},"properties":{"noteIndex":0},"schema":"https://github.com/citation-style-language/schema/raw/master/csl-citation.json"}</w:instrText>
       </w:r>
       <w:r>
         <w:fldChar w:fldCharType="separate"/>
@@ -17307,7 +16857,7 @@
         <w:fldChar w:fldCharType="begin"/>
       </w:r>
       <w:r>
-        <w:instrText xml:space="preserve">ADDIN CSL_CITATION {"citationID":"MENDELEY_CITATION_420","citationItems":[{"id":"ITEM-420","isTemporary":false,"itemData":{"author":[{"family":"Meli","given":"Natacha Kuete"},{"family":"Mannel","given":"Florian"},{"family":"Lellmann","given":"Jan"}],"container-title":"Proceedings of the IEEE/CVF conference on computer vision and pattern recognition (CVPR)","id":"Meli2022","issued":{"date-parts":[[2022]]},"page":"529-537","publisher":"IEEE","title":"An iterative quantum approach for transformation estimation from point sets","type":"paper-conference"},"suppress-author":false}],"isEdited":false,"manualOverride":{"citeprocText":"Meli, Mannel, and Lellmann (2022)","isManuallyOverridden":false,"manualOverrideText":""},"mendeley":{"formattedCitation":"Meli, Mannel, and Lellmann (2022)","plainTextFormattedCitation":"Meli, Mannel, and Lellmann (2022)","previouslyFormattedCitation":"Meli, Mannel, and Lellmann (2022)"},"properties":{"noteIndex":0},"schema":"https://github.com/citation-style-language/schema/raw/master/csl-citation.json"}</w:instrText>
+        <w:instrText xml:space="preserve">ADDIN CSL_CITATION {"citationID":"MENDELEY_CITATION_420","citationItems":[{"id":"ITEM-420","isTemporary":false,"itemData":{"author":[{"family":"Meli","given":"Natacha Kuete"},{"family":"Mannel","given":"Florian"},{"family":"Lellmann","given":"Jan"}],"container-title":"Proceedings of the IEEE/CVF conference on computer vision and pattern recognition (CVPR)","id":"Meli2022","issued":{"date-parts":[[2022]]},"page":"529-537","publisher":"IEEE","publisher-place":"Piscataway, NJ, USA","title":"An iterative quantum approach for transformation estimation from point sets","type":"paper-conference"},"suppress-author":false}],"isEdited":false,"manualOverride":{"citeprocText":"Meli, Mannel, and Lellmann (2022)","isManuallyOverridden":false,"manualOverrideText":""},"mendeley":{"formattedCitation":"Meli, Mannel, and Lellmann (2022)","plainTextFormattedCitation":"Meli, Mannel, and Lellmann (2022)","previouslyFormattedCitation":"Meli, Mannel, and Lellmann (2022)"},"properties":{"noteIndex":0},"schema":"https://github.com/citation-style-language/schema/raw/master/csl-citation.json"}</w:instrText>
       </w:r>
       <w:r>
         <w:fldChar w:fldCharType="separate"/>
@@ -17331,7 +16881,7 @@
         <w:fldChar w:fldCharType="begin"/>
       </w:r>
       <w:r>
-        <w:instrText xml:space="preserve">ADDIN CSL_CITATION {"citationID":"MENDELEY_CITATION_421","citationItems":[{"id":"ITEM-421","isTemporary":false,"itemData":{"DOI":"10.1109/CVPR46437.2021.01292","author":[{"family":"Birdal","given":"Tolga"},{"family":"Golyanik","given":"Vladislav"},{"family":"Theobalt","given":"Christian"},{"family":"Guibas","given":"Leonidas J."}],"container-title":"Proceedings of the IEEE/CVF conference on computer vision and pattern recognition (CVPR)","id":"Birdal2021","issued":{"date-parts":[[2021]]},"page":"13122-13133","publisher":"IEEE","title":"Quantum permutation synchronization","type":"paper-conference"},"suppress-author":false}],"isEdited":false,"manualOverride":{"citeprocText":"Birdal et al. (2021)","isManuallyOverridden":false,"manualOverrideText":""},"mendeley":{"formattedCitation":"Birdal et al. (2021)","plainTextFormattedCitation":"Birdal et al. (2021)","previouslyFormattedCitation":"Birdal et al. (2021)"},"properties":{"noteIndex":0},"schema":"https://github.com/citation-style-language/schema/raw/master/csl-citation.json"}</w:instrText>
+        <w:instrText xml:space="preserve">ADDIN CSL_CITATION {"citationID":"MENDELEY_CITATION_421","citationItems":[{"id":"ITEM-421","isTemporary":false,"itemData":{"DOI":"10.1109/CVPR46437.2021.01292","author":[{"family":"Birdal","given":"Tolga"},{"family":"Golyanik","given":"Vladislav"},{"family":"Theobalt","given":"Christian"},{"family":"Guibas","given":"Leonidas J."}],"container-title":"Proceedings of the IEEE/CVF conference on computer vision and pattern recognition (CVPR)","id":"Birdal2021","issued":{"date-parts":[[2021]]},"page":"13122-13133","publisher":"IEEE","publisher-place":"Piscataway, NJ, USA","title":"Quantum permutation synchronization","type":"paper-conference"},"suppress-author":false}],"isEdited":false,"manualOverride":{"citeprocText":"Birdal et al. (2021)","isManuallyOverridden":false,"manualOverrideText":""},"mendeley":{"formattedCitation":"Birdal et al. (2021)","plainTextFormattedCitation":"Birdal et al. (2021)","previouslyFormattedCitation":"Birdal et al. (2021)"},"properties":{"noteIndex":0},"schema":"https://github.com/citation-style-language/schema/raw/master/csl-citation.json"}</w:instrText>
       </w:r>
       <w:r>
         <w:fldChar w:fldCharType="separate"/>
@@ -17355,7 +16905,7 @@
         <w:fldChar w:fldCharType="begin"/>
       </w:r>
       <w:r>
-        <w:instrText xml:space="preserve">ADDIN CSL_CITATION {"citationID":"MENDELEY_CITATION_422","citationItems":[{"id":"ITEM-422","isTemporary":false,"itemData":{"author":[{"family":"Seelbach Benkner","given":"Marcel"},{"family":"Lähner","given":"Zorah"},{"family":"Golyanik","given":"Vladislav"},{"family":"Wunderlich","given":"Christof"},{"family":"Theobalt","given":"Christian"},{"family":"Moeller","given":"Michael"}],"container-title":"Proceedings of the IEEE/CVF international conference on computer vision (ICCV)","id":"Benkner2021","issued":{"date-parts":[[2021]]},"page":"7586-7596","publisher":"IEEE","title":"Q-Match: Iterative shape matching via quantum annealing","title-short":"Q-Match","type":"paper-conference"},"suppress-author":false}],"isEdited":false,"manualOverride":{"citeprocText":"Seelbach Benkner et al. (2021)","isManuallyOverridden":false,"manualOverrideText":""},"mendeley":{"formattedCitation":"Seelbach Benkner et al. (2021)","plainTextFormattedCitation":"Seelbach Benkner et al. (2021)","previouslyFormattedCitation":"Seelbach Benkner et al. (2021)"},"properties":{"noteIndex":0},"schema":"https://github.com/citation-style-language/schema/raw/master/csl-citation.json"}</w:instrText>
+        <w:instrText xml:space="preserve">ADDIN CSL_CITATION {"citationID":"MENDELEY_CITATION_422","citationItems":[{"id":"ITEM-422","isTemporary":false,"itemData":{"author":[{"family":"Seelbach Benkner","given":"Marcel"},{"family":"Lähner","given":"Zorah"},{"family":"Golyanik","given":"Vladislav"},{"family":"Wunderlich","given":"Christof"},{"family":"Theobalt","given":"Christian"},{"family":"Moeller","given":"Michael"}],"container-title":"Proceedings of the IEEE/CVF international conference on computer vision (ICCV)","id":"Benkner2021","issued":{"date-parts":[[2021]]},"page":"7586-7596","publisher":"IEEE","publisher-place":"Piscataway, NJ, USA","title":"Q-Match: Iterative shape matching via quantum annealing","title-short":"Q-Match","type":"paper-conference"},"suppress-author":false}],"isEdited":false,"manualOverride":{"citeprocText":"Seelbach Benkner et al. (2021)","isManuallyOverridden":false,"manualOverrideText":""},"mendeley":{"formattedCitation":"Seelbach Benkner et al. (2021)","plainTextFormattedCitation":"Seelbach Benkner et al. (2021)","previouslyFormattedCitation":"Seelbach Benkner et al. (2021)"},"properties":{"noteIndex":0},"schema":"https://github.com/citation-style-language/schema/raw/master/csl-citation.json"}</w:instrText>
       </w:r>
       <w:r>
         <w:fldChar w:fldCharType="separate"/>
@@ -17379,7 +16929,7 @@
         <w:fldChar w:fldCharType="begin"/>
       </w:r>
       <w:r>
-        <w:instrText xml:space="preserve">ADDIN CSL_CITATION {"citationID":"MENDELEY_CITATION_423","citationItems":[{"id":"ITEM-423","isTemporary":false,"itemData":{"author":[{"family":"Doan","given":"Anh-Dzung"},{"family":"Sasdelli","given":"Michele"},{"family":"Suter","given":"David"},{"family":"Chin","given":"Tat-Jun"}],"container-title":"Proceedings of the IEEE/CVF conference on computer vision and pattern recognition (CVPR)","id":"Doan2022","issued":{"date-parts":[[2022]]},"page":"417-427","publisher":"IEEE","title":"A hybrid quantum-classical algorithm for robust fitting","type":"paper-conference"},"suppress-author":false}],"isEdited":false,"manualOverride":{"citeprocText":"Doan et al. (2022)","isManuallyOverridden":false,"manualOverrideText":""},"mendeley":{"formattedCitation":"Doan et al. (2022)","plainTextFormattedCitation":"Doan et al. (2022)","previouslyFormattedCitation":"Doan et al. (2022)"},"properties":{"noteIndex":0},"schema":"https://github.com/citation-style-language/schema/raw/master/csl-citation.json"}</w:instrText>
+        <w:instrText xml:space="preserve">ADDIN CSL_CITATION {"citationID":"MENDELEY_CITATION_423","citationItems":[{"id":"ITEM-423","isTemporary":false,"itemData":{"author":[{"family":"Doan","given":"Anh-Dzung"},{"family":"Sasdelli","given":"Michele"},{"family":"Suter","given":"David"},{"family":"Chin","given":"Tat-Jun"}],"container-title":"Proceedings of the IEEE/CVF conference on computer vision and pattern recognition (CVPR)","id":"Doan2022","issued":{"date-parts":[[2022]]},"page":"417-427","publisher":"IEEE","publisher-place":"Piscataway, NJ, USA","title":"A hybrid quantum-classical algorithm for robust fitting","type":"paper-conference"},"suppress-author":false}],"isEdited":false,"manualOverride":{"citeprocText":"Doan et al. (2022)","isManuallyOverridden":false,"manualOverrideText":""},"mendeley":{"formattedCitation":"Doan et al. (2022)","plainTextFormattedCitation":"Doan et al. (2022)","previouslyFormattedCitation":"Doan et al. (2022)"},"properties":{"noteIndex":0},"schema":"https://github.com/citation-style-language/schema/raw/master/csl-citation.json"}</w:instrText>
       </w:r>
       <w:r>
         <w:fldChar w:fldCharType="separate"/>
@@ -17403,7 +16953,7 @@
         <w:fldChar w:fldCharType="begin"/>
       </w:r>
       <w:r>
-        <w:instrText xml:space="preserve">ADDIN CSL_CITATION {"citationID":"MENDELEY_CITATION_424","citationItems":[{"id":"ITEM-424","isTemporary":false,"itemData":{"author":[{"family":"Zaech","given":"Jan-Nico"},{"family":"Liniger","given":"Alexander"},{"family":"Danelljan","given":"Martin"},{"family":"Dai","given":"Dengxin"},{"family":"Van Gool","given":"Luc"}],"container-title":"Proceedings of the IEEE/CVF conference on computer vision and pattern recognition (CVPR)","id":"Zaech2022","issued":{"date-parts":[[2022]]},"page":"8811-8822","publisher":"IEEE","title":"Adiabatic quantum computing for multi object tracking","type":"paper-conference"},"suppress-author":false}],"isEdited":false,"manualOverride":{"citeprocText":"Zaech et al. (2022)","isManuallyOverridden":false,"manualOverrideText":""},"mendeley":{"formattedCitation":"Zaech et al. (2022)","plainTextFormattedCitation":"Zaech et al. (2022)","previouslyFormattedCitation":"Zaech et al. (2022)"},"properties":{"noteIndex":0},"schema":"https://github.com/citation-style-language/schema/raw/master/csl-citation.json"}</w:instrText>
+        <w:instrText xml:space="preserve">ADDIN CSL_CITATION {"citationID":"MENDELEY_CITATION_424","citationItems":[{"id":"ITEM-424","isTemporary":false,"itemData":{"author":[{"family":"Zaech","given":"Jan-Nico"},{"family":"Liniger","given":"Alexander"},{"family":"Danelljan","given":"Martin"},{"family":"Dai","given":"Dengxin"},{"family":"Van Gool","given":"Luc"}],"container-title":"Proceedings of the IEEE/CVF conference on computer vision and pattern recognition (CVPR)","id":"Zaech2022","issued":{"date-parts":[[2022]]},"page":"8811-8822","publisher":"IEEE","publisher-place":"Piscataway, NJ, USA","title":"Adiabatic quantum computing for multi object tracking","type":"paper-conference"},"suppress-author":false}],"isEdited":false,"manualOverride":{"citeprocText":"Zaech et al. (2022)","isManuallyOverridden":false,"manualOverrideText":""},"mendeley":{"formattedCitation":"Zaech et al. (2022)","plainTextFormattedCitation":"Zaech et al. (2022)","previouslyFormattedCitation":"Zaech et al. (2022)"},"properties":{"noteIndex":0},"schema":"https://github.com/citation-style-language/schema/raw/master/csl-citation.json"}</w:instrText>
       </w:r>
       <w:r>
         <w:fldChar w:fldCharType="separate"/>
@@ -17639,7 +17189,7 @@
         <w:fldChar w:fldCharType="begin"/>
       </w:r>
       <w:r>
-        <w:instrText xml:space="preserve">ADDIN CSL_CITATION {"citationID":"MENDELEY_CITATION_435","citationItems":[{"id":"ITEM-432","isTemporary":false,"itemData":{"DOI":"10.1109/ACCESS.2024.3417808","author":[{"family":"Hohenfeld","given":"Hans"},{"family":"Heimann","given":"Dirk"},{"family":"Wiebe","given":"Felix"},{"family":"Kirchner","given":"Frank"}],"container-title":"IEEE Access","id":"Hohenfeld2024","issued":{"date-parts":[[2024]]},"page":"87217-87236","publisher":"IEEE","title":"Quantum deep reinforcement learning for robot navigation tasks","type":"article-journal","volume":"12"}},{"id":"ITEM-433","isTemporary":false,"itemData":{"DOI":"10.5220/0013371800003890","ISBN":"978-989-758-737-5","author":[{"family":"Drăgan","given":"Theodora-Augustina"},{"family":"Künzner","given":"Alexander"},{"family":"Wille","given":"Robert"},{"family":"Lorenz","given":"Jeanette Miriam"}],"container-title":"Proceedings of the 17th international conference on agents and artificial intelligence (ICAART 2025)","id":"Dragan2025","issued":{"date-parts":[[2025]]},"page":"807-814","publisher":"SciTePress","title":"Continuous quantum reinforcement learning for robot navigation","type":"paper-conference","volume":"1"}},{"id":"ITEM-434","isTemporary":false,"itemData":{"DOI":"10.3389/fcomp.2019.00009","author":[{"family":"Ohzeki","given":"Masayuki"},{"family":"Miki","given":"Akira"},{"family":"Miyama","given":"Masamichi J."},{"family":"Terabe","given":"Masayoshi"}],"container-title":"Frontiers in Computer Science","id":"Ohzeki2019","issued":{"date-parts":[[2019]]},"page":"9","publisher":"Frontiers Media","title":"Control of automated guided vehicles without collision by quantum annealer and digital devices","type":"article-journal","volume":"1"}},{"id":"ITEM-435","isTemporary":false,"itemData":{"DOI":"10.1038/s41598-023-45668-1","author":[{"family":"Leib","given":"Dominik"},{"family":"Seidel","given":"Tobias"},{"family":"Jäger","given":"Sven"},{"family":"Heese","given":"Raoul"},{"family":"Jones","given":"Caitlin Isobel"},{"family":"Awasthi","given":"Abhishek"},{"family":"Niederle","given":"Astrid"},{"family":"Bortz","given":"Michael"}],"container-title":"Scientific Reports","id":"Leib2023","issued":{"date-parts":[[2023]]},"publisher":"Nature Publishing Group","title":"An optimization case study for solving a transport robot scheduling problem on quantum-hybrid and quantum-inspired hardware","type":"article-journal","volume":"13"}}],"isEdited":false,"manualOverride":{"citeprocText":"(Hohenfeld et al. 2024; Drăgan et al. 2025; Ohzeki et al. 2019; Leib et al. 2023)","isManuallyOverridden":false,"manualOverrideText":""},"mendeley":{"formattedCitation":"(Hohenfeld et al. 2024; Drăgan et al. 2025; Ohzeki et al. 2019; Leib et al. 2023)","plainTextFormattedCitation":"(Hohenfeld et al. 2024; Drăgan et al. 2025; Ohzeki et al. 2019; Leib et al. 2023)","previouslyFormattedCitation":"(Hohenfeld et al. 2024; Drăgan et al. 2025; Ohzeki et al. 2019; Leib et al. 2023)"},"properties":{"noteIndex":0},"schema":"https://github.com/citation-style-language/schema/raw/master/csl-citation.json"}</w:instrText>
+        <w:instrText xml:space="preserve">ADDIN CSL_CITATION {"citationID":"MENDELEY_CITATION_435","citationItems":[{"id":"ITEM-432","isTemporary":false,"itemData":{"DOI":"10.1109/ACCESS.2024.3417808","author":[{"family":"Hohenfeld","given":"Hans"},{"family":"Heimann","given":"Dirk"},{"family":"Wiebe","given":"Felix"},{"family":"Kirchner","given":"Frank"}],"container-title":"IEEE Access","id":"Hohenfeld2024","issued":{"date-parts":[[2024]]},"page":"87217-87236","publisher":"IEEE","title":"Quantum deep reinforcement learning for robot navigation tasks","type":"article-journal","volume":"12"}},{"id":"ITEM-433","isTemporary":false,"itemData":{"DOI":"10.5220/0013371800003890","ISBN":"978-989-758-737-5","author":[{"family":"Drăgan","given":"Theodora-Augustina"},{"family":"Künzner","given":"Alexander"},{"family":"Wille","given":"Robert"},{"family":"Lorenz","given":"Jeanette Miriam"}],"container-title":"Proceedings of the 17th international conference on agents and artificial intelligence (ICAART 2025)","id":"Dragan2025","issued":{"date-parts":[[2025]]},"page":"807-814","publisher":"SciTePress","publisher-place":"Setúbal, Portugal","title":"Continuous quantum reinforcement learning for robot navigation","type":"paper-conference","volume":"1"}},{"id":"ITEM-434","isTemporary":false,"itemData":{"DOI":"10.3389/fcomp.2019.00009","author":[{"family":"Ohzeki","given":"Masayuki"},{"family":"Miki","given":"Akira"},{"family":"Miyama","given":"Masamichi J."},{"family":"Terabe","given":"Masayoshi"}],"container-title":"Frontiers in Computer Science","id":"Ohzeki2019","issued":{"date-parts":[[2019]]},"page":"9","publisher":"Frontiers Media","title":"Control of automated guided vehicles without collision by quantum annealer and digital devices","type":"article-journal","volume":"1"}},{"id":"ITEM-435","isTemporary":false,"itemData":{"DOI":"10.1038/s41598-023-45668-1","author":[{"family":"Leib","given":"Dominik"},{"family":"Seidel","given":"Tobias"},{"family":"Jäger","given":"Sven"},{"family":"Heese","given":"Raoul"},{"family":"Jones","given":"Caitlin Isobel"},{"family":"Awasthi","given":"Abhishek"},{"family":"Niederle","given":"Astrid"},{"family":"Bortz","given":"Michael"}],"container-title":"Scientific Reports","id":"Leib2023","issued":{"date-parts":[[2023]]},"publisher":"Nature Publishing Group","title":"An optimization case study for solving a transport robot scheduling problem on quantum-hybrid and quantum-inspired hardware","type":"article-journal","volume":"13"}}],"isEdited":false,"manualOverride":{"citeprocText":"(Hohenfeld et al. 2024; Drăgan et al. 2025; Ohzeki et al. 2019; Leib et al. 2023)","isManuallyOverridden":false,"manualOverrideText":""},"mendeley":{"formattedCitation":"(Hohenfeld et al. 2024; Drăgan et al. 2025; Ohzeki et al. 2019; Leib et al. 2023)","plainTextFormattedCitation":"(Hohenfeld et al. 2024; Drăgan et al. 2025; Ohzeki et al. 2019; Leib et al. 2023)","previouslyFormattedCitation":"(Hohenfeld et al. 2024; Drăgan et al. 2025; Ohzeki et al. 2019; Leib et al. 2023)"},"properties":{"noteIndex":0},"schema":"https://github.com/citation-style-language/schema/raw/master/csl-citation.json"}</w:instrText>
       </w:r>
       <w:r>
         <w:fldChar w:fldCharType="separate"/>
@@ -17897,7 +17447,7 @@
               <w:fldChar w:fldCharType="begin"/>
             </w:r>
             <w:r>
-              <w:instrText xml:space="preserve">ADDIN CSL_CITATION {"citationID":"MENDELEY_CITATION_443","citationItems":[{"id":"ITEM-442","isTemporary":false,"itemData":{"URL":"https://proceedings.mlr.press/v267/gerlach25a.html","author":[{"family":"Gerlach","given":"Thore"},{"family":"Lee","given":"Loong Kuan"},{"family":"Barbaresco","given":"Frederic"},{"family":"Piatkowski","given":"Nico"}],"collection-title":"Proceedings of machine learning research","container-title":"Proceedings of the 42nd international conference on machine learning","editor":[{"family":"Singh","given":"Aarti"},{"family":"Fazel","given":"Maryam"},{"family":"Hsu","given":"Daniel"},{"family":"Lacoste-Julien","given":"Simon"},{"family":"Berkenkamp","given":"Felix"},{"family":"Maharaj","given":"Tegan"},{"family":"Wagstaff","given":"Kiri"},{"family":"Zhu","given":"Jerry"}],"id":"Gerlach2025","issued":{"date-parts":[[2025]]},"page":"19161-19171","publisher":"PMLR","title":"Hybrid quantum-classical multi-agent pathfinding","type":"paper-conference","volume":"267"}},{"id":"ITEM-443","isTemporary":false,"itemData":{"URL":"https://arxiv.org/abs/2602.14799","author":[{"family":"González Villasmil","given":"Javier"}],"id":"GonzalezVillasmil2026","issued":{"date-parts":[[2026]]},"title":"Scalable multi-robot path planning via quadratic unconstrained binary optimization","type":""}}],"isEdited":false,"manualOverride":{"citeprocText":"(Gerlach et al. 2025; González Villasmil 2026)","isManuallyOverridden":false,"manualOverrideText":""},"mendeley":{"formattedCitation":"(Gerlach et al. 2025; González Villasmil 2026)","plainTextFormattedCitation":"(Gerlach et al. 2025; González Villasmil 2026)","previouslyFormattedCitation":"(Gerlach et al. 2025; González Villasmil 2026)"},"properties":{"noteIndex":0},"schema":"https://github.com/citation-style-language/schema/raw/master/csl-citation.json"}</w:instrText>
+              <w:instrText xml:space="preserve">ADDIN CSL_CITATION {"citationID":"MENDELEY_CITATION_443","citationItems":[{"id":"ITEM-442","isTemporary":false,"itemData":{"URL":"https://proceedings.mlr.press/v267/gerlach25a.html","author":[{"family":"Gerlach","given":"Thore"},{"family":"Lee","given":"Loong Kuan"},{"family":"Barbaresco","given":"Frederic"},{"family":"Piatkowski","given":"Nico"}],"collection-title":"Proceedings of machine learning research","container-title":"Proceedings of the 42nd international conference on machine learning","editor":[{"family":"Singh","given":"Aarti"},{"family":"Fazel","given":"Maryam"},{"family":"Hsu","given":"Daniel"},{"family":"Lacoste-Julien","given":"Simon"},{"family":"Berkenkamp","given":"Felix"},{"family":"Maharaj","given":"Tegan"},{"family":"Wagstaff","given":"Kiri"},{"family":"Zhu","given":"Jerry"}],"id":"Gerlach2025","issued":{"date-parts":[[2025]]},"page":"19161-19171","publisher":"PMLR","publisher-place":"Vancouver, Canada","title":"Hybrid quantum-classical multi-agent pathfinding","type":"paper-conference","volume":"267"}},{"id":"ITEM-443","isTemporary":false,"itemData":{"URL":"https://arxiv.org/abs/2602.14799","author":[{"family":"González Villasmil","given":"Javier"}],"id":"GonzalezVillasmil2026","issued":{"date-parts":[[2026]]},"title":"Scalable multi-robot path planning via quadratic unconstrained binary optimization","type":""}}],"isEdited":false,"manualOverride":{"citeprocText":"(Gerlach et al. 2025; González Villasmil 2026)","isManuallyOverridden":false,"manualOverrideText":""},"mendeley":{"formattedCitation":"(Gerlach et al. 2025; González Villasmil 2026)","plainTextFormattedCitation":"(Gerlach et al. 2025; González Villasmil 2026)","previouslyFormattedCitation":"(Gerlach et al. 2025; González Villasmil 2026)"},"properties":{"noteIndex":0},"schema":"https://github.com/citation-style-language/schema/raw/master/csl-citation.json"}</w:instrText>
             </w:r>
             <w:r>
               <w:fldChar w:fldCharType="separate"/>
@@ -18282,7 +17832,7 @@
               <w:fldChar w:fldCharType="begin"/>
             </w:r>
             <w:r>
-              <w:instrText xml:space="preserve">ADDIN CSL_CITATION {"citationID":"MENDELEY_CITATION_459","citationItems":[{"id":"ITEM-455","isTemporary":false,"itemData":{"URL":"https://arxiv.org/abs/2508.21361","author":[{"family":"Innan","given":"Nouhaila"},{"family":"Kashif","given":"Muhammad"},{"family":"Marchisio","given":"Alberto"},{"family":"Gan","given":"Yung-Sze"},{"family":"Barbaresco","given":"Frederic"},{"family":"Shafique","given":"Muhammad"}],"id":"Innan2025","issued":{"date-parts":[[2025]]},"title":"QUAV: Quantum-assisted path planning and optimization for UAV navigation with obstacle avoidance","title-short":"QUAV","type":""}},{"id":"ITEM-456","isTemporary":false,"itemData":{"URL":"https://openaccess.thecvf.com/content/CVPR2026/html/Yu_HQC-NBV_A_Hybrid_Quantum-Classical_View_Planning_Approach_CVPR_2026_paper.html","author":[{"family":"Yu","given":"Xiaotong"},{"family":"Chen","given":"Chang Wen"}],"container-title":"Proceedings of the IEEE/CVF conference on computer vision and pattern recognition (CVPR)","id":"Yu2025","issued":{"date-parts":[[2026,6]]},"page":"35091-35100","title":"HQC-NBV: A hybrid quantum-classical view planning approach","title-short":"HQC-NBV","type":"paper-conference"}},{"id":"ITEM-457","isTemporary":false,"itemData":{"DOI":"10.1109/TCE.2024.3423416","author":[{"family":"Sarkar","given":"Mayukh"},{"family":"Pradhan","given":"Jitesh"},{"family":"Singh","given":"Anil Kumar"},{"family":"Nenavath","given":"Hathiram"}],"container-title":"IEEE Transactions on Consumer Electronics","id":"Sarkar2024","issue":"3","issued":{"date-parts":[[2024]]},"page":"5597-5606","publisher":"IEEE","title":"A novel hybrid quantum architecture for path planning in quantum-enabled autonomous mobile robots","type":"article-journal","volume":"70"}},{"id":"ITEM-458","isTemporary":false,"itemData":{"URL":"https://arxiv.org/abs/2501.18432","author":[{"family":"Osaba","given":"Eneko"},{"family":"Miranda-Rodriguez","given":"Pablo"},{"family":"Oikonomakis","given":"Andreas"},{"family":"Petrič","given":"Matic"},{"family":"Ruiz","given":"Alejandra"},{"family":"Bock","given":"Sebastian"},{"family":"Kourtis","given":"Michail-Alexandros"}],"container-title":"2025 IEEE congress on evolutionary computation (CEC)","id":"OsabaDrone2025","issued":{"date-parts":[[2025]]},"publisher":"IEEE","title":"Solving drone routing problems with quantum computing: A hybrid approach combining quantum annealing and gate-based paradigms","title-short":"Solving drone routing problems with quantum computing","type":"paper-conference"}},{"id":"ITEM-459","isTemporary":false,"itemData":{"URL":"https://arxiv.org/abs/2606.14252","author":[{"family":"Bang","given":"Junyeop"},{"family":"Lee","given":"Byongho"},{"family":"An","given":"Dohyun"},{"family":"Kim","given":"Hwangnam"}],"id":"Bang2026","issued":{"date-parts":[[2026]]},"title":"Optimality-preserving decomposition for scalable QAOA in natural-language-guided multi-drone assignment","type":""}}],"isEdited":false,"manualOverride":{"citeprocText":"(Innan et al. 2025; Yu and Chen 2026; Sarkar et al. 2024; Osaba, Miranda-Rodriguez, et al. 2025; Bang et al. 2026)","isManuallyOverridden":false,"manualOverrideText":""},"mendeley":{"formattedCitation":"(Innan et al. 2025; Yu and Chen 2026; Sarkar et al. 2024; Osaba, Miranda-Rodriguez, et al. 2025; Bang et al. 2026)","plainTextFormattedCitation":"(Innan et al. 2025; Yu and Chen 2026; Sarkar et al. 2024; Osaba, Miranda-Rodriguez, et al. 2025; Bang et al. 2026)","previouslyFormattedCitation":"(Innan et al. 2025; Yu and Chen 2026; Sarkar et al. 2024; Osaba, Miranda-Rodriguez, et al. 2025; Bang et al. 2026)"},"properties":{"noteIndex":0},"schema":"https://github.com/citation-style-language/schema/raw/master/csl-citation.json"}</w:instrText>
+              <w:instrText xml:space="preserve">ADDIN CSL_CITATION {"citationID":"MENDELEY_CITATION_459","citationItems":[{"id":"ITEM-455","isTemporary":false,"itemData":{"URL":"https://arxiv.org/abs/2508.21361","author":[{"family":"Innan","given":"Nouhaila"},{"family":"Kashif","given":"Muhammad"},{"family":"Marchisio","given":"Alberto"},{"family":"Gan","given":"Yung-Sze"},{"family":"Barbaresco","given":"Frederic"},{"family":"Shafique","given":"Muhammad"}],"id":"Innan2025","issued":{"date-parts":[[2025]]},"title":"QUAV: Quantum-assisted path planning and optimization for UAV navigation with obstacle avoidance","title-short":"QUAV","type":""}},{"id":"ITEM-456","isTemporary":false,"itemData":{"URL":"https://openaccess.thecvf.com/content/CVPR2026/html/Yu_HQC-NBV_A_Hybrid_Quantum-Classical_View_Planning_Approach_CVPR_2026_paper.html","author":[{"family":"Yu","given":"Xiaotong"},{"family":"Chen","given":"Chang Wen"}],"container-title":"Proceedings of the IEEE/CVF conference on computer vision and pattern recognition (CVPR)","id":"Yu2025","issued":{"date-parts":[[2026,6]]},"page":"35091-35100","publisher":"IEEE","publisher-place":"Piscataway, NJ, USA","title":"HQC-NBV: A hybrid quantum-classical view planning approach","title-short":"HQC-NBV","type":"paper-conference"}},{"id":"ITEM-457","isTemporary":false,"itemData":{"DOI":"10.1109/TCE.2024.3423416","author":[{"family":"Sarkar","given":"Mayukh"},{"family":"Pradhan","given":"Jitesh"},{"family":"Singh","given":"Anil Kumar"},{"family":"Nenavath","given":"Hathiram"}],"container-title":"IEEE Transactions on Consumer Electronics","id":"Sarkar2024","issue":"3","issued":{"date-parts":[[2024]]},"page":"5597-5606","publisher":"IEEE","title":"A novel hybrid quantum architecture for path planning in quantum-enabled autonomous mobile robots","type":"article-journal","volume":"70"}},{"id":"ITEM-458","isTemporary":false,"itemData":{"DOI":"10.1109/CEC65147.2025.11042978","URL":"https://arxiv.org/abs/2501.18432","author":[{"family":"Osaba","given":"Eneko"},{"family":"Miranda-Rodriguez","given":"Pablo"},{"family":"Oikonomakis","given":"Andreas"},{"family":"Petrič","given":"Matic"},{"family":"Ruiz","given":"Alejandra"},{"family":"Bock","given":"Sebastian"},{"family":"Kourtis","given":"Michail-Alexandros"}],"container-title":"2025 IEEE congress on evolutionary computation (CEC)","id":"OsabaDrone2025","issued":{"date-parts":[[2025]]},"publisher":"IEEE","publisher-place":"Piscataway, NJ, USA","title":"Solving drone routing problems with quantum computing: A hybrid approach combining quantum annealing and gate-based paradigms","title-short":"Solving drone routing problems with quantum computing","type":"paper-conference"}},{"id":"ITEM-459","isTemporary":false,"itemData":{"URL":"https://arxiv.org/abs/2606.14252","author":[{"family":"Bang","given":"Junyeop"},{"family":"Lee","given":"Byongho"},{"family":"An","given":"Dohyun"},{"family":"Kim","given":"Hwangnam"}],"id":"Bang2026","issued":{"date-parts":[[2026]]},"title":"Optimality-preserving decomposition for scalable QAOA in natural-language-guided multi-drone assignment","type":""}}],"isEdited":false,"manualOverride":{"citeprocText":"(Innan et al. 2025; Yu and Chen 2026; Sarkar et al. 2024; Osaba, Miranda-Rodriguez, et al. 2025; Bang et al. 2026)","isManuallyOverridden":false,"manualOverrideText":""},"mendeley":{"formattedCitation":"(Innan et al. 2025; Yu and Chen 2026; Sarkar et al. 2024; Osaba, Miranda-Rodriguez, et al. 2025; Bang et al. 2026)","plainTextFormattedCitation":"(Innan et al. 2025; Yu and Chen 2026; Sarkar et al. 2024; Osaba, Miranda-Rodriguez, et al. 2025; Bang et al. 2026)","previouslyFormattedCitation":"(Innan et al. 2025; Yu and Chen 2026; Sarkar et al. 2024; Osaba, Miranda-Rodriguez, et al. 2025; Bang et al. 2026)"},"properties":{"noteIndex":0},"schema":"https://github.com/citation-style-language/schema/raw/master/csl-citation.json"}</w:instrText>
             </w:r>
             <w:r>
               <w:fldChar w:fldCharType="separate"/>
@@ -18436,7 +17986,7 @@
               <w:fldChar w:fldCharType="begin"/>
             </w:r>
             <w:r>
-              <w:instrText xml:space="preserve">ADDIN CSL_CITATION {"citationID":"MENDELEY_CITATION_467","citationItems":[{"id":"ITEM-461","isTemporary":false,"itemData":{"DOI":"10.1109/ACCESS.2024.3417808","author":[{"family":"Hohenfeld","given":"Hans"},{"family":"Heimann","given":"Dirk"},{"family":"Wiebe","given":"Felix"},{"family":"Kirchner","given":"Frank"}],"container-title":"IEEE Access","id":"Hohenfeld2024","issued":{"date-parts":[[2024]]},"page":"87217-87236","publisher":"IEEE","title":"Quantum deep reinforcement learning for robot navigation tasks","type":"article-journal","volume":"12"}},{"id":"ITEM-462","isTemporary":false,"itemData":{"DOI":"10.5220/0013371800003890","ISBN":"978-989-758-737-5","author":[{"family":"Drăgan","given":"Theodora-Augustina"},{"family":"Künzner","given":"Alexander"},{"family":"Wille","given":"Robert"},{"family":"Lorenz","given":"Jeanette Miriam"}],"container-title":"Proceedings of the 17th international conference on agents and artificial intelligence (ICAART 2025)","id":"Dragan2025","issued":{"date-parts":[[2025]]},"page":"807-814","publisher":"SciTePress","title":"Continuous quantum reinforcement learning for robot navigation","type":"paper-conference","volume":"1"}},{"id":"ITEM-463","isTemporary":false,"itemData":{"URL":"https://arxiv.org/abs/2605.20801","author":[{"family":"Altrabulsi","given":"Mohamed Khair"},{"family":"Innan","given":"Nouhaila"},{"family":"Marchisio","given":"Alberto"},{"family":"Kashif","given":"Muhammad"},{"family":"Shafique","given":"Muhammad"}],"id":"Altrabulsi2026","issued":{"date-parts":[[2026]]},"title":"Q-SpiRL: Quantum spiking reinforcement learning for adaptive robot navigation","title-short":"Q-SpiRL","type":""}},{"id":"ITEM-464","isTemporary":false,"itemData":{"DOI":"10.48550/arXiv.2509.11388","URL":"https://arxiv.org/abs/2509.11388","author":[{"family":"Lokossou","given":"Romerik"},{"family":"Girma","given":"Birhanu Shimelis"},{"family":"Tonguz","given":"Ozan K."},{"family":"Biyabani","given":"Ahmed"}],"id":"Lokossou2025","issued":{"date-parts":[[2025]]},"title":"Quantum deep reinforcement learning for humanoid robot navigation task","type":""}},{"id":"ITEM-465","isTemporary":false,"itemData":{"DOI":"10.1007/s42044-025-00306-z","author":[{"family":"Taghavi","given":"Mazyar"},{"family":"Farnoosh","given":"Rahman"}],"container-title":"Iran Journal of Computer Science","id":"Taghavi2025","issue":"4","issued":{"date-parts":[[2025]]},"page":"2139-2155","publisher":"Springer","title":"Quantum computing and neuromorphic computing for safe, reliable, and explainable multi-agent reinforcement learning: Optimal control in autonomous robotics","title-short":"Quantum computing and neuromorphic computing for safe, reliable, and explainable multi-agent reinforcement learning","type":"article-journal","volume":"8"}},{"id":"ITEM-466","isTemporary":false,"itemData":{"author":[{"family":"Park","given":"Chanyoung"},{"family":"Yun","given":"Won Joon"},{"family":"Kim","given":"Jae Pyoung"},{"family":"Rodrigues","given":"Tiago Koketsu"},{"family":"Park","given":"Soohyun"},{"family":"Jung","given":"Soyi"},{"family":"Kim","given":"Joongheon"}],"container-title":"IEEE Internet of Things Journal","id":"Park2023","issue":"22","issued":{"date-parts":[[2023]]},"page":"20033-20048","title":"Quantum multi-agent actor-critic networks for cooperative mobile access in multi-UAV systems","type":"article-journal","volume":"10"}},{"id":"ITEM-467","isTemporary":false,"itemData":{"author":[{"family":"Park","given":"Soohyun"},{"family":"Kim","given":"Jae Pyoung"},{"family":"Park","given":"Chanyoung"},{"family":"Jung","given":"Soyi"},{"family":"Kim","given":"Joongheon"}],"container-title":"IEEE Communications Magazine","id":"Park2024","issue":"6","issued":{"date-parts":[[2024]]},"page":"106-112","title":"Quantum multi-agent reinforcement learning for autonomous mobility cooperation","type":"article-journal","volume":"62"}}],"isEdited":false,"manualOverride":{"citeprocText":"(Hohenfeld et al. 2024; Drăgan et al. 2025; Altrabulsi et al. 2026; Lokossou et al. 2025; Taghavi and Farnoosh 2025; C. Park et al. 2023; S. Park et al. 2024)","isManuallyOverridden":false,"manualOverrideText":""},"mendeley":{"formattedCitation":"(Hohenfeld et al. 2024; Drăgan et al. 2025; Altrabulsi et al. 2026; Lokossou et al. 2025; Taghavi and Farnoosh 2025; C. Park et al. 2023; S. Park et al. 2024)","plainTextFormattedCitation":"(Hohenfeld et al. 2024; Drăgan et al. 2025; Altrabulsi et al. 2026; Lokossou et al. 2025; Taghavi and Farnoosh 2025; C. Park et al. 2023; S. Park et al. 2024)","previouslyFormattedCitation":"(Hohenfeld et al. 2024; Drăgan et al. 2025; Altrabulsi et al. 2026; Lokossou et al. 2025; Taghavi and Farnoosh 2025; C. Park et al. 2023; S. Park et al. 2024)"},"properties":{"noteIndex":0},"schema":"https://github.com/citation-style-language/schema/raw/master/csl-citation.json"}</w:instrText>
+              <w:instrText xml:space="preserve">ADDIN CSL_CITATION {"citationID":"MENDELEY_CITATION_467","citationItems":[{"id":"ITEM-461","isTemporary":false,"itemData":{"DOI":"10.1109/ACCESS.2024.3417808","author":[{"family":"Hohenfeld","given":"Hans"},{"family":"Heimann","given":"Dirk"},{"family":"Wiebe","given":"Felix"},{"family":"Kirchner","given":"Frank"}],"container-title":"IEEE Access","id":"Hohenfeld2024","issued":{"date-parts":[[2024]]},"page":"87217-87236","publisher":"IEEE","title":"Quantum deep reinforcement learning for robot navigation tasks","type":"article-journal","volume":"12"}},{"id":"ITEM-462","isTemporary":false,"itemData":{"DOI":"10.5220/0013371800003890","ISBN":"978-989-758-737-5","author":[{"family":"Drăgan","given":"Theodora-Augustina"},{"family":"Künzner","given":"Alexander"},{"family":"Wille","given":"Robert"},{"family":"Lorenz","given":"Jeanette Miriam"}],"container-title":"Proceedings of the 17th international conference on agents and artificial intelligence (ICAART 2025)","id":"Dragan2025","issued":{"date-parts":[[2025]]},"page":"807-814","publisher":"SciTePress","publisher-place":"Setúbal, Portugal","title":"Continuous quantum reinforcement learning for robot navigation","type":"paper-conference","volume":"1"}},{"id":"ITEM-463","isTemporary":false,"itemData":{"URL":"https://arxiv.org/abs/2605.20801","author":[{"family":"Altrabulsi","given":"Mohamed Khair"},{"family":"Innan","given":"Nouhaila"},{"family":"Marchisio","given":"Alberto"},{"family":"Kashif","given":"Muhammad"},{"family":"Shafique","given":"Muhammad"}],"id":"Altrabulsi2026","issued":{"date-parts":[[2026]]},"title":"Q-SpiRL: Quantum spiking reinforcement learning for adaptive robot navigation","title-short":"Q-SpiRL","type":""}},{"id":"ITEM-464","isTemporary":false,"itemData":{"DOI":"10.48550/arXiv.2509.11388","URL":"https://arxiv.org/abs/2509.11388","author":[{"family":"Lokossou","given":"Romerik"},{"family":"Girma","given":"Birhanu Shimelis"},{"family":"Tonguz","given":"Ozan K."},{"family":"Biyabani","given":"Ahmed"}],"id":"Lokossou2025","issued":{"date-parts":[[2025]]},"title":"Quantum deep reinforcement learning for humanoid robot navigation task","type":""}},{"id":"ITEM-465","isTemporary":false,"itemData":{"DOI":"10.1007/s42044-025-00306-z","author":[{"family":"Taghavi","given":"Mazyar"},{"family":"Farnoosh","given":"Rahman"}],"container-title":"Iran Journal of Computer Science","id":"Taghavi2025","issue":"4","issued":{"date-parts":[[2025]]},"page":"2139-2155","publisher":"Springer","title":"Quantum computing and neuromorphic computing for safe, reliable, and explainable multi-agent reinforcement learning: Optimal control in autonomous robotics","title-short":"Quantum computing and neuromorphic computing for safe, reliable, and explainable multi-agent reinforcement learning","type":"article-journal","volume":"8"}},{"id":"ITEM-466","isTemporary":false,"itemData":{"author":[{"family":"Park","given":"Chanyoung"},{"family":"Yun","given":"Won Joon"},{"family":"Kim","given":"Jae Pyoung"},{"family":"Rodrigues","given":"Tiago Koketsu"},{"family":"Park","given":"Soohyun"},{"family":"Jung","given":"Soyi"},{"family":"Kim","given":"Joongheon"}],"container-title":"IEEE Internet of Things Journal","id":"Park2023","issue":"22","issued":{"date-parts":[[2023]]},"page":"20033-20048","title":"Quantum multi-agent actor-critic networks for cooperative mobile access in multi-UAV systems","type":"article-journal","volume":"10"}},{"id":"ITEM-467","isTemporary":false,"itemData":{"author":[{"family":"Park","given":"Soohyun"},{"family":"Kim","given":"Jae Pyoung"},{"family":"Park","given":"Chanyoung"},{"family":"Jung","given":"Soyi"},{"family":"Kim","given":"Joongheon"}],"container-title":"IEEE Communications Magazine","id":"Park2024","issue":"6","issued":{"date-parts":[[2024]]},"page":"106-112","title":"Quantum multi-agent reinforcement learning for autonomous mobility cooperation","type":"article-journal","volume":"62"}}],"isEdited":false,"manualOverride":{"citeprocText":"(Hohenfeld et al. 2024; Drăgan et al. 2025; Altrabulsi et al. 2026; Lokossou et al. 2025; Taghavi and Farnoosh 2025; C. Park et al. 2023; S. Park et al. 2024)","isManuallyOverridden":false,"manualOverrideText":""},"mendeley":{"formattedCitation":"(Hohenfeld et al. 2024; Drăgan et al. 2025; Altrabulsi et al. 2026; Lokossou et al. 2025; Taghavi and Farnoosh 2025; C. Park et al. 2023; S. Park et al. 2024)","plainTextFormattedCitation":"(Hohenfeld et al. 2024; Drăgan et al. 2025; Altrabulsi et al. 2026; Lokossou et al. 2025; Taghavi and Farnoosh 2025; C. Park et al. 2023; S. Park et al. 2024)","previouslyFormattedCitation":"(Hohenfeld et al. 2024; Drăgan et al. 2025; Altrabulsi et al. 2026; Lokossou et al. 2025; Taghavi and Farnoosh 2025; C. Park et al. 2023; S. Park et al. 2024)"},"properties":{"noteIndex":0},"schema":"https://github.com/citation-style-language/schema/raw/master/csl-citation.json"}</w:instrText>
             </w:r>
             <w:r>
               <w:fldChar w:fldCharType="separate"/>
@@ -19381,7 +18931,7 @@
         <w:fldChar w:fldCharType="begin"/>
       </w:r>
       <w:r>
-        <w:instrText xml:space="preserve">ADDIN CSL_CITATION {"citationID":"MENDELEY_CITATION_509","citationItems":[{"id":"ITEM-504","isTemporary":false,"itemData":{"DOI":"10.3389/fcomp.2019.00009","author":[{"family":"Ohzeki","given":"Masayuki"},{"family":"Miki","given":"Akira"},{"family":"Miyama","given":"Masamichi J."},{"family":"Terabe","given":"Masayoshi"}],"container-title":"Frontiers in Computer Science","id":"Ohzeki2019","issued":{"date-parts":[[2019]]},"page":"9","publisher":"Frontiers Media","title":"Control of automated guided vehicles without collision by quantum annealer and digital devices","type":"article-journal","volume":"1"}},{"id":"ITEM-505","isTemporary":false,"itemData":{"DOI":"10.1038/s41598-024-72101-y","author":[{"family":"Śmierzchalski","given":"Tomasz"},{"family":"Pawłowski","given":"Jakub"},{"family":"Przybysz","given":"Artur"},{"family":"Pawela","given":"Łukasz"},{"family":"Puchała","given":"Zbigniew"},{"family":"Koniorczyk","given":"Mátyás"},{"family":"Gardas","given":"Bartłomiej"},{"family":"Deffner","given":"Sebastian"},{"family":"Domino","given":"Krzysztof"}],"container-title":"Scientific Reports","id":"Smierzchalski2024","issued":{"date-parts":[[2024]]},"page":"21809","publisher":"Nature Publishing Group","title":"Hybrid quantum-classical computation for automatic guided vehicles scheduling","type":"article-journal","volume":"14"}},{"id":"ITEM-506","isTemporary":false,"itemData":{"DOI":"10.1038/s41598-023-45668-1","author":[{"family":"Leib","given":"Dominik"},{"family":"Seidel","given":"Tobias"},{"family":"Jäger","given":"Sven"},{"family":"Heese","given":"Raoul"},{"family":"Jones","given":"Caitlin Isobel"},{"family":"Awasthi","given":"Abhishek"},{"family":"Niederle","given":"Astrid"},{"family":"Bortz","given":"Michael"}],"container-title":"Scientific Reports","id":"Leib2023","issued":{"date-parts":[[2023]]},"publisher":"Nature Publishing Group","title":"An optimization case study for solving a transport robot scheduling problem on quantum-hybrid and quantum-inspired hardware","type":"article-journal","volume":"13"}},{"id":"ITEM-507","isTemporary":false,"itemData":{"DOI":"10.1016/j.procir.2025.01.099","author":[{"family":"Willmann","given":"Moritz"},{"family":"Albus","given":"Marcel"},{"family":"Schnabel","given":"Jan"},{"family":"Roth","given":"Marco"}],"container-title":"Procedia CIRP","id":"Willmann2025","issued":{"date-parts":[[2025]]},"note":"58th CIRP Conference on Manufacturing Systems","page":"25-30","publisher":"Elsevier","title":"Application of quantum annealing for scalable robotic assembly line optimization: A case study","title-short":"Application of quantum annealing for scalable robotic assembly line optimization","type":"article-journal","volume":"134"}},{"id":"ITEM-508","isTemporary":false,"itemData":{"DOI":"10.1109/QCE65121.2025.10359","author":[{"family":"Osaba","given":"Eneko"},{"family":"Garrote","given":"Estibaliz"},{"family":"Miranda-Rodriguez","given":"Pablo"},{"family":"Ciacco","given":"Alessia"},{"family":"Cabanes","given":"Itziar"},{"family":"Mancisidor","given":"Aitziber"}],"container-title":"2025 IEEE international conference on quantum computing and engineering (QCE)","id":"Osaba2025","issued":{"date-parts":[[2025]]},"page":"388-389","publisher":"IEEE","publisher-place":"Albuquerque, NM, USA","title":"Quantum-assisted automatic path-planning for robotic quality inspection in Industry 4.0","type":"paper-conference","volume":"2"}},{"id":"ITEM-509","isTemporary":false,"itemData":{"URL":"https://proceedings.mlr.press/v267/gerlach25a.html","author":[{"family":"Gerlach","given":"Thore"},{"family":"Lee","given":"Loong Kuan"},{"family":"Barbaresco","given":"Frederic"},{"family":"Piatkowski","given":"Nico"}],"collection-title":"Proceedings of machine learning research","container-title":"Proceedings of the 42nd international conference on machine learning","editor":[{"family":"Singh","given":"Aarti"},{"family":"Fazel","given":"Maryam"},{"family":"Hsu","given":"Daniel"},{"family":"Lacoste-Julien","given":"Simon"},{"family":"Berkenkamp","given":"Felix"},{"family":"Maharaj","given":"Tegan"},{"family":"Wagstaff","given":"Kiri"},{"family":"Zhu","given":"Jerry"}],"id":"Gerlach2025","issued":{"date-parts":[[2025]]},"page":"19161-19171","publisher":"PMLR","title":"Hybrid quantum-classical multi-agent pathfinding","type":"paper-conference","volume":"267"}}],"isEdited":false,"manualOverride":{"citeprocText":"(Ohzeki et al. 2019; Śmierzchalski et al. 2024; Leib et al. 2023; Willmann et al. 2025; Osaba, Garrote, et al. 2025; Gerlach et al. 2025)","isManuallyOverridden":false,"manualOverrideText":""},"mendeley":{"formattedCitation":"(Ohzeki et al. 2019; Śmierzchalski et al. 2024; Leib et al. 2023; Willmann et al. 2025; Osaba, Garrote, et al. 2025; Gerlach et al. 2025)","plainTextFormattedCitation":"(Ohzeki et al. 2019; Śmierzchalski et al. 2024; Leib et al. 2023; Willmann et al. 2025; Osaba, Garrote, et al. 2025; Gerlach et al. 2025)","previouslyFormattedCitation":"(Ohzeki et al. 2019; Śmierzchalski et al. 2024; Leib et al. 2023; Willmann et al. 2025; Osaba, Garrote, et al. 2025; Gerlach et al. 2025)"},"properties":{"noteIndex":0},"schema":"https://github.com/citation-style-language/schema/raw/master/csl-citation.json"}</w:instrText>
+        <w:instrText xml:space="preserve">ADDIN CSL_CITATION {"citationID":"MENDELEY_CITATION_509","citationItems":[{"id":"ITEM-504","isTemporary":false,"itemData":{"DOI":"10.3389/fcomp.2019.00009","author":[{"family":"Ohzeki","given":"Masayuki"},{"family":"Miki","given":"Akira"},{"family":"Miyama","given":"Masamichi J."},{"family":"Terabe","given":"Masayoshi"}],"container-title":"Frontiers in Computer Science","id":"Ohzeki2019","issued":{"date-parts":[[2019]]},"page":"9","publisher":"Frontiers Media","title":"Control of automated guided vehicles without collision by quantum annealer and digital devices","type":"article-journal","volume":"1"}},{"id":"ITEM-505","isTemporary":false,"itemData":{"DOI":"10.1038/s41598-024-72101-y","author":[{"family":"Śmierzchalski","given":"Tomasz"},{"family":"Pawłowski","given":"Jakub"},{"family":"Przybysz","given":"Artur"},{"family":"Pawela","given":"Łukasz"},{"family":"Puchała","given":"Zbigniew"},{"family":"Koniorczyk","given":"Mátyás"},{"family":"Gardas","given":"Bartłomiej"},{"family":"Deffner","given":"Sebastian"},{"family":"Domino","given":"Krzysztof"}],"container-title":"Scientific Reports","id":"Smierzchalski2024","issued":{"date-parts":[[2024]]},"page":"21809","publisher":"Nature Publishing Group","title":"Hybrid quantum-classical computation for automatic guided vehicles scheduling","type":"article-journal","volume":"14"}},{"id":"ITEM-506","isTemporary":false,"itemData":{"DOI":"10.1038/s41598-023-45668-1","author":[{"family":"Leib","given":"Dominik"},{"family":"Seidel","given":"Tobias"},{"family":"Jäger","given":"Sven"},{"family":"Heese","given":"Raoul"},{"family":"Jones","given":"Caitlin Isobel"},{"family":"Awasthi","given":"Abhishek"},{"family":"Niederle","given":"Astrid"},{"family":"Bortz","given":"Michael"}],"container-title":"Scientific Reports","id":"Leib2023","issued":{"date-parts":[[2023]]},"publisher":"Nature Publishing Group","title":"An optimization case study for solving a transport robot scheduling problem on quantum-hybrid and quantum-inspired hardware","type":"article-journal","volume":"13"}},{"id":"ITEM-507","isTemporary":false,"itemData":{"DOI":"10.1016/j.procir.2025.01.099","author":[{"family":"Willmann","given":"Moritz"},{"family":"Albus","given":"Marcel"},{"family":"Schnabel","given":"Jan"},{"family":"Roth","given":"Marco"}],"container-title":"Procedia CIRP","id":"Willmann2025","issued":{"date-parts":[[2025]]},"note":"58th CIRP Conference on Manufacturing Systems","page":"25-30","publisher":"Elsevier","title":"Application of quantum annealing for scalable robotic assembly line optimization: A case study","title-short":"Application of quantum annealing for scalable robotic assembly line optimization","type":"article-journal","volume":"134"}},{"id":"ITEM-508","isTemporary":false,"itemData":{"DOI":"10.1109/QCE65121.2025.10359","author":[{"family":"Osaba","given":"Eneko"},{"family":"Garrote","given":"Estibaliz"},{"family":"Miranda-Rodriguez","given":"Pablo"},{"family":"Ciacco","given":"Alessia"},{"family":"Cabanes","given":"Itziar"},{"family":"Mancisidor","given":"Aitziber"}],"container-title":"2025 IEEE international conference on quantum computing and engineering (QCE)","id":"Osaba2025","issued":{"date-parts":[[2025]]},"page":"388-389","publisher":"IEEE","publisher-place":"Albuquerque, NM, USA","title":"Quantum-assisted automatic path-planning for robotic quality inspection in Industry 4.0","type":"paper-conference","volume":"2"}},{"id":"ITEM-509","isTemporary":false,"itemData":{"URL":"https://proceedings.mlr.press/v267/gerlach25a.html","author":[{"family":"Gerlach","given":"Thore"},{"family":"Lee","given":"Loong Kuan"},{"family":"Barbaresco","given":"Frederic"},{"family":"Piatkowski","given":"Nico"}],"collection-title":"Proceedings of machine learning research","container-title":"Proceedings of the 42nd international conference on machine learning","editor":[{"family":"Singh","given":"Aarti"},{"family":"Fazel","given":"Maryam"},{"family":"Hsu","given":"Daniel"},{"family":"Lacoste-Julien","given":"Simon"},{"family":"Berkenkamp","given":"Felix"},{"family":"Maharaj","given":"Tegan"},{"family":"Wagstaff","given":"Kiri"},{"family":"Zhu","given":"Jerry"}],"id":"Gerlach2025","issued":{"date-parts":[[2025]]},"page":"19161-19171","publisher":"PMLR","publisher-place":"Vancouver, Canada","title":"Hybrid quantum-classical multi-agent pathfinding","type":"paper-conference","volume":"267"}}],"isEdited":false,"manualOverride":{"citeprocText":"(Ohzeki et al. 2019; Śmierzchalski et al. 2024; Leib et al. 2023; Willmann et al. 2025; Osaba, Garrote, et al. 2025; Gerlach et al. 2025)","isManuallyOverridden":false,"manualOverrideText":""},"mendeley":{"formattedCitation":"(Ohzeki et al. 2019; Śmierzchalski et al. 2024; Leib et al. 2023; Willmann et al. 2025; Osaba, Garrote, et al. 2025; Gerlach et al. 2025)","plainTextFormattedCitation":"(Ohzeki et al. 2019; Śmierzchalski et al. 2024; Leib et al. 2023; Willmann et al. 2025; Osaba, Garrote, et al. 2025; Gerlach et al. 2025)","previouslyFormattedCitation":"(Ohzeki et al. 2019; Śmierzchalski et al. 2024; Leib et al. 2023; Willmann et al. 2025; Osaba, Garrote, et al. 2025; Gerlach et al. 2025)"},"properties":{"noteIndex":0},"schema":"https://github.com/citation-style-language/schema/raw/master/csl-citation.json"}</w:instrText>
       </w:r>
       <w:r>
         <w:fldChar w:fldCharType="separate"/>
@@ -19420,7 +18970,7 @@
         <w:fldChar w:fldCharType="begin"/>
       </w:r>
       <w:r>
-        <w:instrText xml:space="preserve">ADDIN CSL_CITATION {"citationID":"MENDELEY_CITATION_511","citationItems":[{"id":"ITEM-511","isTemporary":false,"itemData":{"URL":"https://proceedings.mlr.press/v267/gerlach25a.html","author":[{"family":"Gerlach","given":"Thore"},{"family":"Lee","given":"Loong Kuan"},{"family":"Barbaresco","given":"Frederic"},{"family":"Piatkowski","given":"Nico"}],"collection-title":"Proceedings of machine learning research","container-title":"Proceedings of the 42nd international conference on machine learning","editor":[{"family":"Singh","given":"Aarti"},{"family":"Fazel","given":"Maryam"},{"family":"Hsu","given":"Daniel"},{"family":"Lacoste-Julien","given":"Simon"},{"family":"Berkenkamp","given":"Felix"},{"family":"Maharaj","given":"Tegan"},{"family":"Wagstaff","given":"Kiri"},{"family":"Zhu","given":"Jerry"}],"id":"Gerlach2025","issued":{"date-parts":[[2025]]},"page":"19161-19171","publisher":"PMLR","title":"Hybrid quantum-classical multi-agent pathfinding","type":"paper-conference","volume":"267"}}],"isEdited":false,"manualOverride":{"citeprocText":"(Gerlach et al. 2025)","isManuallyOverridden":false,"manualOverrideText":""},"mendeley":{"formattedCitation":"(Gerlach et al. 2025)","plainTextFormattedCitation":"(Gerlach et al. 2025)","previouslyFormattedCitation":"(Gerlach et al. 2025)"},"properties":{"noteIndex":0},"schema":"https://github.com/citation-style-language/schema/raw/master/csl-citation.json"}</w:instrText>
+        <w:instrText xml:space="preserve">ADDIN CSL_CITATION {"citationID":"MENDELEY_CITATION_511","citationItems":[{"id":"ITEM-511","isTemporary":false,"itemData":{"URL":"https://proceedings.mlr.press/v267/gerlach25a.html","author":[{"family":"Gerlach","given":"Thore"},{"family":"Lee","given":"Loong Kuan"},{"family":"Barbaresco","given":"Frederic"},{"family":"Piatkowski","given":"Nico"}],"collection-title":"Proceedings of machine learning research","container-title":"Proceedings of the 42nd international conference on machine learning","editor":[{"family":"Singh","given":"Aarti"},{"family":"Fazel","given":"Maryam"},{"family":"Hsu","given":"Daniel"},{"family":"Lacoste-Julien","given":"Simon"},{"family":"Berkenkamp","given":"Felix"},{"family":"Maharaj","given":"Tegan"},{"family":"Wagstaff","given":"Kiri"},{"family":"Zhu","given":"Jerry"}],"id":"Gerlach2025","issued":{"date-parts":[[2025]]},"page":"19161-19171","publisher":"PMLR","publisher-place":"Vancouver, Canada","title":"Hybrid quantum-classical multi-agent pathfinding","type":"paper-conference","volume":"267"}}],"isEdited":false,"manualOverride":{"citeprocText":"(Gerlach et al. 2025)","isManuallyOverridden":false,"manualOverrideText":""},"mendeley":{"formattedCitation":"(Gerlach et al. 2025)","plainTextFormattedCitation":"(Gerlach et al. 2025)","previouslyFormattedCitation":"(Gerlach et al. 2025)"},"properties":{"noteIndex":0},"schema":"https://github.com/citation-style-language/schema/raw/master/csl-citation.json"}</w:instrText>
       </w:r>
       <w:r>
         <w:fldChar w:fldCharType="separate"/>
@@ -21371,7 +20921,7 @@
               <w:fldChar w:fldCharType="begin"/>
             </w:r>
             <w:r>
-              <w:instrText xml:space="preserve">ADDIN CSL_CITATION {"citationID":"MENDELEY_CITATION_527","citationItems":[{"id":"ITEM-527","isTemporary":false,"itemData":{"URL":"https://proceedings.mlr.press/v267/gerlach25a.html","author":[{"family":"Gerlach","given":"Thore"},{"family":"Lee","given":"Loong Kuan"},{"family":"Barbaresco","given":"Frederic"},{"family":"Piatkowski","given":"Nico"}],"collection-title":"Proceedings of machine learning research","container-title":"Proceedings of the 42nd international conference on machine learning","editor":[{"family":"Singh","given":"Aarti"},{"family":"Fazel","given":"Maryam"},{"family":"Hsu","given":"Daniel"},{"family":"Lacoste-Julien","given":"Simon"},{"family":"Berkenkamp","given":"Felix"},{"family":"Maharaj","given":"Tegan"},{"family":"Wagstaff","given":"Kiri"},{"family":"Zhu","given":"Jerry"}],"id":"Gerlach2025","issued":{"date-parts":[[2025]]},"page":"19161-19171","publisher":"PMLR","title":"Hybrid quantum-classical multi-agent pathfinding","type":"paper-conference","volume":"267"},"suppress-author":false}],"isEdited":false,"manualOverride":{"citeprocText":"Gerlach et al. (2025)","isManuallyOverridden":false,"manualOverrideText":""},"mendeley":{"formattedCitation":"Gerlach et al. (2025)","plainTextFormattedCitation":"Gerlach et al. (2025)","previouslyFormattedCitation":"Gerlach et al. (2025)"},"properties":{"noteIndex":0},"schema":"https://github.com/citation-style-language/schema/raw/master/csl-citation.json"}</w:instrText>
+              <w:instrText xml:space="preserve">ADDIN CSL_CITATION {"citationID":"MENDELEY_CITATION_527","citationItems":[{"id":"ITEM-527","isTemporary":false,"itemData":{"URL":"https://proceedings.mlr.press/v267/gerlach25a.html","author":[{"family":"Gerlach","given":"Thore"},{"family":"Lee","given":"Loong Kuan"},{"family":"Barbaresco","given":"Frederic"},{"family":"Piatkowski","given":"Nico"}],"collection-title":"Proceedings of machine learning research","container-title":"Proceedings of the 42nd international conference on machine learning","editor":[{"family":"Singh","given":"Aarti"},{"family":"Fazel","given":"Maryam"},{"family":"Hsu","given":"Daniel"},{"family":"Lacoste-Julien","given":"Simon"},{"family":"Berkenkamp","given":"Felix"},{"family":"Maharaj","given":"Tegan"},{"family":"Wagstaff","given":"Kiri"},{"family":"Zhu","given":"Jerry"}],"id":"Gerlach2025","issued":{"date-parts":[[2025]]},"page":"19161-19171","publisher":"PMLR","publisher-place":"Vancouver, Canada","title":"Hybrid quantum-classical multi-agent pathfinding","type":"paper-conference","volume":"267"},"suppress-author":false}],"isEdited":false,"manualOverride":{"citeprocText":"Gerlach et al. (2025)","isManuallyOverridden":false,"manualOverrideText":""},"mendeley":{"formattedCitation":"Gerlach et al. (2025)","plainTextFormattedCitation":"Gerlach et al. (2025)","previouslyFormattedCitation":"Gerlach et al. (2025)"},"properties":{"noteIndex":0},"schema":"https://github.com/citation-style-language/schema/raw/master/csl-citation.json"}</w:instrText>
             </w:r>
             <w:r>
               <w:fldChar w:fldCharType="separate"/>
@@ -21519,7 +21069,7 @@
               <w:fldChar w:fldCharType="begin"/>
             </w:r>
             <w:r>
-              <w:instrText xml:space="preserve">ADDIN CSL_CITATION {"citationID":"MENDELEY_CITATION_529","citationItems":[{"id":"ITEM-529","isTemporary":false,"itemData":{"URL":"https://arxiv.org/abs/2501.18432","author":[{"family":"Osaba","given":"Eneko"},{"family":"Miranda-Rodriguez","given":"Pablo"},{"family":"Oikonomakis","given":"Andreas"},{"family":"Petrič","given":"Matic"},{"family":"Ruiz","given":"Alejandra"},{"family":"Bock","given":"Sebastian"},{"family":"Kourtis","given":"Michail-Alexandros"}],"container-title":"2025 IEEE congress on evolutionary computation (CEC)","id":"OsabaDrone2025","issued":{"date-parts":[[2025]]},"publisher":"IEEE","title":"Solving drone routing problems with quantum computing: A hybrid approach combining quantum annealing and gate-based paradigms","title-short":"Solving drone routing problems with quantum computing","type":"paper-conference"},"suppress-author":false}],"isEdited":false,"manualOverride":{"citeprocText":"Osaba, Miranda-Rodriguez, et al. (2025)","isManuallyOverridden":false,"manualOverrideText":""},"mendeley":{"formattedCitation":"Osaba, Miranda-Rodriguez, et al. (2025)","plainTextFormattedCitation":"Osaba, Miranda-Rodriguez, et al. (2025)","previouslyFormattedCitation":"Osaba, Miranda-Rodriguez, et al. (2025)"},"properties":{"noteIndex":0},"schema":"https://github.com/citation-style-language/schema/raw/master/csl-citation.json"}</w:instrText>
+              <w:instrText xml:space="preserve">ADDIN CSL_CITATION {"citationID":"MENDELEY_CITATION_529","citationItems":[{"id":"ITEM-529","isTemporary":false,"itemData":{"DOI":"10.1109/CEC65147.2025.11042978","URL":"https://arxiv.org/abs/2501.18432","author":[{"family":"Osaba","given":"Eneko"},{"family":"Miranda-Rodriguez","given":"Pablo"},{"family":"Oikonomakis","given":"Andreas"},{"family":"Petrič","given":"Matic"},{"family":"Ruiz","given":"Alejandra"},{"family":"Bock","given":"Sebastian"},{"family":"Kourtis","given":"Michail-Alexandros"}],"container-title":"2025 IEEE congress on evolutionary computation (CEC)","id":"OsabaDrone2025","issued":{"date-parts":[[2025]]},"publisher":"IEEE","publisher-place":"Piscataway, NJ, USA","title":"Solving drone routing problems with quantum computing: A hybrid approach combining quantum annealing and gate-based paradigms","title-short":"Solving drone routing problems with quantum computing","type":"paper-conference"},"suppress-author":false}],"isEdited":false,"manualOverride":{"citeprocText":"Osaba, Miranda-Rodriguez, et al. (2025)","isManuallyOverridden":false,"manualOverrideText":""},"mendeley":{"formattedCitation":"Osaba, Miranda-Rodriguez, et al. (2025)","plainTextFormattedCitation":"Osaba, Miranda-Rodriguez, et al. (2025)","previouslyFormattedCitation":"Osaba, Miranda-Rodriguez, et al. (2025)"},"properties":{"noteIndex":0},"schema":"https://github.com/citation-style-language/schema/raw/master/csl-citation.json"}</w:instrText>
             </w:r>
             <w:r>
               <w:fldChar w:fldCharType="separate"/>
@@ -22170,7 +21720,7 @@
         <w:fldChar w:fldCharType="begin"/>
       </w:r>
       <w:r>
-        <w:instrText xml:space="preserve">ADDIN CSL_CITATION {"citationID":"MENDELEY_CITATION_538","citationItems":[{"id":"ITEM-536","isTemporary":false,"itemData":{"DOI":"10.1145/237814.237866","author":[{"family":"Grover","given":"Lov K."}],"container-title":"Proceedings of the twenty-eighth annual ACM symposium on theory of computing (STOC ’96)","id":"Grover1996","issued":{"date-parts":[[1996]]},"page":"212-219","publisher":"ACM","publisher-place":"New York, NY, USA","title":"A fast quantum mechanical algorithm for database search","type":"paper-conference"}},{"id":"ITEM-537","isTemporary":false,"itemData":{"DOI":"10.1090/conm/305/05215","author":[{"family":"Brassard","given":"Gilles"},{"family":"Høyer","given":"Peter"},{"family":"Mosca","given":"Michele"},{"family":"Tapp","given":"Alain"}],"collection-title":"Contemporary mathematics","container-title":"Quantum computation and information","editor":[{"family":"Lomonaco","given":"Samuel J.","suffix":"Jr."}],"id":"Brassard2002","issued":{"date-parts":[[2002]]},"page":"53-74","publisher":"American Mathematical Society","title":"Quantum amplitude amplification and estimation","type":"chapter","volume":"305"}},{"id":"ITEM-538","isTemporary":false,"itemData":{"DOI":"10.1098/rspa.2015.0301","author":[{"family":"Montanaro","given":"Ashley"}],"container-title":"Proceedings of the Royal Society A: Mathematical, Physical and Engineering Sciences","id":"Montanaro2015","issue":"2181","issued":{"date-parts":[[2015]]},"page":"20150301","publisher":"The Royal Society","title":"Quantum speedup of Monte Carlo methods","type":"article-journal","volume":"471"}}],"isEdited":false,"manualOverride":{"citeprocText":"(Grover 1996; Brassard et al. 2002; Montanaro 2015)","isManuallyOverridden":false,"manualOverrideText":""},"mendeley":{"formattedCitation":"(Grover 1996; Brassard et al. 2002; Montanaro 2015)","plainTextFormattedCitation":"(Grover 1996; Brassard et al. 2002; Montanaro 2015)","previouslyFormattedCitation":"(Grover 1996; Brassard et al. 2002; Montanaro 2015)"},"properties":{"noteIndex":0},"schema":"https://github.com/citation-style-language/schema/raw/master/csl-citation.json"}</w:instrText>
+        <w:instrText xml:space="preserve">ADDIN CSL_CITATION {"citationID":"MENDELEY_CITATION_538","citationItems":[{"id":"ITEM-536","isTemporary":false,"itemData":{"DOI":"10.1145/237814.237866","author":[{"family":"Grover","given":"Lov K."}],"container-title":"Proceedings of the twenty-eighth annual ACM symposium on theory of computing (STOC ’96)","id":"Grover1996","issued":{"date-parts":[[1996]]},"page":"212-219","publisher":"ACM","publisher-place":"New York, NY, USA","title":"A fast quantum mechanical algorithm for database search","type":"paper-conference"}},{"id":"ITEM-537","isTemporary":false,"itemData":{"DOI":"10.1090/conm/305/05215","author":[{"family":"Brassard","given":"Gilles"},{"family":"Høyer","given":"Peter"},{"family":"Mosca","given":"Michele"},{"family":"Tapp","given":"Alain"}],"collection-title":"Contemporary mathematics","container-title":"Quantum computation and information","editor":[{"family":"Lomonaco","given":"Samuel J.","suffix":"Jr."}],"id":"Brassard2002","issued":{"date-parts":[[2002]]},"page":"53-74","publisher":"American Mathematical Society","publisher-place":"Providence, RI, USA","title":"Quantum amplitude amplification and estimation","type":"chapter","volume":"305"}},{"id":"ITEM-538","isTemporary":false,"itemData":{"DOI":"10.1098/rspa.2015.0301","author":[{"family":"Montanaro","given":"Ashley"}],"container-title":"Proceedings of the Royal Society A: Mathematical, Physical and Engineering Sciences","id":"Montanaro2015","issue":"2181","issued":{"date-parts":[[2015]]},"page":"20150301","publisher":"The Royal Society","title":"Quantum speedup of Monte Carlo methods","type":"article-journal","volume":"471"}}],"isEdited":false,"manualOverride":{"citeprocText":"(Grover 1996; Brassard et al. 2002; Montanaro 2015)","isManuallyOverridden":false,"manualOverrideText":""},"mendeley":{"formattedCitation":"(Grover 1996; Brassard et al. 2002; Montanaro 2015)","plainTextFormattedCitation":"(Grover 1996; Brassard et al. 2002; Montanaro 2015)","previouslyFormattedCitation":"(Grover 1996; Brassard et al. 2002; Montanaro 2015)"},"properties":{"noteIndex":0},"schema":"https://github.com/citation-style-language/schema/raw/master/csl-citation.json"}</w:instrText>
       </w:r>
       <w:r>
         <w:fldChar w:fldCharType="separate"/>
@@ -22242,7 +21792,7 @@
         <w:fldChar w:fldCharType="begin"/>
       </w:r>
       <w:r>
-        <w:instrText xml:space="preserve">ADDIN CSL_CITATION {"citationID":"MENDELEY_CITATION_544","citationItems":[{"id":"ITEM-544","isTemporary":false,"itemData":{"URL":"https://proceedings.neurips.cc/paper/2021/hash/eec96a7f788e88184c0e713456026f3f-Abstract.html","author":[{"family":"Jerbi","given":"Sofiene"},{"family":"Gyurik","given":"Casper F. S."},{"family":"Marshall","given":"Simon C."},{"family":"Briegel","given":"Hans J."},{"family":"Dunjko","given":"Vedran"}],"container-title":"Advances in neural information processing systems","id":"Jerbi2021","issued":{"date-parts":[[2021]]},"page":"28362-28375","title":"Parametrized quantum policies for reinforcement learning","type":"paper-conference","volume":"34"}}],"isEdited":false,"manualOverride":{"citeprocText":"(Jerbi et al. 2021)","isManuallyOverridden":false,"manualOverrideText":""},"mendeley":{"formattedCitation":"(Jerbi et al. 2021)","plainTextFormattedCitation":"(Jerbi et al. 2021)","previouslyFormattedCitation":"(Jerbi et al. 2021)"},"properties":{"noteIndex":0},"schema":"https://github.com/citation-style-language/schema/raw/master/csl-citation.json"}</w:instrText>
+        <w:instrText xml:space="preserve">ADDIN CSL_CITATION {"citationID":"MENDELEY_CITATION_544","citationItems":[{"id":"ITEM-544","isTemporary":false,"itemData":{"URL":"https://proceedings.neurips.cc/paper/2021/hash/eec96a7f788e88184c0e713456026f3f-Abstract.html","author":[{"family":"Jerbi","given":"Sofiene"},{"family":"Gyurik","given":"Casper F. S."},{"family":"Marshall","given":"Simon C."},{"family":"Briegel","given":"Hans J."},{"family":"Dunjko","given":"Vedran"}],"container-title":"Advances in neural information processing systems","id":"Jerbi2021","issued":{"date-parts":[[2021]]},"page":"28362-28375","publisher":"Curran Associates, Inc.","publisher-place":"Red Hook, NY, USA","title":"Parametrized quantum policies for reinforcement learning","type":"paper-conference","volume":"34"}}],"isEdited":false,"manualOverride":{"citeprocText":"(Jerbi et al. 2021)","isManuallyOverridden":false,"manualOverrideText":""},"mendeley":{"formattedCitation":"(Jerbi et al. 2021)","plainTextFormattedCitation":"(Jerbi et al. 2021)","previouslyFormattedCitation":"(Jerbi et al. 2021)"},"properties":{"noteIndex":0},"schema":"https://github.com/citation-style-language/schema/raw/master/csl-citation.json"}</w:instrText>
       </w:r>
       <w:r>
         <w:fldChar w:fldCharType="separate"/>
@@ -22379,7 +21929,7 @@
         <w:fldChar w:fldCharType="begin"/>
       </w:r>
       <w:r>
-        <w:instrText xml:space="preserve">ADDIN CSL_CITATION {"citationID":"MENDELEY_CITATION_549","citationItems":[{"id":"ITEM-548","isTemporary":false,"itemData":{"URL":"https://arxiv.org/abs/2212.11681","author":[{"family":"Acuto","given":"Alberto"},{"family":"Barillà","given":"Paola"},{"family":"Bozzolo","given":"Ludovico"},{"family":"Conterno","given":"Matteo"},{"family":"Pavese","given":"Mattia"},{"family":"Policicchio","given":"Antonio"}],"id":"Acuto2022","issued":{"date-parts":[[2022]]},"title":"Variational quantum soft actor-critic for robotic arm control","type":""}},{"id":"ITEM-549","isTemporary":false,"itemData":{"DOI":"10.5220/0013371800003890","ISBN":"978-989-758-737-5","author":[{"family":"Drăgan","given":"Theodora-Augustina"},{"family":"Künzner","given":"Alexander"},{"family":"Wille","given":"Robert"},{"family":"Lorenz","given":"Jeanette Miriam"}],"container-title":"Proceedings of the 17th international conference on agents and artificial intelligence (ICAART 2025)","id":"Dragan2025","issued":{"date-parts":[[2025]]},"page":"807-814","publisher":"SciTePress","title":"Continuous quantum reinforcement learning for robot navigation","type":"paper-conference","volume":"1"}}],"isEdited":false,"manualOverride":{"citeprocText":"(Acuto et al. 2022; Drăgan et al. 2025)","isManuallyOverridden":false,"manualOverrideText":""},"mendeley":{"formattedCitation":"(Acuto et al. 2022; Drăgan et al. 2025)","plainTextFormattedCitation":"(Acuto et al. 2022; Drăgan et al. 2025)","previouslyFormattedCitation":"(Acuto et al. 2022; Drăgan et al. 2025)"},"properties":{"noteIndex":0},"schema":"https://github.com/citation-style-language/schema/raw/master/csl-citation.json"}</w:instrText>
+        <w:instrText xml:space="preserve">ADDIN CSL_CITATION {"citationID":"MENDELEY_CITATION_549","citationItems":[{"id":"ITEM-548","isTemporary":false,"itemData":{"URL":"https://arxiv.org/abs/2212.11681","author":[{"family":"Acuto","given":"Alberto"},{"family":"Barillà","given":"Paola"},{"family":"Bozzolo","given":"Ludovico"},{"family":"Conterno","given":"Matteo"},{"family":"Pavese","given":"Mattia"},{"family":"Policicchio","given":"Antonio"}],"id":"Acuto2022","issued":{"date-parts":[[2022]]},"title":"Variational quantum soft actor-critic for robotic arm control","type":""}},{"id":"ITEM-549","isTemporary":false,"itemData":{"DOI":"10.5220/0013371800003890","ISBN":"978-989-758-737-5","author":[{"family":"Drăgan","given":"Theodora-Augustina"},{"family":"Künzner","given":"Alexander"},{"family":"Wille","given":"Robert"},{"family":"Lorenz","given":"Jeanette Miriam"}],"container-title":"Proceedings of the 17th international conference on agents and artificial intelligence (ICAART 2025)","id":"Dragan2025","issued":{"date-parts":[[2025]]},"page":"807-814","publisher":"SciTePress","publisher-place":"Setúbal, Portugal","title":"Continuous quantum reinforcement learning for robot navigation","type":"paper-conference","volume":"1"}}],"isEdited":false,"manualOverride":{"citeprocText":"(Acuto et al. 2022; Drăgan et al. 2025)","isManuallyOverridden":false,"manualOverrideText":""},"mendeley":{"formattedCitation":"(Acuto et al. 2022; Drăgan et al. 2025)","plainTextFormattedCitation":"(Acuto et al. 2022; Drăgan et al. 2025)","previouslyFormattedCitation":"(Acuto et al. 2022; Drăgan et al. 2025)"},"properties":{"noteIndex":0},"schema":"https://github.com/citation-style-language/schema/raw/master/csl-citation.json"}</w:instrText>
       </w:r>
       <w:r>
         <w:fldChar w:fldCharType="separate"/>
@@ -22478,7 +22028,7 @@
         <w:fldChar w:fldCharType="begin"/>
       </w:r>
       <w:r>
-        <w:instrText xml:space="preserve">ADDIN CSL_CITATION {"citationID":"MENDELEY_CITATION_553","citationItems":[{"id":"ITEM-553","isTemporary":false,"itemData":{"URL":"https://proceedings.mlr.press/v267/gerlach25a.html","author":[{"family":"Gerlach","given":"Thore"},{"family":"Lee","given":"Loong Kuan"},{"family":"Barbaresco","given":"Frederic"},{"family":"Piatkowski","given":"Nico"}],"collection-title":"Proceedings of machine learning research","container-title":"Proceedings of the 42nd international conference on machine learning","editor":[{"family":"Singh","given":"Aarti"},{"family":"Fazel","given":"Maryam"},{"family":"Hsu","given":"Daniel"},{"family":"Lacoste-Julien","given":"Simon"},{"family":"Berkenkamp","given":"Felix"},{"family":"Maharaj","given":"Tegan"},{"family":"Wagstaff","given":"Kiri"},{"family":"Zhu","given":"Jerry"}],"id":"Gerlach2025","issued":{"date-parts":[[2025]]},"page":"19161-19171","publisher":"PMLR","title":"Hybrid quantum-classical multi-agent pathfinding","type":"paper-conference","volume":"267"}}],"isEdited":false,"manualOverride":{"citeprocText":"(Gerlach et al. 2025)","isManuallyOverridden":false,"manualOverrideText":""},"mendeley":{"formattedCitation":"(Gerlach et al. 2025)","plainTextFormattedCitation":"(Gerlach et al. 2025)","previouslyFormattedCitation":"(Gerlach et al. 2025)"},"properties":{"noteIndex":0},"schema":"https://github.com/citation-style-language/schema/raw/master/csl-citation.json"}</w:instrText>
+        <w:instrText xml:space="preserve">ADDIN CSL_CITATION {"citationID":"MENDELEY_CITATION_553","citationItems":[{"id":"ITEM-553","isTemporary":false,"itemData":{"URL":"https://proceedings.mlr.press/v267/gerlach25a.html","author":[{"family":"Gerlach","given":"Thore"},{"family":"Lee","given":"Loong Kuan"},{"family":"Barbaresco","given":"Frederic"},{"family":"Piatkowski","given":"Nico"}],"collection-title":"Proceedings of machine learning research","container-title":"Proceedings of the 42nd international conference on machine learning","editor":[{"family":"Singh","given":"Aarti"},{"family":"Fazel","given":"Maryam"},{"family":"Hsu","given":"Daniel"},{"family":"Lacoste-Julien","given":"Simon"},{"family":"Berkenkamp","given":"Felix"},{"family":"Maharaj","given":"Tegan"},{"family":"Wagstaff","given":"Kiri"},{"family":"Zhu","given":"Jerry"}],"id":"Gerlach2025","issued":{"date-parts":[[2025]]},"page":"19161-19171","publisher":"PMLR","publisher-place":"Vancouver, Canada","title":"Hybrid quantum-classical multi-agent pathfinding","type":"paper-conference","volume":"267"}}],"isEdited":false,"manualOverride":{"citeprocText":"(Gerlach et al. 2025)","isManuallyOverridden":false,"manualOverrideText":""},"mendeley":{"formattedCitation":"(Gerlach et al. 2025)","plainTextFormattedCitation":"(Gerlach et al. 2025)","previouslyFormattedCitation":"(Gerlach et al. 2025)"},"properties":{"noteIndex":0},"schema":"https://github.com/citation-style-language/schema/raw/master/csl-citation.json"}</w:instrText>
       </w:r>
       <w:r>
         <w:fldChar w:fldCharType="separate"/>
@@ -22568,7 +22118,7 @@
         <w:fldChar w:fldCharType="begin"/>
       </w:r>
       <w:r>
-        <w:instrText xml:space="preserve">ADDIN CSL_CITATION {"citationID":"MENDELEY_CITATION_558","citationItems":[{"id":"ITEM-558","isTemporary":false,"itemData":{"URL":"https://arxiv.org/abs/2501.18432","author":[{"family":"Osaba","given":"Eneko"},{"family":"Miranda-Rodriguez","given":"Pablo"},{"family":"Oikonomakis","given":"Andreas"},{"family":"Petrič","given":"Matic"},{"family":"Ruiz","given":"Alejandra"},{"family":"Bock","given":"Sebastian"},{"family":"Kourtis","given":"Michail-Alexandros"}],"container-title":"2025 IEEE congress on evolutionary computation (CEC)","id":"OsabaDrone2025","issued":{"date-parts":[[2025]]},"publisher":"IEEE","title":"Solving drone routing problems with quantum computing: A hybrid approach combining quantum annealing and gate-based paradigms","title-short":"Solving drone routing problems with quantum computing","type":"paper-conference"}}],"isEdited":false,"manualOverride":{"citeprocText":"(Osaba, Miranda-Rodriguez, et al. 2025)","isManuallyOverridden":false,"manualOverrideText":""},"mendeley":{"formattedCitation":"(Osaba, Miranda-Rodriguez, et al. 2025)","plainTextFormattedCitation":"(Osaba, Miranda-Rodriguez, et al. 2025)","previouslyFormattedCitation":"(Osaba, Miranda-Rodriguez, et al. 2025)"},"properties":{"noteIndex":0},"schema":"https://github.com/citation-style-language/schema/raw/master/csl-citation.json"}</w:instrText>
+        <w:instrText xml:space="preserve">ADDIN CSL_CITATION {"citationID":"MENDELEY_CITATION_558","citationItems":[{"id":"ITEM-558","isTemporary":false,"itemData":{"DOI":"10.1109/CEC65147.2025.11042978","URL":"https://arxiv.org/abs/2501.18432","author":[{"family":"Osaba","given":"Eneko"},{"family":"Miranda-Rodriguez","given":"Pablo"},{"family":"Oikonomakis","given":"Andreas"},{"family":"Petrič","given":"Matic"},{"family":"Ruiz","given":"Alejandra"},{"family":"Bock","given":"Sebastian"},{"family":"Kourtis","given":"Michail-Alexandros"}],"container-title":"2025 IEEE congress on evolutionary computation (CEC)","id":"OsabaDrone2025","issued":{"date-parts":[[2025]]},"publisher":"IEEE","publisher-place":"Piscataway, NJ, USA","title":"Solving drone routing problems with quantum computing: A hybrid approach combining quantum annealing and gate-based paradigms","title-short":"Solving drone routing problems with quantum computing","type":"paper-conference"}}],"isEdited":false,"manualOverride":{"citeprocText":"(Osaba, Miranda-Rodriguez, et al. 2025)","isManuallyOverridden":false,"manualOverrideText":""},"mendeley":{"formattedCitation":"(Osaba, Miranda-Rodriguez, et al. 2025)","plainTextFormattedCitation":"(Osaba, Miranda-Rodriguez, et al. 2025)","previouslyFormattedCitation":"(Osaba, Miranda-Rodriguez, et al. 2025)"},"properties":{"noteIndex":0},"schema":"https://github.com/citation-style-language/schema/raw/master/csl-citation.json"}</w:instrText>
       </w:r>
       <w:r>
         <w:fldChar w:fldCharType="separate"/>
@@ -22802,7 +22352,7 @@
         <w:fldChar w:fldCharType="begin"/>
       </w:r>
       <w:r>
-        <w:instrText xml:space="preserve">ADDIN CSL_CITATION {"citationID":"MENDELEY_CITATION_570","citationItems":[{"id":"ITEM-570","isTemporary":false,"itemData":{"DOI":"10.1109/IISWC53511.2021.00015","author":[{"family":"Ravi","given":"Gokul Subramanian"},{"family":"Smith","given":"Kaitlin N."},{"family":"Gokhale","given":"Pranav"},{"family":"Chong","given":"Frederic T."}],"container-title":"2021 IEEE international symposium on workload characterization (IISWC)","id":"Ravi2021","issued":{"date-parts":[[2021]]},"page":"39-50","publisher":"IEEE","title":"Quantum computing in the cloud: Analyzing job and machine characteristics","title-short":"Quantum computing in the cloud","type":"paper-conference"}}],"isEdited":false,"manualOverride":{"citeprocText":"(Ravi et al. 2021)","isManuallyOverridden":false,"manualOverrideText":""},"mendeley":{"formattedCitation":"(Ravi et al. 2021)","plainTextFormattedCitation":"(Ravi et al. 2021)","previouslyFormattedCitation":"(Ravi et al. 2021)"},"properties":{"noteIndex":0},"schema":"https://github.com/citation-style-language/schema/raw/master/csl-citation.json"}</w:instrText>
+        <w:instrText xml:space="preserve">ADDIN CSL_CITATION {"citationID":"MENDELEY_CITATION_570","citationItems":[{"id":"ITEM-570","isTemporary":false,"itemData":{"DOI":"10.1109/IISWC53511.2021.00015","author":[{"family":"Ravi","given":"Gokul Subramanian"},{"family":"Smith","given":"Kaitlin N."},{"family":"Gokhale","given":"Pranav"},{"family":"Chong","given":"Frederic T."}],"container-title":"2021 IEEE international symposium on workload characterization (IISWC)","id":"Ravi2021","issued":{"date-parts":[[2021]]},"page":"39-50","publisher":"IEEE","publisher-place":"Piscataway, NJ, USA","title":"Quantum computing in the cloud: Analyzing job and machine characteristics","title-short":"Quantum computing in the cloud","type":"paper-conference"}}],"isEdited":false,"manualOverride":{"citeprocText":"(Ravi et al. 2021)","isManuallyOverridden":false,"manualOverrideText":""},"mendeley":{"formattedCitation":"(Ravi et al. 2021)","plainTextFormattedCitation":"(Ravi et al. 2021)","previouslyFormattedCitation":"(Ravi et al. 2021)"},"properties":{"noteIndex":0},"schema":"https://github.com/citation-style-language/schema/raw/master/csl-citation.json"}</w:instrText>
       </w:r>
       <w:r>
         <w:fldChar w:fldCharType="separate"/>
@@ -23005,7 +22555,7 @@
         <w:fldChar w:fldCharType="begin"/>
       </w:r>
       <w:r>
-        <w:instrText xml:space="preserve">ADDIN CSL_CITATION {"citationID":"MENDELEY_CITATION_577","citationItems":[{"id":"ITEM-577","isTemporary":false,"itemData":{"DOI":"10.1109/IISWC53511.2021.00015","author":[{"family":"Ravi","given":"Gokul Subramanian"},{"family":"Smith","given":"Kaitlin N."},{"family":"Gokhale","given":"Pranav"},{"family":"Chong","given":"Frederic T."}],"container-title":"2021 IEEE international symposium on workload characterization (IISWC)","id":"Ravi2021","issued":{"date-parts":[[2021]]},"page":"39-50","publisher":"IEEE","title":"Quantum computing in the cloud: Analyzing job and machine characteristics","title-short":"Quantum computing in the cloud","type":"paper-conference"},"suppress-author":false}],"isEdited":false,"manualOverride":{"citeprocText":"Ravi et al. (2021)","isManuallyOverridden":false,"manualOverrideText":""},"mendeley":{"formattedCitation":"Ravi et al. (2021)","plainTextFormattedCitation":"Ravi et al. (2021)","previouslyFormattedCitation":"Ravi et al. (2021)"},"properties":{"noteIndex":0},"schema":"https://github.com/citation-style-language/schema/raw/master/csl-citation.json"}</w:instrText>
+        <w:instrText xml:space="preserve">ADDIN CSL_CITATION {"citationID":"MENDELEY_CITATION_577","citationItems":[{"id":"ITEM-577","isTemporary":false,"itemData":{"DOI":"10.1109/IISWC53511.2021.00015","author":[{"family":"Ravi","given":"Gokul Subramanian"},{"family":"Smith","given":"Kaitlin N."},{"family":"Gokhale","given":"Pranav"},{"family":"Chong","given":"Frederic T."}],"container-title":"2021 IEEE international symposium on workload characterization (IISWC)","id":"Ravi2021","issued":{"date-parts":[[2021]]},"page":"39-50","publisher":"IEEE","publisher-place":"Piscataway, NJ, USA","title":"Quantum computing in the cloud: Analyzing job and machine characteristics","title-short":"Quantum computing in the cloud","type":"paper-conference"},"suppress-author":false}],"isEdited":false,"manualOverride":{"citeprocText":"Ravi et al. (2021)","isManuallyOverridden":false,"manualOverrideText":""},"mendeley":{"formattedCitation":"Ravi et al. (2021)","plainTextFormattedCitation":"Ravi et al. (2021)","previouslyFormattedCitation":"Ravi et al. (2021)"},"properties":{"noteIndex":0},"schema":"https://github.com/citation-style-language/schema/raw/master/csl-citation.json"}</w:instrText>
       </w:r>
       <w:r>
         <w:fldChar w:fldCharType="separate"/>
@@ -24630,7 +24180,7 @@
         <w:fldChar w:fldCharType="begin"/>
       </w:r>
       <w:r>
-        <w:instrText xml:space="preserve">ADDIN CSL_CITATION {"citationID":"MENDELEY_CITATION_603","citationItems":[{"id":"ITEM-603","isTemporary":false,"itemData":{"URL":"https://proceedings.mlr.press/v267/gerlach25a.html","author":[{"family":"Gerlach","given":"Thore"},{"family":"Lee","given":"Loong Kuan"},{"family":"Barbaresco","given":"Frederic"},{"family":"Piatkowski","given":"Nico"}],"collection-title":"Proceedings of machine learning research","container-title":"Proceedings of the 42nd international conference on machine learning","editor":[{"family":"Singh","given":"Aarti"},{"family":"Fazel","given":"Maryam"},{"family":"Hsu","given":"Daniel"},{"family":"Lacoste-Julien","given":"Simon"},{"family":"Berkenkamp","given":"Felix"},{"family":"Maharaj","given":"Tegan"},{"family":"Wagstaff","given":"Kiri"},{"family":"Zhu","given":"Jerry"}],"id":"Gerlach2025","issued":{"date-parts":[[2025]]},"page":"19161-19171","publisher":"PMLR","title":"Hybrid quantum-classical multi-agent pathfinding","type":"paper-conference","volume":"267"}}],"isEdited":false,"manualOverride":{"citeprocText":"(Gerlach et al. 2025)","isManuallyOverridden":false,"manualOverrideText":""},"mendeley":{"formattedCitation":"(Gerlach et al. 2025)","plainTextFormattedCitation":"(Gerlach et al. 2025)","previouslyFormattedCitation":"(Gerlach et al. 2025)"},"properties":{"noteIndex":0},"schema":"https://github.com/citation-style-language/schema/raw/master/csl-citation.json"}</w:instrText>
+        <w:instrText xml:space="preserve">ADDIN CSL_CITATION {"citationID":"MENDELEY_CITATION_603","citationItems":[{"id":"ITEM-603","isTemporary":false,"itemData":{"URL":"https://proceedings.mlr.press/v267/gerlach25a.html","author":[{"family":"Gerlach","given":"Thore"},{"family":"Lee","given":"Loong Kuan"},{"family":"Barbaresco","given":"Frederic"},{"family":"Piatkowski","given":"Nico"}],"collection-title":"Proceedings of machine learning research","container-title":"Proceedings of the 42nd international conference on machine learning","editor":[{"family":"Singh","given":"Aarti"},{"family":"Fazel","given":"Maryam"},{"family":"Hsu","given":"Daniel"},{"family":"Lacoste-Julien","given":"Simon"},{"family":"Berkenkamp","given":"Felix"},{"family":"Maharaj","given":"Tegan"},{"family":"Wagstaff","given":"Kiri"},{"family":"Zhu","given":"Jerry"}],"id":"Gerlach2025","issued":{"date-parts":[[2025]]},"page":"19161-19171","publisher":"PMLR","publisher-place":"Vancouver, Canada","title":"Hybrid quantum-classical multi-agent pathfinding","type":"paper-conference","volume":"267"}}],"isEdited":false,"manualOverride":{"citeprocText":"(Gerlach et al. 2025)","isManuallyOverridden":false,"manualOverrideText":""},"mendeley":{"formattedCitation":"(Gerlach et al. 2025)","plainTextFormattedCitation":"(Gerlach et al. 2025)","previouslyFormattedCitation":"(Gerlach et al. 2025)"},"properties":{"noteIndex":0},"schema":"https://github.com/citation-style-language/schema/raw/master/csl-citation.json"}</w:instrText>
       </w:r>
       <w:r>
         <w:fldChar w:fldCharType="separate"/>
@@ -24693,7 +24243,7 @@
         <w:fldChar w:fldCharType="begin"/>
       </w:r>
       <w:r>
-        <w:instrText xml:space="preserve">ADDIN CSL_CITATION {"citationID":"MENDELEY_CITATION_605","citationItems":[{"id":"ITEM-605","isTemporary":false,"itemData":{"DOI":"10.1109/ROBOT.1999.772544","author":[{"family":"Dellaert","given":"Frank"},{"family":"Fox","given":"Dieter"},{"family":"Burgard","given":"Wolfram"},{"family":"Thrun","given":"Sebastian"}],"container-title":"Proceedings of the 1999 IEEE international conference on robotics and automation (ICRA)","id":"Dellaert1999","issued":{"date-parts":[[1999]]},"page":"1322-1328","publisher":"IEEE","title":"Monte Carlo localization for mobile robots","type":"paper-conference","volume":"2"}}],"isEdited":false,"manualOverride":{"citeprocText":"(Dellaert et al. 1999)","isManuallyOverridden":false,"manualOverrideText":""},"mendeley":{"formattedCitation":"(Dellaert et al. 1999)","plainTextFormattedCitation":"(Dellaert et al. 1999)","previouslyFormattedCitation":"(Dellaert et al. 1999)"},"properties":{"noteIndex":0},"schema":"https://github.com/citation-style-language/schema/raw/master/csl-citation.json"}</w:instrText>
+        <w:instrText xml:space="preserve">ADDIN CSL_CITATION {"citationID":"MENDELEY_CITATION_605","citationItems":[{"id":"ITEM-605","isTemporary":false,"itemData":{"DOI":"10.1109/ROBOT.1999.772544","author":[{"family":"Dellaert","given":"Frank"},{"family":"Fox","given":"Dieter"},{"family":"Burgard","given":"Wolfram"},{"family":"Thrun","given":"Sebastian"}],"container-title":"Proceedings of the 1999 IEEE international conference on robotics and automation (ICRA)","id":"Dellaert1999","issued":{"date-parts":[[1999]]},"page":"1322-1328","publisher":"IEEE","publisher-place":"Piscataway, NJ, USA","title":"Monte Carlo localization for mobile robots","type":"paper-conference","volume":"2"}}],"isEdited":false,"manualOverride":{"citeprocText":"(Dellaert et al. 1999)","isManuallyOverridden":false,"manualOverrideText":""},"mendeley":{"formattedCitation":"(Dellaert et al. 1999)","plainTextFormattedCitation":"(Dellaert et al. 1999)","previouslyFormattedCitation":"(Dellaert et al. 1999)"},"properties":{"noteIndex":0},"schema":"https://github.com/citation-style-language/schema/raw/master/csl-citation.json"}</w:instrText>
       </w:r>
       <w:r>
         <w:fldChar w:fldCharType="separate"/>
@@ -25091,7 +24641,7 @@
         <w:fldChar w:fldCharType="begin"/>
       </w:r>
       <w:r>
-        <w:instrText xml:space="preserve">ADDIN CSL_CITATION {"citationID":"MENDELEY_CITATION_621","citationItems":[{"id":"ITEM-621","isTemporary":false,"itemData":{"URL":"https://arxiv.org/abs/2202.03028","author":[{"family":"Finžgar","given":"Jernej Rudi"},{"family":"Ross","given":"Philipp"},{"family":"Hölscher","given":"Leonhard"},{"family":"Klepsch","given":"Johannes"},{"family":"Luckow","given":"Andre"}],"container-title":"2022 IEEE international conference on quantum computing and engineering (QCE)","id":"Finzgar2022","issued":{"date-parts":[[2022]]},"publisher":"IEEE","title":"QUARK: A framework for quantum computing application benchmarking","title-short":"QUARK","type":"paper-conference"}}],"isEdited":false,"manualOverride":{"citeprocText":"(Finžgar et al. 2022)","isManuallyOverridden":false,"manualOverrideText":""},"mendeley":{"formattedCitation":"(Finžgar et al. 2022)","plainTextFormattedCitation":"(Finžgar et al. 2022)","previouslyFormattedCitation":"(Finžgar et al. 2022)"},"properties":{"noteIndex":0},"schema":"https://github.com/citation-style-language/schema/raw/master/csl-citation.json"}</w:instrText>
+        <w:instrText xml:space="preserve">ADDIN CSL_CITATION {"citationID":"MENDELEY_CITATION_621","citationItems":[{"id":"ITEM-621","isTemporary":false,"itemData":{"URL":"https://arxiv.org/abs/2202.03028","author":[{"family":"Finžgar","given":"Jernej Rudi"},{"family":"Ross","given":"Philipp"},{"family":"Hölscher","given":"Leonhard"},{"family":"Klepsch","given":"Johannes"},{"family":"Luckow","given":"Andre"}],"container-title":"2022 IEEE international conference on quantum computing and engineering (QCE)","id":"Finzgar2022","issued":{"date-parts":[[2022]]},"page":"226-237","publisher":"IEEE","publisher-place":"Piscataway, NJ, USA","title":"QUARK: A framework for quantum computing application benchmarking","title-short":"QUARK","type":"paper-conference"}}],"isEdited":false,"manualOverride":{"citeprocText":"(Finžgar et al. 2022)","isManuallyOverridden":false,"manualOverrideText":""},"mendeley":{"formattedCitation":"(Finžgar et al. 2022)","plainTextFormattedCitation":"(Finžgar et al. 2022)","previouslyFormattedCitation":"(Finžgar et al. 2022)"},"properties":{"noteIndex":0},"schema":"https://github.com/citation-style-language/schema/raw/master/csl-citation.json"}</w:instrText>
       </w:r>
       <w:r>
         <w:fldChar w:fldCharType="separate"/>
@@ -25886,7 +25436,7 @@
               <w:fldChar w:fldCharType="begin"/>
             </w:r>
             <w:r>
-              <w:instrText xml:space="preserve">ADDIN CSL_CITATION {"citationID":"MENDELEY_CITATION_633","citationItems":[{"id":"ITEM-631","isTemporary":false,"itemData":{"DOI":"10.1038/s41598-025-28481-w","author":[{"family":"Quang","given":"Thinh Nguyen"},{"family":"Matsuyama","given":"Kosuke"},{"family":"Shimizu","given":"Keisuke"},{"family":"Sugano","given":"Hiroki"},{"family":"Kurimoto","given":"Eiji"},{"family":"Miki","given":"Masahiro"},{"family":"Suzuki","given":"Jumpei"},{"family":"Chen","given":"Ziyi"},{"family":"Waidyasooriya","given":"Hasitha Muthumala"},{"family":"Hariyama","given":"Masanori"},{"family":"Hitomi","given":"Masaru"},{"family":"Sawamura","given":"Kenta"},{"family":"Ohzeki","given":"Masayuki"}],"container-title":"Scientific Reports","id":"Quang2025","issued":{"date-parts":[[2025]]},"page":"44047","publisher":"Nature Publishing Group","title":"Quantum annealing-based route optimization for commercial AGV operating systems in large-scale logistics warehouses","type":"article-journal","volume":"15"}},{"id":"ITEM-632","isTemporary":false,"itemData":{"URL":"https://proceedings.mlr.press/v267/gerlach25a.html","author":[{"family":"Gerlach","given":"Thore"},{"family":"Lee","given":"Loong Kuan"},{"family":"Barbaresco","given":"Frederic"},{"family":"Piatkowski","given":"Nico"}],"collection-title":"Proceedings of machine learning research","container-title":"Proceedings of the 42nd international conference on machine learning","editor":[{"family":"Singh","given":"Aarti"},{"family":"Fazel","given":"Maryam"},{"family":"Hsu","given":"Daniel"},{"family":"Lacoste-Julien","given":"Simon"},{"family":"Berkenkamp","given":"Felix"},{"family":"Maharaj","given":"Tegan"},{"family":"Wagstaff","given":"Kiri"},{"family":"Zhu","given":"Jerry"}],"id":"Gerlach2025","issued":{"date-parts":[[2025]]},"page":"19161-19171","publisher":"PMLR","title":"Hybrid quantum-classical multi-agent pathfinding","type":"paper-conference","volume":"267"}},{"id":"ITEM-633","isTemporary":false,"itemData":{"DOI":"10.1126/sciadv.aav2372","author":[{"family":"Goto","given":"Hayato"},{"family":"Tatsumura","given":"Kosuke"},{"family":"Dixon","given":"Alexander R."}],"container-title":"Science Advances","id":"Goto2019","issue":"4","issued":{"date-parts":[[2019]]},"page":"eaav2372","publisher":"American Association for the Advancement of Science","title":"Combinatorial optimization by simulating adiabatic bifurcations in nonlinear Hamiltonian systems","type":"article-journal","volume":"5"}}],"isEdited":false,"manualOverride":{"citeprocText":"(Quang et al. 2025; Gerlach et al. 2025; Goto, Tatsumura, and Dixon 2019)","isManuallyOverridden":false,"manualOverrideText":""},"mendeley":{"formattedCitation":"(Quang et al. 2025; Gerlach et al. 2025; Goto, Tatsumura, and Dixon 2019)","plainTextFormattedCitation":"(Quang et al. 2025; Gerlach et al. 2025; Goto, Tatsumura, and Dixon 2019)","previouslyFormattedCitation":"(Quang et al. 2025; Gerlach et al. 2025; Goto, Tatsumura, and Dixon 2019)"},"properties":{"noteIndex":0},"schema":"https://github.com/citation-style-language/schema/raw/master/csl-citation.json"}</w:instrText>
+              <w:instrText xml:space="preserve">ADDIN CSL_CITATION {"citationID":"MENDELEY_CITATION_633","citationItems":[{"id":"ITEM-631","isTemporary":false,"itemData":{"DOI":"10.1038/s41598-025-28481-w","author":[{"family":"Quang","given":"Thinh Nguyen"},{"family":"Matsuyama","given":"Kosuke"},{"family":"Shimizu","given":"Keisuke"},{"family":"Sugano","given":"Hiroki"},{"family":"Kurimoto","given":"Eiji"},{"family":"Miki","given":"Masahiro"},{"family":"Suzuki","given":"Jumpei"},{"family":"Chen","given":"Ziyi"},{"family":"Waidyasooriya","given":"Hasitha Muthumala"},{"family":"Hariyama","given":"Masanori"},{"family":"Hitomi","given":"Masaru"},{"family":"Sawamura","given":"Kenta"},{"family":"Ohzeki","given":"Masayuki"}],"container-title":"Scientific Reports","id":"Quang2025","issued":{"date-parts":[[2025]]},"page":"44047","publisher":"Nature Publishing Group","title":"Quantum annealing-based route optimization for commercial AGV operating systems in large-scale logistics warehouses","type":"article-journal","volume":"15"}},{"id":"ITEM-632","isTemporary":false,"itemData":{"URL":"https://proceedings.mlr.press/v267/gerlach25a.html","author":[{"family":"Gerlach","given":"Thore"},{"family":"Lee","given":"Loong Kuan"},{"family":"Barbaresco","given":"Frederic"},{"family":"Piatkowski","given":"Nico"}],"collection-title":"Proceedings of machine learning research","container-title":"Proceedings of the 42nd international conference on machine learning","editor":[{"family":"Singh","given":"Aarti"},{"family":"Fazel","given":"Maryam"},{"family":"Hsu","given":"Daniel"},{"family":"Lacoste-Julien","given":"Simon"},{"family":"Berkenkamp","given":"Felix"},{"family":"Maharaj","given":"Tegan"},{"family":"Wagstaff","given":"Kiri"},{"family":"Zhu","given":"Jerry"}],"id":"Gerlach2025","issued":{"date-parts":[[2025]]},"page":"19161-19171","publisher":"PMLR","publisher-place":"Vancouver, Canada","title":"Hybrid quantum-classical multi-agent pathfinding","type":"paper-conference","volume":"267"}},{"id":"ITEM-633","isTemporary":false,"itemData":{"DOI":"10.1126/sciadv.aav2372","author":[{"family":"Goto","given":"Hayato"},{"family":"Tatsumura","given":"Kosuke"},{"family":"Dixon","given":"Alexander R."}],"container-title":"Science Advances","id":"Goto2019","issue":"4","issued":{"date-parts":[[2019]]},"page":"eaav2372","publisher":"American Association for the Advancement of Science","title":"Combinatorial optimization by simulating adiabatic bifurcations in nonlinear Hamiltonian systems","type":"article-journal","volume":"5"}}],"isEdited":false,"manualOverride":{"citeprocText":"(Quang et al. 2025; Gerlach et al. 2025; Goto, Tatsumura, and Dixon 2019)","isManuallyOverridden":false,"manualOverrideText":""},"mendeley":{"formattedCitation":"(Quang et al. 2025; Gerlach et al. 2025; Goto, Tatsumura, and Dixon 2019)","plainTextFormattedCitation":"(Quang et al. 2025; Gerlach et al. 2025; Goto, Tatsumura, and Dixon 2019)","previouslyFormattedCitation":"(Quang et al. 2025; Gerlach et al. 2025; Goto, Tatsumura, and Dixon 2019)"},"properties":{"noteIndex":0},"schema":"https://github.com/citation-style-language/schema/raw/master/csl-citation.json"}</w:instrText>
             </w:r>
             <w:r>
               <w:fldChar w:fldCharType="separate"/>
@@ -26242,7 +25792,7 @@
               <w:fldChar w:fldCharType="begin"/>
             </w:r>
             <w:r>
-              <w:instrText xml:space="preserve">ADDIN CSL_CITATION {"citationID":"MENDELEY_CITATION_642","citationItems":[{"id":"ITEM-641","isTemporary":false,"itemData":{"DOI":"10.1145/3445814.3446758","author":[{"family":"Tang","given":"Wei"},{"family":"Tomesh","given":"Teague"},{"family":"Suchara","given":"Martin"},{"family":"Larson","given":"Jeffrey"},{"family":"Martonosi","given":"Margaret"}],"container-title":"Proceedings of the 26th ACM international conference on architectural support for programming languages and operating systems (ASPLOS ’21)","id":"Tang2021","issued":{"date-parts":[[2021]]},"page":"473-486","publisher":"Association for Computing Machinery","publisher-place":"New York, NY, USA","title":"CutQC: Using small quantum computers for large quantum circuit evaluations","title-short":"CutQC","type":"paper-conference"}},{"id":"ITEM-642","isTemporary":false,"itemData":{"DOI":"10.1109/ICDCS54860.2022.00151","author":[{"family":"Yun","given":"Won Joon"},{"family":"Kwak","given":"Yunseok"},{"family":"Kim","given":"Jae Pyoung"},{"family":"Cho","given":"Hyunhee"},{"family":"Jung","given":"Soyi"},{"family":"Park","given":"Jihong"},{"family":"Kim","given":"Joongheon"}],"container-title":"Proceedings of the 2022 IEEE 42nd international conference on distributed computing systems (ICDCS)","id":"Yun2022","issued":{"date-parts":[[2022]]},"page":"1332-1335","publisher":"IEEE","title":"Quantum multi-agent reinforcement learning via variational quantum circuit design","type":"paper-conference"}}],"isEdited":false,"manualOverride":{"citeprocText":"(W. Tang et al. 2021; Yun et al. 2022)","isManuallyOverridden":false,"manualOverrideText":""},"mendeley":{"formattedCitation":"(W. Tang et al. 2021; Yun et al. 2022)","plainTextFormattedCitation":"(W. Tang et al. 2021; Yun et al. 2022)","previouslyFormattedCitation":"(W. Tang et al. 2021; Yun et al. 2022)"},"properties":{"noteIndex":0},"schema":"https://github.com/citation-style-language/schema/raw/master/csl-citation.json"}</w:instrText>
+              <w:instrText xml:space="preserve">ADDIN CSL_CITATION {"citationID":"MENDELEY_CITATION_642","citationItems":[{"id":"ITEM-641","isTemporary":false,"itemData":{"DOI":"10.1145/3445814.3446758","author":[{"family":"Tang","given":"Wei"},{"family":"Tomesh","given":"Teague"},{"family":"Suchara","given":"Martin"},{"family":"Larson","given":"Jeffrey"},{"family":"Martonosi","given":"Margaret"}],"container-title":"Proceedings of the 26th ACM international conference on architectural support for programming languages and operating systems (ASPLOS ’21)","id":"Tang2021","issued":{"date-parts":[[2021]]},"page":"473-486","publisher":"Association for Computing Machinery","publisher-place":"New York, NY, USA","title":"CutQC: Using small quantum computers for large quantum circuit evaluations","title-short":"CutQC","type":"paper-conference"}},{"id":"ITEM-642","isTemporary":false,"itemData":{"DOI":"10.1109/ICDCS54860.2022.00151","author":[{"family":"Yun","given":"Won Joon"},{"family":"Kwak","given":"Yunseok"},{"family":"Kim","given":"Jae Pyoung"},{"family":"Cho","given":"Hyunhee"},{"family":"Jung","given":"Soyi"},{"family":"Park","given":"Jihong"},{"family":"Kim","given":"Joongheon"}],"container-title":"Proceedings of the 2022 IEEE 42nd international conference on distributed computing systems (ICDCS)","id":"Yun2022","issued":{"date-parts":[[2022]]},"page":"1332-1335","publisher":"IEEE","publisher-place":"Piscataway, NJ, USA","title":"Quantum multi-agent reinforcement learning via variational quantum circuit design","type":"paper-conference"}}],"isEdited":false,"manualOverride":{"citeprocText":"(W. Tang et al. 2021; Yun et al. 2022)","isManuallyOverridden":false,"manualOverrideText":""},"mendeley":{"formattedCitation":"(W. Tang et al. 2021; Yun et al. 2022)","plainTextFormattedCitation":"(W. Tang et al. 2021; Yun et al. 2022)","previouslyFormattedCitation":"(W. Tang et al. 2021; Yun et al. 2022)"},"properties":{"noteIndex":0},"schema":"https://github.com/citation-style-language/schema/raw/master/csl-citation.json"}</w:instrText>
             </w:r>
             <w:r>
               <w:fldChar w:fldCharType="separate"/>
@@ -27200,7 +26750,7 @@
         <w:t xml:space="preserve">)</w:t>
       </w:r>
       <w:r>
-        <w:t xml:space="preserve">, 13122–33. IEEE.</w:t>
+        <w:t xml:space="preserve">, 13122–33. Piscataway, NJ, USA: IEEE.</w:t>
       </w:r>
       <w:r>
         <w:t xml:space="preserve"> </w:t>
@@ -27341,7 +26891,7 @@
         <w:t xml:space="preserve">Quantum Computation and Information</w:t>
       </w:r>
       <w:r>
-        <w:t xml:space="preserve">, edited by Samuel J. Lomonaco Jr., 305:53–74. Contemporary Mathematics. American Mathematical Society.</w:t>
+        <w:t xml:space="preserve">, edited by Samuel J. Lomonaco Jr., 305:53–74. Contemporary Mathematics. Providence, RI, USA: American Mathematical Society.</w:t>
       </w:r>
       <w:r>
         <w:t xml:space="preserve"> </w:t>
@@ -28414,7 +27964,7 @@
         <w:t xml:space="preserve">)</w:t>
       </w:r>
       <w:r>
-        <w:t xml:space="preserve">, 2:1322–28. IEEE.</w:t>
+        <w:t xml:space="preserve">, 2:1322–28. Piscataway, NJ, USA: IEEE.</w:t>
       </w:r>
       <w:r>
         <w:t xml:space="preserve"> </w:t>
@@ -28609,7 +28159,7 @@
         <w:t xml:space="preserve">)</w:t>
       </w:r>
       <w:r>
-        <w:t xml:space="preserve">, 417–27. IEEE.</w:t>
+        <w:t xml:space="preserve">, 417–27. Piscataway, NJ, USA: IEEE.</w:t>
       </w:r>
     </w:p>
     <w:bookmarkEnd w:id="244"/>
@@ -28847,7 +28397,13 @@
         <w:t xml:space="preserve">2025)</w:t>
       </w:r>
       <w:r>
-        <w:t xml:space="preserve">, 1:807–14. SciTePress.</w:t>
+        <w:t xml:space="preserve">, 1:807–14. Set</w:t>
+      </w:r>
+      <w:r>
+        <w:t xml:space="preserve">ú</w:t>
+      </w:r>
+      <w:r>
+        <w:t xml:space="preserve">bal, Portugal: SciTePress.</w:t>
       </w:r>
       <w:r>
         <w:t xml:space="preserve"> </w:t>
@@ -29092,7 +28648,7 @@
         <w:t xml:space="preserve">)</w:t>
       </w:r>
       <w:r>
-        <w:t xml:space="preserve">. IEEE.</w:t>
+        <w:t xml:space="preserve">. Piscataway, NJ, USA: IEEE.</w:t>
       </w:r>
       <w:r>
         <w:t xml:space="preserve"> </w:t>
@@ -29253,7 +28809,7 @@
         <w:t xml:space="preserve">)</w:t>
       </w:r>
       <w:r>
-        <w:t xml:space="preserve">. IEEE.</w:t>
+        <w:t xml:space="preserve">, 226–37. Piscataway, NJ, USA: IEEE.</w:t>
       </w:r>
       <w:r>
         <w:t xml:space="preserve"> </w:t>
@@ -29486,7 +29042,7 @@
         <w:t xml:space="preserve">Proceedings of the 42nd International Conference on Machine Learning</w:t>
       </w:r>
       <w:r>
-        <w:t xml:space="preserve">, edited by Aarti Singh, Maryam Fazel, Daniel Hsu, Simon Lacoste-Julien, Felix Berkenkamp, Tegan Maharaj, Kiri Wagstaff, and Jerry Zhu, 267:19161–71. Proceedings of Machine Learning Research. PMLR.</w:t>
+        <w:t xml:space="preserve">, edited by Aarti Singh, Maryam Fazel, Daniel Hsu, Simon Lacoste-Julien, Felix Berkenkamp, Tegan Maharaj, Kiri Wagstaff, and Jerry Zhu, 267:19161–71. Proceedings of Machine Learning Research. Vancouver, Canada: PMLR.</w:t>
       </w:r>
       <w:r>
         <w:t xml:space="preserve"> </w:t>
@@ -29623,7 +29179,7 @@
         <w:t xml:space="preserve">)</w:t>
       </w:r>
       <w:r>
-        <w:t xml:space="preserve">, 9182–91. IEEE.</w:t>
+        <w:t xml:space="preserve">, 9182–91. Piscataway, NJ, USA: IEEE.</w:t>
       </w:r>
     </w:p>
     <w:bookmarkEnd w:id="285"/>
@@ -29718,7 +29274,10 @@
         <w:t xml:space="preserve">Nature</w:t>
       </w:r>
       <w:r>
-        <w:t xml:space="preserve">.</w:t>
+        <w:t xml:space="preserve"> </w:t>
+      </w:r>
+      <w:r>
+        <w:t xml:space="preserve">638: 920–26.</w:t>
       </w:r>
       <w:r>
         <w:t xml:space="preserve"> </w:t>
@@ -30415,7 +29974,7 @@
         <w:t xml:space="preserve">Advances in Neural Information Processing Systems</w:t>
       </w:r>
       <w:r>
-        <w:t xml:space="preserve">, 34:28362–75.</w:t>
+        <w:t xml:space="preserve">, 34:28362–75. Red Hook, NY, USA: Curran Associates, Inc.</w:t>
       </w:r>
       <w:r>
         <w:t xml:space="preserve"> </w:t>
@@ -31022,7 +30581,13 @@
         <w:t xml:space="preserve">)</w:t>
       </w:r>
       <w:r>
-        <w:t xml:space="preserve">, 393–400.</w:t>
+        <w:t xml:space="preserve">, 393–400. Set</w:t>
+      </w:r>
+      <w:r>
+        <w:t xml:space="preserve">ú</w:t>
+      </w:r>
+      <w:r>
+        <w:t xml:space="preserve">bal, Portugal: SciTePress.</w:t>
       </w:r>
       <w:r>
         <w:t xml:space="preserve"> </w:t>
@@ -31872,7 +31437,7 @@
         <w:t xml:space="preserve">)</w:t>
       </w:r>
       <w:r>
-        <w:t xml:space="preserve">, 529–37. IEEE.</w:t>
+        <w:t xml:space="preserve">, 529–37. Piscataway, NJ, USA: IEEE.</w:t>
       </w:r>
     </w:p>
     <w:bookmarkEnd w:id="378"/>
@@ -32501,7 +32066,7 @@
         <w:t xml:space="preserve">)</w:t>
       </w:r>
       <w:r>
-        <w:t xml:space="preserve">. IEEE.</w:t>
+        <w:t xml:space="preserve">. Piscataway, NJ, USA: IEEE.</w:t>
       </w:r>
       <w:r>
         <w:t xml:space="preserve"> </w:t>
@@ -32511,7 +32076,7 @@
           <w:rPr>
             <w:rStyle w:val="Hyperlink"/>
           </w:rPr>
-          <w:t xml:space="preserve">https://arxiv.org/abs/2501.18432</w:t>
+          <w:t xml:space="preserve">https://doi.org/10.1109/CEC65147.2025.11042978</w:t>
         </w:r>
       </w:hyperlink>
       <w:r>
@@ -32833,7 +32398,7 @@
         <w:t xml:space="preserve">)</w:t>
       </w:r>
       <w:r>
-        <w:t xml:space="preserve">, 803–10. IEEE.</w:t>
+        <w:t xml:space="preserve">, 803–10. Piscataway, NJ, USA: IEEE.</w:t>
       </w:r>
       <w:r>
         <w:t xml:space="preserve"> </w:t>
@@ -33104,7 +32669,7 @@
         <w:t xml:space="preserve">’07)</w:t>
       </w:r>
       <w:r>
-        <w:t xml:space="preserve">. IEEE.</w:t>
+        <w:t xml:space="preserve">. Piscataway, NJ, USA: IEEE.</w:t>
       </w:r>
     </w:p>
     <w:bookmarkEnd w:id="424"/>
@@ -33211,7 +32776,7 @@
         <w:t xml:space="preserve">)</w:t>
       </w:r>
       <w:r>
-        <w:t xml:space="preserve">, 39–50. IEEE.</w:t>
+        <w:t xml:space="preserve">, 39–50. Piscataway, NJ, USA: IEEE.</w:t>
       </w:r>
       <w:r>
         <w:t xml:space="preserve"> </w:t>
@@ -33803,7 +33368,7 @@
         <w:t xml:space="preserve">)</w:t>
       </w:r>
       <w:r>
-        <w:t xml:space="preserve">, 7586–96. IEEE.</w:t>
+        <w:t xml:space="preserve">, 7586–96. Piscataway, NJ, USA: IEEE.</w:t>
       </w:r>
     </w:p>
     <w:bookmarkEnd w:id="450"/>
@@ -34170,7 +33735,7 @@
         <w:t xml:space="preserve">Quantum Robotics: A Primer on Current Science and Future Perspectives</w:t>
       </w:r>
       <w:r>
-        <w:t xml:space="preserve">. Synthesis Lectures on Quantum Computing. Morgan &amp; Claypool Publishers.</w:t>
+        <w:t xml:space="preserve">. Synthesis Lectures on Quantum Computing. San Rafael, CA, USA: Morgan &amp; Claypool Publishers.</w:t>
       </w:r>
       <w:r>
         <w:t xml:space="preserve"> </w:t>
@@ -34692,7 +34257,7 @@
         <w:t xml:space="preserve">)</w:t>
       </w:r>
       <w:r>
-        <w:t xml:space="preserve">. IEEE.</w:t>
+        <w:t xml:space="preserve">. Piscataway, NJ, USA: IEEE.</w:t>
       </w:r>
       <w:r>
         <w:t xml:space="preserve"> </w:t>
@@ -35255,7 +34820,7 @@
         <w:t xml:space="preserve">)</w:t>
       </w:r>
       <w:r>
-        <w:t xml:space="preserve">, 35091–100.</w:t>
+        <w:t xml:space="preserve">, 35091–100. Piscataway, NJ, USA: IEEE.</w:t>
       </w:r>
       <w:r>
         <w:t xml:space="preserve"> </w:t>
@@ -35346,7 +34911,7 @@
         <w:t xml:space="preserve">)</w:t>
       </w:r>
       <w:r>
-        <w:t xml:space="preserve">, 1332–35. IEEE.</w:t>
+        <w:t xml:space="preserve">, 1332–35. Piscataway, NJ, USA: IEEE.</w:t>
       </w:r>
       <w:r>
         <w:t xml:space="preserve"> </w:t>
@@ -35437,7 +35002,7 @@
         <w:t xml:space="preserve">)</w:t>
       </w:r>
       <w:r>
-        <w:t xml:space="preserve">, 8811–22. IEEE.</w:t>
+        <w:t xml:space="preserve">, 8811–22. Piscataway, NJ, USA: IEEE.</w:t>
       </w:r>
     </w:p>
     <w:bookmarkEnd w:id="509"/>

</xml_diff>

<commit_message>
Survey 1: abstract to CSUR rules (98 words, no first person); spell out keyword acronyms
</commit_message>
<xml_diff>
--- a/github/k/Survey1_ACM_CSUR_Manuscript.docx
+++ b/github/k/Survey1_ACM_CSUR_Manuscript.docx
@@ -303,7 +303,31 @@
         <w:t xml:space="preserve"> </w:t>
       </w:r>
       <w:r>
-        <w:t xml:space="preserve">speed-ups</w:t>
+        <w:t xml:space="preserve">faster</w:t>
+      </w:r>
+      <w:r>
+        <w:t xml:space="preserve"> </w:t>
+      </w:r>
+      <w:r>
+        <w:t xml:space="preserve">optimization,</w:t>
+      </w:r>
+      <w:r>
+        <w:t xml:space="preserve"> </w:t>
+      </w:r>
+      <w:r>
+        <w:t xml:space="preserve">search,</w:t>
+      </w:r>
+      <w:r>
+        <w:t xml:space="preserve"> </w:t>
+      </w:r>
+      <w:r>
+        <w:t xml:space="preserve">and</w:t>
+      </w:r>
+      <w:r>
+        <w:t xml:space="preserve"> </w:t>
+      </w:r>
+      <w:r>
+        <w:t xml:space="preserve">learning</w:t>
       </w:r>
       <w:r>
         <w:t xml:space="preserve"> </w:t>
@@ -315,19 +339,49 @@
         <w:t xml:space="preserve"> </w:t>
       </w:r>
       <w:r>
-        <w:t xml:space="preserve">optimization,</w:t>
-      </w:r>
-      <w:r>
-        <w:t xml:space="preserve"> </w:t>
-      </w:r>
-      <w:r>
-        <w:t xml:space="preserve">search,</w:t>
-      </w:r>
-      <w:r>
-        <w:t xml:space="preserve"> </w:t>
-      </w:r>
-      <w:r>
-        <w:t xml:space="preserve">sampling,</w:t>
+        <w:t xml:space="preserve">autonomous</w:t>
+      </w:r>
+      <w:r>
+        <w:t xml:space="preserve"> </w:t>
+      </w:r>
+      <w:r>
+        <w:t xml:space="preserve">robots,</w:t>
+      </w:r>
+      <w:r>
+        <w:t xml:space="preserve"> </w:t>
+      </w:r>
+      <w:r>
+        <w:t xml:space="preserve">but</w:t>
+      </w:r>
+      <w:r>
+        <w:t xml:space="preserve"> </w:t>
+      </w:r>
+      <w:r>
+        <w:t xml:space="preserve">published</w:t>
+      </w:r>
+      <w:r>
+        <w:t xml:space="preserve"> </w:t>
+      </w:r>
+      <w:r>
+        <w:t xml:space="preserve">claims</w:t>
+      </w:r>
+      <w:r>
+        <w:t xml:space="preserve"> </w:t>
+      </w:r>
+      <w:r>
+        <w:t xml:space="preserve">mix</w:t>
+      </w:r>
+      <w:r>
+        <w:t xml:space="preserve"> </w:t>
+      </w:r>
+      <w:r>
+        <w:t xml:space="preserve">theory,</w:t>
+      </w:r>
+      <w:r>
+        <w:t xml:space="preserve"> </w:t>
+      </w:r>
+      <w:r>
+        <w:t xml:space="preserve">simulation,</w:t>
       </w:r>
       <w:r>
         <w:t xml:space="preserve"> </w:t>
@@ -339,49 +393,253 @@
         <w:t xml:space="preserve"> </w:t>
       </w:r>
       <w:r>
-        <w:t xml:space="preserve">learning,</w:t>
-      </w:r>
-      <w:r>
-        <w:t xml:space="preserve"> </w:t>
-      </w:r>
-      <w:r>
-        <w:t xml:space="preserve">the</w:t>
-      </w:r>
-      <w:r>
-        <w:t xml:space="preserve"> </w:t>
-      </w:r>
-      <w:r>
-        <w:t xml:space="preserve">computations</w:t>
-      </w:r>
-      <w:r>
-        <w:t xml:space="preserve"> </w:t>
-      </w:r>
-      <w:r>
-        <w:t xml:space="preserve">that</w:t>
-      </w:r>
-      <w:r>
-        <w:t xml:space="preserve"> </w:t>
-      </w:r>
-      <w:r>
-        <w:t xml:space="preserve">hold</w:t>
-      </w:r>
-      <w:r>
-        <w:t xml:space="preserve"> </w:t>
-      </w:r>
-      <w:r>
-        <w:t xml:space="preserve">autonomous</w:t>
-      </w:r>
-      <w:r>
-        <w:t xml:space="preserve"> </w:t>
-      </w:r>
-      <w:r>
-        <w:t xml:space="preserve">robots</w:t>
-      </w:r>
-      <w:r>
-        <w:t xml:space="preserve"> </w:t>
-      </w:r>
-      <w:r>
-        <w:t xml:space="preserve">back</w:t>
+        <w:t xml:space="preserve">small</w:t>
+      </w:r>
+      <w:r>
+        <w:t xml:space="preserve"> </w:t>
+      </w:r>
+      <w:r>
+        <w:t xml:space="preserve">hardware</w:t>
+      </w:r>
+      <w:r>
+        <w:t xml:space="preserve"> </w:t>
+      </w:r>
+      <w:r>
+        <w:t xml:space="preserve">runs.</w:t>
+      </w:r>
+      <w:r>
+        <w:t xml:space="preserve"> </w:t>
+      </w:r>
+      <w:r>
+        <w:t xml:space="preserve">This</w:t>
+      </w:r>
+      <w:r>
+        <w:t xml:space="preserve"> </w:t>
+      </w:r>
+      <w:r>
+        <w:t xml:space="preserve">systematic</w:t>
+      </w:r>
+      <w:r>
+        <w:t xml:space="preserve"> </w:t>
+      </w:r>
+      <w:r>
+        <w:t xml:space="preserve">survey</w:t>
+      </w:r>
+      <w:r>
+        <w:t xml:space="preserve"> </w:t>
+      </w:r>
+      <w:r>
+        <w:t xml:space="preserve">grades</w:t>
+      </w:r>
+      <w:r>
+        <w:t xml:space="preserve"> </w:t>
+      </w:r>
+      <w:r>
+        <w:t xml:space="preserve">72</w:t>
+      </w:r>
+      <w:r>
+        <w:t xml:space="preserve"> </w:t>
+      </w:r>
+      <w:r>
+        <w:t xml:space="preserve">primary</w:t>
+      </w:r>
+      <w:r>
+        <w:t xml:space="preserve"> </w:t>
+      </w:r>
+      <w:r>
+        <w:t xml:space="preserve">studies</w:t>
+      </w:r>
+      <w:r>
+        <w:t xml:space="preserve"> </w:t>
+      </w:r>
+      <w:r>
+        <w:t xml:space="preserve">on</w:t>
+      </w:r>
+      <w:r>
+        <w:t xml:space="preserve"> </w:t>
+      </w:r>
+      <w:r>
+        <w:t xml:space="preserve">a</w:t>
+      </w:r>
+      <w:r>
+        <w:t xml:space="preserve"> </w:t>
+      </w:r>
+      <w:r>
+        <w:t xml:space="preserve">six-level</w:t>
+      </w:r>
+      <w:r>
+        <w:t xml:space="preserve"> </w:t>
+      </w:r>
+      <w:r>
+        <w:t xml:space="preserve">evidence</w:t>
+      </w:r>
+      <w:r>
+        <w:t xml:space="preserve"> </w:t>
+      </w:r>
+      <w:r>
+        <w:t xml:space="preserve">scale</w:t>
+      </w:r>
+      <w:r>
+        <w:t xml:space="preserve"> </w:t>
+      </w:r>
+      <w:r>
+        <w:t xml:space="preserve">and</w:t>
+      </w:r>
+      <w:r>
+        <w:t xml:space="preserve"> </w:t>
+      </w:r>
+      <w:r>
+        <w:t xml:space="preserve">records</w:t>
+      </w:r>
+      <w:r>
+        <w:t xml:space="preserve"> </w:t>
+      </w:r>
+      <w:r>
+        <w:t xml:space="preserve">whether</w:t>
+      </w:r>
+      <w:r>
+        <w:t xml:space="preserve"> </w:t>
+      </w:r>
+      <w:r>
+        <w:t xml:space="preserve">each</w:t>
+      </w:r>
+      <w:r>
+        <w:t xml:space="preserve"> </w:t>
+      </w:r>
+      <w:r>
+        <w:t xml:space="preserve">quantum</w:t>
+      </w:r>
+      <w:r>
+        <w:t xml:space="preserve"> </w:t>
+      </w:r>
+      <w:r>
+        <w:t xml:space="preserve">component</w:t>
+      </w:r>
+      <w:r>
+        <w:t xml:space="preserve"> </w:t>
+      </w:r>
+      <w:r>
+        <w:t xml:space="preserve">ran</w:t>
+      </w:r>
+      <w:r>
+        <w:t xml:space="preserve"> </w:t>
+      </w:r>
+      <w:r>
+        <w:t xml:space="preserve">on</w:t>
+      </w:r>
+      <w:r>
+        <w:t xml:space="preserve"> </w:t>
+      </w:r>
+      <w:r>
+        <w:t xml:space="preserve">hardware.</w:t>
+      </w:r>
+      <w:r>
+        <w:t xml:space="preserve"> </w:t>
+      </w:r>
+      <w:r>
+        <w:t xml:space="preserve">No</w:t>
+      </w:r>
+      <w:r>
+        <w:t xml:space="preserve"> </w:t>
+      </w:r>
+      <w:r>
+        <w:t xml:space="preserve">quantum</w:t>
+      </w:r>
+      <w:r>
+        <w:t xml:space="preserve"> </w:t>
+      </w:r>
+      <w:r>
+        <w:t xml:space="preserve">computational</w:t>
+      </w:r>
+      <w:r>
+        <w:t xml:space="preserve"> </w:t>
+      </w:r>
+      <w:r>
+        <w:t xml:space="preserve">method</w:t>
+      </w:r>
+      <w:r>
+        <w:t xml:space="preserve"> </w:t>
+      </w:r>
+      <w:r>
+        <w:t xml:space="preserve">has</w:t>
+      </w:r>
+      <w:r>
+        <w:t xml:space="preserve"> </w:t>
+      </w:r>
+      <w:r>
+        <w:t xml:space="preserve">shown</w:t>
+      </w:r>
+      <w:r>
+        <w:t xml:space="preserve"> </w:t>
+      </w:r>
+      <w:r>
+        <w:t xml:space="preserve">an</w:t>
+      </w:r>
+      <w:r>
+        <w:t xml:space="preserve"> </w:t>
+      </w:r>
+      <w:r>
+        <w:t xml:space="preserve">end-to-end</w:t>
+      </w:r>
+      <w:r>
+        <w:t xml:space="preserve"> </w:t>
+      </w:r>
+      <w:r>
+        <w:t xml:space="preserve">advantage</w:t>
+      </w:r>
+      <w:r>
+        <w:t xml:space="preserve"> </w:t>
+      </w:r>
+      <w:r>
+        <w:t xml:space="preserve">on</w:t>
+      </w:r>
+      <w:r>
+        <w:t xml:space="preserve"> </w:t>
+      </w:r>
+      <w:r>
+        <w:t xml:space="preserve">a</w:t>
+      </w:r>
+      <w:r>
+        <w:t xml:space="preserve"> </w:t>
+      </w:r>
+      <w:r>
+        <w:t xml:space="preserve">physical</w:t>
+      </w:r>
+      <w:r>
+        <w:t xml:space="preserve"> </w:t>
+      </w:r>
+      <w:r>
+        <w:t xml:space="preserve">robot.</w:t>
+      </w:r>
+      <w:r>
+        <w:t xml:space="preserve"> </w:t>
+      </w:r>
+      <w:r>
+        <w:t xml:space="preserve">Classical</w:t>
+      </w:r>
+      <w:r>
+        <w:t xml:space="preserve"> </w:t>
+      </w:r>
+      <w:r>
+        <w:t xml:space="preserve">solvers</w:t>
+      </w:r>
+      <w:r>
+        <w:t xml:space="preserve"> </w:t>
+      </w:r>
+      <w:r>
+        <w:t xml:space="preserve">match</w:t>
+      </w:r>
+      <w:r>
+        <w:t xml:space="preserve"> </w:t>
+      </w:r>
+      <w:r>
+        <w:t xml:space="preserve">quantum</w:t>
+      </w:r>
+      <w:r>
+        <w:t xml:space="preserve"> </w:t>
+      </w:r>
+      <w:r>
+        <w:t xml:space="preserve">annealing</w:t>
       </w:r>
       <w:r>
         <w:t xml:space="preserve"> </w:t>
@@ -393,43 +651,16 @@
         <w:t xml:space="preserve"> </w:t>
       </w:r>
       <w:r>
-        <w:t xml:space="preserve">large,</w:t>
-      </w:r>
-      <w:r>
-        <w:t xml:space="preserve"> </w:t>
-      </w:r>
-      <w:r>
-        <w:t xml:space="preserve">uncertain</w:t>
-      </w:r>
-      <w:r>
-        <w:t xml:space="preserve"> </w:t>
-      </w:r>
-      <w:r>
-        <w:t xml:space="preserve">environments.</w:t>
-      </w:r>
-      <w:r>
-        <w:t xml:space="preserve"> </w:t>
-      </w:r>
-      <w:r>
-        <w:t xml:space="preserve">Yet</w:t>
-      </w:r>
-      <w:r>
-        <w:t xml:space="preserve"> </w:t>
-      </w:r>
-      <w:r>
-        <w:t xml:space="preserve">claims</w:t>
-      </w:r>
-      <w:r>
-        <w:t xml:space="preserve"> </w:t>
-      </w:r>
-      <w:r>
-        <w:t xml:space="preserve">for</w:t>
-      </w:r>
-      <w:r>
-        <w:t xml:space="preserve"> </w:t>
-      </w:r>
-      <w:r>
-        <w:t xml:space="preserve">“</w:t>
+        <w:t xml:space="preserve">direct</w:t>
+      </w:r>
+      <w:r>
+        <w:t xml:space="preserve"> </w:t>
+      </w:r>
+      <w:r>
+        <w:t xml:space="preserve">comparisons,</w:t>
+      </w:r>
+      <w:r>
+        <w:t xml:space="preserve"> </w:t>
       </w:r>
       <w:r>
         <w:t xml:space="preserve">quantum</w:t>
@@ -438,58 +669,49 @@
         <w:t xml:space="preserve"> </w:t>
       </w:r>
       <w:r>
-        <w:t xml:space="preserve">robotics</w:t>
-      </w:r>
-      <w:r>
-        <w:t xml:space="preserve">”</w:t>
-      </w:r>
-      <w:r>
-        <w:t xml:space="preserve"> </w:t>
-      </w:r>
-      <w:r>
-        <w:t xml:space="preserve">range</w:t>
-      </w:r>
-      <w:r>
-        <w:t xml:space="preserve"> </w:t>
-      </w:r>
-      <w:r>
-        <w:t xml:space="preserve">from</w:t>
-      </w:r>
-      <w:r>
-        <w:t xml:space="preserve"> </w:t>
-      </w:r>
-      <w:r>
-        <w:t xml:space="preserve">asymptotic</w:t>
-      </w:r>
-      <w:r>
-        <w:t xml:space="preserve"> </w:t>
-      </w:r>
-      <w:r>
-        <w:t xml:space="preserve">complexity</w:t>
-      </w:r>
-      <w:r>
-        <w:t xml:space="preserve"> </w:t>
-      </w:r>
-      <w:r>
-        <w:t xml:space="preserve">results</w:t>
-      </w:r>
-      <w:r>
-        <w:t xml:space="preserve"> </w:t>
-      </w:r>
-      <w:r>
-        <w:t xml:space="preserve">to</w:t>
-      </w:r>
-      <w:r>
-        <w:t xml:space="preserve"> </w:t>
-      </w:r>
-      <w:r>
-        <w:t xml:space="preserve">small</w:t>
-      </w:r>
-      <w:r>
-        <w:t xml:space="preserve"> </w:t>
-      </w:r>
-      <w:r>
-        <w:t xml:space="preserve">simulations</w:t>
+        <w:t xml:space="preserve">reinforcement</w:t>
+      </w:r>
+      <w:r>
+        <w:t xml:space="preserve"> </w:t>
+      </w:r>
+      <w:r>
+        <w:t xml:space="preserve">learning</w:t>
+      </w:r>
+      <w:r>
+        <w:t xml:space="preserve"> </w:t>
+      </w:r>
+      <w:r>
+        <w:t xml:space="preserve">saves</w:t>
+      </w:r>
+      <w:r>
+        <w:t xml:space="preserve"> </w:t>
+      </w:r>
+      <w:r>
+        <w:t xml:space="preserve">parameters</w:t>
+      </w:r>
+      <w:r>
+        <w:t xml:space="preserve"> </w:t>
+      </w:r>
+      <w:r>
+        <w:t xml:space="preserve">but</w:t>
+      </w:r>
+      <w:r>
+        <w:t xml:space="preserve"> </w:t>
+      </w:r>
+      <w:r>
+        <w:t xml:space="preserve">not</w:t>
+      </w:r>
+      <w:r>
+        <w:t xml:space="preserve"> </w:t>
+      </w:r>
+      <w:r>
+        <w:t xml:space="preserve">training</w:t>
+      </w:r>
+      <w:r>
+        <w:t xml:space="preserve"> </w:t>
+      </w:r>
+      <w:r>
+        <w:t xml:space="preserve">time,</w:t>
       </w:r>
       <w:r>
         <w:t xml:space="preserve"> </w:t>
@@ -501,769 +723,139 @@
         <w:t xml:space="preserve"> </w:t>
       </w:r>
       <w:r>
+        <w:t xml:space="preserve">latency</w:t>
+      </w:r>
+      <w:r>
+        <w:t xml:space="preserve"> </w:t>
+      </w:r>
+      <w:r>
+        <w:t xml:space="preserve">keeps</w:t>
+      </w:r>
+      <w:r>
+        <w:t xml:space="preserve"> </w:t>
+      </w:r>
+      <w:r>
+        <w:t xml:space="preserve">quantum</w:t>
+      </w:r>
+      <w:r>
+        <w:t xml:space="preserve"> </w:t>
+      </w:r>
+      <w:r>
+        <w:t xml:space="preserve">processors</w:t>
+      </w:r>
+      <w:r>
+        <w:t xml:space="preserve"> </w:t>
+      </w:r>
+      <w:r>
+        <w:t xml:space="preserve">out</w:t>
+      </w:r>
+      <w:r>
+        <w:t xml:space="preserve"> </w:t>
+      </w:r>
+      <w:r>
+        <w:t xml:space="preserve">of</w:t>
+      </w:r>
+      <w:r>
+        <w:t xml:space="preserve"> </w:t>
+      </w:r>
+      <w:r>
+        <w:t xml:space="preserve">control</w:t>
+      </w:r>
+      <w:r>
+        <w:t xml:space="preserve"> </w:t>
+      </w:r>
+      <w:r>
+        <w:t xml:space="preserve">loops.</w:t>
+      </w:r>
+      <w:r>
+        <w:t xml:space="preserve"> </w:t>
+      </w:r>
+      <w:r>
+        <w:t xml:space="preserve">Only</w:t>
+      </w:r>
+      <w:r>
+        <w:t xml:space="preserve"> </w:t>
+      </w:r>
+      <w:r>
+        <w:t xml:space="preserve">quantum</w:t>
+      </w:r>
+      <w:r>
+        <w:t xml:space="preserve"> </w:t>
+      </w:r>
+      <w:r>
+        <w:t xml:space="preserve">sensing</w:t>
+      </w:r>
+      <w:r>
+        <w:t xml:space="preserve"> </w:t>
+      </w:r>
+      <w:r>
+        <w:t xml:space="preserve">and</w:t>
+      </w:r>
+      <w:r>
+        <w:t xml:space="preserve"> </w:t>
+      </w:r>
+      <w:r>
+        <w:t xml:space="preserve">communication</w:t>
+      </w:r>
+      <w:r>
+        <w:t xml:space="preserve"> </w:t>
+      </w:r>
+      <w:r>
+        <w:t xml:space="preserve">have</w:t>
+      </w:r>
+      <w:r>
+        <w:t xml:space="preserve"> </w:t>
+      </w:r>
+      <w:r>
+        <w:t xml:space="preserve">reached</w:t>
+      </w:r>
+      <w:r>
+        <w:t xml:space="preserve"> </w:t>
+      </w:r>
+      <w:r>
+        <w:t xml:space="preserve">moving</w:t>
+      </w:r>
+      <w:r>
+        <w:t xml:space="preserve"> </w:t>
+      </w:r>
+      <w:r>
+        <w:t xml:space="preserve">platforms.</w:t>
+      </w:r>
+      <w:r>
+        <w:t xml:space="preserve"> </w:t>
+      </w:r>
+      <w:r>
+        <w:t xml:space="preserve">Reporting</w:t>
+      </w:r>
+      <w:r>
+        <w:t xml:space="preserve"> </w:t>
+      </w:r>
+      <w:r>
+        <w:t xml:space="preserve">standards</w:t>
+      </w:r>
+      <w:r>
+        <w:t xml:space="preserve"> </w:t>
+      </w:r>
+      <w:r>
+        <w:t xml:space="preserve">and</w:t>
+      </w:r>
+      <w:r>
+        <w:t xml:space="preserve"> </w:t>
+      </w:r>
+      <w:r>
         <w:t xml:space="preserve">a</w:t>
       </w:r>
       <w:r>
         <w:t xml:space="preserve"> </w:t>
       </w:r>
       <w:r>
-        <w:t xml:space="preserve">handful</w:t>
-      </w:r>
-      <w:r>
-        <w:t xml:space="preserve"> </w:t>
-      </w:r>
-      <w:r>
-        <w:t xml:space="preserve">of</w:t>
-      </w:r>
-      <w:r>
-        <w:t xml:space="preserve"> </w:t>
-      </w:r>
-      <w:r>
-        <w:t xml:space="preserve">hardware</w:t>
-      </w:r>
-      <w:r>
-        <w:t xml:space="preserve"> </w:t>
-      </w:r>
-      <w:r>
-        <w:t xml:space="preserve">runs,</w:t>
-      </w:r>
-      <w:r>
-        <w:t xml:space="preserve"> </w:t>
-      </w:r>
-      <w:r>
-        <w:t xml:space="preserve">and</w:t>
-      </w:r>
-      <w:r>
-        <w:t xml:space="preserve"> </w:t>
-      </w:r>
-      <w:r>
-        <w:t xml:space="preserve">it</w:t>
-      </w:r>
-      <w:r>
-        <w:t xml:space="preserve"> </w:t>
-      </w:r>
-      <w:r>
-        <w:t xml:space="preserve">is</w:t>
-      </w:r>
-      <w:r>
-        <w:t xml:space="preserve"> </w:t>
-      </w:r>
-      <w:r>
-        <w:t xml:space="preserve">hard</w:t>
-      </w:r>
-      <w:r>
-        <w:t xml:space="preserve"> </w:t>
-      </w:r>
-      <w:r>
-        <w:t xml:space="preserve">to</w:t>
-      </w:r>
-      <w:r>
-        <w:t xml:space="preserve"> </w:t>
-      </w:r>
-      <w:r>
-        <w:t xml:space="preserve">tell</w:t>
-      </w:r>
-      <w:r>
-        <w:t xml:space="preserve"> </w:t>
-      </w:r>
-      <w:r>
-        <w:t xml:space="preserve">what</w:t>
-      </w:r>
-      <w:r>
-        <w:t xml:space="preserve"> </w:t>
-      </w:r>
-      <w:r>
-        <w:t xml:space="preserve">a</w:t>
-      </w:r>
-      <w:r>
-        <w:t xml:space="preserve"> </w:t>
-      </w:r>
-      <w:r>
-        <w:t xml:space="preserve">robot</w:t>
-      </w:r>
-      <w:r>
-        <w:t xml:space="preserve"> </w:t>
-      </w:r>
-      <w:r>
-        <w:t xml:space="preserve">could</w:t>
-      </w:r>
-      <w:r>
-        <w:t xml:space="preserve"> </w:t>
-      </w:r>
-      <w:r>
-        <w:t xml:space="preserve">use</w:t>
-      </w:r>
-      <w:r>
-        <w:t xml:space="preserve"> </w:t>
-      </w:r>
-      <w:r>
-        <w:t xml:space="preserve">today.</w:t>
-      </w:r>
-      <w:r>
-        <w:t xml:space="preserve"> </w:t>
-      </w:r>
-      <w:r>
-        <w:t xml:space="preserve">This</w:t>
-      </w:r>
-      <w:r>
-        <w:t xml:space="preserve"> </w:t>
-      </w:r>
-      <w:r>
-        <w:t xml:space="preserve">systematic</w:t>
-      </w:r>
-      <w:r>
-        <w:t xml:space="preserve"> </w:t>
-      </w:r>
-      <w:r>
-        <w:t xml:space="preserve">survey,</w:t>
-      </w:r>
-      <w:r>
-        <w:t xml:space="preserve"> </w:t>
-      </w:r>
-      <w:r>
-        <w:t xml:space="preserve">reported</w:t>
-      </w:r>
-      <w:r>
-        <w:t xml:space="preserve"> </w:t>
-      </w:r>
-      <w:r>
-        <w:t xml:space="preserve">following</w:t>
-      </w:r>
-      <w:r>
-        <w:t xml:space="preserve"> </w:t>
-      </w:r>
-      <w:r>
-        <w:t xml:space="preserve">PRISMA</w:t>
-      </w:r>
-      <w:r>
-        <w:t xml:space="preserve"> </w:t>
-      </w:r>
-      <w:r>
-        <w:t xml:space="preserve">2020</w:t>
-      </w:r>
-      <w:r>
-        <w:t xml:space="preserve"> </w:t>
-      </w:r>
-      <w:r>
-        <w:t xml:space="preserve">where</w:t>
-      </w:r>
-      <w:r>
-        <w:t xml:space="preserve"> </w:t>
-      </w:r>
-      <w:r>
-        <w:t xml:space="preserve">it</w:t>
-      </w:r>
-      <w:r>
-        <w:t xml:space="preserve"> </w:t>
-      </w:r>
-      <w:r>
-        <w:t xml:space="preserve">applies,</w:t>
-      </w:r>
-      <w:r>
-        <w:t xml:space="preserve"> </w:t>
-      </w:r>
-      <w:r>
-        <w:t xml:space="preserve">examines</w:t>
-      </w:r>
-      <w:r>
-        <w:t xml:space="preserve"> </w:t>
-      </w:r>
-      <w:r>
-        <w:t xml:space="preserve">72</w:t>
-      </w:r>
-      <w:r>
-        <w:t xml:space="preserve"> </w:t>
-      </w:r>
-      <w:r>
-        <w:t xml:space="preserve">primary</w:t>
-      </w:r>
-      <w:r>
-        <w:t xml:space="preserve"> </w:t>
-      </w:r>
-      <w:r>
-        <w:t xml:space="preserve">studies</w:t>
-      </w:r>
-      <w:r>
-        <w:t xml:space="preserve"> </w:t>
-      </w:r>
-      <w:r>
-        <w:t xml:space="preserve">that</w:t>
-      </w:r>
-      <w:r>
-        <w:t xml:space="preserve"> </w:t>
-      </w:r>
-      <w:r>
-        <w:t xml:space="preserve">apply</w:t>
-      </w:r>
-      <w:r>
-        <w:t xml:space="preserve"> </w:t>
-      </w:r>
-      <w:r>
-        <w:t xml:space="preserve">quantum</w:t>
-      </w:r>
-      <w:r>
-        <w:t xml:space="preserve"> </w:t>
-      </w:r>
-      <w:r>
-        <w:t xml:space="preserve">or</w:t>
-      </w:r>
-      <w:r>
-        <w:t xml:space="preserve"> </w:t>
-      </w:r>
-      <w:r>
-        <w:t xml:space="preserve">quantum-inspired</w:t>
-      </w:r>
-      <w:r>
-        <w:t xml:space="preserve"> </w:t>
-      </w:r>
-      <w:r>
-        <w:t xml:space="preserve">methods</w:t>
-      </w:r>
-      <w:r>
-        <w:t xml:space="preserve"> </w:t>
-      </w:r>
-      <w:r>
-        <w:t xml:space="preserve">to</w:t>
-      </w:r>
-      <w:r>
-        <w:t xml:space="preserve"> </w:t>
-      </w:r>
-      <w:r>
-        <w:t xml:space="preserve">robotic</w:t>
-      </w:r>
-      <w:r>
-        <w:t xml:space="preserve"> </w:t>
-      </w:r>
-      <w:r>
-        <w:t xml:space="preserve">functions,</w:t>
-      </w:r>
-      <w:r>
-        <w:t xml:space="preserve"> </w:t>
-      </w:r>
-      <w:r>
-        <w:t xml:space="preserve">set</w:t>
-      </w:r>
-      <w:r>
-        <w:t xml:space="preserve"> </w:t>
-      </w:r>
-      <w:r>
-        <w:t xml:space="preserve">against</w:t>
-      </w:r>
-      <w:r>
-        <w:t xml:space="preserve"> </w:t>
-      </w:r>
-      <w:r>
-        <w:t xml:space="preserve">107</w:t>
-      </w:r>
-      <w:r>
-        <w:t xml:space="preserve"> </w:t>
-      </w:r>
-      <w:r>
-        <w:t xml:space="preserve">foundational</w:t>
-      </w:r>
-      <w:r>
-        <w:t xml:space="preserve"> </w:t>
-      </w:r>
-      <w:r>
-        <w:t xml:space="preserve">works.</w:t>
-      </w:r>
-      <w:r>
-        <w:t xml:space="preserve"> </w:t>
-      </w:r>
-      <w:r>
-        <w:t xml:space="preserve">We</w:t>
-      </w:r>
-      <w:r>
-        <w:t xml:space="preserve"> </w:t>
-      </w:r>
-      <w:r>
-        <w:t xml:space="preserve">organize</w:t>
-      </w:r>
-      <w:r>
-        <w:t xml:space="preserve"> </w:t>
-      </w:r>
-      <w:r>
-        <w:t xml:space="preserve">the</w:t>
-      </w:r>
-      <w:r>
-        <w:t xml:space="preserve"> </w:t>
-      </w:r>
-      <w:r>
-        <w:t xml:space="preserve">field</w:t>
-      </w:r>
-      <w:r>
-        <w:t xml:space="preserve"> </w:t>
-      </w:r>
-      <w:r>
-        <w:t xml:space="preserve">by</w:t>
-      </w:r>
-      <w:r>
-        <w:t xml:space="preserve"> </w:t>
-      </w:r>
-      <w:r>
-        <w:t xml:space="preserve">robotic</w:t>
-      </w:r>
-      <w:r>
-        <w:t xml:space="preserve"> </w:t>
-      </w:r>
-      <w:r>
-        <w:t xml:space="preserve">function</w:t>
-      </w:r>
-      <w:r>
-        <w:t xml:space="preserve"> </w:t>
-      </w:r>
-      <w:r>
-        <w:t xml:space="preserve">(optimization,</w:t>
-      </w:r>
-      <w:r>
-        <w:t xml:space="preserve"> </w:t>
-      </w:r>
-      <w:r>
-        <w:t xml:space="preserve">planning,</w:t>
-      </w:r>
-      <w:r>
-        <w:t xml:space="preserve"> </w:t>
-      </w:r>
-      <w:r>
-        <w:t xml:space="preserve">learning,</w:t>
-      </w:r>
-      <w:r>
-        <w:t xml:space="preserve"> </w:t>
-      </w:r>
-      <w:r>
-        <w:t xml:space="preserve">sensing</w:t>
-      </w:r>
-      <w:r>
-        <w:t xml:space="preserve"> </w:t>
-      </w:r>
-      <w:r>
-        <w:t xml:space="preserve">and</w:t>
-      </w:r>
-      <w:r>
-        <w:t xml:space="preserve"> </w:t>
-      </w:r>
-      <w:r>
-        <w:t xml:space="preserve">communication,</w:t>
-      </w:r>
-      <w:r>
-        <w:t xml:space="preserve"> </w:t>
-      </w:r>
-      <w:r>
-        <w:t xml:space="preserve">and</w:t>
-      </w:r>
-      <w:r>
-        <w:t xml:space="preserve"> </w:t>
-      </w:r>
-      <w:r>
-        <w:t xml:space="preserve">decision-making),</w:t>
-      </w:r>
-      <w:r>
-        <w:t xml:space="preserve"> </w:t>
-      </w:r>
-      <w:r>
-        <w:t xml:space="preserve">grade</w:t>
-      </w:r>
-      <w:r>
-        <w:t xml:space="preserve"> </w:t>
-      </w:r>
-      <w:r>
-        <w:t xml:space="preserve">every</w:t>
-      </w:r>
-      <w:r>
-        <w:t xml:space="preserve"> </w:t>
-      </w:r>
-      <w:r>
-        <w:t xml:space="preserve">study</w:t>
-      </w:r>
-      <w:r>
-        <w:t xml:space="preserve"> </w:t>
-      </w:r>
-      <w:r>
-        <w:t xml:space="preserve">on</w:t>
-      </w:r>
-      <w:r>
-        <w:t xml:space="preserve"> </w:t>
-      </w:r>
-      <w:r>
-        <w:t xml:space="preserve">a</w:t>
-      </w:r>
-      <w:r>
-        <w:t xml:space="preserve"> </w:t>
-      </w:r>
-      <w:r>
-        <w:t xml:space="preserve">six-level</w:t>
-      </w:r>
-      <w:r>
-        <w:t xml:space="preserve"> </w:t>
-      </w:r>
-      <w:r>
-        <w:t xml:space="preserve">evidence</w:t>
-      </w:r>
-      <w:r>
-        <w:t xml:space="preserve"> </w:t>
-      </w:r>
-      <w:r>
-        <w:t xml:space="preserve">hierarchy</w:t>
-      </w:r>
-      <w:r>
-        <w:t xml:space="preserve"> </w:t>
-      </w:r>
-      <w:r>
-        <w:t xml:space="preserve">from</w:t>
-      </w:r>
-      <w:r>
-        <w:t xml:space="preserve"> </w:t>
-      </w:r>
-      <w:r>
-        <w:t xml:space="preserve">theoretical</w:t>
-      </w:r>
-      <w:r>
-        <w:t xml:space="preserve"> </w:t>
-      </w:r>
-      <w:r>
-        <w:t xml:space="preserve">analysis</w:t>
-      </w:r>
-      <w:r>
-        <w:t xml:space="preserve"> </w:t>
-      </w:r>
-      <w:r>
-        <w:t xml:space="preserve">to</w:t>
-      </w:r>
-      <w:r>
-        <w:t xml:space="preserve"> </w:t>
-      </w:r>
-      <w:r>
-        <w:t xml:space="preserve">end-to-end</w:t>
-      </w:r>
-      <w:r>
-        <w:t xml:space="preserve"> </w:t>
-      </w:r>
-      <w:r>
-        <w:t xml:space="preserve">deployment,</w:t>
-      </w:r>
-      <w:r>
-        <w:t xml:space="preserve"> </w:t>
-      </w:r>
-      <w:r>
-        <w:t xml:space="preserve">and</w:t>
-      </w:r>
-      <w:r>
-        <w:t xml:space="preserve"> </w:t>
-      </w:r>
-      <w:r>
-        <w:t xml:space="preserve">record</w:t>
-      </w:r>
-      <w:r>
-        <w:t xml:space="preserve"> </w:t>
-      </w:r>
-      <w:r>
-        <w:t xml:space="preserve">whether</w:t>
-      </w:r>
-      <w:r>
-        <w:t xml:space="preserve"> </w:t>
-      </w:r>
-      <w:r>
-        <w:t xml:space="preserve">its</w:t>
-      </w:r>
-      <w:r>
-        <w:t xml:space="preserve"> </w:t>
-      </w:r>
-      <w:r>
-        <w:t xml:space="preserve">quantum</w:t>
-      </w:r>
-      <w:r>
-        <w:t xml:space="preserve"> </w:t>
-      </w:r>
-      <w:r>
-        <w:t xml:space="preserve">component</w:t>
-      </w:r>
-      <w:r>
-        <w:t xml:space="preserve"> </w:t>
-      </w:r>
-      <w:r>
-        <w:t xml:space="preserve">ran</w:t>
-      </w:r>
-      <w:r>
-        <w:t xml:space="preserve"> </w:t>
-      </w:r>
-      <w:r>
-        <w:t xml:space="preserve">on</w:t>
-      </w:r>
-      <w:r>
-        <w:t xml:space="preserve"> </w:t>
-      </w:r>
-      <w:r>
-        <w:t xml:space="preserve">hardware,</w:t>
-      </w:r>
-      <w:r>
-        <w:t xml:space="preserve"> </w:t>
-      </w:r>
-      <w:r>
-        <w:t xml:space="preserve">in</w:t>
-      </w:r>
-      <w:r>
-        <w:t xml:space="preserve"> </w:t>
-      </w:r>
-      <w:r>
-        <w:t xml:space="preserve">simulation,</w:t>
-      </w:r>
-      <w:r>
-        <w:t xml:space="preserve"> </w:t>
-      </w:r>
-      <w:r>
-        <w:t xml:space="preserve">or</w:t>
-      </w:r>
-      <w:r>
-        <w:t xml:space="preserve"> </w:t>
-      </w:r>
-      <w:r>
-        <w:t xml:space="preserve">not</w:t>
-      </w:r>
-      <w:r>
-        <w:t xml:space="preserve"> </w:t>
-      </w:r>
-      <w:r>
-        <w:t xml:space="preserve">at</w:t>
-      </w:r>
-      <w:r>
-        <w:t xml:space="preserve"> </w:t>
-      </w:r>
-      <w:r>
-        <w:t xml:space="preserve">all.</w:t>
-      </w:r>
-      <w:r>
-        <w:t xml:space="preserve"> </w:t>
-      </w:r>
-      <w:r>
-        <w:t xml:space="preserve">No</w:t>
-      </w:r>
-      <w:r>
-        <w:t xml:space="preserve"> </w:t>
-      </w:r>
-      <w:r>
-        <w:t xml:space="preserve">quantum</w:t>
-      </w:r>
-      <w:r>
-        <w:t xml:space="preserve"> </w:t>
-      </w:r>
-      <w:r>
-        <w:t xml:space="preserve">computational</w:t>
-      </w:r>
-      <w:r>
-        <w:t xml:space="preserve"> </w:t>
-      </w:r>
-      <w:r>
-        <w:t xml:space="preserve">method</w:t>
-      </w:r>
-      <w:r>
-        <w:t xml:space="preserve"> </w:t>
-      </w:r>
-      <w:r>
-        <w:t xml:space="preserve">has</w:t>
-      </w:r>
-      <w:r>
-        <w:t xml:space="preserve"> </w:t>
-      </w:r>
-      <w:r>
-        <w:t xml:space="preserve">yet</w:t>
-      </w:r>
-      <w:r>
-        <w:t xml:space="preserve"> </w:t>
-      </w:r>
-      <w:r>
-        <w:t xml:space="preserve">shown</w:t>
-      </w:r>
-      <w:r>
-        <w:t xml:space="preserve"> </w:t>
-      </w:r>
-      <w:r>
-        <w:t xml:space="preserve">an</w:t>
-      </w:r>
-      <w:r>
-        <w:t xml:space="preserve"> </w:t>
-      </w:r>
-      <w:r>
-        <w:t xml:space="preserve">end-to-end</w:t>
-      </w:r>
-      <w:r>
-        <w:t xml:space="preserve"> </w:t>
-      </w:r>
-      <w:r>
-        <w:t xml:space="preserve">advantage</w:t>
-      </w:r>
-      <w:r>
-        <w:t xml:space="preserve"> </w:t>
-      </w:r>
-      <w:r>
-        <w:t xml:space="preserve">on</w:t>
-      </w:r>
-      <w:r>
-        <w:t xml:space="preserve"> </w:t>
-      </w:r>
-      <w:r>
-        <w:t xml:space="preserve">a</w:t>
-      </w:r>
-      <w:r>
-        <w:t xml:space="preserve"> </w:t>
-      </w:r>
-      <w:r>
-        <w:t xml:space="preserve">physical</w:t>
-      </w:r>
-      <w:r>
-        <w:t xml:space="preserve"> </w:t>
-      </w:r>
-      <w:r>
-        <w:t xml:space="preserve">robot.</w:t>
-      </w:r>
-      <w:r>
-        <w:t xml:space="preserve"> </w:t>
-      </w:r>
-      <w:r>
-        <w:t xml:space="preserve">Quantum</w:t>
-      </w:r>
-      <w:r>
-        <w:t xml:space="preserve"> </w:t>
-      </w:r>
-      <w:r>
-        <w:t xml:space="preserve">annealing</w:t>
-      </w:r>
-      <w:r>
-        <w:t xml:space="preserve"> </w:t>
-      </w:r>
-      <w:r>
-        <w:t xml:space="preserve">has</w:t>
-      </w:r>
-      <w:r>
-        <w:t xml:space="preserve"> </w:t>
-      </w:r>
-      <w:r>
-        <w:t xml:space="preserve">routed</w:t>
-      </w:r>
-      <w:r>
-        <w:t xml:space="preserve"> </w:t>
-      </w:r>
-      <w:r>
-        <w:t xml:space="preserve">fleets</w:t>
-      </w:r>
-      <w:r>
-        <w:t xml:space="preserve"> </w:t>
-      </w:r>
-      <w:r>
-        <w:t xml:space="preserve">of</w:t>
-      </w:r>
-      <w:r>
-        <w:t xml:space="preserve"> </w:t>
-      </w:r>
-      <w:r>
-        <w:t xml:space="preserve">up</w:t>
-      </w:r>
-      <w:r>
-        <w:t xml:space="preserve"> </w:t>
-      </w:r>
-      <w:r>
-        <w:t xml:space="preserve">to</w:t>
-      </w:r>
-      <w:r>
-        <w:t xml:space="preserve"> </w:t>
-      </w:r>
-      <w:r>
-        <w:t xml:space="preserve">1,000</w:t>
-      </w:r>
-      <w:r>
-        <w:t xml:space="preserve"> </w:t>
-      </w:r>
-      <w:r>
-        <w:t xml:space="preserve">simulated</w:t>
-      </w:r>
-      <w:r>
-        <w:t xml:space="preserve"> </w:t>
-      </w:r>
-      <w:r>
-        <w:t xml:space="preserve">vehicles</w:t>
-      </w:r>
-      <w:r>
-        <w:t xml:space="preserve"> </w:t>
-      </w:r>
-      <w:r>
-        <w:t xml:space="preserve">after</w:t>
-      </w:r>
-      <w:r>
-        <w:t xml:space="preserve"> </w:t>
-      </w:r>
-      <w:r>
-        <w:t xml:space="preserve">decomposition,</w:t>
-      </w:r>
-      <w:r>
-        <w:t xml:space="preserve"> </w:t>
-      </w:r>
-      <w:r>
-        <w:t xml:space="preserve">but</w:t>
-      </w:r>
-      <w:r>
-        <w:t xml:space="preserve"> </w:t>
-      </w:r>
-      <w:r>
-        <w:t xml:space="preserve">classical</w:t>
-      </w:r>
-      <w:r>
-        <w:t xml:space="preserve"> </w:t>
-      </w:r>
-      <w:r>
-        <w:t xml:space="preserve">and</w:t>
-      </w:r>
-      <w:r>
-        <w:t xml:space="preserve"> </w:t>
-      </w:r>
-      <w:r>
-        <w:t xml:space="preserve">quantum-inspired</w:t>
-      </w:r>
-      <w:r>
-        <w:t xml:space="preserve"> </w:t>
-      </w:r>
-      <w:r>
-        <w:t xml:space="preserve">solvers</w:t>
-      </w:r>
-      <w:r>
-        <w:t xml:space="preserve"> </w:t>
-      </w:r>
-      <w:r>
-        <w:t xml:space="preserve">match</w:t>
-      </w:r>
-      <w:r>
-        <w:t xml:space="preserve"> </w:t>
-      </w:r>
-      <w:r>
-        <w:t xml:space="preserve">or</w:t>
-      </w:r>
-      <w:r>
-        <w:t xml:space="preserve"> </w:t>
-      </w:r>
-      <w:r>
-        <w:t xml:space="preserve">beat</w:t>
-      </w:r>
-      <w:r>
-        <w:t xml:space="preserve"> </w:t>
-      </w:r>
-      <w:r>
-        <w:t xml:space="preserve">it</w:t>
-      </w:r>
-      <w:r>
-        <w:t xml:space="preserve"> </w:t>
-      </w:r>
-      <w:r>
-        <w:t xml:space="preserve">whenever</w:t>
-      </w:r>
-      <w:r>
-        <w:t xml:space="preserve"> </w:t>
-      </w:r>
-      <w:r>
-        <w:t xml:space="preserve">the</w:t>
-      </w:r>
-      <w:r>
-        <w:t xml:space="preserve"> </w:t>
-      </w:r>
-      <w:r>
-        <w:t xml:space="preserve">two</w:t>
+        <w:t xml:space="preserve">research</w:t>
+      </w:r>
+      <w:r>
+        <w:t xml:space="preserve"> </w:t>
+      </w:r>
+      <w:r>
+        <w:t xml:space="preserve">agenda</w:t>
       </w:r>
       <w:r>
         <w:t xml:space="preserve"> </w:t>
@@ -1275,499 +867,7 @@
         <w:t xml:space="preserve"> </w:t>
       </w:r>
       <w:r>
-        <w:t xml:space="preserve">compared</w:t>
-      </w:r>
-      <w:r>
-        <w:t xml:space="preserve"> </w:t>
-      </w:r>
-      <w:r>
-        <w:t xml:space="preserve">directly.</w:t>
-      </w:r>
-      <w:r>
-        <w:t xml:space="preserve"> </w:t>
-      </w:r>
-      <w:r>
-        <w:t xml:space="preserve">Quantum</w:t>
-      </w:r>
-      <w:r>
-        <w:t xml:space="preserve"> </w:t>
-      </w:r>
-      <w:r>
-        <w:t xml:space="preserve">reinforcement</w:t>
-      </w:r>
-      <w:r>
-        <w:t xml:space="preserve"> </w:t>
-      </w:r>
-      <w:r>
-        <w:t xml:space="preserve">learning</w:t>
-      </w:r>
-      <w:r>
-        <w:t xml:space="preserve"> </w:t>
-      </w:r>
-      <w:r>
-        <w:t xml:space="preserve">reaches</w:t>
-      </w:r>
-      <w:r>
-        <w:t xml:space="preserve"> </w:t>
-      </w:r>
-      <w:r>
-        <w:t xml:space="preserve">comparable</w:t>
-      </w:r>
-      <w:r>
-        <w:t xml:space="preserve"> </w:t>
-      </w:r>
-      <w:r>
-        <w:t xml:space="preserve">returns</w:t>
-      </w:r>
-      <w:r>
-        <w:t xml:space="preserve"> </w:t>
-      </w:r>
-      <w:r>
-        <w:t xml:space="preserve">with</w:t>
-      </w:r>
-      <w:r>
-        <w:t xml:space="preserve"> </w:t>
-      </w:r>
-      <w:r>
-        <w:t xml:space="preserve">one</w:t>
-      </w:r>
-      <w:r>
-        <w:t xml:space="preserve"> </w:t>
-      </w:r>
-      <w:r>
-        <w:t xml:space="preserve">to</w:t>
-      </w:r>
-      <w:r>
-        <w:t xml:space="preserve"> </w:t>
-      </w:r>
-      <w:r>
-        <w:t xml:space="preserve">two</w:t>
-      </w:r>
-      <w:r>
-        <w:t xml:space="preserve"> </w:t>
-      </w:r>
-      <w:r>
-        <w:t xml:space="preserve">orders</w:t>
-      </w:r>
-      <w:r>
-        <w:t xml:space="preserve"> </w:t>
-      </w:r>
-      <w:r>
-        <w:t xml:space="preserve">of</w:t>
-      </w:r>
-      <w:r>
-        <w:t xml:space="preserve"> </w:t>
-      </w:r>
-      <w:r>
-        <w:t xml:space="preserve">magnitude</w:t>
-      </w:r>
-      <w:r>
-        <w:t xml:space="preserve"> </w:t>
-      </w:r>
-      <w:r>
-        <w:t xml:space="preserve">fewer</w:t>
-      </w:r>
-      <w:r>
-        <w:t xml:space="preserve"> </w:t>
-      </w:r>
-      <w:r>
-        <w:t xml:space="preserve">parameters,</w:t>
-      </w:r>
-      <w:r>
-        <w:t xml:space="preserve"> </w:t>
-      </w:r>
-      <w:r>
-        <w:t xml:space="preserve">but</w:t>
-      </w:r>
-      <w:r>
-        <w:t xml:space="preserve"> </w:t>
-      </w:r>
-      <w:r>
-        <w:t xml:space="preserve">not</w:t>
-      </w:r>
-      <w:r>
-        <w:t xml:space="preserve"> </w:t>
-      </w:r>
-      <w:r>
-        <w:t xml:space="preserve">shorter</w:t>
-      </w:r>
-      <w:r>
-        <w:t xml:space="preserve"> </w:t>
-      </w:r>
-      <w:r>
-        <w:t xml:space="preserve">training,</w:t>
-      </w:r>
-      <w:r>
-        <w:t xml:space="preserve"> </w:t>
-      </w:r>
-      <w:r>
-        <w:t xml:space="preserve">fewer</w:t>
-      </w:r>
-      <w:r>
-        <w:t xml:space="preserve"> </w:t>
-      </w:r>
-      <w:r>
-        <w:t xml:space="preserve">samples,</w:t>
-      </w:r>
-      <w:r>
-        <w:t xml:space="preserve"> </w:t>
-      </w:r>
-      <w:r>
-        <w:t xml:space="preserve">or</w:t>
-      </w:r>
-      <w:r>
-        <w:t xml:space="preserve"> </w:t>
-      </w:r>
-      <w:r>
-        <w:t xml:space="preserve">better</w:t>
-      </w:r>
-      <w:r>
-        <w:t xml:space="preserve"> </w:t>
-      </w:r>
-      <w:r>
-        <w:t xml:space="preserve">policies.</w:t>
-      </w:r>
-      <w:r>
-        <w:t xml:space="preserve"> </w:t>
-      </w:r>
-      <w:r>
-        <w:t xml:space="preserve">Cloud</w:t>
-      </w:r>
-      <w:r>
-        <w:t xml:space="preserve"> </w:t>
-      </w:r>
-      <w:r>
-        <w:t xml:space="preserve">latency,</w:t>
-      </w:r>
-      <w:r>
-        <w:t xml:space="preserve"> </w:t>
-      </w:r>
-      <w:r>
-        <w:t xml:space="preserve">noise,</w:t>
-      </w:r>
-      <w:r>
-        <w:t xml:space="preserve"> </w:t>
-      </w:r>
-      <w:r>
-        <w:t xml:space="preserve">and</w:t>
-      </w:r>
-      <w:r>
-        <w:t xml:space="preserve"> </w:t>
-      </w:r>
-      <w:r>
-        <w:t xml:space="preserve">trainability</w:t>
-      </w:r>
-      <w:r>
-        <w:t xml:space="preserve"> </w:t>
-      </w:r>
-      <w:r>
-        <w:t xml:space="preserve">keep</w:t>
-      </w:r>
-      <w:r>
-        <w:t xml:space="preserve"> </w:t>
-      </w:r>
-      <w:r>
-        <w:t xml:space="preserve">quantum</w:t>
-      </w:r>
-      <w:r>
-        <w:t xml:space="preserve"> </w:t>
-      </w:r>
-      <w:r>
-        <w:t xml:space="preserve">processors</w:t>
-      </w:r>
-      <w:r>
-        <w:t xml:space="preserve"> </w:t>
-      </w:r>
-      <w:r>
-        <w:t xml:space="preserve">out</w:t>
-      </w:r>
-      <w:r>
-        <w:t xml:space="preserve"> </w:t>
-      </w:r>
-      <w:r>
-        <w:t xml:space="preserve">of</w:t>
-      </w:r>
-      <w:r>
-        <w:t xml:space="preserve"> </w:t>
-      </w:r>
-      <w:r>
-        <w:t xml:space="preserve">real-time</w:t>
-      </w:r>
-      <w:r>
-        <w:t xml:space="preserve"> </w:t>
-      </w:r>
-      <w:r>
-        <w:t xml:space="preserve">control</w:t>
-      </w:r>
-      <w:r>
-        <w:t xml:space="preserve"> </w:t>
-      </w:r>
-      <w:r>
-        <w:t xml:space="preserve">loops.</w:t>
-      </w:r>
-      <w:r>
-        <w:t xml:space="preserve"> </w:t>
-      </w:r>
-      <w:r>
-        <w:t xml:space="preserve">Only</w:t>
-      </w:r>
-      <w:r>
-        <w:t xml:space="preserve"> </w:t>
-      </w:r>
-      <w:r>
-        <w:t xml:space="preserve">quantum</w:t>
-      </w:r>
-      <w:r>
-        <w:t xml:space="preserve"> </w:t>
-      </w:r>
-      <w:r>
-        <w:t xml:space="preserve">sensing</w:t>
-      </w:r>
-      <w:r>
-        <w:t xml:space="preserve"> </w:t>
-      </w:r>
-      <w:r>
-        <w:t xml:space="preserve">and</w:t>
-      </w:r>
-      <w:r>
-        <w:t xml:space="preserve"> </w:t>
-      </w:r>
-      <w:r>
-        <w:t xml:space="preserve">communication</w:t>
-      </w:r>
-      <w:r>
-        <w:t xml:space="preserve"> </w:t>
-      </w:r>
-      <w:r>
-        <w:t xml:space="preserve">have</w:t>
-      </w:r>
-      <w:r>
-        <w:t xml:space="preserve"> </w:t>
-      </w:r>
-      <w:r>
-        <w:t xml:space="preserve">been</w:t>
-      </w:r>
-      <w:r>
-        <w:t xml:space="preserve"> </w:t>
-      </w:r>
-      <w:r>
-        <w:t xml:space="preserve">fielded</w:t>
-      </w:r>
-      <w:r>
-        <w:t xml:space="preserve"> </w:t>
-      </w:r>
-      <w:r>
-        <w:t xml:space="preserve">on</w:t>
-      </w:r>
-      <w:r>
-        <w:t xml:space="preserve"> </w:t>
-      </w:r>
-      <w:r>
-        <w:t xml:space="preserve">moving</w:t>
-      </w:r>
-      <w:r>
-        <w:t xml:space="preserve"> </w:t>
-      </w:r>
-      <w:r>
-        <w:t xml:space="preserve">platforms,</w:t>
-      </w:r>
-      <w:r>
-        <w:t xml:space="preserve"> </w:t>
-      </w:r>
-      <w:r>
-        <w:t xml:space="preserve">and</w:t>
-      </w:r>
-      <w:r>
-        <w:t xml:space="preserve"> </w:t>
-      </w:r>
-      <w:r>
-        <w:t xml:space="preserve">the</w:t>
-      </w:r>
-      <w:r>
-        <w:t xml:space="preserve"> </w:t>
-      </w:r>
-      <w:r>
-        <w:t xml:space="preserve">one</w:t>
-      </w:r>
-      <w:r>
-        <w:t xml:space="preserve"> </w:t>
-      </w:r>
-      <w:r>
-        <w:t xml:space="preserve">field</w:t>
-      </w:r>
-      <w:r>
-        <w:t xml:space="preserve"> </w:t>
-      </w:r>
-      <w:r>
-        <w:t xml:space="preserve">result</w:t>
-      </w:r>
-      <w:r>
-        <w:t xml:space="preserve"> </w:t>
-      </w:r>
-      <w:r>
-        <w:t xml:space="preserve">showing</w:t>
-      </w:r>
-      <w:r>
-        <w:t xml:space="preserve"> </w:t>
-      </w:r>
-      <w:r>
-        <w:t xml:space="preserve">a</w:t>
-      </w:r>
-      <w:r>
-        <w:t xml:space="preserve"> </w:t>
-      </w:r>
-      <w:r>
-        <w:t xml:space="preserve">navigation</w:t>
-      </w:r>
-      <w:r>
-        <w:t xml:space="preserve"> </w:t>
-      </w:r>
-      <w:r>
-        <w:t xml:space="preserve">advantage</w:t>
-      </w:r>
-      <w:r>
-        <w:t xml:space="preserve"> </w:t>
-      </w:r>
-      <w:r>
-        <w:t xml:space="preserve">awaits</w:t>
-      </w:r>
-      <w:r>
-        <w:t xml:space="preserve"> </w:t>
-      </w:r>
-      <w:r>
-        <w:t xml:space="preserve">replication.</w:t>
-      </w:r>
-      <w:r>
-        <w:t xml:space="preserve"> </w:t>
-      </w:r>
-      <w:r>
-        <w:t xml:space="preserve">We</w:t>
-      </w:r>
-      <w:r>
-        <w:t xml:space="preserve"> </w:t>
-      </w:r>
-      <w:r>
-        <w:t xml:space="preserve">identify</w:t>
-      </w:r>
-      <w:r>
-        <w:t xml:space="preserve"> </w:t>
-      </w:r>
-      <w:r>
-        <w:t xml:space="preserve">quantum-probability</w:t>
-      </w:r>
-      <w:r>
-        <w:t xml:space="preserve"> </w:t>
-      </w:r>
-      <w:r>
-        <w:t xml:space="preserve">models</w:t>
-      </w:r>
-      <w:r>
-        <w:t xml:space="preserve"> </w:t>
-      </w:r>
-      <w:r>
-        <w:t xml:space="preserve">of</w:t>
-      </w:r>
-      <w:r>
-        <w:t xml:space="preserve"> </w:t>
-      </w:r>
-      <w:r>
-        <w:t xml:space="preserve">human</w:t>
-      </w:r>
-      <w:r>
-        <w:t xml:space="preserve"> </w:t>
-      </w:r>
-      <w:r>
-        <w:t xml:space="preserve">judgment</w:t>
-      </w:r>
-      <w:r>
-        <w:t xml:space="preserve"> </w:t>
-      </w:r>
-      <w:r>
-        <w:t xml:space="preserve">as</w:t>
-      </w:r>
-      <w:r>
-        <w:t xml:space="preserve"> </w:t>
-      </w:r>
-      <w:r>
-        <w:t xml:space="preserve">a</w:t>
-      </w:r>
-      <w:r>
-        <w:t xml:space="preserve"> </w:t>
-      </w:r>
-      <w:r>
-        <w:t xml:space="preserve">hardware-light</w:t>
-      </w:r>
-      <w:r>
-        <w:t xml:space="preserve"> </w:t>
-      </w:r>
-      <w:r>
-        <w:t xml:space="preserve">opportunity</w:t>
-      </w:r>
-      <w:r>
-        <w:t xml:space="preserve"> </w:t>
-      </w:r>
-      <w:r>
-        <w:t xml:space="preserve">for</w:t>
-      </w:r>
-      <w:r>
-        <w:t xml:space="preserve"> </w:t>
-      </w:r>
-      <w:r>
-        <w:t xml:space="preserve">human-robot</w:t>
-      </w:r>
-      <w:r>
-        <w:t xml:space="preserve"> </w:t>
-      </w:r>
-      <w:r>
-        <w:t xml:space="preserve">interaction,</w:t>
-      </w:r>
-      <w:r>
-        <w:t xml:space="preserve"> </w:t>
-      </w:r>
-      <w:r>
-        <w:t xml:space="preserve">propose</w:t>
-      </w:r>
-      <w:r>
-        <w:t xml:space="preserve"> </w:t>
-      </w:r>
-      <w:r>
-        <w:t xml:space="preserve">reporting</w:t>
-      </w:r>
-      <w:r>
-        <w:t xml:space="preserve"> </w:t>
-      </w:r>
-      <w:r>
-        <w:t xml:space="preserve">standards,</w:t>
-      </w:r>
-      <w:r>
-        <w:t xml:space="preserve"> </w:t>
-      </w:r>
-      <w:r>
-        <w:t xml:space="preserve">and</w:t>
-      </w:r>
-      <w:r>
-        <w:t xml:space="preserve"> </w:t>
-      </w:r>
-      <w:r>
-        <w:t xml:space="preserve">derive</w:t>
-      </w:r>
-      <w:r>
-        <w:t xml:space="preserve"> </w:t>
-      </w:r>
-      <w:r>
-        <w:t xml:space="preserve">a</w:t>
-      </w:r>
-      <w:r>
-        <w:t xml:space="preserve"> </w:t>
-      </w:r>
-      <w:r>
-        <w:t xml:space="preserve">research</w:t>
-      </w:r>
-      <w:r>
-        <w:t xml:space="preserve"> </w:t>
-      </w:r>
-      <w:r>
-        <w:t xml:space="preserve">agenda.</w:t>
+        <w:t xml:space="preserve">proposed.</w:t>
       </w:r>
     </w:p>
     <w:bookmarkStart w:id="26" w:name="sec:intro"/>

</xml_diff>

<commit_message>
Survey 1: clarify RQ1 scope (learning and reasoning) and add foundation-model/physical-AI agenda item
</commit_message>
<xml_diff>
--- a/github/k/Survey1_ACM_CSUR_Manuscript.docx
+++ b/github/k/Survey1_ACM_CSUR_Manuscript.docx
@@ -4952,7 +4952,7 @@
         <w:t xml:space="preserve">RQ1</w:t>
       </w:r>
       <w:r>
-        <w:t xml:space="preserve">: which quantum methods have been applied to which robotic functions?</w:t>
+        <w:t xml:space="preserve">: which quantum methods have been applied to which robotic functions (optimization and planning; learning, including quantum machine learning and reinforcement learning; sensing and communication; and decision-making and reasoning)?</w:t>
       </w:r>
       <w:r>
         <w:t xml:space="preserve"> </w:t>
@@ -17836,7 +17836,7 @@
     <w:bookmarkEnd w:id="113"/>
     <w:bookmarkEnd w:id="114"/>
     <w:bookmarkEnd w:id="115"/>
-    <w:bookmarkStart w:id="128" w:name="sec:challenges"/>
+    <w:bookmarkStart w:id="129" w:name="sec:challenges"/>
     <w:p>
       <w:pPr>
         <w:pStyle w:val="Heading1"/>
@@ -17876,7 +17876,7 @@
         <w:t xml:space="preserve">. For each robotic function we describe the gap between today’s evidence and a deployable result, and then turn to the challenges that cut across all functions. Supplementary Table S9 arranges the resulting research directions by time horizon.</w:t>
       </w:r>
     </w:p>
-    <w:bookmarkStart w:id="122" w:name="sec:ch-function"/>
+    <w:bookmarkStart w:id="123" w:name="sec:ch-function"/>
     <w:p>
       <w:pPr>
         <w:pStyle w:val="Heading2"/>
@@ -18386,7 +18386,7 @@
       </w:r>
     </w:p>
     <w:bookmarkEnd w:id="120"/>
-    <w:bookmarkStart w:id="121" w:name="where-we-would-place-our-bets."/>
+    <w:bookmarkStart w:id="121" w:name="foundation-models-and-physical-ai."/>
     <w:p>
       <w:pPr>
         <w:pStyle w:val="Heading4"/>
@@ -18401,6 +18401,114 @@
         <w:tab/>
       </w:r>
       <w:r>
+        <w:t xml:space="preserve">Foundation models and physical AI.</w:t>
+      </w:r>
+    </w:p>
+    <w:p>
+      <w:pPr>
+        <w:pStyle w:val="FirstParagraph"/>
+      </w:pPr>
+      <w:r>
+        <w:t xml:space="preserve">Robot learning is moving toward large pretrained models that reason over language and perception, often called physical or embodied AI. In our corpus, quantum methods touch this trend only at the edges:</w:t>
+      </w:r>
+      <w:r>
+        <w:t xml:space="preserve"> </w:t>
+      </w:r>
+      <w:r>
+        <w:fldChar w:fldCharType="begin"/>
+      </w:r>
+      <w:r>
+        <w:instrText xml:space="preserve">ADDIN CSL_CITATION {"citationID":"MENDELEY_CITATION_499","citationItems":[{"id":"ITEM-499","isTemporary":false,"itemData":{"URL":"https://arxiv.org/abs/2606.14252","author":[{"family":"Bang","given":"Junyeop"},{"family":"Lee","given":"Byongho"},{"family":"An","given":"Dohyun"},{"family":"Kim","given":"Hwangnam"}],"id":"Bang2026","issued":{"date-parts":[[2026]]},"title":"Optimality-preserving decomposition for scalable QAOA in natural-language-guided multi-drone assignment","type":""},"suppress-author":false}],"isEdited":false,"manualOverride":{"citeprocText":"Bang et al. (2026)","isManuallyOverridden":false,"manualOverrideText":""},"mendeley":{"formattedCitation":"Bang et al. (2026)","plainTextFormattedCitation":"Bang et al. (2026)","previouslyFormattedCitation":"Bang et al. (2026)"},"properties":{"noteIndex":0},"schema":"https://github.com/citation-style-language/schema/raw/master/csl-citation.json"}</w:instrText>
+      </w:r>
+      <w:r>
+        <w:fldChar w:fldCharType="separate"/>
+      </w:r>
+      <w:r>
+        <w:t xml:space="preserve">Bang et al. (2026)</w:t>
+      </w:r>
+      <w:r>
+        <w:fldChar w:fldCharType="end"/>
+      </w:r>
+      <w:r>
+        <w:t xml:space="preserve"> </w:t>
+      </w:r>
+      <w:r>
+        <w:t xml:space="preserve">used a language front end to generate QUBO task assignments, and QRL and QP decision models address small parts of policy learning and reasoning. No study applied a quantum method to the training or inference of a robot foundation model, so this direction has no graded evidence yet. The obstacles are clear from the rest of this survey: such models have billions of parameters, today’s processors offer hundreds of noisy qubits, loading classical data into quantum states can cancel any speed-up </w:t>
+      </w:r>
+      <w:r>
+        <w:fldChar w:fldCharType="begin"/>
+      </w:r>
+      <w:r>
+        <w:instrText xml:space="preserve">ADDIN CSL_CITATION {"citationID":"MENDELEY_CITATION_500","citationItems":[{"id":"ITEM-500","isTemporary":false,"itemData":{"DOI":"10.1038/nphys3272","author":[{"family":"Aaronson","given":"Scott"}],"container-title":"Nature Physics","id":"Aaronson2015","issue":"4","issued":{"date-parts":[[2015]]},"page":"291-293","title":"Read the fine print","type":"article-journal","volume":"11"}}],"isEdited":false,"manualOverride":{"citeprocText":"(Aaronson 2015)","isManuallyOverridden":false,"manualOverrideText":""},"mendeley":{"formattedCitation":"(Aaronson 2015)","plainTextFormattedCitation":"(Aaronson 2015)","previouslyFormattedCitation":"(Aaronson 2015)"},"properties":{"noteIndex":0},"schema":"https://github.com/citation-style-language/schema/raw/master/csl-citation.json"}</w:instrText>
+      </w:r>
+      <w:r>
+        <w:fldChar w:fldCharType="separate"/>
+      </w:r>
+      <w:r>
+        <w:t xml:space="preserve">(Aaronson 2015)</w:t>
+      </w:r>
+      <w:r>
+        <w:fldChar w:fldCharType="end"/>
+      </w:r>
+      <w:r>
+        <w:t xml:space="preserve">, and dequantization removes several claimed advantages </w:t>
+      </w:r>
+      <w:r>
+        <w:fldChar w:fldCharType="begin"/>
+      </w:r>
+      <w:r>
+        <w:instrText xml:space="preserve">ADDIN CSL_CITATION {"citationID":"MENDELEY_CITATION_501","citationItems":[{"id":"ITEM-501","isTemporary":false,"itemData":{"DOI":"10.1145/3313276.3316310","author":[{"family":"Tang","given":"Ewin"}],"container-title":"Proceedings of the 51st annual ACM SIGACT symposium on theory of computing (STOC 2019)","id":"Tang2019","issued":{"date-parts":[[2019]]},"page":"217-228","publisher":"ACM","publisher-place":"New York, NY, USA","title":"A quantum-inspired classical algorithm for recommendation systems","type":"paper-conference"}}],"isEdited":false,"manualOverride":{"citeprocText":"(E. Tang 2019)","isManuallyOverridden":false,"manualOverrideText":""},"mendeley":{"formattedCitation":"(E. Tang 2019)","plainTextFormattedCitation":"(E. Tang 2019)","previouslyFormattedCitation":"(E. Tang 2019)"},"properties":{"noteIndex":0},"schema":"https://github.com/citation-style-language/schema/raw/master/csl-citation.json"}</w:instrText>
+      </w:r>
+      <w:r>
+        <w:fldChar w:fldCharType="separate"/>
+      </w:r>
+      <w:r>
+        <w:t xml:space="preserve">(E. Tang 2019)</w:t>
+      </w:r>
+      <w:r>
+        <w:fldChar w:fldCharType="end"/>
+      </w:r>
+      <w:r>
+        <w:t xml:space="preserve">. The realistic near-term role is narrower, with quantum solvers handling well-defined combinatorial subproblems that a foundation model formulates, as in</w:t>
+      </w:r>
+      <w:r>
+        <w:t xml:space="preserve"> </w:t>
+      </w:r>
+      <w:r>
+        <w:fldChar w:fldCharType="begin"/>
+      </w:r>
+      <w:r>
+        <w:instrText xml:space="preserve">ADDIN CSL_CITATION {"citationID":"MENDELEY_CITATION_502","citationItems":[{"id":"ITEM-502","isTemporary":false,"itemData":{"URL":"https://arxiv.org/abs/2606.14252","author":[{"family":"Bang","given":"Junyeop"},{"family":"Lee","given":"Byongho"},{"family":"An","given":"Dohyun"},{"family":"Kim","given":"Hwangnam"}],"id":"Bang2026","issued":{"date-parts":[[2026]]},"title":"Optimality-preserving decomposition for scalable QAOA in natural-language-guided multi-drone assignment","type":""},"suppress-author":false}],"isEdited":false,"manualOverride":{"citeprocText":"Bang et al. (2026)","isManuallyOverridden":false,"manualOverrideText":""},"mendeley":{"formattedCitation":"Bang et al. (2026)","plainTextFormattedCitation":"Bang et al. (2026)","previouslyFormattedCitation":"Bang et al. (2026)"},"properties":{"noteIndex":0},"schema":"https://github.com/citation-style-language/schema/raw/master/csl-citation.json"}</w:instrText>
+      </w:r>
+      <w:r>
+        <w:fldChar w:fldCharType="separate"/>
+      </w:r>
+      <w:r>
+        <w:t xml:space="preserve">Bang et al. (2026)</w:t>
+      </w:r>
+      <w:r>
+        <w:fldChar w:fldCharType="end"/>
+      </w:r>
+      <w:r>
+        <w:t xml:space="preserve">, and the open question is whether that division of labor beats a classical solver end to end.</w:t>
+      </w:r>
+    </w:p>
+    <w:bookmarkEnd w:id="121"/>
+    <w:bookmarkStart w:id="122" w:name="where-we-would-place-our-bets."/>
+    <w:p>
+      <w:pPr>
+        <w:pStyle w:val="Heading4"/>
+      </w:pPr>
+      <w:r>
+        <w:rPr>
+          <w:rStyle w:val="SectionNumber"/>
+        </w:rPr>
+        <w:t xml:space="preserve">12.1.0.7</w:t>
+      </w:r>
+      <w:r>
+        <w:tab/>
+      </w:r>
+      <w:r>
         <w:t xml:space="preserve">Where we would place our bets.</w:t>
       </w:r>
     </w:p>
@@ -18412,9 +18520,9 @@
         <w:t xml:space="preserve">If we had to choose, we would invest first in quantum navigation sensing on uncrewed platforms and in QP models for HRI, because both can be tested now and neither depends on fault-tolerant hardware. Next comes fleet-level optimization, but only in studies that report end-to-end time against the best classical solver, since that is where the case for quantum hardware is currently weakest. We would treat Grover-based planning and real-time quantum control as long-term research, worth pursuing for what they teach about algorithm design but not yet as routes to a better robot.</w:t>
       </w:r>
     </w:p>
-    <w:bookmarkEnd w:id="121"/>
     <w:bookmarkEnd w:id="122"/>
-    <w:bookmarkStart w:id="127" w:name="sec:ch-cross"/>
+    <w:bookmarkEnd w:id="123"/>
+    <w:bookmarkStart w:id="128" w:name="sec:ch-cross"/>
     <w:p>
       <w:pPr>
         <w:pStyle w:val="Heading2"/>
@@ -18432,7 +18540,7 @@
         <w:t xml:space="preserve">Cross-Cutting Challenges</w:t>
       </w:r>
     </w:p>
-    <w:bookmarkStart w:id="123" w:name="reporting-standards-and-benchmarks."/>
+    <w:bookmarkStart w:id="124" w:name="reporting-standards-and-benchmarks."/>
     <w:p>
       <w:pPr>
         <w:pStyle w:val="Heading4"/>
@@ -18461,7 +18569,7 @@
         <w:fldChar w:fldCharType="begin"/>
       </w:r>
       <w:r>
-        <w:instrText xml:space="preserve">ADDIN CSL_CITATION {"citationID":"MENDELEY_CITATION_499","citationItems":[{"id":"ITEM-499","isTemporary":false,"itemData":{"URL":"https://arxiv.org/abs/2202.03028","author":[{"family":"Finžgar","given":"Jernej Rudi"},{"family":"Ross","given":"Philipp"},{"family":"Hölscher","given":"Leonhard"},{"family":"Klepsch","given":"Johannes"},{"family":"Luckow","given":"Andre"}],"container-title":"2022 IEEE international conference on quantum computing and engineering (QCE)","id":"Finzgar2022","issued":{"date-parts":[[2022]]},"page":"226-237","publisher":"IEEE","publisher-place":"Piscataway, NJ, USA","title":"QUARK: A framework for quantum computing application benchmarking","title-short":"QUARK","type":"paper-conference"}}],"isEdited":false,"manualOverride":{"citeprocText":"(Finžgar et al. 2022)","isManuallyOverridden":false,"manualOverrideText":""},"mendeley":{"formattedCitation":"(Finžgar et al. 2022)","plainTextFormattedCitation":"(Finžgar et al. 2022)","previouslyFormattedCitation":"(Finžgar et al. 2022)"},"properties":{"noteIndex":0},"schema":"https://github.com/citation-style-language/schema/raw/master/csl-citation.json"}</w:instrText>
+        <w:instrText xml:space="preserve">ADDIN CSL_CITATION {"citationID":"MENDELEY_CITATION_503","citationItems":[{"id":"ITEM-503","isTemporary":false,"itemData":{"URL":"https://arxiv.org/abs/2202.03028","author":[{"family":"Finžgar","given":"Jernej Rudi"},{"family":"Ross","given":"Philipp"},{"family":"Hölscher","given":"Leonhard"},{"family":"Klepsch","given":"Johannes"},{"family":"Luckow","given":"Andre"}],"container-title":"2022 IEEE international conference on quantum computing and engineering (QCE)","id":"Finzgar2022","issued":{"date-parts":[[2022]]},"page":"226-237","publisher":"IEEE","publisher-place":"Piscataway, NJ, USA","title":"QUARK: A framework for quantum computing application benchmarking","title-short":"QUARK","type":"paper-conference"}}],"isEdited":false,"manualOverride":{"citeprocText":"(Finžgar et al. 2022)","isManuallyOverridden":false,"manualOverrideText":""},"mendeley":{"formattedCitation":"(Finžgar et al. 2022)","plainTextFormattedCitation":"(Finžgar et al. 2022)","previouslyFormattedCitation":"(Finžgar et al. 2022)"},"properties":{"noteIndex":0},"schema":"https://github.com/citation-style-language/schema/raw/master/csl-citation.json"}</w:instrText>
       </w:r>
       <w:r>
         <w:fldChar w:fldCharType="separate"/>
@@ -18476,8 +18584,8 @@
         <w:t xml:space="preserve">, and extending such frameworks to the tasks in this survey would be a direct way to meet the checklist.</w:t>
       </w:r>
     </w:p>
-    <w:bookmarkEnd w:id="123"/>
-    <w:bookmarkStart w:id="124" w:name="X0b43672a4b199ed2fc9594e1b2a7e8ae221f859"/>
+    <w:bookmarkEnd w:id="124"/>
+    <w:bookmarkStart w:id="125" w:name="X0b43672a4b199ed2fc9594e1b2a7e8ae221f859"/>
     <w:p>
       <w:pPr>
         <w:pStyle w:val="Heading4"/>
@@ -18506,7 +18614,7 @@
         <w:fldChar w:fldCharType="begin"/>
       </w:r>
       <w:r>
-        <w:instrText xml:space="preserve">ADDIN CSL_CITATION {"citationID":"MENDELEY_CITATION_501","citationItems":[{"id":"ITEM-500","isTemporary":false,"itemData":{"DOI":"10.1038/nphys3272","author":[{"family":"Aaronson","given":"Scott"}],"container-title":"Nature Physics","id":"Aaronson2015","issue":"4","issued":{"date-parts":[[2015]]},"page":"291-293","title":"Read the fine print","type":"article-journal","volume":"11"}},{"id":"ITEM-501","isTemporary":false,"itemData":{"DOI":"10.1145/3313276.3316310","author":[{"family":"Tang","given":"Ewin"}],"container-title":"Proceedings of the 51st annual ACM SIGACT symposium on theory of computing (STOC 2019)","id":"Tang2019","issued":{"date-parts":[[2019]]},"page":"217-228","publisher":"ACM","publisher-place":"New York, NY, USA","title":"A quantum-inspired classical algorithm for recommendation systems","type":"paper-conference"}}],"isEdited":false,"manualOverride":{"citeprocText":"(Aaronson 2015; E. Tang 2019)","isManuallyOverridden":false,"manualOverrideText":""},"mendeley":{"formattedCitation":"(Aaronson 2015; E. Tang 2019)","plainTextFormattedCitation":"(Aaronson 2015; E. Tang 2019)","previouslyFormattedCitation":"(Aaronson 2015; E. Tang 2019)"},"properties":{"noteIndex":0},"schema":"https://github.com/citation-style-language/schema/raw/master/csl-citation.json"}</w:instrText>
+        <w:instrText xml:space="preserve">ADDIN CSL_CITATION {"citationID":"MENDELEY_CITATION_505","citationItems":[{"id":"ITEM-504","isTemporary":false,"itemData":{"DOI":"10.1038/nphys3272","author":[{"family":"Aaronson","given":"Scott"}],"container-title":"Nature Physics","id":"Aaronson2015","issue":"4","issued":{"date-parts":[[2015]]},"page":"291-293","title":"Read the fine print","type":"article-journal","volume":"11"}},{"id":"ITEM-505","isTemporary":false,"itemData":{"DOI":"10.1145/3313276.3316310","author":[{"family":"Tang","given":"Ewin"}],"container-title":"Proceedings of the 51st annual ACM SIGACT symposium on theory of computing (STOC 2019)","id":"Tang2019","issued":{"date-parts":[[2019]]},"page":"217-228","publisher":"ACM","publisher-place":"New York, NY, USA","title":"A quantum-inspired classical algorithm for recommendation systems","type":"paper-conference"}}],"isEdited":false,"manualOverride":{"citeprocText":"(Aaronson 2015; E. Tang 2019)","isManuallyOverridden":false,"manualOverrideText":""},"mendeley":{"formattedCitation":"(Aaronson 2015; E. Tang 2019)","plainTextFormattedCitation":"(Aaronson 2015; E. Tang 2019)","previouslyFormattedCitation":"(Aaronson 2015; E. Tang 2019)"},"properties":{"noteIndex":0},"schema":"https://github.com/citation-style-language/schema/raw/master/csl-citation.json"}</w:instrText>
       </w:r>
       <w:r>
         <w:fldChar w:fldCharType="separate"/>
@@ -18521,8 +18629,8 @@
         <w:t xml:space="preserve">.</w:t>
       </w:r>
     </w:p>
-    <w:bookmarkEnd w:id="124"/>
-    <w:bookmarkStart w:id="125" w:name="latency-aware-architectures."/>
+    <w:bookmarkEnd w:id="125"/>
+    <w:bookmarkStart w:id="126" w:name="latency-aware-architectures."/>
     <w:p>
       <w:pPr>
         <w:pStyle w:val="Heading4"/>
@@ -18551,7 +18659,7 @@
         <w:fldChar w:fldCharType="begin"/>
       </w:r>
       <w:r>
-        <w:instrText xml:space="preserve">ADDIN CSL_CITATION {"citationID":"MENDELEY_CITATION_502","citationItems":[{"id":"ITEM-502","isTemporary":false,"itemData":{"DOI":"10.1103/PhysRevLett.127.100501","author":[{"family":"Córcoles","given":"Antonio D."},{"family":"Takita","given":"Maika"},{"family":"Inoue","given":"Ken"},{"family":"Lekuch","given":"Scott"},{"family":"Minev","given":"Zlatko K."},{"family":"Chow","given":"Jerry M."},{"family":"Gambetta","given":"Jay M."}],"container-title":"Physical Review Letters","id":"Corcoles2021","issue":"10","issued":{"date-parts":[[2021]]},"page":"100501","publisher":"American Physical Society","title":"Exploiting dynamic quantum circuits in a quantum algorithm with superconducting qubits","type":"article-journal","volume":"127"}}],"isEdited":false,"manualOverride":{"citeprocText":"(Córcoles et al. 2021)","isManuallyOverridden":false,"manualOverrideText":""},"mendeley":{"formattedCitation":"(Córcoles et al. 2021)","plainTextFormattedCitation":"(Córcoles et al. 2021)","previouslyFormattedCitation":"(Córcoles et al. 2021)"},"properties":{"noteIndex":0},"schema":"https://github.com/citation-style-language/schema/raw/master/csl-citation.json"}</w:instrText>
+        <w:instrText xml:space="preserve">ADDIN CSL_CITATION {"citationID":"MENDELEY_CITATION_506","citationItems":[{"id":"ITEM-506","isTemporary":false,"itemData":{"DOI":"10.1103/PhysRevLett.127.100501","author":[{"family":"Córcoles","given":"Antonio D."},{"family":"Takita","given":"Maika"},{"family":"Inoue","given":"Ken"},{"family":"Lekuch","given":"Scott"},{"family":"Minev","given":"Zlatko K."},{"family":"Chow","given":"Jerry M."},{"family":"Gambetta","given":"Jay M."}],"container-title":"Physical Review Letters","id":"Corcoles2021","issue":"10","issued":{"date-parts":[[2021]]},"page":"100501","publisher":"American Physical Society","title":"Exploiting dynamic quantum circuits in a quantum algorithm with superconducting qubits","type":"article-journal","volume":"127"}}],"isEdited":false,"manualOverride":{"citeprocText":"(Córcoles et al. 2021)","isManuallyOverridden":false,"manualOverrideText":""},"mendeley":{"formattedCitation":"(Córcoles et al. 2021)","plainTextFormattedCitation":"(Córcoles et al. 2021)","previouslyFormattedCitation":"(Córcoles et al. 2021)"},"properties":{"noteIndex":0},"schema":"https://github.com/citation-style-language/schema/raw/master/csl-citation.json"}</w:instrText>
       </w:r>
       <w:r>
         <w:fldChar w:fldCharType="separate"/>
@@ -18572,7 +18680,7 @@
         <w:fldChar w:fldCharType="begin"/>
       </w:r>
       <w:r>
-        <w:instrText xml:space="preserve">ADDIN CSL_CITATION {"citationID":"MENDELEY_CITATION_503","citationItems":[{"id":"ITEM-503","isTemporary":false,"itemData":{"DOI":"10.1145/3445814.3446758","author":[{"family":"Tang","given":"Wei"},{"family":"Tomesh","given":"Teague"},{"family":"Suchara","given":"Martin"},{"family":"Larson","given":"Jeffrey"},{"family":"Martonosi","given":"Margaret"}],"container-title":"Proceedings of the 26th ACM international conference on architectural support for programming languages and operating systems (ASPLOS ’21)","id":"Tang2021","issued":{"date-parts":[[2021]]},"page":"473-486","publisher":"Association for Computing Machinery","publisher-place":"New York, NY, USA","title":"CutQC: Using small quantum computers for large quantum circuit evaluations","title-short":"CutQC","type":"paper-conference"}}],"isEdited":false,"manualOverride":{"citeprocText":"(W. Tang et al. 2021)","isManuallyOverridden":false,"manualOverrideText":""},"mendeley":{"formattedCitation":"(W. Tang et al. 2021)","plainTextFormattedCitation":"(W. Tang et al. 2021)","previouslyFormattedCitation":"(W. Tang et al. 2021)"},"properties":{"noteIndex":0},"schema":"https://github.com/citation-style-language/schema/raw/master/csl-citation.json"}</w:instrText>
+        <w:instrText xml:space="preserve">ADDIN CSL_CITATION {"citationID":"MENDELEY_CITATION_507","citationItems":[{"id":"ITEM-507","isTemporary":false,"itemData":{"DOI":"10.1145/3445814.3446758","author":[{"family":"Tang","given":"Wei"},{"family":"Tomesh","given":"Teague"},{"family":"Suchara","given":"Martin"},{"family":"Larson","given":"Jeffrey"},{"family":"Martonosi","given":"Margaret"}],"container-title":"Proceedings of the 26th ACM international conference on architectural support for programming languages and operating systems (ASPLOS ’21)","id":"Tang2021","issued":{"date-parts":[[2021]]},"page":"473-486","publisher":"Association for Computing Machinery","publisher-place":"New York, NY, USA","title":"CutQC: Using small quantum computers for large quantum circuit evaluations","title-short":"CutQC","type":"paper-conference"}}],"isEdited":false,"manualOverride":{"citeprocText":"(W. Tang et al. 2021)","isManuallyOverridden":false,"manualOverrideText":""},"mendeley":{"formattedCitation":"(W. Tang et al. 2021)","plainTextFormattedCitation":"(W. Tang et al. 2021)","previouslyFormattedCitation":"(W. Tang et al. 2021)"},"properties":{"noteIndex":0},"schema":"https://github.com/citation-style-language/schema/raw/master/csl-citation.json"}</w:instrText>
       </w:r>
       <w:r>
         <w:fldChar w:fldCharType="separate"/>
@@ -18590,8 +18698,8 @@
         <w:t xml:space="preserve">are the main technical routes to closing the latency gap.</w:t>
       </w:r>
     </w:p>
-    <w:bookmarkEnd w:id="125"/>
-    <w:bookmarkStart w:id="126" w:name="safety-and-verification."/>
+    <w:bookmarkEnd w:id="126"/>
+    <w:bookmarkStart w:id="127" w:name="safety-and-verification."/>
     <w:p>
       <w:pPr>
         <w:pStyle w:val="Heading4"/>
@@ -18620,7 +18728,7 @@
         <w:fldChar w:fldCharType="begin"/>
       </w:r>
       <w:r>
-        <w:instrText xml:space="preserve">ADDIN CSL_CITATION {"citationID":"MENDELEY_CITATION_504","citationItems":[{"id":"ITEM-504","isTemporary":false,"itemData":{"DOI":"10.3389/fcomp.2019.00009","author":[{"family":"Ohzeki","given":"Masayuki"},{"family":"Miki","given":"Akira"},{"family":"Miyama","given":"Masamichi J."},{"family":"Terabe","given":"Masayoshi"}],"container-title":"Frontiers in Computer Science","id":"Ohzeki2019","issued":{"date-parts":[[2019]]},"page":"9","publisher":"Frontiers Media","title":"Control of automated guided vehicles without collision by quantum annealer and digital devices","type":"article-journal","volume":"1"}}],"isEdited":false,"manualOverride":{"citeprocText":"(Ohzeki et al. 2019)","isManuallyOverridden":false,"manualOverrideText":""},"mendeley":{"formattedCitation":"(Ohzeki et al. 2019)","plainTextFormattedCitation":"(Ohzeki et al. 2019)","previouslyFormattedCitation":"(Ohzeki et al. 2019)"},"properties":{"noteIndex":0},"schema":"https://github.com/citation-style-language/schema/raw/master/csl-citation.json"}</w:instrText>
+        <w:instrText xml:space="preserve">ADDIN CSL_CITATION {"citationID":"MENDELEY_CITATION_508","citationItems":[{"id":"ITEM-508","isTemporary":false,"itemData":{"DOI":"10.3389/fcomp.2019.00009","author":[{"family":"Ohzeki","given":"Masayuki"},{"family":"Miki","given":"Akira"},{"family":"Miyama","given":"Masamichi J."},{"family":"Terabe","given":"Masayoshi"}],"container-title":"Frontiers in Computer Science","id":"Ohzeki2019","issued":{"date-parts":[[2019]]},"page":"9","publisher":"Frontiers Media","title":"Control of automated guided vehicles without collision by quantum annealer and digital devices","type":"article-journal","volume":"1"}}],"isEdited":false,"manualOverride":{"citeprocText":"(Ohzeki et al. 2019)","isManuallyOverridden":false,"manualOverrideText":""},"mendeley":{"formattedCitation":"(Ohzeki et al. 2019)","plainTextFormattedCitation":"(Ohzeki et al. 2019)","previouslyFormattedCitation":"(Ohzeki et al. 2019)"},"properties":{"noteIndex":0},"schema":"https://github.com/citation-style-language/schema/raw/master/csl-citation.json"}</w:instrText>
       </w:r>
       <w:r>
         <w:fldChar w:fldCharType="separate"/>
@@ -18638,10 +18746,10 @@
         <w:t xml:space="preserve">is a start, but there are no formal guarantees yet for hybrid quantum-classical controllers.</w:t>
       </w:r>
     </w:p>
-    <w:bookmarkEnd w:id="126"/>
     <w:bookmarkEnd w:id="127"/>
     <w:bookmarkEnd w:id="128"/>
-    <w:bookmarkStart w:id="129" w:name="sec:conclusion"/>
+    <w:bookmarkEnd w:id="129"/>
+    <w:bookmarkStart w:id="130" w:name="sec:conclusion"/>
     <w:p>
       <w:pPr>
         <w:pStyle w:val="Heading1"/>
@@ -18675,8 +18783,8 @@
         <w:t xml:space="preserve">For the near term (2026–2030), the realistic opportunities are quantum-enhanced navigation sensing, QP decision models for HRI, offline or periodic QUBO-based fleet optimization with classical fallbacks, and QPU-trained compact policies for embedded deployment. Real-time control will stay classical for the foreseeable future. Until on-premise, low-latency, fault-tolerant processors exist, quantum resources belong outside the millisecond loop, as training accelerators, periodic planners, or sensors. The long-term vision is a hybrid robot in which classical controllers handle real-time control, quantum sensors provide drift-free navigation, remote or edge quantum processors solve fleet-level optimization and train compact policies, and QP models help the robot understand the humans it works with. Getting there will depend less on a single breakthrough than on patient, honest evaluation of each component, on real robots, against the best classical alternative.</w:t>
       </w:r>
     </w:p>
-    <w:bookmarkEnd w:id="129"/>
-    <w:bookmarkStart w:id="130" w:name="data-availability"/>
+    <w:bookmarkEnd w:id="130"/>
+    <w:bookmarkStart w:id="131" w:name="data-availability"/>
     <w:p>
       <w:pPr>
         <w:pStyle w:val="Heading1"/>
@@ -18693,8 +18801,8 @@
         <w:t xml:space="preserve">The data-extraction table for the 72 primary studies, with evidence level, quantum-execution tag, and publication status for each study, the per-study quality appraisal and its criteria, the codebook, the PRISMA 2020 flow diagram and checklist, and the search strings are provided as supplementary material, including machine-readable (CSV) versions of the extraction and appraisal tables.</w:t>
       </w:r>
     </w:p>
-    <w:bookmarkEnd w:id="130"/>
-    <w:bookmarkStart w:id="470" w:name="bibliography"/>
+    <w:bookmarkEnd w:id="131"/>
+    <w:bookmarkStart w:id="471" w:name="bibliography"/>
     <w:p>
       <w:pPr>
         <w:pStyle w:val="Heading1"/>
@@ -18703,8 +18811,8 @@
         <w:t xml:space="preserve">References</w:t>
       </w:r>
     </w:p>
-    <w:bookmarkStart w:id="469" w:name="refs"/>
-    <w:bookmarkStart w:id="132" w:name="ref-Aaronson2015"/>
+    <w:bookmarkStart w:id="470" w:name="refs"/>
+    <w:bookmarkStart w:id="133" w:name="ref-Aaronson2015"/>
     <w:p>
       <w:pPr>
         <w:pStyle w:val="Bibliography"/>
@@ -18746,7 +18854,7 @@
       <w:r>
         <w:t xml:space="preserve"> </w:t>
       </w:r>
-      <w:hyperlink r:id="rId131">
+      <w:hyperlink r:id="rId132">
         <w:r>
           <w:rPr>
             <w:rStyle w:val="Hyperlink"/>
@@ -18758,8 +18866,8 @@
         <w:t xml:space="preserve">.</w:t>
       </w:r>
     </w:p>
-    <w:bookmarkEnd w:id="132"/>
-    <w:bookmarkStart w:id="134" w:name="ref-Acuto2022"/>
+    <w:bookmarkEnd w:id="133"/>
+    <w:bookmarkStart w:id="135" w:name="ref-Acuto2022"/>
     <w:p>
       <w:pPr>
         <w:pStyle w:val="Bibliography"/>
@@ -18776,7 +18884,7 @@
       <w:r>
         <w:t xml:space="preserve"> </w:t>
       </w:r>
-      <w:hyperlink r:id="rId133">
+      <w:hyperlink r:id="rId134">
         <w:r>
           <w:rPr>
             <w:rStyle w:val="Hyperlink"/>
@@ -18788,8 +18896,8 @@
         <w:t xml:space="preserve">.</w:t>
       </w:r>
     </w:p>
-    <w:bookmarkEnd w:id="134"/>
-    <w:bookmarkStart w:id="136" w:name="ref-Altrabulsi2026"/>
+    <w:bookmarkEnd w:id="135"/>
+    <w:bookmarkStart w:id="137" w:name="ref-Altrabulsi2026"/>
     <w:p>
       <w:pPr>
         <w:pStyle w:val="Bibliography"/>
@@ -18812,7 +18920,7 @@
       <w:r>
         <w:t xml:space="preserve"> </w:t>
       </w:r>
-      <w:hyperlink r:id="rId135">
+      <w:hyperlink r:id="rId136">
         <w:r>
           <w:rPr>
             <w:rStyle w:val="Hyperlink"/>
@@ -18824,8 +18932,8 @@
         <w:t xml:space="preserve">.</w:t>
       </w:r>
     </w:p>
-    <w:bookmarkEnd w:id="136"/>
-    <w:bookmarkStart w:id="138" w:name="ref-Antero2025"/>
+    <w:bookmarkEnd w:id="137"/>
+    <w:bookmarkStart w:id="139" w:name="ref-Antero2025"/>
     <w:p>
       <w:pPr>
         <w:pStyle w:val="Bibliography"/>
@@ -18858,7 +18966,7 @@
       <w:r>
         <w:t xml:space="preserve"> </w:t>
       </w:r>
-      <w:hyperlink r:id="rId137">
+      <w:hyperlink r:id="rId138">
         <w:r>
           <w:rPr>
             <w:rStyle w:val="Hyperlink"/>
@@ -18870,8 +18978,8 @@
         <w:t xml:space="preserve">.</w:t>
       </w:r>
     </w:p>
-    <w:bookmarkEnd w:id="138"/>
-    <w:bookmarkStart w:id="140" w:name="ref-Arute2019"/>
+    <w:bookmarkEnd w:id="139"/>
+    <w:bookmarkStart w:id="141" w:name="ref-Arute2019"/>
     <w:p>
       <w:pPr>
         <w:pStyle w:val="Bibliography"/>
@@ -18904,7 +19012,7 @@
       <w:r>
         <w:t xml:space="preserve"> </w:t>
       </w:r>
-      <w:hyperlink r:id="rId139">
+      <w:hyperlink r:id="rId140">
         <w:r>
           <w:rPr>
             <w:rStyle w:val="Hyperlink"/>
@@ -18916,8 +19024,8 @@
         <w:t xml:space="preserve">.</w:t>
       </w:r>
     </w:p>
-    <w:bookmarkEnd w:id="140"/>
-    <w:bookmarkStart w:id="142" w:name="ref-AtchadeAdelomou2021"/>
+    <w:bookmarkEnd w:id="141"/>
+    <w:bookmarkStart w:id="143" w:name="ref-AtchadeAdelomou2021"/>
     <w:p>
       <w:pPr>
         <w:pStyle w:val="Bibliography"/>
@@ -18956,7 +19064,7 @@
       <w:r>
         <w:t xml:space="preserve"> </w:t>
       </w:r>
-      <w:hyperlink r:id="rId141">
+      <w:hyperlink r:id="rId142">
         <w:r>
           <w:rPr>
             <w:rStyle w:val="Hyperlink"/>
@@ -18968,8 +19076,8 @@
         <w:t xml:space="preserve">.</w:t>
       </w:r>
     </w:p>
-    <w:bookmarkEnd w:id="142"/>
-    <w:bookmarkStart w:id="144" w:name="ref-Babbush2018"/>
+    <w:bookmarkEnd w:id="143"/>
+    <w:bookmarkStart w:id="145" w:name="ref-Babbush2018"/>
     <w:p>
       <w:pPr>
         <w:pStyle w:val="Bibliography"/>
@@ -19014,7 +19122,7 @@
       <w:r>
         <w:t xml:space="preserve"> </w:t>
       </w:r>
-      <w:hyperlink r:id="rId143">
+      <w:hyperlink r:id="rId144">
         <w:r>
           <w:rPr>
             <w:rStyle w:val="Hyperlink"/>
@@ -19026,8 +19134,8 @@
         <w:t xml:space="preserve">.</w:t>
       </w:r>
     </w:p>
-    <w:bookmarkEnd w:id="144"/>
-    <w:bookmarkStart w:id="146" w:name="ref-Babbush2021"/>
+    <w:bookmarkEnd w:id="145"/>
+    <w:bookmarkStart w:id="147" w:name="ref-Babbush2021"/>
     <w:p>
       <w:pPr>
         <w:pStyle w:val="Bibliography"/>
@@ -19060,7 +19168,7 @@
       <w:r>
         <w:t xml:space="preserve"> </w:t>
       </w:r>
-      <w:hyperlink r:id="rId145">
+      <w:hyperlink r:id="rId146">
         <w:r>
           <w:rPr>
             <w:rStyle w:val="Hyperlink"/>
@@ -19072,8 +19180,8 @@
         <w:t xml:space="preserve">.</w:t>
       </w:r>
     </w:p>
-    <w:bookmarkEnd w:id="146"/>
-    <w:bookmarkStart w:id="148" w:name="ref-Bang2026"/>
+    <w:bookmarkEnd w:id="147"/>
+    <w:bookmarkStart w:id="149" w:name="ref-Bang2026"/>
     <w:p>
       <w:pPr>
         <w:pStyle w:val="Bibliography"/>
@@ -19102,7 +19210,7 @@
       <w:r>
         <w:t xml:space="preserve"> </w:t>
       </w:r>
-      <w:hyperlink r:id="rId147">
+      <w:hyperlink r:id="rId148">
         <w:r>
           <w:rPr>
             <w:rStyle w:val="Hyperlink"/>
@@ -19114,8 +19222,8 @@
         <w:t xml:space="preserve">.</w:t>
       </w:r>
     </w:p>
-    <w:bookmarkEnd w:id="148"/>
-    <w:bookmarkStart w:id="150" w:name="ref-Barkoutsos2020"/>
+    <w:bookmarkEnd w:id="149"/>
+    <w:bookmarkStart w:id="151" w:name="ref-Barkoutsos2020"/>
     <w:p>
       <w:pPr>
         <w:pStyle w:val="Bibliography"/>
@@ -19157,7 +19265,7 @@
       <w:r>
         <w:t xml:space="preserve"> </w:t>
       </w:r>
-      <w:hyperlink r:id="rId149">
+      <w:hyperlink r:id="rId150">
         <w:r>
           <w:rPr>
             <w:rStyle w:val="Hyperlink"/>
@@ -19169,8 +19277,8 @@
         <w:t xml:space="preserve">.</w:t>
       </w:r>
     </w:p>
-    <w:bookmarkEnd w:id="150"/>
-    <w:bookmarkStart w:id="152" w:name="ref-Begusic2024"/>
+    <w:bookmarkEnd w:id="151"/>
+    <w:bookmarkStart w:id="153" w:name="ref-Begusic2024"/>
     <w:p>
       <w:pPr>
         <w:pStyle w:val="Bibliography"/>
@@ -19203,7 +19311,7 @@
       <w:r>
         <w:t xml:space="preserve"> </w:t>
       </w:r>
-      <w:hyperlink r:id="rId151">
+      <w:hyperlink r:id="rId152">
         <w:r>
           <w:rPr>
             <w:rStyle w:val="Hyperlink"/>
@@ -19215,8 +19323,8 @@
         <w:t xml:space="preserve">.</w:t>
       </w:r>
     </w:p>
-    <w:bookmarkEnd w:id="152"/>
-    <w:bookmarkStart w:id="154" w:name="ref-Benioff1998"/>
+    <w:bookmarkEnd w:id="153"/>
+    <w:bookmarkStart w:id="155" w:name="ref-Benioff1998"/>
     <w:p>
       <w:pPr>
         <w:pStyle w:val="Bibliography"/>
@@ -19249,7 +19357,7 @@
       <w:r>
         <w:t xml:space="preserve"> </w:t>
       </w:r>
-      <w:hyperlink r:id="rId153">
+      <w:hyperlink r:id="rId154">
         <w:r>
           <w:rPr>
             <w:rStyle w:val="Hyperlink"/>
@@ -19261,8 +19369,8 @@
         <w:t xml:space="preserve">.</w:t>
       </w:r>
     </w:p>
-    <w:bookmarkEnd w:id="154"/>
-    <w:bookmarkStart w:id="156" w:name="ref-Benioff2002"/>
+    <w:bookmarkEnd w:id="155"/>
+    <w:bookmarkStart w:id="157" w:name="ref-Benioff2002"/>
     <w:p>
       <w:pPr>
         <w:pStyle w:val="Bibliography"/>
@@ -19298,7 +19406,7 @@
       <w:r>
         <w:t xml:space="preserve"> </w:t>
       </w:r>
-      <w:hyperlink r:id="rId155">
+      <w:hyperlink r:id="rId156">
         <w:r>
           <w:rPr>
             <w:rStyle w:val="Hyperlink"/>
@@ -19310,8 +19418,8 @@
         <w:t xml:space="preserve">.</w:t>
       </w:r>
     </w:p>
-    <w:bookmarkEnd w:id="156"/>
-    <w:bookmarkStart w:id="158" w:name="ref-Bharti2022"/>
+    <w:bookmarkEnd w:id="157"/>
+    <w:bookmarkStart w:id="159" w:name="ref-Bharti2022"/>
     <w:p>
       <w:pPr>
         <w:pStyle w:val="Bibliography"/>
@@ -19344,7 +19452,7 @@
       <w:r>
         <w:t xml:space="preserve"> </w:t>
       </w:r>
-      <w:hyperlink r:id="rId157">
+      <w:hyperlink r:id="rId158">
         <w:r>
           <w:rPr>
             <w:rStyle w:val="Hyperlink"/>
@@ -19356,8 +19464,8 @@
         <w:t xml:space="preserve">.</w:t>
       </w:r>
     </w:p>
-    <w:bookmarkEnd w:id="158"/>
-    <w:bookmarkStart w:id="160" w:name="ref-Biamonte2017"/>
+    <w:bookmarkEnd w:id="159"/>
+    <w:bookmarkStart w:id="161" w:name="ref-Biamonte2017"/>
     <w:p>
       <w:pPr>
         <w:pStyle w:val="Bibliography"/>
@@ -19390,7 +19498,7 @@
       <w:r>
         <w:t xml:space="preserve"> </w:t>
       </w:r>
-      <w:hyperlink r:id="rId159">
+      <w:hyperlink r:id="rId160">
         <w:r>
           <w:rPr>
             <w:rStyle w:val="Hyperlink"/>
@@ -19402,8 +19510,8 @@
         <w:t xml:space="preserve">.</w:t>
       </w:r>
     </w:p>
-    <w:bookmarkEnd w:id="160"/>
-    <w:bookmarkStart w:id="162" w:name="ref-Bluvstein2024"/>
+    <w:bookmarkEnd w:id="161"/>
+    <w:bookmarkStart w:id="163" w:name="ref-Bluvstein2024"/>
     <w:p>
       <w:pPr>
         <w:pStyle w:val="Bibliography"/>
@@ -19436,7 +19544,7 @@
       <w:r>
         <w:t xml:space="preserve"> </w:t>
       </w:r>
-      <w:hyperlink r:id="rId161">
+      <w:hyperlink r:id="rId162">
         <w:r>
           <w:rPr>
             <w:rStyle w:val="Hyperlink"/>
@@ -19448,8 +19556,8 @@
         <w:t xml:space="preserve">.</w:t>
       </w:r>
     </w:p>
-    <w:bookmarkEnd w:id="162"/>
-    <w:bookmarkStart w:id="164" w:name="ref-Bongs2019"/>
+    <w:bookmarkEnd w:id="163"/>
+    <w:bookmarkStart w:id="165" w:name="ref-Bongs2019"/>
     <w:p>
       <w:pPr>
         <w:pStyle w:val="Bibliography"/>
@@ -19482,7 +19590,7 @@
       <w:r>
         <w:t xml:space="preserve"> </w:t>
       </w:r>
-      <w:hyperlink r:id="rId163">
+      <w:hyperlink r:id="rId164">
         <w:r>
           <w:rPr>
             <w:rStyle w:val="Hyperlink"/>
@@ -19494,8 +19602,8 @@
         <w:t xml:space="preserve">.</w:t>
       </w:r>
     </w:p>
-    <w:bookmarkEnd w:id="164"/>
-    <w:bookmarkStart w:id="166" w:name="ref-Brassard2002"/>
+    <w:bookmarkEnd w:id="165"/>
+    <w:bookmarkStart w:id="167" w:name="ref-Brassard2002"/>
     <w:p>
       <w:pPr>
         <w:pStyle w:val="Bibliography"/>
@@ -19531,7 +19639,7 @@
       <w:r>
         <w:t xml:space="preserve"> </w:t>
       </w:r>
-      <w:hyperlink r:id="rId165">
+      <w:hyperlink r:id="rId166">
         <w:r>
           <w:rPr>
             <w:rStyle w:val="Hyperlink"/>
@@ -19543,8 +19651,8 @@
         <w:t xml:space="preserve">.</w:t>
       </w:r>
     </w:p>
-    <w:bookmarkEnd w:id="166"/>
-    <w:bookmarkStart w:id="168" w:name="ref-Bravyi2024"/>
+    <w:bookmarkEnd w:id="167"/>
+    <w:bookmarkStart w:id="169" w:name="ref-Bravyi2024"/>
     <w:p>
       <w:pPr>
         <w:pStyle w:val="Bibliography"/>
@@ -19577,7 +19685,7 @@
       <w:r>
         <w:t xml:space="preserve"> </w:t>
       </w:r>
-      <w:hyperlink r:id="rId167">
+      <w:hyperlink r:id="rId168">
         <w:r>
           <w:rPr>
             <w:rStyle w:val="Hyperlink"/>
@@ -19589,8 +19697,8 @@
         <w:t xml:space="preserve">.</w:t>
       </w:r>
     </w:p>
-    <w:bookmarkEnd w:id="168"/>
-    <w:bookmarkStart w:id="170" w:name="ref-Briegel2012"/>
+    <w:bookmarkEnd w:id="169"/>
+    <w:bookmarkStart w:id="171" w:name="ref-Briegel2012"/>
     <w:p>
       <w:pPr>
         <w:pStyle w:val="Bibliography"/>
@@ -19623,7 +19731,7 @@
       <w:r>
         <w:t xml:space="preserve"> </w:t>
       </w:r>
-      <w:hyperlink r:id="rId169">
+      <w:hyperlink r:id="rId170">
         <w:r>
           <w:rPr>
             <w:rStyle w:val="Hyperlink"/>
@@ -19635,8 +19743,8 @@
         <w:t xml:space="preserve">.</w:t>
       </w:r>
     </w:p>
-    <w:bookmarkEnd w:id="170"/>
-    <w:bookmarkStart w:id="172" w:name="ref-Busemeyer2012"/>
+    <w:bookmarkEnd w:id="171"/>
+    <w:bookmarkStart w:id="173" w:name="ref-Busemeyer2012"/>
     <w:p>
       <w:pPr>
         <w:pStyle w:val="Bibliography"/>
@@ -19660,7 +19768,7 @@
       <w:r>
         <w:t xml:space="preserve"> </w:t>
       </w:r>
-      <w:hyperlink r:id="rId171">
+      <w:hyperlink r:id="rId172">
         <w:r>
           <w:rPr>
             <w:rStyle w:val="Hyperlink"/>
@@ -19672,8 +19780,8 @@
         <w:t xml:space="preserve">.</w:t>
       </w:r>
     </w:p>
-    <w:bookmarkEnd w:id="172"/>
-    <w:bookmarkStart w:id="174" w:name="ref-Busemeyer1993"/>
+    <w:bookmarkEnd w:id="173"/>
+    <w:bookmarkStart w:id="175" w:name="ref-Busemeyer1993"/>
     <w:p>
       <w:pPr>
         <w:pStyle w:val="Bibliography"/>
@@ -19706,7 +19814,7 @@
       <w:r>
         <w:t xml:space="preserve"> </w:t>
       </w:r>
-      <w:hyperlink r:id="rId173">
+      <w:hyperlink r:id="rId174">
         <w:r>
           <w:rPr>
             <w:rStyle w:val="Hyperlink"/>
@@ -19718,8 +19826,8 @@
         <w:t xml:space="preserve">.</w:t>
       </w:r>
     </w:p>
-    <w:bookmarkEnd w:id="174"/>
-    <w:bookmarkStart w:id="176" w:name="ref-Cai2023"/>
+    <w:bookmarkEnd w:id="175"/>
+    <w:bookmarkStart w:id="177" w:name="ref-Cai2023"/>
     <w:p>
       <w:pPr>
         <w:pStyle w:val="Bibliography"/>
@@ -19752,7 +19860,7 @@
       <w:r>
         <w:t xml:space="preserve"> </w:t>
       </w:r>
-      <w:hyperlink r:id="rId175">
+      <w:hyperlink r:id="rId176">
         <w:r>
           <w:rPr>
             <w:rStyle w:val="Hyperlink"/>
@@ -19764,8 +19872,8 @@
         <w:t xml:space="preserve">.</w:t>
       </w:r>
     </w:p>
-    <w:bookmarkEnd w:id="176"/>
-    <w:bookmarkStart w:id="178" w:name="ref-Cerezo2021a"/>
+    <w:bookmarkEnd w:id="177"/>
+    <w:bookmarkStart w:id="179" w:name="ref-Cerezo2021a"/>
     <w:p>
       <w:pPr>
         <w:pStyle w:val="Bibliography"/>
@@ -19798,7 +19906,7 @@
       <w:r>
         <w:t xml:space="preserve"> </w:t>
       </w:r>
-      <w:hyperlink r:id="rId177">
+      <w:hyperlink r:id="rId178">
         <w:r>
           <w:rPr>
             <w:rStyle w:val="Hyperlink"/>
@@ -19810,8 +19918,8 @@
         <w:t xml:space="preserve">.</w:t>
       </w:r>
     </w:p>
-    <w:bookmarkEnd w:id="178"/>
-    <w:bookmarkStart w:id="180" w:name="ref-Cerezo2021b"/>
+    <w:bookmarkEnd w:id="179"/>
+    <w:bookmarkStart w:id="181" w:name="ref-Cerezo2021b"/>
     <w:p>
       <w:pPr>
         <w:pStyle w:val="Bibliography"/>
@@ -19844,7 +19952,7 @@
       <w:r>
         <w:t xml:space="preserve"> </w:t>
       </w:r>
-      <w:hyperlink r:id="rId179">
+      <w:hyperlink r:id="rId180">
         <w:r>
           <w:rPr>
             <w:rStyle w:val="Hyperlink"/>
@@ -19856,8 +19964,8 @@
         <w:t xml:space="preserve">.</w:t>
       </w:r>
     </w:p>
-    <w:bookmarkEnd w:id="180"/>
-    <w:bookmarkStart w:id="182" w:name="ref-Cheiney2018"/>
+    <w:bookmarkEnd w:id="181"/>
+    <w:bookmarkStart w:id="183" w:name="ref-Cheiney2018"/>
     <w:p>
       <w:pPr>
         <w:pStyle w:val="Bibliography"/>
@@ -19902,7 +20010,7 @@
       <w:r>
         <w:t xml:space="preserve"> </w:t>
       </w:r>
-      <w:hyperlink r:id="rId181">
+      <w:hyperlink r:id="rId182">
         <w:r>
           <w:rPr>
             <w:rStyle w:val="Hyperlink"/>
@@ -19914,8 +20022,8 @@
         <w:t xml:space="preserve">.</w:t>
       </w:r>
     </w:p>
-    <w:bookmarkEnd w:id="182"/>
-    <w:bookmarkStart w:id="184" w:name="ref-Chella2023"/>
+    <w:bookmarkEnd w:id="183"/>
+    <w:bookmarkStart w:id="185" w:name="ref-Chella2023"/>
     <w:p>
       <w:pPr>
         <w:pStyle w:val="Bibliography"/>
@@ -19948,7 +20056,7 @@
       <w:r>
         <w:t xml:space="preserve"> </w:t>
       </w:r>
-      <w:hyperlink r:id="rId183">
+      <w:hyperlink r:id="rId184">
         <w:r>
           <w:rPr>
             <w:rStyle w:val="Hyperlink"/>
@@ -19960,8 +20068,8 @@
         <w:t xml:space="preserve">.</w:t>
       </w:r>
     </w:p>
-    <w:bookmarkEnd w:id="184"/>
-    <w:bookmarkStart w:id="186" w:name="ref-Chella2022"/>
+    <w:bookmarkEnd w:id="185"/>
+    <w:bookmarkStart w:id="187" w:name="ref-Chella2022"/>
     <w:p>
       <w:pPr>
         <w:pStyle w:val="Bibliography"/>
@@ -19994,7 +20102,7 @@
       <w:r>
         <w:t xml:space="preserve"> </w:t>
       </w:r>
-      <w:hyperlink r:id="rId185">
+      <w:hyperlink r:id="rId186">
         <w:r>
           <w:rPr>
             <w:rStyle w:val="Hyperlink"/>
@@ -20006,8 +20114,8 @@
         <w:t xml:space="preserve">.</w:t>
       </w:r>
     </w:p>
-    <w:bookmarkEnd w:id="186"/>
-    <w:bookmarkStart w:id="188" w:name="ref-Chen2022"/>
+    <w:bookmarkEnd w:id="187"/>
+    <w:bookmarkStart w:id="189" w:name="ref-Chen2022"/>
     <w:p>
       <w:pPr>
         <w:pStyle w:val="Bibliography"/>
@@ -20040,7 +20148,7 @@
       <w:r>
         <w:t xml:space="preserve"> </w:t>
       </w:r>
-      <w:hyperlink r:id="rId187">
+      <w:hyperlink r:id="rId188">
         <w:r>
           <w:rPr>
             <w:rStyle w:val="Hyperlink"/>
@@ -20052,8 +20160,8 @@
         <w:t xml:space="preserve">.</w:t>
       </w:r>
     </w:p>
-    <w:bookmarkEnd w:id="188"/>
-    <w:bookmarkStart w:id="190" w:name="ref-Chen2020"/>
+    <w:bookmarkEnd w:id="189"/>
+    <w:bookmarkStart w:id="191" w:name="ref-Chen2020"/>
     <w:p>
       <w:pPr>
         <w:pStyle w:val="Bibliography"/>
@@ -20086,7 +20194,7 @@
       <w:r>
         <w:t xml:space="preserve"> </w:t>
       </w:r>
-      <w:hyperlink r:id="rId189">
+      <w:hyperlink r:id="rId190">
         <w:r>
           <w:rPr>
             <w:rStyle w:val="Hyperlink"/>
@@ -20098,8 +20206,8 @@
         <w:t xml:space="preserve">.</w:t>
       </w:r>
     </w:p>
-    <w:bookmarkEnd w:id="190"/>
-    <w:bookmarkStart w:id="192" w:name="ref-Chia2020"/>
+    <w:bookmarkEnd w:id="191"/>
+    <w:bookmarkStart w:id="193" w:name="ref-Chia2020"/>
     <w:p>
       <w:pPr>
         <w:pStyle w:val="Bibliography"/>
@@ -20156,7 +20264,7 @@
       <w:r>
         <w:t xml:space="preserve"> </w:t>
       </w:r>
-      <w:hyperlink r:id="rId191">
+      <w:hyperlink r:id="rId192">
         <w:r>
           <w:rPr>
             <w:rStyle w:val="Hyperlink"/>
@@ -20168,8 +20276,8 @@
         <w:t xml:space="preserve">.</w:t>
       </w:r>
     </w:p>
-    <w:bookmarkEnd w:id="192"/>
-    <w:bookmarkStart w:id="194" w:name="ref-Clark2019"/>
+    <w:bookmarkEnd w:id="193"/>
+    <w:bookmarkStart w:id="195" w:name="ref-Clark2019"/>
     <w:p>
       <w:pPr>
         <w:pStyle w:val="Bibliography"/>
@@ -20226,7 +20334,7 @@
       <w:r>
         <w:t xml:space="preserve"> </w:t>
       </w:r>
-      <w:hyperlink r:id="rId193">
+      <w:hyperlink r:id="rId194">
         <w:r>
           <w:rPr>
             <w:rStyle w:val="Hyperlink"/>
@@ -20238,8 +20346,8 @@
         <w:t xml:space="preserve">.</w:t>
       </w:r>
     </w:p>
-    <w:bookmarkEnd w:id="194"/>
-    <w:bookmarkStart w:id="196" w:name="ref-Conrad2025"/>
+    <w:bookmarkEnd w:id="195"/>
+    <w:bookmarkStart w:id="197" w:name="ref-Conrad2025"/>
     <w:p>
       <w:pPr>
         <w:pStyle w:val="Bibliography"/>
@@ -20256,7 +20364,7 @@
       <w:r>
         <w:t xml:space="preserve"> </w:t>
       </w:r>
-      <w:hyperlink r:id="rId195">
+      <w:hyperlink r:id="rId196">
         <w:r>
           <w:rPr>
             <w:rStyle w:val="Hyperlink"/>
@@ -20268,8 +20376,8 @@
         <w:t xml:space="preserve">.</w:t>
       </w:r>
     </w:p>
-    <w:bookmarkEnd w:id="196"/>
-    <w:bookmarkStart w:id="198" w:name="ref-Corcoles2021"/>
+    <w:bookmarkEnd w:id="197"/>
+    <w:bookmarkStart w:id="199" w:name="ref-Corcoles2021"/>
     <w:p>
       <w:pPr>
         <w:pStyle w:val="Bibliography"/>
@@ -20302,7 +20410,7 @@
       <w:r>
         <w:t xml:space="preserve"> </w:t>
       </w:r>
-      <w:hyperlink r:id="rId197">
+      <w:hyperlink r:id="rId198">
         <w:r>
           <w:rPr>
             <w:rStyle w:val="Hyperlink"/>
@@ -20314,8 +20422,8 @@
         <w:t xml:space="preserve">.</w:t>
       </w:r>
     </w:p>
-    <w:bookmarkEnd w:id="198"/>
-    <w:bookmarkStart w:id="200" w:name="ref-Daglarli2025"/>
+    <w:bookmarkEnd w:id="199"/>
+    <w:bookmarkStart w:id="201" w:name="ref-Daglarli2025"/>
     <w:p>
       <w:pPr>
         <w:pStyle w:val="Bibliography"/>
@@ -20348,7 +20456,7 @@
       <w:r>
         <w:t xml:space="preserve"> </w:t>
       </w:r>
-      <w:hyperlink r:id="rId199">
+      <w:hyperlink r:id="rId200">
         <w:r>
           <w:rPr>
             <w:rStyle w:val="Hyperlink"/>
@@ -20360,8 +20468,8 @@
         <w:t xml:space="preserve">.</w:t>
       </w:r>
     </w:p>
-    <w:bookmarkEnd w:id="200"/>
-    <w:bookmarkStart w:id="202" w:name="ref-DeCarolis2025"/>
+    <w:bookmarkEnd w:id="201"/>
+    <w:bookmarkStart w:id="203" w:name="ref-DeCarolis2025"/>
     <w:p>
       <w:pPr>
         <w:pStyle w:val="Bibliography"/>
@@ -20458,7 +20566,7 @@
       <w:r>
         <w:t xml:space="preserve"> </w:t>
       </w:r>
-      <w:hyperlink r:id="rId201">
+      <w:hyperlink r:id="rId202">
         <w:r>
           <w:rPr>
             <w:rStyle w:val="Hyperlink"/>
@@ -20470,8 +20578,8 @@
         <w:t xml:space="preserve">.</w:t>
       </w:r>
     </w:p>
-    <w:bookmarkEnd w:id="202"/>
-    <w:bookmarkStart w:id="204" w:name="ref-Degen2017"/>
+    <w:bookmarkEnd w:id="203"/>
+    <w:bookmarkStart w:id="205" w:name="ref-Degen2017"/>
     <w:p>
       <w:pPr>
         <w:pStyle w:val="Bibliography"/>
@@ -20504,7 +20612,7 @@
       <w:r>
         <w:t xml:space="preserve"> </w:t>
       </w:r>
-      <w:hyperlink r:id="rId203">
+      <w:hyperlink r:id="rId204">
         <w:r>
           <w:rPr>
             <w:rStyle w:val="Hyperlink"/>
@@ -20516,8 +20624,8 @@
         <w:t xml:space="preserve">.</w:t>
       </w:r>
     </w:p>
-    <w:bookmarkEnd w:id="204"/>
-    <w:bookmarkStart w:id="206" w:name="ref-Dellaert1999"/>
+    <w:bookmarkEnd w:id="205"/>
+    <w:bookmarkStart w:id="207" w:name="ref-Dellaert1999"/>
     <w:p>
       <w:pPr>
         <w:pStyle w:val="Bibliography"/>
@@ -20604,7 +20712,7 @@
       <w:r>
         <w:t xml:space="preserve"> </w:t>
       </w:r>
-      <w:hyperlink r:id="rId205">
+      <w:hyperlink r:id="rId206">
         <w:r>
           <w:rPr>
             <w:rStyle w:val="Hyperlink"/>
@@ -20616,8 +20724,8 @@
         <w:t xml:space="preserve">.</w:t>
       </w:r>
     </w:p>
-    <w:bookmarkEnd w:id="206"/>
-    <w:bookmarkStart w:id="208" w:name="ref-Deutsch1985"/>
+    <w:bookmarkEnd w:id="207"/>
+    <w:bookmarkStart w:id="209" w:name="ref-Deutsch1985"/>
     <w:p>
       <w:pPr>
         <w:pStyle w:val="Bibliography"/>
@@ -20662,7 +20770,7 @@
       <w:r>
         <w:t xml:space="preserve"> </w:t>
       </w:r>
-      <w:hyperlink r:id="rId207">
+      <w:hyperlink r:id="rId208">
         <w:r>
           <w:rPr>
             <w:rStyle w:val="Hyperlink"/>
@@ -20674,8 +20782,8 @@
         <w:t xml:space="preserve">.</w:t>
       </w:r>
     </w:p>
-    <w:bookmarkEnd w:id="208"/>
-    <w:bookmarkStart w:id="210" w:name="ref-Deutsch1992"/>
+    <w:bookmarkEnd w:id="209"/>
+    <w:bookmarkStart w:id="211" w:name="ref-Deutsch1992"/>
     <w:p>
       <w:pPr>
         <w:pStyle w:val="Bibliography"/>
@@ -20708,7 +20816,7 @@
       <w:r>
         <w:t xml:space="preserve"> </w:t>
       </w:r>
-      <w:hyperlink r:id="rId209">
+      <w:hyperlink r:id="rId210">
         <w:r>
           <w:rPr>
             <w:rStyle w:val="Hyperlink"/>
@@ -20720,8 +20828,8 @@
         <w:t xml:space="preserve">.</w:t>
       </w:r>
     </w:p>
-    <w:bookmarkEnd w:id="210"/>
-    <w:bookmarkStart w:id="212" w:name="ref-Dobler2025"/>
+    <w:bookmarkEnd w:id="211"/>
+    <w:bookmarkStart w:id="213" w:name="ref-Dobler2025"/>
     <w:p>
       <w:pPr>
         <w:pStyle w:val="Bibliography"/>
@@ -20738,7 +20846,7 @@
       <w:r>
         <w:t xml:space="preserve"> </w:t>
       </w:r>
-      <w:hyperlink r:id="rId211">
+      <w:hyperlink r:id="rId212">
         <w:r>
           <w:rPr>
             <w:rStyle w:val="Hyperlink"/>
@@ -20750,8 +20858,8 @@
         <w:t xml:space="preserve">.</w:t>
       </w:r>
     </w:p>
-    <w:bookmarkEnd w:id="212"/>
-    <w:bookmarkStart w:id="214" w:name="ref-Dong2012"/>
+    <w:bookmarkEnd w:id="213"/>
+    <w:bookmarkStart w:id="215" w:name="ref-Dong2012"/>
     <w:p>
       <w:pPr>
         <w:pStyle w:val="Bibliography"/>
@@ -20798,7 +20906,7 @@
       <w:r>
         <w:t xml:space="preserve"> </w:t>
       </w:r>
-      <w:hyperlink r:id="rId213">
+      <w:hyperlink r:id="rId214">
         <w:r>
           <w:rPr>
             <w:rStyle w:val="Hyperlink"/>
@@ -20810,8 +20918,8 @@
         <w:t xml:space="preserve">.</w:t>
       </w:r>
     </w:p>
-    <w:bookmarkEnd w:id="214"/>
-    <w:bookmarkStart w:id="216" w:name="ref-Dong2008"/>
+    <w:bookmarkEnd w:id="215"/>
+    <w:bookmarkStart w:id="217" w:name="ref-Dong2008"/>
     <w:p>
       <w:pPr>
         <w:pStyle w:val="Bibliography"/>
@@ -20844,7 +20952,7 @@
       <w:r>
         <w:t xml:space="preserve"> </w:t>
       </w:r>
-      <w:hyperlink r:id="rId215">
+      <w:hyperlink r:id="rId216">
         <w:r>
           <w:rPr>
             <w:rStyle w:val="Hyperlink"/>
@@ -20856,8 +20964,8 @@
         <w:t xml:space="preserve">.</w:t>
       </w:r>
     </w:p>
-    <w:bookmarkEnd w:id="216"/>
-    <w:bookmarkStart w:id="218" w:name="ref-Dong2006"/>
+    <w:bookmarkEnd w:id="217"/>
+    <w:bookmarkStart w:id="219" w:name="ref-Dong2006"/>
     <w:p>
       <w:pPr>
         <w:pStyle w:val="Bibliography"/>
@@ -20890,7 +20998,7 @@
       <w:r>
         <w:t xml:space="preserve"> </w:t>
       </w:r>
-      <w:hyperlink r:id="rId217">
+      <w:hyperlink r:id="rId218">
         <w:r>
           <w:rPr>
             <w:rStyle w:val="Hyperlink"/>
@@ -20902,8 +21010,8 @@
         <w:t xml:space="preserve">.</w:t>
       </w:r>
     </w:p>
-    <w:bookmarkEnd w:id="218"/>
-    <w:bookmarkStart w:id="220" w:name="ref-Dragan2025"/>
+    <w:bookmarkEnd w:id="219"/>
+    <w:bookmarkStart w:id="221" w:name="ref-Dragan2025"/>
     <w:p>
       <w:pPr>
         <w:pStyle w:val="Bibliography"/>
@@ -20966,7 +21074,7 @@
       <w:r>
         <w:t xml:space="preserve"> </w:t>
       </w:r>
-      <w:hyperlink r:id="rId219">
+      <w:hyperlink r:id="rId220">
         <w:r>
           <w:rPr>
             <w:rStyle w:val="Hyperlink"/>
@@ -20978,8 +21086,8 @@
         <w:t xml:space="preserve">.</w:t>
       </w:r>
     </w:p>
-    <w:bookmarkEnd w:id="220"/>
-    <w:bookmarkStart w:id="222" w:name="ref-Dunjko2018"/>
+    <w:bookmarkEnd w:id="221"/>
+    <w:bookmarkStart w:id="223" w:name="ref-Dunjko2018"/>
     <w:p>
       <w:pPr>
         <w:pStyle w:val="Bibliography"/>
@@ -21012,7 +21120,7 @@
       <w:r>
         <w:t xml:space="preserve"> </w:t>
       </w:r>
-      <w:hyperlink r:id="rId221">
+      <w:hyperlink r:id="rId222">
         <w:r>
           <w:rPr>
             <w:rStyle w:val="Hyperlink"/>
@@ -21024,8 +21132,8 @@
         <w:t xml:space="preserve">.</w:t>
       </w:r>
     </w:p>
-    <w:bookmarkEnd w:id="222"/>
-    <w:bookmarkStart w:id="224" w:name="ref-Endo2021"/>
+    <w:bookmarkEnd w:id="223"/>
+    <w:bookmarkStart w:id="225" w:name="ref-Endo2021"/>
     <w:p>
       <w:pPr>
         <w:pStyle w:val="Bibliography"/>
@@ -21058,7 +21166,7 @@
       <w:r>
         <w:t xml:space="preserve"> </w:t>
       </w:r>
-      <w:hyperlink r:id="rId223">
+      <w:hyperlink r:id="rId224">
         <w:r>
           <w:rPr>
             <w:rStyle w:val="Hyperlink"/>
@@ -21070,8 +21178,8 @@
         <w:t xml:space="preserve">.</w:t>
       </w:r>
     </w:p>
-    <w:bookmarkEnd w:id="224"/>
-    <w:bookmarkStart w:id="226" w:name="ref-Essalmi2026"/>
+    <w:bookmarkEnd w:id="225"/>
+    <w:bookmarkStart w:id="227" w:name="ref-Essalmi2026"/>
     <w:p>
       <w:pPr>
         <w:pStyle w:val="Bibliography"/>
@@ -21088,7 +21196,7 @@
       <w:r>
         <w:t xml:space="preserve"> </w:t>
       </w:r>
-      <w:hyperlink r:id="rId225">
+      <w:hyperlink r:id="rId226">
         <w:r>
           <w:rPr>
             <w:rStyle w:val="Hyperlink"/>
@@ -21100,8 +21208,8 @@
         <w:t xml:space="preserve">.</w:t>
       </w:r>
     </w:p>
-    <w:bookmarkEnd w:id="226"/>
-    <w:bookmarkStart w:id="228" w:name="ref-Farhi2014"/>
+    <w:bookmarkEnd w:id="227"/>
+    <w:bookmarkStart w:id="229" w:name="ref-Farhi2014"/>
     <w:p>
       <w:pPr>
         <w:pStyle w:val="Bibliography"/>
@@ -21118,7 +21226,7 @@
       <w:r>
         <w:t xml:space="preserve"> </w:t>
       </w:r>
-      <w:hyperlink r:id="rId227">
+      <w:hyperlink r:id="rId228">
         <w:r>
           <w:rPr>
             <w:rStyle w:val="Hyperlink"/>
@@ -21130,8 +21238,8 @@
         <w:t xml:space="preserve">.</w:t>
       </w:r>
     </w:p>
-    <w:bookmarkEnd w:id="228"/>
-    <w:bookmarkStart w:id="230" w:name="ref-Farhi2018"/>
+    <w:bookmarkEnd w:id="229"/>
+    <w:bookmarkStart w:id="231" w:name="ref-Farhi2018"/>
     <w:p>
       <w:pPr>
         <w:pStyle w:val="Bibliography"/>
@@ -21148,7 +21256,7 @@
       <w:r>
         <w:t xml:space="preserve"> </w:t>
       </w:r>
-      <w:hyperlink r:id="rId229">
+      <w:hyperlink r:id="rId230">
         <w:r>
           <w:rPr>
             <w:rStyle w:val="Hyperlink"/>
@@ -21160,8 +21268,8 @@
         <w:t xml:space="preserve">.</w:t>
       </w:r>
     </w:p>
-    <w:bookmarkEnd w:id="230"/>
-    <w:bookmarkStart w:id="232" w:name="ref-Fazilat2025a"/>
+    <w:bookmarkEnd w:id="231"/>
+    <w:bookmarkStart w:id="233" w:name="ref-Fazilat2025a"/>
     <w:p>
       <w:pPr>
         <w:pStyle w:val="Bibliography"/>
@@ -21211,7 +21319,7 @@
       <w:r>
         <w:t xml:space="preserve"> </w:t>
       </w:r>
-      <w:hyperlink r:id="rId231">
+      <w:hyperlink r:id="rId232">
         <w:r>
           <w:rPr>
             <w:rStyle w:val="Hyperlink"/>
@@ -21223,8 +21331,8 @@
         <w:t xml:space="preserve">.</w:t>
       </w:r>
     </w:p>
-    <w:bookmarkEnd w:id="232"/>
-    <w:bookmarkStart w:id="234" w:name="ref-Feynman1982"/>
+    <w:bookmarkEnd w:id="233"/>
+    <w:bookmarkStart w:id="235" w:name="ref-Feynman1982"/>
     <w:p>
       <w:pPr>
         <w:pStyle w:val="Bibliography"/>
@@ -21257,7 +21365,7 @@
       <w:r>
         <w:t xml:space="preserve"> </w:t>
       </w:r>
-      <w:hyperlink r:id="rId233">
+      <w:hyperlink r:id="rId234">
         <w:r>
           <w:rPr>
             <w:rStyle w:val="Hyperlink"/>
@@ -21269,8 +21377,8 @@
         <w:t xml:space="preserve">.</w:t>
       </w:r>
     </w:p>
-    <w:bookmarkEnd w:id="234"/>
-    <w:bookmarkStart w:id="236" w:name="ref-Finzgar2022"/>
+    <w:bookmarkEnd w:id="235"/>
+    <w:bookmarkStart w:id="237" w:name="ref-Finzgar2022"/>
     <w:p>
       <w:pPr>
         <w:pStyle w:val="Bibliography"/>
@@ -21326,7 +21434,7 @@
       <w:r>
         <w:t xml:space="preserve"> </w:t>
       </w:r>
-      <w:hyperlink r:id="rId235">
+      <w:hyperlink r:id="rId236">
         <w:r>
           <w:rPr>
             <w:rStyle w:val="Hyperlink"/>
@@ -21338,8 +21446,8 @@
         <w:t xml:space="preserve">.</w:t>
       </w:r>
     </w:p>
-    <w:bookmarkEnd w:id="236"/>
-    <w:bookmarkStart w:id="238" w:name="ref-Fowler2012"/>
+    <w:bookmarkEnd w:id="237"/>
+    <w:bookmarkStart w:id="239" w:name="ref-Fowler2012"/>
     <w:p>
       <w:pPr>
         <w:pStyle w:val="Bibliography"/>
@@ -21372,7 +21480,7 @@
       <w:r>
         <w:t xml:space="preserve"> </w:t>
       </w:r>
-      <w:hyperlink r:id="rId237">
+      <w:hyperlink r:id="rId238">
         <w:r>
           <w:rPr>
             <w:rStyle w:val="Hyperlink"/>
@@ -21384,8 +21492,8 @@
         <w:t xml:space="preserve">.</w:t>
       </w:r>
     </w:p>
-    <w:bookmarkEnd w:id="238"/>
-    <w:bookmarkStart w:id="240" w:name="ref-GarciaPineda2026"/>
+    <w:bookmarkEnd w:id="239"/>
+    <w:bookmarkStart w:id="241" w:name="ref-GarciaPineda2026"/>
     <w:p>
       <w:pPr>
         <w:pStyle w:val="Bibliography"/>
@@ -21418,7 +21526,7 @@
       <w:r>
         <w:t xml:space="preserve"> </w:t>
       </w:r>
-      <w:hyperlink r:id="rId239">
+      <w:hyperlink r:id="rId240">
         <w:r>
           <w:rPr>
             <w:rStyle w:val="Hyperlink"/>
@@ -21430,8 +21538,8 @@
         <w:t xml:space="preserve">.</w:t>
       </w:r>
     </w:p>
-    <w:bookmarkEnd w:id="240"/>
-    <w:bookmarkStart w:id="242" w:name="ref-Garrett2021"/>
+    <w:bookmarkEnd w:id="241"/>
+    <w:bookmarkStart w:id="243" w:name="ref-Garrett2021"/>
     <w:p>
       <w:pPr>
         <w:pStyle w:val="Bibliography"/>
@@ -21464,7 +21572,7 @@
       <w:r>
         <w:t xml:space="preserve"> </w:t>
       </w:r>
-      <w:hyperlink r:id="rId241">
+      <w:hyperlink r:id="rId242">
         <w:r>
           <w:rPr>
             <w:rStyle w:val="Hyperlink"/>
@@ -21476,8 +21584,8 @@
         <w:t xml:space="preserve">.</w:t>
       </w:r>
     </w:p>
-    <w:bookmarkEnd w:id="242"/>
-    <w:bookmarkStart w:id="244" w:name="ref-Geiger2011"/>
+    <w:bookmarkEnd w:id="243"/>
+    <w:bookmarkStart w:id="245" w:name="ref-Geiger2011"/>
     <w:p>
       <w:pPr>
         <w:pStyle w:val="Bibliography"/>
@@ -21510,7 +21618,7 @@
       <w:r>
         <w:t xml:space="preserve"> </w:t>
       </w:r>
-      <w:hyperlink r:id="rId243">
+      <w:hyperlink r:id="rId244">
         <w:r>
           <w:rPr>
             <w:rStyle w:val="Hyperlink"/>
@@ -21522,8 +21630,8 @@
         <w:t xml:space="preserve">.</w:t>
       </w:r>
     </w:p>
-    <w:bookmarkEnd w:id="244"/>
-    <w:bookmarkStart w:id="246" w:name="ref-Gerlach2025"/>
+    <w:bookmarkEnd w:id="245"/>
+    <w:bookmarkStart w:id="247" w:name="ref-Gerlach2025"/>
     <w:p>
       <w:pPr>
         <w:pStyle w:val="Bibliography"/>
@@ -21559,7 +21667,7 @@
       <w:r>
         <w:t xml:space="preserve"> </w:t>
       </w:r>
-      <w:hyperlink r:id="rId245">
+      <w:hyperlink r:id="rId246">
         <w:r>
           <w:rPr>
             <w:rStyle w:val="Hyperlink"/>
@@ -21571,8 +21679,8 @@
         <w:t xml:space="preserve">.</w:t>
       </w:r>
     </w:p>
-    <w:bookmarkEnd w:id="246"/>
-    <w:bookmarkStart w:id="248" w:name="ref-Gill2022"/>
+    <w:bookmarkEnd w:id="247"/>
+    <w:bookmarkStart w:id="249" w:name="ref-Gill2022"/>
     <w:p>
       <w:pPr>
         <w:pStyle w:val="Bibliography"/>
@@ -21605,7 +21713,7 @@
       <w:r>
         <w:t xml:space="preserve"> </w:t>
       </w:r>
-      <w:hyperlink r:id="rId247">
+      <w:hyperlink r:id="rId248">
         <w:r>
           <w:rPr>
             <w:rStyle w:val="Hyperlink"/>
@@ -21617,8 +21725,8 @@
         <w:t xml:space="preserve">.</w:t>
       </w:r>
     </w:p>
-    <w:bookmarkEnd w:id="248"/>
-    <w:bookmarkStart w:id="250" w:name="ref-Goncalves2018"/>
+    <w:bookmarkEnd w:id="249"/>
+    <w:bookmarkStart w:id="251" w:name="ref-Goncalves2018"/>
     <w:p>
       <w:pPr>
         <w:pStyle w:val="Bibliography"/>
@@ -21641,7 +21749,7 @@
       <w:r>
         <w:t xml:space="preserve"> </w:t>
       </w:r>
-      <w:hyperlink r:id="rId249">
+      <w:hyperlink r:id="rId250">
         <w:r>
           <w:rPr>
             <w:rStyle w:val="Hyperlink"/>
@@ -21653,8 +21761,8 @@
         <w:t xml:space="preserve">.</w:t>
       </w:r>
     </w:p>
-    <w:bookmarkEnd w:id="250"/>
-    <w:bookmarkStart w:id="252" w:name="ref-GonzalezVillasmil2026"/>
+    <w:bookmarkEnd w:id="251"/>
+    <w:bookmarkStart w:id="253" w:name="ref-GonzalezVillasmil2026"/>
     <w:p>
       <w:pPr>
         <w:pStyle w:val="Bibliography"/>
@@ -21671,7 +21779,7 @@
       <w:r>
         <w:t xml:space="preserve"> </w:t>
       </w:r>
-      <w:hyperlink r:id="rId251">
+      <w:hyperlink r:id="rId252">
         <w:r>
           <w:rPr>
             <w:rStyle w:val="Hyperlink"/>
@@ -21683,8 +21791,8 @@
         <w:t xml:space="preserve">.</w:t>
       </w:r>
     </w:p>
-    <w:bookmarkEnd w:id="252"/>
-    <w:bookmarkStart w:id="254" w:name="ref-GoogleQAI2025"/>
+    <w:bookmarkEnd w:id="253"/>
+    <w:bookmarkStart w:id="255" w:name="ref-GoogleQAI2025"/>
     <w:p>
       <w:pPr>
         <w:pStyle w:val="Bibliography"/>
@@ -21717,7 +21825,7 @@
       <w:r>
         <w:t xml:space="preserve"> </w:t>
       </w:r>
-      <w:hyperlink r:id="rId253">
+      <w:hyperlink r:id="rId254">
         <w:r>
           <w:rPr>
             <w:rStyle w:val="Hyperlink"/>
@@ -21729,8 +21837,8 @@
         <w:t xml:space="preserve">.</w:t>
       </w:r>
     </w:p>
-    <w:bookmarkEnd w:id="254"/>
-    <w:bookmarkStart w:id="256" w:name="ref-Goto2019"/>
+    <w:bookmarkEnd w:id="255"/>
+    <w:bookmarkStart w:id="257" w:name="ref-Goto2019"/>
     <w:p>
       <w:pPr>
         <w:pStyle w:val="Bibliography"/>
@@ -21775,7 +21883,7 @@
       <w:r>
         <w:t xml:space="preserve"> </w:t>
       </w:r>
-      <w:hyperlink r:id="rId255">
+      <w:hyperlink r:id="rId256">
         <w:r>
           <w:rPr>
             <w:rStyle w:val="Hyperlink"/>
@@ -21787,8 +21895,8 @@
         <w:t xml:space="preserve">.</w:t>
       </w:r>
     </w:p>
-    <w:bookmarkEnd w:id="256"/>
-    <w:bookmarkStart w:id="258" w:name="ref-Grover1996"/>
+    <w:bookmarkEnd w:id="257"/>
+    <w:bookmarkStart w:id="259" w:name="ref-Grover1996"/>
     <w:p>
       <w:pPr>
         <w:pStyle w:val="Bibliography"/>
@@ -21873,7 +21981,7 @@
       <w:r>
         <w:t xml:space="preserve"> </w:t>
       </w:r>
-      <w:hyperlink r:id="rId257">
+      <w:hyperlink r:id="rId258">
         <w:r>
           <w:rPr>
             <w:rStyle w:val="Hyperlink"/>
@@ -21885,8 +21993,8 @@
         <w:t xml:space="preserve">.</w:t>
       </w:r>
     </w:p>
-    <w:bookmarkEnd w:id="258"/>
-    <w:bookmarkStart w:id="260" w:name="ref-Guerreschi2019"/>
+    <w:bookmarkEnd w:id="259"/>
+    <w:bookmarkStart w:id="261" w:name="ref-Guerreschi2019"/>
     <w:p>
       <w:pPr>
         <w:pStyle w:val="Bibliography"/>
@@ -21940,7 +22048,7 @@
       <w:r>
         <w:t xml:space="preserve"> </w:t>
       </w:r>
-      <w:hyperlink r:id="rId259">
+      <w:hyperlink r:id="rId260">
         <w:r>
           <w:rPr>
             <w:rStyle w:val="Hyperlink"/>
@@ -21952,8 +22060,8 @@
         <w:t xml:space="preserve">.</w:t>
       </w:r>
     </w:p>
-    <w:bookmarkEnd w:id="260"/>
-    <w:bookmarkStart w:id="262" w:name="ref-Hadfield2019"/>
+    <w:bookmarkEnd w:id="261"/>
+    <w:bookmarkStart w:id="263" w:name="ref-Hadfield2019"/>
     <w:p>
       <w:pPr>
         <w:pStyle w:val="Bibliography"/>
@@ -21986,7 +22094,7 @@
       <w:r>
         <w:t xml:space="preserve"> </w:t>
       </w:r>
-      <w:hyperlink r:id="rId261">
+      <w:hyperlink r:id="rId262">
         <w:r>
           <w:rPr>
             <w:rStyle w:val="Hyperlink"/>
@@ -21998,8 +22106,8 @@
         <w:t xml:space="preserve">.</w:t>
       </w:r>
     </w:p>
-    <w:bookmarkEnd w:id="262"/>
-    <w:bookmarkStart w:id="264" w:name="ref-Haldorai2024"/>
+    <w:bookmarkEnd w:id="263"/>
+    <w:bookmarkStart w:id="265" w:name="ref-Haldorai2024"/>
     <w:p>
       <w:pPr>
         <w:pStyle w:val="Bibliography"/>
@@ -22032,7 +22140,7 @@
       <w:r>
         <w:t xml:space="preserve"> </w:t>
       </w:r>
-      <w:hyperlink r:id="rId263">
+      <w:hyperlink r:id="rId264">
         <w:r>
           <w:rPr>
             <w:rStyle w:val="Hyperlink"/>
@@ -22044,8 +22152,8 @@
         <w:t xml:space="preserve">.</w:t>
       </w:r>
     </w:p>
-    <w:bookmarkEnd w:id="264"/>
-    <w:bookmarkStart w:id="266" w:name="ref-Han2002"/>
+    <w:bookmarkEnd w:id="265"/>
+    <w:bookmarkStart w:id="267" w:name="ref-Han2002"/>
     <w:p>
       <w:pPr>
         <w:pStyle w:val="Bibliography"/>
@@ -22078,7 +22186,7 @@
       <w:r>
         <w:t xml:space="preserve"> </w:t>
       </w:r>
-      <w:hyperlink r:id="rId265">
+      <w:hyperlink r:id="rId266">
         <w:r>
           <w:rPr>
             <w:rStyle w:val="Hyperlink"/>
@@ -22090,8 +22198,8 @@
         <w:t xml:space="preserve">.</w:t>
       </w:r>
     </w:p>
-    <w:bookmarkEnd w:id="266"/>
-    <w:bookmarkStart w:id="268" w:name="ref-Harrow2009"/>
+    <w:bookmarkEnd w:id="267"/>
+    <w:bookmarkStart w:id="269" w:name="ref-Harrow2009"/>
     <w:p>
       <w:pPr>
         <w:pStyle w:val="Bibliography"/>
@@ -22124,7 +22232,7 @@
       <w:r>
         <w:t xml:space="preserve"> </w:t>
       </w:r>
-      <w:hyperlink r:id="rId267">
+      <w:hyperlink r:id="rId268">
         <w:r>
           <w:rPr>
             <w:rStyle w:val="Hyperlink"/>
@@ -22136,8 +22244,8 @@
         <w:t xml:space="preserve">.</w:t>
       </w:r>
     </w:p>
-    <w:bookmarkEnd w:id="268"/>
-    <w:bookmarkStart w:id="270" w:name="ref-Havlicek2019"/>
+    <w:bookmarkEnd w:id="269"/>
+    <w:bookmarkStart w:id="271" w:name="ref-Havlicek2019"/>
     <w:p>
       <w:pPr>
         <w:pStyle w:val="Bibliography"/>
@@ -22170,7 +22278,7 @@
       <w:r>
         <w:t xml:space="preserve"> </w:t>
       </w:r>
-      <w:hyperlink r:id="rId269">
+      <w:hyperlink r:id="rId270">
         <w:r>
           <w:rPr>
             <w:rStyle w:val="Hyperlink"/>
@@ -22182,8 +22290,8 @@
         <w:t xml:space="preserve">.</w:t>
       </w:r>
     </w:p>
-    <w:bookmarkEnd w:id="270"/>
-    <w:bookmarkStart w:id="272" w:name="ref-Henderson2020"/>
+    <w:bookmarkEnd w:id="271"/>
+    <w:bookmarkStart w:id="273" w:name="ref-Henderson2020"/>
     <w:p>
       <w:pPr>
         <w:pStyle w:val="Bibliography"/>
@@ -22216,7 +22324,7 @@
       <w:r>
         <w:t xml:space="preserve"> </w:t>
       </w:r>
-      <w:hyperlink r:id="rId271">
+      <w:hyperlink r:id="rId272">
         <w:r>
           <w:rPr>
             <w:rStyle w:val="Hyperlink"/>
@@ -22228,8 +22336,8 @@
         <w:t xml:space="preserve">.</w:t>
       </w:r>
     </w:p>
-    <w:bookmarkEnd w:id="272"/>
-    <w:bookmarkStart w:id="274" w:name="ref-Hohenfeld2024"/>
+    <w:bookmarkEnd w:id="273"/>
+    <w:bookmarkStart w:id="275" w:name="ref-Hohenfeld2024"/>
     <w:p>
       <w:pPr>
         <w:pStyle w:val="Bibliography"/>
@@ -22262,7 +22370,7 @@
       <w:r>
         <w:t xml:space="preserve"> </w:t>
       </w:r>
-      <w:hyperlink r:id="rId273">
+      <w:hyperlink r:id="rId274">
         <w:r>
           <w:rPr>
             <w:rStyle w:val="Hyperlink"/>
@@ -22274,8 +22382,8 @@
         <w:t xml:space="preserve">.</w:t>
       </w:r>
     </w:p>
-    <w:bookmarkEnd w:id="274"/>
-    <w:bookmarkStart w:id="276" w:name="ref-Humr2025"/>
+    <w:bookmarkEnd w:id="275"/>
+    <w:bookmarkStart w:id="277" w:name="ref-Humr2025"/>
     <w:p>
       <w:pPr>
         <w:pStyle w:val="Bibliography"/>
@@ -22317,7 +22425,7 @@
       <w:r>
         <w:t xml:space="preserve"> </w:t>
       </w:r>
-      <w:hyperlink r:id="rId275">
+      <w:hyperlink r:id="rId276">
         <w:r>
           <w:rPr>
             <w:rStyle w:val="Hyperlink"/>
@@ -22329,8 +22437,8 @@
         <w:t xml:space="preserve">.</w:t>
       </w:r>
     </w:p>
-    <w:bookmarkEnd w:id="276"/>
-    <w:bookmarkStart w:id="278" w:name="ref-Innan2025"/>
+    <w:bookmarkEnd w:id="277"/>
+    <w:bookmarkStart w:id="279" w:name="ref-Innan2025"/>
     <w:p>
       <w:pPr>
         <w:pStyle w:val="Bibliography"/>
@@ -22365,7 +22473,7 @@
       <w:r>
         <w:t xml:space="preserve"> </w:t>
       </w:r>
-      <w:hyperlink r:id="rId277">
+      <w:hyperlink r:id="rId278">
         <w:r>
           <w:rPr>
             <w:rStyle w:val="Hyperlink"/>
@@ -22377,8 +22485,8 @@
         <w:t xml:space="preserve">.</w:t>
       </w:r>
     </w:p>
-    <w:bookmarkEnd w:id="278"/>
-    <w:bookmarkStart w:id="280" w:name="ref-Jerbi2021"/>
+    <w:bookmarkEnd w:id="279"/>
+    <w:bookmarkStart w:id="281" w:name="ref-Jerbi2021"/>
     <w:p>
       <w:pPr>
         <w:pStyle w:val="Bibliography"/>
@@ -22414,7 +22522,7 @@
       <w:r>
         <w:t xml:space="preserve"> </w:t>
       </w:r>
-      <w:hyperlink r:id="rId279">
+      <w:hyperlink r:id="rId280">
         <w:r>
           <w:rPr>
             <w:rStyle w:val="Hyperlink"/>
@@ -22426,8 +22534,8 @@
         <w:t xml:space="preserve">.</w:t>
       </w:r>
     </w:p>
-    <w:bookmarkEnd w:id="280"/>
-    <w:bookmarkStart w:id="282" w:name="ref-Johnson2011"/>
+    <w:bookmarkEnd w:id="281"/>
+    <w:bookmarkStart w:id="283" w:name="ref-Johnson2011"/>
     <w:p>
       <w:pPr>
         <w:pStyle w:val="Bibliography"/>
@@ -22460,7 +22568,7 @@
       <w:r>
         <w:t xml:space="preserve"> </w:t>
       </w:r>
-      <w:hyperlink r:id="rId281">
+      <w:hyperlink r:id="rId282">
         <w:r>
           <w:rPr>
             <w:rStyle w:val="Hyperlink"/>
@@ -22472,8 +22580,8 @@
         <w:t xml:space="preserve">.</w:t>
       </w:r>
     </w:p>
-    <w:bookmarkEnd w:id="282"/>
-    <w:bookmarkStart w:id="284" w:name="ref-Kadowaki2025"/>
+    <w:bookmarkEnd w:id="283"/>
+    <w:bookmarkStart w:id="285" w:name="ref-Kadowaki2025"/>
     <w:p>
       <w:pPr>
         <w:pStyle w:val="Bibliography"/>
@@ -22499,7 +22607,7 @@
       <w:r>
         <w:t xml:space="preserve"> </w:t>
       </w:r>
-      <w:hyperlink r:id="rId283">
+      <w:hyperlink r:id="rId284">
         <w:r>
           <w:rPr>
             <w:rStyle w:val="Hyperlink"/>
@@ -22511,8 +22619,8 @@
         <w:t xml:space="preserve">.</w:t>
       </w:r>
     </w:p>
-    <w:bookmarkEnd w:id="284"/>
-    <w:bookmarkStart w:id="286" w:name="ref-Kaelbling1998"/>
+    <w:bookmarkEnd w:id="285"/>
+    <w:bookmarkStart w:id="287" w:name="ref-Kaelbling1998"/>
     <w:p>
       <w:pPr>
         <w:pStyle w:val="Bibliography"/>
@@ -22545,7 +22653,7 @@
       <w:r>
         <w:t xml:space="preserve"> </w:t>
       </w:r>
-      <w:hyperlink r:id="rId285">
+      <w:hyperlink r:id="rId286">
         <w:r>
           <w:rPr>
             <w:rStyle w:val="Hyperlink"/>
@@ -22557,8 +22665,8 @@
         <w:t xml:space="preserve">.</w:t>
       </w:r>
     </w:p>
-    <w:bookmarkEnd w:id="286"/>
-    <w:bookmarkStart w:id="288" w:name="ref-Kaldari2025"/>
+    <w:bookmarkEnd w:id="287"/>
+    <w:bookmarkStart w:id="289" w:name="ref-Kaldari2025"/>
     <w:p>
       <w:pPr>
         <w:pStyle w:val="Bibliography"/>
@@ -22575,7 +22683,7 @@
       <w:r>
         <w:t xml:space="preserve"> </w:t>
       </w:r>
-      <w:hyperlink r:id="rId287">
+      <w:hyperlink r:id="rId288">
         <w:r>
           <w:rPr>
             <w:rStyle w:val="Hyperlink"/>
@@ -22587,8 +22695,8 @@
         <w:t xml:space="preserve">.</w:t>
       </w:r>
     </w:p>
-    <w:bookmarkEnd w:id="288"/>
-    <w:bookmarkStart w:id="290" w:name="ref-Kandala2019"/>
+    <w:bookmarkEnd w:id="289"/>
+    <w:bookmarkStart w:id="291" w:name="ref-Kandala2019"/>
     <w:p>
       <w:pPr>
         <w:pStyle w:val="Bibliography"/>
@@ -22621,7 +22729,7 @@
       <w:r>
         <w:t xml:space="preserve"> </w:t>
       </w:r>
-      <w:hyperlink r:id="rId289">
+      <w:hyperlink r:id="rId290">
         <w:r>
           <w:rPr>
             <w:rStyle w:val="Hyperlink"/>
@@ -22633,8 +22741,8 @@
         <w:t xml:space="preserve">.</w:t>
       </w:r>
     </w:p>
-    <w:bookmarkEnd w:id="290"/>
-    <w:bookmarkStart w:id="292" w:name="ref-Karaman2011"/>
+    <w:bookmarkEnd w:id="291"/>
+    <w:bookmarkStart w:id="293" w:name="ref-Karaman2011"/>
     <w:p>
       <w:pPr>
         <w:pStyle w:val="Bibliography"/>
@@ -22667,7 +22775,7 @@
       <w:r>
         <w:t xml:space="preserve"> </w:t>
       </w:r>
-      <w:hyperlink r:id="rId291">
+      <w:hyperlink r:id="rId292">
         <w:r>
           <w:rPr>
             <w:rStyle w:val="Hyperlink"/>
@@ -22679,8 +22787,8 @@
         <w:t xml:space="preserve">.</w:t>
       </w:r>
     </w:p>
-    <w:bookmarkEnd w:id="292"/>
-    <w:bookmarkStart w:id="294" w:name="ref-Khoshnoud2020"/>
+    <w:bookmarkEnd w:id="293"/>
+    <w:bookmarkStart w:id="295" w:name="ref-Khoshnoud2020"/>
     <w:p>
       <w:pPr>
         <w:pStyle w:val="Bibliography"/>
@@ -22697,7 +22805,7 @@
       <w:r>
         <w:t xml:space="preserve"> </w:t>
       </w:r>
-      <w:hyperlink r:id="rId293">
+      <w:hyperlink r:id="rId294">
         <w:r>
           <w:rPr>
             <w:rStyle w:val="Hyperlink"/>
@@ -22709,8 +22817,8 @@
         <w:t xml:space="preserve">.</w:t>
       </w:r>
     </w:p>
-    <w:bookmarkEnd w:id="294"/>
-    <w:bookmarkStart w:id="296" w:name="ref-Kim2022"/>
+    <w:bookmarkEnd w:id="295"/>
+    <w:bookmarkStart w:id="297" w:name="ref-Kim2022"/>
     <w:p>
       <w:pPr>
         <w:pStyle w:val="Bibliography"/>
@@ -22752,7 +22860,7 @@
       <w:r>
         <w:t xml:space="preserve"> </w:t>
       </w:r>
-      <w:hyperlink r:id="rId295">
+      <w:hyperlink r:id="rId296">
         <w:r>
           <w:rPr>
             <w:rStyle w:val="Hyperlink"/>
@@ -22764,8 +22872,8 @@
         <w:t xml:space="preserve">.</w:t>
       </w:r>
     </w:p>
-    <w:bookmarkEnd w:id="296"/>
-    <w:bookmarkStart w:id="298" w:name="ref-KimY2023"/>
+    <w:bookmarkEnd w:id="297"/>
+    <w:bookmarkStart w:id="299" w:name="ref-KimY2023"/>
     <w:p>
       <w:pPr>
         <w:pStyle w:val="Bibliography"/>
@@ -22798,7 +22906,7 @@
       <w:r>
         <w:t xml:space="preserve"> </w:t>
       </w:r>
-      <w:hyperlink r:id="rId297">
+      <w:hyperlink r:id="rId298">
         <w:r>
           <w:rPr>
             <w:rStyle w:val="Hyperlink"/>
@@ -22810,8 +22918,8 @@
         <w:t xml:space="preserve">.</w:t>
       </w:r>
     </w:p>
-    <w:bookmarkEnd w:id="298"/>
-    <w:bookmarkStart w:id="300" w:name="ref-King2025"/>
+    <w:bookmarkEnd w:id="299"/>
+    <w:bookmarkStart w:id="301" w:name="ref-King2025"/>
     <w:p>
       <w:pPr>
         <w:pStyle w:val="Bibliography"/>
@@ -22844,7 +22952,7 @@
       <w:r>
         <w:t xml:space="preserve"> </w:t>
       </w:r>
-      <w:hyperlink r:id="rId299">
+      <w:hyperlink r:id="rId300">
         <w:r>
           <w:rPr>
             <w:rStyle w:val="Hyperlink"/>
@@ -22856,8 +22964,8 @@
         <w:t xml:space="preserve">.</w:t>
       </w:r>
     </w:p>
-    <w:bookmarkEnd w:id="300"/>
-    <w:bookmarkStart w:id="301" w:name="ref-Kitchenham2007"/>
+    <w:bookmarkEnd w:id="301"/>
+    <w:bookmarkStart w:id="302" w:name="ref-Kitchenham2007"/>
     <w:p>
       <w:pPr>
         <w:pStyle w:val="Bibliography"/>
@@ -22878,8 +22986,8 @@
         <w:t xml:space="preserve">EBSE Technical Report EBSE-2007-01. Keele University; Durham University.</w:t>
       </w:r>
     </w:p>
-    <w:bookmarkEnd w:id="301"/>
-    <w:bookmarkStart w:id="303" w:name="ref-Kjaergaard2020"/>
+    <w:bookmarkEnd w:id="302"/>
+    <w:bookmarkStart w:id="304" w:name="ref-Kjaergaard2020"/>
     <w:p>
       <w:pPr>
         <w:pStyle w:val="Bibliography"/>
@@ -22912,7 +23020,7 @@
       <w:r>
         <w:t xml:space="preserve"> </w:t>
       </w:r>
-      <w:hyperlink r:id="rId302">
+      <w:hyperlink r:id="rId303">
         <w:r>
           <w:rPr>
             <w:rStyle w:val="Hyperlink"/>
@@ -22924,8 +23032,8 @@
         <w:t xml:space="preserve">.</w:t>
       </w:r>
     </w:p>
-    <w:bookmarkEnd w:id="303"/>
-    <w:bookmarkStart w:id="305" w:name="ref-Kober2013"/>
+    <w:bookmarkEnd w:id="304"/>
+    <w:bookmarkStart w:id="306" w:name="ref-Kober2013"/>
     <w:p>
       <w:pPr>
         <w:pStyle w:val="Bibliography"/>
@@ -22958,7 +23066,7 @@
       <w:r>
         <w:t xml:space="preserve"> </w:t>
       </w:r>
-      <w:hyperlink r:id="rId304">
+      <w:hyperlink r:id="rId305">
         <w:r>
           <w:rPr>
             <w:rStyle w:val="Hyperlink"/>
@@ -22970,8 +23078,8 @@
         <w:t xml:space="preserve">.</w:t>
       </w:r>
     </w:p>
-    <w:bookmarkEnd w:id="305"/>
-    <w:bookmarkStart w:id="307" w:name="ref-Kruse2024"/>
+    <w:bookmarkEnd w:id="306"/>
+    <w:bookmarkStart w:id="308" w:name="ref-Kruse2024"/>
     <w:p>
       <w:pPr>
         <w:pStyle w:val="Bibliography"/>
@@ -23027,7 +23135,7 @@
       <w:r>
         <w:t xml:space="preserve"> </w:t>
       </w:r>
-      <w:hyperlink r:id="rId306">
+      <w:hyperlink r:id="rId307">
         <w:r>
           <w:rPr>
             <w:rStyle w:val="Hyperlink"/>
@@ -23039,8 +23147,8 @@
         <w:t xml:space="preserve">.</w:t>
       </w:r>
     </w:p>
-    <w:bookmarkEnd w:id="307"/>
-    <w:bookmarkStart w:id="309" w:name="ref-Kurniawati2022"/>
+    <w:bookmarkEnd w:id="308"/>
+    <w:bookmarkStart w:id="310" w:name="ref-Kurniawati2022"/>
     <w:p>
       <w:pPr>
         <w:pStyle w:val="Bibliography"/>
@@ -23085,7 +23193,7 @@
       <w:r>
         <w:t xml:space="preserve"> </w:t>
       </w:r>
-      <w:hyperlink r:id="rId308">
+      <w:hyperlink r:id="rId309">
         <w:r>
           <w:rPr>
             <w:rStyle w:val="Hyperlink"/>
@@ -23097,8 +23205,8 @@
         <w:t xml:space="preserve">.</w:t>
       </w:r>
     </w:p>
-    <w:bookmarkEnd w:id="309"/>
-    <w:bookmarkStart w:id="311" w:name="ref-Larocca2025"/>
+    <w:bookmarkEnd w:id="310"/>
+    <w:bookmarkStart w:id="312" w:name="ref-Larocca2025"/>
     <w:p>
       <w:pPr>
         <w:pStyle w:val="Bibliography"/>
@@ -23131,7 +23239,7 @@
       <w:r>
         <w:t xml:space="preserve"> </w:t>
       </w:r>
-      <w:hyperlink r:id="rId310">
+      <w:hyperlink r:id="rId311">
         <w:r>
           <w:rPr>
             <w:rStyle w:val="Hyperlink"/>
@@ -23143,8 +23251,8 @@
         <w:t xml:space="preserve">.</w:t>
       </w:r>
     </w:p>
-    <w:bookmarkEnd w:id="311"/>
-    <w:bookmarkStart w:id="313" w:name="ref-Lathrop2023"/>
+    <w:bookmarkEnd w:id="312"/>
+    <w:bookmarkStart w:id="314" w:name="ref-Lathrop2023"/>
     <w:p>
       <w:pPr>
         <w:pStyle w:val="Bibliography"/>
@@ -23177,7 +23285,7 @@
       <w:r>
         <w:t xml:space="preserve"> </w:t>
       </w:r>
-      <w:hyperlink r:id="rId312">
+      <w:hyperlink r:id="rId313">
         <w:r>
           <w:rPr>
             <w:rStyle w:val="Hyperlink"/>
@@ -23189,8 +23297,8 @@
         <w:t xml:space="preserve">.</w:t>
       </w:r>
     </w:p>
-    <w:bookmarkEnd w:id="313"/>
-    <w:bookmarkStart w:id="314" w:name="ref-LaValle1998"/>
+    <w:bookmarkEnd w:id="314"/>
+    <w:bookmarkStart w:id="315" w:name="ref-LaValle1998"/>
     <w:p>
       <w:pPr>
         <w:pStyle w:val="Bibliography"/>
@@ -23211,8 +23319,8 @@
         <w:t xml:space="preserve">TR 98-11. Ames, IA, USA: Computer Science Department, Iowa State University.</w:t>
       </w:r>
     </w:p>
-    <w:bookmarkEnd w:id="314"/>
-    <w:bookmarkStart w:id="316" w:name="ref-Lawless2023"/>
+    <w:bookmarkEnd w:id="315"/>
+    <w:bookmarkStart w:id="317" w:name="ref-Lawless2023"/>
     <w:p>
       <w:pPr>
         <w:pStyle w:val="Bibliography"/>
@@ -23245,7 +23353,7 @@
       <w:r>
         <w:t xml:space="preserve"> </w:t>
       </w:r>
-      <w:hyperlink r:id="rId315">
+      <w:hyperlink r:id="rId316">
         <w:r>
           <w:rPr>
             <w:rStyle w:val="Hyperlink"/>
@@ -23257,8 +23365,8 @@
         <w:t xml:space="preserve">.</w:t>
       </w:r>
     </w:p>
-    <w:bookmarkEnd w:id="316"/>
-    <w:bookmarkStart w:id="318" w:name="ref-Leib2023"/>
+    <w:bookmarkEnd w:id="317"/>
+    <w:bookmarkStart w:id="319" w:name="ref-Leib2023"/>
     <w:p>
       <w:pPr>
         <w:pStyle w:val="Bibliography"/>
@@ -23291,7 +23399,7 @@
       <w:r>
         <w:t xml:space="preserve"> </w:t>
       </w:r>
-      <w:hyperlink r:id="rId317">
+      <w:hyperlink r:id="rId318">
         <w:r>
           <w:rPr>
             <w:rStyle w:val="Hyperlink"/>
@@ -23303,8 +23411,8 @@
         <w:t xml:space="preserve">.</w:t>
       </w:r>
     </w:p>
-    <w:bookmarkEnd w:id="318"/>
-    <w:bookmarkStart w:id="320" w:name="ref-Liu2021"/>
+    <w:bookmarkEnd w:id="319"/>
+    <w:bookmarkStart w:id="321" w:name="ref-Liu2021"/>
     <w:p>
       <w:pPr>
         <w:pStyle w:val="Bibliography"/>
@@ -23337,7 +23445,7 @@
       <w:r>
         <w:t xml:space="preserve"> </w:t>
       </w:r>
-      <w:hyperlink r:id="rId319">
+      <w:hyperlink r:id="rId320">
         <w:r>
           <w:rPr>
             <w:rStyle w:val="Hyperlink"/>
@@ -23349,8 +23457,8 @@
         <w:t xml:space="preserve">.</w:t>
       </w:r>
     </w:p>
-    <w:bookmarkEnd w:id="320"/>
-    <w:bookmarkStart w:id="322" w:name="ref-Lloyd2014"/>
+    <w:bookmarkEnd w:id="321"/>
+    <w:bookmarkStart w:id="323" w:name="ref-Lloyd2014"/>
     <w:p>
       <w:pPr>
         <w:pStyle w:val="Bibliography"/>
@@ -23367,7 +23475,7 @@
       <w:r>
         <w:t xml:space="preserve"> </w:t>
       </w:r>
-      <w:hyperlink r:id="rId321">
+      <w:hyperlink r:id="rId322">
         <w:r>
           <w:rPr>
             <w:rStyle w:val="Hyperlink"/>
@@ -23379,8 +23487,8 @@
         <w:t xml:space="preserve">.</w:t>
       </w:r>
     </w:p>
-    <w:bookmarkEnd w:id="322"/>
-    <w:bookmarkStart w:id="324" w:name="ref-Lokossou2025"/>
+    <w:bookmarkEnd w:id="323"/>
+    <w:bookmarkStart w:id="325" w:name="ref-Lokossou2025"/>
     <w:p>
       <w:pPr>
         <w:pStyle w:val="Bibliography"/>
@@ -23397,7 +23505,7 @@
       <w:r>
         <w:t xml:space="preserve"> </w:t>
       </w:r>
-      <w:hyperlink r:id="rId323">
+      <w:hyperlink r:id="rId324">
         <w:r>
           <w:rPr>
             <w:rStyle w:val="Hyperlink"/>
@@ -23409,8 +23517,8 @@
         <w:t xml:space="preserve">.</w:t>
       </w:r>
     </w:p>
-    <w:bookmarkEnd w:id="324"/>
-    <w:bookmarkStart w:id="326" w:name="ref-Lucas2014"/>
+    <w:bookmarkEnd w:id="325"/>
+    <w:bookmarkStart w:id="327" w:name="ref-Lucas2014"/>
     <w:p>
       <w:pPr>
         <w:pStyle w:val="Bibliography"/>
@@ -23464,7 +23572,7 @@
       <w:r>
         <w:t xml:space="preserve"> </w:t>
       </w:r>
-      <w:hyperlink r:id="rId325">
+      <w:hyperlink r:id="rId326">
         <w:r>
           <w:rPr>
             <w:rStyle w:val="Hyperlink"/>
@@ -23476,8 +23584,8 @@
         <w:t xml:space="preserve">.</w:t>
       </w:r>
     </w:p>
-    <w:bookmarkEnd w:id="326"/>
-    <w:bookmarkStart w:id="328" w:name="ref-Mannone2022"/>
+    <w:bookmarkEnd w:id="327"/>
+    <w:bookmarkStart w:id="329" w:name="ref-Mannone2022"/>
     <w:p>
       <w:pPr>
         <w:pStyle w:val="Bibliography"/>
@@ -23510,7 +23618,7 @@
       <w:r>
         <w:t xml:space="preserve"> </w:t>
       </w:r>
-      <w:hyperlink r:id="rId327">
+      <w:hyperlink r:id="rId328">
         <w:r>
           <w:rPr>
             <w:rStyle w:val="Hyperlink"/>
@@ -23522,8 +23630,8 @@
         <w:t xml:space="preserve">.</w:t>
       </w:r>
     </w:p>
-    <w:bookmarkEnd w:id="328"/>
-    <w:bookmarkStart w:id="330" w:name="ref-Mannone2023"/>
+    <w:bookmarkEnd w:id="329"/>
+    <w:bookmarkStart w:id="331" w:name="ref-Mannone2023"/>
     <w:p>
       <w:pPr>
         <w:pStyle w:val="Bibliography"/>
@@ -23556,7 +23664,7 @@
       <w:r>
         <w:t xml:space="preserve"> </w:t>
       </w:r>
-      <w:hyperlink r:id="rId329">
+      <w:hyperlink r:id="rId330">
         <w:r>
           <w:rPr>
             <w:rStyle w:val="Hyperlink"/>
@@ -23568,8 +23676,8 @@
         <w:t xml:space="preserve">.</w:t>
       </w:r>
     </w:p>
-    <w:bookmarkEnd w:id="330"/>
-    <w:bookmarkStart w:id="332" w:name="ref-Mannone2025"/>
+    <w:bookmarkEnd w:id="331"/>
+    <w:bookmarkStart w:id="333" w:name="ref-Mannone2025"/>
     <w:p>
       <w:pPr>
         <w:pStyle w:val="Bibliography"/>
@@ -23602,7 +23710,7 @@
       <w:r>
         <w:t xml:space="preserve"> </w:t>
       </w:r>
-      <w:hyperlink r:id="rId331">
+      <w:hyperlink r:id="rId332">
         <w:r>
           <w:rPr>
             <w:rStyle w:val="Hyperlink"/>
@@ -23614,8 +23722,8 @@
         <w:t xml:space="preserve">.</w:t>
       </w:r>
     </w:p>
-    <w:bookmarkEnd w:id="332"/>
-    <w:bookmarkStart w:id="334" w:name="ref-McClean2018"/>
+    <w:bookmarkEnd w:id="333"/>
+    <w:bookmarkStart w:id="335" w:name="ref-McClean2018"/>
     <w:p>
       <w:pPr>
         <w:pStyle w:val="Bibliography"/>
@@ -23648,7 +23756,7 @@
       <w:r>
         <w:t xml:space="preserve"> </w:t>
       </w:r>
-      <w:hyperlink r:id="rId333">
+      <w:hyperlink r:id="rId334">
         <w:r>
           <w:rPr>
             <w:rStyle w:val="Hyperlink"/>
@@ -23660,8 +23768,8 @@
         <w:t xml:space="preserve">.</w:t>
       </w:r>
     </w:p>
-    <w:bookmarkEnd w:id="334"/>
-    <w:bookmarkStart w:id="336" w:name="ref-McClean2016"/>
+    <w:bookmarkEnd w:id="335"/>
+    <w:bookmarkStart w:id="337" w:name="ref-McClean2016"/>
     <w:p>
       <w:pPr>
         <w:pStyle w:val="Bibliography"/>
@@ -23694,7 +23802,7 @@
       <w:r>
         <w:t xml:space="preserve"> </w:t>
       </w:r>
-      <w:hyperlink r:id="rId335">
+      <w:hyperlink r:id="rId336">
         <w:r>
           <w:rPr>
             <w:rStyle w:val="Hyperlink"/>
@@ -23706,8 +23814,8 @@
         <w:t xml:space="preserve">.</w:t>
       </w:r>
     </w:p>
-    <w:bookmarkEnd w:id="336"/>
-    <w:bookmarkStart w:id="338" w:name="ref-Meyer2022"/>
+    <w:bookmarkEnd w:id="337"/>
+    <w:bookmarkStart w:id="339" w:name="ref-Meyer2022"/>
     <w:p>
       <w:pPr>
         <w:pStyle w:val="Bibliography"/>
@@ -23724,7 +23832,7 @@
       <w:r>
         <w:t xml:space="preserve"> </w:t>
       </w:r>
-      <w:hyperlink r:id="rId337">
+      <w:hyperlink r:id="rId338">
         <w:r>
           <w:rPr>
             <w:rStyle w:val="Hyperlink"/>
@@ -23736,8 +23844,8 @@
         <w:t xml:space="preserve">.</w:t>
       </w:r>
     </w:p>
-    <w:bookmarkEnd w:id="338"/>
-    <w:bookmarkStart w:id="340" w:name="ref-Mitarai2018"/>
+    <w:bookmarkEnd w:id="339"/>
+    <w:bookmarkStart w:id="341" w:name="ref-Mitarai2018"/>
     <w:p>
       <w:pPr>
         <w:pStyle w:val="Bibliography"/>
@@ -23770,7 +23878,7 @@
       <w:r>
         <w:t xml:space="preserve"> </w:t>
       </w:r>
-      <w:hyperlink r:id="rId339">
+      <w:hyperlink r:id="rId340">
         <w:r>
           <w:rPr>
             <w:rStyle w:val="Hyperlink"/>
@@ -23782,8 +23890,8 @@
         <w:t xml:space="preserve">.</w:t>
       </w:r>
     </w:p>
-    <w:bookmarkEnd w:id="340"/>
-    <w:bookmarkStart w:id="342" w:name="ref-Montanaro2015"/>
+    <w:bookmarkEnd w:id="341"/>
+    <w:bookmarkStart w:id="343" w:name="ref-Montanaro2015"/>
     <w:p>
       <w:pPr>
         <w:pStyle w:val="Bibliography"/>
@@ -23828,7 +23936,7 @@
       <w:r>
         <w:t xml:space="preserve"> </w:t>
       </w:r>
-      <w:hyperlink r:id="rId341">
+      <w:hyperlink r:id="rId342">
         <w:r>
           <w:rPr>
             <w:rStyle w:val="Hyperlink"/>
@@ -23840,8 +23948,8 @@
         <w:t xml:space="preserve">.</w:t>
       </w:r>
     </w:p>
-    <w:bookmarkEnd w:id="342"/>
-    <w:bookmarkStart w:id="344" w:name="ref-Montanaro2016"/>
+    <w:bookmarkEnd w:id="343"/>
+    <w:bookmarkStart w:id="345" w:name="ref-Montanaro2016"/>
     <w:p>
       <w:pPr>
         <w:pStyle w:val="Bibliography"/>
@@ -23874,7 +23982,7 @@
       <w:r>
         <w:t xml:space="preserve"> </w:t>
       </w:r>
-      <w:hyperlink r:id="rId343">
+      <w:hyperlink r:id="rId344">
         <w:r>
           <w:rPr>
             <w:rStyle w:val="Hyperlink"/>
@@ -23886,8 +23994,8 @@
         <w:t xml:space="preserve">.</w:t>
       </w:r>
     </w:p>
-    <w:bookmarkEnd w:id="344"/>
-    <w:bookmarkStart w:id="346" w:name="ref-Muradoglu2025"/>
+    <w:bookmarkEnd w:id="345"/>
+    <w:bookmarkStart w:id="347" w:name="ref-Muradoglu2025"/>
     <w:p>
       <w:pPr>
         <w:pStyle w:val="Bibliography"/>
@@ -23916,7 +24024,7 @@
       <w:r>
         <w:t xml:space="preserve"> </w:t>
       </w:r>
-      <w:hyperlink r:id="rId345">
+      <w:hyperlink r:id="rId346">
         <w:r>
           <w:rPr>
             <w:rStyle w:val="Hyperlink"/>
@@ -23928,8 +24036,8 @@
         <w:t xml:space="preserve">.</w:t>
       </w:r>
     </w:p>
-    <w:bookmarkEnd w:id="346"/>
-    <w:bookmarkStart w:id="348" w:name="ref-Neukart2017"/>
+    <w:bookmarkEnd w:id="347"/>
+    <w:bookmarkStart w:id="349" w:name="ref-Neukart2017"/>
     <w:p>
       <w:pPr>
         <w:pStyle w:val="Bibliography"/>
@@ -23962,7 +24070,7 @@
       <w:r>
         <w:t xml:space="preserve"> </w:t>
       </w:r>
-      <w:hyperlink r:id="rId347">
+      <w:hyperlink r:id="rId348">
         <w:r>
           <w:rPr>
             <w:rStyle w:val="Hyperlink"/>
@@ -23974,8 +24082,8 @@
         <w:t xml:space="preserve">.</w:t>
       </w:r>
     </w:p>
-    <w:bookmarkEnd w:id="348"/>
-    <w:bookmarkStart w:id="350" w:name="ref-Ngo2026"/>
+    <w:bookmarkEnd w:id="349"/>
+    <w:bookmarkStart w:id="351" w:name="ref-Ngo2026"/>
     <w:p>
       <w:pPr>
         <w:pStyle w:val="Bibliography"/>
@@ -24004,7 +24112,7 @@
       <w:r>
         <w:t xml:space="preserve"> </w:t>
       </w:r>
-      <w:hyperlink r:id="rId349">
+      <w:hyperlink r:id="rId350">
         <w:r>
           <w:rPr>
             <w:rStyle w:val="Hyperlink"/>
@@ -24016,8 +24124,8 @@
         <w:t xml:space="preserve">.</w:t>
       </w:r>
     </w:p>
-    <w:bookmarkEnd w:id="350"/>
-    <w:bookmarkStart w:id="352" w:name="ref-Nielsen2010"/>
+    <w:bookmarkEnd w:id="351"/>
+    <w:bookmarkStart w:id="353" w:name="ref-Nielsen2010"/>
     <w:p>
       <w:pPr>
         <w:pStyle w:val="Bibliography"/>
@@ -24041,7 +24149,7 @@
       <w:r>
         <w:t xml:space="preserve"> </w:t>
       </w:r>
-      <w:hyperlink r:id="rId351">
+      <w:hyperlink r:id="rId352">
         <w:r>
           <w:rPr>
             <w:rStyle w:val="Hyperlink"/>
@@ -24053,8 +24161,8 @@
         <w:t xml:space="preserve">.</w:t>
       </w:r>
     </w:p>
-    <w:bookmarkEnd w:id="352"/>
-    <w:bookmarkStart w:id="354" w:name="ref-Nigatu2026"/>
+    <w:bookmarkEnd w:id="353"/>
+    <w:bookmarkStart w:id="355" w:name="ref-Nigatu2026"/>
     <w:p>
       <w:pPr>
         <w:pStyle w:val="Bibliography"/>
@@ -24087,7 +24195,7 @@
       <w:r>
         <w:t xml:space="preserve"> </w:t>
       </w:r>
-      <w:hyperlink r:id="rId353">
+      <w:hyperlink r:id="rId354">
         <w:r>
           <w:rPr>
             <w:rStyle w:val="Hyperlink"/>
@@ -24099,8 +24207,8 @@
         <w:t xml:space="preserve">.</w:t>
       </w:r>
     </w:p>
-    <w:bookmarkEnd w:id="354"/>
-    <w:bookmarkStart w:id="355" w:name="ref-Nigatu2025"/>
+    <w:bookmarkEnd w:id="355"/>
+    <w:bookmarkStart w:id="356" w:name="ref-Nigatu2025"/>
     <w:p>
       <w:pPr>
         <w:pStyle w:val="Bibliography"/>
@@ -24137,8 +24245,8 @@
         <w:t xml:space="preserve">.</w:t>
       </w:r>
     </w:p>
-    <w:bookmarkEnd w:id="355"/>
-    <w:bookmarkStart w:id="357" w:name="ref-Ohzeki2019"/>
+    <w:bookmarkEnd w:id="356"/>
+    <w:bookmarkStart w:id="358" w:name="ref-Ohzeki2019"/>
     <w:p>
       <w:pPr>
         <w:pStyle w:val="Bibliography"/>
@@ -24171,7 +24279,7 @@
       <w:r>
         <w:t xml:space="preserve"> </w:t>
       </w:r>
-      <w:hyperlink r:id="rId356">
+      <w:hyperlink r:id="rId357">
         <w:r>
           <w:rPr>
             <w:rStyle w:val="Hyperlink"/>
@@ -24183,8 +24291,8 @@
         <w:t xml:space="preserve">.</w:t>
       </w:r>
     </w:p>
-    <w:bookmarkEnd w:id="357"/>
-    <w:bookmarkStart w:id="359" w:name="ref-Osaba2025"/>
+    <w:bookmarkEnd w:id="358"/>
+    <w:bookmarkStart w:id="360" w:name="ref-Osaba2025"/>
     <w:p>
       <w:pPr>
         <w:pStyle w:val="Bibliography"/>
@@ -24274,7 +24382,7 @@
       <w:r>
         <w:t xml:space="preserve"> </w:t>
       </w:r>
-      <w:hyperlink r:id="rId358">
+      <w:hyperlink r:id="rId359">
         <w:r>
           <w:rPr>
             <w:rStyle w:val="Hyperlink"/>
@@ -24286,8 +24394,8 @@
         <w:t xml:space="preserve">.</w:t>
       </w:r>
     </w:p>
-    <w:bookmarkEnd w:id="359"/>
-    <w:bookmarkStart w:id="361" w:name="ref-OsabaDrone2025"/>
+    <w:bookmarkEnd w:id="360"/>
+    <w:bookmarkStart w:id="362" w:name="ref-OsabaDrone2025"/>
     <w:p>
       <w:pPr>
         <w:pStyle w:val="Bibliography"/>
@@ -24337,7 +24445,7 @@
       <w:r>
         <w:t xml:space="preserve"> </w:t>
       </w:r>
-      <w:hyperlink r:id="rId360">
+      <w:hyperlink r:id="rId361">
         <w:r>
           <w:rPr>
             <w:rStyle w:val="Hyperlink"/>
@@ -24349,8 +24457,8 @@
         <w:t xml:space="preserve">.</w:t>
       </w:r>
     </w:p>
-    <w:bookmarkEnd w:id="361"/>
-    <w:bookmarkStart w:id="363" w:name="ref-Otani2025"/>
+    <w:bookmarkEnd w:id="362"/>
+    <w:bookmarkStart w:id="364" w:name="ref-Otani2025"/>
     <w:p>
       <w:pPr>
         <w:pStyle w:val="Bibliography"/>
@@ -24383,7 +24491,7 @@
       <w:r>
         <w:t xml:space="preserve"> </w:t>
       </w:r>
-      <w:hyperlink r:id="rId362">
+      <w:hyperlink r:id="rId363">
         <w:r>
           <w:rPr>
             <w:rStyle w:val="Hyperlink"/>
@@ -24395,8 +24503,8 @@
         <w:t xml:space="preserve">.</w:t>
       </w:r>
     </w:p>
-    <w:bookmarkEnd w:id="363"/>
-    <w:bookmarkStart w:id="365" w:name="ref-Page2021"/>
+    <w:bookmarkEnd w:id="364"/>
+    <w:bookmarkStart w:id="366" w:name="ref-Page2021"/>
     <w:p>
       <w:pPr>
         <w:pStyle w:val="Bibliography"/>
@@ -24441,7 +24549,7 @@
       <w:r>
         <w:t xml:space="preserve"> </w:t>
       </w:r>
-      <w:hyperlink r:id="rId364">
+      <w:hyperlink r:id="rId365">
         <w:r>
           <w:rPr>
             <w:rStyle w:val="Hyperlink"/>
@@ -24453,8 +24561,8 @@
         <w:t xml:space="preserve">.</w:t>
       </w:r>
     </w:p>
-    <w:bookmarkEnd w:id="365"/>
-    <w:bookmarkStart w:id="367" w:name="ref-Paparo2014"/>
+    <w:bookmarkEnd w:id="366"/>
+    <w:bookmarkStart w:id="368" w:name="ref-Paparo2014"/>
     <w:p>
       <w:pPr>
         <w:pStyle w:val="Bibliography"/>
@@ -24487,7 +24595,7 @@
       <w:r>
         <w:t xml:space="preserve"> </w:t>
       </w:r>
-      <w:hyperlink r:id="rId366">
+      <w:hyperlink r:id="rId367">
         <w:r>
           <w:rPr>
             <w:rStyle w:val="Hyperlink"/>
@@ -24499,8 +24607,8 @@
         <w:t xml:space="preserve">.</w:t>
       </w:r>
     </w:p>
-    <w:bookmarkEnd w:id="367"/>
-    <w:bookmarkStart w:id="368" w:name="ref-Park2023"/>
+    <w:bookmarkEnd w:id="368"/>
+    <w:bookmarkStart w:id="369" w:name="ref-Park2023"/>
     <w:p>
       <w:pPr>
         <w:pStyle w:val="Bibliography"/>
@@ -24540,8 +24648,8 @@
         <w:t xml:space="preserve">10 (22): 20033–48.</w:t>
       </w:r>
     </w:p>
-    <w:bookmarkEnd w:id="368"/>
-    <w:bookmarkStart w:id="369" w:name="ref-Park2024"/>
+    <w:bookmarkEnd w:id="369"/>
+    <w:bookmarkStart w:id="370" w:name="ref-Park2024"/>
     <w:p>
       <w:pPr>
         <w:pStyle w:val="Bibliography"/>
@@ -24572,8 +24680,8 @@
         <w:t xml:space="preserve">62 (6): 106–12.</w:t>
       </w:r>
     </w:p>
-    <w:bookmarkEnd w:id="369"/>
-    <w:bookmarkStart w:id="371" w:name="ref-Peruzzo2014"/>
+    <w:bookmarkEnd w:id="370"/>
+    <w:bookmarkStart w:id="372" w:name="ref-Peruzzo2014"/>
     <w:p>
       <w:pPr>
         <w:pStyle w:val="Bibliography"/>
@@ -24606,7 +24714,7 @@
       <w:r>
         <w:t xml:space="preserve"> </w:t>
       </w:r>
-      <w:hyperlink r:id="rId370">
+      <w:hyperlink r:id="rId371">
         <w:r>
           <w:rPr>
             <w:rStyle w:val="Hyperlink"/>
@@ -24618,8 +24726,8 @@
         <w:t xml:space="preserve">.</w:t>
       </w:r>
     </w:p>
-    <w:bookmarkEnd w:id="371"/>
-    <w:bookmarkStart w:id="373" w:name="ref-Petschnigg2019"/>
+    <w:bookmarkEnd w:id="372"/>
+    <w:bookmarkStart w:id="374" w:name="ref-Petschnigg2019"/>
     <w:p>
       <w:pPr>
         <w:pStyle w:val="Bibliography"/>
@@ -24669,7 +24777,7 @@
       <w:r>
         <w:t xml:space="preserve"> </w:t>
       </w:r>
-      <w:hyperlink r:id="rId372">
+      <w:hyperlink r:id="rId373">
         <w:r>
           <w:rPr>
             <w:rStyle w:val="Hyperlink"/>
@@ -24681,8 +24789,8 @@
         <w:t xml:space="preserve">.</w:t>
       </w:r>
     </w:p>
-    <w:bookmarkEnd w:id="373"/>
-    <w:bookmarkStart w:id="375" w:name="ref-Pothos2013"/>
+    <w:bookmarkEnd w:id="374"/>
+    <w:bookmarkStart w:id="376" w:name="ref-Pothos2013"/>
     <w:p>
       <w:pPr>
         <w:pStyle w:val="Bibliography"/>
@@ -24715,7 +24823,7 @@
       <w:r>
         <w:t xml:space="preserve"> </w:t>
       </w:r>
-      <w:hyperlink r:id="rId374">
+      <w:hyperlink r:id="rId375">
         <w:r>
           <w:rPr>
             <w:rStyle w:val="Hyperlink"/>
@@ -24727,8 +24835,8 @@
         <w:t xml:space="preserve">.</w:t>
       </w:r>
     </w:p>
-    <w:bookmarkEnd w:id="375"/>
-    <w:bookmarkStart w:id="377" w:name="ref-Pothos2022"/>
+    <w:bookmarkEnd w:id="376"/>
+    <w:bookmarkStart w:id="378" w:name="ref-Pothos2022"/>
     <w:p>
       <w:pPr>
         <w:pStyle w:val="Bibliography"/>
@@ -24761,7 +24869,7 @@
       <w:r>
         <w:t xml:space="preserve"> </w:t>
       </w:r>
-      <w:hyperlink r:id="rId376">
+      <w:hyperlink r:id="rId377">
         <w:r>
           <w:rPr>
             <w:rStyle w:val="Hyperlink"/>
@@ -24773,8 +24881,8 @@
         <w:t xml:space="preserve">.</w:t>
       </w:r>
     </w:p>
-    <w:bookmarkEnd w:id="377"/>
-    <w:bookmarkStart w:id="379" w:name="ref-Preskill2018"/>
+    <w:bookmarkEnd w:id="378"/>
+    <w:bookmarkStart w:id="380" w:name="ref-Preskill2018"/>
     <w:p>
       <w:pPr>
         <w:pStyle w:val="Bibliography"/>
@@ -24819,7 +24927,7 @@
       <w:r>
         <w:t xml:space="preserve"> </w:t>
       </w:r>
-      <w:hyperlink r:id="rId378">
+      <w:hyperlink r:id="rId379">
         <w:r>
           <w:rPr>
             <w:rStyle w:val="Hyperlink"/>
@@ -24831,8 +24939,8 @@
         <w:t xml:space="preserve">.</w:t>
       </w:r>
     </w:p>
-    <w:bookmarkEnd w:id="379"/>
-    <w:bookmarkStart w:id="381" w:name="ref-Quang2025"/>
+    <w:bookmarkEnd w:id="380"/>
+    <w:bookmarkStart w:id="382" w:name="ref-Quang2025"/>
     <w:p>
       <w:pPr>
         <w:pStyle w:val="Bibliography"/>
@@ -24877,7 +24985,7 @@
       <w:r>
         <w:t xml:space="preserve"> </w:t>
       </w:r>
-      <w:hyperlink r:id="rId380">
+      <w:hyperlink r:id="rId381">
         <w:r>
           <w:rPr>
             <w:rStyle w:val="Hyperlink"/>
@@ -24889,8 +24997,8 @@
         <w:t xml:space="preserve">.</w:t>
       </w:r>
     </w:p>
-    <w:bookmarkEnd w:id="381"/>
-    <w:bookmarkStart w:id="383" w:name="ref-Rao2024"/>
+    <w:bookmarkEnd w:id="382"/>
+    <w:bookmarkStart w:id="384" w:name="ref-Rao2024"/>
     <w:p>
       <w:pPr>
         <w:pStyle w:val="Bibliography"/>
@@ -24907,7 +25015,7 @@
       <w:r>
         <w:t xml:space="preserve"> </w:t>
       </w:r>
-      <w:hyperlink r:id="rId382">
+      <w:hyperlink r:id="rId383">
         <w:r>
           <w:rPr>
             <w:rStyle w:val="Hyperlink"/>
@@ -24919,8 +25027,8 @@
         <w:t xml:space="preserve">.</w:t>
       </w:r>
     </w:p>
-    <w:bookmarkEnd w:id="383"/>
-    <w:bookmarkStart w:id="385" w:name="ref-Ravi2021"/>
+    <w:bookmarkEnd w:id="384"/>
+    <w:bookmarkStart w:id="386" w:name="ref-Ravi2021"/>
     <w:p>
       <w:pPr>
         <w:pStyle w:val="Bibliography"/>
@@ -24998,7 +25106,7 @@
       <w:r>
         <w:t xml:space="preserve"> </w:t>
       </w:r>
-      <w:hyperlink r:id="rId384">
+      <w:hyperlink r:id="rId385">
         <w:r>
           <w:rPr>
             <w:rStyle w:val="Hyperlink"/>
@@ -25010,8 +25118,8 @@
         <w:t xml:space="preserve">.</w:t>
       </w:r>
     </w:p>
-    <w:bookmarkEnd w:id="385"/>
-    <w:bookmarkStart w:id="387" w:name="ref-Rebentrost2014"/>
+    <w:bookmarkEnd w:id="386"/>
+    <w:bookmarkStart w:id="388" w:name="ref-Rebentrost2014"/>
     <w:p>
       <w:pPr>
         <w:pStyle w:val="Bibliography"/>
@@ -25044,7 +25152,7 @@
       <w:r>
         <w:t xml:space="preserve"> </w:t>
       </w:r>
-      <w:hyperlink r:id="rId386">
+      <w:hyperlink r:id="rId387">
         <w:r>
           <w:rPr>
             <w:rStyle w:val="Hyperlink"/>
@@ -25056,8 +25164,8 @@
         <w:t xml:space="preserve">.</w:t>
       </w:r>
     </w:p>
-    <w:bookmarkEnd w:id="387"/>
-    <w:bookmarkStart w:id="389" w:name="ref-Reiher2017"/>
+    <w:bookmarkEnd w:id="388"/>
+    <w:bookmarkStart w:id="390" w:name="ref-Reiher2017"/>
     <w:p>
       <w:pPr>
         <w:pStyle w:val="Bibliography"/>
@@ -25090,7 +25198,7 @@
       <w:r>
         <w:t xml:space="preserve"> </w:t>
       </w:r>
-      <w:hyperlink r:id="rId388">
+      <w:hyperlink r:id="rId389">
         <w:r>
           <w:rPr>
             <w:rStyle w:val="Hyperlink"/>
@@ -25102,8 +25210,8 @@
         <w:t xml:space="preserve">.</w:t>
       </w:r>
     </w:p>
-    <w:bookmarkEnd w:id="389"/>
-    <w:bookmarkStart w:id="391" w:name="ref-Rieffel2015"/>
+    <w:bookmarkEnd w:id="390"/>
+    <w:bookmarkStart w:id="392" w:name="ref-Rieffel2015"/>
     <w:p>
       <w:pPr>
         <w:pStyle w:val="Bibliography"/>
@@ -25136,7 +25244,7 @@
       <w:r>
         <w:t xml:space="preserve"> </w:t>
       </w:r>
-      <w:hyperlink r:id="rId390">
+      <w:hyperlink r:id="rId391">
         <w:r>
           <w:rPr>
             <w:rStyle w:val="Hyperlink"/>
@@ -25148,8 +25256,8 @@
         <w:t xml:space="preserve">.</w:t>
       </w:r>
     </w:p>
-    <w:bookmarkEnd w:id="391"/>
-    <w:bookmarkStart w:id="393" w:name="ref-RodriguezDiaz2025"/>
+    <w:bookmarkEnd w:id="392"/>
+    <w:bookmarkStart w:id="394" w:name="ref-RodriguezDiaz2025"/>
     <w:p>
       <w:pPr>
         <w:pStyle w:val="Bibliography"/>
@@ -25182,7 +25290,7 @@
       <w:r>
         <w:t xml:space="preserve"> </w:t>
       </w:r>
-      <w:hyperlink r:id="rId392">
+      <w:hyperlink r:id="rId393">
         <w:r>
           <w:rPr>
             <w:rStyle w:val="Hyperlink"/>
@@ -25194,8 +25302,8 @@
         <w:t xml:space="preserve">.</w:t>
       </w:r>
     </w:p>
-    <w:bookmarkEnd w:id="393"/>
-    <w:bookmarkStart w:id="394" w:name="ref-Roh2025"/>
+    <w:bookmarkEnd w:id="394"/>
+    <w:bookmarkStart w:id="395" w:name="ref-Roh2025"/>
     <w:p>
       <w:pPr>
         <w:pStyle w:val="Bibliography"/>
@@ -25226,8 +25334,8 @@
         <w:t xml:space="preserve">24 (2): 1031–42.</w:t>
       </w:r>
     </w:p>
-    <w:bookmarkEnd w:id="394"/>
-    <w:bookmarkStart w:id="396" w:name="ref-Salloum2026"/>
+    <w:bookmarkEnd w:id="395"/>
+    <w:bookmarkStart w:id="397" w:name="ref-Salloum2026"/>
     <w:p>
       <w:pPr>
         <w:pStyle w:val="Bibliography"/>
@@ -25260,7 +25368,7 @@
       <w:r>
         <w:t xml:space="preserve"> </w:t>
       </w:r>
-      <w:hyperlink r:id="rId395">
+      <w:hyperlink r:id="rId396">
         <w:r>
           <w:rPr>
             <w:rStyle w:val="Hyperlink"/>
@@ -25272,8 +25380,8 @@
         <w:t xml:space="preserve">.</w:t>
       </w:r>
     </w:p>
-    <w:bookmarkEnd w:id="396"/>
-    <w:bookmarkStart w:id="398" w:name="ref-Sarkar2024"/>
+    <w:bookmarkEnd w:id="397"/>
+    <w:bookmarkStart w:id="399" w:name="ref-Sarkar2024"/>
     <w:p>
       <w:pPr>
         <w:pStyle w:val="Bibliography"/>
@@ -25306,7 +25414,7 @@
       <w:r>
         <w:t xml:space="preserve"> </w:t>
       </w:r>
-      <w:hyperlink r:id="rId397">
+      <w:hyperlink r:id="rId398">
         <w:r>
           <w:rPr>
             <w:rStyle w:val="Hyperlink"/>
@@ -25318,8 +25426,8 @@
         <w:t xml:space="preserve">.</w:t>
       </w:r>
     </w:p>
-    <w:bookmarkEnd w:id="398"/>
-    <w:bookmarkStart w:id="400" w:name="ref-Schuetz2022"/>
+    <w:bookmarkEnd w:id="399"/>
+    <w:bookmarkStart w:id="401" w:name="ref-Schuetz2022"/>
     <w:p>
       <w:pPr>
         <w:pStyle w:val="Bibliography"/>
@@ -25352,7 +25460,7 @@
       <w:r>
         <w:t xml:space="preserve"> </w:t>
       </w:r>
-      <w:hyperlink r:id="rId399">
+      <w:hyperlink r:id="rId400">
         <w:r>
           <w:rPr>
             <w:rStyle w:val="Hyperlink"/>
@@ -25364,8 +25472,8 @@
         <w:t xml:space="preserve">.</w:t>
       </w:r>
     </w:p>
-    <w:bookmarkEnd w:id="400"/>
-    <w:bookmarkStart w:id="402" w:name="ref-Schuld2019"/>
+    <w:bookmarkEnd w:id="401"/>
+    <w:bookmarkStart w:id="403" w:name="ref-Schuld2019"/>
     <w:p>
       <w:pPr>
         <w:pStyle w:val="Bibliography"/>
@@ -25410,7 +25518,7 @@
       <w:r>
         <w:t xml:space="preserve"> </w:t>
       </w:r>
-      <w:hyperlink r:id="rId401">
+      <w:hyperlink r:id="rId402">
         <w:r>
           <w:rPr>
             <w:rStyle w:val="Hyperlink"/>
@@ -25422,8 +25530,8 @@
         <w:t xml:space="preserve">.</w:t>
       </w:r>
     </w:p>
-    <w:bookmarkEnd w:id="402"/>
-    <w:bookmarkStart w:id="404" w:name="ref-Schuld2021"/>
+    <w:bookmarkEnd w:id="403"/>
+    <w:bookmarkStart w:id="405" w:name="ref-Schuld2021"/>
     <w:p>
       <w:pPr>
         <w:pStyle w:val="Bibliography"/>
@@ -25447,7 +25555,7 @@
       <w:r>
         <w:t xml:space="preserve"> </w:t>
       </w:r>
-      <w:hyperlink r:id="rId403">
+      <w:hyperlink r:id="rId404">
         <w:r>
           <w:rPr>
             <w:rStyle w:val="Hyperlink"/>
@@ -25459,8 +25567,8 @@
         <w:t xml:space="preserve">.</w:t>
       </w:r>
     </w:p>
-    <w:bookmarkEnd w:id="404"/>
-    <w:bookmarkStart w:id="406" w:name="ref-Shor1997"/>
+    <w:bookmarkEnd w:id="405"/>
+    <w:bookmarkStart w:id="407" w:name="ref-Shor1997"/>
     <w:p>
       <w:pPr>
         <w:pStyle w:val="Bibliography"/>
@@ -25493,7 +25601,7 @@
       <w:r>
         <w:t xml:space="preserve"> </w:t>
       </w:r>
-      <w:hyperlink r:id="rId405">
+      <w:hyperlink r:id="rId406">
         <w:r>
           <w:rPr>
             <w:rStyle w:val="Hyperlink"/>
@@ -25505,8 +25613,8 @@
         <w:t xml:space="preserve">.</w:t>
       </w:r>
     </w:p>
-    <w:bookmarkEnd w:id="406"/>
-    <w:bookmarkStart w:id="408" w:name="ref-Siciliano2016"/>
+    <w:bookmarkEnd w:id="407"/>
+    <w:bookmarkStart w:id="409" w:name="ref-Siciliano2016"/>
     <w:p>
       <w:pPr>
         <w:pStyle w:val="Bibliography"/>
@@ -25530,7 +25638,7 @@
       <w:r>
         <w:t xml:space="preserve"> </w:t>
       </w:r>
-      <w:hyperlink r:id="rId407">
+      <w:hyperlink r:id="rId408">
         <w:r>
           <w:rPr>
             <w:rStyle w:val="Hyperlink"/>
@@ -25542,8 +25650,8 @@
         <w:t xml:space="preserve">.</w:t>
       </w:r>
     </w:p>
-    <w:bookmarkEnd w:id="408"/>
-    <w:bookmarkStart w:id="410" w:name="ref-Sinha2023"/>
+    <w:bookmarkEnd w:id="409"/>
+    <w:bookmarkStart w:id="411" w:name="ref-Sinha2023"/>
     <w:p>
       <w:pPr>
         <w:pStyle w:val="Bibliography"/>
@@ -25582,7 +25690,7 @@
       <w:r>
         <w:t xml:space="preserve"> </w:t>
       </w:r>
-      <w:hyperlink r:id="rId409">
+      <w:hyperlink r:id="rId410">
         <w:r>
           <w:rPr>
             <w:rStyle w:val="Hyperlink"/>
@@ -25594,8 +25702,8 @@
         <w:t xml:space="preserve">.</w:t>
       </w:r>
     </w:p>
-    <w:bookmarkEnd w:id="410"/>
-    <w:bookmarkStart w:id="412" w:name="ref-Skolik2022"/>
+    <w:bookmarkEnd w:id="411"/>
+    <w:bookmarkStart w:id="413" w:name="ref-Skolik2022"/>
     <w:p>
       <w:pPr>
         <w:pStyle w:val="Bibliography"/>
@@ -25637,7 +25745,7 @@
       <w:r>
         <w:t xml:space="preserve"> </w:t>
       </w:r>
-      <w:hyperlink r:id="rId411">
+      <w:hyperlink r:id="rId412">
         <w:r>
           <w:rPr>
             <w:rStyle w:val="Hyperlink"/>
@@ -25649,8 +25757,8 @@
         <w:t xml:space="preserve">.</w:t>
       </w:r>
     </w:p>
-    <w:bookmarkEnd w:id="412"/>
-    <w:bookmarkStart w:id="414" w:name="ref-Smierzchalski2024"/>
+    <w:bookmarkEnd w:id="413"/>
+    <w:bookmarkStart w:id="415" w:name="ref-Smierzchalski2024"/>
     <w:p>
       <w:pPr>
         <w:pStyle w:val="Bibliography"/>
@@ -25683,7 +25791,7 @@
       <w:r>
         <w:t xml:space="preserve"> </w:t>
       </w:r>
-      <w:hyperlink r:id="rId413">
+      <w:hyperlink r:id="rId414">
         <w:r>
           <w:rPr>
             <w:rStyle w:val="Hyperlink"/>
@@ -25695,8 +25803,8 @@
         <w:t xml:space="preserve">.</w:t>
       </w:r>
     </w:p>
-    <w:bookmarkEnd w:id="414"/>
-    <w:bookmarkStart w:id="416" w:name="ref-Sun2025"/>
+    <w:bookmarkEnd w:id="415"/>
+    <w:bookmarkStart w:id="417" w:name="ref-Sun2025"/>
     <w:p>
       <w:pPr>
         <w:pStyle w:val="Bibliography"/>
@@ -25722,7 +25830,7 @@
       <w:r>
         <w:t xml:space="preserve"> </w:t>
       </w:r>
-      <w:hyperlink r:id="rId415">
+      <w:hyperlink r:id="rId416">
         <w:r>
           <w:rPr>
             <w:rStyle w:val="Hyperlink"/>
@@ -25734,8 +25842,8 @@
         <w:t xml:space="preserve">.</w:t>
       </w:r>
     </w:p>
-    <w:bookmarkEnd w:id="416"/>
-    <w:bookmarkStart w:id="417" w:name="ref-Sutton2018"/>
+    <w:bookmarkEnd w:id="417"/>
+    <w:bookmarkStart w:id="418" w:name="ref-Sutton2018"/>
     <w:p>
       <w:pPr>
         <w:pStyle w:val="Bibliography"/>
@@ -25757,8 +25865,8 @@
         <w:t xml:space="preserve">. 2nd ed. Adaptive Computation and Machine Learning. Cambridge, MA, USA: MIT Press.</w:t>
       </w:r>
     </w:p>
-    <w:bookmarkEnd w:id="417"/>
-    <w:bookmarkStart w:id="419" w:name="ref-Taghavi2025"/>
+    <w:bookmarkEnd w:id="418"/>
+    <w:bookmarkStart w:id="420" w:name="ref-Taghavi2025"/>
     <w:p>
       <w:pPr>
         <w:pStyle w:val="Bibliography"/>
@@ -25791,7 +25899,7 @@
       <w:r>
         <w:t xml:space="preserve"> </w:t>
       </w:r>
-      <w:hyperlink r:id="rId418">
+      <w:hyperlink r:id="rId419">
         <w:r>
           <w:rPr>
             <w:rStyle w:val="Hyperlink"/>
@@ -25803,8 +25911,8 @@
         <w:t xml:space="preserve">.</w:t>
       </w:r>
     </w:p>
-    <w:bookmarkEnd w:id="419"/>
-    <w:bookmarkStart w:id="421" w:name="ref-Tandon2017"/>
+    <w:bookmarkEnd w:id="420"/>
+    <w:bookmarkStart w:id="422" w:name="ref-Tandon2017"/>
     <w:p>
       <w:pPr>
         <w:pStyle w:val="Bibliography"/>
@@ -25828,7 +25936,7 @@
       <w:r>
         <w:t xml:space="preserve"> </w:t>
       </w:r>
-      <w:hyperlink r:id="rId420">
+      <w:hyperlink r:id="rId421">
         <w:r>
           <w:rPr>
             <w:rStyle w:val="Hyperlink"/>
@@ -25840,8 +25948,8 @@
         <w:t xml:space="preserve">.</w:t>
       </w:r>
     </w:p>
-    <w:bookmarkEnd w:id="421"/>
-    <w:bookmarkStart w:id="423" w:name="ref-Tang2019"/>
+    <w:bookmarkEnd w:id="422"/>
+    <w:bookmarkStart w:id="424" w:name="ref-Tang2019"/>
     <w:p>
       <w:pPr>
         <w:pStyle w:val="Bibliography"/>
@@ -25940,7 +26048,7 @@
       <w:r>
         <w:t xml:space="preserve"> </w:t>
       </w:r>
-      <w:hyperlink r:id="rId422">
+      <w:hyperlink r:id="rId423">
         <w:r>
           <w:rPr>
             <w:rStyle w:val="Hyperlink"/>
@@ -25952,8 +26060,8 @@
         <w:t xml:space="preserve">.</w:t>
       </w:r>
     </w:p>
-    <w:bookmarkEnd w:id="423"/>
-    <w:bookmarkStart w:id="425" w:name="ref-Tang2021"/>
+    <w:bookmarkEnd w:id="424"/>
+    <w:bookmarkStart w:id="426" w:name="ref-Tang2021"/>
     <w:p>
       <w:pPr>
         <w:pStyle w:val="Bibliography"/>
@@ -26016,7 +26124,7 @@
       <w:r>
         <w:t xml:space="preserve"> </w:t>
       </w:r>
-      <w:hyperlink r:id="rId424">
+      <w:hyperlink r:id="rId425">
         <w:r>
           <w:rPr>
             <w:rStyle w:val="Hyperlink"/>
@@ -26028,8 +26136,8 @@
         <w:t xml:space="preserve">.</w:t>
       </w:r>
     </w:p>
-    <w:bookmarkEnd w:id="425"/>
-    <w:bookmarkStart w:id="427" w:name="ref-Temme2017"/>
+    <w:bookmarkEnd w:id="426"/>
+    <w:bookmarkStart w:id="428" w:name="ref-Temme2017"/>
     <w:p>
       <w:pPr>
         <w:pStyle w:val="Bibliography"/>
@@ -26062,7 +26170,7 @@
       <w:r>
         <w:t xml:space="preserve"> </w:t>
       </w:r>
-      <w:hyperlink r:id="rId426">
+      <w:hyperlink r:id="rId427">
         <w:r>
           <w:rPr>
             <w:rStyle w:val="Hyperlink"/>
@@ -26074,8 +26182,8 @@
         <w:t xml:space="preserve">.</w:t>
       </w:r>
     </w:p>
-    <w:bookmarkEnd w:id="427"/>
-    <w:bookmarkStart w:id="429" w:name="ref-Templier2022"/>
+    <w:bookmarkEnd w:id="428"/>
+    <w:bookmarkStart w:id="430" w:name="ref-Templier2022"/>
     <w:p>
       <w:pPr>
         <w:pStyle w:val="Bibliography"/>
@@ -26108,7 +26216,7 @@
       <w:r>
         <w:t xml:space="preserve"> </w:t>
       </w:r>
-      <w:hyperlink r:id="rId428">
+      <w:hyperlink r:id="rId429">
         <w:r>
           <w:rPr>
             <w:rStyle w:val="Hyperlink"/>
@@ -26120,8 +26228,8 @@
         <w:t xml:space="preserve">.</w:t>
       </w:r>
     </w:p>
-    <w:bookmarkEnd w:id="429"/>
-    <w:bookmarkStart w:id="431" w:name="ref-Terhal2015"/>
+    <w:bookmarkEnd w:id="430"/>
+    <w:bookmarkStart w:id="432" w:name="ref-Terhal2015"/>
     <w:p>
       <w:pPr>
         <w:pStyle w:val="Bibliography"/>
@@ -26154,7 +26262,7 @@
       <w:r>
         <w:t xml:space="preserve"> </w:t>
       </w:r>
-      <w:hyperlink r:id="rId430">
+      <w:hyperlink r:id="rId431">
         <w:r>
           <w:rPr>
             <w:rStyle w:val="Hyperlink"/>
@@ -26166,8 +26274,8 @@
         <w:t xml:space="preserve">.</w:t>
       </w:r>
     </w:p>
-    <w:bookmarkEnd w:id="431"/>
-    <w:bookmarkStart w:id="432" w:name="ref-Thrun2005"/>
+    <w:bookmarkEnd w:id="432"/>
+    <w:bookmarkStart w:id="433" w:name="ref-Thrun2005"/>
     <w:p>
       <w:pPr>
         <w:pStyle w:val="Bibliography"/>
@@ -26189,8 +26297,8 @@
         <w:t xml:space="preserve">. Intelligent Robotics and Autonomous Agents. Cambridge, MA, USA: MIT Press.</w:t>
       </w:r>
     </w:p>
-    <w:bookmarkEnd w:id="432"/>
-    <w:bookmarkStart w:id="434" w:name="ref-Tian2023"/>
+    <w:bookmarkEnd w:id="433"/>
+    <w:bookmarkStart w:id="435" w:name="ref-Tian2023"/>
     <w:p>
       <w:pPr>
         <w:pStyle w:val="Bibliography"/>
@@ -26223,7 +26331,7 @@
       <w:r>
         <w:t xml:space="preserve"> </w:t>
       </w:r>
-      <w:hyperlink r:id="rId433">
+      <w:hyperlink r:id="rId434">
         <w:r>
           <w:rPr>
             <w:rStyle w:val="Hyperlink"/>
@@ -26235,8 +26343,8 @@
         <w:t xml:space="preserve">.</w:t>
       </w:r>
     </w:p>
-    <w:bookmarkEnd w:id="434"/>
-    <w:bookmarkStart w:id="436" w:name="ref-Udekwe2025"/>
+    <w:bookmarkEnd w:id="435"/>
+    <w:bookmarkStart w:id="437" w:name="ref-Udekwe2025"/>
     <w:p>
       <w:pPr>
         <w:pStyle w:val="Bibliography"/>
@@ -26259,7 +26367,7 @@
       <w:r>
         <w:t xml:space="preserve"> </w:t>
       </w:r>
-      <w:hyperlink r:id="rId435">
+      <w:hyperlink r:id="rId436">
         <w:r>
           <w:rPr>
             <w:rStyle w:val="Hyperlink"/>
@@ -26271,8 +26379,8 @@
         <w:t xml:space="preserve">.</w:t>
       </w:r>
     </w:p>
-    <w:bookmarkEnd w:id="436"/>
-    <w:bookmarkStart w:id="438" w:name="ref-Wang2025"/>
+    <w:bookmarkEnd w:id="437"/>
+    <w:bookmarkStart w:id="439" w:name="ref-Wang2025"/>
     <w:p>
       <w:pPr>
         <w:pStyle w:val="Bibliography"/>
@@ -26350,7 +26458,7 @@
       <w:r>
         <w:t xml:space="preserve"> </w:t>
       </w:r>
-      <w:hyperlink r:id="rId437">
+      <w:hyperlink r:id="rId438">
         <w:r>
           <w:rPr>
             <w:rStyle w:val="Hyperlink"/>
@@ -26362,8 +26470,8 @@
         <w:t xml:space="preserve">.</w:t>
       </w:r>
     </w:p>
-    <w:bookmarkEnd w:id="438"/>
-    <w:bookmarkStart w:id="440" w:name="ref-Wang2021"/>
+    <w:bookmarkEnd w:id="439"/>
+    <w:bookmarkStart w:id="441" w:name="ref-Wang2021"/>
     <w:p>
       <w:pPr>
         <w:pStyle w:val="Bibliography"/>
@@ -26380,7 +26488,7 @@
       <w:r>
         <w:t xml:space="preserve"> </w:t>
       </w:r>
-      <w:hyperlink r:id="rId439">
+      <w:hyperlink r:id="rId440">
         <w:r>
           <w:rPr>
             <w:rStyle w:val="Hyperlink"/>
@@ -26392,8 +26500,8 @@
         <w:t xml:space="preserve">.</w:t>
       </w:r>
     </w:p>
-    <w:bookmarkEnd w:id="440"/>
-    <w:bookmarkStart w:id="442" w:name="ref-Wang2023"/>
+    <w:bookmarkEnd w:id="441"/>
+    <w:bookmarkStart w:id="443" w:name="ref-Wang2023"/>
     <w:p>
       <w:pPr>
         <w:pStyle w:val="Bibliography"/>
@@ -26441,7 +26549,7 @@
       <w:r>
         <w:t xml:space="preserve"> </w:t>
       </w:r>
-      <w:hyperlink r:id="rId441">
+      <w:hyperlink r:id="rId442">
         <w:r>
           <w:rPr>
             <w:rStyle w:val="Hyperlink"/>
@@ -26453,8 +26561,8 @@
         <w:t xml:space="preserve">.</w:t>
       </w:r>
     </w:p>
-    <w:bookmarkEnd w:id="442"/>
-    <w:bookmarkStart w:id="444" w:name="ref-Wang2024"/>
+    <w:bookmarkEnd w:id="443"/>
+    <w:bookmarkStart w:id="445" w:name="ref-Wang2024"/>
     <w:p>
       <w:pPr>
         <w:pStyle w:val="Bibliography"/>
@@ -26483,7 +26591,7 @@
       <w:r>
         <w:t xml:space="preserve"> </w:t>
       </w:r>
-      <w:hyperlink r:id="rId443">
+      <w:hyperlink r:id="rId444">
         <w:r>
           <w:rPr>
             <w:rStyle w:val="Hyperlink"/>
@@ -26495,8 +26603,8 @@
         <w:t xml:space="preserve">.</w:t>
       </w:r>
     </w:p>
-    <w:bookmarkEnd w:id="444"/>
-    <w:bookmarkStart w:id="446" w:name="ref-Widdows2023"/>
+    <w:bookmarkEnd w:id="445"/>
+    <w:bookmarkStart w:id="447" w:name="ref-Widdows2023"/>
     <w:p>
       <w:pPr>
         <w:pStyle w:val="Bibliography"/>
@@ -26529,7 +26637,7 @@
       <w:r>
         <w:t xml:space="preserve"> </w:t>
       </w:r>
-      <w:hyperlink r:id="rId445">
+      <w:hyperlink r:id="rId446">
         <w:r>
           <w:rPr>
             <w:rStyle w:val="Hyperlink"/>
@@ -26541,8 +26649,8 @@
         <w:t xml:space="preserve">.</w:t>
       </w:r>
     </w:p>
-    <w:bookmarkEnd w:id="446"/>
-    <w:bookmarkStart w:id="448" w:name="ref-Wiebe2015"/>
+    <w:bookmarkEnd w:id="447"/>
+    <w:bookmarkStart w:id="449" w:name="ref-Wiebe2015"/>
     <w:p>
       <w:pPr>
         <w:pStyle w:val="Bibliography"/>
@@ -26575,7 +26683,7 @@
       <w:r>
         <w:t xml:space="preserve"> </w:t>
       </w:r>
-      <w:hyperlink r:id="rId447">
+      <w:hyperlink r:id="rId448">
         <w:r>
           <w:rPr>
             <w:rStyle w:val="Hyperlink"/>
@@ -26587,8 +26695,8 @@
         <w:t xml:space="preserve">.</w:t>
       </w:r>
     </w:p>
-    <w:bookmarkEnd w:id="448"/>
-    <w:bookmarkStart w:id="450" w:name="ref-Willmann2025"/>
+    <w:bookmarkEnd w:id="449"/>
+    <w:bookmarkStart w:id="451" w:name="ref-Willmann2025"/>
     <w:p>
       <w:pPr>
         <w:pStyle w:val="Bibliography"/>
@@ -26635,7 +26743,7 @@
       <w:r>
         <w:t xml:space="preserve"> </w:t>
       </w:r>
-      <w:hyperlink r:id="rId449">
+      <w:hyperlink r:id="rId450">
         <w:r>
           <w:rPr>
             <w:rStyle w:val="Hyperlink"/>
@@ -26647,8 +26755,8 @@
         <w:t xml:space="preserve">.</w:t>
       </w:r>
     </w:p>
-    <w:bookmarkEnd w:id="450"/>
-    <w:bookmarkStart w:id="452" w:name="ref-Windmann2023"/>
+    <w:bookmarkEnd w:id="451"/>
+    <w:bookmarkStart w:id="453" w:name="ref-Windmann2023"/>
     <w:p>
       <w:pPr>
         <w:pStyle w:val="Bibliography"/>
@@ -26678,7 +26786,7 @@
       <w:r>
         <w:t xml:space="preserve"> </w:t>
       </w:r>
-      <w:hyperlink r:id="rId451">
+      <w:hyperlink r:id="rId452">
         <w:r>
           <w:rPr>
             <w:rStyle w:val="Hyperlink"/>
@@ -26690,8 +26798,8 @@
         <w:t xml:space="preserve">.</w:t>
       </w:r>
     </w:p>
-    <w:bookmarkEnd w:id="452"/>
-    <w:bookmarkStart w:id="454" w:name="ref-Yan2021"/>
+    <w:bookmarkEnd w:id="453"/>
+    <w:bookmarkStart w:id="455" w:name="ref-Yan2021"/>
     <w:p>
       <w:pPr>
         <w:pStyle w:val="Bibliography"/>
@@ -26724,7 +26832,7 @@
       <w:r>
         <w:t xml:space="preserve"> </w:t>
       </w:r>
-      <w:hyperlink r:id="rId453">
+      <w:hyperlink r:id="rId454">
         <w:r>
           <w:rPr>
             <w:rStyle w:val="Hyperlink"/>
@@ -26736,8 +26844,8 @@
         <w:t xml:space="preserve">.</w:t>
       </w:r>
     </w:p>
-    <w:bookmarkEnd w:id="454"/>
-    <w:bookmarkStart w:id="456" w:name="ref-Yan2024"/>
+    <w:bookmarkEnd w:id="455"/>
+    <w:bookmarkStart w:id="457" w:name="ref-Yan2024"/>
     <w:p>
       <w:pPr>
         <w:pStyle w:val="Bibliography"/>
@@ -26770,7 +26878,7 @@
       <w:r>
         <w:t xml:space="preserve"> </w:t>
       </w:r>
-      <w:hyperlink r:id="rId455">
+      <w:hyperlink r:id="rId456">
         <w:r>
           <w:rPr>
             <w:rStyle w:val="Hyperlink"/>
@@ -26782,8 +26890,8 @@
         <w:t xml:space="preserve">.</w:t>
       </w:r>
     </w:p>
-    <w:bookmarkEnd w:id="456"/>
-    <w:bookmarkStart w:id="458" w:name="ref-Yarkoni2022"/>
+    <w:bookmarkEnd w:id="457"/>
+    <w:bookmarkStart w:id="459" w:name="ref-Yarkoni2022"/>
     <w:p>
       <w:pPr>
         <w:pStyle w:val="Bibliography"/>
@@ -26816,7 +26924,7 @@
       <w:r>
         <w:t xml:space="preserve"> </w:t>
       </w:r>
-      <w:hyperlink r:id="rId457">
+      <w:hyperlink r:id="rId458">
         <w:r>
           <w:rPr>
             <w:rStyle w:val="Hyperlink"/>
@@ -26828,8 +26936,8 @@
         <w:t xml:space="preserve">.</w:t>
       </w:r>
     </w:p>
-    <w:bookmarkEnd w:id="458"/>
-    <w:bookmarkStart w:id="460" w:name="ref-Yu2025"/>
+    <w:bookmarkEnd w:id="459"/>
+    <w:bookmarkStart w:id="461" w:name="ref-Yu2025"/>
     <w:p>
       <w:pPr>
         <w:pStyle w:val="Bibliography"/>
@@ -26913,7 +27021,7 @@
       <w:r>
         <w:t xml:space="preserve"> </w:t>
       </w:r>
-      <w:hyperlink r:id="rId459">
+      <w:hyperlink r:id="rId460">
         <w:r>
           <w:rPr>
             <w:rStyle w:val="Hyperlink"/>
@@ -26925,8 +27033,8 @@
         <w:t xml:space="preserve">.</w:t>
       </w:r>
     </w:p>
-    <w:bookmarkEnd w:id="460"/>
-    <w:bookmarkStart w:id="462" w:name="ref-Yun2022"/>
+    <w:bookmarkEnd w:id="461"/>
+    <w:bookmarkStart w:id="463" w:name="ref-Yun2022"/>
     <w:p>
       <w:pPr>
         <w:pStyle w:val="Bibliography"/>
@@ -27004,7 +27112,7 @@
       <w:r>
         <w:t xml:space="preserve"> </w:t>
       </w:r>
-      <w:hyperlink r:id="rId461">
+      <w:hyperlink r:id="rId462">
         <w:r>
           <w:rPr>
             <w:rStyle w:val="Hyperlink"/>
@@ -27016,8 +27124,8 @@
         <w:t xml:space="preserve">.</w:t>
       </w:r>
     </w:p>
-    <w:bookmarkEnd w:id="462"/>
-    <w:bookmarkStart w:id="464" w:name="ref-Zhou2020"/>
+    <w:bookmarkEnd w:id="463"/>
+    <w:bookmarkStart w:id="465" w:name="ref-Zhou2020"/>
     <w:p>
       <w:pPr>
         <w:pStyle w:val="Bibliography"/>
@@ -27050,7 +27158,7 @@
       <w:r>
         <w:t xml:space="preserve"> </w:t>
       </w:r>
-      <w:hyperlink r:id="rId463">
+      <w:hyperlink r:id="rId464">
         <w:r>
           <w:rPr>
             <w:rStyle w:val="Hyperlink"/>
@@ -27062,8 +27170,8 @@
         <w:t xml:space="preserve">.</w:t>
       </w:r>
     </w:p>
-    <w:bookmarkEnd w:id="464"/>
-    <w:bookmarkStart w:id="466" w:name="ref-Zhuang2024"/>
+    <w:bookmarkEnd w:id="465"/>
+    <w:bookmarkStart w:id="467" w:name="ref-Zhuang2024"/>
     <w:p>
       <w:pPr>
         <w:pStyle w:val="Bibliography"/>
@@ -27080,7 +27188,7 @@
       <w:r>
         <w:t xml:space="preserve"> </w:t>
       </w:r>
-      <w:hyperlink r:id="rId465">
+      <w:hyperlink r:id="rId466">
         <w:r>
           <w:rPr>
             <w:rStyle w:val="Hyperlink"/>
@@ -27092,8 +27200,8 @@
         <w:t xml:space="preserve">.</w:t>
       </w:r>
     </w:p>
-    <w:bookmarkEnd w:id="466"/>
-    <w:bookmarkStart w:id="468" w:name="ref-Zuo2018"/>
+    <w:bookmarkEnd w:id="467"/>
+    <w:bookmarkStart w:id="469" w:name="ref-Zuo2018"/>
     <w:p>
       <w:pPr>
         <w:pStyle w:val="Bibliography"/>
@@ -27138,7 +27246,7 @@
       <w:r>
         <w:t xml:space="preserve"> </w:t>
       </w:r>
-      <w:hyperlink r:id="rId467">
+      <w:hyperlink r:id="rId468">
         <w:r>
           <w:rPr>
             <w:rStyle w:val="Hyperlink"/>
@@ -27153,9 +27261,9 @@
         <w:fldChar w:fldCharType="end"/>
       </w:r>
     </w:p>
-    <w:bookmarkEnd w:id="468"/>
     <w:bookmarkEnd w:id="469"/>
     <w:bookmarkEnd w:id="470"/>
+    <w:bookmarkEnd w:id="471"/>
     <w:sectPr/>
   </w:body>
 </w:document>

</xml_diff>

<commit_message>
Survey 1: cite QRL and QP decision-model studies in the foundation-model agenda item
</commit_message>
<xml_diff>
--- a/github/k/Survey1_ACM_CSUR_Manuscript.docx
+++ b/github/k/Survey1_ACM_CSUR_Manuscript.docx
@@ -18433,13 +18433,55 @@
         <w:t xml:space="preserve"> </w:t>
       </w:r>
       <w:r>
-        <w:t xml:space="preserve">used a language front end to generate QUBO task assignments, and QRL and QP decision models address small parts of policy learning and reasoning. No study applied a quantum method to the training or inference of a robot foundation model, so this direction has no graded evidence yet. The obstacles are clear from the rest of this survey: such models have billions of parameters, today’s processors offer hundreds of noisy qubits, loading classical data into quantum states can cancel any speed-up </w:t>
-      </w:r>
-      <w:r>
-        <w:fldChar w:fldCharType="begin"/>
-      </w:r>
-      <w:r>
-        <w:instrText xml:space="preserve">ADDIN CSL_CITATION {"citationID":"MENDELEY_CITATION_500","citationItems":[{"id":"ITEM-500","isTemporary":false,"itemData":{"DOI":"10.1038/nphys3272","author":[{"family":"Aaronson","given":"Scott"}],"container-title":"Nature Physics","id":"Aaronson2015","issue":"4","issued":{"date-parts":[[2015]]},"page":"291-293","title":"Read the fine print","type":"article-journal","volume":"11"}}],"isEdited":false,"manualOverride":{"citeprocText":"(Aaronson 2015)","isManuallyOverridden":false,"manualOverrideText":""},"mendeley":{"formattedCitation":"(Aaronson 2015)","plainTextFormattedCitation":"(Aaronson 2015)","previouslyFormattedCitation":"(Aaronson 2015)"},"properties":{"noteIndex":0},"schema":"https://github.com/citation-style-language/schema/raw/master/csl-citation.json"}</w:instrText>
+        <w:t xml:space="preserve">used a language front end to generate QUBO task assignments, and QRL </w:t>
+      </w:r>
+      <w:r>
+        <w:fldChar w:fldCharType="begin"/>
+      </w:r>
+      <w:r>
+        <w:instrText xml:space="preserve">ADDIN CSL_CITATION {"citationID":"MENDELEY_CITATION_501","citationItems":[{"id":"ITEM-500","isTemporary":false,"itemData":{"DOI":"10.1109/ACCESS.2024.3417808","author":[{"family":"Hohenfeld","given":"Hans"},{"family":"Heimann","given":"Dirk"},{"family":"Wiebe","given":"Felix"},{"family":"Kirchner","given":"Frank"}],"container-title":"IEEE Access","id":"Hohenfeld2024","issued":{"date-parts":[[2024]]},"page":"87217-87236","publisher":"IEEE","title":"Quantum deep reinforcement learning for robot navigation tasks","type":"article-journal","volume":"12"}},{"id":"ITEM-501","isTemporary":false,"itemData":{"URL":"https://arxiv.org/abs/2212.11681","author":[{"family":"Acuto","given":"Alberto"},{"family":"Barillà","given":"Paola"},{"family":"Bozzolo","given":"Ludovico"},{"family":"Conterno","given":"Matteo"},{"family":"Pavese","given":"Mattia"},{"family":"Policicchio","given":"Antonio"}],"id":"Acuto2022","issued":{"date-parts":[[2022]]},"title":"Variational quantum soft actor-critic for robotic arm control","type":""}}],"isEdited":false,"manualOverride":{"citeprocText":"(Hohenfeld et al. 2024; Acuto et al. 2022)","isManuallyOverridden":false,"manualOverrideText":""},"mendeley":{"formattedCitation":"(Hohenfeld et al. 2024; Acuto et al. 2022)","plainTextFormattedCitation":"(Hohenfeld et al. 2024; Acuto et al. 2022)","previouslyFormattedCitation":"(Hohenfeld et al. 2024; Acuto et al. 2022)"},"properties":{"noteIndex":0},"schema":"https://github.com/citation-style-language/schema/raw/master/csl-citation.json"}</w:instrText>
+      </w:r>
+      <w:r>
+        <w:fldChar w:fldCharType="separate"/>
+      </w:r>
+      <w:r>
+        <w:t xml:space="preserve">(Hohenfeld et al. 2024; Acuto et al. 2022)</w:t>
+      </w:r>
+      <w:r>
+        <w:fldChar w:fldCharType="end"/>
+      </w:r>
+      <w:r>
+        <w:t xml:space="preserve"> </w:t>
+      </w:r>
+      <w:r>
+        <w:t xml:space="preserve">and QP decision models </w:t>
+      </w:r>
+      <w:r>
+        <w:fldChar w:fldCharType="begin"/>
+      </w:r>
+      <w:r>
+        <w:instrText xml:space="preserve">ADDIN CSL_CITATION {"citationID":"MENDELEY_CITATION_502","citationItems":[{"id":"ITEM-502","isTemporary":false,"itemData":{"DOI":"10.1146/annurev-psych-033020-123501","author":[{"family":"Pothos","given":"Emmanuel M."},{"family":"Busemeyer","given":"Jerome R."}],"container-title":"Annual Review of Psychology","id":"Pothos2022","issue":"1","issued":{"date-parts":[[2022]]},"page":"749-778","publisher":"Annual Reviews","title":"Quantum cognition","type":"article-journal","volume":"73"}}],"isEdited":false,"manualOverride":{"citeprocText":"(Pothos and Busemeyer 2022)","isManuallyOverridden":false,"manualOverrideText":""},"mendeley":{"formattedCitation":"(Pothos and Busemeyer 2022)","plainTextFormattedCitation":"(Pothos and Busemeyer 2022)","previouslyFormattedCitation":"(Pothos and Busemeyer 2022)"},"properties":{"noteIndex":0},"schema":"https://github.com/citation-style-language/schema/raw/master/csl-citation.json"}</w:instrText>
+      </w:r>
+      <w:r>
+        <w:fldChar w:fldCharType="separate"/>
+      </w:r>
+      <w:r>
+        <w:t xml:space="preserve">(Pothos and Busemeyer 2022)</w:t>
+      </w:r>
+      <w:r>
+        <w:fldChar w:fldCharType="end"/>
+      </w:r>
+      <w:r>
+        <w:t xml:space="preserve"> </w:t>
+      </w:r>
+      <w:r>
+        <w:t xml:space="preserve">address small parts of policy learning and reasoning. No study applied a quantum method to the training or inference of a robot foundation model, so this direction has no graded evidence yet. The obstacles are clear from the rest of this survey: such models have billions of parameters, today’s processors offer hundreds of noisy qubits, loading classical data into quantum states can cancel any speed-up </w:t>
+      </w:r>
+      <w:r>
+        <w:fldChar w:fldCharType="begin"/>
+      </w:r>
+      <w:r>
+        <w:instrText xml:space="preserve">ADDIN CSL_CITATION {"citationID":"MENDELEY_CITATION_503","citationItems":[{"id":"ITEM-503","isTemporary":false,"itemData":{"DOI":"10.1038/nphys3272","author":[{"family":"Aaronson","given":"Scott"}],"container-title":"Nature Physics","id":"Aaronson2015","issue":"4","issued":{"date-parts":[[2015]]},"page":"291-293","title":"Read the fine print","type":"article-journal","volume":"11"}}],"isEdited":false,"manualOverride":{"citeprocText":"(Aaronson 2015)","isManuallyOverridden":false,"manualOverrideText":""},"mendeley":{"formattedCitation":"(Aaronson 2015)","plainTextFormattedCitation":"(Aaronson 2015)","previouslyFormattedCitation":"(Aaronson 2015)"},"properties":{"noteIndex":0},"schema":"https://github.com/citation-style-language/schema/raw/master/csl-citation.json"}</w:instrText>
       </w:r>
       <w:r>
         <w:fldChar w:fldCharType="separate"/>
@@ -18457,7 +18499,7 @@
         <w:fldChar w:fldCharType="begin"/>
       </w:r>
       <w:r>
-        <w:instrText xml:space="preserve">ADDIN CSL_CITATION {"citationID":"MENDELEY_CITATION_501","citationItems":[{"id":"ITEM-501","isTemporary":false,"itemData":{"DOI":"10.1145/3313276.3316310","author":[{"family":"Tang","given":"Ewin"}],"container-title":"Proceedings of the 51st annual ACM SIGACT symposium on theory of computing (STOC 2019)","id":"Tang2019","issued":{"date-parts":[[2019]]},"page":"217-228","publisher":"ACM","publisher-place":"New York, NY, USA","title":"A quantum-inspired classical algorithm for recommendation systems","type":"paper-conference"}}],"isEdited":false,"manualOverride":{"citeprocText":"(E. Tang 2019)","isManuallyOverridden":false,"manualOverrideText":""},"mendeley":{"formattedCitation":"(E. Tang 2019)","plainTextFormattedCitation":"(E. Tang 2019)","previouslyFormattedCitation":"(E. Tang 2019)"},"properties":{"noteIndex":0},"schema":"https://github.com/citation-style-language/schema/raw/master/csl-citation.json"}</w:instrText>
+        <w:instrText xml:space="preserve">ADDIN CSL_CITATION {"citationID":"MENDELEY_CITATION_504","citationItems":[{"id":"ITEM-504","isTemporary":false,"itemData":{"DOI":"10.1145/3313276.3316310","author":[{"family":"Tang","given":"Ewin"}],"container-title":"Proceedings of the 51st annual ACM SIGACT symposium on theory of computing (STOC 2019)","id":"Tang2019","issued":{"date-parts":[[2019]]},"page":"217-228","publisher":"ACM","publisher-place":"New York, NY, USA","title":"A quantum-inspired classical algorithm for recommendation systems","type":"paper-conference"}}],"isEdited":false,"manualOverride":{"citeprocText":"(E. Tang 2019)","isManuallyOverridden":false,"manualOverrideText":""},"mendeley":{"formattedCitation":"(E. Tang 2019)","plainTextFormattedCitation":"(E. Tang 2019)","previouslyFormattedCitation":"(E. Tang 2019)"},"properties":{"noteIndex":0},"schema":"https://github.com/citation-style-language/schema/raw/master/csl-citation.json"}</w:instrText>
       </w:r>
       <w:r>
         <w:fldChar w:fldCharType="separate"/>
@@ -18478,7 +18520,7 @@
         <w:fldChar w:fldCharType="begin"/>
       </w:r>
       <w:r>
-        <w:instrText xml:space="preserve">ADDIN CSL_CITATION {"citationID":"MENDELEY_CITATION_502","citationItems":[{"id":"ITEM-502","isTemporary":false,"itemData":{"URL":"https://arxiv.org/abs/2606.14252","author":[{"family":"Bang","given":"Junyeop"},{"family":"Lee","given":"Byongho"},{"family":"An","given":"Dohyun"},{"family":"Kim","given":"Hwangnam"}],"id":"Bang2026","issued":{"date-parts":[[2026]]},"title":"Optimality-preserving decomposition for scalable QAOA in natural-language-guided multi-drone assignment","type":""},"suppress-author":false}],"isEdited":false,"manualOverride":{"citeprocText":"Bang et al. (2026)","isManuallyOverridden":false,"manualOverrideText":""},"mendeley":{"formattedCitation":"Bang et al. (2026)","plainTextFormattedCitation":"Bang et al. (2026)","previouslyFormattedCitation":"Bang et al. (2026)"},"properties":{"noteIndex":0},"schema":"https://github.com/citation-style-language/schema/raw/master/csl-citation.json"}</w:instrText>
+        <w:instrText xml:space="preserve">ADDIN CSL_CITATION {"citationID":"MENDELEY_CITATION_505","citationItems":[{"id":"ITEM-505","isTemporary":false,"itemData":{"URL":"https://arxiv.org/abs/2606.14252","author":[{"family":"Bang","given":"Junyeop"},{"family":"Lee","given":"Byongho"},{"family":"An","given":"Dohyun"},{"family":"Kim","given":"Hwangnam"}],"id":"Bang2026","issued":{"date-parts":[[2026]]},"title":"Optimality-preserving decomposition for scalable QAOA in natural-language-guided multi-drone assignment","type":""},"suppress-author":false}],"isEdited":false,"manualOverride":{"citeprocText":"Bang et al. (2026)","isManuallyOverridden":false,"manualOverrideText":""},"mendeley":{"formattedCitation":"Bang et al. (2026)","plainTextFormattedCitation":"Bang et al. (2026)","previouslyFormattedCitation":"Bang et al. (2026)"},"properties":{"noteIndex":0},"schema":"https://github.com/citation-style-language/schema/raw/master/csl-citation.json"}</w:instrText>
       </w:r>
       <w:r>
         <w:fldChar w:fldCharType="separate"/>
@@ -18569,7 +18611,7 @@
         <w:fldChar w:fldCharType="begin"/>
       </w:r>
       <w:r>
-        <w:instrText xml:space="preserve">ADDIN CSL_CITATION {"citationID":"MENDELEY_CITATION_503","citationItems":[{"id":"ITEM-503","isTemporary":false,"itemData":{"URL":"https://arxiv.org/abs/2202.03028","author":[{"family":"Finžgar","given":"Jernej Rudi"},{"family":"Ross","given":"Philipp"},{"family":"Hölscher","given":"Leonhard"},{"family":"Klepsch","given":"Johannes"},{"family":"Luckow","given":"Andre"}],"container-title":"2022 IEEE international conference on quantum computing and engineering (QCE)","id":"Finzgar2022","issued":{"date-parts":[[2022]]},"page":"226-237","publisher":"IEEE","publisher-place":"Piscataway, NJ, USA","title":"QUARK: A framework for quantum computing application benchmarking","title-short":"QUARK","type":"paper-conference"}}],"isEdited":false,"manualOverride":{"citeprocText":"(Finžgar et al. 2022)","isManuallyOverridden":false,"manualOverrideText":""},"mendeley":{"formattedCitation":"(Finžgar et al. 2022)","plainTextFormattedCitation":"(Finžgar et al. 2022)","previouslyFormattedCitation":"(Finžgar et al. 2022)"},"properties":{"noteIndex":0},"schema":"https://github.com/citation-style-language/schema/raw/master/csl-citation.json"}</w:instrText>
+        <w:instrText xml:space="preserve">ADDIN CSL_CITATION {"citationID":"MENDELEY_CITATION_506","citationItems":[{"id":"ITEM-506","isTemporary":false,"itemData":{"URL":"https://arxiv.org/abs/2202.03028","author":[{"family":"Finžgar","given":"Jernej Rudi"},{"family":"Ross","given":"Philipp"},{"family":"Hölscher","given":"Leonhard"},{"family":"Klepsch","given":"Johannes"},{"family":"Luckow","given":"Andre"}],"container-title":"2022 IEEE international conference on quantum computing and engineering (QCE)","id":"Finzgar2022","issued":{"date-parts":[[2022]]},"page":"226-237","publisher":"IEEE","publisher-place":"Piscataway, NJ, USA","title":"QUARK: A framework for quantum computing application benchmarking","title-short":"QUARK","type":"paper-conference"}}],"isEdited":false,"manualOverride":{"citeprocText":"(Finžgar et al. 2022)","isManuallyOverridden":false,"manualOverrideText":""},"mendeley":{"formattedCitation":"(Finžgar et al. 2022)","plainTextFormattedCitation":"(Finžgar et al. 2022)","previouslyFormattedCitation":"(Finžgar et al. 2022)"},"properties":{"noteIndex":0},"schema":"https://github.com/citation-style-language/schema/raw/master/csl-citation.json"}</w:instrText>
       </w:r>
       <w:r>
         <w:fldChar w:fldCharType="separate"/>
@@ -18614,7 +18656,7 @@
         <w:fldChar w:fldCharType="begin"/>
       </w:r>
       <w:r>
-        <w:instrText xml:space="preserve">ADDIN CSL_CITATION {"citationID":"MENDELEY_CITATION_505","citationItems":[{"id":"ITEM-504","isTemporary":false,"itemData":{"DOI":"10.1038/nphys3272","author":[{"family":"Aaronson","given":"Scott"}],"container-title":"Nature Physics","id":"Aaronson2015","issue":"4","issued":{"date-parts":[[2015]]},"page":"291-293","title":"Read the fine print","type":"article-journal","volume":"11"}},{"id":"ITEM-505","isTemporary":false,"itemData":{"DOI":"10.1145/3313276.3316310","author":[{"family":"Tang","given":"Ewin"}],"container-title":"Proceedings of the 51st annual ACM SIGACT symposium on theory of computing (STOC 2019)","id":"Tang2019","issued":{"date-parts":[[2019]]},"page":"217-228","publisher":"ACM","publisher-place":"New York, NY, USA","title":"A quantum-inspired classical algorithm for recommendation systems","type":"paper-conference"}}],"isEdited":false,"manualOverride":{"citeprocText":"(Aaronson 2015; E. Tang 2019)","isManuallyOverridden":false,"manualOverrideText":""},"mendeley":{"formattedCitation":"(Aaronson 2015; E. Tang 2019)","plainTextFormattedCitation":"(Aaronson 2015; E. Tang 2019)","previouslyFormattedCitation":"(Aaronson 2015; E. Tang 2019)"},"properties":{"noteIndex":0},"schema":"https://github.com/citation-style-language/schema/raw/master/csl-citation.json"}</w:instrText>
+        <w:instrText xml:space="preserve">ADDIN CSL_CITATION {"citationID":"MENDELEY_CITATION_508","citationItems":[{"id":"ITEM-507","isTemporary":false,"itemData":{"DOI":"10.1038/nphys3272","author":[{"family":"Aaronson","given":"Scott"}],"container-title":"Nature Physics","id":"Aaronson2015","issue":"4","issued":{"date-parts":[[2015]]},"page":"291-293","title":"Read the fine print","type":"article-journal","volume":"11"}},{"id":"ITEM-508","isTemporary":false,"itemData":{"DOI":"10.1145/3313276.3316310","author":[{"family":"Tang","given":"Ewin"}],"container-title":"Proceedings of the 51st annual ACM SIGACT symposium on theory of computing (STOC 2019)","id":"Tang2019","issued":{"date-parts":[[2019]]},"page":"217-228","publisher":"ACM","publisher-place":"New York, NY, USA","title":"A quantum-inspired classical algorithm for recommendation systems","type":"paper-conference"}}],"isEdited":false,"manualOverride":{"citeprocText":"(Aaronson 2015; E. Tang 2019)","isManuallyOverridden":false,"manualOverrideText":""},"mendeley":{"formattedCitation":"(Aaronson 2015; E. Tang 2019)","plainTextFormattedCitation":"(Aaronson 2015; E. Tang 2019)","previouslyFormattedCitation":"(Aaronson 2015; E. Tang 2019)"},"properties":{"noteIndex":0},"schema":"https://github.com/citation-style-language/schema/raw/master/csl-citation.json"}</w:instrText>
       </w:r>
       <w:r>
         <w:fldChar w:fldCharType="separate"/>
@@ -18659,7 +18701,7 @@
         <w:fldChar w:fldCharType="begin"/>
       </w:r>
       <w:r>
-        <w:instrText xml:space="preserve">ADDIN CSL_CITATION {"citationID":"MENDELEY_CITATION_506","citationItems":[{"id":"ITEM-506","isTemporary":false,"itemData":{"DOI":"10.1103/PhysRevLett.127.100501","author":[{"family":"Córcoles","given":"Antonio D."},{"family":"Takita","given":"Maika"},{"family":"Inoue","given":"Ken"},{"family":"Lekuch","given":"Scott"},{"family":"Minev","given":"Zlatko K."},{"family":"Chow","given":"Jerry M."},{"family":"Gambetta","given":"Jay M."}],"container-title":"Physical Review Letters","id":"Corcoles2021","issue":"10","issued":{"date-parts":[[2021]]},"page":"100501","publisher":"American Physical Society","title":"Exploiting dynamic quantum circuits in a quantum algorithm with superconducting qubits","type":"article-journal","volume":"127"}}],"isEdited":false,"manualOverride":{"citeprocText":"(Córcoles et al. 2021)","isManuallyOverridden":false,"manualOverrideText":""},"mendeley":{"formattedCitation":"(Córcoles et al. 2021)","plainTextFormattedCitation":"(Córcoles et al. 2021)","previouslyFormattedCitation":"(Córcoles et al. 2021)"},"properties":{"noteIndex":0},"schema":"https://github.com/citation-style-language/schema/raw/master/csl-citation.json"}</w:instrText>
+        <w:instrText xml:space="preserve">ADDIN CSL_CITATION {"citationID":"MENDELEY_CITATION_509","citationItems":[{"id":"ITEM-509","isTemporary":false,"itemData":{"DOI":"10.1103/PhysRevLett.127.100501","author":[{"family":"Córcoles","given":"Antonio D."},{"family":"Takita","given":"Maika"},{"family":"Inoue","given":"Ken"},{"family":"Lekuch","given":"Scott"},{"family":"Minev","given":"Zlatko K."},{"family":"Chow","given":"Jerry M."},{"family":"Gambetta","given":"Jay M."}],"container-title":"Physical Review Letters","id":"Corcoles2021","issue":"10","issued":{"date-parts":[[2021]]},"page":"100501","publisher":"American Physical Society","title":"Exploiting dynamic quantum circuits in a quantum algorithm with superconducting qubits","type":"article-journal","volume":"127"}}],"isEdited":false,"manualOverride":{"citeprocText":"(Córcoles et al. 2021)","isManuallyOverridden":false,"manualOverrideText":""},"mendeley":{"formattedCitation":"(Córcoles et al. 2021)","plainTextFormattedCitation":"(Córcoles et al. 2021)","previouslyFormattedCitation":"(Córcoles et al. 2021)"},"properties":{"noteIndex":0},"schema":"https://github.com/citation-style-language/schema/raw/master/csl-citation.json"}</w:instrText>
       </w:r>
       <w:r>
         <w:fldChar w:fldCharType="separate"/>
@@ -18680,7 +18722,7 @@
         <w:fldChar w:fldCharType="begin"/>
       </w:r>
       <w:r>
-        <w:instrText xml:space="preserve">ADDIN CSL_CITATION {"citationID":"MENDELEY_CITATION_507","citationItems":[{"id":"ITEM-507","isTemporary":false,"itemData":{"DOI":"10.1145/3445814.3446758","author":[{"family":"Tang","given":"Wei"},{"family":"Tomesh","given":"Teague"},{"family":"Suchara","given":"Martin"},{"family":"Larson","given":"Jeffrey"},{"family":"Martonosi","given":"Margaret"}],"container-title":"Proceedings of the 26th ACM international conference on architectural support for programming languages and operating systems (ASPLOS ’21)","id":"Tang2021","issued":{"date-parts":[[2021]]},"page":"473-486","publisher":"Association for Computing Machinery","publisher-place":"New York, NY, USA","title":"CutQC: Using small quantum computers for large quantum circuit evaluations","title-short":"CutQC","type":"paper-conference"}}],"isEdited":false,"manualOverride":{"citeprocText":"(W. Tang et al. 2021)","isManuallyOverridden":false,"manualOverrideText":""},"mendeley":{"formattedCitation":"(W. Tang et al. 2021)","plainTextFormattedCitation":"(W. Tang et al. 2021)","previouslyFormattedCitation":"(W. Tang et al. 2021)"},"properties":{"noteIndex":0},"schema":"https://github.com/citation-style-language/schema/raw/master/csl-citation.json"}</w:instrText>
+        <w:instrText xml:space="preserve">ADDIN CSL_CITATION {"citationID":"MENDELEY_CITATION_510","citationItems":[{"id":"ITEM-510","isTemporary":false,"itemData":{"DOI":"10.1145/3445814.3446758","author":[{"family":"Tang","given":"Wei"},{"family":"Tomesh","given":"Teague"},{"family":"Suchara","given":"Martin"},{"family":"Larson","given":"Jeffrey"},{"family":"Martonosi","given":"Margaret"}],"container-title":"Proceedings of the 26th ACM international conference on architectural support for programming languages and operating systems (ASPLOS ’21)","id":"Tang2021","issued":{"date-parts":[[2021]]},"page":"473-486","publisher":"Association for Computing Machinery","publisher-place":"New York, NY, USA","title":"CutQC: Using small quantum computers for large quantum circuit evaluations","title-short":"CutQC","type":"paper-conference"}}],"isEdited":false,"manualOverride":{"citeprocText":"(W. Tang et al. 2021)","isManuallyOverridden":false,"manualOverrideText":""},"mendeley":{"formattedCitation":"(W. Tang et al. 2021)","plainTextFormattedCitation":"(W. Tang et al. 2021)","previouslyFormattedCitation":"(W. Tang et al. 2021)"},"properties":{"noteIndex":0},"schema":"https://github.com/citation-style-language/schema/raw/master/csl-citation.json"}</w:instrText>
       </w:r>
       <w:r>
         <w:fldChar w:fldCharType="separate"/>
@@ -18728,7 +18770,7 @@
         <w:fldChar w:fldCharType="begin"/>
       </w:r>
       <w:r>
-        <w:instrText xml:space="preserve">ADDIN CSL_CITATION {"citationID":"MENDELEY_CITATION_508","citationItems":[{"id":"ITEM-508","isTemporary":false,"itemData":{"DOI":"10.3389/fcomp.2019.00009","author":[{"family":"Ohzeki","given":"Masayuki"},{"family":"Miki","given":"Akira"},{"family":"Miyama","given":"Masamichi J."},{"family":"Terabe","given":"Masayoshi"}],"container-title":"Frontiers in Computer Science","id":"Ohzeki2019","issued":{"date-parts":[[2019]]},"page":"9","publisher":"Frontiers Media","title":"Control of automated guided vehicles without collision by quantum annealer and digital devices","type":"article-journal","volume":"1"}}],"isEdited":false,"manualOverride":{"citeprocText":"(Ohzeki et al. 2019)","isManuallyOverridden":false,"manualOverrideText":""},"mendeley":{"formattedCitation":"(Ohzeki et al. 2019)","plainTextFormattedCitation":"(Ohzeki et al. 2019)","previouslyFormattedCitation":"(Ohzeki et al. 2019)"},"properties":{"noteIndex":0},"schema":"https://github.com/citation-style-language/schema/raw/master/csl-citation.json"}</w:instrText>
+        <w:instrText xml:space="preserve">ADDIN CSL_CITATION {"citationID":"MENDELEY_CITATION_511","citationItems":[{"id":"ITEM-511","isTemporary":false,"itemData":{"DOI":"10.3389/fcomp.2019.00009","author":[{"family":"Ohzeki","given":"Masayuki"},{"family":"Miki","given":"Akira"},{"family":"Miyama","given":"Masamichi J."},{"family":"Terabe","given":"Masayoshi"}],"container-title":"Frontiers in Computer Science","id":"Ohzeki2019","issued":{"date-parts":[[2019]]},"page":"9","publisher":"Frontiers Media","title":"Control of automated guided vehicles without collision by quantum annealer and digital devices","type":"article-journal","volume":"1"}}],"isEdited":false,"manualOverride":{"citeprocText":"(Ohzeki et al. 2019)","isManuallyOverridden":false,"manualOverrideText":""},"mendeley":{"formattedCitation":"(Ohzeki et al. 2019)","plainTextFormattedCitation":"(Ohzeki et al. 2019)","previouslyFormattedCitation":"(Ohzeki et al. 2019)"},"properties":{"noteIndex":0},"schema":"https://github.com/citation-style-language/schema/raw/master/csl-citation.json"}</w:instrText>
       </w:r>
       <w:r>
         <w:fldChar w:fldCharType="separate"/>

</xml_diff>

<commit_message>
Survey 1: first-page funding footnote (CSUR requirement); funding section in Word
</commit_message>
<xml_diff>
--- a/github/k/Survey1_ACM_CSUR_Manuscript.docx
+++ b/github/k/Survey1_ACM_CSUR_Manuscript.docx
@@ -18844,17 +18844,35 @@
       </w:r>
     </w:p>
     <w:bookmarkEnd w:id="131"/>
-    <w:bookmarkStart w:id="471" w:name="bibliography"/>
+    <w:bookmarkStart w:id="132" w:name="funding"/>
     <w:p>
       <w:pPr>
         <w:pStyle w:val="Heading1"/>
       </w:pPr>
       <w:r>
+        <w:t xml:space="preserve">Funding</w:t>
+      </w:r>
+    </w:p>
+    <w:p>
+      <w:pPr>
+        <w:pStyle w:val="FirstParagraph"/>
+      </w:pPr>
+      <w:r>
+        <w:t xml:space="preserve">This research received no external funding; it was carried out as university work.</w:t>
+      </w:r>
+    </w:p>
+    <w:bookmarkEnd w:id="132"/>
+    <w:bookmarkStart w:id="472" w:name="bibliography"/>
+    <w:p>
+      <w:pPr>
+        <w:pStyle w:val="Heading1"/>
+      </w:pPr>
+      <w:r>
         <w:t xml:space="preserve">References</w:t>
       </w:r>
     </w:p>
-    <w:bookmarkStart w:id="470" w:name="refs"/>
-    <w:bookmarkStart w:id="133" w:name="ref-Aaronson2015"/>
+    <w:bookmarkStart w:id="471" w:name="refs"/>
+    <w:bookmarkStart w:id="134" w:name="ref-Aaronson2015"/>
     <w:p>
       <w:pPr>
         <w:pStyle w:val="Bibliography"/>
@@ -18896,7 +18914,7 @@
       <w:r>
         <w:t xml:space="preserve"> </w:t>
       </w:r>
-      <w:hyperlink r:id="rId132">
+      <w:hyperlink r:id="rId133">
         <w:r>
           <w:rPr>
             <w:rStyle w:val="Hyperlink"/>
@@ -18908,8 +18926,8 @@
         <w:t xml:space="preserve">.</w:t>
       </w:r>
     </w:p>
-    <w:bookmarkEnd w:id="133"/>
-    <w:bookmarkStart w:id="135" w:name="ref-Acuto2022"/>
+    <w:bookmarkEnd w:id="134"/>
+    <w:bookmarkStart w:id="136" w:name="ref-Acuto2022"/>
     <w:p>
       <w:pPr>
         <w:pStyle w:val="Bibliography"/>
@@ -18926,7 +18944,7 @@
       <w:r>
         <w:t xml:space="preserve"> </w:t>
       </w:r>
-      <w:hyperlink r:id="rId134">
+      <w:hyperlink r:id="rId135">
         <w:r>
           <w:rPr>
             <w:rStyle w:val="Hyperlink"/>
@@ -18938,8 +18956,8 @@
         <w:t xml:space="preserve">.</w:t>
       </w:r>
     </w:p>
-    <w:bookmarkEnd w:id="135"/>
-    <w:bookmarkStart w:id="137" w:name="ref-Altrabulsi2026"/>
+    <w:bookmarkEnd w:id="136"/>
+    <w:bookmarkStart w:id="138" w:name="ref-Altrabulsi2026"/>
     <w:p>
       <w:pPr>
         <w:pStyle w:val="Bibliography"/>
@@ -18962,7 +18980,7 @@
       <w:r>
         <w:t xml:space="preserve"> </w:t>
       </w:r>
-      <w:hyperlink r:id="rId136">
+      <w:hyperlink r:id="rId137">
         <w:r>
           <w:rPr>
             <w:rStyle w:val="Hyperlink"/>
@@ -18974,8 +18992,8 @@
         <w:t xml:space="preserve">.</w:t>
       </w:r>
     </w:p>
-    <w:bookmarkEnd w:id="137"/>
-    <w:bookmarkStart w:id="139" w:name="ref-Antero2025"/>
+    <w:bookmarkEnd w:id="138"/>
+    <w:bookmarkStart w:id="140" w:name="ref-Antero2025"/>
     <w:p>
       <w:pPr>
         <w:pStyle w:val="Bibliography"/>
@@ -19008,7 +19026,7 @@
       <w:r>
         <w:t xml:space="preserve"> </w:t>
       </w:r>
-      <w:hyperlink r:id="rId138">
+      <w:hyperlink r:id="rId139">
         <w:r>
           <w:rPr>
             <w:rStyle w:val="Hyperlink"/>
@@ -19020,8 +19038,8 @@
         <w:t xml:space="preserve">.</w:t>
       </w:r>
     </w:p>
-    <w:bookmarkEnd w:id="139"/>
-    <w:bookmarkStart w:id="141" w:name="ref-Arute2019"/>
+    <w:bookmarkEnd w:id="140"/>
+    <w:bookmarkStart w:id="142" w:name="ref-Arute2019"/>
     <w:p>
       <w:pPr>
         <w:pStyle w:val="Bibliography"/>
@@ -19054,7 +19072,7 @@
       <w:r>
         <w:t xml:space="preserve"> </w:t>
       </w:r>
-      <w:hyperlink r:id="rId140">
+      <w:hyperlink r:id="rId141">
         <w:r>
           <w:rPr>
             <w:rStyle w:val="Hyperlink"/>
@@ -19066,8 +19084,8 @@
         <w:t xml:space="preserve">.</w:t>
       </w:r>
     </w:p>
-    <w:bookmarkEnd w:id="141"/>
-    <w:bookmarkStart w:id="143" w:name="ref-AtchadeAdelomou2021"/>
+    <w:bookmarkEnd w:id="142"/>
+    <w:bookmarkStart w:id="144" w:name="ref-AtchadeAdelomou2021"/>
     <w:p>
       <w:pPr>
         <w:pStyle w:val="Bibliography"/>
@@ -19106,7 +19124,7 @@
       <w:r>
         <w:t xml:space="preserve"> </w:t>
       </w:r>
-      <w:hyperlink r:id="rId142">
+      <w:hyperlink r:id="rId143">
         <w:r>
           <w:rPr>
             <w:rStyle w:val="Hyperlink"/>
@@ -19118,8 +19136,8 @@
         <w:t xml:space="preserve">.</w:t>
       </w:r>
     </w:p>
-    <w:bookmarkEnd w:id="143"/>
-    <w:bookmarkStart w:id="145" w:name="ref-Babbush2018"/>
+    <w:bookmarkEnd w:id="144"/>
+    <w:bookmarkStart w:id="146" w:name="ref-Babbush2018"/>
     <w:p>
       <w:pPr>
         <w:pStyle w:val="Bibliography"/>
@@ -19164,7 +19182,7 @@
       <w:r>
         <w:t xml:space="preserve"> </w:t>
       </w:r>
-      <w:hyperlink r:id="rId144">
+      <w:hyperlink r:id="rId145">
         <w:r>
           <w:rPr>
             <w:rStyle w:val="Hyperlink"/>
@@ -19176,8 +19194,8 @@
         <w:t xml:space="preserve">.</w:t>
       </w:r>
     </w:p>
-    <w:bookmarkEnd w:id="145"/>
-    <w:bookmarkStart w:id="147" w:name="ref-Babbush2021"/>
+    <w:bookmarkEnd w:id="146"/>
+    <w:bookmarkStart w:id="148" w:name="ref-Babbush2021"/>
     <w:p>
       <w:pPr>
         <w:pStyle w:val="Bibliography"/>
@@ -19210,7 +19228,7 @@
       <w:r>
         <w:t xml:space="preserve"> </w:t>
       </w:r>
-      <w:hyperlink r:id="rId146">
+      <w:hyperlink r:id="rId147">
         <w:r>
           <w:rPr>
             <w:rStyle w:val="Hyperlink"/>
@@ -19222,8 +19240,8 @@
         <w:t xml:space="preserve">.</w:t>
       </w:r>
     </w:p>
-    <w:bookmarkEnd w:id="147"/>
-    <w:bookmarkStart w:id="149" w:name="ref-Bang2026"/>
+    <w:bookmarkEnd w:id="148"/>
+    <w:bookmarkStart w:id="150" w:name="ref-Bang2026"/>
     <w:p>
       <w:pPr>
         <w:pStyle w:val="Bibliography"/>
@@ -19252,7 +19270,7 @@
       <w:r>
         <w:t xml:space="preserve"> </w:t>
       </w:r>
-      <w:hyperlink r:id="rId148">
+      <w:hyperlink r:id="rId149">
         <w:r>
           <w:rPr>
             <w:rStyle w:val="Hyperlink"/>
@@ -19264,8 +19282,8 @@
         <w:t xml:space="preserve">.</w:t>
       </w:r>
     </w:p>
-    <w:bookmarkEnd w:id="149"/>
-    <w:bookmarkStart w:id="151" w:name="ref-Barkoutsos2020"/>
+    <w:bookmarkEnd w:id="150"/>
+    <w:bookmarkStart w:id="152" w:name="ref-Barkoutsos2020"/>
     <w:p>
       <w:pPr>
         <w:pStyle w:val="Bibliography"/>
@@ -19307,7 +19325,7 @@
       <w:r>
         <w:t xml:space="preserve"> </w:t>
       </w:r>
-      <w:hyperlink r:id="rId150">
+      <w:hyperlink r:id="rId151">
         <w:r>
           <w:rPr>
             <w:rStyle w:val="Hyperlink"/>
@@ -19319,8 +19337,8 @@
         <w:t xml:space="preserve">.</w:t>
       </w:r>
     </w:p>
-    <w:bookmarkEnd w:id="151"/>
-    <w:bookmarkStart w:id="153" w:name="ref-Begusic2024"/>
+    <w:bookmarkEnd w:id="152"/>
+    <w:bookmarkStart w:id="154" w:name="ref-Begusic2024"/>
     <w:p>
       <w:pPr>
         <w:pStyle w:val="Bibliography"/>
@@ -19353,7 +19371,7 @@
       <w:r>
         <w:t xml:space="preserve"> </w:t>
       </w:r>
-      <w:hyperlink r:id="rId152">
+      <w:hyperlink r:id="rId153">
         <w:r>
           <w:rPr>
             <w:rStyle w:val="Hyperlink"/>
@@ -19365,8 +19383,8 @@
         <w:t xml:space="preserve">.</w:t>
       </w:r>
     </w:p>
-    <w:bookmarkEnd w:id="153"/>
-    <w:bookmarkStart w:id="155" w:name="ref-Benioff1998"/>
+    <w:bookmarkEnd w:id="154"/>
+    <w:bookmarkStart w:id="156" w:name="ref-Benioff1998"/>
     <w:p>
       <w:pPr>
         <w:pStyle w:val="Bibliography"/>
@@ -19399,7 +19417,7 @@
       <w:r>
         <w:t xml:space="preserve"> </w:t>
       </w:r>
-      <w:hyperlink r:id="rId154">
+      <w:hyperlink r:id="rId155">
         <w:r>
           <w:rPr>
             <w:rStyle w:val="Hyperlink"/>
@@ -19411,8 +19429,8 @@
         <w:t xml:space="preserve">.</w:t>
       </w:r>
     </w:p>
-    <w:bookmarkEnd w:id="155"/>
-    <w:bookmarkStart w:id="157" w:name="ref-Benioff2002"/>
+    <w:bookmarkEnd w:id="156"/>
+    <w:bookmarkStart w:id="158" w:name="ref-Benioff2002"/>
     <w:p>
       <w:pPr>
         <w:pStyle w:val="Bibliography"/>
@@ -19448,7 +19466,7 @@
       <w:r>
         <w:t xml:space="preserve"> </w:t>
       </w:r>
-      <w:hyperlink r:id="rId156">
+      <w:hyperlink r:id="rId157">
         <w:r>
           <w:rPr>
             <w:rStyle w:val="Hyperlink"/>
@@ -19460,8 +19478,8 @@
         <w:t xml:space="preserve">.</w:t>
       </w:r>
     </w:p>
-    <w:bookmarkEnd w:id="157"/>
-    <w:bookmarkStart w:id="159" w:name="ref-Bharti2022"/>
+    <w:bookmarkEnd w:id="158"/>
+    <w:bookmarkStart w:id="160" w:name="ref-Bharti2022"/>
     <w:p>
       <w:pPr>
         <w:pStyle w:val="Bibliography"/>
@@ -19494,7 +19512,7 @@
       <w:r>
         <w:t xml:space="preserve"> </w:t>
       </w:r>
-      <w:hyperlink r:id="rId158">
+      <w:hyperlink r:id="rId159">
         <w:r>
           <w:rPr>
             <w:rStyle w:val="Hyperlink"/>
@@ -19506,8 +19524,8 @@
         <w:t xml:space="preserve">.</w:t>
       </w:r>
     </w:p>
-    <w:bookmarkEnd w:id="159"/>
-    <w:bookmarkStart w:id="161" w:name="ref-Biamonte2017"/>
+    <w:bookmarkEnd w:id="160"/>
+    <w:bookmarkStart w:id="162" w:name="ref-Biamonte2017"/>
     <w:p>
       <w:pPr>
         <w:pStyle w:val="Bibliography"/>
@@ -19540,7 +19558,7 @@
       <w:r>
         <w:t xml:space="preserve"> </w:t>
       </w:r>
-      <w:hyperlink r:id="rId160">
+      <w:hyperlink r:id="rId161">
         <w:r>
           <w:rPr>
             <w:rStyle w:val="Hyperlink"/>
@@ -19552,8 +19570,8 @@
         <w:t xml:space="preserve">.</w:t>
       </w:r>
     </w:p>
-    <w:bookmarkEnd w:id="161"/>
-    <w:bookmarkStart w:id="163" w:name="ref-Bluvstein2024"/>
+    <w:bookmarkEnd w:id="162"/>
+    <w:bookmarkStart w:id="164" w:name="ref-Bluvstein2024"/>
     <w:p>
       <w:pPr>
         <w:pStyle w:val="Bibliography"/>
@@ -19586,7 +19604,7 @@
       <w:r>
         <w:t xml:space="preserve"> </w:t>
       </w:r>
-      <w:hyperlink r:id="rId162">
+      <w:hyperlink r:id="rId163">
         <w:r>
           <w:rPr>
             <w:rStyle w:val="Hyperlink"/>
@@ -19598,8 +19616,8 @@
         <w:t xml:space="preserve">.</w:t>
       </w:r>
     </w:p>
-    <w:bookmarkEnd w:id="163"/>
-    <w:bookmarkStart w:id="165" w:name="ref-Bongs2019"/>
+    <w:bookmarkEnd w:id="164"/>
+    <w:bookmarkStart w:id="166" w:name="ref-Bongs2019"/>
     <w:p>
       <w:pPr>
         <w:pStyle w:val="Bibliography"/>
@@ -19632,7 +19650,7 @@
       <w:r>
         <w:t xml:space="preserve"> </w:t>
       </w:r>
-      <w:hyperlink r:id="rId164">
+      <w:hyperlink r:id="rId165">
         <w:r>
           <w:rPr>
             <w:rStyle w:val="Hyperlink"/>
@@ -19644,8 +19662,8 @@
         <w:t xml:space="preserve">.</w:t>
       </w:r>
     </w:p>
-    <w:bookmarkEnd w:id="165"/>
-    <w:bookmarkStart w:id="167" w:name="ref-Brassard2002"/>
+    <w:bookmarkEnd w:id="166"/>
+    <w:bookmarkStart w:id="168" w:name="ref-Brassard2002"/>
     <w:p>
       <w:pPr>
         <w:pStyle w:val="Bibliography"/>
@@ -19681,7 +19699,7 @@
       <w:r>
         <w:t xml:space="preserve"> </w:t>
       </w:r>
-      <w:hyperlink r:id="rId166">
+      <w:hyperlink r:id="rId167">
         <w:r>
           <w:rPr>
             <w:rStyle w:val="Hyperlink"/>
@@ -19693,8 +19711,8 @@
         <w:t xml:space="preserve">.</w:t>
       </w:r>
     </w:p>
-    <w:bookmarkEnd w:id="167"/>
-    <w:bookmarkStart w:id="169" w:name="ref-Bravyi2024"/>
+    <w:bookmarkEnd w:id="168"/>
+    <w:bookmarkStart w:id="170" w:name="ref-Bravyi2024"/>
     <w:p>
       <w:pPr>
         <w:pStyle w:val="Bibliography"/>
@@ -19727,7 +19745,7 @@
       <w:r>
         <w:t xml:space="preserve"> </w:t>
       </w:r>
-      <w:hyperlink r:id="rId168">
+      <w:hyperlink r:id="rId169">
         <w:r>
           <w:rPr>
             <w:rStyle w:val="Hyperlink"/>
@@ -19739,8 +19757,8 @@
         <w:t xml:space="preserve">.</w:t>
       </w:r>
     </w:p>
-    <w:bookmarkEnd w:id="169"/>
-    <w:bookmarkStart w:id="171" w:name="ref-Briegel2012"/>
+    <w:bookmarkEnd w:id="170"/>
+    <w:bookmarkStart w:id="172" w:name="ref-Briegel2012"/>
     <w:p>
       <w:pPr>
         <w:pStyle w:val="Bibliography"/>
@@ -19773,7 +19791,7 @@
       <w:r>
         <w:t xml:space="preserve"> </w:t>
       </w:r>
-      <w:hyperlink r:id="rId170">
+      <w:hyperlink r:id="rId171">
         <w:r>
           <w:rPr>
             <w:rStyle w:val="Hyperlink"/>
@@ -19785,8 +19803,8 @@
         <w:t xml:space="preserve">.</w:t>
       </w:r>
     </w:p>
-    <w:bookmarkEnd w:id="171"/>
-    <w:bookmarkStart w:id="173" w:name="ref-Busemeyer2012"/>
+    <w:bookmarkEnd w:id="172"/>
+    <w:bookmarkStart w:id="174" w:name="ref-Busemeyer2012"/>
     <w:p>
       <w:pPr>
         <w:pStyle w:val="Bibliography"/>
@@ -19810,7 +19828,7 @@
       <w:r>
         <w:t xml:space="preserve"> </w:t>
       </w:r>
-      <w:hyperlink r:id="rId172">
+      <w:hyperlink r:id="rId173">
         <w:r>
           <w:rPr>
             <w:rStyle w:val="Hyperlink"/>
@@ -19822,8 +19840,8 @@
         <w:t xml:space="preserve">.</w:t>
       </w:r>
     </w:p>
-    <w:bookmarkEnd w:id="173"/>
-    <w:bookmarkStart w:id="175" w:name="ref-Busemeyer1993"/>
+    <w:bookmarkEnd w:id="174"/>
+    <w:bookmarkStart w:id="176" w:name="ref-Busemeyer1993"/>
     <w:p>
       <w:pPr>
         <w:pStyle w:val="Bibliography"/>
@@ -19856,7 +19874,7 @@
       <w:r>
         <w:t xml:space="preserve"> </w:t>
       </w:r>
-      <w:hyperlink r:id="rId174">
+      <w:hyperlink r:id="rId175">
         <w:r>
           <w:rPr>
             <w:rStyle w:val="Hyperlink"/>
@@ -19868,8 +19886,8 @@
         <w:t xml:space="preserve">.</w:t>
       </w:r>
     </w:p>
-    <w:bookmarkEnd w:id="175"/>
-    <w:bookmarkStart w:id="177" w:name="ref-Cai2023"/>
+    <w:bookmarkEnd w:id="176"/>
+    <w:bookmarkStart w:id="178" w:name="ref-Cai2023"/>
     <w:p>
       <w:pPr>
         <w:pStyle w:val="Bibliography"/>
@@ -19902,7 +19920,7 @@
       <w:r>
         <w:t xml:space="preserve"> </w:t>
       </w:r>
-      <w:hyperlink r:id="rId176">
+      <w:hyperlink r:id="rId177">
         <w:r>
           <w:rPr>
             <w:rStyle w:val="Hyperlink"/>
@@ -19914,8 +19932,8 @@
         <w:t xml:space="preserve">.</w:t>
       </w:r>
     </w:p>
-    <w:bookmarkEnd w:id="177"/>
-    <w:bookmarkStart w:id="179" w:name="ref-Cerezo2021a"/>
+    <w:bookmarkEnd w:id="178"/>
+    <w:bookmarkStart w:id="180" w:name="ref-Cerezo2021a"/>
     <w:p>
       <w:pPr>
         <w:pStyle w:val="Bibliography"/>
@@ -19948,7 +19966,7 @@
       <w:r>
         <w:t xml:space="preserve"> </w:t>
       </w:r>
-      <w:hyperlink r:id="rId178">
+      <w:hyperlink r:id="rId179">
         <w:r>
           <w:rPr>
             <w:rStyle w:val="Hyperlink"/>
@@ -19960,8 +19978,8 @@
         <w:t xml:space="preserve">.</w:t>
       </w:r>
     </w:p>
-    <w:bookmarkEnd w:id="179"/>
-    <w:bookmarkStart w:id="181" w:name="ref-Cerezo2021b"/>
+    <w:bookmarkEnd w:id="180"/>
+    <w:bookmarkStart w:id="182" w:name="ref-Cerezo2021b"/>
     <w:p>
       <w:pPr>
         <w:pStyle w:val="Bibliography"/>
@@ -19994,7 +20012,7 @@
       <w:r>
         <w:t xml:space="preserve"> </w:t>
       </w:r>
-      <w:hyperlink r:id="rId180">
+      <w:hyperlink r:id="rId181">
         <w:r>
           <w:rPr>
             <w:rStyle w:val="Hyperlink"/>
@@ -20006,8 +20024,8 @@
         <w:t xml:space="preserve">.</w:t>
       </w:r>
     </w:p>
-    <w:bookmarkEnd w:id="181"/>
-    <w:bookmarkStart w:id="183" w:name="ref-Cheiney2018"/>
+    <w:bookmarkEnd w:id="182"/>
+    <w:bookmarkStart w:id="184" w:name="ref-Cheiney2018"/>
     <w:p>
       <w:pPr>
         <w:pStyle w:val="Bibliography"/>
@@ -20052,7 +20070,7 @@
       <w:r>
         <w:t xml:space="preserve"> </w:t>
       </w:r>
-      <w:hyperlink r:id="rId182">
+      <w:hyperlink r:id="rId183">
         <w:r>
           <w:rPr>
             <w:rStyle w:val="Hyperlink"/>
@@ -20064,8 +20082,8 @@
         <w:t xml:space="preserve">.</w:t>
       </w:r>
     </w:p>
-    <w:bookmarkEnd w:id="183"/>
-    <w:bookmarkStart w:id="185" w:name="ref-Chella2023"/>
+    <w:bookmarkEnd w:id="184"/>
+    <w:bookmarkStart w:id="186" w:name="ref-Chella2023"/>
     <w:p>
       <w:pPr>
         <w:pStyle w:val="Bibliography"/>
@@ -20098,7 +20116,7 @@
       <w:r>
         <w:t xml:space="preserve"> </w:t>
       </w:r>
-      <w:hyperlink r:id="rId184">
+      <w:hyperlink r:id="rId185">
         <w:r>
           <w:rPr>
             <w:rStyle w:val="Hyperlink"/>
@@ -20110,8 +20128,8 @@
         <w:t xml:space="preserve">.</w:t>
       </w:r>
     </w:p>
-    <w:bookmarkEnd w:id="185"/>
-    <w:bookmarkStart w:id="187" w:name="ref-Chella2022"/>
+    <w:bookmarkEnd w:id="186"/>
+    <w:bookmarkStart w:id="188" w:name="ref-Chella2022"/>
     <w:p>
       <w:pPr>
         <w:pStyle w:val="Bibliography"/>
@@ -20144,7 +20162,7 @@
       <w:r>
         <w:t xml:space="preserve"> </w:t>
       </w:r>
-      <w:hyperlink r:id="rId186">
+      <w:hyperlink r:id="rId187">
         <w:r>
           <w:rPr>
             <w:rStyle w:val="Hyperlink"/>
@@ -20156,8 +20174,8 @@
         <w:t xml:space="preserve">.</w:t>
       </w:r>
     </w:p>
-    <w:bookmarkEnd w:id="187"/>
-    <w:bookmarkStart w:id="189" w:name="ref-Chen2022"/>
+    <w:bookmarkEnd w:id="188"/>
+    <w:bookmarkStart w:id="190" w:name="ref-Chen2022"/>
     <w:p>
       <w:pPr>
         <w:pStyle w:val="Bibliography"/>
@@ -20190,7 +20208,7 @@
       <w:r>
         <w:t xml:space="preserve"> </w:t>
       </w:r>
-      <w:hyperlink r:id="rId188">
+      <w:hyperlink r:id="rId189">
         <w:r>
           <w:rPr>
             <w:rStyle w:val="Hyperlink"/>
@@ -20202,8 +20220,8 @@
         <w:t xml:space="preserve">.</w:t>
       </w:r>
     </w:p>
-    <w:bookmarkEnd w:id="189"/>
-    <w:bookmarkStart w:id="191" w:name="ref-Chen2020"/>
+    <w:bookmarkEnd w:id="190"/>
+    <w:bookmarkStart w:id="192" w:name="ref-Chen2020"/>
     <w:p>
       <w:pPr>
         <w:pStyle w:val="Bibliography"/>
@@ -20236,7 +20254,7 @@
       <w:r>
         <w:t xml:space="preserve"> </w:t>
       </w:r>
-      <w:hyperlink r:id="rId190">
+      <w:hyperlink r:id="rId191">
         <w:r>
           <w:rPr>
             <w:rStyle w:val="Hyperlink"/>
@@ -20248,8 +20266,8 @@
         <w:t xml:space="preserve">.</w:t>
       </w:r>
     </w:p>
-    <w:bookmarkEnd w:id="191"/>
-    <w:bookmarkStart w:id="193" w:name="ref-Chia2020"/>
+    <w:bookmarkEnd w:id="192"/>
+    <w:bookmarkStart w:id="194" w:name="ref-Chia2020"/>
     <w:p>
       <w:pPr>
         <w:pStyle w:val="Bibliography"/>
@@ -20306,7 +20324,7 @@
       <w:r>
         <w:t xml:space="preserve"> </w:t>
       </w:r>
-      <w:hyperlink r:id="rId192">
+      <w:hyperlink r:id="rId193">
         <w:r>
           <w:rPr>
             <w:rStyle w:val="Hyperlink"/>
@@ -20318,8 +20336,8 @@
         <w:t xml:space="preserve">.</w:t>
       </w:r>
     </w:p>
-    <w:bookmarkEnd w:id="193"/>
-    <w:bookmarkStart w:id="195" w:name="ref-Clark2019"/>
+    <w:bookmarkEnd w:id="194"/>
+    <w:bookmarkStart w:id="196" w:name="ref-Clark2019"/>
     <w:p>
       <w:pPr>
         <w:pStyle w:val="Bibliography"/>
@@ -20376,7 +20394,7 @@
       <w:r>
         <w:t xml:space="preserve"> </w:t>
       </w:r>
-      <w:hyperlink r:id="rId194">
+      <w:hyperlink r:id="rId195">
         <w:r>
           <w:rPr>
             <w:rStyle w:val="Hyperlink"/>
@@ -20388,8 +20406,8 @@
         <w:t xml:space="preserve">.</w:t>
       </w:r>
     </w:p>
-    <w:bookmarkEnd w:id="195"/>
-    <w:bookmarkStart w:id="197" w:name="ref-Conrad2025"/>
+    <w:bookmarkEnd w:id="196"/>
+    <w:bookmarkStart w:id="198" w:name="ref-Conrad2025"/>
     <w:p>
       <w:pPr>
         <w:pStyle w:val="Bibliography"/>
@@ -20406,7 +20424,7 @@
       <w:r>
         <w:t xml:space="preserve"> </w:t>
       </w:r>
-      <w:hyperlink r:id="rId196">
+      <w:hyperlink r:id="rId197">
         <w:r>
           <w:rPr>
             <w:rStyle w:val="Hyperlink"/>
@@ -20418,8 +20436,8 @@
         <w:t xml:space="preserve">.</w:t>
       </w:r>
     </w:p>
-    <w:bookmarkEnd w:id="197"/>
-    <w:bookmarkStart w:id="199" w:name="ref-Corcoles2021"/>
+    <w:bookmarkEnd w:id="198"/>
+    <w:bookmarkStart w:id="200" w:name="ref-Corcoles2021"/>
     <w:p>
       <w:pPr>
         <w:pStyle w:val="Bibliography"/>
@@ -20452,7 +20470,7 @@
       <w:r>
         <w:t xml:space="preserve"> </w:t>
       </w:r>
-      <w:hyperlink r:id="rId198">
+      <w:hyperlink r:id="rId199">
         <w:r>
           <w:rPr>
             <w:rStyle w:val="Hyperlink"/>
@@ -20464,8 +20482,8 @@
         <w:t xml:space="preserve">.</w:t>
       </w:r>
     </w:p>
-    <w:bookmarkEnd w:id="199"/>
-    <w:bookmarkStart w:id="201" w:name="ref-Daglarli2025"/>
+    <w:bookmarkEnd w:id="200"/>
+    <w:bookmarkStart w:id="202" w:name="ref-Daglarli2025"/>
     <w:p>
       <w:pPr>
         <w:pStyle w:val="Bibliography"/>
@@ -20498,7 +20516,7 @@
       <w:r>
         <w:t xml:space="preserve"> </w:t>
       </w:r>
-      <w:hyperlink r:id="rId200">
+      <w:hyperlink r:id="rId201">
         <w:r>
           <w:rPr>
             <w:rStyle w:val="Hyperlink"/>
@@ -20510,8 +20528,8 @@
         <w:t xml:space="preserve">.</w:t>
       </w:r>
     </w:p>
-    <w:bookmarkEnd w:id="201"/>
-    <w:bookmarkStart w:id="203" w:name="ref-DeCarolis2025"/>
+    <w:bookmarkEnd w:id="202"/>
+    <w:bookmarkStart w:id="204" w:name="ref-DeCarolis2025"/>
     <w:p>
       <w:pPr>
         <w:pStyle w:val="Bibliography"/>
@@ -20608,7 +20626,7 @@
       <w:r>
         <w:t xml:space="preserve"> </w:t>
       </w:r>
-      <w:hyperlink r:id="rId202">
+      <w:hyperlink r:id="rId203">
         <w:r>
           <w:rPr>
             <w:rStyle w:val="Hyperlink"/>
@@ -20620,8 +20638,8 @@
         <w:t xml:space="preserve">.</w:t>
       </w:r>
     </w:p>
-    <w:bookmarkEnd w:id="203"/>
-    <w:bookmarkStart w:id="205" w:name="ref-Degen2017"/>
+    <w:bookmarkEnd w:id="204"/>
+    <w:bookmarkStart w:id="206" w:name="ref-Degen2017"/>
     <w:p>
       <w:pPr>
         <w:pStyle w:val="Bibliography"/>
@@ -20654,7 +20672,7 @@
       <w:r>
         <w:t xml:space="preserve"> </w:t>
       </w:r>
-      <w:hyperlink r:id="rId204">
+      <w:hyperlink r:id="rId205">
         <w:r>
           <w:rPr>
             <w:rStyle w:val="Hyperlink"/>
@@ -20666,8 +20684,8 @@
         <w:t xml:space="preserve">.</w:t>
       </w:r>
     </w:p>
-    <w:bookmarkEnd w:id="205"/>
-    <w:bookmarkStart w:id="207" w:name="ref-Dellaert1999"/>
+    <w:bookmarkEnd w:id="206"/>
+    <w:bookmarkStart w:id="208" w:name="ref-Dellaert1999"/>
     <w:p>
       <w:pPr>
         <w:pStyle w:val="Bibliography"/>
@@ -20754,7 +20772,7 @@
       <w:r>
         <w:t xml:space="preserve"> </w:t>
       </w:r>
-      <w:hyperlink r:id="rId206">
+      <w:hyperlink r:id="rId207">
         <w:r>
           <w:rPr>
             <w:rStyle w:val="Hyperlink"/>
@@ -20766,8 +20784,8 @@
         <w:t xml:space="preserve">.</w:t>
       </w:r>
     </w:p>
-    <w:bookmarkEnd w:id="207"/>
-    <w:bookmarkStart w:id="209" w:name="ref-Deutsch1985"/>
+    <w:bookmarkEnd w:id="208"/>
+    <w:bookmarkStart w:id="210" w:name="ref-Deutsch1985"/>
     <w:p>
       <w:pPr>
         <w:pStyle w:val="Bibliography"/>
@@ -20812,7 +20830,7 @@
       <w:r>
         <w:t xml:space="preserve"> </w:t>
       </w:r>
-      <w:hyperlink r:id="rId208">
+      <w:hyperlink r:id="rId209">
         <w:r>
           <w:rPr>
             <w:rStyle w:val="Hyperlink"/>
@@ -20824,8 +20842,8 @@
         <w:t xml:space="preserve">.</w:t>
       </w:r>
     </w:p>
-    <w:bookmarkEnd w:id="209"/>
-    <w:bookmarkStart w:id="211" w:name="ref-Deutsch1992"/>
+    <w:bookmarkEnd w:id="210"/>
+    <w:bookmarkStart w:id="212" w:name="ref-Deutsch1992"/>
     <w:p>
       <w:pPr>
         <w:pStyle w:val="Bibliography"/>
@@ -20858,7 +20876,7 @@
       <w:r>
         <w:t xml:space="preserve"> </w:t>
       </w:r>
-      <w:hyperlink r:id="rId210">
+      <w:hyperlink r:id="rId211">
         <w:r>
           <w:rPr>
             <w:rStyle w:val="Hyperlink"/>
@@ -20870,8 +20888,8 @@
         <w:t xml:space="preserve">.</w:t>
       </w:r>
     </w:p>
-    <w:bookmarkEnd w:id="211"/>
-    <w:bookmarkStart w:id="213" w:name="ref-Dobler2025"/>
+    <w:bookmarkEnd w:id="212"/>
+    <w:bookmarkStart w:id="214" w:name="ref-Dobler2025"/>
     <w:p>
       <w:pPr>
         <w:pStyle w:val="Bibliography"/>
@@ -20888,7 +20906,7 @@
       <w:r>
         <w:t xml:space="preserve"> </w:t>
       </w:r>
-      <w:hyperlink r:id="rId212">
+      <w:hyperlink r:id="rId213">
         <w:r>
           <w:rPr>
             <w:rStyle w:val="Hyperlink"/>
@@ -20900,8 +20918,8 @@
         <w:t xml:space="preserve">.</w:t>
       </w:r>
     </w:p>
-    <w:bookmarkEnd w:id="213"/>
-    <w:bookmarkStart w:id="215" w:name="ref-Dong2012"/>
+    <w:bookmarkEnd w:id="214"/>
+    <w:bookmarkStart w:id="216" w:name="ref-Dong2012"/>
     <w:p>
       <w:pPr>
         <w:pStyle w:val="Bibliography"/>
@@ -20948,7 +20966,7 @@
       <w:r>
         <w:t xml:space="preserve"> </w:t>
       </w:r>
-      <w:hyperlink r:id="rId214">
+      <w:hyperlink r:id="rId215">
         <w:r>
           <w:rPr>
             <w:rStyle w:val="Hyperlink"/>
@@ -20960,8 +20978,8 @@
         <w:t xml:space="preserve">.</w:t>
       </w:r>
     </w:p>
-    <w:bookmarkEnd w:id="215"/>
-    <w:bookmarkStart w:id="217" w:name="ref-Dong2008"/>
+    <w:bookmarkEnd w:id="216"/>
+    <w:bookmarkStart w:id="218" w:name="ref-Dong2008"/>
     <w:p>
       <w:pPr>
         <w:pStyle w:val="Bibliography"/>
@@ -20994,7 +21012,7 @@
       <w:r>
         <w:t xml:space="preserve"> </w:t>
       </w:r>
-      <w:hyperlink r:id="rId216">
+      <w:hyperlink r:id="rId217">
         <w:r>
           <w:rPr>
             <w:rStyle w:val="Hyperlink"/>
@@ -21006,8 +21024,8 @@
         <w:t xml:space="preserve">.</w:t>
       </w:r>
     </w:p>
-    <w:bookmarkEnd w:id="217"/>
-    <w:bookmarkStart w:id="219" w:name="ref-Dong2006"/>
+    <w:bookmarkEnd w:id="218"/>
+    <w:bookmarkStart w:id="220" w:name="ref-Dong2006"/>
     <w:p>
       <w:pPr>
         <w:pStyle w:val="Bibliography"/>
@@ -21040,7 +21058,7 @@
       <w:r>
         <w:t xml:space="preserve"> </w:t>
       </w:r>
-      <w:hyperlink r:id="rId218">
+      <w:hyperlink r:id="rId219">
         <w:r>
           <w:rPr>
             <w:rStyle w:val="Hyperlink"/>
@@ -21052,8 +21070,8 @@
         <w:t xml:space="preserve">.</w:t>
       </w:r>
     </w:p>
-    <w:bookmarkEnd w:id="219"/>
-    <w:bookmarkStart w:id="221" w:name="ref-Dragan2025"/>
+    <w:bookmarkEnd w:id="220"/>
+    <w:bookmarkStart w:id="222" w:name="ref-Dragan2025"/>
     <w:p>
       <w:pPr>
         <w:pStyle w:val="Bibliography"/>
@@ -21116,7 +21134,7 @@
       <w:r>
         <w:t xml:space="preserve"> </w:t>
       </w:r>
-      <w:hyperlink r:id="rId220">
+      <w:hyperlink r:id="rId221">
         <w:r>
           <w:rPr>
             <w:rStyle w:val="Hyperlink"/>
@@ -21128,8 +21146,8 @@
         <w:t xml:space="preserve">.</w:t>
       </w:r>
     </w:p>
-    <w:bookmarkEnd w:id="221"/>
-    <w:bookmarkStart w:id="223" w:name="ref-Dunjko2018"/>
+    <w:bookmarkEnd w:id="222"/>
+    <w:bookmarkStart w:id="224" w:name="ref-Dunjko2018"/>
     <w:p>
       <w:pPr>
         <w:pStyle w:val="Bibliography"/>
@@ -21162,7 +21180,7 @@
       <w:r>
         <w:t xml:space="preserve"> </w:t>
       </w:r>
-      <w:hyperlink r:id="rId222">
+      <w:hyperlink r:id="rId223">
         <w:r>
           <w:rPr>
             <w:rStyle w:val="Hyperlink"/>
@@ -21174,8 +21192,8 @@
         <w:t xml:space="preserve">.</w:t>
       </w:r>
     </w:p>
-    <w:bookmarkEnd w:id="223"/>
-    <w:bookmarkStart w:id="225" w:name="ref-Endo2021"/>
+    <w:bookmarkEnd w:id="224"/>
+    <w:bookmarkStart w:id="226" w:name="ref-Endo2021"/>
     <w:p>
       <w:pPr>
         <w:pStyle w:val="Bibliography"/>
@@ -21208,7 +21226,7 @@
       <w:r>
         <w:t xml:space="preserve"> </w:t>
       </w:r>
-      <w:hyperlink r:id="rId224">
+      <w:hyperlink r:id="rId225">
         <w:r>
           <w:rPr>
             <w:rStyle w:val="Hyperlink"/>
@@ -21220,8 +21238,8 @@
         <w:t xml:space="preserve">.</w:t>
       </w:r>
     </w:p>
-    <w:bookmarkEnd w:id="225"/>
-    <w:bookmarkStart w:id="227" w:name="ref-Essalmi2026"/>
+    <w:bookmarkEnd w:id="226"/>
+    <w:bookmarkStart w:id="228" w:name="ref-Essalmi2026"/>
     <w:p>
       <w:pPr>
         <w:pStyle w:val="Bibliography"/>
@@ -21238,7 +21256,7 @@
       <w:r>
         <w:t xml:space="preserve"> </w:t>
       </w:r>
-      <w:hyperlink r:id="rId226">
+      <w:hyperlink r:id="rId227">
         <w:r>
           <w:rPr>
             <w:rStyle w:val="Hyperlink"/>
@@ -21250,8 +21268,8 @@
         <w:t xml:space="preserve">.</w:t>
       </w:r>
     </w:p>
-    <w:bookmarkEnd w:id="227"/>
-    <w:bookmarkStart w:id="229" w:name="ref-Farhi2014"/>
+    <w:bookmarkEnd w:id="228"/>
+    <w:bookmarkStart w:id="230" w:name="ref-Farhi2014"/>
     <w:p>
       <w:pPr>
         <w:pStyle w:val="Bibliography"/>
@@ -21268,7 +21286,7 @@
       <w:r>
         <w:t xml:space="preserve"> </w:t>
       </w:r>
-      <w:hyperlink r:id="rId228">
+      <w:hyperlink r:id="rId229">
         <w:r>
           <w:rPr>
             <w:rStyle w:val="Hyperlink"/>
@@ -21280,8 +21298,8 @@
         <w:t xml:space="preserve">.</w:t>
       </w:r>
     </w:p>
-    <w:bookmarkEnd w:id="229"/>
-    <w:bookmarkStart w:id="231" w:name="ref-Farhi2018"/>
+    <w:bookmarkEnd w:id="230"/>
+    <w:bookmarkStart w:id="232" w:name="ref-Farhi2018"/>
     <w:p>
       <w:pPr>
         <w:pStyle w:val="Bibliography"/>
@@ -21298,7 +21316,7 @@
       <w:r>
         <w:t xml:space="preserve"> </w:t>
       </w:r>
-      <w:hyperlink r:id="rId230">
+      <w:hyperlink r:id="rId231">
         <w:r>
           <w:rPr>
             <w:rStyle w:val="Hyperlink"/>
@@ -21310,8 +21328,8 @@
         <w:t xml:space="preserve">.</w:t>
       </w:r>
     </w:p>
-    <w:bookmarkEnd w:id="231"/>
-    <w:bookmarkStart w:id="233" w:name="ref-Fazilat2025a"/>
+    <w:bookmarkEnd w:id="232"/>
+    <w:bookmarkStart w:id="234" w:name="ref-Fazilat2025a"/>
     <w:p>
       <w:pPr>
         <w:pStyle w:val="Bibliography"/>
@@ -21361,7 +21379,7 @@
       <w:r>
         <w:t xml:space="preserve"> </w:t>
       </w:r>
-      <w:hyperlink r:id="rId232">
+      <w:hyperlink r:id="rId233">
         <w:r>
           <w:rPr>
             <w:rStyle w:val="Hyperlink"/>
@@ -21373,8 +21391,8 @@
         <w:t xml:space="preserve">.</w:t>
       </w:r>
     </w:p>
-    <w:bookmarkEnd w:id="233"/>
-    <w:bookmarkStart w:id="235" w:name="ref-Feynman1982"/>
+    <w:bookmarkEnd w:id="234"/>
+    <w:bookmarkStart w:id="236" w:name="ref-Feynman1982"/>
     <w:p>
       <w:pPr>
         <w:pStyle w:val="Bibliography"/>
@@ -21407,7 +21425,7 @@
       <w:r>
         <w:t xml:space="preserve"> </w:t>
       </w:r>
-      <w:hyperlink r:id="rId234">
+      <w:hyperlink r:id="rId235">
         <w:r>
           <w:rPr>
             <w:rStyle w:val="Hyperlink"/>
@@ -21419,8 +21437,8 @@
         <w:t xml:space="preserve">.</w:t>
       </w:r>
     </w:p>
-    <w:bookmarkEnd w:id="235"/>
-    <w:bookmarkStart w:id="237" w:name="ref-Finzgar2022"/>
+    <w:bookmarkEnd w:id="236"/>
+    <w:bookmarkStart w:id="238" w:name="ref-Finzgar2022"/>
     <w:p>
       <w:pPr>
         <w:pStyle w:val="Bibliography"/>
@@ -21476,7 +21494,7 @@
       <w:r>
         <w:t xml:space="preserve"> </w:t>
       </w:r>
-      <w:hyperlink r:id="rId236">
+      <w:hyperlink r:id="rId237">
         <w:r>
           <w:rPr>
             <w:rStyle w:val="Hyperlink"/>
@@ -21488,8 +21506,8 @@
         <w:t xml:space="preserve">.</w:t>
       </w:r>
     </w:p>
-    <w:bookmarkEnd w:id="237"/>
-    <w:bookmarkStart w:id="239" w:name="ref-Fowler2012"/>
+    <w:bookmarkEnd w:id="238"/>
+    <w:bookmarkStart w:id="240" w:name="ref-Fowler2012"/>
     <w:p>
       <w:pPr>
         <w:pStyle w:val="Bibliography"/>
@@ -21522,7 +21540,7 @@
       <w:r>
         <w:t xml:space="preserve"> </w:t>
       </w:r>
-      <w:hyperlink r:id="rId238">
+      <w:hyperlink r:id="rId239">
         <w:r>
           <w:rPr>
             <w:rStyle w:val="Hyperlink"/>
@@ -21534,8 +21552,8 @@
         <w:t xml:space="preserve">.</w:t>
       </w:r>
     </w:p>
-    <w:bookmarkEnd w:id="239"/>
-    <w:bookmarkStart w:id="241" w:name="ref-GarciaPineda2026"/>
+    <w:bookmarkEnd w:id="240"/>
+    <w:bookmarkStart w:id="242" w:name="ref-GarciaPineda2026"/>
     <w:p>
       <w:pPr>
         <w:pStyle w:val="Bibliography"/>
@@ -21568,7 +21586,7 @@
       <w:r>
         <w:t xml:space="preserve"> </w:t>
       </w:r>
-      <w:hyperlink r:id="rId240">
+      <w:hyperlink r:id="rId241">
         <w:r>
           <w:rPr>
             <w:rStyle w:val="Hyperlink"/>
@@ -21580,8 +21598,8 @@
         <w:t xml:space="preserve">.</w:t>
       </w:r>
     </w:p>
-    <w:bookmarkEnd w:id="241"/>
-    <w:bookmarkStart w:id="243" w:name="ref-Garrett2021"/>
+    <w:bookmarkEnd w:id="242"/>
+    <w:bookmarkStart w:id="244" w:name="ref-Garrett2021"/>
     <w:p>
       <w:pPr>
         <w:pStyle w:val="Bibliography"/>
@@ -21614,7 +21632,7 @@
       <w:r>
         <w:t xml:space="preserve"> </w:t>
       </w:r>
-      <w:hyperlink r:id="rId242">
+      <w:hyperlink r:id="rId243">
         <w:r>
           <w:rPr>
             <w:rStyle w:val="Hyperlink"/>
@@ -21626,8 +21644,8 @@
         <w:t xml:space="preserve">.</w:t>
       </w:r>
     </w:p>
-    <w:bookmarkEnd w:id="243"/>
-    <w:bookmarkStart w:id="245" w:name="ref-Geiger2011"/>
+    <w:bookmarkEnd w:id="244"/>
+    <w:bookmarkStart w:id="246" w:name="ref-Geiger2011"/>
     <w:p>
       <w:pPr>
         <w:pStyle w:val="Bibliography"/>
@@ -21660,7 +21678,7 @@
       <w:r>
         <w:t xml:space="preserve"> </w:t>
       </w:r>
-      <w:hyperlink r:id="rId244">
+      <w:hyperlink r:id="rId245">
         <w:r>
           <w:rPr>
             <w:rStyle w:val="Hyperlink"/>
@@ -21672,8 +21690,8 @@
         <w:t xml:space="preserve">.</w:t>
       </w:r>
     </w:p>
-    <w:bookmarkEnd w:id="245"/>
-    <w:bookmarkStart w:id="247" w:name="ref-Gerlach2025"/>
+    <w:bookmarkEnd w:id="246"/>
+    <w:bookmarkStart w:id="248" w:name="ref-Gerlach2025"/>
     <w:p>
       <w:pPr>
         <w:pStyle w:val="Bibliography"/>
@@ -21709,7 +21727,7 @@
       <w:r>
         <w:t xml:space="preserve"> </w:t>
       </w:r>
-      <w:hyperlink r:id="rId246">
+      <w:hyperlink r:id="rId247">
         <w:r>
           <w:rPr>
             <w:rStyle w:val="Hyperlink"/>
@@ -21721,8 +21739,8 @@
         <w:t xml:space="preserve">.</w:t>
       </w:r>
     </w:p>
-    <w:bookmarkEnd w:id="247"/>
-    <w:bookmarkStart w:id="249" w:name="ref-Gill2022"/>
+    <w:bookmarkEnd w:id="248"/>
+    <w:bookmarkStart w:id="250" w:name="ref-Gill2022"/>
     <w:p>
       <w:pPr>
         <w:pStyle w:val="Bibliography"/>
@@ -21755,7 +21773,7 @@
       <w:r>
         <w:t xml:space="preserve"> </w:t>
       </w:r>
-      <w:hyperlink r:id="rId248">
+      <w:hyperlink r:id="rId249">
         <w:r>
           <w:rPr>
             <w:rStyle w:val="Hyperlink"/>
@@ -21767,8 +21785,8 @@
         <w:t xml:space="preserve">.</w:t>
       </w:r>
     </w:p>
-    <w:bookmarkEnd w:id="249"/>
-    <w:bookmarkStart w:id="251" w:name="ref-Goncalves2018"/>
+    <w:bookmarkEnd w:id="250"/>
+    <w:bookmarkStart w:id="252" w:name="ref-Goncalves2018"/>
     <w:p>
       <w:pPr>
         <w:pStyle w:val="Bibliography"/>
@@ -21791,7 +21809,7 @@
       <w:r>
         <w:t xml:space="preserve"> </w:t>
       </w:r>
-      <w:hyperlink r:id="rId250">
+      <w:hyperlink r:id="rId251">
         <w:r>
           <w:rPr>
             <w:rStyle w:val="Hyperlink"/>
@@ -21803,8 +21821,8 @@
         <w:t xml:space="preserve">.</w:t>
       </w:r>
     </w:p>
-    <w:bookmarkEnd w:id="251"/>
-    <w:bookmarkStart w:id="253" w:name="ref-GonzalezVillasmil2026"/>
+    <w:bookmarkEnd w:id="252"/>
+    <w:bookmarkStart w:id="254" w:name="ref-GonzalezVillasmil2026"/>
     <w:p>
       <w:pPr>
         <w:pStyle w:val="Bibliography"/>
@@ -21821,7 +21839,7 @@
       <w:r>
         <w:t xml:space="preserve"> </w:t>
       </w:r>
-      <w:hyperlink r:id="rId252">
+      <w:hyperlink r:id="rId253">
         <w:r>
           <w:rPr>
             <w:rStyle w:val="Hyperlink"/>
@@ -21833,8 +21851,8 @@
         <w:t xml:space="preserve">.</w:t>
       </w:r>
     </w:p>
-    <w:bookmarkEnd w:id="253"/>
-    <w:bookmarkStart w:id="255" w:name="ref-GoogleQAI2025"/>
+    <w:bookmarkEnd w:id="254"/>
+    <w:bookmarkStart w:id="256" w:name="ref-GoogleQAI2025"/>
     <w:p>
       <w:pPr>
         <w:pStyle w:val="Bibliography"/>
@@ -21867,7 +21885,7 @@
       <w:r>
         <w:t xml:space="preserve"> </w:t>
       </w:r>
-      <w:hyperlink r:id="rId254">
+      <w:hyperlink r:id="rId255">
         <w:r>
           <w:rPr>
             <w:rStyle w:val="Hyperlink"/>
@@ -21879,8 +21897,8 @@
         <w:t xml:space="preserve">.</w:t>
       </w:r>
     </w:p>
-    <w:bookmarkEnd w:id="255"/>
-    <w:bookmarkStart w:id="257" w:name="ref-Goto2019"/>
+    <w:bookmarkEnd w:id="256"/>
+    <w:bookmarkStart w:id="258" w:name="ref-Goto2019"/>
     <w:p>
       <w:pPr>
         <w:pStyle w:val="Bibliography"/>
@@ -21925,7 +21943,7 @@
       <w:r>
         <w:t xml:space="preserve"> </w:t>
       </w:r>
-      <w:hyperlink r:id="rId256">
+      <w:hyperlink r:id="rId257">
         <w:r>
           <w:rPr>
             <w:rStyle w:val="Hyperlink"/>
@@ -21937,8 +21955,8 @@
         <w:t xml:space="preserve">.</w:t>
       </w:r>
     </w:p>
-    <w:bookmarkEnd w:id="257"/>
-    <w:bookmarkStart w:id="259" w:name="ref-Grover1996"/>
+    <w:bookmarkEnd w:id="258"/>
+    <w:bookmarkStart w:id="260" w:name="ref-Grover1996"/>
     <w:p>
       <w:pPr>
         <w:pStyle w:val="Bibliography"/>
@@ -22023,7 +22041,7 @@
       <w:r>
         <w:t xml:space="preserve"> </w:t>
       </w:r>
-      <w:hyperlink r:id="rId258">
+      <w:hyperlink r:id="rId259">
         <w:r>
           <w:rPr>
             <w:rStyle w:val="Hyperlink"/>
@@ -22035,8 +22053,8 @@
         <w:t xml:space="preserve">.</w:t>
       </w:r>
     </w:p>
-    <w:bookmarkEnd w:id="259"/>
-    <w:bookmarkStart w:id="261" w:name="ref-Guerreschi2019"/>
+    <w:bookmarkEnd w:id="260"/>
+    <w:bookmarkStart w:id="262" w:name="ref-Guerreschi2019"/>
     <w:p>
       <w:pPr>
         <w:pStyle w:val="Bibliography"/>
@@ -22090,7 +22108,7 @@
       <w:r>
         <w:t xml:space="preserve"> </w:t>
       </w:r>
-      <w:hyperlink r:id="rId260">
+      <w:hyperlink r:id="rId261">
         <w:r>
           <w:rPr>
             <w:rStyle w:val="Hyperlink"/>
@@ -22102,8 +22120,8 @@
         <w:t xml:space="preserve">.</w:t>
       </w:r>
     </w:p>
-    <w:bookmarkEnd w:id="261"/>
-    <w:bookmarkStart w:id="263" w:name="ref-Hadfield2019"/>
+    <w:bookmarkEnd w:id="262"/>
+    <w:bookmarkStart w:id="264" w:name="ref-Hadfield2019"/>
     <w:p>
       <w:pPr>
         <w:pStyle w:val="Bibliography"/>
@@ -22136,7 +22154,7 @@
       <w:r>
         <w:t xml:space="preserve"> </w:t>
       </w:r>
-      <w:hyperlink r:id="rId262">
+      <w:hyperlink r:id="rId263">
         <w:r>
           <w:rPr>
             <w:rStyle w:val="Hyperlink"/>
@@ -22148,8 +22166,8 @@
         <w:t xml:space="preserve">.</w:t>
       </w:r>
     </w:p>
-    <w:bookmarkEnd w:id="263"/>
-    <w:bookmarkStart w:id="265" w:name="ref-Haldorai2024"/>
+    <w:bookmarkEnd w:id="264"/>
+    <w:bookmarkStart w:id="266" w:name="ref-Haldorai2024"/>
     <w:p>
       <w:pPr>
         <w:pStyle w:val="Bibliography"/>
@@ -22182,7 +22200,7 @@
       <w:r>
         <w:t xml:space="preserve"> </w:t>
       </w:r>
-      <w:hyperlink r:id="rId264">
+      <w:hyperlink r:id="rId265">
         <w:r>
           <w:rPr>
             <w:rStyle w:val="Hyperlink"/>
@@ -22194,8 +22212,8 @@
         <w:t xml:space="preserve">.</w:t>
       </w:r>
     </w:p>
-    <w:bookmarkEnd w:id="265"/>
-    <w:bookmarkStart w:id="267" w:name="ref-Han2002"/>
+    <w:bookmarkEnd w:id="266"/>
+    <w:bookmarkStart w:id="268" w:name="ref-Han2002"/>
     <w:p>
       <w:pPr>
         <w:pStyle w:val="Bibliography"/>
@@ -22228,7 +22246,7 @@
       <w:r>
         <w:t xml:space="preserve"> </w:t>
       </w:r>
-      <w:hyperlink r:id="rId266">
+      <w:hyperlink r:id="rId267">
         <w:r>
           <w:rPr>
             <w:rStyle w:val="Hyperlink"/>
@@ -22240,8 +22258,8 @@
         <w:t xml:space="preserve">.</w:t>
       </w:r>
     </w:p>
-    <w:bookmarkEnd w:id="267"/>
-    <w:bookmarkStart w:id="269" w:name="ref-Harrow2009"/>
+    <w:bookmarkEnd w:id="268"/>
+    <w:bookmarkStart w:id="270" w:name="ref-Harrow2009"/>
     <w:p>
       <w:pPr>
         <w:pStyle w:val="Bibliography"/>
@@ -22274,7 +22292,7 @@
       <w:r>
         <w:t xml:space="preserve"> </w:t>
       </w:r>
-      <w:hyperlink r:id="rId268">
+      <w:hyperlink r:id="rId269">
         <w:r>
           <w:rPr>
             <w:rStyle w:val="Hyperlink"/>
@@ -22286,8 +22304,8 @@
         <w:t xml:space="preserve">.</w:t>
       </w:r>
     </w:p>
-    <w:bookmarkEnd w:id="269"/>
-    <w:bookmarkStart w:id="271" w:name="ref-Havlicek2019"/>
+    <w:bookmarkEnd w:id="270"/>
+    <w:bookmarkStart w:id="272" w:name="ref-Havlicek2019"/>
     <w:p>
       <w:pPr>
         <w:pStyle w:val="Bibliography"/>
@@ -22320,7 +22338,7 @@
       <w:r>
         <w:t xml:space="preserve"> </w:t>
       </w:r>
-      <w:hyperlink r:id="rId270">
+      <w:hyperlink r:id="rId271">
         <w:r>
           <w:rPr>
             <w:rStyle w:val="Hyperlink"/>
@@ -22332,8 +22350,8 @@
         <w:t xml:space="preserve">.</w:t>
       </w:r>
     </w:p>
-    <w:bookmarkEnd w:id="271"/>
-    <w:bookmarkStart w:id="273" w:name="ref-Henderson2020"/>
+    <w:bookmarkEnd w:id="272"/>
+    <w:bookmarkStart w:id="274" w:name="ref-Henderson2020"/>
     <w:p>
       <w:pPr>
         <w:pStyle w:val="Bibliography"/>
@@ -22366,7 +22384,7 @@
       <w:r>
         <w:t xml:space="preserve"> </w:t>
       </w:r>
-      <w:hyperlink r:id="rId272">
+      <w:hyperlink r:id="rId273">
         <w:r>
           <w:rPr>
             <w:rStyle w:val="Hyperlink"/>
@@ -22378,8 +22396,8 @@
         <w:t xml:space="preserve">.</w:t>
       </w:r>
     </w:p>
-    <w:bookmarkEnd w:id="273"/>
-    <w:bookmarkStart w:id="275" w:name="ref-Hohenfeld2024"/>
+    <w:bookmarkEnd w:id="274"/>
+    <w:bookmarkStart w:id="276" w:name="ref-Hohenfeld2024"/>
     <w:p>
       <w:pPr>
         <w:pStyle w:val="Bibliography"/>
@@ -22412,7 +22430,7 @@
       <w:r>
         <w:t xml:space="preserve"> </w:t>
       </w:r>
-      <w:hyperlink r:id="rId274">
+      <w:hyperlink r:id="rId275">
         <w:r>
           <w:rPr>
             <w:rStyle w:val="Hyperlink"/>
@@ -22424,8 +22442,8 @@
         <w:t xml:space="preserve">.</w:t>
       </w:r>
     </w:p>
-    <w:bookmarkEnd w:id="275"/>
-    <w:bookmarkStart w:id="277" w:name="ref-Humr2025"/>
+    <w:bookmarkEnd w:id="276"/>
+    <w:bookmarkStart w:id="278" w:name="ref-Humr2025"/>
     <w:p>
       <w:pPr>
         <w:pStyle w:val="Bibliography"/>
@@ -22467,7 +22485,7 @@
       <w:r>
         <w:t xml:space="preserve"> </w:t>
       </w:r>
-      <w:hyperlink r:id="rId276">
+      <w:hyperlink r:id="rId277">
         <w:r>
           <w:rPr>
             <w:rStyle w:val="Hyperlink"/>
@@ -22479,8 +22497,8 @@
         <w:t xml:space="preserve">.</w:t>
       </w:r>
     </w:p>
-    <w:bookmarkEnd w:id="277"/>
-    <w:bookmarkStart w:id="279" w:name="ref-Innan2025"/>
+    <w:bookmarkEnd w:id="278"/>
+    <w:bookmarkStart w:id="280" w:name="ref-Innan2025"/>
     <w:p>
       <w:pPr>
         <w:pStyle w:val="Bibliography"/>
@@ -22515,7 +22533,7 @@
       <w:r>
         <w:t xml:space="preserve"> </w:t>
       </w:r>
-      <w:hyperlink r:id="rId278">
+      <w:hyperlink r:id="rId279">
         <w:r>
           <w:rPr>
             <w:rStyle w:val="Hyperlink"/>
@@ -22527,8 +22545,8 @@
         <w:t xml:space="preserve">.</w:t>
       </w:r>
     </w:p>
-    <w:bookmarkEnd w:id="279"/>
-    <w:bookmarkStart w:id="281" w:name="ref-Jerbi2021"/>
+    <w:bookmarkEnd w:id="280"/>
+    <w:bookmarkStart w:id="282" w:name="ref-Jerbi2021"/>
     <w:p>
       <w:pPr>
         <w:pStyle w:val="Bibliography"/>
@@ -22564,7 +22582,7 @@
       <w:r>
         <w:t xml:space="preserve"> </w:t>
       </w:r>
-      <w:hyperlink r:id="rId280">
+      <w:hyperlink r:id="rId281">
         <w:r>
           <w:rPr>
             <w:rStyle w:val="Hyperlink"/>
@@ -22576,8 +22594,8 @@
         <w:t xml:space="preserve">.</w:t>
       </w:r>
     </w:p>
-    <w:bookmarkEnd w:id="281"/>
-    <w:bookmarkStart w:id="283" w:name="ref-Johnson2011"/>
+    <w:bookmarkEnd w:id="282"/>
+    <w:bookmarkStart w:id="284" w:name="ref-Johnson2011"/>
     <w:p>
       <w:pPr>
         <w:pStyle w:val="Bibliography"/>
@@ -22610,7 +22628,7 @@
       <w:r>
         <w:t xml:space="preserve"> </w:t>
       </w:r>
-      <w:hyperlink r:id="rId282">
+      <w:hyperlink r:id="rId283">
         <w:r>
           <w:rPr>
             <w:rStyle w:val="Hyperlink"/>
@@ -22622,8 +22640,8 @@
         <w:t xml:space="preserve">.</w:t>
       </w:r>
     </w:p>
-    <w:bookmarkEnd w:id="283"/>
-    <w:bookmarkStart w:id="285" w:name="ref-Kadowaki2025"/>
+    <w:bookmarkEnd w:id="284"/>
+    <w:bookmarkStart w:id="286" w:name="ref-Kadowaki2025"/>
     <w:p>
       <w:pPr>
         <w:pStyle w:val="Bibliography"/>
@@ -22649,7 +22667,7 @@
       <w:r>
         <w:t xml:space="preserve"> </w:t>
       </w:r>
-      <w:hyperlink r:id="rId284">
+      <w:hyperlink r:id="rId285">
         <w:r>
           <w:rPr>
             <w:rStyle w:val="Hyperlink"/>
@@ -22661,8 +22679,8 @@
         <w:t xml:space="preserve">.</w:t>
       </w:r>
     </w:p>
-    <w:bookmarkEnd w:id="285"/>
-    <w:bookmarkStart w:id="287" w:name="ref-Kaelbling1998"/>
+    <w:bookmarkEnd w:id="286"/>
+    <w:bookmarkStart w:id="288" w:name="ref-Kaelbling1998"/>
     <w:p>
       <w:pPr>
         <w:pStyle w:val="Bibliography"/>
@@ -22695,7 +22713,7 @@
       <w:r>
         <w:t xml:space="preserve"> </w:t>
       </w:r>
-      <w:hyperlink r:id="rId286">
+      <w:hyperlink r:id="rId287">
         <w:r>
           <w:rPr>
             <w:rStyle w:val="Hyperlink"/>
@@ -22707,8 +22725,8 @@
         <w:t xml:space="preserve">.</w:t>
       </w:r>
     </w:p>
-    <w:bookmarkEnd w:id="287"/>
-    <w:bookmarkStart w:id="289" w:name="ref-Kaldari2025"/>
+    <w:bookmarkEnd w:id="288"/>
+    <w:bookmarkStart w:id="290" w:name="ref-Kaldari2025"/>
     <w:p>
       <w:pPr>
         <w:pStyle w:val="Bibliography"/>
@@ -22725,7 +22743,7 @@
       <w:r>
         <w:t xml:space="preserve"> </w:t>
       </w:r>
-      <w:hyperlink r:id="rId288">
+      <w:hyperlink r:id="rId289">
         <w:r>
           <w:rPr>
             <w:rStyle w:val="Hyperlink"/>
@@ -22737,8 +22755,8 @@
         <w:t xml:space="preserve">.</w:t>
       </w:r>
     </w:p>
-    <w:bookmarkEnd w:id="289"/>
-    <w:bookmarkStart w:id="291" w:name="ref-Kandala2019"/>
+    <w:bookmarkEnd w:id="290"/>
+    <w:bookmarkStart w:id="292" w:name="ref-Kandala2019"/>
     <w:p>
       <w:pPr>
         <w:pStyle w:val="Bibliography"/>
@@ -22771,7 +22789,7 @@
       <w:r>
         <w:t xml:space="preserve"> </w:t>
       </w:r>
-      <w:hyperlink r:id="rId290">
+      <w:hyperlink r:id="rId291">
         <w:r>
           <w:rPr>
             <w:rStyle w:val="Hyperlink"/>
@@ -22783,8 +22801,8 @@
         <w:t xml:space="preserve">.</w:t>
       </w:r>
     </w:p>
-    <w:bookmarkEnd w:id="291"/>
-    <w:bookmarkStart w:id="293" w:name="ref-Karaman2011"/>
+    <w:bookmarkEnd w:id="292"/>
+    <w:bookmarkStart w:id="294" w:name="ref-Karaman2011"/>
     <w:p>
       <w:pPr>
         <w:pStyle w:val="Bibliography"/>
@@ -22817,7 +22835,7 @@
       <w:r>
         <w:t xml:space="preserve"> </w:t>
       </w:r>
-      <w:hyperlink r:id="rId292">
+      <w:hyperlink r:id="rId293">
         <w:r>
           <w:rPr>
             <w:rStyle w:val="Hyperlink"/>
@@ -22829,8 +22847,8 @@
         <w:t xml:space="preserve">.</w:t>
       </w:r>
     </w:p>
-    <w:bookmarkEnd w:id="293"/>
-    <w:bookmarkStart w:id="295" w:name="ref-Khoshnoud2020"/>
+    <w:bookmarkEnd w:id="294"/>
+    <w:bookmarkStart w:id="296" w:name="ref-Khoshnoud2020"/>
     <w:p>
       <w:pPr>
         <w:pStyle w:val="Bibliography"/>
@@ -22847,7 +22865,7 @@
       <w:r>
         <w:t xml:space="preserve"> </w:t>
       </w:r>
-      <w:hyperlink r:id="rId294">
+      <w:hyperlink r:id="rId295">
         <w:r>
           <w:rPr>
             <w:rStyle w:val="Hyperlink"/>
@@ -22859,8 +22877,8 @@
         <w:t xml:space="preserve">.</w:t>
       </w:r>
     </w:p>
-    <w:bookmarkEnd w:id="295"/>
-    <w:bookmarkStart w:id="297" w:name="ref-Kim2022"/>
+    <w:bookmarkEnd w:id="296"/>
+    <w:bookmarkStart w:id="298" w:name="ref-Kim2022"/>
     <w:p>
       <w:pPr>
         <w:pStyle w:val="Bibliography"/>
@@ -22902,7 +22920,7 @@
       <w:r>
         <w:t xml:space="preserve"> </w:t>
       </w:r>
-      <w:hyperlink r:id="rId296">
+      <w:hyperlink r:id="rId297">
         <w:r>
           <w:rPr>
             <w:rStyle w:val="Hyperlink"/>
@@ -22914,8 +22932,8 @@
         <w:t xml:space="preserve">.</w:t>
       </w:r>
     </w:p>
-    <w:bookmarkEnd w:id="297"/>
-    <w:bookmarkStart w:id="299" w:name="ref-KimY2023"/>
+    <w:bookmarkEnd w:id="298"/>
+    <w:bookmarkStart w:id="300" w:name="ref-KimY2023"/>
     <w:p>
       <w:pPr>
         <w:pStyle w:val="Bibliography"/>
@@ -22948,7 +22966,7 @@
       <w:r>
         <w:t xml:space="preserve"> </w:t>
       </w:r>
-      <w:hyperlink r:id="rId298">
+      <w:hyperlink r:id="rId299">
         <w:r>
           <w:rPr>
             <w:rStyle w:val="Hyperlink"/>
@@ -22960,8 +22978,8 @@
         <w:t xml:space="preserve">.</w:t>
       </w:r>
     </w:p>
-    <w:bookmarkEnd w:id="299"/>
-    <w:bookmarkStart w:id="301" w:name="ref-King2025"/>
+    <w:bookmarkEnd w:id="300"/>
+    <w:bookmarkStart w:id="302" w:name="ref-King2025"/>
     <w:p>
       <w:pPr>
         <w:pStyle w:val="Bibliography"/>
@@ -22994,7 +23012,7 @@
       <w:r>
         <w:t xml:space="preserve"> </w:t>
       </w:r>
-      <w:hyperlink r:id="rId300">
+      <w:hyperlink r:id="rId301">
         <w:r>
           <w:rPr>
             <w:rStyle w:val="Hyperlink"/>
@@ -23006,8 +23024,8 @@
         <w:t xml:space="preserve">.</w:t>
       </w:r>
     </w:p>
-    <w:bookmarkEnd w:id="301"/>
-    <w:bookmarkStart w:id="302" w:name="ref-Kitchenham2007"/>
+    <w:bookmarkEnd w:id="302"/>
+    <w:bookmarkStart w:id="303" w:name="ref-Kitchenham2007"/>
     <w:p>
       <w:pPr>
         <w:pStyle w:val="Bibliography"/>
@@ -23028,8 +23046,8 @@
         <w:t xml:space="preserve">EBSE Technical Report EBSE-2007-01. Keele University; Durham University.</w:t>
       </w:r>
     </w:p>
-    <w:bookmarkEnd w:id="302"/>
-    <w:bookmarkStart w:id="304" w:name="ref-Kjaergaard2020"/>
+    <w:bookmarkEnd w:id="303"/>
+    <w:bookmarkStart w:id="305" w:name="ref-Kjaergaard2020"/>
     <w:p>
       <w:pPr>
         <w:pStyle w:val="Bibliography"/>
@@ -23062,7 +23080,7 @@
       <w:r>
         <w:t xml:space="preserve"> </w:t>
       </w:r>
-      <w:hyperlink r:id="rId303">
+      <w:hyperlink r:id="rId304">
         <w:r>
           <w:rPr>
             <w:rStyle w:val="Hyperlink"/>
@@ -23074,8 +23092,8 @@
         <w:t xml:space="preserve">.</w:t>
       </w:r>
     </w:p>
-    <w:bookmarkEnd w:id="304"/>
-    <w:bookmarkStart w:id="306" w:name="ref-Kober2013"/>
+    <w:bookmarkEnd w:id="305"/>
+    <w:bookmarkStart w:id="307" w:name="ref-Kober2013"/>
     <w:p>
       <w:pPr>
         <w:pStyle w:val="Bibliography"/>
@@ -23108,7 +23126,7 @@
       <w:r>
         <w:t xml:space="preserve"> </w:t>
       </w:r>
-      <w:hyperlink r:id="rId305">
+      <w:hyperlink r:id="rId306">
         <w:r>
           <w:rPr>
             <w:rStyle w:val="Hyperlink"/>
@@ -23120,8 +23138,8 @@
         <w:t xml:space="preserve">.</w:t>
       </w:r>
     </w:p>
-    <w:bookmarkEnd w:id="306"/>
-    <w:bookmarkStart w:id="308" w:name="ref-Kruse2024"/>
+    <w:bookmarkEnd w:id="307"/>
+    <w:bookmarkStart w:id="309" w:name="ref-Kruse2024"/>
     <w:p>
       <w:pPr>
         <w:pStyle w:val="Bibliography"/>
@@ -23177,7 +23195,7 @@
       <w:r>
         <w:t xml:space="preserve"> </w:t>
       </w:r>
-      <w:hyperlink r:id="rId307">
+      <w:hyperlink r:id="rId308">
         <w:r>
           <w:rPr>
             <w:rStyle w:val="Hyperlink"/>
@@ -23189,8 +23207,8 @@
         <w:t xml:space="preserve">.</w:t>
       </w:r>
     </w:p>
-    <w:bookmarkEnd w:id="308"/>
-    <w:bookmarkStart w:id="310" w:name="ref-Kurniawati2022"/>
+    <w:bookmarkEnd w:id="309"/>
+    <w:bookmarkStart w:id="311" w:name="ref-Kurniawati2022"/>
     <w:p>
       <w:pPr>
         <w:pStyle w:val="Bibliography"/>
@@ -23235,7 +23253,7 @@
       <w:r>
         <w:t xml:space="preserve"> </w:t>
       </w:r>
-      <w:hyperlink r:id="rId309">
+      <w:hyperlink r:id="rId310">
         <w:r>
           <w:rPr>
             <w:rStyle w:val="Hyperlink"/>
@@ -23247,8 +23265,8 @@
         <w:t xml:space="preserve">.</w:t>
       </w:r>
     </w:p>
-    <w:bookmarkEnd w:id="310"/>
-    <w:bookmarkStart w:id="312" w:name="ref-Larocca2025"/>
+    <w:bookmarkEnd w:id="311"/>
+    <w:bookmarkStart w:id="313" w:name="ref-Larocca2025"/>
     <w:p>
       <w:pPr>
         <w:pStyle w:val="Bibliography"/>
@@ -23281,7 +23299,7 @@
       <w:r>
         <w:t xml:space="preserve"> </w:t>
       </w:r>
-      <w:hyperlink r:id="rId311">
+      <w:hyperlink r:id="rId312">
         <w:r>
           <w:rPr>
             <w:rStyle w:val="Hyperlink"/>
@@ -23293,8 +23311,8 @@
         <w:t xml:space="preserve">.</w:t>
       </w:r>
     </w:p>
-    <w:bookmarkEnd w:id="312"/>
-    <w:bookmarkStart w:id="314" w:name="ref-Lathrop2023"/>
+    <w:bookmarkEnd w:id="313"/>
+    <w:bookmarkStart w:id="315" w:name="ref-Lathrop2023"/>
     <w:p>
       <w:pPr>
         <w:pStyle w:val="Bibliography"/>
@@ -23327,7 +23345,7 @@
       <w:r>
         <w:t xml:space="preserve"> </w:t>
       </w:r>
-      <w:hyperlink r:id="rId313">
+      <w:hyperlink r:id="rId314">
         <w:r>
           <w:rPr>
             <w:rStyle w:val="Hyperlink"/>
@@ -23339,8 +23357,8 @@
         <w:t xml:space="preserve">.</w:t>
       </w:r>
     </w:p>
-    <w:bookmarkEnd w:id="314"/>
-    <w:bookmarkStart w:id="315" w:name="ref-LaValle1998"/>
+    <w:bookmarkEnd w:id="315"/>
+    <w:bookmarkStart w:id="316" w:name="ref-LaValle1998"/>
     <w:p>
       <w:pPr>
         <w:pStyle w:val="Bibliography"/>
@@ -23361,8 +23379,8 @@
         <w:t xml:space="preserve">TR 98-11. Ames, IA, USA: Computer Science Department, Iowa State University.</w:t>
       </w:r>
     </w:p>
-    <w:bookmarkEnd w:id="315"/>
-    <w:bookmarkStart w:id="317" w:name="ref-Lawless2023"/>
+    <w:bookmarkEnd w:id="316"/>
+    <w:bookmarkStart w:id="318" w:name="ref-Lawless2023"/>
     <w:p>
       <w:pPr>
         <w:pStyle w:val="Bibliography"/>
@@ -23395,7 +23413,7 @@
       <w:r>
         <w:t xml:space="preserve"> </w:t>
       </w:r>
-      <w:hyperlink r:id="rId316">
+      <w:hyperlink r:id="rId317">
         <w:r>
           <w:rPr>
             <w:rStyle w:val="Hyperlink"/>
@@ -23407,8 +23425,8 @@
         <w:t xml:space="preserve">.</w:t>
       </w:r>
     </w:p>
-    <w:bookmarkEnd w:id="317"/>
-    <w:bookmarkStart w:id="319" w:name="ref-Leib2023"/>
+    <w:bookmarkEnd w:id="318"/>
+    <w:bookmarkStart w:id="320" w:name="ref-Leib2023"/>
     <w:p>
       <w:pPr>
         <w:pStyle w:val="Bibliography"/>
@@ -23441,7 +23459,7 @@
       <w:r>
         <w:t xml:space="preserve"> </w:t>
       </w:r>
-      <w:hyperlink r:id="rId318">
+      <w:hyperlink r:id="rId319">
         <w:r>
           <w:rPr>
             <w:rStyle w:val="Hyperlink"/>
@@ -23453,8 +23471,8 @@
         <w:t xml:space="preserve">.</w:t>
       </w:r>
     </w:p>
-    <w:bookmarkEnd w:id="319"/>
-    <w:bookmarkStart w:id="321" w:name="ref-Liu2021"/>
+    <w:bookmarkEnd w:id="320"/>
+    <w:bookmarkStart w:id="322" w:name="ref-Liu2021"/>
     <w:p>
       <w:pPr>
         <w:pStyle w:val="Bibliography"/>
@@ -23487,7 +23505,7 @@
       <w:r>
         <w:t xml:space="preserve"> </w:t>
       </w:r>
-      <w:hyperlink r:id="rId320">
+      <w:hyperlink r:id="rId321">
         <w:r>
           <w:rPr>
             <w:rStyle w:val="Hyperlink"/>
@@ -23499,8 +23517,8 @@
         <w:t xml:space="preserve">.</w:t>
       </w:r>
     </w:p>
-    <w:bookmarkEnd w:id="321"/>
-    <w:bookmarkStart w:id="323" w:name="ref-Lloyd2014"/>
+    <w:bookmarkEnd w:id="322"/>
+    <w:bookmarkStart w:id="324" w:name="ref-Lloyd2014"/>
     <w:p>
       <w:pPr>
         <w:pStyle w:val="Bibliography"/>
@@ -23517,7 +23535,7 @@
       <w:r>
         <w:t xml:space="preserve"> </w:t>
       </w:r>
-      <w:hyperlink r:id="rId322">
+      <w:hyperlink r:id="rId323">
         <w:r>
           <w:rPr>
             <w:rStyle w:val="Hyperlink"/>
@@ -23529,8 +23547,8 @@
         <w:t xml:space="preserve">.</w:t>
       </w:r>
     </w:p>
-    <w:bookmarkEnd w:id="323"/>
-    <w:bookmarkStart w:id="325" w:name="ref-Lokossou2025"/>
+    <w:bookmarkEnd w:id="324"/>
+    <w:bookmarkStart w:id="326" w:name="ref-Lokossou2025"/>
     <w:p>
       <w:pPr>
         <w:pStyle w:val="Bibliography"/>
@@ -23547,7 +23565,7 @@
       <w:r>
         <w:t xml:space="preserve"> </w:t>
       </w:r>
-      <w:hyperlink r:id="rId324">
+      <w:hyperlink r:id="rId325">
         <w:r>
           <w:rPr>
             <w:rStyle w:val="Hyperlink"/>
@@ -23559,8 +23577,8 @@
         <w:t xml:space="preserve">.</w:t>
       </w:r>
     </w:p>
-    <w:bookmarkEnd w:id="325"/>
-    <w:bookmarkStart w:id="327" w:name="ref-Lucas2014"/>
+    <w:bookmarkEnd w:id="326"/>
+    <w:bookmarkStart w:id="328" w:name="ref-Lucas2014"/>
     <w:p>
       <w:pPr>
         <w:pStyle w:val="Bibliography"/>
@@ -23614,7 +23632,7 @@
       <w:r>
         <w:t xml:space="preserve"> </w:t>
       </w:r>
-      <w:hyperlink r:id="rId326">
+      <w:hyperlink r:id="rId327">
         <w:r>
           <w:rPr>
             <w:rStyle w:val="Hyperlink"/>
@@ -23626,8 +23644,8 @@
         <w:t xml:space="preserve">.</w:t>
       </w:r>
     </w:p>
-    <w:bookmarkEnd w:id="327"/>
-    <w:bookmarkStart w:id="329" w:name="ref-Mannone2022"/>
+    <w:bookmarkEnd w:id="328"/>
+    <w:bookmarkStart w:id="330" w:name="ref-Mannone2022"/>
     <w:p>
       <w:pPr>
         <w:pStyle w:val="Bibliography"/>
@@ -23660,7 +23678,7 @@
       <w:r>
         <w:t xml:space="preserve"> </w:t>
       </w:r>
-      <w:hyperlink r:id="rId328">
+      <w:hyperlink r:id="rId329">
         <w:r>
           <w:rPr>
             <w:rStyle w:val="Hyperlink"/>
@@ -23672,8 +23690,8 @@
         <w:t xml:space="preserve">.</w:t>
       </w:r>
     </w:p>
-    <w:bookmarkEnd w:id="329"/>
-    <w:bookmarkStart w:id="331" w:name="ref-Mannone2023"/>
+    <w:bookmarkEnd w:id="330"/>
+    <w:bookmarkStart w:id="332" w:name="ref-Mannone2023"/>
     <w:p>
       <w:pPr>
         <w:pStyle w:val="Bibliography"/>
@@ -23706,7 +23724,7 @@
       <w:r>
         <w:t xml:space="preserve"> </w:t>
       </w:r>
-      <w:hyperlink r:id="rId330">
+      <w:hyperlink r:id="rId331">
         <w:r>
           <w:rPr>
             <w:rStyle w:val="Hyperlink"/>
@@ -23718,8 +23736,8 @@
         <w:t xml:space="preserve">.</w:t>
       </w:r>
     </w:p>
-    <w:bookmarkEnd w:id="331"/>
-    <w:bookmarkStart w:id="333" w:name="ref-Mannone2025"/>
+    <w:bookmarkEnd w:id="332"/>
+    <w:bookmarkStart w:id="334" w:name="ref-Mannone2025"/>
     <w:p>
       <w:pPr>
         <w:pStyle w:val="Bibliography"/>
@@ -23752,7 +23770,7 @@
       <w:r>
         <w:t xml:space="preserve"> </w:t>
       </w:r>
-      <w:hyperlink r:id="rId332">
+      <w:hyperlink r:id="rId333">
         <w:r>
           <w:rPr>
             <w:rStyle w:val="Hyperlink"/>
@@ -23764,8 +23782,8 @@
         <w:t xml:space="preserve">.</w:t>
       </w:r>
     </w:p>
-    <w:bookmarkEnd w:id="333"/>
-    <w:bookmarkStart w:id="335" w:name="ref-McClean2018"/>
+    <w:bookmarkEnd w:id="334"/>
+    <w:bookmarkStart w:id="336" w:name="ref-McClean2018"/>
     <w:p>
       <w:pPr>
         <w:pStyle w:val="Bibliography"/>
@@ -23798,7 +23816,7 @@
       <w:r>
         <w:t xml:space="preserve"> </w:t>
       </w:r>
-      <w:hyperlink r:id="rId334">
+      <w:hyperlink r:id="rId335">
         <w:r>
           <w:rPr>
             <w:rStyle w:val="Hyperlink"/>
@@ -23810,8 +23828,8 @@
         <w:t xml:space="preserve">.</w:t>
       </w:r>
     </w:p>
-    <w:bookmarkEnd w:id="335"/>
-    <w:bookmarkStart w:id="337" w:name="ref-McClean2016"/>
+    <w:bookmarkEnd w:id="336"/>
+    <w:bookmarkStart w:id="338" w:name="ref-McClean2016"/>
     <w:p>
       <w:pPr>
         <w:pStyle w:val="Bibliography"/>
@@ -23844,7 +23862,7 @@
       <w:r>
         <w:t xml:space="preserve"> </w:t>
       </w:r>
-      <w:hyperlink r:id="rId336">
+      <w:hyperlink r:id="rId337">
         <w:r>
           <w:rPr>
             <w:rStyle w:val="Hyperlink"/>
@@ -23856,8 +23874,8 @@
         <w:t xml:space="preserve">.</w:t>
       </w:r>
     </w:p>
-    <w:bookmarkEnd w:id="337"/>
-    <w:bookmarkStart w:id="339" w:name="ref-Meyer2022"/>
+    <w:bookmarkEnd w:id="338"/>
+    <w:bookmarkStart w:id="340" w:name="ref-Meyer2022"/>
     <w:p>
       <w:pPr>
         <w:pStyle w:val="Bibliography"/>
@@ -23874,7 +23892,7 @@
       <w:r>
         <w:t xml:space="preserve"> </w:t>
       </w:r>
-      <w:hyperlink r:id="rId338">
+      <w:hyperlink r:id="rId339">
         <w:r>
           <w:rPr>
             <w:rStyle w:val="Hyperlink"/>
@@ -23886,8 +23904,8 @@
         <w:t xml:space="preserve">.</w:t>
       </w:r>
     </w:p>
-    <w:bookmarkEnd w:id="339"/>
-    <w:bookmarkStart w:id="341" w:name="ref-Mitarai2018"/>
+    <w:bookmarkEnd w:id="340"/>
+    <w:bookmarkStart w:id="342" w:name="ref-Mitarai2018"/>
     <w:p>
       <w:pPr>
         <w:pStyle w:val="Bibliography"/>
@@ -23920,7 +23938,7 @@
       <w:r>
         <w:t xml:space="preserve"> </w:t>
       </w:r>
-      <w:hyperlink r:id="rId340">
+      <w:hyperlink r:id="rId341">
         <w:r>
           <w:rPr>
             <w:rStyle w:val="Hyperlink"/>
@@ -23932,8 +23950,8 @@
         <w:t xml:space="preserve">.</w:t>
       </w:r>
     </w:p>
-    <w:bookmarkEnd w:id="341"/>
-    <w:bookmarkStart w:id="343" w:name="ref-Montanaro2015"/>
+    <w:bookmarkEnd w:id="342"/>
+    <w:bookmarkStart w:id="344" w:name="ref-Montanaro2015"/>
     <w:p>
       <w:pPr>
         <w:pStyle w:val="Bibliography"/>
@@ -23978,7 +23996,7 @@
       <w:r>
         <w:t xml:space="preserve"> </w:t>
       </w:r>
-      <w:hyperlink r:id="rId342">
+      <w:hyperlink r:id="rId343">
         <w:r>
           <w:rPr>
             <w:rStyle w:val="Hyperlink"/>
@@ -23990,8 +24008,8 @@
         <w:t xml:space="preserve">.</w:t>
       </w:r>
     </w:p>
-    <w:bookmarkEnd w:id="343"/>
-    <w:bookmarkStart w:id="345" w:name="ref-Montanaro2016"/>
+    <w:bookmarkEnd w:id="344"/>
+    <w:bookmarkStart w:id="346" w:name="ref-Montanaro2016"/>
     <w:p>
       <w:pPr>
         <w:pStyle w:val="Bibliography"/>
@@ -24024,7 +24042,7 @@
       <w:r>
         <w:t xml:space="preserve"> </w:t>
       </w:r>
-      <w:hyperlink r:id="rId344">
+      <w:hyperlink r:id="rId345">
         <w:r>
           <w:rPr>
             <w:rStyle w:val="Hyperlink"/>
@@ -24036,8 +24054,8 @@
         <w:t xml:space="preserve">.</w:t>
       </w:r>
     </w:p>
-    <w:bookmarkEnd w:id="345"/>
-    <w:bookmarkStart w:id="347" w:name="ref-Muradoglu2025"/>
+    <w:bookmarkEnd w:id="346"/>
+    <w:bookmarkStart w:id="348" w:name="ref-Muradoglu2025"/>
     <w:p>
       <w:pPr>
         <w:pStyle w:val="Bibliography"/>
@@ -24066,7 +24084,7 @@
       <w:r>
         <w:t xml:space="preserve"> </w:t>
       </w:r>
-      <w:hyperlink r:id="rId346">
+      <w:hyperlink r:id="rId347">
         <w:r>
           <w:rPr>
             <w:rStyle w:val="Hyperlink"/>
@@ -24078,8 +24096,8 @@
         <w:t xml:space="preserve">.</w:t>
       </w:r>
     </w:p>
-    <w:bookmarkEnd w:id="347"/>
-    <w:bookmarkStart w:id="349" w:name="ref-Neukart2017"/>
+    <w:bookmarkEnd w:id="348"/>
+    <w:bookmarkStart w:id="350" w:name="ref-Neukart2017"/>
     <w:p>
       <w:pPr>
         <w:pStyle w:val="Bibliography"/>
@@ -24112,7 +24130,7 @@
       <w:r>
         <w:t xml:space="preserve"> </w:t>
       </w:r>
-      <w:hyperlink r:id="rId348">
+      <w:hyperlink r:id="rId349">
         <w:r>
           <w:rPr>
             <w:rStyle w:val="Hyperlink"/>
@@ -24124,8 +24142,8 @@
         <w:t xml:space="preserve">.</w:t>
       </w:r>
     </w:p>
-    <w:bookmarkEnd w:id="349"/>
-    <w:bookmarkStart w:id="351" w:name="ref-Ngo2026"/>
+    <w:bookmarkEnd w:id="350"/>
+    <w:bookmarkStart w:id="352" w:name="ref-Ngo2026"/>
     <w:p>
       <w:pPr>
         <w:pStyle w:val="Bibliography"/>
@@ -24154,7 +24172,7 @@
       <w:r>
         <w:t xml:space="preserve"> </w:t>
       </w:r>
-      <w:hyperlink r:id="rId350">
+      <w:hyperlink r:id="rId351">
         <w:r>
           <w:rPr>
             <w:rStyle w:val="Hyperlink"/>
@@ -24166,8 +24184,8 @@
         <w:t xml:space="preserve">.</w:t>
       </w:r>
     </w:p>
-    <w:bookmarkEnd w:id="351"/>
-    <w:bookmarkStart w:id="353" w:name="ref-Nielsen2010"/>
+    <w:bookmarkEnd w:id="352"/>
+    <w:bookmarkStart w:id="354" w:name="ref-Nielsen2010"/>
     <w:p>
       <w:pPr>
         <w:pStyle w:val="Bibliography"/>
@@ -24191,7 +24209,7 @@
       <w:r>
         <w:t xml:space="preserve"> </w:t>
       </w:r>
-      <w:hyperlink r:id="rId352">
+      <w:hyperlink r:id="rId353">
         <w:r>
           <w:rPr>
             <w:rStyle w:val="Hyperlink"/>
@@ -24203,8 +24221,8 @@
         <w:t xml:space="preserve">.</w:t>
       </w:r>
     </w:p>
-    <w:bookmarkEnd w:id="353"/>
-    <w:bookmarkStart w:id="355" w:name="ref-Nigatu2026"/>
+    <w:bookmarkEnd w:id="354"/>
+    <w:bookmarkStart w:id="356" w:name="ref-Nigatu2026"/>
     <w:p>
       <w:pPr>
         <w:pStyle w:val="Bibliography"/>
@@ -24237,7 +24255,7 @@
       <w:r>
         <w:t xml:space="preserve"> </w:t>
       </w:r>
-      <w:hyperlink r:id="rId354">
+      <w:hyperlink r:id="rId355">
         <w:r>
           <w:rPr>
             <w:rStyle w:val="Hyperlink"/>
@@ -24249,8 +24267,8 @@
         <w:t xml:space="preserve">.</w:t>
       </w:r>
     </w:p>
-    <w:bookmarkEnd w:id="355"/>
-    <w:bookmarkStart w:id="356" w:name="ref-Nigatu2025"/>
+    <w:bookmarkEnd w:id="356"/>
+    <w:bookmarkStart w:id="357" w:name="ref-Nigatu2025"/>
     <w:p>
       <w:pPr>
         <w:pStyle w:val="Bibliography"/>
@@ -24287,8 +24305,8 @@
         <w:t xml:space="preserve">.</w:t>
       </w:r>
     </w:p>
-    <w:bookmarkEnd w:id="356"/>
-    <w:bookmarkStart w:id="358" w:name="ref-Ohzeki2019"/>
+    <w:bookmarkEnd w:id="357"/>
+    <w:bookmarkStart w:id="359" w:name="ref-Ohzeki2019"/>
     <w:p>
       <w:pPr>
         <w:pStyle w:val="Bibliography"/>
@@ -24321,7 +24339,7 @@
       <w:r>
         <w:t xml:space="preserve"> </w:t>
       </w:r>
-      <w:hyperlink r:id="rId357">
+      <w:hyperlink r:id="rId358">
         <w:r>
           <w:rPr>
             <w:rStyle w:val="Hyperlink"/>
@@ -24333,8 +24351,8 @@
         <w:t xml:space="preserve">.</w:t>
       </w:r>
     </w:p>
-    <w:bookmarkEnd w:id="358"/>
-    <w:bookmarkStart w:id="360" w:name="ref-Osaba2025"/>
+    <w:bookmarkEnd w:id="359"/>
+    <w:bookmarkStart w:id="361" w:name="ref-Osaba2025"/>
     <w:p>
       <w:pPr>
         <w:pStyle w:val="Bibliography"/>
@@ -24424,7 +24442,7 @@
       <w:r>
         <w:t xml:space="preserve"> </w:t>
       </w:r>
-      <w:hyperlink r:id="rId359">
+      <w:hyperlink r:id="rId360">
         <w:r>
           <w:rPr>
             <w:rStyle w:val="Hyperlink"/>
@@ -24436,8 +24454,8 @@
         <w:t xml:space="preserve">.</w:t>
       </w:r>
     </w:p>
-    <w:bookmarkEnd w:id="360"/>
-    <w:bookmarkStart w:id="362" w:name="ref-OsabaDrone2025"/>
+    <w:bookmarkEnd w:id="361"/>
+    <w:bookmarkStart w:id="363" w:name="ref-OsabaDrone2025"/>
     <w:p>
       <w:pPr>
         <w:pStyle w:val="Bibliography"/>
@@ -24487,7 +24505,7 @@
       <w:r>
         <w:t xml:space="preserve"> </w:t>
       </w:r>
-      <w:hyperlink r:id="rId361">
+      <w:hyperlink r:id="rId362">
         <w:r>
           <w:rPr>
             <w:rStyle w:val="Hyperlink"/>
@@ -24499,8 +24517,8 @@
         <w:t xml:space="preserve">.</w:t>
       </w:r>
     </w:p>
-    <w:bookmarkEnd w:id="362"/>
-    <w:bookmarkStart w:id="364" w:name="ref-Otani2025"/>
+    <w:bookmarkEnd w:id="363"/>
+    <w:bookmarkStart w:id="365" w:name="ref-Otani2025"/>
     <w:p>
       <w:pPr>
         <w:pStyle w:val="Bibliography"/>
@@ -24533,7 +24551,7 @@
       <w:r>
         <w:t xml:space="preserve"> </w:t>
       </w:r>
-      <w:hyperlink r:id="rId363">
+      <w:hyperlink r:id="rId364">
         <w:r>
           <w:rPr>
             <w:rStyle w:val="Hyperlink"/>
@@ -24545,8 +24563,8 @@
         <w:t xml:space="preserve">.</w:t>
       </w:r>
     </w:p>
-    <w:bookmarkEnd w:id="364"/>
-    <w:bookmarkStart w:id="366" w:name="ref-Page2021"/>
+    <w:bookmarkEnd w:id="365"/>
+    <w:bookmarkStart w:id="367" w:name="ref-Page2021"/>
     <w:p>
       <w:pPr>
         <w:pStyle w:val="Bibliography"/>
@@ -24591,7 +24609,7 @@
       <w:r>
         <w:t xml:space="preserve"> </w:t>
       </w:r>
-      <w:hyperlink r:id="rId365">
+      <w:hyperlink r:id="rId366">
         <w:r>
           <w:rPr>
             <w:rStyle w:val="Hyperlink"/>
@@ -24603,8 +24621,8 @@
         <w:t xml:space="preserve">.</w:t>
       </w:r>
     </w:p>
-    <w:bookmarkEnd w:id="366"/>
-    <w:bookmarkStart w:id="368" w:name="ref-Paparo2014"/>
+    <w:bookmarkEnd w:id="367"/>
+    <w:bookmarkStart w:id="369" w:name="ref-Paparo2014"/>
     <w:p>
       <w:pPr>
         <w:pStyle w:val="Bibliography"/>
@@ -24637,7 +24655,7 @@
       <w:r>
         <w:t xml:space="preserve"> </w:t>
       </w:r>
-      <w:hyperlink r:id="rId367">
+      <w:hyperlink r:id="rId368">
         <w:r>
           <w:rPr>
             <w:rStyle w:val="Hyperlink"/>
@@ -24649,8 +24667,8 @@
         <w:t xml:space="preserve">.</w:t>
       </w:r>
     </w:p>
-    <w:bookmarkEnd w:id="368"/>
-    <w:bookmarkStart w:id="369" w:name="ref-Park2023"/>
+    <w:bookmarkEnd w:id="369"/>
+    <w:bookmarkStart w:id="370" w:name="ref-Park2023"/>
     <w:p>
       <w:pPr>
         <w:pStyle w:val="Bibliography"/>
@@ -24690,8 +24708,8 @@
         <w:t xml:space="preserve">10 (22): 20033–48.</w:t>
       </w:r>
     </w:p>
-    <w:bookmarkEnd w:id="369"/>
-    <w:bookmarkStart w:id="370" w:name="ref-Park2024"/>
+    <w:bookmarkEnd w:id="370"/>
+    <w:bookmarkStart w:id="371" w:name="ref-Park2024"/>
     <w:p>
       <w:pPr>
         <w:pStyle w:val="Bibliography"/>
@@ -24722,8 +24740,8 @@
         <w:t xml:space="preserve">62 (6): 106–12.</w:t>
       </w:r>
     </w:p>
-    <w:bookmarkEnd w:id="370"/>
-    <w:bookmarkStart w:id="372" w:name="ref-Peruzzo2014"/>
+    <w:bookmarkEnd w:id="371"/>
+    <w:bookmarkStart w:id="373" w:name="ref-Peruzzo2014"/>
     <w:p>
       <w:pPr>
         <w:pStyle w:val="Bibliography"/>
@@ -24756,7 +24774,7 @@
       <w:r>
         <w:t xml:space="preserve"> </w:t>
       </w:r>
-      <w:hyperlink r:id="rId371">
+      <w:hyperlink r:id="rId372">
         <w:r>
           <w:rPr>
             <w:rStyle w:val="Hyperlink"/>
@@ -24768,8 +24786,8 @@
         <w:t xml:space="preserve">.</w:t>
       </w:r>
     </w:p>
-    <w:bookmarkEnd w:id="372"/>
-    <w:bookmarkStart w:id="374" w:name="ref-Petschnigg2019"/>
+    <w:bookmarkEnd w:id="373"/>
+    <w:bookmarkStart w:id="375" w:name="ref-Petschnigg2019"/>
     <w:p>
       <w:pPr>
         <w:pStyle w:val="Bibliography"/>
@@ -24819,7 +24837,7 @@
       <w:r>
         <w:t xml:space="preserve"> </w:t>
       </w:r>
-      <w:hyperlink r:id="rId373">
+      <w:hyperlink r:id="rId374">
         <w:r>
           <w:rPr>
             <w:rStyle w:val="Hyperlink"/>
@@ -24831,8 +24849,8 @@
         <w:t xml:space="preserve">.</w:t>
       </w:r>
     </w:p>
-    <w:bookmarkEnd w:id="374"/>
-    <w:bookmarkStart w:id="376" w:name="ref-Pothos2013"/>
+    <w:bookmarkEnd w:id="375"/>
+    <w:bookmarkStart w:id="377" w:name="ref-Pothos2013"/>
     <w:p>
       <w:pPr>
         <w:pStyle w:val="Bibliography"/>
@@ -24865,7 +24883,7 @@
       <w:r>
         <w:t xml:space="preserve"> </w:t>
       </w:r>
-      <w:hyperlink r:id="rId375">
+      <w:hyperlink r:id="rId376">
         <w:r>
           <w:rPr>
             <w:rStyle w:val="Hyperlink"/>
@@ -24877,8 +24895,8 @@
         <w:t xml:space="preserve">.</w:t>
       </w:r>
     </w:p>
-    <w:bookmarkEnd w:id="376"/>
-    <w:bookmarkStart w:id="378" w:name="ref-Pothos2022"/>
+    <w:bookmarkEnd w:id="377"/>
+    <w:bookmarkStart w:id="379" w:name="ref-Pothos2022"/>
     <w:p>
       <w:pPr>
         <w:pStyle w:val="Bibliography"/>
@@ -24911,7 +24929,7 @@
       <w:r>
         <w:t xml:space="preserve"> </w:t>
       </w:r>
-      <w:hyperlink r:id="rId377">
+      <w:hyperlink r:id="rId378">
         <w:r>
           <w:rPr>
             <w:rStyle w:val="Hyperlink"/>
@@ -24923,8 +24941,8 @@
         <w:t xml:space="preserve">.</w:t>
       </w:r>
     </w:p>
-    <w:bookmarkEnd w:id="378"/>
-    <w:bookmarkStart w:id="380" w:name="ref-Preskill2018"/>
+    <w:bookmarkEnd w:id="379"/>
+    <w:bookmarkStart w:id="381" w:name="ref-Preskill2018"/>
     <w:p>
       <w:pPr>
         <w:pStyle w:val="Bibliography"/>
@@ -24969,7 +24987,7 @@
       <w:r>
         <w:t xml:space="preserve"> </w:t>
       </w:r>
-      <w:hyperlink r:id="rId379">
+      <w:hyperlink r:id="rId380">
         <w:r>
           <w:rPr>
             <w:rStyle w:val="Hyperlink"/>
@@ -24981,8 +24999,8 @@
         <w:t xml:space="preserve">.</w:t>
       </w:r>
     </w:p>
-    <w:bookmarkEnd w:id="380"/>
-    <w:bookmarkStart w:id="382" w:name="ref-Quang2025"/>
+    <w:bookmarkEnd w:id="381"/>
+    <w:bookmarkStart w:id="383" w:name="ref-Quang2025"/>
     <w:p>
       <w:pPr>
         <w:pStyle w:val="Bibliography"/>
@@ -25027,7 +25045,7 @@
       <w:r>
         <w:t xml:space="preserve"> </w:t>
       </w:r>
-      <w:hyperlink r:id="rId381">
+      <w:hyperlink r:id="rId382">
         <w:r>
           <w:rPr>
             <w:rStyle w:val="Hyperlink"/>
@@ -25039,8 +25057,8 @@
         <w:t xml:space="preserve">.</w:t>
       </w:r>
     </w:p>
-    <w:bookmarkEnd w:id="382"/>
-    <w:bookmarkStart w:id="384" w:name="ref-Rao2024"/>
+    <w:bookmarkEnd w:id="383"/>
+    <w:bookmarkStart w:id="385" w:name="ref-Rao2024"/>
     <w:p>
       <w:pPr>
         <w:pStyle w:val="Bibliography"/>
@@ -25057,7 +25075,7 @@
       <w:r>
         <w:t xml:space="preserve"> </w:t>
       </w:r>
-      <w:hyperlink r:id="rId383">
+      <w:hyperlink r:id="rId384">
         <w:r>
           <w:rPr>
             <w:rStyle w:val="Hyperlink"/>
@@ -25069,8 +25087,8 @@
         <w:t xml:space="preserve">.</w:t>
       </w:r>
     </w:p>
-    <w:bookmarkEnd w:id="384"/>
-    <w:bookmarkStart w:id="386" w:name="ref-Ravi2021"/>
+    <w:bookmarkEnd w:id="385"/>
+    <w:bookmarkStart w:id="387" w:name="ref-Ravi2021"/>
     <w:p>
       <w:pPr>
         <w:pStyle w:val="Bibliography"/>
@@ -25148,7 +25166,7 @@
       <w:r>
         <w:t xml:space="preserve"> </w:t>
       </w:r>
-      <w:hyperlink r:id="rId385">
+      <w:hyperlink r:id="rId386">
         <w:r>
           <w:rPr>
             <w:rStyle w:val="Hyperlink"/>
@@ -25160,8 +25178,8 @@
         <w:t xml:space="preserve">.</w:t>
       </w:r>
     </w:p>
-    <w:bookmarkEnd w:id="386"/>
-    <w:bookmarkStart w:id="388" w:name="ref-Rebentrost2014"/>
+    <w:bookmarkEnd w:id="387"/>
+    <w:bookmarkStart w:id="389" w:name="ref-Rebentrost2014"/>
     <w:p>
       <w:pPr>
         <w:pStyle w:val="Bibliography"/>
@@ -25194,7 +25212,7 @@
       <w:r>
         <w:t xml:space="preserve"> </w:t>
       </w:r>
-      <w:hyperlink r:id="rId387">
+      <w:hyperlink r:id="rId388">
         <w:r>
           <w:rPr>
             <w:rStyle w:val="Hyperlink"/>
@@ -25206,8 +25224,8 @@
         <w:t xml:space="preserve">.</w:t>
       </w:r>
     </w:p>
-    <w:bookmarkEnd w:id="388"/>
-    <w:bookmarkStart w:id="390" w:name="ref-Reiher2017"/>
+    <w:bookmarkEnd w:id="389"/>
+    <w:bookmarkStart w:id="391" w:name="ref-Reiher2017"/>
     <w:p>
       <w:pPr>
         <w:pStyle w:val="Bibliography"/>
@@ -25240,7 +25258,7 @@
       <w:r>
         <w:t xml:space="preserve"> </w:t>
       </w:r>
-      <w:hyperlink r:id="rId389">
+      <w:hyperlink r:id="rId390">
         <w:r>
           <w:rPr>
             <w:rStyle w:val="Hyperlink"/>
@@ -25252,8 +25270,8 @@
         <w:t xml:space="preserve">.</w:t>
       </w:r>
     </w:p>
-    <w:bookmarkEnd w:id="390"/>
-    <w:bookmarkStart w:id="392" w:name="ref-Rieffel2015"/>
+    <w:bookmarkEnd w:id="391"/>
+    <w:bookmarkStart w:id="393" w:name="ref-Rieffel2015"/>
     <w:p>
       <w:pPr>
         <w:pStyle w:val="Bibliography"/>
@@ -25286,7 +25304,7 @@
       <w:r>
         <w:t xml:space="preserve"> </w:t>
       </w:r>
-      <w:hyperlink r:id="rId391">
+      <w:hyperlink r:id="rId392">
         <w:r>
           <w:rPr>
             <w:rStyle w:val="Hyperlink"/>
@@ -25298,8 +25316,8 @@
         <w:t xml:space="preserve">.</w:t>
       </w:r>
     </w:p>
-    <w:bookmarkEnd w:id="392"/>
-    <w:bookmarkStart w:id="394" w:name="ref-RodriguezDiaz2025"/>
+    <w:bookmarkEnd w:id="393"/>
+    <w:bookmarkStart w:id="395" w:name="ref-RodriguezDiaz2025"/>
     <w:p>
       <w:pPr>
         <w:pStyle w:val="Bibliography"/>
@@ -25332,7 +25350,7 @@
       <w:r>
         <w:t xml:space="preserve"> </w:t>
       </w:r>
-      <w:hyperlink r:id="rId393">
+      <w:hyperlink r:id="rId394">
         <w:r>
           <w:rPr>
             <w:rStyle w:val="Hyperlink"/>
@@ -25344,8 +25362,8 @@
         <w:t xml:space="preserve">.</w:t>
       </w:r>
     </w:p>
-    <w:bookmarkEnd w:id="394"/>
-    <w:bookmarkStart w:id="395" w:name="ref-Roh2025"/>
+    <w:bookmarkEnd w:id="395"/>
+    <w:bookmarkStart w:id="396" w:name="ref-Roh2025"/>
     <w:p>
       <w:pPr>
         <w:pStyle w:val="Bibliography"/>
@@ -25376,8 +25394,8 @@
         <w:t xml:space="preserve">24 (2): 1031–42.</w:t>
       </w:r>
     </w:p>
-    <w:bookmarkEnd w:id="395"/>
-    <w:bookmarkStart w:id="397" w:name="ref-Salloum2026"/>
+    <w:bookmarkEnd w:id="396"/>
+    <w:bookmarkStart w:id="398" w:name="ref-Salloum2026"/>
     <w:p>
       <w:pPr>
         <w:pStyle w:val="Bibliography"/>
@@ -25410,7 +25428,7 @@
       <w:r>
         <w:t xml:space="preserve"> </w:t>
       </w:r>
-      <w:hyperlink r:id="rId396">
+      <w:hyperlink r:id="rId397">
         <w:r>
           <w:rPr>
             <w:rStyle w:val="Hyperlink"/>
@@ -25422,8 +25440,8 @@
         <w:t xml:space="preserve">.</w:t>
       </w:r>
     </w:p>
-    <w:bookmarkEnd w:id="397"/>
-    <w:bookmarkStart w:id="399" w:name="ref-Sarkar2024"/>
+    <w:bookmarkEnd w:id="398"/>
+    <w:bookmarkStart w:id="400" w:name="ref-Sarkar2024"/>
     <w:p>
       <w:pPr>
         <w:pStyle w:val="Bibliography"/>
@@ -25456,7 +25474,7 @@
       <w:r>
         <w:t xml:space="preserve"> </w:t>
       </w:r>
-      <w:hyperlink r:id="rId398">
+      <w:hyperlink r:id="rId399">
         <w:r>
           <w:rPr>
             <w:rStyle w:val="Hyperlink"/>
@@ -25468,8 +25486,8 @@
         <w:t xml:space="preserve">.</w:t>
       </w:r>
     </w:p>
-    <w:bookmarkEnd w:id="399"/>
-    <w:bookmarkStart w:id="401" w:name="ref-Schuetz2022"/>
+    <w:bookmarkEnd w:id="400"/>
+    <w:bookmarkStart w:id="402" w:name="ref-Schuetz2022"/>
     <w:p>
       <w:pPr>
         <w:pStyle w:val="Bibliography"/>
@@ -25502,7 +25520,7 @@
       <w:r>
         <w:t xml:space="preserve"> </w:t>
       </w:r>
-      <w:hyperlink r:id="rId400">
+      <w:hyperlink r:id="rId401">
         <w:r>
           <w:rPr>
             <w:rStyle w:val="Hyperlink"/>
@@ -25514,8 +25532,8 @@
         <w:t xml:space="preserve">.</w:t>
       </w:r>
     </w:p>
-    <w:bookmarkEnd w:id="401"/>
-    <w:bookmarkStart w:id="403" w:name="ref-Schuld2019"/>
+    <w:bookmarkEnd w:id="402"/>
+    <w:bookmarkStart w:id="404" w:name="ref-Schuld2019"/>
     <w:p>
       <w:pPr>
         <w:pStyle w:val="Bibliography"/>
@@ -25560,7 +25578,7 @@
       <w:r>
         <w:t xml:space="preserve"> </w:t>
       </w:r>
-      <w:hyperlink r:id="rId402">
+      <w:hyperlink r:id="rId403">
         <w:r>
           <w:rPr>
             <w:rStyle w:val="Hyperlink"/>
@@ -25572,8 +25590,8 @@
         <w:t xml:space="preserve">.</w:t>
       </w:r>
     </w:p>
-    <w:bookmarkEnd w:id="403"/>
-    <w:bookmarkStart w:id="405" w:name="ref-Schuld2021"/>
+    <w:bookmarkEnd w:id="404"/>
+    <w:bookmarkStart w:id="406" w:name="ref-Schuld2021"/>
     <w:p>
       <w:pPr>
         <w:pStyle w:val="Bibliography"/>
@@ -25597,7 +25615,7 @@
       <w:r>
         <w:t xml:space="preserve"> </w:t>
       </w:r>
-      <w:hyperlink r:id="rId404">
+      <w:hyperlink r:id="rId405">
         <w:r>
           <w:rPr>
             <w:rStyle w:val="Hyperlink"/>
@@ -25609,8 +25627,8 @@
         <w:t xml:space="preserve">.</w:t>
       </w:r>
     </w:p>
-    <w:bookmarkEnd w:id="405"/>
-    <w:bookmarkStart w:id="407" w:name="ref-Shor1997"/>
+    <w:bookmarkEnd w:id="406"/>
+    <w:bookmarkStart w:id="408" w:name="ref-Shor1997"/>
     <w:p>
       <w:pPr>
         <w:pStyle w:val="Bibliography"/>
@@ -25643,7 +25661,7 @@
       <w:r>
         <w:t xml:space="preserve"> </w:t>
       </w:r>
-      <w:hyperlink r:id="rId406">
+      <w:hyperlink r:id="rId407">
         <w:r>
           <w:rPr>
             <w:rStyle w:val="Hyperlink"/>
@@ -25655,8 +25673,8 @@
         <w:t xml:space="preserve">.</w:t>
       </w:r>
     </w:p>
-    <w:bookmarkEnd w:id="407"/>
-    <w:bookmarkStart w:id="409" w:name="ref-Siciliano2016"/>
+    <w:bookmarkEnd w:id="408"/>
+    <w:bookmarkStart w:id="410" w:name="ref-Siciliano2016"/>
     <w:p>
       <w:pPr>
         <w:pStyle w:val="Bibliography"/>
@@ -25680,7 +25698,7 @@
       <w:r>
         <w:t xml:space="preserve"> </w:t>
       </w:r>
-      <w:hyperlink r:id="rId408">
+      <w:hyperlink r:id="rId409">
         <w:r>
           <w:rPr>
             <w:rStyle w:val="Hyperlink"/>
@@ -25692,8 +25710,8 @@
         <w:t xml:space="preserve">.</w:t>
       </w:r>
     </w:p>
-    <w:bookmarkEnd w:id="409"/>
-    <w:bookmarkStart w:id="411" w:name="ref-Sinha2023"/>
+    <w:bookmarkEnd w:id="410"/>
+    <w:bookmarkStart w:id="412" w:name="ref-Sinha2023"/>
     <w:p>
       <w:pPr>
         <w:pStyle w:val="Bibliography"/>
@@ -25732,7 +25750,7 @@
       <w:r>
         <w:t xml:space="preserve"> </w:t>
       </w:r>
-      <w:hyperlink r:id="rId410">
+      <w:hyperlink r:id="rId411">
         <w:r>
           <w:rPr>
             <w:rStyle w:val="Hyperlink"/>
@@ -25744,8 +25762,8 @@
         <w:t xml:space="preserve">.</w:t>
       </w:r>
     </w:p>
-    <w:bookmarkEnd w:id="411"/>
-    <w:bookmarkStart w:id="413" w:name="ref-Skolik2022"/>
+    <w:bookmarkEnd w:id="412"/>
+    <w:bookmarkStart w:id="414" w:name="ref-Skolik2022"/>
     <w:p>
       <w:pPr>
         <w:pStyle w:val="Bibliography"/>
@@ -25787,7 +25805,7 @@
       <w:r>
         <w:t xml:space="preserve"> </w:t>
       </w:r>
-      <w:hyperlink r:id="rId412">
+      <w:hyperlink r:id="rId413">
         <w:r>
           <w:rPr>
             <w:rStyle w:val="Hyperlink"/>
@@ -25799,8 +25817,8 @@
         <w:t xml:space="preserve">.</w:t>
       </w:r>
     </w:p>
-    <w:bookmarkEnd w:id="413"/>
-    <w:bookmarkStart w:id="415" w:name="ref-Smierzchalski2024"/>
+    <w:bookmarkEnd w:id="414"/>
+    <w:bookmarkStart w:id="416" w:name="ref-Smierzchalski2024"/>
     <w:p>
       <w:pPr>
         <w:pStyle w:val="Bibliography"/>
@@ -25833,7 +25851,7 @@
       <w:r>
         <w:t xml:space="preserve"> </w:t>
       </w:r>
-      <w:hyperlink r:id="rId414">
+      <w:hyperlink r:id="rId415">
         <w:r>
           <w:rPr>
             <w:rStyle w:val="Hyperlink"/>
@@ -25845,8 +25863,8 @@
         <w:t xml:space="preserve">.</w:t>
       </w:r>
     </w:p>
-    <w:bookmarkEnd w:id="415"/>
-    <w:bookmarkStart w:id="417" w:name="ref-Sun2025"/>
+    <w:bookmarkEnd w:id="416"/>
+    <w:bookmarkStart w:id="418" w:name="ref-Sun2025"/>
     <w:p>
       <w:pPr>
         <w:pStyle w:val="Bibliography"/>
@@ -25872,7 +25890,7 @@
       <w:r>
         <w:t xml:space="preserve"> </w:t>
       </w:r>
-      <w:hyperlink r:id="rId416">
+      <w:hyperlink r:id="rId417">
         <w:r>
           <w:rPr>
             <w:rStyle w:val="Hyperlink"/>
@@ -25884,8 +25902,8 @@
         <w:t xml:space="preserve">.</w:t>
       </w:r>
     </w:p>
-    <w:bookmarkEnd w:id="417"/>
-    <w:bookmarkStart w:id="418" w:name="ref-Sutton2018"/>
+    <w:bookmarkEnd w:id="418"/>
+    <w:bookmarkStart w:id="419" w:name="ref-Sutton2018"/>
     <w:p>
       <w:pPr>
         <w:pStyle w:val="Bibliography"/>
@@ -25907,8 +25925,8 @@
         <w:t xml:space="preserve">. 2nd ed. Adaptive Computation and Machine Learning. Cambridge, MA, USA: MIT Press.</w:t>
       </w:r>
     </w:p>
-    <w:bookmarkEnd w:id="418"/>
-    <w:bookmarkStart w:id="420" w:name="ref-Taghavi2025"/>
+    <w:bookmarkEnd w:id="419"/>
+    <w:bookmarkStart w:id="421" w:name="ref-Taghavi2025"/>
     <w:p>
       <w:pPr>
         <w:pStyle w:val="Bibliography"/>
@@ -25941,7 +25959,7 @@
       <w:r>
         <w:t xml:space="preserve"> </w:t>
       </w:r>
-      <w:hyperlink r:id="rId419">
+      <w:hyperlink r:id="rId420">
         <w:r>
           <w:rPr>
             <w:rStyle w:val="Hyperlink"/>
@@ -25953,8 +25971,8 @@
         <w:t xml:space="preserve">.</w:t>
       </w:r>
     </w:p>
-    <w:bookmarkEnd w:id="420"/>
-    <w:bookmarkStart w:id="422" w:name="ref-Tandon2017"/>
+    <w:bookmarkEnd w:id="421"/>
+    <w:bookmarkStart w:id="423" w:name="ref-Tandon2017"/>
     <w:p>
       <w:pPr>
         <w:pStyle w:val="Bibliography"/>
@@ -25978,7 +25996,7 @@
       <w:r>
         <w:t xml:space="preserve"> </w:t>
       </w:r>
-      <w:hyperlink r:id="rId421">
+      <w:hyperlink r:id="rId422">
         <w:r>
           <w:rPr>
             <w:rStyle w:val="Hyperlink"/>
@@ -25990,8 +26008,8 @@
         <w:t xml:space="preserve">.</w:t>
       </w:r>
     </w:p>
-    <w:bookmarkEnd w:id="422"/>
-    <w:bookmarkStart w:id="424" w:name="ref-Tang2019"/>
+    <w:bookmarkEnd w:id="423"/>
+    <w:bookmarkStart w:id="425" w:name="ref-Tang2019"/>
     <w:p>
       <w:pPr>
         <w:pStyle w:val="Bibliography"/>
@@ -26090,7 +26108,7 @@
       <w:r>
         <w:t xml:space="preserve"> </w:t>
       </w:r>
-      <w:hyperlink r:id="rId423">
+      <w:hyperlink r:id="rId424">
         <w:r>
           <w:rPr>
             <w:rStyle w:val="Hyperlink"/>
@@ -26102,8 +26120,8 @@
         <w:t xml:space="preserve">.</w:t>
       </w:r>
     </w:p>
-    <w:bookmarkEnd w:id="424"/>
-    <w:bookmarkStart w:id="426" w:name="ref-Tang2021"/>
+    <w:bookmarkEnd w:id="425"/>
+    <w:bookmarkStart w:id="427" w:name="ref-Tang2021"/>
     <w:p>
       <w:pPr>
         <w:pStyle w:val="Bibliography"/>
@@ -26166,7 +26184,7 @@
       <w:r>
         <w:t xml:space="preserve"> </w:t>
       </w:r>
-      <w:hyperlink r:id="rId425">
+      <w:hyperlink r:id="rId426">
         <w:r>
           <w:rPr>
             <w:rStyle w:val="Hyperlink"/>
@@ -26178,8 +26196,8 @@
         <w:t xml:space="preserve">.</w:t>
       </w:r>
     </w:p>
-    <w:bookmarkEnd w:id="426"/>
-    <w:bookmarkStart w:id="428" w:name="ref-Temme2017"/>
+    <w:bookmarkEnd w:id="427"/>
+    <w:bookmarkStart w:id="429" w:name="ref-Temme2017"/>
     <w:p>
       <w:pPr>
         <w:pStyle w:val="Bibliography"/>
@@ -26212,7 +26230,7 @@
       <w:r>
         <w:t xml:space="preserve"> </w:t>
       </w:r>
-      <w:hyperlink r:id="rId427">
+      <w:hyperlink r:id="rId428">
         <w:r>
           <w:rPr>
             <w:rStyle w:val="Hyperlink"/>
@@ -26224,8 +26242,8 @@
         <w:t xml:space="preserve">.</w:t>
       </w:r>
     </w:p>
-    <w:bookmarkEnd w:id="428"/>
-    <w:bookmarkStart w:id="430" w:name="ref-Templier2022"/>
+    <w:bookmarkEnd w:id="429"/>
+    <w:bookmarkStart w:id="431" w:name="ref-Templier2022"/>
     <w:p>
       <w:pPr>
         <w:pStyle w:val="Bibliography"/>
@@ -26258,7 +26276,7 @@
       <w:r>
         <w:t xml:space="preserve"> </w:t>
       </w:r>
-      <w:hyperlink r:id="rId429">
+      <w:hyperlink r:id="rId430">
         <w:r>
           <w:rPr>
             <w:rStyle w:val="Hyperlink"/>
@@ -26270,8 +26288,8 @@
         <w:t xml:space="preserve">.</w:t>
       </w:r>
     </w:p>
-    <w:bookmarkEnd w:id="430"/>
-    <w:bookmarkStart w:id="432" w:name="ref-Terhal2015"/>
+    <w:bookmarkEnd w:id="431"/>
+    <w:bookmarkStart w:id="433" w:name="ref-Terhal2015"/>
     <w:p>
       <w:pPr>
         <w:pStyle w:val="Bibliography"/>
@@ -26304,7 +26322,7 @@
       <w:r>
         <w:t xml:space="preserve"> </w:t>
       </w:r>
-      <w:hyperlink r:id="rId431">
+      <w:hyperlink r:id="rId432">
         <w:r>
           <w:rPr>
             <w:rStyle w:val="Hyperlink"/>
@@ -26316,8 +26334,8 @@
         <w:t xml:space="preserve">.</w:t>
       </w:r>
     </w:p>
-    <w:bookmarkEnd w:id="432"/>
-    <w:bookmarkStart w:id="433" w:name="ref-Thrun2005"/>
+    <w:bookmarkEnd w:id="433"/>
+    <w:bookmarkStart w:id="434" w:name="ref-Thrun2005"/>
     <w:p>
       <w:pPr>
         <w:pStyle w:val="Bibliography"/>
@@ -26339,8 +26357,8 @@
         <w:t xml:space="preserve">. Intelligent Robotics and Autonomous Agents. Cambridge, MA, USA: MIT Press.</w:t>
       </w:r>
     </w:p>
-    <w:bookmarkEnd w:id="433"/>
-    <w:bookmarkStart w:id="435" w:name="ref-Tian2023"/>
+    <w:bookmarkEnd w:id="434"/>
+    <w:bookmarkStart w:id="436" w:name="ref-Tian2023"/>
     <w:p>
       <w:pPr>
         <w:pStyle w:val="Bibliography"/>
@@ -26373,7 +26391,7 @@
       <w:r>
         <w:t xml:space="preserve"> </w:t>
       </w:r>
-      <w:hyperlink r:id="rId434">
+      <w:hyperlink r:id="rId435">
         <w:r>
           <w:rPr>
             <w:rStyle w:val="Hyperlink"/>
@@ -26385,8 +26403,8 @@
         <w:t xml:space="preserve">.</w:t>
       </w:r>
     </w:p>
-    <w:bookmarkEnd w:id="435"/>
-    <w:bookmarkStart w:id="437" w:name="ref-Udekwe2025"/>
+    <w:bookmarkEnd w:id="436"/>
+    <w:bookmarkStart w:id="438" w:name="ref-Udekwe2025"/>
     <w:p>
       <w:pPr>
         <w:pStyle w:val="Bibliography"/>
@@ -26409,7 +26427,7 @@
       <w:r>
         <w:t xml:space="preserve"> </w:t>
       </w:r>
-      <w:hyperlink r:id="rId436">
+      <w:hyperlink r:id="rId437">
         <w:r>
           <w:rPr>
             <w:rStyle w:val="Hyperlink"/>
@@ -26421,8 +26439,8 @@
         <w:t xml:space="preserve">.</w:t>
       </w:r>
     </w:p>
-    <w:bookmarkEnd w:id="437"/>
-    <w:bookmarkStart w:id="439" w:name="ref-Wang2025"/>
+    <w:bookmarkEnd w:id="438"/>
+    <w:bookmarkStart w:id="440" w:name="ref-Wang2025"/>
     <w:p>
       <w:pPr>
         <w:pStyle w:val="Bibliography"/>
@@ -26500,7 +26518,7 @@
       <w:r>
         <w:t xml:space="preserve"> </w:t>
       </w:r>
-      <w:hyperlink r:id="rId438">
+      <w:hyperlink r:id="rId439">
         <w:r>
           <w:rPr>
             <w:rStyle w:val="Hyperlink"/>
@@ -26512,8 +26530,8 @@
         <w:t xml:space="preserve">.</w:t>
       </w:r>
     </w:p>
-    <w:bookmarkEnd w:id="439"/>
-    <w:bookmarkStart w:id="441" w:name="ref-Wang2021"/>
+    <w:bookmarkEnd w:id="440"/>
+    <w:bookmarkStart w:id="442" w:name="ref-Wang2021"/>
     <w:p>
       <w:pPr>
         <w:pStyle w:val="Bibliography"/>
@@ -26530,7 +26548,7 @@
       <w:r>
         <w:t xml:space="preserve"> </w:t>
       </w:r>
-      <w:hyperlink r:id="rId440">
+      <w:hyperlink r:id="rId441">
         <w:r>
           <w:rPr>
             <w:rStyle w:val="Hyperlink"/>
@@ -26542,8 +26560,8 @@
         <w:t xml:space="preserve">.</w:t>
       </w:r>
     </w:p>
-    <w:bookmarkEnd w:id="441"/>
-    <w:bookmarkStart w:id="443" w:name="ref-Wang2023"/>
+    <w:bookmarkEnd w:id="442"/>
+    <w:bookmarkStart w:id="444" w:name="ref-Wang2023"/>
     <w:p>
       <w:pPr>
         <w:pStyle w:val="Bibliography"/>
@@ -26591,7 +26609,7 @@
       <w:r>
         <w:t xml:space="preserve"> </w:t>
       </w:r>
-      <w:hyperlink r:id="rId442">
+      <w:hyperlink r:id="rId443">
         <w:r>
           <w:rPr>
             <w:rStyle w:val="Hyperlink"/>
@@ -26603,8 +26621,8 @@
         <w:t xml:space="preserve">.</w:t>
       </w:r>
     </w:p>
-    <w:bookmarkEnd w:id="443"/>
-    <w:bookmarkStart w:id="445" w:name="ref-Wang2024"/>
+    <w:bookmarkEnd w:id="444"/>
+    <w:bookmarkStart w:id="446" w:name="ref-Wang2024"/>
     <w:p>
       <w:pPr>
         <w:pStyle w:val="Bibliography"/>
@@ -26633,7 +26651,7 @@
       <w:r>
         <w:t xml:space="preserve"> </w:t>
       </w:r>
-      <w:hyperlink r:id="rId444">
+      <w:hyperlink r:id="rId445">
         <w:r>
           <w:rPr>
             <w:rStyle w:val="Hyperlink"/>
@@ -26645,8 +26663,8 @@
         <w:t xml:space="preserve">.</w:t>
       </w:r>
     </w:p>
-    <w:bookmarkEnd w:id="445"/>
-    <w:bookmarkStart w:id="447" w:name="ref-Widdows2023"/>
+    <w:bookmarkEnd w:id="446"/>
+    <w:bookmarkStart w:id="448" w:name="ref-Widdows2023"/>
     <w:p>
       <w:pPr>
         <w:pStyle w:val="Bibliography"/>
@@ -26679,7 +26697,7 @@
       <w:r>
         <w:t xml:space="preserve"> </w:t>
       </w:r>
-      <w:hyperlink r:id="rId446">
+      <w:hyperlink r:id="rId447">
         <w:r>
           <w:rPr>
             <w:rStyle w:val="Hyperlink"/>
@@ -26691,8 +26709,8 @@
         <w:t xml:space="preserve">.</w:t>
       </w:r>
     </w:p>
-    <w:bookmarkEnd w:id="447"/>
-    <w:bookmarkStart w:id="449" w:name="ref-Wiebe2015"/>
+    <w:bookmarkEnd w:id="448"/>
+    <w:bookmarkStart w:id="450" w:name="ref-Wiebe2015"/>
     <w:p>
       <w:pPr>
         <w:pStyle w:val="Bibliography"/>
@@ -26725,7 +26743,7 @@
       <w:r>
         <w:t xml:space="preserve"> </w:t>
       </w:r>
-      <w:hyperlink r:id="rId448">
+      <w:hyperlink r:id="rId449">
         <w:r>
           <w:rPr>
             <w:rStyle w:val="Hyperlink"/>
@@ -26737,8 +26755,8 @@
         <w:t xml:space="preserve">.</w:t>
       </w:r>
     </w:p>
-    <w:bookmarkEnd w:id="449"/>
-    <w:bookmarkStart w:id="451" w:name="ref-Willmann2025"/>
+    <w:bookmarkEnd w:id="450"/>
+    <w:bookmarkStart w:id="452" w:name="ref-Willmann2025"/>
     <w:p>
       <w:pPr>
         <w:pStyle w:val="Bibliography"/>
@@ -26785,7 +26803,7 @@
       <w:r>
         <w:t xml:space="preserve"> </w:t>
       </w:r>
-      <w:hyperlink r:id="rId450">
+      <w:hyperlink r:id="rId451">
         <w:r>
           <w:rPr>
             <w:rStyle w:val="Hyperlink"/>
@@ -26797,8 +26815,8 @@
         <w:t xml:space="preserve">.</w:t>
       </w:r>
     </w:p>
-    <w:bookmarkEnd w:id="451"/>
-    <w:bookmarkStart w:id="453" w:name="ref-Windmann2023"/>
+    <w:bookmarkEnd w:id="452"/>
+    <w:bookmarkStart w:id="454" w:name="ref-Windmann2023"/>
     <w:p>
       <w:pPr>
         <w:pStyle w:val="Bibliography"/>
@@ -26828,7 +26846,7 @@
       <w:r>
         <w:t xml:space="preserve"> </w:t>
       </w:r>
-      <w:hyperlink r:id="rId452">
+      <w:hyperlink r:id="rId453">
         <w:r>
           <w:rPr>
             <w:rStyle w:val="Hyperlink"/>
@@ -26840,8 +26858,8 @@
         <w:t xml:space="preserve">.</w:t>
       </w:r>
     </w:p>
-    <w:bookmarkEnd w:id="453"/>
-    <w:bookmarkStart w:id="455" w:name="ref-Yan2021"/>
+    <w:bookmarkEnd w:id="454"/>
+    <w:bookmarkStart w:id="456" w:name="ref-Yan2021"/>
     <w:p>
       <w:pPr>
         <w:pStyle w:val="Bibliography"/>
@@ -26874,7 +26892,7 @@
       <w:r>
         <w:t xml:space="preserve"> </w:t>
       </w:r>
-      <w:hyperlink r:id="rId454">
+      <w:hyperlink r:id="rId455">
         <w:r>
           <w:rPr>
             <w:rStyle w:val="Hyperlink"/>
@@ -26886,8 +26904,8 @@
         <w:t xml:space="preserve">.</w:t>
       </w:r>
     </w:p>
-    <w:bookmarkEnd w:id="455"/>
-    <w:bookmarkStart w:id="457" w:name="ref-Yan2024"/>
+    <w:bookmarkEnd w:id="456"/>
+    <w:bookmarkStart w:id="458" w:name="ref-Yan2024"/>
     <w:p>
       <w:pPr>
         <w:pStyle w:val="Bibliography"/>
@@ -26920,7 +26938,7 @@
       <w:r>
         <w:t xml:space="preserve"> </w:t>
       </w:r>
-      <w:hyperlink r:id="rId456">
+      <w:hyperlink r:id="rId457">
         <w:r>
           <w:rPr>
             <w:rStyle w:val="Hyperlink"/>
@@ -26932,8 +26950,8 @@
         <w:t xml:space="preserve">.</w:t>
       </w:r>
     </w:p>
-    <w:bookmarkEnd w:id="457"/>
-    <w:bookmarkStart w:id="459" w:name="ref-Yarkoni2022"/>
+    <w:bookmarkEnd w:id="458"/>
+    <w:bookmarkStart w:id="460" w:name="ref-Yarkoni2022"/>
     <w:p>
       <w:pPr>
         <w:pStyle w:val="Bibliography"/>
@@ -26966,7 +26984,7 @@
       <w:r>
         <w:t xml:space="preserve"> </w:t>
       </w:r>
-      <w:hyperlink r:id="rId458">
+      <w:hyperlink r:id="rId459">
         <w:r>
           <w:rPr>
             <w:rStyle w:val="Hyperlink"/>
@@ -26978,8 +26996,8 @@
         <w:t xml:space="preserve">.</w:t>
       </w:r>
     </w:p>
-    <w:bookmarkEnd w:id="459"/>
-    <w:bookmarkStart w:id="461" w:name="ref-Yu2025"/>
+    <w:bookmarkEnd w:id="460"/>
+    <w:bookmarkStart w:id="462" w:name="ref-Yu2025"/>
     <w:p>
       <w:pPr>
         <w:pStyle w:val="Bibliography"/>
@@ -27063,7 +27081,7 @@
       <w:r>
         <w:t xml:space="preserve"> </w:t>
       </w:r>
-      <w:hyperlink r:id="rId460">
+      <w:hyperlink r:id="rId461">
         <w:r>
           <w:rPr>
             <w:rStyle w:val="Hyperlink"/>
@@ -27075,8 +27093,8 @@
         <w:t xml:space="preserve">.</w:t>
       </w:r>
     </w:p>
-    <w:bookmarkEnd w:id="461"/>
-    <w:bookmarkStart w:id="463" w:name="ref-Yun2022"/>
+    <w:bookmarkEnd w:id="462"/>
+    <w:bookmarkStart w:id="464" w:name="ref-Yun2022"/>
     <w:p>
       <w:pPr>
         <w:pStyle w:val="Bibliography"/>
@@ -27154,7 +27172,7 @@
       <w:r>
         <w:t xml:space="preserve"> </w:t>
       </w:r>
-      <w:hyperlink r:id="rId462">
+      <w:hyperlink r:id="rId463">
         <w:r>
           <w:rPr>
             <w:rStyle w:val="Hyperlink"/>
@@ -27166,8 +27184,8 @@
         <w:t xml:space="preserve">.</w:t>
       </w:r>
     </w:p>
-    <w:bookmarkEnd w:id="463"/>
-    <w:bookmarkStart w:id="465" w:name="ref-Zhou2020"/>
+    <w:bookmarkEnd w:id="464"/>
+    <w:bookmarkStart w:id="466" w:name="ref-Zhou2020"/>
     <w:p>
       <w:pPr>
         <w:pStyle w:val="Bibliography"/>
@@ -27200,7 +27218,7 @@
       <w:r>
         <w:t xml:space="preserve"> </w:t>
       </w:r>
-      <w:hyperlink r:id="rId464">
+      <w:hyperlink r:id="rId465">
         <w:r>
           <w:rPr>
             <w:rStyle w:val="Hyperlink"/>
@@ -27212,8 +27230,8 @@
         <w:t xml:space="preserve">.</w:t>
       </w:r>
     </w:p>
-    <w:bookmarkEnd w:id="465"/>
-    <w:bookmarkStart w:id="467" w:name="ref-Zhuang2024"/>
+    <w:bookmarkEnd w:id="466"/>
+    <w:bookmarkStart w:id="468" w:name="ref-Zhuang2024"/>
     <w:p>
       <w:pPr>
         <w:pStyle w:val="Bibliography"/>
@@ -27230,7 +27248,7 @@
       <w:r>
         <w:t xml:space="preserve"> </w:t>
       </w:r>
-      <w:hyperlink r:id="rId466">
+      <w:hyperlink r:id="rId467">
         <w:r>
           <w:rPr>
             <w:rStyle w:val="Hyperlink"/>
@@ -27242,8 +27260,8 @@
         <w:t xml:space="preserve">.</w:t>
       </w:r>
     </w:p>
-    <w:bookmarkEnd w:id="467"/>
-    <w:bookmarkStart w:id="469" w:name="ref-Zuo2018"/>
+    <w:bookmarkEnd w:id="468"/>
+    <w:bookmarkStart w:id="470" w:name="ref-Zuo2018"/>
     <w:p>
       <w:pPr>
         <w:pStyle w:val="Bibliography"/>
@@ -27288,7 +27306,7 @@
       <w:r>
         <w:t xml:space="preserve"> </w:t>
       </w:r>
-      <w:hyperlink r:id="rId468">
+      <w:hyperlink r:id="rId469">
         <w:r>
           <w:rPr>
             <w:rStyle w:val="Hyperlink"/>
@@ -27303,9 +27321,9 @@
         <w:fldChar w:fldCharType="end"/>
       </w:r>
     </w:p>
-    <w:bookmarkEnd w:id="469"/>
     <w:bookmarkEnd w:id="470"/>
     <w:bookmarkEnd w:id="471"/>
+    <w:bookmarkEnd w:id="472"/>
     <w:sectPr/>
   </w:body>
 </w:document>

</xml_diff>

<commit_message>
Word: Mendeley citation fields in Mendeley Desktop legacy format; add 3-citation test file
</commit_message>
<xml_diff>
--- a/github/k/Survey1_ACM_CSUR_Manuscript.docx
+++ b/github/k/Survey1_ACM_CSUR_Manuscript.docx
@@ -917,7 +917,7 @@
         <w:fldChar w:fldCharType="begin"/>
       </w:r>
       <w:r>
-        <w:instrText xml:space="preserve">ADDIN CSL_CITATION {"citationID":"MENDELEY_CITATION_2","citationItems":[{"id":"ITEM-1","isTemporary":false,"itemData":{"ISBN":"978-0-262-20162-9","author":[{"family":"Thrun","given":"Sebastian"},{"family":"Burgard","given":"Wolfram"},{"family":"Fox","given":"Dieter"}],"collection-title":"Intelligent robotics and autonomous agents","id":"Thrun2005","issued":{"date-parts":[[2005]]},"publisher":"MIT Press","publisher-place":"Cambridge, MA, USA","title":"Probabilistic robotics","type":"book"}},{"id":"ITEM-2","isTemporary":false,"itemData":{"DOI":"10.1007/978-3-319-32552-1","ISBN":"978-3-319-32550-7","collection-title":"Springer handbooks","edition":"2nd","editor":[{"family":"Siciliano","given":"Bruno"},{"family":"Khatib","given":"Oussama"}],"id":"Siciliano2016","issued":{"date-parts":[[2016]]},"publisher":"Springer","publisher-place":"Cham","title":"Springer handbook of robotics","type":"book"}}],"isEdited":false,"manualOverride":{"citeprocText":"(Thrun, Burgard, and Fox 2005; Siciliano and Khatib 2016)","isManuallyOverridden":false,"manualOverrideText":""},"mendeley":{"formattedCitation":"(Thrun, Burgard, and Fox 2005; Siciliano and Khatib 2016)","plainTextFormattedCitation":"(Thrun, Burgard, and Fox 2005; Siciliano and Khatib 2016)","previouslyFormattedCitation":"(Thrun, Burgard, and Fox 2005; Siciliano and Khatib 2016)"},"properties":{"noteIndex":0},"schema":"https://github.com/citation-style-language/schema/raw/master/csl-citation.json"}</w:instrText>
+        <w:instrText xml:space="preserve">ADDIN CSL_CITATION {"citationItems":[{"id":"ITEM-1","itemData":{"ISBN":"978-0-262-20162-9","author":[{"family":"Thrun","given":"Sebastian"},{"family":"Burgard","given":"Wolfram"},{"family":"Fox","given":"Dieter"}],"collection-title":"Intelligent robotics and autonomous agents","id":"ITEM-1","issued":{"date-parts":[[2005]]},"publisher":"MIT Press","publisher-place":"Cambridge, MA, USA","title":"Probabilistic robotics","type":"book"}},{"id":"ITEM-2","itemData":{"DOI":"10.1007/978-3-319-32552-1","ISBN":"978-3-319-32550-7","collection-title":"Springer handbooks","edition":"2nd","editor":[{"family":"Siciliano","given":"Bruno"},{"family":"Khatib","given":"Oussama"}],"id":"ITEM-2","issued":{"date-parts":[[2016]]},"publisher":"Springer","publisher-place":"Cham","title":"Springer handbook of robotics","type":"book"}}],"mendeley":{"formattedCitation":"(Thrun, Burgard, and Fox 2005; Siciliano and Khatib 2016)","plainTextFormattedCitation":"(Thrun, Burgard, and Fox 2005; Siciliano and Khatib 2016)","previouslyFormattedCitation":"(Thrun, Burgard, and Fox 2005; Siciliano and Khatib 2016)"},"properties":{"noteIndex":0},"schema":"https://github.com/citation-style-language/schema/raw/master/csl-citation.json"}</w:instrText>
       </w:r>
       <w:r>
         <w:fldChar w:fldCharType="separate"/>
@@ -935,7 +935,7 @@
         <w:fldChar w:fldCharType="begin"/>
       </w:r>
       <w:r>
-        <w:instrText xml:space="preserve">ADDIN CSL_CITATION {"citationID":"MENDELEY_CITATION_3","citationItems":[{"id":"ITEM-3","isTemporary":false,"itemData":{"DOI":"10.1177/0278364913495721","author":[{"family":"Kober","given":"Jens"},{"family":"Bagnell","given":"J. Andrew"},{"family":"Peters","given":"Jan"}],"container-title":"The International Journal of Robotics Research","id":"Kober2013","issue":"11","issued":{"date-parts":[[2013]]},"page":"1238-1274","publisher":"SAGE Publications","title":"Reinforcement learning in robotics: A survey","title-short":"Reinforcement learning in robotics","type":"article-journal","volume":"32"}}],"isEdited":false,"manualOverride":{"citeprocText":"(Kober, Bagnell, and Peters 2013)","isManuallyOverridden":false,"manualOverrideText":""},"mendeley":{"formattedCitation":"(Kober, Bagnell, and Peters 2013)","plainTextFormattedCitation":"(Kober, Bagnell, and Peters 2013)","previouslyFormattedCitation":"(Kober, Bagnell, and Peters 2013)"},"properties":{"noteIndex":0},"schema":"https://github.com/citation-style-language/schema/raw/master/csl-citation.json"}</w:instrText>
+        <w:instrText xml:space="preserve">ADDIN CSL_CITATION {"citationItems":[{"id":"ITEM-1","itemData":{"DOI":"10.1177/0278364913495721","author":[{"family":"Kober","given":"Jens"},{"family":"Bagnell","given":"J. Andrew"},{"family":"Peters","given":"Jan"}],"container-title":"The International Journal of Robotics Research","id":"ITEM-1","issue":"11","issued":{"date-parts":[[2013]]},"page":"1238-1274","publisher":"SAGE Publications","title":"Reinforcement learning in robotics: A survey","title-short":"Reinforcement learning in robotics","type":"article-journal","volume":"32"}}],"mendeley":{"formattedCitation":"(Kober, Bagnell, and Peters 2013)","plainTextFormattedCitation":"(Kober, Bagnell, and Peters 2013)","previouslyFormattedCitation":"(Kober, Bagnell, and Peters 2013)"},"properties":{"noteIndex":0},"schema":"https://github.com/citation-style-language/schema/raw/master/csl-citation.json"}</w:instrText>
       </w:r>
       <w:r>
         <w:fldChar w:fldCharType="separate"/>
@@ -953,7 +953,7 @@
         <w:fldChar w:fldCharType="begin"/>
       </w:r>
       <w:r>
-        <w:instrText xml:space="preserve">ADDIN CSL_CITATION {"citationID":"MENDELEY_CITATION_4","citationItems":[{"id":"ITEM-4","isTemporary":false,"itemData":{"DOI":"10.1145/237814.237866","author":[{"family":"Grover","given":"Lov K."}],"container-title":"Proceedings of the twenty-eighth annual ACM symposium on theory of computing (STOC ’96)","id":"Grover1996","issued":{"date-parts":[[1996]]},"page":"212-219","publisher":"ACM","publisher-place":"New York, NY, USA","title":"A fast quantum mechanical algorithm for database search","type":"paper-conference"}}],"isEdited":false,"manualOverride":{"citeprocText":"(Grover 1996)","isManuallyOverridden":false,"manualOverrideText":""},"mendeley":{"formattedCitation":"(Grover 1996)","plainTextFormattedCitation":"(Grover 1996)","previouslyFormattedCitation":"(Grover 1996)"},"properties":{"noteIndex":0},"schema":"https://github.com/citation-style-language/schema/raw/master/csl-citation.json"}</w:instrText>
+        <w:instrText xml:space="preserve">ADDIN CSL_CITATION {"citationItems":[{"id":"ITEM-1","itemData":{"DOI":"10.1145/237814.237866","author":[{"family":"Grover","given":"Lov K."}],"container-title":"Proceedings of the twenty-eighth annual ACM symposium on theory of computing (STOC ’96)","id":"ITEM-1","issued":{"date-parts":[[1996]]},"page":"212-219","publisher":"ACM","publisher-place":"New York, NY, USA","title":"A fast quantum mechanical algorithm for database search","type":"paper-conference"}}],"mendeley":{"formattedCitation":"(Grover 1996)","plainTextFormattedCitation":"(Grover 1996)","previouslyFormattedCitation":"(Grover 1996)"},"properties":{"noteIndex":0},"schema":"https://github.com/citation-style-language/schema/raw/master/csl-citation.json"}</w:instrText>
       </w:r>
       <w:r>
         <w:fldChar w:fldCharType="separate"/>
@@ -971,7 +971,7 @@
         <w:fldChar w:fldCharType="begin"/>
       </w:r>
       <w:r>
-        <w:instrText xml:space="preserve">ADDIN CSL_CITATION {"citationID":"MENDELEY_CITATION_5","citationItems":[{"id":"ITEM-5","isTemporary":false,"itemData":{"DOI":"10.1098/rspa.2015.0301","author":[{"family":"Montanaro","given":"Ashley"}],"container-title":"Proceedings of the Royal Society A: Mathematical, Physical and Engineering Sciences","id":"Montanaro2015","issue":"2181","issued":{"date-parts":[[2015]]},"page":"20150301","publisher":"The Royal Society","title":"Quantum speedup of Monte Carlo methods","type":"article-journal","volume":"471"}}],"isEdited":false,"manualOverride":{"citeprocText":"(Montanaro 2015)","isManuallyOverridden":false,"manualOverrideText":""},"mendeley":{"formattedCitation":"(Montanaro 2015)","plainTextFormattedCitation":"(Montanaro 2015)","previouslyFormattedCitation":"(Montanaro 2015)"},"properties":{"noteIndex":0},"schema":"https://github.com/citation-style-language/schema/raw/master/csl-citation.json"}</w:instrText>
+        <w:instrText xml:space="preserve">ADDIN CSL_CITATION {"citationItems":[{"id":"ITEM-1","itemData":{"DOI":"10.1098/rspa.2015.0301","author":[{"family":"Montanaro","given":"Ashley"}],"container-title":"Proceedings of the Royal Society A: Mathematical, Physical and Engineering Sciences","id":"ITEM-1","issue":"2181","issued":{"date-parts":[[2015]]},"page":"20150301","publisher":"The Royal Society","title":"Quantum speedup of Monte Carlo methods","type":"article-journal","volume":"471"}}],"mendeley":{"formattedCitation":"(Montanaro 2015)","plainTextFormattedCitation":"(Montanaro 2015)","previouslyFormattedCitation":"(Montanaro 2015)"},"properties":{"noteIndex":0},"schema":"https://github.com/citation-style-language/schema/raw/master/csl-citation.json"}</w:instrText>
       </w:r>
       <w:r>
         <w:fldChar w:fldCharType="separate"/>
@@ -989,7 +989,7 @@
         <w:fldChar w:fldCharType="begin"/>
       </w:r>
       <w:r>
-        <w:instrText xml:space="preserve">ADDIN CSL_CITATION {"citationID":"MENDELEY_CITATION_6","citationItems":[{"id":"ITEM-6","isTemporary":false,"itemData":{"URL":"https://arxiv.org/abs/1411.4028","author":[{"family":"Farhi","given":"Edward"},{"family":"Goldstone","given":"Jeffrey"},{"family":"Gutmann","given":"Sam"}],"id":"Farhi2014","issued":{"date-parts":[[2014]]},"title":"A quantum approximate optimization algorithm","type":""}}],"isEdited":false,"manualOverride":{"citeprocText":"(Farhi, Goldstone, and Gutmann 2014)","isManuallyOverridden":false,"manualOverrideText":""},"mendeley":{"formattedCitation":"(Farhi, Goldstone, and Gutmann 2014)","plainTextFormattedCitation":"(Farhi, Goldstone, and Gutmann 2014)","previouslyFormattedCitation":"(Farhi, Goldstone, and Gutmann 2014)"},"properties":{"noteIndex":0},"schema":"https://github.com/citation-style-language/schema/raw/master/csl-citation.json"}</w:instrText>
+        <w:instrText xml:space="preserve">ADDIN CSL_CITATION {"citationItems":[{"id":"ITEM-1","itemData":{"URL":"https://arxiv.org/abs/1411.4028","author":[{"family":"Farhi","given":"Edward"},{"family":"Goldstone","given":"Jeffrey"},{"family":"Gutmann","given":"Sam"}],"id":"ITEM-1","issued":{"date-parts":[[2014]]},"title":"A quantum approximate optimization algorithm","type":""}}],"mendeley":{"formattedCitation":"(Farhi, Goldstone, and Gutmann 2014)","plainTextFormattedCitation":"(Farhi, Goldstone, and Gutmann 2014)","previouslyFormattedCitation":"(Farhi, Goldstone, and Gutmann 2014)"},"properties":{"noteIndex":0},"schema":"https://github.com/citation-style-language/schema/raw/master/csl-citation.json"}</w:instrText>
       </w:r>
       <w:r>
         <w:fldChar w:fldCharType="separate"/>
@@ -1007,7 +1007,7 @@
         <w:fldChar w:fldCharType="begin"/>
       </w:r>
       <w:r>
-        <w:instrText xml:space="preserve">ADDIN CSL_CITATION {"citationID":"MENDELEY_CITATION_7","citationItems":[{"id":"ITEM-7","isTemporary":false,"itemData":{"DOI":"10.1038/s42254-021-00348-9","author":[{"family":"Cerezo","given":"M."},{"family":"Arrasmith","given":"Andrew"},{"family":"Babbush","given":"Ryan"},{"family":"Benjamin","given":"Simon C."},{"family":"Endo","given":"Suguru"},{"family":"Fujii","given":"Keisuke"},{"family":"McClean","given":"Jarrod R."},{"family":"Mitarai","given":"Kosuke"},{"family":"Yuan","given":"Xiao"},{"family":"Cincio","given":"Lukasz"},{"family":"Coles","given":"Patrick J."}],"container-title":"Nature Reviews Physics","id":"Cerezo2021a","issue":"9","issued":{"date-parts":[[2021]]},"page":"625-644","publisher":"Nature Publishing Group","title":"Variational quantum algorithms","type":"article-journal","volume":"3"}}],"isEdited":false,"manualOverride":{"citeprocText":"(Cerezo, Arrasmith, et al. 2021)","isManuallyOverridden":false,"manualOverrideText":""},"mendeley":{"formattedCitation":"(Cerezo, Arrasmith, et al. 2021)","plainTextFormattedCitation":"(Cerezo, Arrasmith, et al. 2021)","previouslyFormattedCitation":"(Cerezo, Arrasmith, et al. 2021)"},"properties":{"noteIndex":0},"schema":"https://github.com/citation-style-language/schema/raw/master/csl-citation.json"}</w:instrText>
+        <w:instrText xml:space="preserve">ADDIN CSL_CITATION {"citationItems":[{"id":"ITEM-1","itemData":{"DOI":"10.1038/s42254-021-00348-9","author":[{"family":"Cerezo","given":"M."},{"family":"Arrasmith","given":"Andrew"},{"family":"Babbush","given":"Ryan"},{"family":"Benjamin","given":"Simon C."},{"family":"Endo","given":"Suguru"},{"family":"Fujii","given":"Keisuke"},{"family":"McClean","given":"Jarrod R."},{"family":"Mitarai","given":"Kosuke"},{"family":"Yuan","given":"Xiao"},{"family":"Cincio","given":"Lukasz"},{"family":"Coles","given":"Patrick J."}],"container-title":"Nature Reviews Physics","id":"ITEM-1","issue":"9","issued":{"date-parts":[[2021]]},"page":"625-644","publisher":"Nature Publishing Group","title":"Variational quantum algorithms","type":"article-journal","volume":"3"}}],"mendeley":{"formattedCitation":"(Cerezo, Arrasmith, et al. 2021)","plainTextFormattedCitation":"(Cerezo, Arrasmith, et al. 2021)","previouslyFormattedCitation":"(Cerezo, Arrasmith, et al. 2021)"},"properties":{"noteIndex":0},"schema":"https://github.com/citation-style-language/schema/raw/master/csl-citation.json"}</w:instrText>
       </w:r>
       <w:r>
         <w:fldChar w:fldCharType="separate"/>
@@ -1025,7 +1025,7 @@
         <w:fldChar w:fldCharType="begin"/>
       </w:r>
       <w:r>
-        <w:instrText xml:space="preserve">ADDIN CSL_CITATION {"citationID":"MENDELEY_CITATION_8","citationItems":[{"id":"ITEM-8","isTemporary":false,"itemData":{"DOI":"10.1103/RevModPhys.89.035002","author":[{"family":"Degen","given":"Christian L."},{"family":"Reinhard","given":"F."},{"family":"Cappellaro","given":"Paola"}],"container-title":"Reviews of Modern Physics","id":"Degen2017","issue":"3","issued":{"date-parts":[[2017]]},"page":"035002","title":"Quantum sensing","type":"article-journal","volume":"89"}}],"isEdited":false,"manualOverride":{"citeprocText":"(Degen, Reinhard, and Cappellaro 2017)","isManuallyOverridden":false,"manualOverrideText":""},"mendeley":{"formattedCitation":"(Degen, Reinhard, and Cappellaro 2017)","plainTextFormattedCitation":"(Degen, Reinhard, and Cappellaro 2017)","previouslyFormattedCitation":"(Degen, Reinhard, and Cappellaro 2017)"},"properties":{"noteIndex":0},"schema":"https://github.com/citation-style-language/schema/raw/master/csl-citation.json"}</w:instrText>
+        <w:instrText xml:space="preserve">ADDIN CSL_CITATION {"citationItems":[{"id":"ITEM-1","itemData":{"DOI":"10.1103/RevModPhys.89.035002","author":[{"family":"Degen","given":"Christian L."},{"family":"Reinhard","given":"F."},{"family":"Cappellaro","given":"Paola"}],"container-title":"Reviews of Modern Physics","id":"ITEM-1","issue":"3","issued":{"date-parts":[[2017]]},"page":"035002","title":"Quantum sensing","type":"article-journal","volume":"89"}}],"mendeley":{"formattedCitation":"(Degen, Reinhard, and Cappellaro 2017)","plainTextFormattedCitation":"(Degen, Reinhard, and Cappellaro 2017)","previouslyFormattedCitation":"(Degen, Reinhard, and Cappellaro 2017)"},"properties":{"noteIndex":0},"schema":"https://github.com/citation-style-language/schema/raw/master/csl-citation.json"}</w:instrText>
       </w:r>
       <w:r>
         <w:fldChar w:fldCharType="separate"/>
@@ -1051,7 +1051,7 @@
         <w:fldChar w:fldCharType="begin"/>
       </w:r>
       <w:r>
-        <w:instrText xml:space="preserve">ADDIN CSL_CITATION {"citationID":"MENDELEY_CITATION_9","citationItems":[{"id":"ITEM-9","isTemporary":false,"itemData":{"DOI":"10.22331/q-2018-08-06-79","author":[{"family":"Preskill","given":"John"}],"container-title":"Quantum","id":"Preskill2018","issued":{"date-parts":[[2018]]},"page":"79","publisher":"Verein zur Förderung des Open Access Publizierens in den Quantenwissenschaften","title":"Quantum computing in the NISQ era and beyond","type":"article-journal","volume":"2"}}],"isEdited":false,"manualOverride":{"citeprocText":"(Preskill 2018)","isManuallyOverridden":false,"manualOverrideText":""},"mendeley":{"formattedCitation":"(Preskill 2018)","plainTextFormattedCitation":"(Preskill 2018)","previouslyFormattedCitation":"(Preskill 2018)"},"properties":{"noteIndex":0},"schema":"https://github.com/citation-style-language/schema/raw/master/csl-citation.json"}</w:instrText>
+        <w:instrText xml:space="preserve">ADDIN CSL_CITATION {"citationItems":[{"id":"ITEM-1","itemData":{"DOI":"10.22331/q-2018-08-06-79","author":[{"family":"Preskill","given":"John"}],"container-title":"Quantum","id":"ITEM-1","issued":{"date-parts":[[2018]]},"page":"79","publisher":"Verein zur Förderung des Open Access Publizierens in den Quantenwissenschaften","title":"Quantum computing in the NISQ era and beyond","type":"article-journal","volume":"2"}}],"mendeley":{"formattedCitation":"(Preskill 2018)","plainTextFormattedCitation":"(Preskill 2018)","previouslyFormattedCitation":"(Preskill 2018)"},"properties":{"noteIndex":0},"schema":"https://github.com/citation-style-language/schema/raw/master/csl-citation.json"}</w:instrText>
       </w:r>
       <w:r>
         <w:fldChar w:fldCharType="separate"/>
@@ -1206,7 +1206,7 @@
         <w:fldChar w:fldCharType="begin"/>
       </w:r>
       <w:r>
-        <w:instrText xml:space="preserve">ADDIN CSL_CITATION {"citationID":"MENDELEY_CITATION_10","citationItems":[{"id":"ITEM-10","isTemporary":false,"itemData":{"DOI":"10.2200/S00746ED1V01Y201612QMC010","author":[{"family":"Tandon","given":"Prateek"},{"family":"Lam","given":"Stanley"},{"family":"Shih","given":"Ben"},{"family":"Mehta","given":"Tanay"},{"family":"Mitev","given":"Alex"},{"family":"Ong","given":"Zhiyang"}],"collection-title":"Synthesis lectures on quantum computing","id":"Tandon2017","issued":{"date-parts":[[2017]]},"publisher":"Morgan &amp; Claypool Publishers","publisher-place":"San Rafael, CA, USA","title":"Quantum robotics: A primer on current science and future perspectives","title-short":"Quantum robotics","type":"book"},"suppress-author":false}],"isEdited":false,"manualOverride":{"citeprocText":"Tandon et al. (2017)","isManuallyOverridden":false,"manualOverrideText":""},"mendeley":{"formattedCitation":"Tandon et al. (2017)","plainTextFormattedCitation":"Tandon et al. (2017)","previouslyFormattedCitation":"Tandon et al. (2017)"},"properties":{"noteIndex":0},"schema":"https://github.com/citation-style-language/schema/raw/master/csl-citation.json"}</w:instrText>
+        <w:instrText xml:space="preserve">ADDIN CSL_CITATION {"citationItems":[{"id":"ITEM-1","itemData":{"DOI":"10.2200/S00746ED1V01Y201612QMC010","author":[{"family":"Tandon","given":"Prateek"},{"family":"Lam","given":"Stanley"},{"family":"Shih","given":"Ben"},{"family":"Mehta","given":"Tanay"},{"family":"Mitev","given":"Alex"},{"family":"Ong","given":"Zhiyang"}],"collection-title":"Synthesis lectures on quantum computing","id":"ITEM-1","issued":{"date-parts":[[2017]]},"publisher":"Morgan &amp; Claypool Publishers","publisher-place":"San Rafael, CA, USA","title":"Quantum robotics: A primer on current science and future perspectives","title-short":"Quantum robotics","type":"book"}}],"mendeley":{"formattedCitation":"Tandon et al. (2017)","plainTextFormattedCitation":"Tandon et al. (2017)","previouslyFormattedCitation":"Tandon et al. (2017)"},"properties":{"noteIndex":0},"schema":"https://github.com/citation-style-language/schema/raw/master/csl-citation.json"}</w:instrText>
       </w:r>
       <w:r>
         <w:fldChar w:fldCharType="separate"/>
@@ -1230,7 +1230,7 @@
         <w:fldChar w:fldCharType="begin"/>
       </w:r>
       <w:r>
-        <w:instrText xml:space="preserve">ADDIN CSL_CITATION {"citationID":"MENDELEY_CITATION_11","citationItems":[{"id":"ITEM-11","isTemporary":false,"itemData":{"DOI":"10.1109/ICRA.2019.8793768","author":[{"family":"Petschnigg","given":"Christina"},{"family":"Brandstötter","given":"Mathias"},{"family":"Pichler","given":"Horst"},{"family":"Hofbaur","given":"Michael W."},{"family":"Dieber","given":"Bernhard"}],"container-title":"Proceedings of the 2019 international conference on robotics and automation (ICRA)","id":"Petschnigg2019","issued":{"date-parts":[[2019]]},"page":"803-810","publisher":"IEEE","publisher-place":"Piscataway, NJ, USA","title":"Quantum computation in robotic science and applications","type":"paper-conference"},"suppress-author":false}],"isEdited":false,"manualOverride":{"citeprocText":"Petschnigg et al. (2019)","isManuallyOverridden":false,"manualOverrideText":""},"mendeley":{"formattedCitation":"Petschnigg et al. (2019)","plainTextFormattedCitation":"Petschnigg et al. (2019)","previouslyFormattedCitation":"Petschnigg et al. (2019)"},"properties":{"noteIndex":0},"schema":"https://github.com/citation-style-language/schema/raw/master/csl-citation.json"}</w:instrText>
+        <w:instrText xml:space="preserve">ADDIN CSL_CITATION {"citationItems":[{"id":"ITEM-1","itemData":{"DOI":"10.1109/ICRA.2019.8793768","author":[{"family":"Petschnigg","given":"Christina"},{"family":"Brandstötter","given":"Mathias"},{"family":"Pichler","given":"Horst"},{"family":"Hofbaur","given":"Michael W."},{"family":"Dieber","given":"Bernhard"}],"container-title":"Proceedings of the 2019 international conference on robotics and automation (ICRA)","id":"ITEM-1","issued":{"date-parts":[[2019]]},"page":"803-810","publisher":"IEEE","publisher-place":"Piscataway, NJ, USA","title":"Quantum computation in robotic science and applications","type":"paper-conference"}}],"mendeley":{"formattedCitation":"Petschnigg et al. (2019)","plainTextFormattedCitation":"Petschnigg et al. (2019)","previouslyFormattedCitation":"Petschnigg et al. (2019)"},"properties":{"noteIndex":0},"schema":"https://github.com/citation-style-language/schema/raw/master/csl-citation.json"}</w:instrText>
       </w:r>
       <w:r>
         <w:fldChar w:fldCharType="separate"/>
@@ -1254,7 +1254,7 @@
         <w:fldChar w:fldCharType="begin"/>
       </w:r>
       <w:r>
-        <w:instrText xml:space="preserve">ADDIN CSL_CITATION {"citationID":"MENDELEY_CITATION_12","citationItems":[{"id":"ITEM-12","isTemporary":false,"itemData":{"DOI":"10.1007/s42484-024-00225-5","author":[{"family":"Yan","given":"Fei"},{"family":"Iliyasu","given":"Abdullah M."},{"family":"Li","given":"Nianqiao"},{"family":"Salama","given":"Ahmed S."},{"family":"Hirota","given":"Kaoru"}],"container-title":"Quantum Machine Intelligence","id":"Yan2024","issue":"2","issued":{"date-parts":[[2024]]},"page":"86","publisher":"Springer","title":"Quantum robotics: A review of emerging trends","title-short":"Quantum robotics","type":"article-journal","volume":"6"},"suppress-author":false}],"isEdited":false,"manualOverride":{"citeprocText":"Yan et al. (2024)","isManuallyOverridden":false,"manualOverrideText":""},"mendeley":{"formattedCitation":"Yan et al. (2024)","plainTextFormattedCitation":"Yan et al. (2024)","previouslyFormattedCitation":"Yan et al. (2024)"},"properties":{"noteIndex":0},"schema":"https://github.com/citation-style-language/schema/raw/master/csl-citation.json"}</w:instrText>
+        <w:instrText xml:space="preserve">ADDIN CSL_CITATION {"citationItems":[{"id":"ITEM-1","itemData":{"DOI":"10.1007/s42484-024-00225-5","author":[{"family":"Yan","given":"Fei"},{"family":"Iliyasu","given":"Abdullah M."},{"family":"Li","given":"Nianqiao"},{"family":"Salama","given":"Ahmed S."},{"family":"Hirota","given":"Kaoru"}],"container-title":"Quantum Machine Intelligence","id":"ITEM-1","issue":"2","issued":{"date-parts":[[2024]]},"page":"86","publisher":"Springer","title":"Quantum robotics: A review of emerging trends","title-short":"Quantum robotics","type":"article-journal","volume":"6"}}],"mendeley":{"formattedCitation":"Yan et al. (2024)","plainTextFormattedCitation":"Yan et al. (2024)","previouslyFormattedCitation":"Yan et al. (2024)"},"properties":{"noteIndex":0},"schema":"https://github.com/citation-style-language/schema/raw/master/csl-citation.json"}</w:instrText>
       </w:r>
       <w:r>
         <w:fldChar w:fldCharType="separate"/>
@@ -1278,7 +1278,7 @@
         <w:fldChar w:fldCharType="begin"/>
       </w:r>
       <w:r>
-        <w:instrText xml:space="preserve">ADDIN CSL_CITATION {"citationID":"MENDELEY_CITATION_13","citationItems":[{"id":"ITEM-13","isTemporary":false,"itemData":{"DOI":"10.65218/jius.2026.13","author":[{"family":"Nigatu","given":"Hassen"},{"family":"Shi","given":"Gaokun"},{"family":"Li","given":"Jituo"},{"family":"Lu","given":"Guodong"},{"family":"Li","given":"Howard"}],"container-title":"Journal of Intelligent and Unmanned Systems","id":"Nigatu2026","issue":"1","issued":{"date-parts":[[2026]]},"page":"13","title":"Quantum machine learning for robotics: A comprehensive review of algorithms, applications, and future directions","title-short":"Quantum machine learning for robotics","type":"article-journal","volume":"1"},"suppress-author":false}],"isEdited":false,"manualOverride":{"citeprocText":"Nigatu et al. (2026)","isManuallyOverridden":false,"manualOverrideText":""},"mendeley":{"formattedCitation":"Nigatu et al. (2026)","plainTextFormattedCitation":"Nigatu et al. (2026)","previouslyFormattedCitation":"Nigatu et al. (2026)"},"properties":{"noteIndex":0},"schema":"https://github.com/citation-style-language/schema/raw/master/csl-citation.json"}</w:instrText>
+        <w:instrText xml:space="preserve">ADDIN CSL_CITATION {"citationItems":[{"id":"ITEM-1","itemData":{"DOI":"10.65218/jius.2026.13","author":[{"family":"Nigatu","given":"Hassen"},{"family":"Shi","given":"Gaokun"},{"family":"Li","given":"Jituo"},{"family":"Lu","given":"Guodong"},{"family":"Li","given":"Howard"}],"container-title":"Journal of Intelligent and Unmanned Systems","id":"ITEM-1","issue":"1","issued":{"date-parts":[[2026]]},"page":"13","title":"Quantum machine learning for robotics: A comprehensive review of algorithms, applications, and future directions","title-short":"Quantum machine learning for robotics","type":"article-journal","volume":"1"}}],"mendeley":{"formattedCitation":"Nigatu et al. (2026)","plainTextFormattedCitation":"Nigatu et al. (2026)","previouslyFormattedCitation":"Nigatu et al. (2026)"},"properties":{"noteIndex":0},"schema":"https://github.com/citation-style-language/schema/raw/master/csl-citation.json"}</w:instrText>
       </w:r>
       <w:r>
         <w:fldChar w:fldCharType="separate"/>
@@ -1302,7 +1302,7 @@
         <w:fldChar w:fldCharType="begin"/>
       </w:r>
       <w:r>
-        <w:instrText xml:space="preserve">ADDIN CSL_CITATION {"citationID":"MENDELEY_CITATION_14","citationItems":[{"id":"ITEM-14","isTemporary":false,"itemData":{"URL":"https://papers.ssrn.com/sol3/papers.cfm?abstract_id=7383818","author":[{"family":"Udekwe","given":"Daniel"}],"id":"Udekwe2025","issued":{"date-parts":[[2025]]},"publisher":"SSRN preprint 7383818","title":"Quantum computing in robotics: A review of optimization, search, and machine learning approaches","title-short":"Quantum computing in robotics","type":""},"suppress-author":false}],"isEdited":false,"manualOverride":{"citeprocText":"Udekwe (2025)","isManuallyOverridden":false,"manualOverrideText":""},"mendeley":{"formattedCitation":"Udekwe (2025)","plainTextFormattedCitation":"Udekwe (2025)","previouslyFormattedCitation":"Udekwe (2025)"},"properties":{"noteIndex":0},"schema":"https://github.com/citation-style-language/schema/raw/master/csl-citation.json"}</w:instrText>
+        <w:instrText xml:space="preserve">ADDIN CSL_CITATION {"citationItems":[{"id":"ITEM-1","itemData":{"URL":"https://papers.ssrn.com/sol3/papers.cfm?abstract_id=7383818","author":[{"family":"Udekwe","given":"Daniel"}],"id":"ITEM-1","issued":{"date-parts":[[2025]]},"publisher":"SSRN preprint 7383818","title":"Quantum computing in robotics: A review of optimization, search, and machine learning approaches","title-short":"Quantum computing in robotics","type":""}}],"mendeley":{"formattedCitation":"Udekwe (2025)","plainTextFormattedCitation":"Udekwe (2025)","previouslyFormattedCitation":"Udekwe (2025)"},"properties":{"noteIndex":0},"schema":"https://github.com/citation-style-language/schema/raw/master/csl-citation.json"}</w:instrText>
       </w:r>
       <w:r>
         <w:fldChar w:fldCharType="separate"/>
@@ -1323,7 +1323,7 @@
         <w:fldChar w:fldCharType="begin"/>
       </w:r>
       <w:r>
-        <w:instrText xml:space="preserve">ADDIN CSL_CITATION {"citationID":"MENDELEY_CITATION_15","citationItems":[{"id":"ITEM-15","isTemporary":false,"itemData":{"DOI":"10.1109/ICAAID68975.2025.11358227","author":[{"family":"Fazilat","given":"Mehdi"},{"family":"Zioui","given":"Nadjet"}],"container-title":"2025 5th international conference on applied automation and industrial diagnostics (ICAAID)","id":"Fazilat2025a","issued":{"date-parts":[[2025]]},"publisher":"IEEE","publisher-place":"Piscataway, NJ, USA","title":"A brief review on quantum-based control strategies for robotic systems","type":"paper-conference"}}],"isEdited":false,"manualOverride":{"citeprocText":"(Fazilat and Zioui 2025)","isManuallyOverridden":false,"manualOverrideText":""},"mendeley":{"formattedCitation":"(Fazilat and Zioui 2025)","plainTextFormattedCitation":"(Fazilat and Zioui 2025)","previouslyFormattedCitation":"(Fazilat and Zioui 2025)"},"properties":{"noteIndex":0},"schema":"https://github.com/citation-style-language/schema/raw/master/csl-citation.json"}</w:instrText>
+        <w:instrText xml:space="preserve">ADDIN CSL_CITATION {"citationItems":[{"id":"ITEM-1","itemData":{"DOI":"10.1109/ICAAID68975.2025.11358227","author":[{"family":"Fazilat","given":"Mehdi"},{"family":"Zioui","given":"Nadjet"}],"container-title":"2025 5th international conference on applied automation and industrial diagnostics (ICAAID)","id":"ITEM-1","issued":{"date-parts":[[2025]]},"publisher":"IEEE","publisher-place":"Piscataway, NJ, USA","title":"A brief review on quantum-based control strategies for robotic systems","type":"paper-conference"}}],"mendeley":{"formattedCitation":"(Fazilat and Zioui 2025)","plainTextFormattedCitation":"(Fazilat and Zioui 2025)","previouslyFormattedCitation":"(Fazilat and Zioui 2025)"},"properties":{"noteIndex":0},"schema":"https://github.com/citation-style-language/schema/raw/master/csl-citation.json"}</w:instrText>
       </w:r>
       <w:r>
         <w:fldChar w:fldCharType="separate"/>
@@ -1344,7 +1344,7 @@
         <w:fldChar w:fldCharType="begin"/>
       </w:r>
       <w:r>
-        <w:instrText xml:space="preserve">ADDIN CSL_CITATION {"citationID":"MENDELEY_CITATION_16","citationItems":[{"id":"ITEM-16","isTemporary":false,"itemData":{"DOI":"10.53759/181X/JCNS202404006","author":[{"family":"Haldorai","given":"Anandakumar"}],"container-title":"Journal of Computing and Natural Science","id":"Haldorai2024","issue":"4","issued":{"date-parts":[[2024]]},"title":"Advancements and applications of quantum computing in robotics","type":"article-journal","volume":"2"}}],"isEdited":false,"manualOverride":{"citeprocText":"(Haldorai 2024)","isManuallyOverridden":false,"manualOverrideText":""},"mendeley":{"formattedCitation":"(Haldorai 2024)","plainTextFormattedCitation":"(Haldorai 2024)","previouslyFormattedCitation":"(Haldorai 2024)"},"properties":{"noteIndex":0},"schema":"https://github.com/citation-style-language/schema/raw/master/csl-citation.json"}</w:instrText>
+        <w:instrText xml:space="preserve">ADDIN CSL_CITATION {"citationItems":[{"id":"ITEM-1","itemData":{"DOI":"10.53759/181X/JCNS202404006","author":[{"family":"Haldorai","given":"Anandakumar"}],"container-title":"Journal of Computing and Natural Science","id":"ITEM-1","issue":"4","issued":{"date-parts":[[2024]]},"title":"Advancements and applications of quantum computing in robotics","type":"article-journal","volume":"2"}}],"mendeley":{"formattedCitation":"(Haldorai 2024)","plainTextFormattedCitation":"(Haldorai 2024)","previouslyFormattedCitation":"(Haldorai 2024)"},"properties":{"noteIndex":0},"schema":"https://github.com/citation-style-language/schema/raw/master/csl-citation.json"}</w:instrText>
       </w:r>
       <w:r>
         <w:fldChar w:fldCharType="separate"/>
@@ -1362,7 +1362,7 @@
         <w:fldChar w:fldCharType="begin"/>
       </w:r>
       <w:r>
-        <w:instrText xml:space="preserve">ADDIN CSL_CITATION {"citationID":"MENDELEY_CITATION_17","citationItems":[{"id":"ITEM-17","isTemporary":false,"itemData":{"DOI":"10.1002/spe.3039","author":[{"family":"Gill","given":"Sukhpal Singh"},{"family":"Kumar","given":"Adarsh"},{"family":"Singh","given":"Harvinder"},{"family":"Singh","given":"Manmeet"},{"family":"Kaur","given":"Kamalpreet"},{"family":"Usman","given":"Muhammad"},{"family":"Buyya","given":"Rajkumar"}],"container-title":"Software: Practice and Experience","id":"Gill2022","issue":"1","issued":{"date-parts":[[2022]]},"page":"66-114","publisher":"Wiley","title":"Quantum computing: A taxonomy, systematic review and future directions","title-short":"Quantum computing","type":"article-journal","volume":"52"}}],"isEdited":false,"manualOverride":{"citeprocText":"(Gill et al. 2022)","isManuallyOverridden":false,"manualOverrideText":""},"mendeley":{"formattedCitation":"(Gill et al. 2022)","plainTextFormattedCitation":"(Gill et al. 2022)","previouslyFormattedCitation":"(Gill et al. 2022)"},"properties":{"noteIndex":0},"schema":"https://github.com/citation-style-language/schema/raw/master/csl-citation.json"}</w:instrText>
+        <w:instrText xml:space="preserve">ADDIN CSL_CITATION {"citationItems":[{"id":"ITEM-1","itemData":{"DOI":"10.1002/spe.3039","author":[{"family":"Gill","given":"Sukhpal Singh"},{"family":"Kumar","given":"Adarsh"},{"family":"Singh","given":"Harvinder"},{"family":"Singh","given":"Manmeet"},{"family":"Kaur","given":"Kamalpreet"},{"family":"Usman","given":"Muhammad"},{"family":"Buyya","given":"Rajkumar"}],"container-title":"Software: Practice and Experience","id":"ITEM-1","issue":"1","issued":{"date-parts":[[2022]]},"page":"66-114","publisher":"Wiley","title":"Quantum computing: A taxonomy, systematic review and future directions","title-short":"Quantum computing","type":"article-journal","volume":"52"}}],"mendeley":{"formattedCitation":"(Gill et al. 2022)","plainTextFormattedCitation":"(Gill et al. 2022)","previouslyFormattedCitation":"(Gill et al. 2022)"},"properties":{"noteIndex":0},"schema":"https://github.com/citation-style-language/schema/raw/master/csl-citation.json"}</w:instrText>
       </w:r>
       <w:r>
         <w:fldChar w:fldCharType="separate"/>
@@ -1380,7 +1380,7 @@
         <w:fldChar w:fldCharType="begin"/>
       </w:r>
       <w:r>
-        <w:instrText xml:space="preserve">ADDIN CSL_CITATION {"citationID":"MENDELEY_CITATION_18","citationItems":[{"id":"ITEM-18","isTemporary":false,"itemData":{"DOI":"10.1016/j.ijcce.2025.08.002","author":[{"family":"Garcı́a Pineda","given":"Vanessa"},{"family":"Valencia-Arias","given":"Alejandro"},{"family":"López Giraldo","given":"Francisco Eugenio"},{"family":"Zapata-Ochoa","given":"Edison Andrés"}],"container-title":"International Journal of Cognitive Computing in Engineering","id":"GarciaPineda2026","issued":{"date-parts":[[2026]]},"page":"26-39","publisher":"KeAi","title":"Integrating artificial intelligence and quantum computing: A systematic literature review of features and applications","title-short":"Integrating artificial intelligence and quantum computing","type":"article-journal","volume":"7"}}],"isEdited":false,"manualOverride":{"citeprocText":"(Garcı́a Pineda et al. 2026)","isManuallyOverridden":false,"manualOverrideText":""},"mendeley":{"formattedCitation":"(Garcı́a Pineda et al. 2026)","plainTextFormattedCitation":"(Garcı́a Pineda et al. 2026)","previouslyFormattedCitation":"(Garcı́a Pineda et al. 2026)"},"properties":{"noteIndex":0},"schema":"https://github.com/citation-style-language/schema/raw/master/csl-citation.json"}</w:instrText>
+        <w:instrText xml:space="preserve">ADDIN CSL_CITATION {"citationItems":[{"id":"ITEM-1","itemData":{"DOI":"10.1016/j.ijcce.2025.08.002","author":[{"family":"Garcı́a Pineda","given":"Vanessa"},{"family":"Valencia-Arias","given":"Alejandro"},{"family":"López Giraldo","given":"Francisco Eugenio"},{"family":"Zapata-Ochoa","given":"Edison Andrés"}],"container-title":"International Journal of Cognitive Computing in Engineering","id":"ITEM-1","issued":{"date-parts":[[2026]]},"page":"26-39","publisher":"KeAi","title":"Integrating artificial intelligence and quantum computing: A systematic literature review of features and applications","title-short":"Integrating artificial intelligence and quantum computing","type":"article-journal","volume":"7"}}],"mendeley":{"formattedCitation":"(Garcı́a Pineda et al. 2026)","plainTextFormattedCitation":"(Garcı́a Pineda et al. 2026)","previouslyFormattedCitation":"(Garcı́a Pineda et al. 2026)"},"properties":{"noteIndex":0},"schema":"https://github.com/citation-style-language/schema/raw/master/csl-citation.json"}</w:instrText>
       </w:r>
       <w:r>
         <w:fldChar w:fldCharType="separate"/>
@@ -1401,7 +1401,7 @@
         <w:fldChar w:fldCharType="begin"/>
       </w:r>
       <w:r>
-        <w:instrText xml:space="preserve">ADDIN CSL_CITATION {"citationID":"MENDELEY_CITATION_19","citationItems":[{"id":"ITEM-19","isTemporary":false,"itemData":{"DOI":"10.48550/arXiv.2505.10012","URL":"https://arxiv.org/abs/2505.10012","author":[{"family":"Kadowaki","given":"Tadashi"}],"id":"Kadowaki2025","issued":{"date-parts":[[2025]]},"title":"Quantum computing and AI: Perspectives on advanced automation in science and engineering","title-short":"Quantum computing and AI","type":""}}],"isEdited":false,"manualOverride":{"citeprocText":"(Kadowaki 2025)","isManuallyOverridden":false,"manualOverrideText":""},"mendeley":{"formattedCitation":"(Kadowaki 2025)","plainTextFormattedCitation":"(Kadowaki 2025)","previouslyFormattedCitation":"(Kadowaki 2025)"},"properties":{"noteIndex":0},"schema":"https://github.com/citation-style-language/schema/raw/master/csl-citation.json"}</w:instrText>
+        <w:instrText xml:space="preserve">ADDIN CSL_CITATION {"citationItems":[{"id":"ITEM-1","itemData":{"DOI":"10.48550/arXiv.2505.10012","URL":"https://arxiv.org/abs/2505.10012","author":[{"family":"Kadowaki","given":"Tadashi"}],"id":"ITEM-1","issued":{"date-parts":[[2025]]},"title":"Quantum computing and AI: Perspectives on advanced automation in science and engineering","title-short":"Quantum computing and AI","type":""}}],"mendeley":{"formattedCitation":"(Kadowaki 2025)","plainTextFormattedCitation":"(Kadowaki 2025)","previouslyFormattedCitation":"(Kadowaki 2025)"},"properties":{"noteIndex":0},"schema":"https://github.com/citation-style-language/schema/raw/master/csl-citation.json"}</w:instrText>
       </w:r>
       <w:r>
         <w:fldChar w:fldCharType="separate"/>
@@ -1419,7 +1419,7 @@
         <w:fldChar w:fldCharType="begin"/>
       </w:r>
       <w:r>
-        <w:instrText xml:space="preserve">ADDIN CSL_CITATION {"citationID":"MENDELEY_CITATION_21","citationItems":[{"id":"ITEM-20","isTemporary":false,"itemData":{"URL":"https://arxiv.org/abs/2211.03464","author":[{"family":"Meyer","given":"Nico"},{"family":"Ufrecht","given":"Christian"},{"family":"Periyasamy","given":"Maniraman"},{"family":"Scherer","given":"Daniel D."},{"family":"Plinge","given":"Axel"},{"family":"Mutschler","given":"Christopher"}],"id":"Meyer2022","issued":{"date-parts":[[2022]]},"title":"A survey on quantum reinforcement learning","type":""}},{"id":"ITEM-21","isTemporary":false,"itemData":{"URL":"https://arxiv.org/abs/2510.14595","author":[{"family":"Kaldari","given":"Jawaher"},{"family":"Tariq","given":"Shehbaz"},{"family":"Al-Kuwari","given":"Saif"},{"family":"Chen","given":"Samuel Yen-Chi"},{"family":"Chatzinotas","given":"Symeon"},{"family":"Shin","given":"Hyundong"}],"id":"Kaldari2025","issued":{"date-parts":[[2025]]},"title":"Quantum reinforcement learning: Recent advances and future directions","title-short":"Quantum reinforcement learning","type":""}}],"isEdited":false,"manualOverride":{"citeprocText":"(Meyer et al. 2022; Kaldari et al. 2025)","isManuallyOverridden":false,"manualOverrideText":""},"mendeley":{"formattedCitation":"(Meyer et al. 2022; Kaldari et al. 2025)","plainTextFormattedCitation":"(Meyer et al. 2022; Kaldari et al. 2025)","previouslyFormattedCitation":"(Meyer et al. 2022; Kaldari et al. 2025)"},"properties":{"noteIndex":0},"schema":"https://github.com/citation-style-language/schema/raw/master/csl-citation.json"}</w:instrText>
+        <w:instrText xml:space="preserve">ADDIN CSL_CITATION {"citationItems":[{"id":"ITEM-1","itemData":{"URL":"https://arxiv.org/abs/2211.03464","author":[{"family":"Meyer","given":"Nico"},{"family":"Ufrecht","given":"Christian"},{"family":"Periyasamy","given":"Maniraman"},{"family":"Scherer","given":"Daniel D."},{"family":"Plinge","given":"Axel"},{"family":"Mutschler","given":"Christopher"}],"id":"ITEM-1","issued":{"date-parts":[[2022]]},"title":"A survey on quantum reinforcement learning","type":""}},{"id":"ITEM-2","itemData":{"URL":"https://arxiv.org/abs/2510.14595","author":[{"family":"Kaldari","given":"Jawaher"},{"family":"Tariq","given":"Shehbaz"},{"family":"Al-Kuwari","given":"Saif"},{"family":"Chen","given":"Samuel Yen-Chi"},{"family":"Chatzinotas","given":"Symeon"},{"family":"Shin","given":"Hyundong"}],"id":"ITEM-2","issued":{"date-parts":[[2025]]},"title":"Quantum reinforcement learning: Recent advances and future directions","title-short":"Quantum reinforcement learning","type":""}}],"mendeley":{"formattedCitation":"(Meyer et al. 2022; Kaldari et al. 2025)","plainTextFormattedCitation":"(Meyer et al. 2022; Kaldari et al. 2025)","previouslyFormattedCitation":"(Meyer et al. 2022; Kaldari et al. 2025)"},"properties":{"noteIndex":0},"schema":"https://github.com/citation-style-language/schema/raw/master/csl-citation.json"}</w:instrText>
       </w:r>
       <w:r>
         <w:fldChar w:fldCharType="separate"/>
@@ -1437,7 +1437,7 @@
         <w:fldChar w:fldCharType="begin"/>
       </w:r>
       <w:r>
-        <w:instrText xml:space="preserve">ADDIN CSL_CITATION {"citationID":"MENDELEY_CITATION_23","citationItems":[{"id":"ITEM-22","isTemporary":false,"itemData":{"DOI":"10.48550/arXiv.2401.11351","URL":"https://arxiv.org/abs/2401.11351","author":[{"family":"Wang","given":"Yunfei"},{"family":"Liu","given":"Junyu"}],"id":"Wang2024","issued":{"date-parts":[[2024]]},"title":"A comprehensive review of quantum machine learning: From NISQ to fault tolerance","title-short":"A comprehensive review of quantum machine learning","type":""}},{"id":"ITEM-23","isTemporary":false,"itemData":{"DOI":"10.1145/3764582","author":[{"family":"Rodríguez-Díaz","given":"Francesc"},{"family":"Gutiérrez-Avilés","given":"David"},{"family":"Troncoso","given":"Alicia"},{"family":"Martínez-Álvarez","given":"Francisco"}],"container-title":"ACM Computing Surveys","id":"RodriguezDiaz2025","issue":"4","issued":{"date-parts":[[2025]]},"title":"A survey of quantum machine learning: Foundations, algorithms, frameworks, data and applications","title-short":"A survey of quantum machine learning","type":"article-journal","volume":"58"}}],"isEdited":false,"manualOverride":{"citeprocText":"(Y. Wang and Liu 2024; Rodríguez-Díaz et al. 2025)","isManuallyOverridden":false,"manualOverrideText":""},"mendeley":{"formattedCitation":"(Y. Wang and Liu 2024; Rodríguez-Díaz et al. 2025)","plainTextFormattedCitation":"(Y. Wang and Liu 2024; Rodríguez-Díaz et al. 2025)","previouslyFormattedCitation":"(Y. Wang and Liu 2024; Rodríguez-Díaz et al. 2025)"},"properties":{"noteIndex":0},"schema":"https://github.com/citation-style-language/schema/raw/master/csl-citation.json"}</w:instrText>
+        <w:instrText xml:space="preserve">ADDIN CSL_CITATION {"citationItems":[{"id":"ITEM-1","itemData":{"DOI":"10.48550/arXiv.2401.11351","URL":"https://arxiv.org/abs/2401.11351","author":[{"family":"Wang","given":"Yunfei"},{"family":"Liu","given":"Junyu"}],"id":"ITEM-1","issued":{"date-parts":[[2024]]},"title":"A comprehensive review of quantum machine learning: From NISQ to fault tolerance","title-short":"A comprehensive review of quantum machine learning","type":""}},{"id":"ITEM-2","itemData":{"DOI":"10.1145/3764582","author":[{"family":"Rodríguez-Díaz","given":"Francesc"},{"family":"Gutiérrez-Avilés","given":"David"},{"family":"Troncoso","given":"Alicia"},{"family":"Martínez-Álvarez","given":"Francisco"}],"container-title":"ACM Computing Surveys","id":"ITEM-2","issue":"4","issued":{"date-parts":[[2025]]},"title":"A survey of quantum machine learning: Foundations, algorithms, frameworks, data and applications","title-short":"A survey of quantum machine learning","type":"article-journal","volume":"58"}}],"mendeley":{"formattedCitation":"(Y. Wang and Liu 2024; Rodríguez-Díaz et al. 2025)","plainTextFormattedCitation":"(Y. Wang and Liu 2024; Rodríguez-Díaz et al. 2025)","previouslyFormattedCitation":"(Y. Wang and Liu 2024; Rodríguez-Díaz et al. 2025)"},"properties":{"noteIndex":0},"schema":"https://github.com/citation-style-language/schema/raw/master/csl-citation.json"}</w:instrText>
       </w:r>
       <w:r>
         <w:fldChar w:fldCharType="separate"/>
@@ -1455,7 +1455,7 @@
         <w:fldChar w:fldCharType="begin"/>
       </w:r>
       <w:r>
-        <w:instrText xml:space="preserve">ADDIN CSL_CITATION {"citationID":"MENDELEY_CITATION_24","citationItems":[{"id":"ITEM-24","isTemporary":false,"itemData":{"URL":"https://arxiv.org/abs/2406.00862","author":[{"family":"Zhuang","given":"Yifan"},{"family":"Azfar","given":"Talha"},{"family":"Wang","given":"Yinhai"},{"family":"Sun","given":"Wei"},{"family":"Wang","given":"Xiaokun Cara"},{"family":"Guo","given":"Qianwen Vivian"},{"family":"Ke","given":"Ruimin"}],"id":"Zhuang2024","issued":{"date-parts":[[2024]]},"title":"Quantum computing in intelligent transportation systems: A survey","title-short":"Quantum computing in intelligent transportation systems","type":""}}],"isEdited":false,"manualOverride":{"citeprocText":"(Zhuang et al. 2024)","isManuallyOverridden":false,"manualOverrideText":""},"mendeley":{"formattedCitation":"(Zhuang et al. 2024)","plainTextFormattedCitation":"(Zhuang et al. 2024)","previouslyFormattedCitation":"(Zhuang et al. 2024)"},"properties":{"noteIndex":0},"schema":"https://github.com/citation-style-language/schema/raw/master/csl-citation.json"}</w:instrText>
+        <w:instrText xml:space="preserve">ADDIN CSL_CITATION {"citationItems":[{"id":"ITEM-1","itemData":{"URL":"https://arxiv.org/abs/2406.00862","author":[{"family":"Zhuang","given":"Yifan"},{"family":"Azfar","given":"Talha"},{"family":"Wang","given":"Yinhai"},{"family":"Sun","given":"Wei"},{"family":"Wang","given":"Xiaokun Cara"},{"family":"Guo","given":"Qianwen Vivian"},{"family":"Ke","given":"Ruimin"}],"id":"ITEM-1","issued":{"date-parts":[[2024]]},"title":"Quantum computing in intelligent transportation systems: A survey","title-short":"Quantum computing in intelligent transportation systems","type":""}}],"mendeley":{"formattedCitation":"(Zhuang et al. 2024)","plainTextFormattedCitation":"(Zhuang et al. 2024)","previouslyFormattedCitation":"(Zhuang et al. 2024)"},"properties":{"noteIndex":0},"schema":"https://github.com/citation-style-language/schema/raw/master/csl-citation.json"}</w:instrText>
       </w:r>
       <w:r>
         <w:fldChar w:fldCharType="separate"/>
@@ -1501,7 +1501,7 @@
         <w:fldChar w:fldCharType="begin"/>
       </w:r>
       <w:r>
-        <w:instrText xml:space="preserve">ADDIN CSL_CITATION {"citationID":"MENDELEY_CITATION_25","citationItems":[{"id":"ITEM-25","isTemporary":false,"itemData":{"DOI":"10.65218/jius.2026.13","author":[{"family":"Nigatu","given":"Hassen"},{"family":"Shi","given":"Gaokun"},{"family":"Li","given":"Jituo"},{"family":"Lu","given":"Guodong"},{"family":"Li","given":"Howard"}],"container-title":"Journal of Intelligent and Unmanned Systems","id":"Nigatu2026","issue":"1","issued":{"date-parts":[[2026]]},"page":"13","title":"Quantum machine learning for robotics: A comprehensive review of algorithms, applications, and future directions","title-short":"Quantum machine learning for robotics","type":"article-journal","volume":"1"},"suppress-author":false}],"isEdited":false,"manualOverride":{"citeprocText":"Nigatu et al. (2026)","isManuallyOverridden":false,"manualOverrideText":""},"mendeley":{"formattedCitation":"Nigatu et al. (2026)","plainTextFormattedCitation":"Nigatu et al. (2026)","previouslyFormattedCitation":"Nigatu et al. (2026)"},"properties":{"noteIndex":0},"schema":"https://github.com/citation-style-language/schema/raw/master/csl-citation.json"}</w:instrText>
+        <w:instrText xml:space="preserve">ADDIN CSL_CITATION {"citationItems":[{"id":"ITEM-1","itemData":{"DOI":"10.65218/jius.2026.13","author":[{"family":"Nigatu","given":"Hassen"},{"family":"Shi","given":"Gaokun"},{"family":"Li","given":"Jituo"},{"family":"Lu","given":"Guodong"},{"family":"Li","given":"Howard"}],"container-title":"Journal of Intelligent and Unmanned Systems","id":"ITEM-1","issue":"1","issued":{"date-parts":[[2026]]},"page":"13","title":"Quantum machine learning for robotics: A comprehensive review of algorithms, applications, and future directions","title-short":"Quantum machine learning for robotics","type":"article-journal","volume":"1"}}],"mendeley":{"formattedCitation":"Nigatu et al. (2026)","plainTextFormattedCitation":"Nigatu et al. (2026)","previouslyFormattedCitation":"Nigatu et al. (2026)"},"properties":{"noteIndex":0},"schema":"https://github.com/citation-style-language/schema/raw/master/csl-citation.json"}</w:instrText>
       </w:r>
       <w:r>
         <w:fldChar w:fldCharType="separate"/>
@@ -1525,7 +1525,7 @@
         <w:fldChar w:fldCharType="begin"/>
       </w:r>
       <w:r>
-        <w:instrText xml:space="preserve">ADDIN CSL_CITATION {"citationID":"MENDELEY_CITATION_26","citationItems":[{"id":"ITEM-26","isTemporary":false,"itemData":{"URL":"https://papers.ssrn.com/sol3/papers.cfm?abstract_id=7383818","author":[{"family":"Udekwe","given":"Daniel"}],"id":"Udekwe2025","issued":{"date-parts":[[2025]]},"publisher":"SSRN preprint 7383818","title":"Quantum computing in robotics: A review of optimization, search, and machine learning approaches","title-short":"Quantum computing in robotics","type":""},"suppress-author":false}],"isEdited":false,"manualOverride":{"citeprocText":"Udekwe (2025)","isManuallyOverridden":false,"manualOverrideText":""},"mendeley":{"formattedCitation":"Udekwe (2025)","plainTextFormattedCitation":"Udekwe (2025)","previouslyFormattedCitation":"Udekwe (2025)"},"properties":{"noteIndex":0},"schema":"https://github.com/citation-style-language/schema/raw/master/csl-citation.json"}</w:instrText>
+        <w:instrText xml:space="preserve">ADDIN CSL_CITATION {"citationItems":[{"id":"ITEM-1","itemData":{"URL":"https://papers.ssrn.com/sol3/papers.cfm?abstract_id=7383818","author":[{"family":"Udekwe","given":"Daniel"}],"id":"ITEM-1","issued":{"date-parts":[[2025]]},"publisher":"SSRN preprint 7383818","title":"Quantum computing in robotics: A review of optimization, search, and machine learning approaches","title-short":"Quantum computing in robotics","type":""}}],"mendeley":{"formattedCitation":"Udekwe (2025)","plainTextFormattedCitation":"Udekwe (2025)","previouslyFormattedCitation":"Udekwe (2025)"},"properties":{"noteIndex":0},"schema":"https://github.com/citation-style-language/schema/raw/master/csl-citation.json"}</w:instrText>
       </w:r>
       <w:r>
         <w:fldChar w:fldCharType="separate"/>
@@ -1767,7 +1767,7 @@
               <w:fldChar w:fldCharType="begin"/>
             </w:r>
             <w:r>
-              <w:instrText xml:space="preserve">ADDIN CSL_CITATION {"citationID":"MENDELEY_CITATION_27","citationItems":[{"id":"ITEM-27","isTemporary":false,"itemData":{"DOI":"10.2200/S00746ED1V01Y201612QMC010","author":[{"family":"Tandon","given":"Prateek"},{"family":"Lam","given":"Stanley"},{"family":"Shih","given":"Ben"},{"family":"Mehta","given":"Tanay"},{"family":"Mitev","given":"Alex"},{"family":"Ong","given":"Zhiyang"}],"collection-title":"Synthesis lectures on quantum computing","id":"Tandon2017","issued":{"date-parts":[[2017]]},"publisher":"Morgan &amp; Claypool Publishers","publisher-place":"San Rafael, CA, USA","title":"Quantum robotics: A primer on current science and future perspectives","title-short":"Quantum robotics","type":"book"},"suppress-author":false}],"isEdited":false,"manualOverride":{"citeprocText":"Tandon et al. (2017)","isManuallyOverridden":false,"manualOverrideText":""},"mendeley":{"formattedCitation":"Tandon et al. (2017)","plainTextFormattedCitation":"Tandon et al. (2017)","previouslyFormattedCitation":"Tandon et al. (2017)"},"properties":{"noteIndex":0},"schema":"https://github.com/citation-style-language/schema/raw/master/csl-citation.json"}</w:instrText>
+              <w:instrText xml:space="preserve">ADDIN CSL_CITATION {"citationItems":[{"id":"ITEM-1","itemData":{"DOI":"10.2200/S00746ED1V01Y201612QMC010","author":[{"family":"Tandon","given":"Prateek"},{"family":"Lam","given":"Stanley"},{"family":"Shih","given":"Ben"},{"family":"Mehta","given":"Tanay"},{"family":"Mitev","given":"Alex"},{"family":"Ong","given":"Zhiyang"}],"collection-title":"Synthesis lectures on quantum computing","id":"ITEM-1","issued":{"date-parts":[[2017]]},"publisher":"Morgan &amp; Claypool Publishers","publisher-place":"San Rafael, CA, USA","title":"Quantum robotics: A primer on current science and future perspectives","title-short":"Quantum robotics","type":"book"}}],"mendeley":{"formattedCitation":"Tandon et al. (2017)","plainTextFormattedCitation":"Tandon et al. (2017)","previouslyFormattedCitation":"Tandon et al. (2017)"},"properties":{"noteIndex":0},"schema":"https://github.com/citation-style-language/schema/raw/master/csl-citation.json"}</w:instrText>
             </w:r>
             <w:r>
               <w:fldChar w:fldCharType="separate"/>
@@ -1893,7 +1893,7 @@
               <w:fldChar w:fldCharType="begin"/>
             </w:r>
             <w:r>
-              <w:instrText xml:space="preserve">ADDIN CSL_CITATION {"citationID":"MENDELEY_CITATION_28","citationItems":[{"id":"ITEM-28","isTemporary":false,"itemData":{"DOI":"10.1109/ICRA.2019.8793768","author":[{"family":"Petschnigg","given":"Christina"},{"family":"Brandstötter","given":"Mathias"},{"family":"Pichler","given":"Horst"},{"family":"Hofbaur","given":"Michael W."},{"family":"Dieber","given":"Bernhard"}],"container-title":"Proceedings of the 2019 international conference on robotics and automation (ICRA)","id":"Petschnigg2019","issued":{"date-parts":[[2019]]},"page":"803-810","publisher":"IEEE","publisher-place":"Piscataway, NJ, USA","title":"Quantum computation in robotic science and applications","type":"paper-conference"},"suppress-author":false}],"isEdited":false,"manualOverride":{"citeprocText":"Petschnigg et al. (2019)","isManuallyOverridden":false,"manualOverrideText":""},"mendeley":{"formattedCitation":"Petschnigg et al. (2019)","plainTextFormattedCitation":"Petschnigg et al. (2019)","previouslyFormattedCitation":"Petschnigg et al. (2019)"},"properties":{"noteIndex":0},"schema":"https://github.com/citation-style-language/schema/raw/master/csl-citation.json"}</w:instrText>
+              <w:instrText xml:space="preserve">ADDIN CSL_CITATION {"citationItems":[{"id":"ITEM-1","itemData":{"DOI":"10.1109/ICRA.2019.8793768","author":[{"family":"Petschnigg","given":"Christina"},{"family":"Brandstötter","given":"Mathias"},{"family":"Pichler","given":"Horst"},{"family":"Hofbaur","given":"Michael W."},{"family":"Dieber","given":"Bernhard"}],"container-title":"Proceedings of the 2019 international conference on robotics and automation (ICRA)","id":"ITEM-1","issued":{"date-parts":[[2019]]},"page":"803-810","publisher":"IEEE","publisher-place":"Piscataway, NJ, USA","title":"Quantum computation in robotic science and applications","type":"paper-conference"}}],"mendeley":{"formattedCitation":"Petschnigg et al. (2019)","plainTextFormattedCitation":"Petschnigg et al. (2019)","previouslyFormattedCitation":"Petschnigg et al. (2019)"},"properties":{"noteIndex":0},"schema":"https://github.com/citation-style-language/schema/raw/master/csl-citation.json"}</w:instrText>
             </w:r>
             <w:r>
               <w:fldChar w:fldCharType="separate"/>
@@ -2025,7 +2025,7 @@
               <w:fldChar w:fldCharType="begin"/>
             </w:r>
             <w:r>
-              <w:instrText xml:space="preserve">ADDIN CSL_CITATION {"citationID":"MENDELEY_CITATION_29","citationItems":[{"id":"ITEM-29","isTemporary":false,"itemData":{"DOI":"10.1007/s42484-024-00225-5","author":[{"family":"Yan","given":"Fei"},{"family":"Iliyasu","given":"Abdullah M."},{"family":"Li","given":"Nianqiao"},{"family":"Salama","given":"Ahmed S."},{"family":"Hirota","given":"Kaoru"}],"container-title":"Quantum Machine Intelligence","id":"Yan2024","issue":"2","issued":{"date-parts":[[2024]]},"page":"86","publisher":"Springer","title":"Quantum robotics: A review of emerging trends","title-short":"Quantum robotics","type":"article-journal","volume":"6"},"suppress-author":false}],"isEdited":false,"manualOverride":{"citeprocText":"Yan et al. (2024)","isManuallyOverridden":false,"manualOverrideText":""},"mendeley":{"formattedCitation":"Yan et al. (2024)","plainTextFormattedCitation":"Yan et al. (2024)","previouslyFormattedCitation":"Yan et al. (2024)"},"properties":{"noteIndex":0},"schema":"https://github.com/citation-style-language/schema/raw/master/csl-citation.json"}</w:instrText>
+              <w:instrText xml:space="preserve">ADDIN CSL_CITATION {"citationItems":[{"id":"ITEM-1","itemData":{"DOI":"10.1007/s42484-024-00225-5","author":[{"family":"Yan","given":"Fei"},{"family":"Iliyasu","given":"Abdullah M."},{"family":"Li","given":"Nianqiao"},{"family":"Salama","given":"Ahmed S."},{"family":"Hirota","given":"Kaoru"}],"container-title":"Quantum Machine Intelligence","id":"ITEM-1","issue":"2","issued":{"date-parts":[[2024]]},"page":"86","publisher":"Springer","title":"Quantum robotics: A review of emerging trends","title-short":"Quantum robotics","type":"article-journal","volume":"6"}}],"mendeley":{"formattedCitation":"Yan et al. (2024)","plainTextFormattedCitation":"Yan et al. (2024)","previouslyFormattedCitation":"Yan et al. (2024)"},"properties":{"noteIndex":0},"schema":"https://github.com/citation-style-language/schema/raw/master/csl-citation.json"}</w:instrText>
             </w:r>
             <w:r>
               <w:fldChar w:fldCharType="separate"/>
@@ -2162,7 +2162,7 @@
               <w:fldChar w:fldCharType="begin"/>
             </w:r>
             <w:r>
-              <w:instrText xml:space="preserve">ADDIN CSL_CITATION {"citationID":"MENDELEY_CITATION_30","citationItems":[{"id":"ITEM-30","isTemporary":false,"itemData":{"DOI":"10.53759/181X/JCNS202404006","author":[{"family":"Haldorai","given":"Anandakumar"}],"container-title":"Journal of Computing and Natural Science","id":"Haldorai2024","issue":"4","issued":{"date-parts":[[2024]]},"title":"Advancements and applications of quantum computing in robotics","type":"article-journal","volume":"2"},"suppress-author":false}],"isEdited":false,"manualOverride":{"citeprocText":"Haldorai (2024)","isManuallyOverridden":false,"manualOverrideText":""},"mendeley":{"formattedCitation":"Haldorai (2024)","plainTextFormattedCitation":"Haldorai (2024)","previouslyFormattedCitation":"Haldorai (2024)"},"properties":{"noteIndex":0},"schema":"https://github.com/citation-style-language/schema/raw/master/csl-citation.json"}</w:instrText>
+              <w:instrText xml:space="preserve">ADDIN CSL_CITATION {"citationItems":[{"id":"ITEM-1","itemData":{"DOI":"10.53759/181X/JCNS202404006","author":[{"family":"Haldorai","given":"Anandakumar"}],"container-title":"Journal of Computing and Natural Science","id":"ITEM-1","issue":"4","issued":{"date-parts":[[2024]]},"title":"Advancements and applications of quantum computing in robotics","type":"article-journal","volume":"2"}}],"mendeley":{"formattedCitation":"Haldorai (2024)","plainTextFormattedCitation":"Haldorai (2024)","previouslyFormattedCitation":"Haldorai (2024)"},"properties":{"noteIndex":0},"schema":"https://github.com/citation-style-language/schema/raw/master/csl-citation.json"}</w:instrText>
             </w:r>
             <w:r>
               <w:fldChar w:fldCharType="separate"/>
@@ -2283,7 +2283,7 @@
               <w:fldChar w:fldCharType="begin"/>
             </w:r>
             <w:r>
-              <w:instrText xml:space="preserve">ADDIN CSL_CITATION {"citationID":"MENDELEY_CITATION_31","citationItems":[{"id":"ITEM-31","isTemporary":false,"itemData":{"URL":"https://papers.ssrn.com/sol3/papers.cfm?abstract_id=7383818","author":[{"family":"Udekwe","given":"Daniel"}],"id":"Udekwe2025","issued":{"date-parts":[[2025]]},"publisher":"SSRN preprint 7383818","title":"Quantum computing in robotics: A review of optimization, search, and machine learning approaches","title-short":"Quantum computing in robotics","type":""},"suppress-author":false}],"isEdited":false,"manualOverride":{"citeprocText":"Udekwe (2025)","isManuallyOverridden":false,"manualOverrideText":""},"mendeley":{"formattedCitation":"Udekwe (2025)","plainTextFormattedCitation":"Udekwe (2025)","previouslyFormattedCitation":"Udekwe (2025)"},"properties":{"noteIndex":0},"schema":"https://github.com/citation-style-language/schema/raw/master/csl-citation.json"}</w:instrText>
+              <w:instrText xml:space="preserve">ADDIN CSL_CITATION {"citationItems":[{"id":"ITEM-1","itemData":{"URL":"https://papers.ssrn.com/sol3/papers.cfm?abstract_id=7383818","author":[{"family":"Udekwe","given":"Daniel"}],"id":"ITEM-1","issued":{"date-parts":[[2025]]},"publisher":"SSRN preprint 7383818","title":"Quantum computing in robotics: A review of optimization, search, and machine learning approaches","title-short":"Quantum computing in robotics","type":""}}],"mendeley":{"formattedCitation":"Udekwe (2025)","plainTextFormattedCitation":"Udekwe (2025)","previouslyFormattedCitation":"Udekwe (2025)"},"properties":{"noteIndex":0},"schema":"https://github.com/citation-style-language/schema/raw/master/csl-citation.json"}</w:instrText>
             </w:r>
             <w:r>
               <w:fldChar w:fldCharType="separate"/>
@@ -2431,7 +2431,7 @@
               <w:fldChar w:fldCharType="begin"/>
             </w:r>
             <w:r>
-              <w:instrText xml:space="preserve">ADDIN CSL_CITATION {"citationID":"MENDELEY_CITATION_32","citationItems":[{"id":"ITEM-32","isTemporary":false,"itemData":{"DOI":"10.1109/ICAAID68975.2025.11358227","author":[{"family":"Fazilat","given":"Mehdi"},{"family":"Zioui","given":"Nadjet"}],"container-title":"2025 5th international conference on applied automation and industrial diagnostics (ICAAID)","id":"Fazilat2025a","issued":{"date-parts":[[2025]]},"publisher":"IEEE","publisher-place":"Piscataway, NJ, USA","title":"A brief review on quantum-based control strategies for robotic systems","type":"paper-conference"},"suppress-author":false}],"isEdited":false,"manualOverride":{"citeprocText":"Fazilat and Zioui (2025)","isManuallyOverridden":false,"manualOverrideText":""},"mendeley":{"formattedCitation":"Fazilat and Zioui (2025)","plainTextFormattedCitation":"Fazilat and Zioui (2025)","previouslyFormattedCitation":"Fazilat and Zioui (2025)"},"properties":{"noteIndex":0},"schema":"https://github.com/citation-style-language/schema/raw/master/csl-citation.json"}</w:instrText>
+              <w:instrText xml:space="preserve">ADDIN CSL_CITATION {"citationItems":[{"id":"ITEM-1","itemData":{"DOI":"10.1109/ICAAID68975.2025.11358227","author":[{"family":"Fazilat","given":"Mehdi"},{"family":"Zioui","given":"Nadjet"}],"container-title":"2025 5th international conference on applied automation and industrial diagnostics (ICAAID)","id":"ITEM-1","issued":{"date-parts":[[2025]]},"publisher":"IEEE","publisher-place":"Piscataway, NJ, USA","title":"A brief review on quantum-based control strategies for robotic systems","type":"paper-conference"}}],"mendeley":{"formattedCitation":"Fazilat and Zioui (2025)","plainTextFormattedCitation":"Fazilat and Zioui (2025)","previouslyFormattedCitation":"Fazilat and Zioui (2025)"},"properties":{"noteIndex":0},"schema":"https://github.com/citation-style-language/schema/raw/master/csl-citation.json"}</w:instrText>
             </w:r>
             <w:r>
               <w:fldChar w:fldCharType="separate"/>
@@ -2541,7 +2541,7 @@
               <w:fldChar w:fldCharType="begin"/>
             </w:r>
             <w:r>
-              <w:instrText xml:space="preserve">ADDIN CSL_CITATION {"citationID":"MENDELEY_CITATION_33","citationItems":[{"id":"ITEM-33","isTemporary":false,"itemData":{"DOI":"10.65218/jius.2026.13","author":[{"family":"Nigatu","given":"Hassen"},{"family":"Shi","given":"Gaokun"},{"family":"Li","given":"Jituo"},{"family":"Lu","given":"Guodong"},{"family":"Li","given":"Howard"}],"container-title":"Journal of Intelligent and Unmanned Systems","id":"Nigatu2026","issue":"1","issued":{"date-parts":[[2026]]},"page":"13","title":"Quantum machine learning for robotics: A comprehensive review of algorithms, applications, and future directions","title-short":"Quantum machine learning for robotics","type":"article-journal","volume":"1"},"suppress-author":false}],"isEdited":false,"manualOverride":{"citeprocText":"Nigatu et al. (2026)","isManuallyOverridden":false,"manualOverrideText":""},"mendeley":{"formattedCitation":"Nigatu et al. (2026)","plainTextFormattedCitation":"Nigatu et al. (2026)","previouslyFormattedCitation":"Nigatu et al. (2026)"},"properties":{"noteIndex":0},"schema":"https://github.com/citation-style-language/schema/raw/master/csl-citation.json"}</w:instrText>
+              <w:instrText xml:space="preserve">ADDIN CSL_CITATION {"citationItems":[{"id":"ITEM-1","itemData":{"DOI":"10.65218/jius.2026.13","author":[{"family":"Nigatu","given":"Hassen"},{"family":"Shi","given":"Gaokun"},{"family":"Li","given":"Jituo"},{"family":"Lu","given":"Guodong"},{"family":"Li","given":"Howard"}],"container-title":"Journal of Intelligent and Unmanned Systems","id":"ITEM-1","issue":"1","issued":{"date-parts":[[2026]]},"page":"13","title":"Quantum machine learning for robotics: A comprehensive review of algorithms, applications, and future directions","title-short":"Quantum machine learning for robotics","type":"article-journal","volume":"1"}}],"mendeley":{"formattedCitation":"Nigatu et al. (2026)","plainTextFormattedCitation":"Nigatu et al. (2026)","previouslyFormattedCitation":"Nigatu et al. (2026)"},"properties":{"noteIndex":0},"schema":"https://github.com/citation-style-language/schema/raw/master/csl-citation.json"}</w:instrText>
             </w:r>
             <w:r>
               <w:fldChar w:fldCharType="separate"/>
@@ -3307,7 +3307,7 @@
         <w:fldChar w:fldCharType="begin"/>
       </w:r>
       <w:r>
-        <w:instrText xml:space="preserve">ADDIN CSL_CITATION {"citationID":"MENDELEY_CITATION_34","citationItems":[{"id":"ITEM-34","isTemporary":false,"itemData":{"DOI":"10.1017/CBO9780511976667","ISBN":"978-1-107-00217-3","author":[{"family":"Nielsen","given":"Michael A."},{"family":"Chuang","given":"Isaac L."}],"edition":"10th Anniversary","id":"Nielsen2010","issued":{"date-parts":[[2010]]},"publisher":"Cambridge University Press","publisher-place":"Cambridge, UK","title":"Quantum computation and quantum information","type":"book"}}],"isEdited":false,"manualOverride":{"citeprocText":"(Nielsen and Chuang 2010)","isManuallyOverridden":false,"manualOverrideText":""},"mendeley":{"formattedCitation":"(Nielsen and Chuang 2010)","plainTextFormattedCitation":"(Nielsen and Chuang 2010)","previouslyFormattedCitation":"(Nielsen and Chuang 2010)"},"properties":{"noteIndex":0},"schema":"https://github.com/citation-style-language/schema/raw/master/csl-citation.json"}</w:instrText>
+        <w:instrText xml:space="preserve">ADDIN CSL_CITATION {"citationItems":[{"id":"ITEM-1","itemData":{"DOI":"10.1017/CBO9780511976667","ISBN":"978-1-107-00217-3","author":[{"family":"Nielsen","given":"Michael A."},{"family":"Chuang","given":"Isaac L."}],"edition":"10th Anniversary","id":"ITEM-1","issued":{"date-parts":[[2010]]},"publisher":"Cambridge University Press","publisher-place":"Cambridge, UK","title":"Quantum computation and quantum information","type":"book"}}],"mendeley":{"formattedCitation":"(Nielsen and Chuang 2010)","plainTextFormattedCitation":"(Nielsen and Chuang 2010)","previouslyFormattedCitation":"(Nielsen and Chuang 2010)"},"properties":{"noteIndex":0},"schema":"https://github.com/citation-style-language/schema/raw/master/csl-citation.json"}</w:instrText>
       </w:r>
       <w:r>
         <w:fldChar w:fldCharType="separate"/>
@@ -3353,7 +3353,7 @@
         <w:fldChar w:fldCharType="begin"/>
       </w:r>
       <w:r>
-        <w:instrText xml:space="preserve">ADDIN CSL_CITATION {"citationID":"MENDELEY_CITATION_35","citationItems":[{"id":"ITEM-35","isTemporary":false,"itemData":{"DOI":"10.1038/nphys3272","author":[{"family":"Aaronson","given":"Scott"}],"container-title":"Nature Physics","id":"Aaronson2015","issue":"4","issued":{"date-parts":[[2015]]},"page":"291-293","title":"Read the fine print","type":"article-journal","volume":"11"}}],"isEdited":false,"manualOverride":{"citeprocText":"(Aaronson 2015)","isManuallyOverridden":false,"manualOverrideText":""},"mendeley":{"formattedCitation":"(Aaronson 2015)","plainTextFormattedCitation":"(Aaronson 2015)","previouslyFormattedCitation":"(Aaronson 2015)"},"properties":{"noteIndex":0},"schema":"https://github.com/citation-style-language/schema/raw/master/csl-citation.json"}</w:instrText>
+        <w:instrText xml:space="preserve">ADDIN CSL_CITATION {"citationItems":[{"id":"ITEM-1","itemData":{"DOI":"10.1038/nphys3272","author":[{"family":"Aaronson","given":"Scott"}],"container-title":"Nature Physics","id":"ITEM-1","issue":"4","issued":{"date-parts":[[2015]]},"page":"291-293","title":"Read the fine print","type":"article-journal","volume":"11"}}],"mendeley":{"formattedCitation":"(Aaronson 2015)","plainTextFormattedCitation":"(Aaronson 2015)","previouslyFormattedCitation":"(Aaronson 2015)"},"properties":{"noteIndex":0},"schema":"https://github.com/citation-style-language/schema/raw/master/csl-citation.json"}</w:instrText>
       </w:r>
       <w:r>
         <w:fldChar w:fldCharType="separate"/>
@@ -3389,7 +3389,7 @@
         <w:fldChar w:fldCharType="begin"/>
       </w:r>
       <w:r>
-        <w:instrText xml:space="preserve">ADDIN CSL_CITATION {"citationID":"MENDELEY_CITATION_36","citationItems":[{"id":"ITEM-36","isTemporary":false,"itemData":{"DOI":"10.1146/annurev-conmatphys-031119-050605","author":[{"family":"Kjaergaard","given":"Morten"},{"family":"Schwartz","given":"Mollie E."},{"family":"Braumüller","given":"Jochen"},{"family":"Krantz","given":"Philip"},{"family":"Wang","given":"Joel I.-J."},{"family":"Gustavsson","given":"Simon"},{"family":"Oliver","given":"William D."}],"container-title":"Annual Review of Condensed Matter Physics","id":"Kjaergaard2020","issued":{"date-parts":[[2020]]},"page":"369-395","publisher":"Annual Reviews","title":"Superconducting qubits: Current state of play","title-short":"Superconducting qubits","type":"article-journal","volume":"11"}}],"isEdited":false,"manualOverride":{"citeprocText":"(Kjaergaard et al. 2020)","isManuallyOverridden":false,"manualOverrideText":""},"mendeley":{"formattedCitation":"(Kjaergaard et al. 2020)","plainTextFormattedCitation":"(Kjaergaard et al. 2020)","previouslyFormattedCitation":"(Kjaergaard et al. 2020)"},"properties":{"noteIndex":0},"schema":"https://github.com/citation-style-language/schema/raw/master/csl-citation.json"}</w:instrText>
+        <w:instrText xml:space="preserve">ADDIN CSL_CITATION {"citationItems":[{"id":"ITEM-1","itemData":{"DOI":"10.1146/annurev-conmatphys-031119-050605","author":[{"family":"Kjaergaard","given":"Morten"},{"family":"Schwartz","given":"Mollie E."},{"family":"Braumüller","given":"Jochen"},{"family":"Krantz","given":"Philip"},{"family":"Wang","given":"Joel I.-J."},{"family":"Gustavsson","given":"Simon"},{"family":"Oliver","given":"William D."}],"container-title":"Annual Review of Condensed Matter Physics","id":"ITEM-1","issued":{"date-parts":[[2020]]},"page":"369-395","publisher":"Annual Reviews","title":"Superconducting qubits: Current state of play","title-short":"Superconducting qubits","type":"article-journal","volume":"11"}}],"mendeley":{"formattedCitation":"(Kjaergaard et al. 2020)","plainTextFormattedCitation":"(Kjaergaard et al. 2020)","previouslyFormattedCitation":"(Kjaergaard et al. 2020)"},"properties":{"noteIndex":0},"schema":"https://github.com/citation-style-language/schema/raw/master/csl-citation.json"}</w:instrText>
       </w:r>
       <w:r>
         <w:fldChar w:fldCharType="separate"/>
@@ -3524,7 +3524,7 @@
         <w:fldChar w:fldCharType="begin"/>
       </w:r>
       <w:r>
-        <w:instrText xml:space="preserve">ADDIN CSL_CITATION {"citationID":"MENDELEY_CITATION_38","citationItems":[{"id":"ITEM-37","isTemporary":false,"itemData":{"DOI":"10.1038/nature10012","author":[{"family":"Johnson","given":"M. W."},{"family":"Amin","given":"M. H. S."},{"family":"Gildert","given":"S."},{"family":"Lanting","given":"T."},{"family":"Hamze","given":"F."},{"family":"Dickson","given":"N."},{"family":"Harris","given":"R."},{"family":"Berkley","given":"A. J."},{"family":"Johansson","given":"J."},{"family":"Bunyk","given":"P."},{"family":"Chapple","given":"E. M."},{"family":"Enderud","given":"C."},{"family":"Hilton","given":"J. P."},{"family":"Karimi","given":"K."},{"family":"Ladizinsky","given":"E."},{"family":"Ladizinsky","given":"N."},{"family":"Oh","given":"T."},{"family":"Perminov","given":"I."},{"family":"Rich","given":"C."},{"family":"Thom","given":"M. C."},{"family":"Tolkacheva","given":"E."},{"family":"Truncik","given":"C. J. S."},{"family":"Uchaikin","given":"S."},{"family":"Wang","given":"J."},{"family":"Wilson","given":"B."},{"family":"Rose","given":"G."}],"container-title":"Nature","id":"Johnson2011","issue":"7346","issued":{"date-parts":[[2011]]},"page":"194-198","publisher":"Nature Publishing Group","title":"Quantum annealing with manufactured spins","type":"article-journal","volume":"473"}},{"id":"ITEM-38","isTemporary":false,"itemData":{"DOI":"10.3389/fphy.2014.00005","author":[{"family":"Lucas","given":"Andrew"}],"container-title":"Frontiers in Physics","id":"Lucas2014","issued":{"date-parts":[[2014]]},"page":"5","publisher":"Frontiers Media","title":"Ising formulations of many NP problems","type":"article-journal","volume":"2"}}],"isEdited":false,"manualOverride":{"citeprocText":"(Johnson et al. 2011; Lucas 2014)","isManuallyOverridden":false,"manualOverrideText":""},"mendeley":{"formattedCitation":"(Johnson et al. 2011; Lucas 2014)","plainTextFormattedCitation":"(Johnson et al. 2011; Lucas 2014)","previouslyFormattedCitation":"(Johnson et al. 2011; Lucas 2014)"},"properties":{"noteIndex":0},"schema":"https://github.com/citation-style-language/schema/raw/master/csl-citation.json"}</w:instrText>
+        <w:instrText xml:space="preserve">ADDIN CSL_CITATION {"citationItems":[{"id":"ITEM-1","itemData":{"DOI":"10.1038/nature10012","author":[{"family":"Johnson","given":"M. W."},{"family":"Amin","given":"M. H. S."},{"family":"Gildert","given":"S."},{"family":"Lanting","given":"T."},{"family":"Hamze","given":"F."},{"family":"Dickson","given":"N."},{"family":"Harris","given":"R."},{"family":"Berkley","given":"A. J."},{"family":"Johansson","given":"J."},{"family":"Bunyk","given":"P."},{"family":"Chapple","given":"E. M."},{"family":"Enderud","given":"C."},{"family":"Hilton","given":"J. P."},{"family":"Karimi","given":"K."},{"family":"Ladizinsky","given":"E."},{"family":"Ladizinsky","given":"N."},{"family":"Oh","given":"T."},{"family":"Perminov","given":"I."},{"family":"Rich","given":"C."},{"family":"Thom","given":"M. C."},{"family":"Tolkacheva","given":"E."},{"family":"Truncik","given":"C. J. S."},{"family":"Uchaikin","given":"S."},{"family":"Wang","given":"J."},{"family":"Wilson","given":"B."},{"family":"Rose","given":"G."}],"container-title":"Nature","id":"ITEM-1","issue":"7346","issued":{"date-parts":[[2011]]},"page":"194-198","publisher":"Nature Publishing Group","title":"Quantum annealing with manufactured spins","type":"article-journal","volume":"473"}},{"id":"ITEM-2","itemData":{"DOI":"10.3389/fphy.2014.00005","author":[{"family":"Lucas","given":"Andrew"}],"container-title":"Frontiers in Physics","id":"ITEM-2","issued":{"date-parts":[[2014]]},"page":"5","publisher":"Frontiers Media","title":"Ising formulations of many NP problems","type":"article-journal","volume":"2"}}],"mendeley":{"formattedCitation":"(Johnson et al. 2011; Lucas 2014)","plainTextFormattedCitation":"(Johnson et al. 2011; Lucas 2014)","previouslyFormattedCitation":"(Johnson et al. 2011; Lucas 2014)"},"properties":{"noteIndex":0},"schema":"https://github.com/citation-style-language/schema/raw/master/csl-citation.json"}</w:instrText>
       </w:r>
       <w:r>
         <w:fldChar w:fldCharType="separate"/>
@@ -3556,7 +3556,7 @@
         <w:fldChar w:fldCharType="begin"/>
       </w:r>
       <w:r>
-        <w:instrText xml:space="preserve">ADDIN CSL_CITATION {"citationID":"MENDELEY_CITATION_39","citationItems":[{"id":"ITEM-39","isTemporary":false,"itemData":{"URL":"https://arxiv.org/abs/1411.4028","author":[{"family":"Farhi","given":"Edward"},{"family":"Goldstone","given":"Jeffrey"},{"family":"Gutmann","given":"Sam"}],"id":"Farhi2014","issued":{"date-parts":[[2014]]},"title":"A quantum approximate optimization algorithm","type":""}}],"isEdited":false,"manualOverride":{"citeprocText":"(Farhi, Goldstone, and Gutmann 2014)","isManuallyOverridden":false,"manualOverrideText":""},"mendeley":{"formattedCitation":"(Farhi, Goldstone, and Gutmann 2014)","plainTextFormattedCitation":"(Farhi, Goldstone, and Gutmann 2014)","previouslyFormattedCitation":"(Farhi, Goldstone, and Gutmann 2014)"},"properties":{"noteIndex":0},"schema":"https://github.com/citation-style-language/schema/raw/master/csl-citation.json"}</w:instrText>
+        <w:instrText xml:space="preserve">ADDIN CSL_CITATION {"citationItems":[{"id":"ITEM-1","itemData":{"URL":"https://arxiv.org/abs/1411.4028","author":[{"family":"Farhi","given":"Edward"},{"family":"Goldstone","given":"Jeffrey"},{"family":"Gutmann","given":"Sam"}],"id":"ITEM-1","issued":{"date-parts":[[2014]]},"title":"A quantum approximate optimization algorithm","type":""}}],"mendeley":{"formattedCitation":"(Farhi, Goldstone, and Gutmann 2014)","plainTextFormattedCitation":"(Farhi, Goldstone, and Gutmann 2014)","previouslyFormattedCitation":"(Farhi, Goldstone, and Gutmann 2014)"},"properties":{"noteIndex":0},"schema":"https://github.com/citation-style-language/schema/raw/master/csl-citation.json"}</w:instrText>
       </w:r>
       <w:r>
         <w:fldChar w:fldCharType="separate"/>
@@ -3587,7 +3587,7 @@
         <w:fldChar w:fldCharType="begin"/>
       </w:r>
       <w:r>
-        <w:instrText xml:space="preserve">ADDIN CSL_CITATION {"citationID":"MENDELEY_CITATION_43","citationItems":[{"id":"ITEM-40","isTemporary":false,"itemData":{"DOI":"10.1038/ncomms5213","author":[{"family":"Peruzzo","given":"Alberto"},{"family":"McClean","given":"Jarrod"},{"family":"Shadbolt","given":"Peter"},{"family":"Yung","given":"Man-Hong"},{"family":"Zhou","given":"Xiao-Qi"},{"family":"Love","given":"Peter J."},{"family":"Aspuru-Guzik","given":"Alán"},{"family":"O’Brien","given":"Jeremy L."}],"container-title":"Nature Communications","id":"Peruzzo2014","issue":"1","issued":{"date-parts":[[2014]]},"page":"4213","publisher":"Nature Publishing Group","title":"A variational eigenvalue solver on a photonic quantum processor","type":"article-journal","volume":"5"}},{"id":"ITEM-41","isTemporary":false,"itemData":{"DOI":"10.1088/1367-2630/18/2/023023","author":[{"family":"McClean","given":"Jarrod R."},{"family":"Romero","given":"Jonathan"},{"family":"Babbush","given":"Ryan"},{"family":"Aspuru-Guzik","given":"Alán"}],"container-title":"New Journal of Physics","id":"McClean2016","issue":"2","issued":{"date-parts":[[2016]]},"page":"023023","publisher":"IOP Publishing","title":"The theory of variational hybrid quantum-classical algorithms","type":"article-journal","volume":"18"}},{"id":"ITEM-42","isTemporary":false,"itemData":{"DOI":"10.1038/s42254-021-00348-9","author":[{"family":"Cerezo","given":"M."},{"family":"Arrasmith","given":"Andrew"},{"family":"Babbush","given":"Ryan"},{"family":"Benjamin","given":"Simon C."},{"family":"Endo","given":"Suguru"},{"family":"Fujii","given":"Keisuke"},{"family":"McClean","given":"Jarrod R."},{"family":"Mitarai","given":"Kosuke"},{"family":"Yuan","given":"Xiao"},{"family":"Cincio","given":"Lukasz"},{"family":"Coles","given":"Patrick J."}],"container-title":"Nature Reviews Physics","id":"Cerezo2021a","issue":"9","issued":{"date-parts":[[2021]]},"page":"625-644","publisher":"Nature Publishing Group","title":"Variational quantum algorithms","type":"article-journal","volume":"3"}},{"id":"ITEM-43","isTemporary":false,"itemData":{"DOI":"10.1103/RevModPhys.94.015004","author":[{"family":"Bharti","given":"Kishor"},{"family":"Cervera-Lierta","given":"Alba"},{"family":"Kyaw","given":"Thi Ha"},{"family":"Haug","given":"Tobias"},{"family":"Alperin-Lea","given":"Sumner"},{"family":"Anand","given":"Abhinav"},{"family":"Degroote","given":"Matthias"},{"family":"Heimonen","given":"Hermanni"},{"family":"Kottmann","given":"Jakob S."},{"family":"Menke","given":"Tim"},{"family":"Mok","given":"Wai-Keong"},{"family":"Sim","given":"Sukin"},{"family":"Kwek","given":"Leong-Chuan"},{"family":"Aspuru-Guzik","given":"Alán"}],"container-title":"Reviews of Modern Physics","id":"Bharti2022","issue":"1","issued":{"date-parts":[[2022]]},"page":"015004","title":"Noisy intermediate-scale quantum algorithms","type":"article-journal","volume":"94"}}],"isEdited":false,"manualOverride":{"citeprocText":"(Peruzzo et al. 2014; McClean et al. 2016; Cerezo, Arrasmith, et al. 2021; Bharti et al. 2022)","isManuallyOverridden":false,"manualOverrideText":""},"mendeley":{"formattedCitation":"(Peruzzo et al. 2014; McClean et al. 2016; Cerezo, Arrasmith, et al. 2021; Bharti et al. 2022)","plainTextFormattedCitation":"(Peruzzo et al. 2014; McClean et al. 2016; Cerezo, Arrasmith, et al. 2021; Bharti et al. 2022)","previouslyFormattedCitation":"(Peruzzo et al. 2014; McClean et al. 2016; Cerezo, Arrasmith, et al. 2021; Bharti et al. 2022)"},"properties":{"noteIndex":0},"schema":"https://github.com/citation-style-language/schema/raw/master/csl-citation.json"}</w:instrText>
+        <w:instrText xml:space="preserve">ADDIN CSL_CITATION {"citationItems":[{"id":"ITEM-1","itemData":{"DOI":"10.1038/ncomms5213","author":[{"family":"Peruzzo","given":"Alberto"},{"family":"McClean","given":"Jarrod"},{"family":"Shadbolt","given":"Peter"},{"family":"Yung","given":"Man-Hong"},{"family":"Zhou","given":"Xiao-Qi"},{"family":"Love","given":"Peter J."},{"family":"Aspuru-Guzik","given":"Alán"},{"family":"O’Brien","given":"Jeremy L."}],"container-title":"Nature Communications","id":"ITEM-1","issue":"1","issued":{"date-parts":[[2014]]},"page":"4213","publisher":"Nature Publishing Group","title":"A variational eigenvalue solver on a photonic quantum processor","type":"article-journal","volume":"5"}},{"id":"ITEM-2","itemData":{"DOI":"10.1088/1367-2630/18/2/023023","author":[{"family":"McClean","given":"Jarrod R."},{"family":"Romero","given":"Jonathan"},{"family":"Babbush","given":"Ryan"},{"family":"Aspuru-Guzik","given":"Alán"}],"container-title":"New Journal of Physics","id":"ITEM-2","issue":"2","issued":{"date-parts":[[2016]]},"page":"023023","publisher":"IOP Publishing","title":"The theory of variational hybrid quantum-classical algorithms","type":"article-journal","volume":"18"}},{"id":"ITEM-3","itemData":{"DOI":"10.1038/s42254-021-00348-9","author":[{"family":"Cerezo","given":"M."},{"family":"Arrasmith","given":"Andrew"},{"family":"Babbush","given":"Ryan"},{"family":"Benjamin","given":"Simon C."},{"family":"Endo","given":"Suguru"},{"family":"Fujii","given":"Keisuke"},{"family":"McClean","given":"Jarrod R."},{"family":"Mitarai","given":"Kosuke"},{"family":"Yuan","given":"Xiao"},{"family":"Cincio","given":"Lukasz"},{"family":"Coles","given":"Patrick J."}],"container-title":"Nature Reviews Physics","id":"ITEM-3","issue":"9","issued":{"date-parts":[[2021]]},"page":"625-644","publisher":"Nature Publishing Group","title":"Variational quantum algorithms","type":"article-journal","volume":"3"}},{"id":"ITEM-4","itemData":{"DOI":"10.1103/RevModPhys.94.015004","author":[{"family":"Bharti","given":"Kishor"},{"family":"Cervera-Lierta","given":"Alba"},{"family":"Kyaw","given":"Thi Ha"},{"family":"Haug","given":"Tobias"},{"family":"Alperin-Lea","given":"Sumner"},{"family":"Anand","given":"Abhinav"},{"family":"Degroote","given":"Matthias"},{"family":"Heimonen","given":"Hermanni"},{"family":"Kottmann","given":"Jakob S."},{"family":"Menke","given":"Tim"},{"family":"Mok","given":"Wai-Keong"},{"family":"Sim","given":"Sukin"},{"family":"Kwek","given":"Leong-Chuan"},{"family":"Aspuru-Guzik","given":"Alán"}],"container-title":"Reviews of Modern Physics","id":"ITEM-4","issue":"1","issued":{"date-parts":[[2022]]},"page":"015004","title":"Noisy intermediate-scale quantum algorithms","type":"article-journal","volume":"94"}}],"mendeley":{"formattedCitation":"(Peruzzo et al. 2014; McClean et al. 2016; Cerezo, Arrasmith, et al. 2021; Bharti et al. 2022)","plainTextFormattedCitation":"(Peruzzo et al. 2014; McClean et al. 2016; Cerezo, Arrasmith, et al. 2021; Bharti et al. 2022)","previouslyFormattedCitation":"(Peruzzo et al. 2014; McClean et al. 2016; Cerezo, Arrasmith, et al. 2021; Bharti et al. 2022)"},"properties":{"noteIndex":0},"schema":"https://github.com/citation-style-language/schema/raw